<commit_message>
Haal lokaal pad en SharePoint-verwijzing uit de Word-bestanden en beveilig de documenttools
- Een link naar een bestand (./DATABASE-SCHEMA.sql) werd in de .docx een lokaal pad met de
  Windows-gebruikersnaam (file:///C:\Users\...). Alleen http(s)- en mailto-links worden nog een
  link; de rest is gewone tekst
- De verwijzing naar het interne TVB-sjabloon op SharePoint (attachedTemplate) gaat eruit
- md-to-docx.cjs: afbeeldingen alleen PNG/JPEG uit de map van het document (geen ../-paden),
  controle op de argumenten, en weigeren als de uitvoermap de bron of het sjabloon bevat
- word-bijwerken.ps1: verplichte parameters, -LiteralPath, macro's uit (AutomationSecurity)
- TO- en documentatie-docx opnieuw gemaakt
</commit_message>
<xml_diff>
--- a/docs/DOCUMENTATIE.docx
+++ b/docs/DOCUMENTATIE.docx
@@ -82,7 +82,7 @@
           <w:numId w:val="0"/>
         </w:numPr>
       </w:pPr>
-      <w:bookmarkStart w:id="0" w:name="_Toc242224074"/>
+      <w:bookmarkStart w:id="0" w:name="_Toc242435857"/>
       <w:r>
         <w:t>INHOUDSOPGAVE.</w:t>
       </w:r>
@@ -112,7 +112,7 @@
       <w:r>
         <w:fldChar w:fldCharType="separate"/>
       </w:r>
-      <w:hyperlink w:anchor="_Toc242224074" w:history="1">
+      <w:hyperlink w:anchor="_Toc242435857" w:history="1">
         <w:r>
           <w:rPr>
             <w:rStyle w:val="Hyperlink"/>
@@ -139,7 +139,7 @@
             <w:noProof/>
             <w:webHidden/>
           </w:rPr>
-          <w:instrText xml:space="preserve"> PAGEREF _Toc242224074 \h </w:instrText>
+          <w:instrText xml:space="preserve"> PAGEREF _Toc242435857 \h </w:instrText>
         </w:r>
         <w:r>
           <w:rPr>
@@ -186,7 +186,7 @@
           <w:lang w:eastAsia="nl-NL"/>
         </w:rPr>
       </w:pPr>
-      <w:hyperlink w:anchor="_Toc242224075" w:history="1">
+      <w:hyperlink w:anchor="_Toc242435858" w:history="1">
         <w:r>
           <w:rPr>
             <w:rStyle w:val="Hyperlink"/>
@@ -231,7 +231,7 @@
             <w:noProof/>
             <w:webHidden/>
           </w:rPr>
-          <w:instrText xml:space="preserve"> PAGEREF _Toc242224075 \h </w:instrText>
+          <w:instrText xml:space="preserve"> PAGEREF _Toc242435858 \h </w:instrText>
         </w:r>
         <w:r>
           <w:rPr>
@@ -278,7 +278,7 @@
           <w:lang w:eastAsia="nl-NL"/>
         </w:rPr>
       </w:pPr>
-      <w:hyperlink w:anchor="_Toc242224076" w:history="1">
+      <w:hyperlink w:anchor="_Toc242435859" w:history="1">
         <w:r>
           <w:rPr>
             <w:rStyle w:val="Hyperlink"/>
@@ -323,7 +323,7 @@
             <w:noProof/>
             <w:webHidden/>
           </w:rPr>
-          <w:instrText xml:space="preserve"> PAGEREF _Toc242224076 \h </w:instrText>
+          <w:instrText xml:space="preserve"> PAGEREF _Toc242435859 \h </w:instrText>
         </w:r>
         <w:r>
           <w:rPr>
@@ -370,7 +370,7 @@
           <w:lang w:eastAsia="nl-NL"/>
         </w:rPr>
       </w:pPr>
-      <w:hyperlink w:anchor="_Toc242224077" w:history="1">
+      <w:hyperlink w:anchor="_Toc242435860" w:history="1">
         <w:r>
           <w:rPr>
             <w:rStyle w:val="Hyperlink"/>
@@ -415,7 +415,7 @@
             <w:noProof/>
             <w:webHidden/>
           </w:rPr>
-          <w:instrText xml:space="preserve"> PAGEREF _Toc242224077 \h </w:instrText>
+          <w:instrText xml:space="preserve"> PAGEREF _Toc242435860 \h </w:instrText>
         </w:r>
         <w:r>
           <w:rPr>
@@ -462,7 +462,7 @@
           <w:lang w:eastAsia="nl-NL"/>
         </w:rPr>
       </w:pPr>
-      <w:hyperlink w:anchor="_Toc242224078" w:history="1">
+      <w:hyperlink w:anchor="_Toc242435861" w:history="1">
         <w:r>
           <w:rPr>
             <w:rStyle w:val="Hyperlink"/>
@@ -507,7 +507,7 @@
             <w:noProof/>
             <w:webHidden/>
           </w:rPr>
-          <w:instrText xml:space="preserve"> PAGEREF _Toc242224078 \h </w:instrText>
+          <w:instrText xml:space="preserve"> PAGEREF _Toc242435861 \h </w:instrText>
         </w:r>
         <w:r>
           <w:rPr>
@@ -554,7 +554,7 @@
           <w:lang w:eastAsia="nl-NL"/>
         </w:rPr>
       </w:pPr>
-      <w:hyperlink w:anchor="_Toc242224079" w:history="1">
+      <w:hyperlink w:anchor="_Toc242435862" w:history="1">
         <w:r>
           <w:rPr>
             <w:rStyle w:val="Hyperlink"/>
@@ -599,7 +599,7 @@
             <w:noProof/>
             <w:webHidden/>
           </w:rPr>
-          <w:instrText xml:space="preserve"> PAGEREF _Toc242224079 \h </w:instrText>
+          <w:instrText xml:space="preserve"> PAGEREF _Toc242435862 \h </w:instrText>
         </w:r>
         <w:r>
           <w:rPr>
@@ -646,7 +646,7 @@
           <w:lang w:eastAsia="nl-NL"/>
         </w:rPr>
       </w:pPr>
-      <w:hyperlink w:anchor="_Toc242224080" w:history="1">
+      <w:hyperlink w:anchor="_Toc242435863" w:history="1">
         <w:r>
           <w:rPr>
             <w:rStyle w:val="Hyperlink"/>
@@ -691,7 +691,7 @@
             <w:noProof/>
             <w:webHidden/>
           </w:rPr>
-          <w:instrText xml:space="preserve"> PAGEREF _Toc242224080 \h </w:instrText>
+          <w:instrText xml:space="preserve"> PAGEREF _Toc242435863 \h </w:instrText>
         </w:r>
         <w:r>
           <w:rPr>
@@ -738,7 +738,7 @@
           <w:lang w:eastAsia="nl-NL"/>
         </w:rPr>
       </w:pPr>
-      <w:hyperlink w:anchor="_Toc242224081" w:history="1">
+      <w:hyperlink w:anchor="_Toc242435864" w:history="1">
         <w:r>
           <w:rPr>
             <w:rStyle w:val="Hyperlink"/>
@@ -783,7 +783,7 @@
             <w:noProof/>
             <w:webHidden/>
           </w:rPr>
-          <w:instrText xml:space="preserve"> PAGEREF _Toc242224081 \h </w:instrText>
+          <w:instrText xml:space="preserve"> PAGEREF _Toc242435864 \h </w:instrText>
         </w:r>
         <w:r>
           <w:rPr>
@@ -830,7 +830,7 @@
           <w:lang w:eastAsia="nl-NL"/>
         </w:rPr>
       </w:pPr>
-      <w:hyperlink w:anchor="_Toc242224082" w:history="1">
+      <w:hyperlink w:anchor="_Toc242435865" w:history="1">
         <w:r>
           <w:rPr>
             <w:rStyle w:val="Hyperlink"/>
@@ -875,7 +875,7 @@
             <w:noProof/>
             <w:webHidden/>
           </w:rPr>
-          <w:instrText xml:space="preserve"> PAGEREF _Toc242224082 \h </w:instrText>
+          <w:instrText xml:space="preserve"> PAGEREF _Toc242435865 \h </w:instrText>
         </w:r>
         <w:r>
           <w:rPr>
@@ -922,7 +922,7 @@
           <w:lang w:eastAsia="nl-NL"/>
         </w:rPr>
       </w:pPr>
-      <w:hyperlink w:anchor="_Toc242224083" w:history="1">
+      <w:hyperlink w:anchor="_Toc242435866" w:history="1">
         <w:r>
           <w:rPr>
             <w:rStyle w:val="Hyperlink"/>
@@ -967,7 +967,7 @@
             <w:noProof/>
             <w:webHidden/>
           </w:rPr>
-          <w:instrText xml:space="preserve"> PAGEREF _Toc242224083 \h </w:instrText>
+          <w:instrText xml:space="preserve"> PAGEREF _Toc242435866 \h </w:instrText>
         </w:r>
         <w:r>
           <w:rPr>
@@ -1014,7 +1014,7 @@
           <w:lang w:eastAsia="nl-NL"/>
         </w:rPr>
       </w:pPr>
-      <w:hyperlink w:anchor="_Toc242224084" w:history="1">
+      <w:hyperlink w:anchor="_Toc242435867" w:history="1">
         <w:r>
           <w:rPr>
             <w:rStyle w:val="Hyperlink"/>
@@ -1059,7 +1059,7 @@
             <w:noProof/>
             <w:webHidden/>
           </w:rPr>
-          <w:instrText xml:space="preserve"> PAGEREF _Toc242224084 \h </w:instrText>
+          <w:instrText xml:space="preserve"> PAGEREF _Toc242435867 \h </w:instrText>
         </w:r>
         <w:r>
           <w:rPr>
@@ -1106,7 +1106,7 @@
           <w:lang w:eastAsia="nl-NL"/>
         </w:rPr>
       </w:pPr>
-      <w:hyperlink w:anchor="_Toc242224085" w:history="1">
+      <w:hyperlink w:anchor="_Toc242435868" w:history="1">
         <w:r>
           <w:rPr>
             <w:rStyle w:val="Hyperlink"/>
@@ -1151,7 +1151,7 @@
             <w:noProof/>
             <w:webHidden/>
           </w:rPr>
-          <w:instrText xml:space="preserve"> PAGEREF _Toc242224085 \h </w:instrText>
+          <w:instrText xml:space="preserve"> PAGEREF _Toc242435868 \h </w:instrText>
         </w:r>
         <w:r>
           <w:rPr>
@@ -1198,7 +1198,7 @@
           <w:lang w:eastAsia="nl-NL"/>
         </w:rPr>
       </w:pPr>
-      <w:hyperlink w:anchor="_Toc242224086" w:history="1">
+      <w:hyperlink w:anchor="_Toc242435869" w:history="1">
         <w:r>
           <w:rPr>
             <w:rStyle w:val="Hyperlink"/>
@@ -1243,7 +1243,7 @@
             <w:noProof/>
             <w:webHidden/>
           </w:rPr>
-          <w:instrText xml:space="preserve"> PAGEREF _Toc242224086 \h </w:instrText>
+          <w:instrText xml:space="preserve"> PAGEREF _Toc242435869 \h </w:instrText>
         </w:r>
         <w:r>
           <w:rPr>
@@ -1290,7 +1290,7 @@
           <w:lang w:eastAsia="nl-NL"/>
         </w:rPr>
       </w:pPr>
-      <w:hyperlink w:anchor="_Toc242224087" w:history="1">
+      <w:hyperlink w:anchor="_Toc242435870" w:history="1">
         <w:r>
           <w:rPr>
             <w:rStyle w:val="Hyperlink"/>
@@ -1335,7 +1335,7 @@
             <w:noProof/>
             <w:webHidden/>
           </w:rPr>
-          <w:instrText xml:space="preserve"> PAGEREF _Toc242224087 \h </w:instrText>
+          <w:instrText xml:space="preserve"> PAGEREF _Toc242435870 \h </w:instrText>
         </w:r>
         <w:r>
           <w:rPr>
@@ -1382,7 +1382,7 @@
           <w:lang w:eastAsia="nl-NL"/>
         </w:rPr>
       </w:pPr>
-      <w:hyperlink w:anchor="_Toc242224088" w:history="1">
+      <w:hyperlink w:anchor="_Toc242435871" w:history="1">
         <w:r>
           <w:rPr>
             <w:rStyle w:val="Hyperlink"/>
@@ -1427,7 +1427,7 @@
             <w:noProof/>
             <w:webHidden/>
           </w:rPr>
-          <w:instrText xml:space="preserve"> PAGEREF _Toc242224088 \h </w:instrText>
+          <w:instrText xml:space="preserve"> PAGEREF _Toc242435871 \h </w:instrText>
         </w:r>
         <w:r>
           <w:rPr>
@@ -1474,7 +1474,7 @@
           <w:lang w:eastAsia="nl-NL"/>
         </w:rPr>
       </w:pPr>
-      <w:hyperlink w:anchor="_Toc242224089" w:history="1">
+      <w:hyperlink w:anchor="_Toc242435872" w:history="1">
         <w:r>
           <w:rPr>
             <w:rStyle w:val="Hyperlink"/>
@@ -1519,7 +1519,7 @@
             <w:noProof/>
             <w:webHidden/>
           </w:rPr>
-          <w:instrText xml:space="preserve"> PAGEREF _Toc242224089 \h </w:instrText>
+          <w:instrText xml:space="preserve"> PAGEREF _Toc242435872 \h </w:instrText>
         </w:r>
         <w:r>
           <w:rPr>
@@ -1566,7 +1566,7 @@
           <w:lang w:eastAsia="nl-NL"/>
         </w:rPr>
       </w:pPr>
-      <w:hyperlink w:anchor="_Toc242224090" w:history="1">
+      <w:hyperlink w:anchor="_Toc242435873" w:history="1">
         <w:r>
           <w:rPr>
             <w:rStyle w:val="Hyperlink"/>
@@ -1611,7 +1611,7 @@
             <w:noProof/>
             <w:webHidden/>
           </w:rPr>
-          <w:instrText xml:space="preserve"> PAGEREF _Toc242224090 \h </w:instrText>
+          <w:instrText xml:space="preserve"> PAGEREF _Toc242435873 \h </w:instrText>
         </w:r>
         <w:r>
           <w:rPr>
@@ -1658,7 +1658,7 @@
           <w:lang w:eastAsia="nl-NL"/>
         </w:rPr>
       </w:pPr>
-      <w:hyperlink w:anchor="_Toc242224091" w:history="1">
+      <w:hyperlink w:anchor="_Toc242435874" w:history="1">
         <w:r>
           <w:rPr>
             <w:rStyle w:val="Hyperlink"/>
@@ -1703,7 +1703,7 @@
             <w:noProof/>
             <w:webHidden/>
           </w:rPr>
-          <w:instrText xml:space="preserve"> PAGEREF _Toc242224091 \h </w:instrText>
+          <w:instrText xml:space="preserve"> PAGEREF _Toc242435874 \h </w:instrText>
         </w:r>
         <w:r>
           <w:rPr>
@@ -1750,7 +1750,7 @@
           <w:lang w:eastAsia="nl-NL"/>
         </w:rPr>
       </w:pPr>
-      <w:hyperlink w:anchor="_Toc242224092" w:history="1">
+      <w:hyperlink w:anchor="_Toc242435875" w:history="1">
         <w:r>
           <w:rPr>
             <w:rStyle w:val="Hyperlink"/>
@@ -1795,7 +1795,7 @@
             <w:noProof/>
             <w:webHidden/>
           </w:rPr>
-          <w:instrText xml:space="preserve"> PAGEREF _Toc242224092 \h </w:instrText>
+          <w:instrText xml:space="preserve"> PAGEREF _Toc242435875 \h </w:instrText>
         </w:r>
         <w:r>
           <w:rPr>
@@ -1842,7 +1842,7 @@
           <w:lang w:eastAsia="nl-NL"/>
         </w:rPr>
       </w:pPr>
-      <w:hyperlink w:anchor="_Toc242224093" w:history="1">
+      <w:hyperlink w:anchor="_Toc242435876" w:history="1">
         <w:r>
           <w:rPr>
             <w:rStyle w:val="Hyperlink"/>
@@ -1887,7 +1887,7 @@
             <w:noProof/>
             <w:webHidden/>
           </w:rPr>
-          <w:instrText xml:space="preserve"> PAGEREF _Toc242224093 \h </w:instrText>
+          <w:instrText xml:space="preserve"> PAGEREF _Toc242435876 \h </w:instrText>
         </w:r>
         <w:r>
           <w:rPr>
@@ -1934,7 +1934,7 @@
           <w:lang w:eastAsia="nl-NL"/>
         </w:rPr>
       </w:pPr>
-      <w:hyperlink w:anchor="_Toc242224094" w:history="1">
+      <w:hyperlink w:anchor="_Toc242435877" w:history="1">
         <w:r>
           <w:rPr>
             <w:rStyle w:val="Hyperlink"/>
@@ -1995,7 +1995,7 @@
             <w:noProof/>
             <w:webHidden/>
           </w:rPr>
-          <w:instrText xml:space="preserve"> PAGEREF _Toc242224094 \h </w:instrText>
+          <w:instrText xml:space="preserve"> PAGEREF _Toc242435877 \h </w:instrText>
         </w:r>
         <w:r>
           <w:rPr>
@@ -2042,7 +2042,7 @@
           <w:lang w:eastAsia="nl-NL"/>
         </w:rPr>
       </w:pPr>
-      <w:hyperlink w:anchor="_Toc242224095" w:history="1">
+      <w:hyperlink w:anchor="_Toc242435878" w:history="1">
         <w:r>
           <w:rPr>
             <w:rStyle w:val="Hyperlink"/>
@@ -2087,7 +2087,7 @@
             <w:noProof/>
             <w:webHidden/>
           </w:rPr>
-          <w:instrText xml:space="preserve"> PAGEREF _Toc242224095 \h </w:instrText>
+          <w:instrText xml:space="preserve"> PAGEREF _Toc242435878 \h </w:instrText>
         </w:r>
         <w:r>
           <w:rPr>
@@ -2134,7 +2134,7 @@
           <w:lang w:eastAsia="nl-NL"/>
         </w:rPr>
       </w:pPr>
-      <w:hyperlink w:anchor="_Toc242224096" w:history="1">
+      <w:hyperlink w:anchor="_Toc242435879" w:history="1">
         <w:r>
           <w:rPr>
             <w:rStyle w:val="Hyperlink"/>
@@ -2179,7 +2179,7 @@
             <w:noProof/>
             <w:webHidden/>
           </w:rPr>
-          <w:instrText xml:space="preserve"> PAGEREF _Toc242224096 \h </w:instrText>
+          <w:instrText xml:space="preserve"> PAGEREF _Toc242435879 \h </w:instrText>
         </w:r>
         <w:r>
           <w:rPr>
@@ -2226,7 +2226,7 @@
           <w:lang w:eastAsia="nl-NL"/>
         </w:rPr>
       </w:pPr>
-      <w:hyperlink w:anchor="_Toc242224097" w:history="1">
+      <w:hyperlink w:anchor="_Toc242435880" w:history="1">
         <w:r>
           <w:rPr>
             <w:rStyle w:val="Hyperlink"/>
@@ -2271,7 +2271,7 @@
             <w:noProof/>
             <w:webHidden/>
           </w:rPr>
-          <w:instrText xml:space="preserve"> PAGEREF _Toc242224097 \h </w:instrText>
+          <w:instrText xml:space="preserve"> PAGEREF _Toc242435880 \h </w:instrText>
         </w:r>
         <w:r>
           <w:rPr>
@@ -2318,7 +2318,7 @@
           <w:lang w:eastAsia="nl-NL"/>
         </w:rPr>
       </w:pPr>
-      <w:hyperlink w:anchor="_Toc242224098" w:history="1">
+      <w:hyperlink w:anchor="_Toc242435881" w:history="1">
         <w:r>
           <w:rPr>
             <w:rStyle w:val="Hyperlink"/>
@@ -2363,7 +2363,7 @@
             <w:noProof/>
             <w:webHidden/>
           </w:rPr>
-          <w:instrText xml:space="preserve"> PAGEREF _Toc242224098 \h </w:instrText>
+          <w:instrText xml:space="preserve"> PAGEREF _Toc242435881 \h </w:instrText>
         </w:r>
         <w:r>
           <w:rPr>
@@ -2410,7 +2410,7 @@
           <w:lang w:eastAsia="nl-NL"/>
         </w:rPr>
       </w:pPr>
-      <w:hyperlink w:anchor="_Toc242224099" w:history="1">
+      <w:hyperlink w:anchor="_Toc242435882" w:history="1">
         <w:r>
           <w:rPr>
             <w:rStyle w:val="Hyperlink"/>
@@ -2455,7 +2455,7 @@
             <w:noProof/>
             <w:webHidden/>
           </w:rPr>
-          <w:instrText xml:space="preserve"> PAGEREF _Toc242224099 \h </w:instrText>
+          <w:instrText xml:space="preserve"> PAGEREF _Toc242435882 \h </w:instrText>
         </w:r>
         <w:r>
           <w:rPr>
@@ -2502,7 +2502,7 @@
           <w:lang w:eastAsia="nl-NL"/>
         </w:rPr>
       </w:pPr>
-      <w:hyperlink w:anchor="_Toc242224100" w:history="1">
+      <w:hyperlink w:anchor="_Toc242435883" w:history="1">
         <w:r>
           <w:rPr>
             <w:rStyle w:val="Hyperlink"/>
@@ -2547,7 +2547,7 @@
             <w:noProof/>
             <w:webHidden/>
           </w:rPr>
-          <w:instrText xml:space="preserve"> PAGEREF _Toc242224100 \h </w:instrText>
+          <w:instrText xml:space="preserve"> PAGEREF _Toc242435883 \h </w:instrText>
         </w:r>
         <w:r>
           <w:rPr>
@@ -2594,7 +2594,7 @@
           <w:lang w:eastAsia="nl-NL"/>
         </w:rPr>
       </w:pPr>
-      <w:hyperlink w:anchor="_Toc242224101" w:history="1">
+      <w:hyperlink w:anchor="_Toc242435884" w:history="1">
         <w:r>
           <w:rPr>
             <w:rStyle w:val="Hyperlink"/>
@@ -2639,7 +2639,7 @@
             <w:noProof/>
             <w:webHidden/>
           </w:rPr>
-          <w:instrText xml:space="preserve"> PAGEREF _Toc242224101 \h </w:instrText>
+          <w:instrText xml:space="preserve"> PAGEREF _Toc242435884 \h </w:instrText>
         </w:r>
         <w:r>
           <w:rPr>
@@ -2686,7 +2686,7 @@
           <w:lang w:eastAsia="nl-NL"/>
         </w:rPr>
       </w:pPr>
-      <w:hyperlink w:anchor="_Toc242224102" w:history="1">
+      <w:hyperlink w:anchor="_Toc242435885" w:history="1">
         <w:r>
           <w:rPr>
             <w:rStyle w:val="Hyperlink"/>
@@ -2747,7 +2747,7 @@
             <w:noProof/>
             <w:webHidden/>
           </w:rPr>
-          <w:instrText xml:space="preserve"> PAGEREF _Toc242224102 \h </w:instrText>
+          <w:instrText xml:space="preserve"> PAGEREF _Toc242435885 \h </w:instrText>
         </w:r>
         <w:r>
           <w:rPr>
@@ -2794,7 +2794,7 @@
           <w:lang w:eastAsia="nl-NL"/>
         </w:rPr>
       </w:pPr>
-      <w:hyperlink w:anchor="_Toc242224103" w:history="1">
+      <w:hyperlink w:anchor="_Toc242435886" w:history="1">
         <w:r>
           <w:rPr>
             <w:rStyle w:val="Hyperlink"/>
@@ -2839,7 +2839,7 @@
             <w:noProof/>
             <w:webHidden/>
           </w:rPr>
-          <w:instrText xml:space="preserve"> PAGEREF _Toc242224103 \h </w:instrText>
+          <w:instrText xml:space="preserve"> PAGEREF _Toc242435886 \h </w:instrText>
         </w:r>
         <w:r>
           <w:rPr>
@@ -2886,7 +2886,7 @@
           <w:lang w:eastAsia="nl-NL"/>
         </w:rPr>
       </w:pPr>
-      <w:hyperlink w:anchor="_Toc242224104" w:history="1">
+      <w:hyperlink w:anchor="_Toc242435887" w:history="1">
         <w:r>
           <w:rPr>
             <w:rStyle w:val="Hyperlink"/>
@@ -2931,7 +2931,7 @@
             <w:noProof/>
             <w:webHidden/>
           </w:rPr>
-          <w:instrText xml:space="preserve"> PAGEREF _Toc242224104 \h </w:instrText>
+          <w:instrText xml:space="preserve"> PAGEREF _Toc242435887 \h </w:instrText>
         </w:r>
         <w:r>
           <w:rPr>
@@ -2978,7 +2978,7 @@
           <w:lang w:eastAsia="nl-NL"/>
         </w:rPr>
       </w:pPr>
-      <w:hyperlink w:anchor="_Toc242224105" w:history="1">
+      <w:hyperlink w:anchor="_Toc242435888" w:history="1">
         <w:r>
           <w:rPr>
             <w:rStyle w:val="Hyperlink"/>
@@ -3023,7 +3023,7 @@
             <w:noProof/>
             <w:webHidden/>
           </w:rPr>
-          <w:instrText xml:space="preserve"> PAGEREF _Toc242224105 \h </w:instrText>
+          <w:instrText xml:space="preserve"> PAGEREF _Toc242435888 \h </w:instrText>
         </w:r>
         <w:r>
           <w:rPr>
@@ -3070,7 +3070,7 @@
           <w:lang w:eastAsia="nl-NL"/>
         </w:rPr>
       </w:pPr>
-      <w:hyperlink w:anchor="_Toc242224106" w:history="1">
+      <w:hyperlink w:anchor="_Toc242435889" w:history="1">
         <w:r>
           <w:rPr>
             <w:rStyle w:val="Hyperlink"/>
@@ -3131,7 +3131,7 @@
             <w:noProof/>
             <w:webHidden/>
           </w:rPr>
-          <w:instrText xml:space="preserve"> PAGEREF _Toc242224106 \h </w:instrText>
+          <w:instrText xml:space="preserve"> PAGEREF _Toc242435889 \h </w:instrText>
         </w:r>
         <w:r>
           <w:rPr>
@@ -3178,7 +3178,7 @@
           <w:lang w:eastAsia="nl-NL"/>
         </w:rPr>
       </w:pPr>
-      <w:hyperlink w:anchor="_Toc242224107" w:history="1">
+      <w:hyperlink w:anchor="_Toc242435890" w:history="1">
         <w:r>
           <w:rPr>
             <w:rStyle w:val="Hyperlink"/>
@@ -3223,7 +3223,7 @@
             <w:noProof/>
             <w:webHidden/>
           </w:rPr>
-          <w:instrText xml:space="preserve"> PAGEREF _Toc242224107 \h </w:instrText>
+          <w:instrText xml:space="preserve"> PAGEREF _Toc242435890 \h </w:instrText>
         </w:r>
         <w:r>
           <w:rPr>
@@ -3270,7 +3270,7 @@
           <w:lang w:eastAsia="nl-NL"/>
         </w:rPr>
       </w:pPr>
-      <w:hyperlink w:anchor="_Toc242224108" w:history="1">
+      <w:hyperlink w:anchor="_Toc242435891" w:history="1">
         <w:r>
           <w:rPr>
             <w:rStyle w:val="Hyperlink"/>
@@ -3315,7 +3315,7 @@
             <w:noProof/>
             <w:webHidden/>
           </w:rPr>
-          <w:instrText xml:space="preserve"> PAGEREF _Toc242224108 \h </w:instrText>
+          <w:instrText xml:space="preserve"> PAGEREF _Toc242435891 \h </w:instrText>
         </w:r>
         <w:r>
           <w:rPr>
@@ -3362,7 +3362,7 @@
           <w:lang w:eastAsia="nl-NL"/>
         </w:rPr>
       </w:pPr>
-      <w:hyperlink w:anchor="_Toc242224109" w:history="1">
+      <w:hyperlink w:anchor="_Toc242435892" w:history="1">
         <w:r>
           <w:rPr>
             <w:rStyle w:val="Hyperlink"/>
@@ -3409,7 +3409,7 @@
             <w:noProof/>
             <w:webHidden/>
           </w:rPr>
-          <w:instrText xml:space="preserve"> PAGEREF _Toc242224109 \h </w:instrText>
+          <w:instrText xml:space="preserve"> PAGEREF _Toc242435892 \h </w:instrText>
         </w:r>
         <w:r>
           <w:rPr>
@@ -3456,7 +3456,7 @@
           <w:lang w:eastAsia="nl-NL"/>
         </w:rPr>
       </w:pPr>
-      <w:hyperlink w:anchor="_Toc242224110" w:history="1">
+      <w:hyperlink w:anchor="_Toc242435893" w:history="1">
         <w:r>
           <w:rPr>
             <w:rStyle w:val="Hyperlink"/>
@@ -3503,7 +3503,7 @@
             <w:noProof/>
             <w:webHidden/>
           </w:rPr>
-          <w:instrText xml:space="preserve"> PAGEREF _Toc242224110 \h </w:instrText>
+          <w:instrText xml:space="preserve"> PAGEREF _Toc242435893 \h </w:instrText>
         </w:r>
         <w:r>
           <w:rPr>
@@ -3550,7 +3550,7 @@
           <w:lang w:eastAsia="nl-NL"/>
         </w:rPr>
       </w:pPr>
-      <w:hyperlink w:anchor="_Toc242224111" w:history="1">
+      <w:hyperlink w:anchor="_Toc242435894" w:history="1">
         <w:r>
           <w:rPr>
             <w:rStyle w:val="Hyperlink"/>
@@ -3597,7 +3597,7 @@
             <w:noProof/>
             <w:webHidden/>
           </w:rPr>
-          <w:instrText xml:space="preserve"> PAGEREF _Toc242224111 \h </w:instrText>
+          <w:instrText xml:space="preserve"> PAGEREF _Toc242435894 \h </w:instrText>
         </w:r>
         <w:r>
           <w:rPr>
@@ -3644,7 +3644,7 @@
           <w:lang w:eastAsia="nl-NL"/>
         </w:rPr>
       </w:pPr>
-      <w:hyperlink w:anchor="_Toc242224112" w:history="1">
+      <w:hyperlink w:anchor="_Toc242435895" w:history="1">
         <w:r>
           <w:rPr>
             <w:rStyle w:val="Hyperlink"/>
@@ -3691,7 +3691,7 @@
             <w:noProof/>
             <w:webHidden/>
           </w:rPr>
-          <w:instrText xml:space="preserve"> PAGEREF _Toc242224112 \h </w:instrText>
+          <w:instrText xml:space="preserve"> PAGEREF _Toc242435895 \h </w:instrText>
         </w:r>
         <w:r>
           <w:rPr>
@@ -3738,7 +3738,7 @@
           <w:lang w:eastAsia="nl-NL"/>
         </w:rPr>
       </w:pPr>
-      <w:hyperlink w:anchor="_Toc242224113" w:history="1">
+      <w:hyperlink w:anchor="_Toc242435896" w:history="1">
         <w:r>
           <w:rPr>
             <w:rStyle w:val="Hyperlink"/>
@@ -3785,7 +3785,7 @@
             <w:noProof/>
             <w:webHidden/>
           </w:rPr>
-          <w:instrText xml:space="preserve"> PAGEREF _Toc242224113 \h </w:instrText>
+          <w:instrText xml:space="preserve"> PAGEREF _Toc242435896 \h </w:instrText>
         </w:r>
         <w:r>
           <w:rPr>
@@ -3832,7 +3832,7 @@
           <w:lang w:eastAsia="nl-NL"/>
         </w:rPr>
       </w:pPr>
-      <w:hyperlink w:anchor="_Toc242224114" w:history="1">
+      <w:hyperlink w:anchor="_Toc242435897" w:history="1">
         <w:r>
           <w:rPr>
             <w:rStyle w:val="Hyperlink"/>
@@ -3879,7 +3879,7 @@
             <w:noProof/>
             <w:webHidden/>
           </w:rPr>
-          <w:instrText xml:space="preserve"> PAGEREF _Toc242224114 \h </w:instrText>
+          <w:instrText xml:space="preserve"> PAGEREF _Toc242435897 \h </w:instrText>
         </w:r>
         <w:r>
           <w:rPr>
@@ -3926,7 +3926,7 @@
           <w:lang w:eastAsia="nl-NL"/>
         </w:rPr>
       </w:pPr>
-      <w:hyperlink w:anchor="_Toc242224115" w:history="1">
+      <w:hyperlink w:anchor="_Toc242435898" w:history="1">
         <w:r>
           <w:rPr>
             <w:rStyle w:val="Hyperlink"/>
@@ -3971,7 +3971,7 @@
             <w:noProof/>
             <w:webHidden/>
           </w:rPr>
-          <w:instrText xml:space="preserve"> PAGEREF _Toc242224115 \h </w:instrText>
+          <w:instrText xml:space="preserve"> PAGEREF _Toc242435898 \h </w:instrText>
         </w:r>
         <w:r>
           <w:rPr>
@@ -4018,7 +4018,7 @@
           <w:lang w:eastAsia="nl-NL"/>
         </w:rPr>
       </w:pPr>
-      <w:hyperlink w:anchor="_Toc242224116" w:history="1">
+      <w:hyperlink w:anchor="_Toc242435899" w:history="1">
         <w:r>
           <w:rPr>
             <w:rStyle w:val="Hyperlink"/>
@@ -4063,7 +4063,7 @@
             <w:noProof/>
             <w:webHidden/>
           </w:rPr>
-          <w:instrText xml:space="preserve"> PAGEREF _Toc242224116 \h </w:instrText>
+          <w:instrText xml:space="preserve"> PAGEREF _Toc242435899 \h </w:instrText>
         </w:r>
         <w:r>
           <w:rPr>
@@ -4110,7 +4110,7 @@
           <w:lang w:eastAsia="nl-NL"/>
         </w:rPr>
       </w:pPr>
-      <w:hyperlink w:anchor="_Toc242224117" w:history="1">
+      <w:hyperlink w:anchor="_Toc242435900" w:history="1">
         <w:r>
           <w:rPr>
             <w:rStyle w:val="Hyperlink"/>
@@ -4187,7 +4187,7 @@
             <w:noProof/>
             <w:webHidden/>
           </w:rPr>
-          <w:instrText xml:space="preserve"> PAGEREF _Toc242224117 \h </w:instrText>
+          <w:instrText xml:space="preserve"> PAGEREF _Toc242435900 \h </w:instrText>
         </w:r>
         <w:r>
           <w:rPr>
@@ -4234,7 +4234,7 @@
           <w:lang w:eastAsia="nl-NL"/>
         </w:rPr>
       </w:pPr>
-      <w:hyperlink w:anchor="_Toc242224118" w:history="1">
+      <w:hyperlink w:anchor="_Toc242435901" w:history="1">
         <w:r>
           <w:rPr>
             <w:rStyle w:val="Hyperlink"/>
@@ -4279,7 +4279,7 @@
             <w:noProof/>
             <w:webHidden/>
           </w:rPr>
-          <w:instrText xml:space="preserve"> PAGEREF _Toc242224118 \h </w:instrText>
+          <w:instrText xml:space="preserve"> PAGEREF _Toc242435901 \h </w:instrText>
         </w:r>
         <w:r>
           <w:rPr>
@@ -4326,7 +4326,7 @@
           <w:lang w:eastAsia="nl-NL"/>
         </w:rPr>
       </w:pPr>
-      <w:hyperlink w:anchor="_Toc242224119" w:history="1">
+      <w:hyperlink w:anchor="_Toc242435902" w:history="1">
         <w:r>
           <w:rPr>
             <w:rStyle w:val="Hyperlink"/>
@@ -4371,7 +4371,7 @@
             <w:noProof/>
             <w:webHidden/>
           </w:rPr>
-          <w:instrText xml:space="preserve"> PAGEREF _Toc242224119 \h </w:instrText>
+          <w:instrText xml:space="preserve"> PAGEREF _Toc242435902 \h </w:instrText>
         </w:r>
         <w:r>
           <w:rPr>
@@ -4418,7 +4418,7 @@
           <w:lang w:eastAsia="nl-NL"/>
         </w:rPr>
       </w:pPr>
-      <w:hyperlink w:anchor="_Toc242224120" w:history="1">
+      <w:hyperlink w:anchor="_Toc242435903" w:history="1">
         <w:r>
           <w:rPr>
             <w:rStyle w:val="Hyperlink"/>
@@ -4463,7 +4463,7 @@
             <w:noProof/>
             <w:webHidden/>
           </w:rPr>
-          <w:instrText xml:space="preserve"> PAGEREF _Toc242224120 \h </w:instrText>
+          <w:instrText xml:space="preserve"> PAGEREF _Toc242435903 \h </w:instrText>
         </w:r>
         <w:r>
           <w:rPr>
@@ -4510,7 +4510,7 @@
           <w:lang w:eastAsia="nl-NL"/>
         </w:rPr>
       </w:pPr>
-      <w:hyperlink w:anchor="_Toc242224121" w:history="1">
+      <w:hyperlink w:anchor="_Toc242435904" w:history="1">
         <w:r>
           <w:rPr>
             <w:rStyle w:val="Hyperlink"/>
@@ -4555,7 +4555,7 @@
             <w:noProof/>
             <w:webHidden/>
           </w:rPr>
-          <w:instrText xml:space="preserve"> PAGEREF _Toc242224121 \h </w:instrText>
+          <w:instrText xml:space="preserve"> PAGEREF _Toc242435904 \h </w:instrText>
         </w:r>
         <w:r>
           <w:rPr>
@@ -4602,7 +4602,7 @@
           <w:lang w:eastAsia="nl-NL"/>
         </w:rPr>
       </w:pPr>
-      <w:hyperlink w:anchor="_Toc242224122" w:history="1">
+      <w:hyperlink w:anchor="_Toc242435905" w:history="1">
         <w:r>
           <w:rPr>
             <w:rStyle w:val="Hyperlink"/>
@@ -4647,7 +4647,7 @@
             <w:noProof/>
             <w:webHidden/>
           </w:rPr>
-          <w:instrText xml:space="preserve"> PAGEREF _Toc242224122 \h </w:instrText>
+          <w:instrText xml:space="preserve"> PAGEREF _Toc242435905 \h </w:instrText>
         </w:r>
         <w:r>
           <w:rPr>
@@ -4694,7 +4694,7 @@
           <w:lang w:eastAsia="nl-NL"/>
         </w:rPr>
       </w:pPr>
-      <w:hyperlink w:anchor="_Toc242224123" w:history="1">
+      <w:hyperlink w:anchor="_Toc242435906" w:history="1">
         <w:r>
           <w:rPr>
             <w:rStyle w:val="Hyperlink"/>
@@ -4739,7 +4739,7 @@
             <w:noProof/>
             <w:webHidden/>
           </w:rPr>
-          <w:instrText xml:space="preserve"> PAGEREF _Toc242224123 \h </w:instrText>
+          <w:instrText xml:space="preserve"> PAGEREF _Toc242435906 \h </w:instrText>
         </w:r>
         <w:r>
           <w:rPr>
@@ -4786,7 +4786,7 @@
           <w:lang w:eastAsia="nl-NL"/>
         </w:rPr>
       </w:pPr>
-      <w:hyperlink w:anchor="_Toc242224124" w:history="1">
+      <w:hyperlink w:anchor="_Toc242435907" w:history="1">
         <w:r>
           <w:rPr>
             <w:rStyle w:val="Hyperlink"/>
@@ -4831,7 +4831,7 @@
             <w:noProof/>
             <w:webHidden/>
           </w:rPr>
-          <w:instrText xml:space="preserve"> PAGEREF _Toc242224124 \h </w:instrText>
+          <w:instrText xml:space="preserve"> PAGEREF _Toc242435907 \h </w:instrText>
         </w:r>
         <w:r>
           <w:rPr>
@@ -4878,7 +4878,7 @@
           <w:lang w:eastAsia="nl-NL"/>
         </w:rPr>
       </w:pPr>
-      <w:hyperlink w:anchor="_Toc242224125" w:history="1">
+      <w:hyperlink w:anchor="_Toc242435908" w:history="1">
         <w:r>
           <w:rPr>
             <w:rStyle w:val="Hyperlink"/>
@@ -4923,7 +4923,7 @@
             <w:noProof/>
             <w:webHidden/>
           </w:rPr>
-          <w:instrText xml:space="preserve"> PAGEREF _Toc242224125 \h </w:instrText>
+          <w:instrText xml:space="preserve"> PAGEREF _Toc242435908 \h </w:instrText>
         </w:r>
         <w:r>
           <w:rPr>
@@ -4970,7 +4970,7 @@
           <w:lang w:eastAsia="nl-NL"/>
         </w:rPr>
       </w:pPr>
-      <w:hyperlink w:anchor="_Toc242224126" w:history="1">
+      <w:hyperlink w:anchor="_Toc242435909" w:history="1">
         <w:r>
           <w:rPr>
             <w:rStyle w:val="Hyperlink"/>
@@ -5015,7 +5015,7 @@
             <w:noProof/>
             <w:webHidden/>
           </w:rPr>
-          <w:instrText xml:space="preserve"> PAGEREF _Toc242224126 \h </w:instrText>
+          <w:instrText xml:space="preserve"> PAGEREF _Toc242435909 \h </w:instrText>
         </w:r>
         <w:r>
           <w:rPr>
@@ -5068,7 +5068,7 @@
         </w:numPr>
       </w:pPr>
       <w:bookmarkStart w:id="1" w:name="k1"/>
-      <w:bookmarkStart w:id="2" w:name="_Toc242224075"/>
+      <w:bookmarkStart w:id="2" w:name="_Toc242435858"/>
       <w:r>
         <w:t>DOEL VAN DE APPLICATIE.</w:t>
       </w:r>
@@ -5150,7 +5150,7 @@
         </w:numPr>
       </w:pPr>
       <w:bookmarkStart w:id="3" w:name="k2"/>
-      <w:bookmarkStart w:id="4" w:name="_Toc242224076"/>
+      <w:bookmarkStart w:id="4" w:name="_Toc242435859"/>
       <w:r>
         <w:t>BESTANDEN.</w:t>
       </w:r>
@@ -6125,7 +6125,7 @@
                 <w:sz w:val="14"/>
                 <w:shd w:val="clear" w:color="auto" w:fill="EEF4F2"/>
               </w:rPr>
-              <w:t>tools/build-docs.ps1</w:t>
+              <w:t>tools/md-to-docx.cjs</w:t>
             </w:r>
             <w:r>
               <w:rPr>
@@ -6140,7 +6140,7 @@
                 <w:sz w:val="14"/>
                 <w:shd w:val="clear" w:color="auto" w:fill="EEF4F2"/>
               </w:rPr>
-              <w:t>tools/md-to-docx.cjs</w:t>
+              <w:t>tools/word-bijwerken.ps1</w:t>
             </w:r>
           </w:p>
         </w:tc>
@@ -6991,7 +6991,7 @@
         </w:numPr>
       </w:pPr>
       <w:bookmarkStart w:id="5" w:name="k3"/>
-      <w:bookmarkStart w:id="6" w:name="_Toc242224077"/>
+      <w:bookmarkStart w:id="6" w:name="_Toc242435860"/>
       <w:r>
         <w:t>DE WEBSITE STARTEN.</w:t>
       </w:r>
@@ -7213,7 +7213,7 @@
         </w:numPr>
       </w:pPr>
       <w:bookmarkStart w:id="7" w:name="k4"/>
-      <w:bookmarkStart w:id="8" w:name="_Toc242224078"/>
+      <w:bookmarkStart w:id="8" w:name="_Toc242435861"/>
       <w:r>
         <w:t>GEBRUIKERSHANDLEIDING.</w:t>
       </w:r>
@@ -7226,7 +7226,7 @@
         <w:keepNext/>
       </w:pPr>
       <w:bookmarkStart w:id="9" w:name="k5"/>
-      <w:bookmarkStart w:id="10" w:name="_Toc242224079"/>
+      <w:bookmarkStart w:id="10" w:name="_Toc242435862"/>
       <w:r>
         <w:t>EEN MEDEWERKER ZOEKEN</w:t>
       </w:r>
@@ -7281,7 +7281,7 @@
         <w:keepNext/>
       </w:pPr>
       <w:bookmarkStart w:id="11" w:name="k6"/>
-      <w:bookmarkStart w:id="12" w:name="_Toc242224080"/>
+      <w:bookmarkStart w:id="12" w:name="_Toc242435863"/>
       <w:r>
         <w:t>EEN PRODUCT REGISTREREN</w:t>
       </w:r>
@@ -7492,7 +7492,7 @@
         <w:keepNext/>
       </w:pPr>
       <w:bookmarkStart w:id="13" w:name="k7"/>
-      <w:bookmarkStart w:id="14" w:name="_Toc242224081"/>
+      <w:bookmarkStart w:id="14" w:name="_Toc242435864"/>
       <w:r>
         <w:t>ADMIN-DASHBOARD OPENEN</w:t>
       </w:r>
@@ -7623,7 +7623,7 @@
         <w:keepNext/>
       </w:pPr>
       <w:bookmarkStart w:id="15" w:name="k8"/>
-      <w:bookmarkStart w:id="16" w:name="_Toc242224082"/>
+      <w:bookmarkStart w:id="16" w:name="_Toc242435865"/>
       <w:r>
         <w:t>REGISTRATIES BEHEREN</w:t>
       </w:r>
@@ -7854,7 +7854,7 @@
         <w:keepNext/>
       </w:pPr>
       <w:bookmarkStart w:id="17" w:name="k9"/>
-      <w:bookmarkStart w:id="18" w:name="_Toc242224083"/>
+      <w:bookmarkStart w:id="18" w:name="_Toc242435866"/>
       <w:r>
         <w:t>MEDEWERKERS BEHEREN</w:t>
       </w:r>
@@ -8089,7 +8089,7 @@
         <w:keepNext/>
       </w:pPr>
       <w:bookmarkStart w:id="19" w:name="k10"/>
-      <w:bookmarkStart w:id="20" w:name="_Toc242224084"/>
+      <w:bookmarkStart w:id="20" w:name="_Toc242435867"/>
       <w:r>
         <w:t>PRODUCTEN BEHEREN</w:t>
       </w:r>
@@ -8214,7 +8214,7 @@
         <w:keepNext/>
       </w:pPr>
       <w:bookmarkStart w:id="21" w:name="k11"/>
-      <w:bookmarkStart w:id="22" w:name="_Toc242224085"/>
+      <w:bookmarkStart w:id="22" w:name="_Toc242435868"/>
       <w:r>
         <w:t>BEDRIJVEN EN CONSUMPTIEPUNTEN BEHEREN</w:t>
       </w:r>
@@ -8377,7 +8377,7 @@
         <w:keepNext/>
       </w:pPr>
       <w:bookmarkStart w:id="23" w:name="k12"/>
-      <w:bookmarkStart w:id="24" w:name="_Toc242224086"/>
+      <w:bookmarkStart w:id="24" w:name="_Toc242435869"/>
       <w:r>
         <w:t>VOORRAAD BEHEREN</w:t>
       </w:r>
@@ -8595,7 +8595,7 @@
         <w:keepNext/>
       </w:pPr>
       <w:bookmarkStart w:id="25" w:name="k13"/>
-      <w:bookmarkStart w:id="26" w:name="_Toc242224087"/>
+      <w:bookmarkStart w:id="26" w:name="_Toc242435870"/>
       <w:r>
         <w:t>LOGBOEK BEKIJKEN</w:t>
       </w:r>
@@ -8635,7 +8635,7 @@
         <w:keepNext/>
       </w:pPr>
       <w:bookmarkStart w:id="27" w:name="k14"/>
-      <w:bookmarkStart w:id="28" w:name="_Toc242224088"/>
+      <w:bookmarkStart w:id="28" w:name="_Toc242435871"/>
       <w:r>
         <w:t>ALLE GEGEVENS WISSEN</w:t>
       </w:r>
@@ -8761,7 +8761,7 @@
         <w:keepNext/>
       </w:pPr>
       <w:bookmarkStart w:id="29" w:name="k15"/>
-      <w:bookmarkStart w:id="30" w:name="_Toc242224089"/>
+      <w:bookmarkStart w:id="30" w:name="_Toc242435872"/>
       <w:r>
         <w:t>MODAL SLUITEN EN UITLOGGEN</w:t>
       </w:r>
@@ -8790,7 +8790,7 @@
         <w:keepNext/>
       </w:pPr>
       <w:bookmarkStart w:id="31" w:name="k16"/>
-      <w:bookmarkStart w:id="32" w:name="_Toc242224090"/>
+      <w:bookmarkStart w:id="32" w:name="_Toc242435873"/>
       <w:r>
         <w:t>CSV EXPORTEREN</w:t>
       </w:r>
@@ -9127,7 +9127,7 @@
         <w:keepNext/>
       </w:pPr>
       <w:bookmarkStart w:id="33" w:name="k17"/>
-      <w:bookmarkStart w:id="34" w:name="_Toc242224091"/>
+      <w:bookmarkStart w:id="34" w:name="_Toc242435874"/>
       <w:r>
         <w:t>LICHT OF DONKER THEMA</w:t>
       </w:r>
@@ -9234,7 +9234,7 @@
         <w:keepNext/>
       </w:pPr>
       <w:bookmarkStart w:id="35" w:name="k18"/>
-      <w:bookmarkStart w:id="36" w:name="_Toc242224092"/>
+      <w:bookmarkStart w:id="36" w:name="_Toc242435875"/>
       <w:r>
         <w:t>WELKOM EN "ZELFDE ALS VORIGE KEER"</w:t>
       </w:r>
@@ -9307,7 +9307,7 @@
         <w:keepNext/>
       </w:pPr>
       <w:bookmarkStart w:id="37" w:name="k19"/>
-      <w:bookmarkStart w:id="38" w:name="_Toc242224093"/>
+      <w:bookmarkStart w:id="38" w:name="_Toc242435876"/>
       <w:r>
         <w:t>DEMO GEZICHTSHERKENNING</w:t>
       </w:r>
@@ -9515,7 +9515,7 @@
         </w:numPr>
       </w:pPr>
       <w:bookmarkStart w:id="39" w:name="k20"/>
-      <w:bookmarkStart w:id="40" w:name="_Toc242224094"/>
+      <w:bookmarkStart w:id="40" w:name="_Toc242435877"/>
       <w:r>
         <w:t xml:space="preserve">UITLEG VAN </w:t>
       </w:r>
@@ -9539,7 +9539,7 @@
         <w:keepNext/>
       </w:pPr>
       <w:bookmarkStart w:id="41" w:name="k21"/>
-      <w:bookmarkStart w:id="42" w:name="_Toc242224095"/>
+      <w:bookmarkStart w:id="42" w:name="_Toc242435878"/>
       <w:r>
         <w:t>METADATA EN EXTERNE BESTANDEN</w:t>
       </w:r>
@@ -9815,7 +9815,7 @@
         <w:keepNext/>
       </w:pPr>
       <w:bookmarkStart w:id="43" w:name="k22"/>
-      <w:bookmarkStart w:id="44" w:name="_Toc242224096"/>
+      <w:bookmarkStart w:id="44" w:name="_Toc242435879"/>
       <w:r>
         <w:t>NAVIGATIEBALK</w:t>
       </w:r>
@@ -10028,7 +10028,7 @@
         <w:keepNext/>
       </w:pPr>
       <w:bookmarkStart w:id="45" w:name="k23"/>
-      <w:bookmarkStart w:id="46" w:name="_Toc242224097"/>
+      <w:bookmarkStart w:id="46" w:name="_Toc242435880"/>
       <w:r>
         <w:t>HERO-GEDEELTE</w:t>
       </w:r>
@@ -10073,7 +10073,7 @@
         <w:keepNext/>
       </w:pPr>
       <w:bookmarkStart w:id="47" w:name="k24"/>
-      <w:bookmarkStart w:id="48" w:name="_Toc242224098"/>
+      <w:bookmarkStart w:id="48" w:name="_Toc242435881"/>
       <w:r>
         <w:t>MEDEWERKERLIJST</w:t>
       </w:r>
@@ -10336,7 +10336,7 @@
         <w:keepNext/>
       </w:pPr>
       <w:bookmarkStart w:id="49" w:name="k25"/>
-      <w:bookmarkStart w:id="50" w:name="_Toc242224099"/>
+      <w:bookmarkStart w:id="50" w:name="_Toc242435882"/>
       <w:r>
         <w:t>STATISTIEKEN</w:t>
       </w:r>
@@ -10419,7 +10419,7 @@
         <w:keepNext/>
       </w:pPr>
       <w:bookmarkStart w:id="51" w:name="k26"/>
-      <w:bookmarkStart w:id="52" w:name="_Toc242224100"/>
+      <w:bookmarkStart w:id="52" w:name="_Toc242435883"/>
       <w:r>
         <w:t>VENSTERS (MODALS)</w:t>
       </w:r>
@@ -10932,7 +10932,7 @@
         <w:keepNext/>
       </w:pPr>
       <w:bookmarkStart w:id="53" w:name="k27"/>
-      <w:bookmarkStart w:id="54" w:name="_Toc242224101"/>
+      <w:bookmarkStart w:id="54" w:name="_Toc242435884"/>
       <w:r>
         <w:t>WAARSCHUWING BIJ OPENEN ALS LOS BESTAND</w:t>
       </w:r>
@@ -10977,7 +10977,7 @@
         </w:numPr>
       </w:pPr>
       <w:bookmarkStart w:id="55" w:name="k28"/>
-      <w:bookmarkStart w:id="56" w:name="_Toc242224102"/>
+      <w:bookmarkStart w:id="56" w:name="_Toc242435885"/>
       <w:r>
         <w:t xml:space="preserve">UITLEG VAN </w:t>
       </w:r>
@@ -11001,7 +11001,7 @@
         <w:keepNext/>
       </w:pPr>
       <w:bookmarkStart w:id="57" w:name="k29"/>
-      <w:bookmarkStart w:id="58" w:name="_Toc242224103"/>
+      <w:bookmarkStart w:id="58" w:name="_Toc242435886"/>
       <w:r>
         <w:t>CSS-VARIABELEN</w:t>
       </w:r>
@@ -11610,7 +11610,7 @@
         <w:keepNext/>
       </w:pPr>
       <w:bookmarkStart w:id="59" w:name="k30"/>
-      <w:bookmarkStart w:id="60" w:name="_Toc242224104"/>
+      <w:bookmarkStart w:id="60" w:name="_Toc242435887"/>
       <w:r>
         <w:t>LAYOUT</w:t>
       </w:r>
@@ -12131,7 +12131,7 @@
         <w:keepNext/>
       </w:pPr>
       <w:bookmarkStart w:id="61" w:name="k31"/>
-      <w:bookmarkStart w:id="62" w:name="_Toc242224105"/>
+      <w:bookmarkStart w:id="62" w:name="_Toc242435888"/>
       <w:r>
         <w:t>COMPONENTEN</w:t>
       </w:r>
@@ -12354,7 +12354,7 @@
         </w:numPr>
       </w:pPr>
       <w:bookmarkStart w:id="63" w:name="k32"/>
-      <w:bookmarkStart w:id="64" w:name="_Toc242224106"/>
+      <w:bookmarkStart w:id="64" w:name="_Toc242435889"/>
       <w:r>
         <w:t>UITLEG VAN DE JAVASCRIPT (</w:t>
       </w:r>
@@ -12378,7 +12378,7 @@
         <w:keepNext/>
       </w:pPr>
       <w:bookmarkStart w:id="65" w:name="k33"/>
-      <w:bookmarkStart w:id="66" w:name="_Toc242224107"/>
+      <w:bookmarkStart w:id="66" w:name="_Toc242435890"/>
       <w:r>
         <w:t>OPSLAG EN VOORBEELDDATA</w:t>
       </w:r>
@@ -13141,7 +13141,7 @@
         <w:keepNext/>
       </w:pPr>
       <w:bookmarkStart w:id="67" w:name="k34"/>
-      <w:bookmarkStart w:id="68" w:name="_Toc242224108"/>
+      <w:bookmarkStart w:id="68" w:name="_Toc242435891"/>
       <w:r>
         <w:t>OBJECTGEORIËNTEERDE STRUCTUUR</w:t>
       </w:r>
@@ -15257,7 +15257,7 @@
         <w:keepNext/>
       </w:pPr>
       <w:bookmarkStart w:id="77" w:name="k43"/>
-      <w:bookmarkStart w:id="78" w:name="_Toc242224109"/>
+      <w:bookmarkStart w:id="78" w:name="_Toc242435892"/>
       <w:r>
         <w:rPr>
           <w:rFonts w:ascii="Consolas" w:hAnsi="Consolas" w:cs="Consolas"/>
@@ -15400,7 +15400,7 @@
         <w:keepNext/>
       </w:pPr>
       <w:bookmarkStart w:id="79" w:name="k44"/>
-      <w:bookmarkStart w:id="80" w:name="_Toc242224110"/>
+      <w:bookmarkStart w:id="80" w:name="_Toc242435893"/>
       <w:r>
         <w:rPr>
           <w:rFonts w:ascii="Consolas" w:hAnsi="Consolas" w:cs="Consolas"/>
@@ -15477,7 +15477,7 @@
         <w:keepNext/>
       </w:pPr>
       <w:bookmarkStart w:id="81" w:name="k45"/>
-      <w:bookmarkStart w:id="82" w:name="_Toc242224111"/>
+      <w:bookmarkStart w:id="82" w:name="_Toc242435894"/>
       <w:r>
         <w:rPr>
           <w:rFonts w:ascii="Consolas" w:hAnsi="Consolas" w:cs="Consolas"/>
@@ -15626,7 +15626,7 @@
         <w:keepNext/>
       </w:pPr>
       <w:bookmarkStart w:id="83" w:name="k46"/>
-      <w:bookmarkStart w:id="84" w:name="_Toc242224112"/>
+      <w:bookmarkStart w:id="84" w:name="_Toc242435895"/>
       <w:r>
         <w:rPr>
           <w:rFonts w:ascii="Consolas" w:hAnsi="Consolas" w:cs="Consolas"/>
@@ -15693,7 +15693,7 @@
         <w:keepNext/>
       </w:pPr>
       <w:bookmarkStart w:id="85" w:name="k47"/>
-      <w:bookmarkStart w:id="86" w:name="_Toc242224113"/>
+      <w:bookmarkStart w:id="86" w:name="_Toc242435896"/>
       <w:r>
         <w:rPr>
           <w:rFonts w:ascii="Consolas" w:hAnsi="Consolas" w:cs="Consolas"/>
@@ -15793,7 +15793,7 @@
         <w:keepNext/>
       </w:pPr>
       <w:bookmarkStart w:id="87" w:name="k48"/>
-      <w:bookmarkStart w:id="88" w:name="_Toc242224114"/>
+      <w:bookmarkStart w:id="88" w:name="_Toc242435897"/>
       <w:r>
         <w:rPr>
           <w:rFonts w:ascii="Consolas" w:hAnsi="Consolas" w:cs="Consolas"/>
@@ -15838,7 +15838,7 @@
         <w:keepNext/>
       </w:pPr>
       <w:bookmarkStart w:id="89" w:name="k49"/>
-      <w:bookmarkStart w:id="90" w:name="_Toc242224115"/>
+      <w:bookmarkStart w:id="90" w:name="_Toc242435898"/>
       <w:r>
         <w:t>OPSLAGFOUTEN EN TERUGDRAAIEN</w:t>
       </w:r>
@@ -15878,7 +15878,7 @@
         <w:keepNext/>
       </w:pPr>
       <w:bookmarkStart w:id="91" w:name="k50"/>
-      <w:bookmarkStart w:id="92" w:name="_Toc242224116"/>
+      <w:bookmarkStart w:id="92" w:name="_Toc242435899"/>
       <w:r>
         <w:t>ADMINFUNCTIES</w:t>
       </w:r>
@@ -16080,7 +16080,7 @@
         <w:keepNext/>
       </w:pPr>
       <w:bookmarkStart w:id="93" w:name="k51"/>
-      <w:bookmarkStart w:id="94" w:name="_Toc242224117"/>
+      <w:bookmarkStart w:id="94" w:name="_Toc242435900"/>
       <w:r>
         <w:t xml:space="preserve">CSV-EXPORT (CLASS </w:t>
       </w:r>
@@ -16488,7 +16488,7 @@
         <w:keepNext/>
       </w:pPr>
       <w:bookmarkStart w:id="95" w:name="k52"/>
-      <w:bookmarkStart w:id="96" w:name="_Toc242224118"/>
+      <w:bookmarkStart w:id="96" w:name="_Toc242435901"/>
       <w:r>
         <w:t>EVENT LISTENERS</w:t>
       </w:r>
@@ -17093,7 +17093,7 @@
         </w:numPr>
       </w:pPr>
       <w:bookmarkStart w:id="97" w:name="k53"/>
-      <w:bookmarkStart w:id="98" w:name="_Toc242224119"/>
+      <w:bookmarkStart w:id="98" w:name="_Toc242435902"/>
       <w:r>
         <w:t>DATAMODEL EN KOPPELINGEN.</w:t>
       </w:r>
@@ -17111,7 +17111,7 @@
         <w:keepNext/>
       </w:pPr>
       <w:bookmarkStart w:id="99" w:name="k54"/>
-      <w:bookmarkStart w:id="100" w:name="_Toc242224120"/>
+      <w:bookmarkStart w:id="100" w:name="_Toc242435903"/>
       <w:r>
         <w:t>BEDRIJVEN</w:t>
       </w:r>
@@ -17322,7 +17322,7 @@
         <w:keepNext/>
       </w:pPr>
       <w:bookmarkStart w:id="101" w:name="k55"/>
-      <w:bookmarkStart w:id="102" w:name="_Toc242224121"/>
+      <w:bookmarkStart w:id="102" w:name="_Toc242435904"/>
       <w:r>
         <w:t>CONSUMPTIEPUNTEN</w:t>
       </w:r>
@@ -17641,7 +17641,7 @@
         <w:keepNext/>
       </w:pPr>
       <w:bookmarkStart w:id="103" w:name="k56"/>
-      <w:bookmarkStart w:id="104" w:name="_Toc242224122"/>
+      <w:bookmarkStart w:id="104" w:name="_Toc242435905"/>
       <w:r>
         <w:t>MEDEWERKERS</w:t>
       </w:r>
@@ -18112,7 +18112,7 @@
         <w:keepNext/>
       </w:pPr>
       <w:bookmarkStart w:id="105" w:name="k57"/>
-      <w:bookmarkStart w:id="106" w:name="_Toc242224123"/>
+      <w:bookmarkStart w:id="106" w:name="_Toc242435906"/>
       <w:r>
         <w:t>REGISTRATIES</w:t>
       </w:r>
@@ -18678,7 +18678,7 @@
         </w:numPr>
       </w:pPr>
       <w:bookmarkStart w:id="107" w:name="k58"/>
-      <w:bookmarkStart w:id="108" w:name="_Toc242224124"/>
+      <w:bookmarkStart w:id="108" w:name="_Toc242435907"/>
       <w:r>
         <w:t>BELANGRIJKE DEMO-BEPERKINGEN.</w:t>
       </w:r>
@@ -18941,7 +18941,7 @@
         </w:numPr>
       </w:pPr>
       <w:bookmarkStart w:id="109" w:name="k59"/>
-      <w:bookmarkStart w:id="110" w:name="_Toc242224125"/>
+      <w:bookmarkStart w:id="110" w:name="_Toc242435908"/>
       <w:r>
         <w:t>CODE UITLEGGEN TIJDENS EEN PRESENTATIE.</w:t>
       </w:r>
@@ -19226,7 +19226,7 @@
         </w:numPr>
       </w:pPr>
       <w:bookmarkStart w:id="111" w:name="k60"/>
-      <w:bookmarkStart w:id="112" w:name="_Toc242224126"/>
+      <w:bookmarkStart w:id="112" w:name="_Toc242435909"/>
       <w:r>
         <w:t>MOGELIJKE VERVOLGSTAPPEN.</w:t>
       </w:r>

</xml_diff>

<commit_message>
Node.js valt af als backend voor productie, README over de tests op GitHub en Word-bestanden bijgewerkt
</commit_message>
<xml_diff>
--- a/docs/DOCUMENTATIE.docx
+++ b/docs/DOCUMENTATIE.docx
@@ -82,7 +82,7 @@
           <w:numId w:val="0"/>
         </w:numPr>
       </w:pPr>
-      <w:bookmarkStart w:id="0" w:name="_Toc242437634"/>
+      <w:bookmarkStart w:id="0" w:name="_Toc242686878"/>
       <w:r>
         <w:t>INHOUDSOPGAVE.</w:t>
       </w:r>
@@ -112,7 +112,7 @@
       <w:r>
         <w:fldChar w:fldCharType="separate"/>
       </w:r>
-      <w:hyperlink w:anchor="_Toc242437634" w:history="1">
+      <w:hyperlink w:anchor="_Toc242686878" w:history="1">
         <w:r>
           <w:rPr>
             <w:rStyle w:val="Hyperlink"/>
@@ -139,7 +139,7 @@
             <w:noProof/>
             <w:webHidden/>
           </w:rPr>
-          <w:instrText xml:space="preserve"> PAGEREF _Toc242437634 \h </w:instrText>
+          <w:instrText xml:space="preserve"> PAGEREF _Toc242686878 \h </w:instrText>
         </w:r>
         <w:r>
           <w:rPr>
@@ -186,7 +186,7 @@
           <w:lang w:eastAsia="nl-NL"/>
         </w:rPr>
       </w:pPr>
-      <w:hyperlink w:anchor="_Toc242437635" w:history="1">
+      <w:hyperlink w:anchor="_Toc242686879" w:history="1">
         <w:r>
           <w:rPr>
             <w:rStyle w:val="Hyperlink"/>
@@ -231,7 +231,7 @@
             <w:noProof/>
             <w:webHidden/>
           </w:rPr>
-          <w:instrText xml:space="preserve"> PAGEREF _Toc242437635 \h </w:instrText>
+          <w:instrText xml:space="preserve"> PAGEREF _Toc242686879 \h </w:instrText>
         </w:r>
         <w:r>
           <w:rPr>
@@ -278,7 +278,7 @@
           <w:lang w:eastAsia="nl-NL"/>
         </w:rPr>
       </w:pPr>
-      <w:hyperlink w:anchor="_Toc242437636" w:history="1">
+      <w:hyperlink w:anchor="_Toc242686880" w:history="1">
         <w:r>
           <w:rPr>
             <w:rStyle w:val="Hyperlink"/>
@@ -323,7 +323,7 @@
             <w:noProof/>
             <w:webHidden/>
           </w:rPr>
-          <w:instrText xml:space="preserve"> PAGEREF _Toc242437636 \h </w:instrText>
+          <w:instrText xml:space="preserve"> PAGEREF _Toc242686880 \h </w:instrText>
         </w:r>
         <w:r>
           <w:rPr>
@@ -370,7 +370,7 @@
           <w:lang w:eastAsia="nl-NL"/>
         </w:rPr>
       </w:pPr>
-      <w:hyperlink w:anchor="_Toc242437637" w:history="1">
+      <w:hyperlink w:anchor="_Toc242686881" w:history="1">
         <w:r>
           <w:rPr>
             <w:rStyle w:val="Hyperlink"/>
@@ -415,7 +415,7 @@
             <w:noProof/>
             <w:webHidden/>
           </w:rPr>
-          <w:instrText xml:space="preserve"> PAGEREF _Toc242437637 \h </w:instrText>
+          <w:instrText xml:space="preserve"> PAGEREF _Toc242686881 \h </w:instrText>
         </w:r>
         <w:r>
           <w:rPr>
@@ -435,7 +435,7 @@
             <w:noProof/>
             <w:webHidden/>
           </w:rPr>
-          <w:t>7</w:t>
+          <w:t>8</w:t>
         </w:r>
         <w:r>
           <w:rPr>
@@ -462,7 +462,7 @@
           <w:lang w:eastAsia="nl-NL"/>
         </w:rPr>
       </w:pPr>
-      <w:hyperlink w:anchor="_Toc242437638" w:history="1">
+      <w:hyperlink w:anchor="_Toc242686882" w:history="1">
         <w:r>
           <w:rPr>
             <w:rStyle w:val="Hyperlink"/>
@@ -507,7 +507,7 @@
             <w:noProof/>
             <w:webHidden/>
           </w:rPr>
-          <w:instrText xml:space="preserve"> PAGEREF _Toc242437638 \h </w:instrText>
+          <w:instrText xml:space="preserve"> PAGEREF _Toc242686882 \h </w:instrText>
         </w:r>
         <w:r>
           <w:rPr>
@@ -527,7 +527,7 @@
             <w:noProof/>
             <w:webHidden/>
           </w:rPr>
-          <w:t>8</w:t>
+          <w:t>9</w:t>
         </w:r>
         <w:r>
           <w:rPr>
@@ -554,7 +554,7 @@
           <w:lang w:eastAsia="nl-NL"/>
         </w:rPr>
       </w:pPr>
-      <w:hyperlink w:anchor="_Toc242437639" w:history="1">
+      <w:hyperlink w:anchor="_Toc242686883" w:history="1">
         <w:r>
           <w:rPr>
             <w:rStyle w:val="Hyperlink"/>
@@ -599,7 +599,7 @@
             <w:noProof/>
             <w:webHidden/>
           </w:rPr>
-          <w:instrText xml:space="preserve"> PAGEREF _Toc242437639 \h </w:instrText>
+          <w:instrText xml:space="preserve"> PAGEREF _Toc242686883 \h </w:instrText>
         </w:r>
         <w:r>
           <w:rPr>
@@ -619,7 +619,7 @@
             <w:noProof/>
             <w:webHidden/>
           </w:rPr>
-          <w:t>8</w:t>
+          <w:t>9</w:t>
         </w:r>
         <w:r>
           <w:rPr>
@@ -646,7 +646,7 @@
           <w:lang w:eastAsia="nl-NL"/>
         </w:rPr>
       </w:pPr>
-      <w:hyperlink w:anchor="_Toc242437640" w:history="1">
+      <w:hyperlink w:anchor="_Toc242686884" w:history="1">
         <w:r>
           <w:rPr>
             <w:rStyle w:val="Hyperlink"/>
@@ -691,7 +691,7 @@
             <w:noProof/>
             <w:webHidden/>
           </w:rPr>
-          <w:instrText xml:space="preserve"> PAGEREF _Toc242437640 \h </w:instrText>
+          <w:instrText xml:space="preserve"> PAGEREF _Toc242686884 \h </w:instrText>
         </w:r>
         <w:r>
           <w:rPr>
@@ -711,7 +711,7 @@
             <w:noProof/>
             <w:webHidden/>
           </w:rPr>
-          <w:t>8</w:t>
+          <w:t>9</w:t>
         </w:r>
         <w:r>
           <w:rPr>
@@ -738,7 +738,7 @@
           <w:lang w:eastAsia="nl-NL"/>
         </w:rPr>
       </w:pPr>
-      <w:hyperlink w:anchor="_Toc242437641" w:history="1">
+      <w:hyperlink w:anchor="_Toc242686885" w:history="1">
         <w:r>
           <w:rPr>
             <w:rStyle w:val="Hyperlink"/>
@@ -783,7 +783,7 @@
             <w:noProof/>
             <w:webHidden/>
           </w:rPr>
-          <w:instrText xml:space="preserve"> PAGEREF _Toc242437641 \h </w:instrText>
+          <w:instrText xml:space="preserve"> PAGEREF _Toc242686885 \h </w:instrText>
         </w:r>
         <w:r>
           <w:rPr>
@@ -803,7 +803,7 @@
             <w:noProof/>
             <w:webHidden/>
           </w:rPr>
-          <w:t>8</w:t>
+          <w:t>9</w:t>
         </w:r>
         <w:r>
           <w:rPr>
@@ -830,7 +830,7 @@
           <w:lang w:eastAsia="nl-NL"/>
         </w:rPr>
       </w:pPr>
-      <w:hyperlink w:anchor="_Toc242437642" w:history="1">
+      <w:hyperlink w:anchor="_Toc242686886" w:history="1">
         <w:r>
           <w:rPr>
             <w:rStyle w:val="Hyperlink"/>
@@ -875,7 +875,7 @@
             <w:noProof/>
             <w:webHidden/>
           </w:rPr>
-          <w:instrText xml:space="preserve"> PAGEREF _Toc242437642 \h </w:instrText>
+          <w:instrText xml:space="preserve"> PAGEREF _Toc242686886 \h </w:instrText>
         </w:r>
         <w:r>
           <w:rPr>
@@ -895,7 +895,7 @@
             <w:noProof/>
             <w:webHidden/>
           </w:rPr>
-          <w:t>8</w:t>
+          <w:t>9</w:t>
         </w:r>
         <w:r>
           <w:rPr>
@@ -922,7 +922,7 @@
           <w:lang w:eastAsia="nl-NL"/>
         </w:rPr>
       </w:pPr>
-      <w:hyperlink w:anchor="_Toc242437643" w:history="1">
+      <w:hyperlink w:anchor="_Toc242686887" w:history="1">
         <w:r>
           <w:rPr>
             <w:rStyle w:val="Hyperlink"/>
@@ -967,7 +967,7 @@
             <w:noProof/>
             <w:webHidden/>
           </w:rPr>
-          <w:instrText xml:space="preserve"> PAGEREF _Toc242437643 \h </w:instrText>
+          <w:instrText xml:space="preserve"> PAGEREF _Toc242686887 \h </w:instrText>
         </w:r>
         <w:r>
           <w:rPr>
@@ -987,7 +987,7 @@
             <w:noProof/>
             <w:webHidden/>
           </w:rPr>
-          <w:t>9</w:t>
+          <w:t>10</w:t>
         </w:r>
         <w:r>
           <w:rPr>
@@ -1014,7 +1014,7 @@
           <w:lang w:eastAsia="nl-NL"/>
         </w:rPr>
       </w:pPr>
-      <w:hyperlink w:anchor="_Toc242437644" w:history="1">
+      <w:hyperlink w:anchor="_Toc242686888" w:history="1">
         <w:r>
           <w:rPr>
             <w:rStyle w:val="Hyperlink"/>
@@ -1059,7 +1059,7 @@
             <w:noProof/>
             <w:webHidden/>
           </w:rPr>
-          <w:instrText xml:space="preserve"> PAGEREF _Toc242437644 \h </w:instrText>
+          <w:instrText xml:space="preserve"> PAGEREF _Toc242686888 \h </w:instrText>
         </w:r>
         <w:r>
           <w:rPr>
@@ -1079,7 +1079,7 @@
             <w:noProof/>
             <w:webHidden/>
           </w:rPr>
-          <w:t>10</w:t>
+          <w:t>11</w:t>
         </w:r>
         <w:r>
           <w:rPr>
@@ -1106,7 +1106,7 @@
           <w:lang w:eastAsia="nl-NL"/>
         </w:rPr>
       </w:pPr>
-      <w:hyperlink w:anchor="_Toc242437645" w:history="1">
+      <w:hyperlink w:anchor="_Toc242686889" w:history="1">
         <w:r>
           <w:rPr>
             <w:rStyle w:val="Hyperlink"/>
@@ -1151,7 +1151,7 @@
             <w:noProof/>
             <w:webHidden/>
           </w:rPr>
-          <w:instrText xml:space="preserve"> PAGEREF _Toc242437645 \h </w:instrText>
+          <w:instrText xml:space="preserve"> PAGEREF _Toc242686889 \h </w:instrText>
         </w:r>
         <w:r>
           <w:rPr>
@@ -1171,7 +1171,7 @@
             <w:noProof/>
             <w:webHidden/>
           </w:rPr>
-          <w:t>10</w:t>
+          <w:t>11</w:t>
         </w:r>
         <w:r>
           <w:rPr>
@@ -1198,7 +1198,7 @@
           <w:lang w:eastAsia="nl-NL"/>
         </w:rPr>
       </w:pPr>
-      <w:hyperlink w:anchor="_Toc242437646" w:history="1">
+      <w:hyperlink w:anchor="_Toc242686890" w:history="1">
         <w:r>
           <w:rPr>
             <w:rStyle w:val="Hyperlink"/>
@@ -1243,7 +1243,7 @@
             <w:noProof/>
             <w:webHidden/>
           </w:rPr>
-          <w:instrText xml:space="preserve"> PAGEREF _Toc242437646 \h </w:instrText>
+          <w:instrText xml:space="preserve"> PAGEREF _Toc242686890 \h </w:instrText>
         </w:r>
         <w:r>
           <w:rPr>
@@ -1263,7 +1263,7 @@
             <w:noProof/>
             <w:webHidden/>
           </w:rPr>
-          <w:t>11</w:t>
+          <w:t>12</w:t>
         </w:r>
         <w:r>
           <w:rPr>
@@ -1290,7 +1290,7 @@
           <w:lang w:eastAsia="nl-NL"/>
         </w:rPr>
       </w:pPr>
-      <w:hyperlink w:anchor="_Toc242437647" w:history="1">
+      <w:hyperlink w:anchor="_Toc242686891" w:history="1">
         <w:r>
           <w:rPr>
             <w:rStyle w:val="Hyperlink"/>
@@ -1335,7 +1335,7 @@
             <w:noProof/>
             <w:webHidden/>
           </w:rPr>
-          <w:instrText xml:space="preserve"> PAGEREF _Toc242437647 \h </w:instrText>
+          <w:instrText xml:space="preserve"> PAGEREF _Toc242686891 \h </w:instrText>
         </w:r>
         <w:r>
           <w:rPr>
@@ -1355,7 +1355,7 @@
             <w:noProof/>
             <w:webHidden/>
           </w:rPr>
-          <w:t>11</w:t>
+          <w:t>12</w:t>
         </w:r>
         <w:r>
           <w:rPr>
@@ -1382,7 +1382,7 @@
           <w:lang w:eastAsia="nl-NL"/>
         </w:rPr>
       </w:pPr>
-      <w:hyperlink w:anchor="_Toc242437648" w:history="1">
+      <w:hyperlink w:anchor="_Toc242686892" w:history="1">
         <w:r>
           <w:rPr>
             <w:rStyle w:val="Hyperlink"/>
@@ -1427,7 +1427,7 @@
             <w:noProof/>
             <w:webHidden/>
           </w:rPr>
-          <w:instrText xml:space="preserve"> PAGEREF _Toc242437648 \h </w:instrText>
+          <w:instrText xml:space="preserve"> PAGEREF _Toc242686892 \h </w:instrText>
         </w:r>
         <w:r>
           <w:rPr>
@@ -1447,7 +1447,7 @@
             <w:noProof/>
             <w:webHidden/>
           </w:rPr>
-          <w:t>11</w:t>
+          <w:t>12</w:t>
         </w:r>
         <w:r>
           <w:rPr>
@@ -1474,7 +1474,7 @@
           <w:lang w:eastAsia="nl-NL"/>
         </w:rPr>
       </w:pPr>
-      <w:hyperlink w:anchor="_Toc242437649" w:history="1">
+      <w:hyperlink w:anchor="_Toc242686893" w:history="1">
         <w:r>
           <w:rPr>
             <w:rStyle w:val="Hyperlink"/>
@@ -1519,7 +1519,7 @@
             <w:noProof/>
             <w:webHidden/>
           </w:rPr>
-          <w:instrText xml:space="preserve"> PAGEREF _Toc242437649 \h </w:instrText>
+          <w:instrText xml:space="preserve"> PAGEREF _Toc242686893 \h </w:instrText>
         </w:r>
         <w:r>
           <w:rPr>
@@ -1539,7 +1539,7 @@
             <w:noProof/>
             <w:webHidden/>
           </w:rPr>
-          <w:t>12</w:t>
+          <w:t>13</w:t>
         </w:r>
         <w:r>
           <w:rPr>
@@ -1566,7 +1566,7 @@
           <w:lang w:eastAsia="nl-NL"/>
         </w:rPr>
       </w:pPr>
-      <w:hyperlink w:anchor="_Toc242437650" w:history="1">
+      <w:hyperlink w:anchor="_Toc242686894" w:history="1">
         <w:r>
           <w:rPr>
             <w:rStyle w:val="Hyperlink"/>
@@ -1611,7 +1611,7 @@
             <w:noProof/>
             <w:webHidden/>
           </w:rPr>
-          <w:instrText xml:space="preserve"> PAGEREF _Toc242437650 \h </w:instrText>
+          <w:instrText xml:space="preserve"> PAGEREF _Toc242686894 \h </w:instrText>
         </w:r>
         <w:r>
           <w:rPr>
@@ -1631,7 +1631,7 @@
             <w:noProof/>
             <w:webHidden/>
           </w:rPr>
-          <w:t>12</w:t>
+          <w:t>13</w:t>
         </w:r>
         <w:r>
           <w:rPr>
@@ -1658,7 +1658,7 @@
           <w:lang w:eastAsia="nl-NL"/>
         </w:rPr>
       </w:pPr>
-      <w:hyperlink w:anchor="_Toc242437651" w:history="1">
+      <w:hyperlink w:anchor="_Toc242686895" w:history="1">
         <w:r>
           <w:rPr>
             <w:rStyle w:val="Hyperlink"/>
@@ -1703,7 +1703,7 @@
             <w:noProof/>
             <w:webHidden/>
           </w:rPr>
-          <w:instrText xml:space="preserve"> PAGEREF _Toc242437651 \h </w:instrText>
+          <w:instrText xml:space="preserve"> PAGEREF _Toc242686895 \h </w:instrText>
         </w:r>
         <w:r>
           <w:rPr>
@@ -1723,7 +1723,7 @@
             <w:noProof/>
             <w:webHidden/>
           </w:rPr>
-          <w:t>12</w:t>
+          <w:t>13</w:t>
         </w:r>
         <w:r>
           <w:rPr>
@@ -1750,7 +1750,7 @@
           <w:lang w:eastAsia="nl-NL"/>
         </w:rPr>
       </w:pPr>
-      <w:hyperlink w:anchor="_Toc242437652" w:history="1">
+      <w:hyperlink w:anchor="_Toc242686896" w:history="1">
         <w:r>
           <w:rPr>
             <w:rStyle w:val="Hyperlink"/>
@@ -1795,7 +1795,7 @@
             <w:noProof/>
             <w:webHidden/>
           </w:rPr>
-          <w:instrText xml:space="preserve"> PAGEREF _Toc242437652 \h </w:instrText>
+          <w:instrText xml:space="preserve"> PAGEREF _Toc242686896 \h </w:instrText>
         </w:r>
         <w:r>
           <w:rPr>
@@ -1815,7 +1815,7 @@
             <w:noProof/>
             <w:webHidden/>
           </w:rPr>
-          <w:t>13</w:t>
+          <w:t>14</w:t>
         </w:r>
         <w:r>
           <w:rPr>
@@ -1842,7 +1842,7 @@
           <w:lang w:eastAsia="nl-NL"/>
         </w:rPr>
       </w:pPr>
-      <w:hyperlink w:anchor="_Toc242437653" w:history="1">
+      <w:hyperlink w:anchor="_Toc242686897" w:history="1">
         <w:r>
           <w:rPr>
             <w:rStyle w:val="Hyperlink"/>
@@ -1887,7 +1887,7 @@
             <w:noProof/>
             <w:webHidden/>
           </w:rPr>
-          <w:instrText xml:space="preserve"> PAGEREF _Toc242437653 \h </w:instrText>
+          <w:instrText xml:space="preserve"> PAGEREF _Toc242686897 \h </w:instrText>
         </w:r>
         <w:r>
           <w:rPr>
@@ -1907,7 +1907,7 @@
             <w:noProof/>
             <w:webHidden/>
           </w:rPr>
-          <w:t>13</w:t>
+          <w:t>14</w:t>
         </w:r>
         <w:r>
           <w:rPr>
@@ -1934,7 +1934,7 @@
           <w:lang w:eastAsia="nl-NL"/>
         </w:rPr>
       </w:pPr>
-      <w:hyperlink w:anchor="_Toc242437654" w:history="1">
+      <w:hyperlink w:anchor="_Toc242686898" w:history="1">
         <w:r>
           <w:rPr>
             <w:rStyle w:val="Hyperlink"/>
@@ -1979,7 +1979,7 @@
             <w:noProof/>
             <w:webHidden/>
           </w:rPr>
-          <w:instrText xml:space="preserve"> PAGEREF _Toc242437654 \h </w:instrText>
+          <w:instrText xml:space="preserve"> PAGEREF _Toc242686898 \h </w:instrText>
         </w:r>
         <w:r>
           <w:rPr>
@@ -1999,7 +1999,7 @@
             <w:noProof/>
             <w:webHidden/>
           </w:rPr>
-          <w:t>13</w:t>
+          <w:t>14</w:t>
         </w:r>
         <w:r>
           <w:rPr>
@@ -2026,7 +2026,7 @@
           <w:lang w:eastAsia="nl-NL"/>
         </w:rPr>
       </w:pPr>
-      <w:hyperlink w:anchor="_Toc242437655" w:history="1">
+      <w:hyperlink w:anchor="_Toc242686899" w:history="1">
         <w:r>
           <w:rPr>
             <w:rStyle w:val="Hyperlink"/>
@@ -2087,7 +2087,7 @@
             <w:noProof/>
             <w:webHidden/>
           </w:rPr>
-          <w:instrText xml:space="preserve"> PAGEREF _Toc242437655 \h </w:instrText>
+          <w:instrText xml:space="preserve"> PAGEREF _Toc242686899 \h </w:instrText>
         </w:r>
         <w:r>
           <w:rPr>
@@ -2107,7 +2107,7 @@
             <w:noProof/>
             <w:webHidden/>
           </w:rPr>
-          <w:t>15</w:t>
+          <w:t>16</w:t>
         </w:r>
         <w:r>
           <w:rPr>
@@ -2134,7 +2134,7 @@
           <w:lang w:eastAsia="nl-NL"/>
         </w:rPr>
       </w:pPr>
-      <w:hyperlink w:anchor="_Toc242437656" w:history="1">
+      <w:hyperlink w:anchor="_Toc242686900" w:history="1">
         <w:r>
           <w:rPr>
             <w:rStyle w:val="Hyperlink"/>
@@ -2179,7 +2179,7 @@
             <w:noProof/>
             <w:webHidden/>
           </w:rPr>
-          <w:instrText xml:space="preserve"> PAGEREF _Toc242437656 \h </w:instrText>
+          <w:instrText xml:space="preserve"> PAGEREF _Toc242686900 \h </w:instrText>
         </w:r>
         <w:r>
           <w:rPr>
@@ -2199,7 +2199,7 @@
             <w:noProof/>
             <w:webHidden/>
           </w:rPr>
-          <w:t>15</w:t>
+          <w:t>16</w:t>
         </w:r>
         <w:r>
           <w:rPr>
@@ -2226,7 +2226,7 @@
           <w:lang w:eastAsia="nl-NL"/>
         </w:rPr>
       </w:pPr>
-      <w:hyperlink w:anchor="_Toc242437657" w:history="1">
+      <w:hyperlink w:anchor="_Toc242686901" w:history="1">
         <w:r>
           <w:rPr>
             <w:rStyle w:val="Hyperlink"/>
@@ -2271,7 +2271,7 @@
             <w:noProof/>
             <w:webHidden/>
           </w:rPr>
-          <w:instrText xml:space="preserve"> PAGEREF _Toc242437657 \h </w:instrText>
+          <w:instrText xml:space="preserve"> PAGEREF _Toc242686901 \h </w:instrText>
         </w:r>
         <w:r>
           <w:rPr>
@@ -2291,7 +2291,7 @@
             <w:noProof/>
             <w:webHidden/>
           </w:rPr>
-          <w:t>15</w:t>
+          <w:t>16</w:t>
         </w:r>
         <w:r>
           <w:rPr>
@@ -2318,7 +2318,7 @@
           <w:lang w:eastAsia="nl-NL"/>
         </w:rPr>
       </w:pPr>
-      <w:hyperlink w:anchor="_Toc242437658" w:history="1">
+      <w:hyperlink w:anchor="_Toc242686902" w:history="1">
         <w:r>
           <w:rPr>
             <w:rStyle w:val="Hyperlink"/>
@@ -2363,7 +2363,7 @@
             <w:noProof/>
             <w:webHidden/>
           </w:rPr>
-          <w:instrText xml:space="preserve"> PAGEREF _Toc242437658 \h </w:instrText>
+          <w:instrText xml:space="preserve"> PAGEREF _Toc242686902 \h </w:instrText>
         </w:r>
         <w:r>
           <w:rPr>
@@ -2383,7 +2383,7 @@
             <w:noProof/>
             <w:webHidden/>
           </w:rPr>
-          <w:t>15</w:t>
+          <w:t>16</w:t>
         </w:r>
         <w:r>
           <w:rPr>
@@ -2410,7 +2410,7 @@
           <w:lang w:eastAsia="nl-NL"/>
         </w:rPr>
       </w:pPr>
-      <w:hyperlink w:anchor="_Toc242437659" w:history="1">
+      <w:hyperlink w:anchor="_Toc242686903" w:history="1">
         <w:r>
           <w:rPr>
             <w:rStyle w:val="Hyperlink"/>
@@ -2455,7 +2455,7 @@
             <w:noProof/>
             <w:webHidden/>
           </w:rPr>
-          <w:instrText xml:space="preserve"> PAGEREF _Toc242437659 \h </w:instrText>
+          <w:instrText xml:space="preserve"> PAGEREF _Toc242686903 \h </w:instrText>
         </w:r>
         <w:r>
           <w:rPr>
@@ -2475,7 +2475,7 @@
             <w:noProof/>
             <w:webHidden/>
           </w:rPr>
-          <w:t>15</w:t>
+          <w:t>16</w:t>
         </w:r>
         <w:r>
           <w:rPr>
@@ -2502,7 +2502,7 @@
           <w:lang w:eastAsia="nl-NL"/>
         </w:rPr>
       </w:pPr>
-      <w:hyperlink w:anchor="_Toc242437660" w:history="1">
+      <w:hyperlink w:anchor="_Toc242686904" w:history="1">
         <w:r>
           <w:rPr>
             <w:rStyle w:val="Hyperlink"/>
@@ -2547,7 +2547,7 @@
             <w:noProof/>
             <w:webHidden/>
           </w:rPr>
-          <w:instrText xml:space="preserve"> PAGEREF _Toc242437660 \h </w:instrText>
+          <w:instrText xml:space="preserve"> PAGEREF _Toc242686904 \h </w:instrText>
         </w:r>
         <w:r>
           <w:rPr>
@@ -2567,7 +2567,7 @@
             <w:noProof/>
             <w:webHidden/>
           </w:rPr>
-          <w:t>16</w:t>
+          <w:t>17</w:t>
         </w:r>
         <w:r>
           <w:rPr>
@@ -2594,7 +2594,7 @@
           <w:lang w:eastAsia="nl-NL"/>
         </w:rPr>
       </w:pPr>
-      <w:hyperlink w:anchor="_Toc242437661" w:history="1">
+      <w:hyperlink w:anchor="_Toc242686905" w:history="1">
         <w:r>
           <w:rPr>
             <w:rStyle w:val="Hyperlink"/>
@@ -2639,7 +2639,7 @@
             <w:noProof/>
             <w:webHidden/>
           </w:rPr>
-          <w:instrText xml:space="preserve"> PAGEREF _Toc242437661 \h </w:instrText>
+          <w:instrText xml:space="preserve"> PAGEREF _Toc242686905 \h </w:instrText>
         </w:r>
         <w:r>
           <w:rPr>
@@ -2659,7 +2659,7 @@
             <w:noProof/>
             <w:webHidden/>
           </w:rPr>
-          <w:t>16</w:t>
+          <w:t>17</w:t>
         </w:r>
         <w:r>
           <w:rPr>
@@ -2686,7 +2686,7 @@
           <w:lang w:eastAsia="nl-NL"/>
         </w:rPr>
       </w:pPr>
-      <w:hyperlink w:anchor="_Toc242437662" w:history="1">
+      <w:hyperlink w:anchor="_Toc242686906" w:history="1">
         <w:r>
           <w:rPr>
             <w:rStyle w:val="Hyperlink"/>
@@ -2731,7 +2731,7 @@
             <w:noProof/>
             <w:webHidden/>
           </w:rPr>
-          <w:instrText xml:space="preserve"> PAGEREF _Toc242437662 \h </w:instrText>
+          <w:instrText xml:space="preserve"> PAGEREF _Toc242686906 \h </w:instrText>
         </w:r>
         <w:r>
           <w:rPr>
@@ -2751,7 +2751,7 @@
             <w:noProof/>
             <w:webHidden/>
           </w:rPr>
-          <w:t>16</w:t>
+          <w:t>17</w:t>
         </w:r>
         <w:r>
           <w:rPr>
@@ -2778,7 +2778,7 @@
           <w:lang w:eastAsia="nl-NL"/>
         </w:rPr>
       </w:pPr>
-      <w:hyperlink w:anchor="_Toc242437663" w:history="1">
+      <w:hyperlink w:anchor="_Toc242686907" w:history="1">
         <w:r>
           <w:rPr>
             <w:rStyle w:val="Hyperlink"/>
@@ -2839,7 +2839,7 @@
             <w:noProof/>
             <w:webHidden/>
           </w:rPr>
-          <w:instrText xml:space="preserve"> PAGEREF _Toc242437663 \h </w:instrText>
+          <w:instrText xml:space="preserve"> PAGEREF _Toc242686907 \h </w:instrText>
         </w:r>
         <w:r>
           <w:rPr>
@@ -2859,7 +2859,7 @@
             <w:noProof/>
             <w:webHidden/>
           </w:rPr>
-          <w:t>17</w:t>
+          <w:t>18</w:t>
         </w:r>
         <w:r>
           <w:rPr>
@@ -2886,7 +2886,7 @@
           <w:lang w:eastAsia="nl-NL"/>
         </w:rPr>
       </w:pPr>
-      <w:hyperlink w:anchor="_Toc242437664" w:history="1">
+      <w:hyperlink w:anchor="_Toc242686908" w:history="1">
         <w:r>
           <w:rPr>
             <w:rStyle w:val="Hyperlink"/>
@@ -2931,7 +2931,7 @@
             <w:noProof/>
             <w:webHidden/>
           </w:rPr>
-          <w:instrText xml:space="preserve"> PAGEREF _Toc242437664 \h </w:instrText>
+          <w:instrText xml:space="preserve"> PAGEREF _Toc242686908 \h </w:instrText>
         </w:r>
         <w:r>
           <w:rPr>
@@ -2951,7 +2951,7 @@
             <w:noProof/>
             <w:webHidden/>
           </w:rPr>
-          <w:t>17</w:t>
+          <w:t>18</w:t>
         </w:r>
         <w:r>
           <w:rPr>
@@ -2978,7 +2978,7 @@
           <w:lang w:eastAsia="nl-NL"/>
         </w:rPr>
       </w:pPr>
-      <w:hyperlink w:anchor="_Toc242437665" w:history="1">
+      <w:hyperlink w:anchor="_Toc242686909" w:history="1">
         <w:r>
           <w:rPr>
             <w:rStyle w:val="Hyperlink"/>
@@ -3023,7 +3023,7 @@
             <w:noProof/>
             <w:webHidden/>
           </w:rPr>
-          <w:instrText xml:space="preserve"> PAGEREF _Toc242437665 \h </w:instrText>
+          <w:instrText xml:space="preserve"> PAGEREF _Toc242686909 \h </w:instrText>
         </w:r>
         <w:r>
           <w:rPr>
@@ -3043,7 +3043,7 @@
             <w:noProof/>
             <w:webHidden/>
           </w:rPr>
-          <w:t>17</w:t>
+          <w:t>18</w:t>
         </w:r>
         <w:r>
           <w:rPr>
@@ -3070,7 +3070,7 @@
           <w:lang w:eastAsia="nl-NL"/>
         </w:rPr>
       </w:pPr>
-      <w:hyperlink w:anchor="_Toc242437666" w:history="1">
+      <w:hyperlink w:anchor="_Toc242686910" w:history="1">
         <w:r>
           <w:rPr>
             <w:rStyle w:val="Hyperlink"/>
@@ -3115,7 +3115,7 @@
             <w:noProof/>
             <w:webHidden/>
           </w:rPr>
-          <w:instrText xml:space="preserve"> PAGEREF _Toc242437666 \h </w:instrText>
+          <w:instrText xml:space="preserve"> PAGEREF _Toc242686910 \h </w:instrText>
         </w:r>
         <w:r>
           <w:rPr>
@@ -3135,7 +3135,7 @@
             <w:noProof/>
             <w:webHidden/>
           </w:rPr>
-          <w:t>18</w:t>
+          <w:t>19</w:t>
         </w:r>
         <w:r>
           <w:rPr>
@@ -3162,7 +3162,7 @@
           <w:lang w:eastAsia="nl-NL"/>
         </w:rPr>
       </w:pPr>
-      <w:hyperlink w:anchor="_Toc242437667" w:history="1">
+      <w:hyperlink w:anchor="_Toc242686911" w:history="1">
         <w:r>
           <w:rPr>
             <w:rStyle w:val="Hyperlink"/>
@@ -3223,7 +3223,7 @@
             <w:noProof/>
             <w:webHidden/>
           </w:rPr>
-          <w:instrText xml:space="preserve"> PAGEREF _Toc242437667 \h </w:instrText>
+          <w:instrText xml:space="preserve"> PAGEREF _Toc242686911 \h </w:instrText>
         </w:r>
         <w:r>
           <w:rPr>
@@ -3243,7 +3243,7 @@
             <w:noProof/>
             <w:webHidden/>
           </w:rPr>
-          <w:t>19</w:t>
+          <w:t>20</w:t>
         </w:r>
         <w:r>
           <w:rPr>
@@ -3270,7 +3270,7 @@
           <w:lang w:eastAsia="nl-NL"/>
         </w:rPr>
       </w:pPr>
-      <w:hyperlink w:anchor="_Toc242437668" w:history="1">
+      <w:hyperlink w:anchor="_Toc242686912" w:history="1">
         <w:r>
           <w:rPr>
             <w:rStyle w:val="Hyperlink"/>
@@ -3315,7 +3315,7 @@
             <w:noProof/>
             <w:webHidden/>
           </w:rPr>
-          <w:instrText xml:space="preserve"> PAGEREF _Toc242437668 \h </w:instrText>
+          <w:instrText xml:space="preserve"> PAGEREF _Toc242686912 \h </w:instrText>
         </w:r>
         <w:r>
           <w:rPr>
@@ -3335,7 +3335,7 @@
             <w:noProof/>
             <w:webHidden/>
           </w:rPr>
-          <w:t>19</w:t>
+          <w:t>20</w:t>
         </w:r>
         <w:r>
           <w:rPr>
@@ -3362,7 +3362,7 @@
           <w:lang w:eastAsia="nl-NL"/>
         </w:rPr>
       </w:pPr>
-      <w:hyperlink w:anchor="_Toc242437669" w:history="1">
+      <w:hyperlink w:anchor="_Toc242686913" w:history="1">
         <w:r>
           <w:rPr>
             <w:rStyle w:val="Hyperlink"/>
@@ -3407,7 +3407,7 @@
             <w:noProof/>
             <w:webHidden/>
           </w:rPr>
-          <w:instrText xml:space="preserve"> PAGEREF _Toc242437669 \h </w:instrText>
+          <w:instrText xml:space="preserve"> PAGEREF _Toc242686913 \h </w:instrText>
         </w:r>
         <w:r>
           <w:rPr>
@@ -3427,7 +3427,7 @@
             <w:noProof/>
             <w:webHidden/>
           </w:rPr>
-          <w:t>20</w:t>
+          <w:t>21</w:t>
         </w:r>
         <w:r>
           <w:rPr>
@@ -3454,7 +3454,7 @@
           <w:lang w:eastAsia="nl-NL"/>
         </w:rPr>
       </w:pPr>
-      <w:hyperlink w:anchor="_Toc242437670" w:history="1">
+      <w:hyperlink w:anchor="_Toc242686914" w:history="1">
         <w:r>
           <w:rPr>
             <w:rStyle w:val="Hyperlink"/>
@@ -3501,7 +3501,7 @@
             <w:noProof/>
             <w:webHidden/>
           </w:rPr>
-          <w:instrText xml:space="preserve"> PAGEREF _Toc242437670 \h </w:instrText>
+          <w:instrText xml:space="preserve"> PAGEREF _Toc242686914 \h </w:instrText>
         </w:r>
         <w:r>
           <w:rPr>
@@ -3521,7 +3521,7 @@
             <w:noProof/>
             <w:webHidden/>
           </w:rPr>
-          <w:t>24</w:t>
+          <w:t>25</w:t>
         </w:r>
         <w:r>
           <w:rPr>
@@ -3548,7 +3548,7 @@
           <w:lang w:eastAsia="nl-NL"/>
         </w:rPr>
       </w:pPr>
-      <w:hyperlink w:anchor="_Toc242437671" w:history="1">
+      <w:hyperlink w:anchor="_Toc242686915" w:history="1">
         <w:r>
           <w:rPr>
             <w:rStyle w:val="Hyperlink"/>
@@ -3595,7 +3595,7 @@
             <w:noProof/>
             <w:webHidden/>
           </w:rPr>
-          <w:instrText xml:space="preserve"> PAGEREF _Toc242437671 \h </w:instrText>
+          <w:instrText xml:space="preserve"> PAGEREF _Toc242686915 \h </w:instrText>
         </w:r>
         <w:r>
           <w:rPr>
@@ -3615,7 +3615,7 @@
             <w:noProof/>
             <w:webHidden/>
           </w:rPr>
-          <w:t>24</w:t>
+          <w:t>25</w:t>
         </w:r>
         <w:r>
           <w:rPr>
@@ -3642,7 +3642,7 @@
           <w:lang w:eastAsia="nl-NL"/>
         </w:rPr>
       </w:pPr>
-      <w:hyperlink w:anchor="_Toc242437672" w:history="1">
+      <w:hyperlink w:anchor="_Toc242686916" w:history="1">
         <w:r>
           <w:rPr>
             <w:rStyle w:val="Hyperlink"/>
@@ -3689,7 +3689,7 @@
             <w:noProof/>
             <w:webHidden/>
           </w:rPr>
-          <w:instrText xml:space="preserve"> PAGEREF _Toc242437672 \h </w:instrText>
+          <w:instrText xml:space="preserve"> PAGEREF _Toc242686916 \h </w:instrText>
         </w:r>
         <w:r>
           <w:rPr>
@@ -3709,7 +3709,7 @@
             <w:noProof/>
             <w:webHidden/>
           </w:rPr>
-          <w:t>24</w:t>
+          <w:t>25</w:t>
         </w:r>
         <w:r>
           <w:rPr>
@@ -3736,7 +3736,7 @@
           <w:lang w:eastAsia="nl-NL"/>
         </w:rPr>
       </w:pPr>
-      <w:hyperlink w:anchor="_Toc242437673" w:history="1">
+      <w:hyperlink w:anchor="_Toc242686917" w:history="1">
         <w:r>
           <w:rPr>
             <w:rStyle w:val="Hyperlink"/>
@@ -3783,7 +3783,7 @@
             <w:noProof/>
             <w:webHidden/>
           </w:rPr>
-          <w:instrText xml:space="preserve"> PAGEREF _Toc242437673 \h </w:instrText>
+          <w:instrText xml:space="preserve"> PAGEREF _Toc242686917 \h </w:instrText>
         </w:r>
         <w:r>
           <w:rPr>
@@ -3803,7 +3803,7 @@
             <w:noProof/>
             <w:webHidden/>
           </w:rPr>
-          <w:t>24</w:t>
+          <w:t>26</w:t>
         </w:r>
         <w:r>
           <w:rPr>
@@ -3830,7 +3830,7 @@
           <w:lang w:eastAsia="nl-NL"/>
         </w:rPr>
       </w:pPr>
-      <w:hyperlink w:anchor="_Toc242437674" w:history="1">
+      <w:hyperlink w:anchor="_Toc242686918" w:history="1">
         <w:r>
           <w:rPr>
             <w:rStyle w:val="Hyperlink"/>
@@ -3877,7 +3877,7 @@
             <w:noProof/>
             <w:webHidden/>
           </w:rPr>
-          <w:instrText xml:space="preserve"> PAGEREF _Toc242437674 \h </w:instrText>
+          <w:instrText xml:space="preserve"> PAGEREF _Toc242686918 \h </w:instrText>
         </w:r>
         <w:r>
           <w:rPr>
@@ -3897,7 +3897,7 @@
             <w:noProof/>
             <w:webHidden/>
           </w:rPr>
-          <w:t>24</w:t>
+          <w:t>26</w:t>
         </w:r>
         <w:r>
           <w:rPr>
@@ -3924,7 +3924,7 @@
           <w:lang w:eastAsia="nl-NL"/>
         </w:rPr>
       </w:pPr>
-      <w:hyperlink w:anchor="_Toc242437675" w:history="1">
+      <w:hyperlink w:anchor="_Toc242686919" w:history="1">
         <w:r>
           <w:rPr>
             <w:rStyle w:val="Hyperlink"/>
@@ -3971,7 +3971,7 @@
             <w:noProof/>
             <w:webHidden/>
           </w:rPr>
-          <w:instrText xml:space="preserve"> PAGEREF _Toc242437675 \h </w:instrText>
+          <w:instrText xml:space="preserve"> PAGEREF _Toc242686919 \h </w:instrText>
         </w:r>
         <w:r>
           <w:rPr>
@@ -3991,7 +3991,7 @@
             <w:noProof/>
             <w:webHidden/>
           </w:rPr>
-          <w:t>25</w:t>
+          <w:t>26</w:t>
         </w:r>
         <w:r>
           <w:rPr>
@@ -4018,7 +4018,7 @@
           <w:lang w:eastAsia="nl-NL"/>
         </w:rPr>
       </w:pPr>
-      <w:hyperlink w:anchor="_Toc242437676" w:history="1">
+      <w:hyperlink w:anchor="_Toc242686920" w:history="1">
         <w:r>
           <w:rPr>
             <w:rStyle w:val="Hyperlink"/>
@@ -4063,7 +4063,7 @@
             <w:noProof/>
             <w:webHidden/>
           </w:rPr>
-          <w:instrText xml:space="preserve"> PAGEREF _Toc242437676 \h </w:instrText>
+          <w:instrText xml:space="preserve"> PAGEREF _Toc242686920 \h </w:instrText>
         </w:r>
         <w:r>
           <w:rPr>
@@ -4083,7 +4083,7 @@
             <w:noProof/>
             <w:webHidden/>
           </w:rPr>
-          <w:t>25</w:t>
+          <w:t>26</w:t>
         </w:r>
         <w:r>
           <w:rPr>
@@ -4110,7 +4110,7 @@
           <w:lang w:eastAsia="nl-NL"/>
         </w:rPr>
       </w:pPr>
-      <w:hyperlink w:anchor="_Toc242437677" w:history="1">
+      <w:hyperlink w:anchor="_Toc242686921" w:history="1">
         <w:r>
           <w:rPr>
             <w:rStyle w:val="Hyperlink"/>
@@ -4155,7 +4155,7 @@
             <w:noProof/>
             <w:webHidden/>
           </w:rPr>
-          <w:instrText xml:space="preserve"> PAGEREF _Toc242437677 \h </w:instrText>
+          <w:instrText xml:space="preserve"> PAGEREF _Toc242686921 \h </w:instrText>
         </w:r>
         <w:r>
           <w:rPr>
@@ -4175,7 +4175,7 @@
             <w:noProof/>
             <w:webHidden/>
           </w:rPr>
-          <w:t>25</w:t>
+          <w:t>26</w:t>
         </w:r>
         <w:r>
           <w:rPr>
@@ -4202,7 +4202,7 @@
           <w:lang w:eastAsia="nl-NL"/>
         </w:rPr>
       </w:pPr>
-      <w:hyperlink w:anchor="_Toc242437678" w:history="1">
+      <w:hyperlink w:anchor="_Toc242686922" w:history="1">
         <w:r>
           <w:rPr>
             <w:rStyle w:val="Hyperlink"/>
@@ -4279,7 +4279,7 @@
             <w:noProof/>
             <w:webHidden/>
           </w:rPr>
-          <w:instrText xml:space="preserve"> PAGEREF _Toc242437678 \h </w:instrText>
+          <w:instrText xml:space="preserve"> PAGEREF _Toc242686922 \h </w:instrText>
         </w:r>
         <w:r>
           <w:rPr>
@@ -4299,7 +4299,7 @@
             <w:noProof/>
             <w:webHidden/>
           </w:rPr>
-          <w:t>25</w:t>
+          <w:t>27</w:t>
         </w:r>
         <w:r>
           <w:rPr>
@@ -4326,7 +4326,7 @@
           <w:lang w:eastAsia="nl-NL"/>
         </w:rPr>
       </w:pPr>
-      <w:hyperlink w:anchor="_Toc242437679" w:history="1">
+      <w:hyperlink w:anchor="_Toc242686923" w:history="1">
         <w:r>
           <w:rPr>
             <w:rStyle w:val="Hyperlink"/>
@@ -4371,7 +4371,7 @@
             <w:noProof/>
             <w:webHidden/>
           </w:rPr>
-          <w:instrText xml:space="preserve"> PAGEREF _Toc242437679 \h </w:instrText>
+          <w:instrText xml:space="preserve"> PAGEREF _Toc242686923 \h </w:instrText>
         </w:r>
         <w:r>
           <w:rPr>
@@ -4391,7 +4391,7 @@
             <w:noProof/>
             <w:webHidden/>
           </w:rPr>
-          <w:t>26</w:t>
+          <w:t>27</w:t>
         </w:r>
         <w:r>
           <w:rPr>
@@ -4418,7 +4418,7 @@
           <w:lang w:eastAsia="nl-NL"/>
         </w:rPr>
       </w:pPr>
-      <w:hyperlink w:anchor="_Toc242437680" w:history="1">
+      <w:hyperlink w:anchor="_Toc242686924" w:history="1">
         <w:r>
           <w:rPr>
             <w:rStyle w:val="Hyperlink"/>
@@ -4463,7 +4463,7 @@
             <w:noProof/>
             <w:webHidden/>
           </w:rPr>
-          <w:instrText xml:space="preserve"> PAGEREF _Toc242437680 \h </w:instrText>
+          <w:instrText xml:space="preserve"> PAGEREF _Toc242686924 \h </w:instrText>
         </w:r>
         <w:r>
           <w:rPr>
@@ -4483,7 +4483,7 @@
             <w:noProof/>
             <w:webHidden/>
           </w:rPr>
-          <w:t>27</w:t>
+          <w:t>28</w:t>
         </w:r>
         <w:r>
           <w:rPr>
@@ -4510,7 +4510,7 @@
           <w:lang w:eastAsia="nl-NL"/>
         </w:rPr>
       </w:pPr>
-      <w:hyperlink w:anchor="_Toc242437681" w:history="1">
+      <w:hyperlink w:anchor="_Toc242686925" w:history="1">
         <w:r>
           <w:rPr>
             <w:rStyle w:val="Hyperlink"/>
@@ -4555,7 +4555,7 @@
             <w:noProof/>
             <w:webHidden/>
           </w:rPr>
-          <w:instrText xml:space="preserve"> PAGEREF _Toc242437681 \h </w:instrText>
+          <w:instrText xml:space="preserve"> PAGEREF _Toc242686925 \h </w:instrText>
         </w:r>
         <w:r>
           <w:rPr>
@@ -4575,7 +4575,7 @@
             <w:noProof/>
             <w:webHidden/>
           </w:rPr>
-          <w:t>27</w:t>
+          <w:t>28</w:t>
         </w:r>
         <w:r>
           <w:rPr>
@@ -4602,7 +4602,7 @@
           <w:lang w:eastAsia="nl-NL"/>
         </w:rPr>
       </w:pPr>
-      <w:hyperlink w:anchor="_Toc242437682" w:history="1">
+      <w:hyperlink w:anchor="_Toc242686926" w:history="1">
         <w:r>
           <w:rPr>
             <w:rStyle w:val="Hyperlink"/>
@@ -4647,7 +4647,7 @@
             <w:noProof/>
             <w:webHidden/>
           </w:rPr>
-          <w:instrText xml:space="preserve"> PAGEREF _Toc242437682 \h </w:instrText>
+          <w:instrText xml:space="preserve"> PAGEREF _Toc242686926 \h </w:instrText>
         </w:r>
         <w:r>
           <w:rPr>
@@ -4667,7 +4667,7 @@
             <w:noProof/>
             <w:webHidden/>
           </w:rPr>
-          <w:t>27</w:t>
+          <w:t>28</w:t>
         </w:r>
         <w:r>
           <w:rPr>
@@ -4694,7 +4694,7 @@
           <w:lang w:eastAsia="nl-NL"/>
         </w:rPr>
       </w:pPr>
-      <w:hyperlink w:anchor="_Toc242437683" w:history="1">
+      <w:hyperlink w:anchor="_Toc242686927" w:history="1">
         <w:r>
           <w:rPr>
             <w:rStyle w:val="Hyperlink"/>
@@ -4739,7 +4739,7 @@
             <w:noProof/>
             <w:webHidden/>
           </w:rPr>
-          <w:instrText xml:space="preserve"> PAGEREF _Toc242437683 \h </w:instrText>
+          <w:instrText xml:space="preserve"> PAGEREF _Toc242686927 \h </w:instrText>
         </w:r>
         <w:r>
           <w:rPr>
@@ -4759,7 +4759,7 @@
             <w:noProof/>
             <w:webHidden/>
           </w:rPr>
-          <w:t>27</w:t>
+          <w:t>28</w:t>
         </w:r>
         <w:r>
           <w:rPr>
@@ -4786,7 +4786,7 @@
           <w:lang w:eastAsia="nl-NL"/>
         </w:rPr>
       </w:pPr>
-      <w:hyperlink w:anchor="_Toc242437684" w:history="1">
+      <w:hyperlink w:anchor="_Toc242686928" w:history="1">
         <w:r>
           <w:rPr>
             <w:rStyle w:val="Hyperlink"/>
@@ -4831,7 +4831,7 @@
             <w:noProof/>
             <w:webHidden/>
           </w:rPr>
-          <w:instrText xml:space="preserve"> PAGEREF _Toc242437684 \h </w:instrText>
+          <w:instrText xml:space="preserve"> PAGEREF _Toc242686928 \h </w:instrText>
         </w:r>
         <w:r>
           <w:rPr>
@@ -4851,7 +4851,7 @@
             <w:noProof/>
             <w:webHidden/>
           </w:rPr>
-          <w:t>27</w:t>
+          <w:t>28</w:t>
         </w:r>
         <w:r>
           <w:rPr>
@@ -4878,7 +4878,7 @@
           <w:lang w:eastAsia="nl-NL"/>
         </w:rPr>
       </w:pPr>
-      <w:hyperlink w:anchor="_Toc242437685" w:history="1">
+      <w:hyperlink w:anchor="_Toc242686929" w:history="1">
         <w:r>
           <w:rPr>
             <w:rStyle w:val="Hyperlink"/>
@@ -4923,7 +4923,7 @@
             <w:noProof/>
             <w:webHidden/>
           </w:rPr>
-          <w:instrText xml:space="preserve"> PAGEREF _Toc242437685 \h </w:instrText>
+          <w:instrText xml:space="preserve"> PAGEREF _Toc242686929 \h </w:instrText>
         </w:r>
         <w:r>
           <w:rPr>
@@ -4943,7 +4943,7 @@
             <w:noProof/>
             <w:webHidden/>
           </w:rPr>
-          <w:t>29</w:t>
+          <w:t>30</w:t>
         </w:r>
         <w:r>
           <w:rPr>
@@ -4970,7 +4970,7 @@
           <w:lang w:eastAsia="nl-NL"/>
         </w:rPr>
       </w:pPr>
-      <w:hyperlink w:anchor="_Toc242437686" w:history="1">
+      <w:hyperlink w:anchor="_Toc242686930" w:history="1">
         <w:r>
           <w:rPr>
             <w:rStyle w:val="Hyperlink"/>
@@ -5015,7 +5015,7 @@
             <w:noProof/>
             <w:webHidden/>
           </w:rPr>
-          <w:instrText xml:space="preserve"> PAGEREF _Toc242437686 \h </w:instrText>
+          <w:instrText xml:space="preserve"> PAGEREF _Toc242686930 \h </w:instrText>
         </w:r>
         <w:r>
           <w:rPr>
@@ -5035,7 +5035,7 @@
             <w:noProof/>
             <w:webHidden/>
           </w:rPr>
-          <w:t>30</w:t>
+          <w:t>31</w:t>
         </w:r>
         <w:r>
           <w:rPr>
@@ -5062,7 +5062,7 @@
           <w:lang w:eastAsia="nl-NL"/>
         </w:rPr>
       </w:pPr>
-      <w:hyperlink w:anchor="_Toc242437687" w:history="1">
+      <w:hyperlink w:anchor="_Toc242686931" w:history="1">
         <w:r>
           <w:rPr>
             <w:rStyle w:val="Hyperlink"/>
@@ -5107,7 +5107,7 @@
             <w:noProof/>
             <w:webHidden/>
           </w:rPr>
-          <w:instrText xml:space="preserve"> PAGEREF _Toc242437687 \h </w:instrText>
+          <w:instrText xml:space="preserve"> PAGEREF _Toc242686931 \h </w:instrText>
         </w:r>
         <w:r>
           <w:rPr>
@@ -5127,7 +5127,7 @@
             <w:noProof/>
             <w:webHidden/>
           </w:rPr>
-          <w:t>31</w:t>
+          <w:t>32</w:t>
         </w:r>
         <w:r>
           <w:rPr>
@@ -5160,7 +5160,7 @@
         </w:numPr>
       </w:pPr>
       <w:bookmarkStart w:id="1" w:name="k1"/>
-      <w:bookmarkStart w:id="2" w:name="_Toc242437635"/>
+      <w:bookmarkStart w:id="2" w:name="_Toc242686879"/>
       <w:r>
         <w:t>DOEL VAN DE APPLICATIE.</w:t>
       </w:r>
@@ -5242,7 +5242,7 @@
         </w:numPr>
       </w:pPr>
       <w:bookmarkStart w:id="3" w:name="k2"/>
-      <w:bookmarkStart w:id="4" w:name="_Toc242437636"/>
+      <w:bookmarkStart w:id="4" w:name="_Toc242686880"/>
       <w:r>
         <w:t>BESTANDEN.</w:t>
       </w:r>
@@ -6129,7 +6129,7 @@
                 <w:sz w:val="16"/>
                 <w:szCs w:val="16"/>
               </w:rPr>
-              <w:t xml:space="preserve">). Samen ongeveer 8 MB, waarvan 6,4 MB het herkenningsmodel. Wordt alleen geladen als iemand de demo gebruikt. </w:t>
+              <w:t>). In de bibliotheek zit TensorFlow.js 4.22.0, met de Apache-licentie 2.0 (</w:t>
             </w:r>
             <w:r>
               <w:rPr>
@@ -6137,14 +6137,29 @@
                 <w:sz w:val="14"/>
                 <w:shd w:val="clear" w:color="auto" w:fill="EEF4F2"/>
               </w:rPr>
-              <w:t>README.md</w:t>
+              <w:t>LICENSE-TENSORFLOWJS</w:t>
             </w:r>
             <w:r>
               <w:rPr>
                 <w:sz w:val="16"/>
                 <w:szCs w:val="16"/>
               </w:rPr>
-              <w:t xml:space="preserve"> in deze map noemt de bron en een SHA-256-controlegetal per bestand</w:t>
+              <w:t xml:space="preserve">). Samen ongeveer 8 MB, waarvan 6,4 MB het herkenningsmodel. Wordt alleen geladen als iemand de demo gebruikt. </w:t>
+            </w:r>
+            <w:r>
+              <w:rPr>
+                <w:rFonts w:ascii="Consolas" w:hAnsi="Consolas" w:cs="Consolas"/>
+                <w:sz w:val="14"/>
+                <w:shd w:val="clear" w:color="auto" w:fill="EEF4F2"/>
+              </w:rPr>
+              <w:t>README.md</w:t>
+            </w:r>
+            <w:r>
+              <w:rPr>
+                <w:sz w:val="16"/>
+                <w:szCs w:val="16"/>
+              </w:rPr>
+              <w:t xml:space="preserve"> in deze map noemt de bron, een SHA-256-controlegetal per bestand en dat face-api niet meer wordt onderhouden (de repository is gearchiveerd, daarom alleen voor de demo)</w:t>
             </w:r>
           </w:p>
         </w:tc>
@@ -6364,7 +6379,7 @@
                 <w:sz w:val="16"/>
                 <w:szCs w:val="16"/>
               </w:rPr>
-              <w:t xml:space="preserve">) en een PDF in de TVB-huisstijl, op basis van het sjabloon </w:t>
+              <w:t xml:space="preserve">) en een PDF in de TVB-huisstijl, op basis van het TVB-sjabloon </w:t>
             </w:r>
             <w:r>
               <w:rPr>
@@ -6372,14 +6387,14 @@
                 <w:sz w:val="14"/>
                 <w:shd w:val="clear" w:color="auto" w:fill="EEF4F2"/>
               </w:rPr>
-              <w:t>docs/tvbsjabloon.docx</w:t>
+              <w:t>tvbsjabloon.docx</w:t>
             </w:r>
             <w:r>
               <w:rPr>
                 <w:sz w:val="16"/>
                 <w:szCs w:val="16"/>
               </w:rPr>
-              <w:t xml:space="preserve">: voorblad, inhoudsopgave, genummerde koppen, tabellen en opsommingstekens. Nodig: Node.js en Microsoft Word. De </w:t>
+              <w:t xml:space="preserve"> (dat staat niet in de repository, vraag het op bij TVB): voorblad, inhoudsopgave, genummerde koppen, tabellen en opsommingstekens. Nodig: Node.js en Microsoft Word. De </w:t>
             </w:r>
             <w:r>
               <w:rPr>
@@ -6574,7 +6589,7 @@
                 <w:sz w:val="16"/>
                 <w:szCs w:val="16"/>
               </w:rPr>
-              <w:t>Unit tests (511) voor de regels, de opslag, de export, het thema, de welkom- en gezichtsherkenningsfuncties, herkennen met de pas, de controller, de beveiliging en regressietests voor opgeloste bugs</w:t>
+              <w:t>Unit tests (534) voor de regels, de opslag, de export, het thema, de welkom- en gezichtsherkenningsfuncties, herkennen met de pas, de controller, de beveiliging en regressietests voor opgeloste bugs</w:t>
             </w:r>
           </w:p>
         </w:tc>
@@ -7110,7 +7125,7 @@
                 <w:sz w:val="14"/>
                 <w:shd w:val="clear" w:color="auto" w:fill="EEF4F2"/>
               </w:rPr>
-              <w:t>.gitattributes</w:t>
+              <w:t>tests/beveiligingsscan.test.js</w:t>
             </w:r>
           </w:p>
         </w:tc>
@@ -7127,7 +7142,7 @@
                 <w:sz w:val="16"/>
                 <w:szCs w:val="16"/>
               </w:rPr>
-              <w:t xml:space="preserve">Zorgt dat Git de bestanden in </w:t>
+              <w:t xml:space="preserve">Regressietests voor de beveiligingsscan: beheeracties doen niets zonder ingelogde beheerder, product-id's als </w:t>
             </w:r>
             <w:r>
               <w:rPr>
@@ -7135,14 +7150,14 @@
                 <w:sz w:val="14"/>
                 <w:shd w:val="clear" w:color="auto" w:fill="EEF4F2"/>
               </w:rPr>
-              <w:t>assets/vendor/</w:t>
+              <w:t>__proto__</w:t>
             </w:r>
             <w:r>
               <w:rPr>
                 <w:sz w:val="16"/>
                 <w:szCs w:val="16"/>
               </w:rPr>
-              <w:t xml:space="preserve"> en </w:t>
+              <w:t xml:space="preserve">, </w:t>
             </w:r>
             <w:r>
               <w:rPr>
@@ -7150,14 +7165,29 @@
                 <w:sz w:val="14"/>
                 <w:shd w:val="clear" w:color="auto" w:fill="EEF4F2"/>
               </w:rPr>
-              <w:t>assets/fonts/</w:t>
+              <w:t>constructor</w:t>
             </w:r>
             <w:r>
               <w:rPr>
                 <w:sz w:val="16"/>
                 <w:szCs w:val="16"/>
               </w:rPr>
-              <w:t xml:space="preserve"> niet aanpast (geen omzetting van regeleinden), zodat de controlegetallen blijven kloppen</w:t>
+              <w:t xml:space="preserve"> en </w:t>
+            </w:r>
+            <w:r>
+              <w:rPr>
+                <w:rFonts w:ascii="Consolas" w:hAnsi="Consolas" w:cs="Consolas"/>
+                <w:sz w:val="14"/>
+                <w:shd w:val="clear" w:color="auto" w:fill="EEF4F2"/>
+              </w:rPr>
+              <w:t>toString</w:t>
+            </w:r>
+            <w:r>
+              <w:rPr>
+                <w:sz w:val="16"/>
+                <w:szCs w:val="16"/>
+              </w:rPr>
+              <w:t xml:space="preserve"> in de voorraadlijst, de camera die uitgaat na de tijdslimiet, de strengere controle van codes en tijdstippen bij het laden, de Node.js-versie van de CI, het alleen-toevoegen-logboek in het SQL-schema en de licentie van TensorFlow.js</w:t>
             </w:r>
           </w:p>
         </w:tc>
@@ -7180,7 +7210,7 @@
                 <w:sz w:val="14"/>
                 <w:shd w:val="clear" w:color="auto" w:fill="EEF4F2"/>
               </w:rPr>
-              <w:t>.github/workflows/ci.yml</w:t>
+              <w:t>.gitattributes</w:t>
             </w:r>
           </w:p>
         </w:tc>
@@ -7197,7 +7227,77 @@
                 <w:sz w:val="16"/>
                 <w:szCs w:val="16"/>
               </w:rPr>
-              <w:t>Voert de unit tests automatisch uit op GitHub, met alleen leesrechten en actions die op een commit-SHA zijn vastgezet</w:t>
+              <w:t xml:space="preserve">Zorgt dat Git de bestanden in </w:t>
+            </w:r>
+            <w:r>
+              <w:rPr>
+                <w:rFonts w:ascii="Consolas" w:hAnsi="Consolas" w:cs="Consolas"/>
+                <w:sz w:val="14"/>
+                <w:shd w:val="clear" w:color="auto" w:fill="EEF4F2"/>
+              </w:rPr>
+              <w:t>assets/vendor/</w:t>
+            </w:r>
+            <w:r>
+              <w:rPr>
+                <w:sz w:val="16"/>
+                <w:szCs w:val="16"/>
+              </w:rPr>
+              <w:t xml:space="preserve"> en </w:t>
+            </w:r>
+            <w:r>
+              <w:rPr>
+                <w:rFonts w:ascii="Consolas" w:hAnsi="Consolas" w:cs="Consolas"/>
+                <w:sz w:val="14"/>
+                <w:shd w:val="clear" w:color="auto" w:fill="EEF4F2"/>
+              </w:rPr>
+              <w:t>assets/fonts/</w:t>
+            </w:r>
+            <w:r>
+              <w:rPr>
+                <w:sz w:val="16"/>
+                <w:szCs w:val="16"/>
+              </w:rPr>
+              <w:t xml:space="preserve"> niet aanpast (geen omzetting van regeleinden), zodat de controlegetallen blijven kloppen</w:t>
+            </w:r>
+          </w:p>
+        </w:tc>
+      </w:tr>
+      <w:tr>
+        <w:trPr>
+          <w:cantSplit/>
+        </w:trPr>
+        <w:tc>
+          <w:tcPr>
+            <w:tcW w:w="4320" w:type="dxa"/>
+          </w:tcPr>
+          <w:p>
+            <w:pPr>
+              <w:spacing w:before="20" w:after="20" w:line="240" w:lineRule="auto"/>
+            </w:pPr>
+            <w:r>
+              <w:rPr>
+                <w:rFonts w:ascii="Consolas" w:hAnsi="Consolas" w:cs="Consolas"/>
+                <w:sz w:val="14"/>
+                <w:shd w:val="clear" w:color="auto" w:fill="EEF4F2"/>
+              </w:rPr>
+              <w:t>.github/workflows/ci.yml</w:t>
+            </w:r>
+          </w:p>
+        </w:tc>
+        <w:tc>
+          <w:tcPr>
+            <w:tcW w:w="5318" w:type="dxa"/>
+          </w:tcPr>
+          <w:p>
+            <w:pPr>
+              <w:spacing w:before="20" w:after="20" w:line="240" w:lineRule="auto"/>
+            </w:pPr>
+            <w:r>
+              <w:rPr>
+                <w:sz w:val="16"/>
+                <w:szCs w:val="16"/>
+              </w:rPr>
+              <w:t>Voert de unit tests automatisch uit op GitHub met Node.js 24 (LTS), met alleen leesrechten en actions die op een commit-SHA zijn vastgezet</w:t>
             </w:r>
           </w:p>
         </w:tc>
@@ -7238,7 +7338,7 @@
         </w:numPr>
       </w:pPr>
       <w:bookmarkStart w:id="5" w:name="k3"/>
-      <w:bookmarkStart w:id="6" w:name="_Toc242437637"/>
+      <w:bookmarkStart w:id="6" w:name="_Toc242686881"/>
       <w:r>
         <w:t>DE WEBSITE STARTEN.</w:t>
       </w:r>
@@ -7460,7 +7560,7 @@
         </w:numPr>
       </w:pPr>
       <w:bookmarkStart w:id="7" w:name="k4"/>
-      <w:bookmarkStart w:id="8" w:name="_Toc242437638"/>
+      <w:bookmarkStart w:id="8" w:name="_Toc242686882"/>
       <w:r>
         <w:t>GEBRUIKERSHANDLEIDING.</w:t>
       </w:r>
@@ -7473,7 +7573,7 @@
         <w:keepNext/>
       </w:pPr>
       <w:bookmarkStart w:id="9" w:name="k5"/>
-      <w:bookmarkStart w:id="10" w:name="_Toc242437639"/>
+      <w:bookmarkStart w:id="10" w:name="_Toc242686883"/>
       <w:r>
         <w:t>EEN MEDEWERKER ZOEKEN</w:t>
       </w:r>
@@ -7528,7 +7628,7 @@
         <w:keepNext/>
       </w:pPr>
       <w:bookmarkStart w:id="11" w:name="k6"/>
-      <w:bookmarkStart w:id="12" w:name="_Toc242437640"/>
+      <w:bookmarkStart w:id="12" w:name="_Toc242686884"/>
       <w:r>
         <w:t>EEN PRODUCT REGISTREREN</w:t>
       </w:r>
@@ -7739,7 +7839,7 @@
         <w:keepNext/>
       </w:pPr>
       <w:bookmarkStart w:id="13" w:name="k7"/>
-      <w:bookmarkStart w:id="14" w:name="_Toc242437641"/>
+      <w:bookmarkStart w:id="14" w:name="_Toc242686885"/>
       <w:r>
         <w:t>ADMIN-DASHBOARD OPENEN</w:t>
       </w:r>
@@ -7870,7 +7970,7 @@
         <w:keepNext/>
       </w:pPr>
       <w:bookmarkStart w:id="15" w:name="k8"/>
-      <w:bookmarkStart w:id="16" w:name="_Toc242437642"/>
+      <w:bookmarkStart w:id="16" w:name="_Toc242686886"/>
       <w:r>
         <w:t>REGISTRATIES BEHEREN</w:t>
       </w:r>
@@ -8101,7 +8201,7 @@
         <w:keepNext/>
       </w:pPr>
       <w:bookmarkStart w:id="17" w:name="k9"/>
-      <w:bookmarkStart w:id="18" w:name="_Toc242437643"/>
+      <w:bookmarkStart w:id="18" w:name="_Toc242686887"/>
       <w:r>
         <w:t>MEDEWERKERS BEHEREN</w:t>
       </w:r>
@@ -8421,7 +8521,7 @@
         <w:keepNext/>
       </w:pPr>
       <w:bookmarkStart w:id="19" w:name="k10"/>
-      <w:bookmarkStart w:id="20" w:name="_Toc242437644"/>
+      <w:bookmarkStart w:id="20" w:name="_Toc242686888"/>
       <w:r>
         <w:t>PRODUCTEN BEHEREN</w:t>
       </w:r>
@@ -8515,7 +8615,7 @@
     </w:p>
     <w:p>
       <w:r>
-        <w:t xml:space="preserve">De prijs is 0 of hoger en heeft hooguit twee decimalen (hele centen), bijvoorbeeld </w:t>
+        <w:t xml:space="preserve">De prijs ligt tussen 0 en 1000 euro en heeft hooguit twee decimalen (hele centen), bijvoorbeeld </w:t>
       </w:r>
       <w:r>
         <w:rPr>
@@ -8526,7 +8626,10 @@
         <w:t>0.65</w:t>
       </w:r>
       <w:r>
-        <w:t xml:space="preserve">; anders verschijnt "Vul een prijs van 0 of hoger in, met hooguit twee decimalen." Twee producten met dezelfde naam kan niet: dan verschijnt "Er bestaat al een product met deze naam." Een product dat al eens is geregistreerd, kan niet worden verwijderd, zodat oude registraties en de export blijven kloppen ("Dit product wordt al gebruikt en kan niet worden verwijderd"). Bij een product dat nooit is geregistreerd, vraagt de browser eerst "Product Boter verwijderen?" (met de naam van het product); met </w:t>
+        <w:t xml:space="preserve">. Anders verschijnt "Vul een prijs van 0 tot en met 1000 euro in, met hooguit twee decimalen." Twee producten met dezelfde naam kan niet: dan verschijnt "Er bestaat al een product met deze naam." Een product dat al eens is geregistreerd, kan niet worden verwijderd, zodat oude registraties en de export blijven kloppen ("Dit product wordt al gebruikt en kan niet worden verwijderd"). Bij een product dat nooit is geregistreerd, vraagt de browser eerst "Product Boter verwijderen?" (met de naam van het product); </w:t>
+      </w:r>
+      <w:r>
+        <w:t xml:space="preserve">met </w:t>
       </w:r>
       <w:r>
         <w:rPr>
@@ -8546,7 +8649,7 @@
         <w:keepNext/>
       </w:pPr>
       <w:bookmarkStart w:id="21" w:name="k11"/>
-      <w:bookmarkStart w:id="22" w:name="_Toc242437645"/>
+      <w:bookmarkStart w:id="22" w:name="_Toc242686889"/>
       <w:r>
         <w:t>BEDRIJVEN EN CONSUMPTIEPUNTEN BEHEREN</w:t>
       </w:r>
@@ -8709,7 +8812,7 @@
         <w:keepNext/>
       </w:pPr>
       <w:bookmarkStart w:id="23" w:name="k12"/>
-      <w:bookmarkStart w:id="24" w:name="_Toc242437646"/>
+      <w:bookmarkStart w:id="24" w:name="_Toc242686890"/>
       <w:r>
         <w:t>VOORRAAD BEHEREN</w:t>
       </w:r>
@@ -8927,7 +9030,7 @@
         <w:keepNext/>
       </w:pPr>
       <w:bookmarkStart w:id="25" w:name="k13"/>
-      <w:bookmarkStart w:id="26" w:name="_Toc242437647"/>
+      <w:bookmarkStart w:id="26" w:name="_Toc242686891"/>
       <w:r>
         <w:t>LOGBOEK BEKIJKEN</w:t>
       </w:r>
@@ -8967,7 +9070,7 @@
         <w:keepNext/>
       </w:pPr>
       <w:bookmarkStart w:id="27" w:name="k14"/>
-      <w:bookmarkStart w:id="28" w:name="_Toc242437648"/>
+      <w:bookmarkStart w:id="28" w:name="_Toc242686892"/>
       <w:r>
         <w:t>ALLE GEGEVENS WISSEN</w:t>
       </w:r>
@@ -9093,7 +9196,7 @@
         <w:keepNext/>
       </w:pPr>
       <w:bookmarkStart w:id="29" w:name="k15"/>
-      <w:bookmarkStart w:id="30" w:name="_Toc242437649"/>
+      <w:bookmarkStart w:id="30" w:name="_Toc242686893"/>
       <w:r>
         <w:t>MODAL SLUITEN EN UITLOGGEN</w:t>
       </w:r>
@@ -9122,7 +9225,7 @@
         <w:keepNext/>
       </w:pPr>
       <w:bookmarkStart w:id="31" w:name="k16"/>
-      <w:bookmarkStart w:id="32" w:name="_Toc242437650"/>
+      <w:bookmarkStart w:id="32" w:name="_Toc242686894"/>
       <w:r>
         <w:t>CSV EXPORTEREN</w:t>
       </w:r>
@@ -9459,7 +9562,7 @@
         <w:keepNext/>
       </w:pPr>
       <w:bookmarkStart w:id="33" w:name="k17"/>
-      <w:bookmarkStart w:id="34" w:name="_Toc242437651"/>
+      <w:bookmarkStart w:id="34" w:name="_Toc242686895"/>
       <w:r>
         <w:t>LICHT OF DONKER THEMA</w:t>
       </w:r>
@@ -9566,7 +9669,7 @@
         <w:keepNext/>
       </w:pPr>
       <w:bookmarkStart w:id="35" w:name="k18"/>
-      <w:bookmarkStart w:id="36" w:name="_Toc242437652"/>
+      <w:bookmarkStart w:id="36" w:name="_Toc242686896"/>
       <w:r>
         <w:t>WELKOM EN "ZELFDE ALS VORIGE KEER"</w:t>
       </w:r>
@@ -9639,7 +9742,7 @@
         <w:keepNext/>
       </w:pPr>
       <w:bookmarkStart w:id="37" w:name="k19"/>
-      <w:bookmarkStart w:id="38" w:name="_Toc242437653"/>
+      <w:bookmarkStart w:id="38" w:name="_Toc242686897"/>
       <w:r>
         <w:t>DEMO GEZICHTSHERKENNING</w:t>
       </w:r>
@@ -9756,6 +9859,11 @@
     </w:p>
     <w:p>
       <w:r>
+        <w:t>Word je binnen 20 seconden niet herkend, of leg je bij het instellen binnen 20 seconden geen gezicht vast, dan gaat de camera vanzelf uit. Het venster blijft open met een melding. Sluit het venster en probeer het opnieuw, of kies je naam in de lijst.</w:t>
+      </w:r>
+    </w:p>
+    <w:p>
+      <w:r>
         <w:t xml:space="preserve">Er worden geen foto's gemaakt of opgeslagen; de herkenning gebeurt op het apparaat zelf. Na het herladen van de pagina is niemand meer ingesteld. Met </w:t>
       </w:r>
       <w:r>
@@ -9842,7 +9950,7 @@
         <w:keepNext/>
       </w:pPr>
       <w:bookmarkStart w:id="39" w:name="k20"/>
-      <w:bookmarkStart w:id="40" w:name="_Toc242437654"/>
+      <w:bookmarkStart w:id="40" w:name="_Toc242686898"/>
       <w:r>
         <w:t>HERKENNEN MET DE PAS</w:t>
       </w:r>
@@ -9995,7 +10103,7 @@
         <w:t>config.js</w:t>
       </w:r>
       <w:r>
-        <w:t xml:space="preserve"> (minimaal 6 tekens, hooguit 40 milliseconden tussen twee tekens, en 120 milliseconden stilte als einde van de scan voor lezers zonder Enter). Met </w:t>
+        <w:t xml:space="preserve"> (minimaal 4 tekens, net als het kortste pasnummer in het medewerkersformulier, hooguit 40 milliseconden tussen twee tekens, en 120 milliseconden stilte als einde van de scan voor lezers zonder Enter). Met </w:t>
       </w:r>
       <w:r>
         <w:rPr>
@@ -10036,7 +10144,7 @@
         </w:numPr>
       </w:pPr>
       <w:bookmarkStart w:id="41" w:name="k21"/>
-      <w:bookmarkStart w:id="42" w:name="_Toc242437655"/>
+      <w:bookmarkStart w:id="42" w:name="_Toc242686899"/>
       <w:r>
         <w:t xml:space="preserve">UITLEG VAN </w:t>
       </w:r>
@@ -10060,7 +10168,7 @@
         <w:keepNext/>
       </w:pPr>
       <w:bookmarkStart w:id="43" w:name="k22"/>
-      <w:bookmarkStart w:id="44" w:name="_Toc242437656"/>
+      <w:bookmarkStart w:id="44" w:name="_Toc242686900"/>
       <w:r>
         <w:t>METADATA EN EXTERNE BESTANDEN</w:t>
       </w:r>
@@ -10336,7 +10444,7 @@
         <w:keepNext/>
       </w:pPr>
       <w:bookmarkStart w:id="45" w:name="k23"/>
-      <w:bookmarkStart w:id="46" w:name="_Toc242437657"/>
+      <w:bookmarkStart w:id="46" w:name="_Toc242686901"/>
       <w:r>
         <w:t>NAVIGATIEBALK</w:t>
       </w:r>
@@ -10549,7 +10657,7 @@
         <w:keepNext/>
       </w:pPr>
       <w:bookmarkStart w:id="47" w:name="k24"/>
-      <w:bookmarkStart w:id="48" w:name="_Toc242437658"/>
+      <w:bookmarkStart w:id="48" w:name="_Toc242686902"/>
       <w:r>
         <w:t>HERO-GEDEELTE</w:t>
       </w:r>
@@ -10594,7 +10702,7 @@
         <w:keepNext/>
       </w:pPr>
       <w:bookmarkStart w:id="49" w:name="k25"/>
-      <w:bookmarkStart w:id="50" w:name="_Toc242437659"/>
+      <w:bookmarkStart w:id="50" w:name="_Toc242686903"/>
       <w:r>
         <w:t>MEDEWERKERLIJST</w:t>
       </w:r>
@@ -10857,7 +10965,7 @@
         <w:keepNext/>
       </w:pPr>
       <w:bookmarkStart w:id="51" w:name="k26"/>
-      <w:bookmarkStart w:id="52" w:name="_Toc242437660"/>
+      <w:bookmarkStart w:id="52" w:name="_Toc242686904"/>
       <w:r>
         <w:t>STATISTIEKEN</w:t>
       </w:r>
@@ -10940,7 +11048,7 @@
         <w:keepNext/>
       </w:pPr>
       <w:bookmarkStart w:id="53" w:name="k27"/>
-      <w:bookmarkStart w:id="54" w:name="_Toc242437661"/>
+      <w:bookmarkStart w:id="54" w:name="_Toc242686905"/>
       <w:r>
         <w:t>VENSTERS (MODALS)</w:t>
       </w:r>
@@ -11453,7 +11561,7 @@
         <w:keepNext/>
       </w:pPr>
       <w:bookmarkStart w:id="55" w:name="k28"/>
-      <w:bookmarkStart w:id="56" w:name="_Toc242437662"/>
+      <w:bookmarkStart w:id="56" w:name="_Toc242686906"/>
       <w:r>
         <w:t>WAARSCHUWING BIJ OPENEN ALS LOS BESTAND</w:t>
       </w:r>
@@ -11498,7 +11606,7 @@
         </w:numPr>
       </w:pPr>
       <w:bookmarkStart w:id="57" w:name="k29"/>
-      <w:bookmarkStart w:id="58" w:name="_Toc242437663"/>
+      <w:bookmarkStart w:id="58" w:name="_Toc242686907"/>
       <w:r>
         <w:t xml:space="preserve">UITLEG VAN </w:t>
       </w:r>
@@ -11522,7 +11630,7 @@
         <w:keepNext/>
       </w:pPr>
       <w:bookmarkStart w:id="59" w:name="k30"/>
-      <w:bookmarkStart w:id="60" w:name="_Toc242437664"/>
+      <w:bookmarkStart w:id="60" w:name="_Toc242686908"/>
       <w:r>
         <w:t>CSS-VARIABELEN</w:t>
       </w:r>
@@ -12131,7 +12239,7 @@
         <w:keepNext/>
       </w:pPr>
       <w:bookmarkStart w:id="61" w:name="k31"/>
-      <w:bookmarkStart w:id="62" w:name="_Toc242437665"/>
+      <w:bookmarkStart w:id="62" w:name="_Toc242686909"/>
       <w:r>
         <w:t>LAYOUT</w:t>
       </w:r>
@@ -12652,7 +12760,7 @@
         <w:keepNext/>
       </w:pPr>
       <w:bookmarkStart w:id="63" w:name="k32"/>
-      <w:bookmarkStart w:id="64" w:name="_Toc242437666"/>
+      <w:bookmarkStart w:id="64" w:name="_Toc242686910"/>
       <w:r>
         <w:t>COMPONENTEN</w:t>
       </w:r>
@@ -12875,7 +12983,7 @@
         </w:numPr>
       </w:pPr>
       <w:bookmarkStart w:id="65" w:name="k33"/>
-      <w:bookmarkStart w:id="66" w:name="_Toc242437667"/>
+      <w:bookmarkStart w:id="66" w:name="_Toc242686911"/>
       <w:r>
         <w:t>UITLEG VAN DE JAVASCRIPT (</w:t>
       </w:r>
@@ -12899,7 +13007,7 @@
         <w:keepNext/>
       </w:pPr>
       <w:bookmarkStart w:id="67" w:name="k34"/>
-      <w:bookmarkStart w:id="68" w:name="_Toc242437668"/>
+      <w:bookmarkStart w:id="68" w:name="_Toc242686912"/>
       <w:r>
         <w:t>OPSLAG EN VOORBEELDDATA</w:t>
       </w:r>
@@ -13676,7 +13784,7 @@
         <w:keepNext/>
       </w:pPr>
       <w:bookmarkStart w:id="69" w:name="k35"/>
-      <w:bookmarkStart w:id="70" w:name="_Toc242437669"/>
+      <w:bookmarkStart w:id="70" w:name="_Toc242686913"/>
       <w:r>
         <w:t>OBJECTGEORIËNTEERDE STRUCTUUR</w:t>
       </w:r>
@@ -14355,6 +14463,148 @@
     </w:p>
     <w:p>
       <w:r>
+        <w:t>Codes (looncode, personeelsnummer, werkgevernummer) moeten tekst zijn van hooguit 64 tekens zonder stuurtekens zoals tab of enter (</w:t>
+      </w:r>
+      <w:r>
+        <w:rPr>
+          <w:rFonts w:ascii="Consolas" w:hAnsi="Consolas" w:cs="Consolas"/>
+          <w:sz w:val="18"/>
+          <w:shd w:val="clear" w:color="auto" w:fill="EEF4F2"/>
+        </w:rPr>
+        <w:t>isShortCode</w:t>
+      </w:r>
+      <w:r>
+        <w:t>). Een code die een object of lijst is, maakt de regel ongeldig. Een heel getal uit oude gegevens wordt eerst tekst (</w:t>
+      </w:r>
+      <w:r>
+        <w:rPr>
+          <w:rFonts w:ascii="Consolas" w:hAnsi="Consolas" w:cs="Consolas"/>
+          <w:sz w:val="18"/>
+          <w:shd w:val="clear" w:color="auto" w:fill="EEF4F2"/>
+        </w:rPr>
+        <w:t>codeText</w:t>
+      </w:r>
+      <w:r>
+        <w:t>). Tijdstippen (</w:t>
+      </w:r>
+      <w:r>
+        <w:rPr>
+          <w:rFonts w:ascii="Consolas" w:hAnsi="Consolas" w:cs="Consolas"/>
+          <w:sz w:val="18"/>
+          <w:shd w:val="clear" w:color="auto" w:fill="EEF4F2"/>
+        </w:rPr>
+        <w:t>createdAt</w:t>
+      </w:r>
+      <w:r>
+        <w:t xml:space="preserve"> van registraties en logboekregels, en </w:t>
+      </w:r>
+      <w:r>
+        <w:rPr>
+          <w:rFonts w:ascii="Consolas" w:hAnsi="Consolas" w:cs="Consolas"/>
+          <w:sz w:val="18"/>
+          <w:shd w:val="clear" w:color="auto" w:fill="EEF4F2"/>
+        </w:rPr>
+        <w:t>countedAt</w:t>
+      </w:r>
+      <w:r>
+        <w:t xml:space="preserve">) moeten in ISO-vorm staan, zoals </w:t>
+      </w:r>
+      <w:r>
+        <w:rPr>
+          <w:rFonts w:ascii="Consolas" w:hAnsi="Consolas" w:cs="Consolas"/>
+          <w:sz w:val="18"/>
+          <w:shd w:val="clear" w:color="auto" w:fill="EEF4F2"/>
+        </w:rPr>
+        <w:t>2026-10-09T08:30:00.000Z</w:t>
+      </w:r>
+      <w:r>
+        <w:t>, en mogen niet vóór 1 januari 2000 liggen (</w:t>
+      </w:r>
+      <w:r>
+        <w:rPr>
+          <w:rFonts w:ascii="Consolas" w:hAnsi="Consolas" w:cs="Consolas"/>
+          <w:sz w:val="18"/>
+          <w:shd w:val="clear" w:color="auto" w:fill="EEF4F2"/>
+        </w:rPr>
+        <w:t>isValidDateTime</w:t>
+      </w:r>
+      <w:r>
+        <w:t>). Ook een logboekregel van meer dan 24 uur na het moment van laden wordt overgeslagen.</w:t>
+      </w:r>
+    </w:p>
+    <w:p>
+      <w:r>
+        <w:t xml:space="preserve">De voorraadlijst van een consumptiepunt is een object met een product-id als sleutel. Bij het laden neemt </w:t>
+      </w:r>
+      <w:r>
+        <w:rPr>
+          <w:rFonts w:ascii="Consolas" w:hAnsi="Consolas" w:cs="Consolas"/>
+          <w:sz w:val="18"/>
+          <w:shd w:val="clear" w:color="auto" w:fill="EEF4F2"/>
+        </w:rPr>
+        <w:t>renameStockKeys</w:t>
+      </w:r>
+      <w:r>
+        <w:t xml:space="preserve"> alleen sleutels over die een veilige id zijn, en </w:t>
+      </w:r>
+      <w:r>
+        <w:rPr>
+          <w:rFonts w:ascii="Consolas" w:hAnsi="Consolas" w:cs="Consolas"/>
+          <w:sz w:val="18"/>
+          <w:shd w:val="clear" w:color="auto" w:fill="EEF4F2"/>
+        </w:rPr>
+        <w:t>completePointStock</w:t>
+      </w:r>
+      <w:r>
+        <w:t xml:space="preserve"> maakt alleen regels voor geldige producten. Een geknoeide sleutel zoals </w:t>
+      </w:r>
+      <w:r>
+        <w:rPr>
+          <w:rFonts w:ascii="Consolas" w:hAnsi="Consolas" w:cs="Consolas"/>
+          <w:sz w:val="18"/>
+          <w:shd w:val="clear" w:color="auto" w:fill="EEF4F2"/>
+        </w:rPr>
+        <w:t>__proto__</w:t>
+      </w:r>
+      <w:r>
+        <w:t xml:space="preserve"> of </w:t>
+      </w:r>
+      <w:r>
+        <w:rPr>
+          <w:rFonts w:ascii="Consolas" w:hAnsi="Consolas" w:cs="Consolas"/>
+          <w:sz w:val="18"/>
+          <w:shd w:val="clear" w:color="auto" w:fill="EEF4F2"/>
+        </w:rPr>
+        <w:t>constructor</w:t>
+      </w:r>
+      <w:r>
+        <w:t xml:space="preserve"> kan het object zo niet veranderen. </w:t>
+      </w:r>
+      <w:r>
+        <w:rPr>
+          <w:rFonts w:ascii="Consolas" w:hAnsi="Consolas" w:cs="Consolas"/>
+          <w:sz w:val="18"/>
+          <w:shd w:val="clear" w:color="auto" w:fill="EEF4F2"/>
+        </w:rPr>
+        <w:t>isValidPoint</w:t>
+      </w:r>
+      <w:r>
+        <w:t xml:space="preserve"> controleert dat de voorraadlijst een gewoon object is met alleen veilige sleutels (</w:t>
+      </w:r>
+      <w:r>
+        <w:rPr>
+          <w:rFonts w:ascii="Consolas" w:hAnsi="Consolas" w:cs="Consolas"/>
+          <w:sz w:val="18"/>
+          <w:shd w:val="clear" w:color="auto" w:fill="EEF4F2"/>
+        </w:rPr>
+        <w:t>hasSafeStockKeys</w:t>
+      </w:r>
+      <w:r>
+        <w:t>).</w:t>
+      </w:r>
+    </w:p>
+    <w:p>
+      <w:r>
         <w:rPr>
           <w:rFonts w:ascii="Consolas" w:hAnsi="Consolas" w:cs="Consolas"/>
           <w:sz w:val="18"/>
@@ -14750,7 +15000,40 @@
         <w:t>stockEntry</w:t>
       </w:r>
       <w:r>
-        <w:t xml:space="preserve"> geeft de voorraadregel van één product op één punt.</w:t>
+        <w:t xml:space="preserve"> geeft de voorraadregel van één product op één punt. Beide gebruiken </w:t>
+      </w:r>
+      <w:r>
+        <w:rPr>
+          <w:rFonts w:ascii="Consolas" w:hAnsi="Consolas" w:cs="Consolas"/>
+          <w:sz w:val="18"/>
+          <w:shd w:val="clear" w:color="auto" w:fill="EEF4F2"/>
+        </w:rPr>
+        <w:t>pointProduct</w:t>
+      </w:r>
+      <w:r>
+        <w:t>, dat een regel alleen vindt als eigen sleutel van de voorraadlijst (</w:t>
+      </w:r>
+      <w:r>
+        <w:rPr>
+          <w:rFonts w:ascii="Consolas" w:hAnsi="Consolas" w:cs="Consolas"/>
+          <w:sz w:val="18"/>
+          <w:shd w:val="clear" w:color="auto" w:fill="EEF4F2"/>
+        </w:rPr>
+        <w:t>Object.hasOwn</w:t>
+      </w:r>
+      <w:r>
+        <w:t xml:space="preserve">). Een product-id als </w:t>
+      </w:r>
+      <w:r>
+        <w:rPr>
+          <w:rFonts w:ascii="Consolas" w:hAnsi="Consolas" w:cs="Consolas"/>
+          <w:sz w:val="18"/>
+          <w:shd w:val="clear" w:color="auto" w:fill="EEF4F2"/>
+        </w:rPr>
+        <w:t>toString</w:t>
+      </w:r>
+      <w:r>
+        <w:t xml:space="preserve"> vindt dus geen voorraadregel en schrijft er ook geen.</w:t>
       </w:r>
     </w:p>
     <w:p>
@@ -15158,32 +15441,21 @@
           <w:sz w:val="18"/>
           <w:shd w:val="clear" w:color="auto" w:fill="EEF4F2"/>
         </w:rPr>
-        <w:t>refreshIfNewDay</w:t>
-      </w:r>
-      <w:r>
-        <w:t>: een timer roept deze methode iedere minuut aan. Is de kalenderdag veranderd, dan worden de datum (</w:t>
-      </w:r>
-      <w:r>
-        <w:rPr>
-          <w:rFonts w:ascii="Consolas" w:hAnsi="Consolas" w:cs="Consolas"/>
-          <w:sz w:val="18"/>
-          <w:shd w:val="clear" w:color="auto" w:fill="EEF4F2"/>
-        </w:rPr>
-        <w:t>renderTodayLabel</w:t>
-      </w:r>
-      <w:r>
-        <w:t>) en de totalen (</w:t>
-      </w:r>
-      <w:r>
-        <w:rPr>
-          <w:rFonts w:ascii="Consolas" w:hAnsi="Consolas" w:cs="Consolas"/>
-          <w:sz w:val="18"/>
-          <w:shd w:val="clear" w:color="auto" w:fill="EEF4F2"/>
-        </w:rPr>
-        <w:t>renderStats</w:t>
-      </w:r>
-      <w:r>
-        <w:t>) opnieuw getekend.</w:t>
+        <w:t>requireAdmin</w:t>
+      </w:r>
+      <w:r>
+        <w:t xml:space="preserve">: iedere beheeractie begint hiermee (formulieren openen en opslaan, verwijderen, (de)activeren, correcties, leveringen en tellingen, export en </w:t>
+      </w:r>
+      <w:r>
+        <w:rPr>
+          <w:rFonts w:ascii="Consolas" w:hAnsi="Consolas" w:cs="Consolas"/>
+          <w:sz w:val="18"/>
+          <w:shd w:val="clear" w:color="auto" w:fill="EEF4F2"/>
+        </w:rPr>
+        <w:t>Alle gegevens wissen</w:t>
+      </w:r>
+      <w:r>
+        <w:t>). Is er geen beheerder ingelogd, dan gebeurt er niets en verschijnt "Log eerst in als beheerder.". Zo werkt een beheeractie ook niet als een verborgen knop toch wordt ingedrukt of de methode op een andere manier wordt aangeroepen. Registreren door een medewerker zelf vraagt geen login.</w:t>
       </w:r>
     </w:p>
     <w:p>
@@ -15202,7 +15474,7 @@
           <w:sz w:val="18"/>
           <w:shd w:val="clear" w:color="auto" w:fill="EEF4F2"/>
         </w:rPr>
-        <w:t>openModal</w:t>
+        <w:t>stopCameraAfterTimeout</w:t>
       </w:r>
       <w:r>
         <w:t xml:space="preserve"> en </w:t>
@@ -15213,43 +15485,32 @@
           <w:sz w:val="18"/>
           <w:shd w:val="clear" w:color="auto" w:fill="EEF4F2"/>
         </w:rPr>
-        <w:t>closeModal</w:t>
-      </w:r>
-      <w:r>
-        <w:t xml:space="preserve">: openen en sluiten een venster. </w:t>
-      </w:r>
-      <w:r>
-        <w:rPr>
-          <w:rFonts w:ascii="Consolas" w:hAnsi="Consolas" w:cs="Consolas"/>
-          <w:sz w:val="18"/>
-          <w:shd w:val="clear" w:color="auto" w:fill="EEF4F2"/>
-        </w:rPr>
-        <w:t>openModal</w:t>
-      </w:r>
-      <w:r>
-        <w:t xml:space="preserve"> onthoudt welk element de focus had (</w:t>
-      </w:r>
-      <w:r>
-        <w:rPr>
-          <w:rFonts w:ascii="Consolas" w:hAnsi="Consolas" w:cs="Consolas"/>
-          <w:sz w:val="18"/>
-          <w:shd w:val="clear" w:color="auto" w:fill="EEF4F2"/>
-        </w:rPr>
-        <w:t>rememberOpener</w:t>
-      </w:r>
-      <w:r>
-        <w:t xml:space="preserve">); </w:t>
-      </w:r>
-      <w:r>
-        <w:rPr>
-          <w:rFonts w:ascii="Consolas" w:hAnsi="Consolas" w:cs="Consolas"/>
-          <w:sz w:val="18"/>
-          <w:shd w:val="clear" w:color="auto" w:fill="EEF4F2"/>
-        </w:rPr>
-        <w:t>closeModal</w:t>
-      </w:r>
-      <w:r>
-        <w:t xml:space="preserve"> zet de focus daar weer op, als dat element nog zichtbaar op de pagina staat.</w:t>
+        <w:t>scheduleEnrollTimeout</w:t>
+      </w:r>
+      <w:r>
+        <w:t xml:space="preserve">: zetten de camera uit als er bij herkennen binnen </w:t>
+      </w:r>
+      <w:r>
+        <w:rPr>
+          <w:rFonts w:ascii="Consolas" w:hAnsi="Consolas" w:cs="Consolas"/>
+          <w:sz w:val="18"/>
+          <w:shd w:val="clear" w:color="auto" w:fill="EEF4F2"/>
+        </w:rPr>
+        <w:t>FACE_DEMO.scanTimeoutMs</w:t>
+      </w:r>
+      <w:r>
+        <w:t xml:space="preserve"> (20 seconden) niemand is herkend, of als er bij instellen in die tijd geen gezicht is vastgelegd. Het venster blijft open met een melding. </w:t>
+      </w:r>
+      <w:r>
+        <w:rPr>
+          <w:rFonts w:ascii="Consolas" w:hAnsi="Consolas" w:cs="Consolas"/>
+          <w:sz w:val="18"/>
+          <w:shd w:val="clear" w:color="auto" w:fill="EEF4F2"/>
+        </w:rPr>
+        <w:t>closeFaceModal</w:t>
+      </w:r>
+      <w:r>
+        <w:t xml:space="preserve"> ruimt een wachtende time-out op.</w:t>
       </w:r>
     </w:p>
     <w:p>
@@ -15268,21 +15529,32 @@
           <w:sz w:val="18"/>
           <w:shd w:val="clear" w:color="auto" w:fill="EEF4F2"/>
         </w:rPr>
-        <w:t>confirmOldMonthRemoval</w:t>
-      </w:r>
-      <w:r>
-        <w:t xml:space="preserve">: vraagt bevestiging voordat een correctie met </w:t>
-      </w:r>
-      <w:r>
-        <w:rPr>
-          <w:rFonts w:ascii="Consolas" w:hAnsi="Consolas" w:cs="Consolas"/>
-          <w:sz w:val="18"/>
-          <w:shd w:val="clear" w:color="auto" w:fill="EEF4F2"/>
-        </w:rPr>
-        <w:t>−</w:t>
-      </w:r>
-      <w:r>
-        <w:t xml:space="preserve"> een registratie uit een andere maand verwijdert.</w:t>
+        <w:t>refreshIfNewDay</w:t>
+      </w:r>
+      <w:r>
+        <w:t>: een timer roept deze methode iedere minuut aan. Is de kalenderdag veranderd, dan worden de datum (</w:t>
+      </w:r>
+      <w:r>
+        <w:rPr>
+          <w:rFonts w:ascii="Consolas" w:hAnsi="Consolas" w:cs="Consolas"/>
+          <w:sz w:val="18"/>
+          <w:shd w:val="clear" w:color="auto" w:fill="EEF4F2"/>
+        </w:rPr>
+        <w:t>renderTodayLabel</w:t>
+      </w:r>
+      <w:r>
+        <w:t>) en de totalen (</w:t>
+      </w:r>
+      <w:r>
+        <w:rPr>
+          <w:rFonts w:ascii="Consolas" w:hAnsi="Consolas" w:cs="Consolas"/>
+          <w:sz w:val="18"/>
+          <w:shd w:val="clear" w:color="auto" w:fill="EEF4F2"/>
+        </w:rPr>
+        <w:t>renderStats</w:t>
+      </w:r>
+      <w:r>
+        <w:t>) opnieuw getekend.</w:t>
       </w:r>
     </w:p>
     <w:p>
@@ -15301,43 +15573,54 @@
           <w:sz w:val="18"/>
           <w:shd w:val="clear" w:color="auto" w:fill="EEF4F2"/>
         </w:rPr>
-        <w:t>setSaveButtons</w:t>
-      </w:r>
-      <w:r>
-        <w:t xml:space="preserve">: zet de opslagknoppen van het medewerkers- en productformulier goed. Bij toevoegen staan er </w:t>
-      </w:r>
-      <w:r>
-        <w:rPr>
-          <w:rFonts w:ascii="Consolas" w:hAnsi="Consolas" w:cs="Consolas"/>
-          <w:sz w:val="18"/>
-          <w:shd w:val="clear" w:color="auto" w:fill="EEF4F2"/>
-        </w:rPr>
-        <w:t>Opslaan</w:t>
-      </w:r>
-      <w:r>
-        <w:t xml:space="preserve"> (secundair) en </w:t>
-      </w:r>
-      <w:r>
-        <w:rPr>
-          <w:rFonts w:ascii="Consolas" w:hAnsi="Consolas" w:cs="Consolas"/>
-          <w:sz w:val="18"/>
-          <w:shd w:val="clear" w:color="auto" w:fill="EEF4F2"/>
-        </w:rPr>
-        <w:t>Opslaan + opnieuw</w:t>
-      </w:r>
-      <w:r>
-        <w:t xml:space="preserve"> (primair); bij wijzigen alleen </w:t>
-      </w:r>
-      <w:r>
-        <w:rPr>
-          <w:rFonts w:ascii="Consolas" w:hAnsi="Consolas" w:cs="Consolas"/>
-          <w:sz w:val="18"/>
-          <w:shd w:val="clear" w:color="auto" w:fill="EEF4F2"/>
-        </w:rPr>
-        <w:t>Opslaan</w:t>
-      </w:r>
-      <w:r>
-        <w:t>, en die is dan primair.</w:t>
+        <w:t>openModal</w:t>
+      </w:r>
+      <w:r>
+        <w:t xml:space="preserve"> en </w:t>
+      </w:r>
+      <w:r>
+        <w:rPr>
+          <w:rFonts w:ascii="Consolas" w:hAnsi="Consolas" w:cs="Consolas"/>
+          <w:sz w:val="18"/>
+          <w:shd w:val="clear" w:color="auto" w:fill="EEF4F2"/>
+        </w:rPr>
+        <w:t>closeModal</w:t>
+      </w:r>
+      <w:r>
+        <w:t xml:space="preserve">: openen en sluiten een venster. </w:t>
+      </w:r>
+      <w:r>
+        <w:rPr>
+          <w:rFonts w:ascii="Consolas" w:hAnsi="Consolas" w:cs="Consolas"/>
+          <w:sz w:val="18"/>
+          <w:shd w:val="clear" w:color="auto" w:fill="EEF4F2"/>
+        </w:rPr>
+        <w:t>openModal</w:t>
+      </w:r>
+      <w:r>
+        <w:t xml:space="preserve"> onthoudt welk element de focus had (</w:t>
+      </w:r>
+      <w:r>
+        <w:rPr>
+          <w:rFonts w:ascii="Consolas" w:hAnsi="Consolas" w:cs="Consolas"/>
+          <w:sz w:val="18"/>
+          <w:shd w:val="clear" w:color="auto" w:fill="EEF4F2"/>
+        </w:rPr>
+        <w:t>rememberOpener</w:t>
+      </w:r>
+      <w:r>
+        <w:t xml:space="preserve">); </w:t>
+      </w:r>
+      <w:r>
+        <w:rPr>
+          <w:rFonts w:ascii="Consolas" w:hAnsi="Consolas" w:cs="Consolas"/>
+          <w:sz w:val="18"/>
+          <w:shd w:val="clear" w:color="auto" w:fill="EEF4F2"/>
+        </w:rPr>
+        <w:t>closeModal</w:t>
+      </w:r>
+      <w:r>
+        <w:t xml:space="preserve"> zet de focus daar weer op, als dat element nog zichtbaar op de pagina staat.</w:t>
       </w:r>
     </w:p>
     <w:p>
@@ -15356,54 +15639,21 @@
           <w:sz w:val="18"/>
           <w:shd w:val="clear" w:color="auto" w:fill="EEF4F2"/>
         </w:rPr>
-        <w:t>resetCorrectionDate</w:t>
-      </w:r>
-      <w:r>
-        <w:t xml:space="preserve">, </w:t>
-      </w:r>
-      <w:r>
-        <w:rPr>
-          <w:rFonts w:ascii="Consolas" w:hAnsi="Consolas" w:cs="Consolas"/>
-          <w:sz w:val="18"/>
-          <w:shd w:val="clear" w:color="auto" w:fill="EEF4F2"/>
-        </w:rPr>
-        <w:t>readCorrectionDate</w:t>
-      </w:r>
-      <w:r>
-        <w:t xml:space="preserve"> en </w:t>
-      </w:r>
-      <w:r>
-        <w:rPr>
-          <w:rFonts w:ascii="Consolas" w:hAnsi="Consolas" w:cs="Consolas"/>
-          <w:sz w:val="18"/>
-          <w:shd w:val="clear" w:color="auto" w:fill="EEF4F2"/>
-        </w:rPr>
-        <w:t>confirmOldMonthAddition</w:t>
-      </w:r>
-      <w:r>
-        <w:t xml:space="preserve">: het datumveld bij de correctie </w:t>
-      </w:r>
-      <w:r>
-        <w:rPr>
-          <w:rFonts w:ascii="Consolas" w:hAnsi="Consolas" w:cs="Consolas"/>
-          <w:sz w:val="18"/>
-          <w:shd w:val="clear" w:color="auto" w:fill="EEF4F2"/>
-        </w:rPr>
-        <w:t>+</w:t>
-      </w:r>
-      <w:r>
-        <w:t xml:space="preserve">. Na het inloggen staat het op vandaag; bij </w:t>
-      </w:r>
-      <w:r>
-        <w:rPr>
-          <w:rFonts w:ascii="Consolas" w:hAnsi="Consolas" w:cs="Consolas"/>
-          <w:sz w:val="18"/>
-          <w:shd w:val="clear" w:color="auto" w:fill="EEF4F2"/>
-        </w:rPr>
-        <w:t>+</w:t>
-      </w:r>
-      <w:r>
-        <w:t xml:space="preserve"> wordt de datum gecontroleerd (niet in de toekomst, niet vóór 2000) en volgt bij een eerdere maand een bevestigingsvraag.</w:t>
+        <w:t>confirmOldMonthRemoval</w:t>
+      </w:r>
+      <w:r>
+        <w:t xml:space="preserve">: vraagt bevestiging voordat een correctie met </w:t>
+      </w:r>
+      <w:r>
+        <w:rPr>
+          <w:rFonts w:ascii="Consolas" w:hAnsi="Consolas" w:cs="Consolas"/>
+          <w:sz w:val="18"/>
+          <w:shd w:val="clear" w:color="auto" w:fill="EEF4F2"/>
+        </w:rPr>
+        <w:t>−</w:t>
+      </w:r>
+      <w:r>
+        <w:t xml:space="preserve"> een registratie uit een andere maand verwijdert.</w:t>
       </w:r>
     </w:p>
     <w:p>
@@ -15422,6 +15672,127 @@
           <w:sz w:val="18"/>
           <w:shd w:val="clear" w:color="auto" w:fill="EEF4F2"/>
         </w:rPr>
+        <w:t>setSaveButtons</w:t>
+      </w:r>
+      <w:r>
+        <w:t xml:space="preserve">: zet de opslagknoppen van het medewerkers- en productformulier goed. Bij toevoegen staan er </w:t>
+      </w:r>
+      <w:r>
+        <w:rPr>
+          <w:rFonts w:ascii="Consolas" w:hAnsi="Consolas" w:cs="Consolas"/>
+          <w:sz w:val="18"/>
+          <w:shd w:val="clear" w:color="auto" w:fill="EEF4F2"/>
+        </w:rPr>
+        <w:t>Opslaan</w:t>
+      </w:r>
+      <w:r>
+        <w:t xml:space="preserve"> (secundair) en </w:t>
+      </w:r>
+      <w:r>
+        <w:rPr>
+          <w:rFonts w:ascii="Consolas" w:hAnsi="Consolas" w:cs="Consolas"/>
+          <w:sz w:val="18"/>
+          <w:shd w:val="clear" w:color="auto" w:fill="EEF4F2"/>
+        </w:rPr>
+        <w:t>Opslaan + opnieuw</w:t>
+      </w:r>
+      <w:r>
+        <w:t xml:space="preserve"> (primair); bij wijzigen alleen </w:t>
+      </w:r>
+      <w:r>
+        <w:rPr>
+          <w:rFonts w:ascii="Consolas" w:hAnsi="Consolas" w:cs="Consolas"/>
+          <w:sz w:val="18"/>
+          <w:shd w:val="clear" w:color="auto" w:fill="EEF4F2"/>
+        </w:rPr>
+        <w:t>Opslaan</w:t>
+      </w:r>
+      <w:r>
+        <w:t>, en die is dan primair.</w:t>
+      </w:r>
+    </w:p>
+    <w:p>
+      <w:pPr>
+        <w:pStyle w:val="Lijstalinea"/>
+        <w:numPr>
+          <w:ilvl w:val="0"/>
+          <w:numId w:val="3"/>
+        </w:numPr>
+        <w:spacing w:after="60"/>
+        <w:contextualSpacing w:val="0"/>
+      </w:pPr>
+      <w:r>
+        <w:rPr>
+          <w:rFonts w:ascii="Consolas" w:hAnsi="Consolas" w:cs="Consolas"/>
+          <w:sz w:val="18"/>
+          <w:shd w:val="clear" w:color="auto" w:fill="EEF4F2"/>
+        </w:rPr>
+        <w:t>resetCorrectionDate</w:t>
+      </w:r>
+      <w:r>
+        <w:t xml:space="preserve">, </w:t>
+      </w:r>
+      <w:r>
+        <w:rPr>
+          <w:rFonts w:ascii="Consolas" w:hAnsi="Consolas" w:cs="Consolas"/>
+          <w:sz w:val="18"/>
+          <w:shd w:val="clear" w:color="auto" w:fill="EEF4F2"/>
+        </w:rPr>
+        <w:t>readCorrectionDate</w:t>
+      </w:r>
+      <w:r>
+        <w:t xml:space="preserve"> en </w:t>
+      </w:r>
+      <w:r>
+        <w:rPr>
+          <w:rFonts w:ascii="Consolas" w:hAnsi="Consolas" w:cs="Consolas"/>
+          <w:sz w:val="18"/>
+          <w:shd w:val="clear" w:color="auto" w:fill="EEF4F2"/>
+        </w:rPr>
+        <w:t>confirmOldMonthAddition</w:t>
+      </w:r>
+      <w:r>
+        <w:t xml:space="preserve">: het datumveld bij de correctie </w:t>
+      </w:r>
+      <w:r>
+        <w:rPr>
+          <w:rFonts w:ascii="Consolas" w:hAnsi="Consolas" w:cs="Consolas"/>
+          <w:sz w:val="18"/>
+          <w:shd w:val="clear" w:color="auto" w:fill="EEF4F2"/>
+        </w:rPr>
+        <w:t>+</w:t>
+      </w:r>
+      <w:r>
+        <w:t xml:space="preserve">. Na het inloggen staat het op vandaag; bij </w:t>
+      </w:r>
+      <w:r>
+        <w:rPr>
+          <w:rFonts w:ascii="Consolas" w:hAnsi="Consolas" w:cs="Consolas"/>
+          <w:sz w:val="18"/>
+          <w:shd w:val="clear" w:color="auto" w:fill="EEF4F2"/>
+        </w:rPr>
+        <w:t>+</w:t>
+      </w:r>
+      <w:r>
+        <w:t xml:space="preserve"> wordt de datum gecontroleerd (niet in de toekomst, niet vóór 2000) en volgt bij een eerdere maand een bevestigingsvraag.</w:t>
+      </w:r>
+    </w:p>
+    <w:p>
+      <w:pPr>
+        <w:pStyle w:val="Lijstalinea"/>
+        <w:numPr>
+          <w:ilvl w:val="0"/>
+          <w:numId w:val="3"/>
+        </w:numPr>
+        <w:spacing w:after="60"/>
+        <w:contextualSpacing w:val="0"/>
+      </w:pPr>
+      <w:r>
+        <w:rPr>
+          <w:rFonts w:ascii="Consolas" w:hAnsi="Consolas" w:cs="Consolas"/>
+          <w:sz w:val="18"/>
+          <w:shd w:val="clear" w:color="auto" w:fill="EEF4F2"/>
+        </w:rPr>
         <w:t>saveStockField</w:t>
       </w:r>
       <w:r>
@@ -16099,7 +16470,7 @@
         <w:keepNext/>
       </w:pPr>
       <w:bookmarkStart w:id="80" w:name="k45"/>
-      <w:bookmarkStart w:id="81" w:name="_Toc242437670"/>
+      <w:bookmarkStart w:id="81" w:name="_Toc242686914"/>
       <w:r>
         <w:rPr>
           <w:rFonts w:ascii="Consolas" w:hAnsi="Consolas" w:cs="Consolas"/>
@@ -16240,7 +16611,7 @@
         <w:keepNext/>
       </w:pPr>
       <w:bookmarkStart w:id="82" w:name="k46"/>
-      <w:bookmarkStart w:id="83" w:name="_Toc242437671"/>
+      <w:bookmarkStart w:id="83" w:name="_Toc242686915"/>
       <w:r>
         <w:rPr>
           <w:rFonts w:ascii="Consolas" w:hAnsi="Consolas" w:cs="Consolas"/>
@@ -16317,7 +16688,7 @@
         <w:keepNext/>
       </w:pPr>
       <w:bookmarkStart w:id="84" w:name="k47"/>
-      <w:bookmarkStart w:id="85" w:name="_Toc242437672"/>
+      <w:bookmarkStart w:id="85" w:name="_Toc242686916"/>
       <w:r>
         <w:rPr>
           <w:rFonts w:ascii="Consolas" w:hAnsi="Consolas" w:cs="Consolas"/>
@@ -16466,7 +16837,7 @@
         <w:keepNext/>
       </w:pPr>
       <w:bookmarkStart w:id="86" w:name="k48"/>
-      <w:bookmarkStart w:id="87" w:name="_Toc242437673"/>
+      <w:bookmarkStart w:id="87" w:name="_Toc242686917"/>
       <w:r>
         <w:rPr>
           <w:rFonts w:ascii="Consolas" w:hAnsi="Consolas" w:cs="Consolas"/>
@@ -16533,7 +16904,7 @@
         <w:keepNext/>
       </w:pPr>
       <w:bookmarkStart w:id="88" w:name="k49"/>
-      <w:bookmarkStart w:id="89" w:name="_Toc242437674"/>
+      <w:bookmarkStart w:id="89" w:name="_Toc242686918"/>
       <w:r>
         <w:rPr>
           <w:rFonts w:ascii="Consolas" w:hAnsi="Consolas" w:cs="Consolas"/>
@@ -16633,7 +17004,7 @@
         <w:keepNext/>
       </w:pPr>
       <w:bookmarkStart w:id="90" w:name="k50"/>
-      <w:bookmarkStart w:id="91" w:name="_Toc242437675"/>
+      <w:bookmarkStart w:id="91" w:name="_Toc242686919"/>
       <w:r>
         <w:rPr>
           <w:rFonts w:ascii="Consolas" w:hAnsi="Consolas" w:cs="Consolas"/>
@@ -16678,7 +17049,7 @@
         <w:keepNext/>
       </w:pPr>
       <w:bookmarkStart w:id="92" w:name="k51"/>
-      <w:bookmarkStart w:id="93" w:name="_Toc242437676"/>
+      <w:bookmarkStart w:id="93" w:name="_Toc242686920"/>
       <w:r>
         <w:t>OPSLAGFOUTEN EN TERUGDRAAIEN</w:t>
       </w:r>
@@ -16718,7 +17089,7 @@
         <w:keepNext/>
       </w:pPr>
       <w:bookmarkStart w:id="94" w:name="k52"/>
-      <w:bookmarkStart w:id="95" w:name="_Toc242437677"/>
+      <w:bookmarkStart w:id="95" w:name="_Toc242686921"/>
       <w:r>
         <w:t>ADMINFUNCTIES</w:t>
       </w:r>
@@ -16817,7 +17188,51 @@
         <w:t>false</w:t>
       </w:r>
       <w:r>
-        <w:t xml:space="preserve"> en maken het wachtwoordveld leeg.</w:t>
+        <w:t xml:space="preserve"> en maken het wachtwoordveld leeg. </w:t>
+      </w:r>
+      <w:r>
+        <w:rPr>
+          <w:rFonts w:ascii="Consolas" w:hAnsi="Consolas" w:cs="Consolas"/>
+          <w:sz w:val="18"/>
+          <w:shd w:val="clear" w:color="auto" w:fill="EEF4F2"/>
+        </w:rPr>
+        <w:t>closeAdmin</w:t>
+      </w:r>
+      <w:r>
+        <w:t xml:space="preserve"> verbergt ook het dashboard in het venster. Iedere beheeractie controleert </w:t>
+      </w:r>
+      <w:r>
+        <w:rPr>
+          <w:rFonts w:ascii="Consolas" w:hAnsi="Consolas" w:cs="Consolas"/>
+          <w:sz w:val="18"/>
+          <w:shd w:val="clear" w:color="auto" w:fill="EEF4F2"/>
+        </w:rPr>
+        <w:t>adminLoggedIn</w:t>
+      </w:r>
+      <w:r>
+        <w:t xml:space="preserve"> zelf via </w:t>
+      </w:r>
+      <w:r>
+        <w:rPr>
+          <w:rFonts w:ascii="Consolas" w:hAnsi="Consolas" w:cs="Consolas"/>
+          <w:sz w:val="18"/>
+          <w:shd w:val="clear" w:color="auto" w:fill="EEF4F2"/>
+        </w:rPr>
+        <w:t>requireAdmin</w:t>
+      </w:r>
+      <w:r>
+        <w:t xml:space="preserve"> (zie </w:t>
+      </w:r>
+      <w:r>
+        <w:rPr>
+          <w:rFonts w:ascii="Consolas" w:hAnsi="Consolas" w:cs="Consolas"/>
+          <w:sz w:val="18"/>
+          <w:shd w:val="clear" w:color="auto" w:fill="EEF4F2"/>
+        </w:rPr>
+        <w:t>RegistrationApp</w:t>
+      </w:r>
+      <w:r>
+        <w:t xml:space="preserve"> hierboven).</w:t>
       </w:r>
     </w:p>
     <w:p>
@@ -16920,7 +17335,7 @@
         <w:keepNext/>
       </w:pPr>
       <w:bookmarkStart w:id="96" w:name="k53"/>
-      <w:bookmarkStart w:id="97" w:name="_Toc242437678"/>
+      <w:bookmarkStart w:id="97" w:name="_Toc242686922"/>
       <w:r>
         <w:t xml:space="preserve">CSV-EXPORT (CLASS </w:t>
       </w:r>
@@ -17328,7 +17743,7 @@
         <w:keepNext/>
       </w:pPr>
       <w:bookmarkStart w:id="98" w:name="k54"/>
-      <w:bookmarkStart w:id="99" w:name="_Toc242437679"/>
+      <w:bookmarkStart w:id="99" w:name="_Toc242686923"/>
       <w:r>
         <w:t>EVENT LISTENERS</w:t>
       </w:r>
@@ -17933,7 +18348,7 @@
         </w:numPr>
       </w:pPr>
       <w:bookmarkStart w:id="100" w:name="k55"/>
-      <w:bookmarkStart w:id="101" w:name="_Toc242437680"/>
+      <w:bookmarkStart w:id="101" w:name="_Toc242686924"/>
       <w:r>
         <w:t>DATAMODEL EN KOPPELINGEN.</w:t>
       </w:r>
@@ -17951,7 +18366,7 @@
         <w:keepNext/>
       </w:pPr>
       <w:bookmarkStart w:id="102" w:name="k56"/>
-      <w:bookmarkStart w:id="103" w:name="_Toc242437681"/>
+      <w:bookmarkStart w:id="103" w:name="_Toc242686925"/>
       <w:r>
         <w:t>BEDRIJVEN</w:t>
       </w:r>
@@ -18162,7 +18577,7 @@
         <w:keepNext/>
       </w:pPr>
       <w:bookmarkStart w:id="104" w:name="k57"/>
-      <w:bookmarkStart w:id="105" w:name="_Toc242437682"/>
+      <w:bookmarkStart w:id="105" w:name="_Toc242686926"/>
       <w:r>
         <w:t>CONSUMPTIEPUNTEN</w:t>
       </w:r>
@@ -18481,7 +18896,7 @@
         <w:keepNext/>
       </w:pPr>
       <w:bookmarkStart w:id="106" w:name="k58"/>
-      <w:bookmarkStart w:id="107" w:name="_Toc242437683"/>
+      <w:bookmarkStart w:id="107" w:name="_Toc242686927"/>
       <w:r>
         <w:t>MEDEWERKERS</w:t>
       </w:r>
@@ -19037,7 +19452,7 @@
         <w:keepNext/>
       </w:pPr>
       <w:bookmarkStart w:id="108" w:name="k59"/>
-      <w:bookmarkStart w:id="109" w:name="_Toc242437684"/>
+      <w:bookmarkStart w:id="109" w:name="_Toc242686928"/>
       <w:r>
         <w:t>REGISTRATIES</w:t>
       </w:r>
@@ -19603,7 +20018,7 @@
         </w:numPr>
       </w:pPr>
       <w:bookmarkStart w:id="110" w:name="k60"/>
-      <w:bookmarkStart w:id="111" w:name="_Toc242437685"/>
+      <w:bookmarkStart w:id="111" w:name="_Toc242686929"/>
       <w:r>
         <w:t>BELANGRIJKE DEMO-BEPERKINGEN.</w:t>
       </w:r>
@@ -19709,7 +20124,7 @@
         <w:contextualSpacing w:val="0"/>
       </w:pPr>
       <w:r>
-        <w:t>De login heeft geen echte beveiliging: elk ingevuld wachtwoord werkt.</w:t>
+        <w:t>De login heeft geen echte beveiliging: elk ingevuld wachtwoord werkt. De beheeracties controleren wel zelf of er iemand is ingelogd, maar dat is een controle in de browser die met de ontwikkelaarstools te omzeilen is.</w:t>
       </w:r>
     </w:p>
     <w:p>
@@ -19723,18 +20138,7 @@
         <w:contextualSpacing w:val="0"/>
       </w:pPr>
       <w:r>
-        <w:t xml:space="preserve">Alle gegevens staan als gewone tekst in </w:t>
-      </w:r>
-      <w:r>
-        <w:rPr>
-          <w:rFonts w:ascii="Consolas" w:hAnsi="Consolas" w:cs="Consolas"/>
-          <w:sz w:val="18"/>
-          <w:shd w:val="clear" w:color="auto" w:fill="EEF4F2"/>
-        </w:rPr>
-        <w:t>localStorage</w:t>
-      </w:r>
-      <w:r>
-        <w:t xml:space="preserve"> van de tablet. Wie het apparaat en de ontwikkelaarstools van de browser gebruikt, kan ze lezen en aanpassen, en kan via de console ook de code van de pagina uitvoeren.</w:t>
+        <w:t>Iedereen bij de tablet kan op de naam van een collega tikken en op diens naam registreren, of in diens productvenster een eigen gezicht instellen (demo). Iedere registratie staat wel met datum en tijd in het beheer en de beheerder kan die corrigeren. In productie is een pas, QR-code of pincode nodig, en een overzicht waarin een medewerker zijn eigen registraties ziet.</w:t>
       </w:r>
     </w:p>
     <w:p>
@@ -19748,7 +20152,18 @@
         <w:contextualSpacing w:val="0"/>
       </w:pPr>
       <w:r>
-        <w:t>Er zijn geen gebruikersrollen of wachtwoordbeheer.</w:t>
+        <w:t xml:space="preserve">Alle gegevens staan als gewone tekst in </w:t>
+      </w:r>
+      <w:r>
+        <w:rPr>
+          <w:rFonts w:ascii="Consolas" w:hAnsi="Consolas" w:cs="Consolas"/>
+          <w:sz w:val="18"/>
+          <w:shd w:val="clear" w:color="auto" w:fill="EEF4F2"/>
+        </w:rPr>
+        <w:t>localStorage</w:t>
+      </w:r>
+      <w:r>
+        <w:t xml:space="preserve"> van de tablet. Wie het apparaat en de ontwikkelaarstools van de browser gebruikt, kan ze lezen en aanpassen, en kan via de console ook de code van de pagina uitvoeren.</w:t>
       </w:r>
     </w:p>
     <w:p>
@@ -19762,18 +20177,7 @@
         <w:contextualSpacing w:val="0"/>
       </w:pPr>
       <w:r>
-        <w:t xml:space="preserve">Verwijderde medewerkers krijgen geen herstelmogelijkheid, en </w:t>
-      </w:r>
-      <w:r>
-        <w:rPr>
-          <w:rFonts w:ascii="Consolas" w:hAnsi="Consolas" w:cs="Consolas"/>
-          <w:sz w:val="18"/>
-          <w:shd w:val="clear" w:color="auto" w:fill="EEF4F2"/>
-        </w:rPr>
-        <w:t>Alle gegevens wissen</w:t>
-      </w:r>
-      <w:r>
-        <w:t xml:space="preserve"> kan niet ongedaan worden gemaakt.</w:t>
+        <w:t>Er zijn geen gebruikersrollen of wachtwoordbeheer.</w:t>
       </w:r>
     </w:p>
     <w:p>
@@ -19787,7 +20191,18 @@
         <w:contextualSpacing w:val="0"/>
       </w:pPr>
       <w:r>
-        <w:t>Er is geen server-side auditlog; het logboek staat alleen in de browser.</w:t>
+        <w:t xml:space="preserve">Verwijderde medewerkers krijgen geen herstelmogelijkheid, en </w:t>
+      </w:r>
+      <w:r>
+        <w:rPr>
+          <w:rFonts w:ascii="Consolas" w:hAnsi="Consolas" w:cs="Consolas"/>
+          <w:sz w:val="18"/>
+          <w:shd w:val="clear" w:color="auto" w:fill="EEF4F2"/>
+        </w:rPr>
+        <w:t>Alle gegevens wissen</w:t>
+      </w:r>
+      <w:r>
+        <w:t xml:space="preserve"> kan niet ongedaan worden gemaakt.</w:t>
       </w:r>
     </w:p>
     <w:p>
@@ -19801,29 +20216,7 @@
         <w:contextualSpacing w:val="0"/>
       </w:pPr>
       <w:r>
-        <w:t>Bescherming tegen inbedden in een frame (</w:t>
-      </w:r>
-      <w:r>
-        <w:rPr>
-          <w:rFonts w:ascii="Consolas" w:hAnsi="Consolas" w:cs="Consolas"/>
-          <w:sz w:val="18"/>
-          <w:shd w:val="clear" w:color="auto" w:fill="EEF4F2"/>
-        </w:rPr>
-        <w:t>frame-ancestors</w:t>
-      </w:r>
-      <w:r>
-        <w:t xml:space="preserve"> of </w:t>
-      </w:r>
-      <w:r>
-        <w:rPr>
-          <w:rFonts w:ascii="Consolas" w:hAnsi="Consolas" w:cs="Consolas"/>
-          <w:sz w:val="18"/>
-          <w:shd w:val="clear" w:color="auto" w:fill="EEF4F2"/>
-        </w:rPr>
-        <w:t>X-Frame-Options</w:t>
-      </w:r>
-      <w:r>
-        <w:t>) kan alleen met een HTTP-header van de webserver en zit dus niet in de demo.</w:t>
+        <w:t>Er is geen server-side auditlog; het logboek staat alleen in de browser.</w:t>
       </w:r>
     </w:p>
     <w:p>
@@ -19837,6 +20230,42 @@
         <w:contextualSpacing w:val="0"/>
       </w:pPr>
       <w:r>
+        <w:t>Bescherming tegen inbedden in een frame (</w:t>
+      </w:r>
+      <w:r>
+        <w:rPr>
+          <w:rFonts w:ascii="Consolas" w:hAnsi="Consolas" w:cs="Consolas"/>
+          <w:sz w:val="18"/>
+          <w:shd w:val="clear" w:color="auto" w:fill="EEF4F2"/>
+        </w:rPr>
+        <w:t>frame-ancestors</w:t>
+      </w:r>
+      <w:r>
+        <w:t xml:space="preserve"> of </w:t>
+      </w:r>
+      <w:r>
+        <w:rPr>
+          <w:rFonts w:ascii="Consolas" w:hAnsi="Consolas" w:cs="Consolas"/>
+          <w:sz w:val="18"/>
+          <w:shd w:val="clear" w:color="auto" w:fill="EEF4F2"/>
+        </w:rPr>
+        <w:t>X-Frame-Options</w:t>
+      </w:r>
+      <w:r>
+        <w:t>) kan alleen met een HTTP-header van de webserver en zit dus niet in de demo.</w:t>
+      </w:r>
+    </w:p>
+    <w:p>
+      <w:pPr>
+        <w:pStyle w:val="Lijstalinea"/>
+        <w:numPr>
+          <w:ilvl w:val="0"/>
+          <w:numId w:val="3"/>
+        </w:numPr>
+        <w:spacing w:after="60"/>
+        <w:contextualSpacing w:val="0"/>
+      </w:pPr>
+      <w:r>
         <w:t xml:space="preserve">De gezichtsherkenning is alleen een demo. Ingestelde gezichten zijn na het herladen van de pagina weg. Er is geen controle of er een echt, levend gezicht voor de camera staat, en hoe vaak de verkeerde persoon wordt herkend, is niet gemeten. Bij het laden toont de console één onschadelijke CSP-melding over </w:t>
       </w:r>
       <w:r>
@@ -19848,7 +20277,7 @@
         <w:t>wasm-eval</w:t>
       </w:r>
       <w:r>
-        <w:t>, omdat de bibliotheek test of WebAssembly werkt. Zie het TO (hoofdstuk 13) voor de privacyregels en de beveiliging.</w:t>
+        <w:t>, omdat de bibliotheek test of WebAssembly werkt. De bibliotheek face-api wordt niet meer onderhouden (de repository is gearchiveerd) en krijgt dus geen beveiligingsupdates. Ze staat met een vaste versie en controlegetallen in het project en is alleen voor de demo bedoeld. Zie het TO (hoofdstuk 13) voor de privacyregels en de beveiliging.</w:t>
       </w:r>
     </w:p>
     <w:p>
@@ -19880,7 +20309,7 @@
         </w:numPr>
       </w:pPr>
       <w:bookmarkStart w:id="112" w:name="k61"/>
-      <w:bookmarkStart w:id="113" w:name="_Toc242437686"/>
+      <w:bookmarkStart w:id="113" w:name="_Toc242686930"/>
       <w:r>
         <w:t>CODE UITLEGGEN TIJDENS EEN PRESENTATIE.</w:t>
       </w:r>
@@ -20165,7 +20594,7 @@
         </w:numPr>
       </w:pPr>
       <w:bookmarkStart w:id="114" w:name="k62"/>
-      <w:bookmarkStart w:id="115" w:name="_Toc242437687"/>
+      <w:bookmarkStart w:id="115" w:name="_Toc242686931"/>
       <w:r>
         <w:t>MOGELIJKE VERVOLGSTAPPEN.</w:t>
       </w:r>
@@ -20192,7 +20621,7 @@
       </w:r>
       <w:r>
         <w:tab/>
-        <w:t>Kies een backend, bijvoorbeeld PHP, Node.js of een beheerde dienst.</w:t>
+        <w:t>Kies een backend, bijvoorbeeld PHP, .NET of een beheerde dienst. Node.js valt af: TVB gebruikt het bij voorkeur niet voor de eigen software (in dit project alleen voor de tests, de CI en het maken van de Word-bestanden).</w:t>
       </w:r>
     </w:p>
     <w:p>
@@ -20384,6 +20813,8 @@
       </w:r>
       <w:r>
         <w:tab/>
+      </w:r>
+      <w:r>
         <w:t>Voeg naast het maandfilter ook jaar- en periodefilters toe.</w:t>
       </w:r>
     </w:p>
@@ -20743,7 +21174,7 @@
         <v:path o:extrusionok="f" gradientshapeok="t" o:connecttype="rect"/>
         <o:lock v:ext="edit" aspectratio="t"/>
       </v:shapetype>
-      <v:shape id="_x0000_i1025" type="#_x0000_t75" style="width:254pt;height:219.5pt" o:bullet="t">
+      <v:shape id="_x0000_i1025" type="#_x0000_t75" style="width:254.25pt;height:219.75pt" o:bullet="t">
         <v:imagedata r:id="rId1" o:title="Bulletpoint"/>
       </v:shape>
     </w:pict>

</xml_diff>

<commit_message>
Draai de Node.js-tekst in TO, DOCUMENTATIE en README terug (revert van 8a5d1aa) en maak de Word-bestanden opnieuw
</commit_message>
<xml_diff>
--- a/docs/DOCUMENTATIE.docx
+++ b/docs/DOCUMENTATIE.docx
@@ -82,7 +82,7 @@
           <w:numId w:val="0"/>
         </w:numPr>
       </w:pPr>
-      <w:bookmarkStart w:id="0" w:name="_Toc242686878"/>
+      <w:bookmarkStart w:id="0" w:name="_Toc242687069"/>
       <w:r>
         <w:t>INHOUDSOPGAVE.</w:t>
       </w:r>
@@ -112,7 +112,7 @@
       <w:r>
         <w:fldChar w:fldCharType="separate"/>
       </w:r>
-      <w:hyperlink w:anchor="_Toc242686878" w:history="1">
+      <w:hyperlink w:anchor="_Toc242687069" w:history="1">
         <w:r>
           <w:rPr>
             <w:rStyle w:val="Hyperlink"/>
@@ -139,7 +139,7 @@
             <w:noProof/>
             <w:webHidden/>
           </w:rPr>
-          <w:instrText xml:space="preserve"> PAGEREF _Toc242686878 \h </w:instrText>
+          <w:instrText xml:space="preserve"> PAGEREF _Toc242687069 \h </w:instrText>
         </w:r>
         <w:r>
           <w:rPr>
@@ -186,7 +186,7 @@
           <w:lang w:eastAsia="nl-NL"/>
         </w:rPr>
       </w:pPr>
-      <w:hyperlink w:anchor="_Toc242686879" w:history="1">
+      <w:hyperlink w:anchor="_Toc242687070" w:history="1">
         <w:r>
           <w:rPr>
             <w:rStyle w:val="Hyperlink"/>
@@ -231,7 +231,7 @@
             <w:noProof/>
             <w:webHidden/>
           </w:rPr>
-          <w:instrText xml:space="preserve"> PAGEREF _Toc242686879 \h </w:instrText>
+          <w:instrText xml:space="preserve"> PAGEREF _Toc242687070 \h </w:instrText>
         </w:r>
         <w:r>
           <w:rPr>
@@ -278,7 +278,7 @@
           <w:lang w:eastAsia="nl-NL"/>
         </w:rPr>
       </w:pPr>
-      <w:hyperlink w:anchor="_Toc242686880" w:history="1">
+      <w:hyperlink w:anchor="_Toc242687071" w:history="1">
         <w:r>
           <w:rPr>
             <w:rStyle w:val="Hyperlink"/>
@@ -323,7 +323,7 @@
             <w:noProof/>
             <w:webHidden/>
           </w:rPr>
-          <w:instrText xml:space="preserve"> PAGEREF _Toc242686880 \h </w:instrText>
+          <w:instrText xml:space="preserve"> PAGEREF _Toc242687071 \h </w:instrText>
         </w:r>
         <w:r>
           <w:rPr>
@@ -370,7 +370,7 @@
           <w:lang w:eastAsia="nl-NL"/>
         </w:rPr>
       </w:pPr>
-      <w:hyperlink w:anchor="_Toc242686881" w:history="1">
+      <w:hyperlink w:anchor="_Toc242687072" w:history="1">
         <w:r>
           <w:rPr>
             <w:rStyle w:val="Hyperlink"/>
@@ -415,7 +415,7 @@
             <w:noProof/>
             <w:webHidden/>
           </w:rPr>
-          <w:instrText xml:space="preserve"> PAGEREF _Toc242686881 \h </w:instrText>
+          <w:instrText xml:space="preserve"> PAGEREF _Toc242687072 \h </w:instrText>
         </w:r>
         <w:r>
           <w:rPr>
@@ -462,7 +462,7 @@
           <w:lang w:eastAsia="nl-NL"/>
         </w:rPr>
       </w:pPr>
-      <w:hyperlink w:anchor="_Toc242686882" w:history="1">
+      <w:hyperlink w:anchor="_Toc242687073" w:history="1">
         <w:r>
           <w:rPr>
             <w:rStyle w:val="Hyperlink"/>
@@ -507,7 +507,7 @@
             <w:noProof/>
             <w:webHidden/>
           </w:rPr>
-          <w:instrText xml:space="preserve"> PAGEREF _Toc242686882 \h </w:instrText>
+          <w:instrText xml:space="preserve"> PAGEREF _Toc242687073 \h </w:instrText>
         </w:r>
         <w:r>
           <w:rPr>
@@ -554,7 +554,7 @@
           <w:lang w:eastAsia="nl-NL"/>
         </w:rPr>
       </w:pPr>
-      <w:hyperlink w:anchor="_Toc242686883" w:history="1">
+      <w:hyperlink w:anchor="_Toc242687074" w:history="1">
         <w:r>
           <w:rPr>
             <w:rStyle w:val="Hyperlink"/>
@@ -599,7 +599,7 @@
             <w:noProof/>
             <w:webHidden/>
           </w:rPr>
-          <w:instrText xml:space="preserve"> PAGEREF _Toc242686883 \h </w:instrText>
+          <w:instrText xml:space="preserve"> PAGEREF _Toc242687074 \h </w:instrText>
         </w:r>
         <w:r>
           <w:rPr>
@@ -646,7 +646,7 @@
           <w:lang w:eastAsia="nl-NL"/>
         </w:rPr>
       </w:pPr>
-      <w:hyperlink w:anchor="_Toc242686884" w:history="1">
+      <w:hyperlink w:anchor="_Toc242687075" w:history="1">
         <w:r>
           <w:rPr>
             <w:rStyle w:val="Hyperlink"/>
@@ -691,7 +691,7 @@
             <w:noProof/>
             <w:webHidden/>
           </w:rPr>
-          <w:instrText xml:space="preserve"> PAGEREF _Toc242686884 \h </w:instrText>
+          <w:instrText xml:space="preserve"> PAGEREF _Toc242687075 \h </w:instrText>
         </w:r>
         <w:r>
           <w:rPr>
@@ -738,7 +738,7 @@
           <w:lang w:eastAsia="nl-NL"/>
         </w:rPr>
       </w:pPr>
-      <w:hyperlink w:anchor="_Toc242686885" w:history="1">
+      <w:hyperlink w:anchor="_Toc242687076" w:history="1">
         <w:r>
           <w:rPr>
             <w:rStyle w:val="Hyperlink"/>
@@ -783,7 +783,7 @@
             <w:noProof/>
             <w:webHidden/>
           </w:rPr>
-          <w:instrText xml:space="preserve"> PAGEREF _Toc242686885 \h </w:instrText>
+          <w:instrText xml:space="preserve"> PAGEREF _Toc242687076 \h </w:instrText>
         </w:r>
         <w:r>
           <w:rPr>
@@ -830,7 +830,7 @@
           <w:lang w:eastAsia="nl-NL"/>
         </w:rPr>
       </w:pPr>
-      <w:hyperlink w:anchor="_Toc242686886" w:history="1">
+      <w:hyperlink w:anchor="_Toc242687077" w:history="1">
         <w:r>
           <w:rPr>
             <w:rStyle w:val="Hyperlink"/>
@@ -875,7 +875,7 @@
             <w:noProof/>
             <w:webHidden/>
           </w:rPr>
-          <w:instrText xml:space="preserve"> PAGEREF _Toc242686886 \h </w:instrText>
+          <w:instrText xml:space="preserve"> PAGEREF _Toc242687077 \h </w:instrText>
         </w:r>
         <w:r>
           <w:rPr>
@@ -922,7 +922,7 @@
           <w:lang w:eastAsia="nl-NL"/>
         </w:rPr>
       </w:pPr>
-      <w:hyperlink w:anchor="_Toc242686887" w:history="1">
+      <w:hyperlink w:anchor="_Toc242687078" w:history="1">
         <w:r>
           <w:rPr>
             <w:rStyle w:val="Hyperlink"/>
@@ -967,7 +967,7 @@
             <w:noProof/>
             <w:webHidden/>
           </w:rPr>
-          <w:instrText xml:space="preserve"> PAGEREF _Toc242686887 \h </w:instrText>
+          <w:instrText xml:space="preserve"> PAGEREF _Toc242687078 \h </w:instrText>
         </w:r>
         <w:r>
           <w:rPr>
@@ -1014,7 +1014,7 @@
           <w:lang w:eastAsia="nl-NL"/>
         </w:rPr>
       </w:pPr>
-      <w:hyperlink w:anchor="_Toc242686888" w:history="1">
+      <w:hyperlink w:anchor="_Toc242687079" w:history="1">
         <w:r>
           <w:rPr>
             <w:rStyle w:val="Hyperlink"/>
@@ -1059,7 +1059,7 @@
             <w:noProof/>
             <w:webHidden/>
           </w:rPr>
-          <w:instrText xml:space="preserve"> PAGEREF _Toc242686888 \h </w:instrText>
+          <w:instrText xml:space="preserve"> PAGEREF _Toc242687079 \h </w:instrText>
         </w:r>
         <w:r>
           <w:rPr>
@@ -1106,7 +1106,7 @@
           <w:lang w:eastAsia="nl-NL"/>
         </w:rPr>
       </w:pPr>
-      <w:hyperlink w:anchor="_Toc242686889" w:history="1">
+      <w:hyperlink w:anchor="_Toc242687080" w:history="1">
         <w:r>
           <w:rPr>
             <w:rStyle w:val="Hyperlink"/>
@@ -1151,7 +1151,7 @@
             <w:noProof/>
             <w:webHidden/>
           </w:rPr>
-          <w:instrText xml:space="preserve"> PAGEREF _Toc242686889 \h </w:instrText>
+          <w:instrText xml:space="preserve"> PAGEREF _Toc242687080 \h </w:instrText>
         </w:r>
         <w:r>
           <w:rPr>
@@ -1198,7 +1198,7 @@
           <w:lang w:eastAsia="nl-NL"/>
         </w:rPr>
       </w:pPr>
-      <w:hyperlink w:anchor="_Toc242686890" w:history="1">
+      <w:hyperlink w:anchor="_Toc242687081" w:history="1">
         <w:r>
           <w:rPr>
             <w:rStyle w:val="Hyperlink"/>
@@ -1243,7 +1243,7 @@
             <w:noProof/>
             <w:webHidden/>
           </w:rPr>
-          <w:instrText xml:space="preserve"> PAGEREF _Toc242686890 \h </w:instrText>
+          <w:instrText xml:space="preserve"> PAGEREF _Toc242687081 \h </w:instrText>
         </w:r>
         <w:r>
           <w:rPr>
@@ -1290,7 +1290,7 @@
           <w:lang w:eastAsia="nl-NL"/>
         </w:rPr>
       </w:pPr>
-      <w:hyperlink w:anchor="_Toc242686891" w:history="1">
+      <w:hyperlink w:anchor="_Toc242687082" w:history="1">
         <w:r>
           <w:rPr>
             <w:rStyle w:val="Hyperlink"/>
@@ -1335,7 +1335,7 @@
             <w:noProof/>
             <w:webHidden/>
           </w:rPr>
-          <w:instrText xml:space="preserve"> PAGEREF _Toc242686891 \h </w:instrText>
+          <w:instrText xml:space="preserve"> PAGEREF _Toc242687082 \h </w:instrText>
         </w:r>
         <w:r>
           <w:rPr>
@@ -1382,7 +1382,7 @@
           <w:lang w:eastAsia="nl-NL"/>
         </w:rPr>
       </w:pPr>
-      <w:hyperlink w:anchor="_Toc242686892" w:history="1">
+      <w:hyperlink w:anchor="_Toc242687083" w:history="1">
         <w:r>
           <w:rPr>
             <w:rStyle w:val="Hyperlink"/>
@@ -1427,7 +1427,7 @@
             <w:noProof/>
             <w:webHidden/>
           </w:rPr>
-          <w:instrText xml:space="preserve"> PAGEREF _Toc242686892 \h </w:instrText>
+          <w:instrText xml:space="preserve"> PAGEREF _Toc242687083 \h </w:instrText>
         </w:r>
         <w:r>
           <w:rPr>
@@ -1474,7 +1474,7 @@
           <w:lang w:eastAsia="nl-NL"/>
         </w:rPr>
       </w:pPr>
-      <w:hyperlink w:anchor="_Toc242686893" w:history="1">
+      <w:hyperlink w:anchor="_Toc242687084" w:history="1">
         <w:r>
           <w:rPr>
             <w:rStyle w:val="Hyperlink"/>
@@ -1519,7 +1519,7 @@
             <w:noProof/>
             <w:webHidden/>
           </w:rPr>
-          <w:instrText xml:space="preserve"> PAGEREF _Toc242686893 \h </w:instrText>
+          <w:instrText xml:space="preserve"> PAGEREF _Toc242687084 \h </w:instrText>
         </w:r>
         <w:r>
           <w:rPr>
@@ -1566,7 +1566,7 @@
           <w:lang w:eastAsia="nl-NL"/>
         </w:rPr>
       </w:pPr>
-      <w:hyperlink w:anchor="_Toc242686894" w:history="1">
+      <w:hyperlink w:anchor="_Toc242687085" w:history="1">
         <w:r>
           <w:rPr>
             <w:rStyle w:val="Hyperlink"/>
@@ -1611,7 +1611,7 @@
             <w:noProof/>
             <w:webHidden/>
           </w:rPr>
-          <w:instrText xml:space="preserve"> PAGEREF _Toc242686894 \h </w:instrText>
+          <w:instrText xml:space="preserve"> PAGEREF _Toc242687085 \h </w:instrText>
         </w:r>
         <w:r>
           <w:rPr>
@@ -1658,7 +1658,7 @@
           <w:lang w:eastAsia="nl-NL"/>
         </w:rPr>
       </w:pPr>
-      <w:hyperlink w:anchor="_Toc242686895" w:history="1">
+      <w:hyperlink w:anchor="_Toc242687086" w:history="1">
         <w:r>
           <w:rPr>
             <w:rStyle w:val="Hyperlink"/>
@@ -1703,7 +1703,7 @@
             <w:noProof/>
             <w:webHidden/>
           </w:rPr>
-          <w:instrText xml:space="preserve"> PAGEREF _Toc242686895 \h </w:instrText>
+          <w:instrText xml:space="preserve"> PAGEREF _Toc242687086 \h </w:instrText>
         </w:r>
         <w:r>
           <w:rPr>
@@ -1750,7 +1750,7 @@
           <w:lang w:eastAsia="nl-NL"/>
         </w:rPr>
       </w:pPr>
-      <w:hyperlink w:anchor="_Toc242686896" w:history="1">
+      <w:hyperlink w:anchor="_Toc242687087" w:history="1">
         <w:r>
           <w:rPr>
             <w:rStyle w:val="Hyperlink"/>
@@ -1795,7 +1795,7 @@
             <w:noProof/>
             <w:webHidden/>
           </w:rPr>
-          <w:instrText xml:space="preserve"> PAGEREF _Toc242686896 \h </w:instrText>
+          <w:instrText xml:space="preserve"> PAGEREF _Toc242687087 \h </w:instrText>
         </w:r>
         <w:r>
           <w:rPr>
@@ -1842,7 +1842,7 @@
           <w:lang w:eastAsia="nl-NL"/>
         </w:rPr>
       </w:pPr>
-      <w:hyperlink w:anchor="_Toc242686897" w:history="1">
+      <w:hyperlink w:anchor="_Toc242687088" w:history="1">
         <w:r>
           <w:rPr>
             <w:rStyle w:val="Hyperlink"/>
@@ -1887,7 +1887,7 @@
             <w:noProof/>
             <w:webHidden/>
           </w:rPr>
-          <w:instrText xml:space="preserve"> PAGEREF _Toc242686897 \h </w:instrText>
+          <w:instrText xml:space="preserve"> PAGEREF _Toc242687088 \h </w:instrText>
         </w:r>
         <w:r>
           <w:rPr>
@@ -1934,7 +1934,7 @@
           <w:lang w:eastAsia="nl-NL"/>
         </w:rPr>
       </w:pPr>
-      <w:hyperlink w:anchor="_Toc242686898" w:history="1">
+      <w:hyperlink w:anchor="_Toc242687089" w:history="1">
         <w:r>
           <w:rPr>
             <w:rStyle w:val="Hyperlink"/>
@@ -1979,7 +1979,7 @@
             <w:noProof/>
             <w:webHidden/>
           </w:rPr>
-          <w:instrText xml:space="preserve"> PAGEREF _Toc242686898 \h </w:instrText>
+          <w:instrText xml:space="preserve"> PAGEREF _Toc242687089 \h </w:instrText>
         </w:r>
         <w:r>
           <w:rPr>
@@ -2026,7 +2026,7 @@
           <w:lang w:eastAsia="nl-NL"/>
         </w:rPr>
       </w:pPr>
-      <w:hyperlink w:anchor="_Toc242686899" w:history="1">
+      <w:hyperlink w:anchor="_Toc242687090" w:history="1">
         <w:r>
           <w:rPr>
             <w:rStyle w:val="Hyperlink"/>
@@ -2087,7 +2087,7 @@
             <w:noProof/>
             <w:webHidden/>
           </w:rPr>
-          <w:instrText xml:space="preserve"> PAGEREF _Toc242686899 \h </w:instrText>
+          <w:instrText xml:space="preserve"> PAGEREF _Toc242687090 \h </w:instrText>
         </w:r>
         <w:r>
           <w:rPr>
@@ -2134,7 +2134,7 @@
           <w:lang w:eastAsia="nl-NL"/>
         </w:rPr>
       </w:pPr>
-      <w:hyperlink w:anchor="_Toc242686900" w:history="1">
+      <w:hyperlink w:anchor="_Toc242687091" w:history="1">
         <w:r>
           <w:rPr>
             <w:rStyle w:val="Hyperlink"/>
@@ -2179,7 +2179,7 @@
             <w:noProof/>
             <w:webHidden/>
           </w:rPr>
-          <w:instrText xml:space="preserve"> PAGEREF _Toc242686900 \h </w:instrText>
+          <w:instrText xml:space="preserve"> PAGEREF _Toc242687091 \h </w:instrText>
         </w:r>
         <w:r>
           <w:rPr>
@@ -2226,7 +2226,7 @@
           <w:lang w:eastAsia="nl-NL"/>
         </w:rPr>
       </w:pPr>
-      <w:hyperlink w:anchor="_Toc242686901" w:history="1">
+      <w:hyperlink w:anchor="_Toc242687092" w:history="1">
         <w:r>
           <w:rPr>
             <w:rStyle w:val="Hyperlink"/>
@@ -2271,7 +2271,7 @@
             <w:noProof/>
             <w:webHidden/>
           </w:rPr>
-          <w:instrText xml:space="preserve"> PAGEREF _Toc242686901 \h </w:instrText>
+          <w:instrText xml:space="preserve"> PAGEREF _Toc242687092 \h </w:instrText>
         </w:r>
         <w:r>
           <w:rPr>
@@ -2318,7 +2318,7 @@
           <w:lang w:eastAsia="nl-NL"/>
         </w:rPr>
       </w:pPr>
-      <w:hyperlink w:anchor="_Toc242686902" w:history="1">
+      <w:hyperlink w:anchor="_Toc242687093" w:history="1">
         <w:r>
           <w:rPr>
             <w:rStyle w:val="Hyperlink"/>
@@ -2363,7 +2363,7 @@
             <w:noProof/>
             <w:webHidden/>
           </w:rPr>
-          <w:instrText xml:space="preserve"> PAGEREF _Toc242686902 \h </w:instrText>
+          <w:instrText xml:space="preserve"> PAGEREF _Toc242687093 \h </w:instrText>
         </w:r>
         <w:r>
           <w:rPr>
@@ -2410,7 +2410,7 @@
           <w:lang w:eastAsia="nl-NL"/>
         </w:rPr>
       </w:pPr>
-      <w:hyperlink w:anchor="_Toc242686903" w:history="1">
+      <w:hyperlink w:anchor="_Toc242687094" w:history="1">
         <w:r>
           <w:rPr>
             <w:rStyle w:val="Hyperlink"/>
@@ -2455,7 +2455,7 @@
             <w:noProof/>
             <w:webHidden/>
           </w:rPr>
-          <w:instrText xml:space="preserve"> PAGEREF _Toc242686903 \h </w:instrText>
+          <w:instrText xml:space="preserve"> PAGEREF _Toc242687094 \h </w:instrText>
         </w:r>
         <w:r>
           <w:rPr>
@@ -2502,7 +2502,7 @@
           <w:lang w:eastAsia="nl-NL"/>
         </w:rPr>
       </w:pPr>
-      <w:hyperlink w:anchor="_Toc242686904" w:history="1">
+      <w:hyperlink w:anchor="_Toc242687095" w:history="1">
         <w:r>
           <w:rPr>
             <w:rStyle w:val="Hyperlink"/>
@@ -2547,7 +2547,7 @@
             <w:noProof/>
             <w:webHidden/>
           </w:rPr>
-          <w:instrText xml:space="preserve"> PAGEREF _Toc242686904 \h </w:instrText>
+          <w:instrText xml:space="preserve"> PAGEREF _Toc242687095 \h </w:instrText>
         </w:r>
         <w:r>
           <w:rPr>
@@ -2594,7 +2594,7 @@
           <w:lang w:eastAsia="nl-NL"/>
         </w:rPr>
       </w:pPr>
-      <w:hyperlink w:anchor="_Toc242686905" w:history="1">
+      <w:hyperlink w:anchor="_Toc242687096" w:history="1">
         <w:r>
           <w:rPr>
             <w:rStyle w:val="Hyperlink"/>
@@ -2639,7 +2639,7 @@
             <w:noProof/>
             <w:webHidden/>
           </w:rPr>
-          <w:instrText xml:space="preserve"> PAGEREF _Toc242686905 \h </w:instrText>
+          <w:instrText xml:space="preserve"> PAGEREF _Toc242687096 \h </w:instrText>
         </w:r>
         <w:r>
           <w:rPr>
@@ -2686,7 +2686,7 @@
           <w:lang w:eastAsia="nl-NL"/>
         </w:rPr>
       </w:pPr>
-      <w:hyperlink w:anchor="_Toc242686906" w:history="1">
+      <w:hyperlink w:anchor="_Toc242687097" w:history="1">
         <w:r>
           <w:rPr>
             <w:rStyle w:val="Hyperlink"/>
@@ -2731,7 +2731,7 @@
             <w:noProof/>
             <w:webHidden/>
           </w:rPr>
-          <w:instrText xml:space="preserve"> PAGEREF _Toc242686906 \h </w:instrText>
+          <w:instrText xml:space="preserve"> PAGEREF _Toc242687097 \h </w:instrText>
         </w:r>
         <w:r>
           <w:rPr>
@@ -2778,7 +2778,7 @@
           <w:lang w:eastAsia="nl-NL"/>
         </w:rPr>
       </w:pPr>
-      <w:hyperlink w:anchor="_Toc242686907" w:history="1">
+      <w:hyperlink w:anchor="_Toc242687098" w:history="1">
         <w:r>
           <w:rPr>
             <w:rStyle w:val="Hyperlink"/>
@@ -2839,7 +2839,7 @@
             <w:noProof/>
             <w:webHidden/>
           </w:rPr>
-          <w:instrText xml:space="preserve"> PAGEREF _Toc242686907 \h </w:instrText>
+          <w:instrText xml:space="preserve"> PAGEREF _Toc242687098 \h </w:instrText>
         </w:r>
         <w:r>
           <w:rPr>
@@ -2886,7 +2886,7 @@
           <w:lang w:eastAsia="nl-NL"/>
         </w:rPr>
       </w:pPr>
-      <w:hyperlink w:anchor="_Toc242686908" w:history="1">
+      <w:hyperlink w:anchor="_Toc242687099" w:history="1">
         <w:r>
           <w:rPr>
             <w:rStyle w:val="Hyperlink"/>
@@ -2931,7 +2931,7 @@
             <w:noProof/>
             <w:webHidden/>
           </w:rPr>
-          <w:instrText xml:space="preserve"> PAGEREF _Toc242686908 \h </w:instrText>
+          <w:instrText xml:space="preserve"> PAGEREF _Toc242687099 \h </w:instrText>
         </w:r>
         <w:r>
           <w:rPr>
@@ -2978,7 +2978,7 @@
           <w:lang w:eastAsia="nl-NL"/>
         </w:rPr>
       </w:pPr>
-      <w:hyperlink w:anchor="_Toc242686909" w:history="1">
+      <w:hyperlink w:anchor="_Toc242687100" w:history="1">
         <w:r>
           <w:rPr>
             <w:rStyle w:val="Hyperlink"/>
@@ -3023,7 +3023,7 @@
             <w:noProof/>
             <w:webHidden/>
           </w:rPr>
-          <w:instrText xml:space="preserve"> PAGEREF _Toc242686909 \h </w:instrText>
+          <w:instrText xml:space="preserve"> PAGEREF _Toc242687100 \h </w:instrText>
         </w:r>
         <w:r>
           <w:rPr>
@@ -3070,7 +3070,7 @@
           <w:lang w:eastAsia="nl-NL"/>
         </w:rPr>
       </w:pPr>
-      <w:hyperlink w:anchor="_Toc242686910" w:history="1">
+      <w:hyperlink w:anchor="_Toc242687101" w:history="1">
         <w:r>
           <w:rPr>
             <w:rStyle w:val="Hyperlink"/>
@@ -3115,7 +3115,7 @@
             <w:noProof/>
             <w:webHidden/>
           </w:rPr>
-          <w:instrText xml:space="preserve"> PAGEREF _Toc242686910 \h </w:instrText>
+          <w:instrText xml:space="preserve"> PAGEREF _Toc242687101 \h </w:instrText>
         </w:r>
         <w:r>
           <w:rPr>
@@ -3162,7 +3162,7 @@
           <w:lang w:eastAsia="nl-NL"/>
         </w:rPr>
       </w:pPr>
-      <w:hyperlink w:anchor="_Toc242686911" w:history="1">
+      <w:hyperlink w:anchor="_Toc242687102" w:history="1">
         <w:r>
           <w:rPr>
             <w:rStyle w:val="Hyperlink"/>
@@ -3223,7 +3223,7 @@
             <w:noProof/>
             <w:webHidden/>
           </w:rPr>
-          <w:instrText xml:space="preserve"> PAGEREF _Toc242686911 \h </w:instrText>
+          <w:instrText xml:space="preserve"> PAGEREF _Toc242687102 \h </w:instrText>
         </w:r>
         <w:r>
           <w:rPr>
@@ -3270,7 +3270,7 @@
           <w:lang w:eastAsia="nl-NL"/>
         </w:rPr>
       </w:pPr>
-      <w:hyperlink w:anchor="_Toc242686912" w:history="1">
+      <w:hyperlink w:anchor="_Toc242687103" w:history="1">
         <w:r>
           <w:rPr>
             <w:rStyle w:val="Hyperlink"/>
@@ -3315,7 +3315,7 @@
             <w:noProof/>
             <w:webHidden/>
           </w:rPr>
-          <w:instrText xml:space="preserve"> PAGEREF _Toc242686912 \h </w:instrText>
+          <w:instrText xml:space="preserve"> PAGEREF _Toc242687103 \h </w:instrText>
         </w:r>
         <w:r>
           <w:rPr>
@@ -3362,7 +3362,7 @@
           <w:lang w:eastAsia="nl-NL"/>
         </w:rPr>
       </w:pPr>
-      <w:hyperlink w:anchor="_Toc242686913" w:history="1">
+      <w:hyperlink w:anchor="_Toc242687104" w:history="1">
         <w:r>
           <w:rPr>
             <w:rStyle w:val="Hyperlink"/>
@@ -3407,7 +3407,7 @@
             <w:noProof/>
             <w:webHidden/>
           </w:rPr>
-          <w:instrText xml:space="preserve"> PAGEREF _Toc242686913 \h </w:instrText>
+          <w:instrText xml:space="preserve"> PAGEREF _Toc242687104 \h </w:instrText>
         </w:r>
         <w:r>
           <w:rPr>
@@ -3454,7 +3454,7 @@
           <w:lang w:eastAsia="nl-NL"/>
         </w:rPr>
       </w:pPr>
-      <w:hyperlink w:anchor="_Toc242686914" w:history="1">
+      <w:hyperlink w:anchor="_Toc242687105" w:history="1">
         <w:r>
           <w:rPr>
             <w:rStyle w:val="Hyperlink"/>
@@ -3501,7 +3501,7 @@
             <w:noProof/>
             <w:webHidden/>
           </w:rPr>
-          <w:instrText xml:space="preserve"> PAGEREF _Toc242686914 \h </w:instrText>
+          <w:instrText xml:space="preserve"> PAGEREF _Toc242687105 \h </w:instrText>
         </w:r>
         <w:r>
           <w:rPr>
@@ -3548,7 +3548,7 @@
           <w:lang w:eastAsia="nl-NL"/>
         </w:rPr>
       </w:pPr>
-      <w:hyperlink w:anchor="_Toc242686915" w:history="1">
+      <w:hyperlink w:anchor="_Toc242687106" w:history="1">
         <w:r>
           <w:rPr>
             <w:rStyle w:val="Hyperlink"/>
@@ -3595,7 +3595,7 @@
             <w:noProof/>
             <w:webHidden/>
           </w:rPr>
-          <w:instrText xml:space="preserve"> PAGEREF _Toc242686915 \h </w:instrText>
+          <w:instrText xml:space="preserve"> PAGEREF _Toc242687106 \h </w:instrText>
         </w:r>
         <w:r>
           <w:rPr>
@@ -3642,7 +3642,7 @@
           <w:lang w:eastAsia="nl-NL"/>
         </w:rPr>
       </w:pPr>
-      <w:hyperlink w:anchor="_Toc242686916" w:history="1">
+      <w:hyperlink w:anchor="_Toc242687107" w:history="1">
         <w:r>
           <w:rPr>
             <w:rStyle w:val="Hyperlink"/>
@@ -3689,7 +3689,7 @@
             <w:noProof/>
             <w:webHidden/>
           </w:rPr>
-          <w:instrText xml:space="preserve"> PAGEREF _Toc242686916 \h </w:instrText>
+          <w:instrText xml:space="preserve"> PAGEREF _Toc242687107 \h </w:instrText>
         </w:r>
         <w:r>
           <w:rPr>
@@ -3736,7 +3736,7 @@
           <w:lang w:eastAsia="nl-NL"/>
         </w:rPr>
       </w:pPr>
-      <w:hyperlink w:anchor="_Toc242686917" w:history="1">
+      <w:hyperlink w:anchor="_Toc242687108" w:history="1">
         <w:r>
           <w:rPr>
             <w:rStyle w:val="Hyperlink"/>
@@ -3783,7 +3783,7 @@
             <w:noProof/>
             <w:webHidden/>
           </w:rPr>
-          <w:instrText xml:space="preserve"> PAGEREF _Toc242686917 \h </w:instrText>
+          <w:instrText xml:space="preserve"> PAGEREF _Toc242687108 \h </w:instrText>
         </w:r>
         <w:r>
           <w:rPr>
@@ -3830,7 +3830,7 @@
           <w:lang w:eastAsia="nl-NL"/>
         </w:rPr>
       </w:pPr>
-      <w:hyperlink w:anchor="_Toc242686918" w:history="1">
+      <w:hyperlink w:anchor="_Toc242687109" w:history="1">
         <w:r>
           <w:rPr>
             <w:rStyle w:val="Hyperlink"/>
@@ -3877,7 +3877,7 @@
             <w:noProof/>
             <w:webHidden/>
           </w:rPr>
-          <w:instrText xml:space="preserve"> PAGEREF _Toc242686918 \h </w:instrText>
+          <w:instrText xml:space="preserve"> PAGEREF _Toc242687109 \h </w:instrText>
         </w:r>
         <w:r>
           <w:rPr>
@@ -3924,7 +3924,7 @@
           <w:lang w:eastAsia="nl-NL"/>
         </w:rPr>
       </w:pPr>
-      <w:hyperlink w:anchor="_Toc242686919" w:history="1">
+      <w:hyperlink w:anchor="_Toc242687110" w:history="1">
         <w:r>
           <w:rPr>
             <w:rStyle w:val="Hyperlink"/>
@@ -3971,7 +3971,7 @@
             <w:noProof/>
             <w:webHidden/>
           </w:rPr>
-          <w:instrText xml:space="preserve"> PAGEREF _Toc242686919 \h </w:instrText>
+          <w:instrText xml:space="preserve"> PAGEREF _Toc242687110 \h </w:instrText>
         </w:r>
         <w:r>
           <w:rPr>
@@ -4018,7 +4018,7 @@
           <w:lang w:eastAsia="nl-NL"/>
         </w:rPr>
       </w:pPr>
-      <w:hyperlink w:anchor="_Toc242686920" w:history="1">
+      <w:hyperlink w:anchor="_Toc242687111" w:history="1">
         <w:r>
           <w:rPr>
             <w:rStyle w:val="Hyperlink"/>
@@ -4063,7 +4063,7 @@
             <w:noProof/>
             <w:webHidden/>
           </w:rPr>
-          <w:instrText xml:space="preserve"> PAGEREF _Toc242686920 \h </w:instrText>
+          <w:instrText xml:space="preserve"> PAGEREF _Toc242687111 \h </w:instrText>
         </w:r>
         <w:r>
           <w:rPr>
@@ -4110,7 +4110,7 @@
           <w:lang w:eastAsia="nl-NL"/>
         </w:rPr>
       </w:pPr>
-      <w:hyperlink w:anchor="_Toc242686921" w:history="1">
+      <w:hyperlink w:anchor="_Toc242687112" w:history="1">
         <w:r>
           <w:rPr>
             <w:rStyle w:val="Hyperlink"/>
@@ -4155,7 +4155,7 @@
             <w:noProof/>
             <w:webHidden/>
           </w:rPr>
-          <w:instrText xml:space="preserve"> PAGEREF _Toc242686921 \h </w:instrText>
+          <w:instrText xml:space="preserve"> PAGEREF _Toc242687112 \h </w:instrText>
         </w:r>
         <w:r>
           <w:rPr>
@@ -4202,7 +4202,7 @@
           <w:lang w:eastAsia="nl-NL"/>
         </w:rPr>
       </w:pPr>
-      <w:hyperlink w:anchor="_Toc242686922" w:history="1">
+      <w:hyperlink w:anchor="_Toc242687113" w:history="1">
         <w:r>
           <w:rPr>
             <w:rStyle w:val="Hyperlink"/>
@@ -4279,7 +4279,7 @@
             <w:noProof/>
             <w:webHidden/>
           </w:rPr>
-          <w:instrText xml:space="preserve"> PAGEREF _Toc242686922 \h </w:instrText>
+          <w:instrText xml:space="preserve"> PAGEREF _Toc242687113 \h </w:instrText>
         </w:r>
         <w:r>
           <w:rPr>
@@ -4326,7 +4326,7 @@
           <w:lang w:eastAsia="nl-NL"/>
         </w:rPr>
       </w:pPr>
-      <w:hyperlink w:anchor="_Toc242686923" w:history="1">
+      <w:hyperlink w:anchor="_Toc242687114" w:history="1">
         <w:r>
           <w:rPr>
             <w:rStyle w:val="Hyperlink"/>
@@ -4371,7 +4371,7 @@
             <w:noProof/>
             <w:webHidden/>
           </w:rPr>
-          <w:instrText xml:space="preserve"> PAGEREF _Toc242686923 \h </w:instrText>
+          <w:instrText xml:space="preserve"> PAGEREF _Toc242687114 \h </w:instrText>
         </w:r>
         <w:r>
           <w:rPr>
@@ -4418,7 +4418,7 @@
           <w:lang w:eastAsia="nl-NL"/>
         </w:rPr>
       </w:pPr>
-      <w:hyperlink w:anchor="_Toc242686924" w:history="1">
+      <w:hyperlink w:anchor="_Toc242687115" w:history="1">
         <w:r>
           <w:rPr>
             <w:rStyle w:val="Hyperlink"/>
@@ -4463,7 +4463,7 @@
             <w:noProof/>
             <w:webHidden/>
           </w:rPr>
-          <w:instrText xml:space="preserve"> PAGEREF _Toc242686924 \h </w:instrText>
+          <w:instrText xml:space="preserve"> PAGEREF _Toc242687115 \h </w:instrText>
         </w:r>
         <w:r>
           <w:rPr>
@@ -4510,7 +4510,7 @@
           <w:lang w:eastAsia="nl-NL"/>
         </w:rPr>
       </w:pPr>
-      <w:hyperlink w:anchor="_Toc242686925" w:history="1">
+      <w:hyperlink w:anchor="_Toc242687116" w:history="1">
         <w:r>
           <w:rPr>
             <w:rStyle w:val="Hyperlink"/>
@@ -4555,7 +4555,7 @@
             <w:noProof/>
             <w:webHidden/>
           </w:rPr>
-          <w:instrText xml:space="preserve"> PAGEREF _Toc242686925 \h </w:instrText>
+          <w:instrText xml:space="preserve"> PAGEREF _Toc242687116 \h </w:instrText>
         </w:r>
         <w:r>
           <w:rPr>
@@ -4602,7 +4602,7 @@
           <w:lang w:eastAsia="nl-NL"/>
         </w:rPr>
       </w:pPr>
-      <w:hyperlink w:anchor="_Toc242686926" w:history="1">
+      <w:hyperlink w:anchor="_Toc242687117" w:history="1">
         <w:r>
           <w:rPr>
             <w:rStyle w:val="Hyperlink"/>
@@ -4647,7 +4647,7 @@
             <w:noProof/>
             <w:webHidden/>
           </w:rPr>
-          <w:instrText xml:space="preserve"> PAGEREF _Toc242686926 \h </w:instrText>
+          <w:instrText xml:space="preserve"> PAGEREF _Toc242687117 \h </w:instrText>
         </w:r>
         <w:r>
           <w:rPr>
@@ -4694,7 +4694,7 @@
           <w:lang w:eastAsia="nl-NL"/>
         </w:rPr>
       </w:pPr>
-      <w:hyperlink w:anchor="_Toc242686927" w:history="1">
+      <w:hyperlink w:anchor="_Toc242687118" w:history="1">
         <w:r>
           <w:rPr>
             <w:rStyle w:val="Hyperlink"/>
@@ -4739,7 +4739,7 @@
             <w:noProof/>
             <w:webHidden/>
           </w:rPr>
-          <w:instrText xml:space="preserve"> PAGEREF _Toc242686927 \h </w:instrText>
+          <w:instrText xml:space="preserve"> PAGEREF _Toc242687118 \h </w:instrText>
         </w:r>
         <w:r>
           <w:rPr>
@@ -4786,7 +4786,7 @@
           <w:lang w:eastAsia="nl-NL"/>
         </w:rPr>
       </w:pPr>
-      <w:hyperlink w:anchor="_Toc242686928" w:history="1">
+      <w:hyperlink w:anchor="_Toc242687119" w:history="1">
         <w:r>
           <w:rPr>
             <w:rStyle w:val="Hyperlink"/>
@@ -4831,7 +4831,7 @@
             <w:noProof/>
             <w:webHidden/>
           </w:rPr>
-          <w:instrText xml:space="preserve"> PAGEREF _Toc242686928 \h </w:instrText>
+          <w:instrText xml:space="preserve"> PAGEREF _Toc242687119 \h </w:instrText>
         </w:r>
         <w:r>
           <w:rPr>
@@ -4878,7 +4878,7 @@
           <w:lang w:eastAsia="nl-NL"/>
         </w:rPr>
       </w:pPr>
-      <w:hyperlink w:anchor="_Toc242686929" w:history="1">
+      <w:hyperlink w:anchor="_Toc242687120" w:history="1">
         <w:r>
           <w:rPr>
             <w:rStyle w:val="Hyperlink"/>
@@ -4923,7 +4923,7 @@
             <w:noProof/>
             <w:webHidden/>
           </w:rPr>
-          <w:instrText xml:space="preserve"> PAGEREF _Toc242686929 \h </w:instrText>
+          <w:instrText xml:space="preserve"> PAGEREF _Toc242687120 \h </w:instrText>
         </w:r>
         <w:r>
           <w:rPr>
@@ -4970,7 +4970,7 @@
           <w:lang w:eastAsia="nl-NL"/>
         </w:rPr>
       </w:pPr>
-      <w:hyperlink w:anchor="_Toc242686930" w:history="1">
+      <w:hyperlink w:anchor="_Toc242687121" w:history="1">
         <w:r>
           <w:rPr>
             <w:rStyle w:val="Hyperlink"/>
@@ -5015,7 +5015,7 @@
             <w:noProof/>
             <w:webHidden/>
           </w:rPr>
-          <w:instrText xml:space="preserve"> PAGEREF _Toc242686930 \h </w:instrText>
+          <w:instrText xml:space="preserve"> PAGEREF _Toc242687121 \h </w:instrText>
         </w:r>
         <w:r>
           <w:rPr>
@@ -5062,7 +5062,7 @@
           <w:lang w:eastAsia="nl-NL"/>
         </w:rPr>
       </w:pPr>
-      <w:hyperlink w:anchor="_Toc242686931" w:history="1">
+      <w:hyperlink w:anchor="_Toc242687122" w:history="1">
         <w:r>
           <w:rPr>
             <w:rStyle w:val="Hyperlink"/>
@@ -5107,7 +5107,7 @@
             <w:noProof/>
             <w:webHidden/>
           </w:rPr>
-          <w:instrText xml:space="preserve"> PAGEREF _Toc242686931 \h </w:instrText>
+          <w:instrText xml:space="preserve"> PAGEREF _Toc242687122 \h </w:instrText>
         </w:r>
         <w:r>
           <w:rPr>
@@ -5160,7 +5160,7 @@
         </w:numPr>
       </w:pPr>
       <w:bookmarkStart w:id="1" w:name="k1"/>
-      <w:bookmarkStart w:id="2" w:name="_Toc242686879"/>
+      <w:bookmarkStart w:id="2" w:name="_Toc242687070"/>
       <w:r>
         <w:t>DOEL VAN DE APPLICATIE.</w:t>
       </w:r>
@@ -5242,7 +5242,7 @@
         </w:numPr>
       </w:pPr>
       <w:bookmarkStart w:id="3" w:name="k2"/>
-      <w:bookmarkStart w:id="4" w:name="_Toc242686880"/>
+      <w:bookmarkStart w:id="4" w:name="_Toc242687071"/>
       <w:r>
         <w:t>BESTANDEN.</w:t>
       </w:r>
@@ -6379,7 +6379,7 @@
                 <w:sz w:val="16"/>
                 <w:szCs w:val="16"/>
               </w:rPr>
-              <w:t xml:space="preserve">) en een PDF in de TVB-huisstijl, op basis van het TVB-sjabloon </w:t>
+              <w:t xml:space="preserve">) en een PDF in de TVB-huisstijl, op basis van het sjabloon </w:t>
             </w:r>
             <w:r>
               <w:rPr>
@@ -6387,14 +6387,14 @@
                 <w:sz w:val="14"/>
                 <w:shd w:val="clear" w:color="auto" w:fill="EEF4F2"/>
               </w:rPr>
-              <w:t>tvbsjabloon.docx</w:t>
+              <w:t>docs/tvbsjabloon.docx</w:t>
             </w:r>
             <w:r>
               <w:rPr>
                 <w:sz w:val="16"/>
                 <w:szCs w:val="16"/>
               </w:rPr>
-              <w:t xml:space="preserve"> (dat staat niet in de repository, vraag het op bij TVB): voorblad, inhoudsopgave, genummerde koppen, tabellen en opsommingstekens. Nodig: Node.js en Microsoft Word. De </w:t>
+              <w:t xml:space="preserve">: voorblad, inhoudsopgave, genummerde koppen, tabellen en opsommingstekens. Nodig: Node.js en Microsoft Word. De </w:t>
             </w:r>
             <w:r>
               <w:rPr>
@@ -7338,7 +7338,7 @@
         </w:numPr>
       </w:pPr>
       <w:bookmarkStart w:id="5" w:name="k3"/>
-      <w:bookmarkStart w:id="6" w:name="_Toc242686881"/>
+      <w:bookmarkStart w:id="6" w:name="_Toc242687072"/>
       <w:r>
         <w:t>DE WEBSITE STARTEN.</w:t>
       </w:r>
@@ -7560,7 +7560,7 @@
         </w:numPr>
       </w:pPr>
       <w:bookmarkStart w:id="7" w:name="k4"/>
-      <w:bookmarkStart w:id="8" w:name="_Toc242686882"/>
+      <w:bookmarkStart w:id="8" w:name="_Toc242687073"/>
       <w:r>
         <w:t>GEBRUIKERSHANDLEIDING.</w:t>
       </w:r>
@@ -7573,7 +7573,7 @@
         <w:keepNext/>
       </w:pPr>
       <w:bookmarkStart w:id="9" w:name="k5"/>
-      <w:bookmarkStart w:id="10" w:name="_Toc242686883"/>
+      <w:bookmarkStart w:id="10" w:name="_Toc242687074"/>
       <w:r>
         <w:t>EEN MEDEWERKER ZOEKEN</w:t>
       </w:r>
@@ -7628,7 +7628,7 @@
         <w:keepNext/>
       </w:pPr>
       <w:bookmarkStart w:id="11" w:name="k6"/>
-      <w:bookmarkStart w:id="12" w:name="_Toc242686884"/>
+      <w:bookmarkStart w:id="12" w:name="_Toc242687075"/>
       <w:r>
         <w:t>EEN PRODUCT REGISTREREN</w:t>
       </w:r>
@@ -7839,7 +7839,7 @@
         <w:keepNext/>
       </w:pPr>
       <w:bookmarkStart w:id="13" w:name="k7"/>
-      <w:bookmarkStart w:id="14" w:name="_Toc242686885"/>
+      <w:bookmarkStart w:id="14" w:name="_Toc242687076"/>
       <w:r>
         <w:t>ADMIN-DASHBOARD OPENEN</w:t>
       </w:r>
@@ -7970,7 +7970,7 @@
         <w:keepNext/>
       </w:pPr>
       <w:bookmarkStart w:id="15" w:name="k8"/>
-      <w:bookmarkStart w:id="16" w:name="_Toc242686886"/>
+      <w:bookmarkStart w:id="16" w:name="_Toc242687077"/>
       <w:r>
         <w:t>REGISTRATIES BEHEREN</w:t>
       </w:r>
@@ -8201,7 +8201,7 @@
         <w:keepNext/>
       </w:pPr>
       <w:bookmarkStart w:id="17" w:name="k9"/>
-      <w:bookmarkStart w:id="18" w:name="_Toc242686887"/>
+      <w:bookmarkStart w:id="18" w:name="_Toc242687078"/>
       <w:r>
         <w:t>MEDEWERKERS BEHEREN</w:t>
       </w:r>
@@ -8521,7 +8521,7 @@
         <w:keepNext/>
       </w:pPr>
       <w:bookmarkStart w:id="19" w:name="k10"/>
-      <w:bookmarkStart w:id="20" w:name="_Toc242686888"/>
+      <w:bookmarkStart w:id="20" w:name="_Toc242687079"/>
       <w:r>
         <w:t>PRODUCTEN BEHEREN</w:t>
       </w:r>
@@ -8649,7 +8649,7 @@
         <w:keepNext/>
       </w:pPr>
       <w:bookmarkStart w:id="21" w:name="k11"/>
-      <w:bookmarkStart w:id="22" w:name="_Toc242686889"/>
+      <w:bookmarkStart w:id="22" w:name="_Toc242687080"/>
       <w:r>
         <w:t>BEDRIJVEN EN CONSUMPTIEPUNTEN BEHEREN</w:t>
       </w:r>
@@ -8812,7 +8812,7 @@
         <w:keepNext/>
       </w:pPr>
       <w:bookmarkStart w:id="23" w:name="k12"/>
-      <w:bookmarkStart w:id="24" w:name="_Toc242686890"/>
+      <w:bookmarkStart w:id="24" w:name="_Toc242687081"/>
       <w:r>
         <w:t>VOORRAAD BEHEREN</w:t>
       </w:r>
@@ -9030,7 +9030,7 @@
         <w:keepNext/>
       </w:pPr>
       <w:bookmarkStart w:id="25" w:name="k13"/>
-      <w:bookmarkStart w:id="26" w:name="_Toc242686891"/>
+      <w:bookmarkStart w:id="26" w:name="_Toc242687082"/>
       <w:r>
         <w:t>LOGBOEK BEKIJKEN</w:t>
       </w:r>
@@ -9070,7 +9070,7 @@
         <w:keepNext/>
       </w:pPr>
       <w:bookmarkStart w:id="27" w:name="k14"/>
-      <w:bookmarkStart w:id="28" w:name="_Toc242686892"/>
+      <w:bookmarkStart w:id="28" w:name="_Toc242687083"/>
       <w:r>
         <w:t>ALLE GEGEVENS WISSEN</w:t>
       </w:r>
@@ -9196,7 +9196,7 @@
         <w:keepNext/>
       </w:pPr>
       <w:bookmarkStart w:id="29" w:name="k15"/>
-      <w:bookmarkStart w:id="30" w:name="_Toc242686893"/>
+      <w:bookmarkStart w:id="30" w:name="_Toc242687084"/>
       <w:r>
         <w:t>MODAL SLUITEN EN UITLOGGEN</w:t>
       </w:r>
@@ -9225,7 +9225,7 @@
         <w:keepNext/>
       </w:pPr>
       <w:bookmarkStart w:id="31" w:name="k16"/>
-      <w:bookmarkStart w:id="32" w:name="_Toc242686894"/>
+      <w:bookmarkStart w:id="32" w:name="_Toc242687085"/>
       <w:r>
         <w:t>CSV EXPORTEREN</w:t>
       </w:r>
@@ -9562,7 +9562,7 @@
         <w:keepNext/>
       </w:pPr>
       <w:bookmarkStart w:id="33" w:name="k17"/>
-      <w:bookmarkStart w:id="34" w:name="_Toc242686895"/>
+      <w:bookmarkStart w:id="34" w:name="_Toc242687086"/>
       <w:r>
         <w:t>LICHT OF DONKER THEMA</w:t>
       </w:r>
@@ -9669,7 +9669,7 @@
         <w:keepNext/>
       </w:pPr>
       <w:bookmarkStart w:id="35" w:name="k18"/>
-      <w:bookmarkStart w:id="36" w:name="_Toc242686896"/>
+      <w:bookmarkStart w:id="36" w:name="_Toc242687087"/>
       <w:r>
         <w:t>WELKOM EN "ZELFDE ALS VORIGE KEER"</w:t>
       </w:r>
@@ -9742,7 +9742,7 @@
         <w:keepNext/>
       </w:pPr>
       <w:bookmarkStart w:id="37" w:name="k19"/>
-      <w:bookmarkStart w:id="38" w:name="_Toc242686897"/>
+      <w:bookmarkStart w:id="38" w:name="_Toc242687088"/>
       <w:r>
         <w:t>DEMO GEZICHTSHERKENNING</w:t>
       </w:r>
@@ -9950,7 +9950,7 @@
         <w:keepNext/>
       </w:pPr>
       <w:bookmarkStart w:id="39" w:name="k20"/>
-      <w:bookmarkStart w:id="40" w:name="_Toc242686898"/>
+      <w:bookmarkStart w:id="40" w:name="_Toc242687089"/>
       <w:r>
         <w:t>HERKENNEN MET DE PAS</w:t>
       </w:r>
@@ -10144,7 +10144,7 @@
         </w:numPr>
       </w:pPr>
       <w:bookmarkStart w:id="41" w:name="k21"/>
-      <w:bookmarkStart w:id="42" w:name="_Toc242686899"/>
+      <w:bookmarkStart w:id="42" w:name="_Toc242687090"/>
       <w:r>
         <w:t xml:space="preserve">UITLEG VAN </w:t>
       </w:r>
@@ -10168,7 +10168,7 @@
         <w:keepNext/>
       </w:pPr>
       <w:bookmarkStart w:id="43" w:name="k22"/>
-      <w:bookmarkStart w:id="44" w:name="_Toc242686900"/>
+      <w:bookmarkStart w:id="44" w:name="_Toc242687091"/>
       <w:r>
         <w:t>METADATA EN EXTERNE BESTANDEN</w:t>
       </w:r>
@@ -10444,7 +10444,7 @@
         <w:keepNext/>
       </w:pPr>
       <w:bookmarkStart w:id="45" w:name="k23"/>
-      <w:bookmarkStart w:id="46" w:name="_Toc242686901"/>
+      <w:bookmarkStart w:id="46" w:name="_Toc242687092"/>
       <w:r>
         <w:t>NAVIGATIEBALK</w:t>
       </w:r>
@@ -10657,7 +10657,7 @@
         <w:keepNext/>
       </w:pPr>
       <w:bookmarkStart w:id="47" w:name="k24"/>
-      <w:bookmarkStart w:id="48" w:name="_Toc242686902"/>
+      <w:bookmarkStart w:id="48" w:name="_Toc242687093"/>
       <w:r>
         <w:t>HERO-GEDEELTE</w:t>
       </w:r>
@@ -10702,7 +10702,7 @@
         <w:keepNext/>
       </w:pPr>
       <w:bookmarkStart w:id="49" w:name="k25"/>
-      <w:bookmarkStart w:id="50" w:name="_Toc242686903"/>
+      <w:bookmarkStart w:id="50" w:name="_Toc242687094"/>
       <w:r>
         <w:t>MEDEWERKERLIJST</w:t>
       </w:r>
@@ -10965,7 +10965,7 @@
         <w:keepNext/>
       </w:pPr>
       <w:bookmarkStart w:id="51" w:name="k26"/>
-      <w:bookmarkStart w:id="52" w:name="_Toc242686904"/>
+      <w:bookmarkStart w:id="52" w:name="_Toc242687095"/>
       <w:r>
         <w:t>STATISTIEKEN</w:t>
       </w:r>
@@ -11048,7 +11048,7 @@
         <w:keepNext/>
       </w:pPr>
       <w:bookmarkStart w:id="53" w:name="k27"/>
-      <w:bookmarkStart w:id="54" w:name="_Toc242686905"/>
+      <w:bookmarkStart w:id="54" w:name="_Toc242687096"/>
       <w:r>
         <w:t>VENSTERS (MODALS)</w:t>
       </w:r>
@@ -11561,7 +11561,7 @@
         <w:keepNext/>
       </w:pPr>
       <w:bookmarkStart w:id="55" w:name="k28"/>
-      <w:bookmarkStart w:id="56" w:name="_Toc242686906"/>
+      <w:bookmarkStart w:id="56" w:name="_Toc242687097"/>
       <w:r>
         <w:t>WAARSCHUWING BIJ OPENEN ALS LOS BESTAND</w:t>
       </w:r>
@@ -11606,7 +11606,7 @@
         </w:numPr>
       </w:pPr>
       <w:bookmarkStart w:id="57" w:name="k29"/>
-      <w:bookmarkStart w:id="58" w:name="_Toc242686907"/>
+      <w:bookmarkStart w:id="58" w:name="_Toc242687098"/>
       <w:r>
         <w:t xml:space="preserve">UITLEG VAN </w:t>
       </w:r>
@@ -11630,7 +11630,7 @@
         <w:keepNext/>
       </w:pPr>
       <w:bookmarkStart w:id="59" w:name="k30"/>
-      <w:bookmarkStart w:id="60" w:name="_Toc242686908"/>
+      <w:bookmarkStart w:id="60" w:name="_Toc242687099"/>
       <w:r>
         <w:t>CSS-VARIABELEN</w:t>
       </w:r>
@@ -12239,7 +12239,7 @@
         <w:keepNext/>
       </w:pPr>
       <w:bookmarkStart w:id="61" w:name="k31"/>
-      <w:bookmarkStart w:id="62" w:name="_Toc242686909"/>
+      <w:bookmarkStart w:id="62" w:name="_Toc242687100"/>
       <w:r>
         <w:t>LAYOUT</w:t>
       </w:r>
@@ -12760,7 +12760,7 @@
         <w:keepNext/>
       </w:pPr>
       <w:bookmarkStart w:id="63" w:name="k32"/>
-      <w:bookmarkStart w:id="64" w:name="_Toc242686910"/>
+      <w:bookmarkStart w:id="64" w:name="_Toc242687101"/>
       <w:r>
         <w:t>COMPONENTEN</w:t>
       </w:r>
@@ -12983,7 +12983,7 @@
         </w:numPr>
       </w:pPr>
       <w:bookmarkStart w:id="65" w:name="k33"/>
-      <w:bookmarkStart w:id="66" w:name="_Toc242686911"/>
+      <w:bookmarkStart w:id="66" w:name="_Toc242687102"/>
       <w:r>
         <w:t>UITLEG VAN DE JAVASCRIPT (</w:t>
       </w:r>
@@ -13007,7 +13007,7 @@
         <w:keepNext/>
       </w:pPr>
       <w:bookmarkStart w:id="67" w:name="k34"/>
-      <w:bookmarkStart w:id="68" w:name="_Toc242686912"/>
+      <w:bookmarkStart w:id="68" w:name="_Toc242687103"/>
       <w:r>
         <w:t>OPSLAG EN VOORBEELDDATA</w:t>
       </w:r>
@@ -13784,7 +13784,7 @@
         <w:keepNext/>
       </w:pPr>
       <w:bookmarkStart w:id="69" w:name="k35"/>
-      <w:bookmarkStart w:id="70" w:name="_Toc242686913"/>
+      <w:bookmarkStart w:id="70" w:name="_Toc242687104"/>
       <w:r>
         <w:t>OBJECTGEORIËNTEERDE STRUCTUUR</w:t>
       </w:r>
@@ -16470,7 +16470,7 @@
         <w:keepNext/>
       </w:pPr>
       <w:bookmarkStart w:id="80" w:name="k45"/>
-      <w:bookmarkStart w:id="81" w:name="_Toc242686914"/>
+      <w:bookmarkStart w:id="81" w:name="_Toc242687105"/>
       <w:r>
         <w:rPr>
           <w:rFonts w:ascii="Consolas" w:hAnsi="Consolas" w:cs="Consolas"/>
@@ -16611,7 +16611,7 @@
         <w:keepNext/>
       </w:pPr>
       <w:bookmarkStart w:id="82" w:name="k46"/>
-      <w:bookmarkStart w:id="83" w:name="_Toc242686915"/>
+      <w:bookmarkStart w:id="83" w:name="_Toc242687106"/>
       <w:r>
         <w:rPr>
           <w:rFonts w:ascii="Consolas" w:hAnsi="Consolas" w:cs="Consolas"/>
@@ -16688,7 +16688,7 @@
         <w:keepNext/>
       </w:pPr>
       <w:bookmarkStart w:id="84" w:name="k47"/>
-      <w:bookmarkStart w:id="85" w:name="_Toc242686916"/>
+      <w:bookmarkStart w:id="85" w:name="_Toc242687107"/>
       <w:r>
         <w:rPr>
           <w:rFonts w:ascii="Consolas" w:hAnsi="Consolas" w:cs="Consolas"/>
@@ -16837,7 +16837,7 @@
         <w:keepNext/>
       </w:pPr>
       <w:bookmarkStart w:id="86" w:name="k48"/>
-      <w:bookmarkStart w:id="87" w:name="_Toc242686917"/>
+      <w:bookmarkStart w:id="87" w:name="_Toc242687108"/>
       <w:r>
         <w:rPr>
           <w:rFonts w:ascii="Consolas" w:hAnsi="Consolas" w:cs="Consolas"/>
@@ -16904,7 +16904,7 @@
         <w:keepNext/>
       </w:pPr>
       <w:bookmarkStart w:id="88" w:name="k49"/>
-      <w:bookmarkStart w:id="89" w:name="_Toc242686918"/>
+      <w:bookmarkStart w:id="89" w:name="_Toc242687109"/>
       <w:r>
         <w:rPr>
           <w:rFonts w:ascii="Consolas" w:hAnsi="Consolas" w:cs="Consolas"/>
@@ -17004,7 +17004,7 @@
         <w:keepNext/>
       </w:pPr>
       <w:bookmarkStart w:id="90" w:name="k50"/>
-      <w:bookmarkStart w:id="91" w:name="_Toc242686919"/>
+      <w:bookmarkStart w:id="91" w:name="_Toc242687110"/>
       <w:r>
         <w:rPr>
           <w:rFonts w:ascii="Consolas" w:hAnsi="Consolas" w:cs="Consolas"/>
@@ -17049,7 +17049,7 @@
         <w:keepNext/>
       </w:pPr>
       <w:bookmarkStart w:id="92" w:name="k51"/>
-      <w:bookmarkStart w:id="93" w:name="_Toc242686920"/>
+      <w:bookmarkStart w:id="93" w:name="_Toc242687111"/>
       <w:r>
         <w:t>OPSLAGFOUTEN EN TERUGDRAAIEN</w:t>
       </w:r>
@@ -17089,7 +17089,7 @@
         <w:keepNext/>
       </w:pPr>
       <w:bookmarkStart w:id="94" w:name="k52"/>
-      <w:bookmarkStart w:id="95" w:name="_Toc242686921"/>
+      <w:bookmarkStart w:id="95" w:name="_Toc242687112"/>
       <w:r>
         <w:t>ADMINFUNCTIES</w:t>
       </w:r>
@@ -17335,7 +17335,7 @@
         <w:keepNext/>
       </w:pPr>
       <w:bookmarkStart w:id="96" w:name="k53"/>
-      <w:bookmarkStart w:id="97" w:name="_Toc242686922"/>
+      <w:bookmarkStart w:id="97" w:name="_Toc242687113"/>
       <w:r>
         <w:t xml:space="preserve">CSV-EXPORT (CLASS </w:t>
       </w:r>
@@ -17743,7 +17743,7 @@
         <w:keepNext/>
       </w:pPr>
       <w:bookmarkStart w:id="98" w:name="k54"/>
-      <w:bookmarkStart w:id="99" w:name="_Toc242686923"/>
+      <w:bookmarkStart w:id="99" w:name="_Toc242687114"/>
       <w:r>
         <w:t>EVENT LISTENERS</w:t>
       </w:r>
@@ -18348,7 +18348,7 @@
         </w:numPr>
       </w:pPr>
       <w:bookmarkStart w:id="100" w:name="k55"/>
-      <w:bookmarkStart w:id="101" w:name="_Toc242686924"/>
+      <w:bookmarkStart w:id="101" w:name="_Toc242687115"/>
       <w:r>
         <w:t>DATAMODEL EN KOPPELINGEN.</w:t>
       </w:r>
@@ -18366,7 +18366,7 @@
         <w:keepNext/>
       </w:pPr>
       <w:bookmarkStart w:id="102" w:name="k56"/>
-      <w:bookmarkStart w:id="103" w:name="_Toc242686925"/>
+      <w:bookmarkStart w:id="103" w:name="_Toc242687116"/>
       <w:r>
         <w:t>BEDRIJVEN</w:t>
       </w:r>
@@ -18577,7 +18577,7 @@
         <w:keepNext/>
       </w:pPr>
       <w:bookmarkStart w:id="104" w:name="k57"/>
-      <w:bookmarkStart w:id="105" w:name="_Toc242686926"/>
+      <w:bookmarkStart w:id="105" w:name="_Toc242687117"/>
       <w:r>
         <w:t>CONSUMPTIEPUNTEN</w:t>
       </w:r>
@@ -18896,7 +18896,7 @@
         <w:keepNext/>
       </w:pPr>
       <w:bookmarkStart w:id="106" w:name="k58"/>
-      <w:bookmarkStart w:id="107" w:name="_Toc242686927"/>
+      <w:bookmarkStart w:id="107" w:name="_Toc242687118"/>
       <w:r>
         <w:t>MEDEWERKERS</w:t>
       </w:r>
@@ -19452,7 +19452,7 @@
         <w:keepNext/>
       </w:pPr>
       <w:bookmarkStart w:id="108" w:name="k59"/>
-      <w:bookmarkStart w:id="109" w:name="_Toc242686928"/>
+      <w:bookmarkStart w:id="109" w:name="_Toc242687119"/>
       <w:r>
         <w:t>REGISTRATIES</w:t>
       </w:r>
@@ -20018,7 +20018,7 @@
         </w:numPr>
       </w:pPr>
       <w:bookmarkStart w:id="110" w:name="k60"/>
-      <w:bookmarkStart w:id="111" w:name="_Toc242686929"/>
+      <w:bookmarkStart w:id="111" w:name="_Toc242687120"/>
       <w:r>
         <w:t>BELANGRIJKE DEMO-BEPERKINGEN.</w:t>
       </w:r>
@@ -20309,7 +20309,7 @@
         </w:numPr>
       </w:pPr>
       <w:bookmarkStart w:id="112" w:name="k61"/>
-      <w:bookmarkStart w:id="113" w:name="_Toc242686930"/>
+      <w:bookmarkStart w:id="113" w:name="_Toc242687121"/>
       <w:r>
         <w:t>CODE UITLEGGEN TIJDENS EEN PRESENTATIE.</w:t>
       </w:r>
@@ -20594,7 +20594,7 @@
         </w:numPr>
       </w:pPr>
       <w:bookmarkStart w:id="114" w:name="k62"/>
-      <w:bookmarkStart w:id="115" w:name="_Toc242686931"/>
+      <w:bookmarkStart w:id="115" w:name="_Toc242687122"/>
       <w:r>
         <w:t>MOGELIJKE VERVOLGSTAPPEN.</w:t>
       </w:r>
@@ -20621,7 +20621,7 @@
       </w:r>
       <w:r>
         <w:tab/>
-        <w:t>Kies een backend, bijvoorbeeld PHP, .NET of een beheerde dienst. Node.js valt af: TVB gebruikt het bij voorkeur niet voor de eigen software (in dit project alleen voor de tests, de CI en het maken van de Word-bestanden).</w:t>
+        <w:t>Kies een backend, bijvoorbeeld PHP, Node.js of een beheerde dienst.</w:t>
       </w:r>
     </w:p>
     <w:p>
@@ -20813,8 +20813,6 @@
       </w:r>
       <w:r>
         <w:tab/>
-      </w:r>
-      <w:r>
         <w:t>Voeg naast het maandfilter ook jaar- en periodefilters toe.</w:t>
       </w:r>
     </w:p>

</xml_diff>

<commit_message>
TO 3.8: correctie − met keuze, kleurcontrole donker thema en browsertests in de CI
- Correctie − opent een venster waarin de beheerder kiest welke registratie weg moet
- Kleurcontrole keuzelijsten uitgevoerd, placeholder in het donkere thema voldoet nu aan WCAG
- 9 browsertests (tests/e2e) in headless Edge of Chrome via het DevTools Protocol, zonder npm-pakketten
- CI draait de browsertests in een aparte job na de unit tests
- Melding "... bestaat niet meer. Er is niets opgeslagen." gelijk aan het TO
- TO, DOCUMENTATIE, README en Word-bestanden bijgewerkt (547 unit tests)
</commit_message>
<xml_diff>
--- a/docs/DOCUMENTATIE.docx
+++ b/docs/DOCUMENTATIE.docx
@@ -82,7 +82,7 @@
           <w:numId w:val="0"/>
         </w:numPr>
       </w:pPr>
-      <w:bookmarkStart w:id="0" w:name="_Toc242687069"/>
+      <w:bookmarkStart w:id="0" w:name="_Toc242688983"/>
       <w:r>
         <w:t>INHOUDSOPGAVE.</w:t>
       </w:r>
@@ -112,7 +112,7 @@
       <w:r>
         <w:fldChar w:fldCharType="separate"/>
       </w:r>
-      <w:hyperlink w:anchor="_Toc242687069" w:history="1">
+      <w:hyperlink w:anchor="_Toc242688983" w:history="1">
         <w:r>
           <w:rPr>
             <w:rStyle w:val="Hyperlink"/>
@@ -139,7 +139,7 @@
             <w:noProof/>
             <w:webHidden/>
           </w:rPr>
-          <w:instrText xml:space="preserve"> PAGEREF _Toc242687069 \h </w:instrText>
+          <w:instrText xml:space="preserve"> PAGEREF _Toc242688983 \h </w:instrText>
         </w:r>
         <w:r>
           <w:rPr>
@@ -186,7 +186,7 @@
           <w:lang w:eastAsia="nl-NL"/>
         </w:rPr>
       </w:pPr>
-      <w:hyperlink w:anchor="_Toc242687070" w:history="1">
+      <w:hyperlink w:anchor="_Toc242688984" w:history="1">
         <w:r>
           <w:rPr>
             <w:rStyle w:val="Hyperlink"/>
@@ -231,7 +231,7 @@
             <w:noProof/>
             <w:webHidden/>
           </w:rPr>
-          <w:instrText xml:space="preserve"> PAGEREF _Toc242687070 \h </w:instrText>
+          <w:instrText xml:space="preserve"> PAGEREF _Toc242688984 \h </w:instrText>
         </w:r>
         <w:r>
           <w:rPr>
@@ -278,7 +278,7 @@
           <w:lang w:eastAsia="nl-NL"/>
         </w:rPr>
       </w:pPr>
-      <w:hyperlink w:anchor="_Toc242687071" w:history="1">
+      <w:hyperlink w:anchor="_Toc242688985" w:history="1">
         <w:r>
           <w:rPr>
             <w:rStyle w:val="Hyperlink"/>
@@ -323,7 +323,7 @@
             <w:noProof/>
             <w:webHidden/>
           </w:rPr>
-          <w:instrText xml:space="preserve"> PAGEREF _Toc242687071 \h </w:instrText>
+          <w:instrText xml:space="preserve"> PAGEREF _Toc242688985 \h </w:instrText>
         </w:r>
         <w:r>
           <w:rPr>
@@ -370,7 +370,7 @@
           <w:lang w:eastAsia="nl-NL"/>
         </w:rPr>
       </w:pPr>
-      <w:hyperlink w:anchor="_Toc242687072" w:history="1">
+      <w:hyperlink w:anchor="_Toc242688986" w:history="1">
         <w:r>
           <w:rPr>
             <w:rStyle w:val="Hyperlink"/>
@@ -415,7 +415,7 @@
             <w:noProof/>
             <w:webHidden/>
           </w:rPr>
-          <w:instrText xml:space="preserve"> PAGEREF _Toc242687072 \h </w:instrText>
+          <w:instrText xml:space="preserve"> PAGEREF _Toc242688986 \h </w:instrText>
         </w:r>
         <w:r>
           <w:rPr>
@@ -462,7 +462,7 @@
           <w:lang w:eastAsia="nl-NL"/>
         </w:rPr>
       </w:pPr>
-      <w:hyperlink w:anchor="_Toc242687073" w:history="1">
+      <w:hyperlink w:anchor="_Toc242688987" w:history="1">
         <w:r>
           <w:rPr>
             <w:rStyle w:val="Hyperlink"/>
@@ -507,7 +507,7 @@
             <w:noProof/>
             <w:webHidden/>
           </w:rPr>
-          <w:instrText xml:space="preserve"> PAGEREF _Toc242687073 \h </w:instrText>
+          <w:instrText xml:space="preserve"> PAGEREF _Toc242688987 \h </w:instrText>
         </w:r>
         <w:r>
           <w:rPr>
@@ -554,7 +554,7 @@
           <w:lang w:eastAsia="nl-NL"/>
         </w:rPr>
       </w:pPr>
-      <w:hyperlink w:anchor="_Toc242687074" w:history="1">
+      <w:hyperlink w:anchor="_Toc242688988" w:history="1">
         <w:r>
           <w:rPr>
             <w:rStyle w:val="Hyperlink"/>
@@ -599,7 +599,7 @@
             <w:noProof/>
             <w:webHidden/>
           </w:rPr>
-          <w:instrText xml:space="preserve"> PAGEREF _Toc242687074 \h </w:instrText>
+          <w:instrText xml:space="preserve"> PAGEREF _Toc242688988 \h </w:instrText>
         </w:r>
         <w:r>
           <w:rPr>
@@ -646,7 +646,7 @@
           <w:lang w:eastAsia="nl-NL"/>
         </w:rPr>
       </w:pPr>
-      <w:hyperlink w:anchor="_Toc242687075" w:history="1">
+      <w:hyperlink w:anchor="_Toc242688989" w:history="1">
         <w:r>
           <w:rPr>
             <w:rStyle w:val="Hyperlink"/>
@@ -691,7 +691,7 @@
             <w:noProof/>
             <w:webHidden/>
           </w:rPr>
-          <w:instrText xml:space="preserve"> PAGEREF _Toc242687075 \h </w:instrText>
+          <w:instrText xml:space="preserve"> PAGEREF _Toc242688989 \h </w:instrText>
         </w:r>
         <w:r>
           <w:rPr>
@@ -738,7 +738,7 @@
           <w:lang w:eastAsia="nl-NL"/>
         </w:rPr>
       </w:pPr>
-      <w:hyperlink w:anchor="_Toc242687076" w:history="1">
+      <w:hyperlink w:anchor="_Toc242688990" w:history="1">
         <w:r>
           <w:rPr>
             <w:rStyle w:val="Hyperlink"/>
@@ -783,7 +783,7 @@
             <w:noProof/>
             <w:webHidden/>
           </w:rPr>
-          <w:instrText xml:space="preserve"> PAGEREF _Toc242687076 \h </w:instrText>
+          <w:instrText xml:space="preserve"> PAGEREF _Toc242688990 \h </w:instrText>
         </w:r>
         <w:r>
           <w:rPr>
@@ -830,7 +830,7 @@
           <w:lang w:eastAsia="nl-NL"/>
         </w:rPr>
       </w:pPr>
-      <w:hyperlink w:anchor="_Toc242687077" w:history="1">
+      <w:hyperlink w:anchor="_Toc242688991" w:history="1">
         <w:r>
           <w:rPr>
             <w:rStyle w:val="Hyperlink"/>
@@ -875,7 +875,7 @@
             <w:noProof/>
             <w:webHidden/>
           </w:rPr>
-          <w:instrText xml:space="preserve"> PAGEREF _Toc242687077 \h </w:instrText>
+          <w:instrText xml:space="preserve"> PAGEREF _Toc242688991 \h </w:instrText>
         </w:r>
         <w:r>
           <w:rPr>
@@ -922,7 +922,7 @@
           <w:lang w:eastAsia="nl-NL"/>
         </w:rPr>
       </w:pPr>
-      <w:hyperlink w:anchor="_Toc242687078" w:history="1">
+      <w:hyperlink w:anchor="_Toc242688992" w:history="1">
         <w:r>
           <w:rPr>
             <w:rStyle w:val="Hyperlink"/>
@@ -967,7 +967,7 @@
             <w:noProof/>
             <w:webHidden/>
           </w:rPr>
-          <w:instrText xml:space="preserve"> PAGEREF _Toc242687078 \h </w:instrText>
+          <w:instrText xml:space="preserve"> PAGEREF _Toc242688992 \h </w:instrText>
         </w:r>
         <w:r>
           <w:rPr>
@@ -1014,7 +1014,7 @@
           <w:lang w:eastAsia="nl-NL"/>
         </w:rPr>
       </w:pPr>
-      <w:hyperlink w:anchor="_Toc242687079" w:history="1">
+      <w:hyperlink w:anchor="_Toc242688993" w:history="1">
         <w:r>
           <w:rPr>
             <w:rStyle w:val="Hyperlink"/>
@@ -1059,7 +1059,7 @@
             <w:noProof/>
             <w:webHidden/>
           </w:rPr>
-          <w:instrText xml:space="preserve"> PAGEREF _Toc242687079 \h </w:instrText>
+          <w:instrText xml:space="preserve"> PAGEREF _Toc242688993 \h </w:instrText>
         </w:r>
         <w:r>
           <w:rPr>
@@ -1106,7 +1106,7 @@
           <w:lang w:eastAsia="nl-NL"/>
         </w:rPr>
       </w:pPr>
-      <w:hyperlink w:anchor="_Toc242687080" w:history="1">
+      <w:hyperlink w:anchor="_Toc242688994" w:history="1">
         <w:r>
           <w:rPr>
             <w:rStyle w:val="Hyperlink"/>
@@ -1151,7 +1151,7 @@
             <w:noProof/>
             <w:webHidden/>
           </w:rPr>
-          <w:instrText xml:space="preserve"> PAGEREF _Toc242687080 \h </w:instrText>
+          <w:instrText xml:space="preserve"> PAGEREF _Toc242688994 \h </w:instrText>
         </w:r>
         <w:r>
           <w:rPr>
@@ -1198,7 +1198,7 @@
           <w:lang w:eastAsia="nl-NL"/>
         </w:rPr>
       </w:pPr>
-      <w:hyperlink w:anchor="_Toc242687081" w:history="1">
+      <w:hyperlink w:anchor="_Toc242688995" w:history="1">
         <w:r>
           <w:rPr>
             <w:rStyle w:val="Hyperlink"/>
@@ -1243,7 +1243,7 @@
             <w:noProof/>
             <w:webHidden/>
           </w:rPr>
-          <w:instrText xml:space="preserve"> PAGEREF _Toc242687081 \h </w:instrText>
+          <w:instrText xml:space="preserve"> PAGEREF _Toc242688995 \h </w:instrText>
         </w:r>
         <w:r>
           <w:rPr>
@@ -1290,7 +1290,7 @@
           <w:lang w:eastAsia="nl-NL"/>
         </w:rPr>
       </w:pPr>
-      <w:hyperlink w:anchor="_Toc242687082" w:history="1">
+      <w:hyperlink w:anchor="_Toc242688996" w:history="1">
         <w:r>
           <w:rPr>
             <w:rStyle w:val="Hyperlink"/>
@@ -1335,7 +1335,7 @@
             <w:noProof/>
             <w:webHidden/>
           </w:rPr>
-          <w:instrText xml:space="preserve"> PAGEREF _Toc242687082 \h </w:instrText>
+          <w:instrText xml:space="preserve"> PAGEREF _Toc242688996 \h </w:instrText>
         </w:r>
         <w:r>
           <w:rPr>
@@ -1382,7 +1382,7 @@
           <w:lang w:eastAsia="nl-NL"/>
         </w:rPr>
       </w:pPr>
-      <w:hyperlink w:anchor="_Toc242687083" w:history="1">
+      <w:hyperlink w:anchor="_Toc242688997" w:history="1">
         <w:r>
           <w:rPr>
             <w:rStyle w:val="Hyperlink"/>
@@ -1427,7 +1427,7 @@
             <w:noProof/>
             <w:webHidden/>
           </w:rPr>
-          <w:instrText xml:space="preserve"> PAGEREF _Toc242687083 \h </w:instrText>
+          <w:instrText xml:space="preserve"> PAGEREF _Toc242688997 \h </w:instrText>
         </w:r>
         <w:r>
           <w:rPr>
@@ -1447,7 +1447,7 @@
             <w:noProof/>
             <w:webHidden/>
           </w:rPr>
-          <w:t>12</w:t>
+          <w:t>13</w:t>
         </w:r>
         <w:r>
           <w:rPr>
@@ -1474,7 +1474,7 @@
           <w:lang w:eastAsia="nl-NL"/>
         </w:rPr>
       </w:pPr>
-      <w:hyperlink w:anchor="_Toc242687084" w:history="1">
+      <w:hyperlink w:anchor="_Toc242688998" w:history="1">
         <w:r>
           <w:rPr>
             <w:rStyle w:val="Hyperlink"/>
@@ -1519,7 +1519,7 @@
             <w:noProof/>
             <w:webHidden/>
           </w:rPr>
-          <w:instrText xml:space="preserve"> PAGEREF _Toc242687084 \h </w:instrText>
+          <w:instrText xml:space="preserve"> PAGEREF _Toc242688998 \h </w:instrText>
         </w:r>
         <w:r>
           <w:rPr>
@@ -1566,7 +1566,7 @@
           <w:lang w:eastAsia="nl-NL"/>
         </w:rPr>
       </w:pPr>
-      <w:hyperlink w:anchor="_Toc242687085" w:history="1">
+      <w:hyperlink w:anchor="_Toc242688999" w:history="1">
         <w:r>
           <w:rPr>
             <w:rStyle w:val="Hyperlink"/>
@@ -1611,7 +1611,7 @@
             <w:noProof/>
             <w:webHidden/>
           </w:rPr>
-          <w:instrText xml:space="preserve"> PAGEREF _Toc242687085 \h </w:instrText>
+          <w:instrText xml:space="preserve"> PAGEREF _Toc242688999 \h </w:instrText>
         </w:r>
         <w:r>
           <w:rPr>
@@ -1658,7 +1658,7 @@
           <w:lang w:eastAsia="nl-NL"/>
         </w:rPr>
       </w:pPr>
-      <w:hyperlink w:anchor="_Toc242687086" w:history="1">
+      <w:hyperlink w:anchor="_Toc242689000" w:history="1">
         <w:r>
           <w:rPr>
             <w:rStyle w:val="Hyperlink"/>
@@ -1703,7 +1703,7 @@
             <w:noProof/>
             <w:webHidden/>
           </w:rPr>
-          <w:instrText xml:space="preserve"> PAGEREF _Toc242687086 \h </w:instrText>
+          <w:instrText xml:space="preserve"> PAGEREF _Toc242689000 \h </w:instrText>
         </w:r>
         <w:r>
           <w:rPr>
@@ -1723,7 +1723,7 @@
             <w:noProof/>
             <w:webHidden/>
           </w:rPr>
-          <w:t>13</w:t>
+          <w:t>14</w:t>
         </w:r>
         <w:r>
           <w:rPr>
@@ -1750,7 +1750,7 @@
           <w:lang w:eastAsia="nl-NL"/>
         </w:rPr>
       </w:pPr>
-      <w:hyperlink w:anchor="_Toc242687087" w:history="1">
+      <w:hyperlink w:anchor="_Toc242689001" w:history="1">
         <w:r>
           <w:rPr>
             <w:rStyle w:val="Hyperlink"/>
@@ -1795,7 +1795,7 @@
             <w:noProof/>
             <w:webHidden/>
           </w:rPr>
-          <w:instrText xml:space="preserve"> PAGEREF _Toc242687087 \h </w:instrText>
+          <w:instrText xml:space="preserve"> PAGEREF _Toc242689001 \h </w:instrText>
         </w:r>
         <w:r>
           <w:rPr>
@@ -1842,7 +1842,7 @@
           <w:lang w:eastAsia="nl-NL"/>
         </w:rPr>
       </w:pPr>
-      <w:hyperlink w:anchor="_Toc242687088" w:history="1">
+      <w:hyperlink w:anchor="_Toc242689002" w:history="1">
         <w:r>
           <w:rPr>
             <w:rStyle w:val="Hyperlink"/>
@@ -1887,7 +1887,7 @@
             <w:noProof/>
             <w:webHidden/>
           </w:rPr>
-          <w:instrText xml:space="preserve"> PAGEREF _Toc242687088 \h </w:instrText>
+          <w:instrText xml:space="preserve"> PAGEREF _Toc242689002 \h </w:instrText>
         </w:r>
         <w:r>
           <w:rPr>
@@ -1934,7 +1934,7 @@
           <w:lang w:eastAsia="nl-NL"/>
         </w:rPr>
       </w:pPr>
-      <w:hyperlink w:anchor="_Toc242687089" w:history="1">
+      <w:hyperlink w:anchor="_Toc242689003" w:history="1">
         <w:r>
           <w:rPr>
             <w:rStyle w:val="Hyperlink"/>
@@ -1979,7 +1979,7 @@
             <w:noProof/>
             <w:webHidden/>
           </w:rPr>
-          <w:instrText xml:space="preserve"> PAGEREF _Toc242687089 \h </w:instrText>
+          <w:instrText xml:space="preserve"> PAGEREF _Toc242689003 \h </w:instrText>
         </w:r>
         <w:r>
           <w:rPr>
@@ -2026,7 +2026,7 @@
           <w:lang w:eastAsia="nl-NL"/>
         </w:rPr>
       </w:pPr>
-      <w:hyperlink w:anchor="_Toc242687090" w:history="1">
+      <w:hyperlink w:anchor="_Toc242689004" w:history="1">
         <w:r>
           <w:rPr>
             <w:rStyle w:val="Hyperlink"/>
@@ -2087,7 +2087,7 @@
             <w:noProof/>
             <w:webHidden/>
           </w:rPr>
-          <w:instrText xml:space="preserve"> PAGEREF _Toc242687090 \h </w:instrText>
+          <w:instrText xml:space="preserve"> PAGEREF _Toc242689004 \h </w:instrText>
         </w:r>
         <w:r>
           <w:rPr>
@@ -2134,7 +2134,7 @@
           <w:lang w:eastAsia="nl-NL"/>
         </w:rPr>
       </w:pPr>
-      <w:hyperlink w:anchor="_Toc242687091" w:history="1">
+      <w:hyperlink w:anchor="_Toc242689005" w:history="1">
         <w:r>
           <w:rPr>
             <w:rStyle w:val="Hyperlink"/>
@@ -2179,7 +2179,7 @@
             <w:noProof/>
             <w:webHidden/>
           </w:rPr>
-          <w:instrText xml:space="preserve"> PAGEREF _Toc242687091 \h </w:instrText>
+          <w:instrText xml:space="preserve"> PAGEREF _Toc242689005 \h </w:instrText>
         </w:r>
         <w:r>
           <w:rPr>
@@ -2226,7 +2226,7 @@
           <w:lang w:eastAsia="nl-NL"/>
         </w:rPr>
       </w:pPr>
-      <w:hyperlink w:anchor="_Toc242687092" w:history="1">
+      <w:hyperlink w:anchor="_Toc242689006" w:history="1">
         <w:r>
           <w:rPr>
             <w:rStyle w:val="Hyperlink"/>
@@ -2271,7 +2271,7 @@
             <w:noProof/>
             <w:webHidden/>
           </w:rPr>
-          <w:instrText xml:space="preserve"> PAGEREF _Toc242687092 \h </w:instrText>
+          <w:instrText xml:space="preserve"> PAGEREF _Toc242689006 \h </w:instrText>
         </w:r>
         <w:r>
           <w:rPr>
@@ -2318,7 +2318,7 @@
           <w:lang w:eastAsia="nl-NL"/>
         </w:rPr>
       </w:pPr>
-      <w:hyperlink w:anchor="_Toc242687093" w:history="1">
+      <w:hyperlink w:anchor="_Toc242689007" w:history="1">
         <w:r>
           <w:rPr>
             <w:rStyle w:val="Hyperlink"/>
@@ -2363,7 +2363,7 @@
             <w:noProof/>
             <w:webHidden/>
           </w:rPr>
-          <w:instrText xml:space="preserve"> PAGEREF _Toc242687093 \h </w:instrText>
+          <w:instrText xml:space="preserve"> PAGEREF _Toc242689007 \h </w:instrText>
         </w:r>
         <w:r>
           <w:rPr>
@@ -2410,7 +2410,7 @@
           <w:lang w:eastAsia="nl-NL"/>
         </w:rPr>
       </w:pPr>
-      <w:hyperlink w:anchor="_Toc242687094" w:history="1">
+      <w:hyperlink w:anchor="_Toc242689008" w:history="1">
         <w:r>
           <w:rPr>
             <w:rStyle w:val="Hyperlink"/>
@@ -2455,7 +2455,7 @@
             <w:noProof/>
             <w:webHidden/>
           </w:rPr>
-          <w:instrText xml:space="preserve"> PAGEREF _Toc242687094 \h </w:instrText>
+          <w:instrText xml:space="preserve"> PAGEREF _Toc242689008 \h </w:instrText>
         </w:r>
         <w:r>
           <w:rPr>
@@ -2502,7 +2502,7 @@
           <w:lang w:eastAsia="nl-NL"/>
         </w:rPr>
       </w:pPr>
-      <w:hyperlink w:anchor="_Toc242687095" w:history="1">
+      <w:hyperlink w:anchor="_Toc242689009" w:history="1">
         <w:r>
           <w:rPr>
             <w:rStyle w:val="Hyperlink"/>
@@ -2547,7 +2547,7 @@
             <w:noProof/>
             <w:webHidden/>
           </w:rPr>
-          <w:instrText xml:space="preserve"> PAGEREF _Toc242687095 \h </w:instrText>
+          <w:instrText xml:space="preserve"> PAGEREF _Toc242689009 \h </w:instrText>
         </w:r>
         <w:r>
           <w:rPr>
@@ -2594,7 +2594,7 @@
           <w:lang w:eastAsia="nl-NL"/>
         </w:rPr>
       </w:pPr>
-      <w:hyperlink w:anchor="_Toc242687096" w:history="1">
+      <w:hyperlink w:anchor="_Toc242689010" w:history="1">
         <w:r>
           <w:rPr>
             <w:rStyle w:val="Hyperlink"/>
@@ -2639,7 +2639,7 @@
             <w:noProof/>
             <w:webHidden/>
           </w:rPr>
-          <w:instrText xml:space="preserve"> PAGEREF _Toc242687096 \h </w:instrText>
+          <w:instrText xml:space="preserve"> PAGEREF _Toc242689010 \h </w:instrText>
         </w:r>
         <w:r>
           <w:rPr>
@@ -2686,7 +2686,7 @@
           <w:lang w:eastAsia="nl-NL"/>
         </w:rPr>
       </w:pPr>
-      <w:hyperlink w:anchor="_Toc242687097" w:history="1">
+      <w:hyperlink w:anchor="_Toc242689011" w:history="1">
         <w:r>
           <w:rPr>
             <w:rStyle w:val="Hyperlink"/>
@@ -2731,7 +2731,7 @@
             <w:noProof/>
             <w:webHidden/>
           </w:rPr>
-          <w:instrText xml:space="preserve"> PAGEREF _Toc242687097 \h </w:instrText>
+          <w:instrText xml:space="preserve"> PAGEREF _Toc242689011 \h </w:instrText>
         </w:r>
         <w:r>
           <w:rPr>
@@ -2778,7 +2778,7 @@
           <w:lang w:eastAsia="nl-NL"/>
         </w:rPr>
       </w:pPr>
-      <w:hyperlink w:anchor="_Toc242687098" w:history="1">
+      <w:hyperlink w:anchor="_Toc242689012" w:history="1">
         <w:r>
           <w:rPr>
             <w:rStyle w:val="Hyperlink"/>
@@ -2839,7 +2839,7 @@
             <w:noProof/>
             <w:webHidden/>
           </w:rPr>
-          <w:instrText xml:space="preserve"> PAGEREF _Toc242687098 \h </w:instrText>
+          <w:instrText xml:space="preserve"> PAGEREF _Toc242689012 \h </w:instrText>
         </w:r>
         <w:r>
           <w:rPr>
@@ -2886,7 +2886,7 @@
           <w:lang w:eastAsia="nl-NL"/>
         </w:rPr>
       </w:pPr>
-      <w:hyperlink w:anchor="_Toc242687099" w:history="1">
+      <w:hyperlink w:anchor="_Toc242689013" w:history="1">
         <w:r>
           <w:rPr>
             <w:rStyle w:val="Hyperlink"/>
@@ -2931,7 +2931,7 @@
             <w:noProof/>
             <w:webHidden/>
           </w:rPr>
-          <w:instrText xml:space="preserve"> PAGEREF _Toc242687099 \h </w:instrText>
+          <w:instrText xml:space="preserve"> PAGEREF _Toc242689013 \h </w:instrText>
         </w:r>
         <w:r>
           <w:rPr>
@@ -2978,7 +2978,7 @@
           <w:lang w:eastAsia="nl-NL"/>
         </w:rPr>
       </w:pPr>
-      <w:hyperlink w:anchor="_Toc242687100" w:history="1">
+      <w:hyperlink w:anchor="_Toc242689014" w:history="1">
         <w:r>
           <w:rPr>
             <w:rStyle w:val="Hyperlink"/>
@@ -3023,7 +3023,7 @@
             <w:noProof/>
             <w:webHidden/>
           </w:rPr>
-          <w:instrText xml:space="preserve"> PAGEREF _Toc242687100 \h </w:instrText>
+          <w:instrText xml:space="preserve"> PAGEREF _Toc242689014 \h </w:instrText>
         </w:r>
         <w:r>
           <w:rPr>
@@ -3070,7 +3070,7 @@
           <w:lang w:eastAsia="nl-NL"/>
         </w:rPr>
       </w:pPr>
-      <w:hyperlink w:anchor="_Toc242687101" w:history="1">
+      <w:hyperlink w:anchor="_Toc242689015" w:history="1">
         <w:r>
           <w:rPr>
             <w:rStyle w:val="Hyperlink"/>
@@ -3115,7 +3115,7 @@
             <w:noProof/>
             <w:webHidden/>
           </w:rPr>
-          <w:instrText xml:space="preserve"> PAGEREF _Toc242687101 \h </w:instrText>
+          <w:instrText xml:space="preserve"> PAGEREF _Toc242689015 \h </w:instrText>
         </w:r>
         <w:r>
           <w:rPr>
@@ -3162,7 +3162,7 @@
           <w:lang w:eastAsia="nl-NL"/>
         </w:rPr>
       </w:pPr>
-      <w:hyperlink w:anchor="_Toc242687102" w:history="1">
+      <w:hyperlink w:anchor="_Toc242689016" w:history="1">
         <w:r>
           <w:rPr>
             <w:rStyle w:val="Hyperlink"/>
@@ -3223,7 +3223,7 @@
             <w:noProof/>
             <w:webHidden/>
           </w:rPr>
-          <w:instrText xml:space="preserve"> PAGEREF _Toc242687102 \h </w:instrText>
+          <w:instrText xml:space="preserve"> PAGEREF _Toc242689016 \h </w:instrText>
         </w:r>
         <w:r>
           <w:rPr>
@@ -3270,7 +3270,7 @@
           <w:lang w:eastAsia="nl-NL"/>
         </w:rPr>
       </w:pPr>
-      <w:hyperlink w:anchor="_Toc242687103" w:history="1">
+      <w:hyperlink w:anchor="_Toc242689017" w:history="1">
         <w:r>
           <w:rPr>
             <w:rStyle w:val="Hyperlink"/>
@@ -3315,7 +3315,7 @@
             <w:noProof/>
             <w:webHidden/>
           </w:rPr>
-          <w:instrText xml:space="preserve"> PAGEREF _Toc242687103 \h </w:instrText>
+          <w:instrText xml:space="preserve"> PAGEREF _Toc242689017 \h </w:instrText>
         </w:r>
         <w:r>
           <w:rPr>
@@ -3362,7 +3362,7 @@
           <w:lang w:eastAsia="nl-NL"/>
         </w:rPr>
       </w:pPr>
-      <w:hyperlink w:anchor="_Toc242687104" w:history="1">
+      <w:hyperlink w:anchor="_Toc242689018" w:history="1">
         <w:r>
           <w:rPr>
             <w:rStyle w:val="Hyperlink"/>
@@ -3407,7 +3407,7 @@
             <w:noProof/>
             <w:webHidden/>
           </w:rPr>
-          <w:instrText xml:space="preserve"> PAGEREF _Toc242687104 \h </w:instrText>
+          <w:instrText xml:space="preserve"> PAGEREF _Toc242689018 \h </w:instrText>
         </w:r>
         <w:r>
           <w:rPr>
@@ -3454,7 +3454,7 @@
           <w:lang w:eastAsia="nl-NL"/>
         </w:rPr>
       </w:pPr>
-      <w:hyperlink w:anchor="_Toc242687105" w:history="1">
+      <w:hyperlink w:anchor="_Toc242689019" w:history="1">
         <w:r>
           <w:rPr>
             <w:rStyle w:val="Hyperlink"/>
@@ -3501,7 +3501,7 @@
             <w:noProof/>
             <w:webHidden/>
           </w:rPr>
-          <w:instrText xml:space="preserve"> PAGEREF _Toc242687105 \h </w:instrText>
+          <w:instrText xml:space="preserve"> PAGEREF _Toc242689019 \h </w:instrText>
         </w:r>
         <w:r>
           <w:rPr>
@@ -3548,7 +3548,7 @@
           <w:lang w:eastAsia="nl-NL"/>
         </w:rPr>
       </w:pPr>
-      <w:hyperlink w:anchor="_Toc242687106" w:history="1">
+      <w:hyperlink w:anchor="_Toc242689020" w:history="1">
         <w:r>
           <w:rPr>
             <w:rStyle w:val="Hyperlink"/>
@@ -3595,7 +3595,7 @@
             <w:noProof/>
             <w:webHidden/>
           </w:rPr>
-          <w:instrText xml:space="preserve"> PAGEREF _Toc242687106 \h </w:instrText>
+          <w:instrText xml:space="preserve"> PAGEREF _Toc242689020 \h </w:instrText>
         </w:r>
         <w:r>
           <w:rPr>
@@ -3615,7 +3615,7 @@
             <w:noProof/>
             <w:webHidden/>
           </w:rPr>
-          <w:t>25</w:t>
+          <w:t>26</w:t>
         </w:r>
         <w:r>
           <w:rPr>
@@ -3642,7 +3642,7 @@
           <w:lang w:eastAsia="nl-NL"/>
         </w:rPr>
       </w:pPr>
-      <w:hyperlink w:anchor="_Toc242687107" w:history="1">
+      <w:hyperlink w:anchor="_Toc242689021" w:history="1">
         <w:r>
           <w:rPr>
             <w:rStyle w:val="Hyperlink"/>
@@ -3689,7 +3689,7 @@
             <w:noProof/>
             <w:webHidden/>
           </w:rPr>
-          <w:instrText xml:space="preserve"> PAGEREF _Toc242687107 \h </w:instrText>
+          <w:instrText xml:space="preserve"> PAGEREF _Toc242689021 \h </w:instrText>
         </w:r>
         <w:r>
           <w:rPr>
@@ -3709,7 +3709,7 @@
             <w:noProof/>
             <w:webHidden/>
           </w:rPr>
-          <w:t>25</w:t>
+          <w:t>26</w:t>
         </w:r>
         <w:r>
           <w:rPr>
@@ -3736,7 +3736,7 @@
           <w:lang w:eastAsia="nl-NL"/>
         </w:rPr>
       </w:pPr>
-      <w:hyperlink w:anchor="_Toc242687108" w:history="1">
+      <w:hyperlink w:anchor="_Toc242689022" w:history="1">
         <w:r>
           <w:rPr>
             <w:rStyle w:val="Hyperlink"/>
@@ -3783,7 +3783,7 @@
             <w:noProof/>
             <w:webHidden/>
           </w:rPr>
-          <w:instrText xml:space="preserve"> PAGEREF _Toc242687108 \h </w:instrText>
+          <w:instrText xml:space="preserve"> PAGEREF _Toc242689022 \h </w:instrText>
         </w:r>
         <w:r>
           <w:rPr>
@@ -3830,7 +3830,7 @@
           <w:lang w:eastAsia="nl-NL"/>
         </w:rPr>
       </w:pPr>
-      <w:hyperlink w:anchor="_Toc242687109" w:history="1">
+      <w:hyperlink w:anchor="_Toc242689023" w:history="1">
         <w:r>
           <w:rPr>
             <w:rStyle w:val="Hyperlink"/>
@@ -3877,7 +3877,7 @@
             <w:noProof/>
             <w:webHidden/>
           </w:rPr>
-          <w:instrText xml:space="preserve"> PAGEREF _Toc242687109 \h </w:instrText>
+          <w:instrText xml:space="preserve"> PAGEREF _Toc242689023 \h </w:instrText>
         </w:r>
         <w:r>
           <w:rPr>
@@ -3924,7 +3924,7 @@
           <w:lang w:eastAsia="nl-NL"/>
         </w:rPr>
       </w:pPr>
-      <w:hyperlink w:anchor="_Toc242687110" w:history="1">
+      <w:hyperlink w:anchor="_Toc242689024" w:history="1">
         <w:r>
           <w:rPr>
             <w:rStyle w:val="Hyperlink"/>
@@ -3971,7 +3971,7 @@
             <w:noProof/>
             <w:webHidden/>
           </w:rPr>
-          <w:instrText xml:space="preserve"> PAGEREF _Toc242687110 \h </w:instrText>
+          <w:instrText xml:space="preserve"> PAGEREF _Toc242689024 \h </w:instrText>
         </w:r>
         <w:r>
           <w:rPr>
@@ -4018,7 +4018,7 @@
           <w:lang w:eastAsia="nl-NL"/>
         </w:rPr>
       </w:pPr>
-      <w:hyperlink w:anchor="_Toc242687111" w:history="1">
+      <w:hyperlink w:anchor="_Toc242689025" w:history="1">
         <w:r>
           <w:rPr>
             <w:rStyle w:val="Hyperlink"/>
@@ -4063,7 +4063,7 @@
             <w:noProof/>
             <w:webHidden/>
           </w:rPr>
-          <w:instrText xml:space="preserve"> PAGEREF _Toc242687111 \h </w:instrText>
+          <w:instrText xml:space="preserve"> PAGEREF _Toc242689025 \h </w:instrText>
         </w:r>
         <w:r>
           <w:rPr>
@@ -4110,7 +4110,7 @@
           <w:lang w:eastAsia="nl-NL"/>
         </w:rPr>
       </w:pPr>
-      <w:hyperlink w:anchor="_Toc242687112" w:history="1">
+      <w:hyperlink w:anchor="_Toc242689026" w:history="1">
         <w:r>
           <w:rPr>
             <w:rStyle w:val="Hyperlink"/>
@@ -4155,7 +4155,7 @@
             <w:noProof/>
             <w:webHidden/>
           </w:rPr>
-          <w:instrText xml:space="preserve"> PAGEREF _Toc242687112 \h </w:instrText>
+          <w:instrText xml:space="preserve"> PAGEREF _Toc242689026 \h </w:instrText>
         </w:r>
         <w:r>
           <w:rPr>
@@ -4175,7 +4175,7 @@
             <w:noProof/>
             <w:webHidden/>
           </w:rPr>
-          <w:t>26</w:t>
+          <w:t>27</w:t>
         </w:r>
         <w:r>
           <w:rPr>
@@ -4202,7 +4202,7 @@
           <w:lang w:eastAsia="nl-NL"/>
         </w:rPr>
       </w:pPr>
-      <w:hyperlink w:anchor="_Toc242687113" w:history="1">
+      <w:hyperlink w:anchor="_Toc242689027" w:history="1">
         <w:r>
           <w:rPr>
             <w:rStyle w:val="Hyperlink"/>
@@ -4279,7 +4279,7 @@
             <w:noProof/>
             <w:webHidden/>
           </w:rPr>
-          <w:instrText xml:space="preserve"> PAGEREF _Toc242687113 \h </w:instrText>
+          <w:instrText xml:space="preserve"> PAGEREF _Toc242689027 \h </w:instrText>
         </w:r>
         <w:r>
           <w:rPr>
@@ -4326,7 +4326,7 @@
           <w:lang w:eastAsia="nl-NL"/>
         </w:rPr>
       </w:pPr>
-      <w:hyperlink w:anchor="_Toc242687114" w:history="1">
+      <w:hyperlink w:anchor="_Toc242689028" w:history="1">
         <w:r>
           <w:rPr>
             <w:rStyle w:val="Hyperlink"/>
@@ -4371,7 +4371,7 @@
             <w:noProof/>
             <w:webHidden/>
           </w:rPr>
-          <w:instrText xml:space="preserve"> PAGEREF _Toc242687114 \h </w:instrText>
+          <w:instrText xml:space="preserve"> PAGEREF _Toc242689028 \h </w:instrText>
         </w:r>
         <w:r>
           <w:rPr>
@@ -4418,7 +4418,7 @@
           <w:lang w:eastAsia="nl-NL"/>
         </w:rPr>
       </w:pPr>
-      <w:hyperlink w:anchor="_Toc242687115" w:history="1">
+      <w:hyperlink w:anchor="_Toc242689029" w:history="1">
         <w:r>
           <w:rPr>
             <w:rStyle w:val="Hyperlink"/>
@@ -4463,7 +4463,7 @@
             <w:noProof/>
             <w:webHidden/>
           </w:rPr>
-          <w:instrText xml:space="preserve"> PAGEREF _Toc242687115 \h </w:instrText>
+          <w:instrText xml:space="preserve"> PAGEREF _Toc242689029 \h </w:instrText>
         </w:r>
         <w:r>
           <w:rPr>
@@ -4483,7 +4483,7 @@
             <w:noProof/>
             <w:webHidden/>
           </w:rPr>
-          <w:t>28</w:t>
+          <w:t>29</w:t>
         </w:r>
         <w:r>
           <w:rPr>
@@ -4510,7 +4510,7 @@
           <w:lang w:eastAsia="nl-NL"/>
         </w:rPr>
       </w:pPr>
-      <w:hyperlink w:anchor="_Toc242687116" w:history="1">
+      <w:hyperlink w:anchor="_Toc242689030" w:history="1">
         <w:r>
           <w:rPr>
             <w:rStyle w:val="Hyperlink"/>
@@ -4555,7 +4555,7 @@
             <w:noProof/>
             <w:webHidden/>
           </w:rPr>
-          <w:instrText xml:space="preserve"> PAGEREF _Toc242687116 \h </w:instrText>
+          <w:instrText xml:space="preserve"> PAGEREF _Toc242689030 \h </w:instrText>
         </w:r>
         <w:r>
           <w:rPr>
@@ -4575,7 +4575,7 @@
             <w:noProof/>
             <w:webHidden/>
           </w:rPr>
-          <w:t>28</w:t>
+          <w:t>29</w:t>
         </w:r>
         <w:r>
           <w:rPr>
@@ -4602,7 +4602,7 @@
           <w:lang w:eastAsia="nl-NL"/>
         </w:rPr>
       </w:pPr>
-      <w:hyperlink w:anchor="_Toc242687117" w:history="1">
+      <w:hyperlink w:anchor="_Toc242689031" w:history="1">
         <w:r>
           <w:rPr>
             <w:rStyle w:val="Hyperlink"/>
@@ -4647,7 +4647,7 @@
             <w:noProof/>
             <w:webHidden/>
           </w:rPr>
-          <w:instrText xml:space="preserve"> PAGEREF _Toc242687117 \h </w:instrText>
+          <w:instrText xml:space="preserve"> PAGEREF _Toc242689031 \h </w:instrText>
         </w:r>
         <w:r>
           <w:rPr>
@@ -4667,7 +4667,7 @@
             <w:noProof/>
             <w:webHidden/>
           </w:rPr>
-          <w:t>28</w:t>
+          <w:t>29</w:t>
         </w:r>
         <w:r>
           <w:rPr>
@@ -4694,7 +4694,7 @@
           <w:lang w:eastAsia="nl-NL"/>
         </w:rPr>
       </w:pPr>
-      <w:hyperlink w:anchor="_Toc242687118" w:history="1">
+      <w:hyperlink w:anchor="_Toc242689032" w:history="1">
         <w:r>
           <w:rPr>
             <w:rStyle w:val="Hyperlink"/>
@@ -4739,7 +4739,7 @@
             <w:noProof/>
             <w:webHidden/>
           </w:rPr>
-          <w:instrText xml:space="preserve"> PAGEREF _Toc242687118 \h </w:instrText>
+          <w:instrText xml:space="preserve"> PAGEREF _Toc242689032 \h </w:instrText>
         </w:r>
         <w:r>
           <w:rPr>
@@ -4759,7 +4759,7 @@
             <w:noProof/>
             <w:webHidden/>
           </w:rPr>
-          <w:t>28</w:t>
+          <w:t>29</w:t>
         </w:r>
         <w:r>
           <w:rPr>
@@ -4786,7 +4786,7 @@
           <w:lang w:eastAsia="nl-NL"/>
         </w:rPr>
       </w:pPr>
-      <w:hyperlink w:anchor="_Toc242687119" w:history="1">
+      <w:hyperlink w:anchor="_Toc242689033" w:history="1">
         <w:r>
           <w:rPr>
             <w:rStyle w:val="Hyperlink"/>
@@ -4831,7 +4831,7 @@
             <w:noProof/>
             <w:webHidden/>
           </w:rPr>
-          <w:instrText xml:space="preserve"> PAGEREF _Toc242687119 \h </w:instrText>
+          <w:instrText xml:space="preserve"> PAGEREF _Toc242689033 \h </w:instrText>
         </w:r>
         <w:r>
           <w:rPr>
@@ -4851,7 +4851,7 @@
             <w:noProof/>
             <w:webHidden/>
           </w:rPr>
-          <w:t>28</w:t>
+          <w:t>29</w:t>
         </w:r>
         <w:r>
           <w:rPr>
@@ -4878,7 +4878,7 @@
           <w:lang w:eastAsia="nl-NL"/>
         </w:rPr>
       </w:pPr>
-      <w:hyperlink w:anchor="_Toc242687120" w:history="1">
+      <w:hyperlink w:anchor="_Toc242689034" w:history="1">
         <w:r>
           <w:rPr>
             <w:rStyle w:val="Hyperlink"/>
@@ -4923,7 +4923,7 @@
             <w:noProof/>
             <w:webHidden/>
           </w:rPr>
-          <w:instrText xml:space="preserve"> PAGEREF _Toc242687120 \h </w:instrText>
+          <w:instrText xml:space="preserve"> PAGEREF _Toc242689034 \h </w:instrText>
         </w:r>
         <w:r>
           <w:rPr>
@@ -4943,7 +4943,7 @@
             <w:noProof/>
             <w:webHidden/>
           </w:rPr>
-          <w:t>30</w:t>
+          <w:t>31</w:t>
         </w:r>
         <w:r>
           <w:rPr>
@@ -4970,7 +4970,7 @@
           <w:lang w:eastAsia="nl-NL"/>
         </w:rPr>
       </w:pPr>
-      <w:hyperlink w:anchor="_Toc242687121" w:history="1">
+      <w:hyperlink w:anchor="_Toc242689035" w:history="1">
         <w:r>
           <w:rPr>
             <w:rStyle w:val="Hyperlink"/>
@@ -5015,7 +5015,7 @@
             <w:noProof/>
             <w:webHidden/>
           </w:rPr>
-          <w:instrText xml:space="preserve"> PAGEREF _Toc242687121 \h </w:instrText>
+          <w:instrText xml:space="preserve"> PAGEREF _Toc242689035 \h </w:instrText>
         </w:r>
         <w:r>
           <w:rPr>
@@ -5035,7 +5035,7 @@
             <w:noProof/>
             <w:webHidden/>
           </w:rPr>
-          <w:t>31</w:t>
+          <w:t>32</w:t>
         </w:r>
         <w:r>
           <w:rPr>
@@ -5062,7 +5062,7 @@
           <w:lang w:eastAsia="nl-NL"/>
         </w:rPr>
       </w:pPr>
-      <w:hyperlink w:anchor="_Toc242687122" w:history="1">
+      <w:hyperlink w:anchor="_Toc242689036" w:history="1">
         <w:r>
           <w:rPr>
             <w:rStyle w:val="Hyperlink"/>
@@ -5107,7 +5107,7 @@
             <w:noProof/>
             <w:webHidden/>
           </w:rPr>
-          <w:instrText xml:space="preserve"> PAGEREF _Toc242687122 \h </w:instrText>
+          <w:instrText xml:space="preserve"> PAGEREF _Toc242689036 \h </w:instrText>
         </w:r>
         <w:r>
           <w:rPr>
@@ -5127,7 +5127,7 @@
             <w:noProof/>
             <w:webHidden/>
           </w:rPr>
-          <w:t>32</w:t>
+          <w:t>33</w:t>
         </w:r>
         <w:r>
           <w:rPr>
@@ -5160,7 +5160,7 @@
         </w:numPr>
       </w:pPr>
       <w:bookmarkStart w:id="1" w:name="k1"/>
-      <w:bookmarkStart w:id="2" w:name="_Toc242687070"/>
+      <w:bookmarkStart w:id="2" w:name="_Toc242688984"/>
       <w:r>
         <w:t>DOEL VAN DE APPLICATIE.</w:t>
       </w:r>
@@ -5242,7 +5242,7 @@
         </w:numPr>
       </w:pPr>
       <w:bookmarkStart w:id="3" w:name="k2"/>
-      <w:bookmarkStart w:id="4" w:name="_Toc242687071"/>
+      <w:bookmarkStart w:id="4" w:name="_Toc242688985"/>
       <w:r>
         <w:t>BESTANDEN.</w:t>
       </w:r>
@@ -6589,7 +6589,7 @@
                 <w:sz w:val="16"/>
                 <w:szCs w:val="16"/>
               </w:rPr>
-              <w:t>Unit tests (534) voor de regels, de opslag, de export, het thema, de welkom- en gezichtsherkenningsfuncties, herkennen met de pas, de controller, de beveiliging en regressietests voor opgeloste bugs</w:t>
+              <w:t>Unit tests (547) voor de regels, de opslag, de export, het thema, de welkom- en gezichtsherkenningsfuncties, herkennen met de pas, de controller, de beveiliging en regressietests voor opgeloste bugs</w:t>
             </w:r>
           </w:p>
         </w:tc>
@@ -7280,7 +7280,7 @@
                 <w:sz w:val="14"/>
                 <w:shd w:val="clear" w:color="auto" w:fill="EEF4F2"/>
               </w:rPr>
-              <w:t>.github/workflows/ci.yml</w:t>
+              <w:t>tests/e2e/</w:t>
             </w:r>
           </w:p>
         </w:tc>
@@ -7297,7 +7297,100 @@
                 <w:sz w:val="16"/>
                 <w:szCs w:val="16"/>
               </w:rPr>
-              <w:t>Voert de unit tests automatisch uit op GitHub met Node.js 24 (LTS), met alleen leesrechten en actions die op een commit-SHA zijn vastgezet</w:t>
+              <w:t xml:space="preserve">Browsertests (end-to-end): </w:t>
+            </w:r>
+            <w:r>
+              <w:rPr>
+                <w:rFonts w:ascii="Consolas" w:hAnsi="Consolas" w:cs="Consolas"/>
+                <w:sz w:val="14"/>
+                <w:shd w:val="clear" w:color="auto" w:fill="EEF4F2"/>
+              </w:rPr>
+              <w:t>app.e2e.test.js</w:t>
+            </w:r>
+            <w:r>
+              <w:rPr>
+                <w:sz w:val="16"/>
+                <w:szCs w:val="16"/>
+              </w:rPr>
+              <w:t xml:space="preserve"> test de echte pagina in headless Edge of Chrome (laden zonder fouten, zoeken, registreren, Escape en focus, inloggen, thema, pas koppelen en herkennen, CSV-export), </w:t>
+            </w:r>
+            <w:r>
+              <w:rPr>
+                <w:rFonts w:ascii="Consolas" w:hAnsi="Consolas" w:cs="Consolas"/>
+                <w:sz w:val="14"/>
+                <w:shd w:val="clear" w:color="auto" w:fill="EEF4F2"/>
+              </w:rPr>
+              <w:t>browser.js</w:t>
+            </w:r>
+            <w:r>
+              <w:rPr>
+                <w:sz w:val="16"/>
+                <w:szCs w:val="16"/>
+              </w:rPr>
+              <w:t xml:space="preserve"> bevat de webserver en de besturing van de browser via het Chrome DevTools Protocol. Draaien met </w:t>
+            </w:r>
+            <w:r>
+              <w:rPr>
+                <w:rFonts w:ascii="Consolas" w:hAnsi="Consolas" w:cs="Consolas"/>
+                <w:sz w:val="14"/>
+                <w:shd w:val="clear" w:color="auto" w:fill="EEF4F2"/>
+              </w:rPr>
+              <w:t>npm run test:e2e</w:t>
+            </w:r>
+            <w:r>
+              <w:rPr>
+                <w:sz w:val="16"/>
+                <w:szCs w:val="16"/>
+              </w:rPr>
+              <w:t xml:space="preserve">, zonder npm-pakketten. Een andere browser kies je met </w:t>
+            </w:r>
+            <w:r>
+              <w:rPr>
+                <w:rFonts w:ascii="Consolas" w:hAnsi="Consolas" w:cs="Consolas"/>
+                <w:sz w:val="14"/>
+                <w:shd w:val="clear" w:color="auto" w:fill="EEF4F2"/>
+              </w:rPr>
+              <w:t>BROWSER_PATH</w:t>
+            </w:r>
+          </w:p>
+        </w:tc>
+      </w:tr>
+      <w:tr>
+        <w:trPr>
+          <w:cantSplit/>
+        </w:trPr>
+        <w:tc>
+          <w:tcPr>
+            <w:tcW w:w="4320" w:type="dxa"/>
+          </w:tcPr>
+          <w:p>
+            <w:pPr>
+              <w:spacing w:before="20" w:after="20" w:line="240" w:lineRule="auto"/>
+            </w:pPr>
+            <w:r>
+              <w:rPr>
+                <w:rFonts w:ascii="Consolas" w:hAnsi="Consolas" w:cs="Consolas"/>
+                <w:sz w:val="14"/>
+                <w:shd w:val="clear" w:color="auto" w:fill="EEF4F2"/>
+              </w:rPr>
+              <w:t>.github/workflows/ci.yml</w:t>
+            </w:r>
+          </w:p>
+        </w:tc>
+        <w:tc>
+          <w:tcPr>
+            <w:tcW w:w="5318" w:type="dxa"/>
+          </w:tcPr>
+          <w:p>
+            <w:pPr>
+              <w:spacing w:before="20" w:after="20" w:line="240" w:lineRule="auto"/>
+            </w:pPr>
+            <w:r>
+              <w:rPr>
+                <w:sz w:val="16"/>
+                <w:szCs w:val="16"/>
+              </w:rPr>
+              <w:t>Voert de unit tests en daarna de browsertests (in Google Chrome) automatisch uit op GitHub met Node.js 24 (LTS), met alleen leesrechten en actions die op een commit-SHA zijn vastgezet</w:t>
             </w:r>
           </w:p>
         </w:tc>
@@ -7338,7 +7431,7 @@
         </w:numPr>
       </w:pPr>
       <w:bookmarkStart w:id="5" w:name="k3"/>
-      <w:bookmarkStart w:id="6" w:name="_Toc242687072"/>
+      <w:bookmarkStart w:id="6" w:name="_Toc242688986"/>
       <w:r>
         <w:t>DE WEBSITE STARTEN.</w:t>
       </w:r>
@@ -7560,7 +7653,7 @@
         </w:numPr>
       </w:pPr>
       <w:bookmarkStart w:id="7" w:name="k4"/>
-      <w:bookmarkStart w:id="8" w:name="_Toc242687073"/>
+      <w:bookmarkStart w:id="8" w:name="_Toc242688987"/>
       <w:r>
         <w:t>GEBRUIKERSHANDLEIDING.</w:t>
       </w:r>
@@ -7573,7 +7666,7 @@
         <w:keepNext/>
       </w:pPr>
       <w:bookmarkStart w:id="9" w:name="k5"/>
-      <w:bookmarkStart w:id="10" w:name="_Toc242687074"/>
+      <w:bookmarkStart w:id="10" w:name="_Toc242688988"/>
       <w:r>
         <w:t>EEN MEDEWERKER ZOEKEN</w:t>
       </w:r>
@@ -7628,7 +7721,7 @@
         <w:keepNext/>
       </w:pPr>
       <w:bookmarkStart w:id="11" w:name="k6"/>
-      <w:bookmarkStart w:id="12" w:name="_Toc242687075"/>
+      <w:bookmarkStart w:id="12" w:name="_Toc242688989"/>
       <w:r>
         <w:t>EEN PRODUCT REGISTREREN</w:t>
       </w:r>
@@ -7839,7 +7932,7 @@
         <w:keepNext/>
       </w:pPr>
       <w:bookmarkStart w:id="13" w:name="k7"/>
-      <w:bookmarkStart w:id="14" w:name="_Toc242687076"/>
+      <w:bookmarkStart w:id="14" w:name="_Toc242688990"/>
       <w:r>
         <w:t>ADMIN-DASHBOARD OPENEN</w:t>
       </w:r>
@@ -7970,7 +8063,7 @@
         <w:keepNext/>
       </w:pPr>
       <w:bookmarkStart w:id="15" w:name="k8"/>
-      <w:bookmarkStart w:id="16" w:name="_Toc242687077"/>
+      <w:bookmarkStart w:id="16" w:name="_Toc242688991"/>
       <w:r>
         <w:t>REGISTRATIES BEHEREN</w:t>
       </w:r>
@@ -8132,7 +8225,7 @@
         <w:t>Datum bij toevoegen (+)</w:t>
       </w:r>
       <w:r>
-        <w:t xml:space="preserve">. Dat veld staat na het inloggen op vandaag. Kies een eerdere datum voor een vergeten registratie; een datum in de toekomst geeft een foutmelding. Valt de gekozen datum in een eerdere maand, dan vraagt de browser eerst: "Deze registratie komt in september 2026. Die loonmaand is mogelijk al verwerkt. Toch toevoegen?". De datum komt dan ook in het logboek en in de melding ("… op 14 september 2026"). Met </w:t>
+        <w:t xml:space="preserve">. Dat veld staat na het inloggen op vandaag. Kies een eerdere datum voor een vergeten registratie. Een datum in de toekomst geeft een foutmelding. Valt de gekozen datum in een eerdere maand, dan vraagt de browser eerst: "Deze registratie komt in september 2026. Die loonmaand is mogelijk al verwerkt. Toch toevoegen?". De datum komt dan ook in het logboek en in de melding ("… op 14 september 2026"). Met </w:t>
       </w:r>
       <w:r>
         <w:rPr>
@@ -8143,7 +8236,18 @@
         <w:t>−</w:t>
       </w:r>
       <w:r>
-        <w:t xml:space="preserve"> wordt de laatst ingevoerde registratie van dat product bij die medewerker verwijderd (de volgorde van invoer telt, niet de datum: een correctie </w:t>
+        <w:t xml:space="preserve"> opent het venster </w:t>
+      </w:r>
+      <w:r>
+        <w:rPr>
+          <w:rFonts w:ascii="Consolas" w:hAnsi="Consolas" w:cs="Consolas"/>
+          <w:sz w:val="18"/>
+          <w:shd w:val="clear" w:color="auto" w:fill="EEF4F2"/>
+        </w:rPr>
+        <w:t>Registratie verwijderen</w:t>
+      </w:r>
+      <w:r>
+        <w:t xml:space="preserve">. Daarin staan alle registraties van dat product bij die medewerker, met de nieuwste datum bovenaan. Per registratie zie je de datum en tijd, het product en het aantal (altijd 1). Bij een registratie die de beheerder met </w:t>
       </w:r>
       <w:r>
         <w:rPr>
@@ -8154,7 +8258,18 @@
         <w:t>+</w:t>
       </w:r>
       <w:r>
-        <w:t xml:space="preserve"> met een eerdere datum die als laatste is toegevoegd, gaat dus als eerste weg). Is die registratie uit een andere maand dan de huidige, dan vraagt de browser eerst: "Deze registratie is van september 2026. Die loonmaand is mogelijk al verwerkt. Toch verwijderen?" (met de maand van de registratie). Klik alleen op OK als je zeker weet dat de loonadministratie die maand nog niet heeft verwerkt; met </w:t>
+        <w:t xml:space="preserve"> heeft toegevoegd, staat "toegevoegd door beheerder". Klik bij de registratie die weg moet op </w:t>
+      </w:r>
+      <w:r>
+        <w:rPr>
+          <w:rFonts w:ascii="Consolas" w:hAnsi="Consolas" w:cs="Consolas"/>
+          <w:sz w:val="18"/>
+          <w:shd w:val="clear" w:color="auto" w:fill="EEF4F2"/>
+        </w:rPr>
+        <w:t>Verwijderen</w:t>
+      </w:r>
+      <w:r>
+        <w:t xml:space="preserve">. Het venster verschijnt ook als er maar één registratie is, zodat je altijd ziet welke registratie verdwijnt. </w:t>
       </w:r>
       <w:r>
         <w:rPr>
@@ -8165,7 +8280,40 @@
         <w:t>Annuleren</w:t>
       </w:r>
       <w:r>
-        <w:t xml:space="preserve"> verandert er niets. Heeft de medewerker geen registratie van dat product, dan verschijnt de foutmelding "Dit product heeft geen registratie voor deze medewerker". Iedere correctie komt in het logboek; de correctie en de logboekregel worden samen opgeslagen. Een correctie met </w:t>
+        <w:t xml:space="preserve">, het kruisje, een klik naast het venster of Escape sluit het venster zonder dat er iets verandert. Bij het openen staat de focus op de eerste knop </w:t>
+      </w:r>
+      <w:r>
+        <w:rPr>
+          <w:rFonts w:ascii="Consolas" w:hAnsi="Consolas" w:cs="Consolas"/>
+          <w:sz w:val="18"/>
+          <w:shd w:val="clear" w:color="auto" w:fill="EEF4F2"/>
+        </w:rPr>
+        <w:t>Verwijderen</w:t>
+      </w:r>
+      <w:r>
+        <w:t xml:space="preserve">, Tab blijft binnen het venster en na het sluiten staat de focus weer op de </w:t>
+      </w:r>
+      <w:r>
+        <w:rPr>
+          <w:rFonts w:ascii="Consolas" w:hAnsi="Consolas" w:cs="Consolas"/>
+          <w:sz w:val="18"/>
+          <w:shd w:val="clear" w:color="auto" w:fill="EEF4F2"/>
+        </w:rPr>
+        <w:t>−</w:t>
+      </w:r>
+      <w:r>
+        <w:t xml:space="preserve">. Is de gekozen registratie uit een andere maand dan de huidige, dan vraagt de browser eerst: "Deze registratie is van september 2026. Die loonmaand is mogelijk al verwerkt. Toch verwijderen?" (met de maand van de registratie). Klik alleen op OK als je zeker weet dat de loonadministratie die maand nog niet heeft verwerkt. Met </w:t>
+      </w:r>
+      <w:r>
+        <w:rPr>
+          <w:rFonts w:ascii="Consolas" w:hAnsi="Consolas" w:cs="Consolas"/>
+          <w:sz w:val="18"/>
+          <w:shd w:val="clear" w:color="auto" w:fill="EEF4F2"/>
+        </w:rPr>
+        <w:t>Annuleren</w:t>
+      </w:r>
+      <w:r>
+        <w:t xml:space="preserve"> verandert er niets. Heeft de medewerker geen registratie van dat product, dan verschijnt de foutmelding "Dit product heeft geen registratie voor deze medewerker". Iedere correctie komt in het logboek. De correctie en de logboekregel worden samen opgeslagen. Bij een verwijderde registratie staat in het logboek ook wanneer die was geregistreerd, bijvoorbeeld "Blikje van Lotte van Dijk, geregistreerd op 14 september 2026 om 12:00". Een correctie met </w:t>
       </w:r>
       <w:r>
         <w:rPr>
@@ -8176,7 +8324,7 @@
         <w:t>+</w:t>
       </w:r>
       <w:r>
-        <w:t xml:space="preserve"> telt niet mee als "Vorige keer koos je …" in het productvenster van de medewerker, omdat de medewerker die keuze niet zelf heeft gemaakt. De losse registraties in de tabel zijn alleen ter inzage; correcties gebeuren dus altijd via </w:t>
+        <w:t xml:space="preserve"> telt niet mee als "Vorige keer koos je …" in het productvenster van de medewerker, omdat de medewerker die keuze niet zelf heeft gemaakt. De losse registraties in de tabel zijn alleen ter inzage. Correcties gebeuren dus altijd via </w:t>
       </w:r>
       <w:r>
         <w:rPr>
@@ -8201,7 +8349,7 @@
         <w:keepNext/>
       </w:pPr>
       <w:bookmarkStart w:id="17" w:name="k9"/>
-      <w:bookmarkStart w:id="18" w:name="_Toc242687078"/>
+      <w:bookmarkStart w:id="18" w:name="_Toc242688992"/>
       <w:r>
         <w:t>MEDEWERKERS BEHEREN</w:t>
       </w:r>
@@ -8521,7 +8669,7 @@
         <w:keepNext/>
       </w:pPr>
       <w:bookmarkStart w:id="19" w:name="k10"/>
-      <w:bookmarkStart w:id="20" w:name="_Toc242687079"/>
+      <w:bookmarkStart w:id="20" w:name="_Toc242688993"/>
       <w:r>
         <w:t>PRODUCTEN BEHEREN</w:t>
       </w:r>
@@ -8649,7 +8797,7 @@
         <w:keepNext/>
       </w:pPr>
       <w:bookmarkStart w:id="21" w:name="k11"/>
-      <w:bookmarkStart w:id="22" w:name="_Toc242687080"/>
+      <w:bookmarkStart w:id="22" w:name="_Toc242688994"/>
       <w:r>
         <w:t>BEDRIJVEN EN CONSUMPTIEPUNTEN BEHEREN</w:t>
       </w:r>
@@ -8812,7 +8960,7 @@
         <w:keepNext/>
       </w:pPr>
       <w:bookmarkStart w:id="23" w:name="k12"/>
-      <w:bookmarkStart w:id="24" w:name="_Toc242687081"/>
+      <w:bookmarkStart w:id="24" w:name="_Toc242688995"/>
       <w:r>
         <w:t>VOORRAAD BEHEREN</w:t>
       </w:r>
@@ -9030,7 +9178,7 @@
         <w:keepNext/>
       </w:pPr>
       <w:bookmarkStart w:id="25" w:name="k13"/>
-      <w:bookmarkStart w:id="26" w:name="_Toc242687082"/>
+      <w:bookmarkStart w:id="26" w:name="_Toc242688996"/>
       <w:r>
         <w:t>LOGBOEK BEKIJKEN</w:t>
       </w:r>
@@ -9070,7 +9218,7 @@
         <w:keepNext/>
       </w:pPr>
       <w:bookmarkStart w:id="27" w:name="k14"/>
-      <w:bookmarkStart w:id="28" w:name="_Toc242687083"/>
+      <w:bookmarkStart w:id="28" w:name="_Toc242688997"/>
       <w:r>
         <w:t>ALLE GEGEVENS WISSEN</w:t>
       </w:r>
@@ -9196,7 +9344,7 @@
         <w:keepNext/>
       </w:pPr>
       <w:bookmarkStart w:id="29" w:name="k15"/>
-      <w:bookmarkStart w:id="30" w:name="_Toc242687084"/>
+      <w:bookmarkStart w:id="30" w:name="_Toc242688998"/>
       <w:r>
         <w:t>MODAL SLUITEN EN UITLOGGEN</w:t>
       </w:r>
@@ -9225,7 +9373,7 @@
         <w:keepNext/>
       </w:pPr>
       <w:bookmarkStart w:id="31" w:name="k16"/>
-      <w:bookmarkStart w:id="32" w:name="_Toc242687085"/>
+      <w:bookmarkStart w:id="32" w:name="_Toc242688999"/>
       <w:r>
         <w:t>CSV EXPORTEREN</w:t>
       </w:r>
@@ -9562,7 +9710,7 @@
         <w:keepNext/>
       </w:pPr>
       <w:bookmarkStart w:id="33" w:name="k17"/>
-      <w:bookmarkStart w:id="34" w:name="_Toc242687086"/>
+      <w:bookmarkStart w:id="34" w:name="_Toc242689000"/>
       <w:r>
         <w:t>LICHT OF DONKER THEMA</w:t>
       </w:r>
@@ -9669,7 +9817,7 @@
         <w:keepNext/>
       </w:pPr>
       <w:bookmarkStart w:id="35" w:name="k18"/>
-      <w:bookmarkStart w:id="36" w:name="_Toc242687087"/>
+      <w:bookmarkStart w:id="36" w:name="_Toc242689001"/>
       <w:r>
         <w:t>WELKOM EN "ZELFDE ALS VORIGE KEER"</w:t>
       </w:r>
@@ -9742,7 +9890,7 @@
         <w:keepNext/>
       </w:pPr>
       <w:bookmarkStart w:id="37" w:name="k19"/>
-      <w:bookmarkStart w:id="38" w:name="_Toc242687088"/>
+      <w:bookmarkStart w:id="38" w:name="_Toc242689002"/>
       <w:r>
         <w:t>DEMO GEZICHTSHERKENNING</w:t>
       </w:r>
@@ -9950,7 +10098,7 @@
         <w:keepNext/>
       </w:pPr>
       <w:bookmarkStart w:id="39" w:name="k20"/>
-      <w:bookmarkStart w:id="40" w:name="_Toc242687089"/>
+      <w:bookmarkStart w:id="40" w:name="_Toc242689003"/>
       <w:r>
         <w:t>HERKENNEN MET DE PAS</w:t>
       </w:r>
@@ -10144,7 +10292,7 @@
         </w:numPr>
       </w:pPr>
       <w:bookmarkStart w:id="41" w:name="k21"/>
-      <w:bookmarkStart w:id="42" w:name="_Toc242687090"/>
+      <w:bookmarkStart w:id="42" w:name="_Toc242689004"/>
       <w:r>
         <w:t xml:space="preserve">UITLEG VAN </w:t>
       </w:r>
@@ -10168,7 +10316,7 @@
         <w:keepNext/>
       </w:pPr>
       <w:bookmarkStart w:id="43" w:name="k22"/>
-      <w:bookmarkStart w:id="44" w:name="_Toc242687091"/>
+      <w:bookmarkStart w:id="44" w:name="_Toc242689005"/>
       <w:r>
         <w:t>METADATA EN EXTERNE BESTANDEN</w:t>
       </w:r>
@@ -10444,7 +10592,7 @@
         <w:keepNext/>
       </w:pPr>
       <w:bookmarkStart w:id="45" w:name="k23"/>
-      <w:bookmarkStart w:id="46" w:name="_Toc242687092"/>
+      <w:bookmarkStart w:id="46" w:name="_Toc242689006"/>
       <w:r>
         <w:t>NAVIGATIEBALK</w:t>
       </w:r>
@@ -10657,7 +10805,7 @@
         <w:keepNext/>
       </w:pPr>
       <w:bookmarkStart w:id="47" w:name="k24"/>
-      <w:bookmarkStart w:id="48" w:name="_Toc242687093"/>
+      <w:bookmarkStart w:id="48" w:name="_Toc242689007"/>
       <w:r>
         <w:t>HERO-GEDEELTE</w:t>
       </w:r>
@@ -10702,7 +10850,7 @@
         <w:keepNext/>
       </w:pPr>
       <w:bookmarkStart w:id="49" w:name="k25"/>
-      <w:bookmarkStart w:id="50" w:name="_Toc242687094"/>
+      <w:bookmarkStart w:id="50" w:name="_Toc242689008"/>
       <w:r>
         <w:t>MEDEWERKERLIJST</w:t>
       </w:r>
@@ -10965,7 +11113,7 @@
         <w:keepNext/>
       </w:pPr>
       <w:bookmarkStart w:id="51" w:name="k26"/>
-      <w:bookmarkStart w:id="52" w:name="_Toc242687095"/>
+      <w:bookmarkStart w:id="52" w:name="_Toc242689009"/>
       <w:r>
         <w:t>STATISTIEKEN</w:t>
       </w:r>
@@ -11048,7 +11196,7 @@
         <w:keepNext/>
       </w:pPr>
       <w:bookmarkStart w:id="53" w:name="k27"/>
-      <w:bookmarkStart w:id="54" w:name="_Toc242687096"/>
+      <w:bookmarkStart w:id="54" w:name="_Toc242689010"/>
       <w:r>
         <w:t>VENSTERS (MODALS)</w:t>
       </w:r>
@@ -11561,7 +11709,7 @@
         <w:keepNext/>
       </w:pPr>
       <w:bookmarkStart w:id="55" w:name="k28"/>
-      <w:bookmarkStart w:id="56" w:name="_Toc242687097"/>
+      <w:bookmarkStart w:id="56" w:name="_Toc242689011"/>
       <w:r>
         <w:t>WAARSCHUWING BIJ OPENEN ALS LOS BESTAND</w:t>
       </w:r>
@@ -11606,7 +11754,7 @@
         </w:numPr>
       </w:pPr>
       <w:bookmarkStart w:id="57" w:name="k29"/>
-      <w:bookmarkStart w:id="58" w:name="_Toc242687098"/>
+      <w:bookmarkStart w:id="58" w:name="_Toc242689012"/>
       <w:r>
         <w:t xml:space="preserve">UITLEG VAN </w:t>
       </w:r>
@@ -11630,7 +11778,7 @@
         <w:keepNext/>
       </w:pPr>
       <w:bookmarkStart w:id="59" w:name="k30"/>
-      <w:bookmarkStart w:id="60" w:name="_Toc242687099"/>
+      <w:bookmarkStart w:id="60" w:name="_Toc242689013"/>
       <w:r>
         <w:t>CSS-VARIABELEN</w:t>
       </w:r>
@@ -12062,7 +12210,51 @@
         <w:t>tvb-theme-last</w:t>
       </w:r>
       <w:r>
-        <w:t>. Alleen de witte tekst op groene knoppen, de letters in de avatars en de kleuren van de banner zijn in beide thema's hetzelfde.</w:t>
+        <w:t xml:space="preserve">. Alleen de witte tekst op groene knoppen, de letters in de avatars en de kleuren van de banner zijn in beide thema's hetzelfde. Door </w:t>
+      </w:r>
+      <w:r>
+        <w:rPr>
+          <w:rFonts w:ascii="Consolas" w:hAnsi="Consolas" w:cs="Consolas"/>
+          <w:sz w:val="18"/>
+          <w:shd w:val="clear" w:color="auto" w:fill="EEF4F2"/>
+        </w:rPr>
+        <w:t>color-scheme</w:t>
+      </w:r>
+      <w:r>
+        <w:t xml:space="preserve"> tekent de browser de keuzelijsten (</w:t>
+      </w:r>
+      <w:r>
+        <w:rPr>
+          <w:rFonts w:ascii="Consolas" w:hAnsi="Consolas" w:cs="Consolas"/>
+          <w:sz w:val="18"/>
+          <w:shd w:val="clear" w:color="auto" w:fill="EEF4F2"/>
+        </w:rPr>
+        <w:t>select</w:t>
+      </w:r>
+      <w:r>
+        <w:t xml:space="preserve">) en hun opties in het donkere thema ook donker: witte tekst op </w:t>
+      </w:r>
+      <w:r>
+        <w:rPr>
+          <w:rFonts w:ascii="Consolas" w:hAnsi="Consolas" w:cs="Consolas"/>
+          <w:sz w:val="18"/>
+          <w:shd w:val="clear" w:color="auto" w:fill="EEF4F2"/>
+        </w:rPr>
+        <w:t>--paper</w:t>
+      </w:r>
+      <w:r>
+        <w:t xml:space="preserve">, contrast 15,7:1. Placeholdertekst, zoals "Alle bedrijven" in het bedrijfsfilter, krijgt in het donkere thema </w:t>
+      </w:r>
+      <w:r>
+        <w:rPr>
+          <w:rFonts w:ascii="Consolas" w:hAnsi="Consolas" w:cs="Consolas"/>
+          <w:sz w:val="18"/>
+          <w:shd w:val="clear" w:color="auto" w:fill="EEF4F2"/>
+        </w:rPr>
+        <w:t>--muted</w:t>
+      </w:r>
+      <w:r>
+        <w:t xml:space="preserve"> (6,9:1), omdat het standaardgrijs van de browser daar maar 3,4:1 haalt.</w:t>
       </w:r>
     </w:p>
     <w:p>
@@ -12090,6 +12282,8 @@
       </w:r>
       <w:r>
         <w:tab/>
+      </w:r>
+      <w:r>
         <w:t>Globale variabelen en reset.</w:t>
       </w:r>
     </w:p>
@@ -12239,7 +12433,7 @@
         <w:keepNext/>
       </w:pPr>
       <w:bookmarkStart w:id="61" w:name="k31"/>
-      <w:bookmarkStart w:id="62" w:name="_Toc242687100"/>
+      <w:bookmarkStart w:id="62" w:name="_Toc242689014"/>
       <w:r>
         <w:t>LAYOUT</w:t>
       </w:r>
@@ -12760,7 +12954,7 @@
         <w:keepNext/>
       </w:pPr>
       <w:bookmarkStart w:id="63" w:name="k32"/>
-      <w:bookmarkStart w:id="64" w:name="_Toc242687101"/>
+      <w:bookmarkStart w:id="64" w:name="_Toc242689015"/>
       <w:r>
         <w:t>COMPONENTEN</w:t>
       </w:r>
@@ -12983,7 +13177,7 @@
         </w:numPr>
       </w:pPr>
       <w:bookmarkStart w:id="65" w:name="k33"/>
-      <w:bookmarkStart w:id="66" w:name="_Toc242687102"/>
+      <w:bookmarkStart w:id="66" w:name="_Toc242689016"/>
       <w:r>
         <w:t>UITLEG VAN DE JAVASCRIPT (</w:t>
       </w:r>
@@ -13007,7 +13201,7 @@
         <w:keepNext/>
       </w:pPr>
       <w:bookmarkStart w:id="67" w:name="k34"/>
-      <w:bookmarkStart w:id="68" w:name="_Toc242687103"/>
+      <w:bookmarkStart w:id="68" w:name="_Toc242689017"/>
       <w:r>
         <w:t>OPSLAG EN VOORBEELDDATA</w:t>
       </w:r>
@@ -13784,7 +13978,7 @@
         <w:keepNext/>
       </w:pPr>
       <w:bookmarkStart w:id="69" w:name="k35"/>
-      <w:bookmarkStart w:id="70" w:name="_Toc242687104"/>
+      <w:bookmarkStart w:id="70" w:name="_Toc242689018"/>
       <w:r>
         <w:t>OBJECTGEORIËNTEERDE STRUCTUUR</w:t>
       </w:r>
@@ -14931,21 +15125,54 @@
           <w:sz w:val="18"/>
           <w:shd w:val="clear" w:color="auto" w:fill="EEF4F2"/>
         </w:rPr>
-        <w:t>lastRegistration</w:t>
-      </w:r>
-      <w:r>
-        <w:t xml:space="preserve"> zoekt de laatst ingevoerde registratie van een medewerker (en product): de volgorde van invoer telt, niet de datum. Dat is precies de registratie die </w:t>
-      </w:r>
-      <w:r>
-        <w:rPr>
-          <w:rFonts w:ascii="Consolas" w:hAnsi="Consolas" w:cs="Consolas"/>
-          <w:sz w:val="18"/>
-          <w:shd w:val="clear" w:color="auto" w:fill="EEF4F2"/>
-        </w:rPr>
-        <w:t>removeLastRegistration</w:t>
-      </w:r>
-      <w:r>
-        <w:t xml:space="preserve"> zou verwijderen, zodat de controller vooraf kan vragen of een registratie uit een oude maand echt weg mag.</w:t>
+        <w:t>registrationsFor</w:t>
+      </w:r>
+      <w:r>
+        <w:t xml:space="preserve"> geeft alle registraties van een medewerker en product, met de nieuwste datum bovenaan. Dat is de lijst in het venster </w:t>
+      </w:r>
+      <w:r>
+        <w:rPr>
+          <w:rFonts w:ascii="Consolas" w:hAnsi="Consolas" w:cs="Consolas"/>
+          <w:sz w:val="18"/>
+          <w:shd w:val="clear" w:color="auto" w:fill="EEF4F2"/>
+        </w:rPr>
+        <w:t>Registratie verwijderen</w:t>
+      </w:r>
+      <w:r>
+        <w:t xml:space="preserve"> (correctie </w:t>
+      </w:r>
+      <w:r>
+        <w:rPr>
+          <w:rFonts w:ascii="Consolas" w:hAnsi="Consolas" w:cs="Consolas"/>
+          <w:sz w:val="18"/>
+          <w:shd w:val="clear" w:color="auto" w:fill="EEF4F2"/>
+        </w:rPr>
+        <w:t>−</w:t>
+      </w:r>
+      <w:r>
+        <w:t xml:space="preserve">). </w:t>
+      </w:r>
+      <w:r>
+        <w:rPr>
+          <w:rFonts w:ascii="Consolas" w:hAnsi="Consolas" w:cs="Consolas"/>
+          <w:sz w:val="18"/>
+          <w:shd w:val="clear" w:color="auto" w:fill="EEF4F2"/>
+        </w:rPr>
+        <w:t>removeRegistration</w:t>
+      </w:r>
+      <w:r>
+        <w:t xml:space="preserve"> verwijdert precies de gekozen registratie (op id) en zet het product terug in de voorraad van het punt uit de registratie, maar alleen als de registratie ná de laatste telling is gemaakt. </w:t>
+      </w:r>
+      <w:r>
+        <w:rPr>
+          <w:rFonts w:ascii="Consolas" w:hAnsi="Consolas" w:cs="Consolas"/>
+          <w:sz w:val="18"/>
+          <w:shd w:val="clear" w:color="auto" w:fill="EEF4F2"/>
+        </w:rPr>
+        <w:t>findRegistration</w:t>
+      </w:r>
+      <w:r>
+        <w:t xml:space="preserve"> zoekt een registratie op id.</w:t>
       </w:r>
     </w:p>
     <w:p>
@@ -14964,21 +15191,10 @@
           <w:sz w:val="18"/>
           <w:shd w:val="clear" w:color="auto" w:fill="EEF4F2"/>
         </w:rPr>
-        <w:t>setStock</w:t>
-      </w:r>
-      <w:r>
-        <w:t xml:space="preserve"> vervangt de voorraad door de getelde hoeveelheid en bewaart het tijdstip (</w:t>
-      </w:r>
-      <w:r>
-        <w:rPr>
-          <w:rFonts w:ascii="Consolas" w:hAnsi="Consolas" w:cs="Consolas"/>
-          <w:sz w:val="18"/>
-          <w:shd w:val="clear" w:color="auto" w:fill="EEF4F2"/>
-        </w:rPr>
-        <w:t>countedAt</w:t>
-      </w:r>
-      <w:r>
-        <w:t xml:space="preserve">). </w:t>
+        <w:t>lastRegistration</w:t>
+      </w:r>
+      <w:r>
+        <w:t xml:space="preserve"> zoekt de laatst ingevoerde registratie van een medewerker (en product): de volgorde van invoer telt, niet de datum. </w:t>
       </w:r>
       <w:r>
         <w:rPr>
@@ -14989,51 +15205,29 @@
         <w:t>removeLastRegistration</w:t>
       </w:r>
       <w:r>
-        <w:t xml:space="preserve"> zet een product alleen terug in de voorraad als de registratie na die telling is gemaakt. </w:t>
-      </w:r>
-      <w:r>
-        <w:rPr>
-          <w:rFonts w:ascii="Consolas" w:hAnsi="Consolas" w:cs="Consolas"/>
-          <w:sz w:val="18"/>
-          <w:shd w:val="clear" w:color="auto" w:fill="EEF4F2"/>
-        </w:rPr>
-        <w:t>stockEntry</w:t>
-      </w:r>
-      <w:r>
-        <w:t xml:space="preserve"> geeft de voorraadregel van één product op één punt. Beide gebruiken </w:t>
-      </w:r>
-      <w:r>
-        <w:rPr>
-          <w:rFonts w:ascii="Consolas" w:hAnsi="Consolas" w:cs="Consolas"/>
-          <w:sz w:val="18"/>
-          <w:shd w:val="clear" w:color="auto" w:fill="EEF4F2"/>
-        </w:rPr>
-        <w:t>pointProduct</w:t>
-      </w:r>
-      <w:r>
-        <w:t>, dat een regel alleen vindt als eigen sleutel van de voorraadlijst (</w:t>
-      </w:r>
-      <w:r>
-        <w:rPr>
-          <w:rFonts w:ascii="Consolas" w:hAnsi="Consolas" w:cs="Consolas"/>
-          <w:sz w:val="18"/>
-          <w:shd w:val="clear" w:color="auto" w:fill="EEF4F2"/>
-        </w:rPr>
-        <w:t>Object.hasOwn</w:t>
-      </w:r>
-      <w:r>
-        <w:t xml:space="preserve">). Een product-id als </w:t>
-      </w:r>
-      <w:r>
-        <w:rPr>
-          <w:rFonts w:ascii="Consolas" w:hAnsi="Consolas" w:cs="Consolas"/>
-          <w:sz w:val="18"/>
-          <w:shd w:val="clear" w:color="auto" w:fill="EEF4F2"/>
-        </w:rPr>
-        <w:t>toString</w:t>
-      </w:r>
-      <w:r>
-        <w:t xml:space="preserve"> vindt dus geen voorraadregel en schrijft er ook geen.</w:t>
+        <w:t xml:space="preserve"> verwijdert die registratie (via </w:t>
+      </w:r>
+      <w:r>
+        <w:rPr>
+          <w:rFonts w:ascii="Consolas" w:hAnsi="Consolas" w:cs="Consolas"/>
+          <w:sz w:val="18"/>
+          <w:shd w:val="clear" w:color="auto" w:fill="EEF4F2"/>
+        </w:rPr>
+        <w:t>removeRegistration</w:t>
+      </w:r>
+      <w:r>
+        <w:t xml:space="preserve">). De correctie </w:t>
+      </w:r>
+      <w:r>
+        <w:rPr>
+          <w:rFonts w:ascii="Consolas" w:hAnsi="Consolas" w:cs="Consolas"/>
+          <w:sz w:val="18"/>
+          <w:shd w:val="clear" w:color="auto" w:fill="EEF4F2"/>
+        </w:rPr>
+        <w:t>−</w:t>
+      </w:r>
+      <w:r>
+        <w:t xml:space="preserve"> in het beheer gebruikt deze twee niet meer, want daar kiest de beheerder zelf de registratie.</w:t>
       </w:r>
     </w:p>
     <w:p>
@@ -15052,377 +15246,76 @@
           <w:sz w:val="18"/>
           <w:shd w:val="clear" w:color="auto" w:fill="EEF4F2"/>
         </w:rPr>
-        <w:t>moveEmployeesOfPoint</w:t>
-      </w:r>
-      <w:r>
-        <w:t xml:space="preserve"> zet de medewerkers van een consumptiepunt over naar een ander bedrijf. Alleen </w:t>
-      </w:r>
-      <w:r>
-        <w:rPr>
-          <w:rFonts w:ascii="Consolas" w:hAnsi="Consolas" w:cs="Consolas"/>
-          <w:sz w:val="18"/>
-          <w:shd w:val="clear" w:color="auto" w:fill="EEF4F2"/>
-        </w:rPr>
-        <w:t>companyId</w:t>
-      </w:r>
-      <w:r>
-        <w:t xml:space="preserve"> verandert; de naam wordt niet opnieuw opgebouwd.</w:t>
-      </w:r>
-    </w:p>
-    <w:p>
-      <w:pPr>
-        <w:pStyle w:val="Lijstalinea"/>
-        <w:numPr>
-          <w:ilvl w:val="0"/>
-          <w:numId w:val="3"/>
-        </w:numPr>
-        <w:contextualSpacing w:val="0"/>
-      </w:pPr>
-      <w:r>
-        <w:rPr>
-          <w:rFonts w:ascii="Consolas" w:hAnsi="Consolas" w:cs="Consolas"/>
-          <w:sz w:val="18"/>
-          <w:shd w:val="clear" w:color="auto" w:fill="EEF4F2"/>
-        </w:rPr>
-        <w:t>wipeAll</w:t>
-      </w:r>
-      <w:r>
-        <w:t xml:space="preserve"> laat de opslag alles wissen (</w:t>
-      </w:r>
-      <w:r>
-        <w:rPr>
-          <w:rFonts w:ascii="Consolas" w:hAnsi="Consolas" w:cs="Consolas"/>
-          <w:sz w:val="18"/>
-          <w:shd w:val="clear" w:color="auto" w:fill="EEF4F2"/>
-        </w:rPr>
-        <w:t>clearAll</w:t>
-      </w:r>
-      <w:r>
-        <w:t>) en start opnieuw met de demogegevens (</w:t>
-      </w:r>
-      <w:r>
-        <w:rPr>
-          <w:rFonts w:ascii="Consolas" w:hAnsi="Consolas" w:cs="Consolas"/>
-          <w:sz w:val="18"/>
-          <w:shd w:val="clear" w:color="auto" w:fill="EEF4F2"/>
-        </w:rPr>
-        <w:t>createSeedState</w:t>
-      </w:r>
-      <w:r>
-        <w:t>).</w:t>
-      </w:r>
-    </w:p>
-    <w:p>
-      <w:pPr>
-        <w:pStyle w:val="Kop3"/>
-        <w:keepNext/>
-      </w:pPr>
-      <w:bookmarkStart w:id="73" w:name="k38"/>
-      <w:r>
-        <w:rPr>
-          <w:rFonts w:ascii="Consolas" w:hAnsi="Consolas" w:cs="Consolas"/>
-          <w:sz w:val="18"/>
-          <w:shd w:val="clear" w:color="auto" w:fill="EEF4F2"/>
-        </w:rPr>
-        <w:t>RegistrationView</w:t>
-      </w:r>
-      <w:bookmarkEnd w:id="73"/>
-    </w:p>
-    <w:p>
-      <w:r>
-        <w:t xml:space="preserve">Verzorgt alleen de presentatie in de browser. Deze class rendert de medewerkerlijst, het productvenster, statistieken, admin-tabellen, filters, voorraad en toastmeldingen. Alle tekst én alle waarden in HTML-attributen (zoals id's in </w:t>
-      </w:r>
-      <w:r>
-        <w:rPr>
-          <w:rFonts w:ascii="Consolas" w:hAnsi="Consolas" w:cs="Consolas"/>
-          <w:sz w:val="18"/>
-          <w:shd w:val="clear" w:color="auto" w:fill="EEF4F2"/>
-        </w:rPr>
-        <w:t>data-…</w:t>
-      </w:r>
-      <w:r>
-        <w:t xml:space="preserve">, </w:t>
-      </w:r>
-      <w:r>
-        <w:rPr>
-          <w:rFonts w:ascii="Consolas" w:hAnsi="Consolas" w:cs="Consolas"/>
-          <w:sz w:val="18"/>
-          <w:shd w:val="clear" w:color="auto" w:fill="EEF4F2"/>
-        </w:rPr>
-        <w:t>value="…"</w:t>
-      </w:r>
-      <w:r>
-        <w:t xml:space="preserve"> en klassen) gaan eerst door </w:t>
-      </w:r>
-      <w:r>
-        <w:rPr>
-          <w:rFonts w:ascii="Consolas" w:hAnsi="Consolas" w:cs="Consolas"/>
-          <w:sz w:val="18"/>
-          <w:shd w:val="clear" w:color="auto" w:fill="EEF4F2"/>
-        </w:rPr>
-        <w:t>escapeHtml</w:t>
-      </w:r>
-      <w:r>
-        <w:t xml:space="preserve">, zodat ze niet uit het attribuut kunnen breken. De functie </w:t>
-      </w:r>
-      <w:r>
-        <w:rPr>
-          <w:rFonts w:ascii="Consolas" w:hAnsi="Consolas" w:cs="Consolas"/>
-          <w:sz w:val="18"/>
-          <w:shd w:val="clear" w:color="auto" w:fill="EEF4F2"/>
-        </w:rPr>
-        <w:t>cssAttributeValue</w:t>
-      </w:r>
-      <w:r>
-        <w:t xml:space="preserve"> (in hetzelfde bestand, ook gebruikt door de controller) maakt een id veilig voordat die in een CSS-selector komt; in de browser gebruikt die </w:t>
-      </w:r>
-      <w:r>
-        <w:rPr>
-          <w:rFonts w:ascii="Consolas" w:hAnsi="Consolas" w:cs="Consolas"/>
-          <w:sz w:val="18"/>
-          <w:shd w:val="clear" w:color="auto" w:fill="EEF4F2"/>
-        </w:rPr>
-        <w:t>CSS.escape</w:t>
-      </w:r>
-      <w:r>
-        <w:t xml:space="preserve">. </w:t>
-      </w:r>
-      <w:r>
-        <w:rPr>
-          <w:rFonts w:ascii="Consolas" w:hAnsi="Consolas" w:cs="Consolas"/>
-          <w:sz w:val="18"/>
-          <w:shd w:val="clear" w:color="auto" w:fill="EEF4F2"/>
-        </w:rPr>
-        <w:t>companyGroupKey</w:t>
-      </w:r>
-      <w:r>
-        <w:t xml:space="preserve"> bepaalt bij welke groep van het bedrijfsfilter een medewerker hoort: medewerkers zonder bedrijf of met een bedrijf dat niet meer bestaat, vallen onder </w:t>
-      </w:r>
-      <w:r>
-        <w:rPr>
-          <w:rFonts w:ascii="Consolas" w:hAnsi="Consolas" w:cs="Consolas"/>
-          <w:sz w:val="18"/>
-          <w:shd w:val="clear" w:color="auto" w:fill="EEF4F2"/>
-        </w:rPr>
-        <w:t>Onbekend bedrijf</w:t>
-      </w:r>
-      <w:r>
-        <w:t xml:space="preserve">. </w:t>
-      </w:r>
-      <w:r>
-        <w:rPr>
-          <w:rFonts w:ascii="Consolas" w:hAnsi="Consolas" w:cs="Consolas"/>
-          <w:sz w:val="18"/>
-          <w:shd w:val="clear" w:color="auto" w:fill="EEF4F2"/>
-        </w:rPr>
-        <w:t>populateCompanyFilter</w:t>
-      </w:r>
-      <w:r>
-        <w:t xml:space="preserve"> overschrijft de tekst in het bedrijfsfilter niet zolang de gebruiker erin typt. </w:t>
-      </w:r>
-      <w:r>
-        <w:rPr>
-          <w:rFonts w:ascii="Consolas" w:hAnsi="Consolas" w:cs="Consolas"/>
-          <w:sz w:val="18"/>
-          <w:shd w:val="clear" w:color="auto" w:fill="EEF4F2"/>
-        </w:rPr>
-        <w:t>countRegistrations</w:t>
-      </w:r>
-      <w:r>
-        <w:t xml:space="preserve"> telt de registraties per medewerker en product in één keer, zodat de correctielijst ook bij veel registraties snel blijft. </w:t>
-      </w:r>
-      <w:r>
-        <w:rPr>
-          <w:rFonts w:ascii="Consolas" w:hAnsi="Consolas" w:cs="Consolas"/>
-          <w:sz w:val="18"/>
-          <w:shd w:val="clear" w:color="auto" w:fill="EEF4F2"/>
-        </w:rPr>
-        <w:t>renderStockAlerts</w:t>
-      </w:r>
-      <w:r>
-        <w:t xml:space="preserve"> en </w:t>
-      </w:r>
-      <w:r>
-        <w:rPr>
-          <w:rFonts w:ascii="Consolas" w:hAnsi="Consolas" w:cs="Consolas"/>
-          <w:sz w:val="18"/>
-          <w:shd w:val="clear" w:color="auto" w:fill="EEF4F2"/>
-        </w:rPr>
-        <w:t>updateStockStatus</w:t>
-      </w:r>
-      <w:r>
-        <w:t xml:space="preserve"> werken na het aanpassen van de voorraad alleen de bijbestellijst en één statuslabel bij. De view leest uit het model, maar verandert zelf niets.</w:t>
-      </w:r>
-    </w:p>
-    <w:p>
-      <w:pPr>
-        <w:pStyle w:val="Kop3"/>
-        <w:keepNext/>
-      </w:pPr>
-      <w:bookmarkStart w:id="74" w:name="k39"/>
-      <w:r>
-        <w:rPr>
-          <w:rFonts w:ascii="Consolas" w:hAnsi="Consolas" w:cs="Consolas"/>
-          <w:sz w:val="18"/>
-          <w:shd w:val="clear" w:color="auto" w:fill="EEF4F2"/>
-        </w:rPr>
-        <w:t>RegistrationApp</w:t>
-      </w:r>
-      <w:bookmarkEnd w:id="74"/>
-    </w:p>
-    <w:p>
-      <w:r>
-        <w:t xml:space="preserve">Vormt de controller van de applicatie. Deze class koppelt klik- en formulier-events aan het model en laat daarna de view opnieuw renderen. </w:t>
-      </w:r>
-      <w:r>
-        <w:rPr>
-          <w:rFonts w:ascii="Consolas" w:hAnsi="Consolas" w:cs="Consolas"/>
-          <w:sz w:val="18"/>
-          <w:shd w:val="clear" w:color="auto" w:fill="EEF4F2"/>
-        </w:rPr>
-        <w:t>handleClick</w:t>
-      </w:r>
-      <w:r>
-        <w:t xml:space="preserve"> bevat een lijst van knoppen met de actie die erbij hoort; iedere actie is een eigen, korte methode. De methode </w:t>
-      </w:r>
-      <w:r>
-        <w:rPr>
-          <w:rFonts w:ascii="Consolas" w:hAnsi="Consolas" w:cs="Consolas"/>
-          <w:sz w:val="18"/>
-          <w:shd w:val="clear" w:color="auto" w:fill="EEF4F2"/>
-        </w:rPr>
-        <w:t>persist(wijziging, logboekregel)</w:t>
-      </w:r>
-      <w:r>
-        <w:t xml:space="preserve"> zorgt dat iedere wijziging wordt opgeslagen of automatisch wordt teruggedraaid bij een opslagfout. De logboekregel (bijvoorbeeld </w:t>
-      </w:r>
-      <w:r>
-        <w:rPr>
-          <w:rFonts w:ascii="Consolas" w:hAnsi="Consolas" w:cs="Consolas"/>
-          <w:sz w:val="18"/>
-          <w:shd w:val="clear" w:color="auto" w:fill="EEF4F2"/>
-        </w:rPr>
-        <w:t>{ action: "Product verwijderd", details: "Blikje" }</w:t>
-      </w:r>
-      <w:r>
-        <w:t xml:space="preserve">) wordt toegevoegd vóórdat er één keer wordt opgeslagen. Zo worden de wijziging en de logboekregel samen opgeslagen of samen teruggedraaid. </w:t>
-      </w:r>
-      <w:r>
-        <w:rPr>
-          <w:rFonts w:ascii="Consolas" w:hAnsi="Consolas" w:cs="Consolas"/>
-          <w:sz w:val="18"/>
-          <w:shd w:val="clear" w:color="auto" w:fill="EEF4F2"/>
-        </w:rPr>
-        <w:t>finishAdminChange</w:t>
-      </w:r>
-      <w:r>
-        <w:t xml:space="preserve"> tekent daarna alle beheeronderdelen opnieuw, ook de registratietabel (zodat bijvoorbeeld een nieuwe productnaam daar meteen staat), zonder nog eens apart op te slaan.</w:t>
-      </w:r>
-    </w:p>
-    <w:p>
-      <w:r>
-        <w:rPr>
-          <w:rFonts w:ascii="Consolas" w:hAnsi="Consolas" w:cs="Consolas"/>
-          <w:sz w:val="18"/>
-          <w:shd w:val="clear" w:color="auto" w:fill="EEF4F2"/>
-        </w:rPr>
-        <w:t>handleStorageChange</w:t>
-      </w:r>
-      <w:r>
-        <w:t xml:space="preserve"> luistert naar het </w:t>
-      </w:r>
-      <w:r>
-        <w:rPr>
-          <w:rFonts w:ascii="Consolas" w:hAnsi="Consolas" w:cs="Consolas"/>
-          <w:sz w:val="18"/>
-          <w:shd w:val="clear" w:color="auto" w:fill="EEF4F2"/>
-        </w:rPr>
-        <w:t>storage</w:t>
-      </w:r>
-      <w:r>
-        <w:t>-event: slaat een ander tabblad iets op, dan laadt het model de gegevens opnieuw (</w:t>
-      </w:r>
-      <w:r>
-        <w:rPr>
-          <w:rFonts w:ascii="Consolas" w:hAnsi="Consolas" w:cs="Consolas"/>
-          <w:sz w:val="18"/>
-          <w:shd w:val="clear" w:color="auto" w:fill="EEF4F2"/>
-        </w:rPr>
-        <w:t>RegistrationModel.reload</w:t>
-      </w:r>
-      <w:r>
-        <w:t xml:space="preserve">) en wordt alles opnieuw getekend. Daarna ruimt de controller op wat niet meer klopt: </w:t>
-      </w:r>
-      <w:r>
-        <w:rPr>
-          <w:rFonts w:ascii="Consolas" w:hAnsi="Consolas" w:cs="Consolas"/>
-          <w:sz w:val="18"/>
-          <w:shd w:val="clear" w:color="auto" w:fill="EEF4F2"/>
-        </w:rPr>
-        <w:t>closeStaleForms</w:t>
-      </w:r>
-      <w:r>
-        <w:t xml:space="preserve"> sluit een open wijzigformulier van iets dat intussen is verwijderd, en een open productvenster (met het cameravenster erboven) sluit met een melding als de medewerker is verwijderd of gedeactiveerd. Typt de beheerder in de voorraadtabel (</w:t>
-      </w:r>
-      <w:r>
-        <w:rPr>
-          <w:rFonts w:ascii="Consolas" w:hAnsi="Consolas" w:cs="Consolas"/>
-          <w:sz w:val="18"/>
-          <w:shd w:val="clear" w:color="auto" w:fill="EEF4F2"/>
-        </w:rPr>
-        <w:t>isTypingInStockTable</w:t>
-      </w:r>
-      <w:r>
-        <w:t xml:space="preserve">), dan blijft die tabel staan. Waren de nieuwe gegevens onleesbaar, dan volgt een waarschuwing. Klikt iemand in een ander tabblad op </w:t>
-      </w:r>
-      <w:r>
-        <w:rPr>
-          <w:rFonts w:ascii="Consolas" w:hAnsi="Consolas" w:cs="Consolas"/>
-          <w:sz w:val="18"/>
-          <w:shd w:val="clear" w:color="auto" w:fill="EEF4F2"/>
-        </w:rPr>
-        <w:t>Alle gegevens wissen</w:t>
-      </w:r>
-      <w:r>
-        <w:t>, dan verwijdert dat tabblad de gegevenssleutel (</w:t>
-      </w:r>
-      <w:r>
-        <w:rPr>
-          <w:rFonts w:ascii="Consolas" w:hAnsi="Consolas" w:cs="Consolas"/>
-          <w:sz w:val="18"/>
-          <w:shd w:val="clear" w:color="auto" w:fill="EEF4F2"/>
-        </w:rPr>
-        <w:t>event.newValue</w:t>
-      </w:r>
-      <w:r>
-        <w:t xml:space="preserve"> is dan null). Dit tabblad wist dan ook alles uit het geheugen, logt de beheerder uit, vergeet de gezichten en toont "De gegevens zijn in een ander venster gewist." (</w:t>
-      </w:r>
-      <w:r>
-        <w:rPr>
-          <w:rFonts w:ascii="Consolas" w:hAnsi="Consolas" w:cs="Consolas"/>
-          <w:sz w:val="18"/>
-          <w:shd w:val="clear" w:color="auto" w:fill="EEF4F2"/>
-        </w:rPr>
-        <w:t>handleStorageCleared({ keepStore: true })</w:t>
-      </w:r>
-      <w:r>
-        <w:t xml:space="preserve">). De opslag zelf blijft met rust, want het andere tabblad zet er meteen de nieuwe demogegevens in; anders zouden de twee tabbladen elkaar steeds opnieuw wissen. Knoppen en formulieren van iets dat niet meer bestaat, geven via </w:t>
-      </w:r>
-      <w:r>
-        <w:rPr>
-          <w:rFonts w:ascii="Consolas" w:hAnsi="Consolas" w:cs="Consolas"/>
-          <w:sz w:val="18"/>
-          <w:shd w:val="clear" w:color="auto" w:fill="EEF4F2"/>
-        </w:rPr>
-        <w:t>showMissing</w:t>
-      </w:r>
-      <w:r>
-        <w:t xml:space="preserve"> een melding in plaats van het gegeven opnieuw aan te maken.</w:t>
-      </w:r>
-    </w:p>
-    <w:p>
-      <w:r>
-        <w:t>Andere methodes:</w:t>
+        <w:t>setStock</w:t>
+      </w:r>
+      <w:r>
+        <w:t xml:space="preserve"> vervangt de voorraad door de getelde hoeveelheid en bewaart het tijdstip (</w:t>
+      </w:r>
+      <w:r>
+        <w:rPr>
+          <w:rFonts w:ascii="Consolas" w:hAnsi="Consolas" w:cs="Consolas"/>
+          <w:sz w:val="18"/>
+          <w:shd w:val="clear" w:color="auto" w:fill="EEF4F2"/>
+        </w:rPr>
+        <w:t>countedAt</w:t>
+      </w:r>
+      <w:r>
+        <w:t xml:space="preserve">). </w:t>
+      </w:r>
+      <w:r>
+        <w:rPr>
+          <w:rFonts w:ascii="Consolas" w:hAnsi="Consolas" w:cs="Consolas"/>
+          <w:sz w:val="18"/>
+          <w:shd w:val="clear" w:color="auto" w:fill="EEF4F2"/>
+        </w:rPr>
+        <w:t>removeLastRegistration</w:t>
+      </w:r>
+      <w:r>
+        <w:t xml:space="preserve"> zet een product alleen terug in de voorraad als de registratie na die telling is gemaakt. </w:t>
+      </w:r>
+      <w:r>
+        <w:rPr>
+          <w:rFonts w:ascii="Consolas" w:hAnsi="Consolas" w:cs="Consolas"/>
+          <w:sz w:val="18"/>
+          <w:shd w:val="clear" w:color="auto" w:fill="EEF4F2"/>
+        </w:rPr>
+        <w:t>stockEntry</w:t>
+      </w:r>
+      <w:r>
+        <w:t xml:space="preserve"> geeft de voorraadregel van één product op één punt. Beide gebruiken </w:t>
+      </w:r>
+      <w:r>
+        <w:rPr>
+          <w:rFonts w:ascii="Consolas" w:hAnsi="Consolas" w:cs="Consolas"/>
+          <w:sz w:val="18"/>
+          <w:shd w:val="clear" w:color="auto" w:fill="EEF4F2"/>
+        </w:rPr>
+        <w:t>pointProduct</w:t>
+      </w:r>
+      <w:r>
+        <w:t>, dat een regel alleen vindt als eigen sleutel van de voorraadlijst (</w:t>
+      </w:r>
+      <w:r>
+        <w:rPr>
+          <w:rFonts w:ascii="Consolas" w:hAnsi="Consolas" w:cs="Consolas"/>
+          <w:sz w:val="18"/>
+          <w:shd w:val="clear" w:color="auto" w:fill="EEF4F2"/>
+        </w:rPr>
+        <w:t>Object.hasOwn</w:t>
+      </w:r>
+      <w:r>
+        <w:t xml:space="preserve">). Een product-id als </w:t>
+      </w:r>
+      <w:r>
+        <w:rPr>
+          <w:rFonts w:ascii="Consolas" w:hAnsi="Consolas" w:cs="Consolas"/>
+          <w:sz w:val="18"/>
+          <w:shd w:val="clear" w:color="auto" w:fill="EEF4F2"/>
+        </w:rPr>
+        <w:t>toString</w:t>
+      </w:r>
+      <w:r>
+        <w:t xml:space="preserve"> vindt dus geen voorraadregel en schrijft er ook geen.</w:t>
       </w:r>
     </w:p>
     <w:p>
@@ -15441,10 +15334,361 @@
           <w:sz w:val="18"/>
           <w:shd w:val="clear" w:color="auto" w:fill="EEF4F2"/>
         </w:rPr>
-        <w:t>requireAdmin</w:t>
-      </w:r>
-      <w:r>
-        <w:t xml:space="preserve">: iedere beheeractie begint hiermee (formulieren openen en opslaan, verwijderen, (de)activeren, correcties, leveringen en tellingen, export en </w:t>
+        <w:t>moveEmployeesOfPoint</w:t>
+      </w:r>
+      <w:r>
+        <w:t xml:space="preserve"> zet de medewerkers van een consumptiepunt over naar een ander bedrijf. Alleen </w:t>
+      </w:r>
+      <w:r>
+        <w:rPr>
+          <w:rFonts w:ascii="Consolas" w:hAnsi="Consolas" w:cs="Consolas"/>
+          <w:sz w:val="18"/>
+          <w:shd w:val="clear" w:color="auto" w:fill="EEF4F2"/>
+        </w:rPr>
+        <w:t>companyId</w:t>
+      </w:r>
+      <w:r>
+        <w:t xml:space="preserve"> verandert; de naam wordt niet opnieuw opgebouwd.</w:t>
+      </w:r>
+    </w:p>
+    <w:p>
+      <w:pPr>
+        <w:pStyle w:val="Lijstalinea"/>
+        <w:numPr>
+          <w:ilvl w:val="0"/>
+          <w:numId w:val="3"/>
+        </w:numPr>
+        <w:contextualSpacing w:val="0"/>
+      </w:pPr>
+      <w:r>
+        <w:rPr>
+          <w:rFonts w:ascii="Consolas" w:hAnsi="Consolas" w:cs="Consolas"/>
+          <w:sz w:val="18"/>
+          <w:shd w:val="clear" w:color="auto" w:fill="EEF4F2"/>
+        </w:rPr>
+        <w:t>wipeAll</w:t>
+      </w:r>
+      <w:r>
+        <w:t xml:space="preserve"> laat de opslag alles wissen (</w:t>
+      </w:r>
+      <w:r>
+        <w:rPr>
+          <w:rFonts w:ascii="Consolas" w:hAnsi="Consolas" w:cs="Consolas"/>
+          <w:sz w:val="18"/>
+          <w:shd w:val="clear" w:color="auto" w:fill="EEF4F2"/>
+        </w:rPr>
+        <w:t>clearAll</w:t>
+      </w:r>
+      <w:r>
+        <w:t>) en start opnieuw met de demogegevens (</w:t>
+      </w:r>
+      <w:r>
+        <w:rPr>
+          <w:rFonts w:ascii="Consolas" w:hAnsi="Consolas" w:cs="Consolas"/>
+          <w:sz w:val="18"/>
+          <w:shd w:val="clear" w:color="auto" w:fill="EEF4F2"/>
+        </w:rPr>
+        <w:t>createSeedState</w:t>
+      </w:r>
+      <w:r>
+        <w:t>).</w:t>
+      </w:r>
+    </w:p>
+    <w:p>
+      <w:pPr>
+        <w:pStyle w:val="Kop3"/>
+        <w:keepNext/>
+      </w:pPr>
+      <w:bookmarkStart w:id="73" w:name="k38"/>
+      <w:r>
+        <w:rPr>
+          <w:rFonts w:ascii="Consolas" w:hAnsi="Consolas" w:cs="Consolas"/>
+          <w:sz w:val="18"/>
+          <w:shd w:val="clear" w:color="auto" w:fill="EEF4F2"/>
+        </w:rPr>
+        <w:t>RegistrationView</w:t>
+      </w:r>
+      <w:bookmarkEnd w:id="73"/>
+    </w:p>
+    <w:p>
+      <w:r>
+        <w:t xml:space="preserve">Verzorgt alleen de presentatie in de browser. Deze class rendert de medewerkerlijst, het productvenster, statistieken, admin-tabellen, filters, voorraad en toastmeldingen. Alle tekst én alle waarden in HTML-attributen (zoals id's in </w:t>
+      </w:r>
+      <w:r>
+        <w:rPr>
+          <w:rFonts w:ascii="Consolas" w:hAnsi="Consolas" w:cs="Consolas"/>
+          <w:sz w:val="18"/>
+          <w:shd w:val="clear" w:color="auto" w:fill="EEF4F2"/>
+        </w:rPr>
+        <w:t>data-…</w:t>
+      </w:r>
+      <w:r>
+        <w:t xml:space="preserve">, </w:t>
+      </w:r>
+      <w:r>
+        <w:rPr>
+          <w:rFonts w:ascii="Consolas" w:hAnsi="Consolas" w:cs="Consolas"/>
+          <w:sz w:val="18"/>
+          <w:shd w:val="clear" w:color="auto" w:fill="EEF4F2"/>
+        </w:rPr>
+        <w:t>value="…"</w:t>
+      </w:r>
+      <w:r>
+        <w:t xml:space="preserve"> en klassen) gaan eerst door </w:t>
+      </w:r>
+      <w:r>
+        <w:rPr>
+          <w:rFonts w:ascii="Consolas" w:hAnsi="Consolas" w:cs="Consolas"/>
+          <w:sz w:val="18"/>
+          <w:shd w:val="clear" w:color="auto" w:fill="EEF4F2"/>
+        </w:rPr>
+        <w:t>escapeHtml</w:t>
+      </w:r>
+      <w:r>
+        <w:t xml:space="preserve">, zodat ze niet uit het attribuut kunnen breken. De functie </w:t>
+      </w:r>
+      <w:r>
+        <w:rPr>
+          <w:rFonts w:ascii="Consolas" w:hAnsi="Consolas" w:cs="Consolas"/>
+          <w:sz w:val="18"/>
+          <w:shd w:val="clear" w:color="auto" w:fill="EEF4F2"/>
+        </w:rPr>
+        <w:t>cssAttributeValue</w:t>
+      </w:r>
+      <w:r>
+        <w:t xml:space="preserve"> (in hetzelfde bestand, ook gebruikt door de controller) maakt een id veilig voordat die in een CSS-selector komt. In de browser gebruikt die </w:t>
+      </w:r>
+      <w:r>
+        <w:rPr>
+          <w:rFonts w:ascii="Consolas" w:hAnsi="Consolas" w:cs="Consolas"/>
+          <w:sz w:val="18"/>
+          <w:shd w:val="clear" w:color="auto" w:fill="EEF4F2"/>
+        </w:rPr>
+        <w:t>CSS.escape</w:t>
+      </w:r>
+      <w:r>
+        <w:t xml:space="preserve">. </w:t>
+      </w:r>
+      <w:r>
+        <w:rPr>
+          <w:rFonts w:ascii="Consolas" w:hAnsi="Consolas" w:cs="Consolas"/>
+          <w:sz w:val="18"/>
+          <w:shd w:val="clear" w:color="auto" w:fill="EEF4F2"/>
+        </w:rPr>
+        <w:t>companyGroupKey</w:t>
+      </w:r>
+      <w:r>
+        <w:t xml:space="preserve"> bepaalt bij welke groep van het bedrijfsfilter een medewerker hoort: medewerkers zonder bedrijf of met een bedrijf dat niet meer bestaat, vallen onder </w:t>
+      </w:r>
+      <w:r>
+        <w:rPr>
+          <w:rFonts w:ascii="Consolas" w:hAnsi="Consolas" w:cs="Consolas"/>
+          <w:sz w:val="18"/>
+          <w:shd w:val="clear" w:color="auto" w:fill="EEF4F2"/>
+        </w:rPr>
+        <w:t>Onbekend bedrijf</w:t>
+      </w:r>
+      <w:r>
+        <w:t xml:space="preserve">. </w:t>
+      </w:r>
+      <w:r>
+        <w:rPr>
+          <w:rFonts w:ascii="Consolas" w:hAnsi="Consolas" w:cs="Consolas"/>
+          <w:sz w:val="18"/>
+          <w:shd w:val="clear" w:color="auto" w:fill="EEF4F2"/>
+        </w:rPr>
+        <w:t>populateCompanyFilter</w:t>
+      </w:r>
+      <w:r>
+        <w:t xml:space="preserve"> overschrijft de tekst in het bedrijfsfilter niet zolang de gebruiker erin typt. </w:t>
+      </w:r>
+      <w:r>
+        <w:rPr>
+          <w:rFonts w:ascii="Consolas" w:hAnsi="Consolas" w:cs="Consolas"/>
+          <w:sz w:val="18"/>
+          <w:shd w:val="clear" w:color="auto" w:fill="EEF4F2"/>
+        </w:rPr>
+        <w:t>countRegistrations</w:t>
+      </w:r>
+      <w:r>
+        <w:t xml:space="preserve"> telt de registraties per medewerker en product in één keer, zodat de correctielijst ook bij veel registraties snel blijft. </w:t>
+      </w:r>
+      <w:r>
+        <w:rPr>
+          <w:rFonts w:ascii="Consolas" w:hAnsi="Consolas" w:cs="Consolas"/>
+          <w:sz w:val="18"/>
+          <w:shd w:val="clear" w:color="auto" w:fill="EEF4F2"/>
+        </w:rPr>
+        <w:t>renderRemoveRegistrationList</w:t>
+      </w:r>
+      <w:r>
+        <w:t xml:space="preserve"> vult het venster </w:t>
+      </w:r>
+      <w:r>
+        <w:rPr>
+          <w:rFonts w:ascii="Consolas" w:hAnsi="Consolas" w:cs="Consolas"/>
+          <w:sz w:val="18"/>
+          <w:shd w:val="clear" w:color="auto" w:fill="EEF4F2"/>
+        </w:rPr>
+        <w:t>Registratie verwijderen</w:t>
+      </w:r>
+      <w:r>
+        <w:t xml:space="preserve"> met per registratie de datum en tijd, het product, het aantal en een knop </w:t>
+      </w:r>
+      <w:r>
+        <w:rPr>
+          <w:rFonts w:ascii="Consolas" w:hAnsi="Consolas" w:cs="Consolas"/>
+          <w:sz w:val="18"/>
+          <w:shd w:val="clear" w:color="auto" w:fill="EEF4F2"/>
+        </w:rPr>
+        <w:t>Verwijderen</w:t>
+      </w:r>
+      <w:r>
+        <w:t xml:space="preserve">. </w:t>
+      </w:r>
+      <w:r>
+        <w:rPr>
+          <w:rFonts w:ascii="Consolas" w:hAnsi="Consolas" w:cs="Consolas"/>
+          <w:sz w:val="18"/>
+          <w:shd w:val="clear" w:color="auto" w:fill="EEF4F2"/>
+        </w:rPr>
+        <w:t>renderStockAlerts</w:t>
+      </w:r>
+      <w:r>
+        <w:t xml:space="preserve"> en </w:t>
+      </w:r>
+      <w:r>
+        <w:rPr>
+          <w:rFonts w:ascii="Consolas" w:hAnsi="Consolas" w:cs="Consolas"/>
+          <w:sz w:val="18"/>
+          <w:shd w:val="clear" w:color="auto" w:fill="EEF4F2"/>
+        </w:rPr>
+        <w:t>updateStockStatus</w:t>
+      </w:r>
+      <w:r>
+        <w:t xml:space="preserve"> werken na het aanpassen van de voorraad alleen de bijbestellijst en één statuslabel bij. De view leest uit het model, maar verandert zelf niets.</w:t>
+      </w:r>
+    </w:p>
+    <w:p>
+      <w:pPr>
+        <w:pStyle w:val="Kop3"/>
+        <w:keepNext/>
+      </w:pPr>
+      <w:bookmarkStart w:id="74" w:name="k39"/>
+      <w:r>
+        <w:rPr>
+          <w:rFonts w:ascii="Consolas" w:hAnsi="Consolas" w:cs="Consolas"/>
+          <w:sz w:val="18"/>
+          <w:shd w:val="clear" w:color="auto" w:fill="EEF4F2"/>
+        </w:rPr>
+        <w:t>RegistrationApp</w:t>
+      </w:r>
+      <w:bookmarkEnd w:id="74"/>
+    </w:p>
+    <w:p>
+      <w:r>
+        <w:t xml:space="preserve">Vormt de controller van de applicatie. Deze class koppelt klik- en formulier-events aan het model en laat daarna de view opnieuw renderen. </w:t>
+      </w:r>
+      <w:r>
+        <w:rPr>
+          <w:rFonts w:ascii="Consolas" w:hAnsi="Consolas" w:cs="Consolas"/>
+          <w:sz w:val="18"/>
+          <w:shd w:val="clear" w:color="auto" w:fill="EEF4F2"/>
+        </w:rPr>
+        <w:t>handleClick</w:t>
+      </w:r>
+      <w:r>
+        <w:t xml:space="preserve"> bevat een lijst van knoppen met de actie die erbij hoort; iedere actie is een eigen, korte methode. De methode </w:t>
+      </w:r>
+      <w:r>
+        <w:rPr>
+          <w:rFonts w:ascii="Consolas" w:hAnsi="Consolas" w:cs="Consolas"/>
+          <w:sz w:val="18"/>
+          <w:shd w:val="clear" w:color="auto" w:fill="EEF4F2"/>
+        </w:rPr>
+        <w:t>persist(wijziging, logboekregel)</w:t>
+      </w:r>
+      <w:r>
+        <w:t xml:space="preserve"> zorgt dat iedere wijziging wordt opgeslagen of automatisch wordt teruggedraaid bij een opslagfout. De logboekregel (bijvoorbeeld </w:t>
+      </w:r>
+      <w:r>
+        <w:rPr>
+          <w:rFonts w:ascii="Consolas" w:hAnsi="Consolas" w:cs="Consolas"/>
+          <w:sz w:val="18"/>
+          <w:shd w:val="clear" w:color="auto" w:fill="EEF4F2"/>
+        </w:rPr>
+        <w:t>{ action: "Product verwijderd", details: "Blikje" }</w:t>
+      </w:r>
+      <w:r>
+        <w:t xml:space="preserve">) wordt toegevoegd vóórdat er één keer wordt opgeslagen. Zo worden de wijziging en de logboekregel samen opgeslagen of samen teruggedraaid. </w:t>
+      </w:r>
+      <w:r>
+        <w:rPr>
+          <w:rFonts w:ascii="Consolas" w:hAnsi="Consolas" w:cs="Consolas"/>
+          <w:sz w:val="18"/>
+          <w:shd w:val="clear" w:color="auto" w:fill="EEF4F2"/>
+        </w:rPr>
+        <w:t>finishAdminChange</w:t>
+      </w:r>
+      <w:r>
+        <w:t xml:space="preserve"> tekent daarna alle beheeronderdelen opnieuw, ook de registratietabel (zodat bijvoorbeeld een nieuwe productnaam daar meteen staat), zonder nog eens apart op te slaan.</w:t>
+      </w:r>
+    </w:p>
+    <w:p>
+      <w:r>
+        <w:rPr>
+          <w:rFonts w:ascii="Consolas" w:hAnsi="Consolas" w:cs="Consolas"/>
+          <w:sz w:val="18"/>
+          <w:shd w:val="clear" w:color="auto" w:fill="EEF4F2"/>
+        </w:rPr>
+        <w:t>handleStorageChange</w:t>
+      </w:r>
+      <w:r>
+        <w:t xml:space="preserve"> luistert naar het </w:t>
+      </w:r>
+      <w:r>
+        <w:rPr>
+          <w:rFonts w:ascii="Consolas" w:hAnsi="Consolas" w:cs="Consolas"/>
+          <w:sz w:val="18"/>
+          <w:shd w:val="clear" w:color="auto" w:fill="EEF4F2"/>
+        </w:rPr>
+        <w:t>storage</w:t>
+      </w:r>
+      <w:r>
+        <w:t>-event: slaat een ander tabblad iets op, dan laadt het model de gegevens opnieuw (</w:t>
+      </w:r>
+      <w:r>
+        <w:rPr>
+          <w:rFonts w:ascii="Consolas" w:hAnsi="Consolas" w:cs="Consolas"/>
+          <w:sz w:val="18"/>
+          <w:shd w:val="clear" w:color="auto" w:fill="EEF4F2"/>
+        </w:rPr>
+        <w:t>RegistrationModel.reload</w:t>
+      </w:r>
+      <w:r>
+        <w:t xml:space="preserve">) en wordt alles opnieuw getekend. Daarna ruimt de controller op wat niet meer klopt: </w:t>
+      </w:r>
+      <w:r>
+        <w:rPr>
+          <w:rFonts w:ascii="Consolas" w:hAnsi="Consolas" w:cs="Consolas"/>
+          <w:sz w:val="18"/>
+          <w:shd w:val="clear" w:color="auto" w:fill="EEF4F2"/>
+        </w:rPr>
+        <w:t>closeStaleForms</w:t>
+      </w:r>
+      <w:r>
+        <w:t xml:space="preserve"> sluit een open wijzigformulier van iets dat intussen is verwijderd, en een open productvenster (met het cameravenster erboven) sluit met een melding als de medewerker is verwijderd of gedeactiveerd. Typt de beheerder in de voorraadtabel (</w:t>
+      </w:r>
+      <w:r>
+        <w:rPr>
+          <w:rFonts w:ascii="Consolas" w:hAnsi="Consolas" w:cs="Consolas"/>
+          <w:sz w:val="18"/>
+          <w:shd w:val="clear" w:color="auto" w:fill="EEF4F2"/>
+        </w:rPr>
+        <w:t>isTypingInStockTable</w:t>
+      </w:r>
+      <w:r>
+        <w:t xml:space="preserve">), dan blijft die tabel staan. Waren de nieuwe gegevens onleesbaar, dan volgt een waarschuwing. Klikt iemand in een ander tabblad op </w:t>
       </w:r>
       <w:r>
         <w:rPr>
@@ -15455,7 +15699,45 @@
         <w:t>Alle gegevens wissen</w:t>
       </w:r>
       <w:r>
-        <w:t>). Is er geen beheerder ingelogd, dan gebeurt er niets en verschijnt "Log eerst in als beheerder.". Zo werkt een beheeractie ook niet als een verborgen knop toch wordt ingedrukt of de methode op een andere manier wordt aangeroepen. Registreren door een medewerker zelf vraagt geen login.</w:t>
+        <w:t>, dan verwijdert dat tabblad de gegevenssleutel (</w:t>
+      </w:r>
+      <w:r>
+        <w:rPr>
+          <w:rFonts w:ascii="Consolas" w:hAnsi="Consolas" w:cs="Consolas"/>
+          <w:sz w:val="18"/>
+          <w:shd w:val="clear" w:color="auto" w:fill="EEF4F2"/>
+        </w:rPr>
+        <w:t>event.newValue</w:t>
+      </w:r>
+      <w:r>
+        <w:t xml:space="preserve"> is dan null). Dit tabblad wist dan ook alles uit het geheugen, logt de beheerder uit, vergeet de gezichten en toont "De gegevens zijn in een ander venster gewist." (</w:t>
+      </w:r>
+      <w:r>
+        <w:rPr>
+          <w:rFonts w:ascii="Consolas" w:hAnsi="Consolas" w:cs="Consolas"/>
+          <w:sz w:val="18"/>
+          <w:shd w:val="clear" w:color="auto" w:fill="EEF4F2"/>
+        </w:rPr>
+        <w:t>handleStorageCleared({ keepStore: true })</w:t>
+      </w:r>
+      <w:r>
+        <w:t xml:space="preserve">). De opslag zelf blijft met rust, want het andere tabblad zet er meteen de nieuwe demogegevens in; anders zouden de twee tabbladen elkaar steeds opnieuw wissen. Knoppen en formulieren van iets dat niet meer bestaat, geven via </w:t>
+      </w:r>
+      <w:r>
+        <w:rPr>
+          <w:rFonts w:ascii="Consolas" w:hAnsi="Consolas" w:cs="Consolas"/>
+          <w:sz w:val="18"/>
+          <w:shd w:val="clear" w:color="auto" w:fill="EEF4F2"/>
+        </w:rPr>
+        <w:t>showMissing</w:t>
+      </w:r>
+      <w:r>
+        <w:t xml:space="preserve"> een melding in plaats van het gegeven opnieuw aan te maken.</w:t>
+      </w:r>
+    </w:p>
+    <w:p>
+      <w:r>
+        <w:t>Andere methodes:</w:t>
       </w:r>
     </w:p>
     <w:p>
@@ -15474,43 +15756,21 @@
           <w:sz w:val="18"/>
           <w:shd w:val="clear" w:color="auto" w:fill="EEF4F2"/>
         </w:rPr>
-        <w:t>stopCameraAfterTimeout</w:t>
-      </w:r>
-      <w:r>
-        <w:t xml:space="preserve"> en </w:t>
-      </w:r>
-      <w:r>
-        <w:rPr>
-          <w:rFonts w:ascii="Consolas" w:hAnsi="Consolas" w:cs="Consolas"/>
-          <w:sz w:val="18"/>
-          <w:shd w:val="clear" w:color="auto" w:fill="EEF4F2"/>
-        </w:rPr>
-        <w:t>scheduleEnrollTimeout</w:t>
-      </w:r>
-      <w:r>
-        <w:t xml:space="preserve">: zetten de camera uit als er bij herkennen binnen </w:t>
-      </w:r>
-      <w:r>
-        <w:rPr>
-          <w:rFonts w:ascii="Consolas" w:hAnsi="Consolas" w:cs="Consolas"/>
-          <w:sz w:val="18"/>
-          <w:shd w:val="clear" w:color="auto" w:fill="EEF4F2"/>
-        </w:rPr>
-        <w:t>FACE_DEMO.scanTimeoutMs</w:t>
-      </w:r>
-      <w:r>
-        <w:t xml:space="preserve"> (20 seconden) niemand is herkend, of als er bij instellen in die tijd geen gezicht is vastgelegd. Het venster blijft open met een melding. </w:t>
-      </w:r>
-      <w:r>
-        <w:rPr>
-          <w:rFonts w:ascii="Consolas" w:hAnsi="Consolas" w:cs="Consolas"/>
-          <w:sz w:val="18"/>
-          <w:shd w:val="clear" w:color="auto" w:fill="EEF4F2"/>
-        </w:rPr>
-        <w:t>closeFaceModal</w:t>
-      </w:r>
-      <w:r>
-        <w:t xml:space="preserve"> ruimt een wachtende time-out op.</w:t>
+        <w:t>requireAdmin</w:t>
+      </w:r>
+      <w:r>
+        <w:t xml:space="preserve">: iedere beheeractie begint hiermee (formulieren openen en opslaan, verwijderen, (de)activeren, correcties, leveringen en tellingen, export en </w:t>
+      </w:r>
+      <w:r>
+        <w:rPr>
+          <w:rFonts w:ascii="Consolas" w:hAnsi="Consolas" w:cs="Consolas"/>
+          <w:sz w:val="18"/>
+          <w:shd w:val="clear" w:color="auto" w:fill="EEF4F2"/>
+        </w:rPr>
+        <w:t>Alle gegevens wissen</w:t>
+      </w:r>
+      <w:r>
+        <w:t>). Is er geen beheerder ingelogd, dan gebeurt er niets en verschijnt "Log eerst in als beheerder.". Zo werkt een beheeractie ook niet als een verborgen knop toch wordt ingedrukt of de methode op een andere manier wordt aangeroepen. Registreren door een medewerker zelf vraagt geen login.</w:t>
       </w:r>
     </w:p>
     <w:p>
@@ -15529,32 +15789,43 @@
           <w:sz w:val="18"/>
           <w:shd w:val="clear" w:color="auto" w:fill="EEF4F2"/>
         </w:rPr>
-        <w:t>refreshIfNewDay</w:t>
-      </w:r>
-      <w:r>
-        <w:t>: een timer roept deze methode iedere minuut aan. Is de kalenderdag veranderd, dan worden de datum (</w:t>
-      </w:r>
-      <w:r>
-        <w:rPr>
-          <w:rFonts w:ascii="Consolas" w:hAnsi="Consolas" w:cs="Consolas"/>
-          <w:sz w:val="18"/>
-          <w:shd w:val="clear" w:color="auto" w:fill="EEF4F2"/>
-        </w:rPr>
-        <w:t>renderTodayLabel</w:t>
-      </w:r>
-      <w:r>
-        <w:t>) en de totalen (</w:t>
-      </w:r>
-      <w:r>
-        <w:rPr>
-          <w:rFonts w:ascii="Consolas" w:hAnsi="Consolas" w:cs="Consolas"/>
-          <w:sz w:val="18"/>
-          <w:shd w:val="clear" w:color="auto" w:fill="EEF4F2"/>
-        </w:rPr>
-        <w:t>renderStats</w:t>
-      </w:r>
-      <w:r>
-        <w:t>) opnieuw getekend.</w:t>
+        <w:t>stopCameraAfterTimeout</w:t>
+      </w:r>
+      <w:r>
+        <w:t xml:space="preserve"> en </w:t>
+      </w:r>
+      <w:r>
+        <w:rPr>
+          <w:rFonts w:ascii="Consolas" w:hAnsi="Consolas" w:cs="Consolas"/>
+          <w:sz w:val="18"/>
+          <w:shd w:val="clear" w:color="auto" w:fill="EEF4F2"/>
+        </w:rPr>
+        <w:t>scheduleEnrollTimeout</w:t>
+      </w:r>
+      <w:r>
+        <w:t xml:space="preserve">: zetten de camera uit als er bij herkennen binnen </w:t>
+      </w:r>
+      <w:r>
+        <w:rPr>
+          <w:rFonts w:ascii="Consolas" w:hAnsi="Consolas" w:cs="Consolas"/>
+          <w:sz w:val="18"/>
+          <w:shd w:val="clear" w:color="auto" w:fill="EEF4F2"/>
+        </w:rPr>
+        <w:t>FACE_DEMO.scanTimeoutMs</w:t>
+      </w:r>
+      <w:r>
+        <w:t xml:space="preserve"> (20 seconden) niemand is herkend, of als er bij instellen in die tijd geen gezicht is vastgelegd. Het venster blijft open met een melding. </w:t>
+      </w:r>
+      <w:r>
+        <w:rPr>
+          <w:rFonts w:ascii="Consolas" w:hAnsi="Consolas" w:cs="Consolas"/>
+          <w:sz w:val="18"/>
+          <w:shd w:val="clear" w:color="auto" w:fill="EEF4F2"/>
+        </w:rPr>
+        <w:t>closeFaceModal</w:t>
+      </w:r>
+      <w:r>
+        <w:t xml:space="preserve"> ruimt een wachtende time-out op.</w:t>
       </w:r>
     </w:p>
     <w:p>
@@ -15573,54 +15844,32 @@
           <w:sz w:val="18"/>
           <w:shd w:val="clear" w:color="auto" w:fill="EEF4F2"/>
         </w:rPr>
-        <w:t>openModal</w:t>
-      </w:r>
-      <w:r>
-        <w:t xml:space="preserve"> en </w:t>
-      </w:r>
-      <w:r>
-        <w:rPr>
-          <w:rFonts w:ascii="Consolas" w:hAnsi="Consolas" w:cs="Consolas"/>
-          <w:sz w:val="18"/>
-          <w:shd w:val="clear" w:color="auto" w:fill="EEF4F2"/>
-        </w:rPr>
-        <w:t>closeModal</w:t>
-      </w:r>
-      <w:r>
-        <w:t xml:space="preserve">: openen en sluiten een venster. </w:t>
-      </w:r>
-      <w:r>
-        <w:rPr>
-          <w:rFonts w:ascii="Consolas" w:hAnsi="Consolas" w:cs="Consolas"/>
-          <w:sz w:val="18"/>
-          <w:shd w:val="clear" w:color="auto" w:fill="EEF4F2"/>
-        </w:rPr>
-        <w:t>openModal</w:t>
-      </w:r>
-      <w:r>
-        <w:t xml:space="preserve"> onthoudt welk element de focus had (</w:t>
-      </w:r>
-      <w:r>
-        <w:rPr>
-          <w:rFonts w:ascii="Consolas" w:hAnsi="Consolas" w:cs="Consolas"/>
-          <w:sz w:val="18"/>
-          <w:shd w:val="clear" w:color="auto" w:fill="EEF4F2"/>
-        </w:rPr>
-        <w:t>rememberOpener</w:t>
-      </w:r>
-      <w:r>
-        <w:t xml:space="preserve">); </w:t>
-      </w:r>
-      <w:r>
-        <w:rPr>
-          <w:rFonts w:ascii="Consolas" w:hAnsi="Consolas" w:cs="Consolas"/>
-          <w:sz w:val="18"/>
-          <w:shd w:val="clear" w:color="auto" w:fill="EEF4F2"/>
-        </w:rPr>
-        <w:t>closeModal</w:t>
-      </w:r>
-      <w:r>
-        <w:t xml:space="preserve"> zet de focus daar weer op, als dat element nog zichtbaar op de pagina staat.</w:t>
+        <w:t>refreshIfNewDay</w:t>
+      </w:r>
+      <w:r>
+        <w:t>: een timer roept deze methode iedere minuut aan. Is de kalenderdag veranderd, dan worden de datum (</w:t>
+      </w:r>
+      <w:r>
+        <w:rPr>
+          <w:rFonts w:ascii="Consolas" w:hAnsi="Consolas" w:cs="Consolas"/>
+          <w:sz w:val="18"/>
+          <w:shd w:val="clear" w:color="auto" w:fill="EEF4F2"/>
+        </w:rPr>
+        <w:t>renderTodayLabel</w:t>
+      </w:r>
+      <w:r>
+        <w:t>) en de totalen (</w:t>
+      </w:r>
+      <w:r>
+        <w:rPr>
+          <w:rFonts w:ascii="Consolas" w:hAnsi="Consolas" w:cs="Consolas"/>
+          <w:sz w:val="18"/>
+          <w:shd w:val="clear" w:color="auto" w:fill="EEF4F2"/>
+        </w:rPr>
+        <w:t>renderStats</w:t>
+      </w:r>
+      <w:r>
+        <w:t>) opnieuw getekend.</w:t>
       </w:r>
     </w:p>
     <w:p>
@@ -15639,21 +15888,54 @@
           <w:sz w:val="18"/>
           <w:shd w:val="clear" w:color="auto" w:fill="EEF4F2"/>
         </w:rPr>
-        <w:t>confirmOldMonthRemoval</w:t>
-      </w:r>
-      <w:r>
-        <w:t xml:space="preserve">: vraagt bevestiging voordat een correctie met </w:t>
-      </w:r>
-      <w:r>
-        <w:rPr>
-          <w:rFonts w:ascii="Consolas" w:hAnsi="Consolas" w:cs="Consolas"/>
-          <w:sz w:val="18"/>
-          <w:shd w:val="clear" w:color="auto" w:fill="EEF4F2"/>
-        </w:rPr>
-        <w:t>−</w:t>
-      </w:r>
-      <w:r>
-        <w:t xml:space="preserve"> een registratie uit een andere maand verwijdert.</w:t>
+        <w:t>openModal</w:t>
+      </w:r>
+      <w:r>
+        <w:t xml:space="preserve"> en </w:t>
+      </w:r>
+      <w:r>
+        <w:rPr>
+          <w:rFonts w:ascii="Consolas" w:hAnsi="Consolas" w:cs="Consolas"/>
+          <w:sz w:val="18"/>
+          <w:shd w:val="clear" w:color="auto" w:fill="EEF4F2"/>
+        </w:rPr>
+        <w:t>closeModal</w:t>
+      </w:r>
+      <w:r>
+        <w:t xml:space="preserve">: openen en sluiten een venster. </w:t>
+      </w:r>
+      <w:r>
+        <w:rPr>
+          <w:rFonts w:ascii="Consolas" w:hAnsi="Consolas" w:cs="Consolas"/>
+          <w:sz w:val="18"/>
+          <w:shd w:val="clear" w:color="auto" w:fill="EEF4F2"/>
+        </w:rPr>
+        <w:t>openModal</w:t>
+      </w:r>
+      <w:r>
+        <w:t xml:space="preserve"> onthoudt welk element de focus had (</w:t>
+      </w:r>
+      <w:r>
+        <w:rPr>
+          <w:rFonts w:ascii="Consolas" w:hAnsi="Consolas" w:cs="Consolas"/>
+          <w:sz w:val="18"/>
+          <w:shd w:val="clear" w:color="auto" w:fill="EEF4F2"/>
+        </w:rPr>
+        <w:t>rememberOpener</w:t>
+      </w:r>
+      <w:r>
+        <w:t xml:space="preserve">); </w:t>
+      </w:r>
+      <w:r>
+        <w:rPr>
+          <w:rFonts w:ascii="Consolas" w:hAnsi="Consolas" w:cs="Consolas"/>
+          <w:sz w:val="18"/>
+          <w:shd w:val="clear" w:color="auto" w:fill="EEF4F2"/>
+        </w:rPr>
+        <w:t>closeModal</w:t>
+      </w:r>
+      <w:r>
+        <w:t xml:space="preserve"> zet de focus daar weer op, als dat element nog zichtbaar op de pagina staat.</w:t>
       </w:r>
     </w:p>
     <w:p>
@@ -15672,43 +15954,120 @@
           <w:sz w:val="18"/>
           <w:shd w:val="clear" w:color="auto" w:fill="EEF4F2"/>
         </w:rPr>
-        <w:t>setSaveButtons</w:t>
-      </w:r>
-      <w:r>
-        <w:t xml:space="preserve">: zet de opslagknoppen van het medewerkers- en productformulier goed. Bij toevoegen staan er </w:t>
-      </w:r>
-      <w:r>
-        <w:rPr>
-          <w:rFonts w:ascii="Consolas" w:hAnsi="Consolas" w:cs="Consolas"/>
-          <w:sz w:val="18"/>
-          <w:shd w:val="clear" w:color="auto" w:fill="EEF4F2"/>
-        </w:rPr>
-        <w:t>Opslaan</w:t>
-      </w:r>
-      <w:r>
-        <w:t xml:space="preserve"> (secundair) en </w:t>
-      </w:r>
-      <w:r>
-        <w:rPr>
-          <w:rFonts w:ascii="Consolas" w:hAnsi="Consolas" w:cs="Consolas"/>
-          <w:sz w:val="18"/>
-          <w:shd w:val="clear" w:color="auto" w:fill="EEF4F2"/>
-        </w:rPr>
-        <w:t>Opslaan + opnieuw</w:t>
-      </w:r>
-      <w:r>
-        <w:t xml:space="preserve"> (primair); bij wijzigen alleen </w:t>
-      </w:r>
-      <w:r>
-        <w:rPr>
-          <w:rFonts w:ascii="Consolas" w:hAnsi="Consolas" w:cs="Consolas"/>
-          <w:sz w:val="18"/>
-          <w:shd w:val="clear" w:color="auto" w:fill="EEF4F2"/>
-        </w:rPr>
-        <w:t>Opslaan</w:t>
-      </w:r>
-      <w:r>
-        <w:t>, en die is dan primair.</w:t>
+        <w:t>removeCorrection</w:t>
+      </w:r>
+      <w:r>
+        <w:t xml:space="preserve">, </w:t>
+      </w:r>
+      <w:r>
+        <w:rPr>
+          <w:rFonts w:ascii="Consolas" w:hAnsi="Consolas" w:cs="Consolas"/>
+          <w:sz w:val="18"/>
+          <w:shd w:val="clear" w:color="auto" w:fill="EEF4F2"/>
+        </w:rPr>
+        <w:t>removeChosenRegistration</w:t>
+      </w:r>
+      <w:r>
+        <w:t xml:space="preserve"> en </w:t>
+      </w:r>
+      <w:r>
+        <w:rPr>
+          <w:rFonts w:ascii="Consolas" w:hAnsi="Consolas" w:cs="Consolas"/>
+          <w:sz w:val="18"/>
+          <w:shd w:val="clear" w:color="auto" w:fill="EEF4F2"/>
+        </w:rPr>
+        <w:t>closeRemoveRegistration</w:t>
+      </w:r>
+      <w:r>
+        <w:t xml:space="preserve">: de correctie </w:t>
+      </w:r>
+      <w:r>
+        <w:rPr>
+          <w:rFonts w:ascii="Consolas" w:hAnsi="Consolas" w:cs="Consolas"/>
+          <w:sz w:val="18"/>
+          <w:shd w:val="clear" w:color="auto" w:fill="EEF4F2"/>
+        </w:rPr>
+        <w:t>−</w:t>
+      </w:r>
+      <w:r>
+        <w:t xml:space="preserve">. </w:t>
+      </w:r>
+      <w:r>
+        <w:rPr>
+          <w:rFonts w:ascii="Consolas" w:hAnsi="Consolas" w:cs="Consolas"/>
+          <w:sz w:val="18"/>
+          <w:shd w:val="clear" w:color="auto" w:fill="EEF4F2"/>
+        </w:rPr>
+        <w:t>removeCorrection</w:t>
+      </w:r>
+      <w:r>
+        <w:t xml:space="preserve"> opent het venster </w:t>
+      </w:r>
+      <w:r>
+        <w:rPr>
+          <w:rFonts w:ascii="Consolas" w:hAnsi="Consolas" w:cs="Consolas"/>
+          <w:sz w:val="18"/>
+          <w:shd w:val="clear" w:color="auto" w:fill="EEF4F2"/>
+        </w:rPr>
+        <w:t>Registratie verwijderen</w:t>
+      </w:r>
+      <w:r>
+        <w:t xml:space="preserve"> (ook bij één registratie) en zet de focus op de eerste knop </w:t>
+      </w:r>
+      <w:r>
+        <w:rPr>
+          <w:rFonts w:ascii="Consolas" w:hAnsi="Consolas" w:cs="Consolas"/>
+          <w:sz w:val="18"/>
+          <w:shd w:val="clear" w:color="auto" w:fill="EEF4F2"/>
+        </w:rPr>
+        <w:t>Verwijderen</w:t>
+      </w:r>
+      <w:r>
+        <w:t xml:space="preserve">. </w:t>
+      </w:r>
+      <w:r>
+        <w:rPr>
+          <w:rFonts w:ascii="Consolas" w:hAnsi="Consolas" w:cs="Consolas"/>
+          <w:sz w:val="18"/>
+          <w:shd w:val="clear" w:color="auto" w:fill="EEF4F2"/>
+        </w:rPr>
+        <w:t>removeChosenRegistration</w:t>
+      </w:r>
+      <w:r>
+        <w:t xml:space="preserve"> verwijdert de gekozen registratie met een logboekregel via </w:t>
+      </w:r>
+      <w:r>
+        <w:rPr>
+          <w:rFonts w:ascii="Consolas" w:hAnsi="Consolas" w:cs="Consolas"/>
+          <w:sz w:val="18"/>
+          <w:shd w:val="clear" w:color="auto" w:fill="EEF4F2"/>
+        </w:rPr>
+        <w:t>persist</w:t>
+      </w:r>
+      <w:r>
+        <w:t xml:space="preserve">, sluit het venster en tekent de lijsten en de voorraad opnieuw. Bestaat de registratie niet meer, dan volgt via </w:t>
+      </w:r>
+      <w:r>
+        <w:rPr>
+          <w:rFonts w:ascii="Consolas" w:hAnsi="Consolas" w:cs="Consolas"/>
+          <w:sz w:val="18"/>
+          <w:shd w:val="clear" w:color="auto" w:fill="EEF4F2"/>
+        </w:rPr>
+        <w:t>showMissing</w:t>
+      </w:r>
+      <w:r>
+        <w:t xml:space="preserve"> een melding. </w:t>
+      </w:r>
+      <w:r>
+        <w:rPr>
+          <w:rFonts w:ascii="Consolas" w:hAnsi="Consolas" w:cs="Consolas"/>
+          <w:sz w:val="18"/>
+          <w:shd w:val="clear" w:color="auto" w:fill="EEF4F2"/>
+        </w:rPr>
+        <w:t>refreshRemoveRegistration</w:t>
+      </w:r>
+      <w:r>
+        <w:t xml:space="preserve"> werkt de lijst bij na een wijziging in een ander tabblad en sluit het venster als er niets meer te kiezen is. Bij het sluiten van het beheer gaat het venster ook dicht.</w:t>
       </w:r>
     </w:p>
     <w:p>
@@ -15727,54 +16086,21 @@
           <w:sz w:val="18"/>
           <w:shd w:val="clear" w:color="auto" w:fill="EEF4F2"/>
         </w:rPr>
-        <w:t>resetCorrectionDate</w:t>
-      </w:r>
-      <w:r>
-        <w:t xml:space="preserve">, </w:t>
-      </w:r>
-      <w:r>
-        <w:rPr>
-          <w:rFonts w:ascii="Consolas" w:hAnsi="Consolas" w:cs="Consolas"/>
-          <w:sz w:val="18"/>
-          <w:shd w:val="clear" w:color="auto" w:fill="EEF4F2"/>
-        </w:rPr>
-        <w:t>readCorrectionDate</w:t>
-      </w:r>
-      <w:r>
-        <w:t xml:space="preserve"> en </w:t>
-      </w:r>
-      <w:r>
-        <w:rPr>
-          <w:rFonts w:ascii="Consolas" w:hAnsi="Consolas" w:cs="Consolas"/>
-          <w:sz w:val="18"/>
-          <w:shd w:val="clear" w:color="auto" w:fill="EEF4F2"/>
-        </w:rPr>
-        <w:t>confirmOldMonthAddition</w:t>
-      </w:r>
-      <w:r>
-        <w:t xml:space="preserve">: het datumveld bij de correctie </w:t>
-      </w:r>
-      <w:r>
-        <w:rPr>
-          <w:rFonts w:ascii="Consolas" w:hAnsi="Consolas" w:cs="Consolas"/>
-          <w:sz w:val="18"/>
-          <w:shd w:val="clear" w:color="auto" w:fill="EEF4F2"/>
-        </w:rPr>
-        <w:t>+</w:t>
-      </w:r>
-      <w:r>
-        <w:t xml:space="preserve">. Na het inloggen staat het op vandaag; bij </w:t>
-      </w:r>
-      <w:r>
-        <w:rPr>
-          <w:rFonts w:ascii="Consolas" w:hAnsi="Consolas" w:cs="Consolas"/>
-          <w:sz w:val="18"/>
-          <w:shd w:val="clear" w:color="auto" w:fill="EEF4F2"/>
-        </w:rPr>
-        <w:t>+</w:t>
-      </w:r>
-      <w:r>
-        <w:t xml:space="preserve"> wordt de datum gecontroleerd (niet in de toekomst, niet vóór 2000) en volgt bij een eerdere maand een bevestigingsvraag.</w:t>
+        <w:t>confirmOldMonthRemoval</w:t>
+      </w:r>
+      <w:r>
+        <w:t xml:space="preserve">: vraagt bevestiging voordat een correctie met </w:t>
+      </w:r>
+      <w:r>
+        <w:rPr>
+          <w:rFonts w:ascii="Consolas" w:hAnsi="Consolas" w:cs="Consolas"/>
+          <w:sz w:val="18"/>
+          <w:shd w:val="clear" w:color="auto" w:fill="EEF4F2"/>
+        </w:rPr>
+        <w:t>−</w:t>
+      </w:r>
+      <w:r>
+        <w:t xml:space="preserve"> een registratie uit een andere maand verwijdert.</w:t>
       </w:r>
     </w:p>
     <w:p>
@@ -15793,6 +16119,127 @@
           <w:sz w:val="18"/>
           <w:shd w:val="clear" w:color="auto" w:fill="EEF4F2"/>
         </w:rPr>
+        <w:t>setSaveButtons</w:t>
+      </w:r>
+      <w:r>
+        <w:t xml:space="preserve">: zet de opslagknoppen van het medewerkers- en productformulier goed. Bij toevoegen staan er </w:t>
+      </w:r>
+      <w:r>
+        <w:rPr>
+          <w:rFonts w:ascii="Consolas" w:hAnsi="Consolas" w:cs="Consolas"/>
+          <w:sz w:val="18"/>
+          <w:shd w:val="clear" w:color="auto" w:fill="EEF4F2"/>
+        </w:rPr>
+        <w:t>Opslaan</w:t>
+      </w:r>
+      <w:r>
+        <w:t xml:space="preserve"> (secundair) en </w:t>
+      </w:r>
+      <w:r>
+        <w:rPr>
+          <w:rFonts w:ascii="Consolas" w:hAnsi="Consolas" w:cs="Consolas"/>
+          <w:sz w:val="18"/>
+          <w:shd w:val="clear" w:color="auto" w:fill="EEF4F2"/>
+        </w:rPr>
+        <w:t>Opslaan + opnieuw</w:t>
+      </w:r>
+      <w:r>
+        <w:t xml:space="preserve"> (primair); bij wijzigen alleen </w:t>
+      </w:r>
+      <w:r>
+        <w:rPr>
+          <w:rFonts w:ascii="Consolas" w:hAnsi="Consolas" w:cs="Consolas"/>
+          <w:sz w:val="18"/>
+          <w:shd w:val="clear" w:color="auto" w:fill="EEF4F2"/>
+        </w:rPr>
+        <w:t>Opslaan</w:t>
+      </w:r>
+      <w:r>
+        <w:t>, en die is dan primair.</w:t>
+      </w:r>
+    </w:p>
+    <w:p>
+      <w:pPr>
+        <w:pStyle w:val="Lijstalinea"/>
+        <w:numPr>
+          <w:ilvl w:val="0"/>
+          <w:numId w:val="3"/>
+        </w:numPr>
+        <w:spacing w:after="60"/>
+        <w:contextualSpacing w:val="0"/>
+      </w:pPr>
+      <w:r>
+        <w:rPr>
+          <w:rFonts w:ascii="Consolas" w:hAnsi="Consolas" w:cs="Consolas"/>
+          <w:sz w:val="18"/>
+          <w:shd w:val="clear" w:color="auto" w:fill="EEF4F2"/>
+        </w:rPr>
+        <w:t>resetCorrectionDate</w:t>
+      </w:r>
+      <w:r>
+        <w:t xml:space="preserve">, </w:t>
+      </w:r>
+      <w:r>
+        <w:rPr>
+          <w:rFonts w:ascii="Consolas" w:hAnsi="Consolas" w:cs="Consolas"/>
+          <w:sz w:val="18"/>
+          <w:shd w:val="clear" w:color="auto" w:fill="EEF4F2"/>
+        </w:rPr>
+        <w:t>readCorrectionDate</w:t>
+      </w:r>
+      <w:r>
+        <w:t xml:space="preserve"> en </w:t>
+      </w:r>
+      <w:r>
+        <w:rPr>
+          <w:rFonts w:ascii="Consolas" w:hAnsi="Consolas" w:cs="Consolas"/>
+          <w:sz w:val="18"/>
+          <w:shd w:val="clear" w:color="auto" w:fill="EEF4F2"/>
+        </w:rPr>
+        <w:t>confirmOldMonthAddition</w:t>
+      </w:r>
+      <w:r>
+        <w:t xml:space="preserve">: het datumveld bij de correctie </w:t>
+      </w:r>
+      <w:r>
+        <w:rPr>
+          <w:rFonts w:ascii="Consolas" w:hAnsi="Consolas" w:cs="Consolas"/>
+          <w:sz w:val="18"/>
+          <w:shd w:val="clear" w:color="auto" w:fill="EEF4F2"/>
+        </w:rPr>
+        <w:t>+</w:t>
+      </w:r>
+      <w:r>
+        <w:t xml:space="preserve">. Na het inloggen staat het op vandaag; bij </w:t>
+      </w:r>
+      <w:r>
+        <w:rPr>
+          <w:rFonts w:ascii="Consolas" w:hAnsi="Consolas" w:cs="Consolas"/>
+          <w:sz w:val="18"/>
+          <w:shd w:val="clear" w:color="auto" w:fill="EEF4F2"/>
+        </w:rPr>
+        <w:t>+</w:t>
+      </w:r>
+      <w:r>
+        <w:t xml:space="preserve"> wordt de datum gecontroleerd (niet in de toekomst, niet vóór 2000) en volgt bij een eerdere maand een bevestigingsvraag.</w:t>
+      </w:r>
+    </w:p>
+    <w:p>
+      <w:pPr>
+        <w:pStyle w:val="Lijstalinea"/>
+        <w:numPr>
+          <w:ilvl w:val="0"/>
+          <w:numId w:val="3"/>
+        </w:numPr>
+        <w:spacing w:after="60"/>
+        <w:contextualSpacing w:val="0"/>
+      </w:pPr>
+      <w:r>
+        <w:rPr>
+          <w:rFonts w:ascii="Consolas" w:hAnsi="Consolas" w:cs="Consolas"/>
+          <w:sz w:val="18"/>
+          <w:shd w:val="clear" w:color="auto" w:fill="EEF4F2"/>
+        </w:rPr>
         <w:t>saveStockField</w:t>
       </w:r>
       <w:r>
@@ -16470,7 +16917,7 @@
         <w:keepNext/>
       </w:pPr>
       <w:bookmarkStart w:id="80" w:name="k45"/>
-      <w:bookmarkStart w:id="81" w:name="_Toc242687105"/>
+      <w:bookmarkStart w:id="81" w:name="_Toc242689019"/>
       <w:r>
         <w:rPr>
           <w:rFonts w:ascii="Consolas" w:hAnsi="Consolas" w:cs="Consolas"/>
@@ -16611,7 +17058,7 @@
         <w:keepNext/>
       </w:pPr>
       <w:bookmarkStart w:id="82" w:name="k46"/>
-      <w:bookmarkStart w:id="83" w:name="_Toc242687106"/>
+      <w:bookmarkStart w:id="83" w:name="_Toc242689020"/>
       <w:r>
         <w:rPr>
           <w:rFonts w:ascii="Consolas" w:hAnsi="Consolas" w:cs="Consolas"/>
@@ -16688,7 +17135,7 @@
         <w:keepNext/>
       </w:pPr>
       <w:bookmarkStart w:id="84" w:name="k47"/>
-      <w:bookmarkStart w:id="85" w:name="_Toc242687107"/>
+      <w:bookmarkStart w:id="85" w:name="_Toc242689021"/>
       <w:r>
         <w:rPr>
           <w:rFonts w:ascii="Consolas" w:hAnsi="Consolas" w:cs="Consolas"/>
@@ -16837,7 +17284,7 @@
         <w:keepNext/>
       </w:pPr>
       <w:bookmarkStart w:id="86" w:name="k48"/>
-      <w:bookmarkStart w:id="87" w:name="_Toc242687108"/>
+      <w:bookmarkStart w:id="87" w:name="_Toc242689022"/>
       <w:r>
         <w:rPr>
           <w:rFonts w:ascii="Consolas" w:hAnsi="Consolas" w:cs="Consolas"/>
@@ -16904,7 +17351,7 @@
         <w:keepNext/>
       </w:pPr>
       <w:bookmarkStart w:id="88" w:name="k49"/>
-      <w:bookmarkStart w:id="89" w:name="_Toc242687109"/>
+      <w:bookmarkStart w:id="89" w:name="_Toc242689023"/>
       <w:r>
         <w:rPr>
           <w:rFonts w:ascii="Consolas" w:hAnsi="Consolas" w:cs="Consolas"/>
@@ -17004,7 +17451,7 @@
         <w:keepNext/>
       </w:pPr>
       <w:bookmarkStart w:id="90" w:name="k50"/>
-      <w:bookmarkStart w:id="91" w:name="_Toc242687110"/>
+      <w:bookmarkStart w:id="91" w:name="_Toc242689024"/>
       <w:r>
         <w:rPr>
           <w:rFonts w:ascii="Consolas" w:hAnsi="Consolas" w:cs="Consolas"/>
@@ -17049,7 +17496,7 @@
         <w:keepNext/>
       </w:pPr>
       <w:bookmarkStart w:id="92" w:name="k51"/>
-      <w:bookmarkStart w:id="93" w:name="_Toc242687111"/>
+      <w:bookmarkStart w:id="93" w:name="_Toc242689025"/>
       <w:r>
         <w:t>OPSLAGFOUTEN EN TERUGDRAAIEN</w:t>
       </w:r>
@@ -17089,7 +17536,7 @@
         <w:keepNext/>
       </w:pPr>
       <w:bookmarkStart w:id="94" w:name="k52"/>
-      <w:bookmarkStart w:id="95" w:name="_Toc242687112"/>
+      <w:bookmarkStart w:id="95" w:name="_Toc242689026"/>
       <w:r>
         <w:t>ADMINFUNCTIES</w:t>
       </w:r>
@@ -17335,7 +17782,7 @@
         <w:keepNext/>
       </w:pPr>
       <w:bookmarkStart w:id="96" w:name="k53"/>
-      <w:bookmarkStart w:id="97" w:name="_Toc242687113"/>
+      <w:bookmarkStart w:id="97" w:name="_Toc242689027"/>
       <w:r>
         <w:t xml:space="preserve">CSV-EXPORT (CLASS </w:t>
       </w:r>
@@ -17743,7 +18190,7 @@
         <w:keepNext/>
       </w:pPr>
       <w:bookmarkStart w:id="98" w:name="k54"/>
-      <w:bookmarkStart w:id="99" w:name="_Toc242687114"/>
+      <w:bookmarkStart w:id="99" w:name="_Toc242689028"/>
       <w:r>
         <w:t>EVENT LISTENERS</w:t>
       </w:r>
@@ -18348,7 +18795,7 @@
         </w:numPr>
       </w:pPr>
       <w:bookmarkStart w:id="100" w:name="k55"/>
-      <w:bookmarkStart w:id="101" w:name="_Toc242687115"/>
+      <w:bookmarkStart w:id="101" w:name="_Toc242689029"/>
       <w:r>
         <w:t>DATAMODEL EN KOPPELINGEN.</w:t>
       </w:r>
@@ -18366,7 +18813,7 @@
         <w:keepNext/>
       </w:pPr>
       <w:bookmarkStart w:id="102" w:name="k56"/>
-      <w:bookmarkStart w:id="103" w:name="_Toc242687116"/>
+      <w:bookmarkStart w:id="103" w:name="_Toc242689030"/>
       <w:r>
         <w:t>BEDRIJVEN</w:t>
       </w:r>
@@ -18577,7 +19024,7 @@
         <w:keepNext/>
       </w:pPr>
       <w:bookmarkStart w:id="104" w:name="k57"/>
-      <w:bookmarkStart w:id="105" w:name="_Toc242687117"/>
+      <w:bookmarkStart w:id="105" w:name="_Toc242689031"/>
       <w:r>
         <w:t>CONSUMPTIEPUNTEN</w:t>
       </w:r>
@@ -18896,7 +19343,7 @@
         <w:keepNext/>
       </w:pPr>
       <w:bookmarkStart w:id="106" w:name="k58"/>
-      <w:bookmarkStart w:id="107" w:name="_Toc242687118"/>
+      <w:bookmarkStart w:id="107" w:name="_Toc242689032"/>
       <w:r>
         <w:t>MEDEWERKERS</w:t>
       </w:r>
@@ -19452,7 +19899,7 @@
         <w:keepNext/>
       </w:pPr>
       <w:bookmarkStart w:id="108" w:name="k59"/>
-      <w:bookmarkStart w:id="109" w:name="_Toc242687119"/>
+      <w:bookmarkStart w:id="109" w:name="_Toc242689033"/>
       <w:r>
         <w:t>REGISTRATIES</w:t>
       </w:r>
@@ -20018,7 +20465,7 @@
         </w:numPr>
       </w:pPr>
       <w:bookmarkStart w:id="110" w:name="k60"/>
-      <w:bookmarkStart w:id="111" w:name="_Toc242687120"/>
+      <w:bookmarkStart w:id="111" w:name="_Toc242689034"/>
       <w:r>
         <w:t>BELANGRIJKE DEMO-BEPERKINGEN.</w:t>
       </w:r>
@@ -20309,7 +20756,7 @@
         </w:numPr>
       </w:pPr>
       <w:bookmarkStart w:id="112" w:name="k61"/>
-      <w:bookmarkStart w:id="113" w:name="_Toc242687121"/>
+      <w:bookmarkStart w:id="113" w:name="_Toc242689035"/>
       <w:r>
         <w:t>CODE UITLEGGEN TIJDENS EEN PRESENTATIE.</w:t>
       </w:r>
@@ -20594,7 +21041,7 @@
         </w:numPr>
       </w:pPr>
       <w:bookmarkStart w:id="114" w:name="k62"/>
-      <w:bookmarkStart w:id="115" w:name="_Toc242687122"/>
+      <w:bookmarkStart w:id="115" w:name="_Toc242689036"/>
       <w:r>
         <w:t>MOGELIJKE VERVOLGSTAPPEN.</w:t>
       </w:r>

</xml_diff>

<commit_message>
Maak de grijze uitlegtekst (--muted) in het lichte thema iets donkerder zodat die de WCAG-contrastnorm haalt
</commit_message>
<xml_diff>
--- a/docs/DOCUMENTATIE.docx
+++ b/docs/DOCUMENTATIE.docx
@@ -82,8 +82,9 @@
           <w:numId w:val="0"/>
         </w:numPr>
       </w:pPr>
-      <w:bookmarkStart w:id="0" w:name="_Toc242690482"/>
-      <w:r>
+      <w:bookmarkStart w:id="0" w:name="_Toc242690781"/>
+      <w:r>
+        <w:lastRenderedPageBreak/>
         <w:t>INHOUDSOPGAVE.</w:t>
       </w:r>
       <w:bookmarkEnd w:id="0"/>
@@ -112,7 +113,7 @@
       <w:r>
         <w:fldChar w:fldCharType="separate"/>
       </w:r>
-      <w:hyperlink w:anchor="_Toc242690482" w:history="1">
+      <w:hyperlink w:anchor="_Toc242690781" w:history="1">
         <w:r>
           <w:rPr>
             <w:rStyle w:val="Hyperlink"/>
@@ -139,7 +140,7 @@
             <w:noProof/>
             <w:webHidden/>
           </w:rPr>
-          <w:instrText xml:space="preserve"> PAGEREF _Toc242690482 \h </w:instrText>
+          <w:instrText xml:space="preserve"> PAGEREF _Toc242690781 \h </w:instrText>
         </w:r>
         <w:r>
           <w:rPr>
@@ -186,7 +187,7 @@
           <w:lang w:eastAsia="nl-NL"/>
         </w:rPr>
       </w:pPr>
-      <w:hyperlink w:anchor="_Toc242690483" w:history="1">
+      <w:hyperlink w:anchor="_Toc242690782" w:history="1">
         <w:r>
           <w:rPr>
             <w:rStyle w:val="Hyperlink"/>
@@ -231,7 +232,7 @@
             <w:noProof/>
             <w:webHidden/>
           </w:rPr>
-          <w:instrText xml:space="preserve"> PAGEREF _Toc242690483 \h </w:instrText>
+          <w:instrText xml:space="preserve"> PAGEREF _Toc242690782 \h </w:instrText>
         </w:r>
         <w:r>
           <w:rPr>
@@ -278,7 +279,7 @@
           <w:lang w:eastAsia="nl-NL"/>
         </w:rPr>
       </w:pPr>
-      <w:hyperlink w:anchor="_Toc242690484" w:history="1">
+      <w:hyperlink w:anchor="_Toc242690783" w:history="1">
         <w:r>
           <w:rPr>
             <w:rStyle w:val="Hyperlink"/>
@@ -323,7 +324,7 @@
             <w:noProof/>
             <w:webHidden/>
           </w:rPr>
-          <w:instrText xml:space="preserve"> PAGEREF _Toc242690484 \h </w:instrText>
+          <w:instrText xml:space="preserve"> PAGEREF _Toc242690783 \h </w:instrText>
         </w:r>
         <w:r>
           <w:rPr>
@@ -370,7 +371,7 @@
           <w:lang w:eastAsia="nl-NL"/>
         </w:rPr>
       </w:pPr>
-      <w:hyperlink w:anchor="_Toc242690485" w:history="1">
+      <w:hyperlink w:anchor="_Toc242690784" w:history="1">
         <w:r>
           <w:rPr>
             <w:rStyle w:val="Hyperlink"/>
@@ -415,7 +416,7 @@
             <w:noProof/>
             <w:webHidden/>
           </w:rPr>
-          <w:instrText xml:space="preserve"> PAGEREF _Toc242690485 \h </w:instrText>
+          <w:instrText xml:space="preserve"> PAGEREF _Toc242690784 \h </w:instrText>
         </w:r>
         <w:r>
           <w:rPr>
@@ -462,7 +463,7 @@
           <w:lang w:eastAsia="nl-NL"/>
         </w:rPr>
       </w:pPr>
-      <w:hyperlink w:anchor="_Toc242690486" w:history="1">
+      <w:hyperlink w:anchor="_Toc242690785" w:history="1">
         <w:r>
           <w:rPr>
             <w:rStyle w:val="Hyperlink"/>
@@ -507,7 +508,7 @@
             <w:noProof/>
             <w:webHidden/>
           </w:rPr>
-          <w:instrText xml:space="preserve"> PAGEREF _Toc242690486 \h </w:instrText>
+          <w:instrText xml:space="preserve"> PAGEREF _Toc242690785 \h </w:instrText>
         </w:r>
         <w:r>
           <w:rPr>
@@ -554,7 +555,7 @@
           <w:lang w:eastAsia="nl-NL"/>
         </w:rPr>
       </w:pPr>
-      <w:hyperlink w:anchor="_Toc242690487" w:history="1">
+      <w:hyperlink w:anchor="_Toc242690786" w:history="1">
         <w:r>
           <w:rPr>
             <w:rStyle w:val="Hyperlink"/>
@@ -599,7 +600,7 @@
             <w:noProof/>
             <w:webHidden/>
           </w:rPr>
-          <w:instrText xml:space="preserve"> PAGEREF _Toc242690487 \h </w:instrText>
+          <w:instrText xml:space="preserve"> PAGEREF _Toc242690786 \h </w:instrText>
         </w:r>
         <w:r>
           <w:rPr>
@@ -646,7 +647,7 @@
           <w:lang w:eastAsia="nl-NL"/>
         </w:rPr>
       </w:pPr>
-      <w:hyperlink w:anchor="_Toc242690488" w:history="1">
+      <w:hyperlink w:anchor="_Toc242690787" w:history="1">
         <w:r>
           <w:rPr>
             <w:rStyle w:val="Hyperlink"/>
@@ -691,7 +692,7 @@
             <w:noProof/>
             <w:webHidden/>
           </w:rPr>
-          <w:instrText xml:space="preserve"> PAGEREF _Toc242690488 \h </w:instrText>
+          <w:instrText xml:space="preserve"> PAGEREF _Toc242690787 \h </w:instrText>
         </w:r>
         <w:r>
           <w:rPr>
@@ -738,7 +739,7 @@
           <w:lang w:eastAsia="nl-NL"/>
         </w:rPr>
       </w:pPr>
-      <w:hyperlink w:anchor="_Toc242690489" w:history="1">
+      <w:hyperlink w:anchor="_Toc242690788" w:history="1">
         <w:r>
           <w:rPr>
             <w:rStyle w:val="Hyperlink"/>
@@ -783,7 +784,7 @@
             <w:noProof/>
             <w:webHidden/>
           </w:rPr>
-          <w:instrText xml:space="preserve"> PAGEREF _Toc242690489 \h </w:instrText>
+          <w:instrText xml:space="preserve"> PAGEREF _Toc242690788 \h </w:instrText>
         </w:r>
         <w:r>
           <w:rPr>
@@ -830,7 +831,7 @@
           <w:lang w:eastAsia="nl-NL"/>
         </w:rPr>
       </w:pPr>
-      <w:hyperlink w:anchor="_Toc242690490" w:history="1">
+      <w:hyperlink w:anchor="_Toc242690789" w:history="1">
         <w:r>
           <w:rPr>
             <w:rStyle w:val="Hyperlink"/>
@@ -875,7 +876,7 @@
             <w:noProof/>
             <w:webHidden/>
           </w:rPr>
-          <w:instrText xml:space="preserve"> PAGEREF _Toc242690490 \h </w:instrText>
+          <w:instrText xml:space="preserve"> PAGEREF _Toc242690789 \h </w:instrText>
         </w:r>
         <w:r>
           <w:rPr>
@@ -922,7 +923,7 @@
           <w:lang w:eastAsia="nl-NL"/>
         </w:rPr>
       </w:pPr>
-      <w:hyperlink w:anchor="_Toc242690491" w:history="1">
+      <w:hyperlink w:anchor="_Toc242690790" w:history="1">
         <w:r>
           <w:rPr>
             <w:rStyle w:val="Hyperlink"/>
@@ -967,7 +968,7 @@
             <w:noProof/>
             <w:webHidden/>
           </w:rPr>
-          <w:instrText xml:space="preserve"> PAGEREF _Toc242690491 \h </w:instrText>
+          <w:instrText xml:space="preserve"> PAGEREF _Toc242690790 \h </w:instrText>
         </w:r>
         <w:r>
           <w:rPr>
@@ -1014,7 +1015,7 @@
           <w:lang w:eastAsia="nl-NL"/>
         </w:rPr>
       </w:pPr>
-      <w:hyperlink w:anchor="_Toc242690492" w:history="1">
+      <w:hyperlink w:anchor="_Toc242690791" w:history="1">
         <w:r>
           <w:rPr>
             <w:rStyle w:val="Hyperlink"/>
@@ -1059,7 +1060,7 @@
             <w:noProof/>
             <w:webHidden/>
           </w:rPr>
-          <w:instrText xml:space="preserve"> PAGEREF _Toc242690492 \h </w:instrText>
+          <w:instrText xml:space="preserve"> PAGEREF _Toc242690791 \h </w:instrText>
         </w:r>
         <w:r>
           <w:rPr>
@@ -1106,7 +1107,7 @@
           <w:lang w:eastAsia="nl-NL"/>
         </w:rPr>
       </w:pPr>
-      <w:hyperlink w:anchor="_Toc242690493" w:history="1">
+      <w:hyperlink w:anchor="_Toc242690792" w:history="1">
         <w:r>
           <w:rPr>
             <w:rStyle w:val="Hyperlink"/>
@@ -1151,7 +1152,7 @@
             <w:noProof/>
             <w:webHidden/>
           </w:rPr>
-          <w:instrText xml:space="preserve"> PAGEREF _Toc242690493 \h </w:instrText>
+          <w:instrText xml:space="preserve"> PAGEREF _Toc242690792 \h </w:instrText>
         </w:r>
         <w:r>
           <w:rPr>
@@ -1198,7 +1199,7 @@
           <w:lang w:eastAsia="nl-NL"/>
         </w:rPr>
       </w:pPr>
-      <w:hyperlink w:anchor="_Toc242690494" w:history="1">
+      <w:hyperlink w:anchor="_Toc242690793" w:history="1">
         <w:r>
           <w:rPr>
             <w:rStyle w:val="Hyperlink"/>
@@ -1243,7 +1244,7 @@
             <w:noProof/>
             <w:webHidden/>
           </w:rPr>
-          <w:instrText xml:space="preserve"> PAGEREF _Toc242690494 \h </w:instrText>
+          <w:instrText xml:space="preserve"> PAGEREF _Toc242690793 \h </w:instrText>
         </w:r>
         <w:r>
           <w:rPr>
@@ -1290,7 +1291,7 @@
           <w:lang w:eastAsia="nl-NL"/>
         </w:rPr>
       </w:pPr>
-      <w:hyperlink w:anchor="_Toc242690495" w:history="1">
+      <w:hyperlink w:anchor="_Toc242690794" w:history="1">
         <w:r>
           <w:rPr>
             <w:rStyle w:val="Hyperlink"/>
@@ -1335,7 +1336,7 @@
             <w:noProof/>
             <w:webHidden/>
           </w:rPr>
-          <w:instrText xml:space="preserve"> PAGEREF _Toc242690495 \h </w:instrText>
+          <w:instrText xml:space="preserve"> PAGEREF _Toc242690794 \h </w:instrText>
         </w:r>
         <w:r>
           <w:rPr>
@@ -1382,7 +1383,7 @@
           <w:lang w:eastAsia="nl-NL"/>
         </w:rPr>
       </w:pPr>
-      <w:hyperlink w:anchor="_Toc242690496" w:history="1">
+      <w:hyperlink w:anchor="_Toc242690795" w:history="1">
         <w:r>
           <w:rPr>
             <w:rStyle w:val="Hyperlink"/>
@@ -1427,7 +1428,7 @@
             <w:noProof/>
             <w:webHidden/>
           </w:rPr>
-          <w:instrText xml:space="preserve"> PAGEREF _Toc242690496 \h </w:instrText>
+          <w:instrText xml:space="preserve"> PAGEREF _Toc242690795 \h </w:instrText>
         </w:r>
         <w:r>
           <w:rPr>
@@ -1474,7 +1475,7 @@
           <w:lang w:eastAsia="nl-NL"/>
         </w:rPr>
       </w:pPr>
-      <w:hyperlink w:anchor="_Toc242690497" w:history="1">
+      <w:hyperlink w:anchor="_Toc242690796" w:history="1">
         <w:r>
           <w:rPr>
             <w:rStyle w:val="Hyperlink"/>
@@ -1519,7 +1520,7 @@
             <w:noProof/>
             <w:webHidden/>
           </w:rPr>
-          <w:instrText xml:space="preserve"> PAGEREF _Toc242690497 \h </w:instrText>
+          <w:instrText xml:space="preserve"> PAGEREF _Toc242690796 \h </w:instrText>
         </w:r>
         <w:r>
           <w:rPr>
@@ -1566,7 +1567,7 @@
           <w:lang w:eastAsia="nl-NL"/>
         </w:rPr>
       </w:pPr>
-      <w:hyperlink w:anchor="_Toc242690498" w:history="1">
+      <w:hyperlink w:anchor="_Toc242690797" w:history="1">
         <w:r>
           <w:rPr>
             <w:rStyle w:val="Hyperlink"/>
@@ -1611,7 +1612,7 @@
             <w:noProof/>
             <w:webHidden/>
           </w:rPr>
-          <w:instrText xml:space="preserve"> PAGEREF _Toc242690498 \h </w:instrText>
+          <w:instrText xml:space="preserve"> PAGEREF _Toc242690797 \h </w:instrText>
         </w:r>
         <w:r>
           <w:rPr>
@@ -1658,7 +1659,7 @@
           <w:lang w:eastAsia="nl-NL"/>
         </w:rPr>
       </w:pPr>
-      <w:hyperlink w:anchor="_Toc242690499" w:history="1">
+      <w:hyperlink w:anchor="_Toc242690798" w:history="1">
         <w:r>
           <w:rPr>
             <w:rStyle w:val="Hyperlink"/>
@@ -1703,7 +1704,7 @@
             <w:noProof/>
             <w:webHidden/>
           </w:rPr>
-          <w:instrText xml:space="preserve"> PAGEREF _Toc242690499 \h </w:instrText>
+          <w:instrText xml:space="preserve"> PAGEREF _Toc242690798 \h </w:instrText>
         </w:r>
         <w:r>
           <w:rPr>
@@ -1750,7 +1751,7 @@
           <w:lang w:eastAsia="nl-NL"/>
         </w:rPr>
       </w:pPr>
-      <w:hyperlink w:anchor="_Toc242690500" w:history="1">
+      <w:hyperlink w:anchor="_Toc242690799" w:history="1">
         <w:r>
           <w:rPr>
             <w:rStyle w:val="Hyperlink"/>
@@ -1795,7 +1796,7 @@
             <w:noProof/>
             <w:webHidden/>
           </w:rPr>
-          <w:instrText xml:space="preserve"> PAGEREF _Toc242690500 \h </w:instrText>
+          <w:instrText xml:space="preserve"> PAGEREF _Toc242690799 \h </w:instrText>
         </w:r>
         <w:r>
           <w:rPr>
@@ -1842,7 +1843,7 @@
           <w:lang w:eastAsia="nl-NL"/>
         </w:rPr>
       </w:pPr>
-      <w:hyperlink w:anchor="_Toc242690501" w:history="1">
+      <w:hyperlink w:anchor="_Toc242690800" w:history="1">
         <w:r>
           <w:rPr>
             <w:rStyle w:val="Hyperlink"/>
@@ -1887,7 +1888,7 @@
             <w:noProof/>
             <w:webHidden/>
           </w:rPr>
-          <w:instrText xml:space="preserve"> PAGEREF _Toc242690501 \h </w:instrText>
+          <w:instrText xml:space="preserve"> PAGEREF _Toc242690800 \h </w:instrText>
         </w:r>
         <w:r>
           <w:rPr>
@@ -1934,7 +1935,7 @@
           <w:lang w:eastAsia="nl-NL"/>
         </w:rPr>
       </w:pPr>
-      <w:hyperlink w:anchor="_Toc242690502" w:history="1">
+      <w:hyperlink w:anchor="_Toc242690801" w:history="1">
         <w:r>
           <w:rPr>
             <w:rStyle w:val="Hyperlink"/>
@@ -1979,7 +1980,7 @@
             <w:noProof/>
             <w:webHidden/>
           </w:rPr>
-          <w:instrText xml:space="preserve"> PAGEREF _Toc242690502 \h </w:instrText>
+          <w:instrText xml:space="preserve"> PAGEREF _Toc242690801 \h </w:instrText>
         </w:r>
         <w:r>
           <w:rPr>
@@ -2026,7 +2027,7 @@
           <w:lang w:eastAsia="nl-NL"/>
         </w:rPr>
       </w:pPr>
-      <w:hyperlink w:anchor="_Toc242690503" w:history="1">
+      <w:hyperlink w:anchor="_Toc242690802" w:history="1">
         <w:r>
           <w:rPr>
             <w:rStyle w:val="Hyperlink"/>
@@ -2087,7 +2088,7 @@
             <w:noProof/>
             <w:webHidden/>
           </w:rPr>
-          <w:instrText xml:space="preserve"> PAGEREF _Toc242690503 \h </w:instrText>
+          <w:instrText xml:space="preserve"> PAGEREF _Toc242690802 \h </w:instrText>
         </w:r>
         <w:r>
           <w:rPr>
@@ -2134,7 +2135,7 @@
           <w:lang w:eastAsia="nl-NL"/>
         </w:rPr>
       </w:pPr>
-      <w:hyperlink w:anchor="_Toc242690504" w:history="1">
+      <w:hyperlink w:anchor="_Toc242690803" w:history="1">
         <w:r>
           <w:rPr>
             <w:rStyle w:val="Hyperlink"/>
@@ -2179,7 +2180,7 @@
             <w:noProof/>
             <w:webHidden/>
           </w:rPr>
-          <w:instrText xml:space="preserve"> PAGEREF _Toc242690504 \h </w:instrText>
+          <w:instrText xml:space="preserve"> PAGEREF _Toc242690803 \h </w:instrText>
         </w:r>
         <w:r>
           <w:rPr>
@@ -2226,7 +2227,7 @@
           <w:lang w:eastAsia="nl-NL"/>
         </w:rPr>
       </w:pPr>
-      <w:hyperlink w:anchor="_Toc242690505" w:history="1">
+      <w:hyperlink w:anchor="_Toc242690804" w:history="1">
         <w:r>
           <w:rPr>
             <w:rStyle w:val="Hyperlink"/>
@@ -2271,7 +2272,7 @@
             <w:noProof/>
             <w:webHidden/>
           </w:rPr>
-          <w:instrText xml:space="preserve"> PAGEREF _Toc242690505 \h </w:instrText>
+          <w:instrText xml:space="preserve"> PAGEREF _Toc242690804 \h </w:instrText>
         </w:r>
         <w:r>
           <w:rPr>
@@ -2318,7 +2319,7 @@
           <w:lang w:eastAsia="nl-NL"/>
         </w:rPr>
       </w:pPr>
-      <w:hyperlink w:anchor="_Toc242690506" w:history="1">
+      <w:hyperlink w:anchor="_Toc242690805" w:history="1">
         <w:r>
           <w:rPr>
             <w:rStyle w:val="Hyperlink"/>
@@ -2363,7 +2364,7 @@
             <w:noProof/>
             <w:webHidden/>
           </w:rPr>
-          <w:instrText xml:space="preserve"> PAGEREF _Toc242690506 \h </w:instrText>
+          <w:instrText xml:space="preserve"> PAGEREF _Toc242690805 \h </w:instrText>
         </w:r>
         <w:r>
           <w:rPr>
@@ -2410,7 +2411,7 @@
           <w:lang w:eastAsia="nl-NL"/>
         </w:rPr>
       </w:pPr>
-      <w:hyperlink w:anchor="_Toc242690507" w:history="1">
+      <w:hyperlink w:anchor="_Toc242690806" w:history="1">
         <w:r>
           <w:rPr>
             <w:rStyle w:val="Hyperlink"/>
@@ -2455,7 +2456,7 @@
             <w:noProof/>
             <w:webHidden/>
           </w:rPr>
-          <w:instrText xml:space="preserve"> PAGEREF _Toc242690507 \h </w:instrText>
+          <w:instrText xml:space="preserve"> PAGEREF _Toc242690806 \h </w:instrText>
         </w:r>
         <w:r>
           <w:rPr>
@@ -2502,7 +2503,7 @@
           <w:lang w:eastAsia="nl-NL"/>
         </w:rPr>
       </w:pPr>
-      <w:hyperlink w:anchor="_Toc242690508" w:history="1">
+      <w:hyperlink w:anchor="_Toc242690807" w:history="1">
         <w:r>
           <w:rPr>
             <w:rStyle w:val="Hyperlink"/>
@@ -2547,7 +2548,7 @@
             <w:noProof/>
             <w:webHidden/>
           </w:rPr>
-          <w:instrText xml:space="preserve"> PAGEREF _Toc242690508 \h </w:instrText>
+          <w:instrText xml:space="preserve"> PAGEREF _Toc242690807 \h </w:instrText>
         </w:r>
         <w:r>
           <w:rPr>
@@ -2594,7 +2595,7 @@
           <w:lang w:eastAsia="nl-NL"/>
         </w:rPr>
       </w:pPr>
-      <w:hyperlink w:anchor="_Toc242690509" w:history="1">
+      <w:hyperlink w:anchor="_Toc242690808" w:history="1">
         <w:r>
           <w:rPr>
             <w:rStyle w:val="Hyperlink"/>
@@ -2639,7 +2640,7 @@
             <w:noProof/>
             <w:webHidden/>
           </w:rPr>
-          <w:instrText xml:space="preserve"> PAGEREF _Toc242690509 \h </w:instrText>
+          <w:instrText xml:space="preserve"> PAGEREF _Toc242690808 \h </w:instrText>
         </w:r>
         <w:r>
           <w:rPr>
@@ -2686,7 +2687,7 @@
           <w:lang w:eastAsia="nl-NL"/>
         </w:rPr>
       </w:pPr>
-      <w:hyperlink w:anchor="_Toc242690510" w:history="1">
+      <w:hyperlink w:anchor="_Toc242690809" w:history="1">
         <w:r>
           <w:rPr>
             <w:rStyle w:val="Hyperlink"/>
@@ -2731,7 +2732,7 @@
             <w:noProof/>
             <w:webHidden/>
           </w:rPr>
-          <w:instrText xml:space="preserve"> PAGEREF _Toc242690510 \h </w:instrText>
+          <w:instrText xml:space="preserve"> PAGEREF _Toc242690809 \h </w:instrText>
         </w:r>
         <w:r>
           <w:rPr>
@@ -2778,7 +2779,7 @@
           <w:lang w:eastAsia="nl-NL"/>
         </w:rPr>
       </w:pPr>
-      <w:hyperlink w:anchor="_Toc242690511" w:history="1">
+      <w:hyperlink w:anchor="_Toc242690810" w:history="1">
         <w:r>
           <w:rPr>
             <w:rStyle w:val="Hyperlink"/>
@@ -2839,7 +2840,7 @@
             <w:noProof/>
             <w:webHidden/>
           </w:rPr>
-          <w:instrText xml:space="preserve"> PAGEREF _Toc242690511 \h </w:instrText>
+          <w:instrText xml:space="preserve"> PAGEREF _Toc242690810 \h </w:instrText>
         </w:r>
         <w:r>
           <w:rPr>
@@ -2886,7 +2887,7 @@
           <w:lang w:eastAsia="nl-NL"/>
         </w:rPr>
       </w:pPr>
-      <w:hyperlink w:anchor="_Toc242690512" w:history="1">
+      <w:hyperlink w:anchor="_Toc242690811" w:history="1">
         <w:r>
           <w:rPr>
             <w:rStyle w:val="Hyperlink"/>
@@ -2931,7 +2932,7 @@
             <w:noProof/>
             <w:webHidden/>
           </w:rPr>
-          <w:instrText xml:space="preserve"> PAGEREF _Toc242690512 \h </w:instrText>
+          <w:instrText xml:space="preserve"> PAGEREF _Toc242690811 \h </w:instrText>
         </w:r>
         <w:r>
           <w:rPr>
@@ -2978,7 +2979,7 @@
           <w:lang w:eastAsia="nl-NL"/>
         </w:rPr>
       </w:pPr>
-      <w:hyperlink w:anchor="_Toc242690513" w:history="1">
+      <w:hyperlink w:anchor="_Toc242690812" w:history="1">
         <w:r>
           <w:rPr>
             <w:rStyle w:val="Hyperlink"/>
@@ -3023,7 +3024,7 @@
             <w:noProof/>
             <w:webHidden/>
           </w:rPr>
-          <w:instrText xml:space="preserve"> PAGEREF _Toc242690513 \h </w:instrText>
+          <w:instrText xml:space="preserve"> PAGEREF _Toc242690812 \h </w:instrText>
         </w:r>
         <w:r>
           <w:rPr>
@@ -3070,7 +3071,7 @@
           <w:lang w:eastAsia="nl-NL"/>
         </w:rPr>
       </w:pPr>
-      <w:hyperlink w:anchor="_Toc242690514" w:history="1">
+      <w:hyperlink w:anchor="_Toc242690813" w:history="1">
         <w:r>
           <w:rPr>
             <w:rStyle w:val="Hyperlink"/>
@@ -3115,7 +3116,7 @@
             <w:noProof/>
             <w:webHidden/>
           </w:rPr>
-          <w:instrText xml:space="preserve"> PAGEREF _Toc242690514 \h </w:instrText>
+          <w:instrText xml:space="preserve"> PAGEREF _Toc242690813 \h </w:instrText>
         </w:r>
         <w:r>
           <w:rPr>
@@ -3162,7 +3163,7 @@
           <w:lang w:eastAsia="nl-NL"/>
         </w:rPr>
       </w:pPr>
-      <w:hyperlink w:anchor="_Toc242690515" w:history="1">
+      <w:hyperlink w:anchor="_Toc242690814" w:history="1">
         <w:r>
           <w:rPr>
             <w:rStyle w:val="Hyperlink"/>
@@ -3223,7 +3224,7 @@
             <w:noProof/>
             <w:webHidden/>
           </w:rPr>
-          <w:instrText xml:space="preserve"> PAGEREF _Toc242690515 \h </w:instrText>
+          <w:instrText xml:space="preserve"> PAGEREF _Toc242690814 \h </w:instrText>
         </w:r>
         <w:r>
           <w:rPr>
@@ -3270,7 +3271,7 @@
           <w:lang w:eastAsia="nl-NL"/>
         </w:rPr>
       </w:pPr>
-      <w:hyperlink w:anchor="_Toc242690516" w:history="1">
+      <w:hyperlink w:anchor="_Toc242690815" w:history="1">
         <w:r>
           <w:rPr>
             <w:rStyle w:val="Hyperlink"/>
@@ -3315,7 +3316,7 @@
             <w:noProof/>
             <w:webHidden/>
           </w:rPr>
-          <w:instrText xml:space="preserve"> PAGEREF _Toc242690516 \h </w:instrText>
+          <w:instrText xml:space="preserve"> PAGEREF _Toc242690815 \h </w:instrText>
         </w:r>
         <w:r>
           <w:rPr>
@@ -3362,7 +3363,7 @@
           <w:lang w:eastAsia="nl-NL"/>
         </w:rPr>
       </w:pPr>
-      <w:hyperlink w:anchor="_Toc242690517" w:history="1">
+      <w:hyperlink w:anchor="_Toc242690816" w:history="1">
         <w:r>
           <w:rPr>
             <w:rStyle w:val="Hyperlink"/>
@@ -3407,7 +3408,7 @@
             <w:noProof/>
             <w:webHidden/>
           </w:rPr>
-          <w:instrText xml:space="preserve"> PAGEREF _Toc242690517 \h </w:instrText>
+          <w:instrText xml:space="preserve"> PAGEREF _Toc242690816 \h </w:instrText>
         </w:r>
         <w:r>
           <w:rPr>
@@ -3454,7 +3455,7 @@
           <w:lang w:eastAsia="nl-NL"/>
         </w:rPr>
       </w:pPr>
-      <w:hyperlink w:anchor="_Toc242690518" w:history="1">
+      <w:hyperlink w:anchor="_Toc242690817" w:history="1">
         <w:r>
           <w:rPr>
             <w:rStyle w:val="Hyperlink"/>
@@ -3501,7 +3502,7 @@
             <w:noProof/>
             <w:webHidden/>
           </w:rPr>
-          <w:instrText xml:space="preserve"> PAGEREF _Toc242690518 \h </w:instrText>
+          <w:instrText xml:space="preserve"> PAGEREF _Toc242690817 \h </w:instrText>
         </w:r>
         <w:r>
           <w:rPr>
@@ -3548,7 +3549,7 @@
           <w:lang w:eastAsia="nl-NL"/>
         </w:rPr>
       </w:pPr>
-      <w:hyperlink w:anchor="_Toc242690519" w:history="1">
+      <w:hyperlink w:anchor="_Toc242690818" w:history="1">
         <w:r>
           <w:rPr>
             <w:rStyle w:val="Hyperlink"/>
@@ -3595,7 +3596,7 @@
             <w:noProof/>
             <w:webHidden/>
           </w:rPr>
-          <w:instrText xml:space="preserve"> PAGEREF _Toc242690519 \h </w:instrText>
+          <w:instrText xml:space="preserve"> PAGEREF _Toc242690818 \h </w:instrText>
         </w:r>
         <w:r>
           <w:rPr>
@@ -3642,7 +3643,7 @@
           <w:lang w:eastAsia="nl-NL"/>
         </w:rPr>
       </w:pPr>
-      <w:hyperlink w:anchor="_Toc242690520" w:history="1">
+      <w:hyperlink w:anchor="_Toc242690819" w:history="1">
         <w:r>
           <w:rPr>
             <w:rStyle w:val="Hyperlink"/>
@@ -3689,7 +3690,7 @@
             <w:noProof/>
             <w:webHidden/>
           </w:rPr>
-          <w:instrText xml:space="preserve"> PAGEREF _Toc242690520 \h </w:instrText>
+          <w:instrText xml:space="preserve"> PAGEREF _Toc242690819 \h </w:instrText>
         </w:r>
         <w:r>
           <w:rPr>
@@ -3736,7 +3737,7 @@
           <w:lang w:eastAsia="nl-NL"/>
         </w:rPr>
       </w:pPr>
-      <w:hyperlink w:anchor="_Toc242690521" w:history="1">
+      <w:hyperlink w:anchor="_Toc242690820" w:history="1">
         <w:r>
           <w:rPr>
             <w:rStyle w:val="Hyperlink"/>
@@ -3783,7 +3784,7 @@
             <w:noProof/>
             <w:webHidden/>
           </w:rPr>
-          <w:instrText xml:space="preserve"> PAGEREF _Toc242690521 \h </w:instrText>
+          <w:instrText xml:space="preserve"> PAGEREF _Toc242690820 \h </w:instrText>
         </w:r>
         <w:r>
           <w:rPr>
@@ -3830,7 +3831,7 @@
           <w:lang w:eastAsia="nl-NL"/>
         </w:rPr>
       </w:pPr>
-      <w:hyperlink w:anchor="_Toc242690522" w:history="1">
+      <w:hyperlink w:anchor="_Toc242690821" w:history="1">
         <w:r>
           <w:rPr>
             <w:rStyle w:val="Hyperlink"/>
@@ -3877,7 +3878,7 @@
             <w:noProof/>
             <w:webHidden/>
           </w:rPr>
-          <w:instrText xml:space="preserve"> PAGEREF _Toc242690522 \h </w:instrText>
+          <w:instrText xml:space="preserve"> PAGEREF _Toc242690821 \h </w:instrText>
         </w:r>
         <w:r>
           <w:rPr>
@@ -3924,7 +3925,7 @@
           <w:lang w:eastAsia="nl-NL"/>
         </w:rPr>
       </w:pPr>
-      <w:hyperlink w:anchor="_Toc242690523" w:history="1">
+      <w:hyperlink w:anchor="_Toc242690822" w:history="1">
         <w:r>
           <w:rPr>
             <w:rStyle w:val="Hyperlink"/>
@@ -3971,7 +3972,7 @@
             <w:noProof/>
             <w:webHidden/>
           </w:rPr>
-          <w:instrText xml:space="preserve"> PAGEREF _Toc242690523 \h </w:instrText>
+          <w:instrText xml:space="preserve"> PAGEREF _Toc242690822 \h </w:instrText>
         </w:r>
         <w:r>
           <w:rPr>
@@ -4018,7 +4019,7 @@
           <w:lang w:eastAsia="nl-NL"/>
         </w:rPr>
       </w:pPr>
-      <w:hyperlink w:anchor="_Toc242690524" w:history="1">
+      <w:hyperlink w:anchor="_Toc242690823" w:history="1">
         <w:r>
           <w:rPr>
             <w:rStyle w:val="Hyperlink"/>
@@ -4063,7 +4064,7 @@
             <w:noProof/>
             <w:webHidden/>
           </w:rPr>
-          <w:instrText xml:space="preserve"> PAGEREF _Toc242690524 \h </w:instrText>
+          <w:instrText xml:space="preserve"> PAGEREF _Toc242690823 \h </w:instrText>
         </w:r>
         <w:r>
           <w:rPr>
@@ -4110,7 +4111,7 @@
           <w:lang w:eastAsia="nl-NL"/>
         </w:rPr>
       </w:pPr>
-      <w:hyperlink w:anchor="_Toc242690525" w:history="1">
+      <w:hyperlink w:anchor="_Toc242690824" w:history="1">
         <w:r>
           <w:rPr>
             <w:rStyle w:val="Hyperlink"/>
@@ -4155,7 +4156,7 @@
             <w:noProof/>
             <w:webHidden/>
           </w:rPr>
-          <w:instrText xml:space="preserve"> PAGEREF _Toc242690525 \h </w:instrText>
+          <w:instrText xml:space="preserve"> PAGEREF _Toc242690824 \h </w:instrText>
         </w:r>
         <w:r>
           <w:rPr>
@@ -4202,7 +4203,7 @@
           <w:lang w:eastAsia="nl-NL"/>
         </w:rPr>
       </w:pPr>
-      <w:hyperlink w:anchor="_Toc242690526" w:history="1">
+      <w:hyperlink w:anchor="_Toc242690825" w:history="1">
         <w:r>
           <w:rPr>
             <w:rStyle w:val="Hyperlink"/>
@@ -4279,7 +4280,7 @@
             <w:noProof/>
             <w:webHidden/>
           </w:rPr>
-          <w:instrText xml:space="preserve"> PAGEREF _Toc242690526 \h </w:instrText>
+          <w:instrText xml:space="preserve"> PAGEREF _Toc242690825 \h </w:instrText>
         </w:r>
         <w:r>
           <w:rPr>
@@ -4326,7 +4327,7 @@
           <w:lang w:eastAsia="nl-NL"/>
         </w:rPr>
       </w:pPr>
-      <w:hyperlink w:anchor="_Toc242690527" w:history="1">
+      <w:hyperlink w:anchor="_Toc242690826" w:history="1">
         <w:r>
           <w:rPr>
             <w:rStyle w:val="Hyperlink"/>
@@ -4371,7 +4372,7 @@
             <w:noProof/>
             <w:webHidden/>
           </w:rPr>
-          <w:instrText xml:space="preserve"> PAGEREF _Toc242690527 \h </w:instrText>
+          <w:instrText xml:space="preserve"> PAGEREF _Toc242690826 \h </w:instrText>
         </w:r>
         <w:r>
           <w:rPr>
@@ -4418,7 +4419,7 @@
           <w:lang w:eastAsia="nl-NL"/>
         </w:rPr>
       </w:pPr>
-      <w:hyperlink w:anchor="_Toc242690528" w:history="1">
+      <w:hyperlink w:anchor="_Toc242690827" w:history="1">
         <w:r>
           <w:rPr>
             <w:rStyle w:val="Hyperlink"/>
@@ -4463,7 +4464,7 @@
             <w:noProof/>
             <w:webHidden/>
           </w:rPr>
-          <w:instrText xml:space="preserve"> PAGEREF _Toc242690528 \h </w:instrText>
+          <w:instrText xml:space="preserve"> PAGEREF _Toc242690827 \h </w:instrText>
         </w:r>
         <w:r>
           <w:rPr>
@@ -4510,7 +4511,7 @@
           <w:lang w:eastAsia="nl-NL"/>
         </w:rPr>
       </w:pPr>
-      <w:hyperlink w:anchor="_Toc242690529" w:history="1">
+      <w:hyperlink w:anchor="_Toc242690828" w:history="1">
         <w:r>
           <w:rPr>
             <w:rStyle w:val="Hyperlink"/>
@@ -4555,7 +4556,7 @@
             <w:noProof/>
             <w:webHidden/>
           </w:rPr>
-          <w:instrText xml:space="preserve"> PAGEREF _Toc242690529 \h </w:instrText>
+          <w:instrText xml:space="preserve"> PAGEREF _Toc242690828 \h </w:instrText>
         </w:r>
         <w:r>
           <w:rPr>
@@ -4602,7 +4603,7 @@
           <w:lang w:eastAsia="nl-NL"/>
         </w:rPr>
       </w:pPr>
-      <w:hyperlink w:anchor="_Toc242690530" w:history="1">
+      <w:hyperlink w:anchor="_Toc242690829" w:history="1">
         <w:r>
           <w:rPr>
             <w:rStyle w:val="Hyperlink"/>
@@ -4647,7 +4648,7 @@
             <w:noProof/>
             <w:webHidden/>
           </w:rPr>
-          <w:instrText xml:space="preserve"> PAGEREF _Toc242690530 \h </w:instrText>
+          <w:instrText xml:space="preserve"> PAGEREF _Toc242690829 \h </w:instrText>
         </w:r>
         <w:r>
           <w:rPr>
@@ -4694,7 +4695,7 @@
           <w:lang w:eastAsia="nl-NL"/>
         </w:rPr>
       </w:pPr>
-      <w:hyperlink w:anchor="_Toc242690531" w:history="1">
+      <w:hyperlink w:anchor="_Toc242690830" w:history="1">
         <w:r>
           <w:rPr>
             <w:rStyle w:val="Hyperlink"/>
@@ -4739,7 +4740,7 @@
             <w:noProof/>
             <w:webHidden/>
           </w:rPr>
-          <w:instrText xml:space="preserve"> PAGEREF _Toc242690531 \h </w:instrText>
+          <w:instrText xml:space="preserve"> PAGEREF _Toc242690830 \h </w:instrText>
         </w:r>
         <w:r>
           <w:rPr>
@@ -4786,7 +4787,7 @@
           <w:lang w:eastAsia="nl-NL"/>
         </w:rPr>
       </w:pPr>
-      <w:hyperlink w:anchor="_Toc242690532" w:history="1">
+      <w:hyperlink w:anchor="_Toc242690831" w:history="1">
         <w:r>
           <w:rPr>
             <w:rStyle w:val="Hyperlink"/>
@@ -4831,7 +4832,7 @@
             <w:noProof/>
             <w:webHidden/>
           </w:rPr>
-          <w:instrText xml:space="preserve"> PAGEREF _Toc242690532 \h </w:instrText>
+          <w:instrText xml:space="preserve"> PAGEREF _Toc242690831 \h </w:instrText>
         </w:r>
         <w:r>
           <w:rPr>
@@ -4878,7 +4879,7 @@
           <w:lang w:eastAsia="nl-NL"/>
         </w:rPr>
       </w:pPr>
-      <w:hyperlink w:anchor="_Toc242690533" w:history="1">
+      <w:hyperlink w:anchor="_Toc242690832" w:history="1">
         <w:r>
           <w:rPr>
             <w:rStyle w:val="Hyperlink"/>
@@ -4923,7 +4924,7 @@
             <w:noProof/>
             <w:webHidden/>
           </w:rPr>
-          <w:instrText xml:space="preserve"> PAGEREF _Toc242690533 \h </w:instrText>
+          <w:instrText xml:space="preserve"> PAGEREF _Toc242690832 \h </w:instrText>
         </w:r>
         <w:r>
           <w:rPr>
@@ -4970,7 +4971,7 @@
           <w:lang w:eastAsia="nl-NL"/>
         </w:rPr>
       </w:pPr>
-      <w:hyperlink w:anchor="_Toc242690534" w:history="1">
+      <w:hyperlink w:anchor="_Toc242690833" w:history="1">
         <w:r>
           <w:rPr>
             <w:rStyle w:val="Hyperlink"/>
@@ -5015,7 +5016,7 @@
             <w:noProof/>
             <w:webHidden/>
           </w:rPr>
-          <w:instrText xml:space="preserve"> PAGEREF _Toc242690534 \h </w:instrText>
+          <w:instrText xml:space="preserve"> PAGEREF _Toc242690833 \h </w:instrText>
         </w:r>
         <w:r>
           <w:rPr>
@@ -5062,7 +5063,7 @@
           <w:lang w:eastAsia="nl-NL"/>
         </w:rPr>
       </w:pPr>
-      <w:hyperlink w:anchor="_Toc242690535" w:history="1">
+      <w:hyperlink w:anchor="_Toc242690834" w:history="1">
         <w:r>
           <w:rPr>
             <w:rStyle w:val="Hyperlink"/>
@@ -5107,7 +5108,7 @@
             <w:noProof/>
             <w:webHidden/>
           </w:rPr>
-          <w:instrText xml:space="preserve"> PAGEREF _Toc242690535 \h </w:instrText>
+          <w:instrText xml:space="preserve"> PAGEREF _Toc242690834 \h </w:instrText>
         </w:r>
         <w:r>
           <w:rPr>
@@ -5160,7 +5161,7 @@
         </w:numPr>
       </w:pPr>
       <w:bookmarkStart w:id="1" w:name="k1"/>
-      <w:bookmarkStart w:id="2" w:name="_Toc242690483"/>
+      <w:bookmarkStart w:id="2" w:name="_Toc242690782"/>
       <w:r>
         <w:t>DOEL VAN DE APPLICATIE.</w:t>
       </w:r>
@@ -5242,7 +5243,7 @@
         </w:numPr>
       </w:pPr>
       <w:bookmarkStart w:id="3" w:name="k2"/>
-      <w:bookmarkStart w:id="4" w:name="_Toc242690484"/>
+      <w:bookmarkStart w:id="4" w:name="_Toc242690783"/>
       <w:r>
         <w:t>BESTANDEN.</w:t>
       </w:r>
@@ -7962,7 +7963,7 @@
         </w:numPr>
       </w:pPr>
       <w:bookmarkStart w:id="5" w:name="k3"/>
-      <w:bookmarkStart w:id="6" w:name="_Toc242690485"/>
+      <w:bookmarkStart w:id="6" w:name="_Toc242690784"/>
       <w:r>
         <w:t>DE WEBSITE STARTEN.</w:t>
       </w:r>
@@ -8184,7 +8185,7 @@
         </w:numPr>
       </w:pPr>
       <w:bookmarkStart w:id="7" w:name="k4"/>
-      <w:bookmarkStart w:id="8" w:name="_Toc242690486"/>
+      <w:bookmarkStart w:id="8" w:name="_Toc242690785"/>
       <w:r>
         <w:t>GEBRUIKERSHANDLEIDING.</w:t>
       </w:r>
@@ -8197,7 +8198,7 @@
         <w:keepNext/>
       </w:pPr>
       <w:bookmarkStart w:id="9" w:name="k5"/>
-      <w:bookmarkStart w:id="10" w:name="_Toc242690487"/>
+      <w:bookmarkStart w:id="10" w:name="_Toc242690786"/>
       <w:r>
         <w:t>EEN MEDEWERKER ZOEKEN</w:t>
       </w:r>
@@ -8252,7 +8253,7 @@
         <w:keepNext/>
       </w:pPr>
       <w:bookmarkStart w:id="11" w:name="k6"/>
-      <w:bookmarkStart w:id="12" w:name="_Toc242690488"/>
+      <w:bookmarkStart w:id="12" w:name="_Toc242690787"/>
       <w:r>
         <w:t>EEN PRODUCT REGISTREREN</w:t>
       </w:r>
@@ -8463,7 +8464,7 @@
         <w:keepNext/>
       </w:pPr>
       <w:bookmarkStart w:id="13" w:name="k7"/>
-      <w:bookmarkStart w:id="14" w:name="_Toc242690489"/>
+      <w:bookmarkStart w:id="14" w:name="_Toc242690788"/>
       <w:r>
         <w:t>ADMIN-DASHBOARD OPENEN</w:t>
       </w:r>
@@ -8594,7 +8595,7 @@
         <w:keepNext/>
       </w:pPr>
       <w:bookmarkStart w:id="15" w:name="k8"/>
-      <w:bookmarkStart w:id="16" w:name="_Toc242690490"/>
+      <w:bookmarkStart w:id="16" w:name="_Toc242690789"/>
       <w:r>
         <w:t>REGISTRATIES BEHEREN</w:t>
       </w:r>
@@ -8880,7 +8881,7 @@
         <w:keepNext/>
       </w:pPr>
       <w:bookmarkStart w:id="17" w:name="k9"/>
-      <w:bookmarkStart w:id="18" w:name="_Toc242690491"/>
+      <w:bookmarkStart w:id="18" w:name="_Toc242690790"/>
       <w:r>
         <w:t>MEDEWERKERS BEHEREN</w:t>
       </w:r>
@@ -9200,7 +9201,7 @@
         <w:keepNext/>
       </w:pPr>
       <w:bookmarkStart w:id="19" w:name="k10"/>
-      <w:bookmarkStart w:id="20" w:name="_Toc242690492"/>
+      <w:bookmarkStart w:id="20" w:name="_Toc242690791"/>
       <w:r>
         <w:t>PRODUCTEN BEHEREN</w:t>
       </w:r>
@@ -9328,7 +9329,7 @@
         <w:keepNext/>
       </w:pPr>
       <w:bookmarkStart w:id="21" w:name="k11"/>
-      <w:bookmarkStart w:id="22" w:name="_Toc242690493"/>
+      <w:bookmarkStart w:id="22" w:name="_Toc242690792"/>
       <w:r>
         <w:t>BEDRIJVEN EN CONSUMPTIEPUNTEN BEHEREN</w:t>
       </w:r>
@@ -9491,7 +9492,7 @@
         <w:keepNext/>
       </w:pPr>
       <w:bookmarkStart w:id="23" w:name="k12"/>
-      <w:bookmarkStart w:id="24" w:name="_Toc242690494"/>
+      <w:bookmarkStart w:id="24" w:name="_Toc242690793"/>
       <w:r>
         <w:t>VOORRAAD BEHEREN</w:t>
       </w:r>
@@ -9709,7 +9710,7 @@
         <w:keepNext/>
       </w:pPr>
       <w:bookmarkStart w:id="25" w:name="k13"/>
-      <w:bookmarkStart w:id="26" w:name="_Toc242690495"/>
+      <w:bookmarkStart w:id="26" w:name="_Toc242690794"/>
       <w:r>
         <w:t>LOGBOEK BEKIJKEN</w:t>
       </w:r>
@@ -9749,7 +9750,7 @@
         <w:keepNext/>
       </w:pPr>
       <w:bookmarkStart w:id="27" w:name="k14"/>
-      <w:bookmarkStart w:id="28" w:name="_Toc242690496"/>
+      <w:bookmarkStart w:id="28" w:name="_Toc242690795"/>
       <w:r>
         <w:t>ALLE GEGEVENS WISSEN</w:t>
       </w:r>
@@ -9875,7 +9876,7 @@
         <w:keepNext/>
       </w:pPr>
       <w:bookmarkStart w:id="29" w:name="k15"/>
-      <w:bookmarkStart w:id="30" w:name="_Toc242690497"/>
+      <w:bookmarkStart w:id="30" w:name="_Toc242690796"/>
       <w:r>
         <w:t>MODAL SLUITEN EN UITLOGGEN</w:t>
       </w:r>
@@ -9904,7 +9905,7 @@
         <w:keepNext/>
       </w:pPr>
       <w:bookmarkStart w:id="31" w:name="k16"/>
-      <w:bookmarkStart w:id="32" w:name="_Toc242690498"/>
+      <w:bookmarkStart w:id="32" w:name="_Toc242690797"/>
       <w:r>
         <w:t>CSV EXPORTEREN</w:t>
       </w:r>
@@ -10241,7 +10242,7 @@
         <w:keepNext/>
       </w:pPr>
       <w:bookmarkStart w:id="33" w:name="k17"/>
-      <w:bookmarkStart w:id="34" w:name="_Toc242690499"/>
+      <w:bookmarkStart w:id="34" w:name="_Toc242690798"/>
       <w:r>
         <w:t>LICHT OF DONKER THEMA</w:t>
       </w:r>
@@ -10348,7 +10349,7 @@
         <w:keepNext/>
       </w:pPr>
       <w:bookmarkStart w:id="35" w:name="k18"/>
-      <w:bookmarkStart w:id="36" w:name="_Toc242690500"/>
+      <w:bookmarkStart w:id="36" w:name="_Toc242690799"/>
       <w:r>
         <w:t>WELKOM EN "ZELFDE ALS VORIGE KEER"</w:t>
       </w:r>
@@ -10421,7 +10422,7 @@
         <w:keepNext/>
       </w:pPr>
       <w:bookmarkStart w:id="37" w:name="k19"/>
-      <w:bookmarkStart w:id="38" w:name="_Toc242690501"/>
+      <w:bookmarkStart w:id="38" w:name="_Toc242690800"/>
       <w:r>
         <w:t>DEMO GEZICHTSHERKENNING</w:t>
       </w:r>
@@ -10629,7 +10630,7 @@
         <w:keepNext/>
       </w:pPr>
       <w:bookmarkStart w:id="39" w:name="k20"/>
-      <w:bookmarkStart w:id="40" w:name="_Toc242690502"/>
+      <w:bookmarkStart w:id="40" w:name="_Toc242690801"/>
       <w:r>
         <w:t>HERKENNEN MET DE PAS</w:t>
       </w:r>
@@ -10823,7 +10824,7 @@
         </w:numPr>
       </w:pPr>
       <w:bookmarkStart w:id="41" w:name="k21"/>
-      <w:bookmarkStart w:id="42" w:name="_Toc242690503"/>
+      <w:bookmarkStart w:id="42" w:name="_Toc242690802"/>
       <w:r>
         <w:t xml:space="preserve">UITLEG VAN </w:t>
       </w:r>
@@ -10847,7 +10848,7 @@
         <w:keepNext/>
       </w:pPr>
       <w:bookmarkStart w:id="43" w:name="k22"/>
-      <w:bookmarkStart w:id="44" w:name="_Toc242690504"/>
+      <w:bookmarkStart w:id="44" w:name="_Toc242690803"/>
       <w:r>
         <w:t>METADATA EN EXTERNE BESTANDEN</w:t>
       </w:r>
@@ -11123,7 +11124,7 @@
         <w:keepNext/>
       </w:pPr>
       <w:bookmarkStart w:id="45" w:name="k23"/>
-      <w:bookmarkStart w:id="46" w:name="_Toc242690505"/>
+      <w:bookmarkStart w:id="46" w:name="_Toc242690804"/>
       <w:r>
         <w:t>NAVIGATIEBALK</w:t>
       </w:r>
@@ -11336,7 +11337,7 @@
         <w:keepNext/>
       </w:pPr>
       <w:bookmarkStart w:id="47" w:name="k24"/>
-      <w:bookmarkStart w:id="48" w:name="_Toc242690506"/>
+      <w:bookmarkStart w:id="48" w:name="_Toc242690805"/>
       <w:r>
         <w:t>HERO-GEDEELTE</w:t>
       </w:r>
@@ -11381,7 +11382,7 @@
         <w:keepNext/>
       </w:pPr>
       <w:bookmarkStart w:id="49" w:name="k25"/>
-      <w:bookmarkStart w:id="50" w:name="_Toc242690507"/>
+      <w:bookmarkStart w:id="50" w:name="_Toc242690806"/>
       <w:r>
         <w:t>MEDEWERKERLIJST</w:t>
       </w:r>
@@ -11644,7 +11645,7 @@
         <w:keepNext/>
       </w:pPr>
       <w:bookmarkStart w:id="51" w:name="k26"/>
-      <w:bookmarkStart w:id="52" w:name="_Toc242690508"/>
+      <w:bookmarkStart w:id="52" w:name="_Toc242690807"/>
       <w:r>
         <w:t>STATISTIEKEN</w:t>
       </w:r>
@@ -11727,7 +11728,7 @@
         <w:keepNext/>
       </w:pPr>
       <w:bookmarkStart w:id="53" w:name="k27"/>
-      <w:bookmarkStart w:id="54" w:name="_Toc242690509"/>
+      <w:bookmarkStart w:id="54" w:name="_Toc242690808"/>
       <w:r>
         <w:t>VENSTERS (MODALS)</w:t>
       </w:r>
@@ -12240,7 +12241,7 @@
         <w:keepNext/>
       </w:pPr>
       <w:bookmarkStart w:id="55" w:name="k28"/>
-      <w:bookmarkStart w:id="56" w:name="_Toc242690510"/>
+      <w:bookmarkStart w:id="56" w:name="_Toc242690809"/>
       <w:r>
         <w:t>WAARSCHUWING BIJ OPENEN ALS LOS BESTAND</w:t>
       </w:r>
@@ -12285,7 +12286,7 @@
         </w:numPr>
       </w:pPr>
       <w:bookmarkStart w:id="57" w:name="k29"/>
-      <w:bookmarkStart w:id="58" w:name="_Toc242690511"/>
+      <w:bookmarkStart w:id="58" w:name="_Toc242690810"/>
       <w:r>
         <w:t xml:space="preserve">UITLEG VAN </w:t>
       </w:r>
@@ -12309,7 +12310,7 @@
         <w:keepNext/>
       </w:pPr>
       <w:bookmarkStart w:id="59" w:name="k30"/>
-      <w:bookmarkStart w:id="60" w:name="_Toc242690512"/>
+      <w:bookmarkStart w:id="60" w:name="_Toc242690811"/>
       <w:r>
         <w:t>CSS-VARIABELEN</w:t>
       </w:r>
@@ -12785,7 +12786,29 @@
         <w:t>--muted</w:t>
       </w:r>
       <w:r>
-        <w:t xml:space="preserve"> (6,9:1), omdat het standaardgrijs van de browser daar maar 3,4:1 haalt.</w:t>
+        <w:t xml:space="preserve"> (6,9:1), omdat het standaardgrijs van de browser daar maar 3,4:1 haalt. In het lichte thema is </w:t>
+      </w:r>
+      <w:r>
+        <w:rPr>
+          <w:rFonts w:ascii="Consolas" w:hAnsi="Consolas" w:cs="Consolas"/>
+          <w:sz w:val="18"/>
+          <w:shd w:val="clear" w:color="auto" w:fill="EEF4F2"/>
+        </w:rPr>
+        <w:t>--muted</w:t>
+      </w:r>
+      <w:r>
+        <w:t xml:space="preserve"> iets donkerder gemaakt (</w:t>
+      </w:r>
+      <w:r>
+        <w:rPr>
+          <w:rFonts w:ascii="Consolas" w:hAnsi="Consolas" w:cs="Consolas"/>
+          <w:sz w:val="18"/>
+          <w:shd w:val="clear" w:color="auto" w:fill="EEF4F2"/>
+        </w:rPr>
+        <w:t>#5a6c71</w:t>
+      </w:r>
+      <w:r>
+        <w:t>, dezelfde tint), zodat de uitleg- en bijschrifttekst op alle lichte achtergronden minstens 4,5:1 haalt (4,6:1 tot 5,5:1).</w:t>
       </w:r>
     </w:p>
     <w:p>
@@ -12813,8 +12836,6 @@
       </w:r>
       <w:r>
         <w:tab/>
-      </w:r>
-      <w:r>
         <w:t>Globale variabelen en reset.</w:t>
       </w:r>
     </w:p>
@@ -12964,7 +12985,7 @@
         <w:keepNext/>
       </w:pPr>
       <w:bookmarkStart w:id="61" w:name="k31"/>
-      <w:bookmarkStart w:id="62" w:name="_Toc242690513"/>
+      <w:bookmarkStart w:id="62" w:name="_Toc242690812"/>
       <w:r>
         <w:t>LAYOUT</w:t>
       </w:r>
@@ -13485,7 +13506,7 @@
         <w:keepNext/>
       </w:pPr>
       <w:bookmarkStart w:id="63" w:name="k32"/>
-      <w:bookmarkStart w:id="64" w:name="_Toc242690514"/>
+      <w:bookmarkStart w:id="64" w:name="_Toc242690813"/>
       <w:r>
         <w:t>COMPONENTEN</w:t>
       </w:r>
@@ -13708,7 +13729,7 @@
         </w:numPr>
       </w:pPr>
       <w:bookmarkStart w:id="65" w:name="k33"/>
-      <w:bookmarkStart w:id="66" w:name="_Toc242690515"/>
+      <w:bookmarkStart w:id="66" w:name="_Toc242690814"/>
       <w:r>
         <w:t>UITLEG VAN DE JAVASCRIPT (</w:t>
       </w:r>
@@ -13732,7 +13753,7 @@
         <w:keepNext/>
       </w:pPr>
       <w:bookmarkStart w:id="67" w:name="k34"/>
-      <w:bookmarkStart w:id="68" w:name="_Toc242690516"/>
+      <w:bookmarkStart w:id="68" w:name="_Toc242690815"/>
       <w:r>
         <w:t>OPSLAG EN VOORBEELDDATA</w:t>
       </w:r>
@@ -14509,7 +14530,7 @@
         <w:keepNext/>
       </w:pPr>
       <w:bookmarkStart w:id="69" w:name="k35"/>
-      <w:bookmarkStart w:id="70" w:name="_Toc242690517"/>
+      <w:bookmarkStart w:id="70" w:name="_Toc242690816"/>
       <w:r>
         <w:t>OBJECTGEORIËNTEERDE STRUCTUUR</w:t>
       </w:r>
@@ -18915,7 +18936,7 @@
         <w:keepNext/>
       </w:pPr>
       <w:bookmarkStart w:id="81" w:name="k46"/>
-      <w:bookmarkStart w:id="82" w:name="_Toc242690518"/>
+      <w:bookmarkStart w:id="82" w:name="_Toc242690817"/>
       <w:r>
         <w:rPr>
           <w:rFonts w:ascii="Consolas" w:hAnsi="Consolas" w:cs="Consolas"/>
@@ -19056,7 +19077,7 @@
         <w:keepNext/>
       </w:pPr>
       <w:bookmarkStart w:id="83" w:name="k47"/>
-      <w:bookmarkStart w:id="84" w:name="_Toc242690519"/>
+      <w:bookmarkStart w:id="84" w:name="_Toc242690818"/>
       <w:r>
         <w:rPr>
           <w:rFonts w:ascii="Consolas" w:hAnsi="Consolas" w:cs="Consolas"/>
@@ -19133,7 +19154,7 @@
         <w:keepNext/>
       </w:pPr>
       <w:bookmarkStart w:id="85" w:name="k48"/>
-      <w:bookmarkStart w:id="86" w:name="_Toc242690520"/>
+      <w:bookmarkStart w:id="86" w:name="_Toc242690819"/>
       <w:r>
         <w:rPr>
           <w:rFonts w:ascii="Consolas" w:hAnsi="Consolas" w:cs="Consolas"/>
@@ -19282,7 +19303,7 @@
         <w:keepNext/>
       </w:pPr>
       <w:bookmarkStart w:id="87" w:name="k49"/>
-      <w:bookmarkStart w:id="88" w:name="_Toc242690521"/>
+      <w:bookmarkStart w:id="88" w:name="_Toc242690820"/>
       <w:r>
         <w:rPr>
           <w:rFonts w:ascii="Consolas" w:hAnsi="Consolas" w:cs="Consolas"/>
@@ -19349,7 +19370,7 @@
         <w:keepNext/>
       </w:pPr>
       <w:bookmarkStart w:id="89" w:name="k50"/>
-      <w:bookmarkStart w:id="90" w:name="_Toc242690522"/>
+      <w:bookmarkStart w:id="90" w:name="_Toc242690821"/>
       <w:r>
         <w:rPr>
           <w:rFonts w:ascii="Consolas" w:hAnsi="Consolas" w:cs="Consolas"/>
@@ -19449,7 +19470,7 @@
         <w:keepNext/>
       </w:pPr>
       <w:bookmarkStart w:id="91" w:name="k51"/>
-      <w:bookmarkStart w:id="92" w:name="_Toc242690523"/>
+      <w:bookmarkStart w:id="92" w:name="_Toc242690822"/>
       <w:r>
         <w:rPr>
           <w:rFonts w:ascii="Consolas" w:hAnsi="Consolas" w:cs="Consolas"/>
@@ -19494,7 +19515,7 @@
         <w:keepNext/>
       </w:pPr>
       <w:bookmarkStart w:id="93" w:name="k52"/>
-      <w:bookmarkStart w:id="94" w:name="_Toc242690524"/>
+      <w:bookmarkStart w:id="94" w:name="_Toc242690823"/>
       <w:r>
         <w:t>OPSLAGFOUTEN EN TERUGDRAAIEN</w:t>
       </w:r>
@@ -19534,7 +19555,7 @@
         <w:keepNext/>
       </w:pPr>
       <w:bookmarkStart w:id="95" w:name="k53"/>
-      <w:bookmarkStart w:id="96" w:name="_Toc242690525"/>
+      <w:bookmarkStart w:id="96" w:name="_Toc242690824"/>
       <w:r>
         <w:t>ADMINFUNCTIES</w:t>
       </w:r>
@@ -19780,7 +19801,7 @@
         <w:keepNext/>
       </w:pPr>
       <w:bookmarkStart w:id="97" w:name="k54"/>
-      <w:bookmarkStart w:id="98" w:name="_Toc242690526"/>
+      <w:bookmarkStart w:id="98" w:name="_Toc242690825"/>
       <w:r>
         <w:t xml:space="preserve">CSV-EXPORT (CLASS </w:t>
       </w:r>
@@ -20188,7 +20209,7 @@
         <w:keepNext/>
       </w:pPr>
       <w:bookmarkStart w:id="99" w:name="k55"/>
-      <w:bookmarkStart w:id="100" w:name="_Toc242690527"/>
+      <w:bookmarkStart w:id="100" w:name="_Toc242690826"/>
       <w:r>
         <w:t>EVENT LISTENERS</w:t>
       </w:r>
@@ -20793,7 +20814,7 @@
         </w:numPr>
       </w:pPr>
       <w:bookmarkStart w:id="101" w:name="k56"/>
-      <w:bookmarkStart w:id="102" w:name="_Toc242690528"/>
+      <w:bookmarkStart w:id="102" w:name="_Toc242690827"/>
       <w:r>
         <w:t>DATAMODEL EN KOPPELINGEN.</w:t>
       </w:r>
@@ -20811,7 +20832,7 @@
         <w:keepNext/>
       </w:pPr>
       <w:bookmarkStart w:id="103" w:name="k57"/>
-      <w:bookmarkStart w:id="104" w:name="_Toc242690529"/>
+      <w:bookmarkStart w:id="104" w:name="_Toc242690828"/>
       <w:r>
         <w:t>BEDRIJVEN</w:t>
       </w:r>
@@ -21022,7 +21043,7 @@
         <w:keepNext/>
       </w:pPr>
       <w:bookmarkStart w:id="105" w:name="k58"/>
-      <w:bookmarkStart w:id="106" w:name="_Toc242690530"/>
+      <w:bookmarkStart w:id="106" w:name="_Toc242690829"/>
       <w:r>
         <w:t>CONSUMPTIEPUNTEN</w:t>
       </w:r>
@@ -21341,7 +21362,7 @@
         <w:keepNext/>
       </w:pPr>
       <w:bookmarkStart w:id="107" w:name="k59"/>
-      <w:bookmarkStart w:id="108" w:name="_Toc242690531"/>
+      <w:bookmarkStart w:id="108" w:name="_Toc242690830"/>
       <w:r>
         <w:t>MEDEWERKERS</w:t>
       </w:r>
@@ -21897,7 +21918,7 @@
         <w:keepNext/>
       </w:pPr>
       <w:bookmarkStart w:id="109" w:name="k60"/>
-      <w:bookmarkStart w:id="110" w:name="_Toc242690532"/>
+      <w:bookmarkStart w:id="110" w:name="_Toc242690831"/>
       <w:r>
         <w:t>REGISTRATIES</w:t>
       </w:r>
@@ -22463,7 +22484,7 @@
         </w:numPr>
       </w:pPr>
       <w:bookmarkStart w:id="111" w:name="k61"/>
-      <w:bookmarkStart w:id="112" w:name="_Toc242690533"/>
+      <w:bookmarkStart w:id="112" w:name="_Toc242690832"/>
       <w:r>
         <w:t>BELANGRIJKE DEMO-BEPERKINGEN.</w:t>
       </w:r>
@@ -22754,7 +22775,7 @@
         </w:numPr>
       </w:pPr>
       <w:bookmarkStart w:id="113" w:name="k62"/>
-      <w:bookmarkStart w:id="114" w:name="_Toc242690534"/>
+      <w:bookmarkStart w:id="114" w:name="_Toc242690833"/>
       <w:r>
         <w:t>CODE UITLEGGEN TIJDENS EEN PRESENTATIE.</w:t>
       </w:r>
@@ -23105,7 +23126,7 @@
         </w:numPr>
       </w:pPr>
       <w:bookmarkStart w:id="115" w:name="k63"/>
-      <w:bookmarkStart w:id="116" w:name="_Toc242690535"/>
+      <w:bookmarkStart w:id="116" w:name="_Toc242690834"/>
       <w:r>
         <w:t>MOGELIJKE VERVOLGSTAPPEN.</w:t>
       </w:r>

</xml_diff>

<commit_message>
TO 3.10: AVG-verbeteringen in de app en AVG-verantwoording in het TO
- "Welkom terug" en de vorige keuze alleen na herkenning met pas of camera
- Beheerder automatisch uitgelogd na 5 minuten zonder invoer
- Informatieregel over de inhouding op het loon in het productvenster
- Nieuwe paragraaf AVG-verantwoording (productie), UAVG art. 29 bijgewerkt, ondernemingsraad als stakeholder
- FR-68, FR-69, AC-91 t/m AC-93, 565 unit tests en aangepaste browsertests
- Word-bestanden bijgewerkt
</commit_message>
<xml_diff>
--- a/docs/DOCUMENTATIE.docx
+++ b/docs/DOCUMENTATIE.docx
@@ -82,7 +82,7 @@
           <w:numId w:val="0"/>
         </w:numPr>
       </w:pPr>
-      <w:bookmarkStart w:id="0" w:name="_Toc242690781"/>
+      <w:bookmarkStart w:id="0" w:name="_Toc242703525"/>
       <w:r>
         <w:lastRenderedPageBreak/>
         <w:t>INHOUDSOPGAVE.</w:t>
@@ -113,7 +113,7 @@
       <w:r>
         <w:fldChar w:fldCharType="separate"/>
       </w:r>
-      <w:hyperlink w:anchor="_Toc242690781" w:history="1">
+      <w:hyperlink w:anchor="_Toc242703525" w:history="1">
         <w:r>
           <w:rPr>
             <w:rStyle w:val="Hyperlink"/>
@@ -140,7 +140,7 @@
             <w:noProof/>
             <w:webHidden/>
           </w:rPr>
-          <w:instrText xml:space="preserve"> PAGEREF _Toc242690781 \h </w:instrText>
+          <w:instrText xml:space="preserve"> PAGEREF _Toc242703525 \h </w:instrText>
         </w:r>
         <w:r>
           <w:rPr>
@@ -187,7 +187,7 @@
           <w:lang w:eastAsia="nl-NL"/>
         </w:rPr>
       </w:pPr>
-      <w:hyperlink w:anchor="_Toc242690782" w:history="1">
+      <w:hyperlink w:anchor="_Toc242703526" w:history="1">
         <w:r>
           <w:rPr>
             <w:rStyle w:val="Hyperlink"/>
@@ -232,7 +232,7 @@
             <w:noProof/>
             <w:webHidden/>
           </w:rPr>
-          <w:instrText xml:space="preserve"> PAGEREF _Toc242690782 \h </w:instrText>
+          <w:instrText xml:space="preserve"> PAGEREF _Toc242703526 \h </w:instrText>
         </w:r>
         <w:r>
           <w:rPr>
@@ -279,7 +279,7 @@
           <w:lang w:eastAsia="nl-NL"/>
         </w:rPr>
       </w:pPr>
-      <w:hyperlink w:anchor="_Toc242690783" w:history="1">
+      <w:hyperlink w:anchor="_Toc242703527" w:history="1">
         <w:r>
           <w:rPr>
             <w:rStyle w:val="Hyperlink"/>
@@ -324,7 +324,7 @@
             <w:noProof/>
             <w:webHidden/>
           </w:rPr>
-          <w:instrText xml:space="preserve"> PAGEREF _Toc242690783 \h </w:instrText>
+          <w:instrText xml:space="preserve"> PAGEREF _Toc242703527 \h </w:instrText>
         </w:r>
         <w:r>
           <w:rPr>
@@ -371,7 +371,7 @@
           <w:lang w:eastAsia="nl-NL"/>
         </w:rPr>
       </w:pPr>
-      <w:hyperlink w:anchor="_Toc242690784" w:history="1">
+      <w:hyperlink w:anchor="_Toc242703528" w:history="1">
         <w:r>
           <w:rPr>
             <w:rStyle w:val="Hyperlink"/>
@@ -416,7 +416,7 @@
             <w:noProof/>
             <w:webHidden/>
           </w:rPr>
-          <w:instrText xml:space="preserve"> PAGEREF _Toc242690784 \h </w:instrText>
+          <w:instrText xml:space="preserve"> PAGEREF _Toc242703528 \h </w:instrText>
         </w:r>
         <w:r>
           <w:rPr>
@@ -463,7 +463,7 @@
           <w:lang w:eastAsia="nl-NL"/>
         </w:rPr>
       </w:pPr>
-      <w:hyperlink w:anchor="_Toc242690785" w:history="1">
+      <w:hyperlink w:anchor="_Toc242703529" w:history="1">
         <w:r>
           <w:rPr>
             <w:rStyle w:val="Hyperlink"/>
@@ -508,7 +508,7 @@
             <w:noProof/>
             <w:webHidden/>
           </w:rPr>
-          <w:instrText xml:space="preserve"> PAGEREF _Toc242690785 \h </w:instrText>
+          <w:instrText xml:space="preserve"> PAGEREF _Toc242703529 \h </w:instrText>
         </w:r>
         <w:r>
           <w:rPr>
@@ -555,7 +555,7 @@
           <w:lang w:eastAsia="nl-NL"/>
         </w:rPr>
       </w:pPr>
-      <w:hyperlink w:anchor="_Toc242690786" w:history="1">
+      <w:hyperlink w:anchor="_Toc242703530" w:history="1">
         <w:r>
           <w:rPr>
             <w:rStyle w:val="Hyperlink"/>
@@ -600,7 +600,7 @@
             <w:noProof/>
             <w:webHidden/>
           </w:rPr>
-          <w:instrText xml:space="preserve"> PAGEREF _Toc242690786 \h </w:instrText>
+          <w:instrText xml:space="preserve"> PAGEREF _Toc242703530 \h </w:instrText>
         </w:r>
         <w:r>
           <w:rPr>
@@ -647,7 +647,7 @@
           <w:lang w:eastAsia="nl-NL"/>
         </w:rPr>
       </w:pPr>
-      <w:hyperlink w:anchor="_Toc242690787" w:history="1">
+      <w:hyperlink w:anchor="_Toc242703531" w:history="1">
         <w:r>
           <w:rPr>
             <w:rStyle w:val="Hyperlink"/>
@@ -692,7 +692,7 @@
             <w:noProof/>
             <w:webHidden/>
           </w:rPr>
-          <w:instrText xml:space="preserve"> PAGEREF _Toc242690787 \h </w:instrText>
+          <w:instrText xml:space="preserve"> PAGEREF _Toc242703531 \h </w:instrText>
         </w:r>
         <w:r>
           <w:rPr>
@@ -739,7 +739,7 @@
           <w:lang w:eastAsia="nl-NL"/>
         </w:rPr>
       </w:pPr>
-      <w:hyperlink w:anchor="_Toc242690788" w:history="1">
+      <w:hyperlink w:anchor="_Toc242703532" w:history="1">
         <w:r>
           <w:rPr>
             <w:rStyle w:val="Hyperlink"/>
@@ -784,7 +784,7 @@
             <w:noProof/>
             <w:webHidden/>
           </w:rPr>
-          <w:instrText xml:space="preserve"> PAGEREF _Toc242690788 \h </w:instrText>
+          <w:instrText xml:space="preserve"> PAGEREF _Toc242703532 \h </w:instrText>
         </w:r>
         <w:r>
           <w:rPr>
@@ -831,7 +831,7 @@
           <w:lang w:eastAsia="nl-NL"/>
         </w:rPr>
       </w:pPr>
-      <w:hyperlink w:anchor="_Toc242690789" w:history="1">
+      <w:hyperlink w:anchor="_Toc242703533" w:history="1">
         <w:r>
           <w:rPr>
             <w:rStyle w:val="Hyperlink"/>
@@ -876,7 +876,7 @@
             <w:noProof/>
             <w:webHidden/>
           </w:rPr>
-          <w:instrText xml:space="preserve"> PAGEREF _Toc242690789 \h </w:instrText>
+          <w:instrText xml:space="preserve"> PAGEREF _Toc242703533 \h </w:instrText>
         </w:r>
         <w:r>
           <w:rPr>
@@ -923,7 +923,7 @@
           <w:lang w:eastAsia="nl-NL"/>
         </w:rPr>
       </w:pPr>
-      <w:hyperlink w:anchor="_Toc242690790" w:history="1">
+      <w:hyperlink w:anchor="_Toc242703534" w:history="1">
         <w:r>
           <w:rPr>
             <w:rStyle w:val="Hyperlink"/>
@@ -968,7 +968,7 @@
             <w:noProof/>
             <w:webHidden/>
           </w:rPr>
-          <w:instrText xml:space="preserve"> PAGEREF _Toc242690790 \h </w:instrText>
+          <w:instrText xml:space="preserve"> PAGEREF _Toc242703534 \h </w:instrText>
         </w:r>
         <w:r>
           <w:rPr>
@@ -1015,7 +1015,7 @@
           <w:lang w:eastAsia="nl-NL"/>
         </w:rPr>
       </w:pPr>
-      <w:hyperlink w:anchor="_Toc242690791" w:history="1">
+      <w:hyperlink w:anchor="_Toc242703535" w:history="1">
         <w:r>
           <w:rPr>
             <w:rStyle w:val="Hyperlink"/>
@@ -1060,7 +1060,7 @@
             <w:noProof/>
             <w:webHidden/>
           </w:rPr>
-          <w:instrText xml:space="preserve"> PAGEREF _Toc242690791 \h </w:instrText>
+          <w:instrText xml:space="preserve"> PAGEREF _Toc242703535 \h </w:instrText>
         </w:r>
         <w:r>
           <w:rPr>
@@ -1107,7 +1107,7 @@
           <w:lang w:eastAsia="nl-NL"/>
         </w:rPr>
       </w:pPr>
-      <w:hyperlink w:anchor="_Toc242690792" w:history="1">
+      <w:hyperlink w:anchor="_Toc242703536" w:history="1">
         <w:r>
           <w:rPr>
             <w:rStyle w:val="Hyperlink"/>
@@ -1152,7 +1152,7 @@
             <w:noProof/>
             <w:webHidden/>
           </w:rPr>
-          <w:instrText xml:space="preserve"> PAGEREF _Toc242690792 \h </w:instrText>
+          <w:instrText xml:space="preserve"> PAGEREF _Toc242703536 \h </w:instrText>
         </w:r>
         <w:r>
           <w:rPr>
@@ -1199,7 +1199,7 @@
           <w:lang w:eastAsia="nl-NL"/>
         </w:rPr>
       </w:pPr>
-      <w:hyperlink w:anchor="_Toc242690793" w:history="1">
+      <w:hyperlink w:anchor="_Toc242703537" w:history="1">
         <w:r>
           <w:rPr>
             <w:rStyle w:val="Hyperlink"/>
@@ -1244,7 +1244,7 @@
             <w:noProof/>
             <w:webHidden/>
           </w:rPr>
-          <w:instrText xml:space="preserve"> PAGEREF _Toc242690793 \h </w:instrText>
+          <w:instrText xml:space="preserve"> PAGEREF _Toc242703537 \h </w:instrText>
         </w:r>
         <w:r>
           <w:rPr>
@@ -1291,7 +1291,7 @@
           <w:lang w:eastAsia="nl-NL"/>
         </w:rPr>
       </w:pPr>
-      <w:hyperlink w:anchor="_Toc242690794" w:history="1">
+      <w:hyperlink w:anchor="_Toc242703538" w:history="1">
         <w:r>
           <w:rPr>
             <w:rStyle w:val="Hyperlink"/>
@@ -1336,7 +1336,7 @@
             <w:noProof/>
             <w:webHidden/>
           </w:rPr>
-          <w:instrText xml:space="preserve"> PAGEREF _Toc242690794 \h </w:instrText>
+          <w:instrText xml:space="preserve"> PAGEREF _Toc242703538 \h </w:instrText>
         </w:r>
         <w:r>
           <w:rPr>
@@ -1383,7 +1383,7 @@
           <w:lang w:eastAsia="nl-NL"/>
         </w:rPr>
       </w:pPr>
-      <w:hyperlink w:anchor="_Toc242690795" w:history="1">
+      <w:hyperlink w:anchor="_Toc242703539" w:history="1">
         <w:r>
           <w:rPr>
             <w:rStyle w:val="Hyperlink"/>
@@ -1428,7 +1428,7 @@
             <w:noProof/>
             <w:webHidden/>
           </w:rPr>
-          <w:instrText xml:space="preserve"> PAGEREF _Toc242690795 \h </w:instrText>
+          <w:instrText xml:space="preserve"> PAGEREF _Toc242703539 \h </w:instrText>
         </w:r>
         <w:r>
           <w:rPr>
@@ -1475,7 +1475,7 @@
           <w:lang w:eastAsia="nl-NL"/>
         </w:rPr>
       </w:pPr>
-      <w:hyperlink w:anchor="_Toc242690796" w:history="1">
+      <w:hyperlink w:anchor="_Toc242703540" w:history="1">
         <w:r>
           <w:rPr>
             <w:rStyle w:val="Hyperlink"/>
@@ -1520,7 +1520,7 @@
             <w:noProof/>
             <w:webHidden/>
           </w:rPr>
-          <w:instrText xml:space="preserve"> PAGEREF _Toc242690796 \h </w:instrText>
+          <w:instrText xml:space="preserve"> PAGEREF _Toc242703540 \h </w:instrText>
         </w:r>
         <w:r>
           <w:rPr>
@@ -1567,7 +1567,7 @@
           <w:lang w:eastAsia="nl-NL"/>
         </w:rPr>
       </w:pPr>
-      <w:hyperlink w:anchor="_Toc242690797" w:history="1">
+      <w:hyperlink w:anchor="_Toc242703541" w:history="1">
         <w:r>
           <w:rPr>
             <w:rStyle w:val="Hyperlink"/>
@@ -1612,7 +1612,7 @@
             <w:noProof/>
             <w:webHidden/>
           </w:rPr>
-          <w:instrText xml:space="preserve"> PAGEREF _Toc242690797 \h </w:instrText>
+          <w:instrText xml:space="preserve"> PAGEREF _Toc242703541 \h </w:instrText>
         </w:r>
         <w:r>
           <w:rPr>
@@ -1659,7 +1659,7 @@
           <w:lang w:eastAsia="nl-NL"/>
         </w:rPr>
       </w:pPr>
-      <w:hyperlink w:anchor="_Toc242690798" w:history="1">
+      <w:hyperlink w:anchor="_Toc242703542" w:history="1">
         <w:r>
           <w:rPr>
             <w:rStyle w:val="Hyperlink"/>
@@ -1704,7 +1704,7 @@
             <w:noProof/>
             <w:webHidden/>
           </w:rPr>
-          <w:instrText xml:space="preserve"> PAGEREF _Toc242690798 \h </w:instrText>
+          <w:instrText xml:space="preserve"> PAGEREF _Toc242703542 \h </w:instrText>
         </w:r>
         <w:r>
           <w:rPr>
@@ -1751,7 +1751,7 @@
           <w:lang w:eastAsia="nl-NL"/>
         </w:rPr>
       </w:pPr>
-      <w:hyperlink w:anchor="_Toc242690799" w:history="1">
+      <w:hyperlink w:anchor="_Toc242703543" w:history="1">
         <w:r>
           <w:rPr>
             <w:rStyle w:val="Hyperlink"/>
@@ -1796,7 +1796,7 @@
             <w:noProof/>
             <w:webHidden/>
           </w:rPr>
-          <w:instrText xml:space="preserve"> PAGEREF _Toc242690799 \h </w:instrText>
+          <w:instrText xml:space="preserve"> PAGEREF _Toc242703543 \h </w:instrText>
         </w:r>
         <w:r>
           <w:rPr>
@@ -1843,7 +1843,7 @@
           <w:lang w:eastAsia="nl-NL"/>
         </w:rPr>
       </w:pPr>
-      <w:hyperlink w:anchor="_Toc242690800" w:history="1">
+      <w:hyperlink w:anchor="_Toc242703544" w:history="1">
         <w:r>
           <w:rPr>
             <w:rStyle w:val="Hyperlink"/>
@@ -1888,7 +1888,7 @@
             <w:noProof/>
             <w:webHidden/>
           </w:rPr>
-          <w:instrText xml:space="preserve"> PAGEREF _Toc242690800 \h </w:instrText>
+          <w:instrText xml:space="preserve"> PAGEREF _Toc242703544 \h </w:instrText>
         </w:r>
         <w:r>
           <w:rPr>
@@ -1935,7 +1935,7 @@
           <w:lang w:eastAsia="nl-NL"/>
         </w:rPr>
       </w:pPr>
-      <w:hyperlink w:anchor="_Toc242690801" w:history="1">
+      <w:hyperlink w:anchor="_Toc242703545" w:history="1">
         <w:r>
           <w:rPr>
             <w:rStyle w:val="Hyperlink"/>
@@ -1980,7 +1980,7 @@
             <w:noProof/>
             <w:webHidden/>
           </w:rPr>
-          <w:instrText xml:space="preserve"> PAGEREF _Toc242690801 \h </w:instrText>
+          <w:instrText xml:space="preserve"> PAGEREF _Toc242703545 \h </w:instrText>
         </w:r>
         <w:r>
           <w:rPr>
@@ -2000,7 +2000,7 @@
             <w:noProof/>
             <w:webHidden/>
           </w:rPr>
-          <w:t>14</w:t>
+          <w:t>15</w:t>
         </w:r>
         <w:r>
           <w:rPr>
@@ -2027,7 +2027,7 @@
           <w:lang w:eastAsia="nl-NL"/>
         </w:rPr>
       </w:pPr>
-      <w:hyperlink w:anchor="_Toc242690802" w:history="1">
+      <w:hyperlink w:anchor="_Toc242703546" w:history="1">
         <w:r>
           <w:rPr>
             <w:rStyle w:val="Hyperlink"/>
@@ -2088,7 +2088,7 @@
             <w:noProof/>
             <w:webHidden/>
           </w:rPr>
-          <w:instrText xml:space="preserve"> PAGEREF _Toc242690802 \h </w:instrText>
+          <w:instrText xml:space="preserve"> PAGEREF _Toc242703546 \h </w:instrText>
         </w:r>
         <w:r>
           <w:rPr>
@@ -2135,7 +2135,7 @@
           <w:lang w:eastAsia="nl-NL"/>
         </w:rPr>
       </w:pPr>
-      <w:hyperlink w:anchor="_Toc242690803" w:history="1">
+      <w:hyperlink w:anchor="_Toc242703547" w:history="1">
         <w:r>
           <w:rPr>
             <w:rStyle w:val="Hyperlink"/>
@@ -2180,7 +2180,7 @@
             <w:noProof/>
             <w:webHidden/>
           </w:rPr>
-          <w:instrText xml:space="preserve"> PAGEREF _Toc242690803 \h </w:instrText>
+          <w:instrText xml:space="preserve"> PAGEREF _Toc242703547 \h </w:instrText>
         </w:r>
         <w:r>
           <w:rPr>
@@ -2227,7 +2227,7 @@
           <w:lang w:eastAsia="nl-NL"/>
         </w:rPr>
       </w:pPr>
-      <w:hyperlink w:anchor="_Toc242690804" w:history="1">
+      <w:hyperlink w:anchor="_Toc242703548" w:history="1">
         <w:r>
           <w:rPr>
             <w:rStyle w:val="Hyperlink"/>
@@ -2272,7 +2272,7 @@
             <w:noProof/>
             <w:webHidden/>
           </w:rPr>
-          <w:instrText xml:space="preserve"> PAGEREF _Toc242690804 \h </w:instrText>
+          <w:instrText xml:space="preserve"> PAGEREF _Toc242703548 \h </w:instrText>
         </w:r>
         <w:r>
           <w:rPr>
@@ -2319,7 +2319,7 @@
           <w:lang w:eastAsia="nl-NL"/>
         </w:rPr>
       </w:pPr>
-      <w:hyperlink w:anchor="_Toc242690805" w:history="1">
+      <w:hyperlink w:anchor="_Toc242703549" w:history="1">
         <w:r>
           <w:rPr>
             <w:rStyle w:val="Hyperlink"/>
@@ -2364,7 +2364,7 @@
             <w:noProof/>
             <w:webHidden/>
           </w:rPr>
-          <w:instrText xml:space="preserve"> PAGEREF _Toc242690805 \h </w:instrText>
+          <w:instrText xml:space="preserve"> PAGEREF _Toc242703549 \h </w:instrText>
         </w:r>
         <w:r>
           <w:rPr>
@@ -2411,7 +2411,7 @@
           <w:lang w:eastAsia="nl-NL"/>
         </w:rPr>
       </w:pPr>
-      <w:hyperlink w:anchor="_Toc242690806" w:history="1">
+      <w:hyperlink w:anchor="_Toc242703550" w:history="1">
         <w:r>
           <w:rPr>
             <w:rStyle w:val="Hyperlink"/>
@@ -2456,7 +2456,7 @@
             <w:noProof/>
             <w:webHidden/>
           </w:rPr>
-          <w:instrText xml:space="preserve"> PAGEREF _Toc242690806 \h </w:instrText>
+          <w:instrText xml:space="preserve"> PAGEREF _Toc242703550 \h </w:instrText>
         </w:r>
         <w:r>
           <w:rPr>
@@ -2503,7 +2503,7 @@
           <w:lang w:eastAsia="nl-NL"/>
         </w:rPr>
       </w:pPr>
-      <w:hyperlink w:anchor="_Toc242690807" w:history="1">
+      <w:hyperlink w:anchor="_Toc242703551" w:history="1">
         <w:r>
           <w:rPr>
             <w:rStyle w:val="Hyperlink"/>
@@ -2548,7 +2548,7 @@
             <w:noProof/>
             <w:webHidden/>
           </w:rPr>
-          <w:instrText xml:space="preserve"> PAGEREF _Toc242690807 \h </w:instrText>
+          <w:instrText xml:space="preserve"> PAGEREF _Toc242703551 \h </w:instrText>
         </w:r>
         <w:r>
           <w:rPr>
@@ -2595,7 +2595,7 @@
           <w:lang w:eastAsia="nl-NL"/>
         </w:rPr>
       </w:pPr>
-      <w:hyperlink w:anchor="_Toc242690808" w:history="1">
+      <w:hyperlink w:anchor="_Toc242703552" w:history="1">
         <w:r>
           <w:rPr>
             <w:rStyle w:val="Hyperlink"/>
@@ -2640,7 +2640,7 @@
             <w:noProof/>
             <w:webHidden/>
           </w:rPr>
-          <w:instrText xml:space="preserve"> PAGEREF _Toc242690808 \h </w:instrText>
+          <w:instrText xml:space="preserve"> PAGEREF _Toc242703552 \h </w:instrText>
         </w:r>
         <w:r>
           <w:rPr>
@@ -2687,7 +2687,7 @@
           <w:lang w:eastAsia="nl-NL"/>
         </w:rPr>
       </w:pPr>
-      <w:hyperlink w:anchor="_Toc242690809" w:history="1">
+      <w:hyperlink w:anchor="_Toc242703553" w:history="1">
         <w:r>
           <w:rPr>
             <w:rStyle w:val="Hyperlink"/>
@@ -2732,7 +2732,7 @@
             <w:noProof/>
             <w:webHidden/>
           </w:rPr>
-          <w:instrText xml:space="preserve"> PAGEREF _Toc242690809 \h </w:instrText>
+          <w:instrText xml:space="preserve"> PAGEREF _Toc242703553 \h </w:instrText>
         </w:r>
         <w:r>
           <w:rPr>
@@ -2779,7 +2779,7 @@
           <w:lang w:eastAsia="nl-NL"/>
         </w:rPr>
       </w:pPr>
-      <w:hyperlink w:anchor="_Toc242690810" w:history="1">
+      <w:hyperlink w:anchor="_Toc242703554" w:history="1">
         <w:r>
           <w:rPr>
             <w:rStyle w:val="Hyperlink"/>
@@ -2840,7 +2840,7 @@
             <w:noProof/>
             <w:webHidden/>
           </w:rPr>
-          <w:instrText xml:space="preserve"> PAGEREF _Toc242690810 \h </w:instrText>
+          <w:instrText xml:space="preserve"> PAGEREF _Toc242703554 \h </w:instrText>
         </w:r>
         <w:r>
           <w:rPr>
@@ -2887,7 +2887,7 @@
           <w:lang w:eastAsia="nl-NL"/>
         </w:rPr>
       </w:pPr>
-      <w:hyperlink w:anchor="_Toc242690811" w:history="1">
+      <w:hyperlink w:anchor="_Toc242703555" w:history="1">
         <w:r>
           <w:rPr>
             <w:rStyle w:val="Hyperlink"/>
@@ -2932,7 +2932,7 @@
             <w:noProof/>
             <w:webHidden/>
           </w:rPr>
-          <w:instrText xml:space="preserve"> PAGEREF _Toc242690811 \h </w:instrText>
+          <w:instrText xml:space="preserve"> PAGEREF _Toc242703555 \h </w:instrText>
         </w:r>
         <w:r>
           <w:rPr>
@@ -2979,7 +2979,7 @@
           <w:lang w:eastAsia="nl-NL"/>
         </w:rPr>
       </w:pPr>
-      <w:hyperlink w:anchor="_Toc242690812" w:history="1">
+      <w:hyperlink w:anchor="_Toc242703556" w:history="1">
         <w:r>
           <w:rPr>
             <w:rStyle w:val="Hyperlink"/>
@@ -3024,7 +3024,7 @@
             <w:noProof/>
             <w:webHidden/>
           </w:rPr>
-          <w:instrText xml:space="preserve"> PAGEREF _Toc242690812 \h </w:instrText>
+          <w:instrText xml:space="preserve"> PAGEREF _Toc242703556 \h </w:instrText>
         </w:r>
         <w:r>
           <w:rPr>
@@ -3071,7 +3071,7 @@
           <w:lang w:eastAsia="nl-NL"/>
         </w:rPr>
       </w:pPr>
-      <w:hyperlink w:anchor="_Toc242690813" w:history="1">
+      <w:hyperlink w:anchor="_Toc242703557" w:history="1">
         <w:r>
           <w:rPr>
             <w:rStyle w:val="Hyperlink"/>
@@ -3116,7 +3116,7 @@
             <w:noProof/>
             <w:webHidden/>
           </w:rPr>
-          <w:instrText xml:space="preserve"> PAGEREF _Toc242690813 \h </w:instrText>
+          <w:instrText xml:space="preserve"> PAGEREF _Toc242703557 \h </w:instrText>
         </w:r>
         <w:r>
           <w:rPr>
@@ -3163,7 +3163,7 @@
           <w:lang w:eastAsia="nl-NL"/>
         </w:rPr>
       </w:pPr>
-      <w:hyperlink w:anchor="_Toc242690814" w:history="1">
+      <w:hyperlink w:anchor="_Toc242703558" w:history="1">
         <w:r>
           <w:rPr>
             <w:rStyle w:val="Hyperlink"/>
@@ -3224,7 +3224,7 @@
             <w:noProof/>
             <w:webHidden/>
           </w:rPr>
-          <w:instrText xml:space="preserve"> PAGEREF _Toc242690814 \h </w:instrText>
+          <w:instrText xml:space="preserve"> PAGEREF _Toc242703558 \h </w:instrText>
         </w:r>
         <w:r>
           <w:rPr>
@@ -3271,7 +3271,7 @@
           <w:lang w:eastAsia="nl-NL"/>
         </w:rPr>
       </w:pPr>
-      <w:hyperlink w:anchor="_Toc242690815" w:history="1">
+      <w:hyperlink w:anchor="_Toc242703559" w:history="1">
         <w:r>
           <w:rPr>
             <w:rStyle w:val="Hyperlink"/>
@@ -3316,7 +3316,7 @@
             <w:noProof/>
             <w:webHidden/>
           </w:rPr>
-          <w:instrText xml:space="preserve"> PAGEREF _Toc242690815 \h </w:instrText>
+          <w:instrText xml:space="preserve"> PAGEREF _Toc242703559 \h </w:instrText>
         </w:r>
         <w:r>
           <w:rPr>
@@ -3363,7 +3363,7 @@
           <w:lang w:eastAsia="nl-NL"/>
         </w:rPr>
       </w:pPr>
-      <w:hyperlink w:anchor="_Toc242690816" w:history="1">
+      <w:hyperlink w:anchor="_Toc242703560" w:history="1">
         <w:r>
           <w:rPr>
             <w:rStyle w:val="Hyperlink"/>
@@ -3408,7 +3408,7 @@
             <w:noProof/>
             <w:webHidden/>
           </w:rPr>
-          <w:instrText xml:space="preserve"> PAGEREF _Toc242690816 \h </w:instrText>
+          <w:instrText xml:space="preserve"> PAGEREF _Toc242703560 \h </w:instrText>
         </w:r>
         <w:r>
           <w:rPr>
@@ -3455,7 +3455,7 @@
           <w:lang w:eastAsia="nl-NL"/>
         </w:rPr>
       </w:pPr>
-      <w:hyperlink w:anchor="_Toc242690817" w:history="1">
+      <w:hyperlink w:anchor="_Toc242703561" w:history="1">
         <w:r>
           <w:rPr>
             <w:rStyle w:val="Hyperlink"/>
@@ -3502,7 +3502,7 @@
             <w:noProof/>
             <w:webHidden/>
           </w:rPr>
-          <w:instrText xml:space="preserve"> PAGEREF _Toc242690817 \h </w:instrText>
+          <w:instrText xml:space="preserve"> PAGEREF _Toc242703561 \h </w:instrText>
         </w:r>
         <w:r>
           <w:rPr>
@@ -3549,7 +3549,7 @@
           <w:lang w:eastAsia="nl-NL"/>
         </w:rPr>
       </w:pPr>
-      <w:hyperlink w:anchor="_Toc242690818" w:history="1">
+      <w:hyperlink w:anchor="_Toc242703562" w:history="1">
         <w:r>
           <w:rPr>
             <w:rStyle w:val="Hyperlink"/>
@@ -3596,7 +3596,7 @@
             <w:noProof/>
             <w:webHidden/>
           </w:rPr>
-          <w:instrText xml:space="preserve"> PAGEREF _Toc242690818 \h </w:instrText>
+          <w:instrText xml:space="preserve"> PAGEREF _Toc242703562 \h </w:instrText>
         </w:r>
         <w:r>
           <w:rPr>
@@ -3643,7 +3643,7 @@
           <w:lang w:eastAsia="nl-NL"/>
         </w:rPr>
       </w:pPr>
-      <w:hyperlink w:anchor="_Toc242690819" w:history="1">
+      <w:hyperlink w:anchor="_Toc242703563" w:history="1">
         <w:r>
           <w:rPr>
             <w:rStyle w:val="Hyperlink"/>
@@ -3690,7 +3690,7 @@
             <w:noProof/>
             <w:webHidden/>
           </w:rPr>
-          <w:instrText xml:space="preserve"> PAGEREF _Toc242690819 \h </w:instrText>
+          <w:instrText xml:space="preserve"> PAGEREF _Toc242703563 \h </w:instrText>
         </w:r>
         <w:r>
           <w:rPr>
@@ -3737,7 +3737,7 @@
           <w:lang w:eastAsia="nl-NL"/>
         </w:rPr>
       </w:pPr>
-      <w:hyperlink w:anchor="_Toc242690820" w:history="1">
+      <w:hyperlink w:anchor="_Toc242703564" w:history="1">
         <w:r>
           <w:rPr>
             <w:rStyle w:val="Hyperlink"/>
@@ -3784,7 +3784,7 @@
             <w:noProof/>
             <w:webHidden/>
           </w:rPr>
-          <w:instrText xml:space="preserve"> PAGEREF _Toc242690820 \h </w:instrText>
+          <w:instrText xml:space="preserve"> PAGEREF _Toc242703564 \h </w:instrText>
         </w:r>
         <w:r>
           <w:rPr>
@@ -3831,7 +3831,7 @@
           <w:lang w:eastAsia="nl-NL"/>
         </w:rPr>
       </w:pPr>
-      <w:hyperlink w:anchor="_Toc242690821" w:history="1">
+      <w:hyperlink w:anchor="_Toc242703565" w:history="1">
         <w:r>
           <w:rPr>
             <w:rStyle w:val="Hyperlink"/>
@@ -3878,7 +3878,7 @@
             <w:noProof/>
             <w:webHidden/>
           </w:rPr>
-          <w:instrText xml:space="preserve"> PAGEREF _Toc242690821 \h </w:instrText>
+          <w:instrText xml:space="preserve"> PAGEREF _Toc242703565 \h </w:instrText>
         </w:r>
         <w:r>
           <w:rPr>
@@ -3898,7 +3898,7 @@
             <w:noProof/>
             <w:webHidden/>
           </w:rPr>
-          <w:t>27</w:t>
+          <w:t>28</w:t>
         </w:r>
         <w:r>
           <w:rPr>
@@ -3925,7 +3925,7 @@
           <w:lang w:eastAsia="nl-NL"/>
         </w:rPr>
       </w:pPr>
-      <w:hyperlink w:anchor="_Toc242690822" w:history="1">
+      <w:hyperlink w:anchor="_Toc242703566" w:history="1">
         <w:r>
           <w:rPr>
             <w:rStyle w:val="Hyperlink"/>
@@ -3972,7 +3972,7 @@
             <w:noProof/>
             <w:webHidden/>
           </w:rPr>
-          <w:instrText xml:space="preserve"> PAGEREF _Toc242690822 \h </w:instrText>
+          <w:instrText xml:space="preserve"> PAGEREF _Toc242703566 \h </w:instrText>
         </w:r>
         <w:r>
           <w:rPr>
@@ -4019,7 +4019,7 @@
           <w:lang w:eastAsia="nl-NL"/>
         </w:rPr>
       </w:pPr>
-      <w:hyperlink w:anchor="_Toc242690823" w:history="1">
+      <w:hyperlink w:anchor="_Toc242703567" w:history="1">
         <w:r>
           <w:rPr>
             <w:rStyle w:val="Hyperlink"/>
@@ -4064,7 +4064,7 @@
             <w:noProof/>
             <w:webHidden/>
           </w:rPr>
-          <w:instrText xml:space="preserve"> PAGEREF _Toc242690823 \h </w:instrText>
+          <w:instrText xml:space="preserve"> PAGEREF _Toc242703567 \h </w:instrText>
         </w:r>
         <w:r>
           <w:rPr>
@@ -4111,7 +4111,7 @@
           <w:lang w:eastAsia="nl-NL"/>
         </w:rPr>
       </w:pPr>
-      <w:hyperlink w:anchor="_Toc242690824" w:history="1">
+      <w:hyperlink w:anchor="_Toc242703568" w:history="1">
         <w:r>
           <w:rPr>
             <w:rStyle w:val="Hyperlink"/>
@@ -4156,7 +4156,7 @@
             <w:noProof/>
             <w:webHidden/>
           </w:rPr>
-          <w:instrText xml:space="preserve"> PAGEREF _Toc242690824 \h </w:instrText>
+          <w:instrText xml:space="preserve"> PAGEREF _Toc242703568 \h </w:instrText>
         </w:r>
         <w:r>
           <w:rPr>
@@ -4203,7 +4203,7 @@
           <w:lang w:eastAsia="nl-NL"/>
         </w:rPr>
       </w:pPr>
-      <w:hyperlink w:anchor="_Toc242690825" w:history="1">
+      <w:hyperlink w:anchor="_Toc242703569" w:history="1">
         <w:r>
           <w:rPr>
             <w:rStyle w:val="Hyperlink"/>
@@ -4280,7 +4280,7 @@
             <w:noProof/>
             <w:webHidden/>
           </w:rPr>
-          <w:instrText xml:space="preserve"> PAGEREF _Toc242690825 \h </w:instrText>
+          <w:instrText xml:space="preserve"> PAGEREF _Toc242703569 \h </w:instrText>
         </w:r>
         <w:r>
           <w:rPr>
@@ -4327,7 +4327,7 @@
           <w:lang w:eastAsia="nl-NL"/>
         </w:rPr>
       </w:pPr>
-      <w:hyperlink w:anchor="_Toc242690826" w:history="1">
+      <w:hyperlink w:anchor="_Toc242703570" w:history="1">
         <w:r>
           <w:rPr>
             <w:rStyle w:val="Hyperlink"/>
@@ -4372,7 +4372,7 @@
             <w:noProof/>
             <w:webHidden/>
           </w:rPr>
-          <w:instrText xml:space="preserve"> PAGEREF _Toc242690826 \h </w:instrText>
+          <w:instrText xml:space="preserve"> PAGEREF _Toc242703570 \h </w:instrText>
         </w:r>
         <w:r>
           <w:rPr>
@@ -4419,7 +4419,7 @@
           <w:lang w:eastAsia="nl-NL"/>
         </w:rPr>
       </w:pPr>
-      <w:hyperlink w:anchor="_Toc242690827" w:history="1">
+      <w:hyperlink w:anchor="_Toc242703571" w:history="1">
         <w:r>
           <w:rPr>
             <w:rStyle w:val="Hyperlink"/>
@@ -4464,7 +4464,7 @@
             <w:noProof/>
             <w:webHidden/>
           </w:rPr>
-          <w:instrText xml:space="preserve"> PAGEREF _Toc242690827 \h </w:instrText>
+          <w:instrText xml:space="preserve"> PAGEREF _Toc242703571 \h </w:instrText>
         </w:r>
         <w:r>
           <w:rPr>
@@ -4511,7 +4511,7 @@
           <w:lang w:eastAsia="nl-NL"/>
         </w:rPr>
       </w:pPr>
-      <w:hyperlink w:anchor="_Toc242690828" w:history="1">
+      <w:hyperlink w:anchor="_Toc242703572" w:history="1">
         <w:r>
           <w:rPr>
             <w:rStyle w:val="Hyperlink"/>
@@ -4556,7 +4556,7 @@
             <w:noProof/>
             <w:webHidden/>
           </w:rPr>
-          <w:instrText xml:space="preserve"> PAGEREF _Toc242690828 \h </w:instrText>
+          <w:instrText xml:space="preserve"> PAGEREF _Toc242703572 \h </w:instrText>
         </w:r>
         <w:r>
           <w:rPr>
@@ -4603,7 +4603,7 @@
           <w:lang w:eastAsia="nl-NL"/>
         </w:rPr>
       </w:pPr>
-      <w:hyperlink w:anchor="_Toc242690829" w:history="1">
+      <w:hyperlink w:anchor="_Toc242703573" w:history="1">
         <w:r>
           <w:rPr>
             <w:rStyle w:val="Hyperlink"/>
@@ -4648,7 +4648,7 @@
             <w:noProof/>
             <w:webHidden/>
           </w:rPr>
-          <w:instrText xml:space="preserve"> PAGEREF _Toc242690829 \h </w:instrText>
+          <w:instrText xml:space="preserve"> PAGEREF _Toc242703573 \h </w:instrText>
         </w:r>
         <w:r>
           <w:rPr>
@@ -4695,7 +4695,7 @@
           <w:lang w:eastAsia="nl-NL"/>
         </w:rPr>
       </w:pPr>
-      <w:hyperlink w:anchor="_Toc242690830" w:history="1">
+      <w:hyperlink w:anchor="_Toc242703574" w:history="1">
         <w:r>
           <w:rPr>
             <w:rStyle w:val="Hyperlink"/>
@@ -4740,7 +4740,7 @@
             <w:noProof/>
             <w:webHidden/>
           </w:rPr>
-          <w:instrText xml:space="preserve"> PAGEREF _Toc242690830 \h </w:instrText>
+          <w:instrText xml:space="preserve"> PAGEREF _Toc242703574 \h </w:instrText>
         </w:r>
         <w:r>
           <w:rPr>
@@ -4787,7 +4787,7 @@
           <w:lang w:eastAsia="nl-NL"/>
         </w:rPr>
       </w:pPr>
-      <w:hyperlink w:anchor="_Toc242690831" w:history="1">
+      <w:hyperlink w:anchor="_Toc242703575" w:history="1">
         <w:r>
           <w:rPr>
             <w:rStyle w:val="Hyperlink"/>
@@ -4832,7 +4832,7 @@
             <w:noProof/>
             <w:webHidden/>
           </w:rPr>
-          <w:instrText xml:space="preserve"> PAGEREF _Toc242690831 \h </w:instrText>
+          <w:instrText xml:space="preserve"> PAGEREF _Toc242703575 \h </w:instrText>
         </w:r>
         <w:r>
           <w:rPr>
@@ -4879,7 +4879,7 @@
           <w:lang w:eastAsia="nl-NL"/>
         </w:rPr>
       </w:pPr>
-      <w:hyperlink w:anchor="_Toc242690832" w:history="1">
+      <w:hyperlink w:anchor="_Toc242703576" w:history="1">
         <w:r>
           <w:rPr>
             <w:rStyle w:val="Hyperlink"/>
@@ -4924,7 +4924,7 @@
             <w:noProof/>
             <w:webHidden/>
           </w:rPr>
-          <w:instrText xml:space="preserve"> PAGEREF _Toc242690832 \h </w:instrText>
+          <w:instrText xml:space="preserve"> PAGEREF _Toc242703576 \h </w:instrText>
         </w:r>
         <w:r>
           <w:rPr>
@@ -4971,7 +4971,7 @@
           <w:lang w:eastAsia="nl-NL"/>
         </w:rPr>
       </w:pPr>
-      <w:hyperlink w:anchor="_Toc242690833" w:history="1">
+      <w:hyperlink w:anchor="_Toc242703577" w:history="1">
         <w:r>
           <w:rPr>
             <w:rStyle w:val="Hyperlink"/>
@@ -5016,7 +5016,7 @@
             <w:noProof/>
             <w:webHidden/>
           </w:rPr>
-          <w:instrText xml:space="preserve"> PAGEREF _Toc242690833 \h </w:instrText>
+          <w:instrText xml:space="preserve"> PAGEREF _Toc242703577 \h </w:instrText>
         </w:r>
         <w:r>
           <w:rPr>
@@ -5036,7 +5036,7 @@
             <w:noProof/>
             <w:webHidden/>
           </w:rPr>
-          <w:t>33</w:t>
+          <w:t>34</w:t>
         </w:r>
         <w:r>
           <w:rPr>
@@ -5063,7 +5063,7 @@
           <w:lang w:eastAsia="nl-NL"/>
         </w:rPr>
       </w:pPr>
-      <w:hyperlink w:anchor="_Toc242690834" w:history="1">
+      <w:hyperlink w:anchor="_Toc242703578" w:history="1">
         <w:r>
           <w:rPr>
             <w:rStyle w:val="Hyperlink"/>
@@ -5108,7 +5108,7 @@
             <w:noProof/>
             <w:webHidden/>
           </w:rPr>
-          <w:instrText xml:space="preserve"> PAGEREF _Toc242690834 \h </w:instrText>
+          <w:instrText xml:space="preserve"> PAGEREF _Toc242703578 \h </w:instrText>
         </w:r>
         <w:r>
           <w:rPr>
@@ -5128,7 +5128,7 @@
             <w:noProof/>
             <w:webHidden/>
           </w:rPr>
-          <w:t>34</w:t>
+          <w:t>35</w:t>
         </w:r>
         <w:r>
           <w:rPr>
@@ -5161,7 +5161,7 @@
         </w:numPr>
       </w:pPr>
       <w:bookmarkStart w:id="1" w:name="k1"/>
-      <w:bookmarkStart w:id="2" w:name="_Toc242690782"/>
+      <w:bookmarkStart w:id="2" w:name="_Toc242703526"/>
       <w:r>
         <w:t>DOEL VAN DE APPLICATIE.</w:t>
       </w:r>
@@ -5243,7 +5243,7 @@
         </w:numPr>
       </w:pPr>
       <w:bookmarkStart w:id="3" w:name="k2"/>
-      <w:bookmarkStart w:id="4" w:name="_Toc242690783"/>
+      <w:bookmarkStart w:id="4" w:name="_Toc242703527"/>
       <w:r>
         <w:t>BESTANDEN.</w:t>
       </w:r>
@@ -5492,7 +5492,7 @@
                 <w:sz w:val="16"/>
                 <w:szCs w:val="16"/>
               </w:rPr>
-              <w:t>) en van de pasjeslezer (</w:t>
+              <w:t>), van de pasjeslezer (</w:t>
             </w:r>
             <w:r>
               <w:rPr>
@@ -5507,7 +5507,22 @@
                 <w:sz w:val="16"/>
                 <w:szCs w:val="16"/>
               </w:rPr>
-              <w:t>)</w:t>
+              <w:t>) en na hoeveel tijd zonder invoer de beheerder wordt uitgelogd (</w:t>
+            </w:r>
+            <w:r>
+              <w:rPr>
+                <w:rFonts w:ascii="Consolas" w:hAnsi="Consolas" w:cs="Consolas"/>
+                <w:sz w:val="14"/>
+                <w:shd w:val="clear" w:color="auto" w:fill="EEF4F2"/>
+              </w:rPr>
+              <w:t>ADMIN_IDLE_LOGOUT_MS</w:t>
+            </w:r>
+            <w:r>
+              <w:rPr>
+                <w:sz w:val="16"/>
+                <w:szCs w:val="16"/>
+              </w:rPr>
+              <w:t>, 5 minuten)</w:t>
             </w:r>
           </w:p>
         </w:tc>
@@ -7121,7 +7136,7 @@
                 <w:sz w:val="16"/>
                 <w:szCs w:val="16"/>
               </w:rPr>
-              <w:t>Unit tests (547) voor de regels, de opslag, de export, het thema, de welkom- en gezichtsherkenningsfuncties, herkennen met de pas, de controller, de beveiliging en regressietests voor opgeloste bugs</w:t>
+              <w:t>Unit tests (565) voor de regels, de opslag, de export, het thema, de welkom- en gezichtsherkenningsfuncties, herkennen met de pas, de controller, de beveiliging en regressietests voor opgeloste bugs</w:t>
             </w:r>
           </w:p>
         </w:tc>
@@ -7742,7 +7757,7 @@
                 <w:sz w:val="14"/>
                 <w:shd w:val="clear" w:color="auto" w:fill="EEF4F2"/>
               </w:rPr>
-              <w:t>.gitattributes</w:t>
+              <w:t>tests/avg-toets.test.js</w:t>
             </w:r>
           </w:p>
         </w:tc>
@@ -7759,37 +7774,7 @@
                 <w:sz w:val="16"/>
                 <w:szCs w:val="16"/>
               </w:rPr>
-              <w:t xml:space="preserve">Zorgt dat Git de bestanden in </w:t>
-            </w:r>
-            <w:r>
-              <w:rPr>
-                <w:rFonts w:ascii="Consolas" w:hAnsi="Consolas" w:cs="Consolas"/>
-                <w:sz w:val="14"/>
-                <w:shd w:val="clear" w:color="auto" w:fill="EEF4F2"/>
-              </w:rPr>
-              <w:t>assets/vendor/</w:t>
-            </w:r>
-            <w:r>
-              <w:rPr>
-                <w:sz w:val="16"/>
-                <w:szCs w:val="16"/>
-              </w:rPr>
-              <w:t xml:space="preserve"> en </w:t>
-            </w:r>
-            <w:r>
-              <w:rPr>
-                <w:rFonts w:ascii="Consolas" w:hAnsi="Consolas" w:cs="Consolas"/>
-                <w:sz w:val="14"/>
-                <w:shd w:val="clear" w:color="auto" w:fill="EEF4F2"/>
-              </w:rPr>
-              <w:t>assets/fonts/</w:t>
-            </w:r>
-            <w:r>
-              <w:rPr>
-                <w:sz w:val="16"/>
-                <w:szCs w:val="16"/>
-              </w:rPr>
-              <w:t xml:space="preserve"> niet aanpast (geen omzetting van regeleinden), zodat de controlegetallen blijven kloppen</w:t>
+              <w:t>Tests voor de aanpassingen uit de AVG-toets: automatisch uitloggen van de beheerder na 5 minuten zonder invoer (met een nep-klok: net onder en precies op 5 minuten, iedere invoer begint opnieuw, open beheerformulieren gaan dicht, de melding en de timer van 10 seconden) en de uitleg over de inhouding op het loon in het productvenster</w:t>
             </w:r>
           </w:p>
         </w:tc>
@@ -7812,7 +7797,7 @@
                 <w:sz w:val="14"/>
                 <w:shd w:val="clear" w:color="auto" w:fill="EEF4F2"/>
               </w:rPr>
-              <w:t>tests/e2e/</w:t>
+              <w:t>.gitattributes</w:t>
             </w:r>
           </w:p>
         </w:tc>
@@ -7829,7 +7814,7 @@
                 <w:sz w:val="16"/>
                 <w:szCs w:val="16"/>
               </w:rPr>
-              <w:t xml:space="preserve">Browsertests (end-to-end): </w:t>
+              <w:t xml:space="preserve">Zorgt dat Git de bestanden in </w:t>
             </w:r>
             <w:r>
               <w:rPr>
@@ -7837,14 +7822,14 @@
                 <w:sz w:val="14"/>
                 <w:shd w:val="clear" w:color="auto" w:fill="EEF4F2"/>
               </w:rPr>
-              <w:t>app.e2e.test.js</w:t>
+              <w:t>assets/vendor/</w:t>
             </w:r>
             <w:r>
               <w:rPr>
                 <w:sz w:val="16"/>
                 <w:szCs w:val="16"/>
               </w:rPr>
-              <w:t xml:space="preserve"> test de echte pagina in headless Edge of Chrome (laden zonder fouten, zoeken, registreren, Escape en focus, inloggen, thema, pas koppelen en herkennen, CSV-export), </w:t>
+              <w:t xml:space="preserve"> en </w:t>
             </w:r>
             <w:r>
               <w:rPr>
@@ -7852,37 +7837,14 @@
                 <w:sz w:val="14"/>
                 <w:shd w:val="clear" w:color="auto" w:fill="EEF4F2"/>
               </w:rPr>
-              <w:t>browser.js</w:t>
+              <w:t>assets/fonts/</w:t>
             </w:r>
             <w:r>
               <w:rPr>
                 <w:sz w:val="16"/>
                 <w:szCs w:val="16"/>
               </w:rPr>
-              <w:t xml:space="preserve"> bevat de webserver en de besturing van de browser via het Chrome DevTools Protocol. Draaien met </w:t>
-            </w:r>
-            <w:r>
-              <w:rPr>
-                <w:rFonts w:ascii="Consolas" w:hAnsi="Consolas" w:cs="Consolas"/>
-                <w:sz w:val="14"/>
-                <w:shd w:val="clear" w:color="auto" w:fill="EEF4F2"/>
-              </w:rPr>
-              <w:t>npm run test:e2e</w:t>
-            </w:r>
-            <w:r>
-              <w:rPr>
-                <w:sz w:val="16"/>
-                <w:szCs w:val="16"/>
-              </w:rPr>
-              <w:t xml:space="preserve">, zonder npm-pakketten. Een andere browser kies je met </w:t>
-            </w:r>
-            <w:r>
-              <w:rPr>
-                <w:rFonts w:ascii="Consolas" w:hAnsi="Consolas" w:cs="Consolas"/>
-                <w:sz w:val="14"/>
-                <w:shd w:val="clear" w:color="auto" w:fill="EEF4F2"/>
-              </w:rPr>
-              <w:t>BROWSER_PATH</w:t>
+              <w:t xml:space="preserve"> niet aanpast (geen omzetting van regeleinden), zodat de controlegetallen blijven kloppen</w:t>
             </w:r>
           </w:p>
         </w:tc>
@@ -7905,7 +7867,7 @@
                 <w:sz w:val="14"/>
                 <w:shd w:val="clear" w:color="auto" w:fill="EEF4F2"/>
               </w:rPr>
-              <w:t>.github/workflows/ci.yml</w:t>
+              <w:t>tests/e2e/</w:t>
             </w:r>
           </w:p>
         </w:tc>
@@ -7922,6 +7884,99 @@
                 <w:sz w:val="16"/>
                 <w:szCs w:val="16"/>
               </w:rPr>
+              <w:t xml:space="preserve">Browsertests (end-to-end): </w:t>
+            </w:r>
+            <w:r>
+              <w:rPr>
+                <w:rFonts w:ascii="Consolas" w:hAnsi="Consolas" w:cs="Consolas"/>
+                <w:sz w:val="14"/>
+                <w:shd w:val="clear" w:color="auto" w:fill="EEF4F2"/>
+              </w:rPr>
+              <w:t>app.e2e.test.js</w:t>
+            </w:r>
+            <w:r>
+              <w:rPr>
+                <w:sz w:val="16"/>
+                <w:szCs w:val="16"/>
+              </w:rPr>
+              <w:t xml:space="preserve"> test de echte pagina in headless Edge of Chrome (laden zonder fouten, zoeken, registreren (daarna bij kiezen op naam geen "welkom terug"), Escape en focus, inloggen, thema, pas koppelen en herkennen, CSV-export), </w:t>
+            </w:r>
+            <w:r>
+              <w:rPr>
+                <w:rFonts w:ascii="Consolas" w:hAnsi="Consolas" w:cs="Consolas"/>
+                <w:sz w:val="14"/>
+                <w:shd w:val="clear" w:color="auto" w:fill="EEF4F2"/>
+              </w:rPr>
+              <w:t>browser.js</w:t>
+            </w:r>
+            <w:r>
+              <w:rPr>
+                <w:sz w:val="16"/>
+                <w:szCs w:val="16"/>
+              </w:rPr>
+              <w:t xml:space="preserve"> bevat de webserver en de besturing van de browser via het Chrome DevTools Protocol. Draaien met </w:t>
+            </w:r>
+            <w:r>
+              <w:rPr>
+                <w:rFonts w:ascii="Consolas" w:hAnsi="Consolas" w:cs="Consolas"/>
+                <w:sz w:val="14"/>
+                <w:shd w:val="clear" w:color="auto" w:fill="EEF4F2"/>
+              </w:rPr>
+              <w:t>npm run test:e2e</w:t>
+            </w:r>
+            <w:r>
+              <w:rPr>
+                <w:sz w:val="16"/>
+                <w:szCs w:val="16"/>
+              </w:rPr>
+              <w:t xml:space="preserve">, zonder npm-pakketten. Een andere browser kies je met </w:t>
+            </w:r>
+            <w:r>
+              <w:rPr>
+                <w:rFonts w:ascii="Consolas" w:hAnsi="Consolas" w:cs="Consolas"/>
+                <w:sz w:val="14"/>
+                <w:shd w:val="clear" w:color="auto" w:fill="EEF4F2"/>
+              </w:rPr>
+              <w:t>BROWSER_PATH</w:t>
+            </w:r>
+          </w:p>
+        </w:tc>
+      </w:tr>
+      <w:tr>
+        <w:trPr>
+          <w:cantSplit/>
+        </w:trPr>
+        <w:tc>
+          <w:tcPr>
+            <w:tcW w:w="4337" w:type="dxa"/>
+          </w:tcPr>
+          <w:p>
+            <w:pPr>
+              <w:spacing w:before="20" w:after="20" w:line="240" w:lineRule="auto"/>
+            </w:pPr>
+            <w:r>
+              <w:rPr>
+                <w:rFonts w:ascii="Consolas" w:hAnsi="Consolas" w:cs="Consolas"/>
+                <w:sz w:val="14"/>
+                <w:shd w:val="clear" w:color="auto" w:fill="EEF4F2"/>
+              </w:rPr>
+              <w:t>.github/workflows/ci.yml</w:t>
+            </w:r>
+          </w:p>
+        </w:tc>
+        <w:tc>
+          <w:tcPr>
+            <w:tcW w:w="5301" w:type="dxa"/>
+          </w:tcPr>
+          <w:p>
+            <w:pPr>
+              <w:spacing w:before="20" w:after="20" w:line="240" w:lineRule="auto"/>
+            </w:pPr>
+            <w:r>
+              <w:rPr>
+                <w:sz w:val="16"/>
+                <w:szCs w:val="16"/>
+              </w:rPr>
               <w:t>Voert de unit tests en daarna de browsertests (in Google Chrome) automatisch uit op GitHub met Node.js 24 (LTS), met alleen leesrechten en actions die op een commit-SHA zijn vastgezet</w:t>
             </w:r>
           </w:p>
@@ -7963,7 +8018,7 @@
         </w:numPr>
       </w:pPr>
       <w:bookmarkStart w:id="5" w:name="k3"/>
-      <w:bookmarkStart w:id="6" w:name="_Toc242690784"/>
+      <w:bookmarkStart w:id="6" w:name="_Toc242703528"/>
       <w:r>
         <w:t>DE WEBSITE STARTEN.</w:t>
       </w:r>
@@ -8185,7 +8240,7 @@
         </w:numPr>
       </w:pPr>
       <w:bookmarkStart w:id="7" w:name="k4"/>
-      <w:bookmarkStart w:id="8" w:name="_Toc242690785"/>
+      <w:bookmarkStart w:id="8" w:name="_Toc242703529"/>
       <w:r>
         <w:t>GEBRUIKERSHANDLEIDING.</w:t>
       </w:r>
@@ -8198,7 +8253,7 @@
         <w:keepNext/>
       </w:pPr>
       <w:bookmarkStart w:id="9" w:name="k5"/>
-      <w:bookmarkStart w:id="10" w:name="_Toc242690786"/>
+      <w:bookmarkStart w:id="10" w:name="_Toc242703530"/>
       <w:r>
         <w:t>EEN MEDEWERKER ZOEKEN</w:t>
       </w:r>
@@ -8253,7 +8308,7 @@
         <w:keepNext/>
       </w:pPr>
       <w:bookmarkStart w:id="11" w:name="k6"/>
-      <w:bookmarkStart w:id="12" w:name="_Toc242690787"/>
+      <w:bookmarkStart w:id="12" w:name="_Toc242703531"/>
       <w:r>
         <w:t>EEN PRODUCT REGISTREREN</w:t>
       </w:r>
@@ -8464,7 +8519,7 @@
         <w:keepNext/>
       </w:pPr>
       <w:bookmarkStart w:id="13" w:name="k7"/>
-      <w:bookmarkStart w:id="14" w:name="_Toc242690788"/>
+      <w:bookmarkStart w:id="14" w:name="_Toc242703532"/>
       <w:r>
         <w:t>ADMIN-DASHBOARD OPENEN</w:t>
       </w:r>
@@ -8595,7 +8650,7 @@
         <w:keepNext/>
       </w:pPr>
       <w:bookmarkStart w:id="15" w:name="k8"/>
-      <w:bookmarkStart w:id="16" w:name="_Toc242690789"/>
+      <w:bookmarkStart w:id="16" w:name="_Toc242703533"/>
       <w:r>
         <w:t>REGISTRATIES BEHEREN</w:t>
       </w:r>
@@ -8881,7 +8936,7 @@
         <w:keepNext/>
       </w:pPr>
       <w:bookmarkStart w:id="17" w:name="k9"/>
-      <w:bookmarkStart w:id="18" w:name="_Toc242690790"/>
+      <w:bookmarkStart w:id="18" w:name="_Toc242703534"/>
       <w:r>
         <w:t>MEDEWERKERS BEHEREN</w:t>
       </w:r>
@@ -9201,7 +9256,7 @@
         <w:keepNext/>
       </w:pPr>
       <w:bookmarkStart w:id="19" w:name="k10"/>
-      <w:bookmarkStart w:id="20" w:name="_Toc242690791"/>
+      <w:bookmarkStart w:id="20" w:name="_Toc242703535"/>
       <w:r>
         <w:t>PRODUCTEN BEHEREN</w:t>
       </w:r>
@@ -9329,7 +9384,7 @@
         <w:keepNext/>
       </w:pPr>
       <w:bookmarkStart w:id="21" w:name="k11"/>
-      <w:bookmarkStart w:id="22" w:name="_Toc242690792"/>
+      <w:bookmarkStart w:id="22" w:name="_Toc242703536"/>
       <w:r>
         <w:t>BEDRIJVEN EN CONSUMPTIEPUNTEN BEHEREN</w:t>
       </w:r>
@@ -9492,7 +9547,7 @@
         <w:keepNext/>
       </w:pPr>
       <w:bookmarkStart w:id="23" w:name="k12"/>
-      <w:bookmarkStart w:id="24" w:name="_Toc242690793"/>
+      <w:bookmarkStart w:id="24" w:name="_Toc242703537"/>
       <w:r>
         <w:t>VOORRAAD BEHEREN</w:t>
       </w:r>
@@ -9710,7 +9765,7 @@
         <w:keepNext/>
       </w:pPr>
       <w:bookmarkStart w:id="25" w:name="k13"/>
-      <w:bookmarkStart w:id="26" w:name="_Toc242690794"/>
+      <w:bookmarkStart w:id="26" w:name="_Toc242703538"/>
       <w:r>
         <w:t>LOGBOEK BEKIJKEN</w:t>
       </w:r>
@@ -9750,7 +9805,7 @@
         <w:keepNext/>
       </w:pPr>
       <w:bookmarkStart w:id="27" w:name="k14"/>
-      <w:bookmarkStart w:id="28" w:name="_Toc242690795"/>
+      <w:bookmarkStart w:id="28" w:name="_Toc242703539"/>
       <w:r>
         <w:t>ALLE GEGEVENS WISSEN</w:t>
       </w:r>
@@ -9876,7 +9931,7 @@
         <w:keepNext/>
       </w:pPr>
       <w:bookmarkStart w:id="29" w:name="k15"/>
-      <w:bookmarkStart w:id="30" w:name="_Toc242690796"/>
+      <w:bookmarkStart w:id="30" w:name="_Toc242703540"/>
       <w:r>
         <w:t>MODAL SLUITEN EN UITLOGGEN</w:t>
       </w:r>
@@ -9900,12 +9955,57 @@
       </w:r>
     </w:p>
     <w:p>
+      <w:r>
+        <w:rPr>
+          <w:b/>
+          <w:bCs/>
+        </w:rPr>
+        <w:t>Automatisch uitloggen.</w:t>
+      </w:r>
+      <w:r>
+        <w:t xml:space="preserve"> Gebruikt de beheerder het beheer 5 minuten niet (geen muisbeweging, klik, toets, aanraking of scroll), dan logt de website de beheerder vanzelf uit. Open formulieren en het venster </w:t>
+      </w:r>
+      <w:r>
+        <w:rPr>
+          <w:rFonts w:ascii="Consolas" w:hAnsi="Consolas" w:cs="Consolas"/>
+          <w:sz w:val="18"/>
+          <w:shd w:val="clear" w:color="auto" w:fill="EEF4F2"/>
+        </w:rPr>
+        <w:t>Registratie verwijderen</w:t>
+      </w:r>
+      <w:r>
+        <w:t xml:space="preserve"> gaan dicht zonder op te slaan, het beheervenster sluit en onderaan verschijnt "Je bent automatisch uitgelogd omdat het beheer 5 minuten niet is gebruikt." Zo blijft het beheer niet open staan als de beheerder wegloopt. De tijd staat in </w:t>
+      </w:r>
+      <w:r>
+        <w:rPr>
+          <w:rFonts w:ascii="Consolas" w:hAnsi="Consolas" w:cs="Consolas"/>
+          <w:sz w:val="18"/>
+          <w:shd w:val="clear" w:color="auto" w:fill="EEF4F2"/>
+        </w:rPr>
+        <w:t>config.js</w:t>
+      </w:r>
+      <w:r>
+        <w:t xml:space="preserve"> (</w:t>
+      </w:r>
+      <w:r>
+        <w:rPr>
+          <w:rFonts w:ascii="Consolas" w:hAnsi="Consolas" w:cs="Consolas"/>
+          <w:sz w:val="18"/>
+          <w:shd w:val="clear" w:color="auto" w:fill="EEF4F2"/>
+        </w:rPr>
+        <w:t>ADMIN_IDLE_LOGOUT_MS</w:t>
+      </w:r>
+      <w:r>
+        <w:t>). Een timer kijkt iedere 10 seconden of de tijd voorbij is.</w:t>
+      </w:r>
+    </w:p>
+    <w:p>
       <w:pPr>
         <w:pStyle w:val="Kop2"/>
         <w:keepNext/>
       </w:pPr>
       <w:bookmarkStart w:id="31" w:name="k16"/>
-      <w:bookmarkStart w:id="32" w:name="_Toc242690797"/>
+      <w:bookmarkStart w:id="32" w:name="_Toc242703541"/>
       <w:r>
         <w:t>CSV EXPORTEREN</w:t>
       </w:r>
@@ -9932,8 +10032,6 @@
       </w:r>
       <w:r>
         <w:tab/>
-      </w:r>
-      <w:r>
         <w:t>Open het admin-dashboard.</w:t>
       </w:r>
     </w:p>
@@ -10242,7 +10340,7 @@
         <w:keepNext/>
       </w:pPr>
       <w:bookmarkStart w:id="33" w:name="k17"/>
-      <w:bookmarkStart w:id="34" w:name="_Toc242690798"/>
+      <w:bookmarkStart w:id="34" w:name="_Toc242703542"/>
       <w:r>
         <w:t>LICHT OF DONKER THEMA</w:t>
       </w:r>
@@ -10349,7 +10447,7 @@
         <w:keepNext/>
       </w:pPr>
       <w:bookmarkStart w:id="35" w:name="k18"/>
-      <w:bookmarkStart w:id="36" w:name="_Toc242690799"/>
+      <w:bookmarkStart w:id="36" w:name="_Toc242703543"/>
       <w:r>
         <w:t>WELKOM EN "ZELFDE ALS VORIGE KEER"</w:t>
       </w:r>
@@ -10358,7 +10456,10 @@
     </w:p>
     <w:p>
       <w:r>
-        <w:t xml:space="preserve">Als een medewerker het productvenster opent, verschijnt een persoonlijke begroeting die past bij het tijdstip, bijvoorbeeld "Goedemorgen Lotte, welkom terug." Heeft de medewerker eerder iets geregistreerd, dan staat erboven wat er de vorige keer is gekozen ("Vorige keer koos je 1× Blikje en 1× Ei."). Met de knop </w:t>
+        <w:t>Als een medewerker het productvenster opent, verschijnt een persoonlijke begroeting die past bij het tijdstip, bijvoorbeeld "Goedemorgen Lotte." Is de medewerker herkend met de pas of de camera en heeft hij eerder zelf iets geregistreerd, dan wordt dat "Goedemorgen Lotte, welkom terug." en staat eronder wat er de vorige keer is gekozen ("Vorige keer koos je 1× Blikje en 1× Ei."). Wie op een naam in de lijst tikt, ziet die twee dingen niet. Iedereen kan op de naam van een collega tikken, en dan zou te zien z</w:t>
+      </w:r>
+      <w:r>
+        <w:t xml:space="preserve">ijn of die collega al eens iets registreerde en wat (privacy, zie het TO hoofdstuk 13). Met de knop </w:t>
       </w:r>
       <w:r>
         <w:rPr>
@@ -10380,7 +10481,7 @@
         <w:t>Registreren</w:t>
       </w:r>
       <w:r>
-        <w:t xml:space="preserve">. Correcties van de beheerder tellen hierbij niet mee, ook niet voor "welkom terug". Bij het openen staat de focus op de eerste </w:t>
+        <w:t xml:space="preserve">. Correcties van de beheerder tellen hierbij niet mee, ook niet voor "welkom terug". Onder in het productvenster staat in kleine grijze tekst "Wat je registreert, wordt maandelijks ingehouden op je loon. Meer informatie staat in de privacyverklaring voor medewerkers." Er staat geen link bij, omdat TVB de privacyverklaring nog moet vaststellen. Bij het openen staat de focus op de eerste </w:t>
       </w:r>
       <w:r>
         <w:rPr>
@@ -10422,7 +10523,7 @@
         <w:keepNext/>
       </w:pPr>
       <w:bookmarkStart w:id="37" w:name="k19"/>
-      <w:bookmarkStart w:id="38" w:name="_Toc242690800"/>
+      <w:bookmarkStart w:id="38" w:name="_Toc242703544"/>
       <w:r>
         <w:t>DEMO GEZICHTSHERKENNING</w:t>
       </w:r>
@@ -10488,8 +10589,6 @@
       </w:r>
       <w:r>
         <w:tab/>
-      </w:r>
-      <w:r>
         <w:t xml:space="preserve">De camera van de tablet of laptop gaat aan. Plaats je gezicht in het kader, zet het vinkje voor vrijwillige deelname en klik op </w:t>
       </w:r>
       <w:r>
@@ -10630,7 +10729,7 @@
         <w:keepNext/>
       </w:pPr>
       <w:bookmarkStart w:id="39" w:name="k20"/>
-      <w:bookmarkStart w:id="40" w:name="_Toc242690801"/>
+      <w:bookmarkStart w:id="40" w:name="_Toc242703545"/>
       <w:r>
         <w:t>HERKENNEN MET DE PAS</w:t>
       </w:r>
@@ -10824,7 +10923,7 @@
         </w:numPr>
       </w:pPr>
       <w:bookmarkStart w:id="41" w:name="k21"/>
-      <w:bookmarkStart w:id="42" w:name="_Toc242690802"/>
+      <w:bookmarkStart w:id="42" w:name="_Toc242703546"/>
       <w:r>
         <w:t xml:space="preserve">UITLEG VAN </w:t>
       </w:r>
@@ -10848,7 +10947,7 @@
         <w:keepNext/>
       </w:pPr>
       <w:bookmarkStart w:id="43" w:name="k22"/>
-      <w:bookmarkStart w:id="44" w:name="_Toc242690803"/>
+      <w:bookmarkStart w:id="44" w:name="_Toc242703547"/>
       <w:r>
         <w:t>METADATA EN EXTERNE BESTANDEN</w:t>
       </w:r>
@@ -11124,7 +11223,7 @@
         <w:keepNext/>
       </w:pPr>
       <w:bookmarkStart w:id="45" w:name="k23"/>
-      <w:bookmarkStart w:id="46" w:name="_Toc242690804"/>
+      <w:bookmarkStart w:id="46" w:name="_Toc242703548"/>
       <w:r>
         <w:t>NAVIGATIEBALK</w:t>
       </w:r>
@@ -11337,7 +11436,7 @@
         <w:keepNext/>
       </w:pPr>
       <w:bookmarkStart w:id="47" w:name="k24"/>
-      <w:bookmarkStart w:id="48" w:name="_Toc242690805"/>
+      <w:bookmarkStart w:id="48" w:name="_Toc242703549"/>
       <w:r>
         <w:t>HERO-GEDEELTE</w:t>
       </w:r>
@@ -11382,7 +11481,7 @@
         <w:keepNext/>
       </w:pPr>
       <w:bookmarkStart w:id="49" w:name="k25"/>
-      <w:bookmarkStart w:id="50" w:name="_Toc242690806"/>
+      <w:bookmarkStart w:id="50" w:name="_Toc242703550"/>
       <w:r>
         <w:t>MEDEWERKERLIJST</w:t>
       </w:r>
@@ -11645,7 +11744,7 @@
         <w:keepNext/>
       </w:pPr>
       <w:bookmarkStart w:id="51" w:name="k26"/>
-      <w:bookmarkStart w:id="52" w:name="_Toc242690807"/>
+      <w:bookmarkStart w:id="52" w:name="_Toc242703551"/>
       <w:r>
         <w:t>STATISTIEKEN</w:t>
       </w:r>
@@ -11728,7 +11827,7 @@
         <w:keepNext/>
       </w:pPr>
       <w:bookmarkStart w:id="53" w:name="k27"/>
-      <w:bookmarkStart w:id="54" w:name="_Toc242690808"/>
+      <w:bookmarkStart w:id="54" w:name="_Toc242703552"/>
       <w:r>
         <w:t>VENSTERS (MODALS)</w:t>
       </w:r>
@@ -11943,7 +12042,22 @@
                 <w:sz w:val="16"/>
                 <w:szCs w:val="16"/>
               </w:rPr>
-              <w:t xml:space="preserve"> en de link voor de demo gezichtsherkenning</w:t>
+              <w:t xml:space="preserve"> (alleen na herkenning met pas of camera), de link voor de demo gezichtsherkenning en de uitleg over de inhouding op het loon (</w:t>
+            </w:r>
+            <w:r>
+              <w:rPr>
+                <w:rFonts w:ascii="Consolas" w:hAnsi="Consolas" w:cs="Consolas"/>
+                <w:sz w:val="14"/>
+                <w:shd w:val="clear" w:color="auto" w:fill="EEF4F2"/>
+              </w:rPr>
+              <w:t>employeePrivacyNote</w:t>
+            </w:r>
+            <w:r>
+              <w:rPr>
+                <w:sz w:val="16"/>
+                <w:szCs w:val="16"/>
+              </w:rPr>
+              <w:t>)</w:t>
             </w:r>
           </w:p>
         </w:tc>
@@ -12241,7 +12355,7 @@
         <w:keepNext/>
       </w:pPr>
       <w:bookmarkStart w:id="55" w:name="k28"/>
-      <w:bookmarkStart w:id="56" w:name="_Toc242690809"/>
+      <w:bookmarkStart w:id="56" w:name="_Toc242703553"/>
       <w:r>
         <w:t>WAARSCHUWING BIJ OPENEN ALS LOS BESTAND</w:t>
       </w:r>
@@ -12286,7 +12400,7 @@
         </w:numPr>
       </w:pPr>
       <w:bookmarkStart w:id="57" w:name="k29"/>
-      <w:bookmarkStart w:id="58" w:name="_Toc242690810"/>
+      <w:bookmarkStart w:id="58" w:name="_Toc242703554"/>
       <w:r>
         <w:t xml:space="preserve">UITLEG VAN </w:t>
       </w:r>
@@ -12310,7 +12424,7 @@
         <w:keepNext/>
       </w:pPr>
       <w:bookmarkStart w:id="59" w:name="k30"/>
-      <w:bookmarkStart w:id="60" w:name="_Toc242690811"/>
+      <w:bookmarkStart w:id="60" w:name="_Toc242703555"/>
       <w:r>
         <w:t>CSS-VARIABELEN</w:t>
       </w:r>
@@ -12985,7 +13099,7 @@
         <w:keepNext/>
       </w:pPr>
       <w:bookmarkStart w:id="61" w:name="k31"/>
-      <w:bookmarkStart w:id="62" w:name="_Toc242690812"/>
+      <w:bookmarkStart w:id="62" w:name="_Toc242703556"/>
       <w:r>
         <w:t>LAYOUT</w:t>
       </w:r>
@@ -13506,7 +13620,7 @@
         <w:keepNext/>
       </w:pPr>
       <w:bookmarkStart w:id="63" w:name="k32"/>
-      <w:bookmarkStart w:id="64" w:name="_Toc242690813"/>
+      <w:bookmarkStart w:id="64" w:name="_Toc242703557"/>
       <w:r>
         <w:t>COMPONENTEN</w:t>
       </w:r>
@@ -13607,7 +13721,7 @@
         <w:t>+</w:t>
       </w:r>
       <w:r>
-        <w:t xml:space="preserve">-knoppen, de begroeting en het voorstel </w:t>
+        <w:t xml:space="preserve">-knoppen, de begroeting, het voorstel </w:t>
       </w:r>
       <w:r>
         <w:rPr>
@@ -13618,7 +13732,7 @@
         <w:t>Zelfde als vorige keer</w:t>
       </w:r>
       <w:r>
-        <w:t>.</w:t>
+        <w:t xml:space="preserve"> (na herkenning met pas of camera) en de uitleg over de inhouding op het loon.</w:t>
       </w:r>
     </w:p>
     <w:p>
@@ -13729,7 +13843,7 @@
         </w:numPr>
       </w:pPr>
       <w:bookmarkStart w:id="65" w:name="k33"/>
-      <w:bookmarkStart w:id="66" w:name="_Toc242690814"/>
+      <w:bookmarkStart w:id="66" w:name="_Toc242703558"/>
       <w:r>
         <w:t>UITLEG VAN DE JAVASCRIPT (</w:t>
       </w:r>
@@ -13753,7 +13867,7 @@
         <w:keepNext/>
       </w:pPr>
       <w:bookmarkStart w:id="67" w:name="k34"/>
-      <w:bookmarkStart w:id="68" w:name="_Toc242690815"/>
+      <w:bookmarkStart w:id="68" w:name="_Toc242703559"/>
       <w:r>
         <w:t>OPSLAG EN VOORBEELDDATA</w:t>
       </w:r>
@@ -14530,7 +14644,7 @@
         <w:keepNext/>
       </w:pPr>
       <w:bookmarkStart w:id="69" w:name="k35"/>
-      <w:bookmarkStart w:id="70" w:name="_Toc242690816"/>
+      <w:bookmarkStart w:id="70" w:name="_Toc242703560"/>
       <w:r>
         <w:t>OBJECTGEORIËNTEERDE STRUCTUUR</w:t>
       </w:r>
@@ -15013,7 +15127,7 @@
         <w:t>Compositie:</w:t>
       </w:r>
       <w:r>
-        <w:t xml:space="preserve"> de controller krijgt het model, de view, de export, de demo gezichtsherkenning en de pasjeslezer mee in de constructor, in plaats van ze zelf te maken. Daardoor kan in de tests een nep-view of nep-export worden meegegeven. De controller maakt wel zelf zijn acht onderdelen en geeft zichzelf daarbij mee.</w:t>
+        <w:t xml:space="preserve"> de controller krijgt het model, de view, de export, de demo gezichtsherkenning, de pasjeslezer en de klok voor het automatisch uitloggen mee in de constructor, in plaats van ze zelf te maken. Daardoor kan in de tests een nep-view of nep-export worden meegegeven. De controller maakt wel zelf zijn acht onderdelen en geeft zichzelf daarbij mee.</w:t>
       </w:r>
     </w:p>
     <w:p>
@@ -17599,10 +17713,87 @@
           <w:sz w:val="18"/>
           <w:shd w:val="clear" w:color="auto" w:fill="EEF4F2"/>
         </w:rPr>
-        <w:t>finishAdminChange</w:t>
-      </w:r>
-      <w:r>
-        <w:t>: tekent na een beheerwijziging alle beheeronderdelen opnieuw, ook de registratietabel (zodat bijvoorbeeld een nieuwe productnaam daar meteen staat), zonder nog eens apart op te slaan.</w:t>
+        <w:t>startIdleWatch</w:t>
+      </w:r>
+      <w:r>
+        <w:t xml:space="preserve">, </w:t>
+      </w:r>
+      <w:r>
+        <w:rPr>
+          <w:rFonts w:ascii="Consolas" w:hAnsi="Consolas" w:cs="Consolas"/>
+          <w:sz w:val="18"/>
+          <w:shd w:val="clear" w:color="auto" w:fill="EEF4F2"/>
+        </w:rPr>
+        <w:t>noteAdminActivity</w:t>
+      </w:r>
+      <w:r>
+        <w:t xml:space="preserve"> en </w:t>
+      </w:r>
+      <w:r>
+        <w:rPr>
+          <w:rFonts w:ascii="Consolas" w:hAnsi="Consolas" w:cs="Consolas"/>
+          <w:sz w:val="18"/>
+          <w:shd w:val="clear" w:color="auto" w:fill="EEF4F2"/>
+        </w:rPr>
+        <w:t>logoutIfIdle</w:t>
+      </w:r>
+      <w:r>
+        <w:t xml:space="preserve">: automatisch uitloggen. </w:t>
+      </w:r>
+      <w:r>
+        <w:rPr>
+          <w:rFonts w:ascii="Consolas" w:hAnsi="Consolas" w:cs="Consolas"/>
+          <w:sz w:val="18"/>
+          <w:shd w:val="clear" w:color="auto" w:fill="EEF4F2"/>
+        </w:rPr>
+        <w:t>startIdleWatch</w:t>
+      </w:r>
+      <w:r>
+        <w:t xml:space="preserve"> start bij het opstarten een timer die iedere 10 seconden </w:t>
+      </w:r>
+      <w:r>
+        <w:rPr>
+          <w:rFonts w:ascii="Consolas" w:hAnsi="Consolas" w:cs="Consolas"/>
+          <w:sz w:val="18"/>
+          <w:shd w:val="clear" w:color="auto" w:fill="EEF4F2"/>
+        </w:rPr>
+        <w:t>logoutIfIdle</w:t>
+      </w:r>
+      <w:r>
+        <w:t xml:space="preserve"> aanroept. </w:t>
+      </w:r>
+      <w:r>
+        <w:rPr>
+          <w:rFonts w:ascii="Consolas" w:hAnsi="Consolas" w:cs="Consolas"/>
+          <w:sz w:val="18"/>
+          <w:shd w:val="clear" w:color="auto" w:fill="EEF4F2"/>
+        </w:rPr>
+        <w:t>noteAdminActivity</w:t>
+      </w:r>
+      <w:r>
+        <w:t xml:space="preserve"> onthoudt bij iedere muisbeweging, klik, toets, aanraking of scroll het tijdstip, maar alleen als de beheerder is ingelogd. </w:t>
+      </w:r>
+      <w:r>
+        <w:rPr>
+          <w:rFonts w:ascii="Consolas" w:hAnsi="Consolas" w:cs="Consolas"/>
+          <w:sz w:val="18"/>
+          <w:shd w:val="clear" w:color="auto" w:fill="EEF4F2"/>
+        </w:rPr>
+        <w:t>logoutIfIdle</w:t>
+      </w:r>
+      <w:r>
+        <w:t xml:space="preserve"> sluit na 5 minuten zonder invoer de open beheerformulieren en het beheervenster en toont de melding. De klok (tijd en timer) wordt aan de constructor meegegeven, net als bij </w:t>
+      </w:r>
+      <w:r>
+        <w:rPr>
+          <w:rFonts w:ascii="Consolas" w:hAnsi="Consolas" w:cs="Consolas"/>
+          <w:sz w:val="18"/>
+          <w:shd w:val="clear" w:color="auto" w:fill="EEF4F2"/>
+        </w:rPr>
+        <w:t>BadgeReader</w:t>
+      </w:r>
+      <w:r>
+        <w:t>, zodat de tests met een nep-klok werken.</w:t>
       </w:r>
     </w:p>
     <w:p>
@@ -17621,10 +17812,10 @@
           <w:sz w:val="18"/>
           <w:shd w:val="clear" w:color="auto" w:fill="EEF4F2"/>
         </w:rPr>
-        <w:t>showMissing</w:t>
-      </w:r>
-      <w:r>
-        <w:t>: knoppen en formulieren van iets dat niet meer bestaat, geven hiermee een melding in plaats van het gegeven opnieuw aan te maken.</w:t>
+        <w:t>finishAdminChange</w:t>
+      </w:r>
+      <w:r>
+        <w:t>: tekent na een beheerwijziging alle beheeronderdelen opnieuw, ook de registratietabel (zodat bijvoorbeeld een nieuwe productnaam daar meteen staat), zonder nog eens apart op te slaan.</w:t>
       </w:r>
     </w:p>
     <w:p>
@@ -17643,21 +17834,10 @@
           <w:sz w:val="18"/>
           <w:shd w:val="clear" w:color="auto" w:fill="EEF4F2"/>
         </w:rPr>
-        <w:t>exportCsv</w:t>
-      </w:r>
-      <w:r>
-        <w:t xml:space="preserve">: laat </w:t>
-      </w:r>
-      <w:r>
-        <w:rPr>
-          <w:rFonts w:ascii="Consolas" w:hAnsi="Consolas" w:cs="Consolas"/>
-          <w:sz w:val="18"/>
-          <w:shd w:val="clear" w:color="auto" w:fill="EEF4F2"/>
-        </w:rPr>
-        <w:t>CsvExport</w:t>
-      </w:r>
-      <w:r>
-        <w:t xml:space="preserve"> het bestand maken (zie CSV-export hieronder).</w:t>
+        <w:t>showMissing</w:t>
+      </w:r>
+      <w:r>
+        <w:t>: knoppen en formulieren van iets dat niet meer bestaat, geven hiermee een melding in plaats van het gegeven opnieuw aan te maken.</w:t>
       </w:r>
     </w:p>
     <w:p>
@@ -17676,112 +17856,21 @@
           <w:sz w:val="18"/>
           <w:shd w:val="clear" w:color="auto" w:fill="EEF4F2"/>
         </w:rPr>
-        <w:t>wipeAllData</w:t>
-      </w:r>
-      <w:r>
-        <w:t xml:space="preserve">: de knop </w:t>
-      </w:r>
-      <w:r>
-        <w:rPr>
-          <w:rFonts w:ascii="Consolas" w:hAnsi="Consolas" w:cs="Consolas"/>
-          <w:sz w:val="18"/>
-          <w:shd w:val="clear" w:color="auto" w:fill="EEF4F2"/>
-        </w:rPr>
-        <w:t>Alle gegevens wissen</w:t>
-      </w:r>
-      <w:r>
-        <w:t>. Doet niets als er geen beheerder is ingelogd. Vraagt twee keer om bevestiging, laat het model alles wissen (</w:t>
-      </w:r>
-      <w:r>
-        <w:rPr>
-          <w:rFonts w:ascii="Consolas" w:hAnsi="Consolas" w:cs="Consolas"/>
-          <w:sz w:val="18"/>
-          <w:shd w:val="clear" w:color="auto" w:fill="EEF4F2"/>
-        </w:rPr>
-        <w:t>wipeAll</w:t>
-      </w:r>
-      <w:r>
-        <w:t>), slaat de nieuwe demogegevens op, vergeet de ingestelde gezichten, logt de beheerder uit en tekent alles opnieuw.</w:t>
-      </w:r>
-    </w:p>
-    <w:p>
-      <w:pPr>
-        <w:pStyle w:val="Lijstalinea"/>
-        <w:numPr>
-          <w:ilvl w:val="0"/>
-          <w:numId w:val="3"/>
-        </w:numPr>
-        <w:contextualSpacing w:val="0"/>
-      </w:pPr>
-      <w:r>
-        <w:rPr>
-          <w:rFonts w:ascii="Consolas" w:hAnsi="Consolas" w:cs="Consolas"/>
-          <w:sz w:val="18"/>
-          <w:shd w:val="clear" w:color="auto" w:fill="EEF4F2"/>
-        </w:rPr>
-        <w:t>toggleEmployee</w:t>
-      </w:r>
-      <w:r>
-        <w:t xml:space="preserve">, </w:t>
-      </w:r>
-      <w:r>
-        <w:rPr>
-          <w:rFonts w:ascii="Consolas" w:hAnsi="Consolas" w:cs="Consolas"/>
-          <w:sz w:val="18"/>
-          <w:shd w:val="clear" w:color="auto" w:fill="EEF4F2"/>
-        </w:rPr>
-        <w:t>removeEmployee</w:t>
-      </w:r>
-      <w:r>
-        <w:t xml:space="preserve">, </w:t>
-      </w:r>
-      <w:r>
-        <w:rPr>
-          <w:rFonts w:ascii="Consolas" w:hAnsi="Consolas" w:cs="Consolas"/>
-          <w:sz w:val="18"/>
-          <w:shd w:val="clear" w:color="auto" w:fill="EEF4F2"/>
-        </w:rPr>
-        <w:t>removeProduct</w:t>
-      </w:r>
-      <w:r>
-        <w:t xml:space="preserve">, </w:t>
-      </w:r>
-      <w:r>
-        <w:rPr>
-          <w:rFonts w:ascii="Consolas" w:hAnsi="Consolas" w:cs="Consolas"/>
-          <w:sz w:val="18"/>
-          <w:shd w:val="clear" w:color="auto" w:fill="EEF4F2"/>
-        </w:rPr>
-        <w:t>removeCompany</w:t>
-      </w:r>
-      <w:r>
-        <w:t xml:space="preserve"> en </w:t>
-      </w:r>
-      <w:r>
-        <w:rPr>
-          <w:rFonts w:ascii="Consolas" w:hAnsi="Consolas" w:cs="Consolas"/>
-          <w:sz w:val="18"/>
-          <w:shd w:val="clear" w:color="auto" w:fill="EEF4F2"/>
-        </w:rPr>
-        <w:t>removePoint</w:t>
-      </w:r>
-      <w:r>
-        <w:t>: de knoppen in de beheerlijsten.</w:t>
-      </w:r>
-    </w:p>
-    <w:p>
-      <w:r>
-        <w:rPr>
-          <w:rFonts w:ascii="Consolas" w:hAnsi="Consolas" w:cs="Consolas"/>
-          <w:b/>
-          <w:bCs/>
-          <w:sz w:val="18"/>
-          <w:shd w:val="clear" w:color="auto" w:fill="EEF4F2"/>
-        </w:rPr>
-        <w:t>CorrectionController</w:t>
-      </w:r>
-      <w:r>
-        <w:t xml:space="preserve"> regelt de correcties in het tabblad Registraties:</w:t>
+        <w:t>exportCsv</w:t>
+      </w:r>
+      <w:r>
+        <w:t xml:space="preserve">: laat </w:t>
+      </w:r>
+      <w:r>
+        <w:rPr>
+          <w:rFonts w:ascii="Consolas" w:hAnsi="Consolas" w:cs="Consolas"/>
+          <w:sz w:val="18"/>
+          <w:shd w:val="clear" w:color="auto" w:fill="EEF4F2"/>
+        </w:rPr>
+        <w:t>CsvExport</w:t>
+      </w:r>
+      <w:r>
+        <w:t xml:space="preserve"> het bestand maken (zie CSV-export hieronder).</w:t>
       </w:r>
     </w:p>
     <w:p>
@@ -17800,7 +17889,50 @@
           <w:sz w:val="18"/>
           <w:shd w:val="clear" w:color="auto" w:fill="EEF4F2"/>
         </w:rPr>
-        <w:t>resetCorrectionDate</w:t>
+        <w:t>wipeAllData</w:t>
+      </w:r>
+      <w:r>
+        <w:t xml:space="preserve">: de knop </w:t>
+      </w:r>
+      <w:r>
+        <w:rPr>
+          <w:rFonts w:ascii="Consolas" w:hAnsi="Consolas" w:cs="Consolas"/>
+          <w:sz w:val="18"/>
+          <w:shd w:val="clear" w:color="auto" w:fill="EEF4F2"/>
+        </w:rPr>
+        <w:t>Alle gegevens wissen</w:t>
+      </w:r>
+      <w:r>
+        <w:t>. Doet niets als er geen beheerder is ingelogd. Vraagt twee keer om bevestiging, laat het model alles wissen (</w:t>
+      </w:r>
+      <w:r>
+        <w:rPr>
+          <w:rFonts w:ascii="Consolas" w:hAnsi="Consolas" w:cs="Consolas"/>
+          <w:sz w:val="18"/>
+          <w:shd w:val="clear" w:color="auto" w:fill="EEF4F2"/>
+        </w:rPr>
+        <w:t>wipeAll</w:t>
+      </w:r>
+      <w:r>
+        <w:t>), slaat de nieuwe demogegevens op, vergeet de ingestelde gezichten, logt de beheerder uit en tekent alles opnieuw.</w:t>
+      </w:r>
+    </w:p>
+    <w:p>
+      <w:pPr>
+        <w:pStyle w:val="Lijstalinea"/>
+        <w:numPr>
+          <w:ilvl w:val="0"/>
+          <w:numId w:val="3"/>
+        </w:numPr>
+        <w:contextualSpacing w:val="0"/>
+      </w:pPr>
+      <w:r>
+        <w:rPr>
+          <w:rFonts w:ascii="Consolas" w:hAnsi="Consolas" w:cs="Consolas"/>
+          <w:sz w:val="18"/>
+          <w:shd w:val="clear" w:color="auto" w:fill="EEF4F2"/>
+        </w:rPr>
+        <w:t>toggleEmployee</w:t>
       </w:r>
       <w:r>
         <w:t xml:space="preserve">, </w:t>
@@ -17811,7 +17943,29 @@
           <w:sz w:val="18"/>
           <w:shd w:val="clear" w:color="auto" w:fill="EEF4F2"/>
         </w:rPr>
-        <w:t>readCorrectionDate</w:t>
+        <w:t>removeEmployee</w:t>
+      </w:r>
+      <w:r>
+        <w:t xml:space="preserve">, </w:t>
+      </w:r>
+      <w:r>
+        <w:rPr>
+          <w:rFonts w:ascii="Consolas" w:hAnsi="Consolas" w:cs="Consolas"/>
+          <w:sz w:val="18"/>
+          <w:shd w:val="clear" w:color="auto" w:fill="EEF4F2"/>
+        </w:rPr>
+        <w:t>removeProduct</w:t>
+      </w:r>
+      <w:r>
+        <w:t xml:space="preserve">, </w:t>
+      </w:r>
+      <w:r>
+        <w:rPr>
+          <w:rFonts w:ascii="Consolas" w:hAnsi="Consolas" w:cs="Consolas"/>
+          <w:sz w:val="18"/>
+          <w:shd w:val="clear" w:color="auto" w:fill="EEF4F2"/>
+        </w:rPr>
+        <w:t>removeCompany</w:t>
       </w:r>
       <w:r>
         <w:t xml:space="preserve"> en </w:t>
@@ -17822,43 +17976,25 @@
           <w:sz w:val="18"/>
           <w:shd w:val="clear" w:color="auto" w:fill="EEF4F2"/>
         </w:rPr>
-        <w:t>confirmOldMonthAddition</w:t>
-      </w:r>
-      <w:r>
-        <w:t xml:space="preserve">: het datumveld bij de correctie </w:t>
-      </w:r>
-      <w:r>
-        <w:rPr>
-          <w:rFonts w:ascii="Consolas" w:hAnsi="Consolas" w:cs="Consolas"/>
-          <w:sz w:val="18"/>
-          <w:shd w:val="clear" w:color="auto" w:fill="EEF4F2"/>
-        </w:rPr>
-        <w:t>+</w:t>
-      </w:r>
-      <w:r>
-        <w:t xml:space="preserve">. Na het inloggen staat het op vandaag. Bij </w:t>
-      </w:r>
-      <w:r>
-        <w:rPr>
-          <w:rFonts w:ascii="Consolas" w:hAnsi="Consolas" w:cs="Consolas"/>
-          <w:sz w:val="18"/>
-          <w:shd w:val="clear" w:color="auto" w:fill="EEF4F2"/>
-        </w:rPr>
-        <w:t>+</w:t>
-      </w:r>
-      <w:r>
-        <w:t xml:space="preserve"> wordt de datum gecontroleerd (niet in de toekomst, niet vóór 2000) en volgt bij een eerdere maand een bevestigingsvraag. </w:t>
-      </w:r>
-      <w:r>
-        <w:rPr>
-          <w:rFonts w:ascii="Consolas" w:hAnsi="Consolas" w:cs="Consolas"/>
-          <w:sz w:val="18"/>
-          <w:shd w:val="clear" w:color="auto" w:fill="EEF4F2"/>
-        </w:rPr>
-        <w:t>addCorrection</w:t>
-      </w:r>
-      <w:r>
-        <w:t xml:space="preserve"> voegt de registratie toe met een logboekregel.</w:t>
+        <w:t>removePoint</w:t>
+      </w:r>
+      <w:r>
+        <w:t>: de knoppen in de beheerlijsten.</w:t>
+      </w:r>
+    </w:p>
+    <w:p>
+      <w:r>
+        <w:rPr>
+          <w:rFonts w:ascii="Consolas" w:hAnsi="Consolas" w:cs="Consolas"/>
+          <w:b/>
+          <w:bCs/>
+          <w:sz w:val="18"/>
+          <w:shd w:val="clear" w:color="auto" w:fill="EEF4F2"/>
+        </w:rPr>
+        <w:t>CorrectionController</w:t>
+      </w:r>
+      <w:r>
+        <w:t xml:space="preserve"> regelt de correcties in het tabblad Registraties:</w:t>
       </w:r>
     </w:p>
     <w:p>
@@ -17877,7 +18013,7 @@
           <w:sz w:val="18"/>
           <w:shd w:val="clear" w:color="auto" w:fill="EEF4F2"/>
         </w:rPr>
-        <w:t>removeCorrection</w:t>
+        <w:t>resetCorrectionDate</w:t>
       </w:r>
       <w:r>
         <w:t xml:space="preserve">, </w:t>
@@ -17888,7 +18024,7 @@
           <w:sz w:val="18"/>
           <w:shd w:val="clear" w:color="auto" w:fill="EEF4F2"/>
         </w:rPr>
-        <w:t>removeChosenRegistration</w:t>
+        <w:t>readCorrectionDate</w:t>
       </w:r>
       <w:r>
         <w:t xml:space="preserve"> en </w:t>
@@ -17899,98 +18035,43 @@
           <w:sz w:val="18"/>
           <w:shd w:val="clear" w:color="auto" w:fill="EEF4F2"/>
         </w:rPr>
-        <w:t>closeRemoveRegistration</w:t>
-      </w:r>
-      <w:r>
-        <w:t xml:space="preserve">: de correctie </w:t>
-      </w:r>
-      <w:r>
-        <w:rPr>
-          <w:rFonts w:ascii="Consolas" w:hAnsi="Consolas" w:cs="Consolas"/>
-          <w:sz w:val="18"/>
-          <w:shd w:val="clear" w:color="auto" w:fill="EEF4F2"/>
-        </w:rPr>
-        <w:t>−</w:t>
-      </w:r>
-      <w:r>
-        <w:t xml:space="preserve">. </w:t>
-      </w:r>
-      <w:r>
-        <w:rPr>
-          <w:rFonts w:ascii="Consolas" w:hAnsi="Consolas" w:cs="Consolas"/>
-          <w:sz w:val="18"/>
-          <w:shd w:val="clear" w:color="auto" w:fill="EEF4F2"/>
-        </w:rPr>
-        <w:t>removeCorrection</w:t>
-      </w:r>
-      <w:r>
-        <w:t xml:space="preserve"> opent het venster </w:t>
-      </w:r>
-      <w:r>
-        <w:rPr>
-          <w:rFonts w:ascii="Consolas" w:hAnsi="Consolas" w:cs="Consolas"/>
-          <w:sz w:val="18"/>
-          <w:shd w:val="clear" w:color="auto" w:fill="EEF4F2"/>
-        </w:rPr>
-        <w:t>Registratie verwijderen</w:t>
-      </w:r>
-      <w:r>
-        <w:t xml:space="preserve"> (ook bij één registratie) en zet de focus op de eerste knop </w:t>
-      </w:r>
-      <w:r>
-        <w:rPr>
-          <w:rFonts w:ascii="Consolas" w:hAnsi="Consolas" w:cs="Consolas"/>
-          <w:sz w:val="18"/>
-          <w:shd w:val="clear" w:color="auto" w:fill="EEF4F2"/>
-        </w:rPr>
-        <w:t>Verwijderen</w:t>
-      </w:r>
-      <w:r>
-        <w:t xml:space="preserve">. </w:t>
-      </w:r>
-      <w:r>
-        <w:rPr>
-          <w:rFonts w:ascii="Consolas" w:hAnsi="Consolas" w:cs="Consolas"/>
-          <w:sz w:val="18"/>
-          <w:shd w:val="clear" w:color="auto" w:fill="EEF4F2"/>
-        </w:rPr>
-        <w:t>removeChosenRegistration</w:t>
-      </w:r>
-      <w:r>
-        <w:t xml:space="preserve"> verwijdert de gekozen registratie met een logboekregel via </w:t>
-      </w:r>
-      <w:r>
-        <w:rPr>
-          <w:rFonts w:ascii="Consolas" w:hAnsi="Consolas" w:cs="Consolas"/>
-          <w:sz w:val="18"/>
-          <w:shd w:val="clear" w:color="auto" w:fill="EEF4F2"/>
-        </w:rPr>
-        <w:t>persist</w:t>
-      </w:r>
-      <w:r>
-        <w:t xml:space="preserve">, sluit het venster en tekent de lijsten en de voorraad opnieuw. Bestaat de registratie niet meer, dan volgt via </w:t>
-      </w:r>
-      <w:r>
-        <w:rPr>
-          <w:rFonts w:ascii="Consolas" w:hAnsi="Consolas" w:cs="Consolas"/>
-          <w:sz w:val="18"/>
-          <w:shd w:val="clear" w:color="auto" w:fill="EEF4F2"/>
-        </w:rPr>
-        <w:t>showMissing</w:t>
-      </w:r>
-      <w:r>
-        <w:t xml:space="preserve"> een melding. </w:t>
-      </w:r>
-      <w:r>
-        <w:rPr>
-          <w:rFonts w:ascii="Consolas" w:hAnsi="Consolas" w:cs="Consolas"/>
-          <w:sz w:val="18"/>
-          <w:shd w:val="clear" w:color="auto" w:fill="EEF4F2"/>
-        </w:rPr>
-        <w:t>refreshRemoveRegistration</w:t>
-      </w:r>
-      <w:r>
-        <w:t xml:space="preserve"> werkt de lijst bij na een wijziging in een ander tabblad en sluit het venster als er niets meer te kiezen is. Bij het sluiten van het beheer gaat het venster ook dicht.</w:t>
+        <w:t>confirmOldMonthAddition</w:t>
+      </w:r>
+      <w:r>
+        <w:t xml:space="preserve">: het datumveld bij de correctie </w:t>
+      </w:r>
+      <w:r>
+        <w:rPr>
+          <w:rFonts w:ascii="Consolas" w:hAnsi="Consolas" w:cs="Consolas"/>
+          <w:sz w:val="18"/>
+          <w:shd w:val="clear" w:color="auto" w:fill="EEF4F2"/>
+        </w:rPr>
+        <w:t>+</w:t>
+      </w:r>
+      <w:r>
+        <w:t xml:space="preserve">. Na het inloggen staat het op vandaag. Bij </w:t>
+      </w:r>
+      <w:r>
+        <w:rPr>
+          <w:rFonts w:ascii="Consolas" w:hAnsi="Consolas" w:cs="Consolas"/>
+          <w:sz w:val="18"/>
+          <w:shd w:val="clear" w:color="auto" w:fill="EEF4F2"/>
+        </w:rPr>
+        <w:t>+</w:t>
+      </w:r>
+      <w:r>
+        <w:t xml:space="preserve"> wordt de datum gecontroleerd (niet in de toekomst, niet vóór 2000) en volgt bij een eerdere maand een bevestigingsvraag. </w:t>
+      </w:r>
+      <w:r>
+        <w:rPr>
+          <w:rFonts w:ascii="Consolas" w:hAnsi="Consolas" w:cs="Consolas"/>
+          <w:sz w:val="18"/>
+          <w:shd w:val="clear" w:color="auto" w:fill="EEF4F2"/>
+        </w:rPr>
+        <w:t>addCorrection</w:t>
+      </w:r>
+      <w:r>
+        <w:t xml:space="preserve"> voegt de registratie toe met een logboekregel.</w:t>
       </w:r>
     </w:p>
     <w:p>
@@ -18009,6 +18090,138 @@
           <w:sz w:val="18"/>
           <w:shd w:val="clear" w:color="auto" w:fill="EEF4F2"/>
         </w:rPr>
+        <w:t>removeCorrection</w:t>
+      </w:r>
+      <w:r>
+        <w:t xml:space="preserve">, </w:t>
+      </w:r>
+      <w:r>
+        <w:rPr>
+          <w:rFonts w:ascii="Consolas" w:hAnsi="Consolas" w:cs="Consolas"/>
+          <w:sz w:val="18"/>
+          <w:shd w:val="clear" w:color="auto" w:fill="EEF4F2"/>
+        </w:rPr>
+        <w:t>removeChosenRegistration</w:t>
+      </w:r>
+      <w:r>
+        <w:t xml:space="preserve"> en </w:t>
+      </w:r>
+      <w:r>
+        <w:rPr>
+          <w:rFonts w:ascii="Consolas" w:hAnsi="Consolas" w:cs="Consolas"/>
+          <w:sz w:val="18"/>
+          <w:shd w:val="clear" w:color="auto" w:fill="EEF4F2"/>
+        </w:rPr>
+        <w:t>closeRemoveRegistration</w:t>
+      </w:r>
+      <w:r>
+        <w:t xml:space="preserve">: de correctie </w:t>
+      </w:r>
+      <w:r>
+        <w:rPr>
+          <w:rFonts w:ascii="Consolas" w:hAnsi="Consolas" w:cs="Consolas"/>
+          <w:sz w:val="18"/>
+          <w:shd w:val="clear" w:color="auto" w:fill="EEF4F2"/>
+        </w:rPr>
+        <w:t>−</w:t>
+      </w:r>
+      <w:r>
+        <w:t xml:space="preserve">. </w:t>
+      </w:r>
+      <w:r>
+        <w:rPr>
+          <w:rFonts w:ascii="Consolas" w:hAnsi="Consolas" w:cs="Consolas"/>
+          <w:sz w:val="18"/>
+          <w:shd w:val="clear" w:color="auto" w:fill="EEF4F2"/>
+        </w:rPr>
+        <w:t>removeCorrection</w:t>
+      </w:r>
+      <w:r>
+        <w:t xml:space="preserve"> opent het venster </w:t>
+      </w:r>
+      <w:r>
+        <w:rPr>
+          <w:rFonts w:ascii="Consolas" w:hAnsi="Consolas" w:cs="Consolas"/>
+          <w:sz w:val="18"/>
+          <w:shd w:val="clear" w:color="auto" w:fill="EEF4F2"/>
+        </w:rPr>
+        <w:t>Registratie verwijderen</w:t>
+      </w:r>
+      <w:r>
+        <w:t xml:space="preserve"> (ook bij één registratie) en zet de focus op de eerste knop </w:t>
+      </w:r>
+      <w:r>
+        <w:rPr>
+          <w:rFonts w:ascii="Consolas" w:hAnsi="Consolas" w:cs="Consolas"/>
+          <w:sz w:val="18"/>
+          <w:shd w:val="clear" w:color="auto" w:fill="EEF4F2"/>
+        </w:rPr>
+        <w:t>Verwijderen</w:t>
+      </w:r>
+      <w:r>
+        <w:t xml:space="preserve">. </w:t>
+      </w:r>
+      <w:r>
+        <w:rPr>
+          <w:rFonts w:ascii="Consolas" w:hAnsi="Consolas" w:cs="Consolas"/>
+          <w:sz w:val="18"/>
+          <w:shd w:val="clear" w:color="auto" w:fill="EEF4F2"/>
+        </w:rPr>
+        <w:t>removeChosenRegistration</w:t>
+      </w:r>
+      <w:r>
+        <w:t xml:space="preserve"> verwijdert de gekozen registratie met een logboekregel via </w:t>
+      </w:r>
+      <w:r>
+        <w:rPr>
+          <w:rFonts w:ascii="Consolas" w:hAnsi="Consolas" w:cs="Consolas"/>
+          <w:sz w:val="18"/>
+          <w:shd w:val="clear" w:color="auto" w:fill="EEF4F2"/>
+        </w:rPr>
+        <w:t>persist</w:t>
+      </w:r>
+      <w:r>
+        <w:t xml:space="preserve">, sluit het venster en tekent de lijsten en de voorraad opnieuw. Bestaat de registratie niet meer, dan volgt via </w:t>
+      </w:r>
+      <w:r>
+        <w:rPr>
+          <w:rFonts w:ascii="Consolas" w:hAnsi="Consolas" w:cs="Consolas"/>
+          <w:sz w:val="18"/>
+          <w:shd w:val="clear" w:color="auto" w:fill="EEF4F2"/>
+        </w:rPr>
+        <w:t>showMissing</w:t>
+      </w:r>
+      <w:r>
+        <w:t xml:space="preserve"> een melding. </w:t>
+      </w:r>
+      <w:r>
+        <w:rPr>
+          <w:rFonts w:ascii="Consolas" w:hAnsi="Consolas" w:cs="Consolas"/>
+          <w:sz w:val="18"/>
+          <w:shd w:val="clear" w:color="auto" w:fill="EEF4F2"/>
+        </w:rPr>
+        <w:t>refreshRemoveRegistration</w:t>
+      </w:r>
+      <w:r>
+        <w:t xml:space="preserve"> werkt de lijst bij na een wijziging in een ander tabblad en sluit het venster als er niets meer te kiezen is. Bij het sluiten van het beheer gaat het venster ook dicht.</w:t>
+      </w:r>
+    </w:p>
+    <w:p>
+      <w:pPr>
+        <w:pStyle w:val="Lijstalinea"/>
+        <w:numPr>
+          <w:ilvl w:val="0"/>
+          <w:numId w:val="3"/>
+        </w:numPr>
+        <w:spacing w:after="60"/>
+        <w:contextualSpacing w:val="0"/>
+      </w:pPr>
+      <w:r>
+        <w:rPr>
+          <w:rFonts w:ascii="Consolas" w:hAnsi="Consolas" w:cs="Consolas"/>
+          <w:sz w:val="18"/>
+          <w:shd w:val="clear" w:color="auto" w:fill="EEF4F2"/>
+        </w:rPr>
         <w:t>confirmOldMonthRemoval</w:t>
       </w:r>
       <w:r>
@@ -18936,7 +19149,7 @@
         <w:keepNext/>
       </w:pPr>
       <w:bookmarkStart w:id="81" w:name="k46"/>
-      <w:bookmarkStart w:id="82" w:name="_Toc242690817"/>
+      <w:bookmarkStart w:id="82" w:name="_Toc242703561"/>
       <w:r>
         <w:rPr>
           <w:rFonts w:ascii="Consolas" w:hAnsi="Consolas" w:cs="Consolas"/>
@@ -19077,7 +19290,7 @@
         <w:keepNext/>
       </w:pPr>
       <w:bookmarkStart w:id="83" w:name="k47"/>
-      <w:bookmarkStart w:id="84" w:name="_Toc242690818"/>
+      <w:bookmarkStart w:id="84" w:name="_Toc242703562"/>
       <w:r>
         <w:rPr>
           <w:rFonts w:ascii="Consolas" w:hAnsi="Consolas" w:cs="Consolas"/>
@@ -19154,7 +19367,7 @@
         <w:keepNext/>
       </w:pPr>
       <w:bookmarkStart w:id="85" w:name="k48"/>
-      <w:bookmarkStart w:id="86" w:name="_Toc242690819"/>
+      <w:bookmarkStart w:id="86" w:name="_Toc242703563"/>
       <w:r>
         <w:rPr>
           <w:rFonts w:ascii="Consolas" w:hAnsi="Consolas" w:cs="Consolas"/>
@@ -19303,7 +19516,7 @@
         <w:keepNext/>
       </w:pPr>
       <w:bookmarkStart w:id="87" w:name="k49"/>
-      <w:bookmarkStart w:id="88" w:name="_Toc242690820"/>
+      <w:bookmarkStart w:id="88" w:name="_Toc242703564"/>
       <w:r>
         <w:rPr>
           <w:rFonts w:ascii="Consolas" w:hAnsi="Consolas" w:cs="Consolas"/>
@@ -19370,7 +19583,7 @@
         <w:keepNext/>
       </w:pPr>
       <w:bookmarkStart w:id="89" w:name="k50"/>
-      <w:bookmarkStart w:id="90" w:name="_Toc242690821"/>
+      <w:bookmarkStart w:id="90" w:name="_Toc242703565"/>
       <w:r>
         <w:rPr>
           <w:rFonts w:ascii="Consolas" w:hAnsi="Consolas" w:cs="Consolas"/>
@@ -19439,7 +19652,29 @@
         <w:t>describeSelection</w:t>
       </w:r>
       <w:r>
-        <w:t xml:space="preserve">), de producten van het consumptiepunt met </w:t>
+        <w:t xml:space="preserve">, en net als "welkom terug" alleen als </w:t>
+      </w:r>
+      <w:r>
+        <w:rPr>
+          <w:rFonts w:ascii="Consolas" w:hAnsi="Consolas" w:cs="Consolas"/>
+          <w:sz w:val="18"/>
+          <w:shd w:val="clear" w:color="auto" w:fill="EEF4F2"/>
+        </w:rPr>
+        <w:t>face.recognized</w:t>
+      </w:r>
+      <w:r>
+        <w:t xml:space="preserve"> of </w:t>
+      </w:r>
+      <w:r>
+        <w:rPr>
+          <w:rFonts w:ascii="Consolas" w:hAnsi="Consolas" w:cs="Consolas"/>
+          <w:sz w:val="18"/>
+          <w:shd w:val="clear" w:color="auto" w:fill="EEF4F2"/>
+        </w:rPr>
+        <w:t>face.recognizedByBadge</w:t>
+      </w:r>
+      <w:r>
+        <w:t xml:space="preserve"> waar is), de producten van het consumptiepunt met </w:t>
       </w:r>
       <w:r>
         <w:rPr>
@@ -19470,7 +19705,7 @@
         <w:keepNext/>
       </w:pPr>
       <w:bookmarkStart w:id="91" w:name="k51"/>
-      <w:bookmarkStart w:id="92" w:name="_Toc242690822"/>
+      <w:bookmarkStart w:id="92" w:name="_Toc242703566"/>
       <w:r>
         <w:rPr>
           <w:rFonts w:ascii="Consolas" w:hAnsi="Consolas" w:cs="Consolas"/>
@@ -19515,7 +19750,7 @@
         <w:keepNext/>
       </w:pPr>
       <w:bookmarkStart w:id="93" w:name="k52"/>
-      <w:bookmarkStart w:id="94" w:name="_Toc242690823"/>
+      <w:bookmarkStart w:id="94" w:name="_Toc242703567"/>
       <w:r>
         <w:t>OPSLAGFOUTEN EN TERUGDRAAIEN</w:t>
       </w:r>
@@ -19555,7 +19790,7 @@
         <w:keepNext/>
       </w:pPr>
       <w:bookmarkStart w:id="95" w:name="k53"/>
-      <w:bookmarkStart w:id="96" w:name="_Toc242690824"/>
+      <w:bookmarkStart w:id="96" w:name="_Toc242703568"/>
       <w:r>
         <w:t>ADMINFUNCTIES</w:t>
       </w:r>
@@ -19801,7 +20036,7 @@
         <w:keepNext/>
       </w:pPr>
       <w:bookmarkStart w:id="97" w:name="k54"/>
-      <w:bookmarkStart w:id="98" w:name="_Toc242690825"/>
+      <w:bookmarkStart w:id="98" w:name="_Toc242703569"/>
       <w:r>
         <w:t xml:space="preserve">CSV-EXPORT (CLASS </w:t>
       </w:r>
@@ -20209,7 +20444,7 @@
         <w:keepNext/>
       </w:pPr>
       <w:bookmarkStart w:id="99" w:name="k55"/>
-      <w:bookmarkStart w:id="100" w:name="_Toc242690826"/>
+      <w:bookmarkStart w:id="100" w:name="_Toc242703570"/>
       <w:r>
         <w:t>EVENT LISTENERS</w:t>
       </w:r>
@@ -20477,6 +20712,13 @@
               </w:rPr>
               <w:t>Alle gegevens wissen</w:t>
             </w:r>
+            <w:r>
+              <w:rPr>
+                <w:sz w:val="16"/>
+                <w:szCs w:val="16"/>
+              </w:rPr>
+              <w:t>, en de listeners voor muis, toets, aanraking en scroll die het automatisch uitloggen uitstellen</w:t>
+            </w:r>
           </w:p>
         </w:tc>
       </w:tr>
@@ -20814,7 +21056,7 @@
         </w:numPr>
       </w:pPr>
       <w:bookmarkStart w:id="101" w:name="k56"/>
-      <w:bookmarkStart w:id="102" w:name="_Toc242690827"/>
+      <w:bookmarkStart w:id="102" w:name="_Toc242703571"/>
       <w:r>
         <w:t>DATAMODEL EN KOPPELINGEN.</w:t>
       </w:r>
@@ -20832,7 +21074,7 @@
         <w:keepNext/>
       </w:pPr>
       <w:bookmarkStart w:id="103" w:name="k57"/>
-      <w:bookmarkStart w:id="104" w:name="_Toc242690828"/>
+      <w:bookmarkStart w:id="104" w:name="_Toc242703572"/>
       <w:r>
         <w:t>BEDRIJVEN</w:t>
       </w:r>
@@ -21043,7 +21285,7 @@
         <w:keepNext/>
       </w:pPr>
       <w:bookmarkStart w:id="105" w:name="k58"/>
-      <w:bookmarkStart w:id="106" w:name="_Toc242690829"/>
+      <w:bookmarkStart w:id="106" w:name="_Toc242703573"/>
       <w:r>
         <w:t>CONSUMPTIEPUNTEN</w:t>
       </w:r>
@@ -21362,7 +21604,7 @@
         <w:keepNext/>
       </w:pPr>
       <w:bookmarkStart w:id="107" w:name="k59"/>
-      <w:bookmarkStart w:id="108" w:name="_Toc242690830"/>
+      <w:bookmarkStart w:id="108" w:name="_Toc242703574"/>
       <w:r>
         <w:t>MEDEWERKERS</w:t>
       </w:r>
@@ -21918,7 +22160,7 @@
         <w:keepNext/>
       </w:pPr>
       <w:bookmarkStart w:id="109" w:name="k60"/>
-      <w:bookmarkStart w:id="110" w:name="_Toc242690831"/>
+      <w:bookmarkStart w:id="110" w:name="_Toc242703575"/>
       <w:r>
         <w:t>REGISTRATIES</w:t>
       </w:r>
@@ -22484,7 +22726,7 @@
         </w:numPr>
       </w:pPr>
       <w:bookmarkStart w:id="111" w:name="k61"/>
-      <w:bookmarkStart w:id="112" w:name="_Toc242690832"/>
+      <w:bookmarkStart w:id="112" w:name="_Toc242703576"/>
       <w:r>
         <w:t>BELANGRIJKE DEMO-BEPERKINGEN.</w:t>
       </w:r>
@@ -22682,7 +22924,7 @@
         <w:contextualSpacing w:val="0"/>
       </w:pPr>
       <w:r>
-        <w:t>Er is geen server-side auditlog; het logboek staat alleen in de browser.</w:t>
+        <w:t>Er is geen server-side auditlog. Het logboek staat alleen in de browser.</w:t>
       </w:r>
     </w:p>
     <w:p>
@@ -22696,29 +22938,7 @@
         <w:contextualSpacing w:val="0"/>
       </w:pPr>
       <w:r>
-        <w:t>Bescherming tegen inbedden in een frame (</w:t>
-      </w:r>
-      <w:r>
-        <w:rPr>
-          <w:rFonts w:ascii="Consolas" w:hAnsi="Consolas" w:cs="Consolas"/>
-          <w:sz w:val="18"/>
-          <w:shd w:val="clear" w:color="auto" w:fill="EEF4F2"/>
-        </w:rPr>
-        <w:t>frame-ancestors</w:t>
-      </w:r>
-      <w:r>
-        <w:t xml:space="preserve"> of </w:t>
-      </w:r>
-      <w:r>
-        <w:rPr>
-          <w:rFonts w:ascii="Consolas" w:hAnsi="Consolas" w:cs="Consolas"/>
-          <w:sz w:val="18"/>
-          <w:shd w:val="clear" w:color="auto" w:fill="EEF4F2"/>
-        </w:rPr>
-        <w:t>X-Frame-Options</w:t>
-      </w:r>
-      <w:r>
-        <w:t>) kan alleen met een HTTP-header van de webserver en zit dus niet in de demo.</w:t>
+        <w:t>De namen van alle actieve medewerkers staan op de beginpagina, omdat je je eigen naam moet kunnen kiezen. Aantallen, bedragen en eerdere keuzes staan er niet.</w:t>
       </w:r>
     </w:p>
     <w:p>
@@ -22732,6 +22952,84 @@
         <w:contextualSpacing w:val="0"/>
       </w:pPr>
       <w:r>
+        <w:t>Een CSV-bestand komt in de downloadmap van de computer van de beheerder en valt daarmee buiten de app. Stuur het beveiligd naar de loonadministratie en verwijder het na het inlezen.</w:t>
+      </w:r>
+    </w:p>
+    <w:p>
+      <w:pPr>
+        <w:pStyle w:val="Lijstalinea"/>
+        <w:numPr>
+          <w:ilvl w:val="0"/>
+          <w:numId w:val="3"/>
+        </w:numPr>
+        <w:spacing w:after="60"/>
+        <w:contextualSpacing w:val="0"/>
+      </w:pPr>
+      <w:r>
+        <w:t>De demo vertrouwt op een beveiligde tablet: kioskmodus, schermvergrendeling en versleuteling van het apparaat zijn nodig.</w:t>
+      </w:r>
+    </w:p>
+    <w:p>
+      <w:pPr>
+        <w:pStyle w:val="Lijstalinea"/>
+        <w:numPr>
+          <w:ilvl w:val="0"/>
+          <w:numId w:val="3"/>
+        </w:numPr>
+        <w:spacing w:after="60"/>
+        <w:contextualSpacing w:val="0"/>
+      </w:pPr>
+      <w:r>
+        <w:t>Voor productie zijn ook AVG-maatregelen nodig, zoals een grondslag per verwerking, bewaartermijnen, een privacyverklaring, een DPIA en instemming van de ondernemingsraad. Zie het TO, hoofdstuk 13, paragraaf AVG-verantwoording (productie).</w:t>
+      </w:r>
+    </w:p>
+    <w:p>
+      <w:pPr>
+        <w:pStyle w:val="Lijstalinea"/>
+        <w:numPr>
+          <w:ilvl w:val="0"/>
+          <w:numId w:val="3"/>
+        </w:numPr>
+        <w:spacing w:after="60"/>
+        <w:contextualSpacing w:val="0"/>
+      </w:pPr>
+      <w:r>
+        <w:t>Bescherming tegen inbedden in een frame (</w:t>
+      </w:r>
+      <w:r>
+        <w:rPr>
+          <w:rFonts w:ascii="Consolas" w:hAnsi="Consolas" w:cs="Consolas"/>
+          <w:sz w:val="18"/>
+          <w:shd w:val="clear" w:color="auto" w:fill="EEF4F2"/>
+        </w:rPr>
+        <w:t>frame-ancestors</w:t>
+      </w:r>
+      <w:r>
+        <w:t xml:space="preserve"> of </w:t>
+      </w:r>
+      <w:r>
+        <w:rPr>
+          <w:rFonts w:ascii="Consolas" w:hAnsi="Consolas" w:cs="Consolas"/>
+          <w:sz w:val="18"/>
+          <w:shd w:val="clear" w:color="auto" w:fill="EEF4F2"/>
+        </w:rPr>
+        <w:t>X-Frame-Options</w:t>
+      </w:r>
+      <w:r>
+        <w:t>) kan alleen met een HTTP-header van de webserver en zit dus niet in de demo.</w:t>
+      </w:r>
+    </w:p>
+    <w:p>
+      <w:pPr>
+        <w:pStyle w:val="Lijstalinea"/>
+        <w:numPr>
+          <w:ilvl w:val="0"/>
+          <w:numId w:val="3"/>
+        </w:numPr>
+        <w:spacing w:after="60"/>
+        <w:contextualSpacing w:val="0"/>
+      </w:pPr>
+      <w:r>
         <w:t xml:space="preserve">De gezichtsherkenning is alleen een demo. Ingestelde gezichten zijn na het herladen van de pagina weg. Er is geen controle of er een echt, levend gezicht voor de camera staat, en hoe vaak de verkeerde persoon wordt herkend, is niet gemeten. Bij het laden toont de console één onschadelijke CSP-melding over </w:t>
       </w:r>
       <w:r>
@@ -22775,7 +23073,7 @@
         </w:numPr>
       </w:pPr>
       <w:bookmarkStart w:id="113" w:name="k62"/>
-      <w:bookmarkStart w:id="114" w:name="_Toc242690833"/>
+      <w:bookmarkStart w:id="114" w:name="_Toc242703577"/>
       <w:r>
         <w:t>CODE UITLEGGEN TIJDENS EEN PRESENTATIE.</w:t>
       </w:r>
@@ -23126,7 +23424,7 @@
         </w:numPr>
       </w:pPr>
       <w:bookmarkStart w:id="115" w:name="k63"/>
-      <w:bookmarkStart w:id="116" w:name="_Toc242690834"/>
+      <w:bookmarkStart w:id="116" w:name="_Toc242703578"/>
       <w:r>
         <w:t>MOGELIJKE VERVOLGSTAPPEN.</w:t>
       </w:r>
@@ -23706,7 +24004,7 @@
         <v:path o:extrusionok="f" gradientshapeok="t" o:connecttype="rect"/>
         <o:lock v:ext="edit" aspectratio="t"/>
       </v:shapetype>
-      <v:shape id="_x0000_i1025" type="#_x0000_t75" style="width:254.25pt;height:219.75pt" o:bullet="t">
+      <v:shape id="_x0000_i1025" type="#_x0000_t75" style="width:254pt;height:219.5pt" o:bullet="t">
         <v:imagedata r:id="rId1" o:title="Bulletpoint"/>
       </v:shape>
     </w:pict>

</xml_diff>

<commit_message>
TO 3.11: bugs en afwijkingen uit de code-review opgelost
- Beschadigde lijst bij het laden geeft een reservekopie en melding in plaats van stil gegevensverlies
- Aparte melding als de opslag van de browser vol is
- Pas scannen in het veld Pasnummer vervangt het nummer, scan in het bedrijfsfilter wordt teruggezet
- Dubbelklik en ingedrukte Enter na Registreren openen geen ander venster meer
- Focus blijft op de juiste knop na opslaan, (de)activeren en wijzigingen uit een ander tabblad
- Correctiedatum gaat mee bij de dagwissel, niet-bestaande datums worden geweigerd
- Cijfervelden tonen "Gebruik alleen cijfers." in plaats van invoer stil weg te laten
- Gezichtsherkenning kijkt alleen naar actieve medewerkers, wissen meldt een mislukte poging
- Toegankelijkheid van tabbladen, bedrijfsfilter en de teller in het productvenster
- TO, DOCUMENTATIE, README en Word-bestanden bijgewerkt (611 unit tests, 13 browsertests)
</commit_message>
<xml_diff>
--- a/docs/DOCUMENTATIE.docx
+++ b/docs/DOCUMENTATIE.docx
@@ -82,9 +82,8 @@
           <w:numId w:val="0"/>
         </w:numPr>
       </w:pPr>
-      <w:bookmarkStart w:id="0" w:name="_Toc242703525"/>
-      <w:r>
-        <w:lastRenderedPageBreak/>
+      <w:bookmarkStart w:id="0" w:name="_Toc242707508"/>
+      <w:r>
         <w:t>INHOUDSOPGAVE.</w:t>
       </w:r>
       <w:bookmarkEnd w:id="0"/>
@@ -113,7 +112,7 @@
       <w:r>
         <w:fldChar w:fldCharType="separate"/>
       </w:r>
-      <w:hyperlink w:anchor="_Toc242703525" w:history="1">
+      <w:hyperlink w:anchor="_Toc242707508" w:history="1">
         <w:r>
           <w:rPr>
             <w:rStyle w:val="Hyperlink"/>
@@ -140,7 +139,7 @@
             <w:noProof/>
             <w:webHidden/>
           </w:rPr>
-          <w:instrText xml:space="preserve"> PAGEREF _Toc242703525 \h </w:instrText>
+          <w:instrText xml:space="preserve"> PAGEREF _Toc242707508 \h </w:instrText>
         </w:r>
         <w:r>
           <w:rPr>
@@ -187,7 +186,7 @@
           <w:lang w:eastAsia="nl-NL"/>
         </w:rPr>
       </w:pPr>
-      <w:hyperlink w:anchor="_Toc242703526" w:history="1">
+      <w:hyperlink w:anchor="_Toc242707509" w:history="1">
         <w:r>
           <w:rPr>
             <w:rStyle w:val="Hyperlink"/>
@@ -232,7 +231,7 @@
             <w:noProof/>
             <w:webHidden/>
           </w:rPr>
-          <w:instrText xml:space="preserve"> PAGEREF _Toc242703526 \h </w:instrText>
+          <w:instrText xml:space="preserve"> PAGEREF _Toc242707509 \h </w:instrText>
         </w:r>
         <w:r>
           <w:rPr>
@@ -279,7 +278,7 @@
           <w:lang w:eastAsia="nl-NL"/>
         </w:rPr>
       </w:pPr>
-      <w:hyperlink w:anchor="_Toc242703527" w:history="1">
+      <w:hyperlink w:anchor="_Toc242707510" w:history="1">
         <w:r>
           <w:rPr>
             <w:rStyle w:val="Hyperlink"/>
@@ -324,7 +323,7 @@
             <w:noProof/>
             <w:webHidden/>
           </w:rPr>
-          <w:instrText xml:space="preserve"> PAGEREF _Toc242703527 \h </w:instrText>
+          <w:instrText xml:space="preserve"> PAGEREF _Toc242707510 \h </w:instrText>
         </w:r>
         <w:r>
           <w:rPr>
@@ -371,7 +370,7 @@
           <w:lang w:eastAsia="nl-NL"/>
         </w:rPr>
       </w:pPr>
-      <w:hyperlink w:anchor="_Toc242703528" w:history="1">
+      <w:hyperlink w:anchor="_Toc242707511" w:history="1">
         <w:r>
           <w:rPr>
             <w:rStyle w:val="Hyperlink"/>
@@ -416,7 +415,7 @@
             <w:noProof/>
             <w:webHidden/>
           </w:rPr>
-          <w:instrText xml:space="preserve"> PAGEREF _Toc242703528 \h </w:instrText>
+          <w:instrText xml:space="preserve"> PAGEREF _Toc242707511 \h </w:instrText>
         </w:r>
         <w:r>
           <w:rPr>
@@ -436,7 +435,7 @@
             <w:noProof/>
             <w:webHidden/>
           </w:rPr>
-          <w:t>8</w:t>
+          <w:t>9</w:t>
         </w:r>
         <w:r>
           <w:rPr>
@@ -463,7 +462,7 @@
           <w:lang w:eastAsia="nl-NL"/>
         </w:rPr>
       </w:pPr>
-      <w:hyperlink w:anchor="_Toc242703529" w:history="1">
+      <w:hyperlink w:anchor="_Toc242707512" w:history="1">
         <w:r>
           <w:rPr>
             <w:rStyle w:val="Hyperlink"/>
@@ -508,7 +507,7 @@
             <w:noProof/>
             <w:webHidden/>
           </w:rPr>
-          <w:instrText xml:space="preserve"> PAGEREF _Toc242703529 \h </w:instrText>
+          <w:instrText xml:space="preserve"> PAGEREF _Toc242707512 \h </w:instrText>
         </w:r>
         <w:r>
           <w:rPr>
@@ -528,7 +527,7 @@
             <w:noProof/>
             <w:webHidden/>
           </w:rPr>
-          <w:t>9</w:t>
+          <w:t>10</w:t>
         </w:r>
         <w:r>
           <w:rPr>
@@ -555,7 +554,7 @@
           <w:lang w:eastAsia="nl-NL"/>
         </w:rPr>
       </w:pPr>
-      <w:hyperlink w:anchor="_Toc242703530" w:history="1">
+      <w:hyperlink w:anchor="_Toc242707513" w:history="1">
         <w:r>
           <w:rPr>
             <w:rStyle w:val="Hyperlink"/>
@@ -600,7 +599,7 @@
             <w:noProof/>
             <w:webHidden/>
           </w:rPr>
-          <w:instrText xml:space="preserve"> PAGEREF _Toc242703530 \h </w:instrText>
+          <w:instrText xml:space="preserve"> PAGEREF _Toc242707513 \h </w:instrText>
         </w:r>
         <w:r>
           <w:rPr>
@@ -620,7 +619,7 @@
             <w:noProof/>
             <w:webHidden/>
           </w:rPr>
-          <w:t>9</w:t>
+          <w:t>10</w:t>
         </w:r>
         <w:r>
           <w:rPr>
@@ -647,7 +646,7 @@
           <w:lang w:eastAsia="nl-NL"/>
         </w:rPr>
       </w:pPr>
-      <w:hyperlink w:anchor="_Toc242703531" w:history="1">
+      <w:hyperlink w:anchor="_Toc242707514" w:history="1">
         <w:r>
           <w:rPr>
             <w:rStyle w:val="Hyperlink"/>
@@ -692,7 +691,7 @@
             <w:noProof/>
             <w:webHidden/>
           </w:rPr>
-          <w:instrText xml:space="preserve"> PAGEREF _Toc242703531 \h </w:instrText>
+          <w:instrText xml:space="preserve"> PAGEREF _Toc242707514 \h </w:instrText>
         </w:r>
         <w:r>
           <w:rPr>
@@ -712,7 +711,7 @@
             <w:noProof/>
             <w:webHidden/>
           </w:rPr>
-          <w:t>9</w:t>
+          <w:t>10</w:t>
         </w:r>
         <w:r>
           <w:rPr>
@@ -739,7 +738,7 @@
           <w:lang w:eastAsia="nl-NL"/>
         </w:rPr>
       </w:pPr>
-      <w:hyperlink w:anchor="_Toc242703532" w:history="1">
+      <w:hyperlink w:anchor="_Toc242707515" w:history="1">
         <w:r>
           <w:rPr>
             <w:rStyle w:val="Hyperlink"/>
@@ -784,7 +783,7 @@
             <w:noProof/>
             <w:webHidden/>
           </w:rPr>
-          <w:instrText xml:space="preserve"> PAGEREF _Toc242703532 \h </w:instrText>
+          <w:instrText xml:space="preserve"> PAGEREF _Toc242707515 \h </w:instrText>
         </w:r>
         <w:r>
           <w:rPr>
@@ -804,7 +803,7 @@
             <w:noProof/>
             <w:webHidden/>
           </w:rPr>
-          <w:t>9</w:t>
+          <w:t>10</w:t>
         </w:r>
         <w:r>
           <w:rPr>
@@ -831,7 +830,7 @@
           <w:lang w:eastAsia="nl-NL"/>
         </w:rPr>
       </w:pPr>
-      <w:hyperlink w:anchor="_Toc242703533" w:history="1">
+      <w:hyperlink w:anchor="_Toc242707516" w:history="1">
         <w:r>
           <w:rPr>
             <w:rStyle w:val="Hyperlink"/>
@@ -876,7 +875,7 @@
             <w:noProof/>
             <w:webHidden/>
           </w:rPr>
-          <w:instrText xml:space="preserve"> PAGEREF _Toc242703533 \h </w:instrText>
+          <w:instrText xml:space="preserve"> PAGEREF _Toc242707516 \h </w:instrText>
         </w:r>
         <w:r>
           <w:rPr>
@@ -896,7 +895,7 @@
             <w:noProof/>
             <w:webHidden/>
           </w:rPr>
-          <w:t>9</w:t>
+          <w:t>10</w:t>
         </w:r>
         <w:r>
           <w:rPr>
@@ -923,7 +922,7 @@
           <w:lang w:eastAsia="nl-NL"/>
         </w:rPr>
       </w:pPr>
-      <w:hyperlink w:anchor="_Toc242703534" w:history="1">
+      <w:hyperlink w:anchor="_Toc242707517" w:history="1">
         <w:r>
           <w:rPr>
             <w:rStyle w:val="Hyperlink"/>
@@ -968,7 +967,7 @@
             <w:noProof/>
             <w:webHidden/>
           </w:rPr>
-          <w:instrText xml:space="preserve"> PAGEREF _Toc242703534 \h </w:instrText>
+          <w:instrText xml:space="preserve"> PAGEREF _Toc242707517 \h </w:instrText>
         </w:r>
         <w:r>
           <w:rPr>
@@ -988,7 +987,7 @@
             <w:noProof/>
             <w:webHidden/>
           </w:rPr>
-          <w:t>10</w:t>
+          <w:t>11</w:t>
         </w:r>
         <w:r>
           <w:rPr>
@@ -1015,7 +1014,7 @@
           <w:lang w:eastAsia="nl-NL"/>
         </w:rPr>
       </w:pPr>
-      <w:hyperlink w:anchor="_Toc242703535" w:history="1">
+      <w:hyperlink w:anchor="_Toc242707518" w:history="1">
         <w:r>
           <w:rPr>
             <w:rStyle w:val="Hyperlink"/>
@@ -1060,7 +1059,7 @@
             <w:noProof/>
             <w:webHidden/>
           </w:rPr>
-          <w:instrText xml:space="preserve"> PAGEREF _Toc242703535 \h </w:instrText>
+          <w:instrText xml:space="preserve"> PAGEREF _Toc242707518 \h </w:instrText>
         </w:r>
         <w:r>
           <w:rPr>
@@ -1080,7 +1079,7 @@
             <w:noProof/>
             <w:webHidden/>
           </w:rPr>
-          <w:t>11</w:t>
+          <w:t>12</w:t>
         </w:r>
         <w:r>
           <w:rPr>
@@ -1107,7 +1106,7 @@
           <w:lang w:eastAsia="nl-NL"/>
         </w:rPr>
       </w:pPr>
-      <w:hyperlink w:anchor="_Toc242703536" w:history="1">
+      <w:hyperlink w:anchor="_Toc242707519" w:history="1">
         <w:r>
           <w:rPr>
             <w:rStyle w:val="Hyperlink"/>
@@ -1152,7 +1151,7 @@
             <w:noProof/>
             <w:webHidden/>
           </w:rPr>
-          <w:instrText xml:space="preserve"> PAGEREF _Toc242703536 \h </w:instrText>
+          <w:instrText xml:space="preserve"> PAGEREF _Toc242707519 \h </w:instrText>
         </w:r>
         <w:r>
           <w:rPr>
@@ -1172,7 +1171,7 @@
             <w:noProof/>
             <w:webHidden/>
           </w:rPr>
-          <w:t>11</w:t>
+          <w:t>12</w:t>
         </w:r>
         <w:r>
           <w:rPr>
@@ -1199,7 +1198,7 @@
           <w:lang w:eastAsia="nl-NL"/>
         </w:rPr>
       </w:pPr>
-      <w:hyperlink w:anchor="_Toc242703537" w:history="1">
+      <w:hyperlink w:anchor="_Toc242707520" w:history="1">
         <w:r>
           <w:rPr>
             <w:rStyle w:val="Hyperlink"/>
@@ -1244,7 +1243,7 @@
             <w:noProof/>
             <w:webHidden/>
           </w:rPr>
-          <w:instrText xml:space="preserve"> PAGEREF _Toc242703537 \h </w:instrText>
+          <w:instrText xml:space="preserve"> PAGEREF _Toc242707520 \h </w:instrText>
         </w:r>
         <w:r>
           <w:rPr>
@@ -1264,7 +1263,7 @@
             <w:noProof/>
             <w:webHidden/>
           </w:rPr>
-          <w:t>12</w:t>
+          <w:t>13</w:t>
         </w:r>
         <w:r>
           <w:rPr>
@@ -1291,7 +1290,7 @@
           <w:lang w:eastAsia="nl-NL"/>
         </w:rPr>
       </w:pPr>
-      <w:hyperlink w:anchor="_Toc242703538" w:history="1">
+      <w:hyperlink w:anchor="_Toc242707521" w:history="1">
         <w:r>
           <w:rPr>
             <w:rStyle w:val="Hyperlink"/>
@@ -1336,7 +1335,7 @@
             <w:noProof/>
             <w:webHidden/>
           </w:rPr>
-          <w:instrText xml:space="preserve"> PAGEREF _Toc242703538 \h </w:instrText>
+          <w:instrText xml:space="preserve"> PAGEREF _Toc242707521 \h </w:instrText>
         </w:r>
         <w:r>
           <w:rPr>
@@ -1356,7 +1355,7 @@
             <w:noProof/>
             <w:webHidden/>
           </w:rPr>
-          <w:t>12</w:t>
+          <w:t>14</w:t>
         </w:r>
         <w:r>
           <w:rPr>
@@ -1383,7 +1382,7 @@
           <w:lang w:eastAsia="nl-NL"/>
         </w:rPr>
       </w:pPr>
-      <w:hyperlink w:anchor="_Toc242703539" w:history="1">
+      <w:hyperlink w:anchor="_Toc242707522" w:history="1">
         <w:r>
           <w:rPr>
             <w:rStyle w:val="Hyperlink"/>
@@ -1428,7 +1427,7 @@
             <w:noProof/>
             <w:webHidden/>
           </w:rPr>
-          <w:instrText xml:space="preserve"> PAGEREF _Toc242703539 \h </w:instrText>
+          <w:instrText xml:space="preserve"> PAGEREF _Toc242707522 \h </w:instrText>
         </w:r>
         <w:r>
           <w:rPr>
@@ -1448,7 +1447,7 @@
             <w:noProof/>
             <w:webHidden/>
           </w:rPr>
-          <w:t>13</w:t>
+          <w:t>14</w:t>
         </w:r>
         <w:r>
           <w:rPr>
@@ -1475,7 +1474,7 @@
           <w:lang w:eastAsia="nl-NL"/>
         </w:rPr>
       </w:pPr>
-      <w:hyperlink w:anchor="_Toc242703540" w:history="1">
+      <w:hyperlink w:anchor="_Toc242707523" w:history="1">
         <w:r>
           <w:rPr>
             <w:rStyle w:val="Hyperlink"/>
@@ -1520,7 +1519,7 @@
             <w:noProof/>
             <w:webHidden/>
           </w:rPr>
-          <w:instrText xml:space="preserve"> PAGEREF _Toc242703540 \h </w:instrText>
+          <w:instrText xml:space="preserve"> PAGEREF _Toc242707523 \h </w:instrText>
         </w:r>
         <w:r>
           <w:rPr>
@@ -1540,7 +1539,7 @@
             <w:noProof/>
             <w:webHidden/>
           </w:rPr>
-          <w:t>13</w:t>
+          <w:t>14</w:t>
         </w:r>
         <w:r>
           <w:rPr>
@@ -1567,7 +1566,7 @@
           <w:lang w:eastAsia="nl-NL"/>
         </w:rPr>
       </w:pPr>
-      <w:hyperlink w:anchor="_Toc242703541" w:history="1">
+      <w:hyperlink w:anchor="_Toc242707524" w:history="1">
         <w:r>
           <w:rPr>
             <w:rStyle w:val="Hyperlink"/>
@@ -1612,7 +1611,7 @@
             <w:noProof/>
             <w:webHidden/>
           </w:rPr>
-          <w:instrText xml:space="preserve"> PAGEREF _Toc242703541 \h </w:instrText>
+          <w:instrText xml:space="preserve"> PAGEREF _Toc242707524 \h </w:instrText>
         </w:r>
         <w:r>
           <w:rPr>
@@ -1632,7 +1631,7 @@
             <w:noProof/>
             <w:webHidden/>
           </w:rPr>
-          <w:t>13</w:t>
+          <w:t>14</w:t>
         </w:r>
         <w:r>
           <w:rPr>
@@ -1659,7 +1658,7 @@
           <w:lang w:eastAsia="nl-NL"/>
         </w:rPr>
       </w:pPr>
-      <w:hyperlink w:anchor="_Toc242703542" w:history="1">
+      <w:hyperlink w:anchor="_Toc242707525" w:history="1">
         <w:r>
           <w:rPr>
             <w:rStyle w:val="Hyperlink"/>
@@ -1704,7 +1703,7 @@
             <w:noProof/>
             <w:webHidden/>
           </w:rPr>
-          <w:instrText xml:space="preserve"> PAGEREF _Toc242703542 \h </w:instrText>
+          <w:instrText xml:space="preserve"> PAGEREF _Toc242707525 \h </w:instrText>
         </w:r>
         <w:r>
           <w:rPr>
@@ -1724,7 +1723,7 @@
             <w:noProof/>
             <w:webHidden/>
           </w:rPr>
-          <w:t>14</w:t>
+          <w:t>15</w:t>
         </w:r>
         <w:r>
           <w:rPr>
@@ -1751,7 +1750,7 @@
           <w:lang w:eastAsia="nl-NL"/>
         </w:rPr>
       </w:pPr>
-      <w:hyperlink w:anchor="_Toc242703543" w:history="1">
+      <w:hyperlink w:anchor="_Toc242707526" w:history="1">
         <w:r>
           <w:rPr>
             <w:rStyle w:val="Hyperlink"/>
@@ -1796,7 +1795,7 @@
             <w:noProof/>
             <w:webHidden/>
           </w:rPr>
-          <w:instrText xml:space="preserve"> PAGEREF _Toc242703543 \h </w:instrText>
+          <w:instrText xml:space="preserve"> PAGEREF _Toc242707526 \h </w:instrText>
         </w:r>
         <w:r>
           <w:rPr>
@@ -1816,7 +1815,7 @@
             <w:noProof/>
             <w:webHidden/>
           </w:rPr>
-          <w:t>14</w:t>
+          <w:t>15</w:t>
         </w:r>
         <w:r>
           <w:rPr>
@@ -1843,7 +1842,7 @@
           <w:lang w:eastAsia="nl-NL"/>
         </w:rPr>
       </w:pPr>
-      <w:hyperlink w:anchor="_Toc242703544" w:history="1">
+      <w:hyperlink w:anchor="_Toc242707527" w:history="1">
         <w:r>
           <w:rPr>
             <w:rStyle w:val="Hyperlink"/>
@@ -1888,7 +1887,7 @@
             <w:noProof/>
             <w:webHidden/>
           </w:rPr>
-          <w:instrText xml:space="preserve"> PAGEREF _Toc242703544 \h </w:instrText>
+          <w:instrText xml:space="preserve"> PAGEREF _Toc242707527 \h </w:instrText>
         </w:r>
         <w:r>
           <w:rPr>
@@ -1908,7 +1907,7 @@
             <w:noProof/>
             <w:webHidden/>
           </w:rPr>
-          <w:t>14</w:t>
+          <w:t>16</w:t>
         </w:r>
         <w:r>
           <w:rPr>
@@ -1935,7 +1934,7 @@
           <w:lang w:eastAsia="nl-NL"/>
         </w:rPr>
       </w:pPr>
-      <w:hyperlink w:anchor="_Toc242703545" w:history="1">
+      <w:hyperlink w:anchor="_Toc242707528" w:history="1">
         <w:r>
           <w:rPr>
             <w:rStyle w:val="Hyperlink"/>
@@ -1980,7 +1979,7 @@
             <w:noProof/>
             <w:webHidden/>
           </w:rPr>
-          <w:instrText xml:space="preserve"> PAGEREF _Toc242703545 \h </w:instrText>
+          <w:instrText xml:space="preserve"> PAGEREF _Toc242707528 \h </w:instrText>
         </w:r>
         <w:r>
           <w:rPr>
@@ -2000,7 +1999,7 @@
             <w:noProof/>
             <w:webHidden/>
           </w:rPr>
-          <w:t>15</w:t>
+          <w:t>16</w:t>
         </w:r>
         <w:r>
           <w:rPr>
@@ -2027,7 +2026,7 @@
           <w:lang w:eastAsia="nl-NL"/>
         </w:rPr>
       </w:pPr>
-      <w:hyperlink w:anchor="_Toc242703546" w:history="1">
+      <w:hyperlink w:anchor="_Toc242707529" w:history="1">
         <w:r>
           <w:rPr>
             <w:rStyle w:val="Hyperlink"/>
@@ -2088,7 +2087,7 @@
             <w:noProof/>
             <w:webHidden/>
           </w:rPr>
-          <w:instrText xml:space="preserve"> PAGEREF _Toc242703546 \h </w:instrText>
+          <w:instrText xml:space="preserve"> PAGEREF _Toc242707529 \h </w:instrText>
         </w:r>
         <w:r>
           <w:rPr>
@@ -2108,7 +2107,7 @@
             <w:noProof/>
             <w:webHidden/>
           </w:rPr>
-          <w:t>16</w:t>
+          <w:t>18</w:t>
         </w:r>
         <w:r>
           <w:rPr>
@@ -2135,7 +2134,7 @@
           <w:lang w:eastAsia="nl-NL"/>
         </w:rPr>
       </w:pPr>
-      <w:hyperlink w:anchor="_Toc242703547" w:history="1">
+      <w:hyperlink w:anchor="_Toc242707530" w:history="1">
         <w:r>
           <w:rPr>
             <w:rStyle w:val="Hyperlink"/>
@@ -2180,7 +2179,7 @@
             <w:noProof/>
             <w:webHidden/>
           </w:rPr>
-          <w:instrText xml:space="preserve"> PAGEREF _Toc242703547 \h </w:instrText>
+          <w:instrText xml:space="preserve"> PAGEREF _Toc242707530 \h </w:instrText>
         </w:r>
         <w:r>
           <w:rPr>
@@ -2200,7 +2199,7 @@
             <w:noProof/>
             <w:webHidden/>
           </w:rPr>
-          <w:t>16</w:t>
+          <w:t>18</w:t>
         </w:r>
         <w:r>
           <w:rPr>
@@ -2227,7 +2226,7 @@
           <w:lang w:eastAsia="nl-NL"/>
         </w:rPr>
       </w:pPr>
-      <w:hyperlink w:anchor="_Toc242703548" w:history="1">
+      <w:hyperlink w:anchor="_Toc242707531" w:history="1">
         <w:r>
           <w:rPr>
             <w:rStyle w:val="Hyperlink"/>
@@ -2272,7 +2271,7 @@
             <w:noProof/>
             <w:webHidden/>
           </w:rPr>
-          <w:instrText xml:space="preserve"> PAGEREF _Toc242703548 \h </w:instrText>
+          <w:instrText xml:space="preserve"> PAGEREF _Toc242707531 \h </w:instrText>
         </w:r>
         <w:r>
           <w:rPr>
@@ -2292,7 +2291,7 @@
             <w:noProof/>
             <w:webHidden/>
           </w:rPr>
-          <w:t>16</w:t>
+          <w:t>18</w:t>
         </w:r>
         <w:r>
           <w:rPr>
@@ -2319,7 +2318,7 @@
           <w:lang w:eastAsia="nl-NL"/>
         </w:rPr>
       </w:pPr>
-      <w:hyperlink w:anchor="_Toc242703549" w:history="1">
+      <w:hyperlink w:anchor="_Toc242707532" w:history="1">
         <w:r>
           <w:rPr>
             <w:rStyle w:val="Hyperlink"/>
@@ -2364,7 +2363,7 @@
             <w:noProof/>
             <w:webHidden/>
           </w:rPr>
-          <w:instrText xml:space="preserve"> PAGEREF _Toc242703549 \h </w:instrText>
+          <w:instrText xml:space="preserve"> PAGEREF _Toc242707532 \h </w:instrText>
         </w:r>
         <w:r>
           <w:rPr>
@@ -2384,7 +2383,7 @@
             <w:noProof/>
             <w:webHidden/>
           </w:rPr>
-          <w:t>16</w:t>
+          <w:t>18</w:t>
         </w:r>
         <w:r>
           <w:rPr>
@@ -2411,7 +2410,7 @@
           <w:lang w:eastAsia="nl-NL"/>
         </w:rPr>
       </w:pPr>
-      <w:hyperlink w:anchor="_Toc242703550" w:history="1">
+      <w:hyperlink w:anchor="_Toc242707533" w:history="1">
         <w:r>
           <w:rPr>
             <w:rStyle w:val="Hyperlink"/>
@@ -2456,7 +2455,7 @@
             <w:noProof/>
             <w:webHidden/>
           </w:rPr>
-          <w:instrText xml:space="preserve"> PAGEREF _Toc242703550 \h </w:instrText>
+          <w:instrText xml:space="preserve"> PAGEREF _Toc242707533 \h </w:instrText>
         </w:r>
         <w:r>
           <w:rPr>
@@ -2476,7 +2475,7 @@
             <w:noProof/>
             <w:webHidden/>
           </w:rPr>
-          <w:t>16</w:t>
+          <w:t>18</w:t>
         </w:r>
         <w:r>
           <w:rPr>
@@ -2503,7 +2502,7 @@
           <w:lang w:eastAsia="nl-NL"/>
         </w:rPr>
       </w:pPr>
-      <w:hyperlink w:anchor="_Toc242703551" w:history="1">
+      <w:hyperlink w:anchor="_Toc242707534" w:history="1">
         <w:r>
           <w:rPr>
             <w:rStyle w:val="Hyperlink"/>
@@ -2548,7 +2547,7 @@
             <w:noProof/>
             <w:webHidden/>
           </w:rPr>
-          <w:instrText xml:space="preserve"> PAGEREF _Toc242703551 \h </w:instrText>
+          <w:instrText xml:space="preserve"> PAGEREF _Toc242707534 \h </w:instrText>
         </w:r>
         <w:r>
           <w:rPr>
@@ -2568,7 +2567,7 @@
             <w:noProof/>
             <w:webHidden/>
           </w:rPr>
-          <w:t>17</w:t>
+          <w:t>19</w:t>
         </w:r>
         <w:r>
           <w:rPr>
@@ -2595,7 +2594,7 @@
           <w:lang w:eastAsia="nl-NL"/>
         </w:rPr>
       </w:pPr>
-      <w:hyperlink w:anchor="_Toc242703552" w:history="1">
+      <w:hyperlink w:anchor="_Toc242707535" w:history="1">
         <w:r>
           <w:rPr>
             <w:rStyle w:val="Hyperlink"/>
@@ -2640,7 +2639,7 @@
             <w:noProof/>
             <w:webHidden/>
           </w:rPr>
-          <w:instrText xml:space="preserve"> PAGEREF _Toc242703552 \h </w:instrText>
+          <w:instrText xml:space="preserve"> PAGEREF _Toc242707535 \h </w:instrText>
         </w:r>
         <w:r>
           <w:rPr>
@@ -2660,7 +2659,7 @@
             <w:noProof/>
             <w:webHidden/>
           </w:rPr>
-          <w:t>17</w:t>
+          <w:t>19</w:t>
         </w:r>
         <w:r>
           <w:rPr>
@@ -2687,7 +2686,7 @@
           <w:lang w:eastAsia="nl-NL"/>
         </w:rPr>
       </w:pPr>
-      <w:hyperlink w:anchor="_Toc242703553" w:history="1">
+      <w:hyperlink w:anchor="_Toc242707536" w:history="1">
         <w:r>
           <w:rPr>
             <w:rStyle w:val="Hyperlink"/>
@@ -2732,7 +2731,7 @@
             <w:noProof/>
             <w:webHidden/>
           </w:rPr>
-          <w:instrText xml:space="preserve"> PAGEREF _Toc242703553 \h </w:instrText>
+          <w:instrText xml:space="preserve"> PAGEREF _Toc242707536 \h </w:instrText>
         </w:r>
         <w:r>
           <w:rPr>
@@ -2752,7 +2751,7 @@
             <w:noProof/>
             <w:webHidden/>
           </w:rPr>
-          <w:t>17</w:t>
+          <w:t>19</w:t>
         </w:r>
         <w:r>
           <w:rPr>
@@ -2779,7 +2778,7 @@
           <w:lang w:eastAsia="nl-NL"/>
         </w:rPr>
       </w:pPr>
-      <w:hyperlink w:anchor="_Toc242703554" w:history="1">
+      <w:hyperlink w:anchor="_Toc242707537" w:history="1">
         <w:r>
           <w:rPr>
             <w:rStyle w:val="Hyperlink"/>
@@ -2840,7 +2839,7 @@
             <w:noProof/>
             <w:webHidden/>
           </w:rPr>
-          <w:instrText xml:space="preserve"> PAGEREF _Toc242703554 \h </w:instrText>
+          <w:instrText xml:space="preserve"> PAGEREF _Toc242707537 \h </w:instrText>
         </w:r>
         <w:r>
           <w:rPr>
@@ -2860,7 +2859,7 @@
             <w:noProof/>
             <w:webHidden/>
           </w:rPr>
-          <w:t>18</w:t>
+          <w:t>20</w:t>
         </w:r>
         <w:r>
           <w:rPr>
@@ -2887,7 +2886,7 @@
           <w:lang w:eastAsia="nl-NL"/>
         </w:rPr>
       </w:pPr>
-      <w:hyperlink w:anchor="_Toc242703555" w:history="1">
+      <w:hyperlink w:anchor="_Toc242707538" w:history="1">
         <w:r>
           <w:rPr>
             <w:rStyle w:val="Hyperlink"/>
@@ -2932,7 +2931,7 @@
             <w:noProof/>
             <w:webHidden/>
           </w:rPr>
-          <w:instrText xml:space="preserve"> PAGEREF _Toc242703555 \h </w:instrText>
+          <w:instrText xml:space="preserve"> PAGEREF _Toc242707538 \h </w:instrText>
         </w:r>
         <w:r>
           <w:rPr>
@@ -2952,7 +2951,7 @@
             <w:noProof/>
             <w:webHidden/>
           </w:rPr>
-          <w:t>18</w:t>
+          <w:t>20</w:t>
         </w:r>
         <w:r>
           <w:rPr>
@@ -2979,7 +2978,7 @@
           <w:lang w:eastAsia="nl-NL"/>
         </w:rPr>
       </w:pPr>
-      <w:hyperlink w:anchor="_Toc242703556" w:history="1">
+      <w:hyperlink w:anchor="_Toc242707539" w:history="1">
         <w:r>
           <w:rPr>
             <w:rStyle w:val="Hyperlink"/>
@@ -3024,7 +3023,7 @@
             <w:noProof/>
             <w:webHidden/>
           </w:rPr>
-          <w:instrText xml:space="preserve"> PAGEREF _Toc242703556 \h </w:instrText>
+          <w:instrText xml:space="preserve"> PAGEREF _Toc242707539 \h </w:instrText>
         </w:r>
         <w:r>
           <w:rPr>
@@ -3044,7 +3043,7 @@
             <w:noProof/>
             <w:webHidden/>
           </w:rPr>
-          <w:t>18</w:t>
+          <w:t>20</w:t>
         </w:r>
         <w:r>
           <w:rPr>
@@ -3071,7 +3070,7 @@
           <w:lang w:eastAsia="nl-NL"/>
         </w:rPr>
       </w:pPr>
-      <w:hyperlink w:anchor="_Toc242703557" w:history="1">
+      <w:hyperlink w:anchor="_Toc242707540" w:history="1">
         <w:r>
           <w:rPr>
             <w:rStyle w:val="Hyperlink"/>
@@ -3116,7 +3115,7 @@
             <w:noProof/>
             <w:webHidden/>
           </w:rPr>
-          <w:instrText xml:space="preserve"> PAGEREF _Toc242703557 \h </w:instrText>
+          <w:instrText xml:space="preserve"> PAGEREF _Toc242707540 \h </w:instrText>
         </w:r>
         <w:r>
           <w:rPr>
@@ -3136,7 +3135,7 @@
             <w:noProof/>
             <w:webHidden/>
           </w:rPr>
-          <w:t>19</w:t>
+          <w:t>21</w:t>
         </w:r>
         <w:r>
           <w:rPr>
@@ -3163,7 +3162,7 @@
           <w:lang w:eastAsia="nl-NL"/>
         </w:rPr>
       </w:pPr>
-      <w:hyperlink w:anchor="_Toc242703558" w:history="1">
+      <w:hyperlink w:anchor="_Toc242707541" w:history="1">
         <w:r>
           <w:rPr>
             <w:rStyle w:val="Hyperlink"/>
@@ -3224,7 +3223,7 @@
             <w:noProof/>
             <w:webHidden/>
           </w:rPr>
-          <w:instrText xml:space="preserve"> PAGEREF _Toc242703558 \h </w:instrText>
+          <w:instrText xml:space="preserve"> PAGEREF _Toc242707541 \h </w:instrText>
         </w:r>
         <w:r>
           <w:rPr>
@@ -3244,7 +3243,7 @@
             <w:noProof/>
             <w:webHidden/>
           </w:rPr>
-          <w:t>20</w:t>
+          <w:t>22</w:t>
         </w:r>
         <w:r>
           <w:rPr>
@@ -3271,7 +3270,7 @@
           <w:lang w:eastAsia="nl-NL"/>
         </w:rPr>
       </w:pPr>
-      <w:hyperlink w:anchor="_Toc242703559" w:history="1">
+      <w:hyperlink w:anchor="_Toc242707542" w:history="1">
         <w:r>
           <w:rPr>
             <w:rStyle w:val="Hyperlink"/>
@@ -3316,7 +3315,7 @@
             <w:noProof/>
             <w:webHidden/>
           </w:rPr>
-          <w:instrText xml:space="preserve"> PAGEREF _Toc242703559 \h </w:instrText>
+          <w:instrText xml:space="preserve"> PAGEREF _Toc242707542 \h </w:instrText>
         </w:r>
         <w:r>
           <w:rPr>
@@ -3336,7 +3335,7 @@
             <w:noProof/>
             <w:webHidden/>
           </w:rPr>
-          <w:t>20</w:t>
+          <w:t>22</w:t>
         </w:r>
         <w:r>
           <w:rPr>
@@ -3363,7 +3362,7 @@
           <w:lang w:eastAsia="nl-NL"/>
         </w:rPr>
       </w:pPr>
-      <w:hyperlink w:anchor="_Toc242703560" w:history="1">
+      <w:hyperlink w:anchor="_Toc242707543" w:history="1">
         <w:r>
           <w:rPr>
             <w:rStyle w:val="Hyperlink"/>
@@ -3408,7 +3407,7 @@
             <w:noProof/>
             <w:webHidden/>
           </w:rPr>
-          <w:instrText xml:space="preserve"> PAGEREF _Toc242703560 \h </w:instrText>
+          <w:instrText xml:space="preserve"> PAGEREF _Toc242707543 \h </w:instrText>
         </w:r>
         <w:r>
           <w:rPr>
@@ -3428,7 +3427,7 @@
             <w:noProof/>
             <w:webHidden/>
           </w:rPr>
-          <w:t>21</w:t>
+          <w:t>23</w:t>
         </w:r>
         <w:r>
           <w:rPr>
@@ -3455,7 +3454,7 @@
           <w:lang w:eastAsia="nl-NL"/>
         </w:rPr>
       </w:pPr>
-      <w:hyperlink w:anchor="_Toc242703561" w:history="1">
+      <w:hyperlink w:anchor="_Toc242707544" w:history="1">
         <w:r>
           <w:rPr>
             <w:rStyle w:val="Hyperlink"/>
@@ -3502,7 +3501,7 @@
             <w:noProof/>
             <w:webHidden/>
           </w:rPr>
-          <w:instrText xml:space="preserve"> PAGEREF _Toc242703561 \h </w:instrText>
+          <w:instrText xml:space="preserve"> PAGEREF _Toc242707544 \h </w:instrText>
         </w:r>
         <w:r>
           <w:rPr>
@@ -3522,7 +3521,7 @@
             <w:noProof/>
             <w:webHidden/>
           </w:rPr>
-          <w:t>27</w:t>
+          <w:t>29</w:t>
         </w:r>
         <w:r>
           <w:rPr>
@@ -3549,7 +3548,7 @@
           <w:lang w:eastAsia="nl-NL"/>
         </w:rPr>
       </w:pPr>
-      <w:hyperlink w:anchor="_Toc242703562" w:history="1">
+      <w:hyperlink w:anchor="_Toc242707545" w:history="1">
         <w:r>
           <w:rPr>
             <w:rStyle w:val="Hyperlink"/>
@@ -3596,7 +3595,7 @@
             <w:noProof/>
             <w:webHidden/>
           </w:rPr>
-          <w:instrText xml:space="preserve"> PAGEREF _Toc242703562 \h </w:instrText>
+          <w:instrText xml:space="preserve"> PAGEREF _Toc242707545 \h </w:instrText>
         </w:r>
         <w:r>
           <w:rPr>
@@ -3616,7 +3615,7 @@
             <w:noProof/>
             <w:webHidden/>
           </w:rPr>
-          <w:t>27</w:t>
+          <w:t>30</w:t>
         </w:r>
         <w:r>
           <w:rPr>
@@ -3643,7 +3642,7 @@
           <w:lang w:eastAsia="nl-NL"/>
         </w:rPr>
       </w:pPr>
-      <w:hyperlink w:anchor="_Toc242703563" w:history="1">
+      <w:hyperlink w:anchor="_Toc242707546" w:history="1">
         <w:r>
           <w:rPr>
             <w:rStyle w:val="Hyperlink"/>
@@ -3690,7 +3689,7 @@
             <w:noProof/>
             <w:webHidden/>
           </w:rPr>
-          <w:instrText xml:space="preserve"> PAGEREF _Toc242703563 \h </w:instrText>
+          <w:instrText xml:space="preserve"> PAGEREF _Toc242707546 \h </w:instrText>
         </w:r>
         <w:r>
           <w:rPr>
@@ -3710,7 +3709,7 @@
             <w:noProof/>
             <w:webHidden/>
           </w:rPr>
-          <w:t>27</w:t>
+          <w:t>30</w:t>
         </w:r>
         <w:r>
           <w:rPr>
@@ -3737,7 +3736,7 @@
           <w:lang w:eastAsia="nl-NL"/>
         </w:rPr>
       </w:pPr>
-      <w:hyperlink w:anchor="_Toc242703564" w:history="1">
+      <w:hyperlink w:anchor="_Toc242707547" w:history="1">
         <w:r>
           <w:rPr>
             <w:rStyle w:val="Hyperlink"/>
@@ -3784,7 +3783,7 @@
             <w:noProof/>
             <w:webHidden/>
           </w:rPr>
-          <w:instrText xml:space="preserve"> PAGEREF _Toc242703564 \h </w:instrText>
+          <w:instrText xml:space="preserve"> PAGEREF _Toc242707547 \h </w:instrText>
         </w:r>
         <w:r>
           <w:rPr>
@@ -3804,7 +3803,7 @@
             <w:noProof/>
             <w:webHidden/>
           </w:rPr>
-          <w:t>27</w:t>
+          <w:t>30</w:t>
         </w:r>
         <w:r>
           <w:rPr>
@@ -3831,7 +3830,7 @@
           <w:lang w:eastAsia="nl-NL"/>
         </w:rPr>
       </w:pPr>
-      <w:hyperlink w:anchor="_Toc242703565" w:history="1">
+      <w:hyperlink w:anchor="_Toc242707548" w:history="1">
         <w:r>
           <w:rPr>
             <w:rStyle w:val="Hyperlink"/>
@@ -3878,7 +3877,7 @@
             <w:noProof/>
             <w:webHidden/>
           </w:rPr>
-          <w:instrText xml:space="preserve"> PAGEREF _Toc242703565 \h </w:instrText>
+          <w:instrText xml:space="preserve"> PAGEREF _Toc242707548 \h </w:instrText>
         </w:r>
         <w:r>
           <w:rPr>
@@ -3898,7 +3897,7 @@
             <w:noProof/>
             <w:webHidden/>
           </w:rPr>
-          <w:t>28</w:t>
+          <w:t>30</w:t>
         </w:r>
         <w:r>
           <w:rPr>
@@ -3925,7 +3924,7 @@
           <w:lang w:eastAsia="nl-NL"/>
         </w:rPr>
       </w:pPr>
-      <w:hyperlink w:anchor="_Toc242703566" w:history="1">
+      <w:hyperlink w:anchor="_Toc242707549" w:history="1">
         <w:r>
           <w:rPr>
             <w:rStyle w:val="Hyperlink"/>
@@ -3972,7 +3971,7 @@
             <w:noProof/>
             <w:webHidden/>
           </w:rPr>
-          <w:instrText xml:space="preserve"> PAGEREF _Toc242703566 \h </w:instrText>
+          <w:instrText xml:space="preserve"> PAGEREF _Toc242707549 \h </w:instrText>
         </w:r>
         <w:r>
           <w:rPr>
@@ -3992,7 +3991,7 @@
             <w:noProof/>
             <w:webHidden/>
           </w:rPr>
-          <w:t>28</w:t>
+          <w:t>30</w:t>
         </w:r>
         <w:r>
           <w:rPr>
@@ -4019,7 +4018,7 @@
           <w:lang w:eastAsia="nl-NL"/>
         </w:rPr>
       </w:pPr>
-      <w:hyperlink w:anchor="_Toc242703567" w:history="1">
+      <w:hyperlink w:anchor="_Toc242707550" w:history="1">
         <w:r>
           <w:rPr>
             <w:rStyle w:val="Hyperlink"/>
@@ -4064,7 +4063,7 @@
             <w:noProof/>
             <w:webHidden/>
           </w:rPr>
-          <w:instrText xml:space="preserve"> PAGEREF _Toc242703567 \h </w:instrText>
+          <w:instrText xml:space="preserve"> PAGEREF _Toc242707550 \h </w:instrText>
         </w:r>
         <w:r>
           <w:rPr>
@@ -4084,7 +4083,7 @@
             <w:noProof/>
             <w:webHidden/>
           </w:rPr>
-          <w:t>28</w:t>
+          <w:t>31</w:t>
         </w:r>
         <w:r>
           <w:rPr>
@@ -4111,7 +4110,7 @@
           <w:lang w:eastAsia="nl-NL"/>
         </w:rPr>
       </w:pPr>
-      <w:hyperlink w:anchor="_Toc242703568" w:history="1">
+      <w:hyperlink w:anchor="_Toc242707551" w:history="1">
         <w:r>
           <w:rPr>
             <w:rStyle w:val="Hyperlink"/>
@@ -4156,7 +4155,7 @@
             <w:noProof/>
             <w:webHidden/>
           </w:rPr>
-          <w:instrText xml:space="preserve"> PAGEREF _Toc242703568 \h </w:instrText>
+          <w:instrText xml:space="preserve"> PAGEREF _Toc242707551 \h </w:instrText>
         </w:r>
         <w:r>
           <w:rPr>
@@ -4176,7 +4175,7 @@
             <w:noProof/>
             <w:webHidden/>
           </w:rPr>
-          <w:t>28</w:t>
+          <w:t>31</w:t>
         </w:r>
         <w:r>
           <w:rPr>
@@ -4203,7 +4202,7 @@
           <w:lang w:eastAsia="nl-NL"/>
         </w:rPr>
       </w:pPr>
-      <w:hyperlink w:anchor="_Toc242703569" w:history="1">
+      <w:hyperlink w:anchor="_Toc242707552" w:history="1">
         <w:r>
           <w:rPr>
             <w:rStyle w:val="Hyperlink"/>
@@ -4280,7 +4279,7 @@
             <w:noProof/>
             <w:webHidden/>
           </w:rPr>
-          <w:instrText xml:space="preserve"> PAGEREF _Toc242703569 \h </w:instrText>
+          <w:instrText xml:space="preserve"> PAGEREF _Toc242707552 \h </w:instrText>
         </w:r>
         <w:r>
           <w:rPr>
@@ -4300,7 +4299,7 @@
             <w:noProof/>
             <w:webHidden/>
           </w:rPr>
-          <w:t>28</w:t>
+          <w:t>31</w:t>
         </w:r>
         <w:r>
           <w:rPr>
@@ -4327,7 +4326,7 @@
           <w:lang w:eastAsia="nl-NL"/>
         </w:rPr>
       </w:pPr>
-      <w:hyperlink w:anchor="_Toc242703570" w:history="1">
+      <w:hyperlink w:anchor="_Toc242707553" w:history="1">
         <w:r>
           <w:rPr>
             <w:rStyle w:val="Hyperlink"/>
@@ -4372,7 +4371,7 @@
             <w:noProof/>
             <w:webHidden/>
           </w:rPr>
-          <w:instrText xml:space="preserve"> PAGEREF _Toc242703570 \h </w:instrText>
+          <w:instrText xml:space="preserve"> PAGEREF _Toc242707553 \h </w:instrText>
         </w:r>
         <w:r>
           <w:rPr>
@@ -4392,7 +4391,7 @@
             <w:noProof/>
             <w:webHidden/>
           </w:rPr>
-          <w:t>29</w:t>
+          <w:t>32</w:t>
         </w:r>
         <w:r>
           <w:rPr>
@@ -4419,7 +4418,7 @@
           <w:lang w:eastAsia="nl-NL"/>
         </w:rPr>
       </w:pPr>
-      <w:hyperlink w:anchor="_Toc242703571" w:history="1">
+      <w:hyperlink w:anchor="_Toc242707554" w:history="1">
         <w:r>
           <w:rPr>
             <w:rStyle w:val="Hyperlink"/>
@@ -4464,7 +4463,7 @@
             <w:noProof/>
             <w:webHidden/>
           </w:rPr>
-          <w:instrText xml:space="preserve"> PAGEREF _Toc242703571 \h </w:instrText>
+          <w:instrText xml:space="preserve"> PAGEREF _Toc242707554 \h </w:instrText>
         </w:r>
         <w:r>
           <w:rPr>
@@ -4484,7 +4483,7 @@
             <w:noProof/>
             <w:webHidden/>
           </w:rPr>
-          <w:t>30</w:t>
+          <w:t>33</w:t>
         </w:r>
         <w:r>
           <w:rPr>
@@ -4511,7 +4510,7 @@
           <w:lang w:eastAsia="nl-NL"/>
         </w:rPr>
       </w:pPr>
-      <w:hyperlink w:anchor="_Toc242703572" w:history="1">
+      <w:hyperlink w:anchor="_Toc242707555" w:history="1">
         <w:r>
           <w:rPr>
             <w:rStyle w:val="Hyperlink"/>
@@ -4556,7 +4555,7 @@
             <w:noProof/>
             <w:webHidden/>
           </w:rPr>
-          <w:instrText xml:space="preserve"> PAGEREF _Toc242703572 \h </w:instrText>
+          <w:instrText xml:space="preserve"> PAGEREF _Toc242707555 \h </w:instrText>
         </w:r>
         <w:r>
           <w:rPr>
@@ -4576,7 +4575,7 @@
             <w:noProof/>
             <w:webHidden/>
           </w:rPr>
-          <w:t>30</w:t>
+          <w:t>33</w:t>
         </w:r>
         <w:r>
           <w:rPr>
@@ -4603,7 +4602,7 @@
           <w:lang w:eastAsia="nl-NL"/>
         </w:rPr>
       </w:pPr>
-      <w:hyperlink w:anchor="_Toc242703573" w:history="1">
+      <w:hyperlink w:anchor="_Toc242707556" w:history="1">
         <w:r>
           <w:rPr>
             <w:rStyle w:val="Hyperlink"/>
@@ -4648,7 +4647,7 @@
             <w:noProof/>
             <w:webHidden/>
           </w:rPr>
-          <w:instrText xml:space="preserve"> PAGEREF _Toc242703573 \h </w:instrText>
+          <w:instrText xml:space="preserve"> PAGEREF _Toc242707556 \h </w:instrText>
         </w:r>
         <w:r>
           <w:rPr>
@@ -4668,7 +4667,7 @@
             <w:noProof/>
             <w:webHidden/>
           </w:rPr>
-          <w:t>30</w:t>
+          <w:t>33</w:t>
         </w:r>
         <w:r>
           <w:rPr>
@@ -4695,7 +4694,7 @@
           <w:lang w:eastAsia="nl-NL"/>
         </w:rPr>
       </w:pPr>
-      <w:hyperlink w:anchor="_Toc242703574" w:history="1">
+      <w:hyperlink w:anchor="_Toc242707557" w:history="1">
         <w:r>
           <w:rPr>
             <w:rStyle w:val="Hyperlink"/>
@@ -4740,7 +4739,7 @@
             <w:noProof/>
             <w:webHidden/>
           </w:rPr>
-          <w:instrText xml:space="preserve"> PAGEREF _Toc242703574 \h </w:instrText>
+          <w:instrText xml:space="preserve"> PAGEREF _Toc242707557 \h </w:instrText>
         </w:r>
         <w:r>
           <w:rPr>
@@ -4760,7 +4759,7 @@
             <w:noProof/>
             <w:webHidden/>
           </w:rPr>
-          <w:t>30</w:t>
+          <w:t>33</w:t>
         </w:r>
         <w:r>
           <w:rPr>
@@ -4787,7 +4786,7 @@
           <w:lang w:eastAsia="nl-NL"/>
         </w:rPr>
       </w:pPr>
-      <w:hyperlink w:anchor="_Toc242703575" w:history="1">
+      <w:hyperlink w:anchor="_Toc242707558" w:history="1">
         <w:r>
           <w:rPr>
             <w:rStyle w:val="Hyperlink"/>
@@ -4832,7 +4831,7 @@
             <w:noProof/>
             <w:webHidden/>
           </w:rPr>
-          <w:instrText xml:space="preserve"> PAGEREF _Toc242703575 \h </w:instrText>
+          <w:instrText xml:space="preserve"> PAGEREF _Toc242707558 \h </w:instrText>
         </w:r>
         <w:r>
           <w:rPr>
@@ -4852,7 +4851,7 @@
             <w:noProof/>
             <w:webHidden/>
           </w:rPr>
-          <w:t>30</w:t>
+          <w:t>33</w:t>
         </w:r>
         <w:r>
           <w:rPr>
@@ -4879,7 +4878,7 @@
           <w:lang w:eastAsia="nl-NL"/>
         </w:rPr>
       </w:pPr>
-      <w:hyperlink w:anchor="_Toc242703576" w:history="1">
+      <w:hyperlink w:anchor="_Toc242707559" w:history="1">
         <w:r>
           <w:rPr>
             <w:rStyle w:val="Hyperlink"/>
@@ -4924,7 +4923,7 @@
             <w:noProof/>
             <w:webHidden/>
           </w:rPr>
-          <w:instrText xml:space="preserve"> PAGEREF _Toc242703576 \h </w:instrText>
+          <w:instrText xml:space="preserve"> PAGEREF _Toc242707559 \h </w:instrText>
         </w:r>
         <w:r>
           <w:rPr>
@@ -4944,7 +4943,7 @@
             <w:noProof/>
             <w:webHidden/>
           </w:rPr>
-          <w:t>32</w:t>
+          <w:t>35</w:t>
         </w:r>
         <w:r>
           <w:rPr>
@@ -4971,7 +4970,7 @@
           <w:lang w:eastAsia="nl-NL"/>
         </w:rPr>
       </w:pPr>
-      <w:hyperlink w:anchor="_Toc242703577" w:history="1">
+      <w:hyperlink w:anchor="_Toc242707560" w:history="1">
         <w:r>
           <w:rPr>
             <w:rStyle w:val="Hyperlink"/>
@@ -5016,7 +5015,7 @@
             <w:noProof/>
             <w:webHidden/>
           </w:rPr>
-          <w:instrText xml:space="preserve"> PAGEREF _Toc242703577 \h </w:instrText>
+          <w:instrText xml:space="preserve"> PAGEREF _Toc242707560 \h </w:instrText>
         </w:r>
         <w:r>
           <w:rPr>
@@ -5036,7 +5035,7 @@
             <w:noProof/>
             <w:webHidden/>
           </w:rPr>
-          <w:t>34</w:t>
+          <w:t>37</w:t>
         </w:r>
         <w:r>
           <w:rPr>
@@ -5063,7 +5062,7 @@
           <w:lang w:eastAsia="nl-NL"/>
         </w:rPr>
       </w:pPr>
-      <w:hyperlink w:anchor="_Toc242703578" w:history="1">
+      <w:hyperlink w:anchor="_Toc242707561" w:history="1">
         <w:r>
           <w:rPr>
             <w:rStyle w:val="Hyperlink"/>
@@ -5108,7 +5107,7 @@
             <w:noProof/>
             <w:webHidden/>
           </w:rPr>
-          <w:instrText xml:space="preserve"> PAGEREF _Toc242703578 \h </w:instrText>
+          <w:instrText xml:space="preserve"> PAGEREF _Toc242707561 \h </w:instrText>
         </w:r>
         <w:r>
           <w:rPr>
@@ -5128,7 +5127,7 @@
             <w:noProof/>
             <w:webHidden/>
           </w:rPr>
-          <w:t>35</w:t>
+          <w:t>38</w:t>
         </w:r>
         <w:r>
           <w:rPr>
@@ -5161,7 +5160,7 @@
         </w:numPr>
       </w:pPr>
       <w:bookmarkStart w:id="1" w:name="k1"/>
-      <w:bookmarkStart w:id="2" w:name="_Toc242703526"/>
+      <w:bookmarkStart w:id="2" w:name="_Toc242707509"/>
       <w:r>
         <w:t>DOEL VAN DE APPLICATIE.</w:t>
       </w:r>
@@ -5203,7 +5202,7 @@
         <w:t>Registreren</w:t>
       </w:r>
       <w:r>
-        <w:t>; ieder gekozen product wordt dan één registratie. Persoonlijke aantallen en kosten zijn alleen zichtbaar voor de beheerder.</w:t>
+        <w:t>. Ieder gekozen product wordt dan één registratie. Persoonlijke aantallen en kosten zijn alleen zichtbaar voor de beheerder.</w:t>
       </w:r>
     </w:p>
     <w:p>
@@ -5243,7 +5242,7 @@
         </w:numPr>
       </w:pPr>
       <w:bookmarkStart w:id="3" w:name="k2"/>
-      <w:bookmarkStart w:id="4" w:name="_Toc242703527"/>
+      <w:bookmarkStart w:id="4" w:name="_Toc242707510"/>
       <w:r>
         <w:t>BESTANDEN.</w:t>
       </w:r>
@@ -6441,7 +6440,7 @@
                 <w:sz w:val="16"/>
                 <w:szCs w:val="16"/>
               </w:rPr>
-              <w:t xml:space="preserve"> voor unieke id's; werkt ook als de website via een netwerkadres zonder https wordt geopend</w:t>
+              <w:t xml:space="preserve"> voor unieke id's. Werkt ook als de website via een netwerkadres zonder https wordt geopend</w:t>
             </w:r>
           </w:p>
         </w:tc>
@@ -6746,7 +6745,7 @@
                 <w:sz w:val="16"/>
                 <w:szCs w:val="16"/>
               </w:rPr>
-              <w:t>Back-up van de originele versie in één bestand; wordt niet meer geladen</w:t>
+              <w:t>Back-up van de originele versie in één bestand. Wordt niet meer geladen</w:t>
             </w:r>
           </w:p>
         </w:tc>
@@ -6786,7 +6785,7 @@
                 <w:sz w:val="16"/>
                 <w:szCs w:val="16"/>
               </w:rPr>
-              <w:t>Back-up van de oude tests bij die versie; wordt niet meer uitgevoerd</w:t>
+              <w:t>Back-up van de oude tests bij die versie. Wordt niet meer uitgevoerd</w:t>
             </w:r>
           </w:p>
         </w:tc>
@@ -7136,7 +7135,7 @@
                 <w:sz w:val="16"/>
                 <w:szCs w:val="16"/>
               </w:rPr>
-              <w:t>Unit tests (565) voor de regels, de opslag, de export, het thema, de welkom- en gezichtsherkenningsfuncties, herkennen met de pas, de controller, de beveiliging en regressietests voor opgeloste bugs</w:t>
+              <w:t>Unit tests (611) voor de regels, de opslag, de export, het thema, de welkom- en gezichtsherkenningsfuncties, herkennen met de pas, de controller, de beveiliging en regressietests voor opgeloste bugs</w:t>
             </w:r>
           </w:p>
         </w:tc>
@@ -7619,7 +7618,7 @@
                 <w:sz w:val="16"/>
                 <w:szCs w:val="16"/>
               </w:rPr>
-              <w:t xml:space="preserve"> als scan ziet (Enter, Tab of stilte na de laatste toets; niet bij gewoon typen of een te korte code), het normaliseren van het pasnummer, het productvenster of de melding na een scan, geen herkenning als er een venster open is (wel wordt de Enter van de scan tegengehouden), het zoekveld na een scan, de pas koppelen in het medewerkersformulier (uniek, alleen letters en cijfers, leeg = geen pas), de controle en migratie van </w:t>
+              <w:t xml:space="preserve"> als scan ziet (Enter, Tab of stilte na de laatste toets, niet bij gewoon typen of een te korte code), het normaliseren van het pasnummer, het productvenster of de melding na een scan, geen herkenning als er een venster open is (wel wordt de Enter van de scan tegengehouden), het zoekveld na een scan, de pas koppelen in het medewerkersformulier (uniek, alleen letters en cijfers, leeg = geen pas), de controle en migratie van </w:t>
             </w:r>
             <w:r>
               <w:rPr>
@@ -7797,7 +7796,7 @@
                 <w:sz w:val="14"/>
                 <w:shd w:val="clear" w:color="auto" w:fill="EEF4F2"/>
               </w:rPr>
-              <w:t>.gitattributes</w:t>
+              <w:t>tests/review-oktober.test.js</w:t>
             </w:r>
           </w:p>
         </w:tc>
@@ -7814,7 +7813,7 @@
                 <w:sz w:val="16"/>
                 <w:szCs w:val="16"/>
               </w:rPr>
-              <w:t xml:space="preserve">Zorgt dat Git de bestanden in </w:t>
+              <w:t xml:space="preserve">Regressietests voor de review van oktober 2026 (D1 t/m D7, U1 t/m U7, R1 t/m R3 in de naam van iedere test): beschadigde lijsten en volle opslag, dubbele passen, niet-bestaande datums, pasnummers gelijk maken, mislukt wissen, gezichtsherkenning alleen met actieve medewerkers, een scan in het veld </w:t>
             </w:r>
             <w:r>
               <w:rPr>
@@ -7822,14 +7821,14 @@
                 <w:sz w:val="14"/>
                 <w:shd w:val="clear" w:color="auto" w:fill="EEF4F2"/>
               </w:rPr>
-              <w:t>assets/vendor/</w:t>
+              <w:t>Pasnummer</w:t>
             </w:r>
             <w:r>
               <w:rPr>
                 <w:sz w:val="16"/>
                 <w:szCs w:val="16"/>
               </w:rPr>
-              <w:t xml:space="preserve"> en </w:t>
+              <w:t xml:space="preserve"> en in het bedrijfsfilter, dubbelklik op </w:t>
             </w:r>
             <w:r>
               <w:rPr>
@@ -7837,14 +7836,14 @@
                 <w:sz w:val="14"/>
                 <w:shd w:val="clear" w:color="auto" w:fill="EEF4F2"/>
               </w:rPr>
-              <w:t>assets/fonts/</w:t>
+              <w:t>Registreren</w:t>
             </w:r>
             <w:r>
               <w:rPr>
                 <w:sz w:val="16"/>
                 <w:szCs w:val="16"/>
               </w:rPr>
-              <w:t xml:space="preserve"> niet aanpast (geen omzetting van regeleinden), zodat de controlegetallen blijven kloppen</w:t>
+              <w:t>, een ingedrukt gehouden Enter, de focus na opslaan en (de)activeren, het datumveld na middernacht, toegankelijkheid (live region, tabbladen, bedrijfsfilter) en de cijfervelden</w:t>
             </w:r>
           </w:p>
         </w:tc>
@@ -7867,7 +7866,7 @@
                 <w:sz w:val="14"/>
                 <w:shd w:val="clear" w:color="auto" w:fill="EEF4F2"/>
               </w:rPr>
-              <w:t>tests/e2e/</w:t>
+              <w:t>.gitattributes</w:t>
             </w:r>
           </w:p>
         </w:tc>
@@ -7884,7 +7883,7 @@
                 <w:sz w:val="16"/>
                 <w:szCs w:val="16"/>
               </w:rPr>
-              <w:t xml:space="preserve">Browsertests (end-to-end): </w:t>
+              <w:t xml:space="preserve">Zorgt dat Git de bestanden in </w:t>
             </w:r>
             <w:r>
               <w:rPr>
@@ -7892,14 +7891,14 @@
                 <w:sz w:val="14"/>
                 <w:shd w:val="clear" w:color="auto" w:fill="EEF4F2"/>
               </w:rPr>
-              <w:t>app.e2e.test.js</w:t>
+              <w:t>assets/vendor/</w:t>
             </w:r>
             <w:r>
               <w:rPr>
                 <w:sz w:val="16"/>
                 <w:szCs w:val="16"/>
               </w:rPr>
-              <w:t xml:space="preserve"> test de echte pagina in headless Edge of Chrome (laden zonder fouten, zoeken, registreren (daarna bij kiezen op naam geen "welkom terug"), Escape en focus, inloggen, thema, pas koppelen en herkennen, CSV-export), </w:t>
+              <w:t xml:space="preserve"> en </w:t>
             </w:r>
             <w:r>
               <w:rPr>
@@ -7907,37 +7906,14 @@
                 <w:sz w:val="14"/>
                 <w:shd w:val="clear" w:color="auto" w:fill="EEF4F2"/>
               </w:rPr>
-              <w:t>browser.js</w:t>
+              <w:t>assets/fonts/</w:t>
             </w:r>
             <w:r>
               <w:rPr>
                 <w:sz w:val="16"/>
                 <w:szCs w:val="16"/>
               </w:rPr>
-              <w:t xml:space="preserve"> bevat de webserver en de besturing van de browser via het Chrome DevTools Protocol. Draaien met </w:t>
-            </w:r>
-            <w:r>
-              <w:rPr>
-                <w:rFonts w:ascii="Consolas" w:hAnsi="Consolas" w:cs="Consolas"/>
-                <w:sz w:val="14"/>
-                <w:shd w:val="clear" w:color="auto" w:fill="EEF4F2"/>
-              </w:rPr>
-              <w:t>npm run test:e2e</w:t>
-            </w:r>
-            <w:r>
-              <w:rPr>
-                <w:sz w:val="16"/>
-                <w:szCs w:val="16"/>
-              </w:rPr>
-              <w:t xml:space="preserve">, zonder npm-pakketten. Een andere browser kies je met </w:t>
-            </w:r>
-            <w:r>
-              <w:rPr>
-                <w:rFonts w:ascii="Consolas" w:hAnsi="Consolas" w:cs="Consolas"/>
-                <w:sz w:val="14"/>
-                <w:shd w:val="clear" w:color="auto" w:fill="EEF4F2"/>
-              </w:rPr>
-              <w:t>BROWSER_PATH</w:t>
+              <w:t xml:space="preserve"> niet aanpast (geen omzetting van regeleinden), zodat de controlegetallen blijven kloppen</w:t>
             </w:r>
           </w:p>
         </w:tc>
@@ -7960,7 +7936,7 @@
                 <w:sz w:val="14"/>
                 <w:shd w:val="clear" w:color="auto" w:fill="EEF4F2"/>
               </w:rPr>
-              <w:t>.github/workflows/ci.yml</w:t>
+              <w:t>tests/e2e/</w:t>
             </w:r>
           </w:p>
         </w:tc>
@@ -7977,6 +7953,129 @@
                 <w:sz w:val="16"/>
                 <w:szCs w:val="16"/>
               </w:rPr>
+              <w:t xml:space="preserve">Browsertests (end-to-end): </w:t>
+            </w:r>
+            <w:r>
+              <w:rPr>
+                <w:rFonts w:ascii="Consolas" w:hAnsi="Consolas" w:cs="Consolas"/>
+                <w:sz w:val="14"/>
+                <w:shd w:val="clear" w:color="auto" w:fill="EEF4F2"/>
+              </w:rPr>
+              <w:t>app.e2e.test.js</w:t>
+            </w:r>
+            <w:r>
+              <w:rPr>
+                <w:sz w:val="16"/>
+                <w:szCs w:val="16"/>
+              </w:rPr>
+              <w:t xml:space="preserve"> test de echte pagina in headless Edge of Chrome (13 tests: laden zonder fouten, zoeken, registreren (daarna bij kiezen op naam geen "welkom terug"), Escape en focus, inloggen, thema, pas koppelen en herkennen (ook een tweede scan in het veld </w:t>
+            </w:r>
+            <w:r>
+              <w:rPr>
+                <w:rFonts w:ascii="Consolas" w:hAnsi="Consolas" w:cs="Consolas"/>
+                <w:sz w:val="14"/>
+                <w:shd w:val="clear" w:color="auto" w:fill="EEF4F2"/>
+              </w:rPr>
+              <w:t>Pasnummer</w:t>
+            </w:r>
+            <w:r>
+              <w:rPr>
+                <w:sz w:val="16"/>
+                <w:szCs w:val="16"/>
+              </w:rPr>
+              <w:t xml:space="preserve">), CSV-export, een dubbelklik op </w:t>
+            </w:r>
+            <w:r>
+              <w:rPr>
+                <w:rFonts w:ascii="Consolas" w:hAnsi="Consolas" w:cs="Consolas"/>
+                <w:sz w:val="14"/>
+                <w:shd w:val="clear" w:color="auto" w:fill="EEF4F2"/>
+              </w:rPr>
+              <w:t>Registreren</w:t>
+            </w:r>
+            <w:r>
+              <w:rPr>
+                <w:sz w:val="16"/>
+                <w:szCs w:val="16"/>
+              </w:rPr>
+              <w:t xml:space="preserve">, een scan in het bedrijfsfilter, de focus na opslaan en (de)activeren in het beheer, en letters in een cijferveld), </w:t>
+            </w:r>
+            <w:r>
+              <w:rPr>
+                <w:rFonts w:ascii="Consolas" w:hAnsi="Consolas" w:cs="Consolas"/>
+                <w:sz w:val="14"/>
+                <w:shd w:val="clear" w:color="auto" w:fill="EEF4F2"/>
+              </w:rPr>
+              <w:t>browser.js</w:t>
+            </w:r>
+            <w:r>
+              <w:rPr>
+                <w:sz w:val="16"/>
+                <w:szCs w:val="16"/>
+              </w:rPr>
+              <w:t xml:space="preserve"> bevat de webserver en de besturing van de browser via het Chrome DevTools Protocol. Draaien met </w:t>
+            </w:r>
+            <w:r>
+              <w:rPr>
+                <w:rFonts w:ascii="Consolas" w:hAnsi="Consolas" w:cs="Consolas"/>
+                <w:sz w:val="14"/>
+                <w:shd w:val="clear" w:color="auto" w:fill="EEF4F2"/>
+              </w:rPr>
+              <w:t>npm run test:e2e</w:t>
+            </w:r>
+            <w:r>
+              <w:rPr>
+                <w:sz w:val="16"/>
+                <w:szCs w:val="16"/>
+              </w:rPr>
+              <w:t xml:space="preserve">, zonder npm-pakketten. Een andere browser kies je met </w:t>
+            </w:r>
+            <w:r>
+              <w:rPr>
+                <w:rFonts w:ascii="Consolas" w:hAnsi="Consolas" w:cs="Consolas"/>
+                <w:sz w:val="14"/>
+                <w:shd w:val="clear" w:color="auto" w:fill="EEF4F2"/>
+              </w:rPr>
+              <w:t>BROWSER_PATH</w:t>
+            </w:r>
+          </w:p>
+        </w:tc>
+      </w:tr>
+      <w:tr>
+        <w:trPr>
+          <w:cantSplit/>
+        </w:trPr>
+        <w:tc>
+          <w:tcPr>
+            <w:tcW w:w="4337" w:type="dxa"/>
+          </w:tcPr>
+          <w:p>
+            <w:pPr>
+              <w:spacing w:before="20" w:after="20" w:line="240" w:lineRule="auto"/>
+            </w:pPr>
+            <w:r>
+              <w:rPr>
+                <w:rFonts w:ascii="Consolas" w:hAnsi="Consolas" w:cs="Consolas"/>
+                <w:sz w:val="14"/>
+                <w:shd w:val="clear" w:color="auto" w:fill="EEF4F2"/>
+              </w:rPr>
+              <w:t>.github/workflows/ci.yml</w:t>
+            </w:r>
+          </w:p>
+        </w:tc>
+        <w:tc>
+          <w:tcPr>
+            <w:tcW w:w="5301" w:type="dxa"/>
+          </w:tcPr>
+          <w:p>
+            <w:pPr>
+              <w:spacing w:before="20" w:after="20" w:line="240" w:lineRule="auto"/>
+            </w:pPr>
+            <w:r>
+              <w:rPr>
+                <w:sz w:val="16"/>
+                <w:szCs w:val="16"/>
+              </w:rPr>
               <w:t>Voert de unit tests en daarna de browsertests (in Google Chrome) automatisch uit op GitHub met Node.js 24 (LTS), met alleen leesrechten en actions die op een commit-SHA zijn vastgezet</w:t>
             </w:r>
           </w:p>
@@ -7990,7 +8089,7 @@
     </w:p>
     <w:p>
       <w:r>
-        <w:t xml:space="preserve">Bij het toevoegen of wijzigen van een medewerker kiest de beheerder een bedrijf uit de keuzelijst en daarna een consumptiepunt van dat bedrijf. Met het bedrijf worden medewerkers op de beginpagina gegroepeerd en gefilterd. Het bedrijfsfilter op de beginpagina is een keuzelijst waarin je ook kunt typen; de lijst filtert direct tijdens het typen en toont alleen bedrijven met actieve medewerkers. Wat je typt, wordt niet overschreven als de lijst intussen opnieuw wordt getekend. Hebben actieve medewerkers geen </w:t>
+        <w:t xml:space="preserve">Bij het toevoegen of wijzigen van een medewerker kiest de beheerder een bedrijf uit de keuzelijst en daarna een consumptiepunt van dat bedrijf. Met het bedrijf worden medewerkers op de beginpagina gegroepeerd en gefilterd. Het bedrijfsfilter op de beginpagina is een keuzelijst waarin je ook kunt typen. De lijst filtert direct tijdens het typen en toont alleen bedrijven met actieve medewerkers. Wat je typt, wordt niet overschreven als de lijst intussen opnieuw wordt getekend. Hebben actieve medewerkers geen </w:t>
       </w:r>
       <w:r>
         <w:t xml:space="preserve">bedrijf, of bestaat hun bedrijf niet meer, dan staat er ook de keuze </w:t>
@@ -8004,7 +8103,7 @@
         <w:t>Onbekend bedrijf</w:t>
       </w:r>
       <w:r>
-        <w:t>; die toont al deze medewerkers.</w:t>
+        <w:t>. Die toont al deze medewerkers. Escape sluit een open keuzelijst, en een schermlezer hoort of de lijst open is en welk bedrijf is gekozen.</w:t>
       </w:r>
     </w:p>
     <w:p>
@@ -8018,7 +8117,7 @@
         </w:numPr>
       </w:pPr>
       <w:bookmarkStart w:id="5" w:name="k3"/>
-      <w:bookmarkStart w:id="6" w:name="_Toc242703528"/>
+      <w:bookmarkStart w:id="6" w:name="_Toc242707511"/>
       <w:r>
         <w:t>DE WEBSITE STARTEN.</w:t>
       </w:r>
@@ -8240,7 +8339,7 @@
         </w:numPr>
       </w:pPr>
       <w:bookmarkStart w:id="7" w:name="k4"/>
-      <w:bookmarkStart w:id="8" w:name="_Toc242703529"/>
+      <w:bookmarkStart w:id="8" w:name="_Toc242707512"/>
       <w:r>
         <w:t>GEBRUIKERSHANDLEIDING.</w:t>
       </w:r>
@@ -8253,7 +8352,7 @@
         <w:keepNext/>
       </w:pPr>
       <w:bookmarkStart w:id="9" w:name="k5"/>
-      <w:bookmarkStart w:id="10" w:name="_Toc242703530"/>
+      <w:bookmarkStart w:id="10" w:name="_Toc242707513"/>
       <w:r>
         <w:t>EEN MEDEWERKER ZOEKEN</w:t>
       </w:r>
@@ -8299,7 +8398,7 @@
     </w:p>
     <w:p>
       <w:r>
-        <w:t>Sluit je een venster (met het kruisje, een klik naast het venster, Escape of na opslaan), dan gaat de focus terug naar de knop of medewerkerrij waarmee je het venster opende. Met het toetsenbord kun je dan meteen verder waar je was.</w:t>
+        <w:t>Sluit je een venster (met het kruisje, een klik naast het venster, Escape of na opslaan), dan gaat de focus terug naar de knop of medewerkerrij waarmee je het venster opende. Is de lijst intussen opnieuw getekend (bijvoorbeeld na opslaan in het beheer), dan krijgt de nieuwe knop met dezelfde id de focus. Met het toetsenbord kun je dan meteen verder waar je was.</w:t>
       </w:r>
     </w:p>
     <w:p>
@@ -8308,7 +8407,7 @@
         <w:keepNext/>
       </w:pPr>
       <w:bookmarkStart w:id="11" w:name="k6"/>
-      <w:bookmarkStart w:id="12" w:name="_Toc242703531"/>
+      <w:bookmarkStart w:id="12" w:name="_Toc242707514"/>
       <w:r>
         <w:t>EEN PRODUCT REGISTREREN</w:t>
       </w:r>
@@ -8358,8 +8457,6 @@
       </w:r>
       <w:r>
         <w:tab/>
-      </w:r>
-      <w:r>
         <w:t>Klik op je naam. Het productvenster opent met alleen de producten van jouw consumptiepunt.</w:t>
       </w:r>
     </w:p>
@@ -8383,6 +8480,8 @@
       </w:r>
       <w:r>
         <w:tab/>
+      </w:r>
+      <w:r>
         <w:t xml:space="preserve">Klik bij ieder gewenst product op </w:t>
       </w:r>
       <w:r>
@@ -8510,7 +8609,18 @@
         <w:t>Registreren</w:t>
       </w:r>
       <w:r>
-        <w:t xml:space="preserve"> zonder iets te kiezen, dan verschijnt "Kies eerst minimaal één product". Biedt je consumptiepunt nog niets aan, dan staat er "Geen producten op jouw consumptiepunt."</w:t>
+        <w:t xml:space="preserve"> zonder iets te kiezen, dan verschijnt "Kies eerst minimaal één product". Biedt je consumptiepunt nog niets aan, dan staat er "Geen producten op jouw consumptiepunt." Dubbelklik je per ongeluk op </w:t>
+      </w:r>
+      <w:r>
+        <w:rPr>
+          <w:rFonts w:ascii="Consolas" w:hAnsi="Consolas" w:cs="Consolas"/>
+          <w:sz w:val="18"/>
+          <w:shd w:val="clear" w:color="auto" w:fill="EEF4F2"/>
+        </w:rPr>
+        <w:t>Registreren</w:t>
+      </w:r>
+      <w:r>
+        <w:t>, dan wordt er één keer geregistreerd en opent de tweede klik niet het productvenster van de collega wiens naam onder de knop staat.</w:t>
       </w:r>
     </w:p>
     <w:p>
@@ -8519,7 +8629,7 @@
         <w:keepNext/>
       </w:pPr>
       <w:bookmarkStart w:id="13" w:name="k7"/>
-      <w:bookmarkStart w:id="14" w:name="_Toc242703532"/>
+      <w:bookmarkStart w:id="14" w:name="_Toc242707515"/>
       <w:r>
         <w:t>ADMIN-DASHBOARD OPENEN</w:t>
       </w:r>
@@ -8650,7 +8760,7 @@
         <w:keepNext/>
       </w:pPr>
       <w:bookmarkStart w:id="15" w:name="k8"/>
-      <w:bookmarkStart w:id="16" w:name="_Toc242703533"/>
+      <w:bookmarkStart w:id="16" w:name="_Toc242707516"/>
       <w:r>
         <w:t>REGISTRATIES BEHEREN</w:t>
       </w:r>
@@ -8936,7 +9046,7 @@
         <w:keepNext/>
       </w:pPr>
       <w:bookmarkStart w:id="17" w:name="k9"/>
-      <w:bookmarkStart w:id="18" w:name="_Toc242703534"/>
+      <w:bookmarkStart w:id="18" w:name="_Toc242707517"/>
       <w:r>
         <w:t>MEDEWERKERS BEHEREN</w:t>
       </w:r>
@@ -9009,7 +9119,7 @@
         <w:t>Afwijkend werkgevernummer</w:t>
       </w:r>
       <w:r>
-        <w:t xml:space="preserve"> in; dat nummer gaat dan voor in de CSV-export.</w:t>
+        <w:t xml:space="preserve"> in. Dat nummer gaat dan voor in de CSV-export.</w:t>
       </w:r>
     </w:p>
     <w:p>
@@ -9034,7 +9144,7 @@
         <w:t>Pasnummer</w:t>
       </w:r>
       <w:r>
-        <w:t xml:space="preserve"> en houd de pas van de medewerker tegen de USB-NFC-lezer. De lezer typt het pasnummer in het veld; de Enter die de lezer daarna stuurt, verstuurt het formulier niet. Leeg laten betekent: geen pas. Een pas weghalen kan door het veld leeg te maken en op te slaan. Zie 4.16.</w:t>
+        <w:t xml:space="preserve"> en houd de pas van de medewerker tegen de USB-NFC-lezer. De lezer typt het pasnummer in het veld en de Enter die de lezer daarna stuurt, verstuurt het formulier niet. Staat er al een nummer in het veld, dan vervangt het nummer van de nieuwe pas het oude. Leeg laten betekent: geen pas. Een pas weghalen kan door het veld leeg te maken en op te slaan. Zie 4.16.</w:t>
       </w:r>
     </w:p>
     <w:p>
@@ -9135,7 +9245,21 @@
     </w:p>
     <w:p>
       <w:r>
-        <w:t>Voornaam, achternaam, looncode, personeelsnummer en bedrijf zijn verplicht, en ook het consumptiepunt als het gekozen bedrijf consumptiepunten heeft. Ontbreekt er iets, dan krijgt het veld een rode rand met een melding eronder en krijgt het eerste foute veld de focus. Looncode, personeelsnummer en een afwijkend werkgevernummer mogen alleen cijfers bevatten; anders verschijnt "Gebruik alleen cijfers." bij het veld. De voornaam en achternaam worden apart opgeslagen (</w:t>
+        <w:t xml:space="preserve">Voornaam, achternaam, looncode, personeelsnummer en bedrijf zijn verplicht, en ook het consumptiepunt als het gekozen bedrijf consumptiepunten heeft. Ontbreekt er iets, dan krijgt het veld een rode rand met een melding eronder en krijgt het eerste foute veld de focus. Looncode, personeelsnummer en een afwijkend werkgevernummer mogen alleen cijfers bevatten. Anders verschijnt "Gebruik alleen cijfers." bij het veld, ook als je bijvoorbeeld "12a" typt. Deze velden zijn tekstvelden met een cijfertoetsenbord op </w:t>
+      </w:r>
+      <w:r>
+        <w:t>de tablet (</w:t>
+      </w:r>
+      <w:r>
+        <w:rPr>
+          <w:rFonts w:ascii="Consolas" w:hAnsi="Consolas" w:cs="Consolas"/>
+          <w:sz w:val="18"/>
+          <w:shd w:val="clear" w:color="auto" w:fill="EEF4F2"/>
+        </w:rPr>
+        <w:t>inputmode="numeric"</w:t>
+      </w:r>
+      <w:r>
+        <w:t>). De voornaam en achternaam worden apart opgeslagen (</w:t>
       </w:r>
       <w:r>
         <w:rPr>
@@ -9157,7 +9281,7 @@
         <w:t>lastName</w:t>
       </w:r>
       <w:r>
-        <w:t>); de volledige naam (</w:t>
+        <w:t>). De volledige naam (</w:t>
       </w:r>
       <w:r>
         <w:rPr>
@@ -9184,7 +9308,7 @@
         <w:t>Verwijderen</w:t>
       </w:r>
       <w:r>
-        <w:t xml:space="preserve"> definitief worden verwijderd; de browser vraagt eerst om bevestiging. Heeft de medewerker registraties, dan staat de knop er niet en is deactiveren voldoende: zo blijven naam, looncode en personeelsnummer beschikbaar voor de CSV-export. Ook bij een actieve medewerker staat de knop er niet. Controller en model controleren dit zelf ook, voor het geval een knop verouderd is (bijvoorbeeld na een wijziging in een ander tabblad): bij registraties verschijnt "Deze medewerker heeft registraties en kan niet definit</w:t>
+        <w:t xml:space="preserve"> definitief worden verwijderd. De browser vraagt eerst om bevestiging. Heeft de medewerker registraties, dan staat de knop er niet en is deactiveren voldoende: zo blijven naam, looncode en personeelsnummer beschikbaar voor de CSV-export. Ook bij een actieve medewerker staat de knop er niet. Controller en model controleren dit zelf ook, voor het geval een knop verouderd is (bijvoorbeeld na een wijziging in een ander tabblad): bij registraties verschijnt "Deze medewerker heeft registraties en kan niet definit</w:t>
       </w:r>
       <w:r>
         <w:t>ief worden verwijderd. Deactiveren is voldoende.", bij een actieve medewerker "Zet deze medewerker eerst op inactief. Alleen een inactieve medewerker kan definitief worden verwijderd." Een personeelsnummer mag maar bij één medewerker voorkomen.</w:t>
@@ -9236,7 +9360,7 @@
         <w:t>04A1B2C3</w:t>
       </w:r>
       <w:r>
-        <w:t xml:space="preserve">). Daarna mag het alleen letters en cijfers bevatten, 4 tot en met 64 tekens; anders verschijnt "Gebruik alleen letters en cijfers (4 tot 64 tekens)." bij het veld. Een pas mag maar bij één medewerker horen; anders verschijnt "Deze pas is al gekoppeld aan een andere medewerker." In de medewerkerslijst staat bij medewerkers met een pas het label </w:t>
+        <w:t xml:space="preserve">). Daarna mag het alleen letters en cijfers bevatten, 4 tot en met 64 tekens. Anders verschijnt "Gebruik alleen letters en cijfers (4 tot 64 tekens)." bij het veld. Een pas mag maar bij één medewerker horen. Anders verschijnt "Deze pas is al gekoppeld aan een andere medewerker." In de medewerkerslijst staat bij medewerkers met een pas het label </w:t>
       </w:r>
       <w:r>
         <w:rPr>
@@ -9247,7 +9371,7 @@
         <w:t>Pas gekoppeld</w:t>
       </w:r>
       <w:r>
-        <w:t>; het pasnummer zelf staat niet in de lijst, niet in het logboek en niet in de CSV-export.</w:t>
+        <w:t>. Het pasnummer zelf staat niet in de lijst, niet in het logboek en niet in de CSV-export.</w:t>
       </w:r>
     </w:p>
     <w:p>
@@ -9256,7 +9380,7 @@
         <w:keepNext/>
       </w:pPr>
       <w:bookmarkStart w:id="19" w:name="k10"/>
-      <w:bookmarkStart w:id="20" w:name="_Toc242703535"/>
+      <w:bookmarkStart w:id="20" w:name="_Toc242707518"/>
       <w:r>
         <w:t>PRODUCTEN BEHEREN</w:t>
       </w:r>
@@ -9361,10 +9485,10 @@
         <w:t>0.65</w:t>
       </w:r>
       <w:r>
-        <w:t xml:space="preserve">. Anders verschijnt "Vul een prijs van 0 tot en met 1000 euro in, met hooguit twee decimalen." Twee producten met dezelfde naam kan niet: dan verschijnt "Er bestaat al een product met deze naam." Een product dat al eens is geregistreerd, kan niet worden verwijderd, zodat oude registraties en de export blijven kloppen ("Dit product wordt al gebruikt en kan niet worden verwijderd"). Bij een product dat nooit is geregistreerd, vraagt de browser eerst "Product Boter verwijderen?" (met de naam van het product); </w:t>
-      </w:r>
-      <w:r>
-        <w:t xml:space="preserve">met </w:t>
+        <w:t xml:space="preserve">. Anders verschijnt "Vul een prijs van 0 tot en met 1000 euro in, met hooguit twee decimalen." Twee producten met dezelfde naam kan niet: dan verschijnt "Er bestaat al een product met deze naam." Een product dat al eens is geregistreerd, kan niet worden verwijderd, zodat oude registraties en de export blijven kloppen ("Dit product wordt al gebruikt en kan niet worden verwijderd"). Bij een product dat nooit is geregistreerd, vraagt de browser eerst "Product Boter verwijderen?" (met de naam van het product). </w:t>
+      </w:r>
+      <w:r>
+        <w:t xml:space="preserve">Met </w:t>
       </w:r>
       <w:r>
         <w:rPr>
@@ -9384,7 +9508,7 @@
         <w:keepNext/>
       </w:pPr>
       <w:bookmarkStart w:id="21" w:name="k11"/>
-      <w:bookmarkStart w:id="22" w:name="_Toc242703536"/>
+      <w:bookmarkStart w:id="22" w:name="_Toc242707519"/>
       <w:r>
         <w:t>BEDRIJVEN EN CONSUMPTIEPUNTEN BEHEREN</w:t>
       </w:r>
@@ -9517,7 +9641,7 @@
         <w:t>Aanbod wijzigen</w:t>
       </w:r>
       <w:r>
-        <w:t>: naam, bedrijf of aangeboden producten van een punt aanpassen. De voorraad blijft bewaard, ook als een product tijdelijk uit staat. Kies je een ander bedrijf, dan verhuizen de medewerkers van dit punt mee naar dat bedrijf; alleen hun bedrijf verandert, hun naam en andere gegevens blijven gelijk.</w:t>
+        <w:t>: naam, bedrijf of aangeboden producten van een punt aanpassen. De voorraad blijft bewaard, ook als een product tijdelijk uit staat. Kies je een ander bedrijf, dan verhuizen de medewerkers van dit punt mee naar dat bedrijf. Alleen hun bedrijf verandert, hun naam en andere gegevens blijven gelijk.</w:t>
       </w:r>
     </w:p>
     <w:p>
@@ -9547,7 +9671,7 @@
         <w:keepNext/>
       </w:pPr>
       <w:bookmarkStart w:id="23" w:name="k12"/>
-      <w:bookmarkStart w:id="24" w:name="_Toc242703537"/>
+      <w:bookmarkStart w:id="24" w:name="_Toc242707520"/>
       <w:r>
         <w:t>VOORRAAD BEHEREN</w:t>
       </w:r>
@@ -9716,7 +9840,7 @@
     </w:p>
     <w:p>
       <w:r>
-        <w:t>Iedere registratie haalt automatisch 1 van de voorraad af bij het consumptiepunt van de medewerker, maar alleen als dat punt het product aanbiedt (een correctie voor een product dat het punt niet heeft, verandert de voorraad dus niet). Na het aanpassen van voorraad of minimum worden alleen het statuslabel en de bijbestellijst bijgewerkt; de tabel blijft staan, zodat je met Tab gewoon naar het volgende veld kunt. Een foute invoer (leeg, geen heel getal, negatief of meer dan 100.000) geeft een melding en spri</w:t>
+        <w:t>Iedere registratie haalt automatisch 1 van de voorraad af bij het consumptiepunt van de medewerker, maar alleen als dat punt het product aanbiedt (een correctie voor een product dat het punt niet heeft, verandert de voorraad dus niet). Na het aanpassen van voorraad of minimum worden alleen het statuslabel en de bijbestellijst bijgewerkt. De tabel blijft staan, zodat je met Tab gewoon naar het volgende veld kunt. Een foute invoer (leeg, geen heel getal, negatief of meer dan 100.000) geeft een melding en spri</w:t>
       </w:r>
       <w:r>
         <w:t>ngt terug naar de opgeslagen waarde.</w:t>
@@ -9751,7 +9875,7 @@
     </w:p>
     <w:p>
       <w:r>
-        <w:t>Een negatieve telling invullen kan niet. Door registraties kan de voorraad wel onder 0 komen; dat betekent dat er meer is geregistreerd dan er volgens de telling was. Tel dan opnieuw. Alle leveringen, tellingen en wijzigingen van het minimum komen in het logboek.</w:t>
+        <w:t>Een negatieve telling invullen kan niet. Door registraties kan de voorraad wel onder 0 komen. Dat betekent dat er meer is geregistreerd dan er volgens de telling was. Tel dan opnieuw. Alle leveringen, tellingen en wijzigingen van het minimum komen in het logboek.</w:t>
       </w:r>
     </w:p>
     <w:p>
@@ -9765,7 +9889,7 @@
         <w:keepNext/>
       </w:pPr>
       <w:bookmarkStart w:id="25" w:name="k13"/>
-      <w:bookmarkStart w:id="26" w:name="_Toc242703538"/>
+      <w:bookmarkStart w:id="26" w:name="_Toc242707521"/>
       <w:r>
         <w:t>LOGBOEK BEKIJKEN</w:t>
       </w:r>
@@ -9805,7 +9929,7 @@
         <w:keepNext/>
       </w:pPr>
       <w:bookmarkStart w:id="27" w:name="k14"/>
-      <w:bookmarkStart w:id="28" w:name="_Toc242703539"/>
+      <w:bookmarkStart w:id="28" w:name="_Toc242707522"/>
       <w:r>
         <w:t>ALLE GEGEVENS WISSEN</w:t>
       </w:r>
@@ -9922,7 +10046,7 @@
         <w:t>Annuleren</w:t>
       </w:r>
       <w:r>
-        <w:t>, dan verandert er niets. Andere open tabbladen laden de nieuwe demogegevens vanzelf in.</w:t>
+        <w:t>, dan verandert er niets. Andere open tabbladen laden de nieuwe demogegevens vanzelf in. Lukt het wissen niet, dan blijft alles staan en verschijnt "De gegevens konden niet worden gewist. Probeer het opnieuw."</w:t>
       </w:r>
     </w:p>
     <w:p>
@@ -9931,7 +10055,7 @@
         <w:keepNext/>
       </w:pPr>
       <w:bookmarkStart w:id="29" w:name="k15"/>
-      <w:bookmarkStart w:id="30" w:name="_Toc242703540"/>
+      <w:bookmarkStart w:id="30" w:name="_Toc242707523"/>
       <w:r>
         <w:t>MODAL SLUITEN EN UITLOGGEN</w:t>
       </w:r>
@@ -10005,7 +10129,7 @@
         <w:keepNext/>
       </w:pPr>
       <w:bookmarkStart w:id="31" w:name="k16"/>
-      <w:bookmarkStart w:id="32" w:name="_Toc242703541"/>
+      <w:bookmarkStart w:id="32" w:name="_Toc242707524"/>
       <w:r>
         <w:t>CSV EXPORTEREN</w:t>
       </w:r>
@@ -10237,7 +10361,56 @@
         <w:t>Prijs</w:t>
       </w:r>
       <w:r>
-        <w:t>, in die vaste volgorde. Iedere regel is één medewerker in één loonmaand. Het werkgevernummer is het nummer dat bij de registraties is bewaard (zie de tabel Registraties hieronder); is dat binnen een maand veranderd, dan krijgt die maand één regel per werkgevernummer. Er staat bewust geen totaalregel in, omdat de loonadministratie iedere regel als medewerker inleest.</w:t>
+        <w:t>, in die vaste volgorde. Iedere regel is één medewerker in één loonmaand. Het werkgevernummer is het nummer dat bij de registraties is bewaard (zie de tabel Registraties hieronder). Is dat binnen een maand veranderd, dan krijgt die maand één regel per werkgevernummer. Er staat bewust geen totaalregel in, omdat de loonadministratie iedere regel als medewerker inleest.</w:t>
+      </w:r>
+    </w:p>
+    <w:p>
+      <w:r>
+        <w:t xml:space="preserve">Let op bij voorloopnullen: een looncode of personeelsnummer als </w:t>
+      </w:r>
+      <w:r>
+        <w:rPr>
+          <w:rFonts w:ascii="Consolas" w:hAnsi="Consolas" w:cs="Consolas"/>
+          <w:sz w:val="18"/>
+          <w:shd w:val="clear" w:color="auto" w:fill="EEF4F2"/>
+        </w:rPr>
+        <w:t>0012</w:t>
+      </w:r>
+      <w:r>
+        <w:t xml:space="preserve"> staat zo in het bestand, maar Excel toont het na een dubbelklik als </w:t>
+      </w:r>
+      <w:r>
+        <w:rPr>
+          <w:rFonts w:ascii="Consolas" w:hAnsi="Consolas" w:cs="Consolas"/>
+          <w:sz w:val="18"/>
+          <w:shd w:val="clear" w:color="auto" w:fill="EEF4F2"/>
+        </w:rPr>
+        <w:t>12</w:t>
+      </w:r>
+      <w:r>
+        <w:t xml:space="preserve"> en slaat het bij opnieuw opslaan ook zo op. Lees het bestand daarom rechtstreeks in het loonsysteem in, of open het in Excel via </w:t>
+      </w:r>
+      <w:r>
+        <w:rPr>
+          <w:rFonts w:ascii="Consolas" w:hAnsi="Consolas" w:cs="Consolas"/>
+          <w:sz w:val="18"/>
+          <w:shd w:val="clear" w:color="auto" w:fill="EEF4F2"/>
+        </w:rPr>
+        <w:t>Gegevens</w:t>
+      </w:r>
+      <w:r>
+        <w:t xml:space="preserve"> en </w:t>
+      </w:r>
+      <w:r>
+        <w:rPr>
+          <w:rFonts w:ascii="Consolas" w:hAnsi="Consolas" w:cs="Consolas"/>
+          <w:sz w:val="18"/>
+          <w:shd w:val="clear" w:color="auto" w:fill="EEF4F2"/>
+        </w:rPr>
+        <w:t>Uit tekst/CSV</w:t>
+      </w:r>
+      <w:r>
+        <w:t xml:space="preserve"> met de kolommen Looncode, Personeelsnummer en Werkgevernummer als tekst (zie het TO, hoofdstuk 12).</w:t>
       </w:r>
     </w:p>
     <w:p>
@@ -10340,7 +10513,7 @@
         <w:keepNext/>
       </w:pPr>
       <w:bookmarkStart w:id="33" w:name="k17"/>
-      <w:bookmarkStart w:id="34" w:name="_Toc242703542"/>
+      <w:bookmarkStart w:id="34" w:name="_Toc242707525"/>
       <w:r>
         <w:t>LICHT OF DONKER THEMA</w:t>
       </w:r>
@@ -10391,7 +10564,7 @@
         <w:t>Slider (met zon- en maanicoon)</w:t>
       </w:r>
       <w:r>
-        <w:t>: kies zelf licht of donker. Dit is een vaste keuze; "Systeem" en "Auto" staan daarna uit.</w:t>
+        <w:t>: kies zelf licht of donker. Dit is een vaste keuze. "Systeem" en "Auto" staan daarna uit.</w:t>
       </w:r>
     </w:p>
     <w:p>
@@ -10447,7 +10620,7 @@
         <w:keepNext/>
       </w:pPr>
       <w:bookmarkStart w:id="35" w:name="k18"/>
-      <w:bookmarkStart w:id="36" w:name="_Toc242703543"/>
+      <w:bookmarkStart w:id="36" w:name="_Toc242707526"/>
       <w:r>
         <w:t>WELKOM EN "ZELFDE ALS VORIGE KEER"</w:t>
       </w:r>
@@ -10470,7 +10643,7 @@
         <w:t>Zelfde als vorige keer</w:t>
       </w:r>
       <w:r>
-        <w:t xml:space="preserve"> staan die aantallen direct klaar; de medewerker kan ze nog aanpassen en bevestigt met </w:t>
+        <w:t xml:space="preserve"> staan die aantallen direct klaar. De medewerker kan ze nog aanpassen en bevestigt met </w:t>
       </w:r>
       <w:r>
         <w:rPr>
@@ -10492,7 +10665,7 @@
         <w:t>+</w:t>
       </w:r>
       <w:r>
-        <w:t xml:space="preserve">-knop; na een druk op </w:t>
+        <w:t xml:space="preserve">-knop. Na een druk op </w:t>
       </w:r>
       <w:r>
         <w:rPr>
@@ -10514,7 +10687,18 @@
         <w:t>−</w:t>
       </w:r>
       <w:r>
-        <w:t xml:space="preserve"> houdt dezelfde knop de focus, zodat je met het toetsenbord meerdere keren kunt drukken.</w:t>
+        <w:t xml:space="preserve"> houdt dezelfde knop de focus, zodat je met het toetsenbord meerdere keren kunt drukken, en een schermlezer leest het nieuwe aantal voor (bijvoorbeeld "Blikje: 2", via de vaste live region </w:t>
+      </w:r>
+      <w:r>
+        <w:rPr>
+          <w:rFonts w:ascii="Consolas" w:hAnsi="Consolas" w:cs="Consolas"/>
+          <w:sz w:val="18"/>
+          <w:shd w:val="clear" w:color="auto" w:fill="EEF4F2"/>
+        </w:rPr>
+        <w:t>#productLiveStatus</w:t>
+      </w:r>
+      <w:r>
+        <w:t>).</w:t>
       </w:r>
     </w:p>
     <w:p>
@@ -10523,7 +10707,7 @@
         <w:keepNext/>
       </w:pPr>
       <w:bookmarkStart w:id="37" w:name="k19"/>
-      <w:bookmarkStart w:id="38" w:name="_Toc242703544"/>
+      <w:bookmarkStart w:id="38" w:name="_Toc242707527"/>
       <w:r>
         <w:t>DEMO GEZICHTSHERKENNING</w:t>
       </w:r>
@@ -10532,7 +10716,7 @@
     </w:p>
     <w:p>
       <w:r>
-        <w:t>Dit is een demo; zie het TO (hoofdstuk 13, Privacy) waarom gezichtsherkenning niet geschikt is voor de echte toepassing.</w:t>
+        <w:t>Dit is een demo. Zie het TO (hoofdstuk 13, Privacy) waarom gezichtsherkenning niet geschikt is voor de echte toepassing.</w:t>
       </w:r>
     </w:p>
     <w:p>
@@ -10589,6 +10773,8 @@
       </w:r>
       <w:r>
         <w:tab/>
+      </w:r>
+      <w:r>
         <w:t xml:space="preserve">De camera van de tablet of laptop gaat aan. Plaats je gezicht in het kader, zet het vinkje voor vrijwillige deelname en klik op </w:t>
       </w:r>
       <w:r>
@@ -10643,7 +10829,7 @@
     </w:p>
     <w:p>
       <w:r>
-        <w:t xml:space="preserve">Er worden geen foto's gemaakt of opgeslagen; de herkenning gebeurt op het apparaat zelf. Na het herladen van de pagina is niemand meer ingesteld. Met </w:t>
+        <w:t xml:space="preserve">Er worden geen foto's gemaakt of opgeslagen. De herkenning gebeurt op het apparaat zelf. Na het herladen van de pagina is niemand meer ingesteld. Met </w:t>
       </w:r>
       <w:r>
         <w:rPr>
@@ -10654,7 +10840,7 @@
         <w:t>Uitzetten</w:t>
       </w:r>
       <w:r>
-        <w:t xml:space="preserve"> in het productvenster vergeet de demo je gezicht direct; </w:t>
+        <w:t xml:space="preserve"> in het productvenster vergeet de demo je gezicht direct en </w:t>
       </w:r>
       <w:r>
         <w:rPr>
@@ -10729,7 +10915,7 @@
         <w:keepNext/>
       </w:pPr>
       <w:bookmarkStart w:id="39" w:name="k20"/>
-      <w:bookmarkStart w:id="40" w:name="_Toc242703545"/>
+      <w:bookmarkStart w:id="40" w:name="_Toc242707528"/>
       <w:r>
         <w:t>HERKENNEN MET DE PAS</w:t>
       </w:r>
@@ -10860,7 +11046,18 @@
         <w:t>Registreren</w:t>
       </w:r>
       <w:r>
-        <w:t xml:space="preserve">). Staat de focus in het zoekveld, dan haalt de website de getypte tekens van de lezer daar weer uit; het zoekveld heeft na een scan dezelfde inhoud als ervoor. Gewoon typen in het zoekveld werkt zoals altijd: een mens typt veel trager dan de lezer, en dat ziet de website nooit als een scan. De instellingen staan in </w:t>
+        <w:t xml:space="preserve">). Staat de focus in het zoekveld, dan haalt de website de getypte tekens van de lezer daar weer uit. Het zoekveld heeft na een scan dezelfde inhoud als ervoor. Hetzelfde geldt voor het bedrijfsfilter: daar komen na een scan ook het gekozen bedrijf terug en gaat de keuzelijst dicht. In het veld </w:t>
+      </w:r>
+      <w:r>
+        <w:rPr>
+          <w:rFonts w:ascii="Consolas" w:hAnsi="Consolas" w:cs="Consolas"/>
+          <w:sz w:val="18"/>
+          <w:shd w:val="clear" w:color="auto" w:fill="EEF4F2"/>
+        </w:rPr>
+        <w:t>Pasnummer</w:t>
+      </w:r>
+      <w:r>
+        <w:t xml:space="preserve"> van het medewerkersformulier vervangt een scan het nummer dat er al stond. Gewoon typen in het zoekveld werkt zoals altijd: een mens typt veel trager dan de lezer, en dat ziet de website nooit als een scan. De instellingen staan in </w:t>
       </w:r>
       <w:r>
         <w:rPr>
@@ -10923,7 +11120,7 @@
         </w:numPr>
       </w:pPr>
       <w:bookmarkStart w:id="41" w:name="k21"/>
-      <w:bookmarkStart w:id="42" w:name="_Toc242703546"/>
+      <w:bookmarkStart w:id="42" w:name="_Toc242707529"/>
       <w:r>
         <w:t xml:space="preserve">UITLEG VAN </w:t>
       </w:r>
@@ -10947,7 +11144,7 @@
         <w:keepNext/>
       </w:pPr>
       <w:bookmarkStart w:id="43" w:name="k22"/>
-      <w:bookmarkStart w:id="44" w:name="_Toc242703547"/>
+      <w:bookmarkStart w:id="44" w:name="_Toc242707530"/>
       <w:r>
         <w:t>METADATA EN EXTERNE BESTANDEN</w:t>
       </w:r>
@@ -11127,7 +11324,7 @@
         <w:t>file://</w:t>
       </w:r>
       <w:r>
-        <w:t xml:space="preserve">-waarschuwing onderaan) zijn toegestaan via hun sha256-hash. Wijzig je zo'n script, dan moet de hash in de CSP mee veranderen; </w:t>
+        <w:t xml:space="preserve">-waarschuwing onderaan) zijn toegestaan via hun sha256-hash. Wijzig je zo'n script, dan moet de hash in de CSP mee veranderen. </w:t>
       </w:r>
       <w:r>
         <w:rPr>
@@ -11149,7 +11346,7 @@
         <w:t>frame-ancestors</w:t>
       </w:r>
       <w:r>
-        <w:t xml:space="preserve"> werkt niet in een meta-tag; die moet in productie als HTTP-header door de webserver worden meegestuurd (zie het TO, hoofdstuk 13).</w:t>
+        <w:t xml:space="preserve"> werkt niet in een meta-tag. Die moet in productie als HTTP-header door de webserver worden meegestuurd (zie het TO, hoofdstuk 13).</w:t>
       </w:r>
     </w:p>
     <w:p>
@@ -11223,7 +11420,7 @@
         <w:keepNext/>
       </w:pPr>
       <w:bookmarkStart w:id="45" w:name="k23"/>
-      <w:bookmarkStart w:id="46" w:name="_Toc242703548"/>
+      <w:bookmarkStart w:id="46" w:name="_Toc242707531"/>
       <w:r>
         <w:t>NAVIGATIEBALK</w:t>
       </w:r>
@@ -11436,7 +11633,7 @@
         <w:keepNext/>
       </w:pPr>
       <w:bookmarkStart w:id="47" w:name="k24"/>
-      <w:bookmarkStart w:id="48" w:name="_Toc242703549"/>
+      <w:bookmarkStart w:id="48" w:name="_Toc242707532"/>
       <w:r>
         <w:t>HERO-GEDEELTE</w:t>
       </w:r>
@@ -11481,7 +11678,7 @@
         <w:keepNext/>
       </w:pPr>
       <w:bookmarkStart w:id="49" w:name="k25"/>
-      <w:bookmarkStart w:id="50" w:name="_Toc242703550"/>
+      <w:bookmarkStart w:id="50" w:name="_Toc242707533"/>
       <w:r>
         <w:t>MEDEWERKERLIJST</w:t>
       </w:r>
@@ -11587,7 +11784,7 @@
         <w:t>faceRecognizeButton</w:t>
       </w:r>
       <w:r>
-        <w:t>); alleen zichtbaar als de demo aan staat en de browser een camera kan gebruiken.</w:t>
+        <w:t>), alleen zichtbaar als de demo aan staat en de browser een camera kan gebruiken.</w:t>
       </w:r>
     </w:p>
     <w:p>
@@ -11744,7 +11941,7 @@
         <w:keepNext/>
       </w:pPr>
       <w:bookmarkStart w:id="51" w:name="k26"/>
-      <w:bookmarkStart w:id="52" w:name="_Toc242703551"/>
+      <w:bookmarkStart w:id="52" w:name="_Toc242707534"/>
       <w:r>
         <w:t>STATISTIEKEN</w:t>
       </w:r>
@@ -11827,7 +12024,7 @@
         <w:keepNext/>
       </w:pPr>
       <w:bookmarkStart w:id="53" w:name="k27"/>
-      <w:bookmarkStart w:id="54" w:name="_Toc242703552"/>
+      <w:bookmarkStart w:id="54" w:name="_Toc242707535"/>
       <w:r>
         <w:t>VENSTERS (MODALS)</w:t>
       </w:r>
@@ -12308,7 +12505,7 @@
         <w:t>Uitloggen</w:t>
       </w:r>
       <w:r>
-        <w:t xml:space="preserve"> logt uit zonder het venster te sluiten; daarna staat het loginformulier in hetzelfde venster.</w:t>
+        <w:t xml:space="preserve"> logt uit zonder het venster te sluiten. Daarna staat het loginformulier in hetzelfde venster.</w:t>
       </w:r>
     </w:p>
     <w:p>
@@ -12355,7 +12552,7 @@
         <w:keepNext/>
       </w:pPr>
       <w:bookmarkStart w:id="55" w:name="k28"/>
-      <w:bookmarkStart w:id="56" w:name="_Toc242703553"/>
+      <w:bookmarkStart w:id="56" w:name="_Toc242707536"/>
       <w:r>
         <w:t>WAARSCHUWING BIJ OPENEN ALS LOS BESTAND</w:t>
       </w:r>
@@ -12400,7 +12597,7 @@
         </w:numPr>
       </w:pPr>
       <w:bookmarkStart w:id="57" w:name="k29"/>
-      <w:bookmarkStart w:id="58" w:name="_Toc242703554"/>
+      <w:bookmarkStart w:id="58" w:name="_Toc242707537"/>
       <w:r>
         <w:t xml:space="preserve">UITLEG VAN </w:t>
       </w:r>
@@ -12424,7 +12621,7 @@
         <w:keepNext/>
       </w:pPr>
       <w:bookmarkStart w:id="59" w:name="k30"/>
-      <w:bookmarkStart w:id="60" w:name="_Toc242703555"/>
+      <w:bookmarkStart w:id="60" w:name="_Toc242707538"/>
       <w:r>
         <w:t>CSS-VARIABELEN</w:t>
       </w:r>
@@ -13099,7 +13296,7 @@
         <w:keepNext/>
       </w:pPr>
       <w:bookmarkStart w:id="61" w:name="k31"/>
-      <w:bookmarkStart w:id="62" w:name="_Toc242703556"/>
+      <w:bookmarkStart w:id="62" w:name="_Toc242707539"/>
       <w:r>
         <w:t>LAYOUT</w:t>
       </w:r>
@@ -13366,7 +13563,7 @@
                 <w:sz w:val="16"/>
                 <w:szCs w:val="16"/>
               </w:rPr>
-              <w:t>Kleinere zijmarge; de totalen komen onder de medewerkerlijst</w:t>
+              <w:t>Kleinere zijmarge, de totalen komen onder de medewerkerlijst</w:t>
             </w:r>
           </w:p>
         </w:tc>
@@ -13620,7 +13817,7 @@
         <w:keepNext/>
       </w:pPr>
       <w:bookmarkStart w:id="63" w:name="k32"/>
-      <w:bookmarkStart w:id="64" w:name="_Toc242703557"/>
+      <w:bookmarkStart w:id="64" w:name="_Toc242707540"/>
       <w:r>
         <w:t>COMPONENTEN</w:t>
       </w:r>
@@ -13843,7 +14040,7 @@
         </w:numPr>
       </w:pPr>
       <w:bookmarkStart w:id="65" w:name="k33"/>
-      <w:bookmarkStart w:id="66" w:name="_Toc242703558"/>
+      <w:bookmarkStart w:id="66" w:name="_Toc242707541"/>
       <w:r>
         <w:t>UITLEG VAN DE JAVASCRIPT (</w:t>
       </w:r>
@@ -13867,7 +14064,7 @@
         <w:keepNext/>
       </w:pPr>
       <w:bookmarkStart w:id="67" w:name="k34"/>
-      <w:bookmarkStart w:id="68" w:name="_Toc242703559"/>
+      <w:bookmarkStart w:id="68" w:name="_Toc242707542"/>
       <w:r>
         <w:t>OPSLAG EN VOORBEELDDATA</w:t>
       </w:r>
@@ -14564,7 +14761,7 @@
         <w:t>localStorage</w:t>
       </w:r>
       <w:r>
-        <w:t>; ze bestaan alleen in het geheugen van de pagina.</w:t>
+        <w:t>. Ze bestaan alleen in het geheugen van de pagina.</w:t>
       </w:r>
     </w:p>
     <w:p>
@@ -14644,7 +14841,7 @@
         <w:keepNext/>
       </w:pPr>
       <w:bookmarkStart w:id="69" w:name="k35"/>
-      <w:bookmarkStart w:id="70" w:name="_Toc242703560"/>
+      <w:bookmarkStart w:id="70" w:name="_Toc242707543"/>
       <w:r>
         <w:t>OBJECTGEORIËNTEERDE STRUCTUUR</w:t>
       </w:r>
@@ -15267,7 +15464,95 @@
         <w:t>"unreadable"</w:t>
       </w:r>
       <w:r>
-        <w:t>; de controller toont dan een melding. Er zijn hooguit twee reservekopieën (</w:t>
+        <w:t xml:space="preserve">. De controller toont dan een melding. Als onleesbaar telt ook een lijst die er wel staat maar geen lijst is (bijvoorbeeld </w:t>
+      </w:r>
+      <w:r>
+        <w:rPr>
+          <w:rFonts w:ascii="Consolas" w:hAnsi="Consolas" w:cs="Consolas"/>
+          <w:sz w:val="18"/>
+          <w:shd w:val="clear" w:color="auto" w:fill="EEF4F2"/>
+        </w:rPr>
+        <w:t>"registrations": {}</w:t>
+      </w:r>
+      <w:r>
+        <w:t xml:space="preserve">), want die zou anders stil leeg worden en bij de volgende keer opslaan de oude gegevens overschrijven. Alleen een lijst die helemaal ontbreekt (oude versie) krijgt een standaardwaarde. </w:t>
+      </w:r>
+      <w:r>
+        <w:rPr>
+          <w:rFonts w:ascii="Consolas" w:hAnsi="Consolas" w:cs="Consolas"/>
+          <w:sz w:val="18"/>
+          <w:shd w:val="clear" w:color="auto" w:fill="EEF4F2"/>
+        </w:rPr>
+        <w:t>save</w:t>
+      </w:r>
+      <w:r>
+        <w:t xml:space="preserve"> geeft </w:t>
+      </w:r>
+      <w:r>
+        <w:rPr>
+          <w:rFonts w:ascii="Consolas" w:hAnsi="Consolas" w:cs="Consolas"/>
+          <w:sz w:val="18"/>
+          <w:shd w:val="clear" w:color="auto" w:fill="EEF4F2"/>
+        </w:rPr>
+        <w:t>false</w:t>
+      </w:r>
+      <w:r>
+        <w:t xml:space="preserve"> terug als opslaan niet lukt en zet dan </w:t>
+      </w:r>
+      <w:r>
+        <w:rPr>
+          <w:rFonts w:ascii="Consolas" w:hAnsi="Consolas" w:cs="Consolas"/>
+          <w:sz w:val="18"/>
+          <w:shd w:val="clear" w:color="auto" w:fill="EEF4F2"/>
+        </w:rPr>
+        <w:t>saveProblem</w:t>
+      </w:r>
+      <w:r>
+        <w:t xml:space="preserve"> op </w:t>
+      </w:r>
+      <w:r>
+        <w:rPr>
+          <w:rFonts w:ascii="Consolas" w:hAnsi="Consolas" w:cs="Consolas"/>
+          <w:sz w:val="18"/>
+          <w:shd w:val="clear" w:color="auto" w:fill="EEF4F2"/>
+        </w:rPr>
+        <w:t>"full"</w:t>
+      </w:r>
+      <w:r>
+        <w:t xml:space="preserve"> (de opslag van de browser is vol, herkend aan de </w:t>
+      </w:r>
+      <w:r>
+        <w:rPr>
+          <w:rFonts w:ascii="Consolas" w:hAnsi="Consolas" w:cs="Consolas"/>
+          <w:sz w:val="18"/>
+          <w:shd w:val="clear" w:color="auto" w:fill="EEF4F2"/>
+        </w:rPr>
+        <w:t>QuotaExceededError</w:t>
+      </w:r>
+      <w:r>
+        <w:t xml:space="preserve">, zie </w:t>
+      </w:r>
+      <w:r>
+        <w:rPr>
+          <w:rFonts w:ascii="Consolas" w:hAnsi="Consolas" w:cs="Consolas"/>
+          <w:sz w:val="18"/>
+          <w:shd w:val="clear" w:color="auto" w:fill="EEF4F2"/>
+        </w:rPr>
+        <w:t>isQuotaError</w:t>
+      </w:r>
+      <w:r>
+        <w:t xml:space="preserve">) of </w:t>
+      </w:r>
+      <w:r>
+        <w:rPr>
+          <w:rFonts w:ascii="Consolas" w:hAnsi="Consolas" w:cs="Consolas"/>
+          <w:sz w:val="18"/>
+          <w:shd w:val="clear" w:color="auto" w:fill="EEF4F2"/>
+        </w:rPr>
+        <w:t>"failed"</w:t>
+      </w:r>
+      <w:r>
+        <w:t>. Bij een volle opslag toont de controller een eigen melding (zie Opslagfouten en terugdraaien). Er zijn hooguit twee reservekopieën (</w:t>
       </w:r>
       <w:r>
         <w:rPr>
@@ -15382,7 +15667,7 @@
         <w:t>isValidPrice</w:t>
       </w:r>
       <w:r>
-        <w:t xml:space="preserve"> een prijs van 0 tot en met 1000. Een regel met een ongeldige id, verwijzing of prijs wordt overgeslagen; een product zonder prijs (</w:t>
+        <w:t xml:space="preserve"> een prijs van 0 tot en met 1000. Een regel met een ongeldige id, verwijzing of prijs wordt overgeslagen. Een product zonder prijs (</w:t>
       </w:r>
       <w:r>
         <w:rPr>
@@ -15393,7 +15678,40 @@
         <w:t>null</w:t>
       </w:r>
       <w:r>
-        <w:t xml:space="preserve"> of leeg) ook, zodat het niet gratis wordt. Komt een id binnen één lijst (medewerkers, registraties, producten, bedrijven, consumptiepunten of logboek) meer dan één keer voor, dan blijft alleen de eerste regel staan (</w:t>
+        <w:t xml:space="preserve"> of leeg) ook, zodat het niet gratis wordt. Een tijdstip moet ook echt bestaan: </w:t>
+      </w:r>
+      <w:r>
+        <w:rPr>
+          <w:rFonts w:ascii="Consolas" w:hAnsi="Consolas" w:cs="Consolas"/>
+          <w:sz w:val="18"/>
+          <w:shd w:val="clear" w:color="auto" w:fill="EEF4F2"/>
+        </w:rPr>
+        <w:t>2026-02-31</w:t>
+      </w:r>
+      <w:r>
+        <w:t xml:space="preserve"> of </w:t>
+      </w:r>
+      <w:r>
+        <w:rPr>
+          <w:rFonts w:ascii="Consolas" w:hAnsi="Consolas" w:cs="Consolas"/>
+          <w:sz w:val="18"/>
+          <w:shd w:val="clear" w:color="auto" w:fill="EEF4F2"/>
+        </w:rPr>
+        <w:t>T24:00</w:t>
+      </w:r>
+      <w:r>
+        <w:t xml:space="preserve"> is ongeldig, ook al schuift de browser het door naar een andere dag (</w:t>
+      </w:r>
+      <w:r>
+        <w:rPr>
+          <w:rFonts w:ascii="Consolas" w:hAnsi="Consolas" w:cs="Consolas"/>
+          <w:sz w:val="18"/>
+          <w:shd w:val="clear" w:color="auto" w:fill="EEF4F2"/>
+        </w:rPr>
+        <w:t>existsAsWritten</w:t>
+      </w:r>
+      <w:r>
+        <w:t>). Komt een id binnen één lijst (medewerkers, registraties, producten, bedrijven, consumptiepunten of logboek) meer dan één keer voor, dan blijft alleen de eerste regel staan (</w:t>
       </w:r>
       <w:r>
         <w:rPr>
@@ -15448,7 +15766,7 @@
         <w:t>COLORS</w:t>
       </w:r>
       <w:r>
-        <w:t>. Hetzelfde geldt voor het pasnummer (</w:t>
+        <w:t>. Het pasnummer (</w:t>
       </w:r>
       <w:r>
         <w:rPr>
@@ -15459,7 +15777,51 @@
         <w:t>badgeId</w:t>
       </w:r>
       <w:r>
-        <w:t xml:space="preserve">): oude gegevens zonder pasnummer en een ongeldig pasnummer (geen tekst, andere tekens dan </w:t>
+        <w:t>) wordt eerst gelijk gemaakt zoals de pasjeslezer dat doet (</w:t>
+      </w:r>
+      <w:r>
+        <w:rPr>
+          <w:rFonts w:ascii="Consolas" w:hAnsi="Consolas" w:cs="Consolas"/>
+          <w:sz w:val="18"/>
+          <w:shd w:val="clear" w:color="auto" w:fill="EEF4F2"/>
+        </w:rPr>
+        <w:t>migrateBadgeId</w:t>
+      </w:r>
+      <w:r>
+        <w:t xml:space="preserve">: spaties, </w:t>
+      </w:r>
+      <w:r>
+        <w:rPr>
+          <w:rFonts w:ascii="Consolas" w:hAnsi="Consolas" w:cs="Consolas"/>
+          <w:sz w:val="18"/>
+          <w:shd w:val="clear" w:color="auto" w:fill="EEF4F2"/>
+        </w:rPr>
+        <w:t>:</w:t>
+      </w:r>
+      <w:r>
+        <w:t xml:space="preserve"> en </w:t>
+      </w:r>
+      <w:r>
+        <w:rPr>
+          <w:rFonts w:ascii="Consolas" w:hAnsi="Consolas" w:cs="Consolas"/>
+          <w:sz w:val="18"/>
+          <w:shd w:val="clear" w:color="auto" w:fill="EEF4F2"/>
+        </w:rPr>
+        <w:t>-</w:t>
+      </w:r>
+      <w:r>
+        <w:t xml:space="preserve"> weg, hoofdletters). Oude gegevens zonder pasnummer krijgen </w:t>
+      </w:r>
+      <w:r>
+        <w:rPr>
+          <w:rFonts w:ascii="Consolas" w:hAnsi="Consolas" w:cs="Consolas"/>
+          <w:sz w:val="18"/>
+          <w:shd w:val="clear" w:color="auto" w:fill="EEF4F2"/>
+        </w:rPr>
+        <w:t>""</w:t>
+      </w:r>
+      <w:r>
+        <w:t xml:space="preserve"> (geen pas). Een pasnummer dat ook daarna ongeldig is (geen tekst, andere tekens dan </w:t>
       </w:r>
       <w:r>
         <w:rPr>
@@ -15481,7 +15843,7 @@
         <w:t>0-9</w:t>
       </w:r>
       <w:r>
-        <w:t xml:space="preserve">, of meer dan 64 tekens; </w:t>
+        <w:t xml:space="preserve">, of meer dan 64 tekens, zie </w:t>
       </w:r>
       <w:r>
         <w:rPr>
@@ -15492,7 +15854,7 @@
         <w:t>isSafeBadgeId</w:t>
       </w:r>
       <w:r>
-        <w:t xml:space="preserve">) worden </w:t>
+        <w:t xml:space="preserve">), wordt </w:t>
       </w:r>
       <w:r>
         <w:rPr>
@@ -15503,7 +15865,18 @@
         <w:t>""</w:t>
       </w:r>
       <w:r>
-        <w:t xml:space="preserve"> (geen pas), en de medewerker blijft bestaan. Komt hetzelfde pasnummer bij meer medewerkers voor, dan houdt alleen de eerste het (</w:t>
+        <w:t xml:space="preserve"> en telt als overgeslagen (</w:t>
+      </w:r>
+      <w:r>
+        <w:rPr>
+          <w:rFonts w:ascii="Consolas" w:hAnsi="Consolas" w:cs="Consolas"/>
+          <w:sz w:val="18"/>
+          <w:shd w:val="clear" w:color="auto" w:fill="EEF4F2"/>
+        </w:rPr>
+        <w:t>repairedBadges</w:t>
+      </w:r>
+      <w:r>
+        <w:t>), met een reservekopie en een melding. De medewerker blijft bestaan. Komt hetzelfde pasnummer bij meer medewerkers voor, dan houdt alleen de eerste het (</w:t>
       </w:r>
       <w:r>
         <w:rPr>
@@ -15514,45 +15887,230 @@
         <w:t>withoutDuplicateBadges</w:t>
       </w:r>
       <w:r>
+        <w:t>). Die controle gebeurt pas nadat ongeldige regels en dubbele id's zijn overgeslagen, zodat een regel die afvalt geen pas van een geldige medewerker afpakt.</w:t>
+      </w:r>
+    </w:p>
+    <w:p>
+      <w:r>
+        <w:t>Codes (looncode, personeelsnummer, werkgevernummer) moeten tekst zijn van hooguit 64 tekens zonder stuurtekens zoals tab of enter (</w:t>
+      </w:r>
+      <w:r>
+        <w:rPr>
+          <w:rFonts w:ascii="Consolas" w:hAnsi="Consolas" w:cs="Consolas"/>
+          <w:sz w:val="18"/>
+          <w:shd w:val="clear" w:color="auto" w:fill="EEF4F2"/>
+        </w:rPr>
+        <w:t>isShortCode</w:t>
+      </w:r>
+      <w:r>
+        <w:t>). Een code die een object of lijst is, maakt de regel ongeldig. Een heel getal uit oude gegevens wordt eerst tekst (</w:t>
+      </w:r>
+      <w:r>
+        <w:rPr>
+          <w:rFonts w:ascii="Consolas" w:hAnsi="Consolas" w:cs="Consolas"/>
+          <w:sz w:val="18"/>
+          <w:shd w:val="clear" w:color="auto" w:fill="EEF4F2"/>
+        </w:rPr>
+        <w:t>codeText</w:t>
+      </w:r>
+      <w:r>
+        <w:t>). Tijdstippen (</w:t>
+      </w:r>
+      <w:r>
+        <w:rPr>
+          <w:rFonts w:ascii="Consolas" w:hAnsi="Consolas" w:cs="Consolas"/>
+          <w:sz w:val="18"/>
+          <w:shd w:val="clear" w:color="auto" w:fill="EEF4F2"/>
+        </w:rPr>
+        <w:t>createdAt</w:t>
+      </w:r>
+      <w:r>
+        <w:t xml:space="preserve"> van registraties en logboekregels, en </w:t>
+      </w:r>
+      <w:r>
+        <w:rPr>
+          <w:rFonts w:ascii="Consolas" w:hAnsi="Consolas" w:cs="Consolas"/>
+          <w:sz w:val="18"/>
+          <w:shd w:val="clear" w:color="auto" w:fill="EEF4F2"/>
+        </w:rPr>
+        <w:t>countedAt</w:t>
+      </w:r>
+      <w:r>
+        <w:t xml:space="preserve">) moeten in ISO-vorm staan, zoals </w:t>
+      </w:r>
+      <w:r>
+        <w:rPr>
+          <w:rFonts w:ascii="Consolas" w:hAnsi="Consolas" w:cs="Consolas"/>
+          <w:sz w:val="18"/>
+          <w:shd w:val="clear" w:color="auto" w:fill="EEF4F2"/>
+        </w:rPr>
+        <w:t>2026-10-09T08:30:00.000Z</w:t>
+      </w:r>
+      <w:r>
+        <w:t>, en mogen niet vóór 1 januari 2000 liggen (</w:t>
+      </w:r>
+      <w:r>
+        <w:rPr>
+          <w:rFonts w:ascii="Consolas" w:hAnsi="Consolas" w:cs="Consolas"/>
+          <w:sz w:val="18"/>
+          <w:shd w:val="clear" w:color="auto" w:fill="EEF4F2"/>
+        </w:rPr>
+        <w:t>isValidDateTime</w:t>
+      </w:r>
+      <w:r>
+        <w:t>). Ook een logboekregel van meer dan 24 uur na het moment van laden wordt overgeslagen.</w:t>
+      </w:r>
+    </w:p>
+    <w:p>
+      <w:r>
+        <w:t xml:space="preserve">De voorraadlijst van een consumptiepunt is een object met een product-id als sleutel. Bij het laden neemt </w:t>
+      </w:r>
+      <w:r>
+        <w:rPr>
+          <w:rFonts w:ascii="Consolas" w:hAnsi="Consolas" w:cs="Consolas"/>
+          <w:sz w:val="18"/>
+          <w:shd w:val="clear" w:color="auto" w:fill="EEF4F2"/>
+        </w:rPr>
+        <w:t>renameStockKeys</w:t>
+      </w:r>
+      <w:r>
+        <w:t xml:space="preserve"> alleen sleutels over die een veilige id zijn, en </w:t>
+      </w:r>
+      <w:r>
+        <w:rPr>
+          <w:rFonts w:ascii="Consolas" w:hAnsi="Consolas" w:cs="Consolas"/>
+          <w:sz w:val="18"/>
+          <w:shd w:val="clear" w:color="auto" w:fill="EEF4F2"/>
+        </w:rPr>
+        <w:t>completePointStock</w:t>
+      </w:r>
+      <w:r>
+        <w:t xml:space="preserve"> maakt alleen regels voor geldige producten. Een geknoeide sleutel zoals </w:t>
+      </w:r>
+      <w:r>
+        <w:rPr>
+          <w:rFonts w:ascii="Consolas" w:hAnsi="Consolas" w:cs="Consolas"/>
+          <w:sz w:val="18"/>
+          <w:shd w:val="clear" w:color="auto" w:fill="EEF4F2"/>
+        </w:rPr>
+        <w:t>__proto__</w:t>
+      </w:r>
+      <w:r>
+        <w:t xml:space="preserve"> of </w:t>
+      </w:r>
+      <w:r>
+        <w:rPr>
+          <w:rFonts w:ascii="Consolas" w:hAnsi="Consolas" w:cs="Consolas"/>
+          <w:sz w:val="18"/>
+          <w:shd w:val="clear" w:color="auto" w:fill="EEF4F2"/>
+        </w:rPr>
+        <w:t>constructor</w:t>
+      </w:r>
+      <w:r>
+        <w:t xml:space="preserve"> kan het object zo niet veranderen. </w:t>
+      </w:r>
+      <w:r>
+        <w:rPr>
+          <w:rFonts w:ascii="Consolas" w:hAnsi="Consolas" w:cs="Consolas"/>
+          <w:sz w:val="18"/>
+          <w:shd w:val="clear" w:color="auto" w:fill="EEF4F2"/>
+        </w:rPr>
+        <w:t>isValidPoint</w:t>
+      </w:r>
+      <w:r>
+        <w:t xml:space="preserve"> controleert dat de voorraadlijst een gewoon object is met alleen veilige sleutels (</w:t>
+      </w:r>
+      <w:r>
+        <w:rPr>
+          <w:rFonts w:ascii="Consolas" w:hAnsi="Consolas" w:cs="Consolas"/>
+          <w:sz w:val="18"/>
+          <w:shd w:val="clear" w:color="auto" w:fill="EEF4F2"/>
+        </w:rPr>
+        <w:t>hasSafeStockKeys</w:t>
+      </w:r>
+      <w:r>
         <w:t>).</w:t>
       </w:r>
     </w:p>
     <w:p>
       <w:r>
-        <w:t>Codes (looncode, personeelsnummer, werkgevernummer) moeten tekst zijn van hooguit 64 tekens zonder stuurtekens zoals tab of enter (</w:t>
-      </w:r>
-      <w:r>
-        <w:rPr>
-          <w:rFonts w:ascii="Consolas" w:hAnsi="Consolas" w:cs="Consolas"/>
-          <w:sz w:val="18"/>
-          <w:shd w:val="clear" w:color="auto" w:fill="EEF4F2"/>
-        </w:rPr>
-        <w:t>isShortCode</w:t>
-      </w:r>
-      <w:r>
-        <w:t>). Een code die een object of lijst is, maakt de regel ongeldig. Een heel getal uit oude gegevens wordt eerst tekst (</w:t>
-      </w:r>
-      <w:r>
-        <w:rPr>
-          <w:rFonts w:ascii="Consolas" w:hAnsi="Consolas" w:cs="Consolas"/>
-          <w:sz w:val="18"/>
-          <w:shd w:val="clear" w:color="auto" w:fill="EEF4F2"/>
-        </w:rPr>
-        <w:t>codeText</w:t>
-      </w:r>
-      <w:r>
-        <w:t>). Tijdstippen (</w:t>
-      </w:r>
-      <w:r>
-        <w:rPr>
-          <w:rFonts w:ascii="Consolas" w:hAnsi="Consolas" w:cs="Consolas"/>
-          <w:sz w:val="18"/>
-          <w:shd w:val="clear" w:color="auto" w:fill="EEF4F2"/>
-        </w:rPr>
-        <w:t>createdAt</w:t>
-      </w:r>
-      <w:r>
-        <w:t xml:space="preserve"> van registraties en logboekregels, en </w:t>
+        <w:rPr>
+          <w:rFonts w:ascii="Consolas" w:hAnsi="Consolas" w:cs="Consolas"/>
+          <w:sz w:val="18"/>
+          <w:shd w:val="clear" w:color="auto" w:fill="EEF4F2"/>
+        </w:rPr>
+        <w:t>clearAll</w:t>
+      </w:r>
+      <w:r>
+        <w:t xml:space="preserve"> wist de gegevens, beide reservekopieën en oude reservekopieën met een tijdstempel uit een eerdere versie. Dit wordt gebruikt door de knop </w:t>
+      </w:r>
+      <w:r>
+        <w:rPr>
+          <w:rFonts w:ascii="Consolas" w:hAnsi="Consolas" w:cs="Consolas"/>
+          <w:sz w:val="18"/>
+          <w:shd w:val="clear" w:color="auto" w:fill="EEF4F2"/>
+        </w:rPr>
+        <w:t>Alle gegevens wissen</w:t>
+      </w:r>
+      <w:r>
+        <w:t>.</w:t>
+      </w:r>
+    </w:p>
+    <w:p>
+      <w:r>
+        <w:rPr>
+          <w:rFonts w:ascii="Consolas" w:hAnsi="Consolas" w:cs="Consolas"/>
+          <w:sz w:val="18"/>
+          <w:shd w:val="clear" w:color="auto" w:fill="EEF4F2"/>
+        </w:rPr>
+        <w:t>migrate</w:t>
+      </w:r>
+      <w:r>
+        <w:t xml:space="preserve"> zet oude gegevens om (bijvoorbeeld product-id </w:t>
+      </w:r>
+      <w:r>
+        <w:rPr>
+          <w:rFonts w:ascii="Consolas" w:hAnsi="Consolas" w:cs="Consolas"/>
+          <w:sz w:val="18"/>
+          <w:shd w:val="clear" w:color="auto" w:fill="EEF4F2"/>
+        </w:rPr>
+        <w:t>melk</w:t>
+      </w:r>
+      <w:r>
+        <w:t xml:space="preserve"> naar </w:t>
+      </w:r>
+      <w:r>
+        <w:rPr>
+          <w:rFonts w:ascii="Consolas" w:hAnsi="Consolas" w:cs="Consolas"/>
+          <w:sz w:val="18"/>
+          <w:shd w:val="clear" w:color="auto" w:fill="EEF4F2"/>
+        </w:rPr>
+        <w:t>glas-melk</w:t>
+      </w:r>
+      <w:r>
+        <w:t xml:space="preserve"> en </w:t>
+      </w:r>
+      <w:r>
+        <w:rPr>
+          <w:rFonts w:ascii="Consolas" w:hAnsi="Consolas" w:cs="Consolas"/>
+          <w:sz w:val="18"/>
+          <w:shd w:val="clear" w:color="auto" w:fill="EEF4F2"/>
+        </w:rPr>
+        <w:t>brood</w:t>
+      </w:r>
+      <w:r>
+        <w:t xml:space="preserve"> naar </w:t>
+      </w:r>
+      <w:r>
+        <w:rPr>
+          <w:rFonts w:ascii="Consolas" w:hAnsi="Consolas" w:cs="Consolas"/>
+          <w:sz w:val="18"/>
+          <w:shd w:val="clear" w:color="auto" w:fill="EEF4F2"/>
+        </w:rPr>
+        <w:t>sneetje-brood</w:t>
+      </w:r>
+      <w:r>
+        <w:t>, in de registraties, in de opgeslagen productlijst en in de voorraad van de punten, of een vrij ingevulde bedrijfsnaam naar een echt bedrijf). Opgeslagen producten gaan altijd voor op de standaardproducten, zodat gewijzigde prijzen en verwijderde producten bewaard blijven. Voorraad en minimum worden altijd getallen (een negatief minimum wordt 0, een negatieve voorraad blijft staan), het tijdstip van de laatste telling (</w:t>
       </w:r>
       <w:r>
         <w:rPr>
@@ -15563,192 +16121,7 @@
         <w:t>countedAt</w:t>
       </w:r>
       <w:r>
-        <w:t xml:space="preserve">) moeten in ISO-vorm staan, zoals </w:t>
-      </w:r>
-      <w:r>
-        <w:rPr>
-          <w:rFonts w:ascii="Consolas" w:hAnsi="Consolas" w:cs="Consolas"/>
-          <w:sz w:val="18"/>
-          <w:shd w:val="clear" w:color="auto" w:fill="EEF4F2"/>
-        </w:rPr>
-        <w:t>2026-10-09T08:30:00.000Z</w:t>
-      </w:r>
-      <w:r>
-        <w:t>, en mogen niet vóór 1 januari 2000 liggen (</w:t>
-      </w:r>
-      <w:r>
-        <w:rPr>
-          <w:rFonts w:ascii="Consolas" w:hAnsi="Consolas" w:cs="Consolas"/>
-          <w:sz w:val="18"/>
-          <w:shd w:val="clear" w:color="auto" w:fill="EEF4F2"/>
-        </w:rPr>
-        <w:t>isValidDateTime</w:t>
-      </w:r>
-      <w:r>
-        <w:t>). Ook een logboekregel van meer dan 24 uur na het moment van laden wordt overgeslagen.</w:t>
-      </w:r>
-    </w:p>
-    <w:p>
-      <w:r>
-        <w:t xml:space="preserve">De voorraadlijst van een consumptiepunt is een object met een product-id als sleutel. Bij het laden neemt </w:t>
-      </w:r>
-      <w:r>
-        <w:rPr>
-          <w:rFonts w:ascii="Consolas" w:hAnsi="Consolas" w:cs="Consolas"/>
-          <w:sz w:val="18"/>
-          <w:shd w:val="clear" w:color="auto" w:fill="EEF4F2"/>
-        </w:rPr>
-        <w:t>renameStockKeys</w:t>
-      </w:r>
-      <w:r>
-        <w:t xml:space="preserve"> alleen sleutels over die een veilige id zijn, en </w:t>
-      </w:r>
-      <w:r>
-        <w:rPr>
-          <w:rFonts w:ascii="Consolas" w:hAnsi="Consolas" w:cs="Consolas"/>
-          <w:sz w:val="18"/>
-          <w:shd w:val="clear" w:color="auto" w:fill="EEF4F2"/>
-        </w:rPr>
-        <w:t>completePointStock</w:t>
-      </w:r>
-      <w:r>
-        <w:t xml:space="preserve"> maakt alleen regels voor geldige producten. Een geknoeide sleutel zoals </w:t>
-      </w:r>
-      <w:r>
-        <w:rPr>
-          <w:rFonts w:ascii="Consolas" w:hAnsi="Consolas" w:cs="Consolas"/>
-          <w:sz w:val="18"/>
-          <w:shd w:val="clear" w:color="auto" w:fill="EEF4F2"/>
-        </w:rPr>
-        <w:t>__proto__</w:t>
-      </w:r>
-      <w:r>
-        <w:t xml:space="preserve"> of </w:t>
-      </w:r>
-      <w:r>
-        <w:rPr>
-          <w:rFonts w:ascii="Consolas" w:hAnsi="Consolas" w:cs="Consolas"/>
-          <w:sz w:val="18"/>
-          <w:shd w:val="clear" w:color="auto" w:fill="EEF4F2"/>
-        </w:rPr>
-        <w:t>constructor</w:t>
-      </w:r>
-      <w:r>
-        <w:t xml:space="preserve"> kan het object zo niet veranderen. </w:t>
-      </w:r>
-      <w:r>
-        <w:rPr>
-          <w:rFonts w:ascii="Consolas" w:hAnsi="Consolas" w:cs="Consolas"/>
-          <w:sz w:val="18"/>
-          <w:shd w:val="clear" w:color="auto" w:fill="EEF4F2"/>
-        </w:rPr>
-        <w:t>isValidPoint</w:t>
-      </w:r>
-      <w:r>
-        <w:t xml:space="preserve"> controleert dat de voorraadlijst een gewoon object is met alleen veilige sleutels (</w:t>
-      </w:r>
-      <w:r>
-        <w:rPr>
-          <w:rFonts w:ascii="Consolas" w:hAnsi="Consolas" w:cs="Consolas"/>
-          <w:sz w:val="18"/>
-          <w:shd w:val="clear" w:color="auto" w:fill="EEF4F2"/>
-        </w:rPr>
-        <w:t>hasSafeStockKeys</w:t>
-      </w:r>
-      <w:r>
-        <w:t>).</w:t>
-      </w:r>
-    </w:p>
-    <w:p>
-      <w:r>
-        <w:rPr>
-          <w:rFonts w:ascii="Consolas" w:hAnsi="Consolas" w:cs="Consolas"/>
-          <w:sz w:val="18"/>
-          <w:shd w:val="clear" w:color="auto" w:fill="EEF4F2"/>
-        </w:rPr>
-        <w:t>clearAll</w:t>
-      </w:r>
-      <w:r>
-        <w:t xml:space="preserve"> wist de gegevens, beide reservekopieën en oude reservekopieën met een tijdstempel uit een eerdere versie. Dit wordt gebruikt door de knop </w:t>
-      </w:r>
-      <w:r>
-        <w:rPr>
-          <w:rFonts w:ascii="Consolas" w:hAnsi="Consolas" w:cs="Consolas"/>
-          <w:sz w:val="18"/>
-          <w:shd w:val="clear" w:color="auto" w:fill="EEF4F2"/>
-        </w:rPr>
-        <w:t>Alle gegevens wissen</w:t>
-      </w:r>
-      <w:r>
-        <w:t>.</w:t>
-      </w:r>
-    </w:p>
-    <w:p>
-      <w:r>
-        <w:rPr>
-          <w:rFonts w:ascii="Consolas" w:hAnsi="Consolas" w:cs="Consolas"/>
-          <w:sz w:val="18"/>
-          <w:shd w:val="clear" w:color="auto" w:fill="EEF4F2"/>
-        </w:rPr>
-        <w:t>migrate</w:t>
-      </w:r>
-      <w:r>
-        <w:t xml:space="preserve"> zet oude gegevens om (bijvoorbeeld product-id </w:t>
-      </w:r>
-      <w:r>
-        <w:rPr>
-          <w:rFonts w:ascii="Consolas" w:hAnsi="Consolas" w:cs="Consolas"/>
-          <w:sz w:val="18"/>
-          <w:shd w:val="clear" w:color="auto" w:fill="EEF4F2"/>
-        </w:rPr>
-        <w:t>melk</w:t>
-      </w:r>
-      <w:r>
-        <w:t xml:space="preserve"> naar </w:t>
-      </w:r>
-      <w:r>
-        <w:rPr>
-          <w:rFonts w:ascii="Consolas" w:hAnsi="Consolas" w:cs="Consolas"/>
-          <w:sz w:val="18"/>
-          <w:shd w:val="clear" w:color="auto" w:fill="EEF4F2"/>
-        </w:rPr>
-        <w:t>glas-melk</w:t>
-      </w:r>
-      <w:r>
-        <w:t xml:space="preserve"> en </w:t>
-      </w:r>
-      <w:r>
-        <w:rPr>
-          <w:rFonts w:ascii="Consolas" w:hAnsi="Consolas" w:cs="Consolas"/>
-          <w:sz w:val="18"/>
-          <w:shd w:val="clear" w:color="auto" w:fill="EEF4F2"/>
-        </w:rPr>
-        <w:t>brood</w:t>
-      </w:r>
-      <w:r>
-        <w:t xml:space="preserve"> naar </w:t>
-      </w:r>
-      <w:r>
-        <w:rPr>
-          <w:rFonts w:ascii="Consolas" w:hAnsi="Consolas" w:cs="Consolas"/>
-          <w:sz w:val="18"/>
-          <w:shd w:val="clear" w:color="auto" w:fill="EEF4F2"/>
-        </w:rPr>
-        <w:t>sneetje-brood</w:t>
-      </w:r>
-      <w:r>
-        <w:t>, in de registraties, in de opgeslagen productlijst en in de voorraad van de punten, of een vrij ingevulde bedrijfsnaam naar een echt bedrijf). Opgeslagen producten gaan altijd voor op de standaardproducten, zodat gewijzigde prijzen en verwijderde producten bewaard blijven. Voorraad en minimum worden altijd getallen (een negatief minimum wordt 0; een negatieve voorraad blijft staan), het tijdstip van de laatste telling (</w:t>
-      </w:r>
-      <w:r>
-        <w:rPr>
-          <w:rFonts w:ascii="Consolas" w:hAnsi="Consolas" w:cs="Consolas"/>
-          <w:sz w:val="18"/>
-          <w:shd w:val="clear" w:color="auto" w:fill="EEF4F2"/>
-        </w:rPr>
-        <w:t>countedAt</w:t>
-      </w:r>
-      <w:r>
-        <w:t>) blijft bewaard als het een geldige datum is die niet in de toekomst ligt (een telling in de toekomst wordt weggelaten, zodat de voorraad niet geblokkeerd raakt; het product telt dan als "niet geteld"), en beschadigde logboekregels (</w:t>
+        <w:t>) blijft bewaard als het een geldige datum is die niet in de toekomst ligt (een telling in de toekomst wordt weggelaten, zodat de voorraad niet geblokkeerd raakt en het product telt dan als "niet geteld"), en beschadigde logboekregels (</w:t>
       </w:r>
       <w:r>
         <w:rPr>
@@ -15852,7 +16225,7 @@
         <w:t>removeEmployee</w:t>
       </w:r>
       <w:r>
-        <w:t xml:space="preserve"> verwijdert alleen een inactieve medewerker zonder registraties; anders geeft het </w:t>
+        <w:t xml:space="preserve"> verwijdert alleen een inactieve medewerker zonder registraties. Anders geeft het </w:t>
       </w:r>
       <w:r>
         <w:rPr>
@@ -15907,7 +16280,7 @@
         <w:t>isEmployerNumberTaken</w:t>
       </w:r>
       <w:r>
-        <w:t>); een leeg nummer telt niet.</w:t>
+        <w:t>). Een leeg nummer telt niet.</w:t>
       </w:r>
     </w:p>
     <w:p>
@@ -16210,7 +16583,7 @@
         <w:t>companyId</w:t>
       </w:r>
       <w:r>
-        <w:t xml:space="preserve"> verandert; de naam wordt niet opnieuw opgebouwd.</w:t>
+        <w:t xml:space="preserve"> verandert, de naam wordt niet opnieuw opgebouwd.</w:t>
       </w:r>
     </w:p>
     <w:p>
@@ -17003,7 +17376,18 @@
         <w:t>RegistrationModel.reload</w:t>
       </w:r>
       <w:r>
-        <w:t xml:space="preserve">) en wordt alles opnieuw getekend. Daarna ruimt de controller op wat niet meer klopt: </w:t>
+        <w:t>) en wordt alles opnieuw getekend, zonder dat een knop in een lijst de focus verliest (</w:t>
+      </w:r>
+      <w:r>
+        <w:rPr>
+          <w:rFonts w:ascii="Consolas" w:hAnsi="Consolas" w:cs="Consolas"/>
+          <w:sz w:val="18"/>
+          <w:shd w:val="clear" w:color="auto" w:fill="EEF4F2"/>
+        </w:rPr>
+        <w:t>preserveFocus</w:t>
+      </w:r>
+      <w:r>
+        <w:t xml:space="preserve">). Gezichten (demo) van medewerkers die in het andere tabblad zijn verwijderd, worden vergeten. Daarna ruimt de controller op wat niet meer klopt: </w:t>
       </w:r>
       <w:r>
         <w:rPr>
@@ -17117,7 +17501,62 @@
         <w:t>closeModal</w:t>
       </w:r>
       <w:r>
-        <w:t xml:space="preserve"> zet de focus daar weer op, als dat element nog zichtbaar op de pagina staat. </w:t>
+        <w:t xml:space="preserve"> zet de focus daar weer op, als dat element nog zichtbaar op de pagina staat. Is de lijst met die knop intussen opnieuw getekend, dan zoekt </w:t>
+      </w:r>
+      <w:r>
+        <w:rPr>
+          <w:rFonts w:ascii="Consolas" w:hAnsi="Consolas" w:cs="Consolas"/>
+          <w:sz w:val="18"/>
+          <w:shd w:val="clear" w:color="auto" w:fill="EEF4F2"/>
+        </w:rPr>
+        <w:t>findFocusReplacement</w:t>
+      </w:r>
+      <w:r>
+        <w:t xml:space="preserve"> de nieuwe knop met dezelfde data-attributen (bijvoorbeeld </w:t>
+      </w:r>
+      <w:r>
+        <w:rPr>
+          <w:rFonts w:ascii="Consolas" w:hAnsi="Consolas" w:cs="Consolas"/>
+          <w:sz w:val="18"/>
+          <w:shd w:val="clear" w:color="auto" w:fill="EEF4F2"/>
+        </w:rPr>
+        <w:t>[data-edit-product="blikje"]</w:t>
+      </w:r>
+      <w:r>
+        <w:t xml:space="preserve">, gemaakt door </w:t>
+      </w:r>
+      <w:r>
+        <w:rPr>
+          <w:rFonts w:ascii="Consolas" w:hAnsi="Consolas" w:cs="Consolas"/>
+          <w:sz w:val="18"/>
+          <w:shd w:val="clear" w:color="auto" w:fill="EEF4F2"/>
+        </w:rPr>
+        <w:t>focusSelector</w:t>
+      </w:r>
+      <w:r>
+        <w:t xml:space="preserve">), of een logisch alternatief als het item weg is (zoals </w:t>
+      </w:r>
+      <w:r>
+        <w:rPr>
+          <w:rFonts w:ascii="Consolas" w:hAnsi="Consolas" w:cs="Consolas"/>
+          <w:sz w:val="18"/>
+          <w:shd w:val="clear" w:color="auto" w:fill="EEF4F2"/>
+        </w:rPr>
+        <w:t>Medewerker toevoegen</w:t>
+      </w:r>
+      <w:r>
+        <w:t xml:space="preserve">). </w:t>
+      </w:r>
+      <w:r>
+        <w:rPr>
+          <w:rFonts w:ascii="Consolas" w:hAnsi="Consolas" w:cs="Consolas"/>
+          <w:sz w:val="18"/>
+          <w:shd w:val="clear" w:color="auto" w:fill="EEF4F2"/>
+        </w:rPr>
+        <w:t>preserveFocus</w:t>
+      </w:r>
+      <w:r>
+        <w:t xml:space="preserve"> doet hetzelfde rond het opnieuw tekenen van lijsten na opslaan, (de)activeren, verwijderen en een wijziging in een ander tabblad. </w:t>
       </w:r>
       <w:r>
         <w:rPr>
@@ -17319,7 +17758,84 @@
         <w:t>removeUnavailableSelections</w:t>
       </w:r>
       <w:r>
-        <w:t xml:space="preserve"> haalt producten uit de keuze die het consumptiepunt intussen niet meer aanbiedt.</w:t>
+        <w:t xml:space="preserve"> haalt producten uit de keuze die het consumptiepunt intussen niet meer aanbiedt. </w:t>
+      </w:r>
+      <w:r>
+        <w:rPr>
+          <w:rFonts w:ascii="Consolas" w:hAnsi="Consolas" w:cs="Consolas"/>
+          <w:sz w:val="18"/>
+          <w:shd w:val="clear" w:color="auto" w:fill="EEF4F2"/>
+        </w:rPr>
+        <w:t>setCompanyOptionsOpen</w:t>
+      </w:r>
+      <w:r>
+        <w:t xml:space="preserve"> en </w:t>
+      </w:r>
+      <w:r>
+        <w:rPr>
+          <w:rFonts w:ascii="Consolas" w:hAnsi="Consolas" w:cs="Consolas"/>
+          <w:sz w:val="18"/>
+          <w:shd w:val="clear" w:color="auto" w:fill="EEF4F2"/>
+        </w:rPr>
+        <w:t>closeCompanyOptions</w:t>
+      </w:r>
+      <w:r>
+        <w:t xml:space="preserve"> openen en sluiten de keuzelijst van het bedrijfsfilter en houden </w:t>
+      </w:r>
+      <w:r>
+        <w:rPr>
+          <w:rFonts w:ascii="Consolas" w:hAnsi="Consolas" w:cs="Consolas"/>
+          <w:sz w:val="18"/>
+          <w:shd w:val="clear" w:color="auto" w:fill="EEF4F2"/>
+        </w:rPr>
+        <w:t>aria-expanded</w:t>
+      </w:r>
+      <w:r>
+        <w:t xml:space="preserve"> bij (Escape sluit de lijst). </w:t>
+      </w:r>
+      <w:r>
+        <w:rPr>
+          <w:rFonts w:ascii="Consolas" w:hAnsi="Consolas" w:cs="Consolas"/>
+          <w:sz w:val="18"/>
+          <w:shd w:val="clear" w:color="auto" w:fill="EEF4F2"/>
+        </w:rPr>
+        <w:t>isGhostRowClick</w:t>
+      </w:r>
+      <w:r>
+        <w:t xml:space="preserve"> negeert een klik op een medewerkerrij die de tweede klik van een dubbelklik is of minder dan 500 ms na het sluiten van het productvenster komt, zodat een dubbelklik op </w:t>
+      </w:r>
+      <w:r>
+        <w:rPr>
+          <w:rFonts w:ascii="Consolas" w:hAnsi="Consolas" w:cs="Consolas"/>
+          <w:sz w:val="18"/>
+          <w:shd w:val="clear" w:color="auto" w:fill="EEF4F2"/>
+        </w:rPr>
+        <w:t>Registreren</w:t>
+      </w:r>
+      <w:r>
+        <w:t xml:space="preserve"> niet het venster van een collega opent. </w:t>
+      </w:r>
+      <w:r>
+        <w:rPr>
+          <w:rFonts w:ascii="Consolas" w:hAnsi="Consolas" w:cs="Consolas"/>
+          <w:sz w:val="18"/>
+          <w:shd w:val="clear" w:color="auto" w:fill="EEF4F2"/>
+        </w:rPr>
+        <w:t>handleEmployeeRowKey</w:t>
+      </w:r>
+      <w:r>
+        <w:t xml:space="preserve"> opent het venster met Enter of spatie, maar niet bij een ingedrukt gehouden toets (</w:t>
+      </w:r>
+      <w:r>
+        <w:rPr>
+          <w:rFonts w:ascii="Consolas" w:hAnsi="Consolas" w:cs="Consolas"/>
+          <w:sz w:val="18"/>
+          <w:shd w:val="clear" w:color="auto" w:fill="EEF4F2"/>
+        </w:rPr>
+        <w:t>event.repeat</w:t>
+      </w:r>
+      <w:r>
+        <w:t>).</w:t>
       </w:r>
     </w:p>
     <w:p>
@@ -17400,7 +17916,29 @@
         <w:t>restoreSearchAfterScan</w:t>
       </w:r>
       <w:r>
-        <w:t xml:space="preserve"> zorgen dat er geen pasnummer in het zoekveld blijft staan, en </w:t>
+        <w:t xml:space="preserve"> zorgen dat er geen pasnummer in het zoekveld of het bedrijfsfilter blijft staan (ook de bedrijfskeuze komt terug), </w:t>
+      </w:r>
+      <w:r>
+        <w:rPr>
+          <w:rFonts w:ascii="Consolas" w:hAnsi="Consolas" w:cs="Consolas"/>
+          <w:sz w:val="18"/>
+          <w:shd w:val="clear" w:color="auto" w:fill="EEF4F2"/>
+        </w:rPr>
+        <w:t>fillBadgeFieldAfterScan</w:t>
+      </w:r>
+      <w:r>
+        <w:t xml:space="preserve"> vervangt bij een scan in het veld </w:t>
+      </w:r>
+      <w:r>
+        <w:rPr>
+          <w:rFonts w:ascii="Consolas" w:hAnsi="Consolas" w:cs="Consolas"/>
+          <w:sz w:val="18"/>
+          <w:shd w:val="clear" w:color="auto" w:fill="EEF4F2"/>
+        </w:rPr>
+        <w:t>Pasnummer</w:t>
+      </w:r>
+      <w:r>
+        <w:t xml:space="preserve"> het oude nummer, en </w:t>
       </w:r>
       <w:r>
         <w:rPr>
@@ -17694,7 +18232,40 @@
         <w:t>loadMoreAudit</w:t>
       </w:r>
       <w:r>
-        <w:t>: inloggen, uitloggen, het dashboard, de tabbladen en het logboek (zie Adminfuncties hieronder).</w:t>
+        <w:t xml:space="preserve">: inloggen, uitloggen, het dashboard, de tabbladen en het logboek (zie Adminfuncties hieronder). De tabbladen hebben </w:t>
+      </w:r>
+      <w:r>
+        <w:rPr>
+          <w:rFonts w:ascii="Consolas" w:hAnsi="Consolas" w:cs="Consolas"/>
+          <w:sz w:val="18"/>
+          <w:shd w:val="clear" w:color="auto" w:fill="EEF4F2"/>
+        </w:rPr>
+        <w:t>role="tab"</w:t>
+      </w:r>
+      <w:r>
+        <w:t xml:space="preserve"> en </w:t>
+      </w:r>
+      <w:r>
+        <w:rPr>
+          <w:rFonts w:ascii="Consolas" w:hAnsi="Consolas" w:cs="Consolas"/>
+          <w:sz w:val="18"/>
+          <w:shd w:val="clear" w:color="auto" w:fill="EEF4F2"/>
+        </w:rPr>
+        <w:t>switchTab</w:t>
+      </w:r>
+      <w:r>
+        <w:t xml:space="preserve"> zet </w:t>
+      </w:r>
+      <w:r>
+        <w:rPr>
+          <w:rFonts w:ascii="Consolas" w:hAnsi="Consolas" w:cs="Consolas"/>
+          <w:sz w:val="18"/>
+          <w:shd w:val="clear" w:color="auto" w:fill="EEF4F2"/>
+        </w:rPr>
+        <w:t>aria-selected</w:t>
+      </w:r>
+      <w:r>
+        <w:t xml:space="preserve"> op het gekozen tabblad.</w:t>
       </w:r>
     </w:p>
     <w:p>
@@ -17815,7 +18386,18 @@
         <w:t>finishAdminChange</w:t>
       </w:r>
       <w:r>
-        <w:t>: tekent na een beheerwijziging alle beheeronderdelen opnieuw, ook de registratietabel (zodat bijvoorbeeld een nieuwe productnaam daar meteen staat), zonder nog eens apart op te slaan.</w:t>
+        <w:t>: tekent na een beheerwijziging alle beheeronderdelen opnieuw, ook de registratietabel (zodat bijvoorbeeld een nieuwe productnaam daar meteen staat), zonder nog eens apart op te slaan. De focus blijft daarbij op de knop met dezelfde id (</w:t>
+      </w:r>
+      <w:r>
+        <w:rPr>
+          <w:rFonts w:ascii="Consolas" w:hAnsi="Consolas" w:cs="Consolas"/>
+          <w:sz w:val="18"/>
+          <w:shd w:val="clear" w:color="auto" w:fill="EEF4F2"/>
+        </w:rPr>
+        <w:t>preserveFocus</w:t>
+      </w:r>
+      <w:r>
+        <w:t>).</w:t>
       </w:r>
     </w:p>
     <w:p>
@@ -17914,7 +18496,29 @@
         <w:t>wipeAll</w:t>
       </w:r>
       <w:r>
-        <w:t>), slaat de nieuwe demogegevens op, vergeet de ingestelde gezichten, logt de beheerder uit en tekent alles opnieuw.</w:t>
+        <w:t>), slaat de nieuwe demogegevens op, vergeet de ingestelde gezichten, logt de beheerder uit en tekent alles opnieuw. Lukt het wissen van de opslag niet (</w:t>
+      </w:r>
+      <w:r>
+        <w:rPr>
+          <w:rFonts w:ascii="Consolas" w:hAnsi="Consolas" w:cs="Consolas"/>
+          <w:sz w:val="18"/>
+          <w:shd w:val="clear" w:color="auto" w:fill="EEF4F2"/>
+        </w:rPr>
+        <w:t>wipeAll</w:t>
+      </w:r>
+      <w:r>
+        <w:t xml:space="preserve"> geeft </w:t>
+      </w:r>
+      <w:r>
+        <w:rPr>
+          <w:rFonts w:ascii="Consolas" w:hAnsi="Consolas" w:cs="Consolas"/>
+          <w:sz w:val="18"/>
+          <w:shd w:val="clear" w:color="auto" w:fill="EEF4F2"/>
+        </w:rPr>
+        <w:t>false</w:t>
+      </w:r>
+      <w:r>
+        <w:t>), dan blijven de gegevens staan, blijft het beheer open en verschijnt "De gegevens konden niet worden gewist. Probeer het opnieuw."</w:t>
       </w:r>
     </w:p>
     <w:p>
@@ -18735,7 +19339,7 @@
         <w:t>stopCamera</w:t>
       </w:r>
       <w:r>
-        <w:t xml:space="preserve">; is het venster gesloten terwijl de camera startte, dan zet </w:t>
+        <w:t xml:space="preserve">. Is het venster gesloten terwijl de camera startte, dan zet </w:t>
       </w:r>
       <w:r>
         <w:rPr>
@@ -18812,7 +19416,18 @@
         <w:t>FACE_DEMO.matchThreshold</w:t>
       </w:r>
       <w:r>
-        <w:t xml:space="preserve">, en </w:t>
+        <w:t>. De controller geeft daarbij de id's van de actieve medewerkers mee (</w:t>
+      </w:r>
+      <w:r>
+        <w:rPr>
+          <w:rFonts w:ascii="Consolas" w:hAnsi="Consolas" w:cs="Consolas"/>
+          <w:sz w:val="18"/>
+          <w:shd w:val="clear" w:color="auto" w:fill="EEF4F2"/>
+        </w:rPr>
+        <w:t>allowedIds</w:t>
+      </w:r>
+      <w:r>
+        <w:t xml:space="preserve">), zodat het gezicht van een inactieve of verwijderde medewerker een actieve medewerker niet kan "afschermen". </w:t>
       </w:r>
       <w:r>
         <w:rPr>
@@ -18834,7 +19449,7 @@
         <w:t>captureSession</w:t>
       </w:r>
       <w:r>
-        <w:t>); een vastlegging uit een gesloten venster blokkeert een opnieuw geopend venster dus niet. De camera-functie van de browser (</w:t>
+        <w:t>). Een vastlegging uit een gesloten venster blokkeert een opnieuw geopend venster dus niet. De camera-functie van de browser (</w:t>
       </w:r>
       <w:r>
         <w:rPr>
@@ -18866,7 +19481,7 @@
     </w:p>
     <w:p>
       <w:r>
-        <w:t xml:space="preserve">Herkent een pas via een USB-NFC-lezer die zich als toetsenbord gedraagt (zie 4.16). De controller geeft iedere toets op de beginpagina door aan </w:t>
+        <w:t xml:space="preserve">Herkent een pas via een USB-NFC-lezer die zich als toetsenbord gedraagt (zie 4.16). De controller geeft iedere toets door aan </w:t>
       </w:r>
       <w:r>
         <w:rPr>
@@ -18888,7 +19503,7 @@
         <w:t>BadgeController.handleBadgeKey</w:t>
       </w:r>
       <w:r>
-        <w:t xml:space="preserve">, ook als er een venster open is, en dan doet </w:t>
+        <w:t xml:space="preserve">), ook als er een venster open is. Dan herkent </w:t>
       </w:r>
       <w:r>
         <w:rPr>
@@ -18899,7 +19514,7 @@
         <w:t>recognizeBadge</w:t>
       </w:r>
       <w:r>
-        <w:t xml:space="preserve"> niets). De class houdt een buffer bij van snel getypte tekens met het tijdstip van de laatste toets. Een scan is minstens </w:t>
+        <w:t xml:space="preserve"> niemand, maar de afsluitende Enter of Tab wordt wel tegengehouden. De class houdt een buffer bij van snel getypte tekens met het tijdstip van de laatste toets. Een scan is minstens </w:t>
       </w:r>
       <w:r>
         <w:rPr>
@@ -18954,7 +19569,7 @@
         <w:t>finishAfterSilence</w:t>
       </w:r>
       <w:r>
-        <w:t>). Komt een teken te laat, dan begint er een nieuwe buffer; zo wordt menselijk typen nooit een scan. De Enter of Tab die een scan afsluit, wordt tegengehouden (</w:t>
+        <w:t>). Komt een teken te laat, dan begint er een nieuwe buffer. Zo wordt menselijk typen nooit een scan. De Enter of Tab die een scan afsluit, wordt tegengehouden (</w:t>
       </w:r>
       <w:r>
         <w:rPr>
@@ -19009,7 +19624,18 @@
         <w:t>-</w:t>
       </w:r>
       <w:r>
-        <w:t xml:space="preserve"> weg en maakt alles hoofdletters; het medewerkersformulier gebruikt dezelfde methode. Na een scan roept de class </w:t>
+        <w:t xml:space="preserve"> weg en maakt alles hoofdletters. Het medewerkersformulier en </w:t>
+      </w:r>
+      <w:r>
+        <w:rPr>
+          <w:rFonts w:ascii="Consolas" w:hAnsi="Consolas" w:cs="Consolas"/>
+          <w:sz w:val="18"/>
+          <w:shd w:val="clear" w:color="auto" w:fill="EEF4F2"/>
+        </w:rPr>
+        <w:t>DataStore</w:t>
+      </w:r>
+      <w:r>
+        <w:t xml:space="preserve"> (bij het laden) maken een pasnummer op dezelfde manier gelijk. Na een scan roept de class </w:t>
       </w:r>
       <w:r>
         <w:rPr>
@@ -19020,7 +19646,7 @@
         <w:t>onScan(code)</w:t>
       </w:r>
       <w:r>
-        <w:t xml:space="preserve"> aan; de controller zoekt dan de medewerker op (</w:t>
+        <w:t xml:space="preserve"> aan. De controller zoekt dan de medewerker op (</w:t>
       </w:r>
       <w:r>
         <w:rPr>
@@ -19053,7 +19679,7 @@
         <w:t>onStart</w:t>
       </w:r>
       <w:r>
-        <w:t xml:space="preserve"> wordt aangeroepen als er een nieuwe buffer begint; de controller onthoudt dan de inhoud van het zoekveld (</w:t>
+        <w:t xml:space="preserve"> wordt aangeroepen als er een nieuwe buffer begint. De controller onthoudt dan welk veld de focus had en wat er in het zoekveld en het bedrijfsfilter stond (</w:t>
       </w:r>
       <w:r>
         <w:rPr>
@@ -19064,7 +19690,7 @@
         <w:t>rememberSearchBeforeScan</w:t>
       </w:r>
       <w:r>
-        <w:t>) en zet die na de scan terug (</w:t>
+        <w:t>), en zet dat na de scan terug (</w:t>
       </w:r>
       <w:r>
         <w:rPr>
@@ -19075,7 +19701,29 @@
         <w:t>restoreSearchAfterScan</w:t>
       </w:r>
       <w:r>
-        <w:t>). De tijd en de timers (</w:t>
+        <w:t xml:space="preserve">). Begon de scan in het veld </w:t>
+      </w:r>
+      <w:r>
+        <w:rPr>
+          <w:rFonts w:ascii="Consolas" w:hAnsi="Consolas" w:cs="Consolas"/>
+          <w:sz w:val="18"/>
+          <w:shd w:val="clear" w:color="auto" w:fill="EEF4F2"/>
+        </w:rPr>
+        <w:t>Pasnummer</w:t>
+      </w:r>
+      <w:r>
+        <w:t xml:space="preserve">, dan zet </w:t>
+      </w:r>
+      <w:r>
+        <w:rPr>
+          <w:rFonts w:ascii="Consolas" w:hAnsi="Consolas" w:cs="Consolas"/>
+          <w:sz w:val="18"/>
+          <w:shd w:val="clear" w:color="auto" w:fill="EEF4F2"/>
+        </w:rPr>
+        <w:t>fillBadgeFieldAfterScan</w:t>
+      </w:r>
+      <w:r>
+        <w:t xml:space="preserve"> alleen het nieuwe pasnummer in dat veld. De tijd en de timers (</w:t>
       </w:r>
       <w:r>
         <w:rPr>
@@ -19118,7 +19766,7 @@
         <w:t>icon(naam)</w:t>
       </w:r>
       <w:r>
-        <w:t xml:space="preserve"> geeft de HTML van één icoon; elementen met </w:t>
+        <w:t xml:space="preserve"> geeft de HTML van één icoon. Elementen met </w:t>
       </w:r>
       <w:r>
         <w:rPr>
@@ -19149,7 +19797,7 @@
         <w:keepNext/>
       </w:pPr>
       <w:bookmarkStart w:id="81" w:name="k46"/>
-      <w:bookmarkStart w:id="82" w:name="_Toc242703561"/>
+      <w:bookmarkStart w:id="82" w:name="_Toc242707544"/>
       <w:r>
         <w:rPr>
           <w:rFonts w:ascii="Consolas" w:hAnsi="Consolas" w:cs="Consolas"/>
@@ -19220,6 +19868,8 @@
       </w:r>
       <w:r>
         <w:tab/>
+      </w:r>
+      <w:r>
         <w:t>Toont alleen actieve medewerkers die daarbij passen.</w:t>
       </w:r>
     </w:p>
@@ -19290,7 +19940,7 @@
         <w:keepNext/>
       </w:pPr>
       <w:bookmarkStart w:id="83" w:name="k47"/>
-      <w:bookmarkStart w:id="84" w:name="_Toc242703562"/>
+      <w:bookmarkStart w:id="84" w:name="_Toc242707545"/>
       <w:r>
         <w:rPr>
           <w:rFonts w:ascii="Consolas" w:hAnsi="Consolas" w:cs="Consolas"/>
@@ -19367,7 +20017,7 @@
         <w:keepNext/>
       </w:pPr>
       <w:bookmarkStart w:id="85" w:name="k48"/>
-      <w:bookmarkStart w:id="86" w:name="_Toc242703563"/>
+      <w:bookmarkStart w:id="86" w:name="_Toc242707546"/>
       <w:r>
         <w:rPr>
           <w:rFonts w:ascii="Consolas" w:hAnsi="Consolas" w:cs="Consolas"/>
@@ -19516,7 +20166,7 @@
         <w:keepNext/>
       </w:pPr>
       <w:bookmarkStart w:id="87" w:name="k49"/>
-      <w:bookmarkStart w:id="88" w:name="_Toc242703564"/>
+      <w:bookmarkStart w:id="88" w:name="_Toc242707547"/>
       <w:r>
         <w:rPr>
           <w:rFonts w:ascii="Consolas" w:hAnsi="Consolas" w:cs="Consolas"/>
@@ -19583,7 +20233,7 @@
         <w:keepNext/>
       </w:pPr>
       <w:bookmarkStart w:id="89" w:name="k50"/>
-      <w:bookmarkStart w:id="90" w:name="_Toc242703565"/>
+      <w:bookmarkStart w:id="90" w:name="_Toc242707548"/>
       <w:r>
         <w:rPr>
           <w:rFonts w:ascii="Consolas" w:hAnsi="Consolas" w:cs="Consolas"/>
@@ -19705,7 +20355,7 @@
         <w:keepNext/>
       </w:pPr>
       <w:bookmarkStart w:id="91" w:name="k51"/>
-      <w:bookmarkStart w:id="92" w:name="_Toc242703566"/>
+      <w:bookmarkStart w:id="92" w:name="_Toc242707549"/>
       <w:r>
         <w:rPr>
           <w:rFonts w:ascii="Consolas" w:hAnsi="Consolas" w:cs="Consolas"/>
@@ -19741,7 +20391,7 @@
         <w:t>Lotte van Dijk: 2× Blikje, 1× Ei geregistreerd</w:t>
       </w:r>
       <w:r>
-        <w:t xml:space="preserve"> met een vinkje ervoor. Foutmeldingen krijgen een waarschuwingsteken. Standaard verdwijnt een melding na 2,5 seconde; de melding na het registreren blijft 4 seconden staan, zodat een medewerker aan een gedeelde tablet kan lezen voor wie en wat er is opgeslagen.</w:t>
+        <w:t xml:space="preserve"> met een vinkje ervoor. Foutmeldingen krijgen een waarschuwingsteken. Standaard verdwijnt een melding na 2,5 seconde. De melding na het registreren blijft 4 seconden staan, zodat een medewerker aan een gedeelde tablet kan lezen voor wie en wat er is opgeslagen.</w:t>
       </w:r>
     </w:p>
     <w:p>
@@ -19750,7 +20400,7 @@
         <w:keepNext/>
       </w:pPr>
       <w:bookmarkStart w:id="93" w:name="k52"/>
-      <w:bookmarkStart w:id="94" w:name="_Toc242703567"/>
+      <w:bookmarkStart w:id="94" w:name="_Toc242707550"/>
       <w:r>
         <w:t>OPSLAGFOUTEN EN TERUGDRAAIEN</w:t>
       </w:r>
@@ -19781,7 +20431,29 @@
         <w:t>DataStore.save</w:t>
       </w:r>
       <w:r>
-        <w:t xml:space="preserve"> alles in één keer op te slaan. Als de browseropslag mislukt, wordt de vorige status teruggezet, dus zonder de wijziging én zonder de logboekregel, en krijgt de gebruiker een foutmelding. Zo lijkt een mislukte opslag niet toch succesvol, en staat er nooit een wijziging zonder logboekregel (of andersom).</w:t>
+        <w:t xml:space="preserve"> alles in één keer op te slaan. Als de browseropslag mislukt, wordt de vorige status teruggezet, dus zonder de wijziging én zonder de logboekregel, en krijgt de gebruiker een foutmelding: "Opslaan mislukt. Probeer het opnieuw." Is de opslag van de browser vol (</w:t>
+      </w:r>
+      <w:r>
+        <w:rPr>
+          <w:rFonts w:ascii="Consolas" w:hAnsi="Consolas" w:cs="Consolas"/>
+          <w:sz w:val="18"/>
+          <w:shd w:val="clear" w:color="auto" w:fill="EEF4F2"/>
+        </w:rPr>
+        <w:t>DataStore.saveProblem</w:t>
+      </w:r>
+      <w:r>
+        <w:t xml:space="preserve"> is </w:t>
+      </w:r>
+      <w:r>
+        <w:rPr>
+          <w:rFonts w:ascii="Consolas" w:hAnsi="Consolas" w:cs="Consolas"/>
+          <w:sz w:val="18"/>
+          <w:shd w:val="clear" w:color="auto" w:fill="EEF4F2"/>
+        </w:rPr>
+        <w:t>"full"</w:t>
+      </w:r>
+      <w:r>
+        <w:t>), dan helpt opnieuw proberen niet en verschijnt (8 seconden) "De opslag van de browser is vol. Er is niets opgeslagen. Vraag de beheerder om de registraties te exporteren en oude gegevens te wissen." De app verwijdert zelf geen oude gegevens, omdat de bewaartermijn een besluit van TVB is. Zo lijkt een mislukte opslag niet toch succesvol, en staat er nooit een wijziging zonder logboekregel (of andersom).</w:t>
       </w:r>
     </w:p>
     <w:p>
@@ -19790,7 +20462,7 @@
         <w:keepNext/>
       </w:pPr>
       <w:bookmarkStart w:id="95" w:name="k53"/>
-      <w:bookmarkStart w:id="96" w:name="_Toc242703568"/>
+      <w:bookmarkStart w:id="96" w:name="_Toc242707551"/>
       <w:r>
         <w:t>ADMINFUNCTIES</w:t>
       </w:r>
@@ -19818,7 +20490,7 @@
         <w:t>adminLoggedIn</w:t>
       </w:r>
       <w:r>
-        <w:t xml:space="preserve"> waar is, wordt het dashboard opnieuw getoond; anders verschijnt het loginformulier.</w:t>
+        <w:t xml:space="preserve"> waar is, wordt het dashboard opnieuw getoond, anders verschijnt het loginformulier.</w:t>
       </w:r>
     </w:p>
     <w:p>
@@ -20036,7 +20708,7 @@
         <w:keepNext/>
       </w:pPr>
       <w:bookmarkStart w:id="97" w:name="k54"/>
-      <w:bookmarkStart w:id="98" w:name="_Toc242703569"/>
+      <w:bookmarkStart w:id="98" w:name="_Toc242707552"/>
       <w:r>
         <w:t xml:space="preserve">CSV-EXPORT (CLASS </w:t>
       </w:r>
@@ -20444,7 +21116,7 @@
         <w:keepNext/>
       </w:pPr>
       <w:bookmarkStart w:id="99" w:name="k55"/>
-      <w:bookmarkStart w:id="100" w:name="_Toc242703570"/>
+      <w:bookmarkStart w:id="100" w:name="_Toc242707553"/>
       <w:r>
         <w:t>EVENT LISTENERS</w:t>
       </w:r>
@@ -21056,7 +21728,7 @@
         </w:numPr>
       </w:pPr>
       <w:bookmarkStart w:id="101" w:name="k56"/>
-      <w:bookmarkStart w:id="102" w:name="_Toc242703571"/>
+      <w:bookmarkStart w:id="102" w:name="_Toc242707554"/>
       <w:r>
         <w:t>DATAMODEL EN KOPPELINGEN.</w:t>
       </w:r>
@@ -21074,7 +21746,7 @@
         <w:keepNext/>
       </w:pPr>
       <w:bookmarkStart w:id="103" w:name="k57"/>
-      <w:bookmarkStart w:id="104" w:name="_Toc242703572"/>
+      <w:bookmarkStart w:id="104" w:name="_Toc242707555"/>
       <w:r>
         <w:t>BEDRIJVEN</w:t>
       </w:r>
@@ -21285,7 +21957,7 @@
         <w:keepNext/>
       </w:pPr>
       <w:bookmarkStart w:id="105" w:name="k58"/>
-      <w:bookmarkStart w:id="106" w:name="_Toc242703573"/>
+      <w:bookmarkStart w:id="106" w:name="_Toc242707556"/>
       <w:r>
         <w:t>CONSUMPTIEPUNTEN</w:t>
       </w:r>
@@ -21604,7 +22276,7 @@
         <w:keepNext/>
       </w:pPr>
       <w:bookmarkStart w:id="107" w:name="k59"/>
-      <w:bookmarkStart w:id="108" w:name="_Toc242703574"/>
+      <w:bookmarkStart w:id="108" w:name="_Toc242707557"/>
       <w:r>
         <w:t>MEDEWERKERS</w:t>
       </w:r>
@@ -21883,7 +22555,7 @@
                 <w:sz w:val="16"/>
                 <w:szCs w:val="16"/>
               </w:rPr>
-              <w:t>Optioneel afwijkend werkgevernummer; leeg = dat van het bedrijf (</w:t>
+              <w:t>Optioneel afwijkend werkgevernummer. Leeg = dat van het bedrijf (</w:t>
             </w:r>
             <w:r>
               <w:rPr>
@@ -22143,7 +22815,7 @@
                 <w:sz w:val="16"/>
                 <w:szCs w:val="16"/>
               </w:rPr>
-              <w:t xml:space="preserve"> = geen pas. Uniek per medewerker; staat niet in de CSV-export en niet in het logboek</w:t>
+              <w:t xml:space="preserve"> = geen pas. Uniek per medewerker. Staat niet in de CSV-export en niet in het logboek</w:t>
             </w:r>
           </w:p>
         </w:tc>
@@ -22160,7 +22832,7 @@
         <w:keepNext/>
       </w:pPr>
       <w:bookmarkStart w:id="109" w:name="k60"/>
-      <w:bookmarkStart w:id="110" w:name="_Toc242703575"/>
+      <w:bookmarkStart w:id="110" w:name="_Toc242707558"/>
       <w:r>
         <w:t>REGISTRATIES</w:t>
       </w:r>
@@ -22449,7 +23121,7 @@
                 <w:sz w:val="16"/>
                 <w:szCs w:val="16"/>
               </w:rPr>
-              <w:t>). Ontbreekt als er toen nog geen nummer was; dan gebruikt de export het huidige nummer</w:t>
+              <w:t>). Ontbreekt als er toen nog geen nummer was. Dan gebruikt de export het huidige nummer</w:t>
             </w:r>
           </w:p>
         </w:tc>
@@ -22489,7 +23161,7 @@
                 <w:sz w:val="16"/>
                 <w:szCs w:val="16"/>
               </w:rPr>
-              <w:t>Consumptiepunt waar de voorraad van af ging; bij een correctie gaat het product hier weer naartoe terug. Leeg (</w:t>
+              <w:t>Consumptiepunt waar de voorraad van af ging. Bij een correctie gaat het product hier weer naartoe terug. Leeg (</w:t>
             </w:r>
             <w:r>
               <w:rPr>
@@ -22712,7 +23384,7 @@
         <w:t>price</w:t>
       </w:r>
       <w:r>
-        <w:t>); oude registraties zonder prijs gebruiken de huidige prijs uit het productbeheer. Het bestand bevat per medewerker per loonmaand het aantal en de totale prijs. Deze gegevens zijn alleen zichtbaar voor de beheerder.</w:t>
+        <w:t>). Oude registraties zonder prijs gebruiken de huidige prijs uit het productbeheer. Het bestand bevat per medewerker per loonmaand het aantal en de totale prijs. Deze gegevens zijn alleen zichtbaar voor de beheerder.</w:t>
       </w:r>
     </w:p>
     <w:p>
@@ -22726,7 +23398,7 @@
         </w:numPr>
       </w:pPr>
       <w:bookmarkStart w:id="111" w:name="k61"/>
-      <w:bookmarkStart w:id="112" w:name="_Toc242703576"/>
+      <w:bookmarkStart w:id="112" w:name="_Toc242707559"/>
       <w:r>
         <w:t>BELANGRIJKE DEMO-BEPERKINGEN.</w:t>
       </w:r>
@@ -22818,7 +23490,18 @@
         <w:contextualSpacing w:val="0"/>
       </w:pPr>
       <w:r>
-        <w:t>Er is geen echte database.</w:t>
+        <w:t>Er is geen echte database. De opslag van de browser (</w:t>
+      </w:r>
+      <w:r>
+        <w:rPr>
+          <w:rFonts w:ascii="Consolas" w:hAnsi="Consolas" w:cs="Consolas"/>
+          <w:sz w:val="18"/>
+          <w:shd w:val="clear" w:color="auto" w:fill="EEF4F2"/>
+        </w:rPr>
+        <w:t>localStorage</w:t>
+      </w:r>
+      <w:r>
+        <w:t>) heeft per website een grens van ongeveer 5 MB, en de reservekopieën tellen mee. Dat is genoeg voor naar schatting 20.000 registraties. Is de opslag vol, dan meldt de app "De opslag van de browser is vol. Er is niets opgeslagen. Vraag de beheerder om de registraties te exporteren en oude gegevens te wissen." De app verwijdert zelf geen oude gegevens.</w:t>
       </w:r>
     </w:p>
     <w:p>
@@ -22832,7 +23515,29 @@
         <w:contextualSpacing w:val="0"/>
       </w:pPr>
       <w:r>
-        <w:t>De login heeft geen echte beveiliging: elk ingevuld wachtwoord werkt. De beheeracties controleren wel zelf of er iemand is ingelogd, maar dat is een controle in de browser die met de ontwikkelaarstools te omzeilen is.</w:t>
+        <w:t>Excel laat voorloopnullen in looncode, personeelsnummer en werkgevernummer weg als je het CSV-bestand met een dubbelklik opent (</w:t>
+      </w:r>
+      <w:r>
+        <w:rPr>
+          <w:rFonts w:ascii="Consolas" w:hAnsi="Consolas" w:cs="Consolas"/>
+          <w:sz w:val="18"/>
+          <w:shd w:val="clear" w:color="auto" w:fill="EEF4F2"/>
+        </w:rPr>
+        <w:t>0012</w:t>
+      </w:r>
+      <w:r>
+        <w:t xml:space="preserve"> wordt </w:t>
+      </w:r>
+      <w:r>
+        <w:rPr>
+          <w:rFonts w:ascii="Consolas" w:hAnsi="Consolas" w:cs="Consolas"/>
+          <w:sz w:val="18"/>
+          <w:shd w:val="clear" w:color="auto" w:fill="EEF4F2"/>
+        </w:rPr>
+        <w:t>12</w:t>
+      </w:r>
+      <w:r>
+        <w:t>). Lees het bestand rechtstreeks in het loonsysteem in of importeer de kolommen in Excel als tekst (zie 4.12).</w:t>
       </w:r>
     </w:p>
     <w:p>
@@ -22846,7 +23551,7 @@
         <w:contextualSpacing w:val="0"/>
       </w:pPr>
       <w:r>
-        <w:t>Iedereen bij de tablet kan op de naam van een collega tikken en op diens naam registreren, of in diens productvenster een eigen gezicht instellen (demo). Iedere registratie staat wel met datum en tijd in het beheer en de beheerder kan die corrigeren. In productie is een pas, QR-code of pincode nodig, en een overzicht waarin een medewerker zijn eigen registraties ziet.</w:t>
+        <w:t>De login heeft geen echte beveiliging: elk ingevuld wachtwoord werkt. De beheeracties controleren wel zelf of er iemand is ingelogd, maar dat is een controle in de browser die met de ontwikkelaarstools te omzeilen is.</w:t>
       </w:r>
     </w:p>
     <w:p>
@@ -22860,18 +23565,7 @@
         <w:contextualSpacing w:val="0"/>
       </w:pPr>
       <w:r>
-        <w:t xml:space="preserve">Alle gegevens staan als gewone tekst in </w:t>
-      </w:r>
-      <w:r>
-        <w:rPr>
-          <w:rFonts w:ascii="Consolas" w:hAnsi="Consolas" w:cs="Consolas"/>
-          <w:sz w:val="18"/>
-          <w:shd w:val="clear" w:color="auto" w:fill="EEF4F2"/>
-        </w:rPr>
-        <w:t>localStorage</w:t>
-      </w:r>
-      <w:r>
-        <w:t xml:space="preserve"> van de tablet. Wie het apparaat en de ontwikkelaarstools van de browser gebruikt, kan ze lezen en aanpassen, en kan via de console ook de code van de pagina uitvoeren.</w:t>
+        <w:t>Iedereen bij de tablet kan op de naam van een collega tikken en op diens naam registreren, of in diens productvenster een eigen gezicht instellen (demo). Iedere registratie staat wel met datum en tijd in het beheer en de beheerder kan die corrigeren. In productie is een pas, QR-code of pincode nodig, en een overzicht waarin een medewerker zijn eigen registraties ziet.</w:t>
       </w:r>
     </w:p>
     <w:p>
@@ -22885,7 +23579,18 @@
         <w:contextualSpacing w:val="0"/>
       </w:pPr>
       <w:r>
-        <w:t>Er zijn geen gebruikersrollen of wachtwoordbeheer.</w:t>
+        <w:t xml:space="preserve">Alle gegevens staan als gewone tekst in </w:t>
+      </w:r>
+      <w:r>
+        <w:rPr>
+          <w:rFonts w:ascii="Consolas" w:hAnsi="Consolas" w:cs="Consolas"/>
+          <w:sz w:val="18"/>
+          <w:shd w:val="clear" w:color="auto" w:fill="EEF4F2"/>
+        </w:rPr>
+        <w:t>localStorage</w:t>
+      </w:r>
+      <w:r>
+        <w:t xml:space="preserve"> van de tablet. Wie het apparaat en de ontwikkelaarstools van de browser gebruikt, kan ze lezen en aanpassen, en kan via de console ook de code van de pagina uitvoeren.</w:t>
       </w:r>
     </w:p>
     <w:p>
@@ -22899,18 +23604,7 @@
         <w:contextualSpacing w:val="0"/>
       </w:pPr>
       <w:r>
-        <w:t xml:space="preserve">Verwijderde medewerkers krijgen geen herstelmogelijkheid, en </w:t>
-      </w:r>
-      <w:r>
-        <w:rPr>
-          <w:rFonts w:ascii="Consolas" w:hAnsi="Consolas" w:cs="Consolas"/>
-          <w:sz w:val="18"/>
-          <w:shd w:val="clear" w:color="auto" w:fill="EEF4F2"/>
-        </w:rPr>
-        <w:t>Alle gegevens wissen</w:t>
-      </w:r>
-      <w:r>
-        <w:t xml:space="preserve"> kan niet ongedaan worden gemaakt.</w:t>
+        <w:t>Er zijn geen gebruikersrollen of wachtwoordbeheer.</w:t>
       </w:r>
     </w:p>
     <w:p>
@@ -22924,7 +23618,18 @@
         <w:contextualSpacing w:val="0"/>
       </w:pPr>
       <w:r>
-        <w:t>Er is geen server-side auditlog. Het logboek staat alleen in de browser.</w:t>
+        <w:t xml:space="preserve">Verwijderde medewerkers krijgen geen herstelmogelijkheid, en </w:t>
+      </w:r>
+      <w:r>
+        <w:rPr>
+          <w:rFonts w:ascii="Consolas" w:hAnsi="Consolas" w:cs="Consolas"/>
+          <w:sz w:val="18"/>
+          <w:shd w:val="clear" w:color="auto" w:fill="EEF4F2"/>
+        </w:rPr>
+        <w:t>Alle gegevens wissen</w:t>
+      </w:r>
+      <w:r>
+        <w:t xml:space="preserve"> kan niet ongedaan worden gemaakt.</w:t>
       </w:r>
     </w:p>
     <w:p>
@@ -22938,7 +23643,7 @@
         <w:contextualSpacing w:val="0"/>
       </w:pPr>
       <w:r>
-        <w:t>De namen van alle actieve medewerkers staan op de beginpagina, omdat je je eigen naam moet kunnen kiezen. Aantallen, bedragen en eerdere keuzes staan er niet.</w:t>
+        <w:t>Er is geen server-side auditlog. Het logboek staat alleen in de browser.</w:t>
       </w:r>
     </w:p>
     <w:p>
@@ -22952,7 +23657,7 @@
         <w:contextualSpacing w:val="0"/>
       </w:pPr>
       <w:r>
-        <w:t>Een CSV-bestand komt in de downloadmap van de computer van de beheerder en valt daarmee buiten de app. Stuur het beveiligd naar de loonadministratie en verwijder het na het inlezen.</w:t>
+        <w:t>De namen van alle actieve medewerkers staan op de beginpagina, omdat je je eigen naam moet kunnen kiezen. Aantallen, bedragen en eerdere keuzes staan er niet.</w:t>
       </w:r>
     </w:p>
     <w:p>
@@ -22966,7 +23671,7 @@
         <w:contextualSpacing w:val="0"/>
       </w:pPr>
       <w:r>
-        <w:t>De demo vertrouwt op een beveiligde tablet: kioskmodus, schermvergrendeling en versleuteling van het apparaat zijn nodig.</w:t>
+        <w:t>Een CSV-bestand komt in de downloadmap van de computer van de beheerder en valt daarmee buiten de app. Stuur het beveiligd naar de loonadministratie en verwijder het na het inlezen.</w:t>
       </w:r>
     </w:p>
     <w:p>
@@ -22980,7 +23685,7 @@
         <w:contextualSpacing w:val="0"/>
       </w:pPr>
       <w:r>
-        <w:t>Voor productie zijn ook AVG-maatregelen nodig, zoals een grondslag per verwerking, bewaartermijnen, een privacyverklaring, een DPIA en instemming van de ondernemingsraad. Zie het TO, hoofdstuk 13, paragraaf AVG-verantwoording (productie).</w:t>
+        <w:t>De demo vertrouwt op een beveiligde tablet: kioskmodus, schermvergrendeling en versleuteling van het apparaat zijn nodig.</w:t>
       </w:r>
     </w:p>
     <w:p>
@@ -22994,29 +23699,7 @@
         <w:contextualSpacing w:val="0"/>
       </w:pPr>
       <w:r>
-        <w:t>Bescherming tegen inbedden in een frame (</w:t>
-      </w:r>
-      <w:r>
-        <w:rPr>
-          <w:rFonts w:ascii="Consolas" w:hAnsi="Consolas" w:cs="Consolas"/>
-          <w:sz w:val="18"/>
-          <w:shd w:val="clear" w:color="auto" w:fill="EEF4F2"/>
-        </w:rPr>
-        <w:t>frame-ancestors</w:t>
-      </w:r>
-      <w:r>
-        <w:t xml:space="preserve"> of </w:t>
-      </w:r>
-      <w:r>
-        <w:rPr>
-          <w:rFonts w:ascii="Consolas" w:hAnsi="Consolas" w:cs="Consolas"/>
-          <w:sz w:val="18"/>
-          <w:shd w:val="clear" w:color="auto" w:fill="EEF4F2"/>
-        </w:rPr>
-        <w:t>X-Frame-Options</w:t>
-      </w:r>
-      <w:r>
-        <w:t>) kan alleen met een HTTP-header van de webserver en zit dus niet in de demo.</w:t>
+        <w:t>Voor productie zijn ook AVG-maatregelen nodig, zoals een grondslag per verwerking, bewaartermijnen, een privacyverklaring, een DPIA en instemming van de ondernemingsraad. Zie het TO, hoofdstuk 13, paragraaf AVG-verantwoording (productie).</w:t>
       </w:r>
     </w:p>
     <w:p>
@@ -23030,6 +23713,42 @@
         <w:contextualSpacing w:val="0"/>
       </w:pPr>
       <w:r>
+        <w:t>Bescherming tegen inbedden in een frame (</w:t>
+      </w:r>
+      <w:r>
+        <w:rPr>
+          <w:rFonts w:ascii="Consolas" w:hAnsi="Consolas" w:cs="Consolas"/>
+          <w:sz w:val="18"/>
+          <w:shd w:val="clear" w:color="auto" w:fill="EEF4F2"/>
+        </w:rPr>
+        <w:t>frame-ancestors</w:t>
+      </w:r>
+      <w:r>
+        <w:t xml:space="preserve"> of </w:t>
+      </w:r>
+      <w:r>
+        <w:rPr>
+          <w:rFonts w:ascii="Consolas" w:hAnsi="Consolas" w:cs="Consolas"/>
+          <w:sz w:val="18"/>
+          <w:shd w:val="clear" w:color="auto" w:fill="EEF4F2"/>
+        </w:rPr>
+        <w:t>X-Frame-Options</w:t>
+      </w:r>
+      <w:r>
+        <w:t>) kan alleen met een HTTP-header van de webserver en zit dus niet in de demo.</w:t>
+      </w:r>
+    </w:p>
+    <w:p>
+      <w:pPr>
+        <w:pStyle w:val="Lijstalinea"/>
+        <w:numPr>
+          <w:ilvl w:val="0"/>
+          <w:numId w:val="3"/>
+        </w:numPr>
+        <w:spacing w:after="60"/>
+        <w:contextualSpacing w:val="0"/>
+      </w:pPr>
+      <w:r>
         <w:t xml:space="preserve">De gezichtsherkenning is alleen een demo. Ingestelde gezichten zijn na het herladen van de pagina weg. Er is geen controle of er een echt, levend gezicht voor de camera staat, en hoe vaak de verkeerde persoon wordt herkend, is niet gemeten. Bij het laden toont de console één onschadelijke CSP-melding over </w:t>
       </w:r>
       <w:r>
@@ -23073,7 +23792,7 @@
         </w:numPr>
       </w:pPr>
       <w:bookmarkStart w:id="113" w:name="k62"/>
-      <w:bookmarkStart w:id="114" w:name="_Toc242703577"/>
+      <w:bookmarkStart w:id="114" w:name="_Toc242707560"/>
       <w:r>
         <w:t>CODE UITLEGGEN TIJDENS EEN PRESENTATIE.</w:t>
       </w:r>
@@ -23424,7 +24143,7 @@
         </w:numPr>
       </w:pPr>
       <w:bookmarkStart w:id="115" w:name="k63"/>
-      <w:bookmarkStart w:id="116" w:name="_Toc242703578"/>
+      <w:bookmarkStart w:id="116" w:name="_Toc242707561"/>
       <w:r>
         <w:t>MOGELIJKE VERVOLGSTAPPEN.</w:t>
       </w:r>
@@ -23563,7 +24282,7 @@
         <w:t>localStorage</w:t>
       </w:r>
       <w:r>
-        <w:t xml:space="preserve"> door API-aanroepen; alleen </w:t>
+        <w:t xml:space="preserve"> door API-aanroepen. Alleen </w:t>
       </w:r>
       <w:r>
         <w:rPr>

</xml_diff>

<commit_message>
TO 3.12: verbeteringen uit de UX-review
- Productvenster sluit vanzelf na 75 seconden zonder invoer, met een waarschuwing vooraf
- Passcan vervangt het open productvenster van een collega, anders een melding
- Registreren altijd in beeld, breder en hoger, en pas actief na een keuze
- Zoekveld en bedrijfsfilter leeg na registreren
- Compactere beginpagina op een liggende tablet en een hint voor de pasjeslezer
- Gekozen product licht op, tikdoelen minstens 44 px, grotere meldingen en kopjes met meer contrast
- Betere ondersteuning voor schermlezers en eenvoudigere teksten ("Tik op je naam", "Leeg")
- TO, DOCUMENTATIE, README en Word-bestanden bijgewerkt (652 unit tests, 17 browsertests)
</commit_message>
<xml_diff>
--- a/docs/DOCUMENTATIE.docx
+++ b/docs/DOCUMENTATIE.docx
@@ -82,7 +82,7 @@
           <w:numId w:val="0"/>
         </w:numPr>
       </w:pPr>
-      <w:bookmarkStart w:id="0" w:name="_Toc242707508"/>
+      <w:bookmarkStart w:id="0" w:name="_Toc242948991"/>
       <w:r>
         <w:t>INHOUDSOPGAVE.</w:t>
       </w:r>
@@ -112,7 +112,7 @@
       <w:r>
         <w:fldChar w:fldCharType="separate"/>
       </w:r>
-      <w:hyperlink w:anchor="_Toc242707508" w:history="1">
+      <w:hyperlink w:anchor="_Toc242948991" w:history="1">
         <w:r>
           <w:rPr>
             <w:rStyle w:val="Hyperlink"/>
@@ -139,7 +139,7 @@
             <w:noProof/>
             <w:webHidden/>
           </w:rPr>
-          <w:instrText xml:space="preserve"> PAGEREF _Toc242707508 \h </w:instrText>
+          <w:instrText xml:space="preserve"> PAGEREF _Toc242948991 \h </w:instrText>
         </w:r>
         <w:r>
           <w:rPr>
@@ -186,7 +186,7 @@
           <w:lang w:eastAsia="nl-NL"/>
         </w:rPr>
       </w:pPr>
-      <w:hyperlink w:anchor="_Toc242707509" w:history="1">
+      <w:hyperlink w:anchor="_Toc242948992" w:history="1">
         <w:r>
           <w:rPr>
             <w:rStyle w:val="Hyperlink"/>
@@ -231,7 +231,7 @@
             <w:noProof/>
             <w:webHidden/>
           </w:rPr>
-          <w:instrText xml:space="preserve"> PAGEREF _Toc242707509 \h </w:instrText>
+          <w:instrText xml:space="preserve"> PAGEREF _Toc242948992 \h </w:instrText>
         </w:r>
         <w:r>
           <w:rPr>
@@ -278,7 +278,7 @@
           <w:lang w:eastAsia="nl-NL"/>
         </w:rPr>
       </w:pPr>
-      <w:hyperlink w:anchor="_Toc242707510" w:history="1">
+      <w:hyperlink w:anchor="_Toc242948993" w:history="1">
         <w:r>
           <w:rPr>
             <w:rStyle w:val="Hyperlink"/>
@@ -323,7 +323,7 @@
             <w:noProof/>
             <w:webHidden/>
           </w:rPr>
-          <w:instrText xml:space="preserve"> PAGEREF _Toc242707510 \h </w:instrText>
+          <w:instrText xml:space="preserve"> PAGEREF _Toc242948993 \h </w:instrText>
         </w:r>
         <w:r>
           <w:rPr>
@@ -370,7 +370,7 @@
           <w:lang w:eastAsia="nl-NL"/>
         </w:rPr>
       </w:pPr>
-      <w:hyperlink w:anchor="_Toc242707511" w:history="1">
+      <w:hyperlink w:anchor="_Toc242948994" w:history="1">
         <w:r>
           <w:rPr>
             <w:rStyle w:val="Hyperlink"/>
@@ -415,7 +415,7 @@
             <w:noProof/>
             <w:webHidden/>
           </w:rPr>
-          <w:instrText xml:space="preserve"> PAGEREF _Toc242707511 \h </w:instrText>
+          <w:instrText xml:space="preserve"> PAGEREF _Toc242948994 \h </w:instrText>
         </w:r>
         <w:r>
           <w:rPr>
@@ -462,7 +462,7 @@
           <w:lang w:eastAsia="nl-NL"/>
         </w:rPr>
       </w:pPr>
-      <w:hyperlink w:anchor="_Toc242707512" w:history="1">
+      <w:hyperlink w:anchor="_Toc242948995" w:history="1">
         <w:r>
           <w:rPr>
             <w:rStyle w:val="Hyperlink"/>
@@ -507,7 +507,7 @@
             <w:noProof/>
             <w:webHidden/>
           </w:rPr>
-          <w:instrText xml:space="preserve"> PAGEREF _Toc242707512 \h </w:instrText>
+          <w:instrText xml:space="preserve"> PAGEREF _Toc242948995 \h </w:instrText>
         </w:r>
         <w:r>
           <w:rPr>
@@ -554,7 +554,7 @@
           <w:lang w:eastAsia="nl-NL"/>
         </w:rPr>
       </w:pPr>
-      <w:hyperlink w:anchor="_Toc242707513" w:history="1">
+      <w:hyperlink w:anchor="_Toc242948996" w:history="1">
         <w:r>
           <w:rPr>
             <w:rStyle w:val="Hyperlink"/>
@@ -599,7 +599,7 @@
             <w:noProof/>
             <w:webHidden/>
           </w:rPr>
-          <w:instrText xml:space="preserve"> PAGEREF _Toc242707513 \h </w:instrText>
+          <w:instrText xml:space="preserve"> PAGEREF _Toc242948996 \h </w:instrText>
         </w:r>
         <w:r>
           <w:rPr>
@@ -646,7 +646,7 @@
           <w:lang w:eastAsia="nl-NL"/>
         </w:rPr>
       </w:pPr>
-      <w:hyperlink w:anchor="_Toc242707514" w:history="1">
+      <w:hyperlink w:anchor="_Toc242948997" w:history="1">
         <w:r>
           <w:rPr>
             <w:rStyle w:val="Hyperlink"/>
@@ -691,7 +691,7 @@
             <w:noProof/>
             <w:webHidden/>
           </w:rPr>
-          <w:instrText xml:space="preserve"> PAGEREF _Toc242707514 \h </w:instrText>
+          <w:instrText xml:space="preserve"> PAGEREF _Toc242948997 \h </w:instrText>
         </w:r>
         <w:r>
           <w:rPr>
@@ -738,7 +738,7 @@
           <w:lang w:eastAsia="nl-NL"/>
         </w:rPr>
       </w:pPr>
-      <w:hyperlink w:anchor="_Toc242707515" w:history="1">
+      <w:hyperlink w:anchor="_Toc242948998" w:history="1">
         <w:r>
           <w:rPr>
             <w:rStyle w:val="Hyperlink"/>
@@ -783,7 +783,7 @@
             <w:noProof/>
             <w:webHidden/>
           </w:rPr>
-          <w:instrText xml:space="preserve"> PAGEREF _Toc242707515 \h </w:instrText>
+          <w:instrText xml:space="preserve"> PAGEREF _Toc242948998 \h </w:instrText>
         </w:r>
         <w:r>
           <w:rPr>
@@ -830,7 +830,7 @@
           <w:lang w:eastAsia="nl-NL"/>
         </w:rPr>
       </w:pPr>
-      <w:hyperlink w:anchor="_Toc242707516" w:history="1">
+      <w:hyperlink w:anchor="_Toc242948999" w:history="1">
         <w:r>
           <w:rPr>
             <w:rStyle w:val="Hyperlink"/>
@@ -875,7 +875,7 @@
             <w:noProof/>
             <w:webHidden/>
           </w:rPr>
-          <w:instrText xml:space="preserve"> PAGEREF _Toc242707516 \h </w:instrText>
+          <w:instrText xml:space="preserve"> PAGEREF _Toc242948999 \h </w:instrText>
         </w:r>
         <w:r>
           <w:rPr>
@@ -895,7 +895,7 @@
             <w:noProof/>
             <w:webHidden/>
           </w:rPr>
-          <w:t>10</w:t>
+          <w:t>11</w:t>
         </w:r>
         <w:r>
           <w:rPr>
@@ -922,7 +922,7 @@
           <w:lang w:eastAsia="nl-NL"/>
         </w:rPr>
       </w:pPr>
-      <w:hyperlink w:anchor="_Toc242707517" w:history="1">
+      <w:hyperlink w:anchor="_Toc242949000" w:history="1">
         <w:r>
           <w:rPr>
             <w:rStyle w:val="Hyperlink"/>
@@ -967,7 +967,7 @@
             <w:noProof/>
             <w:webHidden/>
           </w:rPr>
-          <w:instrText xml:space="preserve"> PAGEREF _Toc242707517 \h </w:instrText>
+          <w:instrText xml:space="preserve"> PAGEREF _Toc242949000 \h </w:instrText>
         </w:r>
         <w:r>
           <w:rPr>
@@ -1014,7 +1014,7 @@
           <w:lang w:eastAsia="nl-NL"/>
         </w:rPr>
       </w:pPr>
-      <w:hyperlink w:anchor="_Toc242707518" w:history="1">
+      <w:hyperlink w:anchor="_Toc242949001" w:history="1">
         <w:r>
           <w:rPr>
             <w:rStyle w:val="Hyperlink"/>
@@ -1059,7 +1059,7 @@
             <w:noProof/>
             <w:webHidden/>
           </w:rPr>
-          <w:instrText xml:space="preserve"> PAGEREF _Toc242707518 \h </w:instrText>
+          <w:instrText xml:space="preserve"> PAGEREF _Toc242949001 \h </w:instrText>
         </w:r>
         <w:r>
           <w:rPr>
@@ -1106,7 +1106,7 @@
           <w:lang w:eastAsia="nl-NL"/>
         </w:rPr>
       </w:pPr>
-      <w:hyperlink w:anchor="_Toc242707519" w:history="1">
+      <w:hyperlink w:anchor="_Toc242949002" w:history="1">
         <w:r>
           <w:rPr>
             <w:rStyle w:val="Hyperlink"/>
@@ -1151,7 +1151,7 @@
             <w:noProof/>
             <w:webHidden/>
           </w:rPr>
-          <w:instrText xml:space="preserve"> PAGEREF _Toc242707519 \h </w:instrText>
+          <w:instrText xml:space="preserve"> PAGEREF _Toc242949002 \h </w:instrText>
         </w:r>
         <w:r>
           <w:rPr>
@@ -1171,7 +1171,7 @@
             <w:noProof/>
             <w:webHidden/>
           </w:rPr>
-          <w:t>12</w:t>
+          <w:t>13</w:t>
         </w:r>
         <w:r>
           <w:rPr>
@@ -1198,7 +1198,7 @@
           <w:lang w:eastAsia="nl-NL"/>
         </w:rPr>
       </w:pPr>
-      <w:hyperlink w:anchor="_Toc242707520" w:history="1">
+      <w:hyperlink w:anchor="_Toc242949003" w:history="1">
         <w:r>
           <w:rPr>
             <w:rStyle w:val="Hyperlink"/>
@@ -1243,7 +1243,7 @@
             <w:noProof/>
             <w:webHidden/>
           </w:rPr>
-          <w:instrText xml:space="preserve"> PAGEREF _Toc242707520 \h </w:instrText>
+          <w:instrText xml:space="preserve"> PAGEREF _Toc242949003 \h </w:instrText>
         </w:r>
         <w:r>
           <w:rPr>
@@ -1290,7 +1290,7 @@
           <w:lang w:eastAsia="nl-NL"/>
         </w:rPr>
       </w:pPr>
-      <w:hyperlink w:anchor="_Toc242707521" w:history="1">
+      <w:hyperlink w:anchor="_Toc242949004" w:history="1">
         <w:r>
           <w:rPr>
             <w:rStyle w:val="Hyperlink"/>
@@ -1335,7 +1335,7 @@
             <w:noProof/>
             <w:webHidden/>
           </w:rPr>
-          <w:instrText xml:space="preserve"> PAGEREF _Toc242707521 \h </w:instrText>
+          <w:instrText xml:space="preserve"> PAGEREF _Toc242949004 \h </w:instrText>
         </w:r>
         <w:r>
           <w:rPr>
@@ -1382,7 +1382,7 @@
           <w:lang w:eastAsia="nl-NL"/>
         </w:rPr>
       </w:pPr>
-      <w:hyperlink w:anchor="_Toc242707522" w:history="1">
+      <w:hyperlink w:anchor="_Toc242949005" w:history="1">
         <w:r>
           <w:rPr>
             <w:rStyle w:val="Hyperlink"/>
@@ -1427,7 +1427,7 @@
             <w:noProof/>
             <w:webHidden/>
           </w:rPr>
-          <w:instrText xml:space="preserve"> PAGEREF _Toc242707522 \h </w:instrText>
+          <w:instrText xml:space="preserve"> PAGEREF _Toc242949005 \h </w:instrText>
         </w:r>
         <w:r>
           <w:rPr>
@@ -1474,7 +1474,7 @@
           <w:lang w:eastAsia="nl-NL"/>
         </w:rPr>
       </w:pPr>
-      <w:hyperlink w:anchor="_Toc242707523" w:history="1">
+      <w:hyperlink w:anchor="_Toc242949006" w:history="1">
         <w:r>
           <w:rPr>
             <w:rStyle w:val="Hyperlink"/>
@@ -1519,7 +1519,7 @@
             <w:noProof/>
             <w:webHidden/>
           </w:rPr>
-          <w:instrText xml:space="preserve"> PAGEREF _Toc242707523 \h </w:instrText>
+          <w:instrText xml:space="preserve"> PAGEREF _Toc242949006 \h </w:instrText>
         </w:r>
         <w:r>
           <w:rPr>
@@ -1566,7 +1566,7 @@
           <w:lang w:eastAsia="nl-NL"/>
         </w:rPr>
       </w:pPr>
-      <w:hyperlink w:anchor="_Toc242707524" w:history="1">
+      <w:hyperlink w:anchor="_Toc242949007" w:history="1">
         <w:r>
           <w:rPr>
             <w:rStyle w:val="Hyperlink"/>
@@ -1611,7 +1611,7 @@
             <w:noProof/>
             <w:webHidden/>
           </w:rPr>
-          <w:instrText xml:space="preserve"> PAGEREF _Toc242707524 \h </w:instrText>
+          <w:instrText xml:space="preserve"> PAGEREF _Toc242949007 \h </w:instrText>
         </w:r>
         <w:r>
           <w:rPr>
@@ -1631,7 +1631,7 @@
             <w:noProof/>
             <w:webHidden/>
           </w:rPr>
-          <w:t>14</w:t>
+          <w:t>15</w:t>
         </w:r>
         <w:r>
           <w:rPr>
@@ -1658,7 +1658,7 @@
           <w:lang w:eastAsia="nl-NL"/>
         </w:rPr>
       </w:pPr>
-      <w:hyperlink w:anchor="_Toc242707525" w:history="1">
+      <w:hyperlink w:anchor="_Toc242949008" w:history="1">
         <w:r>
           <w:rPr>
             <w:rStyle w:val="Hyperlink"/>
@@ -1703,7 +1703,7 @@
             <w:noProof/>
             <w:webHidden/>
           </w:rPr>
-          <w:instrText xml:space="preserve"> PAGEREF _Toc242707525 \h </w:instrText>
+          <w:instrText xml:space="preserve"> PAGEREF _Toc242949008 \h </w:instrText>
         </w:r>
         <w:r>
           <w:rPr>
@@ -1750,7 +1750,7 @@
           <w:lang w:eastAsia="nl-NL"/>
         </w:rPr>
       </w:pPr>
-      <w:hyperlink w:anchor="_Toc242707526" w:history="1">
+      <w:hyperlink w:anchor="_Toc242949009" w:history="1">
         <w:r>
           <w:rPr>
             <w:rStyle w:val="Hyperlink"/>
@@ -1795,7 +1795,7 @@
             <w:noProof/>
             <w:webHidden/>
           </w:rPr>
-          <w:instrText xml:space="preserve"> PAGEREF _Toc242707526 \h </w:instrText>
+          <w:instrText xml:space="preserve"> PAGEREF _Toc242949009 \h </w:instrText>
         </w:r>
         <w:r>
           <w:rPr>
@@ -1842,7 +1842,7 @@
           <w:lang w:eastAsia="nl-NL"/>
         </w:rPr>
       </w:pPr>
-      <w:hyperlink w:anchor="_Toc242707527" w:history="1">
+      <w:hyperlink w:anchor="_Toc242949010" w:history="1">
         <w:r>
           <w:rPr>
             <w:rStyle w:val="Hyperlink"/>
@@ -1887,7 +1887,7 @@
             <w:noProof/>
             <w:webHidden/>
           </w:rPr>
-          <w:instrText xml:space="preserve"> PAGEREF _Toc242707527 \h </w:instrText>
+          <w:instrText xml:space="preserve"> PAGEREF _Toc242949010 \h </w:instrText>
         </w:r>
         <w:r>
           <w:rPr>
@@ -1934,7 +1934,7 @@
           <w:lang w:eastAsia="nl-NL"/>
         </w:rPr>
       </w:pPr>
-      <w:hyperlink w:anchor="_Toc242707528" w:history="1">
+      <w:hyperlink w:anchor="_Toc242949011" w:history="1">
         <w:r>
           <w:rPr>
             <w:rStyle w:val="Hyperlink"/>
@@ -1979,7 +1979,7 @@
             <w:noProof/>
             <w:webHidden/>
           </w:rPr>
-          <w:instrText xml:space="preserve"> PAGEREF _Toc242707528 \h </w:instrText>
+          <w:instrText xml:space="preserve"> PAGEREF _Toc242949011 \h </w:instrText>
         </w:r>
         <w:r>
           <w:rPr>
@@ -2026,7 +2026,7 @@
           <w:lang w:eastAsia="nl-NL"/>
         </w:rPr>
       </w:pPr>
-      <w:hyperlink w:anchor="_Toc242707529" w:history="1">
+      <w:hyperlink w:anchor="_Toc242949012" w:history="1">
         <w:r>
           <w:rPr>
             <w:rStyle w:val="Hyperlink"/>
@@ -2087,7 +2087,7 @@
             <w:noProof/>
             <w:webHidden/>
           </w:rPr>
-          <w:instrText xml:space="preserve"> PAGEREF _Toc242707529 \h </w:instrText>
+          <w:instrText xml:space="preserve"> PAGEREF _Toc242949012 \h </w:instrText>
         </w:r>
         <w:r>
           <w:rPr>
@@ -2134,7 +2134,7 @@
           <w:lang w:eastAsia="nl-NL"/>
         </w:rPr>
       </w:pPr>
-      <w:hyperlink w:anchor="_Toc242707530" w:history="1">
+      <w:hyperlink w:anchor="_Toc242949013" w:history="1">
         <w:r>
           <w:rPr>
             <w:rStyle w:val="Hyperlink"/>
@@ -2179,7 +2179,7 @@
             <w:noProof/>
             <w:webHidden/>
           </w:rPr>
-          <w:instrText xml:space="preserve"> PAGEREF _Toc242707530 \h </w:instrText>
+          <w:instrText xml:space="preserve"> PAGEREF _Toc242949013 \h </w:instrText>
         </w:r>
         <w:r>
           <w:rPr>
@@ -2226,7 +2226,7 @@
           <w:lang w:eastAsia="nl-NL"/>
         </w:rPr>
       </w:pPr>
-      <w:hyperlink w:anchor="_Toc242707531" w:history="1">
+      <w:hyperlink w:anchor="_Toc242949014" w:history="1">
         <w:r>
           <w:rPr>
             <w:rStyle w:val="Hyperlink"/>
@@ -2271,7 +2271,7 @@
             <w:noProof/>
             <w:webHidden/>
           </w:rPr>
-          <w:instrText xml:space="preserve"> PAGEREF _Toc242707531 \h </w:instrText>
+          <w:instrText xml:space="preserve"> PAGEREF _Toc242949014 \h </w:instrText>
         </w:r>
         <w:r>
           <w:rPr>
@@ -2318,7 +2318,7 @@
           <w:lang w:eastAsia="nl-NL"/>
         </w:rPr>
       </w:pPr>
-      <w:hyperlink w:anchor="_Toc242707532" w:history="1">
+      <w:hyperlink w:anchor="_Toc242949015" w:history="1">
         <w:r>
           <w:rPr>
             <w:rStyle w:val="Hyperlink"/>
@@ -2363,7 +2363,7 @@
             <w:noProof/>
             <w:webHidden/>
           </w:rPr>
-          <w:instrText xml:space="preserve"> PAGEREF _Toc242707532 \h </w:instrText>
+          <w:instrText xml:space="preserve"> PAGEREF _Toc242949015 \h </w:instrText>
         </w:r>
         <w:r>
           <w:rPr>
@@ -2410,7 +2410,7 @@
           <w:lang w:eastAsia="nl-NL"/>
         </w:rPr>
       </w:pPr>
-      <w:hyperlink w:anchor="_Toc242707533" w:history="1">
+      <w:hyperlink w:anchor="_Toc242949016" w:history="1">
         <w:r>
           <w:rPr>
             <w:rStyle w:val="Hyperlink"/>
@@ -2455,7 +2455,7 @@
             <w:noProof/>
             <w:webHidden/>
           </w:rPr>
-          <w:instrText xml:space="preserve"> PAGEREF _Toc242707533 \h </w:instrText>
+          <w:instrText xml:space="preserve"> PAGEREF _Toc242949016 \h </w:instrText>
         </w:r>
         <w:r>
           <w:rPr>
@@ -2502,7 +2502,7 @@
           <w:lang w:eastAsia="nl-NL"/>
         </w:rPr>
       </w:pPr>
-      <w:hyperlink w:anchor="_Toc242707534" w:history="1">
+      <w:hyperlink w:anchor="_Toc242949017" w:history="1">
         <w:r>
           <w:rPr>
             <w:rStyle w:val="Hyperlink"/>
@@ -2547,7 +2547,7 @@
             <w:noProof/>
             <w:webHidden/>
           </w:rPr>
-          <w:instrText xml:space="preserve"> PAGEREF _Toc242707534 \h </w:instrText>
+          <w:instrText xml:space="preserve"> PAGEREF _Toc242949017 \h </w:instrText>
         </w:r>
         <w:r>
           <w:rPr>
@@ -2594,7 +2594,7 @@
           <w:lang w:eastAsia="nl-NL"/>
         </w:rPr>
       </w:pPr>
-      <w:hyperlink w:anchor="_Toc242707535" w:history="1">
+      <w:hyperlink w:anchor="_Toc242949018" w:history="1">
         <w:r>
           <w:rPr>
             <w:rStyle w:val="Hyperlink"/>
@@ -2639,7 +2639,7 @@
             <w:noProof/>
             <w:webHidden/>
           </w:rPr>
-          <w:instrText xml:space="preserve"> PAGEREF _Toc242707535 \h </w:instrText>
+          <w:instrText xml:space="preserve"> PAGEREF _Toc242949018 \h </w:instrText>
         </w:r>
         <w:r>
           <w:rPr>
@@ -2686,7 +2686,7 @@
           <w:lang w:eastAsia="nl-NL"/>
         </w:rPr>
       </w:pPr>
-      <w:hyperlink w:anchor="_Toc242707536" w:history="1">
+      <w:hyperlink w:anchor="_Toc242949019" w:history="1">
         <w:r>
           <w:rPr>
             <w:rStyle w:val="Hyperlink"/>
@@ -2731,7 +2731,7 @@
             <w:noProof/>
             <w:webHidden/>
           </w:rPr>
-          <w:instrText xml:space="preserve"> PAGEREF _Toc242707536 \h </w:instrText>
+          <w:instrText xml:space="preserve"> PAGEREF _Toc242949019 \h </w:instrText>
         </w:r>
         <w:r>
           <w:rPr>
@@ -2751,7 +2751,7 @@
             <w:noProof/>
             <w:webHidden/>
           </w:rPr>
-          <w:t>19</w:t>
+          <w:t>20</w:t>
         </w:r>
         <w:r>
           <w:rPr>
@@ -2778,7 +2778,7 @@
           <w:lang w:eastAsia="nl-NL"/>
         </w:rPr>
       </w:pPr>
-      <w:hyperlink w:anchor="_Toc242707537" w:history="1">
+      <w:hyperlink w:anchor="_Toc242949020" w:history="1">
         <w:r>
           <w:rPr>
             <w:rStyle w:val="Hyperlink"/>
@@ -2839,7 +2839,7 @@
             <w:noProof/>
             <w:webHidden/>
           </w:rPr>
-          <w:instrText xml:space="preserve"> PAGEREF _Toc242707537 \h </w:instrText>
+          <w:instrText xml:space="preserve"> PAGEREF _Toc242949020 \h </w:instrText>
         </w:r>
         <w:r>
           <w:rPr>
@@ -2859,7 +2859,7 @@
             <w:noProof/>
             <w:webHidden/>
           </w:rPr>
-          <w:t>20</w:t>
+          <w:t>21</w:t>
         </w:r>
         <w:r>
           <w:rPr>
@@ -2886,7 +2886,7 @@
           <w:lang w:eastAsia="nl-NL"/>
         </w:rPr>
       </w:pPr>
-      <w:hyperlink w:anchor="_Toc242707538" w:history="1">
+      <w:hyperlink w:anchor="_Toc242949021" w:history="1">
         <w:r>
           <w:rPr>
             <w:rStyle w:val="Hyperlink"/>
@@ -2931,7 +2931,7 @@
             <w:noProof/>
             <w:webHidden/>
           </w:rPr>
-          <w:instrText xml:space="preserve"> PAGEREF _Toc242707538 \h </w:instrText>
+          <w:instrText xml:space="preserve"> PAGEREF _Toc242949021 \h </w:instrText>
         </w:r>
         <w:r>
           <w:rPr>
@@ -2951,7 +2951,7 @@
             <w:noProof/>
             <w:webHidden/>
           </w:rPr>
-          <w:t>20</w:t>
+          <w:t>21</w:t>
         </w:r>
         <w:r>
           <w:rPr>
@@ -2978,7 +2978,7 @@
           <w:lang w:eastAsia="nl-NL"/>
         </w:rPr>
       </w:pPr>
-      <w:hyperlink w:anchor="_Toc242707539" w:history="1">
+      <w:hyperlink w:anchor="_Toc242949022" w:history="1">
         <w:r>
           <w:rPr>
             <w:rStyle w:val="Hyperlink"/>
@@ -3023,7 +3023,7 @@
             <w:noProof/>
             <w:webHidden/>
           </w:rPr>
-          <w:instrText xml:space="preserve"> PAGEREF _Toc242707539 \h </w:instrText>
+          <w:instrText xml:space="preserve"> PAGEREF _Toc242949022 \h </w:instrText>
         </w:r>
         <w:r>
           <w:rPr>
@@ -3043,7 +3043,7 @@
             <w:noProof/>
             <w:webHidden/>
           </w:rPr>
-          <w:t>20</w:t>
+          <w:t>21</w:t>
         </w:r>
         <w:r>
           <w:rPr>
@@ -3070,7 +3070,7 @@
           <w:lang w:eastAsia="nl-NL"/>
         </w:rPr>
       </w:pPr>
-      <w:hyperlink w:anchor="_Toc242707540" w:history="1">
+      <w:hyperlink w:anchor="_Toc242949023" w:history="1">
         <w:r>
           <w:rPr>
             <w:rStyle w:val="Hyperlink"/>
@@ -3115,7 +3115,7 @@
             <w:noProof/>
             <w:webHidden/>
           </w:rPr>
-          <w:instrText xml:space="preserve"> PAGEREF _Toc242707540 \h </w:instrText>
+          <w:instrText xml:space="preserve"> PAGEREF _Toc242949023 \h </w:instrText>
         </w:r>
         <w:r>
           <w:rPr>
@@ -3135,7 +3135,7 @@
             <w:noProof/>
             <w:webHidden/>
           </w:rPr>
-          <w:t>21</w:t>
+          <w:t>22</w:t>
         </w:r>
         <w:r>
           <w:rPr>
@@ -3162,7 +3162,7 @@
           <w:lang w:eastAsia="nl-NL"/>
         </w:rPr>
       </w:pPr>
-      <w:hyperlink w:anchor="_Toc242707541" w:history="1">
+      <w:hyperlink w:anchor="_Toc242949024" w:history="1">
         <w:r>
           <w:rPr>
             <w:rStyle w:val="Hyperlink"/>
@@ -3223,7 +3223,7 @@
             <w:noProof/>
             <w:webHidden/>
           </w:rPr>
-          <w:instrText xml:space="preserve"> PAGEREF _Toc242707541 \h </w:instrText>
+          <w:instrText xml:space="preserve"> PAGEREF _Toc242949024 \h </w:instrText>
         </w:r>
         <w:r>
           <w:rPr>
@@ -3243,7 +3243,7 @@
             <w:noProof/>
             <w:webHidden/>
           </w:rPr>
-          <w:t>22</w:t>
+          <w:t>23</w:t>
         </w:r>
         <w:r>
           <w:rPr>
@@ -3270,7 +3270,7 @@
           <w:lang w:eastAsia="nl-NL"/>
         </w:rPr>
       </w:pPr>
-      <w:hyperlink w:anchor="_Toc242707542" w:history="1">
+      <w:hyperlink w:anchor="_Toc242949025" w:history="1">
         <w:r>
           <w:rPr>
             <w:rStyle w:val="Hyperlink"/>
@@ -3315,7 +3315,7 @@
             <w:noProof/>
             <w:webHidden/>
           </w:rPr>
-          <w:instrText xml:space="preserve"> PAGEREF _Toc242707542 \h </w:instrText>
+          <w:instrText xml:space="preserve"> PAGEREF _Toc242949025 \h </w:instrText>
         </w:r>
         <w:r>
           <w:rPr>
@@ -3335,7 +3335,7 @@
             <w:noProof/>
             <w:webHidden/>
           </w:rPr>
-          <w:t>22</w:t>
+          <w:t>23</w:t>
         </w:r>
         <w:r>
           <w:rPr>
@@ -3362,7 +3362,7 @@
           <w:lang w:eastAsia="nl-NL"/>
         </w:rPr>
       </w:pPr>
-      <w:hyperlink w:anchor="_Toc242707543" w:history="1">
+      <w:hyperlink w:anchor="_Toc242949026" w:history="1">
         <w:r>
           <w:rPr>
             <w:rStyle w:val="Hyperlink"/>
@@ -3407,7 +3407,7 @@
             <w:noProof/>
             <w:webHidden/>
           </w:rPr>
-          <w:instrText xml:space="preserve"> PAGEREF _Toc242707543 \h </w:instrText>
+          <w:instrText xml:space="preserve"> PAGEREF _Toc242949026 \h </w:instrText>
         </w:r>
         <w:r>
           <w:rPr>
@@ -3427,7 +3427,7 @@
             <w:noProof/>
             <w:webHidden/>
           </w:rPr>
-          <w:t>23</w:t>
+          <w:t>24</w:t>
         </w:r>
         <w:r>
           <w:rPr>
@@ -3454,7 +3454,7 @@
           <w:lang w:eastAsia="nl-NL"/>
         </w:rPr>
       </w:pPr>
-      <w:hyperlink w:anchor="_Toc242707544" w:history="1">
+      <w:hyperlink w:anchor="_Toc242949027" w:history="1">
         <w:r>
           <w:rPr>
             <w:rStyle w:val="Hyperlink"/>
@@ -3501,7 +3501,7 @@
             <w:noProof/>
             <w:webHidden/>
           </w:rPr>
-          <w:instrText xml:space="preserve"> PAGEREF _Toc242707544 \h </w:instrText>
+          <w:instrText xml:space="preserve"> PAGEREF _Toc242949027 \h </w:instrText>
         </w:r>
         <w:r>
           <w:rPr>
@@ -3521,7 +3521,7 @@
             <w:noProof/>
             <w:webHidden/>
           </w:rPr>
-          <w:t>29</w:t>
+          <w:t>31</w:t>
         </w:r>
         <w:r>
           <w:rPr>
@@ -3548,7 +3548,7 @@
           <w:lang w:eastAsia="nl-NL"/>
         </w:rPr>
       </w:pPr>
-      <w:hyperlink w:anchor="_Toc242707545" w:history="1">
+      <w:hyperlink w:anchor="_Toc242949028" w:history="1">
         <w:r>
           <w:rPr>
             <w:rStyle w:val="Hyperlink"/>
@@ -3595,7 +3595,7 @@
             <w:noProof/>
             <w:webHidden/>
           </w:rPr>
-          <w:instrText xml:space="preserve"> PAGEREF _Toc242707545 \h </w:instrText>
+          <w:instrText xml:space="preserve"> PAGEREF _Toc242949028 \h </w:instrText>
         </w:r>
         <w:r>
           <w:rPr>
@@ -3615,7 +3615,7 @@
             <w:noProof/>
             <w:webHidden/>
           </w:rPr>
-          <w:t>30</w:t>
+          <w:t>31</w:t>
         </w:r>
         <w:r>
           <w:rPr>
@@ -3642,7 +3642,7 @@
           <w:lang w:eastAsia="nl-NL"/>
         </w:rPr>
       </w:pPr>
-      <w:hyperlink w:anchor="_Toc242707546" w:history="1">
+      <w:hyperlink w:anchor="_Toc242949029" w:history="1">
         <w:r>
           <w:rPr>
             <w:rStyle w:val="Hyperlink"/>
@@ -3689,7 +3689,7 @@
             <w:noProof/>
             <w:webHidden/>
           </w:rPr>
-          <w:instrText xml:space="preserve"> PAGEREF _Toc242707546 \h </w:instrText>
+          <w:instrText xml:space="preserve"> PAGEREF _Toc242949029 \h </w:instrText>
         </w:r>
         <w:r>
           <w:rPr>
@@ -3709,7 +3709,7 @@
             <w:noProof/>
             <w:webHidden/>
           </w:rPr>
-          <w:t>30</w:t>
+          <w:t>31</w:t>
         </w:r>
         <w:r>
           <w:rPr>
@@ -3736,7 +3736,7 @@
           <w:lang w:eastAsia="nl-NL"/>
         </w:rPr>
       </w:pPr>
-      <w:hyperlink w:anchor="_Toc242707547" w:history="1">
+      <w:hyperlink w:anchor="_Toc242949030" w:history="1">
         <w:r>
           <w:rPr>
             <w:rStyle w:val="Hyperlink"/>
@@ -3783,7 +3783,7 @@
             <w:noProof/>
             <w:webHidden/>
           </w:rPr>
-          <w:instrText xml:space="preserve"> PAGEREF _Toc242707547 \h </w:instrText>
+          <w:instrText xml:space="preserve"> PAGEREF _Toc242949030 \h </w:instrText>
         </w:r>
         <w:r>
           <w:rPr>
@@ -3803,7 +3803,7 @@
             <w:noProof/>
             <w:webHidden/>
           </w:rPr>
-          <w:t>30</w:t>
+          <w:t>31</w:t>
         </w:r>
         <w:r>
           <w:rPr>
@@ -3830,7 +3830,7 @@
           <w:lang w:eastAsia="nl-NL"/>
         </w:rPr>
       </w:pPr>
-      <w:hyperlink w:anchor="_Toc242707548" w:history="1">
+      <w:hyperlink w:anchor="_Toc242949031" w:history="1">
         <w:r>
           <w:rPr>
             <w:rStyle w:val="Hyperlink"/>
@@ -3877,7 +3877,7 @@
             <w:noProof/>
             <w:webHidden/>
           </w:rPr>
-          <w:instrText xml:space="preserve"> PAGEREF _Toc242707548 \h </w:instrText>
+          <w:instrText xml:space="preserve"> PAGEREF _Toc242949031 \h </w:instrText>
         </w:r>
         <w:r>
           <w:rPr>
@@ -3897,7 +3897,7 @@
             <w:noProof/>
             <w:webHidden/>
           </w:rPr>
-          <w:t>30</w:t>
+          <w:t>31</w:t>
         </w:r>
         <w:r>
           <w:rPr>
@@ -3924,7 +3924,7 @@
           <w:lang w:eastAsia="nl-NL"/>
         </w:rPr>
       </w:pPr>
-      <w:hyperlink w:anchor="_Toc242707549" w:history="1">
+      <w:hyperlink w:anchor="_Toc242949032" w:history="1">
         <w:r>
           <w:rPr>
             <w:rStyle w:val="Hyperlink"/>
@@ -3971,7 +3971,7 @@
             <w:noProof/>
             <w:webHidden/>
           </w:rPr>
-          <w:instrText xml:space="preserve"> PAGEREF _Toc242707549 \h </w:instrText>
+          <w:instrText xml:space="preserve"> PAGEREF _Toc242949032 \h </w:instrText>
         </w:r>
         <w:r>
           <w:rPr>
@@ -3991,7 +3991,7 @@
             <w:noProof/>
             <w:webHidden/>
           </w:rPr>
-          <w:t>30</w:t>
+          <w:t>32</w:t>
         </w:r>
         <w:r>
           <w:rPr>
@@ -4018,7 +4018,7 @@
           <w:lang w:eastAsia="nl-NL"/>
         </w:rPr>
       </w:pPr>
-      <w:hyperlink w:anchor="_Toc242707550" w:history="1">
+      <w:hyperlink w:anchor="_Toc242949033" w:history="1">
         <w:r>
           <w:rPr>
             <w:rStyle w:val="Hyperlink"/>
@@ -4063,7 +4063,7 @@
             <w:noProof/>
             <w:webHidden/>
           </w:rPr>
-          <w:instrText xml:space="preserve"> PAGEREF _Toc242707550 \h </w:instrText>
+          <w:instrText xml:space="preserve"> PAGEREF _Toc242949033 \h </w:instrText>
         </w:r>
         <w:r>
           <w:rPr>
@@ -4083,7 +4083,7 @@
             <w:noProof/>
             <w:webHidden/>
           </w:rPr>
-          <w:t>31</w:t>
+          <w:t>32</w:t>
         </w:r>
         <w:r>
           <w:rPr>
@@ -4110,7 +4110,7 @@
           <w:lang w:eastAsia="nl-NL"/>
         </w:rPr>
       </w:pPr>
-      <w:hyperlink w:anchor="_Toc242707551" w:history="1">
+      <w:hyperlink w:anchor="_Toc242949034" w:history="1">
         <w:r>
           <w:rPr>
             <w:rStyle w:val="Hyperlink"/>
@@ -4155,7 +4155,7 @@
             <w:noProof/>
             <w:webHidden/>
           </w:rPr>
-          <w:instrText xml:space="preserve"> PAGEREF _Toc242707551 \h </w:instrText>
+          <w:instrText xml:space="preserve"> PAGEREF _Toc242949034 \h </w:instrText>
         </w:r>
         <w:r>
           <w:rPr>
@@ -4175,7 +4175,7 @@
             <w:noProof/>
             <w:webHidden/>
           </w:rPr>
-          <w:t>31</w:t>
+          <w:t>32</w:t>
         </w:r>
         <w:r>
           <w:rPr>
@@ -4202,7 +4202,7 @@
           <w:lang w:eastAsia="nl-NL"/>
         </w:rPr>
       </w:pPr>
-      <w:hyperlink w:anchor="_Toc242707552" w:history="1">
+      <w:hyperlink w:anchor="_Toc242949035" w:history="1">
         <w:r>
           <w:rPr>
             <w:rStyle w:val="Hyperlink"/>
@@ -4279,7 +4279,7 @@
             <w:noProof/>
             <w:webHidden/>
           </w:rPr>
-          <w:instrText xml:space="preserve"> PAGEREF _Toc242707552 \h </w:instrText>
+          <w:instrText xml:space="preserve"> PAGEREF _Toc242949035 \h </w:instrText>
         </w:r>
         <w:r>
           <w:rPr>
@@ -4299,7 +4299,7 @@
             <w:noProof/>
             <w:webHidden/>
           </w:rPr>
-          <w:t>31</w:t>
+          <w:t>33</w:t>
         </w:r>
         <w:r>
           <w:rPr>
@@ -4326,7 +4326,7 @@
           <w:lang w:eastAsia="nl-NL"/>
         </w:rPr>
       </w:pPr>
-      <w:hyperlink w:anchor="_Toc242707553" w:history="1">
+      <w:hyperlink w:anchor="_Toc242949036" w:history="1">
         <w:r>
           <w:rPr>
             <w:rStyle w:val="Hyperlink"/>
@@ -4371,7 +4371,7 @@
             <w:noProof/>
             <w:webHidden/>
           </w:rPr>
-          <w:instrText xml:space="preserve"> PAGEREF _Toc242707553 \h </w:instrText>
+          <w:instrText xml:space="preserve"> PAGEREF _Toc242949036 \h </w:instrText>
         </w:r>
         <w:r>
           <w:rPr>
@@ -4391,7 +4391,7 @@
             <w:noProof/>
             <w:webHidden/>
           </w:rPr>
-          <w:t>32</w:t>
+          <w:t>33</w:t>
         </w:r>
         <w:r>
           <w:rPr>
@@ -4418,7 +4418,7 @@
           <w:lang w:eastAsia="nl-NL"/>
         </w:rPr>
       </w:pPr>
-      <w:hyperlink w:anchor="_Toc242707554" w:history="1">
+      <w:hyperlink w:anchor="_Toc242949037" w:history="1">
         <w:r>
           <w:rPr>
             <w:rStyle w:val="Hyperlink"/>
@@ -4463,7 +4463,7 @@
             <w:noProof/>
             <w:webHidden/>
           </w:rPr>
-          <w:instrText xml:space="preserve"> PAGEREF _Toc242707554 \h </w:instrText>
+          <w:instrText xml:space="preserve"> PAGEREF _Toc242949037 \h </w:instrText>
         </w:r>
         <w:r>
           <w:rPr>
@@ -4483,7 +4483,7 @@
             <w:noProof/>
             <w:webHidden/>
           </w:rPr>
-          <w:t>33</w:t>
+          <w:t>34</w:t>
         </w:r>
         <w:r>
           <w:rPr>
@@ -4510,7 +4510,7 @@
           <w:lang w:eastAsia="nl-NL"/>
         </w:rPr>
       </w:pPr>
-      <w:hyperlink w:anchor="_Toc242707555" w:history="1">
+      <w:hyperlink w:anchor="_Toc242949038" w:history="1">
         <w:r>
           <w:rPr>
             <w:rStyle w:val="Hyperlink"/>
@@ -4555,7 +4555,7 @@
             <w:noProof/>
             <w:webHidden/>
           </w:rPr>
-          <w:instrText xml:space="preserve"> PAGEREF _Toc242707555 \h </w:instrText>
+          <w:instrText xml:space="preserve"> PAGEREF _Toc242949038 \h </w:instrText>
         </w:r>
         <w:r>
           <w:rPr>
@@ -4575,7 +4575,7 @@
             <w:noProof/>
             <w:webHidden/>
           </w:rPr>
-          <w:t>33</w:t>
+          <w:t>34</w:t>
         </w:r>
         <w:r>
           <w:rPr>
@@ -4602,7 +4602,7 @@
           <w:lang w:eastAsia="nl-NL"/>
         </w:rPr>
       </w:pPr>
-      <w:hyperlink w:anchor="_Toc242707556" w:history="1">
+      <w:hyperlink w:anchor="_Toc242949039" w:history="1">
         <w:r>
           <w:rPr>
             <w:rStyle w:val="Hyperlink"/>
@@ -4647,7 +4647,7 @@
             <w:noProof/>
             <w:webHidden/>
           </w:rPr>
-          <w:instrText xml:space="preserve"> PAGEREF _Toc242707556 \h </w:instrText>
+          <w:instrText xml:space="preserve"> PAGEREF _Toc242949039 \h </w:instrText>
         </w:r>
         <w:r>
           <w:rPr>
@@ -4667,7 +4667,7 @@
             <w:noProof/>
             <w:webHidden/>
           </w:rPr>
-          <w:t>33</w:t>
+          <w:t>34</w:t>
         </w:r>
         <w:r>
           <w:rPr>
@@ -4694,7 +4694,7 @@
           <w:lang w:eastAsia="nl-NL"/>
         </w:rPr>
       </w:pPr>
-      <w:hyperlink w:anchor="_Toc242707557" w:history="1">
+      <w:hyperlink w:anchor="_Toc242949040" w:history="1">
         <w:r>
           <w:rPr>
             <w:rStyle w:val="Hyperlink"/>
@@ -4739,7 +4739,7 @@
             <w:noProof/>
             <w:webHidden/>
           </w:rPr>
-          <w:instrText xml:space="preserve"> PAGEREF _Toc242707557 \h </w:instrText>
+          <w:instrText xml:space="preserve"> PAGEREF _Toc242949040 \h </w:instrText>
         </w:r>
         <w:r>
           <w:rPr>
@@ -4759,7 +4759,7 @@
             <w:noProof/>
             <w:webHidden/>
           </w:rPr>
-          <w:t>33</w:t>
+          <w:t>34</w:t>
         </w:r>
         <w:r>
           <w:rPr>
@@ -4786,7 +4786,7 @@
           <w:lang w:eastAsia="nl-NL"/>
         </w:rPr>
       </w:pPr>
-      <w:hyperlink w:anchor="_Toc242707558" w:history="1">
+      <w:hyperlink w:anchor="_Toc242949041" w:history="1">
         <w:r>
           <w:rPr>
             <w:rStyle w:val="Hyperlink"/>
@@ -4831,7 +4831,7 @@
             <w:noProof/>
             <w:webHidden/>
           </w:rPr>
-          <w:instrText xml:space="preserve"> PAGEREF _Toc242707558 \h </w:instrText>
+          <w:instrText xml:space="preserve"> PAGEREF _Toc242949041 \h </w:instrText>
         </w:r>
         <w:r>
           <w:rPr>
@@ -4851,7 +4851,7 @@
             <w:noProof/>
             <w:webHidden/>
           </w:rPr>
-          <w:t>33</w:t>
+          <w:t>34</w:t>
         </w:r>
         <w:r>
           <w:rPr>
@@ -4878,7 +4878,7 @@
           <w:lang w:eastAsia="nl-NL"/>
         </w:rPr>
       </w:pPr>
-      <w:hyperlink w:anchor="_Toc242707559" w:history="1">
+      <w:hyperlink w:anchor="_Toc242949042" w:history="1">
         <w:r>
           <w:rPr>
             <w:rStyle w:val="Hyperlink"/>
@@ -4923,7 +4923,7 @@
             <w:noProof/>
             <w:webHidden/>
           </w:rPr>
-          <w:instrText xml:space="preserve"> PAGEREF _Toc242707559 \h </w:instrText>
+          <w:instrText xml:space="preserve"> PAGEREF _Toc242949042 \h </w:instrText>
         </w:r>
         <w:r>
           <w:rPr>
@@ -4943,7 +4943,7 @@
             <w:noProof/>
             <w:webHidden/>
           </w:rPr>
-          <w:t>35</w:t>
+          <w:t>36</w:t>
         </w:r>
         <w:r>
           <w:rPr>
@@ -4970,7 +4970,7 @@
           <w:lang w:eastAsia="nl-NL"/>
         </w:rPr>
       </w:pPr>
-      <w:hyperlink w:anchor="_Toc242707560" w:history="1">
+      <w:hyperlink w:anchor="_Toc242949043" w:history="1">
         <w:r>
           <w:rPr>
             <w:rStyle w:val="Hyperlink"/>
@@ -5015,7 +5015,7 @@
             <w:noProof/>
             <w:webHidden/>
           </w:rPr>
-          <w:instrText xml:space="preserve"> PAGEREF _Toc242707560 \h </w:instrText>
+          <w:instrText xml:space="preserve"> PAGEREF _Toc242949043 \h </w:instrText>
         </w:r>
         <w:r>
           <w:rPr>
@@ -5035,7 +5035,7 @@
             <w:noProof/>
             <w:webHidden/>
           </w:rPr>
-          <w:t>37</w:t>
+          <w:t>38</w:t>
         </w:r>
         <w:r>
           <w:rPr>
@@ -5062,7 +5062,7 @@
           <w:lang w:eastAsia="nl-NL"/>
         </w:rPr>
       </w:pPr>
-      <w:hyperlink w:anchor="_Toc242707561" w:history="1">
+      <w:hyperlink w:anchor="_Toc242949044" w:history="1">
         <w:r>
           <w:rPr>
             <w:rStyle w:val="Hyperlink"/>
@@ -5107,7 +5107,7 @@
             <w:noProof/>
             <w:webHidden/>
           </w:rPr>
-          <w:instrText xml:space="preserve"> PAGEREF _Toc242707561 \h </w:instrText>
+          <w:instrText xml:space="preserve"> PAGEREF _Toc242949044 \h </w:instrText>
         </w:r>
         <w:r>
           <w:rPr>
@@ -5127,7 +5127,7 @@
             <w:noProof/>
             <w:webHidden/>
           </w:rPr>
-          <w:t>38</w:t>
+          <w:t>39</w:t>
         </w:r>
         <w:r>
           <w:rPr>
@@ -5160,7 +5160,7 @@
         </w:numPr>
       </w:pPr>
       <w:bookmarkStart w:id="1" w:name="k1"/>
-      <w:bookmarkStart w:id="2" w:name="_Toc242707509"/>
+      <w:bookmarkStart w:id="2" w:name="_Toc242948992"/>
       <w:r>
         <w:t>DOEL VAN DE APPLICATIE.</w:t>
       </w:r>
@@ -5242,7 +5242,7 @@
         </w:numPr>
       </w:pPr>
       <w:bookmarkStart w:id="3" w:name="k2"/>
-      <w:bookmarkStart w:id="4" w:name="_Toc242707510"/>
+      <w:bookmarkStart w:id="4" w:name="_Toc242948993"/>
       <w:r>
         <w:t>BESTANDEN.</w:t>
       </w:r>
@@ -5506,7 +5506,7 @@
                 <w:sz w:val="16"/>
                 <w:szCs w:val="16"/>
               </w:rPr>
-              <w:t>) en na hoeveel tijd zonder invoer de beheerder wordt uitgelogd (</w:t>
+              <w:t>), na hoeveel tijd zonder invoer de beheerder wordt uitgelogd (</w:t>
             </w:r>
             <w:r>
               <w:rPr>
@@ -5521,7 +5521,37 @@
                 <w:sz w:val="16"/>
                 <w:szCs w:val="16"/>
               </w:rPr>
-              <w:t>, 5 minuten)</w:t>
+              <w:t>, 5 minuten) en na hoeveel tijd zonder invoer het productvenster vanzelf sluit (</w:t>
+            </w:r>
+            <w:r>
+              <w:rPr>
+                <w:rFonts w:ascii="Consolas" w:hAnsi="Consolas" w:cs="Consolas"/>
+                <w:sz w:val="14"/>
+                <w:shd w:val="clear" w:color="auto" w:fill="EEF4F2"/>
+              </w:rPr>
+              <w:t>EMPLOYEE_IDLE_CLOSE_MS</w:t>
+            </w:r>
+            <w:r>
+              <w:rPr>
+                <w:sz w:val="16"/>
+                <w:szCs w:val="16"/>
+              </w:rPr>
+              <w:t xml:space="preserve">, 75 seconden, met de waarschuwing </w:t>
+            </w:r>
+            <w:r>
+              <w:rPr>
+                <w:rFonts w:ascii="Consolas" w:hAnsi="Consolas" w:cs="Consolas"/>
+                <w:sz w:val="14"/>
+                <w:shd w:val="clear" w:color="auto" w:fill="EEF4F2"/>
+              </w:rPr>
+              <w:t>EMPLOYEE_IDLE_WARNING_MS</w:t>
+            </w:r>
+            <w:r>
+              <w:rPr>
+                <w:sz w:val="16"/>
+                <w:szCs w:val="16"/>
+              </w:rPr>
+              <w:t>, de laatste 10 seconden)</w:t>
             </w:r>
           </w:p>
         </w:tc>
@@ -7135,7 +7165,7 @@
                 <w:sz w:val="16"/>
                 <w:szCs w:val="16"/>
               </w:rPr>
-              <w:t>Unit tests (611) voor de regels, de opslag, de export, het thema, de welkom- en gezichtsherkenningsfuncties, herkennen met de pas, de controller, de beveiliging en regressietests voor opgeloste bugs</w:t>
+              <w:t>Unit tests (652) voor de regels, de opslag, de export, het thema, de welkom- en gezichtsherkenningsfuncties, herkennen met de pas, de controller, de beveiliging en regressietests voor opgeloste bugs</w:t>
             </w:r>
           </w:p>
         </w:tc>
@@ -7618,7 +7648,7 @@
                 <w:sz w:val="16"/>
                 <w:szCs w:val="16"/>
               </w:rPr>
-              <w:t xml:space="preserve"> als scan ziet (Enter, Tab of stilte na de laatste toets, niet bij gewoon typen of een te korte code), het normaliseren van het pasnummer, het productvenster of de melding na een scan, geen herkenning als er een venster open is (wel wordt de Enter van de scan tegengehouden), het zoekveld na een scan, de pas koppelen in het medewerkersformulier (uniek, alleen letters en cijfers, leeg = geen pas), de controle en migratie van </w:t>
+              <w:t xml:space="preserve"> als scan ziet (Enter, Tab of stilte na de laatste toets, niet bij gewoon typen of een te korte code), het normaliseren van het pasnummer, het productvenster of de melding na een scan, geen herkenning als er een ander venster open is (met de melding "Sluit eerst het open venster om je pas te gebruiken.", en de Enter van de scan wordt tegengehouden), het zoekveld na een scan, de pas koppelen in het medewerkersformulier (uniek, alleen letters en cijfers, leeg = geen pas), de controle en migratie van </w:t>
             </w:r>
             <w:r>
               <w:rPr>
@@ -7796,7 +7826,7 @@
                 <w:sz w:val="14"/>
                 <w:shd w:val="clear" w:color="auto" w:fill="EEF4F2"/>
               </w:rPr>
-              <w:t>tests/review-oktober.test.js</w:t>
+              <w:t>tests/ux-review.test.js</w:t>
             </w:r>
           </w:p>
         </w:tc>
@@ -7813,7 +7843,7 @@
                 <w:sz w:val="16"/>
                 <w:szCs w:val="16"/>
               </w:rPr>
-              <w:t xml:space="preserve">Regressietests voor de review van oktober 2026 (D1 t/m D7, U1 t/m U7, R1 t/m R3 in de naam van iedere test): beschadigde lijsten en volle opslag, dubbele passen, niet-bestaande datums, pasnummers gelijk maken, mislukt wissen, gezichtsherkenning alleen met actieve medewerkers, een scan in het veld </w:t>
+              <w:t xml:space="preserve">Tests voor de verbeteringen uit de UX-review van oktober 2026 (UX 1 t/m UX 12 in de naam van iedere test): het productvenster dat na 75 seconden vanzelf sluit (met een nep-klok, de waarschuwing en iedere invoer die opnieuw begint), een pas terwijl een venster open is, de knopbalk met </w:t>
             </w:r>
             <w:r>
               <w:rPr>
@@ -7821,14 +7851,14 @@
                 <w:sz w:val="14"/>
                 <w:shd w:val="clear" w:color="auto" w:fill="EEF4F2"/>
               </w:rPr>
-              <w:t>Pasnummer</w:t>
+              <w:t>Registreren</w:t>
             </w:r>
             <w:r>
               <w:rPr>
                 <w:sz w:val="16"/>
                 <w:szCs w:val="16"/>
               </w:rPr>
-              <w:t xml:space="preserve"> en in het bedrijfsfilter, dubbelklik op </w:t>
+              <w:t xml:space="preserve">, zoekveld en bedrijfsfilter leeg na registreren, de compacte banner, de pashint, de opmaak van een gekozen product, de grootte van knoppen, de statusregel en de meldingsregio's voor schermlezers, de leesbaarheid, de nieuwe teksten en </w:t>
             </w:r>
             <w:r>
               <w:rPr>
@@ -7843,7 +7873,7 @@
                 <w:sz w:val="16"/>
                 <w:szCs w:val="16"/>
               </w:rPr>
-              <w:t>, een ingedrukt gehouden Enter, de focus na opslaan en (de)activeren, het datumveld na middernacht, toegankelijkheid (live region, tabbladen, bedrijfsfilter) en de cijfervelden</w:t>
+              <w:t xml:space="preserve"> zonder keuze</w:t>
             </w:r>
           </w:p>
         </w:tc>
@@ -7866,7 +7896,7 @@
                 <w:sz w:val="14"/>
                 <w:shd w:val="clear" w:color="auto" w:fill="EEF4F2"/>
               </w:rPr>
-              <w:t>.gitattributes</w:t>
+              <w:t>tests/review-oktober.test.js</w:t>
             </w:r>
           </w:p>
         </w:tc>
@@ -7883,7 +7913,7 @@
                 <w:sz w:val="16"/>
                 <w:szCs w:val="16"/>
               </w:rPr>
-              <w:t xml:space="preserve">Zorgt dat Git de bestanden in </w:t>
+              <w:t xml:space="preserve">Regressietests voor de review van oktober 2026 (D1 t/m D7, U1 t/m U7, R1 t/m R3 in de naam van iedere test): beschadigde lijsten en volle opslag, dubbele passen, niet-bestaande datums, pasnummers gelijk maken, mislukt wissen, gezichtsherkenning alleen met actieve medewerkers, een scan in het veld </w:t>
             </w:r>
             <w:r>
               <w:rPr>
@@ -7891,14 +7921,14 @@
                 <w:sz w:val="14"/>
                 <w:shd w:val="clear" w:color="auto" w:fill="EEF4F2"/>
               </w:rPr>
-              <w:t>assets/vendor/</w:t>
+              <w:t>Pasnummer</w:t>
             </w:r>
             <w:r>
               <w:rPr>
                 <w:sz w:val="16"/>
                 <w:szCs w:val="16"/>
               </w:rPr>
-              <w:t xml:space="preserve"> en </w:t>
+              <w:t xml:space="preserve"> en in het bedrijfsfilter, dubbelklik op </w:t>
             </w:r>
             <w:r>
               <w:rPr>
@@ -7906,14 +7936,14 @@
                 <w:sz w:val="14"/>
                 <w:shd w:val="clear" w:color="auto" w:fill="EEF4F2"/>
               </w:rPr>
-              <w:t>assets/fonts/</w:t>
+              <w:t>Registreren</w:t>
             </w:r>
             <w:r>
               <w:rPr>
                 <w:sz w:val="16"/>
                 <w:szCs w:val="16"/>
               </w:rPr>
-              <w:t xml:space="preserve"> niet aanpast (geen omzetting van regeleinden), zodat de controlegetallen blijven kloppen</w:t>
+              <w:t>, een ingedrukt gehouden Enter, de focus na opslaan en (de)activeren, het datumveld na middernacht, toegankelijkheid (live region, tabbladen, bedrijfsfilter) en de cijfervelden</w:t>
             </w:r>
           </w:p>
         </w:tc>
@@ -7936,7 +7966,7 @@
                 <w:sz w:val="14"/>
                 <w:shd w:val="clear" w:color="auto" w:fill="EEF4F2"/>
               </w:rPr>
-              <w:t>tests/e2e/</w:t>
+              <w:t>.gitattributes</w:t>
             </w:r>
           </w:p>
         </w:tc>
@@ -7953,7 +7983,7 @@
                 <w:sz w:val="16"/>
                 <w:szCs w:val="16"/>
               </w:rPr>
-              <w:t xml:space="preserve">Browsertests (end-to-end): </w:t>
+              <w:t xml:space="preserve">Zorgt dat Git de bestanden in </w:t>
             </w:r>
             <w:r>
               <w:rPr>
@@ -7961,14 +7991,14 @@
                 <w:sz w:val="14"/>
                 <w:shd w:val="clear" w:color="auto" w:fill="EEF4F2"/>
               </w:rPr>
-              <w:t>app.e2e.test.js</w:t>
+              <w:t>assets/vendor/</w:t>
             </w:r>
             <w:r>
               <w:rPr>
                 <w:sz w:val="16"/>
                 <w:szCs w:val="16"/>
               </w:rPr>
-              <w:t xml:space="preserve"> test de echte pagina in headless Edge of Chrome (13 tests: laden zonder fouten, zoeken, registreren (daarna bij kiezen op naam geen "welkom terug"), Escape en focus, inloggen, thema, pas koppelen en herkennen (ook een tweede scan in het veld </w:t>
+              <w:t xml:space="preserve"> en </w:t>
             </w:r>
             <w:r>
               <w:rPr>
@@ -7976,67 +8006,14 @@
                 <w:sz w:val="14"/>
                 <w:shd w:val="clear" w:color="auto" w:fill="EEF4F2"/>
               </w:rPr>
-              <w:t>Pasnummer</w:t>
+              <w:t>assets/fonts/</w:t>
             </w:r>
             <w:r>
               <w:rPr>
                 <w:sz w:val="16"/>
                 <w:szCs w:val="16"/>
               </w:rPr>
-              <w:t xml:space="preserve">), CSV-export, een dubbelklik op </w:t>
-            </w:r>
-            <w:r>
-              <w:rPr>
-                <w:rFonts w:ascii="Consolas" w:hAnsi="Consolas" w:cs="Consolas"/>
-                <w:sz w:val="14"/>
-                <w:shd w:val="clear" w:color="auto" w:fill="EEF4F2"/>
-              </w:rPr>
-              <w:t>Registreren</w:t>
-            </w:r>
-            <w:r>
-              <w:rPr>
-                <w:sz w:val="16"/>
-                <w:szCs w:val="16"/>
-              </w:rPr>
-              <w:t xml:space="preserve">, een scan in het bedrijfsfilter, de focus na opslaan en (de)activeren in het beheer, en letters in een cijferveld), </w:t>
-            </w:r>
-            <w:r>
-              <w:rPr>
-                <w:rFonts w:ascii="Consolas" w:hAnsi="Consolas" w:cs="Consolas"/>
-                <w:sz w:val="14"/>
-                <w:shd w:val="clear" w:color="auto" w:fill="EEF4F2"/>
-              </w:rPr>
-              <w:t>browser.js</w:t>
-            </w:r>
-            <w:r>
-              <w:rPr>
-                <w:sz w:val="16"/>
-                <w:szCs w:val="16"/>
-              </w:rPr>
-              <w:t xml:space="preserve"> bevat de webserver en de besturing van de browser via het Chrome DevTools Protocol. Draaien met </w:t>
-            </w:r>
-            <w:r>
-              <w:rPr>
-                <w:rFonts w:ascii="Consolas" w:hAnsi="Consolas" w:cs="Consolas"/>
-                <w:sz w:val="14"/>
-                <w:shd w:val="clear" w:color="auto" w:fill="EEF4F2"/>
-              </w:rPr>
-              <w:t>npm run test:e2e</w:t>
-            </w:r>
-            <w:r>
-              <w:rPr>
-                <w:sz w:val="16"/>
-                <w:szCs w:val="16"/>
-              </w:rPr>
-              <w:t xml:space="preserve">, zonder npm-pakketten. Een andere browser kies je met </w:t>
-            </w:r>
-            <w:r>
-              <w:rPr>
-                <w:rFonts w:ascii="Consolas" w:hAnsi="Consolas" w:cs="Consolas"/>
-                <w:sz w:val="14"/>
-                <w:shd w:val="clear" w:color="auto" w:fill="EEF4F2"/>
-              </w:rPr>
-              <w:t>BROWSER_PATH</w:t>
+              <w:t xml:space="preserve"> niet aanpast (geen omzetting van regeleinden), zodat de controlegetallen blijven kloppen</w:t>
             </w:r>
           </w:p>
         </w:tc>
@@ -8059,7 +8036,7 @@
                 <w:sz w:val="14"/>
                 <w:shd w:val="clear" w:color="auto" w:fill="EEF4F2"/>
               </w:rPr>
-              <w:t>.github/workflows/ci.yml</w:t>
+              <w:t>tests/e2e/</w:t>
             </w:r>
           </w:p>
         </w:tc>
@@ -8076,6 +8053,159 @@
                 <w:sz w:val="16"/>
                 <w:szCs w:val="16"/>
               </w:rPr>
+              <w:t xml:space="preserve">Browsertests (end-to-end): </w:t>
+            </w:r>
+            <w:r>
+              <w:rPr>
+                <w:rFonts w:ascii="Consolas" w:hAnsi="Consolas" w:cs="Consolas"/>
+                <w:sz w:val="14"/>
+                <w:shd w:val="clear" w:color="auto" w:fill="EEF4F2"/>
+              </w:rPr>
+              <w:t>app.e2e.test.js</w:t>
+            </w:r>
+            <w:r>
+              <w:rPr>
+                <w:sz w:val="16"/>
+                <w:szCs w:val="16"/>
+              </w:rPr>
+              <w:t xml:space="preserve"> test de echte pagina in headless Edge of Chrome (17 tests: laden zonder fouten, zoeken, registreren (daarna bij kiezen op naam geen "welkom terug"), </w:t>
+            </w:r>
+            <w:r>
+              <w:rPr>
+                <w:rFonts w:ascii="Consolas" w:hAnsi="Consolas" w:cs="Consolas"/>
+                <w:sz w:val="14"/>
+                <w:shd w:val="clear" w:color="auto" w:fill="EEF4F2"/>
+              </w:rPr>
+              <w:t>Registreren</w:t>
+            </w:r>
+            <w:r>
+              <w:rPr>
+                <w:sz w:val="16"/>
+                <w:szCs w:val="16"/>
+              </w:rPr>
+              <w:t xml:space="preserve"> zonder keuze, Escape en focus, inloggen, thema, pas koppelen en herkennen (ook een tweede scan in het veld </w:t>
+            </w:r>
+            <w:r>
+              <w:rPr>
+                <w:rFonts w:ascii="Consolas" w:hAnsi="Consolas" w:cs="Consolas"/>
+                <w:sz w:val="14"/>
+                <w:shd w:val="clear" w:color="auto" w:fill="EEF4F2"/>
+              </w:rPr>
+              <w:t>Pasnummer</w:t>
+            </w:r>
+            <w:r>
+              <w:rPr>
+                <w:sz w:val="16"/>
+                <w:szCs w:val="16"/>
+              </w:rPr>
+              <w:t xml:space="preserve">), CSV-export, een dubbelklik op </w:t>
+            </w:r>
+            <w:r>
+              <w:rPr>
+                <w:rFonts w:ascii="Consolas" w:hAnsi="Consolas" w:cs="Consolas"/>
+                <w:sz w:val="14"/>
+                <w:shd w:val="clear" w:color="auto" w:fill="EEF4F2"/>
+              </w:rPr>
+              <w:t>Registreren</w:t>
+            </w:r>
+            <w:r>
+              <w:rPr>
+                <w:sz w:val="16"/>
+                <w:szCs w:val="16"/>
+              </w:rPr>
+              <w:t xml:space="preserve">, een scan in het bedrijfsfilter, de focus na opslaan en (de)activeren in het beheer, letters in een cijferveld, het productvenster dat vanzelf sluit, een pas terwijl een venster open is, </w:t>
+            </w:r>
+            <w:r>
+              <w:rPr>
+                <w:rFonts w:ascii="Consolas" w:hAnsi="Consolas" w:cs="Consolas"/>
+                <w:sz w:val="14"/>
+                <w:shd w:val="clear" w:color="auto" w:fill="EEF4F2"/>
+              </w:rPr>
+              <w:t>Registreren</w:t>
+            </w:r>
+            <w:r>
+              <w:rPr>
+                <w:sz w:val="16"/>
+                <w:szCs w:val="16"/>
+              </w:rPr>
+              <w:t xml:space="preserve"> in beeld op een liggende tablet, een telefoon en bij 200% zoom, en een leeg zoekveld na registreren), </w:t>
+            </w:r>
+            <w:r>
+              <w:rPr>
+                <w:rFonts w:ascii="Consolas" w:hAnsi="Consolas" w:cs="Consolas"/>
+                <w:sz w:val="14"/>
+                <w:shd w:val="clear" w:color="auto" w:fill="EEF4F2"/>
+              </w:rPr>
+              <w:t>browser.js</w:t>
+            </w:r>
+            <w:r>
+              <w:rPr>
+                <w:sz w:val="16"/>
+                <w:szCs w:val="16"/>
+              </w:rPr>
+              <w:t xml:space="preserve"> bevat de webserver en de besturing van de browser via het Chrome DevTools Protocol. Draaien met </w:t>
+            </w:r>
+            <w:r>
+              <w:rPr>
+                <w:rFonts w:ascii="Consolas" w:hAnsi="Consolas" w:cs="Consolas"/>
+                <w:sz w:val="14"/>
+                <w:shd w:val="clear" w:color="auto" w:fill="EEF4F2"/>
+              </w:rPr>
+              <w:t>npm run test:e2e</w:t>
+            </w:r>
+            <w:r>
+              <w:rPr>
+                <w:sz w:val="16"/>
+                <w:szCs w:val="16"/>
+              </w:rPr>
+              <w:t xml:space="preserve">, zonder npm-pakketten. Een andere browser kies je met </w:t>
+            </w:r>
+            <w:r>
+              <w:rPr>
+                <w:rFonts w:ascii="Consolas" w:hAnsi="Consolas" w:cs="Consolas"/>
+                <w:sz w:val="14"/>
+                <w:shd w:val="clear" w:color="auto" w:fill="EEF4F2"/>
+              </w:rPr>
+              <w:t>BROWSER_PATH</w:t>
+            </w:r>
+          </w:p>
+        </w:tc>
+      </w:tr>
+      <w:tr>
+        <w:trPr>
+          <w:cantSplit/>
+        </w:trPr>
+        <w:tc>
+          <w:tcPr>
+            <w:tcW w:w="4337" w:type="dxa"/>
+          </w:tcPr>
+          <w:p>
+            <w:pPr>
+              <w:spacing w:before="20" w:after="20" w:line="240" w:lineRule="auto"/>
+            </w:pPr>
+            <w:r>
+              <w:rPr>
+                <w:rFonts w:ascii="Consolas" w:hAnsi="Consolas" w:cs="Consolas"/>
+                <w:sz w:val="14"/>
+                <w:shd w:val="clear" w:color="auto" w:fill="EEF4F2"/>
+              </w:rPr>
+              <w:t>.github/workflows/ci.yml</w:t>
+            </w:r>
+          </w:p>
+        </w:tc>
+        <w:tc>
+          <w:tcPr>
+            <w:tcW w:w="5301" w:type="dxa"/>
+          </w:tcPr>
+          <w:p>
+            <w:pPr>
+              <w:spacing w:before="20" w:after="20" w:line="240" w:lineRule="auto"/>
+            </w:pPr>
+            <w:r>
+              <w:rPr>
+                <w:sz w:val="16"/>
+                <w:szCs w:val="16"/>
+              </w:rPr>
               <w:t>Voert de unit tests en daarna de browsertests (in Google Chrome) automatisch uit op GitHub met Node.js 24 (LTS), met alleen leesrechten en actions die op een commit-SHA zijn vastgezet</w:t>
             </w:r>
           </w:p>
@@ -8117,7 +8247,7 @@
         </w:numPr>
       </w:pPr>
       <w:bookmarkStart w:id="5" w:name="k3"/>
-      <w:bookmarkStart w:id="6" w:name="_Toc242707511"/>
+      <w:bookmarkStart w:id="6" w:name="_Toc242948994"/>
       <w:r>
         <w:t>DE WEBSITE STARTEN.</w:t>
       </w:r>
@@ -8339,7 +8469,7 @@
         </w:numPr>
       </w:pPr>
       <w:bookmarkStart w:id="7" w:name="k4"/>
-      <w:bookmarkStart w:id="8" w:name="_Toc242707512"/>
+      <w:bookmarkStart w:id="8" w:name="_Toc242948995"/>
       <w:r>
         <w:t>GEBRUIKERSHANDLEIDING.</w:t>
       </w:r>
@@ -8352,7 +8482,7 @@
         <w:keepNext/>
       </w:pPr>
       <w:bookmarkStart w:id="9" w:name="k5"/>
-      <w:bookmarkStart w:id="10" w:name="_Toc242707513"/>
+      <w:bookmarkStart w:id="10" w:name="_Toc242948996"/>
       <w:r>
         <w:t>EEN MEDEWERKER ZOEKEN</w:t>
       </w:r>
@@ -8407,7 +8537,7 @@
         <w:keepNext/>
       </w:pPr>
       <w:bookmarkStart w:id="11" w:name="k6"/>
-      <w:bookmarkStart w:id="12" w:name="_Toc242707514"/>
+      <w:bookmarkStart w:id="12" w:name="_Toc242948997"/>
       <w:r>
         <w:t>EEN PRODUCT REGISTREREN</w:t>
       </w:r>
@@ -8434,7 +8564,9 @@
       </w:r>
       <w:r>
         <w:tab/>
-        <w:t>Zoek je eigen naam.</w:t>
+      </w:r>
+      <w:r>
+        <w:t>Zoek je eigen naam, of houd je pas tegen de lezer (zie 4.16). Boven het zoekveld staat daarvoor "Houd je pas tegen de lezer, of zoek je naam".</w:t>
       </w:r>
     </w:p>
     <w:p>
@@ -8457,7 +8589,7 @@
       </w:r>
       <w:r>
         <w:tab/>
-        <w:t>Klik op je naam. Het productvenster opent met alleen de producten van jouw consumptiepunt.</w:t>
+        <w:t>Tik op je naam ("Tik op je naam" staat in de kop, en bij iedere naam "Tik om te kiezen"). Het productvenster opent met alleen de producten van jouw consumptiepunt.</w:t>
       </w:r>
     </w:p>
     <w:p>
@@ -8480,9 +8612,7 @@
       </w:r>
       <w:r>
         <w:tab/>
-      </w:r>
-      <w:r>
-        <w:t xml:space="preserve">Klik bij ieder gewenst product op </w:t>
+        <w:t xml:space="preserve">Tik bij ieder gewenst product op </w:t>
       </w:r>
       <w:r>
         <w:rPr>
@@ -8493,7 +8623,7 @@
         <w:t>+</w:t>
       </w:r>
       <w:r>
-        <w:t xml:space="preserve">. Met </w:t>
+        <w:t xml:space="preserve"> ("Tik op + bij wat je pakt. Tik daarna op Registreren."). Een product dat je hebt gekozen, krijgt een lichtgroene achtergrond en een groene rand. Met </w:t>
       </w:r>
       <w:r>
         <w:rPr>
@@ -8527,7 +8657,7 @@
       </w:r>
       <w:r>
         <w:tab/>
-        <w:t xml:space="preserve">Klik op </w:t>
+        <w:t xml:space="preserve">Tik op </w:t>
       </w:r>
       <w:r>
         <w:rPr>
@@ -8538,7 +8668,7 @@
         <w:t>Registreren (aantal)</w:t>
       </w:r>
       <w:r>
-        <w:t xml:space="preserve"> om alle gekozen producten tegelijk op te slaan.</w:t>
+        <w:t xml:space="preserve"> om alle gekozen producten tegelijk op te slaan. De knop staat onderaan het venster en blijft in beeld, ook als je door de producten scrolt.</w:t>
       </w:r>
     </w:p>
     <w:p>
@@ -8571,7 +8701,7 @@
         <w:t>Lotte van Dijk: 2× Blikje, 1× Ei geregistreerd</w:t>
       </w:r>
       <w:r>
-        <w:t>.</w:t>
+        <w:t>. Het zoekveld en het bedrijfsfilter zijn daarna weer leeg en de lijst staat bovenaan, klaar voor de volgende collega.</w:t>
       </w:r>
     </w:p>
     <w:p>
@@ -8598,7 +8728,7 @@
         <w:t>Registreren</w:t>
       </w:r>
       <w:r>
-        <w:t xml:space="preserve"> klikt. Je ziet geen persoonlijk totaal of persoonlijke kosten. Klik je op </w:t>
+        <w:t xml:space="preserve"> tikt. Je ziet geen persoonlijk totaal of persoonlijke kosten. Zolang je niets hebt gekozen, is </w:t>
       </w:r>
       <w:r>
         <w:rPr>
@@ -8609,7 +8739,12 @@
         <w:t>Registreren</w:t>
       </w:r>
       <w:r>
-        <w:t xml:space="preserve"> zonder iets te kiezen, dan verschijnt "Kies eerst minimaal één product". Biedt je consumptiepunt nog niets aan, dan staat er "Geen producten op jouw consumptiepunt." Dubbelklik je per ongeluk op </w:t>
+        <w:t xml:space="preserve"> uitgeschakeld en staat erboven "Kies eerst een product met +". Tik je toch op de knop, dan wordt die regel vet en rood en wordt er niets opgeslagen. Biedt je consumptiepunt nog niets aan, dan staat er "Geen producten op jouw consumptiepunt."</w:t>
+      </w:r>
+    </w:p>
+    <w:p>
+      <w:r>
+        <w:t xml:space="preserve">Loop je weg zonder te registreren, dan sluit het productvenster na 75 seconden vanzelf, zonder iets op te slaan. In de laatste 10 seconden staat boven de knop "Venster sluit zo. Tik om door te gaan." Ben je nog bezig, tik dan ergens in het venster: dan begint de tijd opnieuw. Houdt een collega intussen zijn pas tegen de lezer, dan sluit jouw venster ook (zonder opslaan) en opent dat van de collega. Dubbelklik je per ongeluk op </w:t>
       </w:r>
       <w:r>
         <w:rPr>
@@ -8629,7 +8764,7 @@
         <w:keepNext/>
       </w:pPr>
       <w:bookmarkStart w:id="13" w:name="k7"/>
-      <w:bookmarkStart w:id="14" w:name="_Toc242707515"/>
+      <w:bookmarkStart w:id="14" w:name="_Toc242948998"/>
       <w:r>
         <w:t>ADMIN-DASHBOARD OPENEN</w:t>
       </w:r>
@@ -8760,7 +8895,7 @@
         <w:keepNext/>
       </w:pPr>
       <w:bookmarkStart w:id="15" w:name="k8"/>
-      <w:bookmarkStart w:id="16" w:name="_Toc242707516"/>
+      <w:bookmarkStart w:id="16" w:name="_Toc242948999"/>
       <w:r>
         <w:t>REGISTRATIES BEHEREN</w:t>
       </w:r>
@@ -9046,7 +9181,7 @@
         <w:keepNext/>
       </w:pPr>
       <w:bookmarkStart w:id="17" w:name="k9"/>
-      <w:bookmarkStart w:id="18" w:name="_Toc242707517"/>
+      <w:bookmarkStart w:id="18" w:name="_Toc242949000"/>
       <w:r>
         <w:t>MEDEWERKERS BEHEREN</w:t>
       </w:r>
@@ -9380,7 +9515,7 @@
         <w:keepNext/>
       </w:pPr>
       <w:bookmarkStart w:id="19" w:name="k10"/>
-      <w:bookmarkStart w:id="20" w:name="_Toc242707518"/>
+      <w:bookmarkStart w:id="20" w:name="_Toc242949001"/>
       <w:r>
         <w:t>PRODUCTEN BEHEREN</w:t>
       </w:r>
@@ -9508,7 +9643,7 @@
         <w:keepNext/>
       </w:pPr>
       <w:bookmarkStart w:id="21" w:name="k11"/>
-      <w:bookmarkStart w:id="22" w:name="_Toc242707519"/>
+      <w:bookmarkStart w:id="22" w:name="_Toc242949002"/>
       <w:r>
         <w:t>BEDRIJVEN EN CONSUMPTIEPUNTEN BEHEREN</w:t>
       </w:r>
@@ -9671,7 +9806,7 @@
         <w:keepNext/>
       </w:pPr>
       <w:bookmarkStart w:id="23" w:name="k12"/>
-      <w:bookmarkStart w:id="24" w:name="_Toc242707520"/>
+      <w:bookmarkStart w:id="24" w:name="_Toc242949003"/>
       <w:r>
         <w:t>VOORRAAD BEHEREN</w:t>
       </w:r>
@@ -9723,7 +9858,7 @@
           <w:sz w:val="18"/>
           <w:shd w:val="clear" w:color="auto" w:fill="EEF4F2"/>
         </w:rPr>
-        <w:t>Op</w:t>
+        <w:t>Leeg</w:t>
       </w:r>
       <w:r>
         <w:t xml:space="preserve"> zijn (voorraad 0 of minder) of op of onder het minimum zitten (</w:t>
@@ -9889,7 +10024,7 @@
         <w:keepNext/>
       </w:pPr>
       <w:bookmarkStart w:id="25" w:name="k13"/>
-      <w:bookmarkStart w:id="26" w:name="_Toc242707521"/>
+      <w:bookmarkStart w:id="26" w:name="_Toc242949004"/>
       <w:r>
         <w:t>LOGBOEK BEKIJKEN</w:t>
       </w:r>
@@ -9929,7 +10064,7 @@
         <w:keepNext/>
       </w:pPr>
       <w:bookmarkStart w:id="27" w:name="k14"/>
-      <w:bookmarkStart w:id="28" w:name="_Toc242707522"/>
+      <w:bookmarkStart w:id="28" w:name="_Toc242949005"/>
       <w:r>
         <w:t>ALLE GEGEVENS WISSEN</w:t>
       </w:r>
@@ -10055,7 +10190,7 @@
         <w:keepNext/>
       </w:pPr>
       <w:bookmarkStart w:id="29" w:name="k15"/>
-      <w:bookmarkStart w:id="30" w:name="_Toc242707523"/>
+      <w:bookmarkStart w:id="30" w:name="_Toc242949006"/>
       <w:r>
         <w:t>MODAL SLUITEN EN UITLOGGEN</w:t>
       </w:r>
@@ -10129,7 +10264,7 @@
         <w:keepNext/>
       </w:pPr>
       <w:bookmarkStart w:id="31" w:name="k16"/>
-      <w:bookmarkStart w:id="32" w:name="_Toc242707524"/>
+      <w:bookmarkStart w:id="32" w:name="_Toc242949007"/>
       <w:r>
         <w:t>CSV EXPORTEREN</w:t>
       </w:r>
@@ -10513,7 +10648,7 @@
         <w:keepNext/>
       </w:pPr>
       <w:bookmarkStart w:id="33" w:name="k17"/>
-      <w:bookmarkStart w:id="34" w:name="_Toc242707525"/>
+      <w:bookmarkStart w:id="34" w:name="_Toc242949008"/>
       <w:r>
         <w:t>LICHT OF DONKER THEMA</w:t>
       </w:r>
@@ -10620,7 +10755,7 @@
         <w:keepNext/>
       </w:pPr>
       <w:bookmarkStart w:id="35" w:name="k18"/>
-      <w:bookmarkStart w:id="36" w:name="_Toc242707526"/>
+      <w:bookmarkStart w:id="36" w:name="_Toc242949009"/>
       <w:r>
         <w:t>WELKOM EN "ZELFDE ALS VORIGE KEER"</w:t>
       </w:r>
@@ -10707,7 +10842,7 @@
         <w:keepNext/>
       </w:pPr>
       <w:bookmarkStart w:id="37" w:name="k19"/>
-      <w:bookmarkStart w:id="38" w:name="_Toc242707527"/>
+      <w:bookmarkStart w:id="38" w:name="_Toc242949010"/>
       <w:r>
         <w:t>DEMO GEZICHTSHERKENNING</w:t>
       </w:r>
@@ -10915,7 +11050,7 @@
         <w:keepNext/>
       </w:pPr>
       <w:bookmarkStart w:id="39" w:name="k20"/>
-      <w:bookmarkStart w:id="40" w:name="_Toc242707528"/>
+      <w:bookmarkStart w:id="40" w:name="_Toc242949011"/>
       <w:r>
         <w:t>HERKENNEN MET DE PAS</w:t>
       </w:r>
@@ -11035,18 +11170,10 @@
     </w:p>
     <w:p>
       <w:r>
-        <w:t xml:space="preserve">Een medewerker herkennen gebeurt alleen op de beginpagina, als er geen venster open is. Is er wel een venster open, dan houdt de website alleen de Enter of Tab tegen waarmee de lezer een scan afsluit, zodat die niet de knop met de focus indrukt (bijvoorbeeld </w:t>
-      </w:r>
-      <w:r>
-        <w:rPr>
-          <w:rFonts w:ascii="Consolas" w:hAnsi="Consolas" w:cs="Consolas"/>
-          <w:sz w:val="18"/>
-          <w:shd w:val="clear" w:color="auto" w:fill="EEF4F2"/>
-        </w:rPr>
-        <w:t>Registreren</w:t>
-      </w:r>
-      <w:r>
-        <w:t xml:space="preserve">). Staat de focus in het zoekveld, dan haalt de website de getypte tekens van de lezer daar weer uit. Het zoekveld heeft na een scan dezelfde inhoud als ervoor. Hetzelfde geldt voor het bedrijfsfilter: daar komen na een scan ook het gekozen bedrijf terug en gaat de keuzelijst dicht. In het veld </w:t>
+        <w:t>Een medewerker herkennen gebeurt op de beginpagina en als het productvenster open is. Staat het productvenster van een collega nog open, dan sluit dat venster zonder op te slaan en opent het venster van de pas. Staat het eigen venster al open, dan blijft het open met de keuze die er al stond. Staat er een ander venster open (het beheer, een formulier of de camera), dan opent er niets en verschijnt "Sluit eerst het open venster om je pas te gebruiken." De website houdt dan wel de Enter of Tab tegen waarmee d</w:t>
+      </w:r>
+      <w:r>
+        <w:t xml:space="preserve">e lezer een scan afsluit, zodat die niet de knop met de focus indrukt. Staat de focus in het zoekveld, dan haalt de website de getypte tekens van de lezer daar weer uit. Het zoekveld heeft na een scan dezelfde inhoud als ervoor. Hetzelfde geldt voor het bedrijfsfilter: daar komen na een scan ook het gekozen bedrijf terug en gaat de keuzelijst dicht. In het veld </w:t>
       </w:r>
       <w:r>
         <w:rPr>
@@ -11090,7 +11217,7 @@
         <w:t>BADGE_READER.enabled = false</w:t>
       </w:r>
       <w:r>
-        <w:t xml:space="preserve"> staat herkennen met de pas helemaal uit. </w:t>
+        <w:t xml:space="preserve"> staat herkennen met de pas helemaal uit en verdwijnt ook de hint boven het zoekveld. </w:t>
       </w:r>
       <w:r>
         <w:rPr>
@@ -11120,7 +11247,7 @@
         </w:numPr>
       </w:pPr>
       <w:bookmarkStart w:id="41" w:name="k21"/>
-      <w:bookmarkStart w:id="42" w:name="_Toc242707529"/>
+      <w:bookmarkStart w:id="42" w:name="_Toc242949012"/>
       <w:r>
         <w:t xml:space="preserve">UITLEG VAN </w:t>
       </w:r>
@@ -11144,7 +11271,7 @@
         <w:keepNext/>
       </w:pPr>
       <w:bookmarkStart w:id="43" w:name="k22"/>
-      <w:bookmarkStart w:id="44" w:name="_Toc242707530"/>
+      <w:bookmarkStart w:id="44" w:name="_Toc242949013"/>
       <w:r>
         <w:t>METADATA EN EXTERNE BESTANDEN</w:t>
       </w:r>
@@ -11420,7 +11547,7 @@
         <w:keepNext/>
       </w:pPr>
       <w:bookmarkStart w:id="45" w:name="k23"/>
-      <w:bookmarkStart w:id="46" w:name="_Toc242707531"/>
+      <w:bookmarkStart w:id="46" w:name="_Toc242949014"/>
       <w:r>
         <w:t>NAVIGATIEBALK</w:t>
       </w:r>
@@ -11633,7 +11760,7 @@
         <w:keepNext/>
       </w:pPr>
       <w:bookmarkStart w:id="47" w:name="k24"/>
-      <w:bookmarkStart w:id="48" w:name="_Toc242707532"/>
+      <w:bookmarkStart w:id="48" w:name="_Toc242949015"/>
       <w:r>
         <w:t>HERO-GEDEELTE</w:t>
       </w:r>
@@ -11678,7 +11805,7 @@
         <w:keepNext/>
       </w:pPr>
       <w:bookmarkStart w:id="49" w:name="k25"/>
-      <w:bookmarkStart w:id="50" w:name="_Toc242707533"/>
+      <w:bookmarkStart w:id="50" w:name="_Toc242949016"/>
       <w:r>
         <w:t>MEDEWERKERLIJST</w:t>
       </w:r>
@@ -11723,7 +11850,29 @@
         <w:t>Registreer je consumptie</w:t>
       </w:r>
       <w:r>
-        <w:t>.</w:t>
+        <w:t xml:space="preserve">, met rechts "Tik op je naam" (id </w:t>
+      </w:r>
+      <w:r>
+        <w:rPr>
+          <w:rFonts w:ascii="Consolas" w:hAnsi="Consolas" w:cs="Consolas"/>
+          <w:sz w:val="18"/>
+          <w:shd w:val="clear" w:color="auto" w:fill="EEF4F2"/>
+        </w:rPr>
+        <w:t>employeeListHint</w:t>
+      </w:r>
+      <w:r>
+        <w:t xml:space="preserve">, verborgen als er niemand wordt gevonden) en de teller met het aantal medewerkers (id </w:t>
+      </w:r>
+      <w:r>
+        <w:rPr>
+          <w:rFonts w:ascii="Consolas" w:hAnsi="Consolas" w:cs="Consolas"/>
+          <w:sz w:val="18"/>
+          <w:shd w:val="clear" w:color="auto" w:fill="EEF4F2"/>
+        </w:rPr>
+        <w:t>employeeCount</w:t>
+      </w:r>
+      <w:r>
+        <w:t>).</w:t>
       </w:r>
     </w:p>
     <w:p>
@@ -11737,18 +11886,62 @@
         <w:contextualSpacing w:val="0"/>
       </w:pPr>
       <w:r>
-        <w:t xml:space="preserve">De teller met het aantal medewerkers (id </w:t>
-      </w:r>
-      <w:r>
-        <w:rPr>
-          <w:rFonts w:ascii="Consolas" w:hAnsi="Consolas" w:cs="Consolas"/>
-          <w:sz w:val="18"/>
-          <w:shd w:val="clear" w:color="auto" w:fill="EEF4F2"/>
-        </w:rPr>
-        <w:t>employeeCount</w:t>
-      </w:r>
-      <w:r>
-        <w:t>).</w:t>
+        <w:t>Op één regel (</w:t>
+      </w:r>
+      <w:r>
+        <w:rPr>
+          <w:rFonts w:ascii="Consolas" w:hAnsi="Consolas" w:cs="Consolas"/>
+          <w:sz w:val="18"/>
+          <w:shd w:val="clear" w:color="auto" w:fill="EEF4F2"/>
+        </w:rPr>
+        <w:t>.directory-tools</w:t>
+      </w:r>
+      <w:r>
+        <w:t xml:space="preserve">): de hint "Houd je pas tegen de lezer, of zoek je naam" (id </w:t>
+      </w:r>
+      <w:r>
+        <w:rPr>
+          <w:rFonts w:ascii="Consolas" w:hAnsi="Consolas" w:cs="Consolas"/>
+          <w:sz w:val="18"/>
+          <w:shd w:val="clear" w:color="auto" w:fill="EEF4F2"/>
+        </w:rPr>
+        <w:t>badgeHint</w:t>
+      </w:r>
+      <w:r>
+        <w:t xml:space="preserve">, alleen zichtbaar als </w:t>
+      </w:r>
+      <w:r>
+        <w:rPr>
+          <w:rFonts w:ascii="Consolas" w:hAnsi="Consolas" w:cs="Consolas"/>
+          <w:sz w:val="18"/>
+          <w:shd w:val="clear" w:color="auto" w:fill="EEF4F2"/>
+        </w:rPr>
+        <w:t>BADGE_READER.enabled</w:t>
+      </w:r>
+      <w:r>
+        <w:t xml:space="preserve"> aan staat) en de knop </w:t>
+      </w:r>
+      <w:r>
+        <w:rPr>
+          <w:rFonts w:ascii="Consolas" w:hAnsi="Consolas" w:cs="Consolas"/>
+          <w:sz w:val="18"/>
+          <w:shd w:val="clear" w:color="auto" w:fill="EEF4F2"/>
+        </w:rPr>
+        <w:t>Herken mij met de camera (demo)</w:t>
+      </w:r>
+      <w:r>
+        <w:t xml:space="preserve"> (id </w:t>
+      </w:r>
+      <w:r>
+        <w:rPr>
+          <w:rFonts w:ascii="Consolas" w:hAnsi="Consolas" w:cs="Consolas"/>
+          <w:sz w:val="18"/>
+          <w:shd w:val="clear" w:color="auto" w:fill="EEF4F2"/>
+        </w:rPr>
+        <w:t>faceRecognizeButton</w:t>
+      </w:r>
+      <w:r>
+        <w:t>, alleen zichtbaar als de demo aan staat en de browser een camera kan gebruiken).</w:t>
       </w:r>
     </w:p>
     <w:p>
@@ -11762,29 +11955,62 @@
         <w:contextualSpacing w:val="0"/>
       </w:pPr>
       <w:r>
-        <w:t xml:space="preserve">De knop </w:t>
-      </w:r>
-      <w:r>
-        <w:rPr>
-          <w:rFonts w:ascii="Consolas" w:hAnsi="Consolas" w:cs="Consolas"/>
-          <w:sz w:val="18"/>
-          <w:shd w:val="clear" w:color="auto" w:fill="EEF4F2"/>
-        </w:rPr>
-        <w:t>Herken mij met de camera (demo)</w:t>
-      </w:r>
-      <w:r>
-        <w:t xml:space="preserve"> (id </w:t>
-      </w:r>
-      <w:r>
-        <w:rPr>
-          <w:rFonts w:ascii="Consolas" w:hAnsi="Consolas" w:cs="Consolas"/>
-          <w:sz w:val="18"/>
-          <w:shd w:val="clear" w:color="auto" w:fill="EEF4F2"/>
-        </w:rPr>
-        <w:t>faceRecognizeButton</w:t>
-      </w:r>
-      <w:r>
-        <w:t>), alleen zichtbaar als de demo aan staat en de browser een camera kan gebruiken.</w:t>
+        <w:t xml:space="preserve">In </w:t>
+      </w:r>
+      <w:r>
+        <w:rPr>
+          <w:rFonts w:ascii="Consolas" w:hAnsi="Consolas" w:cs="Consolas"/>
+          <w:sz w:val="18"/>
+          <w:shd w:val="clear" w:color="auto" w:fill="EEF4F2"/>
+        </w:rPr>
+        <w:t>.directory-filters</w:t>
+      </w:r>
+      <w:r>
+        <w:t xml:space="preserve"> (vanaf tabletbreedte naast elkaar): de zoekbalk met id </w:t>
+      </w:r>
+      <w:r>
+        <w:rPr>
+          <w:rFonts w:ascii="Consolas" w:hAnsi="Consolas" w:cs="Consolas"/>
+          <w:sz w:val="18"/>
+          <w:shd w:val="clear" w:color="auto" w:fill="EEF4F2"/>
+        </w:rPr>
+        <w:t>employeeSearch</w:t>
+      </w:r>
+      <w:r>
+        <w:t xml:space="preserve"> en de sneltoets-hint </w:t>
+      </w:r>
+      <w:r>
+        <w:rPr>
+          <w:rFonts w:ascii="Consolas" w:hAnsi="Consolas" w:cs="Consolas"/>
+          <w:sz w:val="18"/>
+          <w:shd w:val="clear" w:color="auto" w:fill="EEF4F2"/>
+        </w:rPr>
+        <w:t>Ctrl K</w:t>
+      </w:r>
+      <w:r>
+        <w:t xml:space="preserve">, en het bedrijfsfilter met id </w:t>
+      </w:r>
+      <w:r>
+        <w:rPr>
+          <w:rFonts w:ascii="Consolas" w:hAnsi="Consolas" w:cs="Consolas"/>
+          <w:sz w:val="18"/>
+          <w:shd w:val="clear" w:color="auto" w:fill="EEF4F2"/>
+        </w:rPr>
+        <w:t>employeeCompanyFilter</w:t>
+      </w:r>
+      <w:r>
+        <w:t xml:space="preserve"> en de keuzelijst </w:t>
+      </w:r>
+      <w:r>
+        <w:rPr>
+          <w:rFonts w:ascii="Consolas" w:hAnsi="Consolas" w:cs="Consolas"/>
+          <w:sz w:val="18"/>
+          <w:shd w:val="clear" w:color="auto" w:fill="EEF4F2"/>
+        </w:rPr>
+        <w:t>companyFilterOptions</w:t>
+      </w:r>
+      <w:r>
+        <w:t>.</w:t>
       </w:r>
     </w:p>
     <w:p>
@@ -11798,26 +12024,26 @@
         <w:contextualSpacing w:val="0"/>
       </w:pPr>
       <w:r>
-        <w:t xml:space="preserve">De zoekbalk met id </w:t>
-      </w:r>
-      <w:r>
-        <w:rPr>
-          <w:rFonts w:ascii="Consolas" w:hAnsi="Consolas" w:cs="Consolas"/>
-          <w:sz w:val="18"/>
-          <w:shd w:val="clear" w:color="auto" w:fill="EEF4F2"/>
-        </w:rPr>
-        <w:t>employeeSearch</w:t>
-      </w:r>
-      <w:r>
-        <w:t xml:space="preserve"> en de sneltoets-hint </w:t>
-      </w:r>
-      <w:r>
-        <w:rPr>
-          <w:rFonts w:ascii="Consolas" w:hAnsi="Consolas" w:cs="Consolas"/>
-          <w:sz w:val="18"/>
-          <w:shd w:val="clear" w:color="auto" w:fill="EEF4F2"/>
-        </w:rPr>
-        <w:t>Ctrl K</w:t>
+        <w:t xml:space="preserve">De lege status met id </w:t>
+      </w:r>
+      <w:r>
+        <w:rPr>
+          <w:rFonts w:ascii="Consolas" w:hAnsi="Consolas" w:cs="Consolas"/>
+          <w:sz w:val="18"/>
+          <w:shd w:val="clear" w:color="auto" w:fill="EEF4F2"/>
+        </w:rPr>
+        <w:t>emptyState</w:t>
+      </w:r>
+      <w:r>
+        <w:t xml:space="preserve">, met de knop </w:t>
+      </w:r>
+      <w:r>
+        <w:rPr>
+          <w:rFonts w:ascii="Consolas" w:hAnsi="Consolas" w:cs="Consolas"/>
+          <w:sz w:val="18"/>
+          <w:shd w:val="clear" w:color="auto" w:fill="EEF4F2"/>
+        </w:rPr>
+        <w:t>Zoekopdracht wissen</w:t>
       </w:r>
       <w:r>
         <w:t>.</w:t>
@@ -11834,29 +12060,120 @@
         <w:contextualSpacing w:val="0"/>
       </w:pPr>
       <w:r>
-        <w:t xml:space="preserve">Het bedrijfsfilter met id </w:t>
-      </w:r>
-      <w:r>
-        <w:rPr>
-          <w:rFonts w:ascii="Consolas" w:hAnsi="Consolas" w:cs="Consolas"/>
-          <w:sz w:val="18"/>
-          <w:shd w:val="clear" w:color="auto" w:fill="EEF4F2"/>
-        </w:rPr>
-        <w:t>employeeCompanyFilter</w:t>
-      </w:r>
-      <w:r>
-        <w:t xml:space="preserve"> en de keuzelijst </w:t>
-      </w:r>
-      <w:r>
-        <w:rPr>
-          <w:rFonts w:ascii="Consolas" w:hAnsi="Consolas" w:cs="Consolas"/>
-          <w:sz w:val="18"/>
-          <w:shd w:val="clear" w:color="auto" w:fill="EEF4F2"/>
-        </w:rPr>
-        <w:t>companyFilterOptions</w:t>
-      </w:r>
-      <w:r>
-        <w:t>.</w:t>
+        <w:t xml:space="preserve">De dynamische lijst met id </w:t>
+      </w:r>
+      <w:r>
+        <w:rPr>
+          <w:rFonts w:ascii="Consolas" w:hAnsi="Consolas" w:cs="Consolas"/>
+          <w:sz w:val="18"/>
+          <w:shd w:val="clear" w:color="auto" w:fill="EEF4F2"/>
+        </w:rPr>
+        <w:t>employeeList</w:t>
+      </w:r>
+      <w:r>
+        <w:t xml:space="preserve"> (zonder </w:t>
+      </w:r>
+      <w:r>
+        <w:rPr>
+          <w:rFonts w:ascii="Consolas" w:hAnsi="Consolas" w:cs="Consolas"/>
+          <w:sz w:val="18"/>
+          <w:shd w:val="clear" w:color="auto" w:fill="EEF4F2"/>
+        </w:rPr>
+        <w:t>aria-live</w:t>
+      </w:r>
+      <w:r>
+        <w:t>).</w:t>
+      </w:r>
+    </w:p>
+    <w:p>
+      <w:pPr>
+        <w:pStyle w:val="Lijstalinea"/>
+        <w:numPr>
+          <w:ilvl w:val="0"/>
+          <w:numId w:val="3"/>
+        </w:numPr>
+        <w:contextualSpacing w:val="0"/>
+      </w:pPr>
+      <w:r>
+        <w:t xml:space="preserve">Een vaste, onzichtbare statusregel voor schermlezers (id </w:t>
+      </w:r>
+      <w:r>
+        <w:rPr>
+          <w:rFonts w:ascii="Consolas" w:hAnsi="Consolas" w:cs="Consolas"/>
+          <w:sz w:val="18"/>
+          <w:shd w:val="clear" w:color="auto" w:fill="EEF4F2"/>
+        </w:rPr>
+        <w:t>employeeResultsStatus</w:t>
+      </w:r>
+      <w:r>
+        <w:t xml:space="preserve">, </w:t>
+      </w:r>
+      <w:r>
+        <w:rPr>
+          <w:rFonts w:ascii="Consolas" w:hAnsi="Consolas" w:cs="Consolas"/>
+          <w:sz w:val="18"/>
+          <w:shd w:val="clear" w:color="auto" w:fill="EEF4F2"/>
+        </w:rPr>
+        <w:t>role="status"</w:t>
+      </w:r>
+      <w:r>
+        <w:t>) met alleen het aantal, bijvoorbeeld "3 medewerkers gevonden" of "Geen medewerker gevonden".</w:t>
+      </w:r>
+    </w:p>
+    <w:p>
+      <w:r>
+        <w:t xml:space="preserve">JavaScript vult </w:t>
+      </w:r>
+      <w:r>
+        <w:rPr>
+          <w:rFonts w:ascii="Consolas" w:hAnsi="Consolas" w:cs="Consolas"/>
+          <w:sz w:val="18"/>
+          <w:shd w:val="clear" w:color="auto" w:fill="EEF4F2"/>
+        </w:rPr>
+        <w:t>employeeList</w:t>
+      </w:r>
+      <w:r>
+        <w:t xml:space="preserve"> op basis van de medewerkers in de applicatiestatus.</w:t>
+      </w:r>
+    </w:p>
+    <w:p>
+      <w:pPr>
+        <w:pStyle w:val="Kop2"/>
+        <w:keepNext/>
+      </w:pPr>
+      <w:bookmarkStart w:id="51" w:name="k26"/>
+      <w:bookmarkStart w:id="52" w:name="_Toc242949017"/>
+      <w:r>
+        <w:t>STATISTIEKEN</w:t>
+      </w:r>
+      <w:bookmarkEnd w:id="51"/>
+      <w:bookmarkEnd w:id="52"/>
+    </w:p>
+    <w:p>
+      <w:r>
+        <w:t xml:space="preserve">De elementen </w:t>
+      </w:r>
+      <w:r>
+        <w:rPr>
+          <w:rFonts w:ascii="Consolas" w:hAnsi="Consolas" w:cs="Consolas"/>
+          <w:sz w:val="18"/>
+          <w:shd w:val="clear" w:color="auto" w:fill="EEF4F2"/>
+        </w:rPr>
+        <w:t>todayTotal</w:t>
+      </w:r>
+      <w:r>
+        <w:t xml:space="preserve"> en </w:t>
+      </w:r>
+      <w:r>
+        <w:rPr>
+          <w:rFonts w:ascii="Consolas" w:hAnsi="Consolas" w:cs="Consolas"/>
+          <w:sz w:val="18"/>
+          <w:shd w:val="clear" w:color="auto" w:fill="EEF4F2"/>
+        </w:rPr>
+        <w:t>monthTotal</w:t>
+      </w:r>
+      <w:r>
+        <w:t xml:space="preserve"> worden door JavaScript gevuld met:</w:t>
       </w:r>
     </w:p>
     <w:p>
@@ -11870,29 +12187,7 @@
         <w:contextualSpacing w:val="0"/>
       </w:pPr>
       <w:r>
-        <w:t xml:space="preserve">De lege status met id </w:t>
-      </w:r>
-      <w:r>
-        <w:rPr>
-          <w:rFonts w:ascii="Consolas" w:hAnsi="Consolas" w:cs="Consolas"/>
-          <w:sz w:val="18"/>
-          <w:shd w:val="clear" w:color="auto" w:fill="EEF4F2"/>
-        </w:rPr>
-        <w:t>emptyState</w:t>
-      </w:r>
-      <w:r>
-        <w:t xml:space="preserve">, met de knop </w:t>
-      </w:r>
-      <w:r>
-        <w:rPr>
-          <w:rFonts w:ascii="Consolas" w:hAnsi="Consolas" w:cs="Consolas"/>
-          <w:sz w:val="18"/>
-          <w:shd w:val="clear" w:color="auto" w:fill="EEF4F2"/>
-        </w:rPr>
-        <w:t>Zoekopdracht wissen</w:t>
-      </w:r>
-      <w:r>
-        <w:t>.</w:t>
+        <w:t>Het aantal registraties van vandaag.</w:t>
       </w:r>
     </w:p>
     <w:p>
@@ -11905,34 +12200,23 @@
         <w:contextualSpacing w:val="0"/>
       </w:pPr>
       <w:r>
-        <w:t xml:space="preserve">De dynamische lijst met id </w:t>
-      </w:r>
-      <w:r>
-        <w:rPr>
-          <w:rFonts w:ascii="Consolas" w:hAnsi="Consolas" w:cs="Consolas"/>
-          <w:sz w:val="18"/>
-          <w:shd w:val="clear" w:color="auto" w:fill="EEF4F2"/>
-        </w:rPr>
-        <w:t>employeeList</w:t>
+        <w:t>Het aantal registraties van de huidige maand.</w:t>
+      </w:r>
+    </w:p>
+    <w:p>
+      <w:r>
+        <w:t xml:space="preserve">Daaronder staat de tipkaart </w:t>
+      </w:r>
+      <w:r>
+        <w:rPr>
+          <w:rFonts w:ascii="Consolas" w:hAnsi="Consolas" w:cs="Consolas"/>
+          <w:sz w:val="18"/>
+          <w:shd w:val="clear" w:color="auto" w:fill="EEF4F2"/>
+        </w:rPr>
+        <w:t>Goed bezig!</w:t>
       </w:r>
       <w:r>
         <w:t>.</w:t>
-      </w:r>
-    </w:p>
-    <w:p>
-      <w:r>
-        <w:t xml:space="preserve">JavaScript vult </w:t>
-      </w:r>
-      <w:r>
-        <w:rPr>
-          <w:rFonts w:ascii="Consolas" w:hAnsi="Consolas" w:cs="Consolas"/>
-          <w:sz w:val="18"/>
-          <w:shd w:val="clear" w:color="auto" w:fill="EEF4F2"/>
-        </w:rPr>
-        <w:t>employeeList</w:t>
-      </w:r>
-      <w:r>
-        <w:t xml:space="preserve"> op basis van de medewerkers in de applicatiestatus.</w:t>
       </w:r>
     </w:p>
     <w:p>
@@ -11940,91 +12224,8 @@
         <w:pStyle w:val="Kop2"/>
         <w:keepNext/>
       </w:pPr>
-      <w:bookmarkStart w:id="51" w:name="k26"/>
-      <w:bookmarkStart w:id="52" w:name="_Toc242707534"/>
-      <w:r>
-        <w:t>STATISTIEKEN</w:t>
-      </w:r>
-      <w:bookmarkEnd w:id="51"/>
-      <w:bookmarkEnd w:id="52"/>
-    </w:p>
-    <w:p>
-      <w:r>
-        <w:t xml:space="preserve">De elementen </w:t>
-      </w:r>
-      <w:r>
-        <w:rPr>
-          <w:rFonts w:ascii="Consolas" w:hAnsi="Consolas" w:cs="Consolas"/>
-          <w:sz w:val="18"/>
-          <w:shd w:val="clear" w:color="auto" w:fill="EEF4F2"/>
-        </w:rPr>
-        <w:t>todayTotal</w:t>
-      </w:r>
-      <w:r>
-        <w:t xml:space="preserve"> en </w:t>
-      </w:r>
-      <w:r>
-        <w:rPr>
-          <w:rFonts w:ascii="Consolas" w:hAnsi="Consolas" w:cs="Consolas"/>
-          <w:sz w:val="18"/>
-          <w:shd w:val="clear" w:color="auto" w:fill="EEF4F2"/>
-        </w:rPr>
-        <w:t>monthTotal</w:t>
-      </w:r>
-      <w:r>
-        <w:t xml:space="preserve"> worden door JavaScript gevuld met:</w:t>
-      </w:r>
-    </w:p>
-    <w:p>
-      <w:pPr>
-        <w:pStyle w:val="Lijstalinea"/>
-        <w:numPr>
-          <w:ilvl w:val="0"/>
-          <w:numId w:val="3"/>
-        </w:numPr>
-        <w:spacing w:after="60"/>
-        <w:contextualSpacing w:val="0"/>
-      </w:pPr>
-      <w:r>
-        <w:t>Het aantal registraties van vandaag.</w:t>
-      </w:r>
-    </w:p>
-    <w:p>
-      <w:pPr>
-        <w:pStyle w:val="Lijstalinea"/>
-        <w:numPr>
-          <w:ilvl w:val="0"/>
-          <w:numId w:val="3"/>
-        </w:numPr>
-        <w:contextualSpacing w:val="0"/>
-      </w:pPr>
-      <w:r>
-        <w:t>Het aantal registraties van de huidige maand.</w:t>
-      </w:r>
-    </w:p>
-    <w:p>
-      <w:r>
-        <w:t xml:space="preserve">Daaronder staat de tipkaart </w:t>
-      </w:r>
-      <w:r>
-        <w:rPr>
-          <w:rFonts w:ascii="Consolas" w:hAnsi="Consolas" w:cs="Consolas"/>
-          <w:sz w:val="18"/>
-          <w:shd w:val="clear" w:color="auto" w:fill="EEF4F2"/>
-        </w:rPr>
-        <w:t>Goed bezig!</w:t>
-      </w:r>
-      <w:r>
-        <w:t>.</w:t>
-      </w:r>
-    </w:p>
-    <w:p>
-      <w:pPr>
-        <w:pStyle w:val="Kop2"/>
-        <w:keepNext/>
-      </w:pPr>
       <w:bookmarkStart w:id="53" w:name="k27"/>
-      <w:bookmarkStart w:id="54" w:name="_Toc242707535"/>
+      <w:bookmarkStart w:id="54" w:name="_Toc242949018"/>
       <w:r>
         <w:t>VENSTERS (MODALS)</w:t>
       </w:r>
@@ -12239,7 +12440,67 @@
                 <w:sz w:val="16"/>
                 <w:szCs w:val="16"/>
               </w:rPr>
-              <w:t xml:space="preserve"> (alleen na herkenning met pas of camera), de link voor de demo gezichtsherkenning en de uitleg over de inhouding op het loon (</w:t>
+              <w:t xml:space="preserve"> (alleen na herkenning met pas of camera), de link voor de demo gezichtsherkenning op een eigen regel, een knopbalk die onderaan in beeld blijft (</w:t>
+            </w:r>
+            <w:r>
+              <w:rPr>
+                <w:rFonts w:ascii="Consolas" w:hAnsi="Consolas" w:cs="Consolas"/>
+                <w:sz w:val="14"/>
+                <w:shd w:val="clear" w:color="auto" w:fill="EEF4F2"/>
+              </w:rPr>
+              <w:t>.employee-products-actions</w:t>
+            </w:r>
+            <w:r>
+              <w:rPr>
+                <w:sz w:val="16"/>
+                <w:szCs w:val="16"/>
+              </w:rPr>
+              <w:t>) met de waarschuwing vlak voor het automatisch sluiten (</w:t>
+            </w:r>
+            <w:r>
+              <w:rPr>
+                <w:rFonts w:ascii="Consolas" w:hAnsi="Consolas" w:cs="Consolas"/>
+                <w:sz w:val="14"/>
+                <w:shd w:val="clear" w:color="auto" w:fill="EEF4F2"/>
+              </w:rPr>
+              <w:t>productIdleWarning</w:t>
+            </w:r>
+            <w:r>
+              <w:rPr>
+                <w:sz w:val="16"/>
+                <w:szCs w:val="16"/>
+              </w:rPr>
+              <w:t>), de uitleg bij een uitgeschakelde knop (</w:t>
+            </w:r>
+            <w:r>
+              <w:rPr>
+                <w:rFonts w:ascii="Consolas" w:hAnsi="Consolas" w:cs="Consolas"/>
+                <w:sz w:val="14"/>
+                <w:shd w:val="clear" w:color="auto" w:fill="EEF4F2"/>
+              </w:rPr>
+              <w:t>registerHint</w:t>
+            </w:r>
+            <w:r>
+              <w:rPr>
+                <w:sz w:val="16"/>
+                <w:szCs w:val="16"/>
+              </w:rPr>
+              <w:t xml:space="preserve">) en </w:t>
+            </w:r>
+            <w:r>
+              <w:rPr>
+                <w:rFonts w:ascii="Consolas" w:hAnsi="Consolas" w:cs="Consolas"/>
+                <w:sz w:val="14"/>
+                <w:shd w:val="clear" w:color="auto" w:fill="EEF4F2"/>
+              </w:rPr>
+              <w:t>Registreren</w:t>
+            </w:r>
+            <w:r>
+              <w:rPr>
+                <w:sz w:val="16"/>
+                <w:szCs w:val="16"/>
+              </w:rPr>
+              <w:t>, en daaronder de uitleg over de inhouding op het loon (</w:t>
             </w:r>
             <w:r>
               <w:rPr>
@@ -12467,7 +12728,7 @@
     </w:p>
     <w:p>
       <w:r>
-        <w:t xml:space="preserve">Het element </w:t>
+        <w:t xml:space="preserve">De elementen </w:t>
       </w:r>
       <w:r>
         <w:rPr>
@@ -12478,7 +12739,51 @@
         <w:t>toast</w:t>
       </w:r>
       <w:r>
-        <w:t xml:space="preserve"> toont de korte meldingen onderaan het scherm.</w:t>
+        <w:t xml:space="preserve"> (</w:t>
+      </w:r>
+      <w:r>
+        <w:rPr>
+          <w:rFonts w:ascii="Consolas" w:hAnsi="Consolas" w:cs="Consolas"/>
+          <w:sz w:val="18"/>
+          <w:shd w:val="clear" w:color="auto" w:fill="EEF4F2"/>
+        </w:rPr>
+        <w:t>role="status"</w:t>
+      </w:r>
+      <w:r>
+        <w:t xml:space="preserve">, gewone meldingen) en </w:t>
+      </w:r>
+      <w:r>
+        <w:rPr>
+          <w:rFonts w:ascii="Consolas" w:hAnsi="Consolas" w:cs="Consolas"/>
+          <w:sz w:val="18"/>
+          <w:shd w:val="clear" w:color="auto" w:fill="EEF4F2"/>
+        </w:rPr>
+        <w:t>toastAlert</w:t>
+      </w:r>
+      <w:r>
+        <w:t xml:space="preserve"> (</w:t>
+      </w:r>
+      <w:r>
+        <w:rPr>
+          <w:rFonts w:ascii="Consolas" w:hAnsi="Consolas" w:cs="Consolas"/>
+          <w:sz w:val="18"/>
+          <w:shd w:val="clear" w:color="auto" w:fill="EEF4F2"/>
+        </w:rPr>
+        <w:t>role="alert"</w:t>
+      </w:r>
+      <w:r>
+        <w:t xml:space="preserve">, foutmeldingen) tonen de korte meldingen onderaan het scherm. Ze blijven altijd op de pagina staan, zodat een schermlezer ze voorleest (zie </w:t>
+      </w:r>
+      <w:r>
+        <w:rPr>
+          <w:rFonts w:ascii="Consolas" w:hAnsi="Consolas" w:cs="Consolas"/>
+          <w:sz w:val="18"/>
+          <w:shd w:val="clear" w:color="auto" w:fill="EEF4F2"/>
+        </w:rPr>
+        <w:t>showToast</w:t>
+      </w:r>
+      <w:r>
+        <w:t>).</w:t>
       </w:r>
     </w:p>
     <w:p>
@@ -12552,7 +12857,7 @@
         <w:keepNext/>
       </w:pPr>
       <w:bookmarkStart w:id="55" w:name="k28"/>
-      <w:bookmarkStart w:id="56" w:name="_Toc242707536"/>
+      <w:bookmarkStart w:id="56" w:name="_Toc242949019"/>
       <w:r>
         <w:t>WAARSCHUWING BIJ OPENEN ALS LOS BESTAND</w:t>
       </w:r>
@@ -12597,7 +12902,7 @@
         </w:numPr>
       </w:pPr>
       <w:bookmarkStart w:id="57" w:name="k29"/>
-      <w:bookmarkStart w:id="58" w:name="_Toc242707537"/>
+      <w:bookmarkStart w:id="58" w:name="_Toc242949020"/>
       <w:r>
         <w:t xml:space="preserve">UITLEG VAN </w:t>
       </w:r>
@@ -12621,7 +12926,7 @@
         <w:keepNext/>
       </w:pPr>
       <w:bookmarkStart w:id="59" w:name="k30"/>
-      <w:bookmarkStart w:id="60" w:name="_Toc242707538"/>
+      <w:bookmarkStart w:id="60" w:name="_Toc242949021"/>
       <w:r>
         <w:t>CSS-VARIABELEN</w:t>
       </w:r>
@@ -13296,7 +13601,7 @@
         <w:keepNext/>
       </w:pPr>
       <w:bookmarkStart w:id="61" w:name="k31"/>
-      <w:bookmarkStart w:id="62" w:name="_Toc242707539"/>
+      <w:bookmarkStart w:id="62" w:name="_Toc242949022"/>
       <w:r>
         <w:t>LAYOUT</w:t>
       </w:r>
@@ -13422,8 +13727,8 @@
         <w:tblLook w:val="04A0" w:firstRow="1" w:lastRow="0" w:firstColumn="1" w:lastColumn="0" w:noHBand="0" w:noVBand="1"/>
       </w:tblPr>
       <w:tblGrid>
-        <w:gridCol w:w="2520"/>
-        <w:gridCol w:w="7118"/>
+        <w:gridCol w:w="2671"/>
+        <w:gridCol w:w="6967"/>
       </w:tblGrid>
       <w:tr>
         <w:trPr>
@@ -13432,7 +13737,7 @@
         </w:trPr>
         <w:tc>
           <w:tcPr>
-            <w:tcW w:w="2520" w:type="dxa"/>
+            <w:tcW w:w="2671" w:type="dxa"/>
             <w:shd w:val="clear" w:color="auto" w:fill="38B5A8"/>
           </w:tcPr>
           <w:p>
@@ -13453,7 +13758,7 @@
         </w:tc>
         <w:tc>
           <w:tcPr>
-            <w:tcW w:w="7118" w:type="dxa"/>
+            <w:tcW w:w="6967" w:type="dxa"/>
             <w:shd w:val="clear" w:color="auto" w:fill="38B5A8"/>
           </w:tcPr>
           <w:p>
@@ -13479,7 +13784,7 @@
         </w:trPr>
         <w:tc>
           <w:tcPr>
-            <w:tcW w:w="2520" w:type="dxa"/>
+            <w:tcW w:w="2671" w:type="dxa"/>
           </w:tcPr>
           <w:p>
             <w:pPr>
@@ -13497,7 +13802,7 @@
         </w:tc>
         <w:tc>
           <w:tcPr>
-            <w:tcW w:w="7118" w:type="dxa"/>
+            <w:tcW w:w="6967" w:type="dxa"/>
           </w:tcPr>
           <w:p>
             <w:pPr>
@@ -13519,7 +13824,7 @@
         </w:trPr>
         <w:tc>
           <w:tcPr>
-            <w:tcW w:w="2520" w:type="dxa"/>
+            <w:tcW w:w="2671" w:type="dxa"/>
           </w:tcPr>
           <w:p>
             <w:pPr>
@@ -13552,7 +13857,7 @@
         </w:tc>
         <w:tc>
           <w:tcPr>
-            <w:tcW w:w="7118" w:type="dxa"/>
+            <w:tcW w:w="6967" w:type="dxa"/>
           </w:tcPr>
           <w:p>
             <w:pPr>
@@ -13574,7 +13879,7 @@
         </w:trPr>
         <w:tc>
           <w:tcPr>
-            <w:tcW w:w="2520" w:type="dxa"/>
+            <w:tcW w:w="2671" w:type="dxa"/>
           </w:tcPr>
           <w:p>
             <w:pPr>
@@ -13588,33 +13893,11 @@
               </w:rPr>
               <w:t>min-width: 721px</w:t>
             </w:r>
-            <w:r>
-              <w:rPr>
-                <w:sz w:val="16"/>
-                <w:szCs w:val="16"/>
-              </w:rPr>
-              <w:t xml:space="preserve">, </w:t>
-            </w:r>
-            <w:r>
-              <w:rPr>
-                <w:rFonts w:ascii="Consolas" w:hAnsi="Consolas" w:cs="Consolas"/>
-                <w:sz w:val="14"/>
-                <w:shd w:val="clear" w:color="auto" w:fill="EEF4F2"/>
-              </w:rPr>
-              <w:t>max-width: 1100px</w:t>
-            </w:r>
-            <w:r>
-              <w:rPr>
-                <w:sz w:val="16"/>
-                <w:szCs w:val="16"/>
-              </w:rPr>
-              <w:t xml:space="preserve"> en staand</w:t>
-            </w:r>
           </w:p>
         </w:tc>
         <w:tc>
           <w:tcPr>
-            <w:tcW w:w="7118" w:type="dxa"/>
+            <w:tcW w:w="6967" w:type="dxa"/>
           </w:tcPr>
           <w:p>
             <w:pPr>
@@ -13625,7 +13908,7 @@
                 <w:sz w:val="16"/>
                 <w:szCs w:val="16"/>
               </w:rPr>
-              <w:t>Compactere banner op een staande tablet, zodat de lijst hoger begint</w:t>
+              <w:t>Het zoekveld en het bedrijfsfilter staan naast elkaar</w:t>
             </w:r>
           </w:p>
         </w:tc>
@@ -13636,7 +13919,7 @@
         </w:trPr>
         <w:tc>
           <w:tcPr>
-            <w:tcW w:w="2520" w:type="dxa"/>
+            <w:tcW w:w="2671" w:type="dxa"/>
           </w:tcPr>
           <w:p>
             <w:pPr>
@@ -13648,13 +13931,58 @@
                 <w:sz w:val="14"/>
                 <w:shd w:val="clear" w:color="auto" w:fill="EEF4F2"/>
               </w:rPr>
-              <w:t>max-width: 720px</w:t>
+              <w:t>min-width: 721px</w:t>
+            </w:r>
+            <w:r>
+              <w:rPr>
+                <w:sz w:val="16"/>
+                <w:szCs w:val="16"/>
+              </w:rPr>
+              <w:t xml:space="preserve">, </w:t>
+            </w:r>
+            <w:r>
+              <w:rPr>
+                <w:rFonts w:ascii="Consolas" w:hAnsi="Consolas" w:cs="Consolas"/>
+                <w:sz w:val="14"/>
+                <w:shd w:val="clear" w:color="auto" w:fill="EEF4F2"/>
+              </w:rPr>
+              <w:t>max-width: 1100px</w:t>
+            </w:r>
+            <w:r>
+              <w:rPr>
+                <w:sz w:val="16"/>
+                <w:szCs w:val="16"/>
+              </w:rPr>
+              <w:t xml:space="preserve"> en staand, of </w:t>
+            </w:r>
+            <w:r>
+              <w:rPr>
+                <w:rFonts w:ascii="Consolas" w:hAnsi="Consolas" w:cs="Consolas"/>
+                <w:sz w:val="14"/>
+                <w:shd w:val="clear" w:color="auto" w:fill="EEF4F2"/>
+              </w:rPr>
+              <w:t>min-width: 721px</w:t>
+            </w:r>
+            <w:r>
+              <w:rPr>
+                <w:sz w:val="16"/>
+                <w:szCs w:val="16"/>
+              </w:rPr>
+              <w:t xml:space="preserve"> en </w:t>
+            </w:r>
+            <w:r>
+              <w:rPr>
+                <w:rFonts w:ascii="Consolas" w:hAnsi="Consolas" w:cs="Consolas"/>
+                <w:sz w:val="14"/>
+                <w:shd w:val="clear" w:color="auto" w:fill="EEF4F2"/>
+              </w:rPr>
+              <w:t>max-height: 900px</w:t>
             </w:r>
           </w:p>
         </w:tc>
         <w:tc>
           <w:tcPr>
-            <w:tcW w:w="7118" w:type="dxa"/>
+            <w:tcW w:w="6967" w:type="dxa"/>
           </w:tcPr>
           <w:p>
             <w:pPr>
@@ -13665,7 +13993,7 @@
                 <w:sz w:val="16"/>
                 <w:szCs w:val="16"/>
               </w:rPr>
-              <w:t>Telefoonindeling: alles onder elkaar, kleinere zijmarge, minder tekst in de bovenbalk</w:t>
+              <w:t>Compactere banner op een staande tablet en op schermen met weinig hoogte (zoals een liggende tablet van 1080 × 810), zodat de lijst hoger begint</w:t>
             </w:r>
           </w:p>
         </w:tc>
@@ -13676,7 +14004,7 @@
         </w:trPr>
         <w:tc>
           <w:tcPr>
-            <w:tcW w:w="2520" w:type="dxa"/>
+            <w:tcW w:w="2671" w:type="dxa"/>
           </w:tcPr>
           <w:p>
             <w:pPr>
@@ -13688,13 +14016,28 @@
                 <w:sz w:val="14"/>
                 <w:shd w:val="clear" w:color="auto" w:fill="EEF4F2"/>
               </w:rPr>
-              <w:t>max-width: 520px</w:t>
+              <w:t>min-width: 1000px</w:t>
+            </w:r>
+            <w:r>
+              <w:rPr>
+                <w:sz w:val="16"/>
+                <w:szCs w:val="16"/>
+              </w:rPr>
+              <w:t xml:space="preserve"> en </w:t>
+            </w:r>
+            <w:r>
+              <w:rPr>
+                <w:rFonts w:ascii="Consolas" w:hAnsi="Consolas" w:cs="Consolas"/>
+                <w:sz w:val="14"/>
+                <w:shd w:val="clear" w:color="auto" w:fill="EEF4F2"/>
+              </w:rPr>
+              <w:t>max-height: 900px</w:t>
             </w:r>
           </w:p>
         </w:tc>
         <w:tc>
           <w:tcPr>
-            <w:tcW w:w="7118" w:type="dxa"/>
+            <w:tcW w:w="6967" w:type="dxa"/>
           </w:tcPr>
           <w:p>
             <w:pPr>
@@ -13705,7 +14048,7 @@
                 <w:sz w:val="16"/>
                 <w:szCs w:val="16"/>
               </w:rPr>
-              <w:t>De naam naast het logo vervalt</w:t>
+              <w:t>Nog iets lagere banner op een liggende tablet, met de uitleg op één regel</w:t>
             </w:r>
           </w:p>
         </w:tc>
@@ -13716,7 +14059,7 @@
         </w:trPr>
         <w:tc>
           <w:tcPr>
-            <w:tcW w:w="2520" w:type="dxa"/>
+            <w:tcW w:w="2671" w:type="dxa"/>
           </w:tcPr>
           <w:p>
             <w:pPr>
@@ -13728,13 +14071,13 @@
                 <w:sz w:val="14"/>
                 <w:shd w:val="clear" w:color="auto" w:fill="EEF4F2"/>
               </w:rPr>
-              <w:t>hover: none</w:t>
+              <w:t>pointer: coarse</w:t>
             </w:r>
           </w:p>
         </w:tc>
         <w:tc>
           <w:tcPr>
-            <w:tcW w:w="7118" w:type="dxa"/>
+            <w:tcW w:w="6967" w:type="dxa"/>
           </w:tcPr>
           <w:p>
             <w:pPr>
@@ -13745,7 +14088,7 @@
                 <w:sz w:val="16"/>
                 <w:szCs w:val="16"/>
               </w:rPr>
-              <w:t xml:space="preserve">De hint </w:t>
+              <w:t xml:space="preserve">Op een aanraakscherm zijn </w:t>
             </w:r>
             <w:r>
               <w:rPr>
@@ -13753,14 +14096,29 @@
                 <w:sz w:val="14"/>
                 <w:shd w:val="clear" w:color="auto" w:fill="EEF4F2"/>
               </w:rPr>
-              <w:t>Ctrl K</w:t>
+              <w:t>−</w:t>
             </w:r>
             <w:r>
               <w:rPr>
                 <w:sz w:val="16"/>
                 <w:szCs w:val="16"/>
               </w:rPr>
-              <w:t xml:space="preserve"> verdwijnt op aanraakschermen zonder toetsenbord</w:t>
+              <w:t xml:space="preserve"> en </w:t>
+            </w:r>
+            <w:r>
+              <w:rPr>
+                <w:rFonts w:ascii="Consolas" w:hAnsi="Consolas" w:cs="Consolas"/>
+                <w:sz w:val="14"/>
+                <w:shd w:val="clear" w:color="auto" w:fill="EEF4F2"/>
+              </w:rPr>
+              <w:t>+</w:t>
+            </w:r>
+            <w:r>
+              <w:rPr>
+                <w:sz w:val="16"/>
+                <w:szCs w:val="16"/>
+              </w:rPr>
+              <w:t xml:space="preserve"> in het productvenster 52 × 52 pixels</w:t>
             </w:r>
           </w:p>
         </w:tc>
@@ -13771,7 +14129,7 @@
         </w:trPr>
         <w:tc>
           <w:tcPr>
-            <w:tcW w:w="2520" w:type="dxa"/>
+            <w:tcW w:w="2671" w:type="dxa"/>
           </w:tcPr>
           <w:p>
             <w:pPr>
@@ -13783,13 +14141,13 @@
                 <w:sz w:val="14"/>
                 <w:shd w:val="clear" w:color="auto" w:fill="EEF4F2"/>
               </w:rPr>
-              <w:t>prefers-reduced-motion: reduce</w:t>
+              <w:t>max-width: 720px</w:t>
             </w:r>
           </w:p>
         </w:tc>
         <w:tc>
           <w:tcPr>
-            <w:tcW w:w="7118" w:type="dxa"/>
+            <w:tcW w:w="6967" w:type="dxa"/>
           </w:tcPr>
           <w:p>
             <w:pPr>
@@ -13800,6 +14158,141 @@
                 <w:sz w:val="16"/>
                 <w:szCs w:val="16"/>
               </w:rPr>
+              <w:t>Telefoonindeling: alles onder elkaar, kleinere zijmarge, minder tekst in de bovenbalk</w:t>
+            </w:r>
+          </w:p>
+        </w:tc>
+      </w:tr>
+      <w:tr>
+        <w:trPr>
+          <w:cantSplit/>
+        </w:trPr>
+        <w:tc>
+          <w:tcPr>
+            <w:tcW w:w="2671" w:type="dxa"/>
+          </w:tcPr>
+          <w:p>
+            <w:pPr>
+              <w:spacing w:before="20" w:after="20" w:line="240" w:lineRule="auto"/>
+            </w:pPr>
+            <w:r>
+              <w:rPr>
+                <w:rFonts w:ascii="Consolas" w:hAnsi="Consolas" w:cs="Consolas"/>
+                <w:sz w:val="14"/>
+                <w:shd w:val="clear" w:color="auto" w:fill="EEF4F2"/>
+              </w:rPr>
+              <w:t>max-width: 520px</w:t>
+            </w:r>
+          </w:p>
+        </w:tc>
+        <w:tc>
+          <w:tcPr>
+            <w:tcW w:w="6967" w:type="dxa"/>
+          </w:tcPr>
+          <w:p>
+            <w:pPr>
+              <w:spacing w:before="20" w:after="20" w:line="240" w:lineRule="auto"/>
+            </w:pPr>
+            <w:r>
+              <w:rPr>
+                <w:sz w:val="16"/>
+                <w:szCs w:val="16"/>
+              </w:rPr>
+              <w:t>De naam naast het logo vervalt</w:t>
+            </w:r>
+          </w:p>
+        </w:tc>
+      </w:tr>
+      <w:tr>
+        <w:trPr>
+          <w:cantSplit/>
+        </w:trPr>
+        <w:tc>
+          <w:tcPr>
+            <w:tcW w:w="2671" w:type="dxa"/>
+          </w:tcPr>
+          <w:p>
+            <w:pPr>
+              <w:spacing w:before="20" w:after="20" w:line="240" w:lineRule="auto"/>
+            </w:pPr>
+            <w:r>
+              <w:rPr>
+                <w:rFonts w:ascii="Consolas" w:hAnsi="Consolas" w:cs="Consolas"/>
+                <w:sz w:val="14"/>
+                <w:shd w:val="clear" w:color="auto" w:fill="EEF4F2"/>
+              </w:rPr>
+              <w:t>hover: none</w:t>
+            </w:r>
+          </w:p>
+        </w:tc>
+        <w:tc>
+          <w:tcPr>
+            <w:tcW w:w="6967" w:type="dxa"/>
+          </w:tcPr>
+          <w:p>
+            <w:pPr>
+              <w:spacing w:before="20" w:after="20" w:line="240" w:lineRule="auto"/>
+            </w:pPr>
+            <w:r>
+              <w:rPr>
+                <w:sz w:val="16"/>
+                <w:szCs w:val="16"/>
+              </w:rPr>
+              <w:t xml:space="preserve">De hint </w:t>
+            </w:r>
+            <w:r>
+              <w:rPr>
+                <w:rFonts w:ascii="Consolas" w:hAnsi="Consolas" w:cs="Consolas"/>
+                <w:sz w:val="14"/>
+                <w:shd w:val="clear" w:color="auto" w:fill="EEF4F2"/>
+              </w:rPr>
+              <w:t>Ctrl K</w:t>
+            </w:r>
+            <w:r>
+              <w:rPr>
+                <w:sz w:val="16"/>
+                <w:szCs w:val="16"/>
+              </w:rPr>
+              <w:t xml:space="preserve"> verdwijnt op aanraakschermen zonder toetsenbord</w:t>
+            </w:r>
+          </w:p>
+        </w:tc>
+      </w:tr>
+      <w:tr>
+        <w:trPr>
+          <w:cantSplit/>
+        </w:trPr>
+        <w:tc>
+          <w:tcPr>
+            <w:tcW w:w="2671" w:type="dxa"/>
+          </w:tcPr>
+          <w:p>
+            <w:pPr>
+              <w:spacing w:before="20" w:after="20" w:line="240" w:lineRule="auto"/>
+            </w:pPr>
+            <w:r>
+              <w:rPr>
+                <w:rFonts w:ascii="Consolas" w:hAnsi="Consolas" w:cs="Consolas"/>
+                <w:sz w:val="14"/>
+                <w:shd w:val="clear" w:color="auto" w:fill="EEF4F2"/>
+              </w:rPr>
+              <w:t>prefers-reduced-motion: reduce</w:t>
+            </w:r>
+          </w:p>
+        </w:tc>
+        <w:tc>
+          <w:tcPr>
+            <w:tcW w:w="6967" w:type="dxa"/>
+          </w:tcPr>
+          <w:p>
+            <w:pPr>
+              <w:spacing w:before="20" w:after="20" w:line="240" w:lineRule="auto"/>
+            </w:pPr>
+            <w:r>
+              <w:rPr>
+                <w:sz w:val="16"/>
+                <w:szCs w:val="16"/>
+              </w:rPr>
               <w:t>Geen animaties voor wie "minder beweging" heeft ingesteld</w:t>
             </w:r>
           </w:p>
@@ -13817,7 +14310,7 @@
         <w:keepNext/>
       </w:pPr>
       <w:bookmarkStart w:id="63" w:name="k32"/>
-      <w:bookmarkStart w:id="64" w:name="_Toc242707540"/>
+      <w:bookmarkStart w:id="64" w:name="_Toc242949023"/>
       <w:r>
         <w:t>COMPONENTEN</w:t>
       </w:r>
@@ -13918,7 +14411,18 @@
         <w:t>+</w:t>
       </w:r>
       <w:r>
-        <w:t xml:space="preserve">-knoppen, de begroeting, het voorstel </w:t>
+        <w:t>-knoppen (op een aanraakscherm 52 pixels), een gekozen product met lichtgroene achtergrond en groene rand (</w:t>
+      </w:r>
+      <w:r>
+        <w:rPr>
+          <w:rFonts w:ascii="Consolas" w:hAnsi="Consolas" w:cs="Consolas"/>
+          <w:sz w:val="18"/>
+          <w:shd w:val="clear" w:color="auto" w:fill="EEF4F2"/>
+        </w:rPr>
+        <w:t>.is-selected</w:t>
+      </w:r>
+      <w:r>
+        <w:t xml:space="preserve">), de begroeting, het voorstel </w:t>
       </w:r>
       <w:r>
         <w:rPr>
@@ -13929,7 +14433,18 @@
         <w:t>Zelfde als vorige keer</w:t>
       </w:r>
       <w:r>
-        <w:t xml:space="preserve"> (na herkenning met pas of camera) en de uitleg over de inhouding op het loon.</w:t>
+        <w:t xml:space="preserve"> (na herkenning met pas of camera), de knopbalk die onderaan in beeld blijft (</w:t>
+      </w:r>
+      <w:r>
+        <w:rPr>
+          <w:rFonts w:ascii="Consolas" w:hAnsi="Consolas" w:cs="Consolas"/>
+          <w:sz w:val="18"/>
+          <w:shd w:val="clear" w:color="auto" w:fill="EEF4F2"/>
+        </w:rPr>
+        <w:t>position: sticky</w:t>
+      </w:r>
+      <w:r>
+        <w:t>) en de uitleg over de inhouding op het loon.</w:t>
       </w:r>
     </w:p>
     <w:p>
@@ -14040,7 +14555,7 @@
         </w:numPr>
       </w:pPr>
       <w:bookmarkStart w:id="65" w:name="k33"/>
-      <w:bookmarkStart w:id="66" w:name="_Toc242707541"/>
+      <w:bookmarkStart w:id="66" w:name="_Toc242949024"/>
       <w:r>
         <w:t>UITLEG VAN DE JAVASCRIPT (</w:t>
       </w:r>
@@ -14064,7 +14579,7 @@
         <w:keepNext/>
       </w:pPr>
       <w:bookmarkStart w:id="67" w:name="k34"/>
-      <w:bookmarkStart w:id="68" w:name="_Toc242707542"/>
+      <w:bookmarkStart w:id="68" w:name="_Toc242949025"/>
       <w:r>
         <w:t>OPSLAG EN VOORBEELDDATA</w:t>
       </w:r>
@@ -14841,7 +15356,7 @@
         <w:keepNext/>
       </w:pPr>
       <w:bookmarkStart w:id="69" w:name="k35"/>
-      <w:bookmarkStart w:id="70" w:name="_Toc242707543"/>
+      <w:bookmarkStart w:id="70" w:name="_Toc242949026"/>
       <w:r>
         <w:t>OBJECTGEORIËNTEERDE STRUCTUUR</w:t>
       </w:r>
@@ -17835,7 +18350,117 @@
         <w:t>event.repeat</w:t>
       </w:r>
       <w:r>
-        <w:t>).</w:t>
+        <w:t xml:space="preserve">). </w:t>
+      </w:r>
+      <w:r>
+        <w:rPr>
+          <w:rFonts w:ascii="Consolas" w:hAnsi="Consolas" w:cs="Consolas"/>
+          <w:sz w:val="18"/>
+          <w:shd w:val="clear" w:color="auto" w:fill="EEF4F2"/>
+        </w:rPr>
+        <w:t>resetEmployeeSearch</w:t>
+      </w:r>
+      <w:r>
+        <w:t xml:space="preserve"> maakt na registreren het zoekveld en het bedrijfsfilter leeg (ook </w:t>
+      </w:r>
+      <w:r>
+        <w:rPr>
+          <w:rFonts w:ascii="Consolas" w:hAnsi="Consolas" w:cs="Consolas"/>
+          <w:sz w:val="18"/>
+          <w:shd w:val="clear" w:color="auto" w:fill="EEF4F2"/>
+        </w:rPr>
+        <w:t>dataset.value</w:t>
+      </w:r>
+      <w:r>
+        <w:t xml:space="preserve"> en </w:t>
+      </w:r>
+      <w:r>
+        <w:rPr>
+          <w:rFonts w:ascii="Consolas" w:hAnsi="Consolas" w:cs="Consolas"/>
+          <w:sz w:val="18"/>
+          <w:shd w:val="clear" w:color="auto" w:fill="EEF4F2"/>
+        </w:rPr>
+        <w:t>aria-selected</w:t>
+      </w:r>
+      <w:r>
+        <w:t xml:space="preserve">) en zet de lijst bovenaan in beeld. </w:t>
+      </w:r>
+      <w:r>
+        <w:rPr>
+          <w:rFonts w:ascii="Consolas" w:hAnsi="Consolas" w:cs="Consolas"/>
+          <w:sz w:val="18"/>
+          <w:shd w:val="clear" w:color="auto" w:fill="EEF4F2"/>
+        </w:rPr>
+        <w:t>startProductIdleWatch</w:t>
+      </w:r>
+      <w:r>
+        <w:t xml:space="preserve">, </w:t>
+      </w:r>
+      <w:r>
+        <w:rPr>
+          <w:rFonts w:ascii="Consolas" w:hAnsi="Consolas" w:cs="Consolas"/>
+          <w:sz w:val="18"/>
+          <w:shd w:val="clear" w:color="auto" w:fill="EEF4F2"/>
+        </w:rPr>
+        <w:t>noteProductActivity</w:t>
+      </w:r>
+      <w:r>
+        <w:t xml:space="preserve"> en </w:t>
+      </w:r>
+      <w:r>
+        <w:rPr>
+          <w:rFonts w:ascii="Consolas" w:hAnsi="Consolas" w:cs="Consolas"/>
+          <w:sz w:val="18"/>
+          <w:shd w:val="clear" w:color="auto" w:fill="EEF4F2"/>
+        </w:rPr>
+        <w:t>closeProductWindowIfIdle</w:t>
+      </w:r>
+      <w:r>
+        <w:t xml:space="preserve"> sluiten het productvenster na 75 seconden zonder invoer (</w:t>
+      </w:r>
+      <w:r>
+        <w:rPr>
+          <w:rFonts w:ascii="Consolas" w:hAnsi="Consolas" w:cs="Consolas"/>
+          <w:sz w:val="18"/>
+          <w:shd w:val="clear" w:color="auto" w:fill="EEF4F2"/>
+        </w:rPr>
+        <w:t>EMPLOYEE_IDLE_CLOSE_MS</w:t>
+      </w:r>
+      <w:r>
+        <w:t xml:space="preserve"> in </w:t>
+      </w:r>
+      <w:r>
+        <w:rPr>
+          <w:rFonts w:ascii="Consolas" w:hAnsi="Consolas" w:cs="Consolas"/>
+          <w:sz w:val="18"/>
+          <w:shd w:val="clear" w:color="auto" w:fill="EEF4F2"/>
+        </w:rPr>
+        <w:t>config.js</w:t>
+      </w:r>
+      <w:r>
+        <w:t xml:space="preserve">): de timer kijkt iedere seconde, iedere tik, toets of scroll in het venster begint de tijd opnieuw, in de laatste 10 seconden toont </w:t>
+      </w:r>
+      <w:r>
+        <w:rPr>
+          <w:rFonts w:ascii="Consolas" w:hAnsi="Consolas" w:cs="Consolas"/>
+          <w:sz w:val="18"/>
+          <w:shd w:val="clear" w:color="auto" w:fill="EEF4F2"/>
+        </w:rPr>
+        <w:t>setIdleWarning</w:t>
+      </w:r>
+      <w:r>
+        <w:t xml:space="preserve"> de waarschuwing en daarna gaat het venster dicht zonder op te slaan. De klok wordt net als bij </w:t>
+      </w:r>
+      <w:r>
+        <w:rPr>
+          <w:rFonts w:ascii="Consolas" w:hAnsi="Consolas" w:cs="Consolas"/>
+          <w:sz w:val="18"/>
+          <w:shd w:val="clear" w:color="auto" w:fill="EEF4F2"/>
+        </w:rPr>
+        <w:t>AdminController</w:t>
+      </w:r>
+      <w:r>
+        <w:t xml:space="preserve"> aan de constructor meegegeven, zodat de tests met een nep-klok werken.</w:t>
       </w:r>
     </w:p>
     <w:p>
@@ -17949,7 +18574,29 @@
         <w:t>recognizeBadge</w:t>
       </w:r>
       <w:r>
-        <w:t xml:space="preserve"> zoekt na een scan de medewerker op en opent zijn productvenster.</w:t>
+        <w:t xml:space="preserve"> zoekt na een scan de medewerker op en opent zijn productvenster. Staat er een ander venster open dan het productvenster, dan meldt </w:t>
+      </w:r>
+      <w:r>
+        <w:rPr>
+          <w:rFonts w:ascii="Consolas" w:hAnsi="Consolas" w:cs="Consolas"/>
+          <w:sz w:val="18"/>
+          <w:shd w:val="clear" w:color="auto" w:fill="EEF4F2"/>
+        </w:rPr>
+        <w:t>recognizeBadge</w:t>
+      </w:r>
+      <w:r>
+        <w:t xml:space="preserve"> "Sluit eerst het open venster om je pas te gebruiken." Staat het productvenster open, dan beslist </w:t>
+      </w:r>
+      <w:r>
+        <w:rPr>
+          <w:rFonts w:ascii="Consolas" w:hAnsi="Consolas" w:cs="Consolas"/>
+          <w:sz w:val="18"/>
+          <w:shd w:val="clear" w:color="auto" w:fill="EEF4F2"/>
+        </w:rPr>
+        <w:t>replaceProductWindow</w:t>
+      </w:r>
+      <w:r>
+        <w:t>: het eigen venster blijft open, het venster van een collega gaat dicht zonder op te slaan en het venster van de pas opent.</w:t>
       </w:r>
     </w:p>
     <w:p>
@@ -19797,7 +20444,7 @@
         <w:keepNext/>
       </w:pPr>
       <w:bookmarkStart w:id="81" w:name="k46"/>
-      <w:bookmarkStart w:id="82" w:name="_Toc242707544"/>
+      <w:bookmarkStart w:id="82" w:name="_Toc242949027"/>
       <w:r>
         <w:rPr>
           <w:rFonts w:ascii="Consolas" w:hAnsi="Consolas" w:cs="Consolas"/>
@@ -19940,7 +20587,7 @@
         <w:keepNext/>
       </w:pPr>
       <w:bookmarkStart w:id="83" w:name="k47"/>
-      <w:bookmarkStart w:id="84" w:name="_Toc242707545"/>
+      <w:bookmarkStart w:id="84" w:name="_Toc242949028"/>
       <w:r>
         <w:rPr>
           <w:rFonts w:ascii="Consolas" w:hAnsi="Consolas" w:cs="Consolas"/>
@@ -20017,7 +20664,7 @@
         <w:keepNext/>
       </w:pPr>
       <w:bookmarkStart w:id="85" w:name="k48"/>
-      <w:bookmarkStart w:id="86" w:name="_Toc242707546"/>
+      <w:bookmarkStart w:id="86" w:name="_Toc242949029"/>
       <w:r>
         <w:rPr>
           <w:rFonts w:ascii="Consolas" w:hAnsi="Consolas" w:cs="Consolas"/>
@@ -20135,7 +20782,29 @@
         <w:t>persist</w:t>
       </w:r>
       <w:r>
-        <w:t xml:space="preserve"> opgeslagen en alle zichtbare onderdelen opnieuw getekend. Correcties van de beheerder met de </w:t>
+        <w:t xml:space="preserve"> opgeslagen, gaat het venster dicht en maakt </w:t>
+      </w:r>
+      <w:r>
+        <w:rPr>
+          <w:rFonts w:ascii="Consolas" w:hAnsi="Consolas" w:cs="Consolas"/>
+          <w:sz w:val="18"/>
+          <w:shd w:val="clear" w:color="auto" w:fill="EEF4F2"/>
+        </w:rPr>
+        <w:t>resetEmployeeSearch</w:t>
+      </w:r>
+      <w:r>
+        <w:t xml:space="preserve"> het zoekveld en het bedrijfsfilter leeg en tekent alle zichtbare onderdelen opnieuw. Is er niets gekozen, dan slaat de methode niets op en benadrukt </w:t>
+      </w:r>
+      <w:r>
+        <w:rPr>
+          <w:rFonts w:ascii="Consolas" w:hAnsi="Consolas" w:cs="Consolas"/>
+          <w:sz w:val="18"/>
+          <w:shd w:val="clear" w:color="auto" w:fill="EEF4F2"/>
+        </w:rPr>
+        <w:t>RegistrationView.emphasizeRegisterHint</w:t>
+      </w:r>
+      <w:r>
+        <w:t xml:space="preserve"> de regel "Kies eerst een product met +" (geen toast). Correcties van de beheerder met de </w:t>
       </w:r>
       <w:r>
         <w:rPr>
@@ -20166,7 +20835,7 @@
         <w:keepNext/>
       </w:pPr>
       <w:bookmarkStart w:id="87" w:name="k49"/>
-      <w:bookmarkStart w:id="88" w:name="_Toc242707547"/>
+      <w:bookmarkStart w:id="88" w:name="_Toc242949030"/>
       <w:r>
         <w:rPr>
           <w:rFonts w:ascii="Consolas" w:hAnsi="Consolas" w:cs="Consolas"/>
@@ -20233,7 +20902,7 @@
         <w:keepNext/>
       </w:pPr>
       <w:bookmarkStart w:id="89" w:name="k50"/>
-      <w:bookmarkStart w:id="90" w:name="_Toc242707548"/>
+      <w:bookmarkStart w:id="90" w:name="_Toc242949031"/>
       <w:r>
         <w:rPr>
           <w:rFonts w:ascii="Consolas" w:hAnsi="Consolas" w:cs="Consolas"/>
@@ -20355,7 +21024,7 @@
         <w:keepNext/>
       </w:pPr>
       <w:bookmarkStart w:id="91" w:name="k51"/>
-      <w:bookmarkStart w:id="92" w:name="_Toc242707549"/>
+      <w:bookmarkStart w:id="92" w:name="_Toc242949032"/>
       <w:r>
         <w:rPr>
           <w:rFonts w:ascii="Consolas" w:hAnsi="Consolas" w:cs="Consolas"/>
@@ -20391,7 +21060,84 @@
         <w:t>Lotte van Dijk: 2× Blikje, 1× Ei geregistreerd</w:t>
       </w:r>
       <w:r>
-        <w:t xml:space="preserve"> met een vinkje ervoor. Foutmeldingen krijgen een waarschuwingsteken. Standaard verdwijnt een melding na 2,5 seconde. De melding na het registreren blijft 4 seconden staan, zodat een medewerker aan een gedeelde tablet kan lezen voor wie en wat er is opgeslagen.</w:t>
+        <w:t xml:space="preserve"> met een vinkje ervoor. Foutmeldingen krijgen een waarschuwingsteken. Standaard verdwijnt een melding na 2,5 seconde. De melding na het registreren blijft 4 seconden staan, zodat een medewerker aan een gedeelde tablet kan lezen voor wie en wat er is opgeslagen. De tekst is 16 pixels. Gewone meldingen komen in </w:t>
+      </w:r>
+      <w:r>
+        <w:rPr>
+          <w:rFonts w:ascii="Consolas" w:hAnsi="Consolas" w:cs="Consolas"/>
+          <w:sz w:val="18"/>
+          <w:shd w:val="clear" w:color="auto" w:fill="EEF4F2"/>
+        </w:rPr>
+        <w:t>#toast</w:t>
+      </w:r>
+      <w:r>
+        <w:t xml:space="preserve"> (</w:t>
+      </w:r>
+      <w:r>
+        <w:rPr>
+          <w:rFonts w:ascii="Consolas" w:hAnsi="Consolas" w:cs="Consolas"/>
+          <w:sz w:val="18"/>
+          <w:shd w:val="clear" w:color="auto" w:fill="EEF4F2"/>
+        </w:rPr>
+        <w:t>role="status"</w:t>
+      </w:r>
+      <w:r>
+        <w:t xml:space="preserve">), foutmeldingen in </w:t>
+      </w:r>
+      <w:r>
+        <w:rPr>
+          <w:rFonts w:ascii="Consolas" w:hAnsi="Consolas" w:cs="Consolas"/>
+          <w:sz w:val="18"/>
+          <w:shd w:val="clear" w:color="auto" w:fill="EEF4F2"/>
+        </w:rPr>
+        <w:t>#toastAlert</w:t>
+      </w:r>
+      <w:r>
+        <w:t xml:space="preserve"> (</w:t>
+      </w:r>
+      <w:r>
+        <w:rPr>
+          <w:rFonts w:ascii="Consolas" w:hAnsi="Consolas" w:cs="Consolas"/>
+          <w:sz w:val="18"/>
+          <w:shd w:val="clear" w:color="auto" w:fill="EEF4F2"/>
+        </w:rPr>
+        <w:t>role="alert"</w:t>
+      </w:r>
+      <w:r>
+        <w:t>). De methode maakt de regio eerst leeg zichtbaar en zet de tekst er pas na 60 milliseconden in (</w:t>
+      </w:r>
+      <w:r>
+        <w:rPr>
+          <w:rFonts w:ascii="Consolas" w:hAnsi="Consolas" w:cs="Consolas"/>
+          <w:sz w:val="18"/>
+          <w:shd w:val="clear" w:color="auto" w:fill="EEF4F2"/>
+        </w:rPr>
+        <w:t>TOAST_TEXT_DELAY_MS</w:t>
+      </w:r>
+      <w:r>
+        <w:t>), want een schermlezer leest een live region alleen voor als die al bestond voordat de tekst veranderde. Zolang de regio leeg is, is hij doorzichtig (</w:t>
+      </w:r>
+      <w:r>
+        <w:rPr>
+          <w:rFonts w:ascii="Consolas" w:hAnsi="Consolas" w:cs="Consolas"/>
+          <w:sz w:val="18"/>
+          <w:shd w:val="clear" w:color="auto" w:fill="EEF4F2"/>
+        </w:rPr>
+        <w:t>.toast:empty</w:t>
+      </w:r>
+      <w:r>
+        <w:t xml:space="preserve">). </w:t>
+      </w:r>
+      <w:r>
+        <w:rPr>
+          <w:rFonts w:ascii="Consolas" w:hAnsi="Consolas" w:cs="Consolas"/>
+          <w:sz w:val="18"/>
+          <w:shd w:val="clear" w:color="auto" w:fill="EEF4F2"/>
+        </w:rPr>
+        <w:t>hideToast</w:t>
+      </w:r>
+      <w:r>
+        <w:t xml:space="preserve"> haalt een melding weg als er een productvenster opengaat.</w:t>
       </w:r>
     </w:p>
     <w:p>
@@ -20400,7 +21146,7 @@
         <w:keepNext/>
       </w:pPr>
       <w:bookmarkStart w:id="93" w:name="k52"/>
-      <w:bookmarkStart w:id="94" w:name="_Toc242707550"/>
+      <w:bookmarkStart w:id="94" w:name="_Toc242949033"/>
       <w:r>
         <w:t>OPSLAGFOUTEN EN TERUGDRAAIEN</w:t>
       </w:r>
@@ -20462,7 +21208,7 @@
         <w:keepNext/>
       </w:pPr>
       <w:bookmarkStart w:id="95" w:name="k53"/>
-      <w:bookmarkStart w:id="96" w:name="_Toc242707551"/>
+      <w:bookmarkStart w:id="96" w:name="_Toc242949034"/>
       <w:r>
         <w:t>ADMINFUNCTIES</w:t>
       </w:r>
@@ -20708,7 +21454,7 @@
         <w:keepNext/>
       </w:pPr>
       <w:bookmarkStart w:id="97" w:name="k54"/>
-      <w:bookmarkStart w:id="98" w:name="_Toc242707552"/>
+      <w:bookmarkStart w:id="98" w:name="_Toc242949035"/>
       <w:r>
         <w:t xml:space="preserve">CSV-EXPORT (CLASS </w:t>
       </w:r>
@@ -21116,7 +21862,7 @@
         <w:keepNext/>
       </w:pPr>
       <w:bookmarkStart w:id="99" w:name="k55"/>
-      <w:bookmarkStart w:id="100" w:name="_Toc242707553"/>
+      <w:bookmarkStart w:id="100" w:name="_Toc242949036"/>
       <w:r>
         <w:t>EVENT LISTENERS</w:t>
       </w:r>
@@ -21728,7 +22474,7 @@
         </w:numPr>
       </w:pPr>
       <w:bookmarkStart w:id="101" w:name="k56"/>
-      <w:bookmarkStart w:id="102" w:name="_Toc242707554"/>
+      <w:bookmarkStart w:id="102" w:name="_Toc242949037"/>
       <w:r>
         <w:t>DATAMODEL EN KOPPELINGEN.</w:t>
       </w:r>
@@ -21746,7 +22492,7 @@
         <w:keepNext/>
       </w:pPr>
       <w:bookmarkStart w:id="103" w:name="k57"/>
-      <w:bookmarkStart w:id="104" w:name="_Toc242707555"/>
+      <w:bookmarkStart w:id="104" w:name="_Toc242949038"/>
       <w:r>
         <w:t>BEDRIJVEN</w:t>
       </w:r>
@@ -21957,7 +22703,7 @@
         <w:keepNext/>
       </w:pPr>
       <w:bookmarkStart w:id="105" w:name="k58"/>
-      <w:bookmarkStart w:id="106" w:name="_Toc242707556"/>
+      <w:bookmarkStart w:id="106" w:name="_Toc242949039"/>
       <w:r>
         <w:t>CONSUMPTIEPUNTEN</w:t>
       </w:r>
@@ -22276,7 +23022,7 @@
         <w:keepNext/>
       </w:pPr>
       <w:bookmarkStart w:id="107" w:name="k59"/>
-      <w:bookmarkStart w:id="108" w:name="_Toc242707557"/>
+      <w:bookmarkStart w:id="108" w:name="_Toc242949040"/>
       <w:r>
         <w:t>MEDEWERKERS</w:t>
       </w:r>
@@ -22832,7 +23578,7 @@
         <w:keepNext/>
       </w:pPr>
       <w:bookmarkStart w:id="109" w:name="k60"/>
-      <w:bookmarkStart w:id="110" w:name="_Toc242707558"/>
+      <w:bookmarkStart w:id="110" w:name="_Toc242949041"/>
       <w:r>
         <w:t>REGISTRATIES</w:t>
       </w:r>
@@ -23398,7 +24144,7 @@
         </w:numPr>
       </w:pPr>
       <w:bookmarkStart w:id="111" w:name="k61"/>
-      <w:bookmarkStart w:id="112" w:name="_Toc242707559"/>
+      <w:bookmarkStart w:id="112" w:name="_Toc242949042"/>
       <w:r>
         <w:t>BELANGRIJKE DEMO-BEPERKINGEN.</w:t>
       </w:r>
@@ -23792,7 +24538,7 @@
         </w:numPr>
       </w:pPr>
       <w:bookmarkStart w:id="113" w:name="k62"/>
-      <w:bookmarkStart w:id="114" w:name="_Toc242707560"/>
+      <w:bookmarkStart w:id="114" w:name="_Toc242949043"/>
       <w:r>
         <w:t>CODE UITLEGGEN TIJDENS EEN PRESENTATIE.</w:t>
       </w:r>
@@ -24143,7 +24889,7 @@
         </w:numPr>
       </w:pPr>
       <w:bookmarkStart w:id="115" w:name="k63"/>
-      <w:bookmarkStart w:id="116" w:name="_Toc242707561"/>
+      <w:bookmarkStart w:id="116" w:name="_Toc242949044"/>
       <w:r>
         <w:t>MOGELIJKE VERVOLGSTAPPEN.</w:t>
       </w:r>

</xml_diff>

<commit_message>
Screenshots W01 t/m W41 en klassendiagram bijgewerkt naar versie 3.12
- Alle high-fidelity screenshots opnieuw gemaakt met de verbeteringen uit de UX-review
- Klassendiagram met de nieuwe methodes en velden
- Productvenster zonder producten toont geen lege knopbalk meer
- Vensters openen altijd bovenaan, de focus scrolt het venster niet meer weg
- TO, DOCUMENTATIE, README en Word-bestanden bijgewerkt (661 unit tests, 19 browsertests)
</commit_message>
<xml_diff>
--- a/docs/DOCUMENTATIE.docx
+++ b/docs/DOCUMENTATIE.docx
@@ -82,7 +82,7 @@
           <w:numId w:val="0"/>
         </w:numPr>
       </w:pPr>
-      <w:bookmarkStart w:id="0" w:name="_Toc242948991"/>
+      <w:bookmarkStart w:id="0" w:name="_Toc242952340"/>
       <w:r>
         <w:t>INHOUDSOPGAVE.</w:t>
       </w:r>
@@ -112,7 +112,7 @@
       <w:r>
         <w:fldChar w:fldCharType="separate"/>
       </w:r>
-      <w:hyperlink w:anchor="_Toc242948991" w:history="1">
+      <w:hyperlink w:anchor="_Toc242952340" w:history="1">
         <w:r>
           <w:rPr>
             <w:rStyle w:val="Hyperlink"/>
@@ -139,7 +139,7 @@
             <w:noProof/>
             <w:webHidden/>
           </w:rPr>
-          <w:instrText xml:space="preserve"> PAGEREF _Toc242948991 \h </w:instrText>
+          <w:instrText xml:space="preserve"> PAGEREF _Toc242952340 \h </w:instrText>
         </w:r>
         <w:r>
           <w:rPr>
@@ -186,7 +186,7 @@
           <w:lang w:eastAsia="nl-NL"/>
         </w:rPr>
       </w:pPr>
-      <w:hyperlink w:anchor="_Toc242948992" w:history="1">
+      <w:hyperlink w:anchor="_Toc242952341" w:history="1">
         <w:r>
           <w:rPr>
             <w:rStyle w:val="Hyperlink"/>
@@ -231,7 +231,7 @@
             <w:noProof/>
             <w:webHidden/>
           </w:rPr>
-          <w:instrText xml:space="preserve"> PAGEREF _Toc242948992 \h </w:instrText>
+          <w:instrText xml:space="preserve"> PAGEREF _Toc242952341 \h </w:instrText>
         </w:r>
         <w:r>
           <w:rPr>
@@ -278,7 +278,7 @@
           <w:lang w:eastAsia="nl-NL"/>
         </w:rPr>
       </w:pPr>
-      <w:hyperlink w:anchor="_Toc242948993" w:history="1">
+      <w:hyperlink w:anchor="_Toc242952342" w:history="1">
         <w:r>
           <w:rPr>
             <w:rStyle w:val="Hyperlink"/>
@@ -323,7 +323,7 @@
             <w:noProof/>
             <w:webHidden/>
           </w:rPr>
-          <w:instrText xml:space="preserve"> PAGEREF _Toc242948993 \h </w:instrText>
+          <w:instrText xml:space="preserve"> PAGEREF _Toc242952342 \h </w:instrText>
         </w:r>
         <w:r>
           <w:rPr>
@@ -370,7 +370,7 @@
           <w:lang w:eastAsia="nl-NL"/>
         </w:rPr>
       </w:pPr>
-      <w:hyperlink w:anchor="_Toc242948994" w:history="1">
+      <w:hyperlink w:anchor="_Toc242952343" w:history="1">
         <w:r>
           <w:rPr>
             <w:rStyle w:val="Hyperlink"/>
@@ -415,7 +415,7 @@
             <w:noProof/>
             <w:webHidden/>
           </w:rPr>
-          <w:instrText xml:space="preserve"> PAGEREF _Toc242948994 \h </w:instrText>
+          <w:instrText xml:space="preserve"> PAGEREF _Toc242952343 \h </w:instrText>
         </w:r>
         <w:r>
           <w:rPr>
@@ -462,7 +462,7 @@
           <w:lang w:eastAsia="nl-NL"/>
         </w:rPr>
       </w:pPr>
-      <w:hyperlink w:anchor="_Toc242948995" w:history="1">
+      <w:hyperlink w:anchor="_Toc242952344" w:history="1">
         <w:r>
           <w:rPr>
             <w:rStyle w:val="Hyperlink"/>
@@ -507,7 +507,7 @@
             <w:noProof/>
             <w:webHidden/>
           </w:rPr>
-          <w:instrText xml:space="preserve"> PAGEREF _Toc242948995 \h </w:instrText>
+          <w:instrText xml:space="preserve"> PAGEREF _Toc242952344 \h </w:instrText>
         </w:r>
         <w:r>
           <w:rPr>
@@ -554,7 +554,7 @@
           <w:lang w:eastAsia="nl-NL"/>
         </w:rPr>
       </w:pPr>
-      <w:hyperlink w:anchor="_Toc242948996" w:history="1">
+      <w:hyperlink w:anchor="_Toc242952345" w:history="1">
         <w:r>
           <w:rPr>
             <w:rStyle w:val="Hyperlink"/>
@@ -599,7 +599,7 @@
             <w:noProof/>
             <w:webHidden/>
           </w:rPr>
-          <w:instrText xml:space="preserve"> PAGEREF _Toc242948996 \h </w:instrText>
+          <w:instrText xml:space="preserve"> PAGEREF _Toc242952345 \h </w:instrText>
         </w:r>
         <w:r>
           <w:rPr>
@@ -646,7 +646,7 @@
           <w:lang w:eastAsia="nl-NL"/>
         </w:rPr>
       </w:pPr>
-      <w:hyperlink w:anchor="_Toc242948997" w:history="1">
+      <w:hyperlink w:anchor="_Toc242952346" w:history="1">
         <w:r>
           <w:rPr>
             <w:rStyle w:val="Hyperlink"/>
@@ -691,7 +691,7 @@
             <w:noProof/>
             <w:webHidden/>
           </w:rPr>
-          <w:instrText xml:space="preserve"> PAGEREF _Toc242948997 \h </w:instrText>
+          <w:instrText xml:space="preserve"> PAGEREF _Toc242952346 \h </w:instrText>
         </w:r>
         <w:r>
           <w:rPr>
@@ -738,7 +738,7 @@
           <w:lang w:eastAsia="nl-NL"/>
         </w:rPr>
       </w:pPr>
-      <w:hyperlink w:anchor="_Toc242948998" w:history="1">
+      <w:hyperlink w:anchor="_Toc242952347" w:history="1">
         <w:r>
           <w:rPr>
             <w:rStyle w:val="Hyperlink"/>
@@ -783,7 +783,7 @@
             <w:noProof/>
             <w:webHidden/>
           </w:rPr>
-          <w:instrText xml:space="preserve"> PAGEREF _Toc242948998 \h </w:instrText>
+          <w:instrText xml:space="preserve"> PAGEREF _Toc242952347 \h </w:instrText>
         </w:r>
         <w:r>
           <w:rPr>
@@ -830,7 +830,7 @@
           <w:lang w:eastAsia="nl-NL"/>
         </w:rPr>
       </w:pPr>
-      <w:hyperlink w:anchor="_Toc242948999" w:history="1">
+      <w:hyperlink w:anchor="_Toc242952348" w:history="1">
         <w:r>
           <w:rPr>
             <w:rStyle w:val="Hyperlink"/>
@@ -875,7 +875,7 @@
             <w:noProof/>
             <w:webHidden/>
           </w:rPr>
-          <w:instrText xml:space="preserve"> PAGEREF _Toc242948999 \h </w:instrText>
+          <w:instrText xml:space="preserve"> PAGEREF _Toc242952348 \h </w:instrText>
         </w:r>
         <w:r>
           <w:rPr>
@@ -922,7 +922,7 @@
           <w:lang w:eastAsia="nl-NL"/>
         </w:rPr>
       </w:pPr>
-      <w:hyperlink w:anchor="_Toc242949000" w:history="1">
+      <w:hyperlink w:anchor="_Toc242952349" w:history="1">
         <w:r>
           <w:rPr>
             <w:rStyle w:val="Hyperlink"/>
@@ -967,7 +967,7 @@
             <w:noProof/>
             <w:webHidden/>
           </w:rPr>
-          <w:instrText xml:space="preserve"> PAGEREF _Toc242949000 \h </w:instrText>
+          <w:instrText xml:space="preserve"> PAGEREF _Toc242952349 \h </w:instrText>
         </w:r>
         <w:r>
           <w:rPr>
@@ -1014,7 +1014,7 @@
           <w:lang w:eastAsia="nl-NL"/>
         </w:rPr>
       </w:pPr>
-      <w:hyperlink w:anchor="_Toc242949001" w:history="1">
+      <w:hyperlink w:anchor="_Toc242952350" w:history="1">
         <w:r>
           <w:rPr>
             <w:rStyle w:val="Hyperlink"/>
@@ -1059,7 +1059,7 @@
             <w:noProof/>
             <w:webHidden/>
           </w:rPr>
-          <w:instrText xml:space="preserve"> PAGEREF _Toc242949001 \h </w:instrText>
+          <w:instrText xml:space="preserve"> PAGEREF _Toc242952350 \h </w:instrText>
         </w:r>
         <w:r>
           <w:rPr>
@@ -1106,7 +1106,7 @@
           <w:lang w:eastAsia="nl-NL"/>
         </w:rPr>
       </w:pPr>
-      <w:hyperlink w:anchor="_Toc242949002" w:history="1">
+      <w:hyperlink w:anchor="_Toc242952351" w:history="1">
         <w:r>
           <w:rPr>
             <w:rStyle w:val="Hyperlink"/>
@@ -1151,7 +1151,7 @@
             <w:noProof/>
             <w:webHidden/>
           </w:rPr>
-          <w:instrText xml:space="preserve"> PAGEREF _Toc242949002 \h </w:instrText>
+          <w:instrText xml:space="preserve"> PAGEREF _Toc242952351 \h </w:instrText>
         </w:r>
         <w:r>
           <w:rPr>
@@ -1198,7 +1198,7 @@
           <w:lang w:eastAsia="nl-NL"/>
         </w:rPr>
       </w:pPr>
-      <w:hyperlink w:anchor="_Toc242949003" w:history="1">
+      <w:hyperlink w:anchor="_Toc242952352" w:history="1">
         <w:r>
           <w:rPr>
             <w:rStyle w:val="Hyperlink"/>
@@ -1243,7 +1243,7 @@
             <w:noProof/>
             <w:webHidden/>
           </w:rPr>
-          <w:instrText xml:space="preserve"> PAGEREF _Toc242949003 \h </w:instrText>
+          <w:instrText xml:space="preserve"> PAGEREF _Toc242952352 \h </w:instrText>
         </w:r>
         <w:r>
           <w:rPr>
@@ -1290,7 +1290,7 @@
           <w:lang w:eastAsia="nl-NL"/>
         </w:rPr>
       </w:pPr>
-      <w:hyperlink w:anchor="_Toc242949004" w:history="1">
+      <w:hyperlink w:anchor="_Toc242952353" w:history="1">
         <w:r>
           <w:rPr>
             <w:rStyle w:val="Hyperlink"/>
@@ -1335,7 +1335,7 @@
             <w:noProof/>
             <w:webHidden/>
           </w:rPr>
-          <w:instrText xml:space="preserve"> PAGEREF _Toc242949004 \h </w:instrText>
+          <w:instrText xml:space="preserve"> PAGEREF _Toc242952353 \h </w:instrText>
         </w:r>
         <w:r>
           <w:rPr>
@@ -1382,7 +1382,7 @@
           <w:lang w:eastAsia="nl-NL"/>
         </w:rPr>
       </w:pPr>
-      <w:hyperlink w:anchor="_Toc242949005" w:history="1">
+      <w:hyperlink w:anchor="_Toc242952354" w:history="1">
         <w:r>
           <w:rPr>
             <w:rStyle w:val="Hyperlink"/>
@@ -1427,7 +1427,7 @@
             <w:noProof/>
             <w:webHidden/>
           </w:rPr>
-          <w:instrText xml:space="preserve"> PAGEREF _Toc242949005 \h </w:instrText>
+          <w:instrText xml:space="preserve"> PAGEREF _Toc242952354 \h </w:instrText>
         </w:r>
         <w:r>
           <w:rPr>
@@ -1474,7 +1474,7 @@
           <w:lang w:eastAsia="nl-NL"/>
         </w:rPr>
       </w:pPr>
-      <w:hyperlink w:anchor="_Toc242949006" w:history="1">
+      <w:hyperlink w:anchor="_Toc242952355" w:history="1">
         <w:r>
           <w:rPr>
             <w:rStyle w:val="Hyperlink"/>
@@ -1519,7 +1519,7 @@
             <w:noProof/>
             <w:webHidden/>
           </w:rPr>
-          <w:instrText xml:space="preserve"> PAGEREF _Toc242949006 \h </w:instrText>
+          <w:instrText xml:space="preserve"> PAGEREF _Toc242952355 \h </w:instrText>
         </w:r>
         <w:r>
           <w:rPr>
@@ -1566,7 +1566,7 @@
           <w:lang w:eastAsia="nl-NL"/>
         </w:rPr>
       </w:pPr>
-      <w:hyperlink w:anchor="_Toc242949007" w:history="1">
+      <w:hyperlink w:anchor="_Toc242952356" w:history="1">
         <w:r>
           <w:rPr>
             <w:rStyle w:val="Hyperlink"/>
@@ -1611,7 +1611,7 @@
             <w:noProof/>
             <w:webHidden/>
           </w:rPr>
-          <w:instrText xml:space="preserve"> PAGEREF _Toc242949007 \h </w:instrText>
+          <w:instrText xml:space="preserve"> PAGEREF _Toc242952356 \h </w:instrText>
         </w:r>
         <w:r>
           <w:rPr>
@@ -1658,7 +1658,7 @@
           <w:lang w:eastAsia="nl-NL"/>
         </w:rPr>
       </w:pPr>
-      <w:hyperlink w:anchor="_Toc242949008" w:history="1">
+      <w:hyperlink w:anchor="_Toc242952357" w:history="1">
         <w:r>
           <w:rPr>
             <w:rStyle w:val="Hyperlink"/>
@@ -1703,7 +1703,7 @@
             <w:noProof/>
             <w:webHidden/>
           </w:rPr>
-          <w:instrText xml:space="preserve"> PAGEREF _Toc242949008 \h </w:instrText>
+          <w:instrText xml:space="preserve"> PAGEREF _Toc242952357 \h </w:instrText>
         </w:r>
         <w:r>
           <w:rPr>
@@ -1750,7 +1750,7 @@
           <w:lang w:eastAsia="nl-NL"/>
         </w:rPr>
       </w:pPr>
-      <w:hyperlink w:anchor="_Toc242949009" w:history="1">
+      <w:hyperlink w:anchor="_Toc242952358" w:history="1">
         <w:r>
           <w:rPr>
             <w:rStyle w:val="Hyperlink"/>
@@ -1795,7 +1795,7 @@
             <w:noProof/>
             <w:webHidden/>
           </w:rPr>
-          <w:instrText xml:space="preserve"> PAGEREF _Toc242949009 \h </w:instrText>
+          <w:instrText xml:space="preserve"> PAGEREF _Toc242952358 \h </w:instrText>
         </w:r>
         <w:r>
           <w:rPr>
@@ -1842,7 +1842,7 @@
           <w:lang w:eastAsia="nl-NL"/>
         </w:rPr>
       </w:pPr>
-      <w:hyperlink w:anchor="_Toc242949010" w:history="1">
+      <w:hyperlink w:anchor="_Toc242952359" w:history="1">
         <w:r>
           <w:rPr>
             <w:rStyle w:val="Hyperlink"/>
@@ -1887,7 +1887,7 @@
             <w:noProof/>
             <w:webHidden/>
           </w:rPr>
-          <w:instrText xml:space="preserve"> PAGEREF _Toc242949010 \h </w:instrText>
+          <w:instrText xml:space="preserve"> PAGEREF _Toc242952359 \h </w:instrText>
         </w:r>
         <w:r>
           <w:rPr>
@@ -1934,7 +1934,7 @@
           <w:lang w:eastAsia="nl-NL"/>
         </w:rPr>
       </w:pPr>
-      <w:hyperlink w:anchor="_Toc242949011" w:history="1">
+      <w:hyperlink w:anchor="_Toc242952360" w:history="1">
         <w:r>
           <w:rPr>
             <w:rStyle w:val="Hyperlink"/>
@@ -1979,7 +1979,7 @@
             <w:noProof/>
             <w:webHidden/>
           </w:rPr>
-          <w:instrText xml:space="preserve"> PAGEREF _Toc242949011 \h </w:instrText>
+          <w:instrText xml:space="preserve"> PAGEREF _Toc242952360 \h </w:instrText>
         </w:r>
         <w:r>
           <w:rPr>
@@ -2026,7 +2026,7 @@
           <w:lang w:eastAsia="nl-NL"/>
         </w:rPr>
       </w:pPr>
-      <w:hyperlink w:anchor="_Toc242949012" w:history="1">
+      <w:hyperlink w:anchor="_Toc242952361" w:history="1">
         <w:r>
           <w:rPr>
             <w:rStyle w:val="Hyperlink"/>
@@ -2087,7 +2087,7 @@
             <w:noProof/>
             <w:webHidden/>
           </w:rPr>
-          <w:instrText xml:space="preserve"> PAGEREF _Toc242949012 \h </w:instrText>
+          <w:instrText xml:space="preserve"> PAGEREF _Toc242952361 \h </w:instrText>
         </w:r>
         <w:r>
           <w:rPr>
@@ -2134,7 +2134,7 @@
           <w:lang w:eastAsia="nl-NL"/>
         </w:rPr>
       </w:pPr>
-      <w:hyperlink w:anchor="_Toc242949013" w:history="1">
+      <w:hyperlink w:anchor="_Toc242952362" w:history="1">
         <w:r>
           <w:rPr>
             <w:rStyle w:val="Hyperlink"/>
@@ -2179,7 +2179,7 @@
             <w:noProof/>
             <w:webHidden/>
           </w:rPr>
-          <w:instrText xml:space="preserve"> PAGEREF _Toc242949013 \h </w:instrText>
+          <w:instrText xml:space="preserve"> PAGEREF _Toc242952362 \h </w:instrText>
         </w:r>
         <w:r>
           <w:rPr>
@@ -2226,7 +2226,7 @@
           <w:lang w:eastAsia="nl-NL"/>
         </w:rPr>
       </w:pPr>
-      <w:hyperlink w:anchor="_Toc242949014" w:history="1">
+      <w:hyperlink w:anchor="_Toc242952363" w:history="1">
         <w:r>
           <w:rPr>
             <w:rStyle w:val="Hyperlink"/>
@@ -2271,7 +2271,7 @@
             <w:noProof/>
             <w:webHidden/>
           </w:rPr>
-          <w:instrText xml:space="preserve"> PAGEREF _Toc242949014 \h </w:instrText>
+          <w:instrText xml:space="preserve"> PAGEREF _Toc242952363 \h </w:instrText>
         </w:r>
         <w:r>
           <w:rPr>
@@ -2318,7 +2318,7 @@
           <w:lang w:eastAsia="nl-NL"/>
         </w:rPr>
       </w:pPr>
-      <w:hyperlink w:anchor="_Toc242949015" w:history="1">
+      <w:hyperlink w:anchor="_Toc242952364" w:history="1">
         <w:r>
           <w:rPr>
             <w:rStyle w:val="Hyperlink"/>
@@ -2363,7 +2363,7 @@
             <w:noProof/>
             <w:webHidden/>
           </w:rPr>
-          <w:instrText xml:space="preserve"> PAGEREF _Toc242949015 \h </w:instrText>
+          <w:instrText xml:space="preserve"> PAGEREF _Toc242952364 \h </w:instrText>
         </w:r>
         <w:r>
           <w:rPr>
@@ -2410,7 +2410,7 @@
           <w:lang w:eastAsia="nl-NL"/>
         </w:rPr>
       </w:pPr>
-      <w:hyperlink w:anchor="_Toc242949016" w:history="1">
+      <w:hyperlink w:anchor="_Toc242952365" w:history="1">
         <w:r>
           <w:rPr>
             <w:rStyle w:val="Hyperlink"/>
@@ -2455,7 +2455,7 @@
             <w:noProof/>
             <w:webHidden/>
           </w:rPr>
-          <w:instrText xml:space="preserve"> PAGEREF _Toc242949016 \h </w:instrText>
+          <w:instrText xml:space="preserve"> PAGEREF _Toc242952365 \h </w:instrText>
         </w:r>
         <w:r>
           <w:rPr>
@@ -2502,7 +2502,7 @@
           <w:lang w:eastAsia="nl-NL"/>
         </w:rPr>
       </w:pPr>
-      <w:hyperlink w:anchor="_Toc242949017" w:history="1">
+      <w:hyperlink w:anchor="_Toc242952366" w:history="1">
         <w:r>
           <w:rPr>
             <w:rStyle w:val="Hyperlink"/>
@@ -2547,7 +2547,7 @@
             <w:noProof/>
             <w:webHidden/>
           </w:rPr>
-          <w:instrText xml:space="preserve"> PAGEREF _Toc242949017 \h </w:instrText>
+          <w:instrText xml:space="preserve"> PAGEREF _Toc242952366 \h </w:instrText>
         </w:r>
         <w:r>
           <w:rPr>
@@ -2594,7 +2594,7 @@
           <w:lang w:eastAsia="nl-NL"/>
         </w:rPr>
       </w:pPr>
-      <w:hyperlink w:anchor="_Toc242949018" w:history="1">
+      <w:hyperlink w:anchor="_Toc242952367" w:history="1">
         <w:r>
           <w:rPr>
             <w:rStyle w:val="Hyperlink"/>
@@ -2639,7 +2639,7 @@
             <w:noProof/>
             <w:webHidden/>
           </w:rPr>
-          <w:instrText xml:space="preserve"> PAGEREF _Toc242949018 \h </w:instrText>
+          <w:instrText xml:space="preserve"> PAGEREF _Toc242952367 \h </w:instrText>
         </w:r>
         <w:r>
           <w:rPr>
@@ -2686,7 +2686,7 @@
           <w:lang w:eastAsia="nl-NL"/>
         </w:rPr>
       </w:pPr>
-      <w:hyperlink w:anchor="_Toc242949019" w:history="1">
+      <w:hyperlink w:anchor="_Toc242952368" w:history="1">
         <w:r>
           <w:rPr>
             <w:rStyle w:val="Hyperlink"/>
@@ -2731,7 +2731,7 @@
             <w:noProof/>
             <w:webHidden/>
           </w:rPr>
-          <w:instrText xml:space="preserve"> PAGEREF _Toc242949019 \h </w:instrText>
+          <w:instrText xml:space="preserve"> PAGEREF _Toc242952368 \h </w:instrText>
         </w:r>
         <w:r>
           <w:rPr>
@@ -2778,7 +2778,7 @@
           <w:lang w:eastAsia="nl-NL"/>
         </w:rPr>
       </w:pPr>
-      <w:hyperlink w:anchor="_Toc242949020" w:history="1">
+      <w:hyperlink w:anchor="_Toc242952369" w:history="1">
         <w:r>
           <w:rPr>
             <w:rStyle w:val="Hyperlink"/>
@@ -2839,7 +2839,7 @@
             <w:noProof/>
             <w:webHidden/>
           </w:rPr>
-          <w:instrText xml:space="preserve"> PAGEREF _Toc242949020 \h </w:instrText>
+          <w:instrText xml:space="preserve"> PAGEREF _Toc242952369 \h </w:instrText>
         </w:r>
         <w:r>
           <w:rPr>
@@ -2886,7 +2886,7 @@
           <w:lang w:eastAsia="nl-NL"/>
         </w:rPr>
       </w:pPr>
-      <w:hyperlink w:anchor="_Toc242949021" w:history="1">
+      <w:hyperlink w:anchor="_Toc242952370" w:history="1">
         <w:r>
           <w:rPr>
             <w:rStyle w:val="Hyperlink"/>
@@ -2931,7 +2931,7 @@
             <w:noProof/>
             <w:webHidden/>
           </w:rPr>
-          <w:instrText xml:space="preserve"> PAGEREF _Toc242949021 \h </w:instrText>
+          <w:instrText xml:space="preserve"> PAGEREF _Toc242952370 \h </w:instrText>
         </w:r>
         <w:r>
           <w:rPr>
@@ -2978,7 +2978,7 @@
           <w:lang w:eastAsia="nl-NL"/>
         </w:rPr>
       </w:pPr>
-      <w:hyperlink w:anchor="_Toc242949022" w:history="1">
+      <w:hyperlink w:anchor="_Toc242952371" w:history="1">
         <w:r>
           <w:rPr>
             <w:rStyle w:val="Hyperlink"/>
@@ -3023,7 +3023,7 @@
             <w:noProof/>
             <w:webHidden/>
           </w:rPr>
-          <w:instrText xml:space="preserve"> PAGEREF _Toc242949022 \h </w:instrText>
+          <w:instrText xml:space="preserve"> PAGEREF _Toc242952371 \h </w:instrText>
         </w:r>
         <w:r>
           <w:rPr>
@@ -3070,7 +3070,7 @@
           <w:lang w:eastAsia="nl-NL"/>
         </w:rPr>
       </w:pPr>
-      <w:hyperlink w:anchor="_Toc242949023" w:history="1">
+      <w:hyperlink w:anchor="_Toc242952372" w:history="1">
         <w:r>
           <w:rPr>
             <w:rStyle w:val="Hyperlink"/>
@@ -3115,7 +3115,7 @@
             <w:noProof/>
             <w:webHidden/>
           </w:rPr>
-          <w:instrText xml:space="preserve"> PAGEREF _Toc242949023 \h </w:instrText>
+          <w:instrText xml:space="preserve"> PAGEREF _Toc242952372 \h </w:instrText>
         </w:r>
         <w:r>
           <w:rPr>
@@ -3162,7 +3162,7 @@
           <w:lang w:eastAsia="nl-NL"/>
         </w:rPr>
       </w:pPr>
-      <w:hyperlink w:anchor="_Toc242949024" w:history="1">
+      <w:hyperlink w:anchor="_Toc242952373" w:history="1">
         <w:r>
           <w:rPr>
             <w:rStyle w:val="Hyperlink"/>
@@ -3223,7 +3223,7 @@
             <w:noProof/>
             <w:webHidden/>
           </w:rPr>
-          <w:instrText xml:space="preserve"> PAGEREF _Toc242949024 \h </w:instrText>
+          <w:instrText xml:space="preserve"> PAGEREF _Toc242952373 \h </w:instrText>
         </w:r>
         <w:r>
           <w:rPr>
@@ -3270,7 +3270,7 @@
           <w:lang w:eastAsia="nl-NL"/>
         </w:rPr>
       </w:pPr>
-      <w:hyperlink w:anchor="_Toc242949025" w:history="1">
+      <w:hyperlink w:anchor="_Toc242952374" w:history="1">
         <w:r>
           <w:rPr>
             <w:rStyle w:val="Hyperlink"/>
@@ -3315,7 +3315,7 @@
             <w:noProof/>
             <w:webHidden/>
           </w:rPr>
-          <w:instrText xml:space="preserve"> PAGEREF _Toc242949025 \h </w:instrText>
+          <w:instrText xml:space="preserve"> PAGEREF _Toc242952374 \h </w:instrText>
         </w:r>
         <w:r>
           <w:rPr>
@@ -3362,7 +3362,7 @@
           <w:lang w:eastAsia="nl-NL"/>
         </w:rPr>
       </w:pPr>
-      <w:hyperlink w:anchor="_Toc242949026" w:history="1">
+      <w:hyperlink w:anchor="_Toc242952375" w:history="1">
         <w:r>
           <w:rPr>
             <w:rStyle w:val="Hyperlink"/>
@@ -3407,7 +3407,7 @@
             <w:noProof/>
             <w:webHidden/>
           </w:rPr>
-          <w:instrText xml:space="preserve"> PAGEREF _Toc242949026 \h </w:instrText>
+          <w:instrText xml:space="preserve"> PAGEREF _Toc242952375 \h </w:instrText>
         </w:r>
         <w:r>
           <w:rPr>
@@ -3454,7 +3454,7 @@
           <w:lang w:eastAsia="nl-NL"/>
         </w:rPr>
       </w:pPr>
-      <w:hyperlink w:anchor="_Toc242949027" w:history="1">
+      <w:hyperlink w:anchor="_Toc242952376" w:history="1">
         <w:r>
           <w:rPr>
             <w:rStyle w:val="Hyperlink"/>
@@ -3501,7 +3501,7 @@
             <w:noProof/>
             <w:webHidden/>
           </w:rPr>
-          <w:instrText xml:space="preserve"> PAGEREF _Toc242949027 \h </w:instrText>
+          <w:instrText xml:space="preserve"> PAGEREF _Toc242952376 \h </w:instrText>
         </w:r>
         <w:r>
           <w:rPr>
@@ -3548,7 +3548,7 @@
           <w:lang w:eastAsia="nl-NL"/>
         </w:rPr>
       </w:pPr>
-      <w:hyperlink w:anchor="_Toc242949028" w:history="1">
+      <w:hyperlink w:anchor="_Toc242952377" w:history="1">
         <w:r>
           <w:rPr>
             <w:rStyle w:val="Hyperlink"/>
@@ -3595,7 +3595,7 @@
             <w:noProof/>
             <w:webHidden/>
           </w:rPr>
-          <w:instrText xml:space="preserve"> PAGEREF _Toc242949028 \h </w:instrText>
+          <w:instrText xml:space="preserve"> PAGEREF _Toc242952377 \h </w:instrText>
         </w:r>
         <w:r>
           <w:rPr>
@@ -3642,7 +3642,7 @@
           <w:lang w:eastAsia="nl-NL"/>
         </w:rPr>
       </w:pPr>
-      <w:hyperlink w:anchor="_Toc242949029" w:history="1">
+      <w:hyperlink w:anchor="_Toc242952378" w:history="1">
         <w:r>
           <w:rPr>
             <w:rStyle w:val="Hyperlink"/>
@@ -3689,7 +3689,7 @@
             <w:noProof/>
             <w:webHidden/>
           </w:rPr>
-          <w:instrText xml:space="preserve"> PAGEREF _Toc242949029 \h </w:instrText>
+          <w:instrText xml:space="preserve"> PAGEREF _Toc242952378 \h </w:instrText>
         </w:r>
         <w:r>
           <w:rPr>
@@ -3736,7 +3736,7 @@
           <w:lang w:eastAsia="nl-NL"/>
         </w:rPr>
       </w:pPr>
-      <w:hyperlink w:anchor="_Toc242949030" w:history="1">
+      <w:hyperlink w:anchor="_Toc242952379" w:history="1">
         <w:r>
           <w:rPr>
             <w:rStyle w:val="Hyperlink"/>
@@ -3783,7 +3783,7 @@
             <w:noProof/>
             <w:webHidden/>
           </w:rPr>
-          <w:instrText xml:space="preserve"> PAGEREF _Toc242949030 \h </w:instrText>
+          <w:instrText xml:space="preserve"> PAGEREF _Toc242952379 \h </w:instrText>
         </w:r>
         <w:r>
           <w:rPr>
@@ -3830,7 +3830,7 @@
           <w:lang w:eastAsia="nl-NL"/>
         </w:rPr>
       </w:pPr>
-      <w:hyperlink w:anchor="_Toc242949031" w:history="1">
+      <w:hyperlink w:anchor="_Toc242952380" w:history="1">
         <w:r>
           <w:rPr>
             <w:rStyle w:val="Hyperlink"/>
@@ -3877,7 +3877,7 @@
             <w:noProof/>
             <w:webHidden/>
           </w:rPr>
-          <w:instrText xml:space="preserve"> PAGEREF _Toc242949031 \h </w:instrText>
+          <w:instrText xml:space="preserve"> PAGEREF _Toc242952380 \h </w:instrText>
         </w:r>
         <w:r>
           <w:rPr>
@@ -3897,7 +3897,7 @@
             <w:noProof/>
             <w:webHidden/>
           </w:rPr>
-          <w:t>31</w:t>
+          <w:t>32</w:t>
         </w:r>
         <w:r>
           <w:rPr>
@@ -3924,7 +3924,7 @@
           <w:lang w:eastAsia="nl-NL"/>
         </w:rPr>
       </w:pPr>
-      <w:hyperlink w:anchor="_Toc242949032" w:history="1">
+      <w:hyperlink w:anchor="_Toc242952381" w:history="1">
         <w:r>
           <w:rPr>
             <w:rStyle w:val="Hyperlink"/>
@@ -3971,7 +3971,7 @@
             <w:noProof/>
             <w:webHidden/>
           </w:rPr>
-          <w:instrText xml:space="preserve"> PAGEREF _Toc242949032 \h </w:instrText>
+          <w:instrText xml:space="preserve"> PAGEREF _Toc242952381 \h </w:instrText>
         </w:r>
         <w:r>
           <w:rPr>
@@ -4018,7 +4018,7 @@
           <w:lang w:eastAsia="nl-NL"/>
         </w:rPr>
       </w:pPr>
-      <w:hyperlink w:anchor="_Toc242949033" w:history="1">
+      <w:hyperlink w:anchor="_Toc242952382" w:history="1">
         <w:r>
           <w:rPr>
             <w:rStyle w:val="Hyperlink"/>
@@ -4063,7 +4063,7 @@
             <w:noProof/>
             <w:webHidden/>
           </w:rPr>
-          <w:instrText xml:space="preserve"> PAGEREF _Toc242949033 \h </w:instrText>
+          <w:instrText xml:space="preserve"> PAGEREF _Toc242952382 \h </w:instrText>
         </w:r>
         <w:r>
           <w:rPr>
@@ -4110,7 +4110,7 @@
           <w:lang w:eastAsia="nl-NL"/>
         </w:rPr>
       </w:pPr>
-      <w:hyperlink w:anchor="_Toc242949034" w:history="1">
+      <w:hyperlink w:anchor="_Toc242952383" w:history="1">
         <w:r>
           <w:rPr>
             <w:rStyle w:val="Hyperlink"/>
@@ -4155,7 +4155,7 @@
             <w:noProof/>
             <w:webHidden/>
           </w:rPr>
-          <w:instrText xml:space="preserve"> PAGEREF _Toc242949034 \h </w:instrText>
+          <w:instrText xml:space="preserve"> PAGEREF _Toc242952383 \h </w:instrText>
         </w:r>
         <w:r>
           <w:rPr>
@@ -4202,7 +4202,7 @@
           <w:lang w:eastAsia="nl-NL"/>
         </w:rPr>
       </w:pPr>
-      <w:hyperlink w:anchor="_Toc242949035" w:history="1">
+      <w:hyperlink w:anchor="_Toc242952384" w:history="1">
         <w:r>
           <w:rPr>
             <w:rStyle w:val="Hyperlink"/>
@@ -4279,7 +4279,7 @@
             <w:noProof/>
             <w:webHidden/>
           </w:rPr>
-          <w:instrText xml:space="preserve"> PAGEREF _Toc242949035 \h </w:instrText>
+          <w:instrText xml:space="preserve"> PAGEREF _Toc242952384 \h </w:instrText>
         </w:r>
         <w:r>
           <w:rPr>
@@ -4326,7 +4326,7 @@
           <w:lang w:eastAsia="nl-NL"/>
         </w:rPr>
       </w:pPr>
-      <w:hyperlink w:anchor="_Toc242949036" w:history="1">
+      <w:hyperlink w:anchor="_Toc242952385" w:history="1">
         <w:r>
           <w:rPr>
             <w:rStyle w:val="Hyperlink"/>
@@ -4371,7 +4371,7 @@
             <w:noProof/>
             <w:webHidden/>
           </w:rPr>
-          <w:instrText xml:space="preserve"> PAGEREF _Toc242949036 \h </w:instrText>
+          <w:instrText xml:space="preserve"> PAGEREF _Toc242952385 \h </w:instrText>
         </w:r>
         <w:r>
           <w:rPr>
@@ -4418,7 +4418,7 @@
           <w:lang w:eastAsia="nl-NL"/>
         </w:rPr>
       </w:pPr>
-      <w:hyperlink w:anchor="_Toc242949037" w:history="1">
+      <w:hyperlink w:anchor="_Toc242952386" w:history="1">
         <w:r>
           <w:rPr>
             <w:rStyle w:val="Hyperlink"/>
@@ -4463,7 +4463,7 @@
             <w:noProof/>
             <w:webHidden/>
           </w:rPr>
-          <w:instrText xml:space="preserve"> PAGEREF _Toc242949037 \h </w:instrText>
+          <w:instrText xml:space="preserve"> PAGEREF _Toc242952386 \h </w:instrText>
         </w:r>
         <w:r>
           <w:rPr>
@@ -4510,7 +4510,7 @@
           <w:lang w:eastAsia="nl-NL"/>
         </w:rPr>
       </w:pPr>
-      <w:hyperlink w:anchor="_Toc242949038" w:history="1">
+      <w:hyperlink w:anchor="_Toc242952387" w:history="1">
         <w:r>
           <w:rPr>
             <w:rStyle w:val="Hyperlink"/>
@@ -4555,7 +4555,7 @@
             <w:noProof/>
             <w:webHidden/>
           </w:rPr>
-          <w:instrText xml:space="preserve"> PAGEREF _Toc242949038 \h </w:instrText>
+          <w:instrText xml:space="preserve"> PAGEREF _Toc242952387 \h </w:instrText>
         </w:r>
         <w:r>
           <w:rPr>
@@ -4602,7 +4602,7 @@
           <w:lang w:eastAsia="nl-NL"/>
         </w:rPr>
       </w:pPr>
-      <w:hyperlink w:anchor="_Toc242949039" w:history="1">
+      <w:hyperlink w:anchor="_Toc242952388" w:history="1">
         <w:r>
           <w:rPr>
             <w:rStyle w:val="Hyperlink"/>
@@ -4647,7 +4647,7 @@
             <w:noProof/>
             <w:webHidden/>
           </w:rPr>
-          <w:instrText xml:space="preserve"> PAGEREF _Toc242949039 \h </w:instrText>
+          <w:instrText xml:space="preserve"> PAGEREF _Toc242952388 \h </w:instrText>
         </w:r>
         <w:r>
           <w:rPr>
@@ -4694,7 +4694,7 @@
           <w:lang w:eastAsia="nl-NL"/>
         </w:rPr>
       </w:pPr>
-      <w:hyperlink w:anchor="_Toc242949040" w:history="1">
+      <w:hyperlink w:anchor="_Toc242952389" w:history="1">
         <w:r>
           <w:rPr>
             <w:rStyle w:val="Hyperlink"/>
@@ -4739,7 +4739,7 @@
             <w:noProof/>
             <w:webHidden/>
           </w:rPr>
-          <w:instrText xml:space="preserve"> PAGEREF _Toc242949040 \h </w:instrText>
+          <w:instrText xml:space="preserve"> PAGEREF _Toc242952389 \h </w:instrText>
         </w:r>
         <w:r>
           <w:rPr>
@@ -4786,7 +4786,7 @@
           <w:lang w:eastAsia="nl-NL"/>
         </w:rPr>
       </w:pPr>
-      <w:hyperlink w:anchor="_Toc242949041" w:history="1">
+      <w:hyperlink w:anchor="_Toc242952390" w:history="1">
         <w:r>
           <w:rPr>
             <w:rStyle w:val="Hyperlink"/>
@@ -4831,7 +4831,7 @@
             <w:noProof/>
             <w:webHidden/>
           </w:rPr>
-          <w:instrText xml:space="preserve"> PAGEREF _Toc242949041 \h </w:instrText>
+          <w:instrText xml:space="preserve"> PAGEREF _Toc242952390 \h </w:instrText>
         </w:r>
         <w:r>
           <w:rPr>
@@ -4878,7 +4878,7 @@
           <w:lang w:eastAsia="nl-NL"/>
         </w:rPr>
       </w:pPr>
-      <w:hyperlink w:anchor="_Toc242949042" w:history="1">
+      <w:hyperlink w:anchor="_Toc242952391" w:history="1">
         <w:r>
           <w:rPr>
             <w:rStyle w:val="Hyperlink"/>
@@ -4923,7 +4923,7 @@
             <w:noProof/>
             <w:webHidden/>
           </w:rPr>
-          <w:instrText xml:space="preserve"> PAGEREF _Toc242949042 \h </w:instrText>
+          <w:instrText xml:space="preserve"> PAGEREF _Toc242952391 \h </w:instrText>
         </w:r>
         <w:r>
           <w:rPr>
@@ -4970,7 +4970,7 @@
           <w:lang w:eastAsia="nl-NL"/>
         </w:rPr>
       </w:pPr>
-      <w:hyperlink w:anchor="_Toc242949043" w:history="1">
+      <w:hyperlink w:anchor="_Toc242952392" w:history="1">
         <w:r>
           <w:rPr>
             <w:rStyle w:val="Hyperlink"/>
@@ -5015,7 +5015,7 @@
             <w:noProof/>
             <w:webHidden/>
           </w:rPr>
-          <w:instrText xml:space="preserve"> PAGEREF _Toc242949043 \h </w:instrText>
+          <w:instrText xml:space="preserve"> PAGEREF _Toc242952392 \h </w:instrText>
         </w:r>
         <w:r>
           <w:rPr>
@@ -5062,7 +5062,7 @@
           <w:lang w:eastAsia="nl-NL"/>
         </w:rPr>
       </w:pPr>
-      <w:hyperlink w:anchor="_Toc242949044" w:history="1">
+      <w:hyperlink w:anchor="_Toc242952393" w:history="1">
         <w:r>
           <w:rPr>
             <w:rStyle w:val="Hyperlink"/>
@@ -5107,7 +5107,7 @@
             <w:noProof/>
             <w:webHidden/>
           </w:rPr>
-          <w:instrText xml:space="preserve"> PAGEREF _Toc242949044 \h </w:instrText>
+          <w:instrText xml:space="preserve"> PAGEREF _Toc242952393 \h </w:instrText>
         </w:r>
         <w:r>
           <w:rPr>
@@ -5160,7 +5160,7 @@
         </w:numPr>
       </w:pPr>
       <w:bookmarkStart w:id="1" w:name="k1"/>
-      <w:bookmarkStart w:id="2" w:name="_Toc242948992"/>
+      <w:bookmarkStart w:id="2" w:name="_Toc242952341"/>
       <w:r>
         <w:t>DOEL VAN DE APPLICATIE.</w:t>
       </w:r>
@@ -5242,7 +5242,7 @@
         </w:numPr>
       </w:pPr>
       <w:bookmarkStart w:id="3" w:name="k2"/>
-      <w:bookmarkStart w:id="4" w:name="_Toc242948993"/>
+      <w:bookmarkStart w:id="4" w:name="_Toc242952342"/>
       <w:r>
         <w:t>BESTANDEN.</w:t>
       </w:r>
@@ -7165,7 +7165,7 @@
                 <w:sz w:val="16"/>
                 <w:szCs w:val="16"/>
               </w:rPr>
-              <w:t>Unit tests (652) voor de regels, de opslag, de export, het thema, de welkom- en gezichtsherkenningsfuncties, herkennen met de pas, de controller, de beveiliging en regressietests voor opgeloste bugs</w:t>
+              <w:t>Unit tests (661) voor de regels, de opslag, de export, het thema, de welkom- en gezichtsherkenningsfuncties, herkennen met de pas, de controller, de beveiliging en regressietests voor opgeloste bugs</w:t>
             </w:r>
           </w:p>
         </w:tc>
@@ -7843,7 +7843,7 @@
                 <w:sz w:val="16"/>
                 <w:szCs w:val="16"/>
               </w:rPr>
-              <w:t xml:space="preserve">Tests voor de verbeteringen uit de UX-review van oktober 2026 (UX 1 t/m UX 12 in de naam van iedere test): het productvenster dat na 75 seconden vanzelf sluit (met een nep-klok, de waarschuwing en iedere invoer die opnieuw begint), een pas terwijl een venster open is, de knopbalk met </w:t>
+              <w:t xml:space="preserve">Tests voor de verbeteringen uit de UX-review van oktober 2026 (UX 1 t/m UX 12 in de naam van iedere test, daarna 13 en 14): het productvenster dat na 75 seconden vanzelf sluit (met een nep-klok, de waarschuwing en iedere invoer die opnieuw begint), een pas terwijl een venster open is, de knopbalk met </w:t>
             </w:r>
             <w:r>
               <w:rPr>
@@ -7858,7 +7858,7 @@
                 <w:sz w:val="16"/>
                 <w:szCs w:val="16"/>
               </w:rPr>
-              <w:t xml:space="preserve">, zoekveld en bedrijfsfilter leeg na registreren, de compacte banner, de pashint, de opmaak van een gekozen product, de grootte van knoppen, de statusregel en de meldingsregio's voor schermlezers, de leesbaarheid, de nieuwe teksten en </w:t>
+              <w:t xml:space="preserve">, zoekveld en bedrijfsfilter leeg na registreren, de compacte banner, de pashint, de opmaak van een gekozen product, de grootte van knoppen, de statusregel en de meldingsregio's voor schermlezers, de leesbaarheid, de nieuwe teksten, </w:t>
             </w:r>
             <w:r>
               <w:rPr>
@@ -7873,7 +7873,7 @@
                 <w:sz w:val="16"/>
                 <w:szCs w:val="16"/>
               </w:rPr>
-              <w:t xml:space="preserve"> zonder keuze</w:t>
+              <w:t xml:space="preserve"> zonder keuze, een productvenster zonder producten zonder knopbalk en loonregel (13) en vensters die altijd bovenaan openen (14)</w:t>
             </w:r>
           </w:p>
         </w:tc>
@@ -8247,7 +8247,7 @@
         </w:numPr>
       </w:pPr>
       <w:bookmarkStart w:id="5" w:name="k3"/>
-      <w:bookmarkStart w:id="6" w:name="_Toc242948994"/>
+      <w:bookmarkStart w:id="6" w:name="_Toc242952343"/>
       <w:r>
         <w:t>DE WEBSITE STARTEN.</w:t>
       </w:r>
@@ -8469,7 +8469,7 @@
         </w:numPr>
       </w:pPr>
       <w:bookmarkStart w:id="7" w:name="k4"/>
-      <w:bookmarkStart w:id="8" w:name="_Toc242948995"/>
+      <w:bookmarkStart w:id="8" w:name="_Toc242952344"/>
       <w:r>
         <w:t>GEBRUIKERSHANDLEIDING.</w:t>
       </w:r>
@@ -8482,7 +8482,7 @@
         <w:keepNext/>
       </w:pPr>
       <w:bookmarkStart w:id="9" w:name="k5"/>
-      <w:bookmarkStart w:id="10" w:name="_Toc242948996"/>
+      <w:bookmarkStart w:id="10" w:name="_Toc242952345"/>
       <w:r>
         <w:t>EEN MEDEWERKER ZOEKEN</w:t>
       </w:r>
@@ -8537,7 +8537,7 @@
         <w:keepNext/>
       </w:pPr>
       <w:bookmarkStart w:id="11" w:name="k6"/>
-      <w:bookmarkStart w:id="12" w:name="_Toc242948997"/>
+      <w:bookmarkStart w:id="12" w:name="_Toc242952346"/>
       <w:r>
         <w:t>EEN PRODUCT REGISTREREN</w:t>
       </w:r>
@@ -8739,7 +8739,29 @@
         <w:t>Registreren</w:t>
       </w:r>
       <w:r>
-        <w:t xml:space="preserve"> uitgeschakeld en staat erboven "Kies eerst een product met +". Tik je toch op de knop, dan wordt die regel vet en rood en wordt er niets opgeslagen. Biedt je consumptiepunt nog niets aan, dan staat er "Geen producten op jouw consumptiepunt."</w:t>
+        <w:t xml:space="preserve"> uitgeschakeld en staat erboven "Kies eerst een product met +". Tik je toch op de knop, dan wordt die regel vet en rood en wordt er niets opgeslagen. Biedt je consumptiepunt nog niets aan, dan staat er "Geen producten op jouw consumptiepunt." met "Neem contact op met de beheerder als dit niet klopt." De uitleg over </w:t>
+      </w:r>
+      <w:r>
+        <w:rPr>
+          <w:rFonts w:ascii="Consolas" w:hAnsi="Consolas" w:cs="Consolas"/>
+          <w:sz w:val="18"/>
+          <w:shd w:val="clear" w:color="auto" w:fill="EEF4F2"/>
+        </w:rPr>
+        <w:t>+</w:t>
+      </w:r>
+      <w:r>
+        <w:t xml:space="preserve">, de knop </w:t>
+      </w:r>
+      <w:r>
+        <w:rPr>
+          <w:rFonts w:ascii="Consolas" w:hAnsi="Consolas" w:cs="Consolas"/>
+          <w:sz w:val="18"/>
+          <w:shd w:val="clear" w:color="auto" w:fill="EEF4F2"/>
+        </w:rPr>
+        <w:t>Registreren</w:t>
+      </w:r>
+      <w:r>
+        <w:t xml:space="preserve"> en de regel over de inhouding op het loon staan er dan niet, omdat er niets te registreren valt.</w:t>
       </w:r>
     </w:p>
     <w:p>
@@ -8764,7 +8786,7 @@
         <w:keepNext/>
       </w:pPr>
       <w:bookmarkStart w:id="13" w:name="k7"/>
-      <w:bookmarkStart w:id="14" w:name="_Toc242948998"/>
+      <w:bookmarkStart w:id="14" w:name="_Toc242952347"/>
       <w:r>
         <w:t>ADMIN-DASHBOARD OPENEN</w:t>
       </w:r>
@@ -8895,7 +8917,7 @@
         <w:keepNext/>
       </w:pPr>
       <w:bookmarkStart w:id="15" w:name="k8"/>
-      <w:bookmarkStart w:id="16" w:name="_Toc242948999"/>
+      <w:bookmarkStart w:id="16" w:name="_Toc242952348"/>
       <w:r>
         <w:t>REGISTRATIES BEHEREN</w:t>
       </w:r>
@@ -9181,7 +9203,7 @@
         <w:keepNext/>
       </w:pPr>
       <w:bookmarkStart w:id="17" w:name="k9"/>
-      <w:bookmarkStart w:id="18" w:name="_Toc242949000"/>
+      <w:bookmarkStart w:id="18" w:name="_Toc242952349"/>
       <w:r>
         <w:t>MEDEWERKERS BEHEREN</w:t>
       </w:r>
@@ -9515,7 +9537,7 @@
         <w:keepNext/>
       </w:pPr>
       <w:bookmarkStart w:id="19" w:name="k10"/>
-      <w:bookmarkStart w:id="20" w:name="_Toc242949001"/>
+      <w:bookmarkStart w:id="20" w:name="_Toc242952350"/>
       <w:r>
         <w:t>PRODUCTEN BEHEREN</w:t>
       </w:r>
@@ -9643,7 +9665,7 @@
         <w:keepNext/>
       </w:pPr>
       <w:bookmarkStart w:id="21" w:name="k11"/>
-      <w:bookmarkStart w:id="22" w:name="_Toc242949002"/>
+      <w:bookmarkStart w:id="22" w:name="_Toc242952351"/>
       <w:r>
         <w:t>BEDRIJVEN EN CONSUMPTIEPUNTEN BEHEREN</w:t>
       </w:r>
@@ -9806,7 +9828,7 @@
         <w:keepNext/>
       </w:pPr>
       <w:bookmarkStart w:id="23" w:name="k12"/>
-      <w:bookmarkStart w:id="24" w:name="_Toc242949003"/>
+      <w:bookmarkStart w:id="24" w:name="_Toc242952352"/>
       <w:r>
         <w:t>VOORRAAD BEHEREN</w:t>
       </w:r>
@@ -10024,7 +10046,7 @@
         <w:keepNext/>
       </w:pPr>
       <w:bookmarkStart w:id="25" w:name="k13"/>
-      <w:bookmarkStart w:id="26" w:name="_Toc242949004"/>
+      <w:bookmarkStart w:id="26" w:name="_Toc242952353"/>
       <w:r>
         <w:t>LOGBOEK BEKIJKEN</w:t>
       </w:r>
@@ -10064,7 +10086,7 @@
         <w:keepNext/>
       </w:pPr>
       <w:bookmarkStart w:id="27" w:name="k14"/>
-      <w:bookmarkStart w:id="28" w:name="_Toc242949005"/>
+      <w:bookmarkStart w:id="28" w:name="_Toc242952354"/>
       <w:r>
         <w:t>ALLE GEGEVENS WISSEN</w:t>
       </w:r>
@@ -10190,7 +10212,7 @@
         <w:keepNext/>
       </w:pPr>
       <w:bookmarkStart w:id="29" w:name="k15"/>
-      <w:bookmarkStart w:id="30" w:name="_Toc242949006"/>
+      <w:bookmarkStart w:id="30" w:name="_Toc242952355"/>
       <w:r>
         <w:t>MODAL SLUITEN EN UITLOGGEN</w:t>
       </w:r>
@@ -10264,7 +10286,7 @@
         <w:keepNext/>
       </w:pPr>
       <w:bookmarkStart w:id="31" w:name="k16"/>
-      <w:bookmarkStart w:id="32" w:name="_Toc242949007"/>
+      <w:bookmarkStart w:id="32" w:name="_Toc242952356"/>
       <w:r>
         <w:t>CSV EXPORTEREN</w:t>
       </w:r>
@@ -10648,7 +10670,7 @@
         <w:keepNext/>
       </w:pPr>
       <w:bookmarkStart w:id="33" w:name="k17"/>
-      <w:bookmarkStart w:id="34" w:name="_Toc242949008"/>
+      <w:bookmarkStart w:id="34" w:name="_Toc242952357"/>
       <w:r>
         <w:t>LICHT OF DONKER THEMA</w:t>
       </w:r>
@@ -10755,7 +10777,7 @@
         <w:keepNext/>
       </w:pPr>
       <w:bookmarkStart w:id="35" w:name="k18"/>
-      <w:bookmarkStart w:id="36" w:name="_Toc242949009"/>
+      <w:bookmarkStart w:id="36" w:name="_Toc242952358"/>
       <w:r>
         <w:t>WELKOM EN "ZELFDE ALS VORIGE KEER"</w:t>
       </w:r>
@@ -10842,7 +10864,7 @@
         <w:keepNext/>
       </w:pPr>
       <w:bookmarkStart w:id="37" w:name="k19"/>
-      <w:bookmarkStart w:id="38" w:name="_Toc242949010"/>
+      <w:bookmarkStart w:id="38" w:name="_Toc242952359"/>
       <w:r>
         <w:t>DEMO GEZICHTSHERKENNING</w:t>
       </w:r>
@@ -11050,7 +11072,7 @@
         <w:keepNext/>
       </w:pPr>
       <w:bookmarkStart w:id="39" w:name="k20"/>
-      <w:bookmarkStart w:id="40" w:name="_Toc242949011"/>
+      <w:bookmarkStart w:id="40" w:name="_Toc242952360"/>
       <w:r>
         <w:t>HERKENNEN MET DE PAS</w:t>
       </w:r>
@@ -11247,7 +11269,7 @@
         </w:numPr>
       </w:pPr>
       <w:bookmarkStart w:id="41" w:name="k21"/>
-      <w:bookmarkStart w:id="42" w:name="_Toc242949012"/>
+      <w:bookmarkStart w:id="42" w:name="_Toc242952361"/>
       <w:r>
         <w:t xml:space="preserve">UITLEG VAN </w:t>
       </w:r>
@@ -11271,7 +11293,7 @@
         <w:keepNext/>
       </w:pPr>
       <w:bookmarkStart w:id="43" w:name="k22"/>
-      <w:bookmarkStart w:id="44" w:name="_Toc242949013"/>
+      <w:bookmarkStart w:id="44" w:name="_Toc242952362"/>
       <w:r>
         <w:t>METADATA EN EXTERNE BESTANDEN</w:t>
       </w:r>
@@ -11547,7 +11569,7 @@
         <w:keepNext/>
       </w:pPr>
       <w:bookmarkStart w:id="45" w:name="k23"/>
-      <w:bookmarkStart w:id="46" w:name="_Toc242949014"/>
+      <w:bookmarkStart w:id="46" w:name="_Toc242952363"/>
       <w:r>
         <w:t>NAVIGATIEBALK</w:t>
       </w:r>
@@ -11760,7 +11782,7 @@
         <w:keepNext/>
       </w:pPr>
       <w:bookmarkStart w:id="47" w:name="k24"/>
-      <w:bookmarkStart w:id="48" w:name="_Toc242949015"/>
+      <w:bookmarkStart w:id="48" w:name="_Toc242952364"/>
       <w:r>
         <w:t>HERO-GEDEELTE</w:t>
       </w:r>
@@ -11805,7 +11827,7 @@
         <w:keepNext/>
       </w:pPr>
       <w:bookmarkStart w:id="49" w:name="k25"/>
-      <w:bookmarkStart w:id="50" w:name="_Toc242949016"/>
+      <w:bookmarkStart w:id="50" w:name="_Toc242952365"/>
       <w:r>
         <w:t>MEDEWERKERLIJST</w:t>
       </w:r>
@@ -12142,7 +12164,7 @@
         <w:keepNext/>
       </w:pPr>
       <w:bookmarkStart w:id="51" w:name="k26"/>
-      <w:bookmarkStart w:id="52" w:name="_Toc242949017"/>
+      <w:bookmarkStart w:id="52" w:name="_Toc242952366"/>
       <w:r>
         <w:t>STATISTIEKEN</w:t>
       </w:r>
@@ -12225,7 +12247,7 @@
         <w:keepNext/>
       </w:pPr>
       <w:bookmarkStart w:id="53" w:name="k27"/>
-      <w:bookmarkStart w:id="54" w:name="_Toc242949018"/>
+      <w:bookmarkStart w:id="54" w:name="_Toc242952367"/>
       <w:r>
         <w:t>VENSTERS (MODALS)</w:t>
       </w:r>
@@ -12857,7 +12879,7 @@
         <w:keepNext/>
       </w:pPr>
       <w:bookmarkStart w:id="55" w:name="k28"/>
-      <w:bookmarkStart w:id="56" w:name="_Toc242949019"/>
+      <w:bookmarkStart w:id="56" w:name="_Toc242952368"/>
       <w:r>
         <w:t>WAARSCHUWING BIJ OPENEN ALS LOS BESTAND</w:t>
       </w:r>
@@ -12902,7 +12924,7 @@
         </w:numPr>
       </w:pPr>
       <w:bookmarkStart w:id="57" w:name="k29"/>
-      <w:bookmarkStart w:id="58" w:name="_Toc242949020"/>
+      <w:bookmarkStart w:id="58" w:name="_Toc242952369"/>
       <w:r>
         <w:t xml:space="preserve">UITLEG VAN </w:t>
       </w:r>
@@ -12926,7 +12948,7 @@
         <w:keepNext/>
       </w:pPr>
       <w:bookmarkStart w:id="59" w:name="k30"/>
-      <w:bookmarkStart w:id="60" w:name="_Toc242949021"/>
+      <w:bookmarkStart w:id="60" w:name="_Toc242952370"/>
       <w:r>
         <w:t>CSS-VARIABELEN</w:t>
       </w:r>
@@ -13601,7 +13623,7 @@
         <w:keepNext/>
       </w:pPr>
       <w:bookmarkStart w:id="61" w:name="k31"/>
-      <w:bookmarkStart w:id="62" w:name="_Toc242949022"/>
+      <w:bookmarkStart w:id="62" w:name="_Toc242952371"/>
       <w:r>
         <w:t>LAYOUT</w:t>
       </w:r>
@@ -14310,7 +14332,7 @@
         <w:keepNext/>
       </w:pPr>
       <w:bookmarkStart w:id="63" w:name="k32"/>
-      <w:bookmarkStart w:id="64" w:name="_Toc242949023"/>
+      <w:bookmarkStart w:id="64" w:name="_Toc242952372"/>
       <w:r>
         <w:t>COMPONENTEN</w:t>
       </w:r>
@@ -14555,7 +14577,7 @@
         </w:numPr>
       </w:pPr>
       <w:bookmarkStart w:id="65" w:name="k33"/>
-      <w:bookmarkStart w:id="66" w:name="_Toc242949024"/>
+      <w:bookmarkStart w:id="66" w:name="_Toc242952373"/>
       <w:r>
         <w:t>UITLEG VAN DE JAVASCRIPT (</w:t>
       </w:r>
@@ -14579,7 +14601,7 @@
         <w:keepNext/>
       </w:pPr>
       <w:bookmarkStart w:id="67" w:name="k34"/>
-      <w:bookmarkStart w:id="68" w:name="_Toc242949025"/>
+      <w:bookmarkStart w:id="68" w:name="_Toc242952374"/>
       <w:r>
         <w:t>OPSLAG EN VOORBEELDDATA</w:t>
       </w:r>
@@ -15356,7 +15378,7 @@
         <w:keepNext/>
       </w:pPr>
       <w:bookmarkStart w:id="69" w:name="k35"/>
-      <w:bookmarkStart w:id="70" w:name="_Toc242949026"/>
+      <w:bookmarkStart w:id="70" w:name="_Toc242952375"/>
       <w:r>
         <w:t>OBJECTGEORIËNTEERDE STRUCTUUR</w:t>
       </w:r>
@@ -18137,7 +18159,62 @@
         <w:t>hide</w:t>
       </w:r>
       <w:r>
-        <w:t xml:space="preserve"> tonen of verbergen een element.</w:t>
+        <w:t xml:space="preserve"> tonen of verbergen een element. </w:t>
+      </w:r>
+      <w:r>
+        <w:rPr>
+          <w:rFonts w:ascii="Consolas" w:hAnsi="Consolas" w:cs="Consolas"/>
+          <w:sz w:val="18"/>
+          <w:shd w:val="clear" w:color="auto" w:fill="EEF4F2"/>
+        </w:rPr>
+        <w:t>scrollModalToTop</w:t>
+      </w:r>
+      <w:r>
+        <w:t xml:space="preserve"> zet een venster dat opengaat bovenaan (de scrollpositie van het venster en de achtergrond op 0). </w:t>
+      </w:r>
+      <w:r>
+        <w:rPr>
+          <w:rFonts w:ascii="Consolas" w:hAnsi="Consolas" w:cs="Consolas"/>
+          <w:sz w:val="18"/>
+          <w:shd w:val="clear" w:color="auto" w:fill="EEF4F2"/>
+        </w:rPr>
+        <w:t>openModal</w:t>
+      </w:r>
+      <w:r>
+        <w:t xml:space="preserve"> doet dat altijd, en </w:t>
+      </w:r>
+      <w:r>
+        <w:rPr>
+          <w:rFonts w:ascii="Consolas" w:hAnsi="Consolas" w:cs="Consolas"/>
+          <w:sz w:val="18"/>
+          <w:shd w:val="clear" w:color="auto" w:fill="EEF4F2"/>
+        </w:rPr>
+        <w:t>EmployeeController.openEmployeeProducts</w:t>
+      </w:r>
+      <w:r>
+        <w:t xml:space="preserve"> doet het voor het productvenster, met daarna </w:t>
+      </w:r>
+      <w:r>
+        <w:rPr>
+          <w:rFonts w:ascii="Consolas" w:hAnsi="Consolas" w:cs="Consolas"/>
+          <w:sz w:val="18"/>
+          <w:shd w:val="clear" w:color="auto" w:fill="EEF4F2"/>
+        </w:rPr>
+        <w:t>focus({ preventScroll: true })</w:t>
+      </w:r>
+      <w:r>
+        <w:t xml:space="preserve"> op de eerste </w:t>
+      </w:r>
+      <w:r>
+        <w:rPr>
+          <w:rFonts w:ascii="Consolas" w:hAnsi="Consolas" w:cs="Consolas"/>
+          <w:sz w:val="18"/>
+          <w:shd w:val="clear" w:color="auto" w:fill="EEF4F2"/>
+        </w:rPr>
+        <w:t>+</w:t>
+      </w:r>
+      <w:r>
+        <w:t>. Zonder die stap zet de browser de scrollpositie van de vorige keer terug, waardoor het venster een stukje omlaag gescrold kon openen.</w:t>
       </w:r>
     </w:p>
     <w:p>
@@ -20444,7 +20521,7 @@
         <w:keepNext/>
       </w:pPr>
       <w:bookmarkStart w:id="81" w:name="k46"/>
-      <w:bookmarkStart w:id="82" w:name="_Toc242949027"/>
+      <w:bookmarkStart w:id="82" w:name="_Toc242952376"/>
       <w:r>
         <w:rPr>
           <w:rFonts w:ascii="Consolas" w:hAnsi="Consolas" w:cs="Consolas"/>
@@ -20587,7 +20664,7 @@
         <w:keepNext/>
       </w:pPr>
       <w:bookmarkStart w:id="83" w:name="k47"/>
-      <w:bookmarkStart w:id="84" w:name="_Toc242949028"/>
+      <w:bookmarkStart w:id="84" w:name="_Toc242952377"/>
       <w:r>
         <w:rPr>
           <w:rFonts w:ascii="Consolas" w:hAnsi="Consolas" w:cs="Consolas"/>
@@ -20664,7 +20741,7 @@
         <w:keepNext/>
       </w:pPr>
       <w:bookmarkStart w:id="85" w:name="k48"/>
-      <w:bookmarkStart w:id="86" w:name="_Toc242949029"/>
+      <w:bookmarkStart w:id="86" w:name="_Toc242952378"/>
       <w:r>
         <w:rPr>
           <w:rFonts w:ascii="Consolas" w:hAnsi="Consolas" w:cs="Consolas"/>
@@ -20835,7 +20912,7 @@
         <w:keepNext/>
       </w:pPr>
       <w:bookmarkStart w:id="87" w:name="k49"/>
-      <w:bookmarkStart w:id="88" w:name="_Toc242949030"/>
+      <w:bookmarkStart w:id="88" w:name="_Toc242952379"/>
       <w:r>
         <w:rPr>
           <w:rFonts w:ascii="Consolas" w:hAnsi="Consolas" w:cs="Consolas"/>
@@ -20902,7 +20979,7 @@
         <w:keepNext/>
       </w:pPr>
       <w:bookmarkStart w:id="89" w:name="k50"/>
-      <w:bookmarkStart w:id="90" w:name="_Toc242949031"/>
+      <w:bookmarkStart w:id="90" w:name="_Toc242952380"/>
       <w:r>
         <w:rPr>
           <w:rFonts w:ascii="Consolas" w:hAnsi="Consolas" w:cs="Consolas"/>
@@ -21024,7 +21101,7 @@
         <w:keepNext/>
       </w:pPr>
       <w:bookmarkStart w:id="91" w:name="k51"/>
-      <w:bookmarkStart w:id="92" w:name="_Toc242949032"/>
+      <w:bookmarkStart w:id="92" w:name="_Toc242952381"/>
       <w:r>
         <w:rPr>
           <w:rFonts w:ascii="Consolas" w:hAnsi="Consolas" w:cs="Consolas"/>
@@ -21146,7 +21223,7 @@
         <w:keepNext/>
       </w:pPr>
       <w:bookmarkStart w:id="93" w:name="k52"/>
-      <w:bookmarkStart w:id="94" w:name="_Toc242949033"/>
+      <w:bookmarkStart w:id="94" w:name="_Toc242952382"/>
       <w:r>
         <w:t>OPSLAGFOUTEN EN TERUGDRAAIEN</w:t>
       </w:r>
@@ -21208,7 +21285,7 @@
         <w:keepNext/>
       </w:pPr>
       <w:bookmarkStart w:id="95" w:name="k53"/>
-      <w:bookmarkStart w:id="96" w:name="_Toc242949034"/>
+      <w:bookmarkStart w:id="96" w:name="_Toc242952383"/>
       <w:r>
         <w:t>ADMINFUNCTIES</w:t>
       </w:r>
@@ -21454,7 +21531,7 @@
         <w:keepNext/>
       </w:pPr>
       <w:bookmarkStart w:id="97" w:name="k54"/>
-      <w:bookmarkStart w:id="98" w:name="_Toc242949035"/>
+      <w:bookmarkStart w:id="98" w:name="_Toc242952384"/>
       <w:r>
         <w:t xml:space="preserve">CSV-EXPORT (CLASS </w:t>
       </w:r>
@@ -21862,7 +21939,7 @@
         <w:keepNext/>
       </w:pPr>
       <w:bookmarkStart w:id="99" w:name="k55"/>
-      <w:bookmarkStart w:id="100" w:name="_Toc242949036"/>
+      <w:bookmarkStart w:id="100" w:name="_Toc242952385"/>
       <w:r>
         <w:t>EVENT LISTENERS</w:t>
       </w:r>
@@ -22474,7 +22551,7 @@
         </w:numPr>
       </w:pPr>
       <w:bookmarkStart w:id="101" w:name="k56"/>
-      <w:bookmarkStart w:id="102" w:name="_Toc242949037"/>
+      <w:bookmarkStart w:id="102" w:name="_Toc242952386"/>
       <w:r>
         <w:t>DATAMODEL EN KOPPELINGEN.</w:t>
       </w:r>
@@ -22492,7 +22569,7 @@
         <w:keepNext/>
       </w:pPr>
       <w:bookmarkStart w:id="103" w:name="k57"/>
-      <w:bookmarkStart w:id="104" w:name="_Toc242949038"/>
+      <w:bookmarkStart w:id="104" w:name="_Toc242952387"/>
       <w:r>
         <w:t>BEDRIJVEN</w:t>
       </w:r>
@@ -22703,7 +22780,7 @@
         <w:keepNext/>
       </w:pPr>
       <w:bookmarkStart w:id="105" w:name="k58"/>
-      <w:bookmarkStart w:id="106" w:name="_Toc242949039"/>
+      <w:bookmarkStart w:id="106" w:name="_Toc242952388"/>
       <w:r>
         <w:t>CONSUMPTIEPUNTEN</w:t>
       </w:r>
@@ -23022,7 +23099,7 @@
         <w:keepNext/>
       </w:pPr>
       <w:bookmarkStart w:id="107" w:name="k59"/>
-      <w:bookmarkStart w:id="108" w:name="_Toc242949040"/>
+      <w:bookmarkStart w:id="108" w:name="_Toc242952389"/>
       <w:r>
         <w:t>MEDEWERKERS</w:t>
       </w:r>
@@ -23578,7 +23655,7 @@
         <w:keepNext/>
       </w:pPr>
       <w:bookmarkStart w:id="109" w:name="k60"/>
-      <w:bookmarkStart w:id="110" w:name="_Toc242949041"/>
+      <w:bookmarkStart w:id="110" w:name="_Toc242952390"/>
       <w:r>
         <w:t>REGISTRATIES</w:t>
       </w:r>
@@ -24144,7 +24221,7 @@
         </w:numPr>
       </w:pPr>
       <w:bookmarkStart w:id="111" w:name="k61"/>
-      <w:bookmarkStart w:id="112" w:name="_Toc242949042"/>
+      <w:bookmarkStart w:id="112" w:name="_Toc242952391"/>
       <w:r>
         <w:t>BELANGRIJKE DEMO-BEPERKINGEN.</w:t>
       </w:r>
@@ -24538,7 +24615,7 @@
         </w:numPr>
       </w:pPr>
       <w:bookmarkStart w:id="113" w:name="k62"/>
-      <w:bookmarkStart w:id="114" w:name="_Toc242949043"/>
+      <w:bookmarkStart w:id="114" w:name="_Toc242952392"/>
       <w:r>
         <w:t>CODE UITLEGGEN TIJDENS EEN PRESENTATIE.</w:t>
       </w:r>
@@ -24889,7 +24966,7 @@
         </w:numPr>
       </w:pPr>
       <w:bookmarkStart w:id="115" w:name="k63"/>
-      <w:bookmarkStart w:id="116" w:name="_Toc242949044"/>
+      <w:bookmarkStart w:id="116" w:name="_Toc242952393"/>
       <w:r>
         <w:t>MOGELIJKE VERVOLGSTAPPEN.</w:t>
       </w:r>

</xml_diff>

<commit_message>
Browsertests robuust op trage machines en pasjeslezer meet toetsen op het juiste moment
- Klikken in de browsertests wachten tot een element stilstaat (oorzaak van de CI-fout in de koelkasttest)
- Duidelijke foutuitvoer en schermafdrukken als artifact bij een mislukte CI-run
- BadgeReader gebruikt het tijdstip van de toetsaanslag, zodat een scan op een trage tablet niet wordt afgekapt
- TO, DOCUMENTATIE, README en Word-bestanden bijgewerkt (717 unit tests, 21 browsertests)
</commit_message>
<xml_diff>
--- a/docs/DOCUMENTATIE.docx
+++ b/docs/DOCUMENTATIE.docx
@@ -82,7 +82,7 @@
           <w:numId w:val="0"/>
         </w:numPr>
       </w:pPr>
-      <w:bookmarkStart w:id="0" w:name="_Toc243307986"/>
+      <w:bookmarkStart w:id="0" w:name="_Toc243311068"/>
       <w:r>
         <w:t>INHOUDSOPGAVE.</w:t>
       </w:r>
@@ -112,7 +112,7 @@
       <w:r>
         <w:fldChar w:fldCharType="separate"/>
       </w:r>
-      <w:hyperlink w:anchor="_Toc243307986" w:history="1">
+      <w:hyperlink w:anchor="_Toc243311068" w:history="1">
         <w:r>
           <w:rPr>
             <w:rStyle w:val="Hyperlink"/>
@@ -139,7 +139,7 @@
             <w:noProof/>
             <w:webHidden/>
           </w:rPr>
-          <w:instrText xml:space="preserve"> PAGEREF _Toc243307986 \h </w:instrText>
+          <w:instrText xml:space="preserve"> PAGEREF _Toc243311068 \h </w:instrText>
         </w:r>
         <w:r>
           <w:rPr>
@@ -186,7 +186,7 @@
           <w:lang w:eastAsia="nl-NL"/>
         </w:rPr>
       </w:pPr>
-      <w:hyperlink w:anchor="_Toc243307987" w:history="1">
+      <w:hyperlink w:anchor="_Toc243311069" w:history="1">
         <w:r>
           <w:rPr>
             <w:rStyle w:val="Hyperlink"/>
@@ -231,7 +231,7 @@
             <w:noProof/>
             <w:webHidden/>
           </w:rPr>
-          <w:instrText xml:space="preserve"> PAGEREF _Toc243307987 \h </w:instrText>
+          <w:instrText xml:space="preserve"> PAGEREF _Toc243311069 \h </w:instrText>
         </w:r>
         <w:r>
           <w:rPr>
@@ -278,7 +278,7 @@
           <w:lang w:eastAsia="nl-NL"/>
         </w:rPr>
       </w:pPr>
-      <w:hyperlink w:anchor="_Toc243307988" w:history="1">
+      <w:hyperlink w:anchor="_Toc243311070" w:history="1">
         <w:r>
           <w:rPr>
             <w:rStyle w:val="Hyperlink"/>
@@ -323,7 +323,7 @@
             <w:noProof/>
             <w:webHidden/>
           </w:rPr>
-          <w:instrText xml:space="preserve"> PAGEREF _Toc243307988 \h </w:instrText>
+          <w:instrText xml:space="preserve"> PAGEREF _Toc243311070 \h </w:instrText>
         </w:r>
         <w:r>
           <w:rPr>
@@ -370,7 +370,7 @@
           <w:lang w:eastAsia="nl-NL"/>
         </w:rPr>
       </w:pPr>
-      <w:hyperlink w:anchor="_Toc243307989" w:history="1">
+      <w:hyperlink w:anchor="_Toc243311071" w:history="1">
         <w:r>
           <w:rPr>
             <w:rStyle w:val="Hyperlink"/>
@@ -415,7 +415,7 @@
             <w:noProof/>
             <w:webHidden/>
           </w:rPr>
-          <w:instrText xml:space="preserve"> PAGEREF _Toc243307989 \h </w:instrText>
+          <w:instrText xml:space="preserve"> PAGEREF _Toc243311071 \h </w:instrText>
         </w:r>
         <w:r>
           <w:rPr>
@@ -462,7 +462,7 @@
           <w:lang w:eastAsia="nl-NL"/>
         </w:rPr>
       </w:pPr>
-      <w:hyperlink w:anchor="_Toc243307990" w:history="1">
+      <w:hyperlink w:anchor="_Toc243311072" w:history="1">
         <w:r>
           <w:rPr>
             <w:rStyle w:val="Hyperlink"/>
@@ -507,7 +507,7 @@
             <w:noProof/>
             <w:webHidden/>
           </w:rPr>
-          <w:instrText xml:space="preserve"> PAGEREF _Toc243307990 \h </w:instrText>
+          <w:instrText xml:space="preserve"> PAGEREF _Toc243311072 \h </w:instrText>
         </w:r>
         <w:r>
           <w:rPr>
@@ -554,7 +554,7 @@
           <w:lang w:eastAsia="nl-NL"/>
         </w:rPr>
       </w:pPr>
-      <w:hyperlink w:anchor="_Toc243307991" w:history="1">
+      <w:hyperlink w:anchor="_Toc243311073" w:history="1">
         <w:r>
           <w:rPr>
             <w:rStyle w:val="Hyperlink"/>
@@ -599,7 +599,7 @@
             <w:noProof/>
             <w:webHidden/>
           </w:rPr>
-          <w:instrText xml:space="preserve"> PAGEREF _Toc243307991 \h </w:instrText>
+          <w:instrText xml:space="preserve"> PAGEREF _Toc243311073 \h </w:instrText>
         </w:r>
         <w:r>
           <w:rPr>
@@ -646,7 +646,7 @@
           <w:lang w:eastAsia="nl-NL"/>
         </w:rPr>
       </w:pPr>
-      <w:hyperlink w:anchor="_Toc243307992" w:history="1">
+      <w:hyperlink w:anchor="_Toc243311074" w:history="1">
         <w:r>
           <w:rPr>
             <w:rStyle w:val="Hyperlink"/>
@@ -691,7 +691,7 @@
             <w:noProof/>
             <w:webHidden/>
           </w:rPr>
-          <w:instrText xml:space="preserve"> PAGEREF _Toc243307992 \h </w:instrText>
+          <w:instrText xml:space="preserve"> PAGEREF _Toc243311074 \h </w:instrText>
         </w:r>
         <w:r>
           <w:rPr>
@@ -738,7 +738,7 @@
           <w:lang w:eastAsia="nl-NL"/>
         </w:rPr>
       </w:pPr>
-      <w:hyperlink w:anchor="_Toc243307993" w:history="1">
+      <w:hyperlink w:anchor="_Toc243311075" w:history="1">
         <w:r>
           <w:rPr>
             <w:rStyle w:val="Hyperlink"/>
@@ -783,7 +783,7 @@
             <w:noProof/>
             <w:webHidden/>
           </w:rPr>
-          <w:instrText xml:space="preserve"> PAGEREF _Toc243307993 \h </w:instrText>
+          <w:instrText xml:space="preserve"> PAGEREF _Toc243311075 \h </w:instrText>
         </w:r>
         <w:r>
           <w:rPr>
@@ -830,7 +830,7 @@
           <w:lang w:eastAsia="nl-NL"/>
         </w:rPr>
       </w:pPr>
-      <w:hyperlink w:anchor="_Toc243307994" w:history="1">
+      <w:hyperlink w:anchor="_Toc243311076" w:history="1">
         <w:r>
           <w:rPr>
             <w:rStyle w:val="Hyperlink"/>
@@ -875,7 +875,7 @@
             <w:noProof/>
             <w:webHidden/>
           </w:rPr>
-          <w:instrText xml:space="preserve"> PAGEREF _Toc243307994 \h </w:instrText>
+          <w:instrText xml:space="preserve"> PAGEREF _Toc243311076 \h </w:instrText>
         </w:r>
         <w:r>
           <w:rPr>
@@ -922,7 +922,7 @@
           <w:lang w:eastAsia="nl-NL"/>
         </w:rPr>
       </w:pPr>
-      <w:hyperlink w:anchor="_Toc243307995" w:history="1">
+      <w:hyperlink w:anchor="_Toc243311077" w:history="1">
         <w:r>
           <w:rPr>
             <w:rStyle w:val="Hyperlink"/>
@@ -967,7 +967,7 @@
             <w:noProof/>
             <w:webHidden/>
           </w:rPr>
-          <w:instrText xml:space="preserve"> PAGEREF _Toc243307995 \h </w:instrText>
+          <w:instrText xml:space="preserve"> PAGEREF _Toc243311077 \h </w:instrText>
         </w:r>
         <w:r>
           <w:rPr>
@@ -1014,7 +1014,7 @@
           <w:lang w:eastAsia="nl-NL"/>
         </w:rPr>
       </w:pPr>
-      <w:hyperlink w:anchor="_Toc243307996" w:history="1">
+      <w:hyperlink w:anchor="_Toc243311078" w:history="1">
         <w:r>
           <w:rPr>
             <w:rStyle w:val="Hyperlink"/>
@@ -1059,7 +1059,7 @@
             <w:noProof/>
             <w:webHidden/>
           </w:rPr>
-          <w:instrText xml:space="preserve"> PAGEREF _Toc243307996 \h </w:instrText>
+          <w:instrText xml:space="preserve"> PAGEREF _Toc243311078 \h </w:instrText>
         </w:r>
         <w:r>
           <w:rPr>
@@ -1106,7 +1106,7 @@
           <w:lang w:eastAsia="nl-NL"/>
         </w:rPr>
       </w:pPr>
-      <w:hyperlink w:anchor="_Toc243307997" w:history="1">
+      <w:hyperlink w:anchor="_Toc243311079" w:history="1">
         <w:r>
           <w:rPr>
             <w:rStyle w:val="Hyperlink"/>
@@ -1151,7 +1151,7 @@
             <w:noProof/>
             <w:webHidden/>
           </w:rPr>
-          <w:instrText xml:space="preserve"> PAGEREF _Toc243307997 \h </w:instrText>
+          <w:instrText xml:space="preserve"> PAGEREF _Toc243311079 \h </w:instrText>
         </w:r>
         <w:r>
           <w:rPr>
@@ -1198,7 +1198,7 @@
           <w:lang w:eastAsia="nl-NL"/>
         </w:rPr>
       </w:pPr>
-      <w:hyperlink w:anchor="_Toc243307998" w:history="1">
+      <w:hyperlink w:anchor="_Toc243311080" w:history="1">
         <w:r>
           <w:rPr>
             <w:rStyle w:val="Hyperlink"/>
@@ -1243,7 +1243,7 @@
             <w:noProof/>
             <w:webHidden/>
           </w:rPr>
-          <w:instrText xml:space="preserve"> PAGEREF _Toc243307998 \h </w:instrText>
+          <w:instrText xml:space="preserve"> PAGEREF _Toc243311080 \h </w:instrText>
         </w:r>
         <w:r>
           <w:rPr>
@@ -1290,7 +1290,7 @@
           <w:lang w:eastAsia="nl-NL"/>
         </w:rPr>
       </w:pPr>
-      <w:hyperlink w:anchor="_Toc243307999" w:history="1">
+      <w:hyperlink w:anchor="_Toc243311081" w:history="1">
         <w:r>
           <w:rPr>
             <w:rStyle w:val="Hyperlink"/>
@@ -1335,7 +1335,7 @@
             <w:noProof/>
             <w:webHidden/>
           </w:rPr>
-          <w:instrText xml:space="preserve"> PAGEREF _Toc243307999 \h </w:instrText>
+          <w:instrText xml:space="preserve"> PAGEREF _Toc243311081 \h </w:instrText>
         </w:r>
         <w:r>
           <w:rPr>
@@ -1382,7 +1382,7 @@
           <w:lang w:eastAsia="nl-NL"/>
         </w:rPr>
       </w:pPr>
-      <w:hyperlink w:anchor="_Toc243308000" w:history="1">
+      <w:hyperlink w:anchor="_Toc243311082" w:history="1">
         <w:r>
           <w:rPr>
             <w:rStyle w:val="Hyperlink"/>
@@ -1427,7 +1427,7 @@
             <w:noProof/>
             <w:webHidden/>
           </w:rPr>
-          <w:instrText xml:space="preserve"> PAGEREF _Toc243308000 \h </w:instrText>
+          <w:instrText xml:space="preserve"> PAGEREF _Toc243311082 \h </w:instrText>
         </w:r>
         <w:r>
           <w:rPr>
@@ -1474,7 +1474,7 @@
           <w:lang w:eastAsia="nl-NL"/>
         </w:rPr>
       </w:pPr>
-      <w:hyperlink w:anchor="_Toc243308001" w:history="1">
+      <w:hyperlink w:anchor="_Toc243311083" w:history="1">
         <w:r>
           <w:rPr>
             <w:rStyle w:val="Hyperlink"/>
@@ -1519,7 +1519,7 @@
             <w:noProof/>
             <w:webHidden/>
           </w:rPr>
-          <w:instrText xml:space="preserve"> PAGEREF _Toc243308001 \h </w:instrText>
+          <w:instrText xml:space="preserve"> PAGEREF _Toc243311083 \h </w:instrText>
         </w:r>
         <w:r>
           <w:rPr>
@@ -1566,7 +1566,7 @@
           <w:lang w:eastAsia="nl-NL"/>
         </w:rPr>
       </w:pPr>
-      <w:hyperlink w:anchor="_Toc243308002" w:history="1">
+      <w:hyperlink w:anchor="_Toc243311084" w:history="1">
         <w:r>
           <w:rPr>
             <w:rStyle w:val="Hyperlink"/>
@@ -1611,7 +1611,7 @@
             <w:noProof/>
             <w:webHidden/>
           </w:rPr>
-          <w:instrText xml:space="preserve"> PAGEREF _Toc243308002 \h </w:instrText>
+          <w:instrText xml:space="preserve"> PAGEREF _Toc243311084 \h </w:instrText>
         </w:r>
         <w:r>
           <w:rPr>
@@ -1658,7 +1658,7 @@
           <w:lang w:eastAsia="nl-NL"/>
         </w:rPr>
       </w:pPr>
-      <w:hyperlink w:anchor="_Toc243308003" w:history="1">
+      <w:hyperlink w:anchor="_Toc243311085" w:history="1">
         <w:r>
           <w:rPr>
             <w:rStyle w:val="Hyperlink"/>
@@ -1703,7 +1703,7 @@
             <w:noProof/>
             <w:webHidden/>
           </w:rPr>
-          <w:instrText xml:space="preserve"> PAGEREF _Toc243308003 \h </w:instrText>
+          <w:instrText xml:space="preserve"> PAGEREF _Toc243311085 \h </w:instrText>
         </w:r>
         <w:r>
           <w:rPr>
@@ -1750,7 +1750,7 @@
           <w:lang w:eastAsia="nl-NL"/>
         </w:rPr>
       </w:pPr>
-      <w:hyperlink w:anchor="_Toc243308004" w:history="1">
+      <w:hyperlink w:anchor="_Toc243311086" w:history="1">
         <w:r>
           <w:rPr>
             <w:rStyle w:val="Hyperlink"/>
@@ -1795,7 +1795,7 @@
             <w:noProof/>
             <w:webHidden/>
           </w:rPr>
-          <w:instrText xml:space="preserve"> PAGEREF _Toc243308004 \h </w:instrText>
+          <w:instrText xml:space="preserve"> PAGEREF _Toc243311086 \h </w:instrText>
         </w:r>
         <w:r>
           <w:rPr>
@@ -1842,7 +1842,7 @@
           <w:lang w:eastAsia="nl-NL"/>
         </w:rPr>
       </w:pPr>
-      <w:hyperlink w:anchor="_Toc243308005" w:history="1">
+      <w:hyperlink w:anchor="_Toc243311087" w:history="1">
         <w:r>
           <w:rPr>
             <w:rStyle w:val="Hyperlink"/>
@@ -1887,7 +1887,7 @@
             <w:noProof/>
             <w:webHidden/>
           </w:rPr>
-          <w:instrText xml:space="preserve"> PAGEREF _Toc243308005 \h </w:instrText>
+          <w:instrText xml:space="preserve"> PAGEREF _Toc243311087 \h </w:instrText>
         </w:r>
         <w:r>
           <w:rPr>
@@ -1934,7 +1934,7 @@
           <w:lang w:eastAsia="nl-NL"/>
         </w:rPr>
       </w:pPr>
-      <w:hyperlink w:anchor="_Toc243308006" w:history="1">
+      <w:hyperlink w:anchor="_Toc243311088" w:history="1">
         <w:r>
           <w:rPr>
             <w:rStyle w:val="Hyperlink"/>
@@ -1979,7 +1979,7 @@
             <w:noProof/>
             <w:webHidden/>
           </w:rPr>
-          <w:instrText xml:space="preserve"> PAGEREF _Toc243308006 \h </w:instrText>
+          <w:instrText xml:space="preserve"> PAGEREF _Toc243311088 \h </w:instrText>
         </w:r>
         <w:r>
           <w:rPr>
@@ -2026,7 +2026,7 @@
           <w:lang w:eastAsia="nl-NL"/>
         </w:rPr>
       </w:pPr>
-      <w:hyperlink w:anchor="_Toc243308007" w:history="1">
+      <w:hyperlink w:anchor="_Toc243311089" w:history="1">
         <w:r>
           <w:rPr>
             <w:rStyle w:val="Hyperlink"/>
@@ -2071,7 +2071,7 @@
             <w:noProof/>
             <w:webHidden/>
           </w:rPr>
-          <w:instrText xml:space="preserve"> PAGEREF _Toc243308007 \h </w:instrText>
+          <w:instrText xml:space="preserve"> PAGEREF _Toc243311089 \h </w:instrText>
         </w:r>
         <w:r>
           <w:rPr>
@@ -2118,7 +2118,7 @@
           <w:lang w:eastAsia="nl-NL"/>
         </w:rPr>
       </w:pPr>
-      <w:hyperlink w:anchor="_Toc243308008" w:history="1">
+      <w:hyperlink w:anchor="_Toc243311090" w:history="1">
         <w:r>
           <w:rPr>
             <w:rStyle w:val="Hyperlink"/>
@@ -2179,7 +2179,7 @@
             <w:noProof/>
             <w:webHidden/>
           </w:rPr>
-          <w:instrText xml:space="preserve"> PAGEREF _Toc243308008 \h </w:instrText>
+          <w:instrText xml:space="preserve"> PAGEREF _Toc243311090 \h </w:instrText>
         </w:r>
         <w:r>
           <w:rPr>
@@ -2226,7 +2226,7 @@
           <w:lang w:eastAsia="nl-NL"/>
         </w:rPr>
       </w:pPr>
-      <w:hyperlink w:anchor="_Toc243308009" w:history="1">
+      <w:hyperlink w:anchor="_Toc243311091" w:history="1">
         <w:r>
           <w:rPr>
             <w:rStyle w:val="Hyperlink"/>
@@ -2271,7 +2271,7 @@
             <w:noProof/>
             <w:webHidden/>
           </w:rPr>
-          <w:instrText xml:space="preserve"> PAGEREF _Toc243308009 \h </w:instrText>
+          <w:instrText xml:space="preserve"> PAGEREF _Toc243311091 \h </w:instrText>
         </w:r>
         <w:r>
           <w:rPr>
@@ -2318,7 +2318,7 @@
           <w:lang w:eastAsia="nl-NL"/>
         </w:rPr>
       </w:pPr>
-      <w:hyperlink w:anchor="_Toc243308010" w:history="1">
+      <w:hyperlink w:anchor="_Toc243311092" w:history="1">
         <w:r>
           <w:rPr>
             <w:rStyle w:val="Hyperlink"/>
@@ -2363,7 +2363,7 @@
             <w:noProof/>
             <w:webHidden/>
           </w:rPr>
-          <w:instrText xml:space="preserve"> PAGEREF _Toc243308010 \h </w:instrText>
+          <w:instrText xml:space="preserve"> PAGEREF _Toc243311092 \h </w:instrText>
         </w:r>
         <w:r>
           <w:rPr>
@@ -2410,7 +2410,7 @@
           <w:lang w:eastAsia="nl-NL"/>
         </w:rPr>
       </w:pPr>
-      <w:hyperlink w:anchor="_Toc243308011" w:history="1">
+      <w:hyperlink w:anchor="_Toc243311093" w:history="1">
         <w:r>
           <w:rPr>
             <w:rStyle w:val="Hyperlink"/>
@@ -2455,7 +2455,7 @@
             <w:noProof/>
             <w:webHidden/>
           </w:rPr>
-          <w:instrText xml:space="preserve"> PAGEREF _Toc243308011 \h </w:instrText>
+          <w:instrText xml:space="preserve"> PAGEREF _Toc243311093 \h </w:instrText>
         </w:r>
         <w:r>
           <w:rPr>
@@ -2502,7 +2502,7 @@
           <w:lang w:eastAsia="nl-NL"/>
         </w:rPr>
       </w:pPr>
-      <w:hyperlink w:anchor="_Toc243308012" w:history="1">
+      <w:hyperlink w:anchor="_Toc243311094" w:history="1">
         <w:r>
           <w:rPr>
             <w:rStyle w:val="Hyperlink"/>
@@ -2547,7 +2547,7 @@
             <w:noProof/>
             <w:webHidden/>
           </w:rPr>
-          <w:instrText xml:space="preserve"> PAGEREF _Toc243308012 \h </w:instrText>
+          <w:instrText xml:space="preserve"> PAGEREF _Toc243311094 \h </w:instrText>
         </w:r>
         <w:r>
           <w:rPr>
@@ -2594,7 +2594,7 @@
           <w:lang w:eastAsia="nl-NL"/>
         </w:rPr>
       </w:pPr>
-      <w:hyperlink w:anchor="_Toc243308013" w:history="1">
+      <w:hyperlink w:anchor="_Toc243311095" w:history="1">
         <w:r>
           <w:rPr>
             <w:rStyle w:val="Hyperlink"/>
@@ -2639,7 +2639,7 @@
             <w:noProof/>
             <w:webHidden/>
           </w:rPr>
-          <w:instrText xml:space="preserve"> PAGEREF _Toc243308013 \h </w:instrText>
+          <w:instrText xml:space="preserve"> PAGEREF _Toc243311095 \h </w:instrText>
         </w:r>
         <w:r>
           <w:rPr>
@@ -2686,7 +2686,7 @@
           <w:lang w:eastAsia="nl-NL"/>
         </w:rPr>
       </w:pPr>
-      <w:hyperlink w:anchor="_Toc243308014" w:history="1">
+      <w:hyperlink w:anchor="_Toc243311096" w:history="1">
         <w:r>
           <w:rPr>
             <w:rStyle w:val="Hyperlink"/>
@@ -2731,7 +2731,7 @@
             <w:noProof/>
             <w:webHidden/>
           </w:rPr>
-          <w:instrText xml:space="preserve"> PAGEREF _Toc243308014 \h </w:instrText>
+          <w:instrText xml:space="preserve"> PAGEREF _Toc243311096 \h </w:instrText>
         </w:r>
         <w:r>
           <w:rPr>
@@ -2778,7 +2778,7 @@
           <w:lang w:eastAsia="nl-NL"/>
         </w:rPr>
       </w:pPr>
-      <w:hyperlink w:anchor="_Toc243308015" w:history="1">
+      <w:hyperlink w:anchor="_Toc243311097" w:history="1">
         <w:r>
           <w:rPr>
             <w:rStyle w:val="Hyperlink"/>
@@ -2823,7 +2823,7 @@
             <w:noProof/>
             <w:webHidden/>
           </w:rPr>
-          <w:instrText xml:space="preserve"> PAGEREF _Toc243308015 \h </w:instrText>
+          <w:instrText xml:space="preserve"> PAGEREF _Toc243311097 \h </w:instrText>
         </w:r>
         <w:r>
           <w:rPr>
@@ -2870,7 +2870,7 @@
           <w:lang w:eastAsia="nl-NL"/>
         </w:rPr>
       </w:pPr>
-      <w:hyperlink w:anchor="_Toc243308016" w:history="1">
+      <w:hyperlink w:anchor="_Toc243311098" w:history="1">
         <w:r>
           <w:rPr>
             <w:rStyle w:val="Hyperlink"/>
@@ -2931,7 +2931,7 @@
             <w:noProof/>
             <w:webHidden/>
           </w:rPr>
-          <w:instrText xml:space="preserve"> PAGEREF _Toc243308016 \h </w:instrText>
+          <w:instrText xml:space="preserve"> PAGEREF _Toc243311098 \h </w:instrText>
         </w:r>
         <w:r>
           <w:rPr>
@@ -2978,7 +2978,7 @@
           <w:lang w:eastAsia="nl-NL"/>
         </w:rPr>
       </w:pPr>
-      <w:hyperlink w:anchor="_Toc243308017" w:history="1">
+      <w:hyperlink w:anchor="_Toc243311099" w:history="1">
         <w:r>
           <w:rPr>
             <w:rStyle w:val="Hyperlink"/>
@@ -3023,7 +3023,7 @@
             <w:noProof/>
             <w:webHidden/>
           </w:rPr>
-          <w:instrText xml:space="preserve"> PAGEREF _Toc243308017 \h </w:instrText>
+          <w:instrText xml:space="preserve"> PAGEREF _Toc243311099 \h </w:instrText>
         </w:r>
         <w:r>
           <w:rPr>
@@ -3070,7 +3070,7 @@
           <w:lang w:eastAsia="nl-NL"/>
         </w:rPr>
       </w:pPr>
-      <w:hyperlink w:anchor="_Toc243308018" w:history="1">
+      <w:hyperlink w:anchor="_Toc243311100" w:history="1">
         <w:r>
           <w:rPr>
             <w:rStyle w:val="Hyperlink"/>
@@ -3115,7 +3115,7 @@
             <w:noProof/>
             <w:webHidden/>
           </w:rPr>
-          <w:instrText xml:space="preserve"> PAGEREF _Toc243308018 \h </w:instrText>
+          <w:instrText xml:space="preserve"> PAGEREF _Toc243311100 \h </w:instrText>
         </w:r>
         <w:r>
           <w:rPr>
@@ -3162,7 +3162,7 @@
           <w:lang w:eastAsia="nl-NL"/>
         </w:rPr>
       </w:pPr>
-      <w:hyperlink w:anchor="_Toc243308019" w:history="1">
+      <w:hyperlink w:anchor="_Toc243311101" w:history="1">
         <w:r>
           <w:rPr>
             <w:rStyle w:val="Hyperlink"/>
@@ -3207,7 +3207,7 @@
             <w:noProof/>
             <w:webHidden/>
           </w:rPr>
-          <w:instrText xml:space="preserve"> PAGEREF _Toc243308019 \h </w:instrText>
+          <w:instrText xml:space="preserve"> PAGEREF _Toc243311101 \h </w:instrText>
         </w:r>
         <w:r>
           <w:rPr>
@@ -3254,7 +3254,7 @@
           <w:lang w:eastAsia="nl-NL"/>
         </w:rPr>
       </w:pPr>
-      <w:hyperlink w:anchor="_Toc243308020" w:history="1">
+      <w:hyperlink w:anchor="_Toc243311102" w:history="1">
         <w:r>
           <w:rPr>
             <w:rStyle w:val="Hyperlink"/>
@@ -3315,7 +3315,7 @@
             <w:noProof/>
             <w:webHidden/>
           </w:rPr>
-          <w:instrText xml:space="preserve"> PAGEREF _Toc243308020 \h </w:instrText>
+          <w:instrText xml:space="preserve"> PAGEREF _Toc243311102 \h </w:instrText>
         </w:r>
         <w:r>
           <w:rPr>
@@ -3362,7 +3362,7 @@
           <w:lang w:eastAsia="nl-NL"/>
         </w:rPr>
       </w:pPr>
-      <w:hyperlink w:anchor="_Toc243308021" w:history="1">
+      <w:hyperlink w:anchor="_Toc243311103" w:history="1">
         <w:r>
           <w:rPr>
             <w:rStyle w:val="Hyperlink"/>
@@ -3407,7 +3407,7 @@
             <w:noProof/>
             <w:webHidden/>
           </w:rPr>
-          <w:instrText xml:space="preserve"> PAGEREF _Toc243308021 \h </w:instrText>
+          <w:instrText xml:space="preserve"> PAGEREF _Toc243311103 \h </w:instrText>
         </w:r>
         <w:r>
           <w:rPr>
@@ -3454,7 +3454,7 @@
           <w:lang w:eastAsia="nl-NL"/>
         </w:rPr>
       </w:pPr>
-      <w:hyperlink w:anchor="_Toc243308022" w:history="1">
+      <w:hyperlink w:anchor="_Toc243311104" w:history="1">
         <w:r>
           <w:rPr>
             <w:rStyle w:val="Hyperlink"/>
@@ -3499,7 +3499,7 @@
             <w:noProof/>
             <w:webHidden/>
           </w:rPr>
-          <w:instrText xml:space="preserve"> PAGEREF _Toc243308022 \h </w:instrText>
+          <w:instrText xml:space="preserve"> PAGEREF _Toc243311104 \h </w:instrText>
         </w:r>
         <w:r>
           <w:rPr>
@@ -3546,7 +3546,7 @@
           <w:lang w:eastAsia="nl-NL"/>
         </w:rPr>
       </w:pPr>
-      <w:hyperlink w:anchor="_Toc243308023" w:history="1">
+      <w:hyperlink w:anchor="_Toc243311105" w:history="1">
         <w:r>
           <w:rPr>
             <w:rStyle w:val="Hyperlink"/>
@@ -3593,7 +3593,7 @@
             <w:noProof/>
             <w:webHidden/>
           </w:rPr>
-          <w:instrText xml:space="preserve"> PAGEREF _Toc243308023 \h </w:instrText>
+          <w:instrText xml:space="preserve"> PAGEREF _Toc243311105 \h </w:instrText>
         </w:r>
         <w:r>
           <w:rPr>
@@ -3640,7 +3640,7 @@
           <w:lang w:eastAsia="nl-NL"/>
         </w:rPr>
       </w:pPr>
-      <w:hyperlink w:anchor="_Toc243308024" w:history="1">
+      <w:hyperlink w:anchor="_Toc243311106" w:history="1">
         <w:r>
           <w:rPr>
             <w:rStyle w:val="Hyperlink"/>
@@ -3687,7 +3687,7 @@
             <w:noProof/>
             <w:webHidden/>
           </w:rPr>
-          <w:instrText xml:space="preserve"> PAGEREF _Toc243308024 \h </w:instrText>
+          <w:instrText xml:space="preserve"> PAGEREF _Toc243311106 \h </w:instrText>
         </w:r>
         <w:r>
           <w:rPr>
@@ -3734,7 +3734,7 @@
           <w:lang w:eastAsia="nl-NL"/>
         </w:rPr>
       </w:pPr>
-      <w:hyperlink w:anchor="_Toc243308025" w:history="1">
+      <w:hyperlink w:anchor="_Toc243311107" w:history="1">
         <w:r>
           <w:rPr>
             <w:rStyle w:val="Hyperlink"/>
@@ -3781,7 +3781,7 @@
             <w:noProof/>
             <w:webHidden/>
           </w:rPr>
-          <w:instrText xml:space="preserve"> PAGEREF _Toc243308025 \h </w:instrText>
+          <w:instrText xml:space="preserve"> PAGEREF _Toc243311107 \h </w:instrText>
         </w:r>
         <w:r>
           <w:rPr>
@@ -3828,7 +3828,7 @@
           <w:lang w:eastAsia="nl-NL"/>
         </w:rPr>
       </w:pPr>
-      <w:hyperlink w:anchor="_Toc243308026" w:history="1">
+      <w:hyperlink w:anchor="_Toc243311108" w:history="1">
         <w:r>
           <w:rPr>
             <w:rStyle w:val="Hyperlink"/>
@@ -3875,7 +3875,7 @@
             <w:noProof/>
             <w:webHidden/>
           </w:rPr>
-          <w:instrText xml:space="preserve"> PAGEREF _Toc243308026 \h </w:instrText>
+          <w:instrText xml:space="preserve"> PAGEREF _Toc243311108 \h </w:instrText>
         </w:r>
         <w:r>
           <w:rPr>
@@ -3922,7 +3922,7 @@
           <w:lang w:eastAsia="nl-NL"/>
         </w:rPr>
       </w:pPr>
-      <w:hyperlink w:anchor="_Toc243308027" w:history="1">
+      <w:hyperlink w:anchor="_Toc243311109" w:history="1">
         <w:r>
           <w:rPr>
             <w:rStyle w:val="Hyperlink"/>
@@ -3969,7 +3969,7 @@
             <w:noProof/>
             <w:webHidden/>
           </w:rPr>
-          <w:instrText xml:space="preserve"> PAGEREF _Toc243308027 \h </w:instrText>
+          <w:instrText xml:space="preserve"> PAGEREF _Toc243311109 \h </w:instrText>
         </w:r>
         <w:r>
           <w:rPr>
@@ -4016,7 +4016,7 @@
           <w:lang w:eastAsia="nl-NL"/>
         </w:rPr>
       </w:pPr>
-      <w:hyperlink w:anchor="_Toc243308028" w:history="1">
+      <w:hyperlink w:anchor="_Toc243311110" w:history="1">
         <w:r>
           <w:rPr>
             <w:rStyle w:val="Hyperlink"/>
@@ -4063,7 +4063,7 @@
             <w:noProof/>
             <w:webHidden/>
           </w:rPr>
-          <w:instrText xml:space="preserve"> PAGEREF _Toc243308028 \h </w:instrText>
+          <w:instrText xml:space="preserve"> PAGEREF _Toc243311110 \h </w:instrText>
         </w:r>
         <w:r>
           <w:rPr>
@@ -4110,7 +4110,7 @@
           <w:lang w:eastAsia="nl-NL"/>
         </w:rPr>
       </w:pPr>
-      <w:hyperlink w:anchor="_Toc243308029" w:history="1">
+      <w:hyperlink w:anchor="_Toc243311111" w:history="1">
         <w:r>
           <w:rPr>
             <w:rStyle w:val="Hyperlink"/>
@@ -4155,7 +4155,7 @@
             <w:noProof/>
             <w:webHidden/>
           </w:rPr>
-          <w:instrText xml:space="preserve"> PAGEREF _Toc243308029 \h </w:instrText>
+          <w:instrText xml:space="preserve"> PAGEREF _Toc243311111 \h </w:instrText>
         </w:r>
         <w:r>
           <w:rPr>
@@ -4202,7 +4202,7 @@
           <w:lang w:eastAsia="nl-NL"/>
         </w:rPr>
       </w:pPr>
-      <w:hyperlink w:anchor="_Toc243308030" w:history="1">
+      <w:hyperlink w:anchor="_Toc243311112" w:history="1">
         <w:r>
           <w:rPr>
             <w:rStyle w:val="Hyperlink"/>
@@ -4247,7 +4247,7 @@
             <w:noProof/>
             <w:webHidden/>
           </w:rPr>
-          <w:instrText xml:space="preserve"> PAGEREF _Toc243308030 \h </w:instrText>
+          <w:instrText xml:space="preserve"> PAGEREF _Toc243311112 \h </w:instrText>
         </w:r>
         <w:r>
           <w:rPr>
@@ -4294,7 +4294,7 @@
           <w:lang w:eastAsia="nl-NL"/>
         </w:rPr>
       </w:pPr>
-      <w:hyperlink w:anchor="_Toc243308031" w:history="1">
+      <w:hyperlink w:anchor="_Toc243311113" w:history="1">
         <w:r>
           <w:rPr>
             <w:rStyle w:val="Hyperlink"/>
@@ -4371,7 +4371,7 @@
             <w:noProof/>
             <w:webHidden/>
           </w:rPr>
-          <w:instrText xml:space="preserve"> PAGEREF _Toc243308031 \h </w:instrText>
+          <w:instrText xml:space="preserve"> PAGEREF _Toc243311113 \h </w:instrText>
         </w:r>
         <w:r>
           <w:rPr>
@@ -4418,7 +4418,7 @@
           <w:lang w:eastAsia="nl-NL"/>
         </w:rPr>
       </w:pPr>
-      <w:hyperlink w:anchor="_Toc243308032" w:history="1">
+      <w:hyperlink w:anchor="_Toc243311114" w:history="1">
         <w:r>
           <w:rPr>
             <w:rStyle w:val="Hyperlink"/>
@@ -4463,7 +4463,7 @@
             <w:noProof/>
             <w:webHidden/>
           </w:rPr>
-          <w:instrText xml:space="preserve"> PAGEREF _Toc243308032 \h </w:instrText>
+          <w:instrText xml:space="preserve"> PAGEREF _Toc243311114 \h </w:instrText>
         </w:r>
         <w:r>
           <w:rPr>
@@ -4510,7 +4510,7 @@
           <w:lang w:eastAsia="nl-NL"/>
         </w:rPr>
       </w:pPr>
-      <w:hyperlink w:anchor="_Toc243308033" w:history="1">
+      <w:hyperlink w:anchor="_Toc243311115" w:history="1">
         <w:r>
           <w:rPr>
             <w:rStyle w:val="Hyperlink"/>
@@ -4555,7 +4555,7 @@
             <w:noProof/>
             <w:webHidden/>
           </w:rPr>
-          <w:instrText xml:space="preserve"> PAGEREF _Toc243308033 \h </w:instrText>
+          <w:instrText xml:space="preserve"> PAGEREF _Toc243311115 \h </w:instrText>
         </w:r>
         <w:r>
           <w:rPr>
@@ -4602,7 +4602,7 @@
           <w:lang w:eastAsia="nl-NL"/>
         </w:rPr>
       </w:pPr>
-      <w:hyperlink w:anchor="_Toc243308034" w:history="1">
+      <w:hyperlink w:anchor="_Toc243311116" w:history="1">
         <w:r>
           <w:rPr>
             <w:rStyle w:val="Hyperlink"/>
@@ -4647,7 +4647,7 @@
             <w:noProof/>
             <w:webHidden/>
           </w:rPr>
-          <w:instrText xml:space="preserve"> PAGEREF _Toc243308034 \h </w:instrText>
+          <w:instrText xml:space="preserve"> PAGEREF _Toc243311116 \h </w:instrText>
         </w:r>
         <w:r>
           <w:rPr>
@@ -4694,7 +4694,7 @@
           <w:lang w:eastAsia="nl-NL"/>
         </w:rPr>
       </w:pPr>
-      <w:hyperlink w:anchor="_Toc243308035" w:history="1">
+      <w:hyperlink w:anchor="_Toc243311117" w:history="1">
         <w:r>
           <w:rPr>
             <w:rStyle w:val="Hyperlink"/>
@@ -4739,7 +4739,7 @@
             <w:noProof/>
             <w:webHidden/>
           </w:rPr>
-          <w:instrText xml:space="preserve"> PAGEREF _Toc243308035 \h </w:instrText>
+          <w:instrText xml:space="preserve"> PAGEREF _Toc243311117 \h </w:instrText>
         </w:r>
         <w:r>
           <w:rPr>
@@ -4786,7 +4786,7 @@
           <w:lang w:eastAsia="nl-NL"/>
         </w:rPr>
       </w:pPr>
-      <w:hyperlink w:anchor="_Toc243308036" w:history="1">
+      <w:hyperlink w:anchor="_Toc243311118" w:history="1">
         <w:r>
           <w:rPr>
             <w:rStyle w:val="Hyperlink"/>
@@ -4831,7 +4831,7 @@
             <w:noProof/>
             <w:webHidden/>
           </w:rPr>
-          <w:instrText xml:space="preserve"> PAGEREF _Toc243308036 \h </w:instrText>
+          <w:instrText xml:space="preserve"> PAGEREF _Toc243311118 \h </w:instrText>
         </w:r>
         <w:r>
           <w:rPr>
@@ -4878,7 +4878,7 @@
           <w:lang w:eastAsia="nl-NL"/>
         </w:rPr>
       </w:pPr>
-      <w:hyperlink w:anchor="_Toc243308037" w:history="1">
+      <w:hyperlink w:anchor="_Toc243311119" w:history="1">
         <w:r>
           <w:rPr>
             <w:rStyle w:val="Hyperlink"/>
@@ -4923,7 +4923,7 @@
             <w:noProof/>
             <w:webHidden/>
           </w:rPr>
-          <w:instrText xml:space="preserve"> PAGEREF _Toc243308037 \h </w:instrText>
+          <w:instrText xml:space="preserve"> PAGEREF _Toc243311119 \h </w:instrText>
         </w:r>
         <w:r>
           <w:rPr>
@@ -4970,7 +4970,7 @@
           <w:lang w:eastAsia="nl-NL"/>
         </w:rPr>
       </w:pPr>
-      <w:hyperlink w:anchor="_Toc243308038" w:history="1">
+      <w:hyperlink w:anchor="_Toc243311120" w:history="1">
         <w:r>
           <w:rPr>
             <w:rStyle w:val="Hyperlink"/>
@@ -5015,7 +5015,7 @@
             <w:noProof/>
             <w:webHidden/>
           </w:rPr>
-          <w:instrText xml:space="preserve"> PAGEREF _Toc243308038 \h </w:instrText>
+          <w:instrText xml:space="preserve"> PAGEREF _Toc243311120 \h </w:instrText>
         </w:r>
         <w:r>
           <w:rPr>
@@ -5062,7 +5062,7 @@
           <w:lang w:eastAsia="nl-NL"/>
         </w:rPr>
       </w:pPr>
-      <w:hyperlink w:anchor="_Toc243308039" w:history="1">
+      <w:hyperlink w:anchor="_Toc243311121" w:history="1">
         <w:r>
           <w:rPr>
             <w:rStyle w:val="Hyperlink"/>
@@ -5107,7 +5107,7 @@
             <w:noProof/>
             <w:webHidden/>
           </w:rPr>
-          <w:instrText xml:space="preserve"> PAGEREF _Toc243308039 \h </w:instrText>
+          <w:instrText xml:space="preserve"> PAGEREF _Toc243311121 \h </w:instrText>
         </w:r>
         <w:r>
           <w:rPr>
@@ -5154,7 +5154,7 @@
           <w:lang w:eastAsia="nl-NL"/>
         </w:rPr>
       </w:pPr>
-      <w:hyperlink w:anchor="_Toc243308040" w:history="1">
+      <w:hyperlink w:anchor="_Toc243311122" w:history="1">
         <w:r>
           <w:rPr>
             <w:rStyle w:val="Hyperlink"/>
@@ -5199,7 +5199,7 @@
             <w:noProof/>
             <w:webHidden/>
           </w:rPr>
-          <w:instrText xml:space="preserve"> PAGEREF _Toc243308040 \h </w:instrText>
+          <w:instrText xml:space="preserve"> PAGEREF _Toc243311122 \h </w:instrText>
         </w:r>
         <w:r>
           <w:rPr>
@@ -5246,7 +5246,7 @@
           <w:lang w:eastAsia="nl-NL"/>
         </w:rPr>
       </w:pPr>
-      <w:hyperlink w:anchor="_Toc243308041" w:history="1">
+      <w:hyperlink w:anchor="_Toc243311123" w:history="1">
         <w:r>
           <w:rPr>
             <w:rStyle w:val="Hyperlink"/>
@@ -5291,7 +5291,7 @@
             <w:noProof/>
             <w:webHidden/>
           </w:rPr>
-          <w:instrText xml:space="preserve"> PAGEREF _Toc243308041 \h </w:instrText>
+          <w:instrText xml:space="preserve"> PAGEREF _Toc243311123 \h </w:instrText>
         </w:r>
         <w:r>
           <w:rPr>
@@ -5344,7 +5344,7 @@
         </w:numPr>
       </w:pPr>
       <w:bookmarkStart w:id="1" w:name="k1"/>
-      <w:bookmarkStart w:id="2" w:name="_Toc243307987"/>
+      <w:bookmarkStart w:id="2" w:name="_Toc243311069"/>
       <w:r>
         <w:t>DOEL VAN DE APPLICATIE.</w:t>
       </w:r>
@@ -5426,7 +5426,7 @@
         </w:numPr>
       </w:pPr>
       <w:bookmarkStart w:id="3" w:name="k2"/>
-      <w:bookmarkStart w:id="4" w:name="_Toc243307988"/>
+      <w:bookmarkStart w:id="4" w:name="_Toc243311070"/>
       <w:r>
         <w:t>BESTANDEN.</w:t>
       </w:r>
@@ -7709,7 +7709,7 @@
                 <w:sz w:val="16"/>
                 <w:szCs w:val="16"/>
               </w:rPr>
-              <w:t>Unit tests (716) voor de regels, de opslag, de export, het thema, de welkom- en gezichtsherkenningsfuncties, herkennen met de pas, de controller, de beveiliging en regressietests voor opgeloste bugs</w:t>
+              <w:t>Unit tests (717) voor de regels, de opslag, de export, het thema, de welkom- en gezichtsherkenningsfuncties, herkennen met de pas, de controller, de beveiliging en regressietests voor opgeloste bugs</w:t>
             </w:r>
           </w:p>
         </w:tc>
@@ -8192,7 +8192,14 @@
                 <w:sz w:val="16"/>
                 <w:szCs w:val="16"/>
               </w:rPr>
-              <w:t xml:space="preserve"> als scan ziet (Enter, Tab of stilte na de laatste toets, niet bij gewoon typen of een te korte code), het normaliseren van het pasnummer, het productvenster of de melding na een scan, geen herkenning als er een ander venster open is (met de melding "Sluit eerst het open venster om je pas te gebruiken.", en de Enter van de scan wordt tegengehouden), het zoekveld na een scan, de pas koppelen in het medewerkersformulier (uniek, alleen letters en cijfers, leeg = geen pas), de controle en migratie van </w:t>
+              <w:t xml:space="preserve"> als scan ziet (Enter, Tab of stilte na de laatste toets, niet bij gewoon typen of een te korte code, wel op een trage tablet), het normaliseren van het pasnummer, het productvenster of de melding na een scan, geen herkenning als er een ander venster open is (met de melding "Sluit eerst het open venster om je pas te gebruiken.", en de Enter van de scan wordt tegengehouden), het zoekveld na een scan, de pas koppelen in het medewerkersformulier (uniek, alleen letters en cijfers, leeg = geen pas), de controle </w:t>
+            </w:r>
+            <w:r>
+              <w:rPr>
+                <w:sz w:val="16"/>
+                <w:szCs w:val="16"/>
+              </w:rPr>
+              <w:t xml:space="preserve">en migratie van </w:t>
             </w:r>
             <w:r>
               <w:rPr>
@@ -8687,7 +8694,22 @@
                 <w:sz w:val="16"/>
                 <w:szCs w:val="16"/>
               </w:rPr>
-              <w:t xml:space="preserve"> bevat de webserver en de besturing van de browser via het Chrome DevTools Protocol. Draaien met </w:t>
+              <w:t xml:space="preserve"> bevat de webserver en de besturing van de browser via het Chrome DevTools Protocol. Er wordt pas geklikt als het element stilstaat. Bij een mislukte test volgen het scenario, de toestand van de pagina, de laatste meldingen uit de console en een schermafdruk in </w:t>
+            </w:r>
+            <w:r>
+              <w:rPr>
+                <w:rFonts w:ascii="Consolas" w:hAnsi="Consolas" w:cs="Consolas"/>
+                <w:sz w:val="14"/>
+                <w:shd w:val="clear" w:color="auto" w:fill="EEF4F2"/>
+              </w:rPr>
+              <w:t>test-results/e2e</w:t>
+            </w:r>
+            <w:r>
+              <w:rPr>
+                <w:sz w:val="16"/>
+                <w:szCs w:val="16"/>
+              </w:rPr>
+              <w:t xml:space="preserve">. Draaien met </w:t>
             </w:r>
             <w:r>
               <w:rPr>
@@ -8791,7 +8813,7 @@
         </w:numPr>
       </w:pPr>
       <w:bookmarkStart w:id="5" w:name="k3"/>
-      <w:bookmarkStart w:id="6" w:name="_Toc243307989"/>
+      <w:bookmarkStart w:id="6" w:name="_Toc243311071"/>
       <w:r>
         <w:t>DE WEBSITE STARTEN.</w:t>
       </w:r>
@@ -9013,7 +9035,7 @@
         </w:numPr>
       </w:pPr>
       <w:bookmarkStart w:id="7" w:name="k4"/>
-      <w:bookmarkStart w:id="8" w:name="_Toc243307990"/>
+      <w:bookmarkStart w:id="8" w:name="_Toc243311072"/>
       <w:r>
         <w:t>GEBRUIKERSHANDLEIDING.</w:t>
       </w:r>
@@ -9026,7 +9048,7 @@
         <w:keepNext/>
       </w:pPr>
       <w:bookmarkStart w:id="9" w:name="k5"/>
-      <w:bookmarkStart w:id="10" w:name="_Toc243307991"/>
+      <w:bookmarkStart w:id="10" w:name="_Toc243311073"/>
       <w:r>
         <w:t>EEN MEDEWERKER ZOEKEN</w:t>
       </w:r>
@@ -9081,7 +9103,7 @@
         <w:keepNext/>
       </w:pPr>
       <w:bookmarkStart w:id="11" w:name="k6"/>
-      <w:bookmarkStart w:id="12" w:name="_Toc243307992"/>
+      <w:bookmarkStart w:id="12" w:name="_Toc243311074"/>
       <w:r>
         <w:t>EEN PRODUCT REGISTREREN</w:t>
       </w:r>
@@ -9330,7 +9352,7 @@
         <w:keepNext/>
       </w:pPr>
       <w:bookmarkStart w:id="13" w:name="k7"/>
-      <w:bookmarkStart w:id="14" w:name="_Toc243307993"/>
+      <w:bookmarkStart w:id="14" w:name="_Toc243311075"/>
       <w:r>
         <w:t>ADMIN-DASHBOARD OPENEN</w:t>
       </w:r>
@@ -9461,7 +9483,7 @@
         <w:keepNext/>
       </w:pPr>
       <w:bookmarkStart w:id="15" w:name="k8"/>
-      <w:bookmarkStart w:id="16" w:name="_Toc243307994"/>
+      <w:bookmarkStart w:id="16" w:name="_Toc243311076"/>
       <w:r>
         <w:t>REGISTRATIES BEHEREN</w:t>
       </w:r>
@@ -9747,7 +9769,7 @@
         <w:keepNext/>
       </w:pPr>
       <w:bookmarkStart w:id="17" w:name="k9"/>
-      <w:bookmarkStart w:id="18" w:name="_Toc243307995"/>
+      <w:bookmarkStart w:id="18" w:name="_Toc243311077"/>
       <w:r>
         <w:t>MEDEWERKERS BEHEREN</w:t>
       </w:r>
@@ -10081,7 +10103,7 @@
         <w:keepNext/>
       </w:pPr>
       <w:bookmarkStart w:id="19" w:name="k10"/>
-      <w:bookmarkStart w:id="20" w:name="_Toc243307996"/>
+      <w:bookmarkStart w:id="20" w:name="_Toc243311078"/>
       <w:r>
         <w:t>PRODUCTEN BEHEREN</w:t>
       </w:r>
@@ -10209,7 +10231,7 @@
         <w:keepNext/>
       </w:pPr>
       <w:bookmarkStart w:id="21" w:name="k11"/>
-      <w:bookmarkStart w:id="22" w:name="_Toc243307997"/>
+      <w:bookmarkStart w:id="22" w:name="_Toc243311079"/>
       <w:r>
         <w:t>BEDRIJVEN EN CONSUMPTIEPUNTEN BEHEREN</w:t>
       </w:r>
@@ -10372,7 +10394,7 @@
         <w:keepNext/>
       </w:pPr>
       <w:bookmarkStart w:id="23" w:name="k12"/>
-      <w:bookmarkStart w:id="24" w:name="_Toc243307998"/>
+      <w:bookmarkStart w:id="24" w:name="_Toc243311080"/>
       <w:r>
         <w:t>VOORRAAD BEHEREN</w:t>
       </w:r>
@@ -10590,7 +10612,7 @@
         <w:keepNext/>
       </w:pPr>
       <w:bookmarkStart w:id="25" w:name="k13"/>
-      <w:bookmarkStart w:id="26" w:name="_Toc243307999"/>
+      <w:bookmarkStart w:id="26" w:name="_Toc243311081"/>
       <w:r>
         <w:t>LOGBOEK BEKIJKEN</w:t>
       </w:r>
@@ -10630,7 +10652,7 @@
         <w:keepNext/>
       </w:pPr>
       <w:bookmarkStart w:id="27" w:name="k14"/>
-      <w:bookmarkStart w:id="28" w:name="_Toc243308000"/>
+      <w:bookmarkStart w:id="28" w:name="_Toc243311082"/>
       <w:r>
         <w:t>ALLE GEGEVENS WISSEN</w:t>
       </w:r>
@@ -10756,7 +10778,7 @@
         <w:keepNext/>
       </w:pPr>
       <w:bookmarkStart w:id="29" w:name="k15"/>
-      <w:bookmarkStart w:id="30" w:name="_Toc243308001"/>
+      <w:bookmarkStart w:id="30" w:name="_Toc243311083"/>
       <w:r>
         <w:t>MODAL SLUITEN EN UITLOGGEN</w:t>
       </w:r>
@@ -10830,7 +10852,7 @@
         <w:keepNext/>
       </w:pPr>
       <w:bookmarkStart w:id="31" w:name="k16"/>
-      <w:bookmarkStart w:id="32" w:name="_Toc243308002"/>
+      <w:bookmarkStart w:id="32" w:name="_Toc243311084"/>
       <w:r>
         <w:t>CSV EXPORTEREN</w:t>
       </w:r>
@@ -11214,7 +11236,7 @@
         <w:keepNext/>
       </w:pPr>
       <w:bookmarkStart w:id="33" w:name="k17"/>
-      <w:bookmarkStart w:id="34" w:name="_Toc243308003"/>
+      <w:bookmarkStart w:id="34" w:name="_Toc243311085"/>
       <w:r>
         <w:t>LICHT OF DONKER THEMA</w:t>
       </w:r>
@@ -11321,7 +11343,7 @@
         <w:keepNext/>
       </w:pPr>
       <w:bookmarkStart w:id="35" w:name="k18"/>
-      <w:bookmarkStart w:id="36" w:name="_Toc243308004"/>
+      <w:bookmarkStart w:id="36" w:name="_Toc243311086"/>
       <w:r>
         <w:t>WELKOM EN "ZELFDE ALS VORIGE KEER"</w:t>
       </w:r>
@@ -11408,7 +11430,7 @@
         <w:keepNext/>
       </w:pPr>
       <w:bookmarkStart w:id="37" w:name="k19"/>
-      <w:bookmarkStart w:id="38" w:name="_Toc243308005"/>
+      <w:bookmarkStart w:id="38" w:name="_Toc243311087"/>
       <w:r>
         <w:t>DEMO GEZICHTSHERKENNING</w:t>
       </w:r>
@@ -11616,7 +11638,7 @@
         <w:keepNext/>
       </w:pPr>
       <w:bookmarkStart w:id="39" w:name="k20"/>
-      <w:bookmarkStart w:id="40" w:name="_Toc243308006"/>
+      <w:bookmarkStart w:id="40" w:name="_Toc243311088"/>
       <w:r>
         <w:t>HERKENNEN MET DE PAS</w:t>
       </w:r>
@@ -11808,7 +11830,7 @@
         <w:keepNext/>
       </w:pPr>
       <w:bookmarkStart w:id="41" w:name="k21"/>
-      <w:bookmarkStart w:id="42" w:name="_Toc243308007"/>
+      <w:bookmarkStart w:id="42" w:name="_Toc243311089"/>
       <w:r>
         <w:t>SLIMME KOELKAST (DEMO)</w:t>
       </w:r>
@@ -12383,7 +12405,7 @@
         </w:numPr>
       </w:pPr>
       <w:bookmarkStart w:id="43" w:name="k22"/>
-      <w:bookmarkStart w:id="44" w:name="_Toc243308008"/>
+      <w:bookmarkStart w:id="44" w:name="_Toc243311090"/>
       <w:r>
         <w:t xml:space="preserve">UITLEG VAN </w:t>
       </w:r>
@@ -12407,7 +12429,7 @@
         <w:keepNext/>
       </w:pPr>
       <w:bookmarkStart w:id="45" w:name="k23"/>
-      <w:bookmarkStart w:id="46" w:name="_Toc243308009"/>
+      <w:bookmarkStart w:id="46" w:name="_Toc243311091"/>
       <w:r>
         <w:t>METADATA EN EXTERNE BESTANDEN</w:t>
       </w:r>
@@ -12683,7 +12705,7 @@
         <w:keepNext/>
       </w:pPr>
       <w:bookmarkStart w:id="47" w:name="k24"/>
-      <w:bookmarkStart w:id="48" w:name="_Toc243308010"/>
+      <w:bookmarkStart w:id="48" w:name="_Toc243311092"/>
       <w:r>
         <w:t>NAVIGATIEBALK</w:t>
       </w:r>
@@ -12896,7 +12918,7 @@
         <w:keepNext/>
       </w:pPr>
       <w:bookmarkStart w:id="49" w:name="k25"/>
-      <w:bookmarkStart w:id="50" w:name="_Toc243308011"/>
+      <w:bookmarkStart w:id="50" w:name="_Toc243311093"/>
       <w:r>
         <w:t>HERO-GEDEELTE</w:t>
       </w:r>
@@ -12941,7 +12963,7 @@
         <w:keepNext/>
       </w:pPr>
       <w:bookmarkStart w:id="51" w:name="k26"/>
-      <w:bookmarkStart w:id="52" w:name="_Toc243308012"/>
+      <w:bookmarkStart w:id="52" w:name="_Toc243311094"/>
       <w:r>
         <w:t>MEDEWERKERLIJST</w:t>
       </w:r>
@@ -13278,7 +13300,7 @@
         <w:keepNext/>
       </w:pPr>
       <w:bookmarkStart w:id="53" w:name="k27"/>
-      <w:bookmarkStart w:id="54" w:name="_Toc243308013"/>
+      <w:bookmarkStart w:id="54" w:name="_Toc243311095"/>
       <w:r>
         <w:t>STATISTIEKEN</w:t>
       </w:r>
@@ -13361,7 +13383,7 @@
         <w:keepNext/>
       </w:pPr>
       <w:bookmarkStart w:id="55" w:name="k28"/>
-      <w:bookmarkStart w:id="56" w:name="_Toc243308014"/>
+      <w:bookmarkStart w:id="56" w:name="_Toc243311096"/>
       <w:r>
         <w:t>VENSTERS (MODALS)</w:t>
       </w:r>
@@ -13993,7 +14015,7 @@
         <w:keepNext/>
       </w:pPr>
       <w:bookmarkStart w:id="57" w:name="k29"/>
-      <w:bookmarkStart w:id="58" w:name="_Toc243308015"/>
+      <w:bookmarkStart w:id="58" w:name="_Toc243311097"/>
       <w:r>
         <w:t>WAARSCHUWING BIJ OPENEN ALS LOS BESTAND</w:t>
       </w:r>
@@ -14038,7 +14060,7 @@
         </w:numPr>
       </w:pPr>
       <w:bookmarkStart w:id="59" w:name="k30"/>
-      <w:bookmarkStart w:id="60" w:name="_Toc243308016"/>
+      <w:bookmarkStart w:id="60" w:name="_Toc243311098"/>
       <w:r>
         <w:t xml:space="preserve">UITLEG VAN </w:t>
       </w:r>
@@ -14062,7 +14084,7 @@
         <w:keepNext/>
       </w:pPr>
       <w:bookmarkStart w:id="61" w:name="k31"/>
-      <w:bookmarkStart w:id="62" w:name="_Toc243308017"/>
+      <w:bookmarkStart w:id="62" w:name="_Toc243311099"/>
       <w:r>
         <w:t>CSS-VARIABELEN</w:t>
       </w:r>
@@ -14737,7 +14759,7 @@
         <w:keepNext/>
       </w:pPr>
       <w:bookmarkStart w:id="63" w:name="k32"/>
-      <w:bookmarkStart w:id="64" w:name="_Toc243308018"/>
+      <w:bookmarkStart w:id="64" w:name="_Toc243311100"/>
       <w:r>
         <w:t>LAYOUT</w:t>
       </w:r>
@@ -15446,7 +15468,7 @@
         <w:keepNext/>
       </w:pPr>
       <w:bookmarkStart w:id="65" w:name="k33"/>
-      <w:bookmarkStart w:id="66" w:name="_Toc243308019"/>
+      <w:bookmarkStart w:id="66" w:name="_Toc243311101"/>
       <w:r>
         <w:t>COMPONENTEN</w:t>
       </w:r>
@@ -15691,7 +15713,7 @@
         </w:numPr>
       </w:pPr>
       <w:bookmarkStart w:id="67" w:name="k34"/>
-      <w:bookmarkStart w:id="68" w:name="_Toc243308020"/>
+      <w:bookmarkStart w:id="68" w:name="_Toc243311102"/>
       <w:r>
         <w:t>UITLEG VAN DE JAVASCRIPT (</w:t>
       </w:r>
@@ -15715,7 +15737,7 @@
         <w:keepNext/>
       </w:pPr>
       <w:bookmarkStart w:id="69" w:name="k35"/>
-      <w:bookmarkStart w:id="70" w:name="_Toc243308021"/>
+      <w:bookmarkStart w:id="70" w:name="_Toc243311103"/>
       <w:r>
         <w:t>OPSLAG EN VOORBEELDDATA</w:t>
       </w:r>
@@ -16492,7 +16514,7 @@
         <w:keepNext/>
       </w:pPr>
       <w:bookmarkStart w:id="71" w:name="k36"/>
-      <w:bookmarkStart w:id="72" w:name="_Toc243308022"/>
+      <w:bookmarkStart w:id="72" w:name="_Toc243311104"/>
       <w:r>
         <w:t>OBJECTGEORIËNTEERDE STRUCTUUR</w:t>
       </w:r>
@@ -22145,7 +22167,29 @@
         <w:t>maxKeyIntervalMs</w:t>
       </w:r>
       <w:r>
-        <w:t xml:space="preserve"> na het vorige, afgesloten met Enter of Tab, óf </w:t>
+        <w:t xml:space="preserve"> na het vorige (gemeten met </w:t>
+      </w:r>
+      <w:r>
+        <w:rPr>
+          <w:rFonts w:ascii="Consolas" w:hAnsi="Consolas" w:cs="Consolas"/>
+          <w:sz w:val="18"/>
+          <w:shd w:val="clear" w:color="auto" w:fill="EEF4F2"/>
+        </w:rPr>
+        <w:t>keyTime</w:t>
+      </w:r>
+      <w:r>
+        <w:t xml:space="preserve">: het tijdstip waarop de toets binnenkwam, </w:t>
+      </w:r>
+      <w:r>
+        <w:rPr>
+          <w:rFonts w:ascii="Consolas" w:hAnsi="Consolas" w:cs="Consolas"/>
+          <w:sz w:val="18"/>
+          <w:shd w:val="clear" w:color="auto" w:fill="EEF4F2"/>
+        </w:rPr>
+        <w:t>event.timeStamp</w:t>
+      </w:r>
+      <w:r>
+        <w:t xml:space="preserve">, zodat een trage tablet een scan niet als typen ziet), afgesloten met Enter of Tab, óf </w:t>
       </w:r>
       <w:r>
         <w:rPr>
@@ -22406,7 +22450,7 @@
         <w:keepNext/>
       </w:pPr>
       <w:bookmarkStart w:id="85" w:name="k49"/>
-      <w:bookmarkStart w:id="86" w:name="_Toc243308023"/>
+      <w:bookmarkStart w:id="86" w:name="_Toc243311105"/>
       <w:r>
         <w:rPr>
           <w:rFonts w:ascii="Consolas" w:hAnsi="Consolas" w:cs="Consolas"/>
@@ -22477,8 +22521,6 @@
       </w:r>
       <w:r>
         <w:tab/>
-      </w:r>
-      <w:r>
         <w:t>Toont alleen actieve medewerkers die daarbij passen.</w:t>
       </w:r>
     </w:p>
@@ -22549,7 +22591,7 @@
         <w:keepNext/>
       </w:pPr>
       <w:bookmarkStart w:id="87" w:name="k50"/>
-      <w:bookmarkStart w:id="88" w:name="_Toc243308024"/>
+      <w:bookmarkStart w:id="88" w:name="_Toc243311106"/>
       <w:r>
         <w:rPr>
           <w:rFonts w:ascii="Consolas" w:hAnsi="Consolas" w:cs="Consolas"/>
@@ -22626,7 +22668,7 @@
         <w:keepNext/>
       </w:pPr>
       <w:bookmarkStart w:id="89" w:name="k51"/>
-      <w:bookmarkStart w:id="90" w:name="_Toc243308025"/>
+      <w:bookmarkStart w:id="90" w:name="_Toc243311107"/>
       <w:r>
         <w:rPr>
           <w:rFonts w:ascii="Consolas" w:hAnsi="Consolas" w:cs="Consolas"/>
@@ -22797,7 +22839,7 @@
         <w:keepNext/>
       </w:pPr>
       <w:bookmarkStart w:id="91" w:name="k52"/>
-      <w:bookmarkStart w:id="92" w:name="_Toc243308026"/>
+      <w:bookmarkStart w:id="92" w:name="_Toc243311108"/>
       <w:r>
         <w:rPr>
           <w:rFonts w:ascii="Consolas" w:hAnsi="Consolas" w:cs="Consolas"/>
@@ -22864,7 +22906,7 @@
         <w:keepNext/>
       </w:pPr>
       <w:bookmarkStart w:id="93" w:name="k53"/>
-      <w:bookmarkStart w:id="94" w:name="_Toc243308027"/>
+      <w:bookmarkStart w:id="94" w:name="_Toc243311109"/>
       <w:r>
         <w:rPr>
           <w:rFonts w:ascii="Consolas" w:hAnsi="Consolas" w:cs="Consolas"/>
@@ -22986,7 +23028,7 @@
         <w:keepNext/>
       </w:pPr>
       <w:bookmarkStart w:id="95" w:name="k54"/>
-      <w:bookmarkStart w:id="96" w:name="_Toc243308028"/>
+      <w:bookmarkStart w:id="96" w:name="_Toc243311110"/>
       <w:r>
         <w:rPr>
           <w:rFonts w:ascii="Consolas" w:hAnsi="Consolas" w:cs="Consolas"/>
@@ -23108,7 +23150,7 @@
         <w:keepNext/>
       </w:pPr>
       <w:bookmarkStart w:id="97" w:name="k55"/>
-      <w:bookmarkStart w:id="98" w:name="_Toc243308029"/>
+      <w:bookmarkStart w:id="98" w:name="_Toc243311111"/>
       <w:r>
         <w:t>OPSLAGFOUTEN EN TERUGDRAAIEN</w:t>
       </w:r>
@@ -23170,7 +23212,7 @@
         <w:keepNext/>
       </w:pPr>
       <w:bookmarkStart w:id="99" w:name="k56"/>
-      <w:bookmarkStart w:id="100" w:name="_Toc243308030"/>
+      <w:bookmarkStart w:id="100" w:name="_Toc243311112"/>
       <w:r>
         <w:t>ADMINFUNCTIES</w:t>
       </w:r>
@@ -23416,7 +23458,7 @@
         <w:keepNext/>
       </w:pPr>
       <w:bookmarkStart w:id="101" w:name="k57"/>
-      <w:bookmarkStart w:id="102" w:name="_Toc243308031"/>
+      <w:bookmarkStart w:id="102" w:name="_Toc243311113"/>
       <w:r>
         <w:t xml:space="preserve">CSV-EXPORT (CLASS </w:t>
       </w:r>
@@ -23824,7 +23866,7 @@
         <w:keepNext/>
       </w:pPr>
       <w:bookmarkStart w:id="103" w:name="k58"/>
-      <w:bookmarkStart w:id="104" w:name="_Toc243308032"/>
+      <w:bookmarkStart w:id="104" w:name="_Toc243311114"/>
       <w:r>
         <w:t>EVENT LISTENERS</w:t>
       </w:r>
@@ -24436,7 +24478,7 @@
         </w:numPr>
       </w:pPr>
       <w:bookmarkStart w:id="105" w:name="k59"/>
-      <w:bookmarkStart w:id="106" w:name="_Toc243308033"/>
+      <w:bookmarkStart w:id="106" w:name="_Toc243311115"/>
       <w:r>
         <w:t>DATAMODEL EN KOPPELINGEN.</w:t>
       </w:r>
@@ -24454,7 +24496,7 @@
         <w:keepNext/>
       </w:pPr>
       <w:bookmarkStart w:id="107" w:name="k60"/>
-      <w:bookmarkStart w:id="108" w:name="_Toc243308034"/>
+      <w:bookmarkStart w:id="108" w:name="_Toc243311116"/>
       <w:r>
         <w:t>BEDRIJVEN</w:t>
       </w:r>
@@ -24665,7 +24707,7 @@
         <w:keepNext/>
       </w:pPr>
       <w:bookmarkStart w:id="109" w:name="k61"/>
-      <w:bookmarkStart w:id="110" w:name="_Toc243308035"/>
+      <w:bookmarkStart w:id="110" w:name="_Toc243311117"/>
       <w:r>
         <w:t>CONSUMPTIEPUNTEN</w:t>
       </w:r>
@@ -24984,7 +25026,7 @@
         <w:keepNext/>
       </w:pPr>
       <w:bookmarkStart w:id="111" w:name="k62"/>
-      <w:bookmarkStart w:id="112" w:name="_Toc243308036"/>
+      <w:bookmarkStart w:id="112" w:name="_Toc243311118"/>
       <w:r>
         <w:t>MEDEWERKERS</w:t>
       </w:r>
@@ -25540,7 +25582,7 @@
         <w:keepNext/>
       </w:pPr>
       <w:bookmarkStart w:id="113" w:name="k63"/>
-      <w:bookmarkStart w:id="114" w:name="_Toc243308037"/>
+      <w:bookmarkStart w:id="114" w:name="_Toc243311119"/>
       <w:r>
         <w:t>REGISTRATIES</w:t>
       </w:r>
@@ -26201,7 +26243,7 @@
         <w:keepNext/>
       </w:pPr>
       <w:bookmarkStart w:id="115" w:name="k64"/>
-      <w:bookmarkStart w:id="116" w:name="_Toc243308038"/>
+      <w:bookmarkStart w:id="116" w:name="_Toc243311120"/>
       <w:r>
         <w:t>SLIMME KOELKAST</w:t>
       </w:r>
@@ -26626,7 +26668,7 @@
         </w:numPr>
       </w:pPr>
       <w:bookmarkStart w:id="117" w:name="k65"/>
-      <w:bookmarkStart w:id="118" w:name="_Toc243308039"/>
+      <w:bookmarkStart w:id="118" w:name="_Toc243311121"/>
       <w:r>
         <w:t>BELANGRIJKE DEMO-BEPERKINGEN.</w:t>
       </w:r>
@@ -27034,7 +27076,7 @@
         </w:numPr>
       </w:pPr>
       <w:bookmarkStart w:id="119" w:name="k66"/>
-      <w:bookmarkStart w:id="120" w:name="_Toc243308040"/>
+      <w:bookmarkStart w:id="120" w:name="_Toc243311122"/>
       <w:r>
         <w:t>CODE UITLEGGEN TIJDENS EEN PRESENTATIE.</w:t>
       </w:r>
@@ -27440,7 +27482,7 @@
         </w:numPr>
       </w:pPr>
       <w:bookmarkStart w:id="121" w:name="k67"/>
-      <w:bookmarkStart w:id="122" w:name="_Toc243308041"/>
+      <w:bookmarkStart w:id="122" w:name="_Toc243311123"/>
       <w:r>
         <w:t>MOGELIJKE VERVOLGSTAPPEN.</w:t>
       </w:r>

</xml_diff>

<commit_message>
TO 3.16: fouten uit de rollenspel-tests en de FMEA opgelost
- Zoekveld leeg na sluiten van het productvenster zonder registreren
- Koelkast: naam in beeld bij open deur, tweede pas markeert de opening, dubbeltik op Deur dicht genegeerd
- Koelkast rekent met het gemeten gemiddelde stuksgewicht, demo begint zonder voorgeselecteerde medewerker
- Twee tabbladen overschrijven elkaars registraties niet meer
- Logboek met verwacht, geteld en verschil bij een telling en oude en nieuwe waarde bij prijs en nummers
- CSV laat negatieve getallen in getalkolommen door, productieschema rekent de loonmaand in Nederlandse tijd
- Kleine UI-fixes (44 px, hover alleen met muis) en tegenstrijdigheden in het TO gecorrigeerd
- Word-bestanden bijgewerkt (759 unit tests, 26 browsertests)
</commit_message>
<xml_diff>
--- a/docs/DOCUMENTATIE.docx
+++ b/docs/DOCUMENTATIE.docx
@@ -82,7 +82,7 @@
           <w:numId w:val="0"/>
         </w:numPr>
       </w:pPr>
-      <w:bookmarkStart w:id="0" w:name="_Toc243311068"/>
+      <w:bookmarkStart w:id="0" w:name="_Toc243464362"/>
       <w:r>
         <w:t>INHOUDSOPGAVE.</w:t>
       </w:r>
@@ -112,7 +112,7 @@
       <w:r>
         <w:fldChar w:fldCharType="separate"/>
       </w:r>
-      <w:hyperlink w:anchor="_Toc243311068" w:history="1">
+      <w:hyperlink w:anchor="_Toc243464362" w:history="1">
         <w:r>
           <w:rPr>
             <w:rStyle w:val="Hyperlink"/>
@@ -139,7 +139,7 @@
             <w:noProof/>
             <w:webHidden/>
           </w:rPr>
-          <w:instrText xml:space="preserve"> PAGEREF _Toc243311068 \h </w:instrText>
+          <w:instrText xml:space="preserve"> PAGEREF _Toc243464362 \h </w:instrText>
         </w:r>
         <w:r>
           <w:rPr>
@@ -186,7 +186,7 @@
           <w:lang w:eastAsia="nl-NL"/>
         </w:rPr>
       </w:pPr>
-      <w:hyperlink w:anchor="_Toc243311069" w:history="1">
+      <w:hyperlink w:anchor="_Toc243464363" w:history="1">
         <w:r>
           <w:rPr>
             <w:rStyle w:val="Hyperlink"/>
@@ -231,7 +231,7 @@
             <w:noProof/>
             <w:webHidden/>
           </w:rPr>
-          <w:instrText xml:space="preserve"> PAGEREF _Toc243311069 \h </w:instrText>
+          <w:instrText xml:space="preserve"> PAGEREF _Toc243464363 \h </w:instrText>
         </w:r>
         <w:r>
           <w:rPr>
@@ -278,7 +278,7 @@
           <w:lang w:eastAsia="nl-NL"/>
         </w:rPr>
       </w:pPr>
-      <w:hyperlink w:anchor="_Toc243311070" w:history="1">
+      <w:hyperlink w:anchor="_Toc243464364" w:history="1">
         <w:r>
           <w:rPr>
             <w:rStyle w:val="Hyperlink"/>
@@ -323,7 +323,7 @@
             <w:noProof/>
             <w:webHidden/>
           </w:rPr>
-          <w:instrText xml:space="preserve"> PAGEREF _Toc243311070 \h </w:instrText>
+          <w:instrText xml:space="preserve"> PAGEREF _Toc243464364 \h </w:instrText>
         </w:r>
         <w:r>
           <w:rPr>
@@ -370,7 +370,7 @@
           <w:lang w:eastAsia="nl-NL"/>
         </w:rPr>
       </w:pPr>
-      <w:hyperlink w:anchor="_Toc243311071" w:history="1">
+      <w:hyperlink w:anchor="_Toc243464365" w:history="1">
         <w:r>
           <w:rPr>
             <w:rStyle w:val="Hyperlink"/>
@@ -415,7 +415,7 @@
             <w:noProof/>
             <w:webHidden/>
           </w:rPr>
-          <w:instrText xml:space="preserve"> PAGEREF _Toc243311071 \h </w:instrText>
+          <w:instrText xml:space="preserve"> PAGEREF _Toc243464365 \h </w:instrText>
         </w:r>
         <w:r>
           <w:rPr>
@@ -435,7 +435,7 @@
             <w:noProof/>
             <w:webHidden/>
           </w:rPr>
-          <w:t>9</w:t>
+          <w:t>10</w:t>
         </w:r>
         <w:r>
           <w:rPr>
@@ -462,7 +462,7 @@
           <w:lang w:eastAsia="nl-NL"/>
         </w:rPr>
       </w:pPr>
-      <w:hyperlink w:anchor="_Toc243311072" w:history="1">
+      <w:hyperlink w:anchor="_Toc243464366" w:history="1">
         <w:r>
           <w:rPr>
             <w:rStyle w:val="Hyperlink"/>
@@ -507,7 +507,7 @@
             <w:noProof/>
             <w:webHidden/>
           </w:rPr>
-          <w:instrText xml:space="preserve"> PAGEREF _Toc243311072 \h </w:instrText>
+          <w:instrText xml:space="preserve"> PAGEREF _Toc243464366 \h </w:instrText>
         </w:r>
         <w:r>
           <w:rPr>
@@ -527,7 +527,7 @@
             <w:noProof/>
             <w:webHidden/>
           </w:rPr>
-          <w:t>10</w:t>
+          <w:t>11</w:t>
         </w:r>
         <w:r>
           <w:rPr>
@@ -554,7 +554,7 @@
           <w:lang w:eastAsia="nl-NL"/>
         </w:rPr>
       </w:pPr>
-      <w:hyperlink w:anchor="_Toc243311073" w:history="1">
+      <w:hyperlink w:anchor="_Toc243464367" w:history="1">
         <w:r>
           <w:rPr>
             <w:rStyle w:val="Hyperlink"/>
@@ -599,7 +599,7 @@
             <w:noProof/>
             <w:webHidden/>
           </w:rPr>
-          <w:instrText xml:space="preserve"> PAGEREF _Toc243311073 \h </w:instrText>
+          <w:instrText xml:space="preserve"> PAGEREF _Toc243464367 \h </w:instrText>
         </w:r>
         <w:r>
           <w:rPr>
@@ -619,7 +619,7 @@
             <w:noProof/>
             <w:webHidden/>
           </w:rPr>
-          <w:t>10</w:t>
+          <w:t>11</w:t>
         </w:r>
         <w:r>
           <w:rPr>
@@ -646,7 +646,7 @@
           <w:lang w:eastAsia="nl-NL"/>
         </w:rPr>
       </w:pPr>
-      <w:hyperlink w:anchor="_Toc243311074" w:history="1">
+      <w:hyperlink w:anchor="_Toc243464368" w:history="1">
         <w:r>
           <w:rPr>
             <w:rStyle w:val="Hyperlink"/>
@@ -691,7 +691,7 @@
             <w:noProof/>
             <w:webHidden/>
           </w:rPr>
-          <w:instrText xml:space="preserve"> PAGEREF _Toc243311074 \h </w:instrText>
+          <w:instrText xml:space="preserve"> PAGEREF _Toc243464368 \h </w:instrText>
         </w:r>
         <w:r>
           <w:rPr>
@@ -711,7 +711,7 @@
             <w:noProof/>
             <w:webHidden/>
           </w:rPr>
-          <w:t>10</w:t>
+          <w:t>11</w:t>
         </w:r>
         <w:r>
           <w:rPr>
@@ -738,7 +738,7 @@
           <w:lang w:eastAsia="nl-NL"/>
         </w:rPr>
       </w:pPr>
-      <w:hyperlink w:anchor="_Toc243311075" w:history="1">
+      <w:hyperlink w:anchor="_Toc243464369" w:history="1">
         <w:r>
           <w:rPr>
             <w:rStyle w:val="Hyperlink"/>
@@ -783,7 +783,7 @@
             <w:noProof/>
             <w:webHidden/>
           </w:rPr>
-          <w:instrText xml:space="preserve"> PAGEREF _Toc243311075 \h </w:instrText>
+          <w:instrText xml:space="preserve"> PAGEREF _Toc243464369 \h </w:instrText>
         </w:r>
         <w:r>
           <w:rPr>
@@ -803,7 +803,7 @@
             <w:noProof/>
             <w:webHidden/>
           </w:rPr>
-          <w:t>10</w:t>
+          <w:t>11</w:t>
         </w:r>
         <w:r>
           <w:rPr>
@@ -830,7 +830,7 @@
           <w:lang w:eastAsia="nl-NL"/>
         </w:rPr>
       </w:pPr>
-      <w:hyperlink w:anchor="_Toc243311076" w:history="1">
+      <w:hyperlink w:anchor="_Toc243464370" w:history="1">
         <w:r>
           <w:rPr>
             <w:rStyle w:val="Hyperlink"/>
@@ -875,7 +875,7 @@
             <w:noProof/>
             <w:webHidden/>
           </w:rPr>
-          <w:instrText xml:space="preserve"> PAGEREF _Toc243311076 \h </w:instrText>
+          <w:instrText xml:space="preserve"> PAGEREF _Toc243464370 \h </w:instrText>
         </w:r>
         <w:r>
           <w:rPr>
@@ -895,7 +895,7 @@
             <w:noProof/>
             <w:webHidden/>
           </w:rPr>
-          <w:t>11</w:t>
+          <w:t>12</w:t>
         </w:r>
         <w:r>
           <w:rPr>
@@ -922,7 +922,7 @@
           <w:lang w:eastAsia="nl-NL"/>
         </w:rPr>
       </w:pPr>
-      <w:hyperlink w:anchor="_Toc243311077" w:history="1">
+      <w:hyperlink w:anchor="_Toc243464371" w:history="1">
         <w:r>
           <w:rPr>
             <w:rStyle w:val="Hyperlink"/>
@@ -967,7 +967,7 @@
             <w:noProof/>
             <w:webHidden/>
           </w:rPr>
-          <w:instrText xml:space="preserve"> PAGEREF _Toc243311077 \h </w:instrText>
+          <w:instrText xml:space="preserve"> PAGEREF _Toc243464371 \h </w:instrText>
         </w:r>
         <w:r>
           <w:rPr>
@@ -987,7 +987,7 @@
             <w:noProof/>
             <w:webHidden/>
           </w:rPr>
-          <w:t>11</w:t>
+          <w:t>12</w:t>
         </w:r>
         <w:r>
           <w:rPr>
@@ -1014,7 +1014,7 @@
           <w:lang w:eastAsia="nl-NL"/>
         </w:rPr>
       </w:pPr>
-      <w:hyperlink w:anchor="_Toc243311078" w:history="1">
+      <w:hyperlink w:anchor="_Toc243464372" w:history="1">
         <w:r>
           <w:rPr>
             <w:rStyle w:val="Hyperlink"/>
@@ -1059,7 +1059,7 @@
             <w:noProof/>
             <w:webHidden/>
           </w:rPr>
-          <w:instrText xml:space="preserve"> PAGEREF _Toc243311078 \h </w:instrText>
+          <w:instrText xml:space="preserve"> PAGEREF _Toc243464372 \h </w:instrText>
         </w:r>
         <w:r>
           <w:rPr>
@@ -1079,7 +1079,7 @@
             <w:noProof/>
             <w:webHidden/>
           </w:rPr>
-          <w:t>12</w:t>
+          <w:t>13</w:t>
         </w:r>
         <w:r>
           <w:rPr>
@@ -1106,7 +1106,7 @@
           <w:lang w:eastAsia="nl-NL"/>
         </w:rPr>
       </w:pPr>
-      <w:hyperlink w:anchor="_Toc243311079" w:history="1">
+      <w:hyperlink w:anchor="_Toc243464373" w:history="1">
         <w:r>
           <w:rPr>
             <w:rStyle w:val="Hyperlink"/>
@@ -1151,7 +1151,7 @@
             <w:noProof/>
             <w:webHidden/>
           </w:rPr>
-          <w:instrText xml:space="preserve"> PAGEREF _Toc243311079 \h </w:instrText>
+          <w:instrText xml:space="preserve"> PAGEREF _Toc243464373 \h </w:instrText>
         </w:r>
         <w:r>
           <w:rPr>
@@ -1171,7 +1171,7 @@
             <w:noProof/>
             <w:webHidden/>
           </w:rPr>
-          <w:t>13</w:t>
+          <w:t>14</w:t>
         </w:r>
         <w:r>
           <w:rPr>
@@ -1198,7 +1198,7 @@
           <w:lang w:eastAsia="nl-NL"/>
         </w:rPr>
       </w:pPr>
-      <w:hyperlink w:anchor="_Toc243311080" w:history="1">
+      <w:hyperlink w:anchor="_Toc243464374" w:history="1">
         <w:r>
           <w:rPr>
             <w:rStyle w:val="Hyperlink"/>
@@ -1243,7 +1243,7 @@
             <w:noProof/>
             <w:webHidden/>
           </w:rPr>
-          <w:instrText xml:space="preserve"> PAGEREF _Toc243311080 \h </w:instrText>
+          <w:instrText xml:space="preserve"> PAGEREF _Toc243464374 \h </w:instrText>
         </w:r>
         <w:r>
           <w:rPr>
@@ -1263,7 +1263,7 @@
             <w:noProof/>
             <w:webHidden/>
           </w:rPr>
-          <w:t>13</w:t>
+          <w:t>14</w:t>
         </w:r>
         <w:r>
           <w:rPr>
@@ -1290,7 +1290,7 @@
           <w:lang w:eastAsia="nl-NL"/>
         </w:rPr>
       </w:pPr>
-      <w:hyperlink w:anchor="_Toc243311081" w:history="1">
+      <w:hyperlink w:anchor="_Toc243464375" w:history="1">
         <w:r>
           <w:rPr>
             <w:rStyle w:val="Hyperlink"/>
@@ -1335,7 +1335,7 @@
             <w:noProof/>
             <w:webHidden/>
           </w:rPr>
-          <w:instrText xml:space="preserve"> PAGEREF _Toc243311081 \h </w:instrText>
+          <w:instrText xml:space="preserve"> PAGEREF _Toc243464375 \h </w:instrText>
         </w:r>
         <w:r>
           <w:rPr>
@@ -1355,7 +1355,7 @@
             <w:noProof/>
             <w:webHidden/>
           </w:rPr>
-          <w:t>14</w:t>
+          <w:t>15</w:t>
         </w:r>
         <w:r>
           <w:rPr>
@@ -1382,7 +1382,7 @@
           <w:lang w:eastAsia="nl-NL"/>
         </w:rPr>
       </w:pPr>
-      <w:hyperlink w:anchor="_Toc243311082" w:history="1">
+      <w:hyperlink w:anchor="_Toc243464376" w:history="1">
         <w:r>
           <w:rPr>
             <w:rStyle w:val="Hyperlink"/>
@@ -1427,7 +1427,7 @@
             <w:noProof/>
             <w:webHidden/>
           </w:rPr>
-          <w:instrText xml:space="preserve"> PAGEREF _Toc243311082 \h </w:instrText>
+          <w:instrText xml:space="preserve"> PAGEREF _Toc243464376 \h </w:instrText>
         </w:r>
         <w:r>
           <w:rPr>
@@ -1447,7 +1447,7 @@
             <w:noProof/>
             <w:webHidden/>
           </w:rPr>
-          <w:t>14</w:t>
+          <w:t>15</w:t>
         </w:r>
         <w:r>
           <w:rPr>
@@ -1474,7 +1474,7 @@
           <w:lang w:eastAsia="nl-NL"/>
         </w:rPr>
       </w:pPr>
-      <w:hyperlink w:anchor="_Toc243311083" w:history="1">
+      <w:hyperlink w:anchor="_Toc243464377" w:history="1">
         <w:r>
           <w:rPr>
             <w:rStyle w:val="Hyperlink"/>
@@ -1519,7 +1519,7 @@
             <w:noProof/>
             <w:webHidden/>
           </w:rPr>
-          <w:instrText xml:space="preserve"> PAGEREF _Toc243311083 \h </w:instrText>
+          <w:instrText xml:space="preserve"> PAGEREF _Toc243464377 \h </w:instrText>
         </w:r>
         <w:r>
           <w:rPr>
@@ -1539,7 +1539,7 @@
             <w:noProof/>
             <w:webHidden/>
           </w:rPr>
-          <w:t>14</w:t>
+          <w:t>15</w:t>
         </w:r>
         <w:r>
           <w:rPr>
@@ -1566,7 +1566,7 @@
           <w:lang w:eastAsia="nl-NL"/>
         </w:rPr>
       </w:pPr>
-      <w:hyperlink w:anchor="_Toc243311084" w:history="1">
+      <w:hyperlink w:anchor="_Toc243464378" w:history="1">
         <w:r>
           <w:rPr>
             <w:rStyle w:val="Hyperlink"/>
@@ -1611,7 +1611,7 @@
             <w:noProof/>
             <w:webHidden/>
           </w:rPr>
-          <w:instrText xml:space="preserve"> PAGEREF _Toc243311084 \h </w:instrText>
+          <w:instrText xml:space="preserve"> PAGEREF _Toc243464378 \h </w:instrText>
         </w:r>
         <w:r>
           <w:rPr>
@@ -1631,7 +1631,7 @@
             <w:noProof/>
             <w:webHidden/>
           </w:rPr>
-          <w:t>15</w:t>
+          <w:t>16</w:t>
         </w:r>
         <w:r>
           <w:rPr>
@@ -1658,7 +1658,7 @@
           <w:lang w:eastAsia="nl-NL"/>
         </w:rPr>
       </w:pPr>
-      <w:hyperlink w:anchor="_Toc243311085" w:history="1">
+      <w:hyperlink w:anchor="_Toc243464379" w:history="1">
         <w:r>
           <w:rPr>
             <w:rStyle w:val="Hyperlink"/>
@@ -1703,7 +1703,7 @@
             <w:noProof/>
             <w:webHidden/>
           </w:rPr>
-          <w:instrText xml:space="preserve"> PAGEREF _Toc243311085 \h </w:instrText>
+          <w:instrText xml:space="preserve"> PAGEREF _Toc243464379 \h </w:instrText>
         </w:r>
         <w:r>
           <w:rPr>
@@ -1723,7 +1723,7 @@
             <w:noProof/>
             <w:webHidden/>
           </w:rPr>
-          <w:t>15</w:t>
+          <w:t>16</w:t>
         </w:r>
         <w:r>
           <w:rPr>
@@ -1750,7 +1750,7 @@
           <w:lang w:eastAsia="nl-NL"/>
         </w:rPr>
       </w:pPr>
-      <w:hyperlink w:anchor="_Toc243311086" w:history="1">
+      <w:hyperlink w:anchor="_Toc243464380" w:history="1">
         <w:r>
           <w:rPr>
             <w:rStyle w:val="Hyperlink"/>
@@ -1795,7 +1795,7 @@
             <w:noProof/>
             <w:webHidden/>
           </w:rPr>
-          <w:instrText xml:space="preserve"> PAGEREF _Toc243311086 \h </w:instrText>
+          <w:instrText xml:space="preserve"> PAGEREF _Toc243464380 \h </w:instrText>
         </w:r>
         <w:r>
           <w:rPr>
@@ -1815,7 +1815,7 @@
             <w:noProof/>
             <w:webHidden/>
           </w:rPr>
-          <w:t>16</w:t>
+          <w:t>17</w:t>
         </w:r>
         <w:r>
           <w:rPr>
@@ -1842,7 +1842,7 @@
           <w:lang w:eastAsia="nl-NL"/>
         </w:rPr>
       </w:pPr>
-      <w:hyperlink w:anchor="_Toc243311087" w:history="1">
+      <w:hyperlink w:anchor="_Toc243464381" w:history="1">
         <w:r>
           <w:rPr>
             <w:rStyle w:val="Hyperlink"/>
@@ -1887,7 +1887,7 @@
             <w:noProof/>
             <w:webHidden/>
           </w:rPr>
-          <w:instrText xml:space="preserve"> PAGEREF _Toc243311087 \h </w:instrText>
+          <w:instrText xml:space="preserve"> PAGEREF _Toc243464381 \h </w:instrText>
         </w:r>
         <w:r>
           <w:rPr>
@@ -1907,7 +1907,7 @@
             <w:noProof/>
             <w:webHidden/>
           </w:rPr>
-          <w:t>16</w:t>
+          <w:t>17</w:t>
         </w:r>
         <w:r>
           <w:rPr>
@@ -1934,7 +1934,7 @@
           <w:lang w:eastAsia="nl-NL"/>
         </w:rPr>
       </w:pPr>
-      <w:hyperlink w:anchor="_Toc243311088" w:history="1">
+      <w:hyperlink w:anchor="_Toc243464382" w:history="1">
         <w:r>
           <w:rPr>
             <w:rStyle w:val="Hyperlink"/>
@@ -1979,7 +1979,7 @@
             <w:noProof/>
             <w:webHidden/>
           </w:rPr>
-          <w:instrText xml:space="preserve"> PAGEREF _Toc243311088 \h </w:instrText>
+          <w:instrText xml:space="preserve"> PAGEREF _Toc243464382 \h </w:instrText>
         </w:r>
         <w:r>
           <w:rPr>
@@ -1999,7 +1999,7 @@
             <w:noProof/>
             <w:webHidden/>
           </w:rPr>
-          <w:t>16</w:t>
+          <w:t>17</w:t>
         </w:r>
         <w:r>
           <w:rPr>
@@ -2026,7 +2026,7 @@
           <w:lang w:eastAsia="nl-NL"/>
         </w:rPr>
       </w:pPr>
-      <w:hyperlink w:anchor="_Toc243311089" w:history="1">
+      <w:hyperlink w:anchor="_Toc243464383" w:history="1">
         <w:r>
           <w:rPr>
             <w:rStyle w:val="Hyperlink"/>
@@ -2071,7 +2071,7 @@
             <w:noProof/>
             <w:webHidden/>
           </w:rPr>
-          <w:instrText xml:space="preserve"> PAGEREF _Toc243311089 \h </w:instrText>
+          <w:instrText xml:space="preserve"> PAGEREF _Toc243464383 \h </w:instrText>
         </w:r>
         <w:r>
           <w:rPr>
@@ -2091,7 +2091,7 @@
             <w:noProof/>
             <w:webHidden/>
           </w:rPr>
-          <w:t>17</w:t>
+          <w:t>18</w:t>
         </w:r>
         <w:r>
           <w:rPr>
@@ -2118,7 +2118,7 @@
           <w:lang w:eastAsia="nl-NL"/>
         </w:rPr>
       </w:pPr>
-      <w:hyperlink w:anchor="_Toc243311090" w:history="1">
+      <w:hyperlink w:anchor="_Toc243464384" w:history="1">
         <w:r>
           <w:rPr>
             <w:rStyle w:val="Hyperlink"/>
@@ -2179,7 +2179,7 @@
             <w:noProof/>
             <w:webHidden/>
           </w:rPr>
-          <w:instrText xml:space="preserve"> PAGEREF _Toc243311090 \h </w:instrText>
+          <w:instrText xml:space="preserve"> PAGEREF _Toc243464384 \h </w:instrText>
         </w:r>
         <w:r>
           <w:rPr>
@@ -2199,7 +2199,7 @@
             <w:noProof/>
             <w:webHidden/>
           </w:rPr>
-          <w:t>19</w:t>
+          <w:t>20</w:t>
         </w:r>
         <w:r>
           <w:rPr>
@@ -2226,7 +2226,7 @@
           <w:lang w:eastAsia="nl-NL"/>
         </w:rPr>
       </w:pPr>
-      <w:hyperlink w:anchor="_Toc243311091" w:history="1">
+      <w:hyperlink w:anchor="_Toc243464385" w:history="1">
         <w:r>
           <w:rPr>
             <w:rStyle w:val="Hyperlink"/>
@@ -2271,7 +2271,7 @@
             <w:noProof/>
             <w:webHidden/>
           </w:rPr>
-          <w:instrText xml:space="preserve"> PAGEREF _Toc243311091 \h </w:instrText>
+          <w:instrText xml:space="preserve"> PAGEREF _Toc243464385 \h </w:instrText>
         </w:r>
         <w:r>
           <w:rPr>
@@ -2291,7 +2291,7 @@
             <w:noProof/>
             <w:webHidden/>
           </w:rPr>
-          <w:t>19</w:t>
+          <w:t>20</w:t>
         </w:r>
         <w:r>
           <w:rPr>
@@ -2318,7 +2318,7 @@
           <w:lang w:eastAsia="nl-NL"/>
         </w:rPr>
       </w:pPr>
-      <w:hyperlink w:anchor="_Toc243311092" w:history="1">
+      <w:hyperlink w:anchor="_Toc243464386" w:history="1">
         <w:r>
           <w:rPr>
             <w:rStyle w:val="Hyperlink"/>
@@ -2363,7 +2363,7 @@
             <w:noProof/>
             <w:webHidden/>
           </w:rPr>
-          <w:instrText xml:space="preserve"> PAGEREF _Toc243311092 \h </w:instrText>
+          <w:instrText xml:space="preserve"> PAGEREF _Toc243464386 \h </w:instrText>
         </w:r>
         <w:r>
           <w:rPr>
@@ -2383,7 +2383,7 @@
             <w:noProof/>
             <w:webHidden/>
           </w:rPr>
-          <w:t>19</w:t>
+          <w:t>20</w:t>
         </w:r>
         <w:r>
           <w:rPr>
@@ -2410,7 +2410,7 @@
           <w:lang w:eastAsia="nl-NL"/>
         </w:rPr>
       </w:pPr>
-      <w:hyperlink w:anchor="_Toc243311093" w:history="1">
+      <w:hyperlink w:anchor="_Toc243464387" w:history="1">
         <w:r>
           <w:rPr>
             <w:rStyle w:val="Hyperlink"/>
@@ -2455,7 +2455,7 @@
             <w:noProof/>
             <w:webHidden/>
           </w:rPr>
-          <w:instrText xml:space="preserve"> PAGEREF _Toc243311093 \h </w:instrText>
+          <w:instrText xml:space="preserve"> PAGEREF _Toc243464387 \h </w:instrText>
         </w:r>
         <w:r>
           <w:rPr>
@@ -2475,7 +2475,7 @@
             <w:noProof/>
             <w:webHidden/>
           </w:rPr>
-          <w:t>19</w:t>
+          <w:t>20</w:t>
         </w:r>
         <w:r>
           <w:rPr>
@@ -2502,7 +2502,7 @@
           <w:lang w:eastAsia="nl-NL"/>
         </w:rPr>
       </w:pPr>
-      <w:hyperlink w:anchor="_Toc243311094" w:history="1">
+      <w:hyperlink w:anchor="_Toc243464388" w:history="1">
         <w:r>
           <w:rPr>
             <w:rStyle w:val="Hyperlink"/>
@@ -2547,7 +2547,7 @@
             <w:noProof/>
             <w:webHidden/>
           </w:rPr>
-          <w:instrText xml:space="preserve"> PAGEREF _Toc243311094 \h </w:instrText>
+          <w:instrText xml:space="preserve"> PAGEREF _Toc243464388 \h </w:instrText>
         </w:r>
         <w:r>
           <w:rPr>
@@ -2567,7 +2567,7 @@
             <w:noProof/>
             <w:webHidden/>
           </w:rPr>
-          <w:t>19</w:t>
+          <w:t>20</w:t>
         </w:r>
         <w:r>
           <w:rPr>
@@ -2594,7 +2594,7 @@
           <w:lang w:eastAsia="nl-NL"/>
         </w:rPr>
       </w:pPr>
-      <w:hyperlink w:anchor="_Toc243311095" w:history="1">
+      <w:hyperlink w:anchor="_Toc243464389" w:history="1">
         <w:r>
           <w:rPr>
             <w:rStyle w:val="Hyperlink"/>
@@ -2639,7 +2639,7 @@
             <w:noProof/>
             <w:webHidden/>
           </w:rPr>
-          <w:instrText xml:space="preserve"> PAGEREF _Toc243311095 \h </w:instrText>
+          <w:instrText xml:space="preserve"> PAGEREF _Toc243464389 \h </w:instrText>
         </w:r>
         <w:r>
           <w:rPr>
@@ -2659,7 +2659,7 @@
             <w:noProof/>
             <w:webHidden/>
           </w:rPr>
-          <w:t>20</w:t>
+          <w:t>21</w:t>
         </w:r>
         <w:r>
           <w:rPr>
@@ -2686,7 +2686,7 @@
           <w:lang w:eastAsia="nl-NL"/>
         </w:rPr>
       </w:pPr>
-      <w:hyperlink w:anchor="_Toc243311096" w:history="1">
+      <w:hyperlink w:anchor="_Toc243464390" w:history="1">
         <w:r>
           <w:rPr>
             <w:rStyle w:val="Hyperlink"/>
@@ -2731,7 +2731,7 @@
             <w:noProof/>
             <w:webHidden/>
           </w:rPr>
-          <w:instrText xml:space="preserve"> PAGEREF _Toc243311096 \h </w:instrText>
+          <w:instrText xml:space="preserve"> PAGEREF _Toc243464390 \h </w:instrText>
         </w:r>
         <w:r>
           <w:rPr>
@@ -2751,7 +2751,7 @@
             <w:noProof/>
             <w:webHidden/>
           </w:rPr>
-          <w:t>20</w:t>
+          <w:t>21</w:t>
         </w:r>
         <w:r>
           <w:rPr>
@@ -2778,7 +2778,7 @@
           <w:lang w:eastAsia="nl-NL"/>
         </w:rPr>
       </w:pPr>
-      <w:hyperlink w:anchor="_Toc243311097" w:history="1">
+      <w:hyperlink w:anchor="_Toc243464391" w:history="1">
         <w:r>
           <w:rPr>
             <w:rStyle w:val="Hyperlink"/>
@@ -2823,7 +2823,7 @@
             <w:noProof/>
             <w:webHidden/>
           </w:rPr>
-          <w:instrText xml:space="preserve"> PAGEREF _Toc243311097 \h </w:instrText>
+          <w:instrText xml:space="preserve"> PAGEREF _Toc243464391 \h </w:instrText>
         </w:r>
         <w:r>
           <w:rPr>
@@ -2843,7 +2843,7 @@
             <w:noProof/>
             <w:webHidden/>
           </w:rPr>
-          <w:t>21</w:t>
+          <w:t>22</w:t>
         </w:r>
         <w:r>
           <w:rPr>
@@ -2870,7 +2870,7 @@
           <w:lang w:eastAsia="nl-NL"/>
         </w:rPr>
       </w:pPr>
-      <w:hyperlink w:anchor="_Toc243311098" w:history="1">
+      <w:hyperlink w:anchor="_Toc243464392" w:history="1">
         <w:r>
           <w:rPr>
             <w:rStyle w:val="Hyperlink"/>
@@ -2931,7 +2931,7 @@
             <w:noProof/>
             <w:webHidden/>
           </w:rPr>
-          <w:instrText xml:space="preserve"> PAGEREF _Toc243311098 \h </w:instrText>
+          <w:instrText xml:space="preserve"> PAGEREF _Toc243464392 \h </w:instrText>
         </w:r>
         <w:r>
           <w:rPr>
@@ -2951,7 +2951,7 @@
             <w:noProof/>
             <w:webHidden/>
           </w:rPr>
-          <w:t>22</w:t>
+          <w:t>23</w:t>
         </w:r>
         <w:r>
           <w:rPr>
@@ -2978,7 +2978,7 @@
           <w:lang w:eastAsia="nl-NL"/>
         </w:rPr>
       </w:pPr>
-      <w:hyperlink w:anchor="_Toc243311099" w:history="1">
+      <w:hyperlink w:anchor="_Toc243464393" w:history="1">
         <w:r>
           <w:rPr>
             <w:rStyle w:val="Hyperlink"/>
@@ -3023,7 +3023,7 @@
             <w:noProof/>
             <w:webHidden/>
           </w:rPr>
-          <w:instrText xml:space="preserve"> PAGEREF _Toc243311099 \h </w:instrText>
+          <w:instrText xml:space="preserve"> PAGEREF _Toc243464393 \h </w:instrText>
         </w:r>
         <w:r>
           <w:rPr>
@@ -3043,7 +3043,7 @@
             <w:noProof/>
             <w:webHidden/>
           </w:rPr>
-          <w:t>22</w:t>
+          <w:t>23</w:t>
         </w:r>
         <w:r>
           <w:rPr>
@@ -3070,7 +3070,7 @@
           <w:lang w:eastAsia="nl-NL"/>
         </w:rPr>
       </w:pPr>
-      <w:hyperlink w:anchor="_Toc243311100" w:history="1">
+      <w:hyperlink w:anchor="_Toc243464394" w:history="1">
         <w:r>
           <w:rPr>
             <w:rStyle w:val="Hyperlink"/>
@@ -3115,7 +3115,7 @@
             <w:noProof/>
             <w:webHidden/>
           </w:rPr>
-          <w:instrText xml:space="preserve"> PAGEREF _Toc243311100 \h </w:instrText>
+          <w:instrText xml:space="preserve"> PAGEREF _Toc243464394 \h </w:instrText>
         </w:r>
         <w:r>
           <w:rPr>
@@ -3135,7 +3135,7 @@
             <w:noProof/>
             <w:webHidden/>
           </w:rPr>
-          <w:t>22</w:t>
+          <w:t>23</w:t>
         </w:r>
         <w:r>
           <w:rPr>
@@ -3162,7 +3162,7 @@
           <w:lang w:eastAsia="nl-NL"/>
         </w:rPr>
       </w:pPr>
-      <w:hyperlink w:anchor="_Toc243311101" w:history="1">
+      <w:hyperlink w:anchor="_Toc243464395" w:history="1">
         <w:r>
           <w:rPr>
             <w:rStyle w:val="Hyperlink"/>
@@ -3207,7 +3207,7 @@
             <w:noProof/>
             <w:webHidden/>
           </w:rPr>
-          <w:instrText xml:space="preserve"> PAGEREF _Toc243311101 \h </w:instrText>
+          <w:instrText xml:space="preserve"> PAGEREF _Toc243464395 \h </w:instrText>
         </w:r>
         <w:r>
           <w:rPr>
@@ -3227,7 +3227,7 @@
             <w:noProof/>
             <w:webHidden/>
           </w:rPr>
-          <w:t>23</w:t>
+          <w:t>24</w:t>
         </w:r>
         <w:r>
           <w:rPr>
@@ -3254,7 +3254,7 @@
           <w:lang w:eastAsia="nl-NL"/>
         </w:rPr>
       </w:pPr>
-      <w:hyperlink w:anchor="_Toc243311102" w:history="1">
+      <w:hyperlink w:anchor="_Toc243464396" w:history="1">
         <w:r>
           <w:rPr>
             <w:rStyle w:val="Hyperlink"/>
@@ -3315,7 +3315,7 @@
             <w:noProof/>
             <w:webHidden/>
           </w:rPr>
-          <w:instrText xml:space="preserve"> PAGEREF _Toc243311102 \h </w:instrText>
+          <w:instrText xml:space="preserve"> PAGEREF _Toc243464396 \h </w:instrText>
         </w:r>
         <w:r>
           <w:rPr>
@@ -3335,7 +3335,7 @@
             <w:noProof/>
             <w:webHidden/>
           </w:rPr>
-          <w:t>24</w:t>
+          <w:t>25</w:t>
         </w:r>
         <w:r>
           <w:rPr>
@@ -3362,7 +3362,7 @@
           <w:lang w:eastAsia="nl-NL"/>
         </w:rPr>
       </w:pPr>
-      <w:hyperlink w:anchor="_Toc243311103" w:history="1">
+      <w:hyperlink w:anchor="_Toc243464397" w:history="1">
         <w:r>
           <w:rPr>
             <w:rStyle w:val="Hyperlink"/>
@@ -3407,7 +3407,7 @@
             <w:noProof/>
             <w:webHidden/>
           </w:rPr>
-          <w:instrText xml:space="preserve"> PAGEREF _Toc243311103 \h </w:instrText>
+          <w:instrText xml:space="preserve"> PAGEREF _Toc243464397 \h </w:instrText>
         </w:r>
         <w:r>
           <w:rPr>
@@ -3427,7 +3427,7 @@
             <w:noProof/>
             <w:webHidden/>
           </w:rPr>
-          <w:t>24</w:t>
+          <w:t>25</w:t>
         </w:r>
         <w:r>
           <w:rPr>
@@ -3454,7 +3454,7 @@
           <w:lang w:eastAsia="nl-NL"/>
         </w:rPr>
       </w:pPr>
-      <w:hyperlink w:anchor="_Toc243311104" w:history="1">
+      <w:hyperlink w:anchor="_Toc243464398" w:history="1">
         <w:r>
           <w:rPr>
             <w:rStyle w:val="Hyperlink"/>
@@ -3499,7 +3499,7 @@
             <w:noProof/>
             <w:webHidden/>
           </w:rPr>
-          <w:instrText xml:space="preserve"> PAGEREF _Toc243311104 \h </w:instrText>
+          <w:instrText xml:space="preserve"> PAGEREF _Toc243464398 \h </w:instrText>
         </w:r>
         <w:r>
           <w:rPr>
@@ -3519,7 +3519,7 @@
             <w:noProof/>
             <w:webHidden/>
           </w:rPr>
-          <w:t>25</w:t>
+          <w:t>26</w:t>
         </w:r>
         <w:r>
           <w:rPr>
@@ -3546,7 +3546,7 @@
           <w:lang w:eastAsia="nl-NL"/>
         </w:rPr>
       </w:pPr>
-      <w:hyperlink w:anchor="_Toc243311105" w:history="1">
+      <w:hyperlink w:anchor="_Toc243464399" w:history="1">
         <w:r>
           <w:rPr>
             <w:rStyle w:val="Hyperlink"/>
@@ -3593,7 +3593,7 @@
             <w:noProof/>
             <w:webHidden/>
           </w:rPr>
-          <w:instrText xml:space="preserve"> PAGEREF _Toc243311105 \h </w:instrText>
+          <w:instrText xml:space="preserve"> PAGEREF _Toc243464399 \h </w:instrText>
         </w:r>
         <w:r>
           <w:rPr>
@@ -3613,7 +3613,7 @@
             <w:noProof/>
             <w:webHidden/>
           </w:rPr>
-          <w:t>33</w:t>
+          <w:t>34</w:t>
         </w:r>
         <w:r>
           <w:rPr>
@@ -3640,7 +3640,7 @@
           <w:lang w:eastAsia="nl-NL"/>
         </w:rPr>
       </w:pPr>
-      <w:hyperlink w:anchor="_Toc243311106" w:history="1">
+      <w:hyperlink w:anchor="_Toc243464400" w:history="1">
         <w:r>
           <w:rPr>
             <w:rStyle w:val="Hyperlink"/>
@@ -3687,7 +3687,7 @@
             <w:noProof/>
             <w:webHidden/>
           </w:rPr>
-          <w:instrText xml:space="preserve"> PAGEREF _Toc243311106 \h </w:instrText>
+          <w:instrText xml:space="preserve"> PAGEREF _Toc243464400 \h </w:instrText>
         </w:r>
         <w:r>
           <w:rPr>
@@ -3707,7 +3707,7 @@
             <w:noProof/>
             <w:webHidden/>
           </w:rPr>
-          <w:t>33</w:t>
+          <w:t>34</w:t>
         </w:r>
         <w:r>
           <w:rPr>
@@ -3734,7 +3734,7 @@
           <w:lang w:eastAsia="nl-NL"/>
         </w:rPr>
       </w:pPr>
-      <w:hyperlink w:anchor="_Toc243311107" w:history="1">
+      <w:hyperlink w:anchor="_Toc243464401" w:history="1">
         <w:r>
           <w:rPr>
             <w:rStyle w:val="Hyperlink"/>
@@ -3781,7 +3781,7 @@
             <w:noProof/>
             <w:webHidden/>
           </w:rPr>
-          <w:instrText xml:space="preserve"> PAGEREF _Toc243311107 \h </w:instrText>
+          <w:instrText xml:space="preserve"> PAGEREF _Toc243464401 \h </w:instrText>
         </w:r>
         <w:r>
           <w:rPr>
@@ -3801,7 +3801,7 @@
             <w:noProof/>
             <w:webHidden/>
           </w:rPr>
-          <w:t>33</w:t>
+          <w:t>34</w:t>
         </w:r>
         <w:r>
           <w:rPr>
@@ -3828,7 +3828,7 @@
           <w:lang w:eastAsia="nl-NL"/>
         </w:rPr>
       </w:pPr>
-      <w:hyperlink w:anchor="_Toc243311108" w:history="1">
+      <w:hyperlink w:anchor="_Toc243464402" w:history="1">
         <w:r>
           <w:rPr>
             <w:rStyle w:val="Hyperlink"/>
@@ -3875,7 +3875,7 @@
             <w:noProof/>
             <w:webHidden/>
           </w:rPr>
-          <w:instrText xml:space="preserve"> PAGEREF _Toc243311108 \h </w:instrText>
+          <w:instrText xml:space="preserve"> PAGEREF _Toc243464402 \h </w:instrText>
         </w:r>
         <w:r>
           <w:rPr>
@@ -3895,7 +3895,7 @@
             <w:noProof/>
             <w:webHidden/>
           </w:rPr>
-          <w:t>33</w:t>
+          <w:t>34</w:t>
         </w:r>
         <w:r>
           <w:rPr>
@@ -3922,7 +3922,7 @@
           <w:lang w:eastAsia="nl-NL"/>
         </w:rPr>
       </w:pPr>
-      <w:hyperlink w:anchor="_Toc243311109" w:history="1">
+      <w:hyperlink w:anchor="_Toc243464403" w:history="1">
         <w:r>
           <w:rPr>
             <w:rStyle w:val="Hyperlink"/>
@@ -3969,7 +3969,7 @@
             <w:noProof/>
             <w:webHidden/>
           </w:rPr>
-          <w:instrText xml:space="preserve"> PAGEREF _Toc243311109 \h </w:instrText>
+          <w:instrText xml:space="preserve"> PAGEREF _Toc243464403 \h </w:instrText>
         </w:r>
         <w:r>
           <w:rPr>
@@ -3989,7 +3989,7 @@
             <w:noProof/>
             <w:webHidden/>
           </w:rPr>
-          <w:t>33</w:t>
+          <w:t>34</w:t>
         </w:r>
         <w:r>
           <w:rPr>
@@ -4016,7 +4016,7 @@
           <w:lang w:eastAsia="nl-NL"/>
         </w:rPr>
       </w:pPr>
-      <w:hyperlink w:anchor="_Toc243311110" w:history="1">
+      <w:hyperlink w:anchor="_Toc243464404" w:history="1">
         <w:r>
           <w:rPr>
             <w:rStyle w:val="Hyperlink"/>
@@ -4063,7 +4063,7 @@
             <w:noProof/>
             <w:webHidden/>
           </w:rPr>
-          <w:instrText xml:space="preserve"> PAGEREF _Toc243311110 \h </w:instrText>
+          <w:instrText xml:space="preserve"> PAGEREF _Toc243464404 \h </w:instrText>
         </w:r>
         <w:r>
           <w:rPr>
@@ -4083,7 +4083,7 @@
             <w:noProof/>
             <w:webHidden/>
           </w:rPr>
-          <w:t>34</w:t>
+          <w:t>35</w:t>
         </w:r>
         <w:r>
           <w:rPr>
@@ -4110,7 +4110,7 @@
           <w:lang w:eastAsia="nl-NL"/>
         </w:rPr>
       </w:pPr>
-      <w:hyperlink w:anchor="_Toc243311111" w:history="1">
+      <w:hyperlink w:anchor="_Toc243464405" w:history="1">
         <w:r>
           <w:rPr>
             <w:rStyle w:val="Hyperlink"/>
@@ -4155,7 +4155,7 @@
             <w:noProof/>
             <w:webHidden/>
           </w:rPr>
-          <w:instrText xml:space="preserve"> PAGEREF _Toc243311111 \h </w:instrText>
+          <w:instrText xml:space="preserve"> PAGEREF _Toc243464405 \h </w:instrText>
         </w:r>
         <w:r>
           <w:rPr>
@@ -4175,7 +4175,7 @@
             <w:noProof/>
             <w:webHidden/>
           </w:rPr>
-          <w:t>34</w:t>
+          <w:t>35</w:t>
         </w:r>
         <w:r>
           <w:rPr>
@@ -4202,7 +4202,7 @@
           <w:lang w:eastAsia="nl-NL"/>
         </w:rPr>
       </w:pPr>
-      <w:hyperlink w:anchor="_Toc243311112" w:history="1">
+      <w:hyperlink w:anchor="_Toc243464406" w:history="1">
         <w:r>
           <w:rPr>
             <w:rStyle w:val="Hyperlink"/>
@@ -4247,7 +4247,7 @@
             <w:noProof/>
             <w:webHidden/>
           </w:rPr>
-          <w:instrText xml:space="preserve"> PAGEREF _Toc243311112 \h </w:instrText>
+          <w:instrText xml:space="preserve"> PAGEREF _Toc243464406 \h </w:instrText>
         </w:r>
         <w:r>
           <w:rPr>
@@ -4267,7 +4267,7 @@
             <w:noProof/>
             <w:webHidden/>
           </w:rPr>
-          <w:t>34</w:t>
+          <w:t>35</w:t>
         </w:r>
         <w:r>
           <w:rPr>
@@ -4294,7 +4294,7 @@
           <w:lang w:eastAsia="nl-NL"/>
         </w:rPr>
       </w:pPr>
-      <w:hyperlink w:anchor="_Toc243311113" w:history="1">
+      <w:hyperlink w:anchor="_Toc243464407" w:history="1">
         <w:r>
           <w:rPr>
             <w:rStyle w:val="Hyperlink"/>
@@ -4371,7 +4371,7 @@
             <w:noProof/>
             <w:webHidden/>
           </w:rPr>
-          <w:instrText xml:space="preserve"> PAGEREF _Toc243311113 \h </w:instrText>
+          <w:instrText xml:space="preserve"> PAGEREF _Toc243464407 \h </w:instrText>
         </w:r>
         <w:r>
           <w:rPr>
@@ -4391,7 +4391,7 @@
             <w:noProof/>
             <w:webHidden/>
           </w:rPr>
-          <w:t>35</w:t>
+          <w:t>36</w:t>
         </w:r>
         <w:r>
           <w:rPr>
@@ -4418,7 +4418,7 @@
           <w:lang w:eastAsia="nl-NL"/>
         </w:rPr>
       </w:pPr>
-      <w:hyperlink w:anchor="_Toc243311114" w:history="1">
+      <w:hyperlink w:anchor="_Toc243464408" w:history="1">
         <w:r>
           <w:rPr>
             <w:rStyle w:val="Hyperlink"/>
@@ -4463,7 +4463,7 @@
             <w:noProof/>
             <w:webHidden/>
           </w:rPr>
-          <w:instrText xml:space="preserve"> PAGEREF _Toc243311114 \h </w:instrText>
+          <w:instrText xml:space="preserve"> PAGEREF _Toc243464408 \h </w:instrText>
         </w:r>
         <w:r>
           <w:rPr>
@@ -4483,7 +4483,7 @@
             <w:noProof/>
             <w:webHidden/>
           </w:rPr>
-          <w:t>35</w:t>
+          <w:t>36</w:t>
         </w:r>
         <w:r>
           <w:rPr>
@@ -4510,7 +4510,7 @@
           <w:lang w:eastAsia="nl-NL"/>
         </w:rPr>
       </w:pPr>
-      <w:hyperlink w:anchor="_Toc243311115" w:history="1">
+      <w:hyperlink w:anchor="_Toc243464409" w:history="1">
         <w:r>
           <w:rPr>
             <w:rStyle w:val="Hyperlink"/>
@@ -4555,7 +4555,7 @@
             <w:noProof/>
             <w:webHidden/>
           </w:rPr>
-          <w:instrText xml:space="preserve"> PAGEREF _Toc243311115 \h </w:instrText>
+          <w:instrText xml:space="preserve"> PAGEREF _Toc243464409 \h </w:instrText>
         </w:r>
         <w:r>
           <w:rPr>
@@ -4575,7 +4575,7 @@
             <w:noProof/>
             <w:webHidden/>
           </w:rPr>
-          <w:t>36</w:t>
+          <w:t>37</w:t>
         </w:r>
         <w:r>
           <w:rPr>
@@ -4602,7 +4602,7 @@
           <w:lang w:eastAsia="nl-NL"/>
         </w:rPr>
       </w:pPr>
-      <w:hyperlink w:anchor="_Toc243311116" w:history="1">
+      <w:hyperlink w:anchor="_Toc243464410" w:history="1">
         <w:r>
           <w:rPr>
             <w:rStyle w:val="Hyperlink"/>
@@ -4647,7 +4647,7 @@
             <w:noProof/>
             <w:webHidden/>
           </w:rPr>
-          <w:instrText xml:space="preserve"> PAGEREF _Toc243311116 \h </w:instrText>
+          <w:instrText xml:space="preserve"> PAGEREF _Toc243464410 \h </w:instrText>
         </w:r>
         <w:r>
           <w:rPr>
@@ -4667,7 +4667,7 @@
             <w:noProof/>
             <w:webHidden/>
           </w:rPr>
-          <w:t>36</w:t>
+          <w:t>37</w:t>
         </w:r>
         <w:r>
           <w:rPr>
@@ -4694,7 +4694,7 @@
           <w:lang w:eastAsia="nl-NL"/>
         </w:rPr>
       </w:pPr>
-      <w:hyperlink w:anchor="_Toc243311117" w:history="1">
+      <w:hyperlink w:anchor="_Toc243464411" w:history="1">
         <w:r>
           <w:rPr>
             <w:rStyle w:val="Hyperlink"/>
@@ -4739,7 +4739,7 @@
             <w:noProof/>
             <w:webHidden/>
           </w:rPr>
-          <w:instrText xml:space="preserve"> PAGEREF _Toc243311117 \h </w:instrText>
+          <w:instrText xml:space="preserve"> PAGEREF _Toc243464411 \h </w:instrText>
         </w:r>
         <w:r>
           <w:rPr>
@@ -4759,7 +4759,7 @@
             <w:noProof/>
             <w:webHidden/>
           </w:rPr>
-          <w:t>36</w:t>
+          <w:t>37</w:t>
         </w:r>
         <w:r>
           <w:rPr>
@@ -4786,7 +4786,7 @@
           <w:lang w:eastAsia="nl-NL"/>
         </w:rPr>
       </w:pPr>
-      <w:hyperlink w:anchor="_Toc243311118" w:history="1">
+      <w:hyperlink w:anchor="_Toc243464412" w:history="1">
         <w:r>
           <w:rPr>
             <w:rStyle w:val="Hyperlink"/>
@@ -4831,7 +4831,7 @@
             <w:noProof/>
             <w:webHidden/>
           </w:rPr>
-          <w:instrText xml:space="preserve"> PAGEREF _Toc243311118 \h </w:instrText>
+          <w:instrText xml:space="preserve"> PAGEREF _Toc243464412 \h </w:instrText>
         </w:r>
         <w:r>
           <w:rPr>
@@ -4851,7 +4851,7 @@
             <w:noProof/>
             <w:webHidden/>
           </w:rPr>
-          <w:t>36</w:t>
+          <w:t>37</w:t>
         </w:r>
         <w:r>
           <w:rPr>
@@ -4878,7 +4878,7 @@
           <w:lang w:eastAsia="nl-NL"/>
         </w:rPr>
       </w:pPr>
-      <w:hyperlink w:anchor="_Toc243311119" w:history="1">
+      <w:hyperlink w:anchor="_Toc243464413" w:history="1">
         <w:r>
           <w:rPr>
             <w:rStyle w:val="Hyperlink"/>
@@ -4923,7 +4923,7 @@
             <w:noProof/>
             <w:webHidden/>
           </w:rPr>
-          <w:instrText xml:space="preserve"> PAGEREF _Toc243311119 \h </w:instrText>
+          <w:instrText xml:space="preserve"> PAGEREF _Toc243464413 \h </w:instrText>
         </w:r>
         <w:r>
           <w:rPr>
@@ -4943,7 +4943,7 @@
             <w:noProof/>
             <w:webHidden/>
           </w:rPr>
-          <w:t>36</w:t>
+          <w:t>37</w:t>
         </w:r>
         <w:r>
           <w:rPr>
@@ -4970,7 +4970,7 @@
           <w:lang w:eastAsia="nl-NL"/>
         </w:rPr>
       </w:pPr>
-      <w:hyperlink w:anchor="_Toc243311120" w:history="1">
+      <w:hyperlink w:anchor="_Toc243464414" w:history="1">
         <w:r>
           <w:rPr>
             <w:rStyle w:val="Hyperlink"/>
@@ -5015,7 +5015,7 @@
             <w:noProof/>
             <w:webHidden/>
           </w:rPr>
-          <w:instrText xml:space="preserve"> PAGEREF _Toc243311120 \h </w:instrText>
+          <w:instrText xml:space="preserve"> PAGEREF _Toc243464414 \h </w:instrText>
         </w:r>
         <w:r>
           <w:rPr>
@@ -5035,7 +5035,7 @@
             <w:noProof/>
             <w:webHidden/>
           </w:rPr>
-          <w:t>37</w:t>
+          <w:t>38</w:t>
         </w:r>
         <w:r>
           <w:rPr>
@@ -5062,7 +5062,7 @@
           <w:lang w:eastAsia="nl-NL"/>
         </w:rPr>
       </w:pPr>
-      <w:hyperlink w:anchor="_Toc243311121" w:history="1">
+      <w:hyperlink w:anchor="_Toc243464415" w:history="1">
         <w:r>
           <w:rPr>
             <w:rStyle w:val="Hyperlink"/>
@@ -5107,7 +5107,7 @@
             <w:noProof/>
             <w:webHidden/>
           </w:rPr>
-          <w:instrText xml:space="preserve"> PAGEREF _Toc243311121 \h </w:instrText>
+          <w:instrText xml:space="preserve"> PAGEREF _Toc243464415 \h </w:instrText>
         </w:r>
         <w:r>
           <w:rPr>
@@ -5127,7 +5127,7 @@
             <w:noProof/>
             <w:webHidden/>
           </w:rPr>
-          <w:t>38</w:t>
+          <w:t>39</w:t>
         </w:r>
         <w:r>
           <w:rPr>
@@ -5154,7 +5154,7 @@
           <w:lang w:eastAsia="nl-NL"/>
         </w:rPr>
       </w:pPr>
-      <w:hyperlink w:anchor="_Toc243311122" w:history="1">
+      <w:hyperlink w:anchor="_Toc243464416" w:history="1">
         <w:r>
           <w:rPr>
             <w:rStyle w:val="Hyperlink"/>
@@ -5199,7 +5199,7 @@
             <w:noProof/>
             <w:webHidden/>
           </w:rPr>
-          <w:instrText xml:space="preserve"> PAGEREF _Toc243311122 \h </w:instrText>
+          <w:instrText xml:space="preserve"> PAGEREF _Toc243464416 \h </w:instrText>
         </w:r>
         <w:r>
           <w:rPr>
@@ -5219,7 +5219,7 @@
             <w:noProof/>
             <w:webHidden/>
           </w:rPr>
-          <w:t>40</w:t>
+          <w:t>41</w:t>
         </w:r>
         <w:r>
           <w:rPr>
@@ -5246,7 +5246,7 @@
           <w:lang w:eastAsia="nl-NL"/>
         </w:rPr>
       </w:pPr>
-      <w:hyperlink w:anchor="_Toc243311123" w:history="1">
+      <w:hyperlink w:anchor="_Toc243464417" w:history="1">
         <w:r>
           <w:rPr>
             <w:rStyle w:val="Hyperlink"/>
@@ -5291,7 +5291,7 @@
             <w:noProof/>
             <w:webHidden/>
           </w:rPr>
-          <w:instrText xml:space="preserve"> PAGEREF _Toc243311123 \h </w:instrText>
+          <w:instrText xml:space="preserve"> PAGEREF _Toc243464417 \h </w:instrText>
         </w:r>
         <w:r>
           <w:rPr>
@@ -5311,7 +5311,7 @@
             <w:noProof/>
             <w:webHidden/>
           </w:rPr>
-          <w:t>41</w:t>
+          <w:t>42</w:t>
         </w:r>
         <w:r>
           <w:rPr>
@@ -5344,7 +5344,7 @@
         </w:numPr>
       </w:pPr>
       <w:bookmarkStart w:id="1" w:name="k1"/>
-      <w:bookmarkStart w:id="2" w:name="_Toc243311069"/>
+      <w:bookmarkStart w:id="2" w:name="_Toc243464363"/>
       <w:r>
         <w:t>DOEL VAN DE APPLICATIE.</w:t>
       </w:r>
@@ -5426,7 +5426,7 @@
         </w:numPr>
       </w:pPr>
       <w:bookmarkStart w:id="3" w:name="k2"/>
-      <w:bookmarkStart w:id="4" w:name="_Toc243311070"/>
+      <w:bookmarkStart w:id="4" w:name="_Toc243464364"/>
       <w:r>
         <w:t>BESTANDEN.</w:t>
       </w:r>
@@ -7709,7 +7709,7 @@
                 <w:sz w:val="16"/>
                 <w:szCs w:val="16"/>
               </w:rPr>
-              <w:t>Unit tests (717) voor de regels, de opslag, de export, het thema, de welkom- en gezichtsherkenningsfuncties, herkennen met de pas, de controller, de beveiliging en regressietests voor opgeloste bugs</w:t>
+              <w:t>Unit tests (759) voor de regels, de opslag, de export, het thema, de welkom- en gezichtsherkenningsfuncties, herkennen met de pas, de controller, de beveiliging en regressietests voor opgeloste bugs</w:t>
             </w:r>
           </w:p>
         </w:tc>
@@ -8517,7 +8517,7 @@
                 <w:sz w:val="14"/>
                 <w:shd w:val="clear" w:color="auto" w:fill="EEF4F2"/>
               </w:rPr>
-              <w:t>.gitattributes</w:t>
+              <w:t>tests/rollenspel-oktober.test.js</w:t>
             </w:r>
           </w:p>
         </w:tc>
@@ -8534,7 +8534,7 @@
                 <w:sz w:val="16"/>
                 <w:szCs w:val="16"/>
               </w:rPr>
-              <w:t xml:space="preserve">Zorgt dat Git de bestanden in </w:t>
+              <w:t xml:space="preserve">Regressietests voor de fouten uit de rollenspeltests en de FMEA van oktober 2026 (punt 1 t/m 14 in de naam van iedere test): zoekveld leeg na sluiten zonder registreren, geen spookklik na een dubbeltik op </w:t>
             </w:r>
             <w:r>
               <w:rPr>
@@ -8542,29 +8542,14 @@
                 <w:sz w:val="14"/>
                 <w:shd w:val="clear" w:color="auto" w:fill="EEF4F2"/>
               </w:rPr>
-              <w:t>assets/vendor/</w:t>
+              <w:t>Deur dicht</w:t>
             </w:r>
             <w:r>
               <w:rPr>
                 <w:sz w:val="16"/>
                 <w:szCs w:val="16"/>
               </w:rPr>
-              <w:t xml:space="preserve"> en </w:t>
-            </w:r>
-            <w:r>
-              <w:rPr>
-                <w:rFonts w:ascii="Consolas" w:hAnsi="Consolas" w:cs="Consolas"/>
-                <w:sz w:val="14"/>
-                <w:shd w:val="clear" w:color="auto" w:fill="EEF4F2"/>
-              </w:rPr>
-              <w:t>assets/fonts/</w:t>
-            </w:r>
-            <w:r>
-              <w:rPr>
-                <w:sz w:val="16"/>
-                <w:szCs w:val="16"/>
-              </w:rPr>
-              <w:t xml:space="preserve"> niet aanpast (geen omzetting van regeleinden), zodat de controlegetallen blijven kloppen</w:t>
+              <w:t>, de naam in de open koelkast en "Controle nodig" bij de pas van een collega, twee tabbladen op één opslag, de weging met het gemeten gemiddelde gewicht (eieren en blikjes), verwacht en geteld bij een telling, oude en nieuwe waarden in het logboek, de lege demokeuze, tikdoelen en hover, voorraad 0, negatieve getallen in de CSV, het SQL-schema en teksten in het TO</w:t>
             </w:r>
           </w:p>
         </w:tc>
@@ -8587,7 +8572,7 @@
                 <w:sz w:val="14"/>
                 <w:shd w:val="clear" w:color="auto" w:fill="EEF4F2"/>
               </w:rPr>
-              <w:t>tests/e2e/</w:t>
+              <w:t>.gitattributes</w:t>
             </w:r>
           </w:p>
         </w:tc>
@@ -8604,7 +8589,7 @@
                 <w:sz w:val="16"/>
                 <w:szCs w:val="16"/>
               </w:rPr>
-              <w:t xml:space="preserve">Browsertests (end-to-end): </w:t>
+              <w:t xml:space="preserve">Zorgt dat Git de bestanden in </w:t>
             </w:r>
             <w:r>
               <w:rPr>
@@ -8612,14 +8597,14 @@
                 <w:sz w:val="14"/>
                 <w:shd w:val="clear" w:color="auto" w:fill="EEF4F2"/>
               </w:rPr>
-              <w:t>app.e2e.test.js</w:t>
+              <w:t>assets/vendor/</w:t>
             </w:r>
             <w:r>
               <w:rPr>
                 <w:sz w:val="16"/>
                 <w:szCs w:val="16"/>
               </w:rPr>
-              <w:t xml:space="preserve"> test de echte pagina in headless Edge of Chrome (21 tests: laden zonder fouten, zoeken, registreren (daarna bij kiezen op naam geen "welkom terug"), </w:t>
+              <w:t xml:space="preserve"> en </w:t>
             </w:r>
             <w:r>
               <w:rPr>
@@ -8627,112 +8612,14 @@
                 <w:sz w:val="14"/>
                 <w:shd w:val="clear" w:color="auto" w:fill="EEF4F2"/>
               </w:rPr>
-              <w:t>Registreren</w:t>
+              <w:t>assets/fonts/</w:t>
             </w:r>
             <w:r>
               <w:rPr>
                 <w:sz w:val="16"/>
                 <w:szCs w:val="16"/>
               </w:rPr>
-              <w:t xml:space="preserve"> zonder keuze, Escape en focus, inloggen, thema, pas koppelen en herkennen (ook een tweede scan in het veld </w:t>
-            </w:r>
-            <w:r>
-              <w:rPr>
-                <w:rFonts w:ascii="Consolas" w:hAnsi="Consolas" w:cs="Consolas"/>
-                <w:sz w:val="14"/>
-                <w:shd w:val="clear" w:color="auto" w:fill="EEF4F2"/>
-              </w:rPr>
-              <w:t>Pasnummer</w:t>
-            </w:r>
-            <w:r>
-              <w:rPr>
-                <w:sz w:val="16"/>
-                <w:szCs w:val="16"/>
-              </w:rPr>
-              <w:t xml:space="preserve">), CSV-export, een dubbelklik op </w:t>
-            </w:r>
-            <w:r>
-              <w:rPr>
-                <w:rFonts w:ascii="Consolas" w:hAnsi="Consolas" w:cs="Consolas"/>
-                <w:sz w:val="14"/>
-                <w:shd w:val="clear" w:color="auto" w:fill="EEF4F2"/>
-              </w:rPr>
-              <w:t>Registreren</w:t>
-            </w:r>
-            <w:r>
-              <w:rPr>
-                <w:sz w:val="16"/>
-                <w:szCs w:val="16"/>
-              </w:rPr>
-              <w:t xml:space="preserve">, een scan in het bedrijfsfilter, de focus na opslaan en (de)activeren in het beheer, letters in een cijferveld, het productvenster dat vanzelf sluit, een pas terwijl een venster open is, </w:t>
-            </w:r>
-            <w:r>
-              <w:rPr>
-                <w:rFonts w:ascii="Consolas" w:hAnsi="Consolas" w:cs="Consolas"/>
-                <w:sz w:val="14"/>
-                <w:shd w:val="clear" w:color="auto" w:fill="EEF4F2"/>
-              </w:rPr>
-              <w:t>Registreren</w:t>
-            </w:r>
-            <w:r>
-              <w:rPr>
-                <w:sz w:val="16"/>
-                <w:szCs w:val="16"/>
-              </w:rPr>
-              <w:t xml:space="preserve"> in beeld op een liggende tablet, een telefoon en bij 200% zoom, een leeg zoekveld na registreren, een productvenster zonder producten, vensters die bovenaan openen, en de slimme koelkast: openen met de pas, twee blikjes pakken en de registratie terugzien, en een onbekende pas), </w:t>
-            </w:r>
-            <w:r>
-              <w:rPr>
-                <w:rFonts w:ascii="Consolas" w:hAnsi="Consolas" w:cs="Consolas"/>
-                <w:sz w:val="14"/>
-                <w:shd w:val="clear" w:color="auto" w:fill="EEF4F2"/>
-              </w:rPr>
-              <w:t>browser.js</w:t>
-            </w:r>
-            <w:r>
-              <w:rPr>
-                <w:sz w:val="16"/>
-                <w:szCs w:val="16"/>
-              </w:rPr>
-              <w:t xml:space="preserve"> bevat de webserver en de besturing van de browser via het Chrome DevTools Protocol. Er wordt pas geklikt als het element stilstaat. Bij een mislukte test volgen het scenario, de toestand van de pagina, de laatste meldingen uit de console en een schermafdruk in </w:t>
-            </w:r>
-            <w:r>
-              <w:rPr>
-                <w:rFonts w:ascii="Consolas" w:hAnsi="Consolas" w:cs="Consolas"/>
-                <w:sz w:val="14"/>
-                <w:shd w:val="clear" w:color="auto" w:fill="EEF4F2"/>
-              </w:rPr>
-              <w:t>test-results/e2e</w:t>
-            </w:r>
-            <w:r>
-              <w:rPr>
-                <w:sz w:val="16"/>
-                <w:szCs w:val="16"/>
-              </w:rPr>
-              <w:t xml:space="preserve">. Draaien met </w:t>
-            </w:r>
-            <w:r>
-              <w:rPr>
-                <w:rFonts w:ascii="Consolas" w:hAnsi="Consolas" w:cs="Consolas"/>
-                <w:sz w:val="14"/>
-                <w:shd w:val="clear" w:color="auto" w:fill="EEF4F2"/>
-              </w:rPr>
-              <w:t>npm run test:e2e</w:t>
-            </w:r>
-            <w:r>
-              <w:rPr>
-                <w:sz w:val="16"/>
-                <w:szCs w:val="16"/>
-              </w:rPr>
-              <w:t xml:space="preserve">, zonder npm-pakketten. Een andere browser kies je met </w:t>
-            </w:r>
-            <w:r>
-              <w:rPr>
-                <w:rFonts w:ascii="Consolas" w:hAnsi="Consolas" w:cs="Consolas"/>
-                <w:sz w:val="14"/>
-                <w:shd w:val="clear" w:color="auto" w:fill="EEF4F2"/>
-              </w:rPr>
-              <w:t>BROWSER_PATH</w:t>
+              <w:t xml:space="preserve"> niet aanpast (geen omzetting van regeleinden), zodat de controlegetallen blijven kloppen</w:t>
             </w:r>
           </w:p>
         </w:tc>
@@ -8755,7 +8642,7 @@
                 <w:sz w:val="14"/>
                 <w:shd w:val="clear" w:color="auto" w:fill="EEF4F2"/>
               </w:rPr>
-              <w:t>.github/workflows/ci.yml</w:t>
+              <w:t>tests/e2e/</w:t>
             </w:r>
           </w:p>
         </w:tc>
@@ -8772,6 +8659,189 @@
                 <w:sz w:val="16"/>
                 <w:szCs w:val="16"/>
               </w:rPr>
+              <w:t xml:space="preserve">Browsertests (end-to-end): </w:t>
+            </w:r>
+            <w:r>
+              <w:rPr>
+                <w:rFonts w:ascii="Consolas" w:hAnsi="Consolas" w:cs="Consolas"/>
+                <w:sz w:val="14"/>
+                <w:shd w:val="clear" w:color="auto" w:fill="EEF4F2"/>
+              </w:rPr>
+              <w:t>app.e2e.test.js</w:t>
+            </w:r>
+            <w:r>
+              <w:rPr>
+                <w:sz w:val="16"/>
+                <w:szCs w:val="16"/>
+              </w:rPr>
+              <w:t xml:space="preserve"> test de echte pagina in headless Edge of Chrome (26 tests: laden zonder fouten, zoeken, registreren (daarna bij kiezen op naam geen "welkom terug"), </w:t>
+            </w:r>
+            <w:r>
+              <w:rPr>
+                <w:rFonts w:ascii="Consolas" w:hAnsi="Consolas" w:cs="Consolas"/>
+                <w:sz w:val="14"/>
+                <w:shd w:val="clear" w:color="auto" w:fill="EEF4F2"/>
+              </w:rPr>
+              <w:t>Registreren</w:t>
+            </w:r>
+            <w:r>
+              <w:rPr>
+                <w:sz w:val="16"/>
+                <w:szCs w:val="16"/>
+              </w:rPr>
+              <w:t xml:space="preserve"> zonder keuze, Escape en focus, inloggen, thema, pas koppelen en herkennen (ook een tweede scan in het veld </w:t>
+            </w:r>
+            <w:r>
+              <w:rPr>
+                <w:rFonts w:ascii="Consolas" w:hAnsi="Consolas" w:cs="Consolas"/>
+                <w:sz w:val="14"/>
+                <w:shd w:val="clear" w:color="auto" w:fill="EEF4F2"/>
+              </w:rPr>
+              <w:t>Pasnummer</w:t>
+            </w:r>
+            <w:r>
+              <w:rPr>
+                <w:sz w:val="16"/>
+                <w:szCs w:val="16"/>
+              </w:rPr>
+              <w:t xml:space="preserve">), CSV-export, een dubbelklik op </w:t>
+            </w:r>
+            <w:r>
+              <w:rPr>
+                <w:rFonts w:ascii="Consolas" w:hAnsi="Consolas" w:cs="Consolas"/>
+                <w:sz w:val="14"/>
+                <w:shd w:val="clear" w:color="auto" w:fill="EEF4F2"/>
+              </w:rPr>
+              <w:t>Registreren</w:t>
+            </w:r>
+            <w:r>
+              <w:rPr>
+                <w:sz w:val="16"/>
+                <w:szCs w:val="16"/>
+              </w:rPr>
+              <w:t xml:space="preserve">, een scan in het bedrijfsfilter, de focus na opslaan en (de)activeren in het beheer, letters in een cijferveld, het productvenster dat vanzelf sluit, een pas terwijl een venster open is, </w:t>
+            </w:r>
+            <w:r>
+              <w:rPr>
+                <w:rFonts w:ascii="Consolas" w:hAnsi="Consolas" w:cs="Consolas"/>
+                <w:sz w:val="14"/>
+                <w:shd w:val="clear" w:color="auto" w:fill="EEF4F2"/>
+              </w:rPr>
+              <w:t>Registreren</w:t>
+            </w:r>
+            <w:r>
+              <w:rPr>
+                <w:sz w:val="16"/>
+                <w:szCs w:val="16"/>
+              </w:rPr>
+              <w:t xml:space="preserve"> in beeld op een liggende tablet, een telefoon en bij 200% zoom, een leeg zoekveld na registreren, een productvenster zonder producten, vensters die bovenaan openen, de slimme koelkast: openen met de pas, twee blikjes pakken en de registratie terugzien, en een onbekende pas, en de rollenspeltests van oktober 2026: een leeg zoekveld na sluiten zonder registreren, een dubbeltik op </w:t>
+            </w:r>
+            <w:r>
+              <w:rPr>
+                <w:rFonts w:ascii="Consolas" w:hAnsi="Consolas" w:cs="Consolas"/>
+                <w:sz w:val="14"/>
+                <w:shd w:val="clear" w:color="auto" w:fill="EEF4F2"/>
+              </w:rPr>
+              <w:t>Deur dicht</w:t>
+            </w:r>
+            <w:r>
+              <w:rPr>
+                <w:sz w:val="16"/>
+                <w:szCs w:val="16"/>
+              </w:rPr>
+              <w:t xml:space="preserve">, de naam in de open koelkast met de pas van een collega, een opslag van een ander tabblad die niet wordt overschreven en de lege demokeuze), </w:t>
+            </w:r>
+            <w:r>
+              <w:rPr>
+                <w:rFonts w:ascii="Consolas" w:hAnsi="Consolas" w:cs="Consolas"/>
+                <w:sz w:val="14"/>
+                <w:shd w:val="clear" w:color="auto" w:fill="EEF4F2"/>
+              </w:rPr>
+              <w:t>browser.js</w:t>
+            </w:r>
+            <w:r>
+              <w:rPr>
+                <w:sz w:val="16"/>
+                <w:szCs w:val="16"/>
+              </w:rPr>
+              <w:t xml:space="preserve"> bevat de webserver en de besturing van de browser via het Chrome DevTools Protocol. Er wordt pas geklikt als het element stilstaat. Bij een mislukte test volgen het scenario, de toestand van de pagina, de laatste meldingen uit de console en een schermafdruk in </w:t>
+            </w:r>
+            <w:r>
+              <w:rPr>
+                <w:rFonts w:ascii="Consolas" w:hAnsi="Consolas" w:cs="Consolas"/>
+                <w:sz w:val="14"/>
+                <w:shd w:val="clear" w:color="auto" w:fill="EEF4F2"/>
+              </w:rPr>
+              <w:t>test-results/e2e</w:t>
+            </w:r>
+            <w:r>
+              <w:rPr>
+                <w:sz w:val="16"/>
+                <w:szCs w:val="16"/>
+              </w:rPr>
+              <w:t xml:space="preserve">. Draaien met </w:t>
+            </w:r>
+            <w:r>
+              <w:rPr>
+                <w:rFonts w:ascii="Consolas" w:hAnsi="Consolas" w:cs="Consolas"/>
+                <w:sz w:val="14"/>
+                <w:shd w:val="clear" w:color="auto" w:fill="EEF4F2"/>
+              </w:rPr>
+              <w:t>npm run test:e2e</w:t>
+            </w:r>
+            <w:r>
+              <w:rPr>
+                <w:sz w:val="16"/>
+                <w:szCs w:val="16"/>
+              </w:rPr>
+              <w:t xml:space="preserve">, zonder npm-pakketten. Een andere browser kies je met </w:t>
+            </w:r>
+            <w:r>
+              <w:rPr>
+                <w:rFonts w:ascii="Consolas" w:hAnsi="Consolas" w:cs="Consolas"/>
+                <w:sz w:val="14"/>
+                <w:shd w:val="clear" w:color="auto" w:fill="EEF4F2"/>
+              </w:rPr>
+              <w:t>BROWSER_PATH</w:t>
+            </w:r>
+          </w:p>
+        </w:tc>
+      </w:tr>
+      <w:tr>
+        <w:trPr>
+          <w:cantSplit/>
+        </w:trPr>
+        <w:tc>
+          <w:tcPr>
+            <w:tcW w:w="4337" w:type="dxa"/>
+          </w:tcPr>
+          <w:p>
+            <w:pPr>
+              <w:spacing w:before="20" w:after="20" w:line="240" w:lineRule="auto"/>
+            </w:pPr>
+            <w:r>
+              <w:rPr>
+                <w:rFonts w:ascii="Consolas" w:hAnsi="Consolas" w:cs="Consolas"/>
+                <w:sz w:val="14"/>
+                <w:shd w:val="clear" w:color="auto" w:fill="EEF4F2"/>
+              </w:rPr>
+              <w:t>.github/workflows/ci.yml</w:t>
+            </w:r>
+          </w:p>
+        </w:tc>
+        <w:tc>
+          <w:tcPr>
+            <w:tcW w:w="5301" w:type="dxa"/>
+          </w:tcPr>
+          <w:p>
+            <w:pPr>
+              <w:spacing w:before="20" w:after="20" w:line="240" w:lineRule="auto"/>
+            </w:pPr>
+            <w:r>
+              <w:rPr>
+                <w:sz w:val="16"/>
+                <w:szCs w:val="16"/>
+              </w:rPr>
               <w:t>Voert de unit tests en daarna de browsertests (in Google Chrome) automatisch uit op GitHub met Node.js 24 (LTS), met alleen leesrechten en actions die op een commit-SHA zijn vastgezet</w:t>
             </w:r>
           </w:p>
@@ -8813,7 +8883,7 @@
         </w:numPr>
       </w:pPr>
       <w:bookmarkStart w:id="5" w:name="k3"/>
-      <w:bookmarkStart w:id="6" w:name="_Toc243311071"/>
+      <w:bookmarkStart w:id="6" w:name="_Toc243464365"/>
       <w:r>
         <w:t>DE WEBSITE STARTEN.</w:t>
       </w:r>
@@ -9035,7 +9105,7 @@
         </w:numPr>
       </w:pPr>
       <w:bookmarkStart w:id="7" w:name="k4"/>
-      <w:bookmarkStart w:id="8" w:name="_Toc243311072"/>
+      <w:bookmarkStart w:id="8" w:name="_Toc243464366"/>
       <w:r>
         <w:t>GEBRUIKERSHANDLEIDING.</w:t>
       </w:r>
@@ -9048,7 +9118,7 @@
         <w:keepNext/>
       </w:pPr>
       <w:bookmarkStart w:id="9" w:name="k5"/>
-      <w:bookmarkStart w:id="10" w:name="_Toc243311073"/>
+      <w:bookmarkStart w:id="10" w:name="_Toc243464367"/>
       <w:r>
         <w:t>EEN MEDEWERKER ZOEKEN</w:t>
       </w:r>
@@ -9103,7 +9173,7 @@
         <w:keepNext/>
       </w:pPr>
       <w:bookmarkStart w:id="11" w:name="k6"/>
-      <w:bookmarkStart w:id="12" w:name="_Toc243311074"/>
+      <w:bookmarkStart w:id="12" w:name="_Toc243464368"/>
       <w:r>
         <w:t>EEN PRODUCT REGISTREREN</w:t>
       </w:r>
@@ -9267,7 +9337,7 @@
         <w:t>Lotte van Dijk: 2× Blikje, 1× Ei geregistreerd</w:t>
       </w:r>
       <w:r>
-        <w:t>. Het zoekveld en het bedrijfsfilter zijn daarna weer leeg en de lijst staat bovenaan, klaar voor de volgende collega.</w:t>
+        <w:t>. Het zoekveld en het bedrijfsfilter zijn daarna weer leeg en de lijst staat bovenaan, klaar voor de volgende collega. Dat gebeurt ook als je het venster sluit zonder te registreren (kruisje, naast het venster tikken of Escape).</w:t>
       </w:r>
     </w:p>
     <w:p>
@@ -9352,7 +9422,7 @@
         <w:keepNext/>
       </w:pPr>
       <w:bookmarkStart w:id="13" w:name="k7"/>
-      <w:bookmarkStart w:id="14" w:name="_Toc243311075"/>
+      <w:bookmarkStart w:id="14" w:name="_Toc243464369"/>
       <w:r>
         <w:t>ADMIN-DASHBOARD OPENEN</w:t>
       </w:r>
@@ -9483,7 +9553,7 @@
         <w:keepNext/>
       </w:pPr>
       <w:bookmarkStart w:id="15" w:name="k8"/>
-      <w:bookmarkStart w:id="16" w:name="_Toc243311076"/>
+      <w:bookmarkStart w:id="16" w:name="_Toc243464370"/>
       <w:r>
         <w:t>REGISTRATIES BEHEREN</w:t>
       </w:r>
@@ -9769,7 +9839,7 @@
         <w:keepNext/>
       </w:pPr>
       <w:bookmarkStart w:id="17" w:name="k9"/>
-      <w:bookmarkStart w:id="18" w:name="_Toc243311077"/>
+      <w:bookmarkStart w:id="18" w:name="_Toc243464371"/>
       <w:r>
         <w:t>MEDEWERKERS BEHEREN</w:t>
       </w:r>
@@ -10103,7 +10173,7 @@
         <w:keepNext/>
       </w:pPr>
       <w:bookmarkStart w:id="19" w:name="k10"/>
-      <w:bookmarkStart w:id="20" w:name="_Toc243311078"/>
+      <w:bookmarkStart w:id="20" w:name="_Toc243464372"/>
       <w:r>
         <w:t>PRODUCTEN BEHEREN</w:t>
       </w:r>
@@ -10231,7 +10301,7 @@
         <w:keepNext/>
       </w:pPr>
       <w:bookmarkStart w:id="21" w:name="k11"/>
-      <w:bookmarkStart w:id="22" w:name="_Toc243311079"/>
+      <w:bookmarkStart w:id="22" w:name="_Toc243464373"/>
       <w:r>
         <w:t>BEDRIJVEN EN CONSUMPTIEPUNTEN BEHEREN</w:t>
       </w:r>
@@ -10394,7 +10464,7 @@
         <w:keepNext/>
       </w:pPr>
       <w:bookmarkStart w:id="23" w:name="k12"/>
-      <w:bookmarkStart w:id="24" w:name="_Toc243311080"/>
+      <w:bookmarkStart w:id="24" w:name="_Toc243464374"/>
       <w:r>
         <w:t>VOORRAAD BEHEREN</w:t>
       </w:r>
@@ -10538,7 +10608,7 @@
         <w:t>countedAt</w:t>
       </w:r>
       <w:r>
-        <w:t>).</w:t>
+        <w:t>). In het logboek staan bij "Voorraad geteld" de verwachte voorraad, de getelde voorraad en het verschil, bijvoorbeeld "verwacht 20, geteld 18, verschil -2". Zo is later te zien hoeveel er zonder registratie is verdwenen.</w:t>
       </w:r>
     </w:p>
     <w:p>
@@ -10612,7 +10682,7 @@
         <w:keepNext/>
       </w:pPr>
       <w:bookmarkStart w:id="25" w:name="k13"/>
-      <w:bookmarkStart w:id="26" w:name="_Toc243311081"/>
+      <w:bookmarkStart w:id="26" w:name="_Toc243464375"/>
       <w:r>
         <w:t>LOGBOEK BEKIJKEN</w:t>
       </w:r>
@@ -10652,7 +10722,7 @@
         <w:keepNext/>
       </w:pPr>
       <w:bookmarkStart w:id="27" w:name="k14"/>
-      <w:bookmarkStart w:id="28" w:name="_Toc243311082"/>
+      <w:bookmarkStart w:id="28" w:name="_Toc243464376"/>
       <w:r>
         <w:t>ALLE GEGEVENS WISSEN</w:t>
       </w:r>
@@ -10778,7 +10848,7 @@
         <w:keepNext/>
       </w:pPr>
       <w:bookmarkStart w:id="29" w:name="k15"/>
-      <w:bookmarkStart w:id="30" w:name="_Toc243311083"/>
+      <w:bookmarkStart w:id="30" w:name="_Toc243464377"/>
       <w:r>
         <w:t>MODAL SLUITEN EN UITLOGGEN</w:t>
       </w:r>
@@ -10852,7 +10922,7 @@
         <w:keepNext/>
       </w:pPr>
       <w:bookmarkStart w:id="31" w:name="k16"/>
-      <w:bookmarkStart w:id="32" w:name="_Toc243311084"/>
+      <w:bookmarkStart w:id="32" w:name="_Toc243464378"/>
       <w:r>
         <w:t>CSV EXPORTEREN</w:t>
       </w:r>
@@ -11236,7 +11306,7 @@
         <w:keepNext/>
       </w:pPr>
       <w:bookmarkStart w:id="33" w:name="k17"/>
-      <w:bookmarkStart w:id="34" w:name="_Toc243311085"/>
+      <w:bookmarkStart w:id="34" w:name="_Toc243464379"/>
       <w:r>
         <w:t>LICHT OF DONKER THEMA</w:t>
       </w:r>
@@ -11343,7 +11413,7 @@
         <w:keepNext/>
       </w:pPr>
       <w:bookmarkStart w:id="35" w:name="k18"/>
-      <w:bookmarkStart w:id="36" w:name="_Toc243311086"/>
+      <w:bookmarkStart w:id="36" w:name="_Toc243464380"/>
       <w:r>
         <w:t>WELKOM EN "ZELFDE ALS VORIGE KEER"</w:t>
       </w:r>
@@ -11430,7 +11500,7 @@
         <w:keepNext/>
       </w:pPr>
       <w:bookmarkStart w:id="37" w:name="k19"/>
-      <w:bookmarkStart w:id="38" w:name="_Toc243311087"/>
+      <w:bookmarkStart w:id="38" w:name="_Toc243464381"/>
       <w:r>
         <w:t>DEMO GEZICHTSHERKENNING</w:t>
       </w:r>
@@ -11638,7 +11708,7 @@
         <w:keepNext/>
       </w:pPr>
       <w:bookmarkStart w:id="39" w:name="k20"/>
-      <w:bookmarkStart w:id="40" w:name="_Toc243311088"/>
+      <w:bookmarkStart w:id="40" w:name="_Toc243464382"/>
       <w:r>
         <w:t>HERKENNEN MET DE PAS</w:t>
       </w:r>
@@ -11830,7 +11900,7 @@
         <w:keepNext/>
       </w:pPr>
       <w:bookmarkStart w:id="41" w:name="k21"/>
-      <w:bookmarkStart w:id="42" w:name="_Toc243311089"/>
+      <w:bookmarkStart w:id="42" w:name="_Toc243464383"/>
       <w:r>
         <w:t>SLIMME KOELKAST (DEMO)</w:t>
       </w:r>
@@ -11967,7 +12037,7 @@
         <w:t>Openen (demo)</w:t>
       </w:r>
       <w:r>
-        <w:t>.</w:t>
+        <w:t>. De keuzelijst begint met "Kies een medewerker" en de knop gaat pas aan als je een naam hebt gekozen.</w:t>
       </w:r>
     </w:p>
     <w:p>
@@ -11992,7 +12062,7 @@
         <w:tab/>
       </w:r>
       <w:r>
-        <w:t xml:space="preserve">De deur is open. Per schap zie je het product en hoeveel er liggen. Tik op een schap om een product te pakken. Onder de koelkast staat wat je in de hand hebt, bijvoorbeeld "In je hand: 2× Blikje". Zet je iets terug, tik dan op </w:t>
+        <w:t xml:space="preserve">De deur is open. Onder de begroeting staat "Alles wat je nu pakt, staat op naam van …" met jouw naam. Per schap zie je het product en hoeveel er liggen. Tik op een schap om een product te pakken. Onder de koelkast staat wat je in de hand hebt, bijvoorbeeld "In je hand: 2× Blikje". Zet je iets terug, tik dan op </w:t>
       </w:r>
       <w:r>
         <w:rPr>
@@ -12080,7 +12150,7 @@
         <w:contextualSpacing w:val="0"/>
       </w:pPr>
       <w:r>
-        <w:t>Een tweede pas terwijl de deur open is, telt niet: "De koelkast is al open. Sluit eerst de deur." Alles wat je pakt, staat op naam van wie de deur opende.</w:t>
+        <w:t>Een tweede pas terwijl de deur open is, opent niets. Alles wat je pakt, staat op naam van wie de deur opende. Scant een collega zijn pas, dan staat er "De koelkast is al open op naam van … Sluit eerst de deur en open dan met je eigen pas. De beheerder kijkt naar deze opening." en krijgt de opening de status "Controle nodig".</w:t>
       </w:r>
     </w:p>
     <w:p>
@@ -12094,7 +12164,7 @@
         <w:contextualSpacing w:val="0"/>
       </w:pPr>
       <w:r>
-        <w:t>Staat de deur langer dan een minuut open, dan verschijnt "De deur staat al lang open. Sluit de deur."</w:t>
+        <w:t>Staat de deur langer dan een minuut open, dan verschijnt "De deur staat al lang open. Sluit de deur. Wat er nu wordt gepakt, staat op naam van …"</w:t>
       </w:r>
     </w:p>
     <w:p>
@@ -12108,7 +12178,18 @@
         <w:contextualSpacing w:val="0"/>
       </w:pPr>
       <w:r>
-        <w:t>Heb je niets gepakt, dan wordt er niets geregistreerd ("Je hebt niets gepakt"). Escape met de deur open sluit de deur.</w:t>
+        <w:t xml:space="preserve">Tik je per ongeluk twee keer op </w:t>
+      </w:r>
+      <w:r>
+        <w:rPr>
+          <w:rFonts w:ascii="Consolas" w:hAnsi="Consolas" w:cs="Consolas"/>
+          <w:sz w:val="18"/>
+          <w:shd w:val="clear" w:color="auto" w:fill="EEF4F2"/>
+        </w:rPr>
+        <w:t>Deur dicht</w:t>
+      </w:r>
+      <w:r>
+        <w:t>, dan blijft het overzicht staan.</w:t>
       </w:r>
     </w:p>
     <w:p>
@@ -12122,6 +12203,34 @@
         <w:contextualSpacing w:val="0"/>
       </w:pPr>
       <w:r>
+        <w:t>De koelkast rekent met het gemiddelde gewicht van de producten op het schap, zodat bijvoorbeeld eieren die zwaarder zijn dan het ingestelde gewicht toch goed worden geteld.</w:t>
+      </w:r>
+    </w:p>
+    <w:p>
+      <w:pPr>
+        <w:pStyle w:val="Lijstalinea"/>
+        <w:numPr>
+          <w:ilvl w:val="0"/>
+          <w:numId w:val="3"/>
+        </w:numPr>
+        <w:spacing w:after="60"/>
+        <w:contextualSpacing w:val="0"/>
+      </w:pPr>
+      <w:r>
+        <w:t>Heb je niets gepakt, dan wordt er niets geregistreerd ("Je hebt niets gepakt"). Escape met de deur open sluit de deur.</w:t>
+      </w:r>
+    </w:p>
+    <w:p>
+      <w:pPr>
+        <w:pStyle w:val="Lijstalinea"/>
+        <w:numPr>
+          <w:ilvl w:val="0"/>
+          <w:numId w:val="3"/>
+        </w:numPr>
+        <w:spacing w:after="60"/>
+        <w:contextualSpacing w:val="0"/>
+      </w:pPr>
+      <w:r>
         <w:t xml:space="preserve">Klopt het gewicht van een schap niet (in de demo na een tik op </w:t>
       </w:r>
       <w:r>
@@ -12208,8 +12317,6 @@
       </w:r>
       <w:r>
         <w:tab/>
-      </w:r>
-      <w:r>
         <w:t xml:space="preserve">Kies per schap een product (alleen producten die het punt aanbiedt) of </w:t>
       </w:r>
       <w:r>
@@ -12405,7 +12512,7 @@
         </w:numPr>
       </w:pPr>
       <w:bookmarkStart w:id="43" w:name="k22"/>
-      <w:bookmarkStart w:id="44" w:name="_Toc243311090"/>
+      <w:bookmarkStart w:id="44" w:name="_Toc243464384"/>
       <w:r>
         <w:t xml:space="preserve">UITLEG VAN </w:t>
       </w:r>
@@ -12429,7 +12536,7 @@
         <w:keepNext/>
       </w:pPr>
       <w:bookmarkStart w:id="45" w:name="k23"/>
-      <w:bookmarkStart w:id="46" w:name="_Toc243311091"/>
+      <w:bookmarkStart w:id="46" w:name="_Toc243464385"/>
       <w:r>
         <w:t>METADATA EN EXTERNE BESTANDEN</w:t>
       </w:r>
@@ -12705,7 +12812,7 @@
         <w:keepNext/>
       </w:pPr>
       <w:bookmarkStart w:id="47" w:name="k24"/>
-      <w:bookmarkStart w:id="48" w:name="_Toc243311092"/>
+      <w:bookmarkStart w:id="48" w:name="_Toc243464386"/>
       <w:r>
         <w:t>NAVIGATIEBALK</w:t>
       </w:r>
@@ -12918,7 +13025,7 @@
         <w:keepNext/>
       </w:pPr>
       <w:bookmarkStart w:id="49" w:name="k25"/>
-      <w:bookmarkStart w:id="50" w:name="_Toc243311093"/>
+      <w:bookmarkStart w:id="50" w:name="_Toc243464387"/>
       <w:r>
         <w:t>HERO-GEDEELTE</w:t>
       </w:r>
@@ -12963,7 +13070,7 @@
         <w:keepNext/>
       </w:pPr>
       <w:bookmarkStart w:id="51" w:name="k26"/>
-      <w:bookmarkStart w:id="52" w:name="_Toc243311094"/>
+      <w:bookmarkStart w:id="52" w:name="_Toc243464388"/>
       <w:r>
         <w:t>MEDEWERKERLIJST</w:t>
       </w:r>
@@ -13300,7 +13407,7 @@
         <w:keepNext/>
       </w:pPr>
       <w:bookmarkStart w:id="53" w:name="k27"/>
-      <w:bookmarkStart w:id="54" w:name="_Toc243311095"/>
+      <w:bookmarkStart w:id="54" w:name="_Toc243464389"/>
       <w:r>
         <w:t>STATISTIEKEN</w:t>
       </w:r>
@@ -13383,7 +13490,7 @@
         <w:keepNext/>
       </w:pPr>
       <w:bookmarkStart w:id="55" w:name="k28"/>
-      <w:bookmarkStart w:id="56" w:name="_Toc243311096"/>
+      <w:bookmarkStart w:id="56" w:name="_Toc243464390"/>
       <w:r>
         <w:t>VENSTERS (MODALS)</w:t>
       </w:r>
@@ -14015,7 +14122,7 @@
         <w:keepNext/>
       </w:pPr>
       <w:bookmarkStart w:id="57" w:name="k29"/>
-      <w:bookmarkStart w:id="58" w:name="_Toc243311097"/>
+      <w:bookmarkStart w:id="58" w:name="_Toc243464391"/>
       <w:r>
         <w:t>WAARSCHUWING BIJ OPENEN ALS LOS BESTAND</w:t>
       </w:r>
@@ -14060,7 +14167,7 @@
         </w:numPr>
       </w:pPr>
       <w:bookmarkStart w:id="59" w:name="k30"/>
-      <w:bookmarkStart w:id="60" w:name="_Toc243311098"/>
+      <w:bookmarkStart w:id="60" w:name="_Toc243464392"/>
       <w:r>
         <w:t xml:space="preserve">UITLEG VAN </w:t>
       </w:r>
@@ -14084,7 +14191,7 @@
         <w:keepNext/>
       </w:pPr>
       <w:bookmarkStart w:id="61" w:name="k31"/>
-      <w:bookmarkStart w:id="62" w:name="_Toc243311099"/>
+      <w:bookmarkStart w:id="62" w:name="_Toc243464393"/>
       <w:r>
         <w:t>CSS-VARIABELEN</w:t>
       </w:r>
@@ -14759,7 +14866,7 @@
         <w:keepNext/>
       </w:pPr>
       <w:bookmarkStart w:id="63" w:name="k32"/>
-      <w:bookmarkStart w:id="64" w:name="_Toc243311100"/>
+      <w:bookmarkStart w:id="64" w:name="_Toc243464394"/>
       <w:r>
         <w:t>LAYOUT</w:t>
       </w:r>
@@ -15468,7 +15575,7 @@
         <w:keepNext/>
       </w:pPr>
       <w:bookmarkStart w:id="65" w:name="k33"/>
-      <w:bookmarkStart w:id="66" w:name="_Toc243311101"/>
+      <w:bookmarkStart w:id="66" w:name="_Toc243464395"/>
       <w:r>
         <w:t>COMPONENTEN</w:t>
       </w:r>
@@ -15713,7 +15820,7 @@
         </w:numPr>
       </w:pPr>
       <w:bookmarkStart w:id="67" w:name="k34"/>
-      <w:bookmarkStart w:id="68" w:name="_Toc243311102"/>
+      <w:bookmarkStart w:id="68" w:name="_Toc243464396"/>
       <w:r>
         <w:t>UITLEG VAN DE JAVASCRIPT (</w:t>
       </w:r>
@@ -15737,7 +15844,7 @@
         <w:keepNext/>
       </w:pPr>
       <w:bookmarkStart w:id="69" w:name="k35"/>
-      <w:bookmarkStart w:id="70" w:name="_Toc243311103"/>
+      <w:bookmarkStart w:id="70" w:name="_Toc243464397"/>
       <w:r>
         <w:t>OPSLAG EN VOORBEELDDATA</w:t>
       </w:r>
@@ -16514,7 +16621,7 @@
         <w:keepNext/>
       </w:pPr>
       <w:bookmarkStart w:id="71" w:name="k36"/>
-      <w:bookmarkStart w:id="72" w:name="_Toc243311104"/>
+      <w:bookmarkStart w:id="72" w:name="_Toc243464398"/>
       <w:r>
         <w:t>OBJECTGEORIËNTEERDE STRUCTUUR</w:t>
       </w:r>
@@ -22450,7 +22557,7 @@
         <w:keepNext/>
       </w:pPr>
       <w:bookmarkStart w:id="85" w:name="k49"/>
-      <w:bookmarkStart w:id="86" w:name="_Toc243311105"/>
+      <w:bookmarkStart w:id="86" w:name="_Toc243464399"/>
       <w:r>
         <w:rPr>
           <w:rFonts w:ascii="Consolas" w:hAnsi="Consolas" w:cs="Consolas"/>
@@ -22591,7 +22698,7 @@
         <w:keepNext/>
       </w:pPr>
       <w:bookmarkStart w:id="87" w:name="k50"/>
-      <w:bookmarkStart w:id="88" w:name="_Toc243311106"/>
+      <w:bookmarkStart w:id="88" w:name="_Toc243464400"/>
       <w:r>
         <w:rPr>
           <w:rFonts w:ascii="Consolas" w:hAnsi="Consolas" w:cs="Consolas"/>
@@ -22668,7 +22775,7 @@
         <w:keepNext/>
       </w:pPr>
       <w:bookmarkStart w:id="89" w:name="k51"/>
-      <w:bookmarkStart w:id="90" w:name="_Toc243311107"/>
+      <w:bookmarkStart w:id="90" w:name="_Toc243464401"/>
       <w:r>
         <w:rPr>
           <w:rFonts w:ascii="Consolas" w:hAnsi="Consolas" w:cs="Consolas"/>
@@ -22839,7 +22946,7 @@
         <w:keepNext/>
       </w:pPr>
       <w:bookmarkStart w:id="91" w:name="k52"/>
-      <w:bookmarkStart w:id="92" w:name="_Toc243311108"/>
+      <w:bookmarkStart w:id="92" w:name="_Toc243464402"/>
       <w:r>
         <w:rPr>
           <w:rFonts w:ascii="Consolas" w:hAnsi="Consolas" w:cs="Consolas"/>
@@ -22906,7 +23013,7 @@
         <w:keepNext/>
       </w:pPr>
       <w:bookmarkStart w:id="93" w:name="k53"/>
-      <w:bookmarkStart w:id="94" w:name="_Toc243311109"/>
+      <w:bookmarkStart w:id="94" w:name="_Toc243464403"/>
       <w:r>
         <w:rPr>
           <w:rFonts w:ascii="Consolas" w:hAnsi="Consolas" w:cs="Consolas"/>
@@ -23028,7 +23135,7 @@
         <w:keepNext/>
       </w:pPr>
       <w:bookmarkStart w:id="95" w:name="k54"/>
-      <w:bookmarkStart w:id="96" w:name="_Toc243311110"/>
+      <w:bookmarkStart w:id="96" w:name="_Toc243464404"/>
       <w:r>
         <w:rPr>
           <w:rFonts w:ascii="Consolas" w:hAnsi="Consolas" w:cs="Consolas"/>
@@ -23150,7 +23257,7 @@
         <w:keepNext/>
       </w:pPr>
       <w:bookmarkStart w:id="97" w:name="k55"/>
-      <w:bookmarkStart w:id="98" w:name="_Toc243311111"/>
+      <w:bookmarkStart w:id="98" w:name="_Toc243464405"/>
       <w:r>
         <w:t>OPSLAGFOUTEN EN TERUGDRAAIEN</w:t>
       </w:r>
@@ -23212,7 +23319,7 @@
         <w:keepNext/>
       </w:pPr>
       <w:bookmarkStart w:id="99" w:name="k56"/>
-      <w:bookmarkStart w:id="100" w:name="_Toc243311112"/>
+      <w:bookmarkStart w:id="100" w:name="_Toc243464406"/>
       <w:r>
         <w:t>ADMINFUNCTIES</w:t>
       </w:r>
@@ -23458,7 +23565,7 @@
         <w:keepNext/>
       </w:pPr>
       <w:bookmarkStart w:id="101" w:name="k57"/>
-      <w:bookmarkStart w:id="102" w:name="_Toc243311113"/>
+      <w:bookmarkStart w:id="102" w:name="_Toc243464407"/>
       <w:r>
         <w:t xml:space="preserve">CSV-EXPORT (CLASS </w:t>
       </w:r>
@@ -23866,7 +23973,7 @@
         <w:keepNext/>
       </w:pPr>
       <w:bookmarkStart w:id="103" w:name="k58"/>
-      <w:bookmarkStart w:id="104" w:name="_Toc243311114"/>
+      <w:bookmarkStart w:id="104" w:name="_Toc243464408"/>
       <w:r>
         <w:t>EVENT LISTENERS</w:t>
       </w:r>
@@ -24478,7 +24585,7 @@
         </w:numPr>
       </w:pPr>
       <w:bookmarkStart w:id="105" w:name="k59"/>
-      <w:bookmarkStart w:id="106" w:name="_Toc243311115"/>
+      <w:bookmarkStart w:id="106" w:name="_Toc243464409"/>
       <w:r>
         <w:t>DATAMODEL EN KOPPELINGEN.</w:t>
       </w:r>
@@ -24496,7 +24603,7 @@
         <w:keepNext/>
       </w:pPr>
       <w:bookmarkStart w:id="107" w:name="k60"/>
-      <w:bookmarkStart w:id="108" w:name="_Toc243311116"/>
+      <w:bookmarkStart w:id="108" w:name="_Toc243464410"/>
       <w:r>
         <w:t>BEDRIJVEN</w:t>
       </w:r>
@@ -24707,7 +24814,7 @@
         <w:keepNext/>
       </w:pPr>
       <w:bookmarkStart w:id="109" w:name="k61"/>
-      <w:bookmarkStart w:id="110" w:name="_Toc243311117"/>
+      <w:bookmarkStart w:id="110" w:name="_Toc243464411"/>
       <w:r>
         <w:t>CONSUMPTIEPUNTEN</w:t>
       </w:r>
@@ -25026,7 +25133,7 @@
         <w:keepNext/>
       </w:pPr>
       <w:bookmarkStart w:id="111" w:name="k62"/>
-      <w:bookmarkStart w:id="112" w:name="_Toc243311118"/>
+      <w:bookmarkStart w:id="112" w:name="_Toc243464412"/>
       <w:r>
         <w:t>MEDEWERKERS</w:t>
       </w:r>
@@ -25582,7 +25689,7 @@
         <w:keepNext/>
       </w:pPr>
       <w:bookmarkStart w:id="113" w:name="k63"/>
-      <w:bookmarkStart w:id="114" w:name="_Toc243311119"/>
+      <w:bookmarkStart w:id="114" w:name="_Toc243464413"/>
       <w:r>
         <w:t>REGISTRATIES</w:t>
       </w:r>
@@ -26243,7 +26350,7 @@
         <w:keepNext/>
       </w:pPr>
       <w:bookmarkStart w:id="115" w:name="k64"/>
-      <w:bookmarkStart w:id="116" w:name="_Toc243311120"/>
+      <w:bookmarkStart w:id="116" w:name="_Toc243464414"/>
       <w:r>
         <w:t>SLIMME KOELKAST</w:t>
       </w:r>
@@ -26668,7 +26775,7 @@
         </w:numPr>
       </w:pPr>
       <w:bookmarkStart w:id="117" w:name="k65"/>
-      <w:bookmarkStart w:id="118" w:name="_Toc243311121"/>
+      <w:bookmarkStart w:id="118" w:name="_Toc243464415"/>
       <w:r>
         <w:t>BELANGRIJKE DEMO-BEPERKINGEN.</w:t>
       </w:r>
@@ -26699,7 +26806,29 @@
         <w:t>localStorage</w:t>
       </w:r>
       <w:r>
-        <w:t xml:space="preserve"> is niet gedeeld tussen gebruikers of apparaten. Tussen tabbladen in dezelfde browser wel: slaat het ene tabblad iets op, dan laadt het andere tabblad de nieuwe gegevens in.</w:t>
+        <w:t xml:space="preserve"> is niet gedeeld tussen gebruikers of apparaten. Tussen tabbladen in dezelfde browser wel: slaat het ene tabblad iets op, dan laadt het andere tabblad de nieuwe gegevens in. Slaat het andere tabblad op voordat het die gegevens heeft geladen, dan schrijft het er niet overheen maar laadt het eerst de nieuwe gegevens en voert het de wijziging opnieuw uit (</w:t>
+      </w:r>
+      <w:r>
+        <w:rPr>
+          <w:rFonts w:ascii="Consolas" w:hAnsi="Consolas" w:cs="Consolas"/>
+          <w:sz w:val="18"/>
+          <w:shd w:val="clear" w:color="auto" w:fill="EEF4F2"/>
+        </w:rPr>
+        <w:t>DataStore.save</w:t>
+      </w:r>
+      <w:r>
+        <w:t xml:space="preserve"> en </w:t>
+      </w:r>
+      <w:r>
+        <w:rPr>
+          <w:rFonts w:ascii="Consolas" w:hAnsi="Consolas" w:cs="Consolas"/>
+          <w:sz w:val="18"/>
+          <w:shd w:val="clear" w:color="auto" w:fill="EEF4F2"/>
+        </w:rPr>
+        <w:t>RegistrationApp.persist</w:t>
+      </w:r>
+      <w:r>
+        <w:t>).</w:t>
       </w:r>
     </w:p>
     <w:p>
@@ -27076,7 +27205,7 @@
         </w:numPr>
       </w:pPr>
       <w:bookmarkStart w:id="119" w:name="k66"/>
-      <w:bookmarkStart w:id="120" w:name="_Toc243311122"/>
+      <w:bookmarkStart w:id="120" w:name="_Toc243464416"/>
       <w:r>
         <w:t>CODE UITLEGGEN TIJDENS EEN PRESENTATIE.</w:t>
       </w:r>
@@ -27482,7 +27611,7 @@
         </w:numPr>
       </w:pPr>
       <w:bookmarkStart w:id="121" w:name="k67"/>
-      <w:bookmarkStart w:id="122" w:name="_Toc243311123"/>
+      <w:bookmarkStart w:id="122" w:name="_Toc243464417"/>
       <w:r>
         <w:t>MOGELIJKE VERVOLGSTAPPEN.</w:t>
       </w:r>

</xml_diff>

<commit_message>
Screenshots W33 en W42 t/m W44 bijgewerkt en logboektabel past weer in het beheervenster
</commit_message>
<xml_diff>
--- a/docs/DOCUMENTATIE.docx
+++ b/docs/DOCUMENTATIE.docx
@@ -82,7 +82,7 @@
           <w:numId w:val="0"/>
         </w:numPr>
       </w:pPr>
-      <w:bookmarkStart w:id="0" w:name="_Toc243464362"/>
+      <w:bookmarkStart w:id="0" w:name="_Toc243466212"/>
       <w:r>
         <w:t>INHOUDSOPGAVE.</w:t>
       </w:r>
@@ -112,7 +112,7 @@
       <w:r>
         <w:fldChar w:fldCharType="separate"/>
       </w:r>
-      <w:hyperlink w:anchor="_Toc243464362" w:history="1">
+      <w:hyperlink w:anchor="_Toc243466212" w:history="1">
         <w:r>
           <w:rPr>
             <w:rStyle w:val="Hyperlink"/>
@@ -139,7 +139,7 @@
             <w:noProof/>
             <w:webHidden/>
           </w:rPr>
-          <w:instrText xml:space="preserve"> PAGEREF _Toc243464362 \h </w:instrText>
+          <w:instrText xml:space="preserve"> PAGEREF _Toc243466212 \h </w:instrText>
         </w:r>
         <w:r>
           <w:rPr>
@@ -186,7 +186,7 @@
           <w:lang w:eastAsia="nl-NL"/>
         </w:rPr>
       </w:pPr>
-      <w:hyperlink w:anchor="_Toc243464363" w:history="1">
+      <w:hyperlink w:anchor="_Toc243466213" w:history="1">
         <w:r>
           <w:rPr>
             <w:rStyle w:val="Hyperlink"/>
@@ -231,7 +231,7 @@
             <w:noProof/>
             <w:webHidden/>
           </w:rPr>
-          <w:instrText xml:space="preserve"> PAGEREF _Toc243464363 \h </w:instrText>
+          <w:instrText xml:space="preserve"> PAGEREF _Toc243466213 \h </w:instrText>
         </w:r>
         <w:r>
           <w:rPr>
@@ -278,7 +278,7 @@
           <w:lang w:eastAsia="nl-NL"/>
         </w:rPr>
       </w:pPr>
-      <w:hyperlink w:anchor="_Toc243464364" w:history="1">
+      <w:hyperlink w:anchor="_Toc243466214" w:history="1">
         <w:r>
           <w:rPr>
             <w:rStyle w:val="Hyperlink"/>
@@ -323,7 +323,7 @@
             <w:noProof/>
             <w:webHidden/>
           </w:rPr>
-          <w:instrText xml:space="preserve"> PAGEREF _Toc243464364 \h </w:instrText>
+          <w:instrText xml:space="preserve"> PAGEREF _Toc243466214 \h </w:instrText>
         </w:r>
         <w:r>
           <w:rPr>
@@ -370,7 +370,7 @@
           <w:lang w:eastAsia="nl-NL"/>
         </w:rPr>
       </w:pPr>
-      <w:hyperlink w:anchor="_Toc243464365" w:history="1">
+      <w:hyperlink w:anchor="_Toc243466215" w:history="1">
         <w:r>
           <w:rPr>
             <w:rStyle w:val="Hyperlink"/>
@@ -415,7 +415,7 @@
             <w:noProof/>
             <w:webHidden/>
           </w:rPr>
-          <w:instrText xml:space="preserve"> PAGEREF _Toc243464365 \h </w:instrText>
+          <w:instrText xml:space="preserve"> PAGEREF _Toc243466215 \h </w:instrText>
         </w:r>
         <w:r>
           <w:rPr>
@@ -462,7 +462,7 @@
           <w:lang w:eastAsia="nl-NL"/>
         </w:rPr>
       </w:pPr>
-      <w:hyperlink w:anchor="_Toc243464366" w:history="1">
+      <w:hyperlink w:anchor="_Toc243466216" w:history="1">
         <w:r>
           <w:rPr>
             <w:rStyle w:val="Hyperlink"/>
@@ -507,7 +507,7 @@
             <w:noProof/>
             <w:webHidden/>
           </w:rPr>
-          <w:instrText xml:space="preserve"> PAGEREF _Toc243464366 \h </w:instrText>
+          <w:instrText xml:space="preserve"> PAGEREF _Toc243466216 \h </w:instrText>
         </w:r>
         <w:r>
           <w:rPr>
@@ -554,7 +554,7 @@
           <w:lang w:eastAsia="nl-NL"/>
         </w:rPr>
       </w:pPr>
-      <w:hyperlink w:anchor="_Toc243464367" w:history="1">
+      <w:hyperlink w:anchor="_Toc243466217" w:history="1">
         <w:r>
           <w:rPr>
             <w:rStyle w:val="Hyperlink"/>
@@ -599,7 +599,7 @@
             <w:noProof/>
             <w:webHidden/>
           </w:rPr>
-          <w:instrText xml:space="preserve"> PAGEREF _Toc243464367 \h </w:instrText>
+          <w:instrText xml:space="preserve"> PAGEREF _Toc243466217 \h </w:instrText>
         </w:r>
         <w:r>
           <w:rPr>
@@ -646,7 +646,7 @@
           <w:lang w:eastAsia="nl-NL"/>
         </w:rPr>
       </w:pPr>
-      <w:hyperlink w:anchor="_Toc243464368" w:history="1">
+      <w:hyperlink w:anchor="_Toc243466218" w:history="1">
         <w:r>
           <w:rPr>
             <w:rStyle w:val="Hyperlink"/>
@@ -691,7 +691,7 @@
             <w:noProof/>
             <w:webHidden/>
           </w:rPr>
-          <w:instrText xml:space="preserve"> PAGEREF _Toc243464368 \h </w:instrText>
+          <w:instrText xml:space="preserve"> PAGEREF _Toc243466218 \h </w:instrText>
         </w:r>
         <w:r>
           <w:rPr>
@@ -738,7 +738,7 @@
           <w:lang w:eastAsia="nl-NL"/>
         </w:rPr>
       </w:pPr>
-      <w:hyperlink w:anchor="_Toc243464369" w:history="1">
+      <w:hyperlink w:anchor="_Toc243466219" w:history="1">
         <w:r>
           <w:rPr>
             <w:rStyle w:val="Hyperlink"/>
@@ -783,7 +783,7 @@
             <w:noProof/>
             <w:webHidden/>
           </w:rPr>
-          <w:instrText xml:space="preserve"> PAGEREF _Toc243464369 \h </w:instrText>
+          <w:instrText xml:space="preserve"> PAGEREF _Toc243466219 \h </w:instrText>
         </w:r>
         <w:r>
           <w:rPr>
@@ -830,7 +830,7 @@
           <w:lang w:eastAsia="nl-NL"/>
         </w:rPr>
       </w:pPr>
-      <w:hyperlink w:anchor="_Toc243464370" w:history="1">
+      <w:hyperlink w:anchor="_Toc243466220" w:history="1">
         <w:r>
           <w:rPr>
             <w:rStyle w:val="Hyperlink"/>
@@ -875,7 +875,7 @@
             <w:noProof/>
             <w:webHidden/>
           </w:rPr>
-          <w:instrText xml:space="preserve"> PAGEREF _Toc243464370 \h </w:instrText>
+          <w:instrText xml:space="preserve"> PAGEREF _Toc243466220 \h </w:instrText>
         </w:r>
         <w:r>
           <w:rPr>
@@ -922,7 +922,7 @@
           <w:lang w:eastAsia="nl-NL"/>
         </w:rPr>
       </w:pPr>
-      <w:hyperlink w:anchor="_Toc243464371" w:history="1">
+      <w:hyperlink w:anchor="_Toc243466221" w:history="1">
         <w:r>
           <w:rPr>
             <w:rStyle w:val="Hyperlink"/>
@@ -967,7 +967,7 @@
             <w:noProof/>
             <w:webHidden/>
           </w:rPr>
-          <w:instrText xml:space="preserve"> PAGEREF _Toc243464371 \h </w:instrText>
+          <w:instrText xml:space="preserve"> PAGEREF _Toc243466221 \h </w:instrText>
         </w:r>
         <w:r>
           <w:rPr>
@@ -1014,7 +1014,7 @@
           <w:lang w:eastAsia="nl-NL"/>
         </w:rPr>
       </w:pPr>
-      <w:hyperlink w:anchor="_Toc243464372" w:history="1">
+      <w:hyperlink w:anchor="_Toc243466222" w:history="1">
         <w:r>
           <w:rPr>
             <w:rStyle w:val="Hyperlink"/>
@@ -1059,7 +1059,7 @@
             <w:noProof/>
             <w:webHidden/>
           </w:rPr>
-          <w:instrText xml:space="preserve"> PAGEREF _Toc243464372 \h </w:instrText>
+          <w:instrText xml:space="preserve"> PAGEREF _Toc243466222 \h </w:instrText>
         </w:r>
         <w:r>
           <w:rPr>
@@ -1106,7 +1106,7 @@
           <w:lang w:eastAsia="nl-NL"/>
         </w:rPr>
       </w:pPr>
-      <w:hyperlink w:anchor="_Toc243464373" w:history="1">
+      <w:hyperlink w:anchor="_Toc243466223" w:history="1">
         <w:r>
           <w:rPr>
             <w:rStyle w:val="Hyperlink"/>
@@ -1151,7 +1151,7 @@
             <w:noProof/>
             <w:webHidden/>
           </w:rPr>
-          <w:instrText xml:space="preserve"> PAGEREF _Toc243464373 \h </w:instrText>
+          <w:instrText xml:space="preserve"> PAGEREF _Toc243466223 \h </w:instrText>
         </w:r>
         <w:r>
           <w:rPr>
@@ -1198,7 +1198,7 @@
           <w:lang w:eastAsia="nl-NL"/>
         </w:rPr>
       </w:pPr>
-      <w:hyperlink w:anchor="_Toc243464374" w:history="1">
+      <w:hyperlink w:anchor="_Toc243466224" w:history="1">
         <w:r>
           <w:rPr>
             <w:rStyle w:val="Hyperlink"/>
@@ -1243,7 +1243,7 @@
             <w:noProof/>
             <w:webHidden/>
           </w:rPr>
-          <w:instrText xml:space="preserve"> PAGEREF _Toc243464374 \h </w:instrText>
+          <w:instrText xml:space="preserve"> PAGEREF _Toc243466224 \h </w:instrText>
         </w:r>
         <w:r>
           <w:rPr>
@@ -1290,7 +1290,7 @@
           <w:lang w:eastAsia="nl-NL"/>
         </w:rPr>
       </w:pPr>
-      <w:hyperlink w:anchor="_Toc243464375" w:history="1">
+      <w:hyperlink w:anchor="_Toc243466225" w:history="1">
         <w:r>
           <w:rPr>
             <w:rStyle w:val="Hyperlink"/>
@@ -1335,7 +1335,7 @@
             <w:noProof/>
             <w:webHidden/>
           </w:rPr>
-          <w:instrText xml:space="preserve"> PAGEREF _Toc243464375 \h </w:instrText>
+          <w:instrText xml:space="preserve"> PAGEREF _Toc243466225 \h </w:instrText>
         </w:r>
         <w:r>
           <w:rPr>
@@ -1382,7 +1382,7 @@
           <w:lang w:eastAsia="nl-NL"/>
         </w:rPr>
       </w:pPr>
-      <w:hyperlink w:anchor="_Toc243464376" w:history="1">
+      <w:hyperlink w:anchor="_Toc243466226" w:history="1">
         <w:r>
           <w:rPr>
             <w:rStyle w:val="Hyperlink"/>
@@ -1427,7 +1427,7 @@
             <w:noProof/>
             <w:webHidden/>
           </w:rPr>
-          <w:instrText xml:space="preserve"> PAGEREF _Toc243464376 \h </w:instrText>
+          <w:instrText xml:space="preserve"> PAGEREF _Toc243466226 \h </w:instrText>
         </w:r>
         <w:r>
           <w:rPr>
@@ -1474,7 +1474,7 @@
           <w:lang w:eastAsia="nl-NL"/>
         </w:rPr>
       </w:pPr>
-      <w:hyperlink w:anchor="_Toc243464377" w:history="1">
+      <w:hyperlink w:anchor="_Toc243466227" w:history="1">
         <w:r>
           <w:rPr>
             <w:rStyle w:val="Hyperlink"/>
@@ -1519,7 +1519,7 @@
             <w:noProof/>
             <w:webHidden/>
           </w:rPr>
-          <w:instrText xml:space="preserve"> PAGEREF _Toc243464377 \h </w:instrText>
+          <w:instrText xml:space="preserve"> PAGEREF _Toc243466227 \h </w:instrText>
         </w:r>
         <w:r>
           <w:rPr>
@@ -1566,7 +1566,7 @@
           <w:lang w:eastAsia="nl-NL"/>
         </w:rPr>
       </w:pPr>
-      <w:hyperlink w:anchor="_Toc243464378" w:history="1">
+      <w:hyperlink w:anchor="_Toc243466228" w:history="1">
         <w:r>
           <w:rPr>
             <w:rStyle w:val="Hyperlink"/>
@@ -1611,7 +1611,7 @@
             <w:noProof/>
             <w:webHidden/>
           </w:rPr>
-          <w:instrText xml:space="preserve"> PAGEREF _Toc243464378 \h </w:instrText>
+          <w:instrText xml:space="preserve"> PAGEREF _Toc243466228 \h </w:instrText>
         </w:r>
         <w:r>
           <w:rPr>
@@ -1658,7 +1658,7 @@
           <w:lang w:eastAsia="nl-NL"/>
         </w:rPr>
       </w:pPr>
-      <w:hyperlink w:anchor="_Toc243464379" w:history="1">
+      <w:hyperlink w:anchor="_Toc243466229" w:history="1">
         <w:r>
           <w:rPr>
             <w:rStyle w:val="Hyperlink"/>
@@ -1703,7 +1703,7 @@
             <w:noProof/>
             <w:webHidden/>
           </w:rPr>
-          <w:instrText xml:space="preserve"> PAGEREF _Toc243464379 \h </w:instrText>
+          <w:instrText xml:space="preserve"> PAGEREF _Toc243466229 \h </w:instrText>
         </w:r>
         <w:r>
           <w:rPr>
@@ -1750,7 +1750,7 @@
           <w:lang w:eastAsia="nl-NL"/>
         </w:rPr>
       </w:pPr>
-      <w:hyperlink w:anchor="_Toc243464380" w:history="1">
+      <w:hyperlink w:anchor="_Toc243466230" w:history="1">
         <w:r>
           <w:rPr>
             <w:rStyle w:val="Hyperlink"/>
@@ -1795,7 +1795,7 @@
             <w:noProof/>
             <w:webHidden/>
           </w:rPr>
-          <w:instrText xml:space="preserve"> PAGEREF _Toc243464380 \h </w:instrText>
+          <w:instrText xml:space="preserve"> PAGEREF _Toc243466230 \h </w:instrText>
         </w:r>
         <w:r>
           <w:rPr>
@@ -1842,7 +1842,7 @@
           <w:lang w:eastAsia="nl-NL"/>
         </w:rPr>
       </w:pPr>
-      <w:hyperlink w:anchor="_Toc243464381" w:history="1">
+      <w:hyperlink w:anchor="_Toc243466231" w:history="1">
         <w:r>
           <w:rPr>
             <w:rStyle w:val="Hyperlink"/>
@@ -1887,7 +1887,7 @@
             <w:noProof/>
             <w:webHidden/>
           </w:rPr>
-          <w:instrText xml:space="preserve"> PAGEREF _Toc243464381 \h </w:instrText>
+          <w:instrText xml:space="preserve"> PAGEREF _Toc243466231 \h </w:instrText>
         </w:r>
         <w:r>
           <w:rPr>
@@ -1934,7 +1934,7 @@
           <w:lang w:eastAsia="nl-NL"/>
         </w:rPr>
       </w:pPr>
-      <w:hyperlink w:anchor="_Toc243464382" w:history="1">
+      <w:hyperlink w:anchor="_Toc243466232" w:history="1">
         <w:r>
           <w:rPr>
             <w:rStyle w:val="Hyperlink"/>
@@ -1979,7 +1979,7 @@
             <w:noProof/>
             <w:webHidden/>
           </w:rPr>
-          <w:instrText xml:space="preserve"> PAGEREF _Toc243464382 \h </w:instrText>
+          <w:instrText xml:space="preserve"> PAGEREF _Toc243466232 \h </w:instrText>
         </w:r>
         <w:r>
           <w:rPr>
@@ -2026,7 +2026,7 @@
           <w:lang w:eastAsia="nl-NL"/>
         </w:rPr>
       </w:pPr>
-      <w:hyperlink w:anchor="_Toc243464383" w:history="1">
+      <w:hyperlink w:anchor="_Toc243466233" w:history="1">
         <w:r>
           <w:rPr>
             <w:rStyle w:val="Hyperlink"/>
@@ -2071,7 +2071,7 @@
             <w:noProof/>
             <w:webHidden/>
           </w:rPr>
-          <w:instrText xml:space="preserve"> PAGEREF _Toc243464383 \h </w:instrText>
+          <w:instrText xml:space="preserve"> PAGEREF _Toc243466233 \h </w:instrText>
         </w:r>
         <w:r>
           <w:rPr>
@@ -2118,7 +2118,7 @@
           <w:lang w:eastAsia="nl-NL"/>
         </w:rPr>
       </w:pPr>
-      <w:hyperlink w:anchor="_Toc243464384" w:history="1">
+      <w:hyperlink w:anchor="_Toc243466234" w:history="1">
         <w:r>
           <w:rPr>
             <w:rStyle w:val="Hyperlink"/>
@@ -2179,7 +2179,7 @@
             <w:noProof/>
             <w:webHidden/>
           </w:rPr>
-          <w:instrText xml:space="preserve"> PAGEREF _Toc243464384 \h </w:instrText>
+          <w:instrText xml:space="preserve"> PAGEREF _Toc243466234 \h </w:instrText>
         </w:r>
         <w:r>
           <w:rPr>
@@ -2226,7 +2226,7 @@
           <w:lang w:eastAsia="nl-NL"/>
         </w:rPr>
       </w:pPr>
-      <w:hyperlink w:anchor="_Toc243464385" w:history="1">
+      <w:hyperlink w:anchor="_Toc243466235" w:history="1">
         <w:r>
           <w:rPr>
             <w:rStyle w:val="Hyperlink"/>
@@ -2271,7 +2271,7 @@
             <w:noProof/>
             <w:webHidden/>
           </w:rPr>
-          <w:instrText xml:space="preserve"> PAGEREF _Toc243464385 \h </w:instrText>
+          <w:instrText xml:space="preserve"> PAGEREF _Toc243466235 \h </w:instrText>
         </w:r>
         <w:r>
           <w:rPr>
@@ -2318,7 +2318,7 @@
           <w:lang w:eastAsia="nl-NL"/>
         </w:rPr>
       </w:pPr>
-      <w:hyperlink w:anchor="_Toc243464386" w:history="1">
+      <w:hyperlink w:anchor="_Toc243466236" w:history="1">
         <w:r>
           <w:rPr>
             <w:rStyle w:val="Hyperlink"/>
@@ -2363,7 +2363,7 @@
             <w:noProof/>
             <w:webHidden/>
           </w:rPr>
-          <w:instrText xml:space="preserve"> PAGEREF _Toc243464386 \h </w:instrText>
+          <w:instrText xml:space="preserve"> PAGEREF _Toc243466236 \h </w:instrText>
         </w:r>
         <w:r>
           <w:rPr>
@@ -2410,7 +2410,7 @@
           <w:lang w:eastAsia="nl-NL"/>
         </w:rPr>
       </w:pPr>
-      <w:hyperlink w:anchor="_Toc243464387" w:history="1">
+      <w:hyperlink w:anchor="_Toc243466237" w:history="1">
         <w:r>
           <w:rPr>
             <w:rStyle w:val="Hyperlink"/>
@@ -2455,7 +2455,7 @@
             <w:noProof/>
             <w:webHidden/>
           </w:rPr>
-          <w:instrText xml:space="preserve"> PAGEREF _Toc243464387 \h </w:instrText>
+          <w:instrText xml:space="preserve"> PAGEREF _Toc243466237 \h </w:instrText>
         </w:r>
         <w:r>
           <w:rPr>
@@ -2502,7 +2502,7 @@
           <w:lang w:eastAsia="nl-NL"/>
         </w:rPr>
       </w:pPr>
-      <w:hyperlink w:anchor="_Toc243464388" w:history="1">
+      <w:hyperlink w:anchor="_Toc243466238" w:history="1">
         <w:r>
           <w:rPr>
             <w:rStyle w:val="Hyperlink"/>
@@ -2547,7 +2547,7 @@
             <w:noProof/>
             <w:webHidden/>
           </w:rPr>
-          <w:instrText xml:space="preserve"> PAGEREF _Toc243464388 \h </w:instrText>
+          <w:instrText xml:space="preserve"> PAGEREF _Toc243466238 \h </w:instrText>
         </w:r>
         <w:r>
           <w:rPr>
@@ -2594,7 +2594,7 @@
           <w:lang w:eastAsia="nl-NL"/>
         </w:rPr>
       </w:pPr>
-      <w:hyperlink w:anchor="_Toc243464389" w:history="1">
+      <w:hyperlink w:anchor="_Toc243466239" w:history="1">
         <w:r>
           <w:rPr>
             <w:rStyle w:val="Hyperlink"/>
@@ -2639,7 +2639,7 @@
             <w:noProof/>
             <w:webHidden/>
           </w:rPr>
-          <w:instrText xml:space="preserve"> PAGEREF _Toc243464389 \h </w:instrText>
+          <w:instrText xml:space="preserve"> PAGEREF _Toc243466239 \h </w:instrText>
         </w:r>
         <w:r>
           <w:rPr>
@@ -2686,7 +2686,7 @@
           <w:lang w:eastAsia="nl-NL"/>
         </w:rPr>
       </w:pPr>
-      <w:hyperlink w:anchor="_Toc243464390" w:history="1">
+      <w:hyperlink w:anchor="_Toc243466240" w:history="1">
         <w:r>
           <w:rPr>
             <w:rStyle w:val="Hyperlink"/>
@@ -2731,7 +2731,7 @@
             <w:noProof/>
             <w:webHidden/>
           </w:rPr>
-          <w:instrText xml:space="preserve"> PAGEREF _Toc243464390 \h </w:instrText>
+          <w:instrText xml:space="preserve"> PAGEREF _Toc243466240 \h </w:instrText>
         </w:r>
         <w:r>
           <w:rPr>
@@ -2778,7 +2778,7 @@
           <w:lang w:eastAsia="nl-NL"/>
         </w:rPr>
       </w:pPr>
-      <w:hyperlink w:anchor="_Toc243464391" w:history="1">
+      <w:hyperlink w:anchor="_Toc243466241" w:history="1">
         <w:r>
           <w:rPr>
             <w:rStyle w:val="Hyperlink"/>
@@ -2823,7 +2823,7 @@
             <w:noProof/>
             <w:webHidden/>
           </w:rPr>
-          <w:instrText xml:space="preserve"> PAGEREF _Toc243464391 \h </w:instrText>
+          <w:instrText xml:space="preserve"> PAGEREF _Toc243466241 \h </w:instrText>
         </w:r>
         <w:r>
           <w:rPr>
@@ -2870,7 +2870,7 @@
           <w:lang w:eastAsia="nl-NL"/>
         </w:rPr>
       </w:pPr>
-      <w:hyperlink w:anchor="_Toc243464392" w:history="1">
+      <w:hyperlink w:anchor="_Toc243466242" w:history="1">
         <w:r>
           <w:rPr>
             <w:rStyle w:val="Hyperlink"/>
@@ -2931,7 +2931,7 @@
             <w:noProof/>
             <w:webHidden/>
           </w:rPr>
-          <w:instrText xml:space="preserve"> PAGEREF _Toc243464392 \h </w:instrText>
+          <w:instrText xml:space="preserve"> PAGEREF _Toc243466242 \h </w:instrText>
         </w:r>
         <w:r>
           <w:rPr>
@@ -2978,7 +2978,7 @@
           <w:lang w:eastAsia="nl-NL"/>
         </w:rPr>
       </w:pPr>
-      <w:hyperlink w:anchor="_Toc243464393" w:history="1">
+      <w:hyperlink w:anchor="_Toc243466243" w:history="1">
         <w:r>
           <w:rPr>
             <w:rStyle w:val="Hyperlink"/>
@@ -3023,7 +3023,7 @@
             <w:noProof/>
             <w:webHidden/>
           </w:rPr>
-          <w:instrText xml:space="preserve"> PAGEREF _Toc243464393 \h </w:instrText>
+          <w:instrText xml:space="preserve"> PAGEREF _Toc243466243 \h </w:instrText>
         </w:r>
         <w:r>
           <w:rPr>
@@ -3070,7 +3070,7 @@
           <w:lang w:eastAsia="nl-NL"/>
         </w:rPr>
       </w:pPr>
-      <w:hyperlink w:anchor="_Toc243464394" w:history="1">
+      <w:hyperlink w:anchor="_Toc243466244" w:history="1">
         <w:r>
           <w:rPr>
             <w:rStyle w:val="Hyperlink"/>
@@ -3115,7 +3115,7 @@
             <w:noProof/>
             <w:webHidden/>
           </w:rPr>
-          <w:instrText xml:space="preserve"> PAGEREF _Toc243464394 \h </w:instrText>
+          <w:instrText xml:space="preserve"> PAGEREF _Toc243466244 \h </w:instrText>
         </w:r>
         <w:r>
           <w:rPr>
@@ -3162,7 +3162,7 @@
           <w:lang w:eastAsia="nl-NL"/>
         </w:rPr>
       </w:pPr>
-      <w:hyperlink w:anchor="_Toc243464395" w:history="1">
+      <w:hyperlink w:anchor="_Toc243466245" w:history="1">
         <w:r>
           <w:rPr>
             <w:rStyle w:val="Hyperlink"/>
@@ -3207,7 +3207,7 @@
             <w:noProof/>
             <w:webHidden/>
           </w:rPr>
-          <w:instrText xml:space="preserve"> PAGEREF _Toc243464395 \h </w:instrText>
+          <w:instrText xml:space="preserve"> PAGEREF _Toc243466245 \h </w:instrText>
         </w:r>
         <w:r>
           <w:rPr>
@@ -3254,7 +3254,7 @@
           <w:lang w:eastAsia="nl-NL"/>
         </w:rPr>
       </w:pPr>
-      <w:hyperlink w:anchor="_Toc243464396" w:history="1">
+      <w:hyperlink w:anchor="_Toc243466246" w:history="1">
         <w:r>
           <w:rPr>
             <w:rStyle w:val="Hyperlink"/>
@@ -3315,7 +3315,7 @@
             <w:noProof/>
             <w:webHidden/>
           </w:rPr>
-          <w:instrText xml:space="preserve"> PAGEREF _Toc243464396 \h </w:instrText>
+          <w:instrText xml:space="preserve"> PAGEREF _Toc243466246 \h </w:instrText>
         </w:r>
         <w:r>
           <w:rPr>
@@ -3362,7 +3362,7 @@
           <w:lang w:eastAsia="nl-NL"/>
         </w:rPr>
       </w:pPr>
-      <w:hyperlink w:anchor="_Toc243464397" w:history="1">
+      <w:hyperlink w:anchor="_Toc243466247" w:history="1">
         <w:r>
           <w:rPr>
             <w:rStyle w:val="Hyperlink"/>
@@ -3407,7 +3407,7 @@
             <w:noProof/>
             <w:webHidden/>
           </w:rPr>
-          <w:instrText xml:space="preserve"> PAGEREF _Toc243464397 \h </w:instrText>
+          <w:instrText xml:space="preserve"> PAGEREF _Toc243466247 \h </w:instrText>
         </w:r>
         <w:r>
           <w:rPr>
@@ -3454,7 +3454,7 @@
           <w:lang w:eastAsia="nl-NL"/>
         </w:rPr>
       </w:pPr>
-      <w:hyperlink w:anchor="_Toc243464398" w:history="1">
+      <w:hyperlink w:anchor="_Toc243466248" w:history="1">
         <w:r>
           <w:rPr>
             <w:rStyle w:val="Hyperlink"/>
@@ -3499,7 +3499,7 @@
             <w:noProof/>
             <w:webHidden/>
           </w:rPr>
-          <w:instrText xml:space="preserve"> PAGEREF _Toc243464398 \h </w:instrText>
+          <w:instrText xml:space="preserve"> PAGEREF _Toc243466248 \h </w:instrText>
         </w:r>
         <w:r>
           <w:rPr>
@@ -3546,7 +3546,7 @@
           <w:lang w:eastAsia="nl-NL"/>
         </w:rPr>
       </w:pPr>
-      <w:hyperlink w:anchor="_Toc243464399" w:history="1">
+      <w:hyperlink w:anchor="_Toc243466249" w:history="1">
         <w:r>
           <w:rPr>
             <w:rStyle w:val="Hyperlink"/>
@@ -3593,7 +3593,7 @@
             <w:noProof/>
             <w:webHidden/>
           </w:rPr>
-          <w:instrText xml:space="preserve"> PAGEREF _Toc243464399 \h </w:instrText>
+          <w:instrText xml:space="preserve"> PAGEREF _Toc243466249 \h </w:instrText>
         </w:r>
         <w:r>
           <w:rPr>
@@ -3640,7 +3640,7 @@
           <w:lang w:eastAsia="nl-NL"/>
         </w:rPr>
       </w:pPr>
-      <w:hyperlink w:anchor="_Toc243464400" w:history="1">
+      <w:hyperlink w:anchor="_Toc243466250" w:history="1">
         <w:r>
           <w:rPr>
             <w:rStyle w:val="Hyperlink"/>
@@ -3687,7 +3687,7 @@
             <w:noProof/>
             <w:webHidden/>
           </w:rPr>
-          <w:instrText xml:space="preserve"> PAGEREF _Toc243464400 \h </w:instrText>
+          <w:instrText xml:space="preserve"> PAGEREF _Toc243466250 \h </w:instrText>
         </w:r>
         <w:r>
           <w:rPr>
@@ -3734,7 +3734,7 @@
           <w:lang w:eastAsia="nl-NL"/>
         </w:rPr>
       </w:pPr>
-      <w:hyperlink w:anchor="_Toc243464401" w:history="1">
+      <w:hyperlink w:anchor="_Toc243466251" w:history="1">
         <w:r>
           <w:rPr>
             <w:rStyle w:val="Hyperlink"/>
@@ -3781,7 +3781,7 @@
             <w:noProof/>
             <w:webHidden/>
           </w:rPr>
-          <w:instrText xml:space="preserve"> PAGEREF _Toc243464401 \h </w:instrText>
+          <w:instrText xml:space="preserve"> PAGEREF _Toc243466251 \h </w:instrText>
         </w:r>
         <w:r>
           <w:rPr>
@@ -3828,7 +3828,7 @@
           <w:lang w:eastAsia="nl-NL"/>
         </w:rPr>
       </w:pPr>
-      <w:hyperlink w:anchor="_Toc243464402" w:history="1">
+      <w:hyperlink w:anchor="_Toc243466252" w:history="1">
         <w:r>
           <w:rPr>
             <w:rStyle w:val="Hyperlink"/>
@@ -3875,7 +3875,7 @@
             <w:noProof/>
             <w:webHidden/>
           </w:rPr>
-          <w:instrText xml:space="preserve"> PAGEREF _Toc243464402 \h </w:instrText>
+          <w:instrText xml:space="preserve"> PAGEREF _Toc243466252 \h </w:instrText>
         </w:r>
         <w:r>
           <w:rPr>
@@ -3922,7 +3922,7 @@
           <w:lang w:eastAsia="nl-NL"/>
         </w:rPr>
       </w:pPr>
-      <w:hyperlink w:anchor="_Toc243464403" w:history="1">
+      <w:hyperlink w:anchor="_Toc243466253" w:history="1">
         <w:r>
           <w:rPr>
             <w:rStyle w:val="Hyperlink"/>
@@ -3969,7 +3969,7 @@
             <w:noProof/>
             <w:webHidden/>
           </w:rPr>
-          <w:instrText xml:space="preserve"> PAGEREF _Toc243464403 \h </w:instrText>
+          <w:instrText xml:space="preserve"> PAGEREF _Toc243466253 \h </w:instrText>
         </w:r>
         <w:r>
           <w:rPr>
@@ -4016,7 +4016,7 @@
           <w:lang w:eastAsia="nl-NL"/>
         </w:rPr>
       </w:pPr>
-      <w:hyperlink w:anchor="_Toc243464404" w:history="1">
+      <w:hyperlink w:anchor="_Toc243466254" w:history="1">
         <w:r>
           <w:rPr>
             <w:rStyle w:val="Hyperlink"/>
@@ -4063,7 +4063,7 @@
             <w:noProof/>
             <w:webHidden/>
           </w:rPr>
-          <w:instrText xml:space="preserve"> PAGEREF _Toc243464404 \h </w:instrText>
+          <w:instrText xml:space="preserve"> PAGEREF _Toc243466254 \h </w:instrText>
         </w:r>
         <w:r>
           <w:rPr>
@@ -4110,7 +4110,7 @@
           <w:lang w:eastAsia="nl-NL"/>
         </w:rPr>
       </w:pPr>
-      <w:hyperlink w:anchor="_Toc243464405" w:history="1">
+      <w:hyperlink w:anchor="_Toc243466255" w:history="1">
         <w:r>
           <w:rPr>
             <w:rStyle w:val="Hyperlink"/>
@@ -4155,7 +4155,7 @@
             <w:noProof/>
             <w:webHidden/>
           </w:rPr>
-          <w:instrText xml:space="preserve"> PAGEREF _Toc243464405 \h </w:instrText>
+          <w:instrText xml:space="preserve"> PAGEREF _Toc243466255 \h </w:instrText>
         </w:r>
         <w:r>
           <w:rPr>
@@ -4202,7 +4202,7 @@
           <w:lang w:eastAsia="nl-NL"/>
         </w:rPr>
       </w:pPr>
-      <w:hyperlink w:anchor="_Toc243464406" w:history="1">
+      <w:hyperlink w:anchor="_Toc243466256" w:history="1">
         <w:r>
           <w:rPr>
             <w:rStyle w:val="Hyperlink"/>
@@ -4247,7 +4247,7 @@
             <w:noProof/>
             <w:webHidden/>
           </w:rPr>
-          <w:instrText xml:space="preserve"> PAGEREF _Toc243464406 \h </w:instrText>
+          <w:instrText xml:space="preserve"> PAGEREF _Toc243466256 \h </w:instrText>
         </w:r>
         <w:r>
           <w:rPr>
@@ -4294,7 +4294,7 @@
           <w:lang w:eastAsia="nl-NL"/>
         </w:rPr>
       </w:pPr>
-      <w:hyperlink w:anchor="_Toc243464407" w:history="1">
+      <w:hyperlink w:anchor="_Toc243466257" w:history="1">
         <w:r>
           <w:rPr>
             <w:rStyle w:val="Hyperlink"/>
@@ -4371,7 +4371,7 @@
             <w:noProof/>
             <w:webHidden/>
           </w:rPr>
-          <w:instrText xml:space="preserve"> PAGEREF _Toc243464407 \h </w:instrText>
+          <w:instrText xml:space="preserve"> PAGEREF _Toc243466257 \h </w:instrText>
         </w:r>
         <w:r>
           <w:rPr>
@@ -4418,7 +4418,7 @@
           <w:lang w:eastAsia="nl-NL"/>
         </w:rPr>
       </w:pPr>
-      <w:hyperlink w:anchor="_Toc243464408" w:history="1">
+      <w:hyperlink w:anchor="_Toc243466258" w:history="1">
         <w:r>
           <w:rPr>
             <w:rStyle w:val="Hyperlink"/>
@@ -4463,7 +4463,7 @@
             <w:noProof/>
             <w:webHidden/>
           </w:rPr>
-          <w:instrText xml:space="preserve"> PAGEREF _Toc243464408 \h </w:instrText>
+          <w:instrText xml:space="preserve"> PAGEREF _Toc243466258 \h </w:instrText>
         </w:r>
         <w:r>
           <w:rPr>
@@ -4510,7 +4510,7 @@
           <w:lang w:eastAsia="nl-NL"/>
         </w:rPr>
       </w:pPr>
-      <w:hyperlink w:anchor="_Toc243464409" w:history="1">
+      <w:hyperlink w:anchor="_Toc243466259" w:history="1">
         <w:r>
           <w:rPr>
             <w:rStyle w:val="Hyperlink"/>
@@ -4555,7 +4555,7 @@
             <w:noProof/>
             <w:webHidden/>
           </w:rPr>
-          <w:instrText xml:space="preserve"> PAGEREF _Toc243464409 \h </w:instrText>
+          <w:instrText xml:space="preserve"> PAGEREF _Toc243466259 \h </w:instrText>
         </w:r>
         <w:r>
           <w:rPr>
@@ -4602,7 +4602,7 @@
           <w:lang w:eastAsia="nl-NL"/>
         </w:rPr>
       </w:pPr>
-      <w:hyperlink w:anchor="_Toc243464410" w:history="1">
+      <w:hyperlink w:anchor="_Toc243466260" w:history="1">
         <w:r>
           <w:rPr>
             <w:rStyle w:val="Hyperlink"/>
@@ -4647,7 +4647,7 @@
             <w:noProof/>
             <w:webHidden/>
           </w:rPr>
-          <w:instrText xml:space="preserve"> PAGEREF _Toc243464410 \h </w:instrText>
+          <w:instrText xml:space="preserve"> PAGEREF _Toc243466260 \h </w:instrText>
         </w:r>
         <w:r>
           <w:rPr>
@@ -4694,7 +4694,7 @@
           <w:lang w:eastAsia="nl-NL"/>
         </w:rPr>
       </w:pPr>
-      <w:hyperlink w:anchor="_Toc243464411" w:history="1">
+      <w:hyperlink w:anchor="_Toc243466261" w:history="1">
         <w:r>
           <w:rPr>
             <w:rStyle w:val="Hyperlink"/>
@@ -4739,7 +4739,7 @@
             <w:noProof/>
             <w:webHidden/>
           </w:rPr>
-          <w:instrText xml:space="preserve"> PAGEREF _Toc243464411 \h </w:instrText>
+          <w:instrText xml:space="preserve"> PAGEREF _Toc243466261 \h </w:instrText>
         </w:r>
         <w:r>
           <w:rPr>
@@ -4786,7 +4786,7 @@
           <w:lang w:eastAsia="nl-NL"/>
         </w:rPr>
       </w:pPr>
-      <w:hyperlink w:anchor="_Toc243464412" w:history="1">
+      <w:hyperlink w:anchor="_Toc243466262" w:history="1">
         <w:r>
           <w:rPr>
             <w:rStyle w:val="Hyperlink"/>
@@ -4831,7 +4831,7 @@
             <w:noProof/>
             <w:webHidden/>
           </w:rPr>
-          <w:instrText xml:space="preserve"> PAGEREF _Toc243464412 \h </w:instrText>
+          <w:instrText xml:space="preserve"> PAGEREF _Toc243466262 \h </w:instrText>
         </w:r>
         <w:r>
           <w:rPr>
@@ -4878,7 +4878,7 @@
           <w:lang w:eastAsia="nl-NL"/>
         </w:rPr>
       </w:pPr>
-      <w:hyperlink w:anchor="_Toc243464413" w:history="1">
+      <w:hyperlink w:anchor="_Toc243466263" w:history="1">
         <w:r>
           <w:rPr>
             <w:rStyle w:val="Hyperlink"/>
@@ -4923,7 +4923,7 @@
             <w:noProof/>
             <w:webHidden/>
           </w:rPr>
-          <w:instrText xml:space="preserve"> PAGEREF _Toc243464413 \h </w:instrText>
+          <w:instrText xml:space="preserve"> PAGEREF _Toc243466263 \h </w:instrText>
         </w:r>
         <w:r>
           <w:rPr>
@@ -4970,7 +4970,7 @@
           <w:lang w:eastAsia="nl-NL"/>
         </w:rPr>
       </w:pPr>
-      <w:hyperlink w:anchor="_Toc243464414" w:history="1">
+      <w:hyperlink w:anchor="_Toc243466264" w:history="1">
         <w:r>
           <w:rPr>
             <w:rStyle w:val="Hyperlink"/>
@@ -5015,7 +5015,7 @@
             <w:noProof/>
             <w:webHidden/>
           </w:rPr>
-          <w:instrText xml:space="preserve"> PAGEREF _Toc243464414 \h </w:instrText>
+          <w:instrText xml:space="preserve"> PAGEREF _Toc243466264 \h </w:instrText>
         </w:r>
         <w:r>
           <w:rPr>
@@ -5062,7 +5062,7 @@
           <w:lang w:eastAsia="nl-NL"/>
         </w:rPr>
       </w:pPr>
-      <w:hyperlink w:anchor="_Toc243464415" w:history="1">
+      <w:hyperlink w:anchor="_Toc243466265" w:history="1">
         <w:r>
           <w:rPr>
             <w:rStyle w:val="Hyperlink"/>
@@ -5107,7 +5107,7 @@
             <w:noProof/>
             <w:webHidden/>
           </w:rPr>
-          <w:instrText xml:space="preserve"> PAGEREF _Toc243464415 \h </w:instrText>
+          <w:instrText xml:space="preserve"> PAGEREF _Toc243466265 \h </w:instrText>
         </w:r>
         <w:r>
           <w:rPr>
@@ -5154,7 +5154,7 @@
           <w:lang w:eastAsia="nl-NL"/>
         </w:rPr>
       </w:pPr>
-      <w:hyperlink w:anchor="_Toc243464416" w:history="1">
+      <w:hyperlink w:anchor="_Toc243466266" w:history="1">
         <w:r>
           <w:rPr>
             <w:rStyle w:val="Hyperlink"/>
@@ -5199,7 +5199,7 @@
             <w:noProof/>
             <w:webHidden/>
           </w:rPr>
-          <w:instrText xml:space="preserve"> PAGEREF _Toc243464416 \h </w:instrText>
+          <w:instrText xml:space="preserve"> PAGEREF _Toc243466266 \h </w:instrText>
         </w:r>
         <w:r>
           <w:rPr>
@@ -5246,7 +5246,7 @@
           <w:lang w:eastAsia="nl-NL"/>
         </w:rPr>
       </w:pPr>
-      <w:hyperlink w:anchor="_Toc243464417" w:history="1">
+      <w:hyperlink w:anchor="_Toc243466267" w:history="1">
         <w:r>
           <w:rPr>
             <w:rStyle w:val="Hyperlink"/>
@@ -5291,7 +5291,7 @@
             <w:noProof/>
             <w:webHidden/>
           </w:rPr>
-          <w:instrText xml:space="preserve"> PAGEREF _Toc243464417 \h </w:instrText>
+          <w:instrText xml:space="preserve"> PAGEREF _Toc243466267 \h </w:instrText>
         </w:r>
         <w:r>
           <w:rPr>
@@ -5344,7 +5344,7 @@
         </w:numPr>
       </w:pPr>
       <w:bookmarkStart w:id="1" w:name="k1"/>
-      <w:bookmarkStart w:id="2" w:name="_Toc243464363"/>
+      <w:bookmarkStart w:id="2" w:name="_Toc243466213"/>
       <w:r>
         <w:t>DOEL VAN DE APPLICATIE.</w:t>
       </w:r>
@@ -5426,7 +5426,7 @@
         </w:numPr>
       </w:pPr>
       <w:bookmarkStart w:id="3" w:name="k2"/>
-      <w:bookmarkStart w:id="4" w:name="_Toc243464364"/>
+      <w:bookmarkStart w:id="4" w:name="_Toc243466214"/>
       <w:r>
         <w:t>BESTANDEN.</w:t>
       </w:r>
@@ -7709,7 +7709,7 @@
                 <w:sz w:val="16"/>
                 <w:szCs w:val="16"/>
               </w:rPr>
-              <w:t>Unit tests (759) voor de regels, de opslag, de export, het thema, de welkom- en gezichtsherkenningsfuncties, herkennen met de pas, de controller, de beveiliging en regressietests voor opgeloste bugs</w:t>
+              <w:t>Unit tests (760) voor de regels, de opslag, de export, het thema, de welkom- en gezichtsherkenningsfuncties, herkennen met de pas, de controller, de beveiliging en regressietests voor opgeloste bugs</w:t>
             </w:r>
           </w:p>
         </w:tc>
@@ -8883,7 +8883,7 @@
         </w:numPr>
       </w:pPr>
       <w:bookmarkStart w:id="5" w:name="k3"/>
-      <w:bookmarkStart w:id="6" w:name="_Toc243464365"/>
+      <w:bookmarkStart w:id="6" w:name="_Toc243466215"/>
       <w:r>
         <w:t>DE WEBSITE STARTEN.</w:t>
       </w:r>
@@ -9105,7 +9105,7 @@
         </w:numPr>
       </w:pPr>
       <w:bookmarkStart w:id="7" w:name="k4"/>
-      <w:bookmarkStart w:id="8" w:name="_Toc243464366"/>
+      <w:bookmarkStart w:id="8" w:name="_Toc243466216"/>
       <w:r>
         <w:t>GEBRUIKERSHANDLEIDING.</w:t>
       </w:r>
@@ -9118,7 +9118,7 @@
         <w:keepNext/>
       </w:pPr>
       <w:bookmarkStart w:id="9" w:name="k5"/>
-      <w:bookmarkStart w:id="10" w:name="_Toc243464367"/>
+      <w:bookmarkStart w:id="10" w:name="_Toc243466217"/>
       <w:r>
         <w:t>EEN MEDEWERKER ZOEKEN</w:t>
       </w:r>
@@ -9173,7 +9173,7 @@
         <w:keepNext/>
       </w:pPr>
       <w:bookmarkStart w:id="11" w:name="k6"/>
-      <w:bookmarkStart w:id="12" w:name="_Toc243464368"/>
+      <w:bookmarkStart w:id="12" w:name="_Toc243466218"/>
       <w:r>
         <w:t>EEN PRODUCT REGISTREREN</w:t>
       </w:r>
@@ -9422,7 +9422,7 @@
         <w:keepNext/>
       </w:pPr>
       <w:bookmarkStart w:id="13" w:name="k7"/>
-      <w:bookmarkStart w:id="14" w:name="_Toc243464369"/>
+      <w:bookmarkStart w:id="14" w:name="_Toc243466219"/>
       <w:r>
         <w:t>ADMIN-DASHBOARD OPENEN</w:t>
       </w:r>
@@ -9553,7 +9553,7 @@
         <w:keepNext/>
       </w:pPr>
       <w:bookmarkStart w:id="15" w:name="k8"/>
-      <w:bookmarkStart w:id="16" w:name="_Toc243464370"/>
+      <w:bookmarkStart w:id="16" w:name="_Toc243466220"/>
       <w:r>
         <w:t>REGISTRATIES BEHEREN</w:t>
       </w:r>
@@ -9839,7 +9839,7 @@
         <w:keepNext/>
       </w:pPr>
       <w:bookmarkStart w:id="17" w:name="k9"/>
-      <w:bookmarkStart w:id="18" w:name="_Toc243464371"/>
+      <w:bookmarkStart w:id="18" w:name="_Toc243466221"/>
       <w:r>
         <w:t>MEDEWERKERS BEHEREN</w:t>
       </w:r>
@@ -10173,7 +10173,7 @@
         <w:keepNext/>
       </w:pPr>
       <w:bookmarkStart w:id="19" w:name="k10"/>
-      <w:bookmarkStart w:id="20" w:name="_Toc243464372"/>
+      <w:bookmarkStart w:id="20" w:name="_Toc243466222"/>
       <w:r>
         <w:t>PRODUCTEN BEHEREN</w:t>
       </w:r>
@@ -10301,7 +10301,7 @@
         <w:keepNext/>
       </w:pPr>
       <w:bookmarkStart w:id="21" w:name="k11"/>
-      <w:bookmarkStart w:id="22" w:name="_Toc243464373"/>
+      <w:bookmarkStart w:id="22" w:name="_Toc243466223"/>
       <w:r>
         <w:t>BEDRIJVEN EN CONSUMPTIEPUNTEN BEHEREN</w:t>
       </w:r>
@@ -10464,7 +10464,7 @@
         <w:keepNext/>
       </w:pPr>
       <w:bookmarkStart w:id="23" w:name="k12"/>
-      <w:bookmarkStart w:id="24" w:name="_Toc243464374"/>
+      <w:bookmarkStart w:id="24" w:name="_Toc243466224"/>
       <w:r>
         <w:t>VOORRAAD BEHEREN</w:t>
       </w:r>
@@ -10682,7 +10682,7 @@
         <w:keepNext/>
       </w:pPr>
       <w:bookmarkStart w:id="25" w:name="k13"/>
-      <w:bookmarkStart w:id="26" w:name="_Toc243464375"/>
+      <w:bookmarkStart w:id="26" w:name="_Toc243466225"/>
       <w:r>
         <w:t>LOGBOEK BEKIJKEN</w:t>
       </w:r>
@@ -10722,7 +10722,7 @@
         <w:keepNext/>
       </w:pPr>
       <w:bookmarkStart w:id="27" w:name="k14"/>
-      <w:bookmarkStart w:id="28" w:name="_Toc243464376"/>
+      <w:bookmarkStart w:id="28" w:name="_Toc243466226"/>
       <w:r>
         <w:t>ALLE GEGEVENS WISSEN</w:t>
       </w:r>
@@ -10848,7 +10848,7 @@
         <w:keepNext/>
       </w:pPr>
       <w:bookmarkStart w:id="29" w:name="k15"/>
-      <w:bookmarkStart w:id="30" w:name="_Toc243464377"/>
+      <w:bookmarkStart w:id="30" w:name="_Toc243466227"/>
       <w:r>
         <w:t>MODAL SLUITEN EN UITLOGGEN</w:t>
       </w:r>
@@ -10922,7 +10922,7 @@
         <w:keepNext/>
       </w:pPr>
       <w:bookmarkStart w:id="31" w:name="k16"/>
-      <w:bookmarkStart w:id="32" w:name="_Toc243464378"/>
+      <w:bookmarkStart w:id="32" w:name="_Toc243466228"/>
       <w:r>
         <w:t>CSV EXPORTEREN</w:t>
       </w:r>
@@ -11306,7 +11306,7 @@
         <w:keepNext/>
       </w:pPr>
       <w:bookmarkStart w:id="33" w:name="k17"/>
-      <w:bookmarkStart w:id="34" w:name="_Toc243464379"/>
+      <w:bookmarkStart w:id="34" w:name="_Toc243466229"/>
       <w:r>
         <w:t>LICHT OF DONKER THEMA</w:t>
       </w:r>
@@ -11413,7 +11413,7 @@
         <w:keepNext/>
       </w:pPr>
       <w:bookmarkStart w:id="35" w:name="k18"/>
-      <w:bookmarkStart w:id="36" w:name="_Toc243464380"/>
+      <w:bookmarkStart w:id="36" w:name="_Toc243466230"/>
       <w:r>
         <w:t>WELKOM EN "ZELFDE ALS VORIGE KEER"</w:t>
       </w:r>
@@ -11500,7 +11500,7 @@
         <w:keepNext/>
       </w:pPr>
       <w:bookmarkStart w:id="37" w:name="k19"/>
-      <w:bookmarkStart w:id="38" w:name="_Toc243464381"/>
+      <w:bookmarkStart w:id="38" w:name="_Toc243466231"/>
       <w:r>
         <w:t>DEMO GEZICHTSHERKENNING</w:t>
       </w:r>
@@ -11708,7 +11708,7 @@
         <w:keepNext/>
       </w:pPr>
       <w:bookmarkStart w:id="39" w:name="k20"/>
-      <w:bookmarkStart w:id="40" w:name="_Toc243464382"/>
+      <w:bookmarkStart w:id="40" w:name="_Toc243466232"/>
       <w:r>
         <w:t>HERKENNEN MET DE PAS</w:t>
       </w:r>
@@ -11900,7 +11900,7 @@
         <w:keepNext/>
       </w:pPr>
       <w:bookmarkStart w:id="41" w:name="k21"/>
-      <w:bookmarkStart w:id="42" w:name="_Toc243464383"/>
+      <w:bookmarkStart w:id="42" w:name="_Toc243466233"/>
       <w:r>
         <w:t>SLIMME KOELKAST (DEMO)</w:t>
       </w:r>
@@ -12512,7 +12512,7 @@
         </w:numPr>
       </w:pPr>
       <w:bookmarkStart w:id="43" w:name="k22"/>
-      <w:bookmarkStart w:id="44" w:name="_Toc243464384"/>
+      <w:bookmarkStart w:id="44" w:name="_Toc243466234"/>
       <w:r>
         <w:t xml:space="preserve">UITLEG VAN </w:t>
       </w:r>
@@ -12536,7 +12536,7 @@
         <w:keepNext/>
       </w:pPr>
       <w:bookmarkStart w:id="45" w:name="k23"/>
-      <w:bookmarkStart w:id="46" w:name="_Toc243464385"/>
+      <w:bookmarkStart w:id="46" w:name="_Toc243466235"/>
       <w:r>
         <w:t>METADATA EN EXTERNE BESTANDEN</w:t>
       </w:r>
@@ -12812,7 +12812,7 @@
         <w:keepNext/>
       </w:pPr>
       <w:bookmarkStart w:id="47" w:name="k24"/>
-      <w:bookmarkStart w:id="48" w:name="_Toc243464386"/>
+      <w:bookmarkStart w:id="48" w:name="_Toc243466236"/>
       <w:r>
         <w:t>NAVIGATIEBALK</w:t>
       </w:r>
@@ -13025,7 +13025,7 @@
         <w:keepNext/>
       </w:pPr>
       <w:bookmarkStart w:id="49" w:name="k25"/>
-      <w:bookmarkStart w:id="50" w:name="_Toc243464387"/>
+      <w:bookmarkStart w:id="50" w:name="_Toc243466237"/>
       <w:r>
         <w:t>HERO-GEDEELTE</w:t>
       </w:r>
@@ -13070,7 +13070,7 @@
         <w:keepNext/>
       </w:pPr>
       <w:bookmarkStart w:id="51" w:name="k26"/>
-      <w:bookmarkStart w:id="52" w:name="_Toc243464388"/>
+      <w:bookmarkStart w:id="52" w:name="_Toc243466238"/>
       <w:r>
         <w:t>MEDEWERKERLIJST</w:t>
       </w:r>
@@ -13407,7 +13407,7 @@
         <w:keepNext/>
       </w:pPr>
       <w:bookmarkStart w:id="53" w:name="k27"/>
-      <w:bookmarkStart w:id="54" w:name="_Toc243464389"/>
+      <w:bookmarkStart w:id="54" w:name="_Toc243466239"/>
       <w:r>
         <w:t>STATISTIEKEN</w:t>
       </w:r>
@@ -13490,7 +13490,7 @@
         <w:keepNext/>
       </w:pPr>
       <w:bookmarkStart w:id="55" w:name="k28"/>
-      <w:bookmarkStart w:id="56" w:name="_Toc243464390"/>
+      <w:bookmarkStart w:id="56" w:name="_Toc243466240"/>
       <w:r>
         <w:t>VENSTERS (MODALS)</w:t>
       </w:r>
@@ -14122,7 +14122,7 @@
         <w:keepNext/>
       </w:pPr>
       <w:bookmarkStart w:id="57" w:name="k29"/>
-      <w:bookmarkStart w:id="58" w:name="_Toc243464391"/>
+      <w:bookmarkStart w:id="58" w:name="_Toc243466241"/>
       <w:r>
         <w:t>WAARSCHUWING BIJ OPENEN ALS LOS BESTAND</w:t>
       </w:r>
@@ -14167,7 +14167,7 @@
         </w:numPr>
       </w:pPr>
       <w:bookmarkStart w:id="59" w:name="k30"/>
-      <w:bookmarkStart w:id="60" w:name="_Toc243464392"/>
+      <w:bookmarkStart w:id="60" w:name="_Toc243466242"/>
       <w:r>
         <w:t xml:space="preserve">UITLEG VAN </w:t>
       </w:r>
@@ -14191,7 +14191,7 @@
         <w:keepNext/>
       </w:pPr>
       <w:bookmarkStart w:id="61" w:name="k31"/>
-      <w:bookmarkStart w:id="62" w:name="_Toc243464393"/>
+      <w:bookmarkStart w:id="62" w:name="_Toc243466243"/>
       <w:r>
         <w:t>CSS-VARIABELEN</w:t>
       </w:r>
@@ -14866,7 +14866,7 @@
         <w:keepNext/>
       </w:pPr>
       <w:bookmarkStart w:id="63" w:name="k32"/>
-      <w:bookmarkStart w:id="64" w:name="_Toc243464394"/>
+      <w:bookmarkStart w:id="64" w:name="_Toc243466244"/>
       <w:r>
         <w:t>LAYOUT</w:t>
       </w:r>
@@ -15575,7 +15575,7 @@
         <w:keepNext/>
       </w:pPr>
       <w:bookmarkStart w:id="65" w:name="k33"/>
-      <w:bookmarkStart w:id="66" w:name="_Toc243464395"/>
+      <w:bookmarkStart w:id="66" w:name="_Toc243466245"/>
       <w:r>
         <w:t>COMPONENTEN</w:t>
       </w:r>
@@ -15820,7 +15820,7 @@
         </w:numPr>
       </w:pPr>
       <w:bookmarkStart w:id="67" w:name="k34"/>
-      <w:bookmarkStart w:id="68" w:name="_Toc243464396"/>
+      <w:bookmarkStart w:id="68" w:name="_Toc243466246"/>
       <w:r>
         <w:t>UITLEG VAN DE JAVASCRIPT (</w:t>
       </w:r>
@@ -15844,7 +15844,7 @@
         <w:keepNext/>
       </w:pPr>
       <w:bookmarkStart w:id="69" w:name="k35"/>
-      <w:bookmarkStart w:id="70" w:name="_Toc243464397"/>
+      <w:bookmarkStart w:id="70" w:name="_Toc243466247"/>
       <w:r>
         <w:t>OPSLAG EN VOORBEELDDATA</w:t>
       </w:r>
@@ -16621,7 +16621,7 @@
         <w:keepNext/>
       </w:pPr>
       <w:bookmarkStart w:id="71" w:name="k36"/>
-      <w:bookmarkStart w:id="72" w:name="_Toc243464398"/>
+      <w:bookmarkStart w:id="72" w:name="_Toc243466248"/>
       <w:r>
         <w:t>OBJECTGEORIËNTEERDE STRUCTUUR</w:t>
       </w:r>
@@ -22557,7 +22557,7 @@
         <w:keepNext/>
       </w:pPr>
       <w:bookmarkStart w:id="85" w:name="k49"/>
-      <w:bookmarkStart w:id="86" w:name="_Toc243464399"/>
+      <w:bookmarkStart w:id="86" w:name="_Toc243466249"/>
       <w:r>
         <w:rPr>
           <w:rFonts w:ascii="Consolas" w:hAnsi="Consolas" w:cs="Consolas"/>
@@ -22698,7 +22698,7 @@
         <w:keepNext/>
       </w:pPr>
       <w:bookmarkStart w:id="87" w:name="k50"/>
-      <w:bookmarkStart w:id="88" w:name="_Toc243464400"/>
+      <w:bookmarkStart w:id="88" w:name="_Toc243466250"/>
       <w:r>
         <w:rPr>
           <w:rFonts w:ascii="Consolas" w:hAnsi="Consolas" w:cs="Consolas"/>
@@ -22775,7 +22775,7 @@
         <w:keepNext/>
       </w:pPr>
       <w:bookmarkStart w:id="89" w:name="k51"/>
-      <w:bookmarkStart w:id="90" w:name="_Toc243464401"/>
+      <w:bookmarkStart w:id="90" w:name="_Toc243466251"/>
       <w:r>
         <w:rPr>
           <w:rFonts w:ascii="Consolas" w:hAnsi="Consolas" w:cs="Consolas"/>
@@ -22946,7 +22946,7 @@
         <w:keepNext/>
       </w:pPr>
       <w:bookmarkStart w:id="91" w:name="k52"/>
-      <w:bookmarkStart w:id="92" w:name="_Toc243464402"/>
+      <w:bookmarkStart w:id="92" w:name="_Toc243466252"/>
       <w:r>
         <w:rPr>
           <w:rFonts w:ascii="Consolas" w:hAnsi="Consolas" w:cs="Consolas"/>
@@ -23013,7 +23013,7 @@
         <w:keepNext/>
       </w:pPr>
       <w:bookmarkStart w:id="93" w:name="k53"/>
-      <w:bookmarkStart w:id="94" w:name="_Toc243464403"/>
+      <w:bookmarkStart w:id="94" w:name="_Toc243466253"/>
       <w:r>
         <w:rPr>
           <w:rFonts w:ascii="Consolas" w:hAnsi="Consolas" w:cs="Consolas"/>
@@ -23135,7 +23135,7 @@
         <w:keepNext/>
       </w:pPr>
       <w:bookmarkStart w:id="95" w:name="k54"/>
-      <w:bookmarkStart w:id="96" w:name="_Toc243464404"/>
+      <w:bookmarkStart w:id="96" w:name="_Toc243466254"/>
       <w:r>
         <w:rPr>
           <w:rFonts w:ascii="Consolas" w:hAnsi="Consolas" w:cs="Consolas"/>
@@ -23257,7 +23257,7 @@
         <w:keepNext/>
       </w:pPr>
       <w:bookmarkStart w:id="97" w:name="k55"/>
-      <w:bookmarkStart w:id="98" w:name="_Toc243464405"/>
+      <w:bookmarkStart w:id="98" w:name="_Toc243466255"/>
       <w:r>
         <w:t>OPSLAGFOUTEN EN TERUGDRAAIEN</w:t>
       </w:r>
@@ -23319,7 +23319,7 @@
         <w:keepNext/>
       </w:pPr>
       <w:bookmarkStart w:id="99" w:name="k56"/>
-      <w:bookmarkStart w:id="100" w:name="_Toc243464406"/>
+      <w:bookmarkStart w:id="100" w:name="_Toc243466256"/>
       <w:r>
         <w:t>ADMINFUNCTIES</w:t>
       </w:r>
@@ -23565,7 +23565,7 @@
         <w:keepNext/>
       </w:pPr>
       <w:bookmarkStart w:id="101" w:name="k57"/>
-      <w:bookmarkStart w:id="102" w:name="_Toc243464407"/>
+      <w:bookmarkStart w:id="102" w:name="_Toc243466257"/>
       <w:r>
         <w:t xml:space="preserve">CSV-EXPORT (CLASS </w:t>
       </w:r>
@@ -23973,7 +23973,7 @@
         <w:keepNext/>
       </w:pPr>
       <w:bookmarkStart w:id="103" w:name="k58"/>
-      <w:bookmarkStart w:id="104" w:name="_Toc243464408"/>
+      <w:bookmarkStart w:id="104" w:name="_Toc243466258"/>
       <w:r>
         <w:t>EVENT LISTENERS</w:t>
       </w:r>
@@ -24585,7 +24585,7 @@
         </w:numPr>
       </w:pPr>
       <w:bookmarkStart w:id="105" w:name="k59"/>
-      <w:bookmarkStart w:id="106" w:name="_Toc243464409"/>
+      <w:bookmarkStart w:id="106" w:name="_Toc243466259"/>
       <w:r>
         <w:t>DATAMODEL EN KOPPELINGEN.</w:t>
       </w:r>
@@ -24603,7 +24603,7 @@
         <w:keepNext/>
       </w:pPr>
       <w:bookmarkStart w:id="107" w:name="k60"/>
-      <w:bookmarkStart w:id="108" w:name="_Toc243464410"/>
+      <w:bookmarkStart w:id="108" w:name="_Toc243466260"/>
       <w:r>
         <w:t>BEDRIJVEN</w:t>
       </w:r>
@@ -24814,7 +24814,7 @@
         <w:keepNext/>
       </w:pPr>
       <w:bookmarkStart w:id="109" w:name="k61"/>
-      <w:bookmarkStart w:id="110" w:name="_Toc243464411"/>
+      <w:bookmarkStart w:id="110" w:name="_Toc243466261"/>
       <w:r>
         <w:t>CONSUMPTIEPUNTEN</w:t>
       </w:r>
@@ -25133,7 +25133,7 @@
         <w:keepNext/>
       </w:pPr>
       <w:bookmarkStart w:id="111" w:name="k62"/>
-      <w:bookmarkStart w:id="112" w:name="_Toc243464412"/>
+      <w:bookmarkStart w:id="112" w:name="_Toc243466262"/>
       <w:r>
         <w:t>MEDEWERKERS</w:t>
       </w:r>
@@ -25689,7 +25689,7 @@
         <w:keepNext/>
       </w:pPr>
       <w:bookmarkStart w:id="113" w:name="k63"/>
-      <w:bookmarkStart w:id="114" w:name="_Toc243464413"/>
+      <w:bookmarkStart w:id="114" w:name="_Toc243466263"/>
       <w:r>
         <w:t>REGISTRATIES</w:t>
       </w:r>
@@ -26350,7 +26350,7 @@
         <w:keepNext/>
       </w:pPr>
       <w:bookmarkStart w:id="115" w:name="k64"/>
-      <w:bookmarkStart w:id="116" w:name="_Toc243464414"/>
+      <w:bookmarkStart w:id="116" w:name="_Toc243466264"/>
       <w:r>
         <w:t>SLIMME KOELKAST</w:t>
       </w:r>
@@ -26775,7 +26775,7 @@
         </w:numPr>
       </w:pPr>
       <w:bookmarkStart w:id="117" w:name="k65"/>
-      <w:bookmarkStart w:id="118" w:name="_Toc243464415"/>
+      <w:bookmarkStart w:id="118" w:name="_Toc243466265"/>
       <w:r>
         <w:t>BELANGRIJKE DEMO-BEPERKINGEN.</w:t>
       </w:r>
@@ -27205,7 +27205,7 @@
         </w:numPr>
       </w:pPr>
       <w:bookmarkStart w:id="119" w:name="k66"/>
-      <w:bookmarkStart w:id="120" w:name="_Toc243464416"/>
+      <w:bookmarkStart w:id="120" w:name="_Toc243466266"/>
       <w:r>
         <w:t>CODE UITLEGGEN TIJDENS EEN PRESENTATIE.</w:t>
       </w:r>
@@ -27611,7 +27611,7 @@
         </w:numPr>
       </w:pPr>
       <w:bookmarkStart w:id="121" w:name="k67"/>
-      <w:bookmarkStart w:id="122" w:name="_Toc243464417"/>
+      <w:bookmarkStart w:id="122" w:name="_Toc243466267"/>
       <w:r>
         <w:t>MOGELIJKE VERVOLGSTAPPEN.</w:t>
       </w:r>

</xml_diff>

<commit_message>
TO 3.19: fouten uit de generale repetitie opgelost
- Passcan laat geen pasnummer meer achter in het inlogveld, de zoekvelden van het beheer of het medewerkersformulier
- Duidelijke melding als er geen camera is of de camera al in gebruik is
- Veld Aantal op het tabblad Voorraad niet meer afgekapt op de tablet
- Geen 404 meer voor favicon.ico onder Live Server
- Unit test voor het verlopen van gezichtsinstellingen gebruikt alleen de nep-klok
- Word-bestanden bijgewerkt (811 unit tests, 31 browsertests)
</commit_message>
<xml_diff>
--- a/docs/DOCUMENTATIE.docx
+++ b/docs/DOCUMENTATIE.docx
@@ -82,7 +82,7 @@
           <w:numId w:val="0"/>
         </w:numPr>
       </w:pPr>
-      <w:bookmarkStart w:id="0" w:name="_Toc243475693"/>
+      <w:bookmarkStart w:id="0" w:name="_Toc243634049"/>
       <w:r>
         <w:t>INHOUDSOPGAVE.</w:t>
       </w:r>
@@ -112,7 +112,7 @@
       <w:r>
         <w:fldChar w:fldCharType="separate"/>
       </w:r>
-      <w:hyperlink w:anchor="_Toc243475693" w:history="1">
+      <w:hyperlink w:anchor="_Toc243634049" w:history="1">
         <w:r>
           <w:rPr>
             <w:rStyle w:val="Hyperlink"/>
@@ -139,7 +139,7 @@
             <w:noProof/>
             <w:webHidden/>
           </w:rPr>
-          <w:instrText xml:space="preserve"> PAGEREF _Toc243475693 \h </w:instrText>
+          <w:instrText xml:space="preserve"> PAGEREF _Toc243634049 \h </w:instrText>
         </w:r>
         <w:r>
           <w:rPr>
@@ -186,7 +186,7 @@
           <w:lang w:eastAsia="nl-NL"/>
         </w:rPr>
       </w:pPr>
-      <w:hyperlink w:anchor="_Toc243475694" w:history="1">
+      <w:hyperlink w:anchor="_Toc243634050" w:history="1">
         <w:r>
           <w:rPr>
             <w:rStyle w:val="Hyperlink"/>
@@ -231,7 +231,7 @@
             <w:noProof/>
             <w:webHidden/>
           </w:rPr>
-          <w:instrText xml:space="preserve"> PAGEREF _Toc243475694 \h </w:instrText>
+          <w:instrText xml:space="preserve"> PAGEREF _Toc243634050 \h </w:instrText>
         </w:r>
         <w:r>
           <w:rPr>
@@ -278,7 +278,7 @@
           <w:lang w:eastAsia="nl-NL"/>
         </w:rPr>
       </w:pPr>
-      <w:hyperlink w:anchor="_Toc243475695" w:history="1">
+      <w:hyperlink w:anchor="_Toc243634051" w:history="1">
         <w:r>
           <w:rPr>
             <w:rStyle w:val="Hyperlink"/>
@@ -323,7 +323,7 @@
             <w:noProof/>
             <w:webHidden/>
           </w:rPr>
-          <w:instrText xml:space="preserve"> PAGEREF _Toc243475695 \h </w:instrText>
+          <w:instrText xml:space="preserve"> PAGEREF _Toc243634051 \h </w:instrText>
         </w:r>
         <w:r>
           <w:rPr>
@@ -370,7 +370,7 @@
           <w:lang w:eastAsia="nl-NL"/>
         </w:rPr>
       </w:pPr>
-      <w:hyperlink w:anchor="_Toc243475696" w:history="1">
+      <w:hyperlink w:anchor="_Toc243634052" w:history="1">
         <w:r>
           <w:rPr>
             <w:rStyle w:val="Hyperlink"/>
@@ -415,7 +415,7 @@
             <w:noProof/>
             <w:webHidden/>
           </w:rPr>
-          <w:instrText xml:space="preserve"> PAGEREF _Toc243475696 \h </w:instrText>
+          <w:instrText xml:space="preserve"> PAGEREF _Toc243634052 \h </w:instrText>
         </w:r>
         <w:r>
           <w:rPr>
@@ -462,7 +462,7 @@
           <w:lang w:eastAsia="nl-NL"/>
         </w:rPr>
       </w:pPr>
-      <w:hyperlink w:anchor="_Toc243475697" w:history="1">
+      <w:hyperlink w:anchor="_Toc243634053" w:history="1">
         <w:r>
           <w:rPr>
             <w:rStyle w:val="Hyperlink"/>
@@ -507,7 +507,7 @@
             <w:noProof/>
             <w:webHidden/>
           </w:rPr>
-          <w:instrText xml:space="preserve"> PAGEREF _Toc243475697 \h </w:instrText>
+          <w:instrText xml:space="preserve"> PAGEREF _Toc243634053 \h </w:instrText>
         </w:r>
         <w:r>
           <w:rPr>
@@ -554,7 +554,7 @@
           <w:lang w:eastAsia="nl-NL"/>
         </w:rPr>
       </w:pPr>
-      <w:hyperlink w:anchor="_Toc243475698" w:history="1">
+      <w:hyperlink w:anchor="_Toc243634054" w:history="1">
         <w:r>
           <w:rPr>
             <w:rStyle w:val="Hyperlink"/>
@@ -599,7 +599,7 @@
             <w:noProof/>
             <w:webHidden/>
           </w:rPr>
-          <w:instrText xml:space="preserve"> PAGEREF _Toc243475698 \h </w:instrText>
+          <w:instrText xml:space="preserve"> PAGEREF _Toc243634054 \h </w:instrText>
         </w:r>
         <w:r>
           <w:rPr>
@@ -646,7 +646,7 @@
           <w:lang w:eastAsia="nl-NL"/>
         </w:rPr>
       </w:pPr>
-      <w:hyperlink w:anchor="_Toc243475699" w:history="1">
+      <w:hyperlink w:anchor="_Toc243634055" w:history="1">
         <w:r>
           <w:rPr>
             <w:rStyle w:val="Hyperlink"/>
@@ -691,7 +691,7 @@
             <w:noProof/>
             <w:webHidden/>
           </w:rPr>
-          <w:instrText xml:space="preserve"> PAGEREF _Toc243475699 \h </w:instrText>
+          <w:instrText xml:space="preserve"> PAGEREF _Toc243634055 \h </w:instrText>
         </w:r>
         <w:r>
           <w:rPr>
@@ -738,7 +738,7 @@
           <w:lang w:eastAsia="nl-NL"/>
         </w:rPr>
       </w:pPr>
-      <w:hyperlink w:anchor="_Toc243475700" w:history="1">
+      <w:hyperlink w:anchor="_Toc243634056" w:history="1">
         <w:r>
           <w:rPr>
             <w:rStyle w:val="Hyperlink"/>
@@ -783,7 +783,7 @@
             <w:noProof/>
             <w:webHidden/>
           </w:rPr>
-          <w:instrText xml:space="preserve"> PAGEREF _Toc243475700 \h </w:instrText>
+          <w:instrText xml:space="preserve"> PAGEREF _Toc243634056 \h </w:instrText>
         </w:r>
         <w:r>
           <w:rPr>
@@ -830,7 +830,7 @@
           <w:lang w:eastAsia="nl-NL"/>
         </w:rPr>
       </w:pPr>
-      <w:hyperlink w:anchor="_Toc243475701" w:history="1">
+      <w:hyperlink w:anchor="_Toc243634057" w:history="1">
         <w:r>
           <w:rPr>
             <w:rStyle w:val="Hyperlink"/>
@@ -875,7 +875,7 @@
             <w:noProof/>
             <w:webHidden/>
           </w:rPr>
-          <w:instrText xml:space="preserve"> PAGEREF _Toc243475701 \h </w:instrText>
+          <w:instrText xml:space="preserve"> PAGEREF _Toc243634057 \h </w:instrText>
         </w:r>
         <w:r>
           <w:rPr>
@@ -922,7 +922,7 @@
           <w:lang w:eastAsia="nl-NL"/>
         </w:rPr>
       </w:pPr>
-      <w:hyperlink w:anchor="_Toc243475702" w:history="1">
+      <w:hyperlink w:anchor="_Toc243634058" w:history="1">
         <w:r>
           <w:rPr>
             <w:rStyle w:val="Hyperlink"/>
@@ -967,7 +967,7 @@
             <w:noProof/>
             <w:webHidden/>
           </w:rPr>
-          <w:instrText xml:space="preserve"> PAGEREF _Toc243475702 \h </w:instrText>
+          <w:instrText xml:space="preserve"> PAGEREF _Toc243634058 \h </w:instrText>
         </w:r>
         <w:r>
           <w:rPr>
@@ -1014,7 +1014,7 @@
           <w:lang w:eastAsia="nl-NL"/>
         </w:rPr>
       </w:pPr>
-      <w:hyperlink w:anchor="_Toc243475703" w:history="1">
+      <w:hyperlink w:anchor="_Toc243634059" w:history="1">
         <w:r>
           <w:rPr>
             <w:rStyle w:val="Hyperlink"/>
@@ -1059,7 +1059,7 @@
             <w:noProof/>
             <w:webHidden/>
           </w:rPr>
-          <w:instrText xml:space="preserve"> PAGEREF _Toc243475703 \h </w:instrText>
+          <w:instrText xml:space="preserve"> PAGEREF _Toc243634059 \h </w:instrText>
         </w:r>
         <w:r>
           <w:rPr>
@@ -1106,7 +1106,7 @@
           <w:lang w:eastAsia="nl-NL"/>
         </w:rPr>
       </w:pPr>
-      <w:hyperlink w:anchor="_Toc243475704" w:history="1">
+      <w:hyperlink w:anchor="_Toc243634060" w:history="1">
         <w:r>
           <w:rPr>
             <w:rStyle w:val="Hyperlink"/>
@@ -1151,7 +1151,7 @@
             <w:noProof/>
             <w:webHidden/>
           </w:rPr>
-          <w:instrText xml:space="preserve"> PAGEREF _Toc243475704 \h </w:instrText>
+          <w:instrText xml:space="preserve"> PAGEREF _Toc243634060 \h </w:instrText>
         </w:r>
         <w:r>
           <w:rPr>
@@ -1198,7 +1198,7 @@
           <w:lang w:eastAsia="nl-NL"/>
         </w:rPr>
       </w:pPr>
-      <w:hyperlink w:anchor="_Toc243475705" w:history="1">
+      <w:hyperlink w:anchor="_Toc243634061" w:history="1">
         <w:r>
           <w:rPr>
             <w:rStyle w:val="Hyperlink"/>
@@ -1243,7 +1243,7 @@
             <w:noProof/>
             <w:webHidden/>
           </w:rPr>
-          <w:instrText xml:space="preserve"> PAGEREF _Toc243475705 \h </w:instrText>
+          <w:instrText xml:space="preserve"> PAGEREF _Toc243634061 \h </w:instrText>
         </w:r>
         <w:r>
           <w:rPr>
@@ -1290,7 +1290,7 @@
           <w:lang w:eastAsia="nl-NL"/>
         </w:rPr>
       </w:pPr>
-      <w:hyperlink w:anchor="_Toc243475706" w:history="1">
+      <w:hyperlink w:anchor="_Toc243634062" w:history="1">
         <w:r>
           <w:rPr>
             <w:rStyle w:val="Hyperlink"/>
@@ -1335,7 +1335,7 @@
             <w:noProof/>
             <w:webHidden/>
           </w:rPr>
-          <w:instrText xml:space="preserve"> PAGEREF _Toc243475706 \h </w:instrText>
+          <w:instrText xml:space="preserve"> PAGEREF _Toc243634062 \h </w:instrText>
         </w:r>
         <w:r>
           <w:rPr>
@@ -1382,7 +1382,7 @@
           <w:lang w:eastAsia="nl-NL"/>
         </w:rPr>
       </w:pPr>
-      <w:hyperlink w:anchor="_Toc243475707" w:history="1">
+      <w:hyperlink w:anchor="_Toc243634063" w:history="1">
         <w:r>
           <w:rPr>
             <w:rStyle w:val="Hyperlink"/>
@@ -1427,7 +1427,7 @@
             <w:noProof/>
             <w:webHidden/>
           </w:rPr>
-          <w:instrText xml:space="preserve"> PAGEREF _Toc243475707 \h </w:instrText>
+          <w:instrText xml:space="preserve"> PAGEREF _Toc243634063 \h </w:instrText>
         </w:r>
         <w:r>
           <w:rPr>
@@ -1474,7 +1474,7 @@
           <w:lang w:eastAsia="nl-NL"/>
         </w:rPr>
       </w:pPr>
-      <w:hyperlink w:anchor="_Toc243475708" w:history="1">
+      <w:hyperlink w:anchor="_Toc243634064" w:history="1">
         <w:r>
           <w:rPr>
             <w:rStyle w:val="Hyperlink"/>
@@ -1519,7 +1519,7 @@
             <w:noProof/>
             <w:webHidden/>
           </w:rPr>
-          <w:instrText xml:space="preserve"> PAGEREF _Toc243475708 \h </w:instrText>
+          <w:instrText xml:space="preserve"> PAGEREF _Toc243634064 \h </w:instrText>
         </w:r>
         <w:r>
           <w:rPr>
@@ -1566,7 +1566,7 @@
           <w:lang w:eastAsia="nl-NL"/>
         </w:rPr>
       </w:pPr>
-      <w:hyperlink w:anchor="_Toc243475709" w:history="1">
+      <w:hyperlink w:anchor="_Toc243634065" w:history="1">
         <w:r>
           <w:rPr>
             <w:rStyle w:val="Hyperlink"/>
@@ -1611,7 +1611,7 @@
             <w:noProof/>
             <w:webHidden/>
           </w:rPr>
-          <w:instrText xml:space="preserve"> PAGEREF _Toc243475709 \h </w:instrText>
+          <w:instrText xml:space="preserve"> PAGEREF _Toc243634065 \h </w:instrText>
         </w:r>
         <w:r>
           <w:rPr>
@@ -1658,7 +1658,7 @@
           <w:lang w:eastAsia="nl-NL"/>
         </w:rPr>
       </w:pPr>
-      <w:hyperlink w:anchor="_Toc243475710" w:history="1">
+      <w:hyperlink w:anchor="_Toc243634066" w:history="1">
         <w:r>
           <w:rPr>
             <w:rStyle w:val="Hyperlink"/>
@@ -1703,7 +1703,7 @@
             <w:noProof/>
             <w:webHidden/>
           </w:rPr>
-          <w:instrText xml:space="preserve"> PAGEREF _Toc243475710 \h </w:instrText>
+          <w:instrText xml:space="preserve"> PAGEREF _Toc243634066 \h </w:instrText>
         </w:r>
         <w:r>
           <w:rPr>
@@ -1750,7 +1750,7 @@
           <w:lang w:eastAsia="nl-NL"/>
         </w:rPr>
       </w:pPr>
-      <w:hyperlink w:anchor="_Toc243475711" w:history="1">
+      <w:hyperlink w:anchor="_Toc243634067" w:history="1">
         <w:r>
           <w:rPr>
             <w:rStyle w:val="Hyperlink"/>
@@ -1795,7 +1795,7 @@
             <w:noProof/>
             <w:webHidden/>
           </w:rPr>
-          <w:instrText xml:space="preserve"> PAGEREF _Toc243475711 \h </w:instrText>
+          <w:instrText xml:space="preserve"> PAGEREF _Toc243634067 \h </w:instrText>
         </w:r>
         <w:r>
           <w:rPr>
@@ -1842,7 +1842,7 @@
           <w:lang w:eastAsia="nl-NL"/>
         </w:rPr>
       </w:pPr>
-      <w:hyperlink w:anchor="_Toc243475712" w:history="1">
+      <w:hyperlink w:anchor="_Toc243634068" w:history="1">
         <w:r>
           <w:rPr>
             <w:rStyle w:val="Hyperlink"/>
@@ -1887,7 +1887,7 @@
             <w:noProof/>
             <w:webHidden/>
           </w:rPr>
-          <w:instrText xml:space="preserve"> PAGEREF _Toc243475712 \h </w:instrText>
+          <w:instrText xml:space="preserve"> PAGEREF _Toc243634068 \h </w:instrText>
         </w:r>
         <w:r>
           <w:rPr>
@@ -1934,7 +1934,7 @@
           <w:lang w:eastAsia="nl-NL"/>
         </w:rPr>
       </w:pPr>
-      <w:hyperlink w:anchor="_Toc243475713" w:history="1">
+      <w:hyperlink w:anchor="_Toc243634069" w:history="1">
         <w:r>
           <w:rPr>
             <w:rStyle w:val="Hyperlink"/>
@@ -1979,7 +1979,7 @@
             <w:noProof/>
             <w:webHidden/>
           </w:rPr>
-          <w:instrText xml:space="preserve"> PAGEREF _Toc243475713 \h </w:instrText>
+          <w:instrText xml:space="preserve"> PAGEREF _Toc243634069 \h </w:instrText>
         </w:r>
         <w:r>
           <w:rPr>
@@ -2026,7 +2026,7 @@
           <w:lang w:eastAsia="nl-NL"/>
         </w:rPr>
       </w:pPr>
-      <w:hyperlink w:anchor="_Toc243475714" w:history="1">
+      <w:hyperlink w:anchor="_Toc243634070" w:history="1">
         <w:r>
           <w:rPr>
             <w:rStyle w:val="Hyperlink"/>
@@ -2071,7 +2071,7 @@
             <w:noProof/>
             <w:webHidden/>
           </w:rPr>
-          <w:instrText xml:space="preserve"> PAGEREF _Toc243475714 \h </w:instrText>
+          <w:instrText xml:space="preserve"> PAGEREF _Toc243634070 \h </w:instrText>
         </w:r>
         <w:r>
           <w:rPr>
@@ -2118,7 +2118,7 @@
           <w:lang w:eastAsia="nl-NL"/>
         </w:rPr>
       </w:pPr>
-      <w:hyperlink w:anchor="_Toc243475715" w:history="1">
+      <w:hyperlink w:anchor="_Toc243634071" w:history="1">
         <w:r>
           <w:rPr>
             <w:rStyle w:val="Hyperlink"/>
@@ -2163,7 +2163,7 @@
             <w:noProof/>
             <w:webHidden/>
           </w:rPr>
-          <w:instrText xml:space="preserve"> PAGEREF _Toc243475715 \h </w:instrText>
+          <w:instrText xml:space="preserve"> PAGEREF _Toc243634071 \h </w:instrText>
         </w:r>
         <w:r>
           <w:rPr>
@@ -2210,7 +2210,7 @@
           <w:lang w:eastAsia="nl-NL"/>
         </w:rPr>
       </w:pPr>
-      <w:hyperlink w:anchor="_Toc243475716" w:history="1">
+      <w:hyperlink w:anchor="_Toc243634072" w:history="1">
         <w:r>
           <w:rPr>
             <w:rStyle w:val="Hyperlink"/>
@@ -2271,7 +2271,7 @@
             <w:noProof/>
             <w:webHidden/>
           </w:rPr>
-          <w:instrText xml:space="preserve"> PAGEREF _Toc243475716 \h </w:instrText>
+          <w:instrText xml:space="preserve"> PAGEREF _Toc243634072 \h </w:instrText>
         </w:r>
         <w:r>
           <w:rPr>
@@ -2318,7 +2318,7 @@
           <w:lang w:eastAsia="nl-NL"/>
         </w:rPr>
       </w:pPr>
-      <w:hyperlink w:anchor="_Toc243475717" w:history="1">
+      <w:hyperlink w:anchor="_Toc243634073" w:history="1">
         <w:r>
           <w:rPr>
             <w:rStyle w:val="Hyperlink"/>
@@ -2363,7 +2363,7 @@
             <w:noProof/>
             <w:webHidden/>
           </w:rPr>
-          <w:instrText xml:space="preserve"> PAGEREF _Toc243475717 \h </w:instrText>
+          <w:instrText xml:space="preserve"> PAGEREF _Toc243634073 \h </w:instrText>
         </w:r>
         <w:r>
           <w:rPr>
@@ -2410,7 +2410,7 @@
           <w:lang w:eastAsia="nl-NL"/>
         </w:rPr>
       </w:pPr>
-      <w:hyperlink w:anchor="_Toc243475718" w:history="1">
+      <w:hyperlink w:anchor="_Toc243634074" w:history="1">
         <w:r>
           <w:rPr>
             <w:rStyle w:val="Hyperlink"/>
@@ -2455,7 +2455,7 @@
             <w:noProof/>
             <w:webHidden/>
           </w:rPr>
-          <w:instrText xml:space="preserve"> PAGEREF _Toc243475718 \h </w:instrText>
+          <w:instrText xml:space="preserve"> PAGEREF _Toc243634074 \h </w:instrText>
         </w:r>
         <w:r>
           <w:rPr>
@@ -2502,7 +2502,7 @@
           <w:lang w:eastAsia="nl-NL"/>
         </w:rPr>
       </w:pPr>
-      <w:hyperlink w:anchor="_Toc243475719" w:history="1">
+      <w:hyperlink w:anchor="_Toc243634075" w:history="1">
         <w:r>
           <w:rPr>
             <w:rStyle w:val="Hyperlink"/>
@@ -2547,7 +2547,7 @@
             <w:noProof/>
             <w:webHidden/>
           </w:rPr>
-          <w:instrText xml:space="preserve"> PAGEREF _Toc243475719 \h </w:instrText>
+          <w:instrText xml:space="preserve"> PAGEREF _Toc243634075 \h </w:instrText>
         </w:r>
         <w:r>
           <w:rPr>
@@ -2594,7 +2594,7 @@
           <w:lang w:eastAsia="nl-NL"/>
         </w:rPr>
       </w:pPr>
-      <w:hyperlink w:anchor="_Toc243475720" w:history="1">
+      <w:hyperlink w:anchor="_Toc243634076" w:history="1">
         <w:r>
           <w:rPr>
             <w:rStyle w:val="Hyperlink"/>
@@ -2639,7 +2639,7 @@
             <w:noProof/>
             <w:webHidden/>
           </w:rPr>
-          <w:instrText xml:space="preserve"> PAGEREF _Toc243475720 \h </w:instrText>
+          <w:instrText xml:space="preserve"> PAGEREF _Toc243634076 \h </w:instrText>
         </w:r>
         <w:r>
           <w:rPr>
@@ -2686,7 +2686,7 @@
           <w:lang w:eastAsia="nl-NL"/>
         </w:rPr>
       </w:pPr>
-      <w:hyperlink w:anchor="_Toc243475721" w:history="1">
+      <w:hyperlink w:anchor="_Toc243634077" w:history="1">
         <w:r>
           <w:rPr>
             <w:rStyle w:val="Hyperlink"/>
@@ -2731,7 +2731,7 @@
             <w:noProof/>
             <w:webHidden/>
           </w:rPr>
-          <w:instrText xml:space="preserve"> PAGEREF _Toc243475721 \h </w:instrText>
+          <w:instrText xml:space="preserve"> PAGEREF _Toc243634077 \h </w:instrText>
         </w:r>
         <w:r>
           <w:rPr>
@@ -2778,7 +2778,7 @@
           <w:lang w:eastAsia="nl-NL"/>
         </w:rPr>
       </w:pPr>
-      <w:hyperlink w:anchor="_Toc243475722" w:history="1">
+      <w:hyperlink w:anchor="_Toc243634078" w:history="1">
         <w:r>
           <w:rPr>
             <w:rStyle w:val="Hyperlink"/>
@@ -2823,7 +2823,7 @@
             <w:noProof/>
             <w:webHidden/>
           </w:rPr>
-          <w:instrText xml:space="preserve"> PAGEREF _Toc243475722 \h </w:instrText>
+          <w:instrText xml:space="preserve"> PAGEREF _Toc243634078 \h </w:instrText>
         </w:r>
         <w:r>
           <w:rPr>
@@ -2870,7 +2870,7 @@
           <w:lang w:eastAsia="nl-NL"/>
         </w:rPr>
       </w:pPr>
-      <w:hyperlink w:anchor="_Toc243475723" w:history="1">
+      <w:hyperlink w:anchor="_Toc243634079" w:history="1">
         <w:r>
           <w:rPr>
             <w:rStyle w:val="Hyperlink"/>
@@ -2915,7 +2915,7 @@
             <w:noProof/>
             <w:webHidden/>
           </w:rPr>
-          <w:instrText xml:space="preserve"> PAGEREF _Toc243475723 \h </w:instrText>
+          <w:instrText xml:space="preserve"> PAGEREF _Toc243634079 \h </w:instrText>
         </w:r>
         <w:r>
           <w:rPr>
@@ -2962,7 +2962,7 @@
           <w:lang w:eastAsia="nl-NL"/>
         </w:rPr>
       </w:pPr>
-      <w:hyperlink w:anchor="_Toc243475724" w:history="1">
+      <w:hyperlink w:anchor="_Toc243634080" w:history="1">
         <w:r>
           <w:rPr>
             <w:rStyle w:val="Hyperlink"/>
@@ -3023,7 +3023,7 @@
             <w:noProof/>
             <w:webHidden/>
           </w:rPr>
-          <w:instrText xml:space="preserve"> PAGEREF _Toc243475724 \h </w:instrText>
+          <w:instrText xml:space="preserve"> PAGEREF _Toc243634080 \h </w:instrText>
         </w:r>
         <w:r>
           <w:rPr>
@@ -3070,7 +3070,7 @@
           <w:lang w:eastAsia="nl-NL"/>
         </w:rPr>
       </w:pPr>
-      <w:hyperlink w:anchor="_Toc243475725" w:history="1">
+      <w:hyperlink w:anchor="_Toc243634081" w:history="1">
         <w:r>
           <w:rPr>
             <w:rStyle w:val="Hyperlink"/>
@@ -3115,7 +3115,7 @@
             <w:noProof/>
             <w:webHidden/>
           </w:rPr>
-          <w:instrText xml:space="preserve"> PAGEREF _Toc243475725 \h </w:instrText>
+          <w:instrText xml:space="preserve"> PAGEREF _Toc243634081 \h </w:instrText>
         </w:r>
         <w:r>
           <w:rPr>
@@ -3162,7 +3162,7 @@
           <w:lang w:eastAsia="nl-NL"/>
         </w:rPr>
       </w:pPr>
-      <w:hyperlink w:anchor="_Toc243475726" w:history="1">
+      <w:hyperlink w:anchor="_Toc243634082" w:history="1">
         <w:r>
           <w:rPr>
             <w:rStyle w:val="Hyperlink"/>
@@ -3207,7 +3207,7 @@
             <w:noProof/>
             <w:webHidden/>
           </w:rPr>
-          <w:instrText xml:space="preserve"> PAGEREF _Toc243475726 \h </w:instrText>
+          <w:instrText xml:space="preserve"> PAGEREF _Toc243634082 \h </w:instrText>
         </w:r>
         <w:r>
           <w:rPr>
@@ -3254,7 +3254,7 @@
           <w:lang w:eastAsia="nl-NL"/>
         </w:rPr>
       </w:pPr>
-      <w:hyperlink w:anchor="_Toc243475727" w:history="1">
+      <w:hyperlink w:anchor="_Toc243634083" w:history="1">
         <w:r>
           <w:rPr>
             <w:rStyle w:val="Hyperlink"/>
@@ -3299,7 +3299,7 @@
             <w:noProof/>
             <w:webHidden/>
           </w:rPr>
-          <w:instrText xml:space="preserve"> PAGEREF _Toc243475727 \h </w:instrText>
+          <w:instrText xml:space="preserve"> PAGEREF _Toc243634083 \h </w:instrText>
         </w:r>
         <w:r>
           <w:rPr>
@@ -3346,7 +3346,7 @@
           <w:lang w:eastAsia="nl-NL"/>
         </w:rPr>
       </w:pPr>
-      <w:hyperlink w:anchor="_Toc243475728" w:history="1">
+      <w:hyperlink w:anchor="_Toc243634084" w:history="1">
         <w:r>
           <w:rPr>
             <w:rStyle w:val="Hyperlink"/>
@@ -3407,7 +3407,7 @@
             <w:noProof/>
             <w:webHidden/>
           </w:rPr>
-          <w:instrText xml:space="preserve"> PAGEREF _Toc243475728 \h </w:instrText>
+          <w:instrText xml:space="preserve"> PAGEREF _Toc243634084 \h </w:instrText>
         </w:r>
         <w:r>
           <w:rPr>
@@ -3454,7 +3454,7 @@
           <w:lang w:eastAsia="nl-NL"/>
         </w:rPr>
       </w:pPr>
-      <w:hyperlink w:anchor="_Toc243475729" w:history="1">
+      <w:hyperlink w:anchor="_Toc243634085" w:history="1">
         <w:r>
           <w:rPr>
             <w:rStyle w:val="Hyperlink"/>
@@ -3499,7 +3499,7 @@
             <w:noProof/>
             <w:webHidden/>
           </w:rPr>
-          <w:instrText xml:space="preserve"> PAGEREF _Toc243475729 \h </w:instrText>
+          <w:instrText xml:space="preserve"> PAGEREF _Toc243634085 \h </w:instrText>
         </w:r>
         <w:r>
           <w:rPr>
@@ -3546,7 +3546,7 @@
           <w:lang w:eastAsia="nl-NL"/>
         </w:rPr>
       </w:pPr>
-      <w:hyperlink w:anchor="_Toc243475730" w:history="1">
+      <w:hyperlink w:anchor="_Toc243634086" w:history="1">
         <w:r>
           <w:rPr>
             <w:rStyle w:val="Hyperlink"/>
@@ -3591,7 +3591,7 @@
             <w:noProof/>
             <w:webHidden/>
           </w:rPr>
-          <w:instrText xml:space="preserve"> PAGEREF _Toc243475730 \h </w:instrText>
+          <w:instrText xml:space="preserve"> PAGEREF _Toc243634086 \h </w:instrText>
         </w:r>
         <w:r>
           <w:rPr>
@@ -3638,7 +3638,7 @@
           <w:lang w:eastAsia="nl-NL"/>
         </w:rPr>
       </w:pPr>
-      <w:hyperlink w:anchor="_Toc243475731" w:history="1">
+      <w:hyperlink w:anchor="_Toc243634087" w:history="1">
         <w:r>
           <w:rPr>
             <w:rStyle w:val="Hyperlink"/>
@@ -3685,7 +3685,7 @@
             <w:noProof/>
             <w:webHidden/>
           </w:rPr>
-          <w:instrText xml:space="preserve"> PAGEREF _Toc243475731 \h </w:instrText>
+          <w:instrText xml:space="preserve"> PAGEREF _Toc243634087 \h </w:instrText>
         </w:r>
         <w:r>
           <w:rPr>
@@ -3732,7 +3732,7 @@
           <w:lang w:eastAsia="nl-NL"/>
         </w:rPr>
       </w:pPr>
-      <w:hyperlink w:anchor="_Toc243475732" w:history="1">
+      <w:hyperlink w:anchor="_Toc243634088" w:history="1">
         <w:r>
           <w:rPr>
             <w:rStyle w:val="Hyperlink"/>
@@ -3779,7 +3779,7 @@
             <w:noProof/>
             <w:webHidden/>
           </w:rPr>
-          <w:instrText xml:space="preserve"> PAGEREF _Toc243475732 \h </w:instrText>
+          <w:instrText xml:space="preserve"> PAGEREF _Toc243634088 \h </w:instrText>
         </w:r>
         <w:r>
           <w:rPr>
@@ -3826,7 +3826,7 @@
           <w:lang w:eastAsia="nl-NL"/>
         </w:rPr>
       </w:pPr>
-      <w:hyperlink w:anchor="_Toc243475733" w:history="1">
+      <w:hyperlink w:anchor="_Toc243634089" w:history="1">
         <w:r>
           <w:rPr>
             <w:rStyle w:val="Hyperlink"/>
@@ -3873,7 +3873,7 @@
             <w:noProof/>
             <w:webHidden/>
           </w:rPr>
-          <w:instrText xml:space="preserve"> PAGEREF _Toc243475733 \h </w:instrText>
+          <w:instrText xml:space="preserve"> PAGEREF _Toc243634089 \h </w:instrText>
         </w:r>
         <w:r>
           <w:rPr>
@@ -3920,7 +3920,7 @@
           <w:lang w:eastAsia="nl-NL"/>
         </w:rPr>
       </w:pPr>
-      <w:hyperlink w:anchor="_Toc243475734" w:history="1">
+      <w:hyperlink w:anchor="_Toc243634090" w:history="1">
         <w:r>
           <w:rPr>
             <w:rStyle w:val="Hyperlink"/>
@@ -3967,7 +3967,7 @@
             <w:noProof/>
             <w:webHidden/>
           </w:rPr>
-          <w:instrText xml:space="preserve"> PAGEREF _Toc243475734 \h </w:instrText>
+          <w:instrText xml:space="preserve"> PAGEREF _Toc243634090 \h </w:instrText>
         </w:r>
         <w:r>
           <w:rPr>
@@ -4014,7 +4014,7 @@
           <w:lang w:eastAsia="nl-NL"/>
         </w:rPr>
       </w:pPr>
-      <w:hyperlink w:anchor="_Toc243475735" w:history="1">
+      <w:hyperlink w:anchor="_Toc243634091" w:history="1">
         <w:r>
           <w:rPr>
             <w:rStyle w:val="Hyperlink"/>
@@ -4061,7 +4061,7 @@
             <w:noProof/>
             <w:webHidden/>
           </w:rPr>
-          <w:instrText xml:space="preserve"> PAGEREF _Toc243475735 \h </w:instrText>
+          <w:instrText xml:space="preserve"> PAGEREF _Toc243634091 \h </w:instrText>
         </w:r>
         <w:r>
           <w:rPr>
@@ -4108,7 +4108,7 @@
           <w:lang w:eastAsia="nl-NL"/>
         </w:rPr>
       </w:pPr>
-      <w:hyperlink w:anchor="_Toc243475736" w:history="1">
+      <w:hyperlink w:anchor="_Toc243634092" w:history="1">
         <w:r>
           <w:rPr>
             <w:rStyle w:val="Hyperlink"/>
@@ -4155,7 +4155,7 @@
             <w:noProof/>
             <w:webHidden/>
           </w:rPr>
-          <w:instrText xml:space="preserve"> PAGEREF _Toc243475736 \h </w:instrText>
+          <w:instrText xml:space="preserve"> PAGEREF _Toc243634092 \h </w:instrText>
         </w:r>
         <w:r>
           <w:rPr>
@@ -4202,7 +4202,7 @@
           <w:lang w:eastAsia="nl-NL"/>
         </w:rPr>
       </w:pPr>
-      <w:hyperlink w:anchor="_Toc243475737" w:history="1">
+      <w:hyperlink w:anchor="_Toc243634093" w:history="1">
         <w:r>
           <w:rPr>
             <w:rStyle w:val="Hyperlink"/>
@@ -4247,7 +4247,7 @@
             <w:noProof/>
             <w:webHidden/>
           </w:rPr>
-          <w:instrText xml:space="preserve"> PAGEREF _Toc243475737 \h </w:instrText>
+          <w:instrText xml:space="preserve"> PAGEREF _Toc243634093 \h </w:instrText>
         </w:r>
         <w:r>
           <w:rPr>
@@ -4267,7 +4267,7 @@
             <w:noProof/>
             <w:webHidden/>
           </w:rPr>
-          <w:t>36</w:t>
+          <w:t>37</w:t>
         </w:r>
         <w:r>
           <w:rPr>
@@ -4294,7 +4294,7 @@
           <w:lang w:eastAsia="nl-NL"/>
         </w:rPr>
       </w:pPr>
-      <w:hyperlink w:anchor="_Toc243475738" w:history="1">
+      <w:hyperlink w:anchor="_Toc243634094" w:history="1">
         <w:r>
           <w:rPr>
             <w:rStyle w:val="Hyperlink"/>
@@ -4339,7 +4339,7 @@
             <w:noProof/>
             <w:webHidden/>
           </w:rPr>
-          <w:instrText xml:space="preserve"> PAGEREF _Toc243475738 \h </w:instrText>
+          <w:instrText xml:space="preserve"> PAGEREF _Toc243634094 \h </w:instrText>
         </w:r>
         <w:r>
           <w:rPr>
@@ -4386,7 +4386,7 @@
           <w:lang w:eastAsia="nl-NL"/>
         </w:rPr>
       </w:pPr>
-      <w:hyperlink w:anchor="_Toc243475739" w:history="1">
+      <w:hyperlink w:anchor="_Toc243634095" w:history="1">
         <w:r>
           <w:rPr>
             <w:rStyle w:val="Hyperlink"/>
@@ -4463,7 +4463,7 @@
             <w:noProof/>
             <w:webHidden/>
           </w:rPr>
-          <w:instrText xml:space="preserve"> PAGEREF _Toc243475739 \h </w:instrText>
+          <w:instrText xml:space="preserve"> PAGEREF _Toc243634095 \h </w:instrText>
         </w:r>
         <w:r>
           <w:rPr>
@@ -4510,7 +4510,7 @@
           <w:lang w:eastAsia="nl-NL"/>
         </w:rPr>
       </w:pPr>
-      <w:hyperlink w:anchor="_Toc243475740" w:history="1">
+      <w:hyperlink w:anchor="_Toc243634096" w:history="1">
         <w:r>
           <w:rPr>
             <w:rStyle w:val="Hyperlink"/>
@@ -4555,7 +4555,7 @@
             <w:noProof/>
             <w:webHidden/>
           </w:rPr>
-          <w:instrText xml:space="preserve"> PAGEREF _Toc243475740 \h </w:instrText>
+          <w:instrText xml:space="preserve"> PAGEREF _Toc243634096 \h </w:instrText>
         </w:r>
         <w:r>
           <w:rPr>
@@ -4575,7 +4575,7 @@
             <w:noProof/>
             <w:webHidden/>
           </w:rPr>
-          <w:t>37</w:t>
+          <w:t>38</w:t>
         </w:r>
         <w:r>
           <w:rPr>
@@ -4602,7 +4602,7 @@
           <w:lang w:eastAsia="nl-NL"/>
         </w:rPr>
       </w:pPr>
-      <w:hyperlink w:anchor="_Toc243475741" w:history="1">
+      <w:hyperlink w:anchor="_Toc243634097" w:history="1">
         <w:r>
           <w:rPr>
             <w:rStyle w:val="Hyperlink"/>
@@ -4647,7 +4647,7 @@
             <w:noProof/>
             <w:webHidden/>
           </w:rPr>
-          <w:instrText xml:space="preserve"> PAGEREF _Toc243475741 \h </w:instrText>
+          <w:instrText xml:space="preserve"> PAGEREF _Toc243634097 \h </w:instrText>
         </w:r>
         <w:r>
           <w:rPr>
@@ -4694,7 +4694,7 @@
           <w:lang w:eastAsia="nl-NL"/>
         </w:rPr>
       </w:pPr>
-      <w:hyperlink w:anchor="_Toc243475742" w:history="1">
+      <w:hyperlink w:anchor="_Toc243634098" w:history="1">
         <w:r>
           <w:rPr>
             <w:rStyle w:val="Hyperlink"/>
@@ -4739,7 +4739,7 @@
             <w:noProof/>
             <w:webHidden/>
           </w:rPr>
-          <w:instrText xml:space="preserve"> PAGEREF _Toc243475742 \h </w:instrText>
+          <w:instrText xml:space="preserve"> PAGEREF _Toc243634098 \h </w:instrText>
         </w:r>
         <w:r>
           <w:rPr>
@@ -4786,7 +4786,7 @@
           <w:lang w:eastAsia="nl-NL"/>
         </w:rPr>
       </w:pPr>
-      <w:hyperlink w:anchor="_Toc243475743" w:history="1">
+      <w:hyperlink w:anchor="_Toc243634099" w:history="1">
         <w:r>
           <w:rPr>
             <w:rStyle w:val="Hyperlink"/>
@@ -4831,7 +4831,7 @@
             <w:noProof/>
             <w:webHidden/>
           </w:rPr>
-          <w:instrText xml:space="preserve"> PAGEREF _Toc243475743 \h </w:instrText>
+          <w:instrText xml:space="preserve"> PAGEREF _Toc243634099 \h </w:instrText>
         </w:r>
         <w:r>
           <w:rPr>
@@ -4878,7 +4878,7 @@
           <w:lang w:eastAsia="nl-NL"/>
         </w:rPr>
       </w:pPr>
-      <w:hyperlink w:anchor="_Toc243475744" w:history="1">
+      <w:hyperlink w:anchor="_Toc243634100" w:history="1">
         <w:r>
           <w:rPr>
             <w:rStyle w:val="Hyperlink"/>
@@ -4923,7 +4923,7 @@
             <w:noProof/>
             <w:webHidden/>
           </w:rPr>
-          <w:instrText xml:space="preserve"> PAGEREF _Toc243475744 \h </w:instrText>
+          <w:instrText xml:space="preserve"> PAGEREF _Toc243634100 \h </w:instrText>
         </w:r>
         <w:r>
           <w:rPr>
@@ -4970,7 +4970,7 @@
           <w:lang w:eastAsia="nl-NL"/>
         </w:rPr>
       </w:pPr>
-      <w:hyperlink w:anchor="_Toc243475745" w:history="1">
+      <w:hyperlink w:anchor="_Toc243634101" w:history="1">
         <w:r>
           <w:rPr>
             <w:rStyle w:val="Hyperlink"/>
@@ -5015,7 +5015,7 @@
             <w:noProof/>
             <w:webHidden/>
           </w:rPr>
-          <w:instrText xml:space="preserve"> PAGEREF _Toc243475745 \h </w:instrText>
+          <w:instrText xml:space="preserve"> PAGEREF _Toc243634101 \h </w:instrText>
         </w:r>
         <w:r>
           <w:rPr>
@@ -5062,7 +5062,7 @@
           <w:lang w:eastAsia="nl-NL"/>
         </w:rPr>
       </w:pPr>
-      <w:hyperlink w:anchor="_Toc243475746" w:history="1">
+      <w:hyperlink w:anchor="_Toc243634102" w:history="1">
         <w:r>
           <w:rPr>
             <w:rStyle w:val="Hyperlink"/>
@@ -5107,7 +5107,7 @@
             <w:noProof/>
             <w:webHidden/>
           </w:rPr>
-          <w:instrText xml:space="preserve"> PAGEREF _Toc243475746 \h </w:instrText>
+          <w:instrText xml:space="preserve"> PAGEREF _Toc243634102 \h </w:instrText>
         </w:r>
         <w:r>
           <w:rPr>
@@ -5154,7 +5154,7 @@
           <w:lang w:eastAsia="nl-NL"/>
         </w:rPr>
       </w:pPr>
-      <w:hyperlink w:anchor="_Toc243475747" w:history="1">
+      <w:hyperlink w:anchor="_Toc243634103" w:history="1">
         <w:r>
           <w:rPr>
             <w:rStyle w:val="Hyperlink"/>
@@ -5199,7 +5199,7 @@
             <w:noProof/>
             <w:webHidden/>
           </w:rPr>
-          <w:instrText xml:space="preserve"> PAGEREF _Toc243475747 \h </w:instrText>
+          <w:instrText xml:space="preserve"> PAGEREF _Toc243634103 \h </w:instrText>
         </w:r>
         <w:r>
           <w:rPr>
@@ -5246,7 +5246,7 @@
           <w:lang w:eastAsia="nl-NL"/>
         </w:rPr>
       </w:pPr>
-      <w:hyperlink w:anchor="_Toc243475748" w:history="1">
+      <w:hyperlink w:anchor="_Toc243634104" w:history="1">
         <w:r>
           <w:rPr>
             <w:rStyle w:val="Hyperlink"/>
@@ -5291,7 +5291,7 @@
             <w:noProof/>
             <w:webHidden/>
           </w:rPr>
-          <w:instrText xml:space="preserve"> PAGEREF _Toc243475748 \h </w:instrText>
+          <w:instrText xml:space="preserve"> PAGEREF _Toc243634104 \h </w:instrText>
         </w:r>
         <w:r>
           <w:rPr>
@@ -5338,7 +5338,7 @@
           <w:lang w:eastAsia="nl-NL"/>
         </w:rPr>
       </w:pPr>
-      <w:hyperlink w:anchor="_Toc243475749" w:history="1">
+      <w:hyperlink w:anchor="_Toc243634105" w:history="1">
         <w:r>
           <w:rPr>
             <w:rStyle w:val="Hyperlink"/>
@@ -5383,7 +5383,7 @@
             <w:noProof/>
             <w:webHidden/>
           </w:rPr>
-          <w:instrText xml:space="preserve"> PAGEREF _Toc243475749 \h </w:instrText>
+          <w:instrText xml:space="preserve"> PAGEREF _Toc243634105 \h </w:instrText>
         </w:r>
         <w:r>
           <w:rPr>
@@ -5430,7 +5430,7 @@
           <w:lang w:eastAsia="nl-NL"/>
         </w:rPr>
       </w:pPr>
-      <w:hyperlink w:anchor="_Toc243475750" w:history="1">
+      <w:hyperlink w:anchor="_Toc243634106" w:history="1">
         <w:r>
           <w:rPr>
             <w:rStyle w:val="Hyperlink"/>
@@ -5475,7 +5475,7 @@
             <w:noProof/>
             <w:webHidden/>
           </w:rPr>
-          <w:instrText xml:space="preserve"> PAGEREF _Toc243475750 \h </w:instrText>
+          <w:instrText xml:space="preserve"> PAGEREF _Toc243634106 \h </w:instrText>
         </w:r>
         <w:r>
           <w:rPr>
@@ -5528,7 +5528,7 @@
         </w:numPr>
       </w:pPr>
       <w:bookmarkStart w:id="1" w:name="k1"/>
-      <w:bookmarkStart w:id="2" w:name="_Toc243475694"/>
+      <w:bookmarkStart w:id="2" w:name="_Toc243634050"/>
       <w:r>
         <w:t>DOEL VAN DE APPLICATIE.</w:t>
       </w:r>
@@ -5610,7 +5610,7 @@
         </w:numPr>
       </w:pPr>
       <w:bookmarkStart w:id="3" w:name="k2"/>
-      <w:bookmarkStart w:id="4" w:name="_Toc243475695"/>
+      <w:bookmarkStart w:id="4" w:name="_Toc243634051"/>
       <w:r>
         <w:t>BESTANDEN.</w:t>
       </w:r>
@@ -8086,7 +8086,7 @@
                 <w:sz w:val="14"/>
                 <w:shd w:val="clear" w:color="auto" w:fill="EEF4F2"/>
               </w:rPr>
-              <w:t>tests/</w:t>
+              <w:t>tests/generale-repetitie.test.js</w:t>
             </w:r>
           </w:p>
         </w:tc>
@@ -8103,7 +8103,30 @@
                 <w:sz w:val="16"/>
                 <w:szCs w:val="16"/>
               </w:rPr>
-              <w:t>Unit tests (802) voor de regels, de opslag, de export, het thema, de welkom- en gezichtsherkenningsfuncties, herkennen met de pas, de controller, de beveiliging en regressietests voor opgeloste bugs</w:t>
+              <w:t xml:space="preserve">Regressietests voor de fouten uit de generale repetitie van de demo (versie 3.19): een pas in een ander tekstveld laat de oude inhoud staan (niet in </w:t>
+            </w:r>
+            <w:r>
+              <w:rPr>
+                <w:rFonts w:ascii="Consolas" w:hAnsi="Consolas" w:cs="Consolas"/>
+                <w:sz w:val="14"/>
+                <w:shd w:val="clear" w:color="auto" w:fill="EEF4F2"/>
+              </w:rPr>
+              <w:t>Pasnummer</w:t>
+            </w:r>
+            <w:r>
+              <w:rPr>
+                <w:sz w:val="16"/>
+                <w:szCs w:val="16"/>
+              </w:rPr>
+              <w:t xml:space="preserve">), de melding per reden als de camera niet start, de binnenruimte van de velden in de voorraadtabel en het lege pictogram in </w:t>
+            </w:r>
+            <w:r>
+              <w:rPr>
+                <w:rFonts w:ascii="Consolas" w:hAnsi="Consolas" w:cs="Consolas"/>
+                <w:sz w:val="14"/>
+                <w:shd w:val="clear" w:color="auto" w:fill="EEF4F2"/>
+              </w:rPr>
+              <w:t>index.html</w:t>
             </w:r>
           </w:p>
         </w:tc>
@@ -8126,7 +8149,7 @@
                 <w:sz w:val="14"/>
                 <w:shd w:val="clear" w:color="auto" w:fill="EEF4F2"/>
               </w:rPr>
-              <w:t>tests/opslag-model-export.test.js</w:t>
+              <w:t>tests/</w:t>
             </w:r>
           </w:p>
         </w:tc>
@@ -8143,22 +8166,7 @@
                 <w:sz w:val="16"/>
                 <w:szCs w:val="16"/>
               </w:rPr>
-              <w:t>Tests voor de reservekopieën, het wissen van gegevens, de strengere controle bij het laden, de voorraadtelling (</w:t>
-            </w:r>
-            <w:r>
-              <w:rPr>
-                <w:rFonts w:ascii="Consolas" w:hAnsi="Consolas" w:cs="Consolas"/>
-                <w:sz w:val="14"/>
-                <w:shd w:val="clear" w:color="auto" w:fill="EEF4F2"/>
-              </w:rPr>
-              <w:t>countedAt</w:t>
-            </w:r>
-            <w:r>
-              <w:rPr>
-                <w:sz w:val="16"/>
-                <w:szCs w:val="16"/>
-              </w:rPr>
-              <w:t>), nieuwe modelmethodes en de beveiliging van de CSV-export, verboden id's, maximale tekstlengtes en een opslag die niet te lezen is</w:t>
+              <w:t>Unit tests (811) voor de regels, de opslag, de export, het thema, de welkom- en gezichtsherkenningsfuncties, herkennen met de pas, de controller, de beveiliging en regressietests voor opgeloste bugs</w:t>
             </w:r>
           </w:p>
         </w:tc>
@@ -8181,7 +8189,7 @@
                 <w:sz w:val="14"/>
                 <w:shd w:val="clear" w:color="auto" w:fill="EEF4F2"/>
               </w:rPr>
-              <w:t>tests/controller-robuustheid.test.js</w:t>
+              <w:t>tests/opslag-model-export.test.js</w:t>
             </w:r>
           </w:p>
         </w:tc>
@@ -8198,7 +8206,7 @@
                 <w:sz w:val="16"/>
                 <w:szCs w:val="16"/>
               </w:rPr>
-              <w:t xml:space="preserve">Tests voor de robuustheid van controller en view: na middernacht, correcties in een oude maand, logboek en wijziging in één keer opslaan, grenzen bij de voorraad, verouderde formulieren en knoppen, de camera, de focus na sluiten, veilige HTML, </w:t>
+              <w:t>Tests voor de reservekopieën, het wissen van gegevens, de strengere controle bij het laden, de voorraadtelling (</w:t>
             </w:r>
             <w:r>
               <w:rPr>
@@ -8206,14 +8214,14 @@
                 <w:sz w:val="14"/>
                 <w:shd w:val="clear" w:color="auto" w:fill="EEF4F2"/>
               </w:rPr>
-              <w:t>Alle gegevens wissen</w:t>
+              <w:t>countedAt</w:t>
             </w:r>
             <w:r>
               <w:rPr>
                 <w:sz w:val="16"/>
                 <w:szCs w:val="16"/>
               </w:rPr>
-              <w:t>, en exporteren en wissen alleen voor een ingelogde beheerder</w:t>
+              <w:t>), nieuwe modelmethodes en de beveiliging van de CSV-export, verboden id's, maximale tekstlengtes en een opslag die niet te lezen is</w:t>
             </w:r>
           </w:p>
         </w:tc>
@@ -8236,7 +8244,7 @@
                 <w:sz w:val="14"/>
                 <w:shd w:val="clear" w:color="auto" w:fill="EEF4F2"/>
               </w:rPr>
-              <w:t>tests/beveiliging-config.test.js</w:t>
+              <w:t>tests/controller-robuustheid.test.js</w:t>
             </w:r>
           </w:p>
         </w:tc>
@@ -8253,7 +8261,22 @@
                 <w:sz w:val="16"/>
                 <w:szCs w:val="16"/>
               </w:rPr>
-              <w:t>Tests voor de configuratie: geen externe bronnen, de Content-Security-Policy, lokale lettertypes en face-api (met de SHA-256-controlegetallen), en de CI-workflow</w:t>
+              <w:t xml:space="preserve">Tests voor de robuustheid van controller en view: na middernacht, correcties in een oude maand, logboek en wijziging in één keer opslaan, grenzen bij de voorraad, verouderde formulieren en knoppen, de camera, de focus na sluiten, veilige HTML, </w:t>
+            </w:r>
+            <w:r>
+              <w:rPr>
+                <w:rFonts w:ascii="Consolas" w:hAnsi="Consolas" w:cs="Consolas"/>
+                <w:sz w:val="14"/>
+                <w:shd w:val="clear" w:color="auto" w:fill="EEF4F2"/>
+              </w:rPr>
+              <w:t>Alle gegevens wissen</w:t>
+            </w:r>
+            <w:r>
+              <w:rPr>
+                <w:sz w:val="16"/>
+                <w:szCs w:val="16"/>
+              </w:rPr>
+              <w:t>, en exporteren en wissen alleen voor een ingelogde beheerder</w:t>
             </w:r>
           </w:p>
         </w:tc>
@@ -8276,7 +8299,7 @@
                 <w:sz w:val="14"/>
                 <w:shd w:val="clear" w:color="auto" w:fill="EEF4F2"/>
               </w:rPr>
-              <w:t>tests/gegevens-en-tabbladen.test.js</w:t>
+              <w:t>tests/beveiliging-config.test.js</w:t>
             </w:r>
           </w:p>
         </w:tc>
@@ -8293,52 +8316,7 @@
                 <w:sz w:val="16"/>
                 <w:szCs w:val="16"/>
               </w:rPr>
-              <w:t xml:space="preserve">Tests voor de prijsgrens van 1000 euro, de focus na </w:t>
-            </w:r>
-            <w:r>
-              <w:rPr>
-                <w:rFonts w:ascii="Consolas" w:hAnsi="Consolas" w:cs="Consolas"/>
-                <w:sz w:val="14"/>
-                <w:shd w:val="clear" w:color="auto" w:fill="EEF4F2"/>
-              </w:rPr>
-              <w:t>Registreren</w:t>
-            </w:r>
-            <w:r>
-              <w:rPr>
-                <w:sz w:val="16"/>
-                <w:szCs w:val="16"/>
-              </w:rPr>
-              <w:t>, "niets gewijzigd" bij opslaan, en verouderde formulieren of een gewiste opslag na een wijziging in een ander tabblad. Gebruikt de strenge nep-view (</w:t>
-            </w:r>
-            <w:r>
-              <w:rPr>
-                <w:rFonts w:ascii="Consolas" w:hAnsi="Consolas" w:cs="Consolas"/>
-                <w:sz w:val="14"/>
-                <w:shd w:val="clear" w:color="auto" w:fill="EEF4F2"/>
-              </w:rPr>
-              <w:t>createStrictView</w:t>
-            </w:r>
-            <w:r>
-              <w:rPr>
-                <w:sz w:val="16"/>
-                <w:szCs w:val="16"/>
-              </w:rPr>
-              <w:t xml:space="preserve"> in </w:t>
-            </w:r>
-            <w:r>
-              <w:rPr>
-                <w:rFonts w:ascii="Consolas" w:hAnsi="Consolas" w:cs="Consolas"/>
-                <w:sz w:val="14"/>
-                <w:shd w:val="clear" w:color="auto" w:fill="EEF4F2"/>
-              </w:rPr>
-              <w:t>helpers.js</w:t>
-            </w:r>
-            <w:r>
-              <w:rPr>
-                <w:sz w:val="16"/>
-                <w:szCs w:val="16"/>
-              </w:rPr>
-              <w:t>)</w:t>
+              <w:t>Tests voor de configuratie: geen externe bronnen, de Content-Security-Policy, lokale lettertypes en face-api (met de SHA-256-controlegetallen), en de CI-workflow</w:t>
             </w:r>
           </w:p>
         </w:tc>
@@ -8361,7 +8339,7 @@
                 <w:sz w:val="14"/>
                 <w:shd w:val="clear" w:color="auto" w:fill="EEF4F2"/>
               </w:rPr>
-              <w:t>tests/werkgever-en-correctiedatum.test.js</w:t>
+              <w:t>tests/gegevens-en-tabbladen.test.js</w:t>
             </w:r>
           </w:p>
         </w:tc>
@@ -8378,7 +8356,7 @@
                 <w:sz w:val="16"/>
                 <w:szCs w:val="16"/>
               </w:rPr>
-              <w:t xml:space="preserve">Tests voor het werkgevernummer per registratie en de datum bij een correctie </w:t>
+              <w:t xml:space="preserve">Tests voor de prijsgrens van 1000 euro, de focus na </w:t>
             </w:r>
             <w:r>
               <w:rPr>
@@ -8386,7 +8364,44 @@
                 <w:sz w:val="14"/>
                 <w:shd w:val="clear" w:color="auto" w:fill="EEF4F2"/>
               </w:rPr>
-              <w:t>+</w:t>
+              <w:t>Registreren</w:t>
+            </w:r>
+            <w:r>
+              <w:rPr>
+                <w:sz w:val="16"/>
+                <w:szCs w:val="16"/>
+              </w:rPr>
+              <w:t>, "niets gewijzigd" bij opslaan, en verouderde formulieren of een gewiste opslag na een wijziging in een ander tabblad. Gebruikt de strenge nep-view (</w:t>
+            </w:r>
+            <w:r>
+              <w:rPr>
+                <w:rFonts w:ascii="Consolas" w:hAnsi="Consolas" w:cs="Consolas"/>
+                <w:sz w:val="14"/>
+                <w:shd w:val="clear" w:color="auto" w:fill="EEF4F2"/>
+              </w:rPr>
+              <w:t>createStrictView</w:t>
+            </w:r>
+            <w:r>
+              <w:rPr>
+                <w:sz w:val="16"/>
+                <w:szCs w:val="16"/>
+              </w:rPr>
+              <w:t xml:space="preserve"> in </w:t>
+            </w:r>
+            <w:r>
+              <w:rPr>
+                <w:rFonts w:ascii="Consolas" w:hAnsi="Consolas" w:cs="Consolas"/>
+                <w:sz w:val="14"/>
+                <w:shd w:val="clear" w:color="auto" w:fill="EEF4F2"/>
+              </w:rPr>
+              <w:t>helpers.js</w:t>
+            </w:r>
+            <w:r>
+              <w:rPr>
+                <w:sz w:val="16"/>
+                <w:szCs w:val="16"/>
+              </w:rPr>
+              <w:t>)</w:t>
             </w:r>
           </w:p>
         </w:tc>
@@ -8409,7 +8424,7 @@
                 <w:sz w:val="14"/>
                 <w:shd w:val="clear" w:color="auto" w:fill="EEF4F2"/>
               </w:rPr>
-              <w:t>tests/to-controle.test.js</w:t>
+              <w:t>tests/werkgever-en-correctiedatum.test.js</w:t>
             </w:r>
           </w:p>
         </w:tc>
@@ -8426,7 +8441,7 @@
                 <w:sz w:val="16"/>
                 <w:szCs w:val="16"/>
               </w:rPr>
-              <w:t xml:space="preserve">Regressietests voor de TO-controle: "1 medewerker"/"2 medewerkers", bevestiging bij product verwijderen, de melding bij een verwijderde medewerker (correctie </w:t>
+              <w:t xml:space="preserve">Tests voor het werkgevernummer per registratie en de datum bij een correctie </w:t>
             </w:r>
             <w:r>
               <w:rPr>
@@ -8435,103 +8450,6 @@
                 <w:shd w:val="clear" w:color="auto" w:fill="EEF4F2"/>
               </w:rPr>
               <w:t>+</w:t>
-            </w:r>
-            <w:r>
-              <w:rPr>
-                <w:sz w:val="16"/>
-                <w:szCs w:val="16"/>
-              </w:rPr>
-              <w:t xml:space="preserve">), alleen een inactieve medewerker zonder registraties verwijderen, uniek werkgevernummer, dubbele id's en datums in de toekomst bij het laden, de apostrof in de CSV, </w:t>
-            </w:r>
-            <w:r>
-              <w:rPr>
-                <w:rFonts w:ascii="Consolas" w:hAnsi="Consolas" w:cs="Consolas"/>
-                <w:sz w:val="14"/>
-                <w:shd w:val="clear" w:color="auto" w:fill="EEF4F2"/>
-              </w:rPr>
-              <w:t>lastRegistration</w:t>
-            </w:r>
-            <w:r>
-              <w:rPr>
-                <w:sz w:val="16"/>
-                <w:szCs w:val="16"/>
-              </w:rPr>
-              <w:t xml:space="preserve"> en </w:t>
-            </w:r>
-            <w:r>
-              <w:rPr>
-                <w:rFonts w:ascii="Consolas" w:hAnsi="Consolas" w:cs="Consolas"/>
-                <w:sz w:val="14"/>
-                <w:shd w:val="clear" w:color="auto" w:fill="EEF4F2"/>
-              </w:rPr>
-              <w:t>pointId</w:t>
-            </w:r>
-            <w:r>
-              <w:rPr>
-                <w:sz w:val="16"/>
-                <w:szCs w:val="16"/>
-              </w:rPr>
-              <w:t>, het SQL-schema (</w:t>
-            </w:r>
-            <w:r>
-              <w:rPr>
-                <w:rFonts w:ascii="Consolas" w:hAnsi="Consolas" w:cs="Consolas"/>
-                <w:sz w:val="14"/>
-                <w:shd w:val="clear" w:color="auto" w:fill="EEF4F2"/>
-              </w:rPr>
-              <w:t>counted_at</w:t>
-            </w:r>
-            <w:r>
-              <w:rPr>
-                <w:sz w:val="16"/>
-                <w:szCs w:val="16"/>
-              </w:rPr>
-              <w:t xml:space="preserve">, geen rol </w:t>
-            </w:r>
-            <w:r>
-              <w:rPr>
-                <w:rFonts w:ascii="Consolas" w:hAnsi="Consolas" w:cs="Consolas"/>
-                <w:sz w:val="14"/>
-                <w:shd w:val="clear" w:color="auto" w:fill="EEF4F2"/>
-              </w:rPr>
-              <w:t>manager</w:t>
-            </w:r>
-            <w:r>
-              <w:rPr>
-                <w:sz w:val="16"/>
-                <w:szCs w:val="16"/>
-              </w:rPr>
-              <w:t xml:space="preserve">), de opslagknoppen bij wijzigen, de filters op een smal scherm en tests voor FR-01, FR-02, FR-04, FR-10 en FR-29 (actieve medewerkers, zoeken op naam, de </w:t>
-            </w:r>
-            <w:r>
-              <w:rPr>
-                <w:rFonts w:ascii="Consolas" w:hAnsi="Consolas" w:cs="Consolas"/>
-                <w:sz w:val="14"/>
-                <w:shd w:val="clear" w:color="auto" w:fill="EEF4F2"/>
-              </w:rPr>
-              <w:t>−</w:t>
-            </w:r>
-            <w:r>
-              <w:rPr>
-                <w:sz w:val="16"/>
-                <w:szCs w:val="16"/>
-              </w:rPr>
-              <w:t xml:space="preserve"> in het productvenster, alle registraties voor de beheerder, geen bedragen of aantallen op de publieke pagina). Verder: "1 product" in de correctielijst, een klik op de medewerkerkaart (FR-32) en het totaal op de knop </w:t>
-            </w:r>
-            <w:r>
-              <w:rPr>
-                <w:rFonts w:ascii="Consolas" w:hAnsi="Consolas" w:cs="Consolas"/>
-                <w:sz w:val="14"/>
-                <w:shd w:val="clear" w:color="auto" w:fill="EEF4F2"/>
-              </w:rPr>
-              <w:t>Registreren</w:t>
-            </w:r>
-            <w:r>
-              <w:rPr>
-                <w:sz w:val="16"/>
-                <w:szCs w:val="16"/>
-              </w:rPr>
-              <w:t xml:space="preserve"> (FR-47)</w:t>
             </w:r>
           </w:p>
         </w:tc>
@@ -8554,7 +8472,7 @@
                 <w:sz w:val="14"/>
                 <w:shd w:val="clear" w:color="auto" w:fill="EEF4F2"/>
               </w:rPr>
-              <w:t>tests/pasjeslezer.test.js</w:t>
+              <w:t>tests/to-controle.test.js</w:t>
             </w:r>
           </w:p>
         </w:tc>
@@ -8571,7 +8489,7 @@
                 <w:sz w:val="16"/>
                 <w:szCs w:val="16"/>
               </w:rPr>
-              <w:t xml:space="preserve">Tests voor herkennen met de pas: wat de </w:t>
+              <w:t xml:space="preserve">Regressietests voor de TO-controle: "1 medewerker"/"2 medewerkers", bevestiging bij product verwijderen, de melding bij een verwijderde medewerker (correctie </w:t>
             </w:r>
             <w:r>
               <w:rPr>
@@ -8579,21 +8497,14 @@
                 <w:sz w:val="14"/>
                 <w:shd w:val="clear" w:color="auto" w:fill="EEF4F2"/>
               </w:rPr>
-              <w:t>BadgeReader</w:t>
+              <w:t>+</w:t>
             </w:r>
             <w:r>
               <w:rPr>
                 <w:sz w:val="16"/>
                 <w:szCs w:val="16"/>
               </w:rPr>
-              <w:t xml:space="preserve"> als scan ziet (Enter, Tab of stilte na de laatste toets, niet bij gewoon typen of een te korte code, wel op een trage tablet), het normaliseren van het pasnummer, het productvenster of de melding na een scan, geen herkenning als er een ander venster open is (met de melding "Sluit eerst het open venster om je pas te gebruiken.", en de Enter van de scan wordt tegengehouden), het zoekveld na een scan, de pas koppelen in het medewerkersformulier (uniek, alleen letters en cijfers, leeg = geen pas), de controle </w:t>
-            </w:r>
-            <w:r>
-              <w:rPr>
-                <w:sz w:val="16"/>
-                <w:szCs w:val="16"/>
-              </w:rPr>
-              <w:t xml:space="preserve">en migratie van </w:t>
+              <w:t xml:space="preserve">), alleen een inactieve medewerker zonder registraties verwijderen, uniek werkgevernummer, dubbele id's en datums in de toekomst bij het laden, de apostrof in de CSV, </w:t>
             </w:r>
             <w:r>
               <w:rPr>
@@ -8601,14 +8512,14 @@
                 <w:sz w:val="14"/>
                 <w:shd w:val="clear" w:color="auto" w:fill="EEF4F2"/>
               </w:rPr>
-              <w:t>badgeId</w:t>
+              <w:t>lastRegistration</w:t>
             </w:r>
             <w:r>
               <w:rPr>
                 <w:sz w:val="16"/>
                 <w:szCs w:val="16"/>
               </w:rPr>
-              <w:t xml:space="preserve"> in </w:t>
+              <w:t xml:space="preserve"> en </w:t>
             </w:r>
             <w:r>
               <w:rPr>
@@ -8616,14 +8527,74 @@
                 <w:sz w:val="14"/>
                 <w:shd w:val="clear" w:color="auto" w:fill="EEF4F2"/>
               </w:rPr>
-              <w:t>DataStore</w:t>
+              <w:t>pointId</w:t>
             </w:r>
             <w:r>
               <w:rPr>
                 <w:sz w:val="16"/>
                 <w:szCs w:val="16"/>
               </w:rPr>
-              <w:t>, en dat het pasnummer niet in de CSV-export of het logboek komt</w:t>
+              <w:t>, het SQL-schema (</w:t>
+            </w:r>
+            <w:r>
+              <w:rPr>
+                <w:rFonts w:ascii="Consolas" w:hAnsi="Consolas" w:cs="Consolas"/>
+                <w:sz w:val="14"/>
+                <w:shd w:val="clear" w:color="auto" w:fill="EEF4F2"/>
+              </w:rPr>
+              <w:t>counted_at</w:t>
+            </w:r>
+            <w:r>
+              <w:rPr>
+                <w:sz w:val="16"/>
+                <w:szCs w:val="16"/>
+              </w:rPr>
+              <w:t xml:space="preserve">, geen rol </w:t>
+            </w:r>
+            <w:r>
+              <w:rPr>
+                <w:rFonts w:ascii="Consolas" w:hAnsi="Consolas" w:cs="Consolas"/>
+                <w:sz w:val="14"/>
+                <w:shd w:val="clear" w:color="auto" w:fill="EEF4F2"/>
+              </w:rPr>
+              <w:t>manager</w:t>
+            </w:r>
+            <w:r>
+              <w:rPr>
+                <w:sz w:val="16"/>
+                <w:szCs w:val="16"/>
+              </w:rPr>
+              <w:t xml:space="preserve">), de opslagknoppen bij wijzigen, de filters op een smal scherm en tests voor FR-01, FR-02, FR-04, FR-10 en FR-29 (actieve medewerkers, zoeken op naam, de </w:t>
+            </w:r>
+            <w:r>
+              <w:rPr>
+                <w:rFonts w:ascii="Consolas" w:hAnsi="Consolas" w:cs="Consolas"/>
+                <w:sz w:val="14"/>
+                <w:shd w:val="clear" w:color="auto" w:fill="EEF4F2"/>
+              </w:rPr>
+              <w:t>−</w:t>
+            </w:r>
+            <w:r>
+              <w:rPr>
+                <w:sz w:val="16"/>
+                <w:szCs w:val="16"/>
+              </w:rPr>
+              <w:t xml:space="preserve"> in het productvenster, alle registraties voor de beheerder, geen bedragen of aantallen op de publieke pagina). Verder: "1 product" in de correctielijst, een klik op de medewerkerkaart (FR-32) en het totaal op de knop </w:t>
+            </w:r>
+            <w:r>
+              <w:rPr>
+                <w:rFonts w:ascii="Consolas" w:hAnsi="Consolas" w:cs="Consolas"/>
+                <w:sz w:val="14"/>
+                <w:shd w:val="clear" w:color="auto" w:fill="EEF4F2"/>
+              </w:rPr>
+              <w:t>Registreren</w:t>
+            </w:r>
+            <w:r>
+              <w:rPr>
+                <w:sz w:val="16"/>
+                <w:szCs w:val="16"/>
+              </w:rPr>
+              <w:t xml:space="preserve"> (FR-47)</w:t>
             </w:r>
           </w:p>
         </w:tc>
@@ -8646,7 +8617,7 @@
                 <w:sz w:val="14"/>
                 <w:shd w:val="clear" w:color="auto" w:fill="EEF4F2"/>
               </w:rPr>
-              <w:t>tests/beveiligingsscan.test.js</w:t>
+              <w:t>tests/pasjeslezer.test.js</w:t>
             </w:r>
           </w:p>
         </w:tc>
@@ -8663,7 +8634,7 @@
                 <w:sz w:val="16"/>
                 <w:szCs w:val="16"/>
               </w:rPr>
-              <w:t xml:space="preserve">Regressietests voor de beveiligingsscan: beheeracties doen niets zonder ingelogde beheerder, product-id's als </w:t>
+              <w:t xml:space="preserve">Tests voor herkennen met de pas: wat de </w:t>
             </w:r>
             <w:r>
               <w:rPr>
@@ -8671,14 +8642,21 @@
                 <w:sz w:val="14"/>
                 <w:shd w:val="clear" w:color="auto" w:fill="EEF4F2"/>
               </w:rPr>
-              <w:t>__proto__</w:t>
+              <w:t>BadgeReader</w:t>
             </w:r>
             <w:r>
               <w:rPr>
                 <w:sz w:val="16"/>
                 <w:szCs w:val="16"/>
               </w:rPr>
-              <w:t xml:space="preserve">, </w:t>
+              <w:t xml:space="preserve"> als scan ziet (Enter, Tab of stilte na de laatste toets, niet bij gewoon typen of een te korte code, wel op een trage tablet), het normaliseren van het pasnummer, het productvenster of de melding na een scan, geen herkenning als er een ander venster open is (met de melding "Sluit eerst het open venster om je pas te gebruiken.", en de Enter van de scan wordt tegengehouden), het zoekveld na een scan, de pas koppelen in het medewerkersformulier (uniek, alleen letters en cijfers, leeg = geen pas), de controle </w:t>
+            </w:r>
+            <w:r>
+              <w:rPr>
+                <w:sz w:val="16"/>
+                <w:szCs w:val="16"/>
+              </w:rPr>
+              <w:t xml:space="preserve">en migratie van </w:t>
             </w:r>
             <w:r>
               <w:rPr>
@@ -8686,14 +8664,14 @@
                 <w:sz w:val="14"/>
                 <w:shd w:val="clear" w:color="auto" w:fill="EEF4F2"/>
               </w:rPr>
-              <w:t>constructor</w:t>
+              <w:t>badgeId</w:t>
             </w:r>
             <w:r>
               <w:rPr>
                 <w:sz w:val="16"/>
                 <w:szCs w:val="16"/>
               </w:rPr>
-              <w:t xml:space="preserve"> en </w:t>
+              <w:t xml:space="preserve"> in </w:t>
             </w:r>
             <w:r>
               <w:rPr>
@@ -8701,14 +8679,14 @@
                 <w:sz w:val="14"/>
                 <w:shd w:val="clear" w:color="auto" w:fill="EEF4F2"/>
               </w:rPr>
-              <w:t>toString</w:t>
+              <w:t>DataStore</w:t>
             </w:r>
             <w:r>
               <w:rPr>
                 <w:sz w:val="16"/>
                 <w:szCs w:val="16"/>
               </w:rPr>
-              <w:t xml:space="preserve"> in de voorraadlijst, de camera die uitgaat na de tijdslimiet, de strengere controle van codes en tijdstippen bij het laden, de Node.js-versie van de CI, het alleen-toevoegen-logboek in het SQL-schema en de licentie van TensorFlow.js</w:t>
+              <w:t>, en dat het pasnummer niet in de CSV-export of het logboek komt</w:t>
             </w:r>
           </w:p>
         </w:tc>
@@ -8731,7 +8709,7 @@
                 <w:sz w:val="14"/>
                 <w:shd w:val="clear" w:color="auto" w:fill="EEF4F2"/>
               </w:rPr>
-              <w:t>tests/avg-toets.test.js</w:t>
+              <w:t>tests/beveiligingsscan.test.js</w:t>
             </w:r>
           </w:p>
         </w:tc>
@@ -8748,7 +8726,52 @@
                 <w:sz w:val="16"/>
                 <w:szCs w:val="16"/>
               </w:rPr>
-              <w:t>Tests voor de aanpassingen uit de AVG-toets: automatisch uitloggen van de beheerder na 5 minuten zonder invoer (met een nep-klok: net onder en precies op 5 minuten, iedere invoer begint opnieuw, open beheerformulieren gaan dicht, de melding en de timer van 10 seconden) en de uitleg over de inhouding op het loon in het productvenster</w:t>
+              <w:t xml:space="preserve">Regressietests voor de beveiligingsscan: beheeracties doen niets zonder ingelogde beheerder, product-id's als </w:t>
+            </w:r>
+            <w:r>
+              <w:rPr>
+                <w:rFonts w:ascii="Consolas" w:hAnsi="Consolas" w:cs="Consolas"/>
+                <w:sz w:val="14"/>
+                <w:shd w:val="clear" w:color="auto" w:fill="EEF4F2"/>
+              </w:rPr>
+              <w:t>__proto__</w:t>
+            </w:r>
+            <w:r>
+              <w:rPr>
+                <w:sz w:val="16"/>
+                <w:szCs w:val="16"/>
+              </w:rPr>
+              <w:t xml:space="preserve">, </w:t>
+            </w:r>
+            <w:r>
+              <w:rPr>
+                <w:rFonts w:ascii="Consolas" w:hAnsi="Consolas" w:cs="Consolas"/>
+                <w:sz w:val="14"/>
+                <w:shd w:val="clear" w:color="auto" w:fill="EEF4F2"/>
+              </w:rPr>
+              <w:t>constructor</w:t>
+            </w:r>
+            <w:r>
+              <w:rPr>
+                <w:sz w:val="16"/>
+                <w:szCs w:val="16"/>
+              </w:rPr>
+              <w:t xml:space="preserve"> en </w:t>
+            </w:r>
+            <w:r>
+              <w:rPr>
+                <w:rFonts w:ascii="Consolas" w:hAnsi="Consolas" w:cs="Consolas"/>
+                <w:sz w:val="14"/>
+                <w:shd w:val="clear" w:color="auto" w:fill="EEF4F2"/>
+              </w:rPr>
+              <w:t>toString</w:t>
+            </w:r>
+            <w:r>
+              <w:rPr>
+                <w:sz w:val="16"/>
+                <w:szCs w:val="16"/>
+              </w:rPr>
+              <w:t xml:space="preserve"> in de voorraadlijst, de camera die uitgaat na de tijdslimiet, de strengere controle van codes en tijdstippen bij het laden, de Node.js-versie van de CI, het alleen-toevoegen-logboek in het SQL-schema en de licentie van TensorFlow.js</w:t>
             </w:r>
           </w:p>
         </w:tc>
@@ -8771,7 +8794,7 @@
                 <w:sz w:val="14"/>
                 <w:shd w:val="clear" w:color="auto" w:fill="EEF4F2"/>
               </w:rPr>
-              <w:t>tests/ux-review.test.js</w:t>
+              <w:t>tests/avg-toets.test.js</w:t>
             </w:r>
           </w:p>
         </w:tc>
@@ -8788,37 +8811,7 @@
                 <w:sz w:val="16"/>
                 <w:szCs w:val="16"/>
               </w:rPr>
-              <w:t xml:space="preserve">Tests voor de verbeteringen uit de UX-review van oktober 2026 (UX 1 t/m UX 12 in de naam van iedere test, daarna 13 en 14): het productvenster dat na 75 seconden vanzelf sluit (met een nep-klok, de waarschuwing en iedere invoer die opnieuw begint), een pas terwijl een venster open is, de knopbalk met </w:t>
-            </w:r>
-            <w:r>
-              <w:rPr>
-                <w:rFonts w:ascii="Consolas" w:hAnsi="Consolas" w:cs="Consolas"/>
-                <w:sz w:val="14"/>
-                <w:shd w:val="clear" w:color="auto" w:fill="EEF4F2"/>
-              </w:rPr>
-              <w:t>Registreren</w:t>
-            </w:r>
-            <w:r>
-              <w:rPr>
-                <w:sz w:val="16"/>
-                <w:szCs w:val="16"/>
-              </w:rPr>
-              <w:t xml:space="preserve">, zoekveld en bedrijfsfilter leeg na registreren, de compacte banner, de pashint, de opmaak van een gekozen product, de grootte van knoppen, de statusregel en de meldingsregio's voor schermlezers, de leesbaarheid, de nieuwe teksten, </w:t>
-            </w:r>
-            <w:r>
-              <w:rPr>
-                <w:rFonts w:ascii="Consolas" w:hAnsi="Consolas" w:cs="Consolas"/>
-                <w:sz w:val="14"/>
-                <w:shd w:val="clear" w:color="auto" w:fill="EEF4F2"/>
-              </w:rPr>
-              <w:t>Registreren</w:t>
-            </w:r>
-            <w:r>
-              <w:rPr>
-                <w:sz w:val="16"/>
-                <w:szCs w:val="16"/>
-              </w:rPr>
-              <w:t xml:space="preserve"> zonder keuze, een productvenster zonder producten zonder knopbalk en loonregel (13) en vensters die altijd bovenaan openen (14)</w:t>
+              <w:t>Tests voor de aanpassingen uit de AVG-toets: automatisch uitloggen van de beheerder na 5 minuten zonder invoer (met een nep-klok: net onder en precies op 5 minuten, iedere invoer begint opnieuw, open beheerformulieren gaan dicht, de melding en de timer van 10 seconden) en de uitleg over de inhouding op het loon in het productvenster</w:t>
             </w:r>
           </w:p>
         </w:tc>
@@ -8841,7 +8834,7 @@
                 <w:sz w:val="14"/>
                 <w:shd w:val="clear" w:color="auto" w:fill="EEF4F2"/>
               </w:rPr>
-              <w:t>tests/review-oktober.test.js</w:t>
+              <w:t>tests/ux-review.test.js</w:t>
             </w:r>
           </w:p>
         </w:tc>
@@ -8858,7 +8851,7 @@
                 <w:sz w:val="16"/>
                 <w:szCs w:val="16"/>
               </w:rPr>
-              <w:t xml:space="preserve">Regressietests voor de review van oktober 2026 (D1 t/m D7, U1 t/m U7, R1 t/m R3 in de naam van iedere test): beschadigde lijsten en volle opslag, dubbele passen, niet-bestaande datums, pasnummers gelijk maken, mislukt wissen, gezichtsherkenning alleen met actieve medewerkers, een scan in het veld </w:t>
+              <w:t xml:space="preserve">Tests voor de verbeteringen uit de UX-review van oktober 2026 (UX 1 t/m UX 12 in de naam van iedere test, daarna 13 en 14): het productvenster dat na 75 seconden vanzelf sluit (met een nep-klok, de waarschuwing en iedere invoer die opnieuw begint), een pas terwijl een venster open is, de knopbalk met </w:t>
             </w:r>
             <w:r>
               <w:rPr>
@@ -8866,14 +8859,14 @@
                 <w:sz w:val="14"/>
                 <w:shd w:val="clear" w:color="auto" w:fill="EEF4F2"/>
               </w:rPr>
-              <w:t>Pasnummer</w:t>
+              <w:t>Registreren</w:t>
             </w:r>
             <w:r>
               <w:rPr>
                 <w:sz w:val="16"/>
                 <w:szCs w:val="16"/>
               </w:rPr>
-              <w:t xml:space="preserve"> en in het bedrijfsfilter, dubbelklik op </w:t>
+              <w:t xml:space="preserve">, zoekveld en bedrijfsfilter leeg na registreren, de compacte banner, de pashint, de opmaak van een gekozen product, de grootte van knoppen, de statusregel en de meldingsregio's voor schermlezers, de leesbaarheid, de nieuwe teksten, </w:t>
             </w:r>
             <w:r>
               <w:rPr>
@@ -8888,7 +8881,7 @@
                 <w:sz w:val="16"/>
                 <w:szCs w:val="16"/>
               </w:rPr>
-              <w:t>, een ingedrukt gehouden Enter, de focus na opslaan en (de)activeren, het datumveld na middernacht, toegankelijkheid (live region, tabbladen, bedrijfsfilter) en de cijfervelden</w:t>
+              <w:t xml:space="preserve"> zonder keuze, een productvenster zonder producten zonder knopbalk en loonregel (13) en vensters die altijd bovenaan openen (14)</w:t>
             </w:r>
           </w:p>
         </w:tc>
@@ -8911,7 +8904,7 @@
                 <w:sz w:val="14"/>
                 <w:shd w:val="clear" w:color="auto" w:fill="EEF4F2"/>
               </w:rPr>
-              <w:t>tests/rollenspel-oktober.test.js</w:t>
+              <w:t>tests/review-oktober.test.js</w:t>
             </w:r>
           </w:p>
         </w:tc>
@@ -8928,7 +8921,7 @@
                 <w:sz w:val="16"/>
                 <w:szCs w:val="16"/>
               </w:rPr>
-              <w:t xml:space="preserve">Regressietests voor de fouten uit de rollenspeltests en de FMEA van oktober 2026 (punt 1 t/m 14 in de naam van iedere test): zoekveld leeg na sluiten zonder registreren, geen spookklik na een dubbeltik op </w:t>
+              <w:t xml:space="preserve">Regressietests voor de review van oktober 2026 (D1 t/m D7, U1 t/m U7, R1 t/m R3 in de naam van iedere test): beschadigde lijsten en volle opslag, dubbele passen, niet-bestaande datums, pasnummers gelijk maken, mislukt wissen, gezichtsherkenning alleen met actieve medewerkers, een scan in het veld </w:t>
             </w:r>
             <w:r>
               <w:rPr>
@@ -8936,14 +8929,29 @@
                 <w:sz w:val="14"/>
                 <w:shd w:val="clear" w:color="auto" w:fill="EEF4F2"/>
               </w:rPr>
-              <w:t>Deur dicht</w:t>
+              <w:t>Pasnummer</w:t>
             </w:r>
             <w:r>
               <w:rPr>
                 <w:sz w:val="16"/>
                 <w:szCs w:val="16"/>
               </w:rPr>
-              <w:t>, de naam in de open koelkast en "Controle nodig" bij de pas van een collega, twee tabbladen op één opslag, de weging met het gemeten gemiddelde gewicht (eieren en blikjes), verwacht en geteld bij een telling, oude en nieuwe waarden in het logboek, de lege demokeuze, tikdoelen en hover, voorraad 0, negatieve getallen in de CSV, het SQL-schema en teksten in het TO</w:t>
+              <w:t xml:space="preserve"> en in het bedrijfsfilter, dubbelklik op </w:t>
+            </w:r>
+            <w:r>
+              <w:rPr>
+                <w:rFonts w:ascii="Consolas" w:hAnsi="Consolas" w:cs="Consolas"/>
+                <w:sz w:val="14"/>
+                <w:shd w:val="clear" w:color="auto" w:fill="EEF4F2"/>
+              </w:rPr>
+              <w:t>Registreren</w:t>
+            </w:r>
+            <w:r>
+              <w:rPr>
+                <w:sz w:val="16"/>
+                <w:szCs w:val="16"/>
+              </w:rPr>
+              <w:t>, een ingedrukt gehouden Enter, de focus na opslaan en (de)activeren, het datumveld na middernacht, toegankelijkheid (live region, tabbladen, bedrijfsfilter) en de cijfervelden</w:t>
             </w:r>
           </w:p>
         </w:tc>
@@ -8966,7 +8974,7 @@
                 <w:sz w:val="14"/>
                 <w:shd w:val="clear" w:color="auto" w:fill="EEF4F2"/>
               </w:rPr>
-              <w:t>.gitattributes</w:t>
+              <w:t>tests/rollenspel-oktober.test.js</w:t>
             </w:r>
           </w:p>
         </w:tc>
@@ -8983,7 +8991,7 @@
                 <w:sz w:val="16"/>
                 <w:szCs w:val="16"/>
               </w:rPr>
-              <w:t xml:space="preserve">Zorgt dat Git de bestanden in </w:t>
+              <w:t xml:space="preserve">Regressietests voor de fouten uit de rollenspeltests en de FMEA van oktober 2026 (punt 1 t/m 14 in de naam van iedere test): zoekveld leeg na sluiten zonder registreren, geen spookklik na een dubbeltik op </w:t>
             </w:r>
             <w:r>
               <w:rPr>
@@ -8991,29 +8999,14 @@
                 <w:sz w:val="14"/>
                 <w:shd w:val="clear" w:color="auto" w:fill="EEF4F2"/>
               </w:rPr>
-              <w:t>assets/vendor/</w:t>
+              <w:t>Deur dicht</w:t>
             </w:r>
             <w:r>
               <w:rPr>
                 <w:sz w:val="16"/>
                 <w:szCs w:val="16"/>
               </w:rPr>
-              <w:t xml:space="preserve"> en </w:t>
-            </w:r>
-            <w:r>
-              <w:rPr>
-                <w:rFonts w:ascii="Consolas" w:hAnsi="Consolas" w:cs="Consolas"/>
-                <w:sz w:val="14"/>
-                <w:shd w:val="clear" w:color="auto" w:fill="EEF4F2"/>
-              </w:rPr>
-              <w:t>assets/fonts/</w:t>
-            </w:r>
-            <w:r>
-              <w:rPr>
-                <w:sz w:val="16"/>
-                <w:szCs w:val="16"/>
-              </w:rPr>
-              <w:t xml:space="preserve"> niet aanpast (geen omzetting van regeleinden), zodat de controlegetallen blijven kloppen</w:t>
+              <w:t>, de naam in de open koelkast en "Controle nodig" bij de pas van een collega, twee tabbladen op één opslag, de weging met het gemeten gemiddelde gewicht (eieren en blikjes), verwacht en geteld bij een telling, oude en nieuwe waarden in het logboek, de lege demokeuze, tikdoelen en hover, voorraad 0, negatieve getallen in de CSV, het SQL-schema en teksten in het TO</w:t>
             </w:r>
           </w:p>
         </w:tc>
@@ -9036,7 +9029,7 @@
                 <w:sz w:val="14"/>
                 <w:shd w:val="clear" w:color="auto" w:fill="EEF4F2"/>
               </w:rPr>
-              <w:t>tests/e2e/</w:t>
+              <w:t>.gitattributes</w:t>
             </w:r>
           </w:p>
         </w:tc>
@@ -9053,7 +9046,7 @@
                 <w:sz w:val="16"/>
                 <w:szCs w:val="16"/>
               </w:rPr>
-              <w:t xml:space="preserve">Browsertests (end-to-end): </w:t>
+              <w:t xml:space="preserve">Zorgt dat Git de bestanden in </w:t>
             </w:r>
             <w:r>
               <w:rPr>
@@ -9061,14 +9054,14 @@
                 <w:sz w:val="14"/>
                 <w:shd w:val="clear" w:color="auto" w:fill="EEF4F2"/>
               </w:rPr>
-              <w:t>app.e2e.test.js</w:t>
+              <w:t>assets/vendor/</w:t>
             </w:r>
             <w:r>
               <w:rPr>
                 <w:sz w:val="16"/>
                 <w:szCs w:val="16"/>
               </w:rPr>
-              <w:t xml:space="preserve"> test de echte pagina in headless Edge of Chrome (30 tests: laden zonder fouten, zoeken, registreren (daarna bij kiezen op naam geen "welkom terug"), </w:t>
+              <w:t xml:space="preserve"> en </w:t>
             </w:r>
             <w:r>
               <w:rPr>
@@ -9076,127 +9069,14 @@
                 <w:sz w:val="14"/>
                 <w:shd w:val="clear" w:color="auto" w:fill="EEF4F2"/>
               </w:rPr>
-              <w:t>Registreren</w:t>
+              <w:t>assets/fonts/</w:t>
             </w:r>
             <w:r>
               <w:rPr>
                 <w:sz w:val="16"/>
                 <w:szCs w:val="16"/>
               </w:rPr>
-              <w:t xml:space="preserve"> zonder keuze, Escape en focus, inloggen, thema, pas koppelen en herkennen (ook een tweede scan in het veld </w:t>
-            </w:r>
-            <w:r>
-              <w:rPr>
-                <w:rFonts w:ascii="Consolas" w:hAnsi="Consolas" w:cs="Consolas"/>
-                <w:sz w:val="14"/>
-                <w:shd w:val="clear" w:color="auto" w:fill="EEF4F2"/>
-              </w:rPr>
-              <w:t>Pasnummer</w:t>
-            </w:r>
-            <w:r>
-              <w:rPr>
-                <w:sz w:val="16"/>
-                <w:szCs w:val="16"/>
-              </w:rPr>
-              <w:t xml:space="preserve">), CSV-export, een dubbelklik op </w:t>
-            </w:r>
-            <w:r>
-              <w:rPr>
-                <w:rFonts w:ascii="Consolas" w:hAnsi="Consolas" w:cs="Consolas"/>
-                <w:sz w:val="14"/>
-                <w:shd w:val="clear" w:color="auto" w:fill="EEF4F2"/>
-              </w:rPr>
-              <w:t>Registreren</w:t>
-            </w:r>
-            <w:r>
-              <w:rPr>
-                <w:sz w:val="16"/>
-                <w:szCs w:val="16"/>
-              </w:rPr>
-              <w:t xml:space="preserve">, een scan in het bedrijfsfilter, de focus na opslaan en (de)activeren in het beheer, letters in een cijferveld, het productvenster dat vanzelf sluit, een pas terwijl een venster open is, </w:t>
-            </w:r>
-            <w:r>
-              <w:rPr>
-                <w:rFonts w:ascii="Consolas" w:hAnsi="Consolas" w:cs="Consolas"/>
-                <w:sz w:val="14"/>
-                <w:shd w:val="clear" w:color="auto" w:fill="EEF4F2"/>
-              </w:rPr>
-              <w:t>Registreren</w:t>
-            </w:r>
-            <w:r>
-              <w:rPr>
-                <w:sz w:val="16"/>
-                <w:szCs w:val="16"/>
-              </w:rPr>
-              <w:t xml:space="preserve"> in beeld op een liggende tablet, een telefoon en bij 200% zoom, een leeg zoekveld na registreren, een productvenster zonder producten, vensters die bovenaan openen, de slimme koelkast: openen met de pas, twee blikjes pakken en de registratie terugzien, en een onbekende pas, en de rollenspeltests van oktober 2026: een leeg zoekveld na sluiten zonder registreren, een dubbeltik op </w:t>
-            </w:r>
-            <w:r>
-              <w:rPr>
-                <w:rFonts w:ascii="Consolas" w:hAnsi="Consolas" w:cs="Consolas"/>
-                <w:sz w:val="14"/>
-                <w:shd w:val="clear" w:color="auto" w:fill="EEF4F2"/>
-              </w:rPr>
-              <w:t>Deur dicht</w:t>
-            </w:r>
-            <w:r>
-              <w:rPr>
-                <w:sz w:val="16"/>
-                <w:szCs w:val="16"/>
-              </w:rPr>
-              <w:t xml:space="preserve">, de naam in de open koelkast met de pas van een collega, een opslag van een ander tabblad die niet wordt overschreven en de lege demokeuze, en sinds versie 3.17 de standby (dimmen, een tik wekt zonder klik-door, een toets wekt), een passcan in standby die de koelkast opent en de vraag na een passcan met een nagebootste camera), </w:t>
-            </w:r>
-            <w:r>
-              <w:rPr>
-                <w:rFonts w:ascii="Consolas" w:hAnsi="Consolas" w:cs="Consolas"/>
-                <w:sz w:val="14"/>
-                <w:shd w:val="clear" w:color="auto" w:fill="EEF4F2"/>
-              </w:rPr>
-              <w:t>browser.js</w:t>
-            </w:r>
-            <w:r>
-              <w:rPr>
-                <w:sz w:val="16"/>
-                <w:szCs w:val="16"/>
-              </w:rPr>
-              <w:t xml:space="preserve"> bevat de webserver en de besturing van de browser via het Chrome DevTools Protocol. Er wordt pas geklikt als het element stilstaat. Bij een mislukte test volgen het scenario, de toestand van de pagina, de laatste meldingen uit de console en een schermafdruk in </w:t>
-            </w:r>
-            <w:r>
-              <w:rPr>
-                <w:rFonts w:ascii="Consolas" w:hAnsi="Consolas" w:cs="Consolas"/>
-                <w:sz w:val="14"/>
-                <w:shd w:val="clear" w:color="auto" w:fill="EEF4F2"/>
-              </w:rPr>
-              <w:t>test-results/e2e</w:t>
-            </w:r>
-            <w:r>
-              <w:rPr>
-                <w:sz w:val="16"/>
-                <w:szCs w:val="16"/>
-              </w:rPr>
-              <w:t xml:space="preserve">. Draaien met </w:t>
-            </w:r>
-            <w:r>
-              <w:rPr>
-                <w:rFonts w:ascii="Consolas" w:hAnsi="Consolas" w:cs="Consolas"/>
-                <w:sz w:val="14"/>
-                <w:shd w:val="clear" w:color="auto" w:fill="EEF4F2"/>
-              </w:rPr>
-              <w:t>npm run test:e2e</w:t>
-            </w:r>
-            <w:r>
-              <w:rPr>
-                <w:sz w:val="16"/>
-                <w:szCs w:val="16"/>
-              </w:rPr>
-              <w:t xml:space="preserve">, zonder npm-pakketten. Een andere browser kies je met </w:t>
-            </w:r>
-            <w:r>
-              <w:rPr>
-                <w:rFonts w:ascii="Consolas" w:hAnsi="Consolas" w:cs="Consolas"/>
-                <w:sz w:val="14"/>
-                <w:shd w:val="clear" w:color="auto" w:fill="EEF4F2"/>
-              </w:rPr>
-              <w:t>BROWSER_PATH</w:t>
+              <w:t xml:space="preserve"> niet aanpast (geen omzetting van regeleinden), zodat de controlegetallen blijven kloppen</w:t>
             </w:r>
           </w:p>
         </w:tc>
@@ -9219,7 +9099,7 @@
                 <w:sz w:val="14"/>
                 <w:shd w:val="clear" w:color="auto" w:fill="EEF4F2"/>
               </w:rPr>
-              <w:t>.github/workflows/ci.yml</w:t>
+              <w:t>tests/e2e/</w:t>
             </w:r>
           </w:p>
         </w:tc>
@@ -9236,6 +9116,189 @@
                 <w:sz w:val="16"/>
                 <w:szCs w:val="16"/>
               </w:rPr>
+              <w:t xml:space="preserve">Browsertests (end-to-end): </w:t>
+            </w:r>
+            <w:r>
+              <w:rPr>
+                <w:rFonts w:ascii="Consolas" w:hAnsi="Consolas" w:cs="Consolas"/>
+                <w:sz w:val="14"/>
+                <w:shd w:val="clear" w:color="auto" w:fill="EEF4F2"/>
+              </w:rPr>
+              <w:t>app.e2e.test.js</w:t>
+            </w:r>
+            <w:r>
+              <w:rPr>
+                <w:sz w:val="16"/>
+                <w:szCs w:val="16"/>
+              </w:rPr>
+              <w:t xml:space="preserve"> test de echte pagina in headless Edge of Chrome (31 tests: laden zonder fouten, zoeken, registreren (daarna bij kiezen op naam geen "welkom terug"), </w:t>
+            </w:r>
+            <w:r>
+              <w:rPr>
+                <w:rFonts w:ascii="Consolas" w:hAnsi="Consolas" w:cs="Consolas"/>
+                <w:sz w:val="14"/>
+                <w:shd w:val="clear" w:color="auto" w:fill="EEF4F2"/>
+              </w:rPr>
+              <w:t>Registreren</w:t>
+            </w:r>
+            <w:r>
+              <w:rPr>
+                <w:sz w:val="16"/>
+                <w:szCs w:val="16"/>
+              </w:rPr>
+              <w:t xml:space="preserve"> zonder keuze, Escape en focus, inloggen, thema, pas koppelen en herkennen (ook een tweede scan in het veld </w:t>
+            </w:r>
+            <w:r>
+              <w:rPr>
+                <w:rFonts w:ascii="Consolas" w:hAnsi="Consolas" w:cs="Consolas"/>
+                <w:sz w:val="14"/>
+                <w:shd w:val="clear" w:color="auto" w:fill="EEF4F2"/>
+              </w:rPr>
+              <w:t>Pasnummer</w:t>
+            </w:r>
+            <w:r>
+              <w:rPr>
+                <w:sz w:val="16"/>
+                <w:szCs w:val="16"/>
+              </w:rPr>
+              <w:t xml:space="preserve">), CSV-export, een dubbelklik op </w:t>
+            </w:r>
+            <w:r>
+              <w:rPr>
+                <w:rFonts w:ascii="Consolas" w:hAnsi="Consolas" w:cs="Consolas"/>
+                <w:sz w:val="14"/>
+                <w:shd w:val="clear" w:color="auto" w:fill="EEF4F2"/>
+              </w:rPr>
+              <w:t>Registreren</w:t>
+            </w:r>
+            <w:r>
+              <w:rPr>
+                <w:sz w:val="16"/>
+                <w:szCs w:val="16"/>
+              </w:rPr>
+              <w:t xml:space="preserve">, een scan in het bedrijfsfilter, de focus na opslaan en (de)activeren in het beheer, letters in een cijferveld, het productvenster dat vanzelf sluit, een pas terwijl een venster open is, </w:t>
+            </w:r>
+            <w:r>
+              <w:rPr>
+                <w:rFonts w:ascii="Consolas" w:hAnsi="Consolas" w:cs="Consolas"/>
+                <w:sz w:val="14"/>
+                <w:shd w:val="clear" w:color="auto" w:fill="EEF4F2"/>
+              </w:rPr>
+              <w:t>Registreren</w:t>
+            </w:r>
+            <w:r>
+              <w:rPr>
+                <w:sz w:val="16"/>
+                <w:szCs w:val="16"/>
+              </w:rPr>
+              <w:t xml:space="preserve"> in beeld op een liggende tablet, een telefoon en bij 200% zoom, een leeg zoekveld na registreren, een productvenster zonder producten, vensters die bovenaan openen, de slimme koelkast: openen met de pas, twee blikjes pakken en de registratie terugzien, en een onbekende pas, en de rollenspeltests van oktober 2026: een leeg zoekveld na sluiten zonder registreren, een dubbeltik op </w:t>
+            </w:r>
+            <w:r>
+              <w:rPr>
+                <w:rFonts w:ascii="Consolas" w:hAnsi="Consolas" w:cs="Consolas"/>
+                <w:sz w:val="14"/>
+                <w:shd w:val="clear" w:color="auto" w:fill="EEF4F2"/>
+              </w:rPr>
+              <w:t>Deur dicht</w:t>
+            </w:r>
+            <w:r>
+              <w:rPr>
+                <w:sz w:val="16"/>
+                <w:szCs w:val="16"/>
+              </w:rPr>
+              <w:t xml:space="preserve">, de naam in de open koelkast met de pas van een collega, een opslag van een ander tabblad die niet wordt overschreven en de lege demokeuze, en sinds versie 3.17 de standby (dimmen, een tik wekt zonder klik-door, een toets wekt), een passcan in standby die de koelkast opent, de vraag na een passcan met een nagebootste camera, en sinds versie 3.19 een pas in het inlogvenster en een zoekveld van het beheer zonder achtergebleven pasnummer en "Aantal" dat past in het leveringsveld op een staande tablet), </w:t>
+            </w:r>
+            <w:r>
+              <w:rPr>
+                <w:rFonts w:ascii="Consolas" w:hAnsi="Consolas" w:cs="Consolas"/>
+                <w:sz w:val="14"/>
+                <w:shd w:val="clear" w:color="auto" w:fill="EEF4F2"/>
+              </w:rPr>
+              <w:t>browser.js</w:t>
+            </w:r>
+            <w:r>
+              <w:rPr>
+                <w:sz w:val="16"/>
+                <w:szCs w:val="16"/>
+              </w:rPr>
+              <w:t xml:space="preserve"> bevat de webserver en de besturing van de browser via het Chrome DevTools Protocol. Er wordt pas geklikt als het element stilstaat. Bij een mislukte test volgen het scenario, de toestand van de pagina, de laatste meldingen uit de console en een schermafdruk in </w:t>
+            </w:r>
+            <w:r>
+              <w:rPr>
+                <w:rFonts w:ascii="Consolas" w:hAnsi="Consolas" w:cs="Consolas"/>
+                <w:sz w:val="14"/>
+                <w:shd w:val="clear" w:color="auto" w:fill="EEF4F2"/>
+              </w:rPr>
+              <w:t>test-results/e2e</w:t>
+            </w:r>
+            <w:r>
+              <w:rPr>
+                <w:sz w:val="16"/>
+                <w:szCs w:val="16"/>
+              </w:rPr>
+              <w:t xml:space="preserve">. Draaien met </w:t>
+            </w:r>
+            <w:r>
+              <w:rPr>
+                <w:rFonts w:ascii="Consolas" w:hAnsi="Consolas" w:cs="Consolas"/>
+                <w:sz w:val="14"/>
+                <w:shd w:val="clear" w:color="auto" w:fill="EEF4F2"/>
+              </w:rPr>
+              <w:t>npm run test:e2e</w:t>
+            </w:r>
+            <w:r>
+              <w:rPr>
+                <w:sz w:val="16"/>
+                <w:szCs w:val="16"/>
+              </w:rPr>
+              <w:t xml:space="preserve">, zonder npm-pakketten. Een andere browser kies je met </w:t>
+            </w:r>
+            <w:r>
+              <w:rPr>
+                <w:rFonts w:ascii="Consolas" w:hAnsi="Consolas" w:cs="Consolas"/>
+                <w:sz w:val="14"/>
+                <w:shd w:val="clear" w:color="auto" w:fill="EEF4F2"/>
+              </w:rPr>
+              <w:t>BROWSER_PATH</w:t>
+            </w:r>
+          </w:p>
+        </w:tc>
+      </w:tr>
+      <w:tr>
+        <w:trPr>
+          <w:cantSplit/>
+        </w:trPr>
+        <w:tc>
+          <w:tcPr>
+            <w:tcW w:w="4337" w:type="dxa"/>
+          </w:tcPr>
+          <w:p>
+            <w:pPr>
+              <w:spacing w:before="20" w:after="20" w:line="240" w:lineRule="auto"/>
+            </w:pPr>
+            <w:r>
+              <w:rPr>
+                <w:rFonts w:ascii="Consolas" w:hAnsi="Consolas" w:cs="Consolas"/>
+                <w:sz w:val="14"/>
+                <w:shd w:val="clear" w:color="auto" w:fill="EEF4F2"/>
+              </w:rPr>
+              <w:t>.github/workflows/ci.yml</w:t>
+            </w:r>
+          </w:p>
+        </w:tc>
+        <w:tc>
+          <w:tcPr>
+            <w:tcW w:w="5301" w:type="dxa"/>
+          </w:tcPr>
+          <w:p>
+            <w:pPr>
+              <w:spacing w:before="20" w:after="20" w:line="240" w:lineRule="auto"/>
+            </w:pPr>
+            <w:r>
+              <w:rPr>
+                <w:sz w:val="16"/>
+                <w:szCs w:val="16"/>
+              </w:rPr>
               <w:t>Voert de unit tests en daarna de browsertests (in Google Chrome) automatisch uit op GitHub met Node.js 24 (LTS), met alleen leesrechten en actions die op een commit-SHA zijn vastgezet</w:t>
             </w:r>
           </w:p>
@@ -9277,7 +9340,7 @@
         </w:numPr>
       </w:pPr>
       <w:bookmarkStart w:id="5" w:name="k3"/>
-      <w:bookmarkStart w:id="6" w:name="_Toc243475696"/>
+      <w:bookmarkStart w:id="6" w:name="_Toc243634052"/>
       <w:r>
         <w:t>DE WEBSITE STARTEN.</w:t>
       </w:r>
@@ -9499,7 +9562,7 @@
         </w:numPr>
       </w:pPr>
       <w:bookmarkStart w:id="7" w:name="k4"/>
-      <w:bookmarkStart w:id="8" w:name="_Toc243475697"/>
+      <w:bookmarkStart w:id="8" w:name="_Toc243634053"/>
       <w:r>
         <w:t>GEBRUIKERSHANDLEIDING.</w:t>
       </w:r>
@@ -9512,7 +9575,7 @@
         <w:keepNext/>
       </w:pPr>
       <w:bookmarkStart w:id="9" w:name="k5"/>
-      <w:bookmarkStart w:id="10" w:name="_Toc243475698"/>
+      <w:bookmarkStart w:id="10" w:name="_Toc243634054"/>
       <w:r>
         <w:t>EEN MEDEWERKER ZOEKEN</w:t>
       </w:r>
@@ -9567,7 +9630,7 @@
         <w:keepNext/>
       </w:pPr>
       <w:bookmarkStart w:id="11" w:name="k6"/>
-      <w:bookmarkStart w:id="12" w:name="_Toc243475699"/>
+      <w:bookmarkStart w:id="12" w:name="_Toc243634055"/>
       <w:r>
         <w:t>EEN PRODUCT REGISTREREN</w:t>
       </w:r>
@@ -9816,7 +9879,7 @@
         <w:keepNext/>
       </w:pPr>
       <w:bookmarkStart w:id="13" w:name="k7"/>
-      <w:bookmarkStart w:id="14" w:name="_Toc243475700"/>
+      <w:bookmarkStart w:id="14" w:name="_Toc243634056"/>
       <w:r>
         <w:t>ADMIN-DASHBOARD OPENEN</w:t>
       </w:r>
@@ -9947,7 +10010,7 @@
         <w:keepNext/>
       </w:pPr>
       <w:bookmarkStart w:id="15" w:name="k8"/>
-      <w:bookmarkStart w:id="16" w:name="_Toc243475701"/>
+      <w:bookmarkStart w:id="16" w:name="_Toc243634057"/>
       <w:r>
         <w:t>REGISTRATIES BEHEREN</w:t>
       </w:r>
@@ -10233,7 +10296,7 @@
         <w:keepNext/>
       </w:pPr>
       <w:bookmarkStart w:id="17" w:name="k9"/>
-      <w:bookmarkStart w:id="18" w:name="_Toc243475702"/>
+      <w:bookmarkStart w:id="18" w:name="_Toc243634058"/>
       <w:r>
         <w:t>MEDEWERKERS BEHEREN</w:t>
       </w:r>
@@ -10567,7 +10630,7 @@
         <w:keepNext/>
       </w:pPr>
       <w:bookmarkStart w:id="19" w:name="k10"/>
-      <w:bookmarkStart w:id="20" w:name="_Toc243475703"/>
+      <w:bookmarkStart w:id="20" w:name="_Toc243634059"/>
       <w:r>
         <w:t>PRODUCTEN BEHEREN</w:t>
       </w:r>
@@ -10695,7 +10758,7 @@
         <w:keepNext/>
       </w:pPr>
       <w:bookmarkStart w:id="21" w:name="k11"/>
-      <w:bookmarkStart w:id="22" w:name="_Toc243475704"/>
+      <w:bookmarkStart w:id="22" w:name="_Toc243634060"/>
       <w:r>
         <w:t>BEDRIJVEN EN CONSUMPTIEPUNTEN BEHEREN</w:t>
       </w:r>
@@ -10858,7 +10921,7 @@
         <w:keepNext/>
       </w:pPr>
       <w:bookmarkStart w:id="23" w:name="k12"/>
-      <w:bookmarkStart w:id="24" w:name="_Toc243475705"/>
+      <w:bookmarkStart w:id="24" w:name="_Toc243634061"/>
       <w:r>
         <w:t>VOORRAAD BEHEREN</w:t>
       </w:r>
@@ -11076,7 +11139,7 @@
         <w:keepNext/>
       </w:pPr>
       <w:bookmarkStart w:id="25" w:name="k13"/>
-      <w:bookmarkStart w:id="26" w:name="_Toc243475706"/>
+      <w:bookmarkStart w:id="26" w:name="_Toc243634062"/>
       <w:r>
         <w:t>LOGBOEK BEKIJKEN</w:t>
       </w:r>
@@ -11116,7 +11179,7 @@
         <w:keepNext/>
       </w:pPr>
       <w:bookmarkStart w:id="27" w:name="k14"/>
-      <w:bookmarkStart w:id="28" w:name="_Toc243475707"/>
+      <w:bookmarkStart w:id="28" w:name="_Toc243634063"/>
       <w:r>
         <w:t>ALLE GEGEVENS WISSEN</w:t>
       </w:r>
@@ -11242,7 +11305,7 @@
         <w:keepNext/>
       </w:pPr>
       <w:bookmarkStart w:id="29" w:name="k15"/>
-      <w:bookmarkStart w:id="30" w:name="_Toc243475708"/>
+      <w:bookmarkStart w:id="30" w:name="_Toc243634064"/>
       <w:r>
         <w:t>MODAL SLUITEN EN UITLOGGEN</w:t>
       </w:r>
@@ -11316,7 +11379,7 @@
         <w:keepNext/>
       </w:pPr>
       <w:bookmarkStart w:id="31" w:name="k16"/>
-      <w:bookmarkStart w:id="32" w:name="_Toc243475709"/>
+      <w:bookmarkStart w:id="32" w:name="_Toc243634065"/>
       <w:r>
         <w:t>CSV EXPORTEREN</w:t>
       </w:r>
@@ -11700,7 +11763,7 @@
         <w:keepNext/>
       </w:pPr>
       <w:bookmarkStart w:id="33" w:name="k17"/>
-      <w:bookmarkStart w:id="34" w:name="_Toc243475710"/>
+      <w:bookmarkStart w:id="34" w:name="_Toc243634066"/>
       <w:r>
         <w:t>LICHT OF DONKER THEMA</w:t>
       </w:r>
@@ -11807,7 +11870,7 @@
         <w:keepNext/>
       </w:pPr>
       <w:bookmarkStart w:id="35" w:name="k18"/>
-      <w:bookmarkStart w:id="36" w:name="_Toc243475711"/>
+      <w:bookmarkStart w:id="36" w:name="_Toc243634067"/>
       <w:r>
         <w:t>WELKOM EN "ZELFDE ALS VORIGE KEER"</w:t>
       </w:r>
@@ -11894,7 +11957,7 @@
         <w:keepNext/>
       </w:pPr>
       <w:bookmarkStart w:id="37" w:name="k19"/>
-      <w:bookmarkStart w:id="38" w:name="_Toc243475712"/>
+      <w:bookmarkStart w:id="38" w:name="_Toc243634068"/>
       <w:r>
         <w:t>DEMO GEZICHTSHERKENNING</w:t>
       </w:r>
@@ -12140,7 +12203,7 @@
         <w:keepNext/>
       </w:pPr>
       <w:bookmarkStart w:id="39" w:name="k20"/>
-      <w:bookmarkStart w:id="40" w:name="_Toc243475713"/>
+      <w:bookmarkStart w:id="40" w:name="_Toc243634069"/>
       <w:r>
         <w:t>HERKENNEN MET DE PAS</w:t>
       </w:r>
@@ -12265,7 +12328,10 @@
         <w:t>Een medewerker herkennen gebeurt op de beginpagina en als het productvenster open is. Staat het productvenster van een collega nog open, dan sluit dat venster zonder op te slaan en opent het venster van de pas. Staat het eigen venster al open, dan blijft het open met de keuze die er al stond. Staat er een ander venster open (het beheer, een formulier of de camera), dan opent er niets en verschijnt "Sluit eerst het open venster om je pas te gebruiken." De website houdt dan wel de Enter of Tab tegen waarmee d</w:t>
       </w:r>
       <w:r>
-        <w:t xml:space="preserve">e lezer een scan afsluit, zodat die niet de knop met de focus indrukt. Staat de focus in het zoekveld, dan haalt de website de getypte tekens van de lezer daar weer uit. Het zoekveld heeft na een scan dezelfde inhoud als ervoor. Hetzelfde geldt voor het bedrijfsfilter: daar komen na een scan ook het gekozen bedrijf terug en gaat de keuzelijst dicht. In het veld </w:t>
+        <w:t>e lezer een scan afsluit, zodat die niet de knop met de focus indrukt. Staat de focus in het zoekveld, dan haalt de website de getypte tekens van de lezer daar weer uit. Het zoekveld heeft na een scan dezelfde inhoud als ervoor. Hetzelfde geldt voor het bedrijfsfilter: daar komen na een scan ook het gekozen bedrijf terug en gaat de keuzelijst dicht. Sinds versie 3.19 geldt dat voor ieder ander tekstveld met de focus, bijvoorbeeld het e-mailadres bij het inloggen, een zoekveld in het beheer of de naam in het</w:t>
+      </w:r>
+      <w:r>
+        <w:t xml:space="preserve"> medewerkersformulier: na de scan staat daar weer wat er stond. In het veld </w:t>
       </w:r>
       <w:r>
         <w:rPr>
@@ -12334,7 +12400,7 @@
         <w:keepNext/>
       </w:pPr>
       <w:bookmarkStart w:id="41" w:name="k21"/>
-      <w:bookmarkStart w:id="42" w:name="_Toc243475714"/>
+      <w:bookmarkStart w:id="42" w:name="_Toc243634070"/>
       <w:r>
         <w:t>SLIMME KOELKAST (DEMO)</w:t>
       </w:r>
@@ -12957,7 +13023,7 @@
         <w:keepNext/>
       </w:pPr>
       <w:bookmarkStart w:id="43" w:name="k22"/>
-      <w:bookmarkStart w:id="44" w:name="_Toc243475715"/>
+      <w:bookmarkStart w:id="44" w:name="_Toc243634071"/>
       <w:r>
         <w:t>STANDBY EN TIK OM TE SCANNEN (DEMO)</w:t>
       </w:r>
@@ -13186,7 +13252,7 @@
         </w:numPr>
       </w:pPr>
       <w:bookmarkStart w:id="45" w:name="k23"/>
-      <w:bookmarkStart w:id="46" w:name="_Toc243475716"/>
+      <w:bookmarkStart w:id="46" w:name="_Toc243634072"/>
       <w:r>
         <w:t xml:space="preserve">UITLEG VAN </w:t>
       </w:r>
@@ -13210,7 +13276,7 @@
         <w:keepNext/>
       </w:pPr>
       <w:bookmarkStart w:id="47" w:name="k24"/>
-      <w:bookmarkStart w:id="48" w:name="_Toc243475717"/>
+      <w:bookmarkStart w:id="48" w:name="_Toc243634073"/>
       <w:r>
         <w:t>METADATA EN EXTERNE BESTANDEN</w:t>
       </w:r>
@@ -13486,7 +13552,7 @@
         <w:keepNext/>
       </w:pPr>
       <w:bookmarkStart w:id="49" w:name="k25"/>
-      <w:bookmarkStart w:id="50" w:name="_Toc243475718"/>
+      <w:bookmarkStart w:id="50" w:name="_Toc243634074"/>
       <w:r>
         <w:t>NAVIGATIEBALK</w:t>
       </w:r>
@@ -13699,7 +13765,7 @@
         <w:keepNext/>
       </w:pPr>
       <w:bookmarkStart w:id="51" w:name="k26"/>
-      <w:bookmarkStart w:id="52" w:name="_Toc243475719"/>
+      <w:bookmarkStart w:id="52" w:name="_Toc243634075"/>
       <w:r>
         <w:t>HERO-GEDEELTE</w:t>
       </w:r>
@@ -13744,7 +13810,7 @@
         <w:keepNext/>
       </w:pPr>
       <w:bookmarkStart w:id="53" w:name="k27"/>
-      <w:bookmarkStart w:id="54" w:name="_Toc243475720"/>
+      <w:bookmarkStart w:id="54" w:name="_Toc243634076"/>
       <w:r>
         <w:t>MEDEWERKERLIJST</w:t>
       </w:r>
@@ -14081,7 +14147,7 @@
         <w:keepNext/>
       </w:pPr>
       <w:bookmarkStart w:id="55" w:name="k28"/>
-      <w:bookmarkStart w:id="56" w:name="_Toc243475721"/>
+      <w:bookmarkStart w:id="56" w:name="_Toc243634077"/>
       <w:r>
         <w:t>STATISTIEKEN</w:t>
       </w:r>
@@ -14164,7 +14230,7 @@
         <w:keepNext/>
       </w:pPr>
       <w:bookmarkStart w:id="57" w:name="k29"/>
-      <w:bookmarkStart w:id="58" w:name="_Toc243475722"/>
+      <w:bookmarkStart w:id="58" w:name="_Toc243634078"/>
       <w:r>
         <w:t>VENSTERS (MODALS)</w:t>
       </w:r>
@@ -14796,7 +14862,7 @@
         <w:keepNext/>
       </w:pPr>
       <w:bookmarkStart w:id="59" w:name="k30"/>
-      <w:bookmarkStart w:id="60" w:name="_Toc243475723"/>
+      <w:bookmarkStart w:id="60" w:name="_Toc243634079"/>
       <w:r>
         <w:t>WAARSCHUWING BIJ OPENEN ALS LOS BESTAND</w:t>
       </w:r>
@@ -14841,7 +14907,7 @@
         </w:numPr>
       </w:pPr>
       <w:bookmarkStart w:id="61" w:name="k31"/>
-      <w:bookmarkStart w:id="62" w:name="_Toc243475724"/>
+      <w:bookmarkStart w:id="62" w:name="_Toc243634080"/>
       <w:r>
         <w:t xml:space="preserve">UITLEG VAN </w:t>
       </w:r>
@@ -14865,7 +14931,7 @@
         <w:keepNext/>
       </w:pPr>
       <w:bookmarkStart w:id="63" w:name="k32"/>
-      <w:bookmarkStart w:id="64" w:name="_Toc243475725"/>
+      <w:bookmarkStart w:id="64" w:name="_Toc243634081"/>
       <w:r>
         <w:t>CSS-VARIABELEN</w:t>
       </w:r>
@@ -15540,7 +15606,7 @@
         <w:keepNext/>
       </w:pPr>
       <w:bookmarkStart w:id="65" w:name="k33"/>
-      <w:bookmarkStart w:id="66" w:name="_Toc243475726"/>
+      <w:bookmarkStart w:id="66" w:name="_Toc243634082"/>
       <w:r>
         <w:t>LAYOUT</w:t>
       </w:r>
@@ -16249,7 +16315,7 @@
         <w:keepNext/>
       </w:pPr>
       <w:bookmarkStart w:id="67" w:name="k34"/>
-      <w:bookmarkStart w:id="68" w:name="_Toc243475727"/>
+      <w:bookmarkStart w:id="68" w:name="_Toc243634083"/>
       <w:r>
         <w:t>COMPONENTEN</w:t>
       </w:r>
@@ -16494,7 +16560,7 @@
         </w:numPr>
       </w:pPr>
       <w:bookmarkStart w:id="69" w:name="k35"/>
-      <w:bookmarkStart w:id="70" w:name="_Toc243475728"/>
+      <w:bookmarkStart w:id="70" w:name="_Toc243634084"/>
       <w:r>
         <w:t>UITLEG VAN DE JAVASCRIPT (</w:t>
       </w:r>
@@ -16518,7 +16584,7 @@
         <w:keepNext/>
       </w:pPr>
       <w:bookmarkStart w:id="71" w:name="k36"/>
-      <w:bookmarkStart w:id="72" w:name="_Toc243475729"/>
+      <w:bookmarkStart w:id="72" w:name="_Toc243634085"/>
       <w:r>
         <w:t>OPSLAG EN VOORBEELDDATA</w:t>
       </w:r>
@@ -17296,7 +17362,7 @@
         <w:keepNext/>
       </w:pPr>
       <w:bookmarkStart w:id="73" w:name="k37"/>
-      <w:bookmarkStart w:id="74" w:name="_Toc243475730"/>
+      <w:bookmarkStart w:id="74" w:name="_Toc243634086"/>
       <w:r>
         <w:t>OBJECTGEORIËNTEERDE STRUCTUUR</w:t>
       </w:r>
@@ -20671,6 +20737,39 @@
           <w:sz w:val="18"/>
           <w:shd w:val="clear" w:color="auto" w:fill="EEF4F2"/>
         </w:rPr>
+        <w:t>restoreOtherFieldAfterScan</w:t>
+      </w:r>
+      <w:r>
+        <w:t xml:space="preserve"> doet dat voor ieder ander tekstveld met de focus (welke velden dat zijn, bepaalt </w:t>
+      </w:r>
+      <w:r>
+        <w:rPr>
+          <w:rFonts w:ascii="Consolas" w:hAnsi="Consolas" w:cs="Consolas"/>
+          <w:sz w:val="18"/>
+          <w:shd w:val="clear" w:color="auto" w:fill="EEF4F2"/>
+        </w:rPr>
+        <w:t>isOtherTextField</w:t>
+      </w:r>
+      <w:r>
+        <w:t xml:space="preserve">: niet het zoekveld, het bedrijfsfilter en </w:t>
+      </w:r>
+      <w:r>
+        <w:rPr>
+          <w:rFonts w:ascii="Consolas" w:hAnsi="Consolas" w:cs="Consolas"/>
+          <w:sz w:val="18"/>
+          <w:shd w:val="clear" w:color="auto" w:fill="EEF4F2"/>
+        </w:rPr>
+        <w:t>Pasnummer</w:t>
+      </w:r>
+      <w:r>
+        <w:t xml:space="preserve">, en geen vinkjes of knoppen) en vuurt daarna een input-event af, zodat een zoekveld in het beheer de lijst opnieuw tekent, </w:t>
+      </w:r>
+      <w:r>
+        <w:rPr>
+          <w:rFonts w:ascii="Consolas" w:hAnsi="Consolas" w:cs="Consolas"/>
+          <w:sz w:val="18"/>
+          <w:shd w:val="clear" w:color="auto" w:fill="EEF4F2"/>
+        </w:rPr>
         <w:t>fillBadgeFieldAfterScan</w:t>
       </w:r>
       <w:r>
@@ -23650,7 +23749,7 @@
         <w:t>onStart</w:t>
       </w:r>
       <w:r>
-        <w:t xml:space="preserve"> wordt aangeroepen als er een nieuwe buffer begint. De controller onthoudt dan welk veld de focus had en wat er in het zoekveld en het bedrijfsfilter stond (</w:t>
+        <w:t xml:space="preserve"> wordt aangeroepen als er een nieuwe buffer begint. De controller onthoudt dan welk veld de focus had en wat er in het zoekveld, het bedrijfsfilter en een ander tekstveld met de focus stond (</w:t>
       </w:r>
       <w:r>
         <w:rPr>
@@ -23670,6 +23769,17 @@
           <w:shd w:val="clear" w:color="auto" w:fill="EEF4F2"/>
         </w:rPr>
         <w:t>restoreSearchAfterScan</w:t>
+      </w:r>
+      <w:r>
+        <w:t xml:space="preserve"> en </w:t>
+      </w:r>
+      <w:r>
+        <w:rPr>
+          <w:rFonts w:ascii="Consolas" w:hAnsi="Consolas" w:cs="Consolas"/>
+          <w:sz w:val="18"/>
+          <w:shd w:val="clear" w:color="auto" w:fill="EEF4F2"/>
+        </w:rPr>
+        <w:t>restoreOtherFieldAfterScan</w:t>
       </w:r>
       <w:r>
         <w:t xml:space="preserve">). Begon de scan in het veld </w:t>
@@ -23768,7 +23878,7 @@
         <w:keepNext/>
       </w:pPr>
       <w:bookmarkStart w:id="87" w:name="k50"/>
-      <w:bookmarkStart w:id="88" w:name="_Toc243475731"/>
+      <w:bookmarkStart w:id="88" w:name="_Toc243634087"/>
       <w:r>
         <w:rPr>
           <w:rFonts w:ascii="Consolas" w:hAnsi="Consolas" w:cs="Consolas"/>
@@ -23909,7 +24019,7 @@
         <w:keepNext/>
       </w:pPr>
       <w:bookmarkStart w:id="89" w:name="k51"/>
-      <w:bookmarkStart w:id="90" w:name="_Toc243475732"/>
+      <w:bookmarkStart w:id="90" w:name="_Toc243634088"/>
       <w:r>
         <w:rPr>
           <w:rFonts w:ascii="Consolas" w:hAnsi="Consolas" w:cs="Consolas"/>
@@ -23986,7 +24096,7 @@
         <w:keepNext/>
       </w:pPr>
       <w:bookmarkStart w:id="91" w:name="k52"/>
-      <w:bookmarkStart w:id="92" w:name="_Toc243475733"/>
+      <w:bookmarkStart w:id="92" w:name="_Toc243634089"/>
       <w:r>
         <w:rPr>
           <w:rFonts w:ascii="Consolas" w:hAnsi="Consolas" w:cs="Consolas"/>
@@ -24157,7 +24267,7 @@
         <w:keepNext/>
       </w:pPr>
       <w:bookmarkStart w:id="93" w:name="k53"/>
-      <w:bookmarkStart w:id="94" w:name="_Toc243475734"/>
+      <w:bookmarkStart w:id="94" w:name="_Toc243634090"/>
       <w:r>
         <w:rPr>
           <w:rFonts w:ascii="Consolas" w:hAnsi="Consolas" w:cs="Consolas"/>
@@ -24224,7 +24334,7 @@
         <w:keepNext/>
       </w:pPr>
       <w:bookmarkStart w:id="95" w:name="k54"/>
-      <w:bookmarkStart w:id="96" w:name="_Toc243475735"/>
+      <w:bookmarkStart w:id="96" w:name="_Toc243634091"/>
       <w:r>
         <w:rPr>
           <w:rFonts w:ascii="Consolas" w:hAnsi="Consolas" w:cs="Consolas"/>
@@ -24346,7 +24456,7 @@
         <w:keepNext/>
       </w:pPr>
       <w:bookmarkStart w:id="97" w:name="k55"/>
-      <w:bookmarkStart w:id="98" w:name="_Toc243475736"/>
+      <w:bookmarkStart w:id="98" w:name="_Toc243634092"/>
       <w:r>
         <w:rPr>
           <w:rFonts w:ascii="Consolas" w:hAnsi="Consolas" w:cs="Consolas"/>
@@ -24468,7 +24578,7 @@
         <w:keepNext/>
       </w:pPr>
       <w:bookmarkStart w:id="99" w:name="k56"/>
-      <w:bookmarkStart w:id="100" w:name="_Toc243475737"/>
+      <w:bookmarkStart w:id="100" w:name="_Toc243634093"/>
       <w:r>
         <w:t>OPSLAGFOUTEN EN TERUGDRAAIEN</w:t>
       </w:r>
@@ -24530,7 +24640,7 @@
         <w:keepNext/>
       </w:pPr>
       <w:bookmarkStart w:id="101" w:name="k57"/>
-      <w:bookmarkStart w:id="102" w:name="_Toc243475738"/>
+      <w:bookmarkStart w:id="102" w:name="_Toc243634094"/>
       <w:r>
         <w:t>ADMINFUNCTIES</w:t>
       </w:r>
@@ -24776,7 +24886,7 @@
         <w:keepNext/>
       </w:pPr>
       <w:bookmarkStart w:id="103" w:name="k58"/>
-      <w:bookmarkStart w:id="104" w:name="_Toc243475739"/>
+      <w:bookmarkStart w:id="104" w:name="_Toc243634095"/>
       <w:r>
         <w:t xml:space="preserve">CSV-EXPORT (CLASS </w:t>
       </w:r>
@@ -25184,7 +25294,7 @@
         <w:keepNext/>
       </w:pPr>
       <w:bookmarkStart w:id="105" w:name="k59"/>
-      <w:bookmarkStart w:id="106" w:name="_Toc243475740"/>
+      <w:bookmarkStart w:id="106" w:name="_Toc243634096"/>
       <w:r>
         <w:t>EVENT LISTENERS</w:t>
       </w:r>
@@ -25796,7 +25906,7 @@
         </w:numPr>
       </w:pPr>
       <w:bookmarkStart w:id="107" w:name="k60"/>
-      <w:bookmarkStart w:id="108" w:name="_Toc243475741"/>
+      <w:bookmarkStart w:id="108" w:name="_Toc243634097"/>
       <w:r>
         <w:t>DATAMODEL EN KOPPELINGEN.</w:t>
       </w:r>
@@ -25814,7 +25924,7 @@
         <w:keepNext/>
       </w:pPr>
       <w:bookmarkStart w:id="109" w:name="k61"/>
-      <w:bookmarkStart w:id="110" w:name="_Toc243475742"/>
+      <w:bookmarkStart w:id="110" w:name="_Toc243634098"/>
       <w:r>
         <w:t>BEDRIJVEN</w:t>
       </w:r>
@@ -26025,7 +26135,7 @@
         <w:keepNext/>
       </w:pPr>
       <w:bookmarkStart w:id="111" w:name="k62"/>
-      <w:bookmarkStart w:id="112" w:name="_Toc243475743"/>
+      <w:bookmarkStart w:id="112" w:name="_Toc243634099"/>
       <w:r>
         <w:t>CONSUMPTIEPUNTEN</w:t>
       </w:r>
@@ -26344,7 +26454,7 @@
         <w:keepNext/>
       </w:pPr>
       <w:bookmarkStart w:id="113" w:name="k63"/>
-      <w:bookmarkStart w:id="114" w:name="_Toc243475744"/>
+      <w:bookmarkStart w:id="114" w:name="_Toc243634100"/>
       <w:r>
         <w:t>MEDEWERKERS</w:t>
       </w:r>
@@ -26900,7 +27010,7 @@
         <w:keepNext/>
       </w:pPr>
       <w:bookmarkStart w:id="115" w:name="k64"/>
-      <w:bookmarkStart w:id="116" w:name="_Toc243475745"/>
+      <w:bookmarkStart w:id="116" w:name="_Toc243634101"/>
       <w:r>
         <w:t>REGISTRATIES</w:t>
       </w:r>
@@ -27561,7 +27671,7 @@
         <w:keepNext/>
       </w:pPr>
       <w:bookmarkStart w:id="117" w:name="k65"/>
-      <w:bookmarkStart w:id="118" w:name="_Toc243475746"/>
+      <w:bookmarkStart w:id="118" w:name="_Toc243634102"/>
       <w:r>
         <w:t>SLIMME KOELKAST</w:t>
       </w:r>
@@ -27981,7 +28091,7 @@
         <w:keepNext/>
       </w:pPr>
       <w:bookmarkStart w:id="119" w:name="k66"/>
-      <w:bookmarkStart w:id="120" w:name="_Toc243475747"/>
+      <w:bookmarkStart w:id="120" w:name="_Toc243634103"/>
       <w:r>
         <w:t>DEMO GEZICHTSHERKENNING</w:t>
       </w:r>
@@ -28279,7 +28389,7 @@
         </w:numPr>
       </w:pPr>
       <w:bookmarkStart w:id="121" w:name="k67"/>
-      <w:bookmarkStart w:id="122" w:name="_Toc243475748"/>
+      <w:bookmarkStart w:id="122" w:name="_Toc243634104"/>
       <w:r>
         <w:t>BELANGRIJKE DEMO-BEPERKINGEN.</w:t>
       </w:r>
@@ -28720,7 +28830,7 @@
         </w:numPr>
       </w:pPr>
       <w:bookmarkStart w:id="123" w:name="k68"/>
-      <w:bookmarkStart w:id="124" w:name="_Toc243475749"/>
+      <w:bookmarkStart w:id="124" w:name="_Toc243634105"/>
       <w:r>
         <w:t>CODE UITLEGGEN TIJDENS EEN PRESENTATIE.</w:t>
       </w:r>
@@ -29126,7 +29236,7 @@
         </w:numPr>
       </w:pPr>
       <w:bookmarkStart w:id="125" w:name="k69"/>
-      <w:bookmarkStart w:id="126" w:name="_Toc243475750"/>
+      <w:bookmarkStart w:id="126" w:name="_Toc243634106"/>
       <w:r>
         <w:t>MOGELIJKE VERVOLGSTAPPEN.</w:t>
       </w:r>
@@ -29706,7 +29816,7 @@
         <v:path o:extrusionok="f" gradientshapeok="t" o:connecttype="rect"/>
         <o:lock v:ext="edit" aspectratio="t"/>
       </v:shapetype>
-      <v:shape id="_x0000_i1025" type="#_x0000_t75" style="width:254pt;height:219.5pt" o:bullet="t">
+      <v:shape id="_x0000_i1025" type="#_x0000_t75" style="width:254.25pt;height:219.75pt" o:bullet="t">
         <v:imagedata r:id="rId1" o:title="Bulletpoint"/>
       </v:shape>
     </w:pict>

</xml_diff>

<commit_message>
TO 3.20: styles.css opgedeeld in 18 stylesheets per onderdeel
- Vormgeving staat nu in assets/css/ in 18 bestanden (base, topbar, home, modal, admin, product-window, admin-forms, toast, admin-corrections, motion, icons, feedback, suggestion, directory-tools, face, standby, fridge, responsive)
- Samengevoegd in laadvolgorde zijn ze teken voor teken gelijk aan de oude styles.css, dus de cascade en het uiterlijk zijn ongewijzigd (0 verschillende pixels in 48 screenshots)
- index.html laadt ze in vaste volgorde, nieuwe test controleert volgorde, geen @import en de CSP
- Tests lezen alle stylesheets via readAllCss()
- README, DOCUMENTATIE, TO en Word-bestanden bijgewerkt (812 unit tests, 31 browsertests)
</commit_message>
<xml_diff>
--- a/docs/DOCUMENTATIE.docx
+++ b/docs/DOCUMENTATIE.docx
@@ -82,7 +82,7 @@
           <w:numId w:val="0"/>
         </w:numPr>
       </w:pPr>
-      <w:bookmarkStart w:id="0" w:name="_Toc243634049"/>
+      <w:bookmarkStart w:id="0" w:name="_Toc243897595"/>
       <w:r>
         <w:t>INHOUDSOPGAVE.</w:t>
       </w:r>
@@ -112,7 +112,7 @@
       <w:r>
         <w:fldChar w:fldCharType="separate"/>
       </w:r>
-      <w:hyperlink w:anchor="_Toc243634049" w:history="1">
+      <w:hyperlink w:anchor="_Toc243897595" w:history="1">
         <w:r>
           <w:rPr>
             <w:rStyle w:val="Hyperlink"/>
@@ -139,7 +139,7 @@
             <w:noProof/>
             <w:webHidden/>
           </w:rPr>
-          <w:instrText xml:space="preserve"> PAGEREF _Toc243634049 \h </w:instrText>
+          <w:instrText xml:space="preserve"> PAGEREF _Toc243897595 \h </w:instrText>
         </w:r>
         <w:r>
           <w:rPr>
@@ -186,7 +186,7 @@
           <w:lang w:eastAsia="nl-NL"/>
         </w:rPr>
       </w:pPr>
-      <w:hyperlink w:anchor="_Toc243634050" w:history="1">
+      <w:hyperlink w:anchor="_Toc243897596" w:history="1">
         <w:r>
           <w:rPr>
             <w:rStyle w:val="Hyperlink"/>
@@ -231,7 +231,7 @@
             <w:noProof/>
             <w:webHidden/>
           </w:rPr>
-          <w:instrText xml:space="preserve"> PAGEREF _Toc243634050 \h </w:instrText>
+          <w:instrText xml:space="preserve"> PAGEREF _Toc243897596 \h </w:instrText>
         </w:r>
         <w:r>
           <w:rPr>
@@ -278,7 +278,7 @@
           <w:lang w:eastAsia="nl-NL"/>
         </w:rPr>
       </w:pPr>
-      <w:hyperlink w:anchor="_Toc243634051" w:history="1">
+      <w:hyperlink w:anchor="_Toc243897597" w:history="1">
         <w:r>
           <w:rPr>
             <w:rStyle w:val="Hyperlink"/>
@@ -323,7 +323,7 @@
             <w:noProof/>
             <w:webHidden/>
           </w:rPr>
-          <w:instrText xml:space="preserve"> PAGEREF _Toc243634051 \h </w:instrText>
+          <w:instrText xml:space="preserve"> PAGEREF _Toc243897597 \h </w:instrText>
         </w:r>
         <w:r>
           <w:rPr>
@@ -370,7 +370,7 @@
           <w:lang w:eastAsia="nl-NL"/>
         </w:rPr>
       </w:pPr>
-      <w:hyperlink w:anchor="_Toc243634052" w:history="1">
+      <w:hyperlink w:anchor="_Toc243897598" w:history="1">
         <w:r>
           <w:rPr>
             <w:rStyle w:val="Hyperlink"/>
@@ -415,7 +415,7 @@
             <w:noProof/>
             <w:webHidden/>
           </w:rPr>
-          <w:instrText xml:space="preserve"> PAGEREF _Toc243634052 \h </w:instrText>
+          <w:instrText xml:space="preserve"> PAGEREF _Toc243897598 \h </w:instrText>
         </w:r>
         <w:r>
           <w:rPr>
@@ -462,7 +462,7 @@
           <w:lang w:eastAsia="nl-NL"/>
         </w:rPr>
       </w:pPr>
-      <w:hyperlink w:anchor="_Toc243634053" w:history="1">
+      <w:hyperlink w:anchor="_Toc243897599" w:history="1">
         <w:r>
           <w:rPr>
             <w:rStyle w:val="Hyperlink"/>
@@ -507,7 +507,7 @@
             <w:noProof/>
             <w:webHidden/>
           </w:rPr>
-          <w:instrText xml:space="preserve"> PAGEREF _Toc243634053 \h </w:instrText>
+          <w:instrText xml:space="preserve"> PAGEREF _Toc243897599 \h </w:instrText>
         </w:r>
         <w:r>
           <w:rPr>
@@ -554,7 +554,7 @@
           <w:lang w:eastAsia="nl-NL"/>
         </w:rPr>
       </w:pPr>
-      <w:hyperlink w:anchor="_Toc243634054" w:history="1">
+      <w:hyperlink w:anchor="_Toc243897600" w:history="1">
         <w:r>
           <w:rPr>
             <w:rStyle w:val="Hyperlink"/>
@@ -599,7 +599,7 @@
             <w:noProof/>
             <w:webHidden/>
           </w:rPr>
-          <w:instrText xml:space="preserve"> PAGEREF _Toc243634054 \h </w:instrText>
+          <w:instrText xml:space="preserve"> PAGEREF _Toc243897600 \h </w:instrText>
         </w:r>
         <w:r>
           <w:rPr>
@@ -646,7 +646,7 @@
           <w:lang w:eastAsia="nl-NL"/>
         </w:rPr>
       </w:pPr>
-      <w:hyperlink w:anchor="_Toc243634055" w:history="1">
+      <w:hyperlink w:anchor="_Toc243897601" w:history="1">
         <w:r>
           <w:rPr>
             <w:rStyle w:val="Hyperlink"/>
@@ -691,7 +691,7 @@
             <w:noProof/>
             <w:webHidden/>
           </w:rPr>
-          <w:instrText xml:space="preserve"> PAGEREF _Toc243634055 \h </w:instrText>
+          <w:instrText xml:space="preserve"> PAGEREF _Toc243897601 \h </w:instrText>
         </w:r>
         <w:r>
           <w:rPr>
@@ -738,7 +738,7 @@
           <w:lang w:eastAsia="nl-NL"/>
         </w:rPr>
       </w:pPr>
-      <w:hyperlink w:anchor="_Toc243634056" w:history="1">
+      <w:hyperlink w:anchor="_Toc243897602" w:history="1">
         <w:r>
           <w:rPr>
             <w:rStyle w:val="Hyperlink"/>
@@ -783,7 +783,7 @@
             <w:noProof/>
             <w:webHidden/>
           </w:rPr>
-          <w:instrText xml:space="preserve"> PAGEREF _Toc243634056 \h </w:instrText>
+          <w:instrText xml:space="preserve"> PAGEREF _Toc243897602 \h </w:instrText>
         </w:r>
         <w:r>
           <w:rPr>
@@ -830,7 +830,7 @@
           <w:lang w:eastAsia="nl-NL"/>
         </w:rPr>
       </w:pPr>
-      <w:hyperlink w:anchor="_Toc243634057" w:history="1">
+      <w:hyperlink w:anchor="_Toc243897603" w:history="1">
         <w:r>
           <w:rPr>
             <w:rStyle w:val="Hyperlink"/>
@@ -875,7 +875,7 @@
             <w:noProof/>
             <w:webHidden/>
           </w:rPr>
-          <w:instrText xml:space="preserve"> PAGEREF _Toc243634057 \h </w:instrText>
+          <w:instrText xml:space="preserve"> PAGEREF _Toc243897603 \h </w:instrText>
         </w:r>
         <w:r>
           <w:rPr>
@@ -922,7 +922,7 @@
           <w:lang w:eastAsia="nl-NL"/>
         </w:rPr>
       </w:pPr>
-      <w:hyperlink w:anchor="_Toc243634058" w:history="1">
+      <w:hyperlink w:anchor="_Toc243897604" w:history="1">
         <w:r>
           <w:rPr>
             <w:rStyle w:val="Hyperlink"/>
@@ -967,7 +967,7 @@
             <w:noProof/>
             <w:webHidden/>
           </w:rPr>
-          <w:instrText xml:space="preserve"> PAGEREF _Toc243634058 \h </w:instrText>
+          <w:instrText xml:space="preserve"> PAGEREF _Toc243897604 \h </w:instrText>
         </w:r>
         <w:r>
           <w:rPr>
@@ -1014,7 +1014,7 @@
           <w:lang w:eastAsia="nl-NL"/>
         </w:rPr>
       </w:pPr>
-      <w:hyperlink w:anchor="_Toc243634059" w:history="1">
+      <w:hyperlink w:anchor="_Toc243897605" w:history="1">
         <w:r>
           <w:rPr>
             <w:rStyle w:val="Hyperlink"/>
@@ -1059,7 +1059,7 @@
             <w:noProof/>
             <w:webHidden/>
           </w:rPr>
-          <w:instrText xml:space="preserve"> PAGEREF _Toc243634059 \h </w:instrText>
+          <w:instrText xml:space="preserve"> PAGEREF _Toc243897605 \h </w:instrText>
         </w:r>
         <w:r>
           <w:rPr>
@@ -1106,7 +1106,7 @@
           <w:lang w:eastAsia="nl-NL"/>
         </w:rPr>
       </w:pPr>
-      <w:hyperlink w:anchor="_Toc243634060" w:history="1">
+      <w:hyperlink w:anchor="_Toc243897606" w:history="1">
         <w:r>
           <w:rPr>
             <w:rStyle w:val="Hyperlink"/>
@@ -1151,7 +1151,7 @@
             <w:noProof/>
             <w:webHidden/>
           </w:rPr>
-          <w:instrText xml:space="preserve"> PAGEREF _Toc243634060 \h </w:instrText>
+          <w:instrText xml:space="preserve"> PAGEREF _Toc243897606 \h </w:instrText>
         </w:r>
         <w:r>
           <w:rPr>
@@ -1198,7 +1198,7 @@
           <w:lang w:eastAsia="nl-NL"/>
         </w:rPr>
       </w:pPr>
-      <w:hyperlink w:anchor="_Toc243634061" w:history="1">
+      <w:hyperlink w:anchor="_Toc243897607" w:history="1">
         <w:r>
           <w:rPr>
             <w:rStyle w:val="Hyperlink"/>
@@ -1243,7 +1243,7 @@
             <w:noProof/>
             <w:webHidden/>
           </w:rPr>
-          <w:instrText xml:space="preserve"> PAGEREF _Toc243634061 \h </w:instrText>
+          <w:instrText xml:space="preserve"> PAGEREF _Toc243897607 \h </w:instrText>
         </w:r>
         <w:r>
           <w:rPr>
@@ -1290,7 +1290,7 @@
           <w:lang w:eastAsia="nl-NL"/>
         </w:rPr>
       </w:pPr>
-      <w:hyperlink w:anchor="_Toc243634062" w:history="1">
+      <w:hyperlink w:anchor="_Toc243897608" w:history="1">
         <w:r>
           <w:rPr>
             <w:rStyle w:val="Hyperlink"/>
@@ -1335,7 +1335,7 @@
             <w:noProof/>
             <w:webHidden/>
           </w:rPr>
-          <w:instrText xml:space="preserve"> PAGEREF _Toc243634062 \h </w:instrText>
+          <w:instrText xml:space="preserve"> PAGEREF _Toc243897608 \h </w:instrText>
         </w:r>
         <w:r>
           <w:rPr>
@@ -1382,7 +1382,7 @@
           <w:lang w:eastAsia="nl-NL"/>
         </w:rPr>
       </w:pPr>
-      <w:hyperlink w:anchor="_Toc243634063" w:history="1">
+      <w:hyperlink w:anchor="_Toc243897609" w:history="1">
         <w:r>
           <w:rPr>
             <w:rStyle w:val="Hyperlink"/>
@@ -1427,7 +1427,7 @@
             <w:noProof/>
             <w:webHidden/>
           </w:rPr>
-          <w:instrText xml:space="preserve"> PAGEREF _Toc243634063 \h </w:instrText>
+          <w:instrText xml:space="preserve"> PAGEREF _Toc243897609 \h </w:instrText>
         </w:r>
         <w:r>
           <w:rPr>
@@ -1474,7 +1474,7 @@
           <w:lang w:eastAsia="nl-NL"/>
         </w:rPr>
       </w:pPr>
-      <w:hyperlink w:anchor="_Toc243634064" w:history="1">
+      <w:hyperlink w:anchor="_Toc243897610" w:history="1">
         <w:r>
           <w:rPr>
             <w:rStyle w:val="Hyperlink"/>
@@ -1519,7 +1519,7 @@
             <w:noProof/>
             <w:webHidden/>
           </w:rPr>
-          <w:instrText xml:space="preserve"> PAGEREF _Toc243634064 \h </w:instrText>
+          <w:instrText xml:space="preserve"> PAGEREF _Toc243897610 \h </w:instrText>
         </w:r>
         <w:r>
           <w:rPr>
@@ -1566,7 +1566,7 @@
           <w:lang w:eastAsia="nl-NL"/>
         </w:rPr>
       </w:pPr>
-      <w:hyperlink w:anchor="_Toc243634065" w:history="1">
+      <w:hyperlink w:anchor="_Toc243897611" w:history="1">
         <w:r>
           <w:rPr>
             <w:rStyle w:val="Hyperlink"/>
@@ -1611,7 +1611,7 @@
             <w:noProof/>
             <w:webHidden/>
           </w:rPr>
-          <w:instrText xml:space="preserve"> PAGEREF _Toc243634065 \h </w:instrText>
+          <w:instrText xml:space="preserve"> PAGEREF _Toc243897611 \h </w:instrText>
         </w:r>
         <w:r>
           <w:rPr>
@@ -1658,7 +1658,7 @@
           <w:lang w:eastAsia="nl-NL"/>
         </w:rPr>
       </w:pPr>
-      <w:hyperlink w:anchor="_Toc243634066" w:history="1">
+      <w:hyperlink w:anchor="_Toc243897612" w:history="1">
         <w:r>
           <w:rPr>
             <w:rStyle w:val="Hyperlink"/>
@@ -1703,7 +1703,7 @@
             <w:noProof/>
             <w:webHidden/>
           </w:rPr>
-          <w:instrText xml:space="preserve"> PAGEREF _Toc243634066 \h </w:instrText>
+          <w:instrText xml:space="preserve"> PAGEREF _Toc243897612 \h </w:instrText>
         </w:r>
         <w:r>
           <w:rPr>
@@ -1750,7 +1750,7 @@
           <w:lang w:eastAsia="nl-NL"/>
         </w:rPr>
       </w:pPr>
-      <w:hyperlink w:anchor="_Toc243634067" w:history="1">
+      <w:hyperlink w:anchor="_Toc243897613" w:history="1">
         <w:r>
           <w:rPr>
             <w:rStyle w:val="Hyperlink"/>
@@ -1795,7 +1795,7 @@
             <w:noProof/>
             <w:webHidden/>
           </w:rPr>
-          <w:instrText xml:space="preserve"> PAGEREF _Toc243634067 \h </w:instrText>
+          <w:instrText xml:space="preserve"> PAGEREF _Toc243897613 \h </w:instrText>
         </w:r>
         <w:r>
           <w:rPr>
@@ -1842,7 +1842,7 @@
           <w:lang w:eastAsia="nl-NL"/>
         </w:rPr>
       </w:pPr>
-      <w:hyperlink w:anchor="_Toc243634068" w:history="1">
+      <w:hyperlink w:anchor="_Toc243897614" w:history="1">
         <w:r>
           <w:rPr>
             <w:rStyle w:val="Hyperlink"/>
@@ -1887,7 +1887,7 @@
             <w:noProof/>
             <w:webHidden/>
           </w:rPr>
-          <w:instrText xml:space="preserve"> PAGEREF _Toc243634068 \h </w:instrText>
+          <w:instrText xml:space="preserve"> PAGEREF _Toc243897614 \h </w:instrText>
         </w:r>
         <w:r>
           <w:rPr>
@@ -1934,7 +1934,7 @@
           <w:lang w:eastAsia="nl-NL"/>
         </w:rPr>
       </w:pPr>
-      <w:hyperlink w:anchor="_Toc243634069" w:history="1">
+      <w:hyperlink w:anchor="_Toc243897615" w:history="1">
         <w:r>
           <w:rPr>
             <w:rStyle w:val="Hyperlink"/>
@@ -1979,7 +1979,7 @@
             <w:noProof/>
             <w:webHidden/>
           </w:rPr>
-          <w:instrText xml:space="preserve"> PAGEREF _Toc243634069 \h </w:instrText>
+          <w:instrText xml:space="preserve"> PAGEREF _Toc243897615 \h </w:instrText>
         </w:r>
         <w:r>
           <w:rPr>
@@ -2026,7 +2026,7 @@
           <w:lang w:eastAsia="nl-NL"/>
         </w:rPr>
       </w:pPr>
-      <w:hyperlink w:anchor="_Toc243634070" w:history="1">
+      <w:hyperlink w:anchor="_Toc243897616" w:history="1">
         <w:r>
           <w:rPr>
             <w:rStyle w:val="Hyperlink"/>
@@ -2071,7 +2071,7 @@
             <w:noProof/>
             <w:webHidden/>
           </w:rPr>
-          <w:instrText xml:space="preserve"> PAGEREF _Toc243634070 \h </w:instrText>
+          <w:instrText xml:space="preserve"> PAGEREF _Toc243897616 \h </w:instrText>
         </w:r>
         <w:r>
           <w:rPr>
@@ -2118,7 +2118,7 @@
           <w:lang w:eastAsia="nl-NL"/>
         </w:rPr>
       </w:pPr>
-      <w:hyperlink w:anchor="_Toc243634071" w:history="1">
+      <w:hyperlink w:anchor="_Toc243897617" w:history="1">
         <w:r>
           <w:rPr>
             <w:rStyle w:val="Hyperlink"/>
@@ -2163,7 +2163,7 @@
             <w:noProof/>
             <w:webHidden/>
           </w:rPr>
-          <w:instrText xml:space="preserve"> PAGEREF _Toc243634071 \h </w:instrText>
+          <w:instrText xml:space="preserve"> PAGEREF _Toc243897617 \h </w:instrText>
         </w:r>
         <w:r>
           <w:rPr>
@@ -2210,7 +2210,7 @@
           <w:lang w:eastAsia="nl-NL"/>
         </w:rPr>
       </w:pPr>
-      <w:hyperlink w:anchor="_Toc243634072" w:history="1">
+      <w:hyperlink w:anchor="_Toc243897618" w:history="1">
         <w:r>
           <w:rPr>
             <w:rStyle w:val="Hyperlink"/>
@@ -2271,7 +2271,7 @@
             <w:noProof/>
             <w:webHidden/>
           </w:rPr>
-          <w:instrText xml:space="preserve"> PAGEREF _Toc243634072 \h </w:instrText>
+          <w:instrText xml:space="preserve"> PAGEREF _Toc243897618 \h </w:instrText>
         </w:r>
         <w:r>
           <w:rPr>
@@ -2318,7 +2318,7 @@
           <w:lang w:eastAsia="nl-NL"/>
         </w:rPr>
       </w:pPr>
-      <w:hyperlink w:anchor="_Toc243634073" w:history="1">
+      <w:hyperlink w:anchor="_Toc243897619" w:history="1">
         <w:r>
           <w:rPr>
             <w:rStyle w:val="Hyperlink"/>
@@ -2363,7 +2363,7 @@
             <w:noProof/>
             <w:webHidden/>
           </w:rPr>
-          <w:instrText xml:space="preserve"> PAGEREF _Toc243634073 \h </w:instrText>
+          <w:instrText xml:space="preserve"> PAGEREF _Toc243897619 \h </w:instrText>
         </w:r>
         <w:r>
           <w:rPr>
@@ -2410,7 +2410,7 @@
           <w:lang w:eastAsia="nl-NL"/>
         </w:rPr>
       </w:pPr>
-      <w:hyperlink w:anchor="_Toc243634074" w:history="1">
+      <w:hyperlink w:anchor="_Toc243897620" w:history="1">
         <w:r>
           <w:rPr>
             <w:rStyle w:val="Hyperlink"/>
@@ -2455,7 +2455,7 @@
             <w:noProof/>
             <w:webHidden/>
           </w:rPr>
-          <w:instrText xml:space="preserve"> PAGEREF _Toc243634074 \h </w:instrText>
+          <w:instrText xml:space="preserve"> PAGEREF _Toc243897620 \h </w:instrText>
         </w:r>
         <w:r>
           <w:rPr>
@@ -2502,7 +2502,7 @@
           <w:lang w:eastAsia="nl-NL"/>
         </w:rPr>
       </w:pPr>
-      <w:hyperlink w:anchor="_Toc243634075" w:history="1">
+      <w:hyperlink w:anchor="_Toc243897621" w:history="1">
         <w:r>
           <w:rPr>
             <w:rStyle w:val="Hyperlink"/>
@@ -2547,7 +2547,7 @@
             <w:noProof/>
             <w:webHidden/>
           </w:rPr>
-          <w:instrText xml:space="preserve"> PAGEREF _Toc243634075 \h </w:instrText>
+          <w:instrText xml:space="preserve"> PAGEREF _Toc243897621 \h </w:instrText>
         </w:r>
         <w:r>
           <w:rPr>
@@ -2594,7 +2594,7 @@
           <w:lang w:eastAsia="nl-NL"/>
         </w:rPr>
       </w:pPr>
-      <w:hyperlink w:anchor="_Toc243634076" w:history="1">
+      <w:hyperlink w:anchor="_Toc243897622" w:history="1">
         <w:r>
           <w:rPr>
             <w:rStyle w:val="Hyperlink"/>
@@ -2639,7 +2639,7 @@
             <w:noProof/>
             <w:webHidden/>
           </w:rPr>
-          <w:instrText xml:space="preserve"> PAGEREF _Toc243634076 \h </w:instrText>
+          <w:instrText xml:space="preserve"> PAGEREF _Toc243897622 \h </w:instrText>
         </w:r>
         <w:r>
           <w:rPr>
@@ -2686,7 +2686,7 @@
           <w:lang w:eastAsia="nl-NL"/>
         </w:rPr>
       </w:pPr>
-      <w:hyperlink w:anchor="_Toc243634077" w:history="1">
+      <w:hyperlink w:anchor="_Toc243897623" w:history="1">
         <w:r>
           <w:rPr>
             <w:rStyle w:val="Hyperlink"/>
@@ -2731,7 +2731,7 @@
             <w:noProof/>
             <w:webHidden/>
           </w:rPr>
-          <w:instrText xml:space="preserve"> PAGEREF _Toc243634077 \h </w:instrText>
+          <w:instrText xml:space="preserve"> PAGEREF _Toc243897623 \h </w:instrText>
         </w:r>
         <w:r>
           <w:rPr>
@@ -2778,7 +2778,7 @@
           <w:lang w:eastAsia="nl-NL"/>
         </w:rPr>
       </w:pPr>
-      <w:hyperlink w:anchor="_Toc243634078" w:history="1">
+      <w:hyperlink w:anchor="_Toc243897624" w:history="1">
         <w:r>
           <w:rPr>
             <w:rStyle w:val="Hyperlink"/>
@@ -2823,7 +2823,7 @@
             <w:noProof/>
             <w:webHidden/>
           </w:rPr>
-          <w:instrText xml:space="preserve"> PAGEREF _Toc243634078 \h </w:instrText>
+          <w:instrText xml:space="preserve"> PAGEREF _Toc243897624 \h </w:instrText>
         </w:r>
         <w:r>
           <w:rPr>
@@ -2870,7 +2870,7 @@
           <w:lang w:eastAsia="nl-NL"/>
         </w:rPr>
       </w:pPr>
-      <w:hyperlink w:anchor="_Toc243634079" w:history="1">
+      <w:hyperlink w:anchor="_Toc243897625" w:history="1">
         <w:r>
           <w:rPr>
             <w:rStyle w:val="Hyperlink"/>
@@ -2915,7 +2915,7 @@
             <w:noProof/>
             <w:webHidden/>
           </w:rPr>
-          <w:instrText xml:space="preserve"> PAGEREF _Toc243634079 \h </w:instrText>
+          <w:instrText xml:space="preserve"> PAGEREF _Toc243897625 \h </w:instrText>
         </w:r>
         <w:r>
           <w:rPr>
@@ -2962,7 +2962,7 @@
           <w:lang w:eastAsia="nl-NL"/>
         </w:rPr>
       </w:pPr>
-      <w:hyperlink w:anchor="_Toc243634080" w:history="1">
+      <w:hyperlink w:anchor="_Toc243897626" w:history="1">
         <w:r>
           <w:rPr>
             <w:rStyle w:val="Hyperlink"/>
@@ -2986,7 +2986,7 @@
             <w:rStyle w:val="Hyperlink"/>
             <w:noProof/>
           </w:rPr>
-          <w:t xml:space="preserve">UITLEG VAN </w:t>
+          <w:t>UITLEG VAN DE CSS (</w:t>
         </w:r>
         <w:r>
           <w:rPr>
@@ -2995,14 +2995,14 @@
             <w:noProof/>
             <w:shd w:val="clear" w:color="auto" w:fill="EEF4F2"/>
           </w:rPr>
-          <w:t>assets/css/styles.css</w:t>
+          <w:t>assets/css/</w:t>
         </w:r>
         <w:r>
           <w:rPr>
             <w:rStyle w:val="Hyperlink"/>
             <w:noProof/>
           </w:rPr>
-          <w:t>.</w:t>
+          <w:t>).</w:t>
         </w:r>
         <w:r>
           <w:rPr>
@@ -3023,7 +3023,7 @@
             <w:noProof/>
             <w:webHidden/>
           </w:rPr>
-          <w:instrText xml:space="preserve"> PAGEREF _Toc243634080 \h </w:instrText>
+          <w:instrText xml:space="preserve"> PAGEREF _Toc243897626 \h </w:instrText>
         </w:r>
         <w:r>
           <w:rPr>
@@ -3070,7 +3070,7 @@
           <w:lang w:eastAsia="nl-NL"/>
         </w:rPr>
       </w:pPr>
-      <w:hyperlink w:anchor="_Toc243634081" w:history="1">
+      <w:hyperlink w:anchor="_Toc243897627" w:history="1">
         <w:r>
           <w:rPr>
             <w:rStyle w:val="Hyperlink"/>
@@ -3094,7 +3094,7 @@
             <w:rStyle w:val="Hyperlink"/>
             <w:noProof/>
           </w:rPr>
-          <w:t>CSS-VARIABELEN</w:t>
+          <w:t>BESTANDEN EN VOLGORDE</w:t>
         </w:r>
         <w:r>
           <w:rPr>
@@ -3115,7 +3115,7 @@
             <w:noProof/>
             <w:webHidden/>
           </w:rPr>
-          <w:instrText xml:space="preserve"> PAGEREF _Toc243634081 \h </w:instrText>
+          <w:instrText xml:space="preserve"> PAGEREF _Toc243897627 \h </w:instrText>
         </w:r>
         <w:r>
           <w:rPr>
@@ -3162,7 +3162,7 @@
           <w:lang w:eastAsia="nl-NL"/>
         </w:rPr>
       </w:pPr>
-      <w:hyperlink w:anchor="_Toc243634082" w:history="1">
+      <w:hyperlink w:anchor="_Toc243897628" w:history="1">
         <w:r>
           <w:rPr>
             <w:rStyle w:val="Hyperlink"/>
@@ -3186,7 +3186,7 @@
             <w:rStyle w:val="Hyperlink"/>
             <w:noProof/>
           </w:rPr>
-          <w:t>LAYOUT</w:t>
+          <w:t>CSS-VARIABELEN</w:t>
         </w:r>
         <w:r>
           <w:rPr>
@@ -3207,7 +3207,7 @@
             <w:noProof/>
             <w:webHidden/>
           </w:rPr>
-          <w:instrText xml:space="preserve"> PAGEREF _Toc243634082 \h </w:instrText>
+          <w:instrText xml:space="preserve"> PAGEREF _Toc243897628 \h </w:instrText>
         </w:r>
         <w:r>
           <w:rPr>
@@ -3254,7 +3254,7 @@
           <w:lang w:eastAsia="nl-NL"/>
         </w:rPr>
       </w:pPr>
-      <w:hyperlink w:anchor="_Toc243634083" w:history="1">
+      <w:hyperlink w:anchor="_Toc243897629" w:history="1">
         <w:r>
           <w:rPr>
             <w:rStyle w:val="Hyperlink"/>
@@ -3278,7 +3278,7 @@
             <w:rStyle w:val="Hyperlink"/>
             <w:noProof/>
           </w:rPr>
-          <w:t>COMPONENTEN</w:t>
+          <w:t>LAYOUT</w:t>
         </w:r>
         <w:r>
           <w:rPr>
@@ -3299,7 +3299,7 @@
             <w:noProof/>
             <w:webHidden/>
           </w:rPr>
-          <w:instrText xml:space="preserve"> PAGEREF _Toc243634083 \h </w:instrText>
+          <w:instrText xml:space="preserve"> PAGEREF _Toc243897629 \h </w:instrText>
         </w:r>
         <w:r>
           <w:rPr>
@@ -3332,9 +3332,9 @@
     </w:p>
     <w:p>
       <w:pPr>
-        <w:pStyle w:val="Inhopg1"/>
+        <w:pStyle w:val="Inhopg2"/>
         <w:tabs>
-          <w:tab w:val="left" w:pos="720"/>
+          <w:tab w:val="left" w:pos="960"/>
           <w:tab w:val="right" w:leader="dot" w:pos="9628"/>
         </w:tabs>
         <w:rPr>
@@ -3346,13 +3346,13 @@
           <w:lang w:eastAsia="nl-NL"/>
         </w:rPr>
       </w:pPr>
-      <w:hyperlink w:anchor="_Toc243634084" w:history="1">
+      <w:hyperlink w:anchor="_Toc243897630" w:history="1">
         <w:r>
           <w:rPr>
             <w:rStyle w:val="Hyperlink"/>
             <w:noProof/>
           </w:rPr>
-          <w:t>7.</w:t>
+          <w:t>6.4</w:t>
         </w:r>
         <w:r>
           <w:rPr>
@@ -3370,23 +3370,7 @@
             <w:rStyle w:val="Hyperlink"/>
             <w:noProof/>
           </w:rPr>
-          <w:t>UITLEG VAN DE JAVASCRIPT (</w:t>
-        </w:r>
-        <w:r>
-          <w:rPr>
-            <w:rStyle w:val="Hyperlink"/>
-            <w:rFonts w:ascii="Consolas" w:hAnsi="Consolas" w:cs="Consolas"/>
-            <w:noProof/>
-            <w:shd w:val="clear" w:color="auto" w:fill="EEF4F2"/>
-          </w:rPr>
-          <w:t>assets/js/</w:t>
-        </w:r>
-        <w:r>
-          <w:rPr>
-            <w:rStyle w:val="Hyperlink"/>
-            <w:noProof/>
-          </w:rPr>
-          <w:t>).</w:t>
+          <w:t>COMPONENTEN</w:t>
         </w:r>
         <w:r>
           <w:rPr>
@@ -3407,7 +3391,7 @@
             <w:noProof/>
             <w:webHidden/>
           </w:rPr>
-          <w:instrText xml:space="preserve"> PAGEREF _Toc243634084 \h </w:instrText>
+          <w:instrText xml:space="preserve"> PAGEREF _Toc243897630 \h </w:instrText>
         </w:r>
         <w:r>
           <w:rPr>
@@ -3440,9 +3424,9 @@
     </w:p>
     <w:p>
       <w:pPr>
-        <w:pStyle w:val="Inhopg2"/>
+        <w:pStyle w:val="Inhopg1"/>
         <w:tabs>
-          <w:tab w:val="left" w:pos="960"/>
+          <w:tab w:val="left" w:pos="720"/>
           <w:tab w:val="right" w:leader="dot" w:pos="9628"/>
         </w:tabs>
         <w:rPr>
@@ -3454,13 +3438,13 @@
           <w:lang w:eastAsia="nl-NL"/>
         </w:rPr>
       </w:pPr>
-      <w:hyperlink w:anchor="_Toc243634085" w:history="1">
+      <w:hyperlink w:anchor="_Toc243897631" w:history="1">
         <w:r>
           <w:rPr>
             <w:rStyle w:val="Hyperlink"/>
             <w:noProof/>
           </w:rPr>
-          <w:t>7.1</w:t>
+          <w:t>7.</w:t>
         </w:r>
         <w:r>
           <w:rPr>
@@ -3478,7 +3462,23 @@
             <w:rStyle w:val="Hyperlink"/>
             <w:noProof/>
           </w:rPr>
-          <w:t>OPSLAG EN VOORBEELDDATA</w:t>
+          <w:t>UITLEG VAN DE JAVASCRIPT (</w:t>
+        </w:r>
+        <w:r>
+          <w:rPr>
+            <w:rStyle w:val="Hyperlink"/>
+            <w:rFonts w:ascii="Consolas" w:hAnsi="Consolas" w:cs="Consolas"/>
+            <w:noProof/>
+            <w:shd w:val="clear" w:color="auto" w:fill="EEF4F2"/>
+          </w:rPr>
+          <w:t>assets/js/</w:t>
+        </w:r>
+        <w:r>
+          <w:rPr>
+            <w:rStyle w:val="Hyperlink"/>
+            <w:noProof/>
+          </w:rPr>
+          <w:t>).</w:t>
         </w:r>
         <w:r>
           <w:rPr>
@@ -3499,7 +3499,7 @@
             <w:noProof/>
             <w:webHidden/>
           </w:rPr>
-          <w:instrText xml:space="preserve"> PAGEREF _Toc243634085 \h </w:instrText>
+          <w:instrText xml:space="preserve"> PAGEREF _Toc243897631 \h </w:instrText>
         </w:r>
         <w:r>
           <w:rPr>
@@ -3519,7 +3519,7 @@
             <w:noProof/>
             <w:webHidden/>
           </w:rPr>
-          <w:t>26</w:t>
+          <w:t>27</w:t>
         </w:r>
         <w:r>
           <w:rPr>
@@ -3546,13 +3546,13 @@
           <w:lang w:eastAsia="nl-NL"/>
         </w:rPr>
       </w:pPr>
-      <w:hyperlink w:anchor="_Toc243634086" w:history="1">
+      <w:hyperlink w:anchor="_Toc243897632" w:history="1">
         <w:r>
           <w:rPr>
             <w:rStyle w:val="Hyperlink"/>
             <w:noProof/>
           </w:rPr>
-          <w:t>7.2</w:t>
+          <w:t>7.1</w:t>
         </w:r>
         <w:r>
           <w:rPr>
@@ -3570,7 +3570,7 @@
             <w:rStyle w:val="Hyperlink"/>
             <w:noProof/>
           </w:rPr>
-          <w:t>OBJECTGEORIËNTEERDE STRUCTUUR</w:t>
+          <w:t>OPSLAG EN VOORBEELDDATA</w:t>
         </w:r>
         <w:r>
           <w:rPr>
@@ -3591,7 +3591,7 @@
             <w:noProof/>
             <w:webHidden/>
           </w:rPr>
-          <w:instrText xml:space="preserve"> PAGEREF _Toc243634086 \h </w:instrText>
+          <w:instrText xml:space="preserve"> PAGEREF _Toc243897632 \h </w:instrText>
         </w:r>
         <w:r>
           <w:rPr>
@@ -3638,13 +3638,13 @@
           <w:lang w:eastAsia="nl-NL"/>
         </w:rPr>
       </w:pPr>
-      <w:hyperlink w:anchor="_Toc243634087" w:history="1">
+      <w:hyperlink w:anchor="_Toc243897633" w:history="1">
         <w:r>
           <w:rPr>
             <w:rStyle w:val="Hyperlink"/>
             <w:noProof/>
           </w:rPr>
-          <w:t>7.3</w:t>
+          <w:t>7.2</w:t>
         </w:r>
         <w:r>
           <w:rPr>
@@ -3660,11 +3660,9 @@
         <w:r>
           <w:rPr>
             <w:rStyle w:val="Hyperlink"/>
-            <w:rFonts w:ascii="Consolas" w:hAnsi="Consolas" w:cs="Consolas"/>
-            <w:noProof/>
-            <w:shd w:val="clear" w:color="auto" w:fill="EEF4F2"/>
-          </w:rPr>
-          <w:t>renderEmployees</w:t>
+            <w:noProof/>
+          </w:rPr>
+          <w:t>OBJECTGEORIËNTEERDE STRUCTUUR</w:t>
         </w:r>
         <w:r>
           <w:rPr>
@@ -3685,7 +3683,7 @@
             <w:noProof/>
             <w:webHidden/>
           </w:rPr>
-          <w:instrText xml:space="preserve"> PAGEREF _Toc243634087 \h </w:instrText>
+          <w:instrText xml:space="preserve"> PAGEREF _Toc243897633 \h </w:instrText>
         </w:r>
         <w:r>
           <w:rPr>
@@ -3705,7 +3703,7 @@
             <w:noProof/>
             <w:webHidden/>
           </w:rPr>
-          <w:t>35</w:t>
+          <w:t>28</w:t>
         </w:r>
         <w:r>
           <w:rPr>
@@ -3732,13 +3730,13 @@
           <w:lang w:eastAsia="nl-NL"/>
         </w:rPr>
       </w:pPr>
-      <w:hyperlink w:anchor="_Toc243634088" w:history="1">
+      <w:hyperlink w:anchor="_Toc243897634" w:history="1">
         <w:r>
           <w:rPr>
             <w:rStyle w:val="Hyperlink"/>
             <w:noProof/>
           </w:rPr>
-          <w:t>7.4</w:t>
+          <w:t>7.3</w:t>
         </w:r>
         <w:r>
           <w:rPr>
@@ -3758,7 +3756,7 @@
             <w:noProof/>
             <w:shd w:val="clear" w:color="auto" w:fill="EEF4F2"/>
           </w:rPr>
-          <w:t>renderStats</w:t>
+          <w:t>renderEmployees</w:t>
         </w:r>
         <w:r>
           <w:rPr>
@@ -3779,7 +3777,7 @@
             <w:noProof/>
             <w:webHidden/>
           </w:rPr>
-          <w:instrText xml:space="preserve"> PAGEREF _Toc243634088 \h </w:instrText>
+          <w:instrText xml:space="preserve"> PAGEREF _Toc243897634 \h </w:instrText>
         </w:r>
         <w:r>
           <w:rPr>
@@ -3799,7 +3797,7 @@
             <w:noProof/>
             <w:webHidden/>
           </w:rPr>
-          <w:t>35</w:t>
+          <w:t>36</w:t>
         </w:r>
         <w:r>
           <w:rPr>
@@ -3826,13 +3824,13 @@
           <w:lang w:eastAsia="nl-NL"/>
         </w:rPr>
       </w:pPr>
-      <w:hyperlink w:anchor="_Toc243634089" w:history="1">
+      <w:hyperlink w:anchor="_Toc243897635" w:history="1">
         <w:r>
           <w:rPr>
             <w:rStyle w:val="Hyperlink"/>
             <w:noProof/>
           </w:rPr>
-          <w:t>7.5</w:t>
+          <w:t>7.4</w:t>
         </w:r>
         <w:r>
           <w:rPr>
@@ -3852,7 +3850,7 @@
             <w:noProof/>
             <w:shd w:val="clear" w:color="auto" w:fill="EEF4F2"/>
           </w:rPr>
-          <w:t>registerSelectedProducts</w:t>
+          <w:t>renderStats</w:t>
         </w:r>
         <w:r>
           <w:rPr>
@@ -3873,7 +3871,7 @@
             <w:noProof/>
             <w:webHidden/>
           </w:rPr>
-          <w:instrText xml:space="preserve"> PAGEREF _Toc243634089 \h </w:instrText>
+          <w:instrText xml:space="preserve"> PAGEREF _Toc243897635 \h </w:instrText>
         </w:r>
         <w:r>
           <w:rPr>
@@ -3920,13 +3918,13 @@
           <w:lang w:eastAsia="nl-NL"/>
         </w:rPr>
       </w:pPr>
-      <w:hyperlink w:anchor="_Toc243634090" w:history="1">
+      <w:hyperlink w:anchor="_Toc243897636" w:history="1">
         <w:r>
           <w:rPr>
             <w:rStyle w:val="Hyperlink"/>
             <w:noProof/>
           </w:rPr>
-          <w:t>7.6</w:t>
+          <w:t>7.5</w:t>
         </w:r>
         <w:r>
           <w:rPr>
@@ -3946,7 +3944,7 @@
             <w:noProof/>
             <w:shd w:val="clear" w:color="auto" w:fill="EEF4F2"/>
           </w:rPr>
-          <w:t>renderAll</w:t>
+          <w:t>registerSelectedProducts</w:t>
         </w:r>
         <w:r>
           <w:rPr>
@@ -3967,7 +3965,7 @@
             <w:noProof/>
             <w:webHidden/>
           </w:rPr>
-          <w:instrText xml:space="preserve"> PAGEREF _Toc243634090 \h </w:instrText>
+          <w:instrText xml:space="preserve"> PAGEREF _Toc243897636 \h </w:instrText>
         </w:r>
         <w:r>
           <w:rPr>
@@ -3987,7 +3985,7 @@
             <w:noProof/>
             <w:webHidden/>
           </w:rPr>
-          <w:t>36</w:t>
+          <w:t>37</w:t>
         </w:r>
         <w:r>
           <w:rPr>
@@ -4014,13 +4012,13 @@
           <w:lang w:eastAsia="nl-NL"/>
         </w:rPr>
       </w:pPr>
-      <w:hyperlink w:anchor="_Toc243634091" w:history="1">
+      <w:hyperlink w:anchor="_Toc243897637" w:history="1">
         <w:r>
           <w:rPr>
             <w:rStyle w:val="Hyperlink"/>
             <w:noProof/>
           </w:rPr>
-          <w:t>7.7</w:t>
+          <w:t>7.6</w:t>
         </w:r>
         <w:r>
           <w:rPr>
@@ -4040,7 +4038,7 @@
             <w:noProof/>
             <w:shd w:val="clear" w:color="auto" w:fill="EEF4F2"/>
           </w:rPr>
-          <w:t>renderEmployeeProducts</w:t>
+          <w:t>renderAll</w:t>
         </w:r>
         <w:r>
           <w:rPr>
@@ -4061,7 +4059,7 @@
             <w:noProof/>
             <w:webHidden/>
           </w:rPr>
-          <w:instrText xml:space="preserve"> PAGEREF _Toc243634091 \h </w:instrText>
+          <w:instrText xml:space="preserve"> PAGEREF _Toc243897637 \h </w:instrText>
         </w:r>
         <w:r>
           <w:rPr>
@@ -4081,7 +4079,7 @@
             <w:noProof/>
             <w:webHidden/>
           </w:rPr>
-          <w:t>36</w:t>
+          <w:t>37</w:t>
         </w:r>
         <w:r>
           <w:rPr>
@@ -4108,13 +4106,13 @@
           <w:lang w:eastAsia="nl-NL"/>
         </w:rPr>
       </w:pPr>
-      <w:hyperlink w:anchor="_Toc243634092" w:history="1">
+      <w:hyperlink w:anchor="_Toc243897638" w:history="1">
         <w:r>
           <w:rPr>
             <w:rStyle w:val="Hyperlink"/>
             <w:noProof/>
           </w:rPr>
-          <w:t>7.8</w:t>
+          <w:t>7.7</w:t>
         </w:r>
         <w:r>
           <w:rPr>
@@ -4134,7 +4132,7 @@
             <w:noProof/>
             <w:shd w:val="clear" w:color="auto" w:fill="EEF4F2"/>
           </w:rPr>
-          <w:t>showToast</w:t>
+          <w:t>renderEmployeeProducts</w:t>
         </w:r>
         <w:r>
           <w:rPr>
@@ -4155,7 +4153,7 @@
             <w:noProof/>
             <w:webHidden/>
           </w:rPr>
-          <w:instrText xml:space="preserve"> PAGEREF _Toc243634092 \h </w:instrText>
+          <w:instrText xml:space="preserve"> PAGEREF _Toc243897638 \h </w:instrText>
         </w:r>
         <w:r>
           <w:rPr>
@@ -4175,7 +4173,7 @@
             <w:noProof/>
             <w:webHidden/>
           </w:rPr>
-          <w:t>36</w:t>
+          <w:t>37</w:t>
         </w:r>
         <w:r>
           <w:rPr>
@@ -4202,13 +4200,13 @@
           <w:lang w:eastAsia="nl-NL"/>
         </w:rPr>
       </w:pPr>
-      <w:hyperlink w:anchor="_Toc243634093" w:history="1">
+      <w:hyperlink w:anchor="_Toc243897639" w:history="1">
         <w:r>
           <w:rPr>
             <w:rStyle w:val="Hyperlink"/>
             <w:noProof/>
           </w:rPr>
-          <w:t>7.9</w:t>
+          <w:t>7.8</w:t>
         </w:r>
         <w:r>
           <w:rPr>
@@ -4224,9 +4222,11 @@
         <w:r>
           <w:rPr>
             <w:rStyle w:val="Hyperlink"/>
-            <w:noProof/>
-          </w:rPr>
-          <w:t>OPSLAGFOUTEN EN TERUGDRAAIEN</w:t>
+            <w:rFonts w:ascii="Consolas" w:hAnsi="Consolas" w:cs="Consolas"/>
+            <w:noProof/>
+            <w:shd w:val="clear" w:color="auto" w:fill="EEF4F2"/>
+          </w:rPr>
+          <w:t>showToast</w:t>
         </w:r>
         <w:r>
           <w:rPr>
@@ -4247,7 +4247,7 @@
             <w:noProof/>
             <w:webHidden/>
           </w:rPr>
-          <w:instrText xml:space="preserve"> PAGEREF _Toc243634093 \h </w:instrText>
+          <w:instrText xml:space="preserve"> PAGEREF _Toc243897639 \h </w:instrText>
         </w:r>
         <w:r>
           <w:rPr>
@@ -4294,13 +4294,13 @@
           <w:lang w:eastAsia="nl-NL"/>
         </w:rPr>
       </w:pPr>
-      <w:hyperlink w:anchor="_Toc243634094" w:history="1">
+      <w:hyperlink w:anchor="_Toc243897640" w:history="1">
         <w:r>
           <w:rPr>
             <w:rStyle w:val="Hyperlink"/>
             <w:noProof/>
           </w:rPr>
-          <w:t>7.10</w:t>
+          <w:t>7.9</w:t>
         </w:r>
         <w:r>
           <w:rPr>
@@ -4318,7 +4318,7 @@
             <w:rStyle w:val="Hyperlink"/>
             <w:noProof/>
           </w:rPr>
-          <w:t>ADMINFUNCTIES</w:t>
+          <w:t>OPSLAGFOUTEN EN TERUGDRAAIEN</w:t>
         </w:r>
         <w:r>
           <w:rPr>
@@ -4339,7 +4339,7 @@
             <w:noProof/>
             <w:webHidden/>
           </w:rPr>
-          <w:instrText xml:space="preserve"> PAGEREF _Toc243634094 \h </w:instrText>
+          <w:instrText xml:space="preserve"> PAGEREF _Toc243897640 \h </w:instrText>
         </w:r>
         <w:r>
           <w:rPr>
@@ -4359,7 +4359,7 @@
             <w:noProof/>
             <w:webHidden/>
           </w:rPr>
-          <w:t>37</w:t>
+          <w:t>38</w:t>
         </w:r>
         <w:r>
           <w:rPr>
@@ -4386,13 +4386,13 @@
           <w:lang w:eastAsia="nl-NL"/>
         </w:rPr>
       </w:pPr>
-      <w:hyperlink w:anchor="_Toc243634095" w:history="1">
+      <w:hyperlink w:anchor="_Toc243897641" w:history="1">
         <w:r>
           <w:rPr>
             <w:rStyle w:val="Hyperlink"/>
             <w:noProof/>
           </w:rPr>
-          <w:t>7.11</w:t>
+          <w:t>7.10</w:t>
         </w:r>
         <w:r>
           <w:rPr>
@@ -4410,39 +4410,7 @@
             <w:rStyle w:val="Hyperlink"/>
             <w:noProof/>
           </w:rPr>
-          <w:t xml:space="preserve">CSV-EXPORT (CLASS </w:t>
-        </w:r>
-        <w:r>
-          <w:rPr>
-            <w:rStyle w:val="Hyperlink"/>
-            <w:rFonts w:ascii="Consolas" w:hAnsi="Consolas" w:cs="Consolas"/>
-            <w:noProof/>
-            <w:shd w:val="clear" w:color="auto" w:fill="EEF4F2"/>
-          </w:rPr>
-          <w:t>CsvExport</w:t>
-        </w:r>
-        <w:r>
-          <w:rPr>
-            <w:rStyle w:val="Hyperlink"/>
-            <w:noProof/>
-          </w:rPr>
-          <w:t xml:space="preserve"> IN </w:t>
-        </w:r>
-        <w:r>
-          <w:rPr>
-            <w:rStyle w:val="Hyperlink"/>
-            <w:rFonts w:ascii="Consolas" w:hAnsi="Consolas" w:cs="Consolas"/>
-            <w:noProof/>
-            <w:shd w:val="clear" w:color="auto" w:fill="EEF4F2"/>
-          </w:rPr>
-          <w:t>CsvExport.js</w:t>
-        </w:r>
-        <w:r>
-          <w:rPr>
-            <w:rStyle w:val="Hyperlink"/>
-            <w:noProof/>
-          </w:rPr>
-          <w:t>)</w:t>
+          <w:t>ADMINFUNCTIES</w:t>
         </w:r>
         <w:r>
           <w:rPr>
@@ -4463,7 +4431,7 @@
             <w:noProof/>
             <w:webHidden/>
           </w:rPr>
-          <w:instrText xml:space="preserve"> PAGEREF _Toc243634095 \h </w:instrText>
+          <w:instrText xml:space="preserve"> PAGEREF _Toc243897641 \h </w:instrText>
         </w:r>
         <w:r>
           <w:rPr>
@@ -4483,7 +4451,7 @@
             <w:noProof/>
             <w:webHidden/>
           </w:rPr>
-          <w:t>37</w:t>
+          <w:t>38</w:t>
         </w:r>
         <w:r>
           <w:rPr>
@@ -4510,13 +4478,13 @@
           <w:lang w:eastAsia="nl-NL"/>
         </w:rPr>
       </w:pPr>
-      <w:hyperlink w:anchor="_Toc243634096" w:history="1">
+      <w:hyperlink w:anchor="_Toc243897642" w:history="1">
         <w:r>
           <w:rPr>
             <w:rStyle w:val="Hyperlink"/>
             <w:noProof/>
           </w:rPr>
-          <w:t>7.12</w:t>
+          <w:t>7.11</w:t>
         </w:r>
         <w:r>
           <w:rPr>
@@ -4534,7 +4502,39 @@
             <w:rStyle w:val="Hyperlink"/>
             <w:noProof/>
           </w:rPr>
-          <w:t>EVENT LISTENERS</w:t>
+          <w:t xml:space="preserve">CSV-EXPORT (CLASS </w:t>
+        </w:r>
+        <w:r>
+          <w:rPr>
+            <w:rStyle w:val="Hyperlink"/>
+            <w:rFonts w:ascii="Consolas" w:hAnsi="Consolas" w:cs="Consolas"/>
+            <w:noProof/>
+            <w:shd w:val="clear" w:color="auto" w:fill="EEF4F2"/>
+          </w:rPr>
+          <w:t>CsvExport</w:t>
+        </w:r>
+        <w:r>
+          <w:rPr>
+            <w:rStyle w:val="Hyperlink"/>
+            <w:noProof/>
+          </w:rPr>
+          <w:t xml:space="preserve"> IN </w:t>
+        </w:r>
+        <w:r>
+          <w:rPr>
+            <w:rStyle w:val="Hyperlink"/>
+            <w:rFonts w:ascii="Consolas" w:hAnsi="Consolas" w:cs="Consolas"/>
+            <w:noProof/>
+            <w:shd w:val="clear" w:color="auto" w:fill="EEF4F2"/>
+          </w:rPr>
+          <w:t>CsvExport.js</w:t>
+        </w:r>
+        <w:r>
+          <w:rPr>
+            <w:rStyle w:val="Hyperlink"/>
+            <w:noProof/>
+          </w:rPr>
+          <w:t>)</w:t>
         </w:r>
         <w:r>
           <w:rPr>
@@ -4555,7 +4555,7 @@
             <w:noProof/>
             <w:webHidden/>
           </w:rPr>
-          <w:instrText xml:space="preserve"> PAGEREF _Toc243634096 \h </w:instrText>
+          <w:instrText xml:space="preserve"> PAGEREF _Toc243897642 \h </w:instrText>
         </w:r>
         <w:r>
           <w:rPr>
@@ -4588,9 +4588,9 @@
     </w:p>
     <w:p>
       <w:pPr>
-        <w:pStyle w:val="Inhopg1"/>
+        <w:pStyle w:val="Inhopg2"/>
         <w:tabs>
-          <w:tab w:val="left" w:pos="720"/>
+          <w:tab w:val="left" w:pos="960"/>
           <w:tab w:val="right" w:leader="dot" w:pos="9628"/>
         </w:tabs>
         <w:rPr>
@@ -4602,13 +4602,13 @@
           <w:lang w:eastAsia="nl-NL"/>
         </w:rPr>
       </w:pPr>
-      <w:hyperlink w:anchor="_Toc243634097" w:history="1">
+      <w:hyperlink w:anchor="_Toc243897643" w:history="1">
         <w:r>
           <w:rPr>
             <w:rStyle w:val="Hyperlink"/>
             <w:noProof/>
           </w:rPr>
-          <w:t>8.</w:t>
+          <w:t>7.12</w:t>
         </w:r>
         <w:r>
           <w:rPr>
@@ -4626,7 +4626,7 @@
             <w:rStyle w:val="Hyperlink"/>
             <w:noProof/>
           </w:rPr>
-          <w:t>DATAMODEL EN KOPPELINGEN.</w:t>
+          <w:t>EVENT LISTENERS</w:t>
         </w:r>
         <w:r>
           <w:rPr>
@@ -4647,7 +4647,7 @@
             <w:noProof/>
             <w:webHidden/>
           </w:rPr>
-          <w:instrText xml:space="preserve"> PAGEREF _Toc243634097 \h </w:instrText>
+          <w:instrText xml:space="preserve"> PAGEREF _Toc243897643 \h </w:instrText>
         </w:r>
         <w:r>
           <w:rPr>
@@ -4680,9 +4680,9 @@
     </w:p>
     <w:p>
       <w:pPr>
-        <w:pStyle w:val="Inhopg2"/>
+        <w:pStyle w:val="Inhopg1"/>
         <w:tabs>
-          <w:tab w:val="left" w:pos="960"/>
+          <w:tab w:val="left" w:pos="720"/>
           <w:tab w:val="right" w:leader="dot" w:pos="9628"/>
         </w:tabs>
         <w:rPr>
@@ -4694,13 +4694,13 @@
           <w:lang w:eastAsia="nl-NL"/>
         </w:rPr>
       </w:pPr>
-      <w:hyperlink w:anchor="_Toc243634098" w:history="1">
+      <w:hyperlink w:anchor="_Toc243897644" w:history="1">
         <w:r>
           <w:rPr>
             <w:rStyle w:val="Hyperlink"/>
             <w:noProof/>
           </w:rPr>
-          <w:t>8.1</w:t>
+          <w:t>8.</w:t>
         </w:r>
         <w:r>
           <w:rPr>
@@ -4718,7 +4718,7 @@
             <w:rStyle w:val="Hyperlink"/>
             <w:noProof/>
           </w:rPr>
-          <w:t>BEDRIJVEN</w:t>
+          <w:t>DATAMODEL EN KOPPELINGEN.</w:t>
         </w:r>
         <w:r>
           <w:rPr>
@@ -4739,7 +4739,7 @@
             <w:noProof/>
             <w:webHidden/>
           </w:rPr>
-          <w:instrText xml:space="preserve"> PAGEREF _Toc243634098 \h </w:instrText>
+          <w:instrText xml:space="preserve"> PAGEREF _Toc243897644 \h </w:instrText>
         </w:r>
         <w:r>
           <w:rPr>
@@ -4759,7 +4759,7 @@
             <w:noProof/>
             <w:webHidden/>
           </w:rPr>
-          <w:t>39</w:t>
+          <w:t>40</w:t>
         </w:r>
         <w:r>
           <w:rPr>
@@ -4786,13 +4786,13 @@
           <w:lang w:eastAsia="nl-NL"/>
         </w:rPr>
       </w:pPr>
-      <w:hyperlink w:anchor="_Toc243634099" w:history="1">
+      <w:hyperlink w:anchor="_Toc243897645" w:history="1">
         <w:r>
           <w:rPr>
             <w:rStyle w:val="Hyperlink"/>
             <w:noProof/>
           </w:rPr>
-          <w:t>8.2</w:t>
+          <w:t>8.1</w:t>
         </w:r>
         <w:r>
           <w:rPr>
@@ -4810,7 +4810,7 @@
             <w:rStyle w:val="Hyperlink"/>
             <w:noProof/>
           </w:rPr>
-          <w:t>CONSUMPTIEPUNTEN</w:t>
+          <w:t>BEDRIJVEN</w:t>
         </w:r>
         <w:r>
           <w:rPr>
@@ -4831,7 +4831,7 @@
             <w:noProof/>
             <w:webHidden/>
           </w:rPr>
-          <w:instrText xml:space="preserve"> PAGEREF _Toc243634099 \h </w:instrText>
+          <w:instrText xml:space="preserve"> PAGEREF _Toc243897645 \h </w:instrText>
         </w:r>
         <w:r>
           <w:rPr>
@@ -4851,7 +4851,7 @@
             <w:noProof/>
             <w:webHidden/>
           </w:rPr>
-          <w:t>39</w:t>
+          <w:t>40</w:t>
         </w:r>
         <w:r>
           <w:rPr>
@@ -4878,13 +4878,13 @@
           <w:lang w:eastAsia="nl-NL"/>
         </w:rPr>
       </w:pPr>
-      <w:hyperlink w:anchor="_Toc243634100" w:history="1">
+      <w:hyperlink w:anchor="_Toc243897646" w:history="1">
         <w:r>
           <w:rPr>
             <w:rStyle w:val="Hyperlink"/>
             <w:noProof/>
           </w:rPr>
-          <w:t>8.3</w:t>
+          <w:t>8.2</w:t>
         </w:r>
         <w:r>
           <w:rPr>
@@ -4902,7 +4902,7 @@
             <w:rStyle w:val="Hyperlink"/>
             <w:noProof/>
           </w:rPr>
-          <w:t>MEDEWERKERS</w:t>
+          <w:t>CONSUMPTIEPUNTEN</w:t>
         </w:r>
         <w:r>
           <w:rPr>
@@ -4923,7 +4923,7 @@
             <w:noProof/>
             <w:webHidden/>
           </w:rPr>
-          <w:instrText xml:space="preserve"> PAGEREF _Toc243634100 \h </w:instrText>
+          <w:instrText xml:space="preserve"> PAGEREF _Toc243897646 \h </w:instrText>
         </w:r>
         <w:r>
           <w:rPr>
@@ -4943,7 +4943,7 @@
             <w:noProof/>
             <w:webHidden/>
           </w:rPr>
-          <w:t>39</w:t>
+          <w:t>40</w:t>
         </w:r>
         <w:r>
           <w:rPr>
@@ -4970,13 +4970,13 @@
           <w:lang w:eastAsia="nl-NL"/>
         </w:rPr>
       </w:pPr>
-      <w:hyperlink w:anchor="_Toc243634101" w:history="1">
+      <w:hyperlink w:anchor="_Toc243897647" w:history="1">
         <w:r>
           <w:rPr>
             <w:rStyle w:val="Hyperlink"/>
             <w:noProof/>
           </w:rPr>
-          <w:t>8.4</w:t>
+          <w:t>8.3</w:t>
         </w:r>
         <w:r>
           <w:rPr>
@@ -4994,7 +4994,7 @@
             <w:rStyle w:val="Hyperlink"/>
             <w:noProof/>
           </w:rPr>
-          <w:t>REGISTRATIES</w:t>
+          <w:t>MEDEWERKERS</w:t>
         </w:r>
         <w:r>
           <w:rPr>
@@ -5015,7 +5015,7 @@
             <w:noProof/>
             <w:webHidden/>
           </w:rPr>
-          <w:instrText xml:space="preserve"> PAGEREF _Toc243634101 \h </w:instrText>
+          <w:instrText xml:space="preserve"> PAGEREF _Toc243897647 \h </w:instrText>
         </w:r>
         <w:r>
           <w:rPr>
@@ -5035,7 +5035,7 @@
             <w:noProof/>
             <w:webHidden/>
           </w:rPr>
-          <w:t>39</w:t>
+          <w:t>40</w:t>
         </w:r>
         <w:r>
           <w:rPr>
@@ -5062,13 +5062,13 @@
           <w:lang w:eastAsia="nl-NL"/>
         </w:rPr>
       </w:pPr>
-      <w:hyperlink w:anchor="_Toc243634102" w:history="1">
+      <w:hyperlink w:anchor="_Toc243897648" w:history="1">
         <w:r>
           <w:rPr>
             <w:rStyle w:val="Hyperlink"/>
             <w:noProof/>
           </w:rPr>
-          <w:t>8.5</w:t>
+          <w:t>8.4</w:t>
         </w:r>
         <w:r>
           <w:rPr>
@@ -5086,7 +5086,7 @@
             <w:rStyle w:val="Hyperlink"/>
             <w:noProof/>
           </w:rPr>
-          <w:t>SLIMME KOELKAST</w:t>
+          <w:t>REGISTRATIES</w:t>
         </w:r>
         <w:r>
           <w:rPr>
@@ -5107,7 +5107,7 @@
             <w:noProof/>
             <w:webHidden/>
           </w:rPr>
-          <w:instrText xml:space="preserve"> PAGEREF _Toc243634102 \h </w:instrText>
+          <w:instrText xml:space="preserve"> PAGEREF _Toc243897648 \h </w:instrText>
         </w:r>
         <w:r>
           <w:rPr>
@@ -5154,13 +5154,13 @@
           <w:lang w:eastAsia="nl-NL"/>
         </w:rPr>
       </w:pPr>
-      <w:hyperlink w:anchor="_Toc243634103" w:history="1">
+      <w:hyperlink w:anchor="_Toc243897649" w:history="1">
         <w:r>
           <w:rPr>
             <w:rStyle w:val="Hyperlink"/>
             <w:noProof/>
           </w:rPr>
-          <w:t>8.6</w:t>
+          <w:t>8.5</w:t>
         </w:r>
         <w:r>
           <w:rPr>
@@ -5178,7 +5178,7 @@
             <w:rStyle w:val="Hyperlink"/>
             <w:noProof/>
           </w:rPr>
-          <w:t>DEMO GEZICHTSHERKENNING</w:t>
+          <w:t>SLIMME KOELKAST</w:t>
         </w:r>
         <w:r>
           <w:rPr>
@@ -5199,7 +5199,7 @@
             <w:noProof/>
             <w:webHidden/>
           </w:rPr>
-          <w:instrText xml:space="preserve"> PAGEREF _Toc243634103 \h </w:instrText>
+          <w:instrText xml:space="preserve"> PAGEREF _Toc243897649 \h </w:instrText>
         </w:r>
         <w:r>
           <w:rPr>
@@ -5219,7 +5219,7 @@
             <w:noProof/>
             <w:webHidden/>
           </w:rPr>
-          <w:t>40</w:t>
+          <w:t>41</w:t>
         </w:r>
         <w:r>
           <w:rPr>
@@ -5232,9 +5232,9 @@
     </w:p>
     <w:p>
       <w:pPr>
-        <w:pStyle w:val="Inhopg1"/>
+        <w:pStyle w:val="Inhopg2"/>
         <w:tabs>
-          <w:tab w:val="left" w:pos="720"/>
+          <w:tab w:val="left" w:pos="960"/>
           <w:tab w:val="right" w:leader="dot" w:pos="9628"/>
         </w:tabs>
         <w:rPr>
@@ -5246,13 +5246,13 @@
           <w:lang w:eastAsia="nl-NL"/>
         </w:rPr>
       </w:pPr>
-      <w:hyperlink w:anchor="_Toc243634104" w:history="1">
+      <w:hyperlink w:anchor="_Toc243897650" w:history="1">
         <w:r>
           <w:rPr>
             <w:rStyle w:val="Hyperlink"/>
             <w:noProof/>
           </w:rPr>
-          <w:t>9.</w:t>
+          <w:t>8.6</w:t>
         </w:r>
         <w:r>
           <w:rPr>
@@ -5270,7 +5270,7 @@
             <w:rStyle w:val="Hyperlink"/>
             <w:noProof/>
           </w:rPr>
-          <w:t>BELANGRIJKE DEMO-BEPERKINGEN.</w:t>
+          <w:t>DEMO GEZICHTSHERKENNING</w:t>
         </w:r>
         <w:r>
           <w:rPr>
@@ -5291,7 +5291,7 @@
             <w:noProof/>
             <w:webHidden/>
           </w:rPr>
-          <w:instrText xml:space="preserve"> PAGEREF _Toc243634104 \h </w:instrText>
+          <w:instrText xml:space="preserve"> PAGEREF _Toc243897650 \h </w:instrText>
         </w:r>
         <w:r>
           <w:rPr>
@@ -5338,13 +5338,13 @@
           <w:lang w:eastAsia="nl-NL"/>
         </w:rPr>
       </w:pPr>
-      <w:hyperlink w:anchor="_Toc243634105" w:history="1">
+      <w:hyperlink w:anchor="_Toc243897651" w:history="1">
         <w:r>
           <w:rPr>
             <w:rStyle w:val="Hyperlink"/>
             <w:noProof/>
           </w:rPr>
-          <w:t>10.</w:t>
+          <w:t>9.</w:t>
         </w:r>
         <w:r>
           <w:rPr>
@@ -5362,7 +5362,7 @@
             <w:rStyle w:val="Hyperlink"/>
             <w:noProof/>
           </w:rPr>
-          <w:t>CODE UITLEGGEN TIJDENS EEN PRESENTATIE.</w:t>
+          <w:t>BELANGRIJKE DEMO-BEPERKINGEN.</w:t>
         </w:r>
         <w:r>
           <w:rPr>
@@ -5383,7 +5383,7 @@
             <w:noProof/>
             <w:webHidden/>
           </w:rPr>
-          <w:instrText xml:space="preserve"> PAGEREF _Toc243634105 \h </w:instrText>
+          <w:instrText xml:space="preserve"> PAGEREF _Toc243897651 \h </w:instrText>
         </w:r>
         <w:r>
           <w:rPr>
@@ -5403,7 +5403,7 @@
             <w:noProof/>
             <w:webHidden/>
           </w:rPr>
-          <w:t>43</w:t>
+          <w:t>42</w:t>
         </w:r>
         <w:r>
           <w:rPr>
@@ -5430,13 +5430,13 @@
           <w:lang w:eastAsia="nl-NL"/>
         </w:rPr>
       </w:pPr>
-      <w:hyperlink w:anchor="_Toc243634106" w:history="1">
+      <w:hyperlink w:anchor="_Toc243897652" w:history="1">
         <w:r>
           <w:rPr>
             <w:rStyle w:val="Hyperlink"/>
             <w:noProof/>
           </w:rPr>
-          <w:t>11.</w:t>
+          <w:t>10.</w:t>
         </w:r>
         <w:r>
           <w:rPr>
@@ -5454,6 +5454,98 @@
             <w:rStyle w:val="Hyperlink"/>
             <w:noProof/>
           </w:rPr>
+          <w:t>CODE UITLEGGEN TIJDENS EEN PRESENTATIE.</w:t>
+        </w:r>
+        <w:r>
+          <w:rPr>
+            <w:noProof/>
+            <w:webHidden/>
+          </w:rPr>
+          <w:tab/>
+        </w:r>
+        <w:r>
+          <w:rPr>
+            <w:noProof/>
+            <w:webHidden/>
+          </w:rPr>
+          <w:fldChar w:fldCharType="begin"/>
+        </w:r>
+        <w:r>
+          <w:rPr>
+            <w:noProof/>
+            <w:webHidden/>
+          </w:rPr>
+          <w:instrText xml:space="preserve"> PAGEREF _Toc243897652 \h </w:instrText>
+        </w:r>
+        <w:r>
+          <w:rPr>
+            <w:noProof/>
+            <w:webHidden/>
+          </w:rPr>
+        </w:r>
+        <w:r>
+          <w:rPr>
+            <w:noProof/>
+            <w:webHidden/>
+          </w:rPr>
+          <w:fldChar w:fldCharType="separate"/>
+        </w:r>
+        <w:r>
+          <w:rPr>
+            <w:noProof/>
+            <w:webHidden/>
+          </w:rPr>
+          <w:t>44</w:t>
+        </w:r>
+        <w:r>
+          <w:rPr>
+            <w:noProof/>
+            <w:webHidden/>
+          </w:rPr>
+          <w:fldChar w:fldCharType="end"/>
+        </w:r>
+      </w:hyperlink>
+    </w:p>
+    <w:p>
+      <w:pPr>
+        <w:pStyle w:val="Inhopg1"/>
+        <w:tabs>
+          <w:tab w:val="left" w:pos="720"/>
+          <w:tab w:val="right" w:leader="dot" w:pos="9628"/>
+        </w:tabs>
+        <w:rPr>
+          <w:rFonts w:asciiTheme="minorHAnsi" w:eastAsiaTheme="minorEastAsia" w:hAnsiTheme="minorHAnsi"/>
+          <w:noProof/>
+          <w:color w:val="auto"/>
+          <w:sz w:val="24"/>
+          <w:szCs w:val="24"/>
+          <w:lang w:eastAsia="nl-NL"/>
+        </w:rPr>
+      </w:pPr>
+      <w:hyperlink w:anchor="_Toc243897653" w:history="1">
+        <w:r>
+          <w:rPr>
+            <w:rStyle w:val="Hyperlink"/>
+            <w:noProof/>
+          </w:rPr>
+          <w:t>11.</w:t>
+        </w:r>
+        <w:r>
+          <w:rPr>
+            <w:rFonts w:asciiTheme="minorHAnsi" w:eastAsiaTheme="minorEastAsia" w:hAnsiTheme="minorHAnsi"/>
+            <w:noProof/>
+            <w:color w:val="auto"/>
+            <w:sz w:val="24"/>
+            <w:szCs w:val="24"/>
+            <w:lang w:eastAsia="nl-NL"/>
+          </w:rPr>
+          <w:tab/>
+        </w:r>
+        <w:r>
+          <w:rPr>
+            <w:rStyle w:val="Hyperlink"/>
+            <w:noProof/>
+          </w:rPr>
           <w:t>MOGELIJKE VERVOLGSTAPPEN.</w:t>
         </w:r>
         <w:r>
@@ -5475,7 +5567,7 @@
             <w:noProof/>
             <w:webHidden/>
           </w:rPr>
-          <w:instrText xml:space="preserve"> PAGEREF _Toc243634106 \h </w:instrText>
+          <w:instrText xml:space="preserve"> PAGEREF _Toc243897653 \h </w:instrText>
         </w:r>
         <w:r>
           <w:rPr>
@@ -5495,7 +5587,7 @@
             <w:noProof/>
             <w:webHidden/>
           </w:rPr>
-          <w:t>44</w:t>
+          <w:t>45</w:t>
         </w:r>
         <w:r>
           <w:rPr>
@@ -5528,7 +5620,7 @@
         </w:numPr>
       </w:pPr>
       <w:bookmarkStart w:id="1" w:name="k1"/>
-      <w:bookmarkStart w:id="2" w:name="_Toc243634050"/>
+      <w:bookmarkStart w:id="2" w:name="_Toc243897596"/>
       <w:r>
         <w:t>DOEL VAN DE APPLICATIE.</w:t>
       </w:r>
@@ -5610,7 +5702,7 @@
         </w:numPr>
       </w:pPr>
       <w:bookmarkStart w:id="3" w:name="k2"/>
-      <w:bookmarkStart w:id="4" w:name="_Toc243634051"/>
+      <w:bookmarkStart w:id="4" w:name="_Toc243897597"/>
       <w:r>
         <w:t>BESTANDEN.</w:t>
       </w:r>
@@ -5747,7 +5839,7 @@
                 <w:sz w:val="14"/>
                 <w:shd w:val="clear" w:color="auto" w:fill="EEF4F2"/>
               </w:rPr>
-              <w:t>assets/css/styles.css</w:t>
+              <w:t>assets/css/</w:t>
             </w:r>
           </w:p>
         </w:tc>
@@ -5764,7 +5856,22 @@
                 <w:sz w:val="16"/>
                 <w:szCs w:val="16"/>
               </w:rPr>
-              <w:t>De volledige vormgeving, kleuren, layout en mobiele weergave</w:t>
+              <w:t xml:space="preserve">De vormgeving, kleuren, layout en mobiele weergave, verdeeld over achttien stylesheets per onderdeel (sinds versie 3.20, zie hoofdstuk 6). </w:t>
+            </w:r>
+            <w:r>
+              <w:rPr>
+                <w:rFonts w:ascii="Consolas" w:hAnsi="Consolas" w:cs="Consolas"/>
+                <w:sz w:val="14"/>
+                <w:shd w:val="clear" w:color="auto" w:fill="EEF4F2"/>
+              </w:rPr>
+              <w:t>index.html</w:t>
+            </w:r>
+            <w:r>
+              <w:rPr>
+                <w:sz w:val="16"/>
+                <w:szCs w:val="16"/>
+              </w:rPr>
+              <w:t xml:space="preserve"> laadt ze in een vaste volgorde</w:t>
             </w:r>
           </w:p>
         </w:tc>
@@ -8166,7 +8273,7 @@
                 <w:sz w:val="16"/>
                 <w:szCs w:val="16"/>
               </w:rPr>
-              <w:t>Unit tests (811) voor de regels, de opslag, de export, het thema, de welkom- en gezichtsherkenningsfuncties, herkennen met de pas, de controller, de beveiliging en regressietests voor opgeloste bugs</w:t>
+              <w:t>Unit tests (812) voor de regels, de opslag, de export, het thema, de welkom- en gezichtsherkenningsfuncties, herkennen met de pas, de controller, de beveiliging en regressietests voor opgeloste bugs</w:t>
             </w:r>
           </w:p>
         </w:tc>
@@ -8316,7 +8423,22 @@
                 <w:sz w:val="16"/>
                 <w:szCs w:val="16"/>
               </w:rPr>
-              <w:t>Tests voor de configuratie: geen externe bronnen, de Content-Security-Policy, lokale lettertypes en face-api (met de SHA-256-controlegetallen), en de CI-workflow</w:t>
+              <w:t xml:space="preserve">Tests voor de configuratie: geen externe bronnen, iedere stylesheet precies één keer gelinkt in </w:t>
+            </w:r>
+            <w:r>
+              <w:rPr>
+                <w:rFonts w:ascii="Consolas" w:hAnsi="Consolas" w:cs="Consolas"/>
+                <w:sz w:val="14"/>
+                <w:shd w:val="clear" w:color="auto" w:fill="EEF4F2"/>
+              </w:rPr>
+              <w:t>index.html</w:t>
+            </w:r>
+            <w:r>
+              <w:rPr>
+                <w:sz w:val="16"/>
+                <w:szCs w:val="16"/>
+              </w:rPr>
+              <w:t>, de Content-Security-Policy, lokale lettertypes en face-api (met de SHA-256-controlegetallen), en de CI-workflow</w:t>
             </w:r>
           </w:p>
         </w:tc>
@@ -9340,7 +9462,7 @@
         </w:numPr>
       </w:pPr>
       <w:bookmarkStart w:id="5" w:name="k3"/>
-      <w:bookmarkStart w:id="6" w:name="_Toc243634052"/>
+      <w:bookmarkStart w:id="6" w:name="_Toc243897598"/>
       <w:r>
         <w:t>DE WEBSITE STARTEN.</w:t>
       </w:r>
@@ -9562,7 +9684,7 @@
         </w:numPr>
       </w:pPr>
       <w:bookmarkStart w:id="7" w:name="k4"/>
-      <w:bookmarkStart w:id="8" w:name="_Toc243634053"/>
+      <w:bookmarkStart w:id="8" w:name="_Toc243897599"/>
       <w:r>
         <w:t>GEBRUIKERSHANDLEIDING.</w:t>
       </w:r>
@@ -9575,7 +9697,7 @@
         <w:keepNext/>
       </w:pPr>
       <w:bookmarkStart w:id="9" w:name="k5"/>
-      <w:bookmarkStart w:id="10" w:name="_Toc243634054"/>
+      <w:bookmarkStart w:id="10" w:name="_Toc243897600"/>
       <w:r>
         <w:t>EEN MEDEWERKER ZOEKEN</w:t>
       </w:r>
@@ -9630,7 +9752,7 @@
         <w:keepNext/>
       </w:pPr>
       <w:bookmarkStart w:id="11" w:name="k6"/>
-      <w:bookmarkStart w:id="12" w:name="_Toc243634055"/>
+      <w:bookmarkStart w:id="12" w:name="_Toc243897601"/>
       <w:r>
         <w:t>EEN PRODUCT REGISTREREN</w:t>
       </w:r>
@@ -9879,7 +10001,7 @@
         <w:keepNext/>
       </w:pPr>
       <w:bookmarkStart w:id="13" w:name="k7"/>
-      <w:bookmarkStart w:id="14" w:name="_Toc243634056"/>
+      <w:bookmarkStart w:id="14" w:name="_Toc243897602"/>
       <w:r>
         <w:t>ADMIN-DASHBOARD OPENEN</w:t>
       </w:r>
@@ -10010,7 +10132,7 @@
         <w:keepNext/>
       </w:pPr>
       <w:bookmarkStart w:id="15" w:name="k8"/>
-      <w:bookmarkStart w:id="16" w:name="_Toc243634057"/>
+      <w:bookmarkStart w:id="16" w:name="_Toc243897603"/>
       <w:r>
         <w:t>REGISTRATIES BEHEREN</w:t>
       </w:r>
@@ -10296,7 +10418,7 @@
         <w:keepNext/>
       </w:pPr>
       <w:bookmarkStart w:id="17" w:name="k9"/>
-      <w:bookmarkStart w:id="18" w:name="_Toc243634058"/>
+      <w:bookmarkStart w:id="18" w:name="_Toc243897604"/>
       <w:r>
         <w:t>MEDEWERKERS BEHEREN</w:t>
       </w:r>
@@ -10630,7 +10752,7 @@
         <w:keepNext/>
       </w:pPr>
       <w:bookmarkStart w:id="19" w:name="k10"/>
-      <w:bookmarkStart w:id="20" w:name="_Toc243634059"/>
+      <w:bookmarkStart w:id="20" w:name="_Toc243897605"/>
       <w:r>
         <w:t>PRODUCTEN BEHEREN</w:t>
       </w:r>
@@ -10758,7 +10880,7 @@
         <w:keepNext/>
       </w:pPr>
       <w:bookmarkStart w:id="21" w:name="k11"/>
-      <w:bookmarkStart w:id="22" w:name="_Toc243634060"/>
+      <w:bookmarkStart w:id="22" w:name="_Toc243897606"/>
       <w:r>
         <w:t>BEDRIJVEN EN CONSUMPTIEPUNTEN BEHEREN</w:t>
       </w:r>
@@ -10921,7 +11043,7 @@
         <w:keepNext/>
       </w:pPr>
       <w:bookmarkStart w:id="23" w:name="k12"/>
-      <w:bookmarkStart w:id="24" w:name="_Toc243634061"/>
+      <w:bookmarkStart w:id="24" w:name="_Toc243897607"/>
       <w:r>
         <w:t>VOORRAAD BEHEREN</w:t>
       </w:r>
@@ -11139,7 +11261,7 @@
         <w:keepNext/>
       </w:pPr>
       <w:bookmarkStart w:id="25" w:name="k13"/>
-      <w:bookmarkStart w:id="26" w:name="_Toc243634062"/>
+      <w:bookmarkStart w:id="26" w:name="_Toc243897608"/>
       <w:r>
         <w:t>LOGBOEK BEKIJKEN</w:t>
       </w:r>
@@ -11179,7 +11301,7 @@
         <w:keepNext/>
       </w:pPr>
       <w:bookmarkStart w:id="27" w:name="k14"/>
-      <w:bookmarkStart w:id="28" w:name="_Toc243634063"/>
+      <w:bookmarkStart w:id="28" w:name="_Toc243897609"/>
       <w:r>
         <w:t>ALLE GEGEVENS WISSEN</w:t>
       </w:r>
@@ -11305,7 +11427,7 @@
         <w:keepNext/>
       </w:pPr>
       <w:bookmarkStart w:id="29" w:name="k15"/>
-      <w:bookmarkStart w:id="30" w:name="_Toc243634064"/>
+      <w:bookmarkStart w:id="30" w:name="_Toc243897610"/>
       <w:r>
         <w:t>MODAL SLUITEN EN UITLOGGEN</w:t>
       </w:r>
@@ -11379,7 +11501,7 @@
         <w:keepNext/>
       </w:pPr>
       <w:bookmarkStart w:id="31" w:name="k16"/>
-      <w:bookmarkStart w:id="32" w:name="_Toc243634065"/>
+      <w:bookmarkStart w:id="32" w:name="_Toc243897611"/>
       <w:r>
         <w:t>CSV EXPORTEREN</w:t>
       </w:r>
@@ -11763,7 +11885,7 @@
         <w:keepNext/>
       </w:pPr>
       <w:bookmarkStart w:id="33" w:name="k17"/>
-      <w:bookmarkStart w:id="34" w:name="_Toc243634066"/>
+      <w:bookmarkStart w:id="34" w:name="_Toc243897612"/>
       <w:r>
         <w:t>LICHT OF DONKER THEMA</w:t>
       </w:r>
@@ -11870,7 +11992,7 @@
         <w:keepNext/>
       </w:pPr>
       <w:bookmarkStart w:id="35" w:name="k18"/>
-      <w:bookmarkStart w:id="36" w:name="_Toc243634067"/>
+      <w:bookmarkStart w:id="36" w:name="_Toc243897613"/>
       <w:r>
         <w:t>WELKOM EN "ZELFDE ALS VORIGE KEER"</w:t>
       </w:r>
@@ -11957,7 +12079,7 @@
         <w:keepNext/>
       </w:pPr>
       <w:bookmarkStart w:id="37" w:name="k19"/>
-      <w:bookmarkStart w:id="38" w:name="_Toc243634068"/>
+      <w:bookmarkStart w:id="38" w:name="_Toc243897614"/>
       <w:r>
         <w:t>DEMO GEZICHTSHERKENNING</w:t>
       </w:r>
@@ -12203,7 +12325,7 @@
         <w:keepNext/>
       </w:pPr>
       <w:bookmarkStart w:id="39" w:name="k20"/>
-      <w:bookmarkStart w:id="40" w:name="_Toc243634069"/>
+      <w:bookmarkStart w:id="40" w:name="_Toc243897615"/>
       <w:r>
         <w:t>HERKENNEN MET DE PAS</w:t>
       </w:r>
@@ -12400,7 +12522,7 @@
         <w:keepNext/>
       </w:pPr>
       <w:bookmarkStart w:id="41" w:name="k21"/>
-      <w:bookmarkStart w:id="42" w:name="_Toc243634070"/>
+      <w:bookmarkStart w:id="42" w:name="_Toc243897616"/>
       <w:r>
         <w:t>SLIMME KOELKAST (DEMO)</w:t>
       </w:r>
@@ -13023,7 +13145,7 @@
         <w:keepNext/>
       </w:pPr>
       <w:bookmarkStart w:id="43" w:name="k22"/>
-      <w:bookmarkStart w:id="44" w:name="_Toc243634071"/>
+      <w:bookmarkStart w:id="44" w:name="_Toc243897617"/>
       <w:r>
         <w:t>STANDBY EN TIK OM TE SCANNEN (DEMO)</w:t>
       </w:r>
@@ -13252,7 +13374,7 @@
         </w:numPr>
       </w:pPr>
       <w:bookmarkStart w:id="45" w:name="k23"/>
-      <w:bookmarkStart w:id="46" w:name="_Toc243634072"/>
+      <w:bookmarkStart w:id="46" w:name="_Toc243897618"/>
       <w:r>
         <w:t xml:space="preserve">UITLEG VAN </w:t>
       </w:r>
@@ -13276,7 +13398,7 @@
         <w:keepNext/>
       </w:pPr>
       <w:bookmarkStart w:id="47" w:name="k24"/>
-      <w:bookmarkStart w:id="48" w:name="_Toc243634073"/>
+      <w:bookmarkStart w:id="48" w:name="_Toc243897619"/>
       <w:r>
         <w:t>METADATA EN EXTERNE BESTANDEN</w:t>
       </w:r>
@@ -13492,15 +13614,62 @@
         <w:contextualSpacing w:val="0"/>
       </w:pPr>
       <w:r>
-        <w:rPr>
-          <w:rFonts w:ascii="Consolas" w:hAnsi="Consolas" w:cs="Consolas"/>
-          <w:sz w:val="18"/>
-          <w:shd w:val="clear" w:color="auto" w:fill="EEF4F2"/>
-        </w:rPr>
-        <w:t>assets/css/styles.css</w:t>
-      </w:r>
-      <w:r>
-        <w:t xml:space="preserve"> voor de vormgeving. De lettertypes worden daar met </w:t>
+        <w:t xml:space="preserve">De achttien stylesheets uit </w:t>
+      </w:r>
+      <w:r>
+        <w:rPr>
+          <w:rFonts w:ascii="Consolas" w:hAnsi="Consolas" w:cs="Consolas"/>
+          <w:sz w:val="18"/>
+          <w:shd w:val="clear" w:color="auto" w:fill="EEF4F2"/>
+        </w:rPr>
+        <w:t>assets/css/</w:t>
+      </w:r>
+      <w:r>
+        <w:t xml:space="preserve"> voor de vormgeving, elk met een eigen </w:t>
+      </w:r>
+      <w:r>
+        <w:rPr>
+          <w:rFonts w:ascii="Consolas" w:hAnsi="Consolas" w:cs="Consolas"/>
+          <w:sz w:val="18"/>
+          <w:shd w:val="clear" w:color="auto" w:fill="EEF4F2"/>
+        </w:rPr>
+        <w:t>&lt;link rel="stylesheet"&gt;</w:t>
+      </w:r>
+      <w:r>
+        <w:t xml:space="preserve">, van </w:t>
+      </w:r>
+      <w:r>
+        <w:rPr>
+          <w:rFonts w:ascii="Consolas" w:hAnsi="Consolas" w:cs="Consolas"/>
+          <w:sz w:val="18"/>
+          <w:shd w:val="clear" w:color="auto" w:fill="EEF4F2"/>
+        </w:rPr>
+        <w:t>base.css</w:t>
+      </w:r>
+      <w:r>
+        <w:t xml:space="preserve"> tot en met </w:t>
+      </w:r>
+      <w:r>
+        <w:rPr>
+          <w:rFonts w:ascii="Consolas" w:hAnsi="Consolas" w:cs="Consolas"/>
+          <w:sz w:val="18"/>
+          <w:shd w:val="clear" w:color="auto" w:fill="EEF4F2"/>
+        </w:rPr>
+        <w:t>responsive.css</w:t>
+      </w:r>
+      <w:r>
+        <w:t xml:space="preserve"> (zie hoofdstuk 6). De lettertypes worden in </w:t>
+      </w:r>
+      <w:r>
+        <w:rPr>
+          <w:rFonts w:ascii="Consolas" w:hAnsi="Consolas" w:cs="Consolas"/>
+          <w:sz w:val="18"/>
+          <w:shd w:val="clear" w:color="auto" w:fill="EEF4F2"/>
+        </w:rPr>
+        <w:t>base.css</w:t>
+      </w:r>
+      <w:r>
+        <w:t xml:space="preserve"> met </w:t>
       </w:r>
       <w:r>
         <w:rPr>
@@ -13552,7 +13721,7 @@
         <w:keepNext/>
       </w:pPr>
       <w:bookmarkStart w:id="49" w:name="k25"/>
-      <w:bookmarkStart w:id="50" w:name="_Toc243634074"/>
+      <w:bookmarkStart w:id="50" w:name="_Toc243897620"/>
       <w:r>
         <w:t>NAVIGATIEBALK</w:t>
       </w:r>
@@ -13765,7 +13934,7 @@
         <w:keepNext/>
       </w:pPr>
       <w:bookmarkStart w:id="51" w:name="k26"/>
-      <w:bookmarkStart w:id="52" w:name="_Toc243634075"/>
+      <w:bookmarkStart w:id="52" w:name="_Toc243897621"/>
       <w:r>
         <w:t>HERO-GEDEELTE</w:t>
       </w:r>
@@ -13810,7 +13979,7 @@
         <w:keepNext/>
       </w:pPr>
       <w:bookmarkStart w:id="53" w:name="k27"/>
-      <w:bookmarkStart w:id="54" w:name="_Toc243634076"/>
+      <w:bookmarkStart w:id="54" w:name="_Toc243897622"/>
       <w:r>
         <w:t>MEDEWERKERLIJST</w:t>
       </w:r>
@@ -14147,7 +14316,7 @@
         <w:keepNext/>
       </w:pPr>
       <w:bookmarkStart w:id="55" w:name="k28"/>
-      <w:bookmarkStart w:id="56" w:name="_Toc243634077"/>
+      <w:bookmarkStart w:id="56" w:name="_Toc243897623"/>
       <w:r>
         <w:t>STATISTIEKEN</w:t>
       </w:r>
@@ -14230,7 +14399,7 @@
         <w:keepNext/>
       </w:pPr>
       <w:bookmarkStart w:id="57" w:name="k29"/>
-      <w:bookmarkStart w:id="58" w:name="_Toc243634078"/>
+      <w:bookmarkStart w:id="58" w:name="_Toc243897624"/>
       <w:r>
         <w:t>VENSTERS (MODALS)</w:t>
       </w:r>
@@ -14862,7 +15031,7 @@
         <w:keepNext/>
       </w:pPr>
       <w:bookmarkStart w:id="59" w:name="k30"/>
-      <w:bookmarkStart w:id="60" w:name="_Toc243634079"/>
+      <w:bookmarkStart w:id="60" w:name="_Toc243897625"/>
       <w:r>
         <w:t>WAARSCHUWING BIJ OPENEN ALS LOS BESTAND</w:t>
       </w:r>
@@ -14907,20 +15076,20 @@
         </w:numPr>
       </w:pPr>
       <w:bookmarkStart w:id="61" w:name="k31"/>
-      <w:bookmarkStart w:id="62" w:name="_Toc243634080"/>
-      <w:r>
-        <w:t xml:space="preserve">UITLEG VAN </w:t>
-      </w:r>
-      <w:r>
-        <w:rPr>
-          <w:rFonts w:ascii="Consolas" w:hAnsi="Consolas" w:cs="Consolas"/>
-          <w:sz w:val="18"/>
-          <w:shd w:val="clear" w:color="auto" w:fill="EEF4F2"/>
-        </w:rPr>
-        <w:t>assets/css/styles.css</w:t>
-      </w:r>
-      <w:r>
-        <w:t>.</w:t>
+      <w:bookmarkStart w:id="62" w:name="_Toc243897626"/>
+      <w:r>
+        <w:t>UITLEG VAN DE CSS (</w:t>
+      </w:r>
+      <w:r>
+        <w:rPr>
+          <w:rFonts w:ascii="Consolas" w:hAnsi="Consolas" w:cs="Consolas"/>
+          <w:sz w:val="18"/>
+          <w:shd w:val="clear" w:color="auto" w:fill="EEF4F2"/>
+        </w:rPr>
+        <w:t>assets/css/</w:t>
+      </w:r>
+      <w:r>
+        <w:t>).</w:t>
       </w:r>
       <w:bookmarkEnd w:id="61"/>
       <w:bookmarkEnd w:id="62"/>
@@ -14931,15 +15100,1319 @@
         <w:keepNext/>
       </w:pPr>
       <w:bookmarkStart w:id="63" w:name="k32"/>
-      <w:bookmarkStart w:id="64" w:name="_Toc243634081"/>
-      <w:r>
-        <w:t>CSS-VARIABELEN</w:t>
+      <w:bookmarkStart w:id="64" w:name="_Toc243897627"/>
+      <w:r>
+        <w:t>BESTANDEN EN VOLGORDE</w:t>
       </w:r>
       <w:bookmarkEnd w:id="63"/>
       <w:bookmarkEnd w:id="64"/>
     </w:p>
     <w:p>
       <w:r>
+        <w:t>Tot en met versie 3.19 stond alle vormgeving in één bestand (</w:t>
+      </w:r>
+      <w:r>
+        <w:rPr>
+          <w:rFonts w:ascii="Consolas" w:hAnsi="Consolas" w:cs="Consolas"/>
+          <w:sz w:val="18"/>
+          <w:shd w:val="clear" w:color="auto" w:fill="EEF4F2"/>
+        </w:rPr>
+        <w:t>styles.css</w:t>
+      </w:r>
+      <w:r>
+        <w:t>, 2706 regels). Sinds versie 3.20 staat die in achttien kleinere stylesheets, één per onderdeel. Er is daarbij niets aan de regels zelf veranderd: het oude bestand is in aaneengesloten stukken geknipt, in de oorspronkelijke volgorde, en ieder stuk kreeg bovenaan een korte uitleg.</w:t>
+      </w:r>
+    </w:p>
+    <w:p>
+      <w:r>
+        <w:rPr>
+          <w:rFonts w:ascii="Consolas" w:hAnsi="Consolas" w:cs="Consolas"/>
+          <w:sz w:val="18"/>
+          <w:shd w:val="clear" w:color="auto" w:fill="EEF4F2"/>
+        </w:rPr>
+        <w:t>index.html</w:t>
+      </w:r>
+      <w:r>
+        <w:t xml:space="preserve"> laadt de bestanden met losse </w:t>
+      </w:r>
+      <w:r>
+        <w:rPr>
+          <w:rFonts w:ascii="Consolas" w:hAnsi="Consolas" w:cs="Consolas"/>
+          <w:sz w:val="18"/>
+          <w:shd w:val="clear" w:color="auto" w:fill="EEF4F2"/>
+        </w:rPr>
+        <w:t>&lt;link rel="stylesheet"&gt;</w:t>
+      </w:r>
+      <w:r>
+        <w:t>-regels in deze volgorde. Die volgorde is belangrijk: hebben twee regels dezelfde sterkte, dan wint de regel die later komt. Zet de bestanden dus niet in een andere volgorde.</w:t>
+      </w:r>
+    </w:p>
+    <w:tbl>
+      <w:tblPr>
+        <w:tblW w:w="9638" w:type="dxa"/>
+        <w:tblBorders>
+          <w:top w:val="single" w:sz="4" w:space="0" w:color="C9D8D5"/>
+          <w:left w:val="single" w:sz="4" w:space="0" w:color="C9D8D5"/>
+          <w:bottom w:val="single" w:sz="4" w:space="0" w:color="C9D8D5"/>
+          <w:right w:val="single" w:sz="4" w:space="0" w:color="C9D8D5"/>
+          <w:insideH w:val="single" w:sz="4" w:space="0" w:color="C9D8D5"/>
+          <w:insideV w:val="single" w:sz="4" w:space="0" w:color="C9D8D5"/>
+        </w:tblBorders>
+        <w:tblLayout w:type="fixed"/>
+        <w:tblCellMar>
+          <w:top w:w="40" w:type="dxa"/>
+          <w:left w:w="80" w:type="dxa"/>
+          <w:bottom w:w="40" w:type="dxa"/>
+          <w:right w:w="80" w:type="dxa"/>
+        </w:tblCellMar>
+        <w:tblLook w:val="04A0" w:firstRow="1" w:lastRow="0" w:firstColumn="1" w:lastColumn="0" w:noHBand="0" w:noVBand="1"/>
+      </w:tblPr>
+      <w:tblGrid>
+        <w:gridCol w:w="1100"/>
+        <w:gridCol w:w="2320"/>
+        <w:gridCol w:w="6218"/>
+      </w:tblGrid>
+      <w:tr>
+        <w:trPr>
+          <w:cantSplit/>
+          <w:tblHeader/>
+        </w:trPr>
+        <w:tc>
+          <w:tcPr>
+            <w:tcW w:w="1100" w:type="dxa"/>
+            <w:shd w:val="clear" w:color="auto" w:fill="38B5A8"/>
+          </w:tcPr>
+          <w:p>
+            <w:pPr>
+              <w:spacing w:before="20" w:after="20" w:line="240" w:lineRule="auto"/>
+            </w:pPr>
+            <w:r>
+              <w:rPr>
+                <w:b/>
+                <w:bCs/>
+                <w:color w:val="FFFFFF"/>
+                <w:sz w:val="16"/>
+                <w:szCs w:val="16"/>
+              </w:rPr>
+              <w:t>Volgorde</w:t>
+            </w:r>
+          </w:p>
+        </w:tc>
+        <w:tc>
+          <w:tcPr>
+            <w:tcW w:w="2320" w:type="dxa"/>
+            <w:shd w:val="clear" w:color="auto" w:fill="38B5A8"/>
+          </w:tcPr>
+          <w:p>
+            <w:pPr>
+              <w:spacing w:before="20" w:after="20" w:line="240" w:lineRule="auto"/>
+            </w:pPr>
+            <w:r>
+              <w:rPr>
+                <w:b/>
+                <w:bCs/>
+                <w:color w:val="FFFFFF"/>
+                <w:sz w:val="16"/>
+                <w:szCs w:val="16"/>
+              </w:rPr>
+              <w:t>Bestand</w:t>
+            </w:r>
+          </w:p>
+        </w:tc>
+        <w:tc>
+          <w:tcPr>
+            <w:tcW w:w="6218" w:type="dxa"/>
+            <w:shd w:val="clear" w:color="auto" w:fill="38B5A8"/>
+          </w:tcPr>
+          <w:p>
+            <w:pPr>
+              <w:spacing w:before="20" w:after="20" w:line="240" w:lineRule="auto"/>
+            </w:pPr>
+            <w:r>
+              <w:rPr>
+                <w:b/>
+                <w:bCs/>
+                <w:color w:val="FFFFFF"/>
+                <w:sz w:val="16"/>
+                <w:szCs w:val="16"/>
+              </w:rPr>
+              <w:t>Wat erin staat</w:t>
+            </w:r>
+          </w:p>
+        </w:tc>
+      </w:tr>
+      <w:tr>
+        <w:trPr>
+          <w:cantSplit/>
+        </w:trPr>
+        <w:tc>
+          <w:tcPr>
+            <w:tcW w:w="1100" w:type="dxa"/>
+          </w:tcPr>
+          <w:p>
+            <w:pPr>
+              <w:spacing w:before="20" w:after="20" w:line="240" w:lineRule="auto"/>
+            </w:pPr>
+            <w:r>
+              <w:rPr>
+                <w:sz w:val="16"/>
+                <w:szCs w:val="16"/>
+              </w:rPr>
+              <w:t>1</w:t>
+            </w:r>
+          </w:p>
+        </w:tc>
+        <w:tc>
+          <w:tcPr>
+            <w:tcW w:w="2320" w:type="dxa"/>
+          </w:tcPr>
+          <w:p>
+            <w:pPr>
+              <w:spacing w:before="20" w:after="20" w:line="240" w:lineRule="auto"/>
+            </w:pPr>
+            <w:r>
+              <w:rPr>
+                <w:rFonts w:ascii="Consolas" w:hAnsi="Consolas" w:cs="Consolas"/>
+                <w:sz w:val="14"/>
+                <w:shd w:val="clear" w:color="auto" w:fill="EEF4F2"/>
+              </w:rPr>
+              <w:t>base.css</w:t>
+            </w:r>
+          </w:p>
+        </w:tc>
+        <w:tc>
+          <w:tcPr>
+            <w:tcW w:w="6218" w:type="dxa"/>
+          </w:tcPr>
+          <w:p>
+            <w:pPr>
+              <w:spacing w:before="20" w:after="20" w:line="240" w:lineRule="auto"/>
+            </w:pPr>
+            <w:r>
+              <w:rPr>
+                <w:sz w:val="16"/>
+                <w:szCs w:val="16"/>
+              </w:rPr>
+              <w:t>Lettertypes, de kleurvariabelen voor licht en donker, de reset en de pagina-opbouw</w:t>
+            </w:r>
+          </w:p>
+        </w:tc>
+      </w:tr>
+      <w:tr>
+        <w:trPr>
+          <w:cantSplit/>
+        </w:trPr>
+        <w:tc>
+          <w:tcPr>
+            <w:tcW w:w="1100" w:type="dxa"/>
+          </w:tcPr>
+          <w:p>
+            <w:pPr>
+              <w:spacing w:before="20" w:after="20" w:line="240" w:lineRule="auto"/>
+            </w:pPr>
+            <w:r>
+              <w:rPr>
+                <w:sz w:val="16"/>
+                <w:szCs w:val="16"/>
+              </w:rPr>
+              <w:t>2</w:t>
+            </w:r>
+          </w:p>
+        </w:tc>
+        <w:tc>
+          <w:tcPr>
+            <w:tcW w:w="2320" w:type="dxa"/>
+          </w:tcPr>
+          <w:p>
+            <w:pPr>
+              <w:spacing w:before="20" w:after="20" w:line="240" w:lineRule="auto"/>
+            </w:pPr>
+            <w:r>
+              <w:rPr>
+                <w:rFonts w:ascii="Consolas" w:hAnsi="Consolas" w:cs="Consolas"/>
+                <w:sz w:val="14"/>
+                <w:shd w:val="clear" w:color="auto" w:fill="EEF4F2"/>
+              </w:rPr>
+              <w:t>topbar.css</w:t>
+            </w:r>
+          </w:p>
+        </w:tc>
+        <w:tc>
+          <w:tcPr>
+            <w:tcW w:w="6218" w:type="dxa"/>
+          </w:tcPr>
+          <w:p>
+            <w:pPr>
+              <w:spacing w:before="20" w:after="20" w:line="240" w:lineRule="auto"/>
+            </w:pPr>
+            <w:r>
+              <w:rPr>
+                <w:sz w:val="16"/>
+                <w:szCs w:val="16"/>
+              </w:rPr>
+              <w:t xml:space="preserve">De bovenbalk met logo, thema-schakelaar en de knop </w:t>
+            </w:r>
+            <w:r>
+              <w:rPr>
+                <w:rFonts w:ascii="Consolas" w:hAnsi="Consolas" w:cs="Consolas"/>
+                <w:sz w:val="14"/>
+                <w:shd w:val="clear" w:color="auto" w:fill="EEF4F2"/>
+              </w:rPr>
+              <w:t>Admin login</w:t>
+            </w:r>
+          </w:p>
+        </w:tc>
+      </w:tr>
+      <w:tr>
+        <w:trPr>
+          <w:cantSplit/>
+        </w:trPr>
+        <w:tc>
+          <w:tcPr>
+            <w:tcW w:w="1100" w:type="dxa"/>
+          </w:tcPr>
+          <w:p>
+            <w:pPr>
+              <w:spacing w:before="20" w:after="20" w:line="240" w:lineRule="auto"/>
+            </w:pPr>
+            <w:r>
+              <w:rPr>
+                <w:sz w:val="16"/>
+                <w:szCs w:val="16"/>
+              </w:rPr>
+              <w:t>3</w:t>
+            </w:r>
+          </w:p>
+        </w:tc>
+        <w:tc>
+          <w:tcPr>
+            <w:tcW w:w="2320" w:type="dxa"/>
+          </w:tcPr>
+          <w:p>
+            <w:pPr>
+              <w:spacing w:before="20" w:after="20" w:line="240" w:lineRule="auto"/>
+            </w:pPr>
+            <w:r>
+              <w:rPr>
+                <w:rFonts w:ascii="Consolas" w:hAnsi="Consolas" w:cs="Consolas"/>
+                <w:sz w:val="14"/>
+                <w:shd w:val="clear" w:color="auto" w:fill="EEF4F2"/>
+              </w:rPr>
+              <w:t>home.css</w:t>
+            </w:r>
+          </w:p>
+        </w:tc>
+        <w:tc>
+          <w:tcPr>
+            <w:tcW w:w="6218" w:type="dxa"/>
+          </w:tcPr>
+          <w:p>
+            <w:pPr>
+              <w:spacing w:before="20" w:after="20" w:line="240" w:lineRule="auto"/>
+            </w:pPr>
+            <w:r>
+              <w:rPr>
+                <w:sz w:val="16"/>
+                <w:szCs w:val="16"/>
+              </w:rPr>
+              <w:t>De beginpagina: banner, medewerkerlijst, zoekveld, bedrijfsfilter, totalen, tip en footer</w:t>
+            </w:r>
+          </w:p>
+        </w:tc>
+      </w:tr>
+      <w:tr>
+        <w:trPr>
+          <w:cantSplit/>
+        </w:trPr>
+        <w:tc>
+          <w:tcPr>
+            <w:tcW w:w="1100" w:type="dxa"/>
+          </w:tcPr>
+          <w:p>
+            <w:pPr>
+              <w:spacing w:before="20" w:after="20" w:line="240" w:lineRule="auto"/>
+            </w:pPr>
+            <w:r>
+              <w:rPr>
+                <w:sz w:val="16"/>
+                <w:szCs w:val="16"/>
+              </w:rPr>
+              <w:t>4</w:t>
+            </w:r>
+          </w:p>
+        </w:tc>
+        <w:tc>
+          <w:tcPr>
+            <w:tcW w:w="2320" w:type="dxa"/>
+          </w:tcPr>
+          <w:p>
+            <w:pPr>
+              <w:spacing w:before="20" w:after="20" w:line="240" w:lineRule="auto"/>
+            </w:pPr>
+            <w:r>
+              <w:rPr>
+                <w:rFonts w:ascii="Consolas" w:hAnsi="Consolas" w:cs="Consolas"/>
+                <w:sz w:val="14"/>
+                <w:shd w:val="clear" w:color="auto" w:fill="EEF4F2"/>
+              </w:rPr>
+              <w:t>modal.css</w:t>
+            </w:r>
+          </w:p>
+        </w:tc>
+        <w:tc>
+          <w:tcPr>
+            <w:tcW w:w="6218" w:type="dxa"/>
+          </w:tcPr>
+          <w:p>
+            <w:pPr>
+              <w:spacing w:before="20" w:after="20" w:line="240" w:lineRule="auto"/>
+            </w:pPr>
+            <w:r>
+              <w:rPr>
+                <w:sz w:val="16"/>
+                <w:szCs w:val="16"/>
+              </w:rPr>
+              <w:t>Vensters, velden in een venster en de algemene knoppen</w:t>
+            </w:r>
+          </w:p>
+        </w:tc>
+      </w:tr>
+      <w:tr>
+        <w:trPr>
+          <w:cantSplit/>
+        </w:trPr>
+        <w:tc>
+          <w:tcPr>
+            <w:tcW w:w="1100" w:type="dxa"/>
+          </w:tcPr>
+          <w:p>
+            <w:pPr>
+              <w:spacing w:before="20" w:after="20" w:line="240" w:lineRule="auto"/>
+            </w:pPr>
+            <w:r>
+              <w:rPr>
+                <w:sz w:val="16"/>
+                <w:szCs w:val="16"/>
+              </w:rPr>
+              <w:t>5</w:t>
+            </w:r>
+          </w:p>
+        </w:tc>
+        <w:tc>
+          <w:tcPr>
+            <w:tcW w:w="2320" w:type="dxa"/>
+          </w:tcPr>
+          <w:p>
+            <w:pPr>
+              <w:spacing w:before="20" w:after="20" w:line="240" w:lineRule="auto"/>
+            </w:pPr>
+            <w:r>
+              <w:rPr>
+                <w:rFonts w:ascii="Consolas" w:hAnsi="Consolas" w:cs="Consolas"/>
+                <w:sz w:val="14"/>
+                <w:shd w:val="clear" w:color="auto" w:fill="EEF4F2"/>
+              </w:rPr>
+              <w:t>admin.css</w:t>
+            </w:r>
+          </w:p>
+        </w:tc>
+        <w:tc>
+          <w:tcPr>
+            <w:tcW w:w="6218" w:type="dxa"/>
+          </w:tcPr>
+          <w:p>
+            <w:pPr>
+              <w:spacing w:before="20" w:after="20" w:line="240" w:lineRule="auto"/>
+            </w:pPr>
+            <w:r>
+              <w:rPr>
+                <w:sz w:val="16"/>
+                <w:szCs w:val="16"/>
+              </w:rPr>
+              <w:t>Het beheer: kop, tabbladen, filters en tabellen</w:t>
+            </w:r>
+          </w:p>
+        </w:tc>
+      </w:tr>
+      <w:tr>
+        <w:trPr>
+          <w:cantSplit/>
+        </w:trPr>
+        <w:tc>
+          <w:tcPr>
+            <w:tcW w:w="1100" w:type="dxa"/>
+          </w:tcPr>
+          <w:p>
+            <w:pPr>
+              <w:spacing w:before="20" w:after="20" w:line="240" w:lineRule="auto"/>
+            </w:pPr>
+            <w:r>
+              <w:rPr>
+                <w:sz w:val="16"/>
+                <w:szCs w:val="16"/>
+              </w:rPr>
+              <w:t>6</w:t>
+            </w:r>
+          </w:p>
+        </w:tc>
+        <w:tc>
+          <w:tcPr>
+            <w:tcW w:w="2320" w:type="dxa"/>
+          </w:tcPr>
+          <w:p>
+            <w:pPr>
+              <w:spacing w:before="20" w:after="20" w:line="240" w:lineRule="auto"/>
+            </w:pPr>
+            <w:r>
+              <w:rPr>
+                <w:rFonts w:ascii="Consolas" w:hAnsi="Consolas" w:cs="Consolas"/>
+                <w:sz w:val="14"/>
+                <w:shd w:val="clear" w:color="auto" w:fill="EEF4F2"/>
+              </w:rPr>
+              <w:t>product-window.css</w:t>
+            </w:r>
+          </w:p>
+        </w:tc>
+        <w:tc>
+          <w:tcPr>
+            <w:tcW w:w="6218" w:type="dxa"/>
+          </w:tcPr>
+          <w:p>
+            <w:pPr>
+              <w:spacing w:before="20" w:after="20" w:line="240" w:lineRule="auto"/>
+            </w:pPr>
+            <w:r>
+              <w:rPr>
+                <w:sz w:val="16"/>
+                <w:szCs w:val="16"/>
+              </w:rPr>
+              <w:t xml:space="preserve">Het productvenster met </w:t>
+            </w:r>
+            <w:r>
+              <w:rPr>
+                <w:rFonts w:ascii="Consolas" w:hAnsi="Consolas" w:cs="Consolas"/>
+                <w:sz w:val="14"/>
+                <w:shd w:val="clear" w:color="auto" w:fill="EEF4F2"/>
+              </w:rPr>
+              <w:t>−</w:t>
+            </w:r>
+            <w:r>
+              <w:rPr>
+                <w:sz w:val="16"/>
+                <w:szCs w:val="16"/>
+              </w:rPr>
+              <w:t xml:space="preserve"> en </w:t>
+            </w:r>
+            <w:r>
+              <w:rPr>
+                <w:rFonts w:ascii="Consolas" w:hAnsi="Consolas" w:cs="Consolas"/>
+                <w:sz w:val="14"/>
+                <w:shd w:val="clear" w:color="auto" w:fill="EEF4F2"/>
+              </w:rPr>
+              <w:t>+</w:t>
+            </w:r>
+            <w:r>
+              <w:rPr>
+                <w:sz w:val="16"/>
+                <w:szCs w:val="16"/>
+              </w:rPr>
+              <w:t xml:space="preserve"> en de knopbalk met </w:t>
+            </w:r>
+            <w:r>
+              <w:rPr>
+                <w:rFonts w:ascii="Consolas" w:hAnsi="Consolas" w:cs="Consolas"/>
+                <w:sz w:val="14"/>
+                <w:shd w:val="clear" w:color="auto" w:fill="EEF4F2"/>
+              </w:rPr>
+              <w:t>Registreren</w:t>
+            </w:r>
+          </w:p>
+        </w:tc>
+      </w:tr>
+      <w:tr>
+        <w:trPr>
+          <w:cantSplit/>
+        </w:trPr>
+        <w:tc>
+          <w:tcPr>
+            <w:tcW w:w="1100" w:type="dxa"/>
+          </w:tcPr>
+          <w:p>
+            <w:pPr>
+              <w:spacing w:before="20" w:after="20" w:line="240" w:lineRule="auto"/>
+            </w:pPr>
+            <w:r>
+              <w:rPr>
+                <w:sz w:val="16"/>
+                <w:szCs w:val="16"/>
+              </w:rPr>
+              <w:t>7</w:t>
+            </w:r>
+          </w:p>
+        </w:tc>
+        <w:tc>
+          <w:tcPr>
+            <w:tcW w:w="2320" w:type="dxa"/>
+          </w:tcPr>
+          <w:p>
+            <w:pPr>
+              <w:spacing w:before="20" w:after="20" w:line="240" w:lineRule="auto"/>
+            </w:pPr>
+            <w:r>
+              <w:rPr>
+                <w:rFonts w:ascii="Consolas" w:hAnsi="Consolas" w:cs="Consolas"/>
+                <w:sz w:val="14"/>
+                <w:shd w:val="clear" w:color="auto" w:fill="EEF4F2"/>
+              </w:rPr>
+              <w:t>admin-forms.css</w:t>
+            </w:r>
+          </w:p>
+        </w:tc>
+        <w:tc>
+          <w:tcPr>
+            <w:tcW w:w="6218" w:type="dxa"/>
+          </w:tcPr>
+          <w:p>
+            <w:pPr>
+              <w:spacing w:before="20" w:after="20" w:line="240" w:lineRule="auto"/>
+            </w:pPr>
+            <w:r>
+              <w:rPr>
+                <w:sz w:val="16"/>
+                <w:szCs w:val="16"/>
+              </w:rPr>
+              <w:t>Het beheer: formulieren, lijsten, bedrijven, consumptiepunten en voorraad</w:t>
+            </w:r>
+          </w:p>
+        </w:tc>
+      </w:tr>
+      <w:tr>
+        <w:trPr>
+          <w:cantSplit/>
+        </w:trPr>
+        <w:tc>
+          <w:tcPr>
+            <w:tcW w:w="1100" w:type="dxa"/>
+          </w:tcPr>
+          <w:p>
+            <w:pPr>
+              <w:spacing w:before="20" w:after="20" w:line="240" w:lineRule="auto"/>
+            </w:pPr>
+            <w:r>
+              <w:rPr>
+                <w:sz w:val="16"/>
+                <w:szCs w:val="16"/>
+              </w:rPr>
+              <w:t>8</w:t>
+            </w:r>
+          </w:p>
+        </w:tc>
+        <w:tc>
+          <w:tcPr>
+            <w:tcW w:w="2320" w:type="dxa"/>
+          </w:tcPr>
+          <w:p>
+            <w:pPr>
+              <w:spacing w:before="20" w:after="20" w:line="240" w:lineRule="auto"/>
+            </w:pPr>
+            <w:r>
+              <w:rPr>
+                <w:rFonts w:ascii="Consolas" w:hAnsi="Consolas" w:cs="Consolas"/>
+                <w:sz w:val="14"/>
+                <w:shd w:val="clear" w:color="auto" w:fill="EEF4F2"/>
+              </w:rPr>
+              <w:t>toast.css</w:t>
+            </w:r>
+          </w:p>
+        </w:tc>
+        <w:tc>
+          <w:tcPr>
+            <w:tcW w:w="6218" w:type="dxa"/>
+          </w:tcPr>
+          <w:p>
+            <w:pPr>
+              <w:spacing w:before="20" w:after="20" w:line="240" w:lineRule="auto"/>
+            </w:pPr>
+            <w:r>
+              <w:rPr>
+                <w:sz w:val="16"/>
+                <w:szCs w:val="16"/>
+              </w:rPr>
+              <w:t>De melding bij openen als los bestand en de tijdelijke meldingen</w:t>
+            </w:r>
+          </w:p>
+        </w:tc>
+      </w:tr>
+      <w:tr>
+        <w:trPr>
+          <w:cantSplit/>
+        </w:trPr>
+        <w:tc>
+          <w:tcPr>
+            <w:tcW w:w="1100" w:type="dxa"/>
+          </w:tcPr>
+          <w:p>
+            <w:pPr>
+              <w:spacing w:before="20" w:after="20" w:line="240" w:lineRule="auto"/>
+            </w:pPr>
+            <w:r>
+              <w:rPr>
+                <w:sz w:val="16"/>
+                <w:szCs w:val="16"/>
+              </w:rPr>
+              <w:t>9</w:t>
+            </w:r>
+          </w:p>
+        </w:tc>
+        <w:tc>
+          <w:tcPr>
+            <w:tcW w:w="2320" w:type="dxa"/>
+          </w:tcPr>
+          <w:p>
+            <w:pPr>
+              <w:spacing w:before="20" w:after="20" w:line="240" w:lineRule="auto"/>
+            </w:pPr>
+            <w:r>
+              <w:rPr>
+                <w:rFonts w:ascii="Consolas" w:hAnsi="Consolas" w:cs="Consolas"/>
+                <w:sz w:val="14"/>
+                <w:shd w:val="clear" w:color="auto" w:fill="EEF4F2"/>
+              </w:rPr>
+              <w:t>admin-corrections.css</w:t>
+            </w:r>
+          </w:p>
+        </w:tc>
+        <w:tc>
+          <w:tcPr>
+            <w:tcW w:w="6218" w:type="dxa"/>
+          </w:tcPr>
+          <w:p>
+            <w:pPr>
+              <w:spacing w:before="20" w:after="20" w:line="240" w:lineRule="auto"/>
+            </w:pPr>
+            <w:r>
+              <w:rPr>
+                <w:sz w:val="16"/>
+                <w:szCs w:val="16"/>
+              </w:rPr>
+              <w:t xml:space="preserve">Het beheer: correcties en het venster </w:t>
+            </w:r>
+            <w:r>
+              <w:rPr>
+                <w:rFonts w:ascii="Consolas" w:hAnsi="Consolas" w:cs="Consolas"/>
+                <w:sz w:val="14"/>
+                <w:shd w:val="clear" w:color="auto" w:fill="EEF4F2"/>
+              </w:rPr>
+              <w:t>Registratie verwijderen</w:t>
+            </w:r>
+          </w:p>
+        </w:tc>
+      </w:tr>
+      <w:tr>
+        <w:trPr>
+          <w:cantSplit/>
+        </w:trPr>
+        <w:tc>
+          <w:tcPr>
+            <w:tcW w:w="1100" w:type="dxa"/>
+          </w:tcPr>
+          <w:p>
+            <w:pPr>
+              <w:spacing w:before="20" w:after="20" w:line="240" w:lineRule="auto"/>
+            </w:pPr>
+            <w:r>
+              <w:rPr>
+                <w:sz w:val="16"/>
+                <w:szCs w:val="16"/>
+              </w:rPr>
+              <w:t>10</w:t>
+            </w:r>
+          </w:p>
+        </w:tc>
+        <w:tc>
+          <w:tcPr>
+            <w:tcW w:w="2320" w:type="dxa"/>
+          </w:tcPr>
+          <w:p>
+            <w:pPr>
+              <w:spacing w:before="20" w:after="20" w:line="240" w:lineRule="auto"/>
+            </w:pPr>
+            <w:r>
+              <w:rPr>
+                <w:rFonts w:ascii="Consolas" w:hAnsi="Consolas" w:cs="Consolas"/>
+                <w:sz w:val="14"/>
+                <w:shd w:val="clear" w:color="auto" w:fill="EEF4F2"/>
+              </w:rPr>
+              <w:t>motion.css</w:t>
+            </w:r>
+          </w:p>
+        </w:tc>
+        <w:tc>
+          <w:tcPr>
+            <w:tcW w:w="6218" w:type="dxa"/>
+          </w:tcPr>
+          <w:p>
+            <w:pPr>
+              <w:spacing w:before="20" w:after="20" w:line="240" w:lineRule="auto"/>
+            </w:pPr>
+            <w:r>
+              <w:rPr>
+                <w:sz w:val="16"/>
+                <w:szCs w:val="16"/>
+              </w:rPr>
+              <w:t>Overgangen en animaties, en geen animaties bij "minder beweging"</w:t>
+            </w:r>
+          </w:p>
+        </w:tc>
+      </w:tr>
+      <w:tr>
+        <w:trPr>
+          <w:cantSplit/>
+        </w:trPr>
+        <w:tc>
+          <w:tcPr>
+            <w:tcW w:w="1100" w:type="dxa"/>
+          </w:tcPr>
+          <w:p>
+            <w:pPr>
+              <w:spacing w:before="20" w:after="20" w:line="240" w:lineRule="auto"/>
+            </w:pPr>
+            <w:r>
+              <w:rPr>
+                <w:sz w:val="16"/>
+                <w:szCs w:val="16"/>
+              </w:rPr>
+              <w:t>11</w:t>
+            </w:r>
+          </w:p>
+        </w:tc>
+        <w:tc>
+          <w:tcPr>
+            <w:tcW w:w="2320" w:type="dxa"/>
+          </w:tcPr>
+          <w:p>
+            <w:pPr>
+              <w:spacing w:before="20" w:after="20" w:line="240" w:lineRule="auto"/>
+            </w:pPr>
+            <w:r>
+              <w:rPr>
+                <w:rFonts w:ascii="Consolas" w:hAnsi="Consolas" w:cs="Consolas"/>
+                <w:sz w:val="14"/>
+                <w:shd w:val="clear" w:color="auto" w:fill="EEF4F2"/>
+              </w:rPr>
+              <w:t>icons.css</w:t>
+            </w:r>
+          </w:p>
+        </w:tc>
+        <w:tc>
+          <w:tcPr>
+            <w:tcW w:w="6218" w:type="dxa"/>
+          </w:tcPr>
+          <w:p>
+            <w:pPr>
+              <w:spacing w:before="20" w:after="20" w:line="240" w:lineRule="auto"/>
+            </w:pPr>
+            <w:r>
+              <w:rPr>
+                <w:sz w:val="16"/>
+                <w:szCs w:val="16"/>
+              </w:rPr>
+              <w:t>De SVG-iconen</w:t>
+            </w:r>
+          </w:p>
+        </w:tc>
+      </w:tr>
+      <w:tr>
+        <w:trPr>
+          <w:cantSplit/>
+        </w:trPr>
+        <w:tc>
+          <w:tcPr>
+            <w:tcW w:w="1100" w:type="dxa"/>
+          </w:tcPr>
+          <w:p>
+            <w:pPr>
+              <w:spacing w:before="20" w:after="20" w:line="240" w:lineRule="auto"/>
+            </w:pPr>
+            <w:r>
+              <w:rPr>
+                <w:sz w:val="16"/>
+                <w:szCs w:val="16"/>
+              </w:rPr>
+              <w:t>12</w:t>
+            </w:r>
+          </w:p>
+        </w:tc>
+        <w:tc>
+          <w:tcPr>
+            <w:tcW w:w="2320" w:type="dxa"/>
+          </w:tcPr>
+          <w:p>
+            <w:pPr>
+              <w:spacing w:before="20" w:after="20" w:line="240" w:lineRule="auto"/>
+            </w:pPr>
+            <w:r>
+              <w:rPr>
+                <w:rFonts w:ascii="Consolas" w:hAnsi="Consolas" w:cs="Consolas"/>
+                <w:sz w:val="14"/>
+                <w:shd w:val="clear" w:color="auto" w:fill="EEF4F2"/>
+              </w:rPr>
+              <w:t>feedback.css</w:t>
+            </w:r>
+          </w:p>
+        </w:tc>
+        <w:tc>
+          <w:tcPr>
+            <w:tcW w:w="6218" w:type="dxa"/>
+          </w:tcPr>
+          <w:p>
+            <w:pPr>
+              <w:spacing w:before="20" w:after="20" w:line="240" w:lineRule="auto"/>
+            </w:pPr>
+            <w:r>
+              <w:rPr>
+                <w:sz w:val="16"/>
+                <w:szCs w:val="16"/>
+              </w:rPr>
+              <w:t>Iconen in meldingen, foutmeldingen onder een veld en de lege toestand</w:t>
+            </w:r>
+          </w:p>
+        </w:tc>
+      </w:tr>
+      <w:tr>
+        <w:trPr>
+          <w:cantSplit/>
+        </w:trPr>
+        <w:tc>
+          <w:tcPr>
+            <w:tcW w:w="1100" w:type="dxa"/>
+          </w:tcPr>
+          <w:p>
+            <w:pPr>
+              <w:spacing w:before="20" w:after="20" w:line="240" w:lineRule="auto"/>
+            </w:pPr>
+            <w:r>
+              <w:rPr>
+                <w:sz w:val="16"/>
+                <w:szCs w:val="16"/>
+              </w:rPr>
+              <w:t>13</w:t>
+            </w:r>
+          </w:p>
+        </w:tc>
+        <w:tc>
+          <w:tcPr>
+            <w:tcW w:w="2320" w:type="dxa"/>
+          </w:tcPr>
+          <w:p>
+            <w:pPr>
+              <w:spacing w:before="20" w:after="20" w:line="240" w:lineRule="auto"/>
+            </w:pPr>
+            <w:r>
+              <w:rPr>
+                <w:rFonts w:ascii="Consolas" w:hAnsi="Consolas" w:cs="Consolas"/>
+                <w:sz w:val="14"/>
+                <w:shd w:val="clear" w:color="auto" w:fill="EEF4F2"/>
+              </w:rPr>
+              <w:t>suggestion.css</w:t>
+            </w:r>
+          </w:p>
+        </w:tc>
+        <w:tc>
+          <w:tcPr>
+            <w:tcW w:w="6218" w:type="dxa"/>
+          </w:tcPr>
+          <w:p>
+            <w:pPr>
+              <w:spacing w:before="20" w:after="20" w:line="240" w:lineRule="auto"/>
+            </w:pPr>
+            <w:r>
+              <w:rPr>
+                <w:sz w:val="16"/>
+                <w:szCs w:val="16"/>
+              </w:rPr>
+              <w:t>De begroeting en de aanbeveling in het productvenster</w:t>
+            </w:r>
+          </w:p>
+        </w:tc>
+      </w:tr>
+      <w:tr>
+        <w:trPr>
+          <w:cantSplit/>
+        </w:trPr>
+        <w:tc>
+          <w:tcPr>
+            <w:tcW w:w="1100" w:type="dxa"/>
+          </w:tcPr>
+          <w:p>
+            <w:pPr>
+              <w:spacing w:before="20" w:after="20" w:line="240" w:lineRule="auto"/>
+            </w:pPr>
+            <w:r>
+              <w:rPr>
+                <w:sz w:val="16"/>
+                <w:szCs w:val="16"/>
+              </w:rPr>
+              <w:t>14</w:t>
+            </w:r>
+          </w:p>
+        </w:tc>
+        <w:tc>
+          <w:tcPr>
+            <w:tcW w:w="2320" w:type="dxa"/>
+          </w:tcPr>
+          <w:p>
+            <w:pPr>
+              <w:spacing w:before="20" w:after="20" w:line="240" w:lineRule="auto"/>
+            </w:pPr>
+            <w:r>
+              <w:rPr>
+                <w:rFonts w:ascii="Consolas" w:hAnsi="Consolas" w:cs="Consolas"/>
+                <w:sz w:val="14"/>
+                <w:shd w:val="clear" w:color="auto" w:fill="EEF4F2"/>
+              </w:rPr>
+              <w:t>directory-tools.css</w:t>
+            </w:r>
+          </w:p>
+        </w:tc>
+        <w:tc>
+          <w:tcPr>
+            <w:tcW w:w="6218" w:type="dxa"/>
+          </w:tcPr>
+          <w:p>
+            <w:pPr>
+              <w:spacing w:before="20" w:after="20" w:line="240" w:lineRule="auto"/>
+            </w:pPr>
+            <w:r>
+              <w:rPr>
+                <w:sz w:val="16"/>
+                <w:szCs w:val="16"/>
+              </w:rPr>
+              <w:t>De hint voor de pas, de demoknoppen en zoekveld en filter naast elkaar</w:t>
+            </w:r>
+          </w:p>
+        </w:tc>
+      </w:tr>
+      <w:tr>
+        <w:trPr>
+          <w:cantSplit/>
+        </w:trPr>
+        <w:tc>
+          <w:tcPr>
+            <w:tcW w:w="1100" w:type="dxa"/>
+          </w:tcPr>
+          <w:p>
+            <w:pPr>
+              <w:spacing w:before="20" w:after="20" w:line="240" w:lineRule="auto"/>
+            </w:pPr>
+            <w:r>
+              <w:rPr>
+                <w:sz w:val="16"/>
+                <w:szCs w:val="16"/>
+              </w:rPr>
+              <w:t>15</w:t>
+            </w:r>
+          </w:p>
+        </w:tc>
+        <w:tc>
+          <w:tcPr>
+            <w:tcW w:w="2320" w:type="dxa"/>
+          </w:tcPr>
+          <w:p>
+            <w:pPr>
+              <w:spacing w:before="20" w:after="20" w:line="240" w:lineRule="auto"/>
+            </w:pPr>
+            <w:r>
+              <w:rPr>
+                <w:rFonts w:ascii="Consolas" w:hAnsi="Consolas" w:cs="Consolas"/>
+                <w:sz w:val="14"/>
+                <w:shd w:val="clear" w:color="auto" w:fill="EEF4F2"/>
+              </w:rPr>
+              <w:t>face.css</w:t>
+            </w:r>
+          </w:p>
+        </w:tc>
+        <w:tc>
+          <w:tcPr>
+            <w:tcW w:w="6218" w:type="dxa"/>
+          </w:tcPr>
+          <w:p>
+            <w:pPr>
+              <w:spacing w:before="20" w:after="20" w:line="240" w:lineRule="auto"/>
+            </w:pPr>
+            <w:r>
+              <w:rPr>
+                <w:sz w:val="16"/>
+                <w:szCs w:val="16"/>
+              </w:rPr>
+              <w:t>De demo gezichtsherkenning</w:t>
+            </w:r>
+          </w:p>
+        </w:tc>
+      </w:tr>
+      <w:tr>
+        <w:trPr>
+          <w:cantSplit/>
+        </w:trPr>
+        <w:tc>
+          <w:tcPr>
+            <w:tcW w:w="1100" w:type="dxa"/>
+          </w:tcPr>
+          <w:p>
+            <w:pPr>
+              <w:spacing w:before="20" w:after="20" w:line="240" w:lineRule="auto"/>
+            </w:pPr>
+            <w:r>
+              <w:rPr>
+                <w:sz w:val="16"/>
+                <w:szCs w:val="16"/>
+              </w:rPr>
+              <w:t>16</w:t>
+            </w:r>
+          </w:p>
+        </w:tc>
+        <w:tc>
+          <w:tcPr>
+            <w:tcW w:w="2320" w:type="dxa"/>
+          </w:tcPr>
+          <w:p>
+            <w:pPr>
+              <w:spacing w:before="20" w:after="20" w:line="240" w:lineRule="auto"/>
+            </w:pPr>
+            <w:r>
+              <w:rPr>
+                <w:rFonts w:ascii="Consolas" w:hAnsi="Consolas" w:cs="Consolas"/>
+                <w:sz w:val="14"/>
+                <w:shd w:val="clear" w:color="auto" w:fill="EEF4F2"/>
+              </w:rPr>
+              <w:t>standby.css</w:t>
+            </w:r>
+          </w:p>
+        </w:tc>
+        <w:tc>
+          <w:tcPr>
+            <w:tcW w:w="6218" w:type="dxa"/>
+          </w:tcPr>
+          <w:p>
+            <w:pPr>
+              <w:spacing w:before="20" w:after="20" w:line="240" w:lineRule="auto"/>
+            </w:pPr>
+            <w:r>
+              <w:rPr>
+                <w:sz w:val="16"/>
+                <w:szCs w:val="16"/>
+              </w:rPr>
+              <w:t>Het standby-scherm</w:t>
+            </w:r>
+          </w:p>
+        </w:tc>
+      </w:tr>
+      <w:tr>
+        <w:trPr>
+          <w:cantSplit/>
+        </w:trPr>
+        <w:tc>
+          <w:tcPr>
+            <w:tcW w:w="1100" w:type="dxa"/>
+          </w:tcPr>
+          <w:p>
+            <w:pPr>
+              <w:spacing w:before="20" w:after="20" w:line="240" w:lineRule="auto"/>
+            </w:pPr>
+            <w:r>
+              <w:rPr>
+                <w:sz w:val="16"/>
+                <w:szCs w:val="16"/>
+              </w:rPr>
+              <w:t>17</w:t>
+            </w:r>
+          </w:p>
+        </w:tc>
+        <w:tc>
+          <w:tcPr>
+            <w:tcW w:w="2320" w:type="dxa"/>
+          </w:tcPr>
+          <w:p>
+            <w:pPr>
+              <w:spacing w:before="20" w:after="20" w:line="240" w:lineRule="auto"/>
+            </w:pPr>
+            <w:r>
+              <w:rPr>
+                <w:rFonts w:ascii="Consolas" w:hAnsi="Consolas" w:cs="Consolas"/>
+                <w:sz w:val="14"/>
+                <w:shd w:val="clear" w:color="auto" w:fill="EEF4F2"/>
+              </w:rPr>
+              <w:t>fridge.css</w:t>
+            </w:r>
+          </w:p>
+        </w:tc>
+        <w:tc>
+          <w:tcPr>
+            <w:tcW w:w="6218" w:type="dxa"/>
+          </w:tcPr>
+          <w:p>
+            <w:pPr>
+              <w:spacing w:before="20" w:after="20" w:line="240" w:lineRule="auto"/>
+            </w:pPr>
+            <w:r>
+              <w:rPr>
+                <w:sz w:val="16"/>
+                <w:szCs w:val="16"/>
+              </w:rPr>
+              <w:t>De slimme koelkast en het tabblad Koelkast</w:t>
+            </w:r>
+          </w:p>
+        </w:tc>
+      </w:tr>
+      <w:tr>
+        <w:trPr>
+          <w:cantSplit/>
+        </w:trPr>
+        <w:tc>
+          <w:tcPr>
+            <w:tcW w:w="1100" w:type="dxa"/>
+          </w:tcPr>
+          <w:p>
+            <w:pPr>
+              <w:spacing w:before="20" w:after="20" w:line="240" w:lineRule="auto"/>
+            </w:pPr>
+            <w:r>
+              <w:rPr>
+                <w:sz w:val="16"/>
+                <w:szCs w:val="16"/>
+              </w:rPr>
+              <w:t>18</w:t>
+            </w:r>
+          </w:p>
+        </w:tc>
+        <w:tc>
+          <w:tcPr>
+            <w:tcW w:w="2320" w:type="dxa"/>
+          </w:tcPr>
+          <w:p>
+            <w:pPr>
+              <w:spacing w:before="20" w:after="20" w:line="240" w:lineRule="auto"/>
+            </w:pPr>
+            <w:r>
+              <w:rPr>
+                <w:rFonts w:ascii="Consolas" w:hAnsi="Consolas" w:cs="Consolas"/>
+                <w:sz w:val="14"/>
+                <w:shd w:val="clear" w:color="auto" w:fill="EEF4F2"/>
+              </w:rPr>
+              <w:t>responsive.css</w:t>
+            </w:r>
+          </w:p>
+        </w:tc>
+        <w:tc>
+          <w:tcPr>
+            <w:tcW w:w="6218" w:type="dxa"/>
+          </w:tcPr>
+          <w:p>
+            <w:pPr>
+              <w:spacing w:before="20" w:after="20" w:line="240" w:lineRule="auto"/>
+            </w:pPr>
+            <w:r>
+              <w:rPr>
+                <w:sz w:val="16"/>
+                <w:szCs w:val="16"/>
+              </w:rPr>
+              <w:t>De mediaqueries voor telefoon en tablet. Staat als laatste</w:t>
+            </w:r>
+          </w:p>
+        </w:tc>
+      </w:tr>
+    </w:tbl>
+    <w:p>
+      <w:pPr>
+        <w:spacing w:after="120"/>
+      </w:pPr>
+    </w:p>
+    <w:p>
+      <w:r>
+        <w:t xml:space="preserve">Een nieuwe regel hoort in het bestand van het onderdeel. Komt er een nieuw bestand bij, link het dan ook in </w:t>
+      </w:r>
+      <w:r>
+        <w:rPr>
+          <w:rFonts w:ascii="Consolas" w:hAnsi="Consolas" w:cs="Consolas"/>
+          <w:sz w:val="18"/>
+          <w:shd w:val="clear" w:color="auto" w:fill="EEF4F2"/>
+        </w:rPr>
+        <w:t>index.html</w:t>
+      </w:r>
+      <w:r>
+        <w:t xml:space="preserve">. </w:t>
+      </w:r>
+      <w:r>
+        <w:rPr>
+          <w:rFonts w:ascii="Consolas" w:hAnsi="Consolas" w:cs="Consolas"/>
+          <w:sz w:val="18"/>
+          <w:shd w:val="clear" w:color="auto" w:fill="EEF4F2"/>
+        </w:rPr>
+        <w:t>tests/beveiliging-config.test.js</w:t>
+      </w:r>
+      <w:r>
+        <w:t xml:space="preserve"> controleert dat ieder bestand in </w:t>
+      </w:r>
+      <w:r>
+        <w:rPr>
+          <w:rFonts w:ascii="Consolas" w:hAnsi="Consolas" w:cs="Consolas"/>
+          <w:sz w:val="18"/>
+          <w:shd w:val="clear" w:color="auto" w:fill="EEF4F2"/>
+        </w:rPr>
+        <w:t>assets/css/</w:t>
+      </w:r>
+      <w:r>
+        <w:t xml:space="preserve"> precies één keer wordt geladen. De unit tests lezen alle CSS samen met </w:t>
+      </w:r>
+      <w:r>
+        <w:rPr>
+          <w:rFonts w:ascii="Consolas" w:hAnsi="Consolas" w:cs="Consolas"/>
+          <w:sz w:val="18"/>
+          <w:shd w:val="clear" w:color="auto" w:fill="EEF4F2"/>
+        </w:rPr>
+        <w:t>readAllCss()</w:t>
+      </w:r>
+      <w:r>
+        <w:t xml:space="preserve"> uit </w:t>
+      </w:r>
+      <w:r>
+        <w:rPr>
+          <w:rFonts w:ascii="Consolas" w:hAnsi="Consolas" w:cs="Consolas"/>
+          <w:sz w:val="18"/>
+          <w:shd w:val="clear" w:color="auto" w:fill="EEF4F2"/>
+        </w:rPr>
+        <w:t>tests/helpers.js</w:t>
+      </w:r>
+      <w:r>
+        <w:t xml:space="preserve">, in de volgorde van </w:t>
+      </w:r>
+      <w:r>
+        <w:rPr>
+          <w:rFonts w:ascii="Consolas" w:hAnsi="Consolas" w:cs="Consolas"/>
+          <w:sz w:val="18"/>
+          <w:shd w:val="clear" w:color="auto" w:fill="EEF4F2"/>
+        </w:rPr>
+        <w:t>index.html</w:t>
+      </w:r>
+      <w:r>
+        <w:t>.</w:t>
+      </w:r>
+    </w:p>
+    <w:p>
+      <w:pPr>
+        <w:pStyle w:val="Kop2"/>
+        <w:keepNext/>
+      </w:pPr>
+      <w:bookmarkStart w:id="65" w:name="k33"/>
+      <w:bookmarkStart w:id="66" w:name="_Toc243897628"/>
+      <w:r>
+        <w:t>CSS-VARIABELEN</w:t>
+      </w:r>
+      <w:bookmarkEnd w:id="65"/>
+      <w:bookmarkEnd w:id="66"/>
+    </w:p>
+    <w:p>
+      <w:r>
         <w:t xml:space="preserve">In </w:t>
       </w:r>
       <w:r>
@@ -14951,7 +16424,18 @@
         <w:t>:root</w:t>
       </w:r>
       <w:r>
-        <w:t xml:space="preserve"> staan herbruikbare variabelen:</w:t>
+        <w:t xml:space="preserve"> (in </w:t>
+      </w:r>
+      <w:r>
+        <w:rPr>
+          <w:rFonts w:ascii="Consolas" w:hAnsi="Consolas" w:cs="Consolas"/>
+          <w:sz w:val="18"/>
+          <w:shd w:val="clear" w:color="auto" w:fill="EEF4F2"/>
+        </w:rPr>
+        <w:t>base.css</w:t>
+      </w:r>
+      <w:r>
+        <w:t>) staan herbruikbare variabelen:</w:t>
       </w:r>
     </w:p>
     <w:p>
@@ -15434,7 +16918,7 @@
     </w:p>
     <w:p>
       <w:r>
-        <w:t>De stylesheet is geordend van algemeen naar specifiek:</w:t>
+        <w:t>De stylesheets zijn geordend van algemeen naar specifiek:</w:t>
       </w:r>
     </w:p>
     <w:p>
@@ -15457,7 +16941,18 @@
       </w:r>
       <w:r>
         <w:tab/>
-        <w:t>Globale variabelen en reset.</w:t>
+        <w:t>Globale variabelen en reset (</w:t>
+      </w:r>
+      <w:r>
+        <w:rPr>
+          <w:rFonts w:ascii="Consolas" w:hAnsi="Consolas" w:cs="Consolas"/>
+          <w:sz w:val="18"/>
+          <w:shd w:val="clear" w:color="auto" w:fill="EEF4F2"/>
+        </w:rPr>
+        <w:t>base.css</w:t>
+      </w:r>
+      <w:r>
+        <w:t>).</w:t>
       </w:r>
     </w:p>
     <w:p>
@@ -15480,7 +16975,29 @@
       </w:r>
       <w:r>
         <w:tab/>
-        <w:t>Basislayout en navigatie.</w:t>
+        <w:t>Basislayout en navigatie (</w:t>
+      </w:r>
+      <w:r>
+        <w:rPr>
+          <w:rFonts w:ascii="Consolas" w:hAnsi="Consolas" w:cs="Consolas"/>
+          <w:sz w:val="18"/>
+          <w:shd w:val="clear" w:color="auto" w:fill="EEF4F2"/>
+        </w:rPr>
+        <w:t>topbar.css</w:t>
+      </w:r>
+      <w:r>
+        <w:t xml:space="preserve"> en </w:t>
+      </w:r>
+      <w:r>
+        <w:rPr>
+          <w:rFonts w:ascii="Consolas" w:hAnsi="Consolas" w:cs="Consolas"/>
+          <w:sz w:val="18"/>
+          <w:shd w:val="clear" w:color="auto" w:fill="EEF4F2"/>
+        </w:rPr>
+        <w:t>home.css</w:t>
+      </w:r>
+      <w:r>
+        <w:t>).</w:t>
       </w:r>
     </w:p>
     <w:p>
@@ -15503,7 +17020,7 @@
       </w:r>
       <w:r>
         <w:tab/>
-        <w:t>Hoofdcomponenten zoals hero, kaarten en medewerkerregels.</w:t>
+        <w:t>Hoofdcomponenten zoals hero, kaarten, medewerkerregels, vensters en het productvenster.</w:t>
       </w:r>
     </w:p>
     <w:p>
@@ -15535,6 +17052,7 @@
         <w:tabs>
           <w:tab w:val="left" w:pos="720"/>
         </w:tabs>
+        <w:spacing w:after="60"/>
         <w:ind w:hanging="360"/>
         <w:contextualSpacing w:val="0"/>
       </w:pPr>
@@ -15548,7 +17066,40 @@
       </w:r>
       <w:r>
         <w:tab/>
-        <w:t>Responsive regels voor kleinere schermen.</w:t>
+        <w:t>De onderdelen die later zijn toegevoegd: gezichtsherkenning, standby en de slimme koelkast.</w:t>
+      </w:r>
+    </w:p>
+    <w:p>
+      <w:pPr>
+        <w:pStyle w:val="Lijstalinea"/>
+        <w:tabs>
+          <w:tab w:val="left" w:pos="720"/>
+        </w:tabs>
+        <w:ind w:hanging="360"/>
+        <w:contextualSpacing w:val="0"/>
+      </w:pPr>
+      <w:r>
+        <w:rPr>
+          <w:b/>
+          <w:bCs/>
+          <w:color w:val="38B5A8"/>
+        </w:rPr>
+        <w:t>6.</w:t>
+      </w:r>
+      <w:r>
+        <w:tab/>
+        <w:t>Responsive regels voor kleinere schermen (</w:t>
+      </w:r>
+      <w:r>
+        <w:rPr>
+          <w:rFonts w:ascii="Consolas" w:hAnsi="Consolas" w:cs="Consolas"/>
+          <w:sz w:val="18"/>
+          <w:shd w:val="clear" w:color="auto" w:fill="EEF4F2"/>
+        </w:rPr>
+        <w:t>responsive.css</w:t>
+      </w:r>
+      <w:r>
+        <w:t>).</w:t>
       </w:r>
     </w:p>
     <w:p>
@@ -15605,13 +17156,13 @@
         <w:pStyle w:val="Kop2"/>
         <w:keepNext/>
       </w:pPr>
-      <w:bookmarkStart w:id="65" w:name="k33"/>
-      <w:bookmarkStart w:id="66" w:name="_Toc243634082"/>
+      <w:bookmarkStart w:id="67" w:name="k34"/>
+      <w:bookmarkStart w:id="68" w:name="_Toc243897629"/>
       <w:r>
         <w:t>LAYOUT</w:t>
       </w:r>
-      <w:bookmarkEnd w:id="65"/>
-      <w:bookmarkEnd w:id="66"/>
+      <w:bookmarkEnd w:id="67"/>
+      <w:bookmarkEnd w:id="68"/>
     </w:p>
     <w:p>
       <w:r>
@@ -16314,13 +17865,13 @@
         <w:pStyle w:val="Kop2"/>
         <w:keepNext/>
       </w:pPr>
-      <w:bookmarkStart w:id="67" w:name="k34"/>
-      <w:bookmarkStart w:id="68" w:name="_Toc243634083"/>
+      <w:bookmarkStart w:id="69" w:name="k35"/>
+      <w:bookmarkStart w:id="70" w:name="_Toc243897630"/>
       <w:r>
         <w:t>COMPONENTEN</w:t>
       </w:r>
-      <w:bookmarkEnd w:id="67"/>
-      <w:bookmarkEnd w:id="68"/>
+      <w:bookmarkEnd w:id="69"/>
+      <w:bookmarkEnd w:id="70"/>
     </w:p>
     <w:p>
       <w:r>
@@ -16559,8 +18110,8 @@
           <w:numId w:val="37"/>
         </w:numPr>
       </w:pPr>
-      <w:bookmarkStart w:id="69" w:name="k35"/>
-      <w:bookmarkStart w:id="70" w:name="_Toc243634084"/>
+      <w:bookmarkStart w:id="71" w:name="k36"/>
+      <w:bookmarkStart w:id="72" w:name="_Toc243897631"/>
       <w:r>
         <w:t>UITLEG VAN DE JAVASCRIPT (</w:t>
       </w:r>
@@ -16575,21 +18126,21 @@
       <w:r>
         <w:t>).</w:t>
       </w:r>
-      <w:bookmarkEnd w:id="69"/>
-      <w:bookmarkEnd w:id="70"/>
+      <w:bookmarkEnd w:id="71"/>
+      <w:bookmarkEnd w:id="72"/>
     </w:p>
     <w:p>
       <w:pPr>
         <w:pStyle w:val="Kop2"/>
         <w:keepNext/>
       </w:pPr>
-      <w:bookmarkStart w:id="71" w:name="k36"/>
-      <w:bookmarkStart w:id="72" w:name="_Toc243634085"/>
+      <w:bookmarkStart w:id="73" w:name="k37"/>
+      <w:bookmarkStart w:id="74" w:name="_Toc243897632"/>
       <w:r>
         <w:t>OPSLAG EN VOORBEELDDATA</w:t>
       </w:r>
-      <w:bookmarkEnd w:id="71"/>
-      <w:bookmarkEnd w:id="72"/>
+      <w:bookmarkEnd w:id="73"/>
+      <w:bookmarkEnd w:id="74"/>
     </w:p>
     <w:p>
       <w:pPr>
@@ -17361,13 +18912,13 @@
         <w:pStyle w:val="Kop2"/>
         <w:keepNext/>
       </w:pPr>
-      <w:bookmarkStart w:id="73" w:name="k37"/>
-      <w:bookmarkStart w:id="74" w:name="_Toc243634086"/>
+      <w:bookmarkStart w:id="75" w:name="k38"/>
+      <w:bookmarkStart w:id="76" w:name="_Toc243897633"/>
       <w:r>
         <w:t>OBJECTGEORIËNTEERDE STRUCTUUR</w:t>
       </w:r>
-      <w:bookmarkEnd w:id="73"/>
-      <w:bookmarkEnd w:id="74"/>
+      <w:bookmarkEnd w:id="75"/>
+      <w:bookmarkEnd w:id="76"/>
     </w:p>
     <w:p>
       <w:r>
@@ -18022,7 +19573,7 @@
         <w:pStyle w:val="Kop3"/>
         <w:keepNext/>
       </w:pPr>
-      <w:bookmarkStart w:id="75" w:name="k38"/>
+      <w:bookmarkStart w:id="77" w:name="k39"/>
       <w:r>
         <w:rPr>
           <w:rFonts w:ascii="Consolas" w:hAnsi="Consolas" w:cs="Consolas"/>
@@ -18031,7 +19582,7 @@
         </w:rPr>
         <w:t>DataStore</w:t>
       </w:r>
-      <w:bookmarkEnd w:id="75"/>
+      <w:bookmarkEnd w:id="77"/>
     </w:p>
     <w:p>
       <w:r>
@@ -18788,7 +20339,7 @@
         <w:pStyle w:val="Kop3"/>
         <w:keepNext/>
       </w:pPr>
-      <w:bookmarkStart w:id="76" w:name="k39"/>
+      <w:bookmarkStart w:id="78" w:name="k40"/>
       <w:r>
         <w:rPr>
           <w:rFonts w:ascii="Consolas" w:hAnsi="Consolas" w:cs="Consolas"/>
@@ -18797,7 +20348,7 @@
         </w:rPr>
         <w:t>RegistrationModel</w:t>
       </w:r>
-      <w:bookmarkEnd w:id="76"/>
+      <w:bookmarkEnd w:id="78"/>
     </w:p>
     <w:p>
       <w:r>
@@ -19282,7 +20833,7 @@
         <w:pStyle w:val="Kop3"/>
         <w:keepNext/>
       </w:pPr>
-      <w:bookmarkStart w:id="77" w:name="k40"/>
+      <w:bookmarkStart w:id="79" w:name="k41"/>
       <w:r>
         <w:rPr>
           <w:rFonts w:ascii="Consolas" w:hAnsi="Consolas" w:cs="Consolas"/>
@@ -19291,7 +20842,7 @@
         </w:rPr>
         <w:t>RegistrationView</w:t>
       </w:r>
-      <w:bookmarkEnd w:id="77"/>
+      <w:bookmarkEnd w:id="79"/>
     </w:p>
     <w:p>
       <w:r>
@@ -19457,7 +21008,7 @@
         <w:pStyle w:val="Kop3"/>
         <w:keepNext/>
       </w:pPr>
-      <w:bookmarkStart w:id="78" w:name="k41"/>
+      <w:bookmarkStart w:id="80" w:name="k42"/>
       <w:r>
         <w:rPr>
           <w:rFonts w:ascii="Consolas" w:hAnsi="Consolas" w:cs="Consolas"/>
@@ -19466,7 +21017,7 @@
         </w:rPr>
         <w:t>RegistrationApp</w:t>
       </w:r>
-      <w:bookmarkEnd w:id="78"/>
+      <w:bookmarkEnd w:id="80"/>
     </w:p>
     <w:p>
       <w:r>
@@ -20098,11 +21649,11 @@
         <w:pStyle w:val="Kop3"/>
         <w:keepNext/>
       </w:pPr>
-      <w:bookmarkStart w:id="79" w:name="k42"/>
+      <w:bookmarkStart w:id="81" w:name="k43"/>
       <w:r>
         <w:t>Onderdelen van de controller</w:t>
       </w:r>
-      <w:bookmarkEnd w:id="79"/>
+      <w:bookmarkEnd w:id="81"/>
     </w:p>
     <w:p>
       <w:r>
@@ -22703,7 +24254,7 @@
         <w:pStyle w:val="Kop3"/>
         <w:keepNext/>
       </w:pPr>
-      <w:bookmarkStart w:id="80" w:name="k43"/>
+      <w:bookmarkStart w:id="82" w:name="k44"/>
       <w:r>
         <w:t>Slimme koelkast (</w:t>
       </w:r>
@@ -22718,7 +24269,7 @@
       <w:r>
         <w:t>)</w:t>
       </w:r>
-      <w:bookmarkEnd w:id="80"/>
+      <w:bookmarkEnd w:id="82"/>
     </w:p>
     <w:p>
       <w:pPr>
@@ -23058,7 +24609,7 @@
         <w:pStyle w:val="Kop3"/>
         <w:keepNext/>
       </w:pPr>
-      <w:bookmarkStart w:id="81" w:name="k44"/>
+      <w:bookmarkStart w:id="83" w:name="k45"/>
       <w:r>
         <w:rPr>
           <w:rFonts w:ascii="Consolas" w:hAnsi="Consolas" w:cs="Consolas"/>
@@ -23067,7 +24618,7 @@
         </w:rPr>
         <w:t>FridgeView</w:t>
       </w:r>
-      <w:bookmarkEnd w:id="81"/>
+      <w:bookmarkEnd w:id="83"/>
     </w:p>
     <w:p>
       <w:r>
@@ -23156,7 +24707,7 @@
         <w:pStyle w:val="Kop3"/>
         <w:keepNext/>
       </w:pPr>
-      <w:bookmarkStart w:id="82" w:name="k45"/>
+      <w:bookmarkStart w:id="84" w:name="k46"/>
       <w:r>
         <w:rPr>
           <w:rFonts w:ascii="Consolas" w:hAnsi="Consolas" w:cs="Consolas"/>
@@ -23165,7 +24716,7 @@
         </w:rPr>
         <w:t>CsvExport</w:t>
       </w:r>
-      <w:bookmarkEnd w:id="82"/>
+      <w:bookmarkEnd w:id="84"/>
     </w:p>
     <w:p>
       <w:r>
@@ -23177,7 +24728,7 @@
         <w:pStyle w:val="Kop3"/>
         <w:keepNext/>
       </w:pPr>
-      <w:bookmarkStart w:id="83" w:name="k46"/>
+      <w:bookmarkStart w:id="85" w:name="k47"/>
       <w:r>
         <w:rPr>
           <w:rFonts w:ascii="Consolas" w:hAnsi="Consolas" w:cs="Consolas"/>
@@ -23186,7 +24737,7 @@
         </w:rPr>
         <w:t>ThemeManager</w:t>
       </w:r>
-      <w:bookmarkEnd w:id="83"/>
+      <w:bookmarkEnd w:id="85"/>
     </w:p>
     <w:p>
       <w:r>
@@ -23275,7 +24826,7 @@
         <w:pStyle w:val="Kop3"/>
         <w:keepNext/>
       </w:pPr>
-      <w:bookmarkStart w:id="84" w:name="k47"/>
+      <w:bookmarkStart w:id="86" w:name="k48"/>
       <w:r>
         <w:rPr>
           <w:rFonts w:ascii="Consolas" w:hAnsi="Consolas" w:cs="Consolas"/>
@@ -23284,7 +24835,7 @@
         </w:rPr>
         <w:t>FaceRecognitionDemo</w:t>
       </w:r>
-      <w:bookmarkEnd w:id="84"/>
+      <w:bookmarkEnd w:id="86"/>
     </w:p>
     <w:p>
       <w:r>
@@ -23516,7 +25067,7 @@
         <w:pStyle w:val="Kop3"/>
         <w:keepNext/>
       </w:pPr>
-      <w:bookmarkStart w:id="85" w:name="k48"/>
+      <w:bookmarkStart w:id="87" w:name="k49"/>
       <w:r>
         <w:rPr>
           <w:rFonts w:ascii="Consolas" w:hAnsi="Consolas" w:cs="Consolas"/>
@@ -23525,7 +25076,7 @@
         </w:rPr>
         <w:t>BadgeReader</w:t>
       </w:r>
-      <w:bookmarkEnd w:id="85"/>
+      <w:bookmarkEnd w:id="87"/>
     </w:p>
     <w:p>
       <w:r>
@@ -23823,7 +25374,7 @@
         <w:pStyle w:val="Kop3"/>
         <w:keepNext/>
       </w:pPr>
-      <w:bookmarkStart w:id="86" w:name="k49"/>
+      <w:bookmarkStart w:id="88" w:name="k50"/>
       <w:r>
         <w:rPr>
           <w:rFonts w:ascii="Consolas" w:hAnsi="Consolas" w:cs="Consolas"/>
@@ -23832,7 +25383,7 @@
         </w:rPr>
         <w:t>icons.js</w:t>
       </w:r>
-      <w:bookmarkEnd w:id="86"/>
+      <w:bookmarkEnd w:id="88"/>
     </w:p>
     <w:p>
       <w:r>
@@ -23877,8 +25428,8 @@
         <w:pStyle w:val="Kop2"/>
         <w:keepNext/>
       </w:pPr>
-      <w:bookmarkStart w:id="87" w:name="k50"/>
-      <w:bookmarkStart w:id="88" w:name="_Toc243634087"/>
+      <w:bookmarkStart w:id="89" w:name="k51"/>
+      <w:bookmarkStart w:id="90" w:name="_Toc243897634"/>
       <w:r>
         <w:rPr>
           <w:rFonts w:ascii="Consolas" w:hAnsi="Consolas" w:cs="Consolas"/>
@@ -23887,8 +25438,8 @@
         </w:rPr>
         <w:t>renderEmployees</w:t>
       </w:r>
-      <w:bookmarkEnd w:id="87"/>
-      <w:bookmarkEnd w:id="88"/>
+      <w:bookmarkEnd w:id="89"/>
+      <w:bookmarkEnd w:id="90"/>
     </w:p>
     <w:p>
       <w:r>
@@ -24018,8 +25569,8 @@
         <w:pStyle w:val="Kop2"/>
         <w:keepNext/>
       </w:pPr>
-      <w:bookmarkStart w:id="89" w:name="k51"/>
-      <w:bookmarkStart w:id="90" w:name="_Toc243634088"/>
+      <w:bookmarkStart w:id="91" w:name="k52"/>
+      <w:bookmarkStart w:id="92" w:name="_Toc243897635"/>
       <w:r>
         <w:rPr>
           <w:rFonts w:ascii="Consolas" w:hAnsi="Consolas" w:cs="Consolas"/>
@@ -24028,8 +25579,8 @@
         </w:rPr>
         <w:t>renderStats</w:t>
       </w:r>
-      <w:bookmarkEnd w:id="89"/>
-      <w:bookmarkEnd w:id="90"/>
+      <w:bookmarkEnd w:id="91"/>
+      <w:bookmarkEnd w:id="92"/>
     </w:p>
     <w:p>
       <w:r>
@@ -24095,8 +25646,8 @@
         <w:pStyle w:val="Kop2"/>
         <w:keepNext/>
       </w:pPr>
-      <w:bookmarkStart w:id="91" w:name="k52"/>
-      <w:bookmarkStart w:id="92" w:name="_Toc243634089"/>
+      <w:bookmarkStart w:id="93" w:name="k53"/>
+      <w:bookmarkStart w:id="94" w:name="_Toc243897636"/>
       <w:r>
         <w:rPr>
           <w:rFonts w:ascii="Consolas" w:hAnsi="Consolas" w:cs="Consolas"/>
@@ -24105,8 +25656,8 @@
         </w:rPr>
         <w:t>registerSelectedProducts</w:t>
       </w:r>
-      <w:bookmarkEnd w:id="91"/>
-      <w:bookmarkEnd w:id="92"/>
+      <w:bookmarkEnd w:id="93"/>
+      <w:bookmarkEnd w:id="94"/>
     </w:p>
     <w:p>
       <w:r>
@@ -24266,8 +25817,8 @@
         <w:pStyle w:val="Kop2"/>
         <w:keepNext/>
       </w:pPr>
-      <w:bookmarkStart w:id="93" w:name="k53"/>
-      <w:bookmarkStart w:id="94" w:name="_Toc243634090"/>
+      <w:bookmarkStart w:id="95" w:name="k54"/>
+      <w:bookmarkStart w:id="96" w:name="_Toc243897637"/>
       <w:r>
         <w:rPr>
           <w:rFonts w:ascii="Consolas" w:hAnsi="Consolas" w:cs="Consolas"/>
@@ -24276,8 +25827,8 @@
         </w:rPr>
         <w:t>renderAll</w:t>
       </w:r>
-      <w:bookmarkEnd w:id="93"/>
-      <w:bookmarkEnd w:id="94"/>
+      <w:bookmarkEnd w:id="95"/>
+      <w:bookmarkEnd w:id="96"/>
     </w:p>
     <w:p>
       <w:r>
@@ -24333,8 +25884,8 @@
         <w:pStyle w:val="Kop2"/>
         <w:keepNext/>
       </w:pPr>
-      <w:bookmarkStart w:id="95" w:name="k54"/>
-      <w:bookmarkStart w:id="96" w:name="_Toc243634091"/>
+      <w:bookmarkStart w:id="97" w:name="k55"/>
+      <w:bookmarkStart w:id="98" w:name="_Toc243897638"/>
       <w:r>
         <w:rPr>
           <w:rFonts w:ascii="Consolas" w:hAnsi="Consolas" w:cs="Consolas"/>
@@ -24343,8 +25894,8 @@
         </w:rPr>
         <w:t>renderEmployeeProducts</w:t>
       </w:r>
-      <w:bookmarkEnd w:id="95"/>
-      <w:bookmarkEnd w:id="96"/>
+      <w:bookmarkEnd w:id="97"/>
+      <w:bookmarkEnd w:id="98"/>
     </w:p>
     <w:p>
       <w:r>
@@ -24455,8 +26006,8 @@
         <w:pStyle w:val="Kop2"/>
         <w:keepNext/>
       </w:pPr>
-      <w:bookmarkStart w:id="97" w:name="k55"/>
-      <w:bookmarkStart w:id="98" w:name="_Toc243634092"/>
+      <w:bookmarkStart w:id="99" w:name="k56"/>
+      <w:bookmarkStart w:id="100" w:name="_Toc243897639"/>
       <w:r>
         <w:rPr>
           <w:rFonts w:ascii="Consolas" w:hAnsi="Consolas" w:cs="Consolas"/>
@@ -24465,8 +26016,8 @@
         </w:rPr>
         <w:t>showToast</w:t>
       </w:r>
-      <w:bookmarkEnd w:id="97"/>
-      <w:bookmarkEnd w:id="98"/>
+      <w:bookmarkEnd w:id="99"/>
+      <w:bookmarkEnd w:id="100"/>
     </w:p>
     <w:p>
       <w:r>
@@ -24577,13 +26128,13 @@
         <w:pStyle w:val="Kop2"/>
         <w:keepNext/>
       </w:pPr>
-      <w:bookmarkStart w:id="99" w:name="k56"/>
-      <w:bookmarkStart w:id="100" w:name="_Toc243634093"/>
+      <w:bookmarkStart w:id="101" w:name="k57"/>
+      <w:bookmarkStart w:id="102" w:name="_Toc243897640"/>
       <w:r>
         <w:t>OPSLAGFOUTEN EN TERUGDRAAIEN</w:t>
       </w:r>
-      <w:bookmarkEnd w:id="99"/>
-      <w:bookmarkEnd w:id="100"/>
+      <w:bookmarkEnd w:id="101"/>
+      <w:bookmarkEnd w:id="102"/>
     </w:p>
     <w:p>
       <w:r>
@@ -24639,13 +26190,13 @@
         <w:pStyle w:val="Kop2"/>
         <w:keepNext/>
       </w:pPr>
-      <w:bookmarkStart w:id="101" w:name="k57"/>
-      <w:bookmarkStart w:id="102" w:name="_Toc243634094"/>
+      <w:bookmarkStart w:id="103" w:name="k58"/>
+      <w:bookmarkStart w:id="104" w:name="_Toc243897641"/>
       <w:r>
         <w:t>ADMINFUNCTIES</w:t>
       </w:r>
-      <w:bookmarkEnd w:id="101"/>
-      <w:bookmarkEnd w:id="102"/>
+      <w:bookmarkEnd w:id="103"/>
+      <w:bookmarkEnd w:id="104"/>
     </w:p>
     <w:p>
       <w:r>
@@ -24885,8 +26436,8 @@
         <w:pStyle w:val="Kop2"/>
         <w:keepNext/>
       </w:pPr>
-      <w:bookmarkStart w:id="103" w:name="k58"/>
-      <w:bookmarkStart w:id="104" w:name="_Toc243634095"/>
+      <w:bookmarkStart w:id="105" w:name="k59"/>
+      <w:bookmarkStart w:id="106" w:name="_Toc243897642"/>
       <w:r>
         <w:t xml:space="preserve">CSV-EXPORT (CLASS </w:t>
       </w:r>
@@ -24912,8 +26463,8 @@
       <w:r>
         <w:t>)</w:t>
       </w:r>
-      <w:bookmarkEnd w:id="103"/>
-      <w:bookmarkEnd w:id="104"/>
+      <w:bookmarkEnd w:id="105"/>
+      <w:bookmarkEnd w:id="106"/>
     </w:p>
     <w:p>
       <w:r>
@@ -25293,13 +26844,13 @@
         <w:pStyle w:val="Kop2"/>
         <w:keepNext/>
       </w:pPr>
-      <w:bookmarkStart w:id="105" w:name="k59"/>
-      <w:bookmarkStart w:id="106" w:name="_Toc243634096"/>
+      <w:bookmarkStart w:id="107" w:name="k60"/>
+      <w:bookmarkStart w:id="108" w:name="_Toc243897643"/>
       <w:r>
         <w:t>EVENT LISTENERS</w:t>
       </w:r>
-      <w:bookmarkEnd w:id="105"/>
-      <w:bookmarkEnd w:id="106"/>
+      <w:bookmarkEnd w:id="107"/>
+      <w:bookmarkEnd w:id="108"/>
     </w:p>
     <w:p>
       <w:r>
@@ -25905,13 +27456,13 @@
           <w:numId w:val="37"/>
         </w:numPr>
       </w:pPr>
-      <w:bookmarkStart w:id="107" w:name="k60"/>
-      <w:bookmarkStart w:id="108" w:name="_Toc243634097"/>
+      <w:bookmarkStart w:id="109" w:name="k61"/>
+      <w:bookmarkStart w:id="110" w:name="_Toc243897644"/>
       <w:r>
         <w:t>DATAMODEL EN KOPPELINGEN.</w:t>
       </w:r>
-      <w:bookmarkEnd w:id="107"/>
-      <w:bookmarkEnd w:id="108"/>
+      <w:bookmarkEnd w:id="109"/>
+      <w:bookmarkEnd w:id="110"/>
     </w:p>
     <w:p>
       <w:r>
@@ -25923,13 +27474,13 @@
         <w:pStyle w:val="Kop2"/>
         <w:keepNext/>
       </w:pPr>
-      <w:bookmarkStart w:id="109" w:name="k61"/>
-      <w:bookmarkStart w:id="110" w:name="_Toc243634098"/>
+      <w:bookmarkStart w:id="111" w:name="k62"/>
+      <w:bookmarkStart w:id="112" w:name="_Toc243897645"/>
       <w:r>
         <w:t>BEDRIJVEN</w:t>
       </w:r>
-      <w:bookmarkEnd w:id="109"/>
-      <w:bookmarkEnd w:id="110"/>
+      <w:bookmarkEnd w:id="111"/>
+      <w:bookmarkEnd w:id="112"/>
     </w:p>
     <w:tbl>
       <w:tblPr>
@@ -26134,13 +27685,13 @@
         <w:pStyle w:val="Kop2"/>
         <w:keepNext/>
       </w:pPr>
-      <w:bookmarkStart w:id="111" w:name="k62"/>
-      <w:bookmarkStart w:id="112" w:name="_Toc243634099"/>
+      <w:bookmarkStart w:id="113" w:name="k63"/>
+      <w:bookmarkStart w:id="114" w:name="_Toc243897646"/>
       <w:r>
         <w:t>CONSUMPTIEPUNTEN</w:t>
       </w:r>
-      <w:bookmarkEnd w:id="111"/>
-      <w:bookmarkEnd w:id="112"/>
+      <w:bookmarkEnd w:id="113"/>
+      <w:bookmarkEnd w:id="114"/>
     </w:p>
     <w:tbl>
       <w:tblPr>
@@ -26453,13 +28004,13 @@
         <w:pStyle w:val="Kop2"/>
         <w:keepNext/>
       </w:pPr>
-      <w:bookmarkStart w:id="113" w:name="k63"/>
-      <w:bookmarkStart w:id="114" w:name="_Toc243634100"/>
+      <w:bookmarkStart w:id="115" w:name="k64"/>
+      <w:bookmarkStart w:id="116" w:name="_Toc243897647"/>
       <w:r>
         <w:t>MEDEWERKERS</w:t>
       </w:r>
-      <w:bookmarkEnd w:id="113"/>
-      <w:bookmarkEnd w:id="114"/>
+      <w:bookmarkEnd w:id="115"/>
+      <w:bookmarkEnd w:id="116"/>
     </w:p>
     <w:tbl>
       <w:tblPr>
@@ -27009,13 +28560,13 @@
         <w:pStyle w:val="Kop2"/>
         <w:keepNext/>
       </w:pPr>
-      <w:bookmarkStart w:id="115" w:name="k64"/>
-      <w:bookmarkStart w:id="116" w:name="_Toc243634101"/>
+      <w:bookmarkStart w:id="117" w:name="k65"/>
+      <w:bookmarkStart w:id="118" w:name="_Toc243897648"/>
       <w:r>
         <w:t>REGISTRATIES</w:t>
       </w:r>
-      <w:bookmarkEnd w:id="115"/>
-      <w:bookmarkEnd w:id="116"/>
+      <w:bookmarkEnd w:id="117"/>
+      <w:bookmarkEnd w:id="118"/>
     </w:p>
     <w:tbl>
       <w:tblPr>
@@ -27670,13 +29221,13 @@
         <w:pStyle w:val="Kop2"/>
         <w:keepNext/>
       </w:pPr>
-      <w:bookmarkStart w:id="117" w:name="k65"/>
-      <w:bookmarkStart w:id="118" w:name="_Toc243634102"/>
+      <w:bookmarkStart w:id="119" w:name="k66"/>
+      <w:bookmarkStart w:id="120" w:name="_Toc243897649"/>
       <w:r>
         <w:t>SLIMME KOELKAST</w:t>
       </w:r>
-      <w:bookmarkEnd w:id="117"/>
-      <w:bookmarkEnd w:id="118"/>
+      <w:bookmarkEnd w:id="119"/>
+      <w:bookmarkEnd w:id="120"/>
     </w:p>
     <w:tbl>
       <w:tblPr>
@@ -28090,13 +29641,13 @@
         <w:pStyle w:val="Kop2"/>
         <w:keepNext/>
       </w:pPr>
-      <w:bookmarkStart w:id="119" w:name="k66"/>
-      <w:bookmarkStart w:id="120" w:name="_Toc243634103"/>
+      <w:bookmarkStart w:id="121" w:name="k67"/>
+      <w:bookmarkStart w:id="122" w:name="_Toc243897650"/>
       <w:r>
         <w:t>DEMO GEZICHTSHERKENNING</w:t>
       </w:r>
-      <w:bookmarkEnd w:id="119"/>
-      <w:bookmarkEnd w:id="120"/>
+      <w:bookmarkEnd w:id="121"/>
+      <w:bookmarkEnd w:id="122"/>
     </w:p>
     <w:tbl>
       <w:tblPr>
@@ -28388,13 +29939,13 @@
           <w:numId w:val="37"/>
         </w:numPr>
       </w:pPr>
-      <w:bookmarkStart w:id="121" w:name="k67"/>
-      <w:bookmarkStart w:id="122" w:name="_Toc243634104"/>
+      <w:bookmarkStart w:id="123" w:name="k68"/>
+      <w:bookmarkStart w:id="124" w:name="_Toc243897651"/>
       <w:r>
         <w:t>BELANGRIJKE DEMO-BEPERKINGEN.</w:t>
       </w:r>
-      <w:bookmarkEnd w:id="121"/>
-      <w:bookmarkEnd w:id="122"/>
+      <w:bookmarkEnd w:id="123"/>
+      <w:bookmarkEnd w:id="124"/>
     </w:p>
     <w:p>
       <w:r>
@@ -28829,13 +30380,13 @@
           <w:numId w:val="37"/>
         </w:numPr>
       </w:pPr>
-      <w:bookmarkStart w:id="123" w:name="k68"/>
-      <w:bookmarkStart w:id="124" w:name="_Toc243634105"/>
+      <w:bookmarkStart w:id="125" w:name="k69"/>
+      <w:bookmarkStart w:id="126" w:name="_Toc243897652"/>
       <w:r>
         <w:t>CODE UITLEGGEN TIJDENS EEN PRESENTATIE.</w:t>
       </w:r>
-      <w:bookmarkEnd w:id="123"/>
-      <w:bookmarkEnd w:id="124"/>
+      <w:bookmarkEnd w:id="125"/>
+      <w:bookmarkEnd w:id="126"/>
     </w:p>
     <w:p>
       <w:r>
@@ -29235,13 +30786,13 @@
           <w:numId w:val="37"/>
         </w:numPr>
       </w:pPr>
-      <w:bookmarkStart w:id="125" w:name="k69"/>
-      <w:bookmarkStart w:id="126" w:name="_Toc243634106"/>
+      <w:bookmarkStart w:id="127" w:name="k70"/>
+      <w:bookmarkStart w:id="128" w:name="_Toc243897653"/>
       <w:r>
         <w:t>MOGELIJKE VERVOLGSTAPPEN.</w:t>
       </w:r>
-      <w:bookmarkEnd w:id="125"/>
-      <w:bookmarkEnd w:id="126"/>
+      <w:bookmarkEnd w:id="127"/>
+      <w:bookmarkEnd w:id="128"/>
     </w:p>
     <w:p>
       <w:pPr>
@@ -29816,7 +31367,7 @@
         <v:path o:extrusionok="f" gradientshapeok="t" o:connecttype="rect"/>
         <o:lock v:ext="edit" aspectratio="t"/>
       </v:shapetype>
-      <v:shape id="_x0000_i1025" type="#_x0000_t75" style="width:254.25pt;height:219.75pt" o:bullet="t">
+      <v:shape id="_x0000_i1025" type="#_x0000_t75" style="width:254pt;height:219.5pt" o:bullet="t">
         <v:imagedata r:id="rId1" o:title="Bulletpoint"/>
       </v:shape>
     </w:pict>

</xml_diff>

<commit_message>
TO 3.22: gezichtsherkenning alleen instellen na de pas of door de beheerder
- Na kiezen op naam geen instellen of uitzetten meer, zodat niemand een gezicht onder de naam van een collega kan zetten
- Beheerder kan per medewerker gezichtsherkenning instellen en uitzetten (tabblad Medewerkers), met vervaldatum
- Na een jaar opnieuw instellen alleen na de pas of via de beheerder, met een nieuw toestemmingsvinkje
- Moment van toestemming (consentAt) wordt bewaard en gecontroleerd bij het laden, niet in export of logboek
- FR-87, FR-88, UC-23, AC-141 t/m AC-147 (874 unit tests, 34 browsertests), Word-bestanden bijgewerkt
</commit_message>
<xml_diff>
--- a/docs/DOCUMENTATIE.docx
+++ b/docs/DOCUMENTATIE.docx
@@ -82,7 +82,7 @@
           <w:numId w:val="0"/>
         </w:numPr>
       </w:pPr>
-      <w:bookmarkStart w:id="0" w:name="_Toc243906801"/>
+      <w:bookmarkStart w:id="0" w:name="_Toc243983739"/>
       <w:r>
         <w:t>INHOUDSOPGAVE.</w:t>
       </w:r>
@@ -112,7 +112,7 @@
       <w:r>
         <w:fldChar w:fldCharType="separate"/>
       </w:r>
-      <w:hyperlink w:anchor="_Toc243906801" w:history="1">
+      <w:hyperlink w:anchor="_Toc243983739" w:history="1">
         <w:r>
           <w:rPr>
             <w:rStyle w:val="Hyperlink"/>
@@ -139,7 +139,7 @@
             <w:noProof/>
             <w:webHidden/>
           </w:rPr>
-          <w:instrText xml:space="preserve"> PAGEREF _Toc243906801 \h </w:instrText>
+          <w:instrText xml:space="preserve"> PAGEREF _Toc243983739 \h </w:instrText>
         </w:r>
         <w:r>
           <w:rPr>
@@ -186,7 +186,7 @@
           <w:lang w:eastAsia="nl-NL"/>
         </w:rPr>
       </w:pPr>
-      <w:hyperlink w:anchor="_Toc243906802" w:history="1">
+      <w:hyperlink w:anchor="_Toc243983740" w:history="1">
         <w:r>
           <w:rPr>
             <w:rStyle w:val="Hyperlink"/>
@@ -231,7 +231,7 @@
             <w:noProof/>
             <w:webHidden/>
           </w:rPr>
-          <w:instrText xml:space="preserve"> PAGEREF _Toc243906802 \h </w:instrText>
+          <w:instrText xml:space="preserve"> PAGEREF _Toc243983740 \h </w:instrText>
         </w:r>
         <w:r>
           <w:rPr>
@@ -278,7 +278,7 @@
           <w:lang w:eastAsia="nl-NL"/>
         </w:rPr>
       </w:pPr>
-      <w:hyperlink w:anchor="_Toc243906803" w:history="1">
+      <w:hyperlink w:anchor="_Toc243983741" w:history="1">
         <w:r>
           <w:rPr>
             <w:rStyle w:val="Hyperlink"/>
@@ -323,7 +323,7 @@
             <w:noProof/>
             <w:webHidden/>
           </w:rPr>
-          <w:instrText xml:space="preserve"> PAGEREF _Toc243906803 \h </w:instrText>
+          <w:instrText xml:space="preserve"> PAGEREF _Toc243983741 \h </w:instrText>
         </w:r>
         <w:r>
           <w:rPr>
@@ -370,7 +370,7 @@
           <w:lang w:eastAsia="nl-NL"/>
         </w:rPr>
       </w:pPr>
-      <w:hyperlink w:anchor="_Toc243906804" w:history="1">
+      <w:hyperlink w:anchor="_Toc243983742" w:history="1">
         <w:r>
           <w:rPr>
             <w:rStyle w:val="Hyperlink"/>
@@ -415,7 +415,7 @@
             <w:noProof/>
             <w:webHidden/>
           </w:rPr>
-          <w:instrText xml:space="preserve"> PAGEREF _Toc243906804 \h </w:instrText>
+          <w:instrText xml:space="preserve"> PAGEREF _Toc243983742 \h </w:instrText>
         </w:r>
         <w:r>
           <w:rPr>
@@ -462,7 +462,7 @@
           <w:lang w:eastAsia="nl-NL"/>
         </w:rPr>
       </w:pPr>
-      <w:hyperlink w:anchor="_Toc243906805" w:history="1">
+      <w:hyperlink w:anchor="_Toc243983743" w:history="1">
         <w:r>
           <w:rPr>
             <w:rStyle w:val="Hyperlink"/>
@@ -507,7 +507,7 @@
             <w:noProof/>
             <w:webHidden/>
           </w:rPr>
-          <w:instrText xml:space="preserve"> PAGEREF _Toc243906805 \h </w:instrText>
+          <w:instrText xml:space="preserve"> PAGEREF _Toc243983743 \h </w:instrText>
         </w:r>
         <w:r>
           <w:rPr>
@@ -554,7 +554,7 @@
           <w:lang w:eastAsia="nl-NL"/>
         </w:rPr>
       </w:pPr>
-      <w:hyperlink w:anchor="_Toc243906806" w:history="1">
+      <w:hyperlink w:anchor="_Toc243983744" w:history="1">
         <w:r>
           <w:rPr>
             <w:rStyle w:val="Hyperlink"/>
@@ -599,7 +599,7 @@
             <w:noProof/>
             <w:webHidden/>
           </w:rPr>
-          <w:instrText xml:space="preserve"> PAGEREF _Toc243906806 \h </w:instrText>
+          <w:instrText xml:space="preserve"> PAGEREF _Toc243983744 \h </w:instrText>
         </w:r>
         <w:r>
           <w:rPr>
@@ -646,7 +646,7 @@
           <w:lang w:eastAsia="nl-NL"/>
         </w:rPr>
       </w:pPr>
-      <w:hyperlink w:anchor="_Toc243906807" w:history="1">
+      <w:hyperlink w:anchor="_Toc243983745" w:history="1">
         <w:r>
           <w:rPr>
             <w:rStyle w:val="Hyperlink"/>
@@ -691,7 +691,7 @@
             <w:noProof/>
             <w:webHidden/>
           </w:rPr>
-          <w:instrText xml:space="preserve"> PAGEREF _Toc243906807 \h </w:instrText>
+          <w:instrText xml:space="preserve"> PAGEREF _Toc243983745 \h </w:instrText>
         </w:r>
         <w:r>
           <w:rPr>
@@ -738,7 +738,7 @@
           <w:lang w:eastAsia="nl-NL"/>
         </w:rPr>
       </w:pPr>
-      <w:hyperlink w:anchor="_Toc243906808" w:history="1">
+      <w:hyperlink w:anchor="_Toc243983746" w:history="1">
         <w:r>
           <w:rPr>
             <w:rStyle w:val="Hyperlink"/>
@@ -783,7 +783,7 @@
             <w:noProof/>
             <w:webHidden/>
           </w:rPr>
-          <w:instrText xml:space="preserve"> PAGEREF _Toc243906808 \h </w:instrText>
+          <w:instrText xml:space="preserve"> PAGEREF _Toc243983746 \h </w:instrText>
         </w:r>
         <w:r>
           <w:rPr>
@@ -830,7 +830,7 @@
           <w:lang w:eastAsia="nl-NL"/>
         </w:rPr>
       </w:pPr>
-      <w:hyperlink w:anchor="_Toc243906809" w:history="1">
+      <w:hyperlink w:anchor="_Toc243983747" w:history="1">
         <w:r>
           <w:rPr>
             <w:rStyle w:val="Hyperlink"/>
@@ -875,7 +875,7 @@
             <w:noProof/>
             <w:webHidden/>
           </w:rPr>
-          <w:instrText xml:space="preserve"> PAGEREF _Toc243906809 \h </w:instrText>
+          <w:instrText xml:space="preserve"> PAGEREF _Toc243983747 \h </w:instrText>
         </w:r>
         <w:r>
           <w:rPr>
@@ -922,7 +922,7 @@
           <w:lang w:eastAsia="nl-NL"/>
         </w:rPr>
       </w:pPr>
-      <w:hyperlink w:anchor="_Toc243906810" w:history="1">
+      <w:hyperlink w:anchor="_Toc243983748" w:history="1">
         <w:r>
           <w:rPr>
             <w:rStyle w:val="Hyperlink"/>
@@ -967,7 +967,7 @@
             <w:noProof/>
             <w:webHidden/>
           </w:rPr>
-          <w:instrText xml:space="preserve"> PAGEREF _Toc243906810 \h </w:instrText>
+          <w:instrText xml:space="preserve"> PAGEREF _Toc243983748 \h </w:instrText>
         </w:r>
         <w:r>
           <w:rPr>
@@ -1014,7 +1014,7 @@
           <w:lang w:eastAsia="nl-NL"/>
         </w:rPr>
       </w:pPr>
-      <w:hyperlink w:anchor="_Toc243906811" w:history="1">
+      <w:hyperlink w:anchor="_Toc243983749" w:history="1">
         <w:r>
           <w:rPr>
             <w:rStyle w:val="Hyperlink"/>
@@ -1059,7 +1059,7 @@
             <w:noProof/>
             <w:webHidden/>
           </w:rPr>
-          <w:instrText xml:space="preserve"> PAGEREF _Toc243906811 \h </w:instrText>
+          <w:instrText xml:space="preserve"> PAGEREF _Toc243983749 \h </w:instrText>
         </w:r>
         <w:r>
           <w:rPr>
@@ -1106,7 +1106,7 @@
           <w:lang w:eastAsia="nl-NL"/>
         </w:rPr>
       </w:pPr>
-      <w:hyperlink w:anchor="_Toc243906812" w:history="1">
+      <w:hyperlink w:anchor="_Toc243983750" w:history="1">
         <w:r>
           <w:rPr>
             <w:rStyle w:val="Hyperlink"/>
@@ -1151,7 +1151,7 @@
             <w:noProof/>
             <w:webHidden/>
           </w:rPr>
-          <w:instrText xml:space="preserve"> PAGEREF _Toc243906812 \h </w:instrText>
+          <w:instrText xml:space="preserve"> PAGEREF _Toc243983750 \h </w:instrText>
         </w:r>
         <w:r>
           <w:rPr>
@@ -1198,7 +1198,7 @@
           <w:lang w:eastAsia="nl-NL"/>
         </w:rPr>
       </w:pPr>
-      <w:hyperlink w:anchor="_Toc243906813" w:history="1">
+      <w:hyperlink w:anchor="_Toc243983751" w:history="1">
         <w:r>
           <w:rPr>
             <w:rStyle w:val="Hyperlink"/>
@@ -1243,7 +1243,7 @@
             <w:noProof/>
             <w:webHidden/>
           </w:rPr>
-          <w:instrText xml:space="preserve"> PAGEREF _Toc243906813 \h </w:instrText>
+          <w:instrText xml:space="preserve"> PAGEREF _Toc243983751 \h </w:instrText>
         </w:r>
         <w:r>
           <w:rPr>
@@ -1290,7 +1290,7 @@
           <w:lang w:eastAsia="nl-NL"/>
         </w:rPr>
       </w:pPr>
-      <w:hyperlink w:anchor="_Toc243906814" w:history="1">
+      <w:hyperlink w:anchor="_Toc243983752" w:history="1">
         <w:r>
           <w:rPr>
             <w:rStyle w:val="Hyperlink"/>
@@ -1335,7 +1335,7 @@
             <w:noProof/>
             <w:webHidden/>
           </w:rPr>
-          <w:instrText xml:space="preserve"> PAGEREF _Toc243906814 \h </w:instrText>
+          <w:instrText xml:space="preserve"> PAGEREF _Toc243983752 \h </w:instrText>
         </w:r>
         <w:r>
           <w:rPr>
@@ -1382,7 +1382,7 @@
           <w:lang w:eastAsia="nl-NL"/>
         </w:rPr>
       </w:pPr>
-      <w:hyperlink w:anchor="_Toc243906815" w:history="1">
+      <w:hyperlink w:anchor="_Toc243983753" w:history="1">
         <w:r>
           <w:rPr>
             <w:rStyle w:val="Hyperlink"/>
@@ -1427,7 +1427,7 @@
             <w:noProof/>
             <w:webHidden/>
           </w:rPr>
-          <w:instrText xml:space="preserve"> PAGEREF _Toc243906815 \h </w:instrText>
+          <w:instrText xml:space="preserve"> PAGEREF _Toc243983753 \h </w:instrText>
         </w:r>
         <w:r>
           <w:rPr>
@@ -1474,7 +1474,7 @@
           <w:lang w:eastAsia="nl-NL"/>
         </w:rPr>
       </w:pPr>
-      <w:hyperlink w:anchor="_Toc243906816" w:history="1">
+      <w:hyperlink w:anchor="_Toc243983754" w:history="1">
         <w:r>
           <w:rPr>
             <w:rStyle w:val="Hyperlink"/>
@@ -1519,7 +1519,7 @@
             <w:noProof/>
             <w:webHidden/>
           </w:rPr>
-          <w:instrText xml:space="preserve"> PAGEREF _Toc243906816 \h </w:instrText>
+          <w:instrText xml:space="preserve"> PAGEREF _Toc243983754 \h </w:instrText>
         </w:r>
         <w:r>
           <w:rPr>
@@ -1566,7 +1566,7 @@
           <w:lang w:eastAsia="nl-NL"/>
         </w:rPr>
       </w:pPr>
-      <w:hyperlink w:anchor="_Toc243906817" w:history="1">
+      <w:hyperlink w:anchor="_Toc243983755" w:history="1">
         <w:r>
           <w:rPr>
             <w:rStyle w:val="Hyperlink"/>
@@ -1611,7 +1611,7 @@
             <w:noProof/>
             <w:webHidden/>
           </w:rPr>
-          <w:instrText xml:space="preserve"> PAGEREF _Toc243906817 \h </w:instrText>
+          <w:instrText xml:space="preserve"> PAGEREF _Toc243983755 \h </w:instrText>
         </w:r>
         <w:r>
           <w:rPr>
@@ -1658,7 +1658,7 @@
           <w:lang w:eastAsia="nl-NL"/>
         </w:rPr>
       </w:pPr>
-      <w:hyperlink w:anchor="_Toc243906818" w:history="1">
+      <w:hyperlink w:anchor="_Toc243983756" w:history="1">
         <w:r>
           <w:rPr>
             <w:rStyle w:val="Hyperlink"/>
@@ -1703,7 +1703,7 @@
             <w:noProof/>
             <w:webHidden/>
           </w:rPr>
-          <w:instrText xml:space="preserve"> PAGEREF _Toc243906818 \h </w:instrText>
+          <w:instrText xml:space="preserve"> PAGEREF _Toc243983756 \h </w:instrText>
         </w:r>
         <w:r>
           <w:rPr>
@@ -1723,7 +1723,7 @@
             <w:noProof/>
             <w:webHidden/>
           </w:rPr>
-          <w:t>17</w:t>
+          <w:t>18</w:t>
         </w:r>
         <w:r>
           <w:rPr>
@@ -1750,7 +1750,7 @@
           <w:lang w:eastAsia="nl-NL"/>
         </w:rPr>
       </w:pPr>
-      <w:hyperlink w:anchor="_Toc243906819" w:history="1">
+      <w:hyperlink w:anchor="_Toc243983757" w:history="1">
         <w:r>
           <w:rPr>
             <w:rStyle w:val="Hyperlink"/>
@@ -1795,7 +1795,7 @@
             <w:noProof/>
             <w:webHidden/>
           </w:rPr>
-          <w:instrText xml:space="preserve"> PAGEREF _Toc243906819 \h </w:instrText>
+          <w:instrText xml:space="preserve"> PAGEREF _Toc243983757 \h </w:instrText>
         </w:r>
         <w:r>
           <w:rPr>
@@ -1842,7 +1842,7 @@
           <w:lang w:eastAsia="nl-NL"/>
         </w:rPr>
       </w:pPr>
-      <w:hyperlink w:anchor="_Toc243906820" w:history="1">
+      <w:hyperlink w:anchor="_Toc243983758" w:history="1">
         <w:r>
           <w:rPr>
             <w:rStyle w:val="Hyperlink"/>
@@ -1887,7 +1887,7 @@
             <w:noProof/>
             <w:webHidden/>
           </w:rPr>
-          <w:instrText xml:space="preserve"> PAGEREF _Toc243906820 \h </w:instrText>
+          <w:instrText xml:space="preserve"> PAGEREF _Toc243983758 \h </w:instrText>
         </w:r>
         <w:r>
           <w:rPr>
@@ -1934,7 +1934,7 @@
           <w:lang w:eastAsia="nl-NL"/>
         </w:rPr>
       </w:pPr>
-      <w:hyperlink w:anchor="_Toc243906821" w:history="1">
+      <w:hyperlink w:anchor="_Toc243983759" w:history="1">
         <w:r>
           <w:rPr>
             <w:rStyle w:val="Hyperlink"/>
@@ -1979,7 +1979,7 @@
             <w:noProof/>
             <w:webHidden/>
           </w:rPr>
-          <w:instrText xml:space="preserve"> PAGEREF _Toc243906821 \h </w:instrText>
+          <w:instrText xml:space="preserve"> PAGEREF _Toc243983759 \h </w:instrText>
         </w:r>
         <w:r>
           <w:rPr>
@@ -2026,7 +2026,7 @@
           <w:lang w:eastAsia="nl-NL"/>
         </w:rPr>
       </w:pPr>
-      <w:hyperlink w:anchor="_Toc243906822" w:history="1">
+      <w:hyperlink w:anchor="_Toc243983760" w:history="1">
         <w:r>
           <w:rPr>
             <w:rStyle w:val="Hyperlink"/>
@@ -2071,7 +2071,7 @@
             <w:noProof/>
             <w:webHidden/>
           </w:rPr>
-          <w:instrText xml:space="preserve"> PAGEREF _Toc243906822 \h </w:instrText>
+          <w:instrText xml:space="preserve"> PAGEREF _Toc243983760 \h </w:instrText>
         </w:r>
         <w:r>
           <w:rPr>
@@ -2118,7 +2118,7 @@
           <w:lang w:eastAsia="nl-NL"/>
         </w:rPr>
       </w:pPr>
-      <w:hyperlink w:anchor="_Toc243906823" w:history="1">
+      <w:hyperlink w:anchor="_Toc243983761" w:history="1">
         <w:r>
           <w:rPr>
             <w:rStyle w:val="Hyperlink"/>
@@ -2163,7 +2163,7 @@
             <w:noProof/>
             <w:webHidden/>
           </w:rPr>
-          <w:instrText xml:space="preserve"> PAGEREF _Toc243906823 \h </w:instrText>
+          <w:instrText xml:space="preserve"> PAGEREF _Toc243983761 \h </w:instrText>
         </w:r>
         <w:r>
           <w:rPr>
@@ -2210,7 +2210,7 @@
           <w:lang w:eastAsia="nl-NL"/>
         </w:rPr>
       </w:pPr>
-      <w:hyperlink w:anchor="_Toc243906824" w:history="1">
+      <w:hyperlink w:anchor="_Toc243983762" w:history="1">
         <w:r>
           <w:rPr>
             <w:rStyle w:val="Hyperlink"/>
@@ -2271,7 +2271,7 @@
             <w:noProof/>
             <w:webHidden/>
           </w:rPr>
-          <w:instrText xml:space="preserve"> PAGEREF _Toc243906824 \h </w:instrText>
+          <w:instrText xml:space="preserve"> PAGEREF _Toc243983762 \h </w:instrText>
         </w:r>
         <w:r>
           <w:rPr>
@@ -2291,7 +2291,7 @@
             <w:noProof/>
             <w:webHidden/>
           </w:rPr>
-          <w:t>23</w:t>
+          <w:t>24</w:t>
         </w:r>
         <w:r>
           <w:rPr>
@@ -2318,7 +2318,7 @@
           <w:lang w:eastAsia="nl-NL"/>
         </w:rPr>
       </w:pPr>
-      <w:hyperlink w:anchor="_Toc243906825" w:history="1">
+      <w:hyperlink w:anchor="_Toc243983763" w:history="1">
         <w:r>
           <w:rPr>
             <w:rStyle w:val="Hyperlink"/>
@@ -2363,7 +2363,7 @@
             <w:noProof/>
             <w:webHidden/>
           </w:rPr>
-          <w:instrText xml:space="preserve"> PAGEREF _Toc243906825 \h </w:instrText>
+          <w:instrText xml:space="preserve"> PAGEREF _Toc243983763 \h </w:instrText>
         </w:r>
         <w:r>
           <w:rPr>
@@ -2383,7 +2383,7 @@
             <w:noProof/>
             <w:webHidden/>
           </w:rPr>
-          <w:t>23</w:t>
+          <w:t>24</w:t>
         </w:r>
         <w:r>
           <w:rPr>
@@ -2410,7 +2410,7 @@
           <w:lang w:eastAsia="nl-NL"/>
         </w:rPr>
       </w:pPr>
-      <w:hyperlink w:anchor="_Toc243906826" w:history="1">
+      <w:hyperlink w:anchor="_Toc243983764" w:history="1">
         <w:r>
           <w:rPr>
             <w:rStyle w:val="Hyperlink"/>
@@ -2455,7 +2455,7 @@
             <w:noProof/>
             <w:webHidden/>
           </w:rPr>
-          <w:instrText xml:space="preserve"> PAGEREF _Toc243906826 \h </w:instrText>
+          <w:instrText xml:space="preserve"> PAGEREF _Toc243983764 \h </w:instrText>
         </w:r>
         <w:r>
           <w:rPr>
@@ -2475,7 +2475,7 @@
             <w:noProof/>
             <w:webHidden/>
           </w:rPr>
-          <w:t>23</w:t>
+          <w:t>24</w:t>
         </w:r>
         <w:r>
           <w:rPr>
@@ -2502,7 +2502,7 @@
           <w:lang w:eastAsia="nl-NL"/>
         </w:rPr>
       </w:pPr>
-      <w:hyperlink w:anchor="_Toc243906827" w:history="1">
+      <w:hyperlink w:anchor="_Toc243983765" w:history="1">
         <w:r>
           <w:rPr>
             <w:rStyle w:val="Hyperlink"/>
@@ -2547,7 +2547,7 @@
             <w:noProof/>
             <w:webHidden/>
           </w:rPr>
-          <w:instrText xml:space="preserve"> PAGEREF _Toc243906827 \h </w:instrText>
+          <w:instrText xml:space="preserve"> PAGEREF _Toc243983765 \h </w:instrText>
         </w:r>
         <w:r>
           <w:rPr>
@@ -2567,7 +2567,7 @@
             <w:noProof/>
             <w:webHidden/>
           </w:rPr>
-          <w:t>23</w:t>
+          <w:t>24</w:t>
         </w:r>
         <w:r>
           <w:rPr>
@@ -2594,7 +2594,7 @@
           <w:lang w:eastAsia="nl-NL"/>
         </w:rPr>
       </w:pPr>
-      <w:hyperlink w:anchor="_Toc243906828" w:history="1">
+      <w:hyperlink w:anchor="_Toc243983766" w:history="1">
         <w:r>
           <w:rPr>
             <w:rStyle w:val="Hyperlink"/>
@@ -2639,7 +2639,7 @@
             <w:noProof/>
             <w:webHidden/>
           </w:rPr>
-          <w:instrText xml:space="preserve"> PAGEREF _Toc243906828 \h </w:instrText>
+          <w:instrText xml:space="preserve"> PAGEREF _Toc243983766 \h </w:instrText>
         </w:r>
         <w:r>
           <w:rPr>
@@ -2659,7 +2659,7 @@
             <w:noProof/>
             <w:webHidden/>
           </w:rPr>
-          <w:t>23</w:t>
+          <w:t>24</w:t>
         </w:r>
         <w:r>
           <w:rPr>
@@ -2686,7 +2686,7 @@
           <w:lang w:eastAsia="nl-NL"/>
         </w:rPr>
       </w:pPr>
-      <w:hyperlink w:anchor="_Toc243906829" w:history="1">
+      <w:hyperlink w:anchor="_Toc243983767" w:history="1">
         <w:r>
           <w:rPr>
             <w:rStyle w:val="Hyperlink"/>
@@ -2731,7 +2731,7 @@
             <w:noProof/>
             <w:webHidden/>
           </w:rPr>
-          <w:instrText xml:space="preserve"> PAGEREF _Toc243906829 \h </w:instrText>
+          <w:instrText xml:space="preserve"> PAGEREF _Toc243983767 \h </w:instrText>
         </w:r>
         <w:r>
           <w:rPr>
@@ -2751,7 +2751,7 @@
             <w:noProof/>
             <w:webHidden/>
           </w:rPr>
-          <w:t>24</w:t>
+          <w:t>25</w:t>
         </w:r>
         <w:r>
           <w:rPr>
@@ -2778,7 +2778,7 @@
           <w:lang w:eastAsia="nl-NL"/>
         </w:rPr>
       </w:pPr>
-      <w:hyperlink w:anchor="_Toc243906830" w:history="1">
+      <w:hyperlink w:anchor="_Toc243983768" w:history="1">
         <w:r>
           <w:rPr>
             <w:rStyle w:val="Hyperlink"/>
@@ -2823,7 +2823,7 @@
             <w:noProof/>
             <w:webHidden/>
           </w:rPr>
-          <w:instrText xml:space="preserve"> PAGEREF _Toc243906830 \h </w:instrText>
+          <w:instrText xml:space="preserve"> PAGEREF _Toc243983768 \h </w:instrText>
         </w:r>
         <w:r>
           <w:rPr>
@@ -2843,7 +2843,7 @@
             <w:noProof/>
             <w:webHidden/>
           </w:rPr>
-          <w:t>24</w:t>
+          <w:t>25</w:t>
         </w:r>
         <w:r>
           <w:rPr>
@@ -2870,7 +2870,7 @@
           <w:lang w:eastAsia="nl-NL"/>
         </w:rPr>
       </w:pPr>
-      <w:hyperlink w:anchor="_Toc243906831" w:history="1">
+      <w:hyperlink w:anchor="_Toc243983769" w:history="1">
         <w:r>
           <w:rPr>
             <w:rStyle w:val="Hyperlink"/>
@@ -2915,7 +2915,7 @@
             <w:noProof/>
             <w:webHidden/>
           </w:rPr>
-          <w:instrText xml:space="preserve"> PAGEREF _Toc243906831 \h </w:instrText>
+          <w:instrText xml:space="preserve"> PAGEREF _Toc243983769 \h </w:instrText>
         </w:r>
         <w:r>
           <w:rPr>
@@ -2935,7 +2935,7 @@
             <w:noProof/>
             <w:webHidden/>
           </w:rPr>
-          <w:t>25</w:t>
+          <w:t>26</w:t>
         </w:r>
         <w:r>
           <w:rPr>
@@ -2962,7 +2962,7 @@
           <w:lang w:eastAsia="nl-NL"/>
         </w:rPr>
       </w:pPr>
-      <w:hyperlink w:anchor="_Toc243906832" w:history="1">
+      <w:hyperlink w:anchor="_Toc243983770" w:history="1">
         <w:r>
           <w:rPr>
             <w:rStyle w:val="Hyperlink"/>
@@ -3007,7 +3007,7 @@
             <w:noProof/>
             <w:webHidden/>
           </w:rPr>
-          <w:instrText xml:space="preserve"> PAGEREF _Toc243906832 \h </w:instrText>
+          <w:instrText xml:space="preserve"> PAGEREF _Toc243983770 \h </w:instrText>
         </w:r>
         <w:r>
           <w:rPr>
@@ -3027,7 +3027,7 @@
             <w:noProof/>
             <w:webHidden/>
           </w:rPr>
-          <w:t>25</w:t>
+          <w:t>26</w:t>
         </w:r>
         <w:r>
           <w:rPr>
@@ -3054,7 +3054,7 @@
           <w:lang w:eastAsia="nl-NL"/>
         </w:rPr>
       </w:pPr>
-      <w:hyperlink w:anchor="_Toc243906833" w:history="1">
+      <w:hyperlink w:anchor="_Toc243983771" w:history="1">
         <w:r>
           <w:rPr>
             <w:rStyle w:val="Hyperlink"/>
@@ -3115,7 +3115,7 @@
             <w:noProof/>
             <w:webHidden/>
           </w:rPr>
-          <w:instrText xml:space="preserve"> PAGEREF _Toc243906833 \h </w:instrText>
+          <w:instrText xml:space="preserve"> PAGEREF _Toc243983771 \h </w:instrText>
         </w:r>
         <w:r>
           <w:rPr>
@@ -3135,7 +3135,7 @@
             <w:noProof/>
             <w:webHidden/>
           </w:rPr>
-          <w:t>26</w:t>
+          <w:t>27</w:t>
         </w:r>
         <w:r>
           <w:rPr>
@@ -3162,7 +3162,7 @@
           <w:lang w:eastAsia="nl-NL"/>
         </w:rPr>
       </w:pPr>
-      <w:hyperlink w:anchor="_Toc243906834" w:history="1">
+      <w:hyperlink w:anchor="_Toc243983772" w:history="1">
         <w:r>
           <w:rPr>
             <w:rStyle w:val="Hyperlink"/>
@@ -3207,7 +3207,7 @@
             <w:noProof/>
             <w:webHidden/>
           </w:rPr>
-          <w:instrText xml:space="preserve"> PAGEREF _Toc243906834 \h </w:instrText>
+          <w:instrText xml:space="preserve"> PAGEREF _Toc243983772 \h </w:instrText>
         </w:r>
         <w:r>
           <w:rPr>
@@ -3227,7 +3227,7 @@
             <w:noProof/>
             <w:webHidden/>
           </w:rPr>
-          <w:t>26</w:t>
+          <w:t>27</w:t>
         </w:r>
         <w:r>
           <w:rPr>
@@ -3254,7 +3254,7 @@
           <w:lang w:eastAsia="nl-NL"/>
         </w:rPr>
       </w:pPr>
-      <w:hyperlink w:anchor="_Toc243906835" w:history="1">
+      <w:hyperlink w:anchor="_Toc243983773" w:history="1">
         <w:r>
           <w:rPr>
             <w:rStyle w:val="Hyperlink"/>
@@ -3299,7 +3299,7 @@
             <w:noProof/>
             <w:webHidden/>
           </w:rPr>
-          <w:instrText xml:space="preserve"> PAGEREF _Toc243906835 \h </w:instrText>
+          <w:instrText xml:space="preserve"> PAGEREF _Toc243983773 \h </w:instrText>
         </w:r>
         <w:r>
           <w:rPr>
@@ -3319,7 +3319,7 @@
             <w:noProof/>
             <w:webHidden/>
           </w:rPr>
-          <w:t>26</w:t>
+          <w:t>27</w:t>
         </w:r>
         <w:r>
           <w:rPr>
@@ -3346,7 +3346,7 @@
           <w:lang w:eastAsia="nl-NL"/>
         </w:rPr>
       </w:pPr>
-      <w:hyperlink w:anchor="_Toc243906836" w:history="1">
+      <w:hyperlink w:anchor="_Toc243983774" w:history="1">
         <w:r>
           <w:rPr>
             <w:rStyle w:val="Hyperlink"/>
@@ -3391,7 +3391,7 @@
             <w:noProof/>
             <w:webHidden/>
           </w:rPr>
-          <w:instrText xml:space="preserve"> PAGEREF _Toc243906836 \h </w:instrText>
+          <w:instrText xml:space="preserve"> PAGEREF _Toc243983774 \h </w:instrText>
         </w:r>
         <w:r>
           <w:rPr>
@@ -3411,7 +3411,7 @@
             <w:noProof/>
             <w:webHidden/>
           </w:rPr>
-          <w:t>27</w:t>
+          <w:t>28</w:t>
         </w:r>
         <w:r>
           <w:rPr>
@@ -3438,7 +3438,7 @@
           <w:lang w:eastAsia="nl-NL"/>
         </w:rPr>
       </w:pPr>
-      <w:hyperlink w:anchor="_Toc243906837" w:history="1">
+      <w:hyperlink w:anchor="_Toc243983775" w:history="1">
         <w:r>
           <w:rPr>
             <w:rStyle w:val="Hyperlink"/>
@@ -3483,7 +3483,7 @@
             <w:noProof/>
             <w:webHidden/>
           </w:rPr>
-          <w:instrText xml:space="preserve"> PAGEREF _Toc243906837 \h </w:instrText>
+          <w:instrText xml:space="preserve"> PAGEREF _Toc243983775 \h </w:instrText>
         </w:r>
         <w:r>
           <w:rPr>
@@ -3503,7 +3503,7 @@
             <w:noProof/>
             <w:webHidden/>
           </w:rPr>
-          <w:t>28</w:t>
+          <w:t>29</w:t>
         </w:r>
         <w:r>
           <w:rPr>
@@ -3530,7 +3530,7 @@
           <w:lang w:eastAsia="nl-NL"/>
         </w:rPr>
       </w:pPr>
-      <w:hyperlink w:anchor="_Toc243906838" w:history="1">
+      <w:hyperlink w:anchor="_Toc243983776" w:history="1">
         <w:r>
           <w:rPr>
             <w:rStyle w:val="Hyperlink"/>
@@ -3591,7 +3591,7 @@
             <w:noProof/>
             <w:webHidden/>
           </w:rPr>
-          <w:instrText xml:space="preserve"> PAGEREF _Toc243906838 \h </w:instrText>
+          <w:instrText xml:space="preserve"> PAGEREF _Toc243983776 \h </w:instrText>
         </w:r>
         <w:r>
           <w:rPr>
@@ -3611,7 +3611,7 @@
             <w:noProof/>
             <w:webHidden/>
           </w:rPr>
-          <w:t>29</w:t>
+          <w:t>30</w:t>
         </w:r>
         <w:r>
           <w:rPr>
@@ -3638,7 +3638,7 @@
           <w:lang w:eastAsia="nl-NL"/>
         </w:rPr>
       </w:pPr>
-      <w:hyperlink w:anchor="_Toc243906839" w:history="1">
+      <w:hyperlink w:anchor="_Toc243983777" w:history="1">
         <w:r>
           <w:rPr>
             <w:rStyle w:val="Hyperlink"/>
@@ -3683,7 +3683,7 @@
             <w:noProof/>
             <w:webHidden/>
           </w:rPr>
-          <w:instrText xml:space="preserve"> PAGEREF _Toc243906839 \h </w:instrText>
+          <w:instrText xml:space="preserve"> PAGEREF _Toc243983777 \h </w:instrText>
         </w:r>
         <w:r>
           <w:rPr>
@@ -3703,7 +3703,7 @@
             <w:noProof/>
             <w:webHidden/>
           </w:rPr>
-          <w:t>29</w:t>
+          <w:t>30</w:t>
         </w:r>
         <w:r>
           <w:rPr>
@@ -3730,7 +3730,7 @@
           <w:lang w:eastAsia="nl-NL"/>
         </w:rPr>
       </w:pPr>
-      <w:hyperlink w:anchor="_Toc243906840" w:history="1">
+      <w:hyperlink w:anchor="_Toc243983778" w:history="1">
         <w:r>
           <w:rPr>
             <w:rStyle w:val="Hyperlink"/>
@@ -3775,7 +3775,7 @@
             <w:noProof/>
             <w:webHidden/>
           </w:rPr>
-          <w:instrText xml:space="preserve"> PAGEREF _Toc243906840 \h </w:instrText>
+          <w:instrText xml:space="preserve"> PAGEREF _Toc243983778 \h </w:instrText>
         </w:r>
         <w:r>
           <w:rPr>
@@ -3795,7 +3795,7 @@
             <w:noProof/>
             <w:webHidden/>
           </w:rPr>
-          <w:t>30</w:t>
+          <w:t>31</w:t>
         </w:r>
         <w:r>
           <w:rPr>
@@ -3822,7 +3822,7 @@
           <w:lang w:eastAsia="nl-NL"/>
         </w:rPr>
       </w:pPr>
-      <w:hyperlink w:anchor="_Toc243906841" w:history="1">
+      <w:hyperlink w:anchor="_Toc243983779" w:history="1">
         <w:r>
           <w:rPr>
             <w:rStyle w:val="Hyperlink"/>
@@ -3869,7 +3869,7 @@
             <w:noProof/>
             <w:webHidden/>
           </w:rPr>
-          <w:instrText xml:space="preserve"> PAGEREF _Toc243906841 \h </w:instrText>
+          <w:instrText xml:space="preserve"> PAGEREF _Toc243983779 \h </w:instrText>
         </w:r>
         <w:r>
           <w:rPr>
@@ -3889,7 +3889,7 @@
             <w:noProof/>
             <w:webHidden/>
           </w:rPr>
-          <w:t>39</w:t>
+          <w:t>40</w:t>
         </w:r>
         <w:r>
           <w:rPr>
@@ -3916,7 +3916,7 @@
           <w:lang w:eastAsia="nl-NL"/>
         </w:rPr>
       </w:pPr>
-      <w:hyperlink w:anchor="_Toc243906842" w:history="1">
+      <w:hyperlink w:anchor="_Toc243983780" w:history="1">
         <w:r>
           <w:rPr>
             <w:rStyle w:val="Hyperlink"/>
@@ -3963,7 +3963,7 @@
             <w:noProof/>
             <w:webHidden/>
           </w:rPr>
-          <w:instrText xml:space="preserve"> PAGEREF _Toc243906842 \h </w:instrText>
+          <w:instrText xml:space="preserve"> PAGEREF _Toc243983780 \h </w:instrText>
         </w:r>
         <w:r>
           <w:rPr>
@@ -3983,7 +3983,7 @@
             <w:noProof/>
             <w:webHidden/>
           </w:rPr>
-          <w:t>39</w:t>
+          <w:t>40</w:t>
         </w:r>
         <w:r>
           <w:rPr>
@@ -4010,7 +4010,7 @@
           <w:lang w:eastAsia="nl-NL"/>
         </w:rPr>
       </w:pPr>
-      <w:hyperlink w:anchor="_Toc243906843" w:history="1">
+      <w:hyperlink w:anchor="_Toc243983781" w:history="1">
         <w:r>
           <w:rPr>
             <w:rStyle w:val="Hyperlink"/>
@@ -4057,7 +4057,7 @@
             <w:noProof/>
             <w:webHidden/>
           </w:rPr>
-          <w:instrText xml:space="preserve"> PAGEREF _Toc243906843 \h </w:instrText>
+          <w:instrText xml:space="preserve"> PAGEREF _Toc243983781 \h </w:instrText>
         </w:r>
         <w:r>
           <w:rPr>
@@ -4077,7 +4077,7 @@
             <w:noProof/>
             <w:webHidden/>
           </w:rPr>
-          <w:t>39</w:t>
+          <w:t>41</w:t>
         </w:r>
         <w:r>
           <w:rPr>
@@ -4104,7 +4104,7 @@
           <w:lang w:eastAsia="nl-NL"/>
         </w:rPr>
       </w:pPr>
-      <w:hyperlink w:anchor="_Toc243906844" w:history="1">
+      <w:hyperlink w:anchor="_Toc243983782" w:history="1">
         <w:r>
           <w:rPr>
             <w:rStyle w:val="Hyperlink"/>
@@ -4151,7 +4151,7 @@
             <w:noProof/>
             <w:webHidden/>
           </w:rPr>
-          <w:instrText xml:space="preserve"> PAGEREF _Toc243906844 \h </w:instrText>
+          <w:instrText xml:space="preserve"> PAGEREF _Toc243983782 \h </w:instrText>
         </w:r>
         <w:r>
           <w:rPr>
@@ -4171,7 +4171,7 @@
             <w:noProof/>
             <w:webHidden/>
           </w:rPr>
-          <w:t>40</w:t>
+          <w:t>41</w:t>
         </w:r>
         <w:r>
           <w:rPr>
@@ -4198,7 +4198,7 @@
           <w:lang w:eastAsia="nl-NL"/>
         </w:rPr>
       </w:pPr>
-      <w:hyperlink w:anchor="_Toc243906845" w:history="1">
+      <w:hyperlink w:anchor="_Toc243983783" w:history="1">
         <w:r>
           <w:rPr>
             <w:rStyle w:val="Hyperlink"/>
@@ -4245,7 +4245,7 @@
             <w:noProof/>
             <w:webHidden/>
           </w:rPr>
-          <w:instrText xml:space="preserve"> PAGEREF _Toc243906845 \h </w:instrText>
+          <w:instrText xml:space="preserve"> PAGEREF _Toc243983783 \h </w:instrText>
         </w:r>
         <w:r>
           <w:rPr>
@@ -4265,7 +4265,7 @@
             <w:noProof/>
             <w:webHidden/>
           </w:rPr>
-          <w:t>40</w:t>
+          <w:t>41</w:t>
         </w:r>
         <w:r>
           <w:rPr>
@@ -4292,7 +4292,7 @@
           <w:lang w:eastAsia="nl-NL"/>
         </w:rPr>
       </w:pPr>
-      <w:hyperlink w:anchor="_Toc243906846" w:history="1">
+      <w:hyperlink w:anchor="_Toc243983784" w:history="1">
         <w:r>
           <w:rPr>
             <w:rStyle w:val="Hyperlink"/>
@@ -4339,7 +4339,7 @@
             <w:noProof/>
             <w:webHidden/>
           </w:rPr>
-          <w:instrText xml:space="preserve"> PAGEREF _Toc243906846 \h </w:instrText>
+          <w:instrText xml:space="preserve"> PAGEREF _Toc243983784 \h </w:instrText>
         </w:r>
         <w:r>
           <w:rPr>
@@ -4359,7 +4359,7 @@
             <w:noProof/>
             <w:webHidden/>
           </w:rPr>
-          <w:t>40</w:t>
+          <w:t>41</w:t>
         </w:r>
         <w:r>
           <w:rPr>
@@ -4386,7 +4386,7 @@
           <w:lang w:eastAsia="nl-NL"/>
         </w:rPr>
       </w:pPr>
-      <w:hyperlink w:anchor="_Toc243906847" w:history="1">
+      <w:hyperlink w:anchor="_Toc243983785" w:history="1">
         <w:r>
           <w:rPr>
             <w:rStyle w:val="Hyperlink"/>
@@ -4431,7 +4431,7 @@
             <w:noProof/>
             <w:webHidden/>
           </w:rPr>
-          <w:instrText xml:space="preserve"> PAGEREF _Toc243906847 \h </w:instrText>
+          <w:instrText xml:space="preserve"> PAGEREF _Toc243983785 \h </w:instrText>
         </w:r>
         <w:r>
           <w:rPr>
@@ -4451,7 +4451,7 @@
             <w:noProof/>
             <w:webHidden/>
           </w:rPr>
-          <w:t>40</w:t>
+          <w:t>41</w:t>
         </w:r>
         <w:r>
           <w:rPr>
@@ -4478,7 +4478,7 @@
           <w:lang w:eastAsia="nl-NL"/>
         </w:rPr>
       </w:pPr>
-      <w:hyperlink w:anchor="_Toc243906848" w:history="1">
+      <w:hyperlink w:anchor="_Toc243983786" w:history="1">
         <w:r>
           <w:rPr>
             <w:rStyle w:val="Hyperlink"/>
@@ -4523,7 +4523,7 @@
             <w:noProof/>
             <w:webHidden/>
           </w:rPr>
-          <w:instrText xml:space="preserve"> PAGEREF _Toc243906848 \h </w:instrText>
+          <w:instrText xml:space="preserve"> PAGEREF _Toc243983786 \h </w:instrText>
         </w:r>
         <w:r>
           <w:rPr>
@@ -4543,7 +4543,7 @@
             <w:noProof/>
             <w:webHidden/>
           </w:rPr>
-          <w:t>40</w:t>
+          <w:t>42</w:t>
         </w:r>
         <w:r>
           <w:rPr>
@@ -4570,7 +4570,7 @@
           <w:lang w:eastAsia="nl-NL"/>
         </w:rPr>
       </w:pPr>
-      <w:hyperlink w:anchor="_Toc243906849" w:history="1">
+      <w:hyperlink w:anchor="_Toc243983787" w:history="1">
         <w:r>
           <w:rPr>
             <w:rStyle w:val="Hyperlink"/>
@@ -4647,7 +4647,7 @@
             <w:noProof/>
             <w:webHidden/>
           </w:rPr>
-          <w:instrText xml:space="preserve"> PAGEREF _Toc243906849 \h </w:instrText>
+          <w:instrText xml:space="preserve"> PAGEREF _Toc243983787 \h </w:instrText>
         </w:r>
         <w:r>
           <w:rPr>
@@ -4667,7 +4667,7 @@
             <w:noProof/>
             <w:webHidden/>
           </w:rPr>
-          <w:t>41</w:t>
+          <w:t>42</w:t>
         </w:r>
         <w:r>
           <w:rPr>
@@ -4694,7 +4694,7 @@
           <w:lang w:eastAsia="nl-NL"/>
         </w:rPr>
       </w:pPr>
-      <w:hyperlink w:anchor="_Toc243906850" w:history="1">
+      <w:hyperlink w:anchor="_Toc243983788" w:history="1">
         <w:r>
           <w:rPr>
             <w:rStyle w:val="Hyperlink"/>
@@ -4739,7 +4739,7 @@
             <w:noProof/>
             <w:webHidden/>
           </w:rPr>
-          <w:instrText xml:space="preserve"> PAGEREF _Toc243906850 \h </w:instrText>
+          <w:instrText xml:space="preserve"> PAGEREF _Toc243983788 \h </w:instrText>
         </w:r>
         <w:r>
           <w:rPr>
@@ -4759,7 +4759,7 @@
             <w:noProof/>
             <w:webHidden/>
           </w:rPr>
-          <w:t>41</w:t>
+          <w:t>42</w:t>
         </w:r>
         <w:r>
           <w:rPr>
@@ -4786,7 +4786,7 @@
           <w:lang w:eastAsia="nl-NL"/>
         </w:rPr>
       </w:pPr>
-      <w:hyperlink w:anchor="_Toc243906851" w:history="1">
+      <w:hyperlink w:anchor="_Toc243983789" w:history="1">
         <w:r>
           <w:rPr>
             <w:rStyle w:val="Hyperlink"/>
@@ -4831,7 +4831,7 @@
             <w:noProof/>
             <w:webHidden/>
           </w:rPr>
-          <w:instrText xml:space="preserve"> PAGEREF _Toc243906851 \h </w:instrText>
+          <w:instrText xml:space="preserve"> PAGEREF _Toc243983789 \h </w:instrText>
         </w:r>
         <w:r>
           <w:rPr>
@@ -4851,7 +4851,7 @@
             <w:noProof/>
             <w:webHidden/>
           </w:rPr>
-          <w:t>43</w:t>
+          <w:t>44</w:t>
         </w:r>
         <w:r>
           <w:rPr>
@@ -4878,7 +4878,7 @@
           <w:lang w:eastAsia="nl-NL"/>
         </w:rPr>
       </w:pPr>
-      <w:hyperlink w:anchor="_Toc243906852" w:history="1">
+      <w:hyperlink w:anchor="_Toc243983790" w:history="1">
         <w:r>
           <w:rPr>
             <w:rStyle w:val="Hyperlink"/>
@@ -4923,7 +4923,7 @@
             <w:noProof/>
             <w:webHidden/>
           </w:rPr>
-          <w:instrText xml:space="preserve"> PAGEREF _Toc243906852 \h </w:instrText>
+          <w:instrText xml:space="preserve"> PAGEREF _Toc243983790 \h </w:instrText>
         </w:r>
         <w:r>
           <w:rPr>
@@ -4943,7 +4943,7 @@
             <w:noProof/>
             <w:webHidden/>
           </w:rPr>
-          <w:t>43</w:t>
+          <w:t>44</w:t>
         </w:r>
         <w:r>
           <w:rPr>
@@ -4970,7 +4970,7 @@
           <w:lang w:eastAsia="nl-NL"/>
         </w:rPr>
       </w:pPr>
-      <w:hyperlink w:anchor="_Toc243906853" w:history="1">
+      <w:hyperlink w:anchor="_Toc243983791" w:history="1">
         <w:r>
           <w:rPr>
             <w:rStyle w:val="Hyperlink"/>
@@ -5015,7 +5015,7 @@
             <w:noProof/>
             <w:webHidden/>
           </w:rPr>
-          <w:instrText xml:space="preserve"> PAGEREF _Toc243906853 \h </w:instrText>
+          <w:instrText xml:space="preserve"> PAGEREF _Toc243983791 \h </w:instrText>
         </w:r>
         <w:r>
           <w:rPr>
@@ -5035,7 +5035,7 @@
             <w:noProof/>
             <w:webHidden/>
           </w:rPr>
-          <w:t>43</w:t>
+          <w:t>44</w:t>
         </w:r>
         <w:r>
           <w:rPr>
@@ -5062,7 +5062,7 @@
           <w:lang w:eastAsia="nl-NL"/>
         </w:rPr>
       </w:pPr>
-      <w:hyperlink w:anchor="_Toc243906854" w:history="1">
+      <w:hyperlink w:anchor="_Toc243983792" w:history="1">
         <w:r>
           <w:rPr>
             <w:rStyle w:val="Hyperlink"/>
@@ -5107,7 +5107,7 @@
             <w:noProof/>
             <w:webHidden/>
           </w:rPr>
-          <w:instrText xml:space="preserve"> PAGEREF _Toc243906854 \h </w:instrText>
+          <w:instrText xml:space="preserve"> PAGEREF _Toc243983792 \h </w:instrText>
         </w:r>
         <w:r>
           <w:rPr>
@@ -5127,7 +5127,7 @@
             <w:noProof/>
             <w:webHidden/>
           </w:rPr>
-          <w:t>43</w:t>
+          <w:t>44</w:t>
         </w:r>
         <w:r>
           <w:rPr>
@@ -5154,7 +5154,7 @@
           <w:lang w:eastAsia="nl-NL"/>
         </w:rPr>
       </w:pPr>
-      <w:hyperlink w:anchor="_Toc243906855" w:history="1">
+      <w:hyperlink w:anchor="_Toc243983793" w:history="1">
         <w:r>
           <w:rPr>
             <w:rStyle w:val="Hyperlink"/>
@@ -5199,7 +5199,7 @@
             <w:noProof/>
             <w:webHidden/>
           </w:rPr>
-          <w:instrText xml:space="preserve"> PAGEREF _Toc243906855 \h </w:instrText>
+          <w:instrText xml:space="preserve"> PAGEREF _Toc243983793 \h </w:instrText>
         </w:r>
         <w:r>
           <w:rPr>
@@ -5219,7 +5219,7 @@
             <w:noProof/>
             <w:webHidden/>
           </w:rPr>
-          <w:t>43</w:t>
+          <w:t>44</w:t>
         </w:r>
         <w:r>
           <w:rPr>
@@ -5246,7 +5246,7 @@
           <w:lang w:eastAsia="nl-NL"/>
         </w:rPr>
       </w:pPr>
-      <w:hyperlink w:anchor="_Toc243906856" w:history="1">
+      <w:hyperlink w:anchor="_Toc243983794" w:history="1">
         <w:r>
           <w:rPr>
             <w:rStyle w:val="Hyperlink"/>
@@ -5291,7 +5291,7 @@
             <w:noProof/>
             <w:webHidden/>
           </w:rPr>
-          <w:instrText xml:space="preserve"> PAGEREF _Toc243906856 \h </w:instrText>
+          <w:instrText xml:space="preserve"> PAGEREF _Toc243983794 \h </w:instrText>
         </w:r>
         <w:r>
           <w:rPr>
@@ -5311,7 +5311,7 @@
             <w:noProof/>
             <w:webHidden/>
           </w:rPr>
-          <w:t>44</w:t>
+          <w:t>45</w:t>
         </w:r>
         <w:r>
           <w:rPr>
@@ -5338,7 +5338,7 @@
           <w:lang w:eastAsia="nl-NL"/>
         </w:rPr>
       </w:pPr>
-      <w:hyperlink w:anchor="_Toc243906857" w:history="1">
+      <w:hyperlink w:anchor="_Toc243983795" w:history="1">
         <w:r>
           <w:rPr>
             <w:rStyle w:val="Hyperlink"/>
@@ -5383,7 +5383,7 @@
             <w:noProof/>
             <w:webHidden/>
           </w:rPr>
-          <w:instrText xml:space="preserve"> PAGEREF _Toc243906857 \h </w:instrText>
+          <w:instrText xml:space="preserve"> PAGEREF _Toc243983795 \h </w:instrText>
         </w:r>
         <w:r>
           <w:rPr>
@@ -5403,7 +5403,7 @@
             <w:noProof/>
             <w:webHidden/>
           </w:rPr>
-          <w:t>44</w:t>
+          <w:t>45</w:t>
         </w:r>
         <w:r>
           <w:rPr>
@@ -5430,7 +5430,7 @@
           <w:lang w:eastAsia="nl-NL"/>
         </w:rPr>
       </w:pPr>
-      <w:hyperlink w:anchor="_Toc243906858" w:history="1">
+      <w:hyperlink w:anchor="_Toc243983796" w:history="1">
         <w:r>
           <w:rPr>
             <w:rStyle w:val="Hyperlink"/>
@@ -5475,7 +5475,7 @@
             <w:noProof/>
             <w:webHidden/>
           </w:rPr>
-          <w:instrText xml:space="preserve"> PAGEREF _Toc243906858 \h </w:instrText>
+          <w:instrText xml:space="preserve"> PAGEREF _Toc243983796 \h </w:instrText>
         </w:r>
         <w:r>
           <w:rPr>
@@ -5495,7 +5495,7 @@
             <w:noProof/>
             <w:webHidden/>
           </w:rPr>
-          <w:t>45</w:t>
+          <w:t>47</w:t>
         </w:r>
         <w:r>
           <w:rPr>
@@ -5522,7 +5522,7 @@
           <w:lang w:eastAsia="nl-NL"/>
         </w:rPr>
       </w:pPr>
-      <w:hyperlink w:anchor="_Toc243906859" w:history="1">
+      <w:hyperlink w:anchor="_Toc243983797" w:history="1">
         <w:r>
           <w:rPr>
             <w:rStyle w:val="Hyperlink"/>
@@ -5567,7 +5567,7 @@
             <w:noProof/>
             <w:webHidden/>
           </w:rPr>
-          <w:instrText xml:space="preserve"> PAGEREF _Toc243906859 \h </w:instrText>
+          <w:instrText xml:space="preserve"> PAGEREF _Toc243983797 \h </w:instrText>
         </w:r>
         <w:r>
           <w:rPr>
@@ -5587,7 +5587,7 @@
             <w:noProof/>
             <w:webHidden/>
           </w:rPr>
-          <w:t>47</w:t>
+          <w:t>49</w:t>
         </w:r>
         <w:r>
           <w:rPr>
@@ -5614,7 +5614,7 @@
           <w:lang w:eastAsia="nl-NL"/>
         </w:rPr>
       </w:pPr>
-      <w:hyperlink w:anchor="_Toc243906860" w:history="1">
+      <w:hyperlink w:anchor="_Toc243983798" w:history="1">
         <w:r>
           <w:rPr>
             <w:rStyle w:val="Hyperlink"/>
@@ -5659,7 +5659,7 @@
             <w:noProof/>
             <w:webHidden/>
           </w:rPr>
-          <w:instrText xml:space="preserve"> PAGEREF _Toc243906860 \h </w:instrText>
+          <w:instrText xml:space="preserve"> PAGEREF _Toc243983798 \h </w:instrText>
         </w:r>
         <w:r>
           <w:rPr>
@@ -5679,7 +5679,7 @@
             <w:noProof/>
             <w:webHidden/>
           </w:rPr>
-          <w:t>48</w:t>
+          <w:t>50</w:t>
         </w:r>
         <w:r>
           <w:rPr>
@@ -5712,7 +5712,7 @@
         </w:numPr>
       </w:pPr>
       <w:bookmarkStart w:id="1" w:name="k1"/>
-      <w:bookmarkStart w:id="2" w:name="_Toc243906802"/>
+      <w:bookmarkStart w:id="2" w:name="_Toc243983740"/>
       <w:r>
         <w:t>DOEL VAN DE APPLICATIE.</w:t>
       </w:r>
@@ -5794,7 +5794,7 @@
         </w:numPr>
       </w:pPr>
       <w:bookmarkStart w:id="3" w:name="k2"/>
-      <w:bookmarkStart w:id="4" w:name="_Toc243906803"/>
+      <w:bookmarkStart w:id="4" w:name="_Toc243983741"/>
       <w:r>
         <w:t>BESTANDEN.</w:t>
       </w:r>
@@ -6618,7 +6618,7 @@
                 <w:sz w:val="16"/>
                 <w:szCs w:val="16"/>
               </w:rPr>
-              <w:t xml:space="preserve"> (onderdeel van de controller): het cameravenster van de demo gezichtsherkenning, de scan na een tik, opslaan en uitzetten van een gezicht en verlopen gezichten wissen</w:t>
+              <w:t xml:space="preserve"> (onderdeel van de controller): het cameravenster van de demo gezichtsherkenning, de scan na een tik, opslaan en uitzetten van een gezicht (sinds versie 3.22 zelf alleen na de pas, uitzetten na de pas of de camera, en door de beheerder) en verlopen gezichten wissen</w:t>
             </w:r>
           </w:p>
         </w:tc>
@@ -8626,7 +8626,7 @@
                 <w:sz w:val="14"/>
                 <w:shd w:val="clear" w:color="auto" w:fill="EEF4F2"/>
               </w:rPr>
-              <w:t>tests/</w:t>
+              <w:t>tests/gezicht-instellen-veilig.test.js</w:t>
             </w:r>
           </w:p>
         </w:tc>
@@ -8643,7 +8643,37 @@
                 <w:sz w:val="16"/>
                 <w:szCs w:val="16"/>
               </w:rPr>
-              <w:t>Unit tests (846) voor de regels, de opslag, de export, het thema, de welkom- en gezichtsherkenningsfuncties, herkennen met de pas, de controller, de beveiliging en regressietests voor opgeloste bugs</w:t>
+              <w:t xml:space="preserve">Tests voor veilig instellen van gezichtsherkenning (versie 3.22), met een nep-klok en een nep-camera: na kiezen op naam geen link en geen </w:t>
+            </w:r>
+            <w:r>
+              <w:rPr>
+                <w:rFonts w:ascii="Consolas" w:hAnsi="Consolas" w:cs="Consolas"/>
+                <w:sz w:val="14"/>
+                <w:shd w:val="clear" w:color="auto" w:fill="EEF4F2"/>
+              </w:rPr>
+              <w:t>Uitzetten</w:t>
+            </w:r>
+            <w:r>
+              <w:rPr>
+                <w:sz w:val="16"/>
+                <w:szCs w:val="16"/>
+              </w:rPr>
+              <w:t xml:space="preserve"> en weigert de controller instellen en uitzetten, na de pas wel instellen, na de camera wel uitzetten, de beheerder kan instellen en uitzetten (niet zonder inloggen, niet zonder camera, niets bewaard na uitloggen), de knoppen en de vervaldatum in het tabblad Medewerkers, verlopen na 365 dagen en opnieuw instellen alleen na de pas of via de beheerder met een nieuw vinkje, en het moment van toestemming (</w:t>
+            </w:r>
+            <w:r>
+              <w:rPr>
+                <w:rFonts w:ascii="Consolas" w:hAnsi="Consolas" w:cs="Consolas"/>
+                <w:sz w:val="14"/>
+                <w:shd w:val="clear" w:color="auto" w:fill="EEF4F2"/>
+              </w:rPr>
+              <w:t>consentAt</w:t>
+            </w:r>
+            <w:r>
+              <w:rPr>
+                <w:sz w:val="16"/>
+                <w:szCs w:val="16"/>
+              </w:rPr>
+              <w:t>) met controle en migratie bij het laden</w:t>
             </w:r>
           </w:p>
         </w:tc>
@@ -8666,7 +8696,7 @@
                 <w:sz w:val="14"/>
                 <w:shd w:val="clear" w:color="auto" w:fill="EEF4F2"/>
               </w:rPr>
-              <w:t>tests/opslag-model-export.test.js</w:t>
+              <w:t>tests/</w:t>
             </w:r>
           </w:p>
         </w:tc>
@@ -8683,22 +8713,7 @@
                 <w:sz w:val="16"/>
                 <w:szCs w:val="16"/>
               </w:rPr>
-              <w:t>Tests voor de reservekopieën, het wissen van gegevens, de strengere controle bij het laden, de voorraadtelling (</w:t>
-            </w:r>
-            <w:r>
-              <w:rPr>
-                <w:rFonts w:ascii="Consolas" w:hAnsi="Consolas" w:cs="Consolas"/>
-                <w:sz w:val="14"/>
-                <w:shd w:val="clear" w:color="auto" w:fill="EEF4F2"/>
-              </w:rPr>
-              <w:t>countedAt</w:t>
-            </w:r>
-            <w:r>
-              <w:rPr>
-                <w:sz w:val="16"/>
-                <w:szCs w:val="16"/>
-              </w:rPr>
-              <w:t>), nieuwe modelmethodes en de beveiliging van de CSV-export, verboden id's, maximale tekstlengtes en een opslag die niet te lezen is</w:t>
+              <w:t>Unit tests (874) voor de regels, de opslag, de export, het thema, de welkom- en gezichtsherkenningsfuncties, herkennen met de pas, de controller, de beveiliging en regressietests voor opgeloste bugs</w:t>
             </w:r>
           </w:p>
         </w:tc>
@@ -8721,7 +8736,7 @@
                 <w:sz w:val="14"/>
                 <w:shd w:val="clear" w:color="auto" w:fill="EEF4F2"/>
               </w:rPr>
-              <w:t>tests/controller-robuustheid.test.js</w:t>
+              <w:t>tests/opslag-model-export.test.js</w:t>
             </w:r>
           </w:p>
         </w:tc>
@@ -8738,7 +8753,7 @@
                 <w:sz w:val="16"/>
                 <w:szCs w:val="16"/>
               </w:rPr>
-              <w:t xml:space="preserve">Tests voor de robuustheid van controller en view: na middernacht, correcties in een oude maand, logboek en wijziging in één keer opslaan, grenzen bij de voorraad, verouderde formulieren en knoppen, de camera, de focus na sluiten, veilige HTML, </w:t>
+              <w:t>Tests voor de reservekopieën, het wissen van gegevens, de strengere controle bij het laden, de voorraadtelling (</w:t>
             </w:r>
             <w:r>
               <w:rPr>
@@ -8746,14 +8761,14 @@
                 <w:sz w:val="14"/>
                 <w:shd w:val="clear" w:color="auto" w:fill="EEF4F2"/>
               </w:rPr>
-              <w:t>Alle gegevens wissen</w:t>
+              <w:t>countedAt</w:t>
             </w:r>
             <w:r>
               <w:rPr>
                 <w:sz w:val="16"/>
                 <w:szCs w:val="16"/>
               </w:rPr>
-              <w:t>, en exporteren en wissen alleen voor een ingelogde beheerder</w:t>
+              <w:t>), nieuwe modelmethodes en de beveiliging van de CSV-export, verboden id's, maximale tekstlengtes en een opslag die niet te lezen is</w:t>
             </w:r>
           </w:p>
         </w:tc>
@@ -8776,7 +8791,7 @@
                 <w:sz w:val="14"/>
                 <w:shd w:val="clear" w:color="auto" w:fill="EEF4F2"/>
               </w:rPr>
-              <w:t>tests/beveiliging-config.test.js</w:t>
+              <w:t>tests/controller-robuustheid.test.js</w:t>
             </w:r>
           </w:p>
         </w:tc>
@@ -8793,7 +8808,7 @@
                 <w:sz w:val="16"/>
                 <w:szCs w:val="16"/>
               </w:rPr>
-              <w:t xml:space="preserve">Tests voor de configuratie: geen externe bronnen, iedere stylesheet precies één keer gelinkt in </w:t>
+              <w:t xml:space="preserve">Tests voor de robuustheid van controller en view: na middernacht, correcties in een oude maand, logboek en wijziging in één keer opslaan, grenzen bij de voorraad, verouderde formulieren en knoppen, de camera, de focus na sluiten, veilige HTML, </w:t>
             </w:r>
             <w:r>
               <w:rPr>
@@ -8801,14 +8816,14 @@
                 <w:sz w:val="14"/>
                 <w:shd w:val="clear" w:color="auto" w:fill="EEF4F2"/>
               </w:rPr>
-              <w:t>index.html</w:t>
+              <w:t>Alle gegevens wissen</w:t>
             </w:r>
             <w:r>
               <w:rPr>
                 <w:sz w:val="16"/>
                 <w:szCs w:val="16"/>
               </w:rPr>
-              <w:t>, de Content-Security-Policy, lokale lettertypes en face-api (met de SHA-256-controlegetallen), en de CI-workflow</w:t>
+              <w:t>, en exporteren en wissen alleen voor een ingelogde beheerder</w:t>
             </w:r>
           </w:p>
         </w:tc>
@@ -8831,7 +8846,7 @@
                 <w:sz w:val="14"/>
                 <w:shd w:val="clear" w:color="auto" w:fill="EEF4F2"/>
               </w:rPr>
-              <w:t>tests/gegevens-en-tabbladen.test.js</w:t>
+              <w:t>tests/beveiliging-config.test.js</w:t>
             </w:r>
           </w:p>
         </w:tc>
@@ -8848,7 +8863,7 @@
                 <w:sz w:val="16"/>
                 <w:szCs w:val="16"/>
               </w:rPr>
-              <w:t xml:space="preserve">Tests voor de prijsgrens van 1000 euro, de focus na </w:t>
+              <w:t xml:space="preserve">Tests voor de configuratie: geen externe bronnen, iedere stylesheet precies één keer gelinkt in </w:t>
             </w:r>
             <w:r>
               <w:rPr>
@@ -8856,44 +8871,14 @@
                 <w:sz w:val="14"/>
                 <w:shd w:val="clear" w:color="auto" w:fill="EEF4F2"/>
               </w:rPr>
-              <w:t>Registreren</w:t>
+              <w:t>index.html</w:t>
             </w:r>
             <w:r>
               <w:rPr>
                 <w:sz w:val="16"/>
                 <w:szCs w:val="16"/>
               </w:rPr>
-              <w:t>, "niets gewijzigd" bij opslaan, en verouderde formulieren of een gewiste opslag na een wijziging in een ander tabblad. Gebruikt de strenge nep-view (</w:t>
-            </w:r>
-            <w:r>
-              <w:rPr>
-                <w:rFonts w:ascii="Consolas" w:hAnsi="Consolas" w:cs="Consolas"/>
-                <w:sz w:val="14"/>
-                <w:shd w:val="clear" w:color="auto" w:fill="EEF4F2"/>
-              </w:rPr>
-              <w:t>createStrictView</w:t>
-            </w:r>
-            <w:r>
-              <w:rPr>
-                <w:sz w:val="16"/>
-                <w:szCs w:val="16"/>
-              </w:rPr>
-              <w:t xml:space="preserve"> in </w:t>
-            </w:r>
-            <w:r>
-              <w:rPr>
-                <w:rFonts w:ascii="Consolas" w:hAnsi="Consolas" w:cs="Consolas"/>
-                <w:sz w:val="14"/>
-                <w:shd w:val="clear" w:color="auto" w:fill="EEF4F2"/>
-              </w:rPr>
-              <w:t>helpers.js</w:t>
-            </w:r>
-            <w:r>
-              <w:rPr>
-                <w:sz w:val="16"/>
-                <w:szCs w:val="16"/>
-              </w:rPr>
-              <w:t>)</w:t>
+              <w:t>, de Content-Security-Policy, lokale lettertypes en face-api (met de SHA-256-controlegetallen), en de CI-workflow</w:t>
             </w:r>
           </w:p>
         </w:tc>
@@ -8916,7 +8901,7 @@
                 <w:sz w:val="14"/>
                 <w:shd w:val="clear" w:color="auto" w:fill="EEF4F2"/>
               </w:rPr>
-              <w:t>tests/werkgever-en-correctiedatum.test.js</w:t>
+              <w:t>tests/gegevens-en-tabbladen.test.js</w:t>
             </w:r>
           </w:p>
         </w:tc>
@@ -8933,7 +8918,7 @@
                 <w:sz w:val="16"/>
                 <w:szCs w:val="16"/>
               </w:rPr>
-              <w:t xml:space="preserve">Tests voor het werkgevernummer per registratie en de datum bij een correctie </w:t>
+              <w:t xml:space="preserve">Tests voor de prijsgrens van 1000 euro, de focus na </w:t>
             </w:r>
             <w:r>
               <w:rPr>
@@ -8941,7 +8926,44 @@
                 <w:sz w:val="14"/>
                 <w:shd w:val="clear" w:color="auto" w:fill="EEF4F2"/>
               </w:rPr>
-              <w:t>+</w:t>
+              <w:t>Registreren</w:t>
+            </w:r>
+            <w:r>
+              <w:rPr>
+                <w:sz w:val="16"/>
+                <w:szCs w:val="16"/>
+              </w:rPr>
+              <w:t>, "niets gewijzigd" bij opslaan, en verouderde formulieren of een gewiste opslag na een wijziging in een ander tabblad. Gebruikt de strenge nep-view (</w:t>
+            </w:r>
+            <w:r>
+              <w:rPr>
+                <w:rFonts w:ascii="Consolas" w:hAnsi="Consolas" w:cs="Consolas"/>
+                <w:sz w:val="14"/>
+                <w:shd w:val="clear" w:color="auto" w:fill="EEF4F2"/>
+              </w:rPr>
+              <w:t>createStrictView</w:t>
+            </w:r>
+            <w:r>
+              <w:rPr>
+                <w:sz w:val="16"/>
+                <w:szCs w:val="16"/>
+              </w:rPr>
+              <w:t xml:space="preserve"> in </w:t>
+            </w:r>
+            <w:r>
+              <w:rPr>
+                <w:rFonts w:ascii="Consolas" w:hAnsi="Consolas" w:cs="Consolas"/>
+                <w:sz w:val="14"/>
+                <w:shd w:val="clear" w:color="auto" w:fill="EEF4F2"/>
+              </w:rPr>
+              <w:t>helpers.js</w:t>
+            </w:r>
+            <w:r>
+              <w:rPr>
+                <w:sz w:val="16"/>
+                <w:szCs w:val="16"/>
+              </w:rPr>
+              <w:t>)</w:t>
             </w:r>
           </w:p>
         </w:tc>
@@ -8964,7 +8986,7 @@
                 <w:sz w:val="14"/>
                 <w:shd w:val="clear" w:color="auto" w:fill="EEF4F2"/>
               </w:rPr>
-              <w:t>tests/to-controle.test.js</w:t>
+              <w:t>tests/werkgever-en-correctiedatum.test.js</w:t>
             </w:r>
           </w:p>
         </w:tc>
@@ -8981,7 +9003,7 @@
                 <w:sz w:val="16"/>
                 <w:szCs w:val="16"/>
               </w:rPr>
-              <w:t xml:space="preserve">Regressietests voor de TO-controle: "1 medewerker"/"2 medewerkers", bevestiging bij product verwijderen, de melding bij een verwijderde medewerker (correctie </w:t>
+              <w:t xml:space="preserve">Tests voor het werkgevernummer per registratie en de datum bij een correctie </w:t>
             </w:r>
             <w:r>
               <w:rPr>
@@ -8990,103 +9012,6 @@
                 <w:shd w:val="clear" w:color="auto" w:fill="EEF4F2"/>
               </w:rPr>
               <w:t>+</w:t>
-            </w:r>
-            <w:r>
-              <w:rPr>
-                <w:sz w:val="16"/>
-                <w:szCs w:val="16"/>
-              </w:rPr>
-              <w:t xml:space="preserve">), alleen een inactieve medewerker zonder registraties verwijderen, uniek werkgevernummer, dubbele id's en datums in de toekomst bij het laden, de apostrof in de CSV, </w:t>
-            </w:r>
-            <w:r>
-              <w:rPr>
-                <w:rFonts w:ascii="Consolas" w:hAnsi="Consolas" w:cs="Consolas"/>
-                <w:sz w:val="14"/>
-                <w:shd w:val="clear" w:color="auto" w:fill="EEF4F2"/>
-              </w:rPr>
-              <w:t>lastRegistration</w:t>
-            </w:r>
-            <w:r>
-              <w:rPr>
-                <w:sz w:val="16"/>
-                <w:szCs w:val="16"/>
-              </w:rPr>
-              <w:t xml:space="preserve"> en </w:t>
-            </w:r>
-            <w:r>
-              <w:rPr>
-                <w:rFonts w:ascii="Consolas" w:hAnsi="Consolas" w:cs="Consolas"/>
-                <w:sz w:val="14"/>
-                <w:shd w:val="clear" w:color="auto" w:fill="EEF4F2"/>
-              </w:rPr>
-              <w:t>pointId</w:t>
-            </w:r>
-            <w:r>
-              <w:rPr>
-                <w:sz w:val="16"/>
-                <w:szCs w:val="16"/>
-              </w:rPr>
-              <w:t>, het SQL-schema (</w:t>
-            </w:r>
-            <w:r>
-              <w:rPr>
-                <w:rFonts w:ascii="Consolas" w:hAnsi="Consolas" w:cs="Consolas"/>
-                <w:sz w:val="14"/>
-                <w:shd w:val="clear" w:color="auto" w:fill="EEF4F2"/>
-              </w:rPr>
-              <w:t>counted_at</w:t>
-            </w:r>
-            <w:r>
-              <w:rPr>
-                <w:sz w:val="16"/>
-                <w:szCs w:val="16"/>
-              </w:rPr>
-              <w:t xml:space="preserve">, geen rol </w:t>
-            </w:r>
-            <w:r>
-              <w:rPr>
-                <w:rFonts w:ascii="Consolas" w:hAnsi="Consolas" w:cs="Consolas"/>
-                <w:sz w:val="14"/>
-                <w:shd w:val="clear" w:color="auto" w:fill="EEF4F2"/>
-              </w:rPr>
-              <w:t>manager</w:t>
-            </w:r>
-            <w:r>
-              <w:rPr>
-                <w:sz w:val="16"/>
-                <w:szCs w:val="16"/>
-              </w:rPr>
-              <w:t xml:space="preserve">), de opslagknoppen bij wijzigen, de filters op een smal scherm en tests voor FR-01, FR-02, FR-04, FR-10 en FR-29 (actieve medewerkers, zoeken op naam, de </w:t>
-            </w:r>
-            <w:r>
-              <w:rPr>
-                <w:rFonts w:ascii="Consolas" w:hAnsi="Consolas" w:cs="Consolas"/>
-                <w:sz w:val="14"/>
-                <w:shd w:val="clear" w:color="auto" w:fill="EEF4F2"/>
-              </w:rPr>
-              <w:t>−</w:t>
-            </w:r>
-            <w:r>
-              <w:rPr>
-                <w:sz w:val="16"/>
-                <w:szCs w:val="16"/>
-              </w:rPr>
-              <w:t xml:space="preserve"> in het productvenster, alle registraties voor de beheerder, geen bedragen of aantallen op de publieke pagina). Verder: "1 product" in de correctielijst, een klik op de medewerkerkaart (FR-32) en het totaal op de knop </w:t>
-            </w:r>
-            <w:r>
-              <w:rPr>
-                <w:rFonts w:ascii="Consolas" w:hAnsi="Consolas" w:cs="Consolas"/>
-                <w:sz w:val="14"/>
-                <w:shd w:val="clear" w:color="auto" w:fill="EEF4F2"/>
-              </w:rPr>
-              <w:t>Registreren</w:t>
-            </w:r>
-            <w:r>
-              <w:rPr>
-                <w:sz w:val="16"/>
-                <w:szCs w:val="16"/>
-              </w:rPr>
-              <w:t xml:space="preserve"> (FR-47)</w:t>
             </w:r>
           </w:p>
         </w:tc>
@@ -9109,7 +9034,7 @@
                 <w:sz w:val="14"/>
                 <w:shd w:val="clear" w:color="auto" w:fill="EEF4F2"/>
               </w:rPr>
-              <w:t>tests/pasjeslezer.test.js</w:t>
+              <w:t>tests/to-controle.test.js</w:t>
             </w:r>
           </w:p>
         </w:tc>
@@ -9126,7 +9051,7 @@
                 <w:sz w:val="16"/>
                 <w:szCs w:val="16"/>
               </w:rPr>
-              <w:t xml:space="preserve">Tests voor herkennen met de pas: wat de </w:t>
+              <w:t xml:space="preserve">Regressietests voor de TO-controle: "1 medewerker"/"2 medewerkers", bevestiging bij product verwijderen, de melding bij een verwijderde medewerker (correctie </w:t>
             </w:r>
             <w:r>
               <w:rPr>
@@ -9134,21 +9059,14 @@
                 <w:sz w:val="14"/>
                 <w:shd w:val="clear" w:color="auto" w:fill="EEF4F2"/>
               </w:rPr>
-              <w:t>BadgeReader</w:t>
+              <w:t>+</w:t>
             </w:r>
             <w:r>
               <w:rPr>
                 <w:sz w:val="16"/>
                 <w:szCs w:val="16"/>
               </w:rPr>
-              <w:t xml:space="preserve"> als scan ziet (Enter, Tab of stilte na de laatste toets, niet bij gewoon typen of een te korte code, wel op een trage tablet), het normaliseren van het pasnummer, het productvenster of de melding na een scan, geen herkenning als er een ander venster open is (met de melding "Sluit eerst het open venster om je pas te gebruiken.", en de Enter van de scan wordt tegengehouden), het zoekveld na een scan, de pas koppelen in het medewerkersformulier (uniek, alleen letters en cijfers, leeg = geen pas), de controle </w:t>
-            </w:r>
-            <w:r>
-              <w:rPr>
-                <w:sz w:val="16"/>
-                <w:szCs w:val="16"/>
-              </w:rPr>
-              <w:t xml:space="preserve">en migratie van </w:t>
+              <w:t xml:space="preserve">), alleen een inactieve medewerker zonder registraties verwijderen, uniek werkgevernummer, dubbele id's en datums in de toekomst bij het laden, de apostrof in de CSV, </w:t>
             </w:r>
             <w:r>
               <w:rPr>
@@ -9156,14 +9074,14 @@
                 <w:sz w:val="14"/>
                 <w:shd w:val="clear" w:color="auto" w:fill="EEF4F2"/>
               </w:rPr>
-              <w:t>badgeId</w:t>
+              <w:t>lastRegistration</w:t>
             </w:r>
             <w:r>
               <w:rPr>
                 <w:sz w:val="16"/>
                 <w:szCs w:val="16"/>
               </w:rPr>
-              <w:t xml:space="preserve"> in </w:t>
+              <w:t xml:space="preserve"> en </w:t>
             </w:r>
             <w:r>
               <w:rPr>
@@ -9171,14 +9089,74 @@
                 <w:sz w:val="14"/>
                 <w:shd w:val="clear" w:color="auto" w:fill="EEF4F2"/>
               </w:rPr>
-              <w:t>DataStore</w:t>
+              <w:t>pointId</w:t>
             </w:r>
             <w:r>
               <w:rPr>
                 <w:sz w:val="16"/>
                 <w:szCs w:val="16"/>
               </w:rPr>
-              <w:t>, en dat het pasnummer niet in de CSV-export of het logboek komt</w:t>
+              <w:t>, het SQL-schema (</w:t>
+            </w:r>
+            <w:r>
+              <w:rPr>
+                <w:rFonts w:ascii="Consolas" w:hAnsi="Consolas" w:cs="Consolas"/>
+                <w:sz w:val="14"/>
+                <w:shd w:val="clear" w:color="auto" w:fill="EEF4F2"/>
+              </w:rPr>
+              <w:t>counted_at</w:t>
+            </w:r>
+            <w:r>
+              <w:rPr>
+                <w:sz w:val="16"/>
+                <w:szCs w:val="16"/>
+              </w:rPr>
+              <w:t xml:space="preserve">, geen rol </w:t>
+            </w:r>
+            <w:r>
+              <w:rPr>
+                <w:rFonts w:ascii="Consolas" w:hAnsi="Consolas" w:cs="Consolas"/>
+                <w:sz w:val="14"/>
+                <w:shd w:val="clear" w:color="auto" w:fill="EEF4F2"/>
+              </w:rPr>
+              <w:t>manager</w:t>
+            </w:r>
+            <w:r>
+              <w:rPr>
+                <w:sz w:val="16"/>
+                <w:szCs w:val="16"/>
+              </w:rPr>
+              <w:t xml:space="preserve">), de opslagknoppen bij wijzigen, de filters op een smal scherm en tests voor FR-01, FR-02, FR-04, FR-10 en FR-29 (actieve medewerkers, zoeken op naam, de </w:t>
+            </w:r>
+            <w:r>
+              <w:rPr>
+                <w:rFonts w:ascii="Consolas" w:hAnsi="Consolas" w:cs="Consolas"/>
+                <w:sz w:val="14"/>
+                <w:shd w:val="clear" w:color="auto" w:fill="EEF4F2"/>
+              </w:rPr>
+              <w:t>−</w:t>
+            </w:r>
+            <w:r>
+              <w:rPr>
+                <w:sz w:val="16"/>
+                <w:szCs w:val="16"/>
+              </w:rPr>
+              <w:t xml:space="preserve"> in het productvenster, alle registraties voor de beheerder, geen bedragen of aantallen op de publieke pagina). Verder: "1 product" in de correctielijst, een klik op de medewerkerkaart (FR-32) en het totaal op de knop </w:t>
+            </w:r>
+            <w:r>
+              <w:rPr>
+                <w:rFonts w:ascii="Consolas" w:hAnsi="Consolas" w:cs="Consolas"/>
+                <w:sz w:val="14"/>
+                <w:shd w:val="clear" w:color="auto" w:fill="EEF4F2"/>
+              </w:rPr>
+              <w:t>Registreren</w:t>
+            </w:r>
+            <w:r>
+              <w:rPr>
+                <w:sz w:val="16"/>
+                <w:szCs w:val="16"/>
+              </w:rPr>
+              <w:t xml:space="preserve"> (FR-47)</w:t>
             </w:r>
           </w:p>
         </w:tc>
@@ -9201,7 +9179,7 @@
                 <w:sz w:val="14"/>
                 <w:shd w:val="clear" w:color="auto" w:fill="EEF4F2"/>
               </w:rPr>
-              <w:t>tests/beveiligingsscan.test.js</w:t>
+              <w:t>tests/pasjeslezer.test.js</w:t>
             </w:r>
           </w:p>
         </w:tc>
@@ -9218,7 +9196,7 @@
                 <w:sz w:val="16"/>
                 <w:szCs w:val="16"/>
               </w:rPr>
-              <w:t xml:space="preserve">Regressietests voor de beveiligingsscan: beheeracties doen niets zonder ingelogde beheerder, product-id's als </w:t>
+              <w:t xml:space="preserve">Tests voor herkennen met de pas: wat de </w:t>
             </w:r>
             <w:r>
               <w:rPr>
@@ -9226,14 +9204,21 @@
                 <w:sz w:val="14"/>
                 <w:shd w:val="clear" w:color="auto" w:fill="EEF4F2"/>
               </w:rPr>
-              <w:t>__proto__</w:t>
+              <w:t>BadgeReader</w:t>
             </w:r>
             <w:r>
               <w:rPr>
                 <w:sz w:val="16"/>
                 <w:szCs w:val="16"/>
               </w:rPr>
-              <w:t xml:space="preserve">, </w:t>
+              <w:t xml:space="preserve"> als scan ziet (Enter, Tab of stilte na de laatste toets, niet bij gewoon typen of een te korte code, wel op een trage tablet), het normaliseren van het pasnummer, het productvenster of de melding na een scan, geen herkenning als er een ander venster open is (met de melding "Sluit eerst het open venster om je pas te gebruiken.", en de Enter van de scan wordt tegengehouden), het zoekveld na een scan, de pas koppelen in het medewerkersformulier (uniek, alleen letters en cijfers, leeg = geen pas), de controle </w:t>
+            </w:r>
+            <w:r>
+              <w:rPr>
+                <w:sz w:val="16"/>
+                <w:szCs w:val="16"/>
+              </w:rPr>
+              <w:t xml:space="preserve">en migratie van </w:t>
             </w:r>
             <w:r>
               <w:rPr>
@@ -9241,14 +9226,14 @@
                 <w:sz w:val="14"/>
                 <w:shd w:val="clear" w:color="auto" w:fill="EEF4F2"/>
               </w:rPr>
-              <w:t>constructor</w:t>
+              <w:t>badgeId</w:t>
             </w:r>
             <w:r>
               <w:rPr>
                 <w:sz w:val="16"/>
                 <w:szCs w:val="16"/>
               </w:rPr>
-              <w:t xml:space="preserve"> en </w:t>
+              <w:t xml:space="preserve"> in </w:t>
             </w:r>
             <w:r>
               <w:rPr>
@@ -9256,14 +9241,14 @@
                 <w:sz w:val="14"/>
                 <w:shd w:val="clear" w:color="auto" w:fill="EEF4F2"/>
               </w:rPr>
-              <w:t>toString</w:t>
+              <w:t>DataStore</w:t>
             </w:r>
             <w:r>
               <w:rPr>
                 <w:sz w:val="16"/>
                 <w:szCs w:val="16"/>
               </w:rPr>
-              <w:t xml:space="preserve"> in de voorraadlijst, de camera die uitgaat na de tijdslimiet, de strengere controle van codes en tijdstippen bij het laden, de Node.js-versie van de CI, het alleen-toevoegen-logboek in het SQL-schema en de licentie van TensorFlow.js</w:t>
+              <w:t>, en dat het pasnummer niet in de CSV-export of het logboek komt</w:t>
             </w:r>
           </w:p>
         </w:tc>
@@ -9286,7 +9271,7 @@
                 <w:sz w:val="14"/>
                 <w:shd w:val="clear" w:color="auto" w:fill="EEF4F2"/>
               </w:rPr>
-              <w:t>tests/avg-toets.test.js</w:t>
+              <w:t>tests/beveiligingsscan.test.js</w:t>
             </w:r>
           </w:p>
         </w:tc>
@@ -9303,7 +9288,52 @@
                 <w:sz w:val="16"/>
                 <w:szCs w:val="16"/>
               </w:rPr>
-              <w:t>Tests voor de aanpassingen uit de AVG-toets: automatisch uitloggen van de beheerder na 5 minuten zonder invoer (met een nep-klok: net onder en precies op 5 minuten, iedere invoer begint opnieuw, open beheerformulieren gaan dicht, de melding en de timer van 10 seconden) en de uitleg over de inhouding op het loon in het productvenster</w:t>
+              <w:t xml:space="preserve">Regressietests voor de beveiligingsscan: beheeracties doen niets zonder ingelogde beheerder, product-id's als </w:t>
+            </w:r>
+            <w:r>
+              <w:rPr>
+                <w:rFonts w:ascii="Consolas" w:hAnsi="Consolas" w:cs="Consolas"/>
+                <w:sz w:val="14"/>
+                <w:shd w:val="clear" w:color="auto" w:fill="EEF4F2"/>
+              </w:rPr>
+              <w:t>__proto__</w:t>
+            </w:r>
+            <w:r>
+              <w:rPr>
+                <w:sz w:val="16"/>
+                <w:szCs w:val="16"/>
+              </w:rPr>
+              <w:t xml:space="preserve">, </w:t>
+            </w:r>
+            <w:r>
+              <w:rPr>
+                <w:rFonts w:ascii="Consolas" w:hAnsi="Consolas" w:cs="Consolas"/>
+                <w:sz w:val="14"/>
+                <w:shd w:val="clear" w:color="auto" w:fill="EEF4F2"/>
+              </w:rPr>
+              <w:t>constructor</w:t>
+            </w:r>
+            <w:r>
+              <w:rPr>
+                <w:sz w:val="16"/>
+                <w:szCs w:val="16"/>
+              </w:rPr>
+              <w:t xml:space="preserve"> en </w:t>
+            </w:r>
+            <w:r>
+              <w:rPr>
+                <w:rFonts w:ascii="Consolas" w:hAnsi="Consolas" w:cs="Consolas"/>
+                <w:sz w:val="14"/>
+                <w:shd w:val="clear" w:color="auto" w:fill="EEF4F2"/>
+              </w:rPr>
+              <w:t>toString</w:t>
+            </w:r>
+            <w:r>
+              <w:rPr>
+                <w:sz w:val="16"/>
+                <w:szCs w:val="16"/>
+              </w:rPr>
+              <w:t xml:space="preserve"> in de voorraadlijst, de camera die uitgaat na de tijdslimiet, de strengere controle van codes en tijdstippen bij het laden, de Node.js-versie van de CI, het alleen-toevoegen-logboek in het SQL-schema en de licentie van TensorFlow.js</w:t>
             </w:r>
           </w:p>
         </w:tc>
@@ -9326,7 +9356,7 @@
                 <w:sz w:val="14"/>
                 <w:shd w:val="clear" w:color="auto" w:fill="EEF4F2"/>
               </w:rPr>
-              <w:t>tests/ux-review.test.js</w:t>
+              <w:t>tests/avg-toets.test.js</w:t>
             </w:r>
           </w:p>
         </w:tc>
@@ -9343,37 +9373,7 @@
                 <w:sz w:val="16"/>
                 <w:szCs w:val="16"/>
               </w:rPr>
-              <w:t xml:space="preserve">Tests voor de verbeteringen uit de UX-review van oktober 2026 (UX 1 t/m UX 12 in de naam van iedere test, daarna 13 en 14): het productvenster dat na 75 seconden vanzelf sluit (met een nep-klok, de waarschuwing en iedere invoer die opnieuw begint), een pas terwijl een venster open is, de knopbalk met </w:t>
-            </w:r>
-            <w:r>
-              <w:rPr>
-                <w:rFonts w:ascii="Consolas" w:hAnsi="Consolas" w:cs="Consolas"/>
-                <w:sz w:val="14"/>
-                <w:shd w:val="clear" w:color="auto" w:fill="EEF4F2"/>
-              </w:rPr>
-              <w:t>Registreren</w:t>
-            </w:r>
-            <w:r>
-              <w:rPr>
-                <w:sz w:val="16"/>
-                <w:szCs w:val="16"/>
-              </w:rPr>
-              <w:t xml:space="preserve">, zoekveld en bedrijfsfilter leeg na registreren, de compacte banner, de pashint, de opmaak van een gekozen product, de grootte van knoppen, de statusregel en de meldingsregio's voor schermlezers, de leesbaarheid, de nieuwe teksten, </w:t>
-            </w:r>
-            <w:r>
-              <w:rPr>
-                <w:rFonts w:ascii="Consolas" w:hAnsi="Consolas" w:cs="Consolas"/>
-                <w:sz w:val="14"/>
-                <w:shd w:val="clear" w:color="auto" w:fill="EEF4F2"/>
-              </w:rPr>
-              <w:t>Registreren</w:t>
-            </w:r>
-            <w:r>
-              <w:rPr>
-                <w:sz w:val="16"/>
-                <w:szCs w:val="16"/>
-              </w:rPr>
-              <w:t xml:space="preserve"> zonder keuze, een productvenster zonder producten zonder knopbalk en loonregel (13) en vensters die altijd bovenaan openen (14)</w:t>
+              <w:t>Tests voor de aanpassingen uit de AVG-toets: automatisch uitloggen van de beheerder na 5 minuten zonder invoer (met een nep-klok: net onder en precies op 5 minuten, iedere invoer begint opnieuw, open beheerformulieren gaan dicht, de melding en de timer van 10 seconden) en de uitleg over de inhouding op het loon in het productvenster</w:t>
             </w:r>
           </w:p>
         </w:tc>
@@ -9396,7 +9396,7 @@
                 <w:sz w:val="14"/>
                 <w:shd w:val="clear" w:color="auto" w:fill="EEF4F2"/>
               </w:rPr>
-              <w:t>tests/review-oktober.test.js</w:t>
+              <w:t>tests/ux-review.test.js</w:t>
             </w:r>
           </w:p>
         </w:tc>
@@ -9413,7 +9413,7 @@
                 <w:sz w:val="16"/>
                 <w:szCs w:val="16"/>
               </w:rPr>
-              <w:t xml:space="preserve">Regressietests voor de review van oktober 2026 (D1 t/m D7, U1 t/m U7, R1 t/m R3 in de naam van iedere test): beschadigde lijsten en volle opslag, dubbele passen, niet-bestaande datums, pasnummers gelijk maken, mislukt wissen, gezichtsherkenning alleen met actieve medewerkers, een scan in het veld </w:t>
+              <w:t xml:space="preserve">Tests voor de verbeteringen uit de UX-review van oktober 2026 (UX 1 t/m UX 12 in de naam van iedere test, daarna 13 en 14): het productvenster dat na 75 seconden vanzelf sluit (met een nep-klok, de waarschuwing en iedere invoer die opnieuw begint), een pas terwijl een venster open is, de knopbalk met </w:t>
             </w:r>
             <w:r>
               <w:rPr>
@@ -9421,14 +9421,14 @@
                 <w:sz w:val="14"/>
                 <w:shd w:val="clear" w:color="auto" w:fill="EEF4F2"/>
               </w:rPr>
-              <w:t>Pasnummer</w:t>
+              <w:t>Registreren</w:t>
             </w:r>
             <w:r>
               <w:rPr>
                 <w:sz w:val="16"/>
                 <w:szCs w:val="16"/>
               </w:rPr>
-              <w:t xml:space="preserve"> en in het bedrijfsfilter, dubbelklik op </w:t>
+              <w:t xml:space="preserve">, zoekveld en bedrijfsfilter leeg na registreren, de compacte banner, de pashint, de opmaak van een gekozen product, de grootte van knoppen, de statusregel en de meldingsregio's voor schermlezers, de leesbaarheid, de nieuwe teksten, </w:t>
             </w:r>
             <w:r>
               <w:rPr>
@@ -9443,7 +9443,7 @@
                 <w:sz w:val="16"/>
                 <w:szCs w:val="16"/>
               </w:rPr>
-              <w:t>, een ingedrukt gehouden Enter, de focus na opslaan en (de)activeren, het datumveld na middernacht, toegankelijkheid (live region, tabbladen, bedrijfsfilter) en de cijfervelden</w:t>
+              <w:t xml:space="preserve"> zonder keuze, een productvenster zonder producten zonder knopbalk en loonregel (13) en vensters die altijd bovenaan openen (14)</w:t>
             </w:r>
           </w:p>
         </w:tc>
@@ -9466,7 +9466,7 @@
                 <w:sz w:val="14"/>
                 <w:shd w:val="clear" w:color="auto" w:fill="EEF4F2"/>
               </w:rPr>
-              <w:t>tests/rollenspel-oktober.test.js</w:t>
+              <w:t>tests/review-oktober.test.js</w:t>
             </w:r>
           </w:p>
         </w:tc>
@@ -9483,7 +9483,7 @@
                 <w:sz w:val="16"/>
                 <w:szCs w:val="16"/>
               </w:rPr>
-              <w:t xml:space="preserve">Regressietests voor de fouten uit de rollenspeltests en de FMEA van oktober 2026 (punt 1 t/m 14 in de naam van iedere test): zoekveld leeg na sluiten zonder registreren, geen spookklik na een dubbeltik op </w:t>
+              <w:t xml:space="preserve">Regressietests voor de review van oktober 2026 (D1 t/m D7, U1 t/m U7, R1 t/m R3 in de naam van iedere test): beschadigde lijsten en volle opslag, dubbele passen, niet-bestaande datums, pasnummers gelijk maken, mislukt wissen, gezichtsherkenning alleen met actieve medewerkers, een scan in het veld </w:t>
             </w:r>
             <w:r>
               <w:rPr>
@@ -9491,14 +9491,29 @@
                 <w:sz w:val="14"/>
                 <w:shd w:val="clear" w:color="auto" w:fill="EEF4F2"/>
               </w:rPr>
-              <w:t>Deur dicht</w:t>
+              <w:t>Pasnummer</w:t>
             </w:r>
             <w:r>
               <w:rPr>
                 <w:sz w:val="16"/>
                 <w:szCs w:val="16"/>
               </w:rPr>
-              <w:t>, de naam in de open koelkast en "Controle nodig" bij de pas van een collega, twee tabbladen op één opslag, de weging met het gemeten gemiddelde gewicht (eieren en blikjes), verwacht en geteld bij een telling, oude en nieuwe waarden in het logboek, de lege demokeuze, tikdoelen en hover, voorraad 0, negatieve getallen in de CSV, het SQL-schema en teksten in het TO</w:t>
+              <w:t xml:space="preserve"> en in het bedrijfsfilter, dubbelklik op </w:t>
+            </w:r>
+            <w:r>
+              <w:rPr>
+                <w:rFonts w:ascii="Consolas" w:hAnsi="Consolas" w:cs="Consolas"/>
+                <w:sz w:val="14"/>
+                <w:shd w:val="clear" w:color="auto" w:fill="EEF4F2"/>
+              </w:rPr>
+              <w:t>Registreren</w:t>
+            </w:r>
+            <w:r>
+              <w:rPr>
+                <w:sz w:val="16"/>
+                <w:szCs w:val="16"/>
+              </w:rPr>
+              <w:t>, een ingedrukt gehouden Enter, de focus na opslaan en (de)activeren, het datumveld na middernacht, toegankelijkheid (live region, tabbladen, bedrijfsfilter) en de cijfervelden</w:t>
             </w:r>
           </w:p>
         </w:tc>
@@ -9521,7 +9536,7 @@
                 <w:sz w:val="14"/>
                 <w:shd w:val="clear" w:color="auto" w:fill="EEF4F2"/>
               </w:rPr>
-              <w:t>.gitattributes</w:t>
+              <w:t>tests/rollenspel-oktober.test.js</w:t>
             </w:r>
           </w:p>
         </w:tc>
@@ -9538,7 +9553,7 @@
                 <w:sz w:val="16"/>
                 <w:szCs w:val="16"/>
               </w:rPr>
-              <w:t xml:space="preserve">Zorgt dat Git de bestanden in </w:t>
+              <w:t xml:space="preserve">Regressietests voor de fouten uit de rollenspeltests en de FMEA van oktober 2026 (punt 1 t/m 14 in de naam van iedere test): zoekveld leeg na sluiten zonder registreren, geen spookklik na een dubbeltik op </w:t>
             </w:r>
             <w:r>
               <w:rPr>
@@ -9546,29 +9561,14 @@
                 <w:sz w:val="14"/>
                 <w:shd w:val="clear" w:color="auto" w:fill="EEF4F2"/>
               </w:rPr>
-              <w:t>assets/vendor/</w:t>
+              <w:t>Deur dicht</w:t>
             </w:r>
             <w:r>
               <w:rPr>
                 <w:sz w:val="16"/>
                 <w:szCs w:val="16"/>
               </w:rPr>
-              <w:t xml:space="preserve"> en </w:t>
-            </w:r>
-            <w:r>
-              <w:rPr>
-                <w:rFonts w:ascii="Consolas" w:hAnsi="Consolas" w:cs="Consolas"/>
-                <w:sz w:val="14"/>
-                <w:shd w:val="clear" w:color="auto" w:fill="EEF4F2"/>
-              </w:rPr>
-              <w:t>assets/fonts/</w:t>
-            </w:r>
-            <w:r>
-              <w:rPr>
-                <w:sz w:val="16"/>
-                <w:szCs w:val="16"/>
-              </w:rPr>
-              <w:t xml:space="preserve"> niet aanpast (geen omzetting van regeleinden), zodat de controlegetallen blijven kloppen</w:t>
+              <w:t>, de naam in de open koelkast en "Controle nodig" bij de pas van een collega, twee tabbladen op één opslag, de weging met het gemeten gemiddelde gewicht (eieren en blikjes), verwacht en geteld bij een telling, oude en nieuwe waarden in het logboek, de lege demokeuze, tikdoelen en hover, voorraad 0, negatieve getallen in de CSV, het SQL-schema en teksten in het TO</w:t>
             </w:r>
           </w:p>
         </w:tc>
@@ -9591,7 +9591,7 @@
                 <w:sz w:val="14"/>
                 <w:shd w:val="clear" w:color="auto" w:fill="EEF4F2"/>
               </w:rPr>
-              <w:t>tests/e2e/</w:t>
+              <w:t>.gitattributes</w:t>
             </w:r>
           </w:p>
         </w:tc>
@@ -9608,7 +9608,7 @@
                 <w:sz w:val="16"/>
                 <w:szCs w:val="16"/>
               </w:rPr>
-              <w:t xml:space="preserve">Browsertests (end-to-end): </w:t>
+              <w:t xml:space="preserve">Zorgt dat Git de bestanden in </w:t>
             </w:r>
             <w:r>
               <w:rPr>
@@ -9616,14 +9616,14 @@
                 <w:sz w:val="14"/>
                 <w:shd w:val="clear" w:color="auto" w:fill="EEF4F2"/>
               </w:rPr>
-              <w:t>app.e2e.test.js</w:t>
+              <w:t>assets/vendor/</w:t>
             </w:r>
             <w:r>
               <w:rPr>
                 <w:sz w:val="16"/>
                 <w:szCs w:val="16"/>
               </w:rPr>
-              <w:t xml:space="preserve"> test de echte pagina in headless Edge of Chrome (33 tests, die na het openen eerst op </w:t>
+              <w:t xml:space="preserve"> en </w:t>
             </w:r>
             <w:r>
               <w:rPr>
@@ -9631,172 +9631,14 @@
                 <w:sz w:val="14"/>
                 <w:shd w:val="clear" w:color="auto" w:fill="EEF4F2"/>
               </w:rPr>
-              <w:t>Handmatig zoeken</w:t>
+              <w:t>assets/fonts/</w:t>
             </w:r>
             <w:r>
               <w:rPr>
                 <w:sz w:val="16"/>
                 <w:szCs w:val="16"/>
               </w:rPr>
-              <w:t xml:space="preserve"> tikken: laden zonder fouten, zoeken, registreren (daarna bij kiezen op naam geen "welkom terug"), </w:t>
-            </w:r>
-            <w:r>
-              <w:rPr>
-                <w:rFonts w:ascii="Consolas" w:hAnsi="Consolas" w:cs="Consolas"/>
-                <w:sz w:val="14"/>
-                <w:shd w:val="clear" w:color="auto" w:fill="EEF4F2"/>
-              </w:rPr>
-              <w:t>Registreren</w:t>
-            </w:r>
-            <w:r>
-              <w:rPr>
-                <w:sz w:val="16"/>
-                <w:szCs w:val="16"/>
-              </w:rPr>
-              <w:t xml:space="preserve"> zonder keuze, Escape en focus, inloggen, thema, pas koppelen en herkennen (ook een tweede scan in het veld </w:t>
-            </w:r>
-            <w:r>
-              <w:rPr>
-                <w:rFonts w:ascii="Consolas" w:hAnsi="Consolas" w:cs="Consolas"/>
-                <w:sz w:val="14"/>
-                <w:shd w:val="clear" w:color="auto" w:fill="EEF4F2"/>
-              </w:rPr>
-              <w:t>Pasnummer</w:t>
-            </w:r>
-            <w:r>
-              <w:rPr>
-                <w:sz w:val="16"/>
-                <w:szCs w:val="16"/>
-              </w:rPr>
-              <w:t xml:space="preserve">), CSV-export, een dubbelklik op </w:t>
-            </w:r>
-            <w:r>
-              <w:rPr>
-                <w:rFonts w:ascii="Consolas" w:hAnsi="Consolas" w:cs="Consolas"/>
-                <w:sz w:val="14"/>
-                <w:shd w:val="clear" w:color="auto" w:fill="EEF4F2"/>
-              </w:rPr>
-              <w:t>Registreren</w:t>
-            </w:r>
-            <w:r>
-              <w:rPr>
-                <w:sz w:val="16"/>
-                <w:szCs w:val="16"/>
-              </w:rPr>
-              <w:t xml:space="preserve">, een scan in het bedrijfsfilter, de focus na opslaan en (de)activeren in het beheer, letters in een cijferveld, het productvenster dat vanzelf sluit, een pas terwijl een venster open is, </w:t>
-            </w:r>
-            <w:r>
-              <w:rPr>
-                <w:rFonts w:ascii="Consolas" w:hAnsi="Consolas" w:cs="Consolas"/>
-                <w:sz w:val="14"/>
-                <w:shd w:val="clear" w:color="auto" w:fill="EEF4F2"/>
-              </w:rPr>
-              <w:t>Registreren</w:t>
-            </w:r>
-            <w:r>
-              <w:rPr>
-                <w:sz w:val="16"/>
-                <w:szCs w:val="16"/>
-              </w:rPr>
-              <w:t xml:space="preserve"> in beeld op een liggende tablet, een telefoon en bij 200% zoom, een leeg zoekveld na registreren, een productvenster zonder producten, vensters die bovenaan openen, de slimme koelkast: openen met de pas, twee blikjes pakken en de registratie terugzien, en een onbekende pas, en de rollenspeltests van oktober 2026: een leeg zoekveld na sluiten zonder registreren, een dubbeltik op </w:t>
-            </w:r>
-            <w:r>
-              <w:rPr>
-                <w:rFonts w:ascii="Consolas" w:hAnsi="Consolas" w:cs="Consolas"/>
-                <w:sz w:val="14"/>
-                <w:shd w:val="clear" w:color="auto" w:fill="EEF4F2"/>
-              </w:rPr>
-              <w:t>Deur dicht</w:t>
-            </w:r>
-            <w:r>
-              <w:rPr>
-                <w:sz w:val="16"/>
-                <w:szCs w:val="16"/>
-              </w:rPr>
-              <w:t xml:space="preserve">, de naam in de open koelkast met de pas van een collega, een opslag van een ander tabblad die niet wordt overschreven en de lege demokeuze, en sinds versie 3.17 de standby (dimmen, een tik wekt zonder klik-door, een toets wekt) is sinds versie 3.21 vervangen door vier tests van het startscherm (zwart en zonder camera alleen pas en </w:t>
-            </w:r>
-            <w:r>
-              <w:rPr>
-                <w:rFonts w:ascii="Consolas" w:hAnsi="Consolas" w:cs="Consolas"/>
-                <w:sz w:val="14"/>
-                <w:shd w:val="clear" w:color="auto" w:fill="EEF4F2"/>
-              </w:rPr>
-              <w:t>Handmatig zoeken</w:t>
-            </w:r>
-            <w:r>
-              <w:rPr>
-                <w:sz w:val="16"/>
-                <w:szCs w:val="16"/>
-              </w:rPr>
-              <w:t xml:space="preserve">, terug na 2 minuten en na registreren, een passcan op het startscherm die de koelkast opent en na </w:t>
-            </w:r>
-            <w:r>
-              <w:rPr>
-                <w:rFonts w:ascii="Consolas" w:hAnsi="Consolas" w:cs="Consolas"/>
-                <w:sz w:val="14"/>
-                <w:shd w:val="clear" w:color="auto" w:fill="EEF4F2"/>
-              </w:rPr>
-              <w:t>Klaar</w:t>
-            </w:r>
-            <w:r>
-              <w:rPr>
-                <w:sz w:val="16"/>
-                <w:szCs w:val="16"/>
-              </w:rPr>
-              <w:t xml:space="preserve"> het startscherm, en een camera zonder toestemming zonder fouten), de vraag na een passcan met een nagebootste camera, en sinds versie 3.19 een pas in het inlogvenster en een zoekveld van het beheer zonder achtergebleven pasnummer en "Aantal" dat past in het leveringsveld op een staande tablet), </w:t>
-            </w:r>
-            <w:r>
-              <w:rPr>
-                <w:rFonts w:ascii="Consolas" w:hAnsi="Consolas" w:cs="Consolas"/>
-                <w:sz w:val="14"/>
-                <w:shd w:val="clear" w:color="auto" w:fill="EEF4F2"/>
-              </w:rPr>
-              <w:t>browser.js</w:t>
-            </w:r>
-            <w:r>
-              <w:rPr>
-                <w:sz w:val="16"/>
-                <w:szCs w:val="16"/>
-              </w:rPr>
-              <w:t xml:space="preserve"> bevat de webserver en de besturing van de browser via het Chrome DevTools Protocol. Er wordt pas geklikt als het element stilstaat. Bij een mislukte test volgen het scenario, de toestand van de pagina, de laatste meldingen uit de console en een schermafdruk in </w:t>
-            </w:r>
-            <w:r>
-              <w:rPr>
-                <w:rFonts w:ascii="Consolas" w:hAnsi="Consolas" w:cs="Consolas"/>
-                <w:sz w:val="14"/>
-                <w:shd w:val="clear" w:color="auto" w:fill="EEF4F2"/>
-              </w:rPr>
-              <w:t>test-results/e2e</w:t>
-            </w:r>
-            <w:r>
-              <w:rPr>
-                <w:sz w:val="16"/>
-                <w:szCs w:val="16"/>
-              </w:rPr>
-              <w:t xml:space="preserve">. Draaien met </w:t>
-            </w:r>
-            <w:r>
-              <w:rPr>
-                <w:rFonts w:ascii="Consolas" w:hAnsi="Consolas" w:cs="Consolas"/>
-                <w:sz w:val="14"/>
-                <w:shd w:val="clear" w:color="auto" w:fill="EEF4F2"/>
-              </w:rPr>
-              <w:t>npm run test:e2e</w:t>
-            </w:r>
-            <w:r>
-              <w:rPr>
-                <w:sz w:val="16"/>
-                <w:szCs w:val="16"/>
-              </w:rPr>
-              <w:t xml:space="preserve">, zonder npm-pakketten. Een andere browser kies je met </w:t>
-            </w:r>
-            <w:r>
-              <w:rPr>
-                <w:rFonts w:ascii="Consolas" w:hAnsi="Consolas" w:cs="Consolas"/>
-                <w:sz w:val="14"/>
-                <w:shd w:val="clear" w:color="auto" w:fill="EEF4F2"/>
-              </w:rPr>
-              <w:t>BROWSER_PATH</w:t>
+              <w:t xml:space="preserve"> niet aanpast (geen omzetting van regeleinden), zodat de controlegetallen blijven kloppen</w:t>
             </w:r>
           </w:p>
         </w:tc>
@@ -9819,7 +9661,7 @@
                 <w:sz w:val="14"/>
                 <w:shd w:val="clear" w:color="auto" w:fill="EEF4F2"/>
               </w:rPr>
-              <w:t>.github/workflows/ci.yml</w:t>
+              <w:t>tests/e2e/</w:t>
             </w:r>
           </w:p>
         </w:tc>
@@ -9836,6 +9678,234 @@
                 <w:sz w:val="16"/>
                 <w:szCs w:val="16"/>
               </w:rPr>
+              <w:t xml:space="preserve">Browsertests (end-to-end): </w:t>
+            </w:r>
+            <w:r>
+              <w:rPr>
+                <w:rFonts w:ascii="Consolas" w:hAnsi="Consolas" w:cs="Consolas"/>
+                <w:sz w:val="14"/>
+                <w:shd w:val="clear" w:color="auto" w:fill="EEF4F2"/>
+              </w:rPr>
+              <w:t>app.e2e.test.js</w:t>
+            </w:r>
+            <w:r>
+              <w:rPr>
+                <w:sz w:val="16"/>
+                <w:szCs w:val="16"/>
+              </w:rPr>
+              <w:t xml:space="preserve"> test de echte pagina in headless Edge of Chrome (34 tests, die na het openen eerst op </w:t>
+            </w:r>
+            <w:r>
+              <w:rPr>
+                <w:rFonts w:ascii="Consolas" w:hAnsi="Consolas" w:cs="Consolas"/>
+                <w:sz w:val="14"/>
+                <w:shd w:val="clear" w:color="auto" w:fill="EEF4F2"/>
+              </w:rPr>
+              <w:t>Handmatig zoeken</w:t>
+            </w:r>
+            <w:r>
+              <w:rPr>
+                <w:sz w:val="16"/>
+                <w:szCs w:val="16"/>
+              </w:rPr>
+              <w:t xml:space="preserve"> tikken: sinds versie 3.22 ook geen link na kiezen op naam en de knop in het beheer, laden zonder fouten, zoeken, registreren (daarna bij kiezen op naam geen "welkom terug"), </w:t>
+            </w:r>
+            <w:r>
+              <w:rPr>
+                <w:rFonts w:ascii="Consolas" w:hAnsi="Consolas" w:cs="Consolas"/>
+                <w:sz w:val="14"/>
+                <w:shd w:val="clear" w:color="auto" w:fill="EEF4F2"/>
+              </w:rPr>
+              <w:t>Registreren</w:t>
+            </w:r>
+            <w:r>
+              <w:rPr>
+                <w:sz w:val="16"/>
+                <w:szCs w:val="16"/>
+              </w:rPr>
+              <w:t xml:space="preserve"> zonder keuze, Escape en focus, inloggen, thema, pas koppelen en herkennen (ook een tweede scan in het veld </w:t>
+            </w:r>
+            <w:r>
+              <w:rPr>
+                <w:rFonts w:ascii="Consolas" w:hAnsi="Consolas" w:cs="Consolas"/>
+                <w:sz w:val="14"/>
+                <w:shd w:val="clear" w:color="auto" w:fill="EEF4F2"/>
+              </w:rPr>
+              <w:t>Pasnummer</w:t>
+            </w:r>
+            <w:r>
+              <w:rPr>
+                <w:sz w:val="16"/>
+                <w:szCs w:val="16"/>
+              </w:rPr>
+              <w:t xml:space="preserve">), CSV-export, een dubbelklik op </w:t>
+            </w:r>
+            <w:r>
+              <w:rPr>
+                <w:rFonts w:ascii="Consolas" w:hAnsi="Consolas" w:cs="Consolas"/>
+                <w:sz w:val="14"/>
+                <w:shd w:val="clear" w:color="auto" w:fill="EEF4F2"/>
+              </w:rPr>
+              <w:t>Registreren</w:t>
+            </w:r>
+            <w:r>
+              <w:rPr>
+                <w:sz w:val="16"/>
+                <w:szCs w:val="16"/>
+              </w:rPr>
+              <w:t xml:space="preserve">, een scan in het bedrijfsfilter, de focus na opslaan en (de)activeren in het beheer, letters in een cijferveld, het productvenster dat vanzelf sluit, een pas terwijl een venster open is, </w:t>
+            </w:r>
+            <w:r>
+              <w:rPr>
+                <w:rFonts w:ascii="Consolas" w:hAnsi="Consolas" w:cs="Consolas"/>
+                <w:sz w:val="14"/>
+                <w:shd w:val="clear" w:color="auto" w:fill="EEF4F2"/>
+              </w:rPr>
+              <w:t>Registreren</w:t>
+            </w:r>
+            <w:r>
+              <w:rPr>
+                <w:sz w:val="16"/>
+                <w:szCs w:val="16"/>
+              </w:rPr>
+              <w:t xml:space="preserve"> in beeld op een liggende tablet, een telefoon en bij 200% zoom, een leeg zoekveld na registreren, een productvenster zonder producten, vensters die bovenaan openen, de slimme koelkast: openen met de pas, twee blikjes pakken en de registratie terugzien, en een onbekende pas, en de rollenspeltests van oktober 2026: een leeg zoekveld na sluiten zonder registreren, een dubbeltik op </w:t>
+            </w:r>
+            <w:r>
+              <w:rPr>
+                <w:rFonts w:ascii="Consolas" w:hAnsi="Consolas" w:cs="Consolas"/>
+                <w:sz w:val="14"/>
+                <w:shd w:val="clear" w:color="auto" w:fill="EEF4F2"/>
+              </w:rPr>
+              <w:t>Deur dicht</w:t>
+            </w:r>
+            <w:r>
+              <w:rPr>
+                <w:sz w:val="16"/>
+                <w:szCs w:val="16"/>
+              </w:rPr>
+              <w:t xml:space="preserve">, de naam in de open koelkast met de pas van een collega, een opslag van een ander tabblad die niet wordt overschreven en de lege demokeuze, en sinds versie 3.17 de standby (dimmen, een tik wekt zonder klik-door, een toets wekt) is sinds versie 3.21 vervangen door vier tests van het startscherm (zwart en zonder camera alleen pas en </w:t>
+            </w:r>
+            <w:r>
+              <w:rPr>
+                <w:rFonts w:ascii="Consolas" w:hAnsi="Consolas" w:cs="Consolas"/>
+                <w:sz w:val="14"/>
+                <w:shd w:val="clear" w:color="auto" w:fill="EEF4F2"/>
+              </w:rPr>
+              <w:t>Handmatig zoeken</w:t>
+            </w:r>
+            <w:r>
+              <w:rPr>
+                <w:sz w:val="16"/>
+                <w:szCs w:val="16"/>
+              </w:rPr>
+              <w:t xml:space="preserve">, terug na 2 minuten en na registreren, een passcan op het startscherm die de koelkast opent en na </w:t>
+            </w:r>
+            <w:r>
+              <w:rPr>
+                <w:rFonts w:ascii="Consolas" w:hAnsi="Consolas" w:cs="Consolas"/>
+                <w:sz w:val="14"/>
+                <w:shd w:val="clear" w:color="auto" w:fill="EEF4F2"/>
+              </w:rPr>
+              <w:t>Klaar</w:t>
+            </w:r>
+            <w:r>
+              <w:rPr>
+                <w:sz w:val="16"/>
+                <w:szCs w:val="16"/>
+              </w:rPr>
+              <w:t xml:space="preserve"> het startscherm, en een camera zonder toestemming zonder fouten), de vraag na een passcan met een nagebootste camera, en sinds versie 3.19 een pas in het inlogvenster en een zoekveld van het beheer zonder achtergebleven pasnummer en "Aantal" dat past in het leveringsveld op een staande tablet), </w:t>
+            </w:r>
+            <w:r>
+              <w:rPr>
+                <w:rFonts w:ascii="Consolas" w:hAnsi="Consolas" w:cs="Consolas"/>
+                <w:sz w:val="14"/>
+                <w:shd w:val="clear" w:color="auto" w:fill="EEF4F2"/>
+              </w:rPr>
+              <w:t>browser.js</w:t>
+            </w:r>
+            <w:r>
+              <w:rPr>
+                <w:sz w:val="16"/>
+                <w:szCs w:val="16"/>
+              </w:rPr>
+              <w:t xml:space="preserve"> bevat de webserver en de besturing van de browser via het Chrome DevTools Protocol. Er wordt pas geklikt als het element stilstaat. Bij een mislukte test volgen het scenario, de toestand van de pagina, de laatste meldingen uit de console en een schermafdruk in </w:t>
+            </w:r>
+            <w:r>
+              <w:rPr>
+                <w:rFonts w:ascii="Consolas" w:hAnsi="Consolas" w:cs="Consolas"/>
+                <w:sz w:val="14"/>
+                <w:shd w:val="clear" w:color="auto" w:fill="EEF4F2"/>
+              </w:rPr>
+              <w:t>test-results/e2e</w:t>
+            </w:r>
+            <w:r>
+              <w:rPr>
+                <w:sz w:val="16"/>
+                <w:szCs w:val="16"/>
+              </w:rPr>
+              <w:t xml:space="preserve">. Draaien met </w:t>
+            </w:r>
+            <w:r>
+              <w:rPr>
+                <w:rFonts w:ascii="Consolas" w:hAnsi="Consolas" w:cs="Consolas"/>
+                <w:sz w:val="14"/>
+                <w:shd w:val="clear" w:color="auto" w:fill="EEF4F2"/>
+              </w:rPr>
+              <w:t>npm run test:e2e</w:t>
+            </w:r>
+            <w:r>
+              <w:rPr>
+                <w:sz w:val="16"/>
+                <w:szCs w:val="16"/>
+              </w:rPr>
+              <w:t xml:space="preserve">, zonder npm-pakketten. Een andere browser kies je met </w:t>
+            </w:r>
+            <w:r>
+              <w:rPr>
+                <w:rFonts w:ascii="Consolas" w:hAnsi="Consolas" w:cs="Consolas"/>
+                <w:sz w:val="14"/>
+                <w:shd w:val="clear" w:color="auto" w:fill="EEF4F2"/>
+              </w:rPr>
+              <w:t>BROWSER_PATH</w:t>
+            </w:r>
+          </w:p>
+        </w:tc>
+      </w:tr>
+      <w:tr>
+        <w:trPr>
+          <w:cantSplit/>
+        </w:trPr>
+        <w:tc>
+          <w:tcPr>
+            <w:tcW w:w="4337" w:type="dxa"/>
+          </w:tcPr>
+          <w:p>
+            <w:pPr>
+              <w:spacing w:before="20" w:after="20" w:line="240" w:lineRule="auto"/>
+            </w:pPr>
+            <w:r>
+              <w:rPr>
+                <w:rFonts w:ascii="Consolas" w:hAnsi="Consolas" w:cs="Consolas"/>
+                <w:sz w:val="14"/>
+                <w:shd w:val="clear" w:color="auto" w:fill="EEF4F2"/>
+              </w:rPr>
+              <w:t>.github/workflows/ci.yml</w:t>
+            </w:r>
+          </w:p>
+        </w:tc>
+        <w:tc>
+          <w:tcPr>
+            <w:tcW w:w="5301" w:type="dxa"/>
+          </w:tcPr>
+          <w:p>
+            <w:pPr>
+              <w:spacing w:before="20" w:after="20" w:line="240" w:lineRule="auto"/>
+            </w:pPr>
+            <w:r>
+              <w:rPr>
+                <w:sz w:val="16"/>
+                <w:szCs w:val="16"/>
+              </w:rPr>
               <w:t>Voert de unit tests en daarna de browsertests (in Google Chrome) automatisch uit op GitHub met Node.js 24 (LTS), met alleen leesrechten en actions die op een commit-SHA zijn vastgezet</w:t>
             </w:r>
           </w:p>
@@ -9877,7 +9947,7 @@
         </w:numPr>
       </w:pPr>
       <w:bookmarkStart w:id="5" w:name="k3"/>
-      <w:bookmarkStart w:id="6" w:name="_Toc243906804"/>
+      <w:bookmarkStart w:id="6" w:name="_Toc243983742"/>
       <w:r>
         <w:t>DE WEBSITE STARTEN.</w:t>
       </w:r>
@@ -10099,7 +10169,7 @@
         </w:numPr>
       </w:pPr>
       <w:bookmarkStart w:id="7" w:name="k4"/>
-      <w:bookmarkStart w:id="8" w:name="_Toc243906805"/>
+      <w:bookmarkStart w:id="8" w:name="_Toc243983743"/>
       <w:r>
         <w:t>GEBRUIKERSHANDLEIDING.</w:t>
       </w:r>
@@ -10139,7 +10209,7 @@
         <w:keepNext/>
       </w:pPr>
       <w:bookmarkStart w:id="9" w:name="k5"/>
-      <w:bookmarkStart w:id="10" w:name="_Toc243906806"/>
+      <w:bookmarkStart w:id="10" w:name="_Toc243983744"/>
       <w:r>
         <w:t>EEN MEDEWERKER ZOEKEN</w:t>
       </w:r>
@@ -10205,7 +10275,7 @@
         <w:keepNext/>
       </w:pPr>
       <w:bookmarkStart w:id="11" w:name="k6"/>
-      <w:bookmarkStart w:id="12" w:name="_Toc243906807"/>
+      <w:bookmarkStart w:id="12" w:name="_Toc243983745"/>
       <w:r>
         <w:t>EEN PRODUCT REGISTREREN</w:t>
       </w:r>
@@ -10454,7 +10524,7 @@
         <w:keepNext/>
       </w:pPr>
       <w:bookmarkStart w:id="13" w:name="k7"/>
-      <w:bookmarkStart w:id="14" w:name="_Toc243906808"/>
+      <w:bookmarkStart w:id="14" w:name="_Toc243983746"/>
       <w:r>
         <w:t>ADMIN-DASHBOARD OPENEN</w:t>
       </w:r>
@@ -10585,7 +10655,7 @@
         <w:keepNext/>
       </w:pPr>
       <w:bookmarkStart w:id="15" w:name="k8"/>
-      <w:bookmarkStart w:id="16" w:name="_Toc243906809"/>
+      <w:bookmarkStart w:id="16" w:name="_Toc243983747"/>
       <w:r>
         <w:t>REGISTRATIES BEHEREN</w:t>
       </w:r>
@@ -10871,7 +10941,7 @@
         <w:keepNext/>
       </w:pPr>
       <w:bookmarkStart w:id="17" w:name="k9"/>
-      <w:bookmarkStart w:id="18" w:name="_Toc243906810"/>
+      <w:bookmarkStart w:id="18" w:name="_Toc243983748"/>
       <w:r>
         <w:t>MEDEWERKERS BEHEREN</w:t>
       </w:r>
@@ -11040,6 +11110,7 @@
           <w:ilvl w:val="0"/>
           <w:numId w:val="3"/>
         </w:numPr>
+        <w:spacing w:after="60"/>
         <w:contextualSpacing w:val="0"/>
       </w:pPr>
       <w:r>
@@ -11066,6 +11137,52 @@
       </w:r>
       <w:r>
         <w:t xml:space="preserve"> om de medewerkerstatus te wijzigen.</w:t>
+      </w:r>
+    </w:p>
+    <w:p>
+      <w:pPr>
+        <w:pStyle w:val="Lijstalinea"/>
+        <w:numPr>
+          <w:ilvl w:val="0"/>
+          <w:numId w:val="3"/>
+        </w:numPr>
+        <w:contextualSpacing w:val="0"/>
+      </w:pPr>
+      <w:r>
+        <w:t xml:space="preserve">Gezichtsherkenning (demo, sinds versie 3.22): bij een actieve medewerker staat </w:t>
+      </w:r>
+      <w:r>
+        <w:rPr>
+          <w:rFonts w:ascii="Consolas" w:hAnsi="Consolas" w:cs="Consolas"/>
+          <w:sz w:val="18"/>
+          <w:shd w:val="clear" w:color="auto" w:fill="EEF4F2"/>
+        </w:rPr>
+        <w:t>Gezichtsherkenning instellen</w:t>
+      </w:r>
+      <w:r>
+        <w:t xml:space="preserve">. Laat de medewerker zelf voor de camera staan en zelf het vinkje voor toestemming zetten, en klik dan op </w:t>
+      </w:r>
+      <w:r>
+        <w:rPr>
+          <w:rFonts w:ascii="Consolas" w:hAnsi="Consolas" w:cs="Consolas"/>
+          <w:sz w:val="18"/>
+          <w:shd w:val="clear" w:color="auto" w:fill="EEF4F2"/>
+        </w:rPr>
+        <w:t>Gezicht vastleggen</w:t>
+      </w:r>
+      <w:r>
+        <w:t xml:space="preserve">. Daarna staat in de lijst "Gezichtsherkenning ingesteld tot 27-10-2027" (een jaar later) met </w:t>
+      </w:r>
+      <w:r>
+        <w:rPr>
+          <w:rFonts w:ascii="Consolas" w:hAnsi="Consolas" w:cs="Consolas"/>
+          <w:sz w:val="18"/>
+          <w:shd w:val="clear" w:color="auto" w:fill="EEF4F2"/>
+        </w:rPr>
+        <w:t>Uitzetten</w:t>
+      </w:r>
+      <w:r>
+        <w:t>. Het logboek krijgt "Gezichtsherkenning ingesteld door beheerder" of "Gezichtsherkenning uitgezet door beheerder" met de naam. Zonder camera is de knop uitgeschakeld met "Geen camera gevonden. Instellen kan alleen met een camera." Staat de demo uit, dan zijn er geen knoppen. Zie 4.15.</w:t>
       </w:r>
     </w:p>
     <w:p>
@@ -11205,7 +11322,7 @@
         <w:keepNext/>
       </w:pPr>
       <w:bookmarkStart w:id="19" w:name="k10"/>
-      <w:bookmarkStart w:id="20" w:name="_Toc243906811"/>
+      <w:bookmarkStart w:id="20" w:name="_Toc243983749"/>
       <w:r>
         <w:t>PRODUCTEN BEHEREN</w:t>
       </w:r>
@@ -11333,7 +11450,7 @@
         <w:keepNext/>
       </w:pPr>
       <w:bookmarkStart w:id="21" w:name="k11"/>
-      <w:bookmarkStart w:id="22" w:name="_Toc243906812"/>
+      <w:bookmarkStart w:id="22" w:name="_Toc243983750"/>
       <w:r>
         <w:t>BEDRIJVEN EN CONSUMPTIEPUNTEN BEHEREN</w:t>
       </w:r>
@@ -11496,7 +11613,7 @@
         <w:keepNext/>
       </w:pPr>
       <w:bookmarkStart w:id="23" w:name="k12"/>
-      <w:bookmarkStart w:id="24" w:name="_Toc243906813"/>
+      <w:bookmarkStart w:id="24" w:name="_Toc243983751"/>
       <w:r>
         <w:t>VOORRAAD BEHEREN</w:t>
       </w:r>
@@ -11714,7 +11831,7 @@
         <w:keepNext/>
       </w:pPr>
       <w:bookmarkStart w:id="25" w:name="k13"/>
-      <w:bookmarkStart w:id="26" w:name="_Toc243906814"/>
+      <w:bookmarkStart w:id="26" w:name="_Toc243983752"/>
       <w:r>
         <w:t>LOGBOEK BEKIJKEN</w:t>
       </w:r>
@@ -11754,7 +11871,7 @@
         <w:keepNext/>
       </w:pPr>
       <w:bookmarkStart w:id="27" w:name="k14"/>
-      <w:bookmarkStart w:id="28" w:name="_Toc243906815"/>
+      <w:bookmarkStart w:id="28" w:name="_Toc243983753"/>
       <w:r>
         <w:t>ALLE GEGEVENS WISSEN</w:t>
       </w:r>
@@ -11880,7 +11997,7 @@
         <w:keepNext/>
       </w:pPr>
       <w:bookmarkStart w:id="29" w:name="k15"/>
-      <w:bookmarkStart w:id="30" w:name="_Toc243906816"/>
+      <w:bookmarkStart w:id="30" w:name="_Toc243983754"/>
       <w:r>
         <w:t>MODAL SLUITEN EN UITLOGGEN</w:t>
       </w:r>
@@ -11954,7 +12071,7 @@
         <w:keepNext/>
       </w:pPr>
       <w:bookmarkStart w:id="31" w:name="k16"/>
-      <w:bookmarkStart w:id="32" w:name="_Toc243906817"/>
+      <w:bookmarkStart w:id="32" w:name="_Toc243983755"/>
       <w:r>
         <w:t>CSV EXPORTEREN</w:t>
       </w:r>
@@ -12338,7 +12455,7 @@
         <w:keepNext/>
       </w:pPr>
       <w:bookmarkStart w:id="33" w:name="k17"/>
-      <w:bookmarkStart w:id="34" w:name="_Toc243906818"/>
+      <w:bookmarkStart w:id="34" w:name="_Toc243983756"/>
       <w:r>
         <w:t>LICHT OF DONKER THEMA</w:t>
       </w:r>
@@ -12445,7 +12562,7 @@
         <w:keepNext/>
       </w:pPr>
       <w:bookmarkStart w:id="35" w:name="k18"/>
-      <w:bookmarkStart w:id="36" w:name="_Toc243906819"/>
+      <w:bookmarkStart w:id="36" w:name="_Toc243983757"/>
       <w:r>
         <w:t>WELKOM EN "ZELFDE ALS VORIGE KEER"</w:t>
       </w:r>
@@ -12532,7 +12649,7 @@
         <w:keepNext/>
       </w:pPr>
       <w:bookmarkStart w:id="37" w:name="k19"/>
-      <w:bookmarkStart w:id="38" w:name="_Toc243906820"/>
+      <w:bookmarkStart w:id="38" w:name="_Toc243983758"/>
       <w:r>
         <w:t>DEMO GEZICHTSHERKENNING</w:t>
       </w:r>
@@ -12564,7 +12681,20 @@
       </w:r>
       <w:r>
         <w:tab/>
-        <w:t xml:space="preserve">Kies je naam in de lijst. Onderaan het productvenster staat </w:t>
+      </w:r>
+      <w:r>
+        <w:t xml:space="preserve">Houd je pas tegen de lezer. Heb je nog geen gezichtsherkenning, dan vraagt de tablet "Gezichtsherkenning nog niet ingesteld. Wil je dit?" Kies </w:t>
+      </w:r>
+      <w:r>
+        <w:rPr>
+          <w:rFonts w:ascii="Consolas" w:hAnsi="Consolas" w:cs="Consolas"/>
+          <w:sz w:val="18"/>
+          <w:shd w:val="clear" w:color="auto" w:fill="EEF4F2"/>
+        </w:rPr>
+        <w:t>Ja, instellen</w:t>
+      </w:r>
+      <w:r>
+        <w:t xml:space="preserve">. Opent na je pas het productvenster, dan staat daar ook de link </w:t>
       </w:r>
       <w:r>
         <w:rPr>
@@ -12598,8 +12728,6 @@
       </w:r>
       <w:r>
         <w:tab/>
-      </w:r>
-      <w:r>
         <w:t xml:space="preserve">De camera van de tablet of laptop gaat aan. Plaats je gezicht in het kader, zet het vinkje voor vrijwillige deelname en klik op </w:t>
       </w:r>
       <w:r>
@@ -12611,7 +12739,7 @@
         <w:t>Gezicht vastleggen</w:t>
       </w:r>
       <w:r>
-        <w:t>.</w:t>
+        <w:t>. Daarna gaat de koelkast (of het productvenster) open.</w:t>
       </w:r>
     </w:p>
     <w:p>
@@ -12633,6 +12761,8 @@
       </w:r>
       <w:r>
         <w:tab/>
+      </w:r>
+      <w:r>
         <w:t xml:space="preserve">Voortaan kijk je op het startscherm in het ovaal (4.18), of klik je op de beginpagina op </w:t>
       </w:r>
       <w:r>
@@ -12660,18 +12790,7 @@
     </w:p>
     <w:p>
       <w:r>
-        <w:t xml:space="preserve">Je kunt het ook instellen na een passcan. Heb je nog geen gezichtsherkenning, dan vraagt de tablet "Gezichtsherkenning nog niet ingesteld. Wil je dit?" Met </w:t>
-      </w:r>
-      <w:r>
-        <w:rPr>
-          <w:rFonts w:ascii="Consolas" w:hAnsi="Consolas" w:cs="Consolas"/>
-          <w:sz w:val="18"/>
-          <w:shd w:val="clear" w:color="auto" w:fill="EEF4F2"/>
-        </w:rPr>
-        <w:t>Ja, instellen</w:t>
-      </w:r>
-      <w:r>
-        <w:t xml:space="preserve"> kom je bij stap 2. Met </w:t>
+        <w:t xml:space="preserve">Met </w:t>
       </w:r>
       <w:r>
         <w:rPr>
@@ -12682,7 +12801,52 @@
         <w:t>Nee</w:t>
       </w:r>
       <w:r>
-        <w:t xml:space="preserve"> komt de vraag niet meer terug. Daarna gaat de koelkast (of het productvenster) open.</w:t>
+        <w:t xml:space="preserve"> komt de vraag niet meer terug. Wil je het later toch, open dan met je pas het productvenster en kies de link, of vraag het de beheerder (4.5).</w:t>
+      </w:r>
+    </w:p>
+    <w:p>
+      <w:r>
+        <w:rPr>
+          <w:b/>
+          <w:bCs/>
+        </w:rPr>
+        <w:t>Alleen na de pas of via de beheerder (sinds versie 3.22).</w:t>
+      </w:r>
+      <w:r>
+        <w:t xml:space="preserve"> Iedereen kan op de tablet op de naam van een collega tikken. Kon je daarna een gezicht instellen, dan kon iemand zijn eigen gezicht onder de naam van een collega zetten en op diens naam pakken. Daarom staat na </w:t>
+      </w:r>
+      <w:r>
+        <w:rPr>
+          <w:rFonts w:ascii="Consolas" w:hAnsi="Consolas" w:cs="Consolas"/>
+          <w:sz w:val="18"/>
+          <w:shd w:val="clear" w:color="auto" w:fill="EEF4F2"/>
+        </w:rPr>
+        <w:t>Handmatig zoeken</w:t>
+      </w:r>
+      <w:r>
+        <w:t xml:space="preserve"> en een tik op een naam geen link en geen </w:t>
+      </w:r>
+      <w:r>
+        <w:rPr>
+          <w:rFonts w:ascii="Consolas" w:hAnsi="Consolas" w:cs="Consolas"/>
+          <w:sz w:val="18"/>
+          <w:shd w:val="clear" w:color="auto" w:fill="EEF4F2"/>
+        </w:rPr>
+        <w:t>Uitzetten</w:t>
+      </w:r>
+      <w:r>
+        <w:t xml:space="preserve">, maar alleen "Gezichtsherkenning instellen? Houd je pas tegen de lezer of vraag het de beheerder." Die regel staat er bij iedereen, ook als de collega al een gezicht heeft. </w:t>
+      </w:r>
+      <w:r>
+        <w:rPr>
+          <w:rFonts w:ascii="Consolas" w:hAnsi="Consolas" w:cs="Consolas"/>
+          <w:sz w:val="18"/>
+          <w:shd w:val="clear" w:color="auto" w:fill="EEF4F2"/>
+        </w:rPr>
+        <w:t>Uitzetten</w:t>
+      </w:r>
+      <w:r>
+        <w:t xml:space="preserve"> staat er alleen na herkenning met de pas of de camera. Heb je geen pas, dan stelt de beheerder het voor je in, terwijl je zelf voor de camera staat en zelf het vinkje zet.</w:t>
       </w:r>
     </w:p>
     <w:p>
@@ -12692,7 +12856,29 @@
     </w:p>
     <w:p>
       <w:r>
-        <w:t xml:space="preserve">Er worden geen foto's gemaakt of opgeslagen. De herkenning gebeurt op het apparaat zelf. Sinds versie 3.17 worden alleen de kenmerken van je gezicht (128 getallen) met de datum van instellen op de tablet bewaard, zodat het na herladen blijft werken. Na een jaar verloopt de instelling: de kenmerken worden gewist en bij de volgende passcan vraagt de tablet "Je gezichtsherkenning is verlopen. Opnieuw instellen?" Met </w:t>
+        <w:t>Er worden geen foto's gemaakt of opgeslagen. De herkenning gebeurt op het apparaat zelf. Sinds versie 3.17 worden alleen de kenmerken van je gezicht (128 getallen) met de datum van instellen op de tablet bewaard, zodat het na herladen blijft werken. Sinds versie 3.22 staat er ook het moment van je toestemming bij (</w:t>
+      </w:r>
+      <w:r>
+        <w:rPr>
+          <w:rFonts w:ascii="Consolas" w:hAnsi="Consolas" w:cs="Consolas"/>
+          <w:sz w:val="18"/>
+          <w:shd w:val="clear" w:color="auto" w:fill="EEF4F2"/>
+        </w:rPr>
+        <w:t>consentAt</w:t>
+      </w:r>
+      <w:r>
+        <w:t xml:space="preserve">). Na een jaar verloopt de instelling: de kenmerken worden gewist, de camera herkent je niet meer en bij de volgende passcan vraagt de tablet "Je gezichtsherkenning is verlopen. Opnieuw instellen?" Opnieuw instellen kan alleen na je pas of via de beheerder, met het vinkje dat weer uit staat en dat je zelf opnieuw zet. </w:t>
+      </w:r>
+      <w:r>
+        <w:rPr>
+          <w:rFonts w:ascii="Consolas" w:hAnsi="Consolas" w:cs="Consolas"/>
+          <w:sz w:val="18"/>
+          <w:shd w:val="clear" w:color="auto" w:fill="EEF4F2"/>
+        </w:rPr>
+        <w:t>Nee</w:t>
+      </w:r>
+      <w:r>
+        <w:t xml:space="preserve"> wordt ook dan onthouden. Met </w:t>
       </w:r>
       <w:r>
         <w:rPr>
@@ -12703,7 +12889,7 @@
         <w:t>Uitzetten</w:t>
       </w:r>
       <w:r>
-        <w:t xml:space="preserve"> in het productvenster wist de demo je gezicht direct. Deactiveren, opnieuw activeren of verwijderen van de medewerker en </w:t>
+        <w:t xml:space="preserve"> in het productvenster (na je pas of de camera) wist de demo je gezicht direct. Deactiveren, opnieuw activeren of verwijderen van de medewerker en </w:t>
       </w:r>
       <w:r>
         <w:rPr>
@@ -12714,7 +12900,7 @@
         <w:t>Alle gegevens wissen</w:t>
       </w:r>
       <w:r>
-        <w:t xml:space="preserve"> wissen ook. De kenmerken staan niet in de CSV-export en niet in het logboek (daar staat alleen "Gezichtsherkenning ingesteld", "uitgezet" of "verlopen" met de naam). De bibliotheek en de modellen komen uit het project zelf (</w:t>
+        <w:t xml:space="preserve"> wissen ook. De kenmerken en het moment van toestemming staan niet in de CSV-export en niet in het logboek (daar staat alleen "Gezichtsherkenning ingesteld", "opnieuw ingesteld", "uitgezet" of "verlopen" met de naam, bij de beheerder met "door beheerder" erachter). De bibliotheek en de modellen komen uit het project zelf (</w:t>
       </w:r>
       <w:r>
         <w:rPr>
@@ -12778,7 +12964,7 @@
         <w:keepNext/>
       </w:pPr>
       <w:bookmarkStart w:id="39" w:name="k20"/>
-      <w:bookmarkStart w:id="40" w:name="_Toc243906821"/>
+      <w:bookmarkStart w:id="40" w:name="_Toc243983759"/>
       <w:r>
         <w:t>HERKENNEN MET DE PAS</w:t>
       </w:r>
@@ -12975,7 +13161,7 @@
         <w:keepNext/>
       </w:pPr>
       <w:bookmarkStart w:id="41" w:name="k21"/>
-      <w:bookmarkStart w:id="42" w:name="_Toc243906822"/>
+      <w:bookmarkStart w:id="42" w:name="_Toc243983760"/>
       <w:r>
         <w:t>SLIMME KOELKAST (DEMO)</w:t>
       </w:r>
@@ -13609,7 +13795,7 @@
         <w:keepNext/>
       </w:pPr>
       <w:bookmarkStart w:id="43" w:name="k22"/>
-      <w:bookmarkStart w:id="44" w:name="_Toc243906823"/>
+      <w:bookmarkStart w:id="44" w:name="_Toc243983761"/>
       <w:r>
         <w:t>HET STARTSCHERM EN AUTOMATISCH SCANNEN (DEMO)</w:t>
       </w:r>
@@ -14155,7 +14341,7 @@
         </w:numPr>
       </w:pPr>
       <w:bookmarkStart w:id="45" w:name="k23"/>
-      <w:bookmarkStart w:id="46" w:name="_Toc243906824"/>
+      <w:bookmarkStart w:id="46" w:name="_Toc243983762"/>
       <w:r>
         <w:t xml:space="preserve">UITLEG VAN </w:t>
       </w:r>
@@ -14179,7 +14365,7 @@
         <w:keepNext/>
       </w:pPr>
       <w:bookmarkStart w:id="47" w:name="k24"/>
-      <w:bookmarkStart w:id="48" w:name="_Toc243906825"/>
+      <w:bookmarkStart w:id="48" w:name="_Toc243983763"/>
       <w:r>
         <w:t>METADATA EN EXTERNE BESTANDEN</w:t>
       </w:r>
@@ -14502,7 +14688,7 @@
         <w:keepNext/>
       </w:pPr>
       <w:bookmarkStart w:id="49" w:name="k25"/>
-      <w:bookmarkStart w:id="50" w:name="_Toc243906826"/>
+      <w:bookmarkStart w:id="50" w:name="_Toc243983764"/>
       <w:r>
         <w:t>NAVIGATIEBALK</w:t>
       </w:r>
@@ -14715,7 +14901,7 @@
         <w:keepNext/>
       </w:pPr>
       <w:bookmarkStart w:id="51" w:name="k26"/>
-      <w:bookmarkStart w:id="52" w:name="_Toc243906827"/>
+      <w:bookmarkStart w:id="52" w:name="_Toc243983765"/>
       <w:r>
         <w:t>HERO-GEDEELTE</w:t>
       </w:r>
@@ -14760,7 +14946,7 @@
         <w:keepNext/>
       </w:pPr>
       <w:bookmarkStart w:id="53" w:name="k27"/>
-      <w:bookmarkStart w:id="54" w:name="_Toc243906828"/>
+      <w:bookmarkStart w:id="54" w:name="_Toc243983766"/>
       <w:r>
         <w:t>MEDEWERKERLIJST</w:t>
       </w:r>
@@ -15097,7 +15283,7 @@
         <w:keepNext/>
       </w:pPr>
       <w:bookmarkStart w:id="55" w:name="k28"/>
-      <w:bookmarkStart w:id="56" w:name="_Toc243906829"/>
+      <w:bookmarkStart w:id="56" w:name="_Toc243983767"/>
       <w:r>
         <w:t>STATISTIEKEN</w:t>
       </w:r>
@@ -15180,7 +15366,7 @@
         <w:keepNext/>
       </w:pPr>
       <w:bookmarkStart w:id="57" w:name="k29"/>
-      <w:bookmarkStart w:id="58" w:name="_Toc243906830"/>
+      <w:bookmarkStart w:id="58" w:name="_Toc243983768"/>
       <w:r>
         <w:t>VENSTERS (MODALS)</w:t>
       </w:r>
@@ -15395,7 +15581,37 @@
                 <w:sz w:val="16"/>
                 <w:szCs w:val="16"/>
               </w:rPr>
-              <w:t xml:space="preserve"> (alleen na herkenning met pas of camera), de link voor de demo gezichtsherkenning op een eigen regel, een knopbalk die onderaan in beeld blijft (</w:t>
+              <w:t xml:space="preserve"> (alleen na herkenning met pas of camera), de regel voor de demo gezichtsherkenning (</w:t>
+            </w:r>
+            <w:r>
+              <w:rPr>
+                <w:rFonts w:ascii="Consolas" w:hAnsi="Consolas" w:cs="Consolas"/>
+                <w:sz w:val="14"/>
+                <w:shd w:val="clear" w:color="auto" w:fill="EEF4F2"/>
+              </w:rPr>
+              <w:t>faceEnrollArea</w:t>
+            </w:r>
+            <w:r>
+              <w:rPr>
+                <w:sz w:val="16"/>
+                <w:szCs w:val="16"/>
+              </w:rPr>
+              <w:t xml:space="preserve">, sinds versie 3.22 de link alleen na de pas, </w:t>
+            </w:r>
+            <w:r>
+              <w:rPr>
+                <w:rFonts w:ascii="Consolas" w:hAnsi="Consolas" w:cs="Consolas"/>
+                <w:sz w:val="14"/>
+                <w:shd w:val="clear" w:color="auto" w:fill="EEF4F2"/>
+              </w:rPr>
+              <w:t>Uitzetten</w:t>
+            </w:r>
+            <w:r>
+              <w:rPr>
+                <w:sz w:val="16"/>
+                <w:szCs w:val="16"/>
+              </w:rPr>
+              <w:t xml:space="preserve"> na de pas of de camera en na kiezen op naam alleen de uitleg), een knopbalk die onderaan in beeld blijft (</w:t>
             </w:r>
             <w:r>
               <w:rPr>
@@ -15812,7 +16028,7 @@
         <w:keepNext/>
       </w:pPr>
       <w:bookmarkStart w:id="59" w:name="k30"/>
-      <w:bookmarkStart w:id="60" w:name="_Toc243906831"/>
+      <w:bookmarkStart w:id="60" w:name="_Toc243983769"/>
       <w:r>
         <w:t>STARTSCHERM</w:t>
       </w:r>
@@ -16039,7 +16255,7 @@
         <w:keepNext/>
       </w:pPr>
       <w:bookmarkStart w:id="61" w:name="k31"/>
-      <w:bookmarkStart w:id="62" w:name="_Toc243906832"/>
+      <w:bookmarkStart w:id="62" w:name="_Toc243983770"/>
       <w:r>
         <w:t>WAARSCHUWING BIJ OPENEN ALS LOS BESTAND</w:t>
       </w:r>
@@ -16084,7 +16300,7 @@
         </w:numPr>
       </w:pPr>
       <w:bookmarkStart w:id="63" w:name="k32"/>
-      <w:bookmarkStart w:id="64" w:name="_Toc243906833"/>
+      <w:bookmarkStart w:id="64" w:name="_Toc243983771"/>
       <w:r>
         <w:t>UITLEG VAN DE CSS (</w:t>
       </w:r>
@@ -16108,7 +16324,7 @@
         <w:keepNext/>
       </w:pPr>
       <w:bookmarkStart w:id="65" w:name="k33"/>
-      <w:bookmarkStart w:id="66" w:name="_Toc243906834"/>
+      <w:bookmarkStart w:id="66" w:name="_Toc243983772"/>
       <w:r>
         <w:t>BESTANDEN EN VOLGORDE</w:t>
       </w:r>
@@ -17427,7 +17643,7 @@
         <w:keepNext/>
       </w:pPr>
       <w:bookmarkStart w:id="67" w:name="k34"/>
-      <w:bookmarkStart w:id="68" w:name="_Toc243906835"/>
+      <w:bookmarkStart w:id="68" w:name="_Toc243983773"/>
       <w:r>
         <w:t>CSS-VARIABELEN</w:t>
       </w:r>
@@ -18270,7 +18486,7 @@
         <w:keepNext/>
       </w:pPr>
       <w:bookmarkStart w:id="69" w:name="k35"/>
-      <w:bookmarkStart w:id="70" w:name="_Toc243906836"/>
+      <w:bookmarkStart w:id="70" w:name="_Toc243983774"/>
       <w:r>
         <w:t>LAYOUT</w:t>
       </w:r>
@@ -18979,7 +19195,7 @@
         <w:keepNext/>
       </w:pPr>
       <w:bookmarkStart w:id="71" w:name="k36"/>
-      <w:bookmarkStart w:id="72" w:name="_Toc243906837"/>
+      <w:bookmarkStart w:id="72" w:name="_Toc243983775"/>
       <w:r>
         <w:t>COMPONENTEN</w:t>
       </w:r>
@@ -19224,7 +19440,7 @@
         </w:numPr>
       </w:pPr>
       <w:bookmarkStart w:id="73" w:name="k37"/>
-      <w:bookmarkStart w:id="74" w:name="_Toc243906838"/>
+      <w:bookmarkStart w:id="74" w:name="_Toc243983776"/>
       <w:r>
         <w:t>UITLEG VAN DE JAVASCRIPT (</w:t>
       </w:r>
@@ -19248,7 +19464,7 @@
         <w:keepNext/>
       </w:pPr>
       <w:bookmarkStart w:id="75" w:name="k38"/>
-      <w:bookmarkStart w:id="76" w:name="_Toc243906839"/>
+      <w:bookmarkStart w:id="76" w:name="_Toc243983777"/>
       <w:r>
         <w:t>OPSLAG EN VOORBEELDDATA</w:t>
       </w:r>
@@ -20026,7 +20242,7 @@
         <w:keepNext/>
       </w:pPr>
       <w:bookmarkStart w:id="77" w:name="k39"/>
-      <w:bookmarkStart w:id="78" w:name="_Toc243906840"/>
+      <w:bookmarkStart w:id="78" w:name="_Toc243983778"/>
       <w:r>
         <w:t>OBJECTGEORIËNTEERDE STRUCTUUR</w:t>
       </w:r>
@@ -23865,7 +24081,161 @@
         <w:t>enrollContinuation</w:t>
       </w:r>
       <w:r>
-        <w:t>).</w:t>
+        <w:t xml:space="preserve">). Sinds versie 3.22 bepalen </w:t>
+      </w:r>
+      <w:r>
+        <w:rPr>
+          <w:rFonts w:ascii="Consolas" w:hAnsi="Consolas" w:cs="Consolas"/>
+          <w:sz w:val="18"/>
+          <w:shd w:val="clear" w:color="auto" w:fill="EEF4F2"/>
+        </w:rPr>
+        <w:t>canSelfEnroll</w:t>
+      </w:r>
+      <w:r>
+        <w:t xml:space="preserve"> en </w:t>
+      </w:r>
+      <w:r>
+        <w:rPr>
+          <w:rFonts w:ascii="Consolas" w:hAnsi="Consolas" w:cs="Consolas"/>
+          <w:sz w:val="18"/>
+          <w:shd w:val="clear" w:color="auto" w:fill="EEF4F2"/>
+        </w:rPr>
+        <w:t>canSelfForget</w:t>
+      </w:r>
+      <w:r>
+        <w:t xml:space="preserve"> wie zelf mag instellen (alleen na de pas, </w:t>
+      </w:r>
+      <w:r>
+        <w:rPr>
+          <w:rFonts w:ascii="Consolas" w:hAnsi="Consolas" w:cs="Consolas"/>
+          <w:sz w:val="18"/>
+          <w:shd w:val="clear" w:color="auto" w:fill="EEF4F2"/>
+        </w:rPr>
+        <w:t>recognizedBy</w:t>
+      </w:r>
+      <w:r>
+        <w:t xml:space="preserve"> is "badge") en uitzetten (na de pas of de camera). </w:t>
+      </w:r>
+      <w:r>
+        <w:rPr>
+          <w:rFonts w:ascii="Consolas" w:hAnsi="Consolas" w:cs="Consolas"/>
+          <w:sz w:val="18"/>
+          <w:shd w:val="clear" w:color="auto" w:fill="EEF4F2"/>
+        </w:rPr>
+        <w:t>startFaceEnrollment</w:t>
+      </w:r>
+      <w:r>
+        <w:t xml:space="preserve">, </w:t>
+      </w:r>
+      <w:r>
+        <w:rPr>
+          <w:rFonts w:ascii="Consolas" w:hAnsi="Consolas" w:cs="Consolas"/>
+          <w:sz w:val="18"/>
+          <w:shd w:val="clear" w:color="auto" w:fill="EEF4F2"/>
+        </w:rPr>
+        <w:t>startFaceEnrollmentFor</w:t>
+      </w:r>
+      <w:r>
+        <w:t xml:space="preserve"> (alleen met </w:t>
+      </w:r>
+      <w:r>
+        <w:rPr>
+          <w:rFonts w:ascii="Consolas" w:hAnsi="Consolas" w:cs="Consolas"/>
+          <w:sz w:val="18"/>
+          <w:shd w:val="clear" w:color="auto" w:fill="EEF4F2"/>
+        </w:rPr>
+        <w:t>how</w:t>
+      </w:r>
+      <w:r>
+        <w:t xml:space="preserve"> "badge") en </w:t>
+      </w:r>
+      <w:r>
+        <w:rPr>
+          <w:rFonts w:ascii="Consolas" w:hAnsi="Consolas" w:cs="Consolas"/>
+          <w:sz w:val="18"/>
+          <w:shd w:val="clear" w:color="auto" w:fill="EEF4F2"/>
+        </w:rPr>
+        <w:t>forgetFace</w:t>
+      </w:r>
+      <w:r>
+        <w:t xml:space="preserve"> weigeren anders met een melding, zonder de camera aan te zetten. </w:t>
+      </w:r>
+      <w:r>
+        <w:rPr>
+          <w:rFonts w:ascii="Consolas" w:hAnsi="Consolas" w:cs="Consolas"/>
+          <w:sz w:val="18"/>
+          <w:shd w:val="clear" w:color="auto" w:fill="EEF4F2"/>
+        </w:rPr>
+        <w:t>startAdminFaceEnrollment</w:t>
+      </w:r>
+      <w:r>
+        <w:t xml:space="preserve"> en </w:t>
+      </w:r>
+      <w:r>
+        <w:rPr>
+          <w:rFonts w:ascii="Consolas" w:hAnsi="Consolas" w:cs="Consolas"/>
+          <w:sz w:val="18"/>
+          <w:shd w:val="clear" w:color="auto" w:fill="EEF4F2"/>
+        </w:rPr>
+        <w:t>adminForgetFace</w:t>
+      </w:r>
+      <w:r>
+        <w:t xml:space="preserve"> zijn voor de beheerder in het tabblad Medewerkers (alleen na </w:t>
+      </w:r>
+      <w:r>
+        <w:rPr>
+          <w:rFonts w:ascii="Consolas" w:hAnsi="Consolas" w:cs="Consolas"/>
+          <w:sz w:val="18"/>
+          <w:shd w:val="clear" w:color="auto" w:fill="EEF4F2"/>
+        </w:rPr>
+        <w:t>requireAdmin</w:t>
+      </w:r>
+      <w:r>
+        <w:t xml:space="preserve">), met </w:t>
+      </w:r>
+      <w:r>
+        <w:rPr>
+          <w:rFonts w:ascii="Consolas" w:hAnsi="Consolas" w:cs="Consolas"/>
+          <w:sz w:val="18"/>
+          <w:shd w:val="clear" w:color="auto" w:fill="EEF4F2"/>
+        </w:rPr>
+        <w:t>enrollByAdmin</w:t>
+      </w:r>
+      <w:r>
+        <w:t xml:space="preserve"> zodat het logboek "door beheerder" zegt en het cameravenster bij uitloggen sluit. </w:t>
+      </w:r>
+      <w:r>
+        <w:rPr>
+          <w:rFonts w:ascii="Consolas" w:hAnsi="Consolas" w:cs="Consolas"/>
+          <w:sz w:val="18"/>
+          <w:shd w:val="clear" w:color="auto" w:fill="EEF4F2"/>
+        </w:rPr>
+        <w:t>faceSetupState</w:t>
+      </w:r>
+      <w:r>
+        <w:t xml:space="preserve"> geeft "ready", "noCamera" of "off" terug voor de knop in het beheer. </w:t>
+      </w:r>
+      <w:r>
+        <w:rPr>
+          <w:rFonts w:ascii="Consolas" w:hAnsi="Consolas" w:cs="Consolas"/>
+          <w:sz w:val="18"/>
+          <w:shd w:val="clear" w:color="auto" w:fill="EEF4F2"/>
+        </w:rPr>
+        <w:t>captureEnrollment</w:t>
+      </w:r>
+      <w:r>
+        <w:t xml:space="preserve"> bewaart ook het moment van toestemming (</w:t>
+      </w:r>
+      <w:r>
+        <w:rPr>
+          <w:rFonts w:ascii="Consolas" w:hAnsi="Consolas" w:cs="Consolas"/>
+          <w:sz w:val="18"/>
+          <w:shd w:val="clear" w:color="auto" w:fill="EEF4F2"/>
+        </w:rPr>
+        <w:t>consentAt</w:t>
+      </w:r>
+      <w:r>
+        <w:t>) en zegt na verlopen "Gezichtsherkenning opnieuw ingesteld".</w:t>
       </w:r>
     </w:p>
     <w:p>
@@ -26991,7 +27361,7 @@
         <w:keepNext/>
       </w:pPr>
       <w:bookmarkStart w:id="92" w:name="k53"/>
-      <w:bookmarkStart w:id="93" w:name="_Toc243906841"/>
+      <w:bookmarkStart w:id="93" w:name="_Toc243983779"/>
       <w:r>
         <w:rPr>
           <w:rFonts w:ascii="Consolas" w:hAnsi="Consolas" w:cs="Consolas"/>
@@ -27134,7 +27504,7 @@
         <w:keepNext/>
       </w:pPr>
       <w:bookmarkStart w:id="94" w:name="k54"/>
-      <w:bookmarkStart w:id="95" w:name="_Toc243906842"/>
+      <w:bookmarkStart w:id="95" w:name="_Toc243983780"/>
       <w:r>
         <w:rPr>
           <w:rFonts w:ascii="Consolas" w:hAnsi="Consolas" w:cs="Consolas"/>
@@ -27211,7 +27581,7 @@
         <w:keepNext/>
       </w:pPr>
       <w:bookmarkStart w:id="96" w:name="k55"/>
-      <w:bookmarkStart w:id="97" w:name="_Toc243906843"/>
+      <w:bookmarkStart w:id="97" w:name="_Toc243983781"/>
       <w:r>
         <w:rPr>
           <w:rFonts w:ascii="Consolas" w:hAnsi="Consolas" w:cs="Consolas"/>
@@ -27382,7 +27752,7 @@
         <w:keepNext/>
       </w:pPr>
       <w:bookmarkStart w:id="98" w:name="k56"/>
-      <w:bookmarkStart w:id="99" w:name="_Toc243906844"/>
+      <w:bookmarkStart w:id="99" w:name="_Toc243983782"/>
       <w:r>
         <w:rPr>
           <w:rFonts w:ascii="Consolas" w:hAnsi="Consolas" w:cs="Consolas"/>
@@ -27449,7 +27819,7 @@
         <w:keepNext/>
       </w:pPr>
       <w:bookmarkStart w:id="100" w:name="k57"/>
-      <w:bookmarkStart w:id="101" w:name="_Toc243906845"/>
+      <w:bookmarkStart w:id="101" w:name="_Toc243983783"/>
       <w:r>
         <w:rPr>
           <w:rFonts w:ascii="Consolas" w:hAnsi="Consolas" w:cs="Consolas"/>
@@ -27571,7 +27941,7 @@
         <w:keepNext/>
       </w:pPr>
       <w:bookmarkStart w:id="102" w:name="k58"/>
-      <w:bookmarkStart w:id="103" w:name="_Toc243906846"/>
+      <w:bookmarkStart w:id="103" w:name="_Toc243983784"/>
       <w:r>
         <w:rPr>
           <w:rFonts w:ascii="Consolas" w:hAnsi="Consolas" w:cs="Consolas"/>
@@ -27693,7 +28063,7 @@
         <w:keepNext/>
       </w:pPr>
       <w:bookmarkStart w:id="104" w:name="k59"/>
-      <w:bookmarkStart w:id="105" w:name="_Toc243906847"/>
+      <w:bookmarkStart w:id="105" w:name="_Toc243983785"/>
       <w:r>
         <w:t>OPSLAGFOUTEN EN TERUGDRAAIEN</w:t>
       </w:r>
@@ -27755,7 +28125,7 @@
         <w:keepNext/>
       </w:pPr>
       <w:bookmarkStart w:id="106" w:name="k60"/>
-      <w:bookmarkStart w:id="107" w:name="_Toc243906848"/>
+      <w:bookmarkStart w:id="107" w:name="_Toc243983786"/>
       <w:r>
         <w:t>ADMINFUNCTIES</w:t>
       </w:r>
@@ -28001,7 +28371,7 @@
         <w:keepNext/>
       </w:pPr>
       <w:bookmarkStart w:id="108" w:name="k61"/>
-      <w:bookmarkStart w:id="109" w:name="_Toc243906849"/>
+      <w:bookmarkStart w:id="109" w:name="_Toc243983787"/>
       <w:r>
         <w:t xml:space="preserve">CSV-EXPORT (CLASS </w:t>
       </w:r>
@@ -28409,7 +28779,7 @@
         <w:keepNext/>
       </w:pPr>
       <w:bookmarkStart w:id="110" w:name="k62"/>
-      <w:bookmarkStart w:id="111" w:name="_Toc243906850"/>
+      <w:bookmarkStart w:id="111" w:name="_Toc243983788"/>
       <w:r>
         <w:t>EVENT LISTENERS</w:t>
       </w:r>
@@ -29106,7 +29476,7 @@
         </w:numPr>
       </w:pPr>
       <w:bookmarkStart w:id="112" w:name="k63"/>
-      <w:bookmarkStart w:id="113" w:name="_Toc243906851"/>
+      <w:bookmarkStart w:id="113" w:name="_Toc243983789"/>
       <w:r>
         <w:t>DATAMODEL EN KOPPELINGEN.</w:t>
       </w:r>
@@ -29124,7 +29494,7 @@
         <w:keepNext/>
       </w:pPr>
       <w:bookmarkStart w:id="114" w:name="k64"/>
-      <w:bookmarkStart w:id="115" w:name="_Toc243906852"/>
+      <w:bookmarkStart w:id="115" w:name="_Toc243983790"/>
       <w:r>
         <w:t>BEDRIJVEN</w:t>
       </w:r>
@@ -29335,7 +29705,7 @@
         <w:keepNext/>
       </w:pPr>
       <w:bookmarkStart w:id="116" w:name="k65"/>
-      <w:bookmarkStart w:id="117" w:name="_Toc243906853"/>
+      <w:bookmarkStart w:id="117" w:name="_Toc243983791"/>
       <w:r>
         <w:t>CONSUMPTIEPUNTEN</w:t>
       </w:r>
@@ -29654,7 +30024,7 @@
         <w:keepNext/>
       </w:pPr>
       <w:bookmarkStart w:id="118" w:name="k66"/>
-      <w:bookmarkStart w:id="119" w:name="_Toc243906854"/>
+      <w:bookmarkStart w:id="119" w:name="_Toc243983792"/>
       <w:r>
         <w:t>MEDEWERKERS</w:t>
       </w:r>
@@ -30210,7 +30580,7 @@
         <w:keepNext/>
       </w:pPr>
       <w:bookmarkStart w:id="120" w:name="k67"/>
-      <w:bookmarkStart w:id="121" w:name="_Toc243906855"/>
+      <w:bookmarkStart w:id="121" w:name="_Toc243983793"/>
       <w:r>
         <w:t>REGISTRATIES</w:t>
       </w:r>
@@ -30871,7 +31241,7 @@
         <w:keepNext/>
       </w:pPr>
       <w:bookmarkStart w:id="122" w:name="k68"/>
-      <w:bookmarkStart w:id="123" w:name="_Toc243906856"/>
+      <w:bookmarkStart w:id="123" w:name="_Toc243983794"/>
       <w:r>
         <w:t>SLIMME KOELKAST</w:t>
       </w:r>
@@ -31291,7 +31661,7 @@
         <w:keepNext/>
       </w:pPr>
       <w:bookmarkStart w:id="124" w:name="k69"/>
-      <w:bookmarkStart w:id="125" w:name="_Toc243906857"/>
+      <w:bookmarkStart w:id="125" w:name="_Toc243983795"/>
       <w:r>
         <w:t>DEMO GEZICHTSHERKENNING</w:t>
       </w:r>
@@ -31420,7 +31790,52 @@
                 <w:sz w:val="16"/>
                 <w:szCs w:val="16"/>
               </w:rPr>
-              <w:t>, precies 128 getallen tussen -10 en 10, geen foto) en de datum van instellen (</w:t>
+              <w:t>, precies 128 getallen tussen -10 en 10, geen foto), de datum van instellen (</w:t>
+            </w:r>
+            <w:r>
+              <w:rPr>
+                <w:rFonts w:ascii="Consolas" w:hAnsi="Consolas" w:cs="Consolas"/>
+                <w:sz w:val="14"/>
+                <w:shd w:val="clear" w:color="auto" w:fill="EEF4F2"/>
+              </w:rPr>
+              <w:t>enrolledAt</w:t>
+            </w:r>
+            <w:r>
+              <w:rPr>
+                <w:sz w:val="16"/>
+                <w:szCs w:val="16"/>
+              </w:rPr>
+              <w:t>) en sinds versie 3.22 het moment van toestemming (</w:t>
+            </w:r>
+            <w:r>
+              <w:rPr>
+                <w:rFonts w:ascii="Consolas" w:hAnsi="Consolas" w:cs="Consolas"/>
+                <w:sz w:val="14"/>
+                <w:shd w:val="clear" w:color="auto" w:fill="EEF4F2"/>
+              </w:rPr>
+              <w:t>consentAt</w:t>
+            </w:r>
+            <w:r>
+              <w:rPr>
+                <w:sz w:val="16"/>
+                <w:szCs w:val="16"/>
+              </w:rPr>
+              <w:t xml:space="preserve">, gelijk aan </w:t>
+            </w:r>
+            <w:r>
+              <w:rPr>
+                <w:rFonts w:ascii="Consolas" w:hAnsi="Consolas" w:cs="Consolas"/>
+                <w:sz w:val="14"/>
+                <w:shd w:val="clear" w:color="auto" w:fill="EEF4F2"/>
+              </w:rPr>
+              <w:t>enrolledAt</w:t>
+            </w:r>
+            <w:r>
+              <w:rPr>
+                <w:sz w:val="16"/>
+                <w:szCs w:val="16"/>
+              </w:rPr>
+              <w:t xml:space="preserve">, niet erna, oudere gegevens krijgen bij het laden </w:t>
             </w:r>
             <w:r>
               <w:rPr>
@@ -31589,7 +32004,7 @@
         </w:numPr>
       </w:pPr>
       <w:bookmarkStart w:id="126" w:name="k70"/>
-      <w:bookmarkStart w:id="127" w:name="_Toc243906858"/>
+      <w:bookmarkStart w:id="127" w:name="_Toc243983796"/>
       <w:r>
         <w:t>BELANGRIJKE DEMO-BEPERKINGEN.</w:t>
       </w:r>
@@ -31778,7 +32193,7 @@
         <w:contextualSpacing w:val="0"/>
       </w:pPr>
       <w:r>
-        <w:t>Iedereen bij de tablet kan op de naam van een collega tikken en op diens naam registreren, of in diens productvenster een eigen gezicht instellen (demo). Iedere registratie staat wel met datum en tijd in het beheer en de beheerder kan die corrigeren. In productie is een pas, QR-code of pincode nodig, en een overzicht waarin een medewerker zijn eigen registraties ziet.</w:t>
+        <w:t>Iedereen bij de tablet kan op de naam van een collega tikken en op diens naam registreren. Een eigen gezicht instellen in het productvenster van een collega kan sinds versie 3.22 niet meer (alleen na de pas of via de beheerder). Iedere registratie staat wel met datum en tijd in het beheer en de beheerder kan die corrigeren. In productie is een pas, QR-code of pincode nodig, en een overzicht waarin een medewerker zijn eigen registraties ziet.</w:t>
       </w:r>
     </w:p>
     <w:p>
@@ -32052,7 +32467,7 @@
         </w:numPr>
       </w:pPr>
       <w:bookmarkStart w:id="128" w:name="k71"/>
-      <w:bookmarkStart w:id="129" w:name="_Toc243906859"/>
+      <w:bookmarkStart w:id="129" w:name="_Toc243983797"/>
       <w:r>
         <w:t>CODE UITLEGGEN TIJDENS EEN PRESENTATIE.</w:t>
       </w:r>
@@ -32458,7 +32873,7 @@
         </w:numPr>
       </w:pPr>
       <w:bookmarkStart w:id="130" w:name="k72"/>
-      <w:bookmarkStart w:id="131" w:name="_Toc243906860"/>
+      <w:bookmarkStart w:id="131" w:name="_Toc243983798"/>
       <w:r>
         <w:t>MOGELIJKE VERVOLGSTAPPEN.</w:t>
       </w:r>
@@ -33038,7 +33453,7 @@
         <v:path o:extrusionok="f" gradientshapeok="t" o:connecttype="rect"/>
         <o:lock v:ext="edit" aspectratio="t"/>
       </v:shapetype>
-      <v:shape id="_x0000_i1025" type="#_x0000_t75" style="width:254.25pt;height:219.75pt" o:bullet="t">
+      <v:shape id="_x0000_i1025" type="#_x0000_t75" style="width:254pt;height:219.5pt" o:bullet="t">
         <v:imagedata r:id="rId1" o:title="Bulletpoint"/>
       </v:shape>
     </w:pict>

</xml_diff>

<commit_message>
Screenshots na versie 3.22 opnieuw gemaakt en UC-23 in het use-casediagram
</commit_message>
<xml_diff>
--- a/docs/DOCUMENTATIE.docx
+++ b/docs/DOCUMENTATIE.docx
@@ -82,7 +82,7 @@
           <w:numId w:val="0"/>
         </w:numPr>
       </w:pPr>
-      <w:bookmarkStart w:id="0" w:name="_Toc243983739"/>
+      <w:bookmarkStart w:id="0" w:name="_Toc243985391"/>
       <w:r>
         <w:t>INHOUDSOPGAVE.</w:t>
       </w:r>
@@ -112,7 +112,7 @@
       <w:r>
         <w:fldChar w:fldCharType="separate"/>
       </w:r>
-      <w:hyperlink w:anchor="_Toc243983739" w:history="1">
+      <w:hyperlink w:anchor="_Toc243985391" w:history="1">
         <w:r>
           <w:rPr>
             <w:rStyle w:val="Hyperlink"/>
@@ -139,7 +139,7 @@
             <w:noProof/>
             <w:webHidden/>
           </w:rPr>
-          <w:instrText xml:space="preserve"> PAGEREF _Toc243983739 \h </w:instrText>
+          <w:instrText xml:space="preserve"> PAGEREF _Toc243985391 \h </w:instrText>
         </w:r>
         <w:r>
           <w:rPr>
@@ -186,7 +186,7 @@
           <w:lang w:eastAsia="nl-NL"/>
         </w:rPr>
       </w:pPr>
-      <w:hyperlink w:anchor="_Toc243983740" w:history="1">
+      <w:hyperlink w:anchor="_Toc243985392" w:history="1">
         <w:r>
           <w:rPr>
             <w:rStyle w:val="Hyperlink"/>
@@ -231,7 +231,7 @@
             <w:noProof/>
             <w:webHidden/>
           </w:rPr>
-          <w:instrText xml:space="preserve"> PAGEREF _Toc243983740 \h </w:instrText>
+          <w:instrText xml:space="preserve"> PAGEREF _Toc243985392 \h </w:instrText>
         </w:r>
         <w:r>
           <w:rPr>
@@ -278,7 +278,7 @@
           <w:lang w:eastAsia="nl-NL"/>
         </w:rPr>
       </w:pPr>
-      <w:hyperlink w:anchor="_Toc243983741" w:history="1">
+      <w:hyperlink w:anchor="_Toc243985393" w:history="1">
         <w:r>
           <w:rPr>
             <w:rStyle w:val="Hyperlink"/>
@@ -323,7 +323,7 @@
             <w:noProof/>
             <w:webHidden/>
           </w:rPr>
-          <w:instrText xml:space="preserve"> PAGEREF _Toc243983741 \h </w:instrText>
+          <w:instrText xml:space="preserve"> PAGEREF _Toc243985393 \h </w:instrText>
         </w:r>
         <w:r>
           <w:rPr>
@@ -370,7 +370,7 @@
           <w:lang w:eastAsia="nl-NL"/>
         </w:rPr>
       </w:pPr>
-      <w:hyperlink w:anchor="_Toc243983742" w:history="1">
+      <w:hyperlink w:anchor="_Toc243985394" w:history="1">
         <w:r>
           <w:rPr>
             <w:rStyle w:val="Hyperlink"/>
@@ -415,7 +415,7 @@
             <w:noProof/>
             <w:webHidden/>
           </w:rPr>
-          <w:instrText xml:space="preserve"> PAGEREF _Toc243983742 \h </w:instrText>
+          <w:instrText xml:space="preserve"> PAGEREF _Toc243985394 \h </w:instrText>
         </w:r>
         <w:r>
           <w:rPr>
@@ -462,7 +462,7 @@
           <w:lang w:eastAsia="nl-NL"/>
         </w:rPr>
       </w:pPr>
-      <w:hyperlink w:anchor="_Toc243983743" w:history="1">
+      <w:hyperlink w:anchor="_Toc243985395" w:history="1">
         <w:r>
           <w:rPr>
             <w:rStyle w:val="Hyperlink"/>
@@ -507,7 +507,7 @@
             <w:noProof/>
             <w:webHidden/>
           </w:rPr>
-          <w:instrText xml:space="preserve"> PAGEREF _Toc243983743 \h </w:instrText>
+          <w:instrText xml:space="preserve"> PAGEREF _Toc243985395 \h </w:instrText>
         </w:r>
         <w:r>
           <w:rPr>
@@ -554,7 +554,7 @@
           <w:lang w:eastAsia="nl-NL"/>
         </w:rPr>
       </w:pPr>
-      <w:hyperlink w:anchor="_Toc243983744" w:history="1">
+      <w:hyperlink w:anchor="_Toc243985396" w:history="1">
         <w:r>
           <w:rPr>
             <w:rStyle w:val="Hyperlink"/>
@@ -599,7 +599,7 @@
             <w:noProof/>
             <w:webHidden/>
           </w:rPr>
-          <w:instrText xml:space="preserve"> PAGEREF _Toc243983744 \h </w:instrText>
+          <w:instrText xml:space="preserve"> PAGEREF _Toc243985396 \h </w:instrText>
         </w:r>
         <w:r>
           <w:rPr>
@@ -646,7 +646,7 @@
           <w:lang w:eastAsia="nl-NL"/>
         </w:rPr>
       </w:pPr>
-      <w:hyperlink w:anchor="_Toc243983745" w:history="1">
+      <w:hyperlink w:anchor="_Toc243985397" w:history="1">
         <w:r>
           <w:rPr>
             <w:rStyle w:val="Hyperlink"/>
@@ -691,7 +691,7 @@
             <w:noProof/>
             <w:webHidden/>
           </w:rPr>
-          <w:instrText xml:space="preserve"> PAGEREF _Toc243983745 \h </w:instrText>
+          <w:instrText xml:space="preserve"> PAGEREF _Toc243985397 \h </w:instrText>
         </w:r>
         <w:r>
           <w:rPr>
@@ -738,7 +738,7 @@
           <w:lang w:eastAsia="nl-NL"/>
         </w:rPr>
       </w:pPr>
-      <w:hyperlink w:anchor="_Toc243983746" w:history="1">
+      <w:hyperlink w:anchor="_Toc243985398" w:history="1">
         <w:r>
           <w:rPr>
             <w:rStyle w:val="Hyperlink"/>
@@ -783,7 +783,7 @@
             <w:noProof/>
             <w:webHidden/>
           </w:rPr>
-          <w:instrText xml:space="preserve"> PAGEREF _Toc243983746 \h </w:instrText>
+          <w:instrText xml:space="preserve"> PAGEREF _Toc243985398 \h </w:instrText>
         </w:r>
         <w:r>
           <w:rPr>
@@ -830,7 +830,7 @@
           <w:lang w:eastAsia="nl-NL"/>
         </w:rPr>
       </w:pPr>
-      <w:hyperlink w:anchor="_Toc243983747" w:history="1">
+      <w:hyperlink w:anchor="_Toc243985399" w:history="1">
         <w:r>
           <w:rPr>
             <w:rStyle w:val="Hyperlink"/>
@@ -875,7 +875,7 @@
             <w:noProof/>
             <w:webHidden/>
           </w:rPr>
-          <w:instrText xml:space="preserve"> PAGEREF _Toc243983747 \h </w:instrText>
+          <w:instrText xml:space="preserve"> PAGEREF _Toc243985399 \h </w:instrText>
         </w:r>
         <w:r>
           <w:rPr>
@@ -922,7 +922,7 @@
           <w:lang w:eastAsia="nl-NL"/>
         </w:rPr>
       </w:pPr>
-      <w:hyperlink w:anchor="_Toc243983748" w:history="1">
+      <w:hyperlink w:anchor="_Toc243985400" w:history="1">
         <w:r>
           <w:rPr>
             <w:rStyle w:val="Hyperlink"/>
@@ -967,7 +967,7 @@
             <w:noProof/>
             <w:webHidden/>
           </w:rPr>
-          <w:instrText xml:space="preserve"> PAGEREF _Toc243983748 \h </w:instrText>
+          <w:instrText xml:space="preserve"> PAGEREF _Toc243985400 \h </w:instrText>
         </w:r>
         <w:r>
           <w:rPr>
@@ -1014,7 +1014,7 @@
           <w:lang w:eastAsia="nl-NL"/>
         </w:rPr>
       </w:pPr>
-      <w:hyperlink w:anchor="_Toc243983749" w:history="1">
+      <w:hyperlink w:anchor="_Toc243985401" w:history="1">
         <w:r>
           <w:rPr>
             <w:rStyle w:val="Hyperlink"/>
@@ -1059,7 +1059,7 @@
             <w:noProof/>
             <w:webHidden/>
           </w:rPr>
-          <w:instrText xml:space="preserve"> PAGEREF _Toc243983749 \h </w:instrText>
+          <w:instrText xml:space="preserve"> PAGEREF _Toc243985401 \h </w:instrText>
         </w:r>
         <w:r>
           <w:rPr>
@@ -1106,7 +1106,7 @@
           <w:lang w:eastAsia="nl-NL"/>
         </w:rPr>
       </w:pPr>
-      <w:hyperlink w:anchor="_Toc243983750" w:history="1">
+      <w:hyperlink w:anchor="_Toc243985402" w:history="1">
         <w:r>
           <w:rPr>
             <w:rStyle w:val="Hyperlink"/>
@@ -1151,7 +1151,7 @@
             <w:noProof/>
             <w:webHidden/>
           </w:rPr>
-          <w:instrText xml:space="preserve"> PAGEREF _Toc243983750 \h </w:instrText>
+          <w:instrText xml:space="preserve"> PAGEREF _Toc243985402 \h </w:instrText>
         </w:r>
         <w:r>
           <w:rPr>
@@ -1198,7 +1198,7 @@
           <w:lang w:eastAsia="nl-NL"/>
         </w:rPr>
       </w:pPr>
-      <w:hyperlink w:anchor="_Toc243983751" w:history="1">
+      <w:hyperlink w:anchor="_Toc243985403" w:history="1">
         <w:r>
           <w:rPr>
             <w:rStyle w:val="Hyperlink"/>
@@ -1243,7 +1243,7 @@
             <w:noProof/>
             <w:webHidden/>
           </w:rPr>
-          <w:instrText xml:space="preserve"> PAGEREF _Toc243983751 \h </w:instrText>
+          <w:instrText xml:space="preserve"> PAGEREF _Toc243985403 \h </w:instrText>
         </w:r>
         <w:r>
           <w:rPr>
@@ -1290,7 +1290,7 @@
           <w:lang w:eastAsia="nl-NL"/>
         </w:rPr>
       </w:pPr>
-      <w:hyperlink w:anchor="_Toc243983752" w:history="1">
+      <w:hyperlink w:anchor="_Toc243985404" w:history="1">
         <w:r>
           <w:rPr>
             <w:rStyle w:val="Hyperlink"/>
@@ -1335,7 +1335,7 @@
             <w:noProof/>
             <w:webHidden/>
           </w:rPr>
-          <w:instrText xml:space="preserve"> PAGEREF _Toc243983752 \h </w:instrText>
+          <w:instrText xml:space="preserve"> PAGEREF _Toc243985404 \h </w:instrText>
         </w:r>
         <w:r>
           <w:rPr>
@@ -1382,7 +1382,7 @@
           <w:lang w:eastAsia="nl-NL"/>
         </w:rPr>
       </w:pPr>
-      <w:hyperlink w:anchor="_Toc243983753" w:history="1">
+      <w:hyperlink w:anchor="_Toc243985405" w:history="1">
         <w:r>
           <w:rPr>
             <w:rStyle w:val="Hyperlink"/>
@@ -1427,7 +1427,7 @@
             <w:noProof/>
             <w:webHidden/>
           </w:rPr>
-          <w:instrText xml:space="preserve"> PAGEREF _Toc243983753 \h </w:instrText>
+          <w:instrText xml:space="preserve"> PAGEREF _Toc243985405 \h </w:instrText>
         </w:r>
         <w:r>
           <w:rPr>
@@ -1474,7 +1474,7 @@
           <w:lang w:eastAsia="nl-NL"/>
         </w:rPr>
       </w:pPr>
-      <w:hyperlink w:anchor="_Toc243983754" w:history="1">
+      <w:hyperlink w:anchor="_Toc243985406" w:history="1">
         <w:r>
           <w:rPr>
             <w:rStyle w:val="Hyperlink"/>
@@ -1519,7 +1519,7 @@
             <w:noProof/>
             <w:webHidden/>
           </w:rPr>
-          <w:instrText xml:space="preserve"> PAGEREF _Toc243983754 \h </w:instrText>
+          <w:instrText xml:space="preserve"> PAGEREF _Toc243985406 \h </w:instrText>
         </w:r>
         <w:r>
           <w:rPr>
@@ -1566,7 +1566,7 @@
           <w:lang w:eastAsia="nl-NL"/>
         </w:rPr>
       </w:pPr>
-      <w:hyperlink w:anchor="_Toc243983755" w:history="1">
+      <w:hyperlink w:anchor="_Toc243985407" w:history="1">
         <w:r>
           <w:rPr>
             <w:rStyle w:val="Hyperlink"/>
@@ -1611,7 +1611,7 @@
             <w:noProof/>
             <w:webHidden/>
           </w:rPr>
-          <w:instrText xml:space="preserve"> PAGEREF _Toc243983755 \h </w:instrText>
+          <w:instrText xml:space="preserve"> PAGEREF _Toc243985407 \h </w:instrText>
         </w:r>
         <w:r>
           <w:rPr>
@@ -1658,7 +1658,7 @@
           <w:lang w:eastAsia="nl-NL"/>
         </w:rPr>
       </w:pPr>
-      <w:hyperlink w:anchor="_Toc243983756" w:history="1">
+      <w:hyperlink w:anchor="_Toc243985408" w:history="1">
         <w:r>
           <w:rPr>
             <w:rStyle w:val="Hyperlink"/>
@@ -1703,7 +1703,7 @@
             <w:noProof/>
             <w:webHidden/>
           </w:rPr>
-          <w:instrText xml:space="preserve"> PAGEREF _Toc243983756 \h </w:instrText>
+          <w:instrText xml:space="preserve"> PAGEREF _Toc243985408 \h </w:instrText>
         </w:r>
         <w:r>
           <w:rPr>
@@ -1750,7 +1750,7 @@
           <w:lang w:eastAsia="nl-NL"/>
         </w:rPr>
       </w:pPr>
-      <w:hyperlink w:anchor="_Toc243983757" w:history="1">
+      <w:hyperlink w:anchor="_Toc243985409" w:history="1">
         <w:r>
           <w:rPr>
             <w:rStyle w:val="Hyperlink"/>
@@ -1795,7 +1795,7 @@
             <w:noProof/>
             <w:webHidden/>
           </w:rPr>
-          <w:instrText xml:space="preserve"> PAGEREF _Toc243983757 \h </w:instrText>
+          <w:instrText xml:space="preserve"> PAGEREF _Toc243985409 \h </w:instrText>
         </w:r>
         <w:r>
           <w:rPr>
@@ -1842,7 +1842,7 @@
           <w:lang w:eastAsia="nl-NL"/>
         </w:rPr>
       </w:pPr>
-      <w:hyperlink w:anchor="_Toc243983758" w:history="1">
+      <w:hyperlink w:anchor="_Toc243985410" w:history="1">
         <w:r>
           <w:rPr>
             <w:rStyle w:val="Hyperlink"/>
@@ -1887,7 +1887,7 @@
             <w:noProof/>
             <w:webHidden/>
           </w:rPr>
-          <w:instrText xml:space="preserve"> PAGEREF _Toc243983758 \h </w:instrText>
+          <w:instrText xml:space="preserve"> PAGEREF _Toc243985410 \h </w:instrText>
         </w:r>
         <w:r>
           <w:rPr>
@@ -1934,7 +1934,7 @@
           <w:lang w:eastAsia="nl-NL"/>
         </w:rPr>
       </w:pPr>
-      <w:hyperlink w:anchor="_Toc243983759" w:history="1">
+      <w:hyperlink w:anchor="_Toc243985411" w:history="1">
         <w:r>
           <w:rPr>
             <w:rStyle w:val="Hyperlink"/>
@@ -1979,7 +1979,7 @@
             <w:noProof/>
             <w:webHidden/>
           </w:rPr>
-          <w:instrText xml:space="preserve"> PAGEREF _Toc243983759 \h </w:instrText>
+          <w:instrText xml:space="preserve"> PAGEREF _Toc243985411 \h </w:instrText>
         </w:r>
         <w:r>
           <w:rPr>
@@ -2026,7 +2026,7 @@
           <w:lang w:eastAsia="nl-NL"/>
         </w:rPr>
       </w:pPr>
-      <w:hyperlink w:anchor="_Toc243983760" w:history="1">
+      <w:hyperlink w:anchor="_Toc243985412" w:history="1">
         <w:r>
           <w:rPr>
             <w:rStyle w:val="Hyperlink"/>
@@ -2071,7 +2071,7 @@
             <w:noProof/>
             <w:webHidden/>
           </w:rPr>
-          <w:instrText xml:space="preserve"> PAGEREF _Toc243983760 \h </w:instrText>
+          <w:instrText xml:space="preserve"> PAGEREF _Toc243985412 \h </w:instrText>
         </w:r>
         <w:r>
           <w:rPr>
@@ -2118,7 +2118,7 @@
           <w:lang w:eastAsia="nl-NL"/>
         </w:rPr>
       </w:pPr>
-      <w:hyperlink w:anchor="_Toc243983761" w:history="1">
+      <w:hyperlink w:anchor="_Toc243985413" w:history="1">
         <w:r>
           <w:rPr>
             <w:rStyle w:val="Hyperlink"/>
@@ -2163,7 +2163,7 @@
             <w:noProof/>
             <w:webHidden/>
           </w:rPr>
-          <w:instrText xml:space="preserve"> PAGEREF _Toc243983761 \h </w:instrText>
+          <w:instrText xml:space="preserve"> PAGEREF _Toc243985413 \h </w:instrText>
         </w:r>
         <w:r>
           <w:rPr>
@@ -2210,7 +2210,7 @@
           <w:lang w:eastAsia="nl-NL"/>
         </w:rPr>
       </w:pPr>
-      <w:hyperlink w:anchor="_Toc243983762" w:history="1">
+      <w:hyperlink w:anchor="_Toc243985414" w:history="1">
         <w:r>
           <w:rPr>
             <w:rStyle w:val="Hyperlink"/>
@@ -2271,7 +2271,7 @@
             <w:noProof/>
             <w:webHidden/>
           </w:rPr>
-          <w:instrText xml:space="preserve"> PAGEREF _Toc243983762 \h </w:instrText>
+          <w:instrText xml:space="preserve"> PAGEREF _Toc243985414 \h </w:instrText>
         </w:r>
         <w:r>
           <w:rPr>
@@ -2318,7 +2318,7 @@
           <w:lang w:eastAsia="nl-NL"/>
         </w:rPr>
       </w:pPr>
-      <w:hyperlink w:anchor="_Toc243983763" w:history="1">
+      <w:hyperlink w:anchor="_Toc243985415" w:history="1">
         <w:r>
           <w:rPr>
             <w:rStyle w:val="Hyperlink"/>
@@ -2363,7 +2363,7 @@
             <w:noProof/>
             <w:webHidden/>
           </w:rPr>
-          <w:instrText xml:space="preserve"> PAGEREF _Toc243983763 \h </w:instrText>
+          <w:instrText xml:space="preserve"> PAGEREF _Toc243985415 \h </w:instrText>
         </w:r>
         <w:r>
           <w:rPr>
@@ -2410,7 +2410,7 @@
           <w:lang w:eastAsia="nl-NL"/>
         </w:rPr>
       </w:pPr>
-      <w:hyperlink w:anchor="_Toc243983764" w:history="1">
+      <w:hyperlink w:anchor="_Toc243985416" w:history="1">
         <w:r>
           <w:rPr>
             <w:rStyle w:val="Hyperlink"/>
@@ -2455,7 +2455,7 @@
             <w:noProof/>
             <w:webHidden/>
           </w:rPr>
-          <w:instrText xml:space="preserve"> PAGEREF _Toc243983764 \h </w:instrText>
+          <w:instrText xml:space="preserve"> PAGEREF _Toc243985416 \h </w:instrText>
         </w:r>
         <w:r>
           <w:rPr>
@@ -2502,7 +2502,7 @@
           <w:lang w:eastAsia="nl-NL"/>
         </w:rPr>
       </w:pPr>
-      <w:hyperlink w:anchor="_Toc243983765" w:history="1">
+      <w:hyperlink w:anchor="_Toc243985417" w:history="1">
         <w:r>
           <w:rPr>
             <w:rStyle w:val="Hyperlink"/>
@@ -2547,7 +2547,7 @@
             <w:noProof/>
             <w:webHidden/>
           </w:rPr>
-          <w:instrText xml:space="preserve"> PAGEREF _Toc243983765 \h </w:instrText>
+          <w:instrText xml:space="preserve"> PAGEREF _Toc243985417 \h </w:instrText>
         </w:r>
         <w:r>
           <w:rPr>
@@ -2594,7 +2594,7 @@
           <w:lang w:eastAsia="nl-NL"/>
         </w:rPr>
       </w:pPr>
-      <w:hyperlink w:anchor="_Toc243983766" w:history="1">
+      <w:hyperlink w:anchor="_Toc243985418" w:history="1">
         <w:r>
           <w:rPr>
             <w:rStyle w:val="Hyperlink"/>
@@ -2639,7 +2639,7 @@
             <w:noProof/>
             <w:webHidden/>
           </w:rPr>
-          <w:instrText xml:space="preserve"> PAGEREF _Toc243983766 \h </w:instrText>
+          <w:instrText xml:space="preserve"> PAGEREF _Toc243985418 \h </w:instrText>
         </w:r>
         <w:r>
           <w:rPr>
@@ -2686,7 +2686,7 @@
           <w:lang w:eastAsia="nl-NL"/>
         </w:rPr>
       </w:pPr>
-      <w:hyperlink w:anchor="_Toc243983767" w:history="1">
+      <w:hyperlink w:anchor="_Toc243985419" w:history="1">
         <w:r>
           <w:rPr>
             <w:rStyle w:val="Hyperlink"/>
@@ -2731,7 +2731,7 @@
             <w:noProof/>
             <w:webHidden/>
           </w:rPr>
-          <w:instrText xml:space="preserve"> PAGEREF _Toc243983767 \h </w:instrText>
+          <w:instrText xml:space="preserve"> PAGEREF _Toc243985419 \h </w:instrText>
         </w:r>
         <w:r>
           <w:rPr>
@@ -2778,7 +2778,7 @@
           <w:lang w:eastAsia="nl-NL"/>
         </w:rPr>
       </w:pPr>
-      <w:hyperlink w:anchor="_Toc243983768" w:history="1">
+      <w:hyperlink w:anchor="_Toc243985420" w:history="1">
         <w:r>
           <w:rPr>
             <w:rStyle w:val="Hyperlink"/>
@@ -2823,7 +2823,7 @@
             <w:noProof/>
             <w:webHidden/>
           </w:rPr>
-          <w:instrText xml:space="preserve"> PAGEREF _Toc243983768 \h </w:instrText>
+          <w:instrText xml:space="preserve"> PAGEREF _Toc243985420 \h </w:instrText>
         </w:r>
         <w:r>
           <w:rPr>
@@ -2870,7 +2870,7 @@
           <w:lang w:eastAsia="nl-NL"/>
         </w:rPr>
       </w:pPr>
-      <w:hyperlink w:anchor="_Toc243983769" w:history="1">
+      <w:hyperlink w:anchor="_Toc243985421" w:history="1">
         <w:r>
           <w:rPr>
             <w:rStyle w:val="Hyperlink"/>
@@ -2915,7 +2915,7 @@
             <w:noProof/>
             <w:webHidden/>
           </w:rPr>
-          <w:instrText xml:space="preserve"> PAGEREF _Toc243983769 \h </w:instrText>
+          <w:instrText xml:space="preserve"> PAGEREF _Toc243985421 \h </w:instrText>
         </w:r>
         <w:r>
           <w:rPr>
@@ -2962,7 +2962,7 @@
           <w:lang w:eastAsia="nl-NL"/>
         </w:rPr>
       </w:pPr>
-      <w:hyperlink w:anchor="_Toc243983770" w:history="1">
+      <w:hyperlink w:anchor="_Toc243985422" w:history="1">
         <w:r>
           <w:rPr>
             <w:rStyle w:val="Hyperlink"/>
@@ -3007,7 +3007,7 @@
             <w:noProof/>
             <w:webHidden/>
           </w:rPr>
-          <w:instrText xml:space="preserve"> PAGEREF _Toc243983770 \h </w:instrText>
+          <w:instrText xml:space="preserve"> PAGEREF _Toc243985422 \h </w:instrText>
         </w:r>
         <w:r>
           <w:rPr>
@@ -3054,7 +3054,7 @@
           <w:lang w:eastAsia="nl-NL"/>
         </w:rPr>
       </w:pPr>
-      <w:hyperlink w:anchor="_Toc243983771" w:history="1">
+      <w:hyperlink w:anchor="_Toc243985423" w:history="1">
         <w:r>
           <w:rPr>
             <w:rStyle w:val="Hyperlink"/>
@@ -3115,7 +3115,7 @@
             <w:noProof/>
             <w:webHidden/>
           </w:rPr>
-          <w:instrText xml:space="preserve"> PAGEREF _Toc243983771 \h </w:instrText>
+          <w:instrText xml:space="preserve"> PAGEREF _Toc243985423 \h </w:instrText>
         </w:r>
         <w:r>
           <w:rPr>
@@ -3162,7 +3162,7 @@
           <w:lang w:eastAsia="nl-NL"/>
         </w:rPr>
       </w:pPr>
-      <w:hyperlink w:anchor="_Toc243983772" w:history="1">
+      <w:hyperlink w:anchor="_Toc243985424" w:history="1">
         <w:r>
           <w:rPr>
             <w:rStyle w:val="Hyperlink"/>
@@ -3207,7 +3207,7 @@
             <w:noProof/>
             <w:webHidden/>
           </w:rPr>
-          <w:instrText xml:space="preserve"> PAGEREF _Toc243983772 \h </w:instrText>
+          <w:instrText xml:space="preserve"> PAGEREF _Toc243985424 \h </w:instrText>
         </w:r>
         <w:r>
           <w:rPr>
@@ -3254,7 +3254,7 @@
           <w:lang w:eastAsia="nl-NL"/>
         </w:rPr>
       </w:pPr>
-      <w:hyperlink w:anchor="_Toc243983773" w:history="1">
+      <w:hyperlink w:anchor="_Toc243985425" w:history="1">
         <w:r>
           <w:rPr>
             <w:rStyle w:val="Hyperlink"/>
@@ -3299,7 +3299,7 @@
             <w:noProof/>
             <w:webHidden/>
           </w:rPr>
-          <w:instrText xml:space="preserve"> PAGEREF _Toc243983773 \h </w:instrText>
+          <w:instrText xml:space="preserve"> PAGEREF _Toc243985425 \h </w:instrText>
         </w:r>
         <w:r>
           <w:rPr>
@@ -3346,7 +3346,7 @@
           <w:lang w:eastAsia="nl-NL"/>
         </w:rPr>
       </w:pPr>
-      <w:hyperlink w:anchor="_Toc243983774" w:history="1">
+      <w:hyperlink w:anchor="_Toc243985426" w:history="1">
         <w:r>
           <w:rPr>
             <w:rStyle w:val="Hyperlink"/>
@@ -3391,7 +3391,7 @@
             <w:noProof/>
             <w:webHidden/>
           </w:rPr>
-          <w:instrText xml:space="preserve"> PAGEREF _Toc243983774 \h </w:instrText>
+          <w:instrText xml:space="preserve"> PAGEREF _Toc243985426 \h </w:instrText>
         </w:r>
         <w:r>
           <w:rPr>
@@ -3438,7 +3438,7 @@
           <w:lang w:eastAsia="nl-NL"/>
         </w:rPr>
       </w:pPr>
-      <w:hyperlink w:anchor="_Toc243983775" w:history="1">
+      <w:hyperlink w:anchor="_Toc243985427" w:history="1">
         <w:r>
           <w:rPr>
             <w:rStyle w:val="Hyperlink"/>
@@ -3483,7 +3483,7 @@
             <w:noProof/>
             <w:webHidden/>
           </w:rPr>
-          <w:instrText xml:space="preserve"> PAGEREF _Toc243983775 \h </w:instrText>
+          <w:instrText xml:space="preserve"> PAGEREF _Toc243985427 \h </w:instrText>
         </w:r>
         <w:r>
           <w:rPr>
@@ -3530,7 +3530,7 @@
           <w:lang w:eastAsia="nl-NL"/>
         </w:rPr>
       </w:pPr>
-      <w:hyperlink w:anchor="_Toc243983776" w:history="1">
+      <w:hyperlink w:anchor="_Toc243985428" w:history="1">
         <w:r>
           <w:rPr>
             <w:rStyle w:val="Hyperlink"/>
@@ -3591,7 +3591,7 @@
             <w:noProof/>
             <w:webHidden/>
           </w:rPr>
-          <w:instrText xml:space="preserve"> PAGEREF _Toc243983776 \h </w:instrText>
+          <w:instrText xml:space="preserve"> PAGEREF _Toc243985428 \h </w:instrText>
         </w:r>
         <w:r>
           <w:rPr>
@@ -3638,7 +3638,7 @@
           <w:lang w:eastAsia="nl-NL"/>
         </w:rPr>
       </w:pPr>
-      <w:hyperlink w:anchor="_Toc243983777" w:history="1">
+      <w:hyperlink w:anchor="_Toc243985429" w:history="1">
         <w:r>
           <w:rPr>
             <w:rStyle w:val="Hyperlink"/>
@@ -3683,7 +3683,7 @@
             <w:noProof/>
             <w:webHidden/>
           </w:rPr>
-          <w:instrText xml:space="preserve"> PAGEREF _Toc243983777 \h </w:instrText>
+          <w:instrText xml:space="preserve"> PAGEREF _Toc243985429 \h </w:instrText>
         </w:r>
         <w:r>
           <w:rPr>
@@ -3730,7 +3730,7 @@
           <w:lang w:eastAsia="nl-NL"/>
         </w:rPr>
       </w:pPr>
-      <w:hyperlink w:anchor="_Toc243983778" w:history="1">
+      <w:hyperlink w:anchor="_Toc243985430" w:history="1">
         <w:r>
           <w:rPr>
             <w:rStyle w:val="Hyperlink"/>
@@ -3775,7 +3775,7 @@
             <w:noProof/>
             <w:webHidden/>
           </w:rPr>
-          <w:instrText xml:space="preserve"> PAGEREF _Toc243983778 \h </w:instrText>
+          <w:instrText xml:space="preserve"> PAGEREF _Toc243985430 \h </w:instrText>
         </w:r>
         <w:r>
           <w:rPr>
@@ -3822,7 +3822,7 @@
           <w:lang w:eastAsia="nl-NL"/>
         </w:rPr>
       </w:pPr>
-      <w:hyperlink w:anchor="_Toc243983779" w:history="1">
+      <w:hyperlink w:anchor="_Toc243985431" w:history="1">
         <w:r>
           <w:rPr>
             <w:rStyle w:val="Hyperlink"/>
@@ -3869,7 +3869,7 @@
             <w:noProof/>
             <w:webHidden/>
           </w:rPr>
-          <w:instrText xml:space="preserve"> PAGEREF _Toc243983779 \h </w:instrText>
+          <w:instrText xml:space="preserve"> PAGEREF _Toc243985431 \h </w:instrText>
         </w:r>
         <w:r>
           <w:rPr>
@@ -3916,7 +3916,7 @@
           <w:lang w:eastAsia="nl-NL"/>
         </w:rPr>
       </w:pPr>
-      <w:hyperlink w:anchor="_Toc243983780" w:history="1">
+      <w:hyperlink w:anchor="_Toc243985432" w:history="1">
         <w:r>
           <w:rPr>
             <w:rStyle w:val="Hyperlink"/>
@@ -3963,7 +3963,7 @@
             <w:noProof/>
             <w:webHidden/>
           </w:rPr>
-          <w:instrText xml:space="preserve"> PAGEREF _Toc243983780 \h </w:instrText>
+          <w:instrText xml:space="preserve"> PAGEREF _Toc243985432 \h </w:instrText>
         </w:r>
         <w:r>
           <w:rPr>
@@ -4010,7 +4010,7 @@
           <w:lang w:eastAsia="nl-NL"/>
         </w:rPr>
       </w:pPr>
-      <w:hyperlink w:anchor="_Toc243983781" w:history="1">
+      <w:hyperlink w:anchor="_Toc243985433" w:history="1">
         <w:r>
           <w:rPr>
             <w:rStyle w:val="Hyperlink"/>
@@ -4057,7 +4057,7 @@
             <w:noProof/>
             <w:webHidden/>
           </w:rPr>
-          <w:instrText xml:space="preserve"> PAGEREF _Toc243983781 \h </w:instrText>
+          <w:instrText xml:space="preserve"> PAGEREF _Toc243985433 \h </w:instrText>
         </w:r>
         <w:r>
           <w:rPr>
@@ -4104,7 +4104,7 @@
           <w:lang w:eastAsia="nl-NL"/>
         </w:rPr>
       </w:pPr>
-      <w:hyperlink w:anchor="_Toc243983782" w:history="1">
+      <w:hyperlink w:anchor="_Toc243985434" w:history="1">
         <w:r>
           <w:rPr>
             <w:rStyle w:val="Hyperlink"/>
@@ -4151,7 +4151,7 @@
             <w:noProof/>
             <w:webHidden/>
           </w:rPr>
-          <w:instrText xml:space="preserve"> PAGEREF _Toc243983782 \h </w:instrText>
+          <w:instrText xml:space="preserve"> PAGEREF _Toc243985434 \h </w:instrText>
         </w:r>
         <w:r>
           <w:rPr>
@@ -4198,7 +4198,7 @@
           <w:lang w:eastAsia="nl-NL"/>
         </w:rPr>
       </w:pPr>
-      <w:hyperlink w:anchor="_Toc243983783" w:history="1">
+      <w:hyperlink w:anchor="_Toc243985435" w:history="1">
         <w:r>
           <w:rPr>
             <w:rStyle w:val="Hyperlink"/>
@@ -4245,7 +4245,7 @@
             <w:noProof/>
             <w:webHidden/>
           </w:rPr>
-          <w:instrText xml:space="preserve"> PAGEREF _Toc243983783 \h </w:instrText>
+          <w:instrText xml:space="preserve"> PAGEREF _Toc243985435 \h </w:instrText>
         </w:r>
         <w:r>
           <w:rPr>
@@ -4292,7 +4292,7 @@
           <w:lang w:eastAsia="nl-NL"/>
         </w:rPr>
       </w:pPr>
-      <w:hyperlink w:anchor="_Toc243983784" w:history="1">
+      <w:hyperlink w:anchor="_Toc243985436" w:history="1">
         <w:r>
           <w:rPr>
             <w:rStyle w:val="Hyperlink"/>
@@ -4339,7 +4339,7 @@
             <w:noProof/>
             <w:webHidden/>
           </w:rPr>
-          <w:instrText xml:space="preserve"> PAGEREF _Toc243983784 \h </w:instrText>
+          <w:instrText xml:space="preserve"> PAGEREF _Toc243985436 \h </w:instrText>
         </w:r>
         <w:r>
           <w:rPr>
@@ -4386,7 +4386,7 @@
           <w:lang w:eastAsia="nl-NL"/>
         </w:rPr>
       </w:pPr>
-      <w:hyperlink w:anchor="_Toc243983785" w:history="1">
+      <w:hyperlink w:anchor="_Toc243985437" w:history="1">
         <w:r>
           <w:rPr>
             <w:rStyle w:val="Hyperlink"/>
@@ -4431,7 +4431,7 @@
             <w:noProof/>
             <w:webHidden/>
           </w:rPr>
-          <w:instrText xml:space="preserve"> PAGEREF _Toc243983785 \h </w:instrText>
+          <w:instrText xml:space="preserve"> PAGEREF _Toc243985437 \h </w:instrText>
         </w:r>
         <w:r>
           <w:rPr>
@@ -4478,7 +4478,7 @@
           <w:lang w:eastAsia="nl-NL"/>
         </w:rPr>
       </w:pPr>
-      <w:hyperlink w:anchor="_Toc243983786" w:history="1">
+      <w:hyperlink w:anchor="_Toc243985438" w:history="1">
         <w:r>
           <w:rPr>
             <w:rStyle w:val="Hyperlink"/>
@@ -4523,7 +4523,7 @@
             <w:noProof/>
             <w:webHidden/>
           </w:rPr>
-          <w:instrText xml:space="preserve"> PAGEREF _Toc243983786 \h </w:instrText>
+          <w:instrText xml:space="preserve"> PAGEREF _Toc243985438 \h </w:instrText>
         </w:r>
         <w:r>
           <w:rPr>
@@ -4570,7 +4570,7 @@
           <w:lang w:eastAsia="nl-NL"/>
         </w:rPr>
       </w:pPr>
-      <w:hyperlink w:anchor="_Toc243983787" w:history="1">
+      <w:hyperlink w:anchor="_Toc243985439" w:history="1">
         <w:r>
           <w:rPr>
             <w:rStyle w:val="Hyperlink"/>
@@ -4647,7 +4647,7 @@
             <w:noProof/>
             <w:webHidden/>
           </w:rPr>
-          <w:instrText xml:space="preserve"> PAGEREF _Toc243983787 \h </w:instrText>
+          <w:instrText xml:space="preserve"> PAGEREF _Toc243985439 \h </w:instrText>
         </w:r>
         <w:r>
           <w:rPr>
@@ -4694,7 +4694,7 @@
           <w:lang w:eastAsia="nl-NL"/>
         </w:rPr>
       </w:pPr>
-      <w:hyperlink w:anchor="_Toc243983788" w:history="1">
+      <w:hyperlink w:anchor="_Toc243985440" w:history="1">
         <w:r>
           <w:rPr>
             <w:rStyle w:val="Hyperlink"/>
@@ -4739,7 +4739,7 @@
             <w:noProof/>
             <w:webHidden/>
           </w:rPr>
-          <w:instrText xml:space="preserve"> PAGEREF _Toc243983788 \h </w:instrText>
+          <w:instrText xml:space="preserve"> PAGEREF _Toc243985440 \h </w:instrText>
         </w:r>
         <w:r>
           <w:rPr>
@@ -4786,7 +4786,7 @@
           <w:lang w:eastAsia="nl-NL"/>
         </w:rPr>
       </w:pPr>
-      <w:hyperlink w:anchor="_Toc243983789" w:history="1">
+      <w:hyperlink w:anchor="_Toc243985441" w:history="1">
         <w:r>
           <w:rPr>
             <w:rStyle w:val="Hyperlink"/>
@@ -4831,7 +4831,7 @@
             <w:noProof/>
             <w:webHidden/>
           </w:rPr>
-          <w:instrText xml:space="preserve"> PAGEREF _Toc243983789 \h </w:instrText>
+          <w:instrText xml:space="preserve"> PAGEREF _Toc243985441 \h </w:instrText>
         </w:r>
         <w:r>
           <w:rPr>
@@ -4878,7 +4878,7 @@
           <w:lang w:eastAsia="nl-NL"/>
         </w:rPr>
       </w:pPr>
-      <w:hyperlink w:anchor="_Toc243983790" w:history="1">
+      <w:hyperlink w:anchor="_Toc243985442" w:history="1">
         <w:r>
           <w:rPr>
             <w:rStyle w:val="Hyperlink"/>
@@ -4923,7 +4923,7 @@
             <w:noProof/>
             <w:webHidden/>
           </w:rPr>
-          <w:instrText xml:space="preserve"> PAGEREF _Toc243983790 \h </w:instrText>
+          <w:instrText xml:space="preserve"> PAGEREF _Toc243985442 \h </w:instrText>
         </w:r>
         <w:r>
           <w:rPr>
@@ -4970,7 +4970,7 @@
           <w:lang w:eastAsia="nl-NL"/>
         </w:rPr>
       </w:pPr>
-      <w:hyperlink w:anchor="_Toc243983791" w:history="1">
+      <w:hyperlink w:anchor="_Toc243985443" w:history="1">
         <w:r>
           <w:rPr>
             <w:rStyle w:val="Hyperlink"/>
@@ -5015,7 +5015,7 @@
             <w:noProof/>
             <w:webHidden/>
           </w:rPr>
-          <w:instrText xml:space="preserve"> PAGEREF _Toc243983791 \h </w:instrText>
+          <w:instrText xml:space="preserve"> PAGEREF _Toc243985443 \h </w:instrText>
         </w:r>
         <w:r>
           <w:rPr>
@@ -5062,7 +5062,7 @@
           <w:lang w:eastAsia="nl-NL"/>
         </w:rPr>
       </w:pPr>
-      <w:hyperlink w:anchor="_Toc243983792" w:history="1">
+      <w:hyperlink w:anchor="_Toc243985444" w:history="1">
         <w:r>
           <w:rPr>
             <w:rStyle w:val="Hyperlink"/>
@@ -5107,7 +5107,7 @@
             <w:noProof/>
             <w:webHidden/>
           </w:rPr>
-          <w:instrText xml:space="preserve"> PAGEREF _Toc243983792 \h </w:instrText>
+          <w:instrText xml:space="preserve"> PAGEREF _Toc243985444 \h </w:instrText>
         </w:r>
         <w:r>
           <w:rPr>
@@ -5154,7 +5154,7 @@
           <w:lang w:eastAsia="nl-NL"/>
         </w:rPr>
       </w:pPr>
-      <w:hyperlink w:anchor="_Toc243983793" w:history="1">
+      <w:hyperlink w:anchor="_Toc243985445" w:history="1">
         <w:r>
           <w:rPr>
             <w:rStyle w:val="Hyperlink"/>
@@ -5199,7 +5199,7 @@
             <w:noProof/>
             <w:webHidden/>
           </w:rPr>
-          <w:instrText xml:space="preserve"> PAGEREF _Toc243983793 \h </w:instrText>
+          <w:instrText xml:space="preserve"> PAGEREF _Toc243985445 \h </w:instrText>
         </w:r>
         <w:r>
           <w:rPr>
@@ -5246,7 +5246,7 @@
           <w:lang w:eastAsia="nl-NL"/>
         </w:rPr>
       </w:pPr>
-      <w:hyperlink w:anchor="_Toc243983794" w:history="1">
+      <w:hyperlink w:anchor="_Toc243985446" w:history="1">
         <w:r>
           <w:rPr>
             <w:rStyle w:val="Hyperlink"/>
@@ -5291,7 +5291,7 @@
             <w:noProof/>
             <w:webHidden/>
           </w:rPr>
-          <w:instrText xml:space="preserve"> PAGEREF _Toc243983794 \h </w:instrText>
+          <w:instrText xml:space="preserve"> PAGEREF _Toc243985446 \h </w:instrText>
         </w:r>
         <w:r>
           <w:rPr>
@@ -5338,7 +5338,7 @@
           <w:lang w:eastAsia="nl-NL"/>
         </w:rPr>
       </w:pPr>
-      <w:hyperlink w:anchor="_Toc243983795" w:history="1">
+      <w:hyperlink w:anchor="_Toc243985447" w:history="1">
         <w:r>
           <w:rPr>
             <w:rStyle w:val="Hyperlink"/>
@@ -5383,7 +5383,7 @@
             <w:noProof/>
             <w:webHidden/>
           </w:rPr>
-          <w:instrText xml:space="preserve"> PAGEREF _Toc243983795 \h </w:instrText>
+          <w:instrText xml:space="preserve"> PAGEREF _Toc243985447 \h </w:instrText>
         </w:r>
         <w:r>
           <w:rPr>
@@ -5430,7 +5430,7 @@
           <w:lang w:eastAsia="nl-NL"/>
         </w:rPr>
       </w:pPr>
-      <w:hyperlink w:anchor="_Toc243983796" w:history="1">
+      <w:hyperlink w:anchor="_Toc243985448" w:history="1">
         <w:r>
           <w:rPr>
             <w:rStyle w:val="Hyperlink"/>
@@ -5475,7 +5475,7 @@
             <w:noProof/>
             <w:webHidden/>
           </w:rPr>
-          <w:instrText xml:space="preserve"> PAGEREF _Toc243983796 \h </w:instrText>
+          <w:instrText xml:space="preserve"> PAGEREF _Toc243985448 \h </w:instrText>
         </w:r>
         <w:r>
           <w:rPr>
@@ -5522,7 +5522,7 @@
           <w:lang w:eastAsia="nl-NL"/>
         </w:rPr>
       </w:pPr>
-      <w:hyperlink w:anchor="_Toc243983797" w:history="1">
+      <w:hyperlink w:anchor="_Toc243985449" w:history="1">
         <w:r>
           <w:rPr>
             <w:rStyle w:val="Hyperlink"/>
@@ -5567,7 +5567,7 @@
             <w:noProof/>
             <w:webHidden/>
           </w:rPr>
-          <w:instrText xml:space="preserve"> PAGEREF _Toc243983797 \h </w:instrText>
+          <w:instrText xml:space="preserve"> PAGEREF _Toc243985449 \h </w:instrText>
         </w:r>
         <w:r>
           <w:rPr>
@@ -5614,7 +5614,7 @@
           <w:lang w:eastAsia="nl-NL"/>
         </w:rPr>
       </w:pPr>
-      <w:hyperlink w:anchor="_Toc243983798" w:history="1">
+      <w:hyperlink w:anchor="_Toc243985450" w:history="1">
         <w:r>
           <w:rPr>
             <w:rStyle w:val="Hyperlink"/>
@@ -5659,7 +5659,7 @@
             <w:noProof/>
             <w:webHidden/>
           </w:rPr>
-          <w:instrText xml:space="preserve"> PAGEREF _Toc243983798 \h </w:instrText>
+          <w:instrText xml:space="preserve"> PAGEREF _Toc243985450 \h </w:instrText>
         </w:r>
         <w:r>
           <w:rPr>
@@ -5712,7 +5712,7 @@
         </w:numPr>
       </w:pPr>
       <w:bookmarkStart w:id="1" w:name="k1"/>
-      <w:bookmarkStart w:id="2" w:name="_Toc243983740"/>
+      <w:bookmarkStart w:id="2" w:name="_Toc243985392"/>
       <w:r>
         <w:t>DOEL VAN DE APPLICATIE.</w:t>
       </w:r>
@@ -5794,7 +5794,7 @@
         </w:numPr>
       </w:pPr>
       <w:bookmarkStart w:id="3" w:name="k2"/>
-      <w:bookmarkStart w:id="4" w:name="_Toc243983741"/>
+      <w:bookmarkStart w:id="4" w:name="_Toc243985393"/>
       <w:r>
         <w:t>BESTANDEN.</w:t>
       </w:r>
@@ -9947,7 +9947,7 @@
         </w:numPr>
       </w:pPr>
       <w:bookmarkStart w:id="5" w:name="k3"/>
-      <w:bookmarkStart w:id="6" w:name="_Toc243983742"/>
+      <w:bookmarkStart w:id="6" w:name="_Toc243985394"/>
       <w:r>
         <w:t>DE WEBSITE STARTEN.</w:t>
       </w:r>
@@ -10169,7 +10169,7 @@
         </w:numPr>
       </w:pPr>
       <w:bookmarkStart w:id="7" w:name="k4"/>
-      <w:bookmarkStart w:id="8" w:name="_Toc243983743"/>
+      <w:bookmarkStart w:id="8" w:name="_Toc243985395"/>
       <w:r>
         <w:t>GEBRUIKERSHANDLEIDING.</w:t>
       </w:r>
@@ -10209,7 +10209,7 @@
         <w:keepNext/>
       </w:pPr>
       <w:bookmarkStart w:id="9" w:name="k5"/>
-      <w:bookmarkStart w:id="10" w:name="_Toc243983744"/>
+      <w:bookmarkStart w:id="10" w:name="_Toc243985396"/>
       <w:r>
         <w:t>EEN MEDEWERKER ZOEKEN</w:t>
       </w:r>
@@ -10275,7 +10275,7 @@
         <w:keepNext/>
       </w:pPr>
       <w:bookmarkStart w:id="11" w:name="k6"/>
-      <w:bookmarkStart w:id="12" w:name="_Toc243983745"/>
+      <w:bookmarkStart w:id="12" w:name="_Toc243985397"/>
       <w:r>
         <w:t>EEN PRODUCT REGISTREREN</w:t>
       </w:r>
@@ -10524,7 +10524,7 @@
         <w:keepNext/>
       </w:pPr>
       <w:bookmarkStart w:id="13" w:name="k7"/>
-      <w:bookmarkStart w:id="14" w:name="_Toc243983746"/>
+      <w:bookmarkStart w:id="14" w:name="_Toc243985398"/>
       <w:r>
         <w:t>ADMIN-DASHBOARD OPENEN</w:t>
       </w:r>
@@ -10655,7 +10655,7 @@
         <w:keepNext/>
       </w:pPr>
       <w:bookmarkStart w:id="15" w:name="k8"/>
-      <w:bookmarkStart w:id="16" w:name="_Toc243983747"/>
+      <w:bookmarkStart w:id="16" w:name="_Toc243985399"/>
       <w:r>
         <w:t>REGISTRATIES BEHEREN</w:t>
       </w:r>
@@ -10941,7 +10941,7 @@
         <w:keepNext/>
       </w:pPr>
       <w:bookmarkStart w:id="17" w:name="k9"/>
-      <w:bookmarkStart w:id="18" w:name="_Toc243983748"/>
+      <w:bookmarkStart w:id="18" w:name="_Toc243985400"/>
       <w:r>
         <w:t>MEDEWERKERS BEHEREN</w:t>
       </w:r>
@@ -11322,7 +11322,7 @@
         <w:keepNext/>
       </w:pPr>
       <w:bookmarkStart w:id="19" w:name="k10"/>
-      <w:bookmarkStart w:id="20" w:name="_Toc243983749"/>
+      <w:bookmarkStart w:id="20" w:name="_Toc243985401"/>
       <w:r>
         <w:t>PRODUCTEN BEHEREN</w:t>
       </w:r>
@@ -11450,7 +11450,7 @@
         <w:keepNext/>
       </w:pPr>
       <w:bookmarkStart w:id="21" w:name="k11"/>
-      <w:bookmarkStart w:id="22" w:name="_Toc243983750"/>
+      <w:bookmarkStart w:id="22" w:name="_Toc243985402"/>
       <w:r>
         <w:t>BEDRIJVEN EN CONSUMPTIEPUNTEN BEHEREN</w:t>
       </w:r>
@@ -11613,7 +11613,7 @@
         <w:keepNext/>
       </w:pPr>
       <w:bookmarkStart w:id="23" w:name="k12"/>
-      <w:bookmarkStart w:id="24" w:name="_Toc243983751"/>
+      <w:bookmarkStart w:id="24" w:name="_Toc243985403"/>
       <w:r>
         <w:t>VOORRAAD BEHEREN</w:t>
       </w:r>
@@ -11831,7 +11831,7 @@
         <w:keepNext/>
       </w:pPr>
       <w:bookmarkStart w:id="25" w:name="k13"/>
-      <w:bookmarkStart w:id="26" w:name="_Toc243983752"/>
+      <w:bookmarkStart w:id="26" w:name="_Toc243985404"/>
       <w:r>
         <w:t>LOGBOEK BEKIJKEN</w:t>
       </w:r>
@@ -11871,7 +11871,7 @@
         <w:keepNext/>
       </w:pPr>
       <w:bookmarkStart w:id="27" w:name="k14"/>
-      <w:bookmarkStart w:id="28" w:name="_Toc243983753"/>
+      <w:bookmarkStart w:id="28" w:name="_Toc243985405"/>
       <w:r>
         <w:t>ALLE GEGEVENS WISSEN</w:t>
       </w:r>
@@ -11997,7 +11997,7 @@
         <w:keepNext/>
       </w:pPr>
       <w:bookmarkStart w:id="29" w:name="k15"/>
-      <w:bookmarkStart w:id="30" w:name="_Toc243983754"/>
+      <w:bookmarkStart w:id="30" w:name="_Toc243985406"/>
       <w:r>
         <w:t>MODAL SLUITEN EN UITLOGGEN</w:t>
       </w:r>
@@ -12071,7 +12071,7 @@
         <w:keepNext/>
       </w:pPr>
       <w:bookmarkStart w:id="31" w:name="k16"/>
-      <w:bookmarkStart w:id="32" w:name="_Toc243983755"/>
+      <w:bookmarkStart w:id="32" w:name="_Toc243985407"/>
       <w:r>
         <w:t>CSV EXPORTEREN</w:t>
       </w:r>
@@ -12455,7 +12455,7 @@
         <w:keepNext/>
       </w:pPr>
       <w:bookmarkStart w:id="33" w:name="k17"/>
-      <w:bookmarkStart w:id="34" w:name="_Toc243983756"/>
+      <w:bookmarkStart w:id="34" w:name="_Toc243985408"/>
       <w:r>
         <w:t>LICHT OF DONKER THEMA</w:t>
       </w:r>
@@ -12562,7 +12562,7 @@
         <w:keepNext/>
       </w:pPr>
       <w:bookmarkStart w:id="35" w:name="k18"/>
-      <w:bookmarkStart w:id="36" w:name="_Toc243983757"/>
+      <w:bookmarkStart w:id="36" w:name="_Toc243985409"/>
       <w:r>
         <w:t>WELKOM EN "ZELFDE ALS VORIGE KEER"</w:t>
       </w:r>
@@ -12649,7 +12649,7 @@
         <w:keepNext/>
       </w:pPr>
       <w:bookmarkStart w:id="37" w:name="k19"/>
-      <w:bookmarkStart w:id="38" w:name="_Toc243983758"/>
+      <w:bookmarkStart w:id="38" w:name="_Toc243985410"/>
       <w:r>
         <w:t>DEMO GEZICHTSHERKENNING</w:t>
       </w:r>
@@ -12964,7 +12964,7 @@
         <w:keepNext/>
       </w:pPr>
       <w:bookmarkStart w:id="39" w:name="k20"/>
-      <w:bookmarkStart w:id="40" w:name="_Toc243983759"/>
+      <w:bookmarkStart w:id="40" w:name="_Toc243985411"/>
       <w:r>
         <w:t>HERKENNEN MET DE PAS</w:t>
       </w:r>
@@ -13161,7 +13161,7 @@
         <w:keepNext/>
       </w:pPr>
       <w:bookmarkStart w:id="41" w:name="k21"/>
-      <w:bookmarkStart w:id="42" w:name="_Toc243983760"/>
+      <w:bookmarkStart w:id="42" w:name="_Toc243985412"/>
       <w:r>
         <w:t>SLIMME KOELKAST (DEMO)</w:t>
       </w:r>
@@ -13795,7 +13795,7 @@
         <w:keepNext/>
       </w:pPr>
       <w:bookmarkStart w:id="43" w:name="k22"/>
-      <w:bookmarkStart w:id="44" w:name="_Toc243983761"/>
+      <w:bookmarkStart w:id="44" w:name="_Toc243985413"/>
       <w:r>
         <w:t>HET STARTSCHERM EN AUTOMATISCH SCANNEN (DEMO)</w:t>
       </w:r>
@@ -14341,7 +14341,7 @@
         </w:numPr>
       </w:pPr>
       <w:bookmarkStart w:id="45" w:name="k23"/>
-      <w:bookmarkStart w:id="46" w:name="_Toc243983762"/>
+      <w:bookmarkStart w:id="46" w:name="_Toc243985414"/>
       <w:r>
         <w:t xml:space="preserve">UITLEG VAN </w:t>
       </w:r>
@@ -14365,7 +14365,7 @@
         <w:keepNext/>
       </w:pPr>
       <w:bookmarkStart w:id="47" w:name="k24"/>
-      <w:bookmarkStart w:id="48" w:name="_Toc243983763"/>
+      <w:bookmarkStart w:id="48" w:name="_Toc243985415"/>
       <w:r>
         <w:t>METADATA EN EXTERNE BESTANDEN</w:t>
       </w:r>
@@ -14688,7 +14688,7 @@
         <w:keepNext/>
       </w:pPr>
       <w:bookmarkStart w:id="49" w:name="k25"/>
-      <w:bookmarkStart w:id="50" w:name="_Toc243983764"/>
+      <w:bookmarkStart w:id="50" w:name="_Toc243985416"/>
       <w:r>
         <w:t>NAVIGATIEBALK</w:t>
       </w:r>
@@ -14901,7 +14901,7 @@
         <w:keepNext/>
       </w:pPr>
       <w:bookmarkStart w:id="51" w:name="k26"/>
-      <w:bookmarkStart w:id="52" w:name="_Toc243983765"/>
+      <w:bookmarkStart w:id="52" w:name="_Toc243985417"/>
       <w:r>
         <w:t>HERO-GEDEELTE</w:t>
       </w:r>
@@ -14946,7 +14946,7 @@
         <w:keepNext/>
       </w:pPr>
       <w:bookmarkStart w:id="53" w:name="k27"/>
-      <w:bookmarkStart w:id="54" w:name="_Toc243983766"/>
+      <w:bookmarkStart w:id="54" w:name="_Toc243985418"/>
       <w:r>
         <w:t>MEDEWERKERLIJST</w:t>
       </w:r>
@@ -15283,7 +15283,7 @@
         <w:keepNext/>
       </w:pPr>
       <w:bookmarkStart w:id="55" w:name="k28"/>
-      <w:bookmarkStart w:id="56" w:name="_Toc243983767"/>
+      <w:bookmarkStart w:id="56" w:name="_Toc243985419"/>
       <w:r>
         <w:t>STATISTIEKEN</w:t>
       </w:r>
@@ -15366,7 +15366,7 @@
         <w:keepNext/>
       </w:pPr>
       <w:bookmarkStart w:id="57" w:name="k29"/>
-      <w:bookmarkStart w:id="58" w:name="_Toc243983768"/>
+      <w:bookmarkStart w:id="58" w:name="_Toc243985420"/>
       <w:r>
         <w:t>VENSTERS (MODALS)</w:t>
       </w:r>
@@ -16028,7 +16028,7 @@
         <w:keepNext/>
       </w:pPr>
       <w:bookmarkStart w:id="59" w:name="k30"/>
-      <w:bookmarkStart w:id="60" w:name="_Toc243983769"/>
+      <w:bookmarkStart w:id="60" w:name="_Toc243985421"/>
       <w:r>
         <w:t>STARTSCHERM</w:t>
       </w:r>
@@ -16255,7 +16255,7 @@
         <w:keepNext/>
       </w:pPr>
       <w:bookmarkStart w:id="61" w:name="k31"/>
-      <w:bookmarkStart w:id="62" w:name="_Toc243983770"/>
+      <w:bookmarkStart w:id="62" w:name="_Toc243985422"/>
       <w:r>
         <w:t>WAARSCHUWING BIJ OPENEN ALS LOS BESTAND</w:t>
       </w:r>
@@ -16300,7 +16300,7 @@
         </w:numPr>
       </w:pPr>
       <w:bookmarkStart w:id="63" w:name="k32"/>
-      <w:bookmarkStart w:id="64" w:name="_Toc243983771"/>
+      <w:bookmarkStart w:id="64" w:name="_Toc243985423"/>
       <w:r>
         <w:t>UITLEG VAN DE CSS (</w:t>
       </w:r>
@@ -16324,7 +16324,7 @@
         <w:keepNext/>
       </w:pPr>
       <w:bookmarkStart w:id="65" w:name="k33"/>
-      <w:bookmarkStart w:id="66" w:name="_Toc243983772"/>
+      <w:bookmarkStart w:id="66" w:name="_Toc243985424"/>
       <w:r>
         <w:t>BESTANDEN EN VOLGORDE</w:t>
       </w:r>
@@ -17643,7 +17643,7 @@
         <w:keepNext/>
       </w:pPr>
       <w:bookmarkStart w:id="67" w:name="k34"/>
-      <w:bookmarkStart w:id="68" w:name="_Toc243983773"/>
+      <w:bookmarkStart w:id="68" w:name="_Toc243985425"/>
       <w:r>
         <w:t>CSS-VARIABELEN</w:t>
       </w:r>
@@ -18486,7 +18486,7 @@
         <w:keepNext/>
       </w:pPr>
       <w:bookmarkStart w:id="69" w:name="k35"/>
-      <w:bookmarkStart w:id="70" w:name="_Toc243983774"/>
+      <w:bookmarkStart w:id="70" w:name="_Toc243985426"/>
       <w:r>
         <w:t>LAYOUT</w:t>
       </w:r>
@@ -19195,7 +19195,7 @@
         <w:keepNext/>
       </w:pPr>
       <w:bookmarkStart w:id="71" w:name="k36"/>
-      <w:bookmarkStart w:id="72" w:name="_Toc243983775"/>
+      <w:bookmarkStart w:id="72" w:name="_Toc243985427"/>
       <w:r>
         <w:t>COMPONENTEN</w:t>
       </w:r>
@@ -19440,7 +19440,7 @@
         </w:numPr>
       </w:pPr>
       <w:bookmarkStart w:id="73" w:name="k37"/>
-      <w:bookmarkStart w:id="74" w:name="_Toc243983776"/>
+      <w:bookmarkStart w:id="74" w:name="_Toc243985428"/>
       <w:r>
         <w:t>UITLEG VAN DE JAVASCRIPT (</w:t>
       </w:r>
@@ -19464,7 +19464,7 @@
         <w:keepNext/>
       </w:pPr>
       <w:bookmarkStart w:id="75" w:name="k38"/>
-      <w:bookmarkStart w:id="76" w:name="_Toc243983777"/>
+      <w:bookmarkStart w:id="76" w:name="_Toc243985429"/>
       <w:r>
         <w:t>OPSLAG EN VOORBEELDDATA</w:t>
       </w:r>
@@ -20242,7 +20242,7 @@
         <w:keepNext/>
       </w:pPr>
       <w:bookmarkStart w:id="77" w:name="k39"/>
-      <w:bookmarkStart w:id="78" w:name="_Toc243983778"/>
+      <w:bookmarkStart w:id="78" w:name="_Toc243985430"/>
       <w:r>
         <w:t>OBJECTGEORIËNTEERDE STRUCTUUR</w:t>
       </w:r>
@@ -27361,7 +27361,7 @@
         <w:keepNext/>
       </w:pPr>
       <w:bookmarkStart w:id="92" w:name="k53"/>
-      <w:bookmarkStart w:id="93" w:name="_Toc243983779"/>
+      <w:bookmarkStart w:id="93" w:name="_Toc243985431"/>
       <w:r>
         <w:rPr>
           <w:rFonts w:ascii="Consolas" w:hAnsi="Consolas" w:cs="Consolas"/>
@@ -27504,7 +27504,7 @@
         <w:keepNext/>
       </w:pPr>
       <w:bookmarkStart w:id="94" w:name="k54"/>
-      <w:bookmarkStart w:id="95" w:name="_Toc243983780"/>
+      <w:bookmarkStart w:id="95" w:name="_Toc243985432"/>
       <w:r>
         <w:rPr>
           <w:rFonts w:ascii="Consolas" w:hAnsi="Consolas" w:cs="Consolas"/>
@@ -27581,7 +27581,7 @@
         <w:keepNext/>
       </w:pPr>
       <w:bookmarkStart w:id="96" w:name="k55"/>
-      <w:bookmarkStart w:id="97" w:name="_Toc243983781"/>
+      <w:bookmarkStart w:id="97" w:name="_Toc243985433"/>
       <w:r>
         <w:rPr>
           <w:rFonts w:ascii="Consolas" w:hAnsi="Consolas" w:cs="Consolas"/>
@@ -27752,7 +27752,7 @@
         <w:keepNext/>
       </w:pPr>
       <w:bookmarkStart w:id="98" w:name="k56"/>
-      <w:bookmarkStart w:id="99" w:name="_Toc243983782"/>
+      <w:bookmarkStart w:id="99" w:name="_Toc243985434"/>
       <w:r>
         <w:rPr>
           <w:rFonts w:ascii="Consolas" w:hAnsi="Consolas" w:cs="Consolas"/>
@@ -27819,7 +27819,7 @@
         <w:keepNext/>
       </w:pPr>
       <w:bookmarkStart w:id="100" w:name="k57"/>
-      <w:bookmarkStart w:id="101" w:name="_Toc243983783"/>
+      <w:bookmarkStart w:id="101" w:name="_Toc243985435"/>
       <w:r>
         <w:rPr>
           <w:rFonts w:ascii="Consolas" w:hAnsi="Consolas" w:cs="Consolas"/>
@@ -27941,7 +27941,7 @@
         <w:keepNext/>
       </w:pPr>
       <w:bookmarkStart w:id="102" w:name="k58"/>
-      <w:bookmarkStart w:id="103" w:name="_Toc243983784"/>
+      <w:bookmarkStart w:id="103" w:name="_Toc243985436"/>
       <w:r>
         <w:rPr>
           <w:rFonts w:ascii="Consolas" w:hAnsi="Consolas" w:cs="Consolas"/>
@@ -28063,7 +28063,7 @@
         <w:keepNext/>
       </w:pPr>
       <w:bookmarkStart w:id="104" w:name="k59"/>
-      <w:bookmarkStart w:id="105" w:name="_Toc243983785"/>
+      <w:bookmarkStart w:id="105" w:name="_Toc243985437"/>
       <w:r>
         <w:t>OPSLAGFOUTEN EN TERUGDRAAIEN</w:t>
       </w:r>
@@ -28125,7 +28125,7 @@
         <w:keepNext/>
       </w:pPr>
       <w:bookmarkStart w:id="106" w:name="k60"/>
-      <w:bookmarkStart w:id="107" w:name="_Toc243983786"/>
+      <w:bookmarkStart w:id="107" w:name="_Toc243985438"/>
       <w:r>
         <w:t>ADMINFUNCTIES</w:t>
       </w:r>
@@ -28371,7 +28371,7 @@
         <w:keepNext/>
       </w:pPr>
       <w:bookmarkStart w:id="108" w:name="k61"/>
-      <w:bookmarkStart w:id="109" w:name="_Toc243983787"/>
+      <w:bookmarkStart w:id="109" w:name="_Toc243985439"/>
       <w:r>
         <w:t xml:space="preserve">CSV-EXPORT (CLASS </w:t>
       </w:r>
@@ -28779,7 +28779,7 @@
         <w:keepNext/>
       </w:pPr>
       <w:bookmarkStart w:id="110" w:name="k62"/>
-      <w:bookmarkStart w:id="111" w:name="_Toc243983788"/>
+      <w:bookmarkStart w:id="111" w:name="_Toc243985440"/>
       <w:r>
         <w:t>EVENT LISTENERS</w:t>
       </w:r>
@@ -29476,7 +29476,7 @@
         </w:numPr>
       </w:pPr>
       <w:bookmarkStart w:id="112" w:name="k63"/>
-      <w:bookmarkStart w:id="113" w:name="_Toc243983789"/>
+      <w:bookmarkStart w:id="113" w:name="_Toc243985441"/>
       <w:r>
         <w:t>DATAMODEL EN KOPPELINGEN.</w:t>
       </w:r>
@@ -29494,7 +29494,7 @@
         <w:keepNext/>
       </w:pPr>
       <w:bookmarkStart w:id="114" w:name="k64"/>
-      <w:bookmarkStart w:id="115" w:name="_Toc243983790"/>
+      <w:bookmarkStart w:id="115" w:name="_Toc243985442"/>
       <w:r>
         <w:t>BEDRIJVEN</w:t>
       </w:r>
@@ -29705,7 +29705,7 @@
         <w:keepNext/>
       </w:pPr>
       <w:bookmarkStart w:id="116" w:name="k65"/>
-      <w:bookmarkStart w:id="117" w:name="_Toc243983791"/>
+      <w:bookmarkStart w:id="117" w:name="_Toc243985443"/>
       <w:r>
         <w:t>CONSUMPTIEPUNTEN</w:t>
       </w:r>
@@ -30024,7 +30024,7 @@
         <w:keepNext/>
       </w:pPr>
       <w:bookmarkStart w:id="118" w:name="k66"/>
-      <w:bookmarkStart w:id="119" w:name="_Toc243983792"/>
+      <w:bookmarkStart w:id="119" w:name="_Toc243985444"/>
       <w:r>
         <w:t>MEDEWERKERS</w:t>
       </w:r>
@@ -30580,7 +30580,7 @@
         <w:keepNext/>
       </w:pPr>
       <w:bookmarkStart w:id="120" w:name="k67"/>
-      <w:bookmarkStart w:id="121" w:name="_Toc243983793"/>
+      <w:bookmarkStart w:id="121" w:name="_Toc243985445"/>
       <w:r>
         <w:t>REGISTRATIES</w:t>
       </w:r>
@@ -31241,7 +31241,7 @@
         <w:keepNext/>
       </w:pPr>
       <w:bookmarkStart w:id="122" w:name="k68"/>
-      <w:bookmarkStart w:id="123" w:name="_Toc243983794"/>
+      <w:bookmarkStart w:id="123" w:name="_Toc243985446"/>
       <w:r>
         <w:t>SLIMME KOELKAST</w:t>
       </w:r>
@@ -31661,7 +31661,7 @@
         <w:keepNext/>
       </w:pPr>
       <w:bookmarkStart w:id="124" w:name="k69"/>
-      <w:bookmarkStart w:id="125" w:name="_Toc243983795"/>
+      <w:bookmarkStart w:id="125" w:name="_Toc243985447"/>
       <w:r>
         <w:t>DEMO GEZICHTSHERKENNING</w:t>
       </w:r>
@@ -32004,7 +32004,7 @@
         </w:numPr>
       </w:pPr>
       <w:bookmarkStart w:id="126" w:name="k70"/>
-      <w:bookmarkStart w:id="127" w:name="_Toc243983796"/>
+      <w:bookmarkStart w:id="127" w:name="_Toc243985448"/>
       <w:r>
         <w:t>BELANGRIJKE DEMO-BEPERKINGEN.</w:t>
       </w:r>
@@ -32467,7 +32467,7 @@
         </w:numPr>
       </w:pPr>
       <w:bookmarkStart w:id="128" w:name="k71"/>
-      <w:bookmarkStart w:id="129" w:name="_Toc243983797"/>
+      <w:bookmarkStart w:id="129" w:name="_Toc243985449"/>
       <w:r>
         <w:t>CODE UITLEGGEN TIJDENS EEN PRESENTATIE.</w:t>
       </w:r>
@@ -32873,7 +32873,7 @@
         </w:numPr>
       </w:pPr>
       <w:bookmarkStart w:id="130" w:name="k72"/>
-      <w:bookmarkStart w:id="131" w:name="_Toc243983798"/>
+      <w:bookmarkStart w:id="131" w:name="_Toc243985450"/>
       <w:r>
         <w:t>MOGELIJKE VERVOLGSTAPPEN.</w:t>
       </w:r>

</xml_diff>

<commit_message>
TO 3.24: navraag over de passen, geen centraal systeem met pasnummers
</commit_message>
<xml_diff>
--- a/docs/DOCUMENTATIE.docx
+++ b/docs/DOCUMENTATIE.docx
@@ -82,7 +82,7 @@
           <w:numId w:val="0"/>
         </w:numPr>
       </w:pPr>
-      <w:bookmarkStart w:id="0" w:name="_Toc244002603"/>
+      <w:bookmarkStart w:id="0" w:name="_Toc244159307"/>
       <w:r>
         <w:t>INHOUDSOPGAVE.</w:t>
       </w:r>
@@ -112,7 +112,7 @@
       <w:r>
         <w:fldChar w:fldCharType="separate"/>
       </w:r>
-      <w:hyperlink w:anchor="_Toc244002603" w:history="1">
+      <w:hyperlink w:anchor="_Toc244159307" w:history="1">
         <w:r>
           <w:rPr>
             <w:rStyle w:val="Hyperlink"/>
@@ -139,7 +139,7 @@
             <w:noProof/>
             <w:webHidden/>
           </w:rPr>
-          <w:instrText xml:space="preserve"> PAGEREF _Toc244002603 \h </w:instrText>
+          <w:instrText xml:space="preserve"> PAGEREF _Toc244159307 \h </w:instrText>
         </w:r>
         <w:r>
           <w:rPr>
@@ -186,7 +186,7 @@
           <w:lang w:eastAsia="nl-NL"/>
         </w:rPr>
       </w:pPr>
-      <w:hyperlink w:anchor="_Toc244002604" w:history="1">
+      <w:hyperlink w:anchor="_Toc244159308" w:history="1">
         <w:r>
           <w:rPr>
             <w:rStyle w:val="Hyperlink"/>
@@ -231,7 +231,7 @@
             <w:noProof/>
             <w:webHidden/>
           </w:rPr>
-          <w:instrText xml:space="preserve"> PAGEREF _Toc244002604 \h </w:instrText>
+          <w:instrText xml:space="preserve"> PAGEREF _Toc244159308 \h </w:instrText>
         </w:r>
         <w:r>
           <w:rPr>
@@ -278,7 +278,7 @@
           <w:lang w:eastAsia="nl-NL"/>
         </w:rPr>
       </w:pPr>
-      <w:hyperlink w:anchor="_Toc244002605" w:history="1">
+      <w:hyperlink w:anchor="_Toc244159309" w:history="1">
         <w:r>
           <w:rPr>
             <w:rStyle w:val="Hyperlink"/>
@@ -323,7 +323,7 @@
             <w:noProof/>
             <w:webHidden/>
           </w:rPr>
-          <w:instrText xml:space="preserve"> PAGEREF _Toc244002605 \h </w:instrText>
+          <w:instrText xml:space="preserve"> PAGEREF _Toc244159309 \h </w:instrText>
         </w:r>
         <w:r>
           <w:rPr>
@@ -370,7 +370,7 @@
           <w:lang w:eastAsia="nl-NL"/>
         </w:rPr>
       </w:pPr>
-      <w:hyperlink w:anchor="_Toc244002606" w:history="1">
+      <w:hyperlink w:anchor="_Toc244159310" w:history="1">
         <w:r>
           <w:rPr>
             <w:rStyle w:val="Hyperlink"/>
@@ -415,7 +415,7 @@
             <w:noProof/>
             <w:webHidden/>
           </w:rPr>
-          <w:instrText xml:space="preserve"> PAGEREF _Toc244002606 \h </w:instrText>
+          <w:instrText xml:space="preserve"> PAGEREF _Toc244159310 \h </w:instrText>
         </w:r>
         <w:r>
           <w:rPr>
@@ -462,7 +462,7 @@
           <w:lang w:eastAsia="nl-NL"/>
         </w:rPr>
       </w:pPr>
-      <w:hyperlink w:anchor="_Toc244002607" w:history="1">
+      <w:hyperlink w:anchor="_Toc244159311" w:history="1">
         <w:r>
           <w:rPr>
             <w:rStyle w:val="Hyperlink"/>
@@ -507,7 +507,7 @@
             <w:noProof/>
             <w:webHidden/>
           </w:rPr>
-          <w:instrText xml:space="preserve"> PAGEREF _Toc244002607 \h </w:instrText>
+          <w:instrText xml:space="preserve"> PAGEREF _Toc244159311 \h </w:instrText>
         </w:r>
         <w:r>
           <w:rPr>
@@ -554,7 +554,7 @@
           <w:lang w:eastAsia="nl-NL"/>
         </w:rPr>
       </w:pPr>
-      <w:hyperlink w:anchor="_Toc244002608" w:history="1">
+      <w:hyperlink w:anchor="_Toc244159312" w:history="1">
         <w:r>
           <w:rPr>
             <w:rStyle w:val="Hyperlink"/>
@@ -599,7 +599,7 @@
             <w:noProof/>
             <w:webHidden/>
           </w:rPr>
-          <w:instrText xml:space="preserve"> PAGEREF _Toc244002608 \h </w:instrText>
+          <w:instrText xml:space="preserve"> PAGEREF _Toc244159312 \h </w:instrText>
         </w:r>
         <w:r>
           <w:rPr>
@@ -646,7 +646,7 @@
           <w:lang w:eastAsia="nl-NL"/>
         </w:rPr>
       </w:pPr>
-      <w:hyperlink w:anchor="_Toc244002609" w:history="1">
+      <w:hyperlink w:anchor="_Toc244159313" w:history="1">
         <w:r>
           <w:rPr>
             <w:rStyle w:val="Hyperlink"/>
@@ -691,7 +691,7 @@
             <w:noProof/>
             <w:webHidden/>
           </w:rPr>
-          <w:instrText xml:space="preserve"> PAGEREF _Toc244002609 \h </w:instrText>
+          <w:instrText xml:space="preserve"> PAGEREF _Toc244159313 \h </w:instrText>
         </w:r>
         <w:r>
           <w:rPr>
@@ -738,7 +738,7 @@
           <w:lang w:eastAsia="nl-NL"/>
         </w:rPr>
       </w:pPr>
-      <w:hyperlink w:anchor="_Toc244002610" w:history="1">
+      <w:hyperlink w:anchor="_Toc244159314" w:history="1">
         <w:r>
           <w:rPr>
             <w:rStyle w:val="Hyperlink"/>
@@ -783,7 +783,7 @@
             <w:noProof/>
             <w:webHidden/>
           </w:rPr>
-          <w:instrText xml:space="preserve"> PAGEREF _Toc244002610 \h </w:instrText>
+          <w:instrText xml:space="preserve"> PAGEREF _Toc244159314 \h </w:instrText>
         </w:r>
         <w:r>
           <w:rPr>
@@ -830,7 +830,7 @@
           <w:lang w:eastAsia="nl-NL"/>
         </w:rPr>
       </w:pPr>
-      <w:hyperlink w:anchor="_Toc244002611" w:history="1">
+      <w:hyperlink w:anchor="_Toc244159315" w:history="1">
         <w:r>
           <w:rPr>
             <w:rStyle w:val="Hyperlink"/>
@@ -875,7 +875,7 @@
             <w:noProof/>
             <w:webHidden/>
           </w:rPr>
-          <w:instrText xml:space="preserve"> PAGEREF _Toc244002611 \h </w:instrText>
+          <w:instrText xml:space="preserve"> PAGEREF _Toc244159315 \h </w:instrText>
         </w:r>
         <w:r>
           <w:rPr>
@@ -922,7 +922,7 @@
           <w:lang w:eastAsia="nl-NL"/>
         </w:rPr>
       </w:pPr>
-      <w:hyperlink w:anchor="_Toc244002612" w:history="1">
+      <w:hyperlink w:anchor="_Toc244159316" w:history="1">
         <w:r>
           <w:rPr>
             <w:rStyle w:val="Hyperlink"/>
@@ -967,7 +967,7 @@
             <w:noProof/>
             <w:webHidden/>
           </w:rPr>
-          <w:instrText xml:space="preserve"> PAGEREF _Toc244002612 \h </w:instrText>
+          <w:instrText xml:space="preserve"> PAGEREF _Toc244159316 \h </w:instrText>
         </w:r>
         <w:r>
           <w:rPr>
@@ -1014,7 +1014,7 @@
           <w:lang w:eastAsia="nl-NL"/>
         </w:rPr>
       </w:pPr>
-      <w:hyperlink w:anchor="_Toc244002613" w:history="1">
+      <w:hyperlink w:anchor="_Toc244159317" w:history="1">
         <w:r>
           <w:rPr>
             <w:rStyle w:val="Hyperlink"/>
@@ -1059,7 +1059,7 @@
             <w:noProof/>
             <w:webHidden/>
           </w:rPr>
-          <w:instrText xml:space="preserve"> PAGEREF _Toc244002613 \h </w:instrText>
+          <w:instrText xml:space="preserve"> PAGEREF _Toc244159317 \h </w:instrText>
         </w:r>
         <w:r>
           <w:rPr>
@@ -1106,7 +1106,7 @@
           <w:lang w:eastAsia="nl-NL"/>
         </w:rPr>
       </w:pPr>
-      <w:hyperlink w:anchor="_Toc244002614" w:history="1">
+      <w:hyperlink w:anchor="_Toc244159318" w:history="1">
         <w:r>
           <w:rPr>
             <w:rStyle w:val="Hyperlink"/>
@@ -1151,7 +1151,7 @@
             <w:noProof/>
             <w:webHidden/>
           </w:rPr>
-          <w:instrText xml:space="preserve"> PAGEREF _Toc244002614 \h </w:instrText>
+          <w:instrText xml:space="preserve"> PAGEREF _Toc244159318 \h </w:instrText>
         </w:r>
         <w:r>
           <w:rPr>
@@ -1198,7 +1198,7 @@
           <w:lang w:eastAsia="nl-NL"/>
         </w:rPr>
       </w:pPr>
-      <w:hyperlink w:anchor="_Toc244002615" w:history="1">
+      <w:hyperlink w:anchor="_Toc244159319" w:history="1">
         <w:r>
           <w:rPr>
             <w:rStyle w:val="Hyperlink"/>
@@ -1243,7 +1243,7 @@
             <w:noProof/>
             <w:webHidden/>
           </w:rPr>
-          <w:instrText xml:space="preserve"> PAGEREF _Toc244002615 \h </w:instrText>
+          <w:instrText xml:space="preserve"> PAGEREF _Toc244159319 \h </w:instrText>
         </w:r>
         <w:r>
           <w:rPr>
@@ -1290,7 +1290,7 @@
           <w:lang w:eastAsia="nl-NL"/>
         </w:rPr>
       </w:pPr>
-      <w:hyperlink w:anchor="_Toc244002616" w:history="1">
+      <w:hyperlink w:anchor="_Toc244159320" w:history="1">
         <w:r>
           <w:rPr>
             <w:rStyle w:val="Hyperlink"/>
@@ -1335,7 +1335,7 @@
             <w:noProof/>
             <w:webHidden/>
           </w:rPr>
-          <w:instrText xml:space="preserve"> PAGEREF _Toc244002616 \h </w:instrText>
+          <w:instrText xml:space="preserve"> PAGEREF _Toc244159320 \h </w:instrText>
         </w:r>
         <w:r>
           <w:rPr>
@@ -1382,7 +1382,7 @@
           <w:lang w:eastAsia="nl-NL"/>
         </w:rPr>
       </w:pPr>
-      <w:hyperlink w:anchor="_Toc244002617" w:history="1">
+      <w:hyperlink w:anchor="_Toc244159321" w:history="1">
         <w:r>
           <w:rPr>
             <w:rStyle w:val="Hyperlink"/>
@@ -1427,7 +1427,7 @@
             <w:noProof/>
             <w:webHidden/>
           </w:rPr>
-          <w:instrText xml:space="preserve"> PAGEREF _Toc244002617 \h </w:instrText>
+          <w:instrText xml:space="preserve"> PAGEREF _Toc244159321 \h </w:instrText>
         </w:r>
         <w:r>
           <w:rPr>
@@ -1474,7 +1474,7 @@
           <w:lang w:eastAsia="nl-NL"/>
         </w:rPr>
       </w:pPr>
-      <w:hyperlink w:anchor="_Toc244002618" w:history="1">
+      <w:hyperlink w:anchor="_Toc244159322" w:history="1">
         <w:r>
           <w:rPr>
             <w:rStyle w:val="Hyperlink"/>
@@ -1519,7 +1519,7 @@
             <w:noProof/>
             <w:webHidden/>
           </w:rPr>
-          <w:instrText xml:space="preserve"> PAGEREF _Toc244002618 \h </w:instrText>
+          <w:instrText xml:space="preserve"> PAGEREF _Toc244159322 \h </w:instrText>
         </w:r>
         <w:r>
           <w:rPr>
@@ -1566,7 +1566,7 @@
           <w:lang w:eastAsia="nl-NL"/>
         </w:rPr>
       </w:pPr>
-      <w:hyperlink w:anchor="_Toc244002619" w:history="1">
+      <w:hyperlink w:anchor="_Toc244159323" w:history="1">
         <w:r>
           <w:rPr>
             <w:rStyle w:val="Hyperlink"/>
@@ -1611,7 +1611,7 @@
             <w:noProof/>
             <w:webHidden/>
           </w:rPr>
-          <w:instrText xml:space="preserve"> PAGEREF _Toc244002619 \h </w:instrText>
+          <w:instrText xml:space="preserve"> PAGEREF _Toc244159323 \h </w:instrText>
         </w:r>
         <w:r>
           <w:rPr>
@@ -1658,7 +1658,7 @@
           <w:lang w:eastAsia="nl-NL"/>
         </w:rPr>
       </w:pPr>
-      <w:hyperlink w:anchor="_Toc244002620" w:history="1">
+      <w:hyperlink w:anchor="_Toc244159324" w:history="1">
         <w:r>
           <w:rPr>
             <w:rStyle w:val="Hyperlink"/>
@@ -1703,7 +1703,7 @@
             <w:noProof/>
             <w:webHidden/>
           </w:rPr>
-          <w:instrText xml:space="preserve"> PAGEREF _Toc244002620 \h </w:instrText>
+          <w:instrText xml:space="preserve"> PAGEREF _Toc244159324 \h </w:instrText>
         </w:r>
         <w:r>
           <w:rPr>
@@ -1750,7 +1750,7 @@
           <w:lang w:eastAsia="nl-NL"/>
         </w:rPr>
       </w:pPr>
-      <w:hyperlink w:anchor="_Toc244002621" w:history="1">
+      <w:hyperlink w:anchor="_Toc244159325" w:history="1">
         <w:r>
           <w:rPr>
             <w:rStyle w:val="Hyperlink"/>
@@ -1795,7 +1795,7 @@
             <w:noProof/>
             <w:webHidden/>
           </w:rPr>
-          <w:instrText xml:space="preserve"> PAGEREF _Toc244002621 \h </w:instrText>
+          <w:instrText xml:space="preserve"> PAGEREF _Toc244159325 \h </w:instrText>
         </w:r>
         <w:r>
           <w:rPr>
@@ -1842,7 +1842,7 @@
           <w:lang w:eastAsia="nl-NL"/>
         </w:rPr>
       </w:pPr>
-      <w:hyperlink w:anchor="_Toc244002622" w:history="1">
+      <w:hyperlink w:anchor="_Toc244159326" w:history="1">
         <w:r>
           <w:rPr>
             <w:rStyle w:val="Hyperlink"/>
@@ -1887,7 +1887,7 @@
             <w:noProof/>
             <w:webHidden/>
           </w:rPr>
-          <w:instrText xml:space="preserve"> PAGEREF _Toc244002622 \h </w:instrText>
+          <w:instrText xml:space="preserve"> PAGEREF _Toc244159326 \h </w:instrText>
         </w:r>
         <w:r>
           <w:rPr>
@@ -1934,7 +1934,7 @@
           <w:lang w:eastAsia="nl-NL"/>
         </w:rPr>
       </w:pPr>
-      <w:hyperlink w:anchor="_Toc244002623" w:history="1">
+      <w:hyperlink w:anchor="_Toc244159327" w:history="1">
         <w:r>
           <w:rPr>
             <w:rStyle w:val="Hyperlink"/>
@@ -1979,7 +1979,7 @@
             <w:noProof/>
             <w:webHidden/>
           </w:rPr>
-          <w:instrText xml:space="preserve"> PAGEREF _Toc244002623 \h </w:instrText>
+          <w:instrText xml:space="preserve"> PAGEREF _Toc244159327 \h </w:instrText>
         </w:r>
         <w:r>
           <w:rPr>
@@ -2026,7 +2026,7 @@
           <w:lang w:eastAsia="nl-NL"/>
         </w:rPr>
       </w:pPr>
-      <w:hyperlink w:anchor="_Toc244002624" w:history="1">
+      <w:hyperlink w:anchor="_Toc244159328" w:history="1">
         <w:r>
           <w:rPr>
             <w:rStyle w:val="Hyperlink"/>
@@ -2071,7 +2071,7 @@
             <w:noProof/>
             <w:webHidden/>
           </w:rPr>
-          <w:instrText xml:space="preserve"> PAGEREF _Toc244002624 \h </w:instrText>
+          <w:instrText xml:space="preserve"> PAGEREF _Toc244159328 \h </w:instrText>
         </w:r>
         <w:r>
           <w:rPr>
@@ -2091,7 +2091,7 @@
             <w:noProof/>
             <w:webHidden/>
           </w:rPr>
-          <w:t>20</w:t>
+          <w:t>21</w:t>
         </w:r>
         <w:r>
           <w:rPr>
@@ -2118,7 +2118,7 @@
           <w:lang w:eastAsia="nl-NL"/>
         </w:rPr>
       </w:pPr>
-      <w:hyperlink w:anchor="_Toc244002625" w:history="1">
+      <w:hyperlink w:anchor="_Toc244159329" w:history="1">
         <w:r>
           <w:rPr>
             <w:rStyle w:val="Hyperlink"/>
@@ -2163,7 +2163,7 @@
             <w:noProof/>
             <w:webHidden/>
           </w:rPr>
-          <w:instrText xml:space="preserve"> PAGEREF _Toc244002625 \h </w:instrText>
+          <w:instrText xml:space="preserve"> PAGEREF _Toc244159329 \h </w:instrText>
         </w:r>
         <w:r>
           <w:rPr>
@@ -2210,7 +2210,7 @@
           <w:lang w:eastAsia="nl-NL"/>
         </w:rPr>
       </w:pPr>
-      <w:hyperlink w:anchor="_Toc244002626" w:history="1">
+      <w:hyperlink w:anchor="_Toc244159330" w:history="1">
         <w:r>
           <w:rPr>
             <w:rStyle w:val="Hyperlink"/>
@@ -2271,7 +2271,7 @@
             <w:noProof/>
             <w:webHidden/>
           </w:rPr>
-          <w:instrText xml:space="preserve"> PAGEREF _Toc244002626 \h </w:instrText>
+          <w:instrText xml:space="preserve"> PAGEREF _Toc244159330 \h </w:instrText>
         </w:r>
         <w:r>
           <w:rPr>
@@ -2318,7 +2318,7 @@
           <w:lang w:eastAsia="nl-NL"/>
         </w:rPr>
       </w:pPr>
-      <w:hyperlink w:anchor="_Toc244002627" w:history="1">
+      <w:hyperlink w:anchor="_Toc244159331" w:history="1">
         <w:r>
           <w:rPr>
             <w:rStyle w:val="Hyperlink"/>
@@ -2363,7 +2363,7 @@
             <w:noProof/>
             <w:webHidden/>
           </w:rPr>
-          <w:instrText xml:space="preserve"> PAGEREF _Toc244002627 \h </w:instrText>
+          <w:instrText xml:space="preserve"> PAGEREF _Toc244159331 \h </w:instrText>
         </w:r>
         <w:r>
           <w:rPr>
@@ -2410,7 +2410,7 @@
           <w:lang w:eastAsia="nl-NL"/>
         </w:rPr>
       </w:pPr>
-      <w:hyperlink w:anchor="_Toc244002628" w:history="1">
+      <w:hyperlink w:anchor="_Toc244159332" w:history="1">
         <w:r>
           <w:rPr>
             <w:rStyle w:val="Hyperlink"/>
@@ -2455,7 +2455,7 @@
             <w:noProof/>
             <w:webHidden/>
           </w:rPr>
-          <w:instrText xml:space="preserve"> PAGEREF _Toc244002628 \h </w:instrText>
+          <w:instrText xml:space="preserve"> PAGEREF _Toc244159332 \h </w:instrText>
         </w:r>
         <w:r>
           <w:rPr>
@@ -2502,7 +2502,7 @@
           <w:lang w:eastAsia="nl-NL"/>
         </w:rPr>
       </w:pPr>
-      <w:hyperlink w:anchor="_Toc244002629" w:history="1">
+      <w:hyperlink w:anchor="_Toc244159333" w:history="1">
         <w:r>
           <w:rPr>
             <w:rStyle w:val="Hyperlink"/>
@@ -2547,7 +2547,7 @@
             <w:noProof/>
             <w:webHidden/>
           </w:rPr>
-          <w:instrText xml:space="preserve"> PAGEREF _Toc244002629 \h </w:instrText>
+          <w:instrText xml:space="preserve"> PAGEREF _Toc244159333 \h </w:instrText>
         </w:r>
         <w:r>
           <w:rPr>
@@ -2594,7 +2594,7 @@
           <w:lang w:eastAsia="nl-NL"/>
         </w:rPr>
       </w:pPr>
-      <w:hyperlink w:anchor="_Toc244002630" w:history="1">
+      <w:hyperlink w:anchor="_Toc244159334" w:history="1">
         <w:r>
           <w:rPr>
             <w:rStyle w:val="Hyperlink"/>
@@ -2639,7 +2639,7 @@
             <w:noProof/>
             <w:webHidden/>
           </w:rPr>
-          <w:instrText xml:space="preserve"> PAGEREF _Toc244002630 \h </w:instrText>
+          <w:instrText xml:space="preserve"> PAGEREF _Toc244159334 \h </w:instrText>
         </w:r>
         <w:r>
           <w:rPr>
@@ -2686,7 +2686,7 @@
           <w:lang w:eastAsia="nl-NL"/>
         </w:rPr>
       </w:pPr>
-      <w:hyperlink w:anchor="_Toc244002631" w:history="1">
+      <w:hyperlink w:anchor="_Toc244159335" w:history="1">
         <w:r>
           <w:rPr>
             <w:rStyle w:val="Hyperlink"/>
@@ -2731,7 +2731,7 @@
             <w:noProof/>
             <w:webHidden/>
           </w:rPr>
-          <w:instrText xml:space="preserve"> PAGEREF _Toc244002631 \h </w:instrText>
+          <w:instrText xml:space="preserve"> PAGEREF _Toc244159335 \h </w:instrText>
         </w:r>
         <w:r>
           <w:rPr>
@@ -2778,7 +2778,7 @@
           <w:lang w:eastAsia="nl-NL"/>
         </w:rPr>
       </w:pPr>
-      <w:hyperlink w:anchor="_Toc244002632" w:history="1">
+      <w:hyperlink w:anchor="_Toc244159336" w:history="1">
         <w:r>
           <w:rPr>
             <w:rStyle w:val="Hyperlink"/>
@@ -2823,7 +2823,7 @@
             <w:noProof/>
             <w:webHidden/>
           </w:rPr>
-          <w:instrText xml:space="preserve"> PAGEREF _Toc244002632 \h </w:instrText>
+          <w:instrText xml:space="preserve"> PAGEREF _Toc244159336 \h </w:instrText>
         </w:r>
         <w:r>
           <w:rPr>
@@ -2870,7 +2870,7 @@
           <w:lang w:eastAsia="nl-NL"/>
         </w:rPr>
       </w:pPr>
-      <w:hyperlink w:anchor="_Toc244002633" w:history="1">
+      <w:hyperlink w:anchor="_Toc244159337" w:history="1">
         <w:r>
           <w:rPr>
             <w:rStyle w:val="Hyperlink"/>
@@ -2915,7 +2915,7 @@
             <w:noProof/>
             <w:webHidden/>
           </w:rPr>
-          <w:instrText xml:space="preserve"> PAGEREF _Toc244002633 \h </w:instrText>
+          <w:instrText xml:space="preserve"> PAGEREF _Toc244159337 \h </w:instrText>
         </w:r>
         <w:r>
           <w:rPr>
@@ -2962,7 +2962,7 @@
           <w:lang w:eastAsia="nl-NL"/>
         </w:rPr>
       </w:pPr>
-      <w:hyperlink w:anchor="_Toc244002634" w:history="1">
+      <w:hyperlink w:anchor="_Toc244159338" w:history="1">
         <w:r>
           <w:rPr>
             <w:rStyle w:val="Hyperlink"/>
@@ -3007,7 +3007,7 @@
             <w:noProof/>
             <w:webHidden/>
           </w:rPr>
-          <w:instrText xml:space="preserve"> PAGEREF _Toc244002634 \h </w:instrText>
+          <w:instrText xml:space="preserve"> PAGEREF _Toc244159338 \h </w:instrText>
         </w:r>
         <w:r>
           <w:rPr>
@@ -3054,7 +3054,7 @@
           <w:lang w:eastAsia="nl-NL"/>
         </w:rPr>
       </w:pPr>
-      <w:hyperlink w:anchor="_Toc244002635" w:history="1">
+      <w:hyperlink w:anchor="_Toc244159339" w:history="1">
         <w:r>
           <w:rPr>
             <w:rStyle w:val="Hyperlink"/>
@@ -3115,7 +3115,7 @@
             <w:noProof/>
             <w:webHidden/>
           </w:rPr>
-          <w:instrText xml:space="preserve"> PAGEREF _Toc244002635 \h </w:instrText>
+          <w:instrText xml:space="preserve"> PAGEREF _Toc244159339 \h </w:instrText>
         </w:r>
         <w:r>
           <w:rPr>
@@ -3162,7 +3162,7 @@
           <w:lang w:eastAsia="nl-NL"/>
         </w:rPr>
       </w:pPr>
-      <w:hyperlink w:anchor="_Toc244002636" w:history="1">
+      <w:hyperlink w:anchor="_Toc244159340" w:history="1">
         <w:r>
           <w:rPr>
             <w:rStyle w:val="Hyperlink"/>
@@ -3207,7 +3207,7 @@
             <w:noProof/>
             <w:webHidden/>
           </w:rPr>
-          <w:instrText xml:space="preserve"> PAGEREF _Toc244002636 \h </w:instrText>
+          <w:instrText xml:space="preserve"> PAGEREF _Toc244159340 \h </w:instrText>
         </w:r>
         <w:r>
           <w:rPr>
@@ -3254,7 +3254,7 @@
           <w:lang w:eastAsia="nl-NL"/>
         </w:rPr>
       </w:pPr>
-      <w:hyperlink w:anchor="_Toc244002637" w:history="1">
+      <w:hyperlink w:anchor="_Toc244159341" w:history="1">
         <w:r>
           <w:rPr>
             <w:rStyle w:val="Hyperlink"/>
@@ -3299,7 +3299,7 @@
             <w:noProof/>
             <w:webHidden/>
           </w:rPr>
-          <w:instrText xml:space="preserve"> PAGEREF _Toc244002637 \h </w:instrText>
+          <w:instrText xml:space="preserve"> PAGEREF _Toc244159341 \h </w:instrText>
         </w:r>
         <w:r>
           <w:rPr>
@@ -3346,7 +3346,7 @@
           <w:lang w:eastAsia="nl-NL"/>
         </w:rPr>
       </w:pPr>
-      <w:hyperlink w:anchor="_Toc244002638" w:history="1">
+      <w:hyperlink w:anchor="_Toc244159342" w:history="1">
         <w:r>
           <w:rPr>
             <w:rStyle w:val="Hyperlink"/>
@@ -3391,7 +3391,7 @@
             <w:noProof/>
             <w:webHidden/>
           </w:rPr>
-          <w:instrText xml:space="preserve"> PAGEREF _Toc244002638 \h </w:instrText>
+          <w:instrText xml:space="preserve"> PAGEREF _Toc244159342 \h </w:instrText>
         </w:r>
         <w:r>
           <w:rPr>
@@ -3438,7 +3438,7 @@
           <w:lang w:eastAsia="nl-NL"/>
         </w:rPr>
       </w:pPr>
-      <w:hyperlink w:anchor="_Toc244002639" w:history="1">
+      <w:hyperlink w:anchor="_Toc244159343" w:history="1">
         <w:r>
           <w:rPr>
             <w:rStyle w:val="Hyperlink"/>
@@ -3483,7 +3483,7 @@
             <w:noProof/>
             <w:webHidden/>
           </w:rPr>
-          <w:instrText xml:space="preserve"> PAGEREF _Toc244002639 \h </w:instrText>
+          <w:instrText xml:space="preserve"> PAGEREF _Toc244159343 \h </w:instrText>
         </w:r>
         <w:r>
           <w:rPr>
@@ -3530,7 +3530,7 @@
           <w:lang w:eastAsia="nl-NL"/>
         </w:rPr>
       </w:pPr>
-      <w:hyperlink w:anchor="_Toc244002640" w:history="1">
+      <w:hyperlink w:anchor="_Toc244159344" w:history="1">
         <w:r>
           <w:rPr>
             <w:rStyle w:val="Hyperlink"/>
@@ -3591,7 +3591,7 @@
             <w:noProof/>
             <w:webHidden/>
           </w:rPr>
-          <w:instrText xml:space="preserve"> PAGEREF _Toc244002640 \h </w:instrText>
+          <w:instrText xml:space="preserve"> PAGEREF _Toc244159344 \h </w:instrText>
         </w:r>
         <w:r>
           <w:rPr>
@@ -3638,7 +3638,7 @@
           <w:lang w:eastAsia="nl-NL"/>
         </w:rPr>
       </w:pPr>
-      <w:hyperlink w:anchor="_Toc244002641" w:history="1">
+      <w:hyperlink w:anchor="_Toc244159345" w:history="1">
         <w:r>
           <w:rPr>
             <w:rStyle w:val="Hyperlink"/>
@@ -3683,7 +3683,7 @@
             <w:noProof/>
             <w:webHidden/>
           </w:rPr>
-          <w:instrText xml:space="preserve"> PAGEREF _Toc244002641 \h </w:instrText>
+          <w:instrText xml:space="preserve"> PAGEREF _Toc244159345 \h </w:instrText>
         </w:r>
         <w:r>
           <w:rPr>
@@ -3730,7 +3730,7 @@
           <w:lang w:eastAsia="nl-NL"/>
         </w:rPr>
       </w:pPr>
-      <w:hyperlink w:anchor="_Toc244002642" w:history="1">
+      <w:hyperlink w:anchor="_Toc244159346" w:history="1">
         <w:r>
           <w:rPr>
             <w:rStyle w:val="Hyperlink"/>
@@ -3775,7 +3775,7 @@
             <w:noProof/>
             <w:webHidden/>
           </w:rPr>
-          <w:instrText xml:space="preserve"> PAGEREF _Toc244002642 \h </w:instrText>
+          <w:instrText xml:space="preserve"> PAGEREF _Toc244159346 \h </w:instrText>
         </w:r>
         <w:r>
           <w:rPr>
@@ -3822,7 +3822,7 @@
           <w:lang w:eastAsia="nl-NL"/>
         </w:rPr>
       </w:pPr>
-      <w:hyperlink w:anchor="_Toc244002643" w:history="1">
+      <w:hyperlink w:anchor="_Toc244159347" w:history="1">
         <w:r>
           <w:rPr>
             <w:rStyle w:val="Hyperlink"/>
@@ -3869,7 +3869,7 @@
             <w:noProof/>
             <w:webHidden/>
           </w:rPr>
-          <w:instrText xml:space="preserve"> PAGEREF _Toc244002643 \h </w:instrText>
+          <w:instrText xml:space="preserve"> PAGEREF _Toc244159347 \h </w:instrText>
         </w:r>
         <w:r>
           <w:rPr>
@@ -3916,7 +3916,7 @@
           <w:lang w:eastAsia="nl-NL"/>
         </w:rPr>
       </w:pPr>
-      <w:hyperlink w:anchor="_Toc244002644" w:history="1">
+      <w:hyperlink w:anchor="_Toc244159348" w:history="1">
         <w:r>
           <w:rPr>
             <w:rStyle w:val="Hyperlink"/>
@@ -3963,7 +3963,7 @@
             <w:noProof/>
             <w:webHidden/>
           </w:rPr>
-          <w:instrText xml:space="preserve"> PAGEREF _Toc244002644 \h </w:instrText>
+          <w:instrText xml:space="preserve"> PAGEREF _Toc244159348 \h </w:instrText>
         </w:r>
         <w:r>
           <w:rPr>
@@ -4010,7 +4010,7 @@
           <w:lang w:eastAsia="nl-NL"/>
         </w:rPr>
       </w:pPr>
-      <w:hyperlink w:anchor="_Toc244002645" w:history="1">
+      <w:hyperlink w:anchor="_Toc244159349" w:history="1">
         <w:r>
           <w:rPr>
             <w:rStyle w:val="Hyperlink"/>
@@ -4057,7 +4057,7 @@
             <w:noProof/>
             <w:webHidden/>
           </w:rPr>
-          <w:instrText xml:space="preserve"> PAGEREF _Toc244002645 \h </w:instrText>
+          <w:instrText xml:space="preserve"> PAGEREF _Toc244159349 \h </w:instrText>
         </w:r>
         <w:r>
           <w:rPr>
@@ -4104,7 +4104,7 @@
           <w:lang w:eastAsia="nl-NL"/>
         </w:rPr>
       </w:pPr>
-      <w:hyperlink w:anchor="_Toc244002646" w:history="1">
+      <w:hyperlink w:anchor="_Toc244159350" w:history="1">
         <w:r>
           <w:rPr>
             <w:rStyle w:val="Hyperlink"/>
@@ -4151,7 +4151,7 @@
             <w:noProof/>
             <w:webHidden/>
           </w:rPr>
-          <w:instrText xml:space="preserve"> PAGEREF _Toc244002646 \h </w:instrText>
+          <w:instrText xml:space="preserve"> PAGEREF _Toc244159350 \h </w:instrText>
         </w:r>
         <w:r>
           <w:rPr>
@@ -4198,7 +4198,7 @@
           <w:lang w:eastAsia="nl-NL"/>
         </w:rPr>
       </w:pPr>
-      <w:hyperlink w:anchor="_Toc244002647" w:history="1">
+      <w:hyperlink w:anchor="_Toc244159351" w:history="1">
         <w:r>
           <w:rPr>
             <w:rStyle w:val="Hyperlink"/>
@@ -4245,7 +4245,7 @@
             <w:noProof/>
             <w:webHidden/>
           </w:rPr>
-          <w:instrText xml:space="preserve"> PAGEREF _Toc244002647 \h </w:instrText>
+          <w:instrText xml:space="preserve"> PAGEREF _Toc244159351 \h </w:instrText>
         </w:r>
         <w:r>
           <w:rPr>
@@ -4292,7 +4292,7 @@
           <w:lang w:eastAsia="nl-NL"/>
         </w:rPr>
       </w:pPr>
-      <w:hyperlink w:anchor="_Toc244002648" w:history="1">
+      <w:hyperlink w:anchor="_Toc244159352" w:history="1">
         <w:r>
           <w:rPr>
             <w:rStyle w:val="Hyperlink"/>
@@ -4339,7 +4339,7 @@
             <w:noProof/>
             <w:webHidden/>
           </w:rPr>
-          <w:instrText xml:space="preserve"> PAGEREF _Toc244002648 \h </w:instrText>
+          <w:instrText xml:space="preserve"> PAGEREF _Toc244159352 \h </w:instrText>
         </w:r>
         <w:r>
           <w:rPr>
@@ -4386,7 +4386,7 @@
           <w:lang w:eastAsia="nl-NL"/>
         </w:rPr>
       </w:pPr>
-      <w:hyperlink w:anchor="_Toc244002649" w:history="1">
+      <w:hyperlink w:anchor="_Toc244159353" w:history="1">
         <w:r>
           <w:rPr>
             <w:rStyle w:val="Hyperlink"/>
@@ -4431,7 +4431,7 @@
             <w:noProof/>
             <w:webHidden/>
           </w:rPr>
-          <w:instrText xml:space="preserve"> PAGEREF _Toc244002649 \h </w:instrText>
+          <w:instrText xml:space="preserve"> PAGEREF _Toc244159353 \h </w:instrText>
         </w:r>
         <w:r>
           <w:rPr>
@@ -4478,7 +4478,7 @@
           <w:lang w:eastAsia="nl-NL"/>
         </w:rPr>
       </w:pPr>
-      <w:hyperlink w:anchor="_Toc244002650" w:history="1">
+      <w:hyperlink w:anchor="_Toc244159354" w:history="1">
         <w:r>
           <w:rPr>
             <w:rStyle w:val="Hyperlink"/>
@@ -4523,7 +4523,7 @@
             <w:noProof/>
             <w:webHidden/>
           </w:rPr>
-          <w:instrText xml:space="preserve"> PAGEREF _Toc244002650 \h </w:instrText>
+          <w:instrText xml:space="preserve"> PAGEREF _Toc244159354 \h </w:instrText>
         </w:r>
         <w:r>
           <w:rPr>
@@ -4570,7 +4570,7 @@
           <w:lang w:eastAsia="nl-NL"/>
         </w:rPr>
       </w:pPr>
-      <w:hyperlink w:anchor="_Toc244002651" w:history="1">
+      <w:hyperlink w:anchor="_Toc244159355" w:history="1">
         <w:r>
           <w:rPr>
             <w:rStyle w:val="Hyperlink"/>
@@ -4647,7 +4647,7 @@
             <w:noProof/>
             <w:webHidden/>
           </w:rPr>
-          <w:instrText xml:space="preserve"> PAGEREF _Toc244002651 \h </w:instrText>
+          <w:instrText xml:space="preserve"> PAGEREF _Toc244159355 \h </w:instrText>
         </w:r>
         <w:r>
           <w:rPr>
@@ -4694,7 +4694,7 @@
           <w:lang w:eastAsia="nl-NL"/>
         </w:rPr>
       </w:pPr>
-      <w:hyperlink w:anchor="_Toc244002652" w:history="1">
+      <w:hyperlink w:anchor="_Toc244159356" w:history="1">
         <w:r>
           <w:rPr>
             <w:rStyle w:val="Hyperlink"/>
@@ -4739,7 +4739,7 @@
             <w:noProof/>
             <w:webHidden/>
           </w:rPr>
-          <w:instrText xml:space="preserve"> PAGEREF _Toc244002652 \h </w:instrText>
+          <w:instrText xml:space="preserve"> PAGEREF _Toc244159356 \h </w:instrText>
         </w:r>
         <w:r>
           <w:rPr>
@@ -4786,7 +4786,7 @@
           <w:lang w:eastAsia="nl-NL"/>
         </w:rPr>
       </w:pPr>
-      <w:hyperlink w:anchor="_Toc244002653" w:history="1">
+      <w:hyperlink w:anchor="_Toc244159357" w:history="1">
         <w:r>
           <w:rPr>
             <w:rStyle w:val="Hyperlink"/>
@@ -4831,7 +4831,7 @@
             <w:noProof/>
             <w:webHidden/>
           </w:rPr>
-          <w:instrText xml:space="preserve"> PAGEREF _Toc244002653 \h </w:instrText>
+          <w:instrText xml:space="preserve"> PAGEREF _Toc244159357 \h </w:instrText>
         </w:r>
         <w:r>
           <w:rPr>
@@ -4878,7 +4878,7 @@
           <w:lang w:eastAsia="nl-NL"/>
         </w:rPr>
       </w:pPr>
-      <w:hyperlink w:anchor="_Toc244002654" w:history="1">
+      <w:hyperlink w:anchor="_Toc244159358" w:history="1">
         <w:r>
           <w:rPr>
             <w:rStyle w:val="Hyperlink"/>
@@ -4923,7 +4923,7 @@
             <w:noProof/>
             <w:webHidden/>
           </w:rPr>
-          <w:instrText xml:space="preserve"> PAGEREF _Toc244002654 \h </w:instrText>
+          <w:instrText xml:space="preserve"> PAGEREF _Toc244159358 \h </w:instrText>
         </w:r>
         <w:r>
           <w:rPr>
@@ -4970,7 +4970,7 @@
           <w:lang w:eastAsia="nl-NL"/>
         </w:rPr>
       </w:pPr>
-      <w:hyperlink w:anchor="_Toc244002655" w:history="1">
+      <w:hyperlink w:anchor="_Toc244159359" w:history="1">
         <w:r>
           <w:rPr>
             <w:rStyle w:val="Hyperlink"/>
@@ -5015,7 +5015,7 @@
             <w:noProof/>
             <w:webHidden/>
           </w:rPr>
-          <w:instrText xml:space="preserve"> PAGEREF _Toc244002655 \h </w:instrText>
+          <w:instrText xml:space="preserve"> PAGEREF _Toc244159359 \h </w:instrText>
         </w:r>
         <w:r>
           <w:rPr>
@@ -5062,7 +5062,7 @@
           <w:lang w:eastAsia="nl-NL"/>
         </w:rPr>
       </w:pPr>
-      <w:hyperlink w:anchor="_Toc244002656" w:history="1">
+      <w:hyperlink w:anchor="_Toc244159360" w:history="1">
         <w:r>
           <w:rPr>
             <w:rStyle w:val="Hyperlink"/>
@@ -5107,7 +5107,7 @@
             <w:noProof/>
             <w:webHidden/>
           </w:rPr>
-          <w:instrText xml:space="preserve"> PAGEREF _Toc244002656 \h </w:instrText>
+          <w:instrText xml:space="preserve"> PAGEREF _Toc244159360 \h </w:instrText>
         </w:r>
         <w:r>
           <w:rPr>
@@ -5154,7 +5154,7 @@
           <w:lang w:eastAsia="nl-NL"/>
         </w:rPr>
       </w:pPr>
-      <w:hyperlink w:anchor="_Toc244002657" w:history="1">
+      <w:hyperlink w:anchor="_Toc244159361" w:history="1">
         <w:r>
           <w:rPr>
             <w:rStyle w:val="Hyperlink"/>
@@ -5199,7 +5199,7 @@
             <w:noProof/>
             <w:webHidden/>
           </w:rPr>
-          <w:instrText xml:space="preserve"> PAGEREF _Toc244002657 \h </w:instrText>
+          <w:instrText xml:space="preserve"> PAGEREF _Toc244159361 \h </w:instrText>
         </w:r>
         <w:r>
           <w:rPr>
@@ -5246,7 +5246,7 @@
           <w:lang w:eastAsia="nl-NL"/>
         </w:rPr>
       </w:pPr>
-      <w:hyperlink w:anchor="_Toc244002658" w:history="1">
+      <w:hyperlink w:anchor="_Toc244159362" w:history="1">
         <w:r>
           <w:rPr>
             <w:rStyle w:val="Hyperlink"/>
@@ -5291,7 +5291,7 @@
             <w:noProof/>
             <w:webHidden/>
           </w:rPr>
-          <w:instrText xml:space="preserve"> PAGEREF _Toc244002658 \h </w:instrText>
+          <w:instrText xml:space="preserve"> PAGEREF _Toc244159362 \h </w:instrText>
         </w:r>
         <w:r>
           <w:rPr>
@@ -5338,7 +5338,7 @@
           <w:lang w:eastAsia="nl-NL"/>
         </w:rPr>
       </w:pPr>
-      <w:hyperlink w:anchor="_Toc244002659" w:history="1">
+      <w:hyperlink w:anchor="_Toc244159363" w:history="1">
         <w:r>
           <w:rPr>
             <w:rStyle w:val="Hyperlink"/>
@@ -5383,7 +5383,7 @@
             <w:noProof/>
             <w:webHidden/>
           </w:rPr>
-          <w:instrText xml:space="preserve"> PAGEREF _Toc244002659 \h </w:instrText>
+          <w:instrText xml:space="preserve"> PAGEREF _Toc244159363 \h </w:instrText>
         </w:r>
         <w:r>
           <w:rPr>
@@ -5430,7 +5430,7 @@
           <w:lang w:eastAsia="nl-NL"/>
         </w:rPr>
       </w:pPr>
-      <w:hyperlink w:anchor="_Toc244002660" w:history="1">
+      <w:hyperlink w:anchor="_Toc244159364" w:history="1">
         <w:r>
           <w:rPr>
             <w:rStyle w:val="Hyperlink"/>
@@ -5475,7 +5475,7 @@
             <w:noProof/>
             <w:webHidden/>
           </w:rPr>
-          <w:instrText xml:space="preserve"> PAGEREF _Toc244002660 \h </w:instrText>
+          <w:instrText xml:space="preserve"> PAGEREF _Toc244159364 \h </w:instrText>
         </w:r>
         <w:r>
           <w:rPr>
@@ -5522,7 +5522,7 @@
           <w:lang w:eastAsia="nl-NL"/>
         </w:rPr>
       </w:pPr>
-      <w:hyperlink w:anchor="_Toc244002661" w:history="1">
+      <w:hyperlink w:anchor="_Toc244159365" w:history="1">
         <w:r>
           <w:rPr>
             <w:rStyle w:val="Hyperlink"/>
@@ -5567,7 +5567,7 @@
             <w:noProof/>
             <w:webHidden/>
           </w:rPr>
-          <w:instrText xml:space="preserve"> PAGEREF _Toc244002661 \h </w:instrText>
+          <w:instrText xml:space="preserve"> PAGEREF _Toc244159365 \h </w:instrText>
         </w:r>
         <w:r>
           <w:rPr>
@@ -5614,7 +5614,7 @@
           <w:lang w:eastAsia="nl-NL"/>
         </w:rPr>
       </w:pPr>
-      <w:hyperlink w:anchor="_Toc244002662" w:history="1">
+      <w:hyperlink w:anchor="_Toc244159366" w:history="1">
         <w:r>
           <w:rPr>
             <w:rStyle w:val="Hyperlink"/>
@@ -5659,7 +5659,7 @@
             <w:noProof/>
             <w:webHidden/>
           </w:rPr>
-          <w:instrText xml:space="preserve"> PAGEREF _Toc244002662 \h </w:instrText>
+          <w:instrText xml:space="preserve"> PAGEREF _Toc244159366 \h </w:instrText>
         </w:r>
         <w:r>
           <w:rPr>
@@ -5712,7 +5712,7 @@
         </w:numPr>
       </w:pPr>
       <w:bookmarkStart w:id="1" w:name="k1"/>
-      <w:bookmarkStart w:id="2" w:name="_Toc244002604"/>
+      <w:bookmarkStart w:id="2" w:name="_Toc244159308"/>
       <w:r>
         <w:t>DOEL VAN DE APPLICATIE.</w:t>
       </w:r>
@@ -5794,7 +5794,7 @@
         </w:numPr>
       </w:pPr>
       <w:bookmarkStart w:id="3" w:name="k2"/>
-      <w:bookmarkStart w:id="4" w:name="_Toc244002605"/>
+      <w:bookmarkStart w:id="4" w:name="_Toc244159309"/>
       <w:r>
         <w:t>BESTANDEN.</w:t>
       </w:r>
@@ -10269,7 +10269,7 @@
         </w:numPr>
       </w:pPr>
       <w:bookmarkStart w:id="5" w:name="k3"/>
-      <w:bookmarkStart w:id="6" w:name="_Toc244002606"/>
+      <w:bookmarkStart w:id="6" w:name="_Toc244159310"/>
       <w:r>
         <w:t>DE WEBSITE STARTEN.</w:t>
       </w:r>
@@ -10491,7 +10491,7 @@
         </w:numPr>
       </w:pPr>
       <w:bookmarkStart w:id="7" w:name="k4"/>
-      <w:bookmarkStart w:id="8" w:name="_Toc244002607"/>
+      <w:bookmarkStart w:id="8" w:name="_Toc244159311"/>
       <w:r>
         <w:t>GEBRUIKERSHANDLEIDING.</w:t>
       </w:r>
@@ -10531,7 +10531,7 @@
         <w:keepNext/>
       </w:pPr>
       <w:bookmarkStart w:id="9" w:name="k5"/>
-      <w:bookmarkStart w:id="10" w:name="_Toc244002608"/>
+      <w:bookmarkStart w:id="10" w:name="_Toc244159312"/>
       <w:r>
         <w:t>EEN MEDEWERKER ZOEKEN</w:t>
       </w:r>
@@ -10597,7 +10597,7 @@
         <w:keepNext/>
       </w:pPr>
       <w:bookmarkStart w:id="11" w:name="k6"/>
-      <w:bookmarkStart w:id="12" w:name="_Toc244002609"/>
+      <w:bookmarkStart w:id="12" w:name="_Toc244159313"/>
       <w:r>
         <w:t>EEN PRODUCT REGISTREREN</w:t>
       </w:r>
@@ -10846,7 +10846,7 @@
         <w:keepNext/>
       </w:pPr>
       <w:bookmarkStart w:id="13" w:name="k7"/>
-      <w:bookmarkStart w:id="14" w:name="_Toc244002610"/>
+      <w:bookmarkStart w:id="14" w:name="_Toc244159314"/>
       <w:r>
         <w:t>ADMIN-DASHBOARD OPENEN</w:t>
       </w:r>
@@ -10977,7 +10977,7 @@
         <w:keepNext/>
       </w:pPr>
       <w:bookmarkStart w:id="15" w:name="k8"/>
-      <w:bookmarkStart w:id="16" w:name="_Toc244002611"/>
+      <w:bookmarkStart w:id="16" w:name="_Toc244159315"/>
       <w:r>
         <w:t>REGISTRATIES BEHEREN</w:t>
       </w:r>
@@ -11263,7 +11263,7 @@
         <w:keepNext/>
       </w:pPr>
       <w:bookmarkStart w:id="17" w:name="k9"/>
-      <w:bookmarkStart w:id="18" w:name="_Toc244002612"/>
+      <w:bookmarkStart w:id="18" w:name="_Toc244159316"/>
       <w:r>
         <w:t>MEDEWERKERS BEHEREN</w:t>
       </w:r>
@@ -11644,7 +11644,7 @@
         <w:keepNext/>
       </w:pPr>
       <w:bookmarkStart w:id="19" w:name="k10"/>
-      <w:bookmarkStart w:id="20" w:name="_Toc244002613"/>
+      <w:bookmarkStart w:id="20" w:name="_Toc244159317"/>
       <w:r>
         <w:t>PRODUCTEN BEHEREN</w:t>
       </w:r>
@@ -11772,7 +11772,7 @@
         <w:keepNext/>
       </w:pPr>
       <w:bookmarkStart w:id="21" w:name="k11"/>
-      <w:bookmarkStart w:id="22" w:name="_Toc244002614"/>
+      <w:bookmarkStart w:id="22" w:name="_Toc244159318"/>
       <w:r>
         <w:t>BEDRIJVEN EN CONSUMPTIEPUNTEN BEHEREN</w:t>
       </w:r>
@@ -11935,7 +11935,7 @@
         <w:keepNext/>
       </w:pPr>
       <w:bookmarkStart w:id="23" w:name="k12"/>
-      <w:bookmarkStart w:id="24" w:name="_Toc244002615"/>
+      <w:bookmarkStart w:id="24" w:name="_Toc244159319"/>
       <w:r>
         <w:t>VOORRAAD BEHEREN</w:t>
       </w:r>
@@ -12153,7 +12153,7 @@
         <w:keepNext/>
       </w:pPr>
       <w:bookmarkStart w:id="25" w:name="k13"/>
-      <w:bookmarkStart w:id="26" w:name="_Toc244002616"/>
+      <w:bookmarkStart w:id="26" w:name="_Toc244159320"/>
       <w:r>
         <w:t>LOGBOEK BEKIJKEN</w:t>
       </w:r>
@@ -12193,7 +12193,7 @@
         <w:keepNext/>
       </w:pPr>
       <w:bookmarkStart w:id="27" w:name="k14"/>
-      <w:bookmarkStart w:id="28" w:name="_Toc244002617"/>
+      <w:bookmarkStart w:id="28" w:name="_Toc244159321"/>
       <w:r>
         <w:t>ALLE GEGEVENS WISSEN</w:t>
       </w:r>
@@ -12319,7 +12319,7 @@
         <w:keepNext/>
       </w:pPr>
       <w:bookmarkStart w:id="29" w:name="k15"/>
-      <w:bookmarkStart w:id="30" w:name="_Toc244002618"/>
+      <w:bookmarkStart w:id="30" w:name="_Toc244159322"/>
       <w:r>
         <w:t>MODAL SLUITEN EN UITLOGGEN</w:t>
       </w:r>
@@ -12393,7 +12393,7 @@
         <w:keepNext/>
       </w:pPr>
       <w:bookmarkStart w:id="31" w:name="k16"/>
-      <w:bookmarkStart w:id="32" w:name="_Toc244002619"/>
+      <w:bookmarkStart w:id="32" w:name="_Toc244159323"/>
       <w:r>
         <w:t>CSV EXPORTEREN</w:t>
       </w:r>
@@ -12777,7 +12777,7 @@
         <w:keepNext/>
       </w:pPr>
       <w:bookmarkStart w:id="33" w:name="k17"/>
-      <w:bookmarkStart w:id="34" w:name="_Toc244002620"/>
+      <w:bookmarkStart w:id="34" w:name="_Toc244159324"/>
       <w:r>
         <w:t>LICHT OF DONKER THEMA</w:t>
       </w:r>
@@ -12884,7 +12884,7 @@
         <w:keepNext/>
       </w:pPr>
       <w:bookmarkStart w:id="35" w:name="k18"/>
-      <w:bookmarkStart w:id="36" w:name="_Toc244002621"/>
+      <w:bookmarkStart w:id="36" w:name="_Toc244159325"/>
       <w:r>
         <w:t>WELKOM EN "ZELFDE ALS VORIGE KEER"</w:t>
       </w:r>
@@ -12971,7 +12971,7 @@
         <w:keepNext/>
       </w:pPr>
       <w:bookmarkStart w:id="37" w:name="k19"/>
-      <w:bookmarkStart w:id="38" w:name="_Toc244002622"/>
+      <w:bookmarkStart w:id="38" w:name="_Toc244159326"/>
       <w:r>
         <w:t>DEMO GEZICHTSHERKENNING</w:t>
       </w:r>
@@ -13561,7 +13561,7 @@
         <w:keepNext/>
       </w:pPr>
       <w:bookmarkStart w:id="39" w:name="k20"/>
-      <w:bookmarkStart w:id="40" w:name="_Toc244002623"/>
+      <w:bookmarkStart w:id="40" w:name="_Toc244159327"/>
       <w:r>
         <w:t>HERKENNEN MET DE PAS</w:t>
       </w:r>
@@ -13749,7 +13749,7 @@
     </w:p>
     <w:p>
       <w:r>
-        <w:t>Let op: het nummer van een pas is niet geheim en kan met goedkope apparatuur worden gekopieerd. Herkennen met de pas is dus gemak, geen bewijs van identiteit. Zie het TO voor de beveiliging en de koppeling met AFAS of het toegangssysteem van TVB in productie.</w:t>
+        <w:t>Let op: het nummer van een pas is niet geheim en kan met goedkope apparatuur worden gekopieerd. Herkennen met de pas is dus gemak, geen bewijs van identiteit. Zie het TO voor de beveiliging en voor hoe de passen in productie worden gekoppeld ("Herkomst van het pasnummer").</w:t>
       </w:r>
     </w:p>
     <w:p>
@@ -13758,7 +13758,7 @@
         <w:keepNext/>
       </w:pPr>
       <w:bookmarkStart w:id="41" w:name="k21"/>
-      <w:bookmarkStart w:id="42" w:name="_Toc244002624"/>
+      <w:bookmarkStart w:id="42" w:name="_Toc244159328"/>
       <w:r>
         <w:t>SLIMME KOELKAST (DEMO)</w:t>
       </w:r>
@@ -14392,7 +14392,7 @@
         <w:keepNext/>
       </w:pPr>
       <w:bookmarkStart w:id="43" w:name="k22"/>
-      <w:bookmarkStart w:id="44" w:name="_Toc244002625"/>
+      <w:bookmarkStart w:id="44" w:name="_Toc244159329"/>
       <w:r>
         <w:t>HET STARTSCHERM EN AUTOMATISCH SCANNEN (DEMO)</w:t>
       </w:r>
@@ -14960,7 +14960,7 @@
         </w:numPr>
       </w:pPr>
       <w:bookmarkStart w:id="45" w:name="k23"/>
-      <w:bookmarkStart w:id="46" w:name="_Toc244002626"/>
+      <w:bookmarkStart w:id="46" w:name="_Toc244159330"/>
       <w:r>
         <w:t xml:space="preserve">UITLEG VAN </w:t>
       </w:r>
@@ -14984,7 +14984,7 @@
         <w:keepNext/>
       </w:pPr>
       <w:bookmarkStart w:id="47" w:name="k24"/>
-      <w:bookmarkStart w:id="48" w:name="_Toc244002627"/>
+      <w:bookmarkStart w:id="48" w:name="_Toc244159331"/>
       <w:r>
         <w:t>METADATA EN EXTERNE BESTANDEN</w:t>
       </w:r>
@@ -15307,7 +15307,7 @@
         <w:keepNext/>
       </w:pPr>
       <w:bookmarkStart w:id="49" w:name="k25"/>
-      <w:bookmarkStart w:id="50" w:name="_Toc244002628"/>
+      <w:bookmarkStart w:id="50" w:name="_Toc244159332"/>
       <w:r>
         <w:t>NAVIGATIEBALK</w:t>
       </w:r>
@@ -15520,7 +15520,7 @@
         <w:keepNext/>
       </w:pPr>
       <w:bookmarkStart w:id="51" w:name="k26"/>
-      <w:bookmarkStart w:id="52" w:name="_Toc244002629"/>
+      <w:bookmarkStart w:id="52" w:name="_Toc244159333"/>
       <w:r>
         <w:t>HERO-GEDEELTE</w:t>
       </w:r>
@@ -15565,7 +15565,7 @@
         <w:keepNext/>
       </w:pPr>
       <w:bookmarkStart w:id="53" w:name="k27"/>
-      <w:bookmarkStart w:id="54" w:name="_Toc244002630"/>
+      <w:bookmarkStart w:id="54" w:name="_Toc244159334"/>
       <w:r>
         <w:t>MEDEWERKERLIJST</w:t>
       </w:r>
@@ -15902,7 +15902,7 @@
         <w:keepNext/>
       </w:pPr>
       <w:bookmarkStart w:id="55" w:name="k28"/>
-      <w:bookmarkStart w:id="56" w:name="_Toc244002631"/>
+      <w:bookmarkStart w:id="56" w:name="_Toc244159335"/>
       <w:r>
         <w:t>STATISTIEKEN</w:t>
       </w:r>
@@ -15985,7 +15985,7 @@
         <w:keepNext/>
       </w:pPr>
       <w:bookmarkStart w:id="57" w:name="k29"/>
-      <w:bookmarkStart w:id="58" w:name="_Toc244002632"/>
+      <w:bookmarkStart w:id="58" w:name="_Toc244159336"/>
       <w:r>
         <w:t>VENSTERS (MODALS)</w:t>
       </w:r>
@@ -16647,7 +16647,7 @@
         <w:keepNext/>
       </w:pPr>
       <w:bookmarkStart w:id="59" w:name="k30"/>
-      <w:bookmarkStart w:id="60" w:name="_Toc244002633"/>
+      <w:bookmarkStart w:id="60" w:name="_Toc244159337"/>
       <w:r>
         <w:t>STARTSCHERM</w:t>
       </w:r>
@@ -16874,7 +16874,7 @@
         <w:keepNext/>
       </w:pPr>
       <w:bookmarkStart w:id="61" w:name="k31"/>
-      <w:bookmarkStart w:id="62" w:name="_Toc244002634"/>
+      <w:bookmarkStart w:id="62" w:name="_Toc244159338"/>
       <w:r>
         <w:t>WAARSCHUWING BIJ OPENEN ALS LOS BESTAND</w:t>
       </w:r>
@@ -16919,7 +16919,7 @@
         </w:numPr>
       </w:pPr>
       <w:bookmarkStart w:id="63" w:name="k32"/>
-      <w:bookmarkStart w:id="64" w:name="_Toc244002635"/>
+      <w:bookmarkStart w:id="64" w:name="_Toc244159339"/>
       <w:r>
         <w:t>UITLEG VAN DE CSS (</w:t>
       </w:r>
@@ -16943,7 +16943,7 @@
         <w:keepNext/>
       </w:pPr>
       <w:bookmarkStart w:id="65" w:name="k33"/>
-      <w:bookmarkStart w:id="66" w:name="_Toc244002636"/>
+      <w:bookmarkStart w:id="66" w:name="_Toc244159340"/>
       <w:r>
         <w:t>BESTANDEN EN VOLGORDE</w:t>
       </w:r>
@@ -18262,7 +18262,7 @@
         <w:keepNext/>
       </w:pPr>
       <w:bookmarkStart w:id="67" w:name="k34"/>
-      <w:bookmarkStart w:id="68" w:name="_Toc244002637"/>
+      <w:bookmarkStart w:id="68" w:name="_Toc244159341"/>
       <w:r>
         <w:t>CSS-VARIABELEN</w:t>
       </w:r>
@@ -19105,7 +19105,7 @@
         <w:keepNext/>
       </w:pPr>
       <w:bookmarkStart w:id="69" w:name="k35"/>
-      <w:bookmarkStart w:id="70" w:name="_Toc244002638"/>
+      <w:bookmarkStart w:id="70" w:name="_Toc244159342"/>
       <w:r>
         <w:t>LAYOUT</w:t>
       </w:r>
@@ -19814,7 +19814,7 @@
         <w:keepNext/>
       </w:pPr>
       <w:bookmarkStart w:id="71" w:name="k36"/>
-      <w:bookmarkStart w:id="72" w:name="_Toc244002639"/>
+      <w:bookmarkStart w:id="72" w:name="_Toc244159343"/>
       <w:r>
         <w:t>COMPONENTEN</w:t>
       </w:r>
@@ -20059,7 +20059,7 @@
         </w:numPr>
       </w:pPr>
       <w:bookmarkStart w:id="73" w:name="k37"/>
-      <w:bookmarkStart w:id="74" w:name="_Toc244002640"/>
+      <w:bookmarkStart w:id="74" w:name="_Toc244159344"/>
       <w:r>
         <w:t>UITLEG VAN DE JAVASCRIPT (</w:t>
       </w:r>
@@ -20083,7 +20083,7 @@
         <w:keepNext/>
       </w:pPr>
       <w:bookmarkStart w:id="75" w:name="k38"/>
-      <w:bookmarkStart w:id="76" w:name="_Toc244002641"/>
+      <w:bookmarkStart w:id="76" w:name="_Toc244159345"/>
       <w:r>
         <w:t>OPSLAG EN VOORBEELDDATA</w:t>
       </w:r>
@@ -20861,7 +20861,7 @@
         <w:keepNext/>
       </w:pPr>
       <w:bookmarkStart w:id="77" w:name="k39"/>
-      <w:bookmarkStart w:id="78" w:name="_Toc244002642"/>
+      <w:bookmarkStart w:id="78" w:name="_Toc244159346"/>
       <w:r>
         <w:t>OBJECTGEORIËNTEERDE STRUCTUUR</w:t>
       </w:r>
@@ -28315,7 +28315,7 @@
         <w:keepNext/>
       </w:pPr>
       <w:bookmarkStart w:id="93" w:name="k54"/>
-      <w:bookmarkStart w:id="94" w:name="_Toc244002643"/>
+      <w:bookmarkStart w:id="94" w:name="_Toc244159347"/>
       <w:r>
         <w:rPr>
           <w:rFonts w:ascii="Consolas" w:hAnsi="Consolas" w:cs="Consolas"/>
@@ -28458,7 +28458,7 @@
         <w:keepNext/>
       </w:pPr>
       <w:bookmarkStart w:id="95" w:name="k55"/>
-      <w:bookmarkStart w:id="96" w:name="_Toc244002644"/>
+      <w:bookmarkStart w:id="96" w:name="_Toc244159348"/>
       <w:r>
         <w:rPr>
           <w:rFonts w:ascii="Consolas" w:hAnsi="Consolas" w:cs="Consolas"/>
@@ -28535,7 +28535,7 @@
         <w:keepNext/>
       </w:pPr>
       <w:bookmarkStart w:id="97" w:name="k56"/>
-      <w:bookmarkStart w:id="98" w:name="_Toc244002645"/>
+      <w:bookmarkStart w:id="98" w:name="_Toc244159349"/>
       <w:r>
         <w:rPr>
           <w:rFonts w:ascii="Consolas" w:hAnsi="Consolas" w:cs="Consolas"/>
@@ -28706,7 +28706,7 @@
         <w:keepNext/>
       </w:pPr>
       <w:bookmarkStart w:id="99" w:name="k57"/>
-      <w:bookmarkStart w:id="100" w:name="_Toc244002646"/>
+      <w:bookmarkStart w:id="100" w:name="_Toc244159350"/>
       <w:r>
         <w:rPr>
           <w:rFonts w:ascii="Consolas" w:hAnsi="Consolas" w:cs="Consolas"/>
@@ -28773,7 +28773,7 @@
         <w:keepNext/>
       </w:pPr>
       <w:bookmarkStart w:id="101" w:name="k58"/>
-      <w:bookmarkStart w:id="102" w:name="_Toc244002647"/>
+      <w:bookmarkStart w:id="102" w:name="_Toc244159351"/>
       <w:r>
         <w:rPr>
           <w:rFonts w:ascii="Consolas" w:hAnsi="Consolas" w:cs="Consolas"/>
@@ -28895,7 +28895,7 @@
         <w:keepNext/>
       </w:pPr>
       <w:bookmarkStart w:id="103" w:name="k59"/>
-      <w:bookmarkStart w:id="104" w:name="_Toc244002648"/>
+      <w:bookmarkStart w:id="104" w:name="_Toc244159352"/>
       <w:r>
         <w:rPr>
           <w:rFonts w:ascii="Consolas" w:hAnsi="Consolas" w:cs="Consolas"/>
@@ -29017,7 +29017,7 @@
         <w:keepNext/>
       </w:pPr>
       <w:bookmarkStart w:id="105" w:name="k60"/>
-      <w:bookmarkStart w:id="106" w:name="_Toc244002649"/>
+      <w:bookmarkStart w:id="106" w:name="_Toc244159353"/>
       <w:r>
         <w:t>OPSLAGFOUTEN EN TERUGDRAAIEN</w:t>
       </w:r>
@@ -29079,7 +29079,7 @@
         <w:keepNext/>
       </w:pPr>
       <w:bookmarkStart w:id="107" w:name="k61"/>
-      <w:bookmarkStart w:id="108" w:name="_Toc244002650"/>
+      <w:bookmarkStart w:id="108" w:name="_Toc244159354"/>
       <w:r>
         <w:t>ADMINFUNCTIES</w:t>
       </w:r>
@@ -29325,7 +29325,7 @@
         <w:keepNext/>
       </w:pPr>
       <w:bookmarkStart w:id="109" w:name="k62"/>
-      <w:bookmarkStart w:id="110" w:name="_Toc244002651"/>
+      <w:bookmarkStart w:id="110" w:name="_Toc244159355"/>
       <w:r>
         <w:t xml:space="preserve">CSV-EXPORT (CLASS </w:t>
       </w:r>
@@ -29733,7 +29733,7 @@
         <w:keepNext/>
       </w:pPr>
       <w:bookmarkStart w:id="111" w:name="k63"/>
-      <w:bookmarkStart w:id="112" w:name="_Toc244002652"/>
+      <w:bookmarkStart w:id="112" w:name="_Toc244159356"/>
       <w:r>
         <w:t>EVENT LISTENERS</w:t>
       </w:r>
@@ -30430,7 +30430,7 @@
         </w:numPr>
       </w:pPr>
       <w:bookmarkStart w:id="113" w:name="k64"/>
-      <w:bookmarkStart w:id="114" w:name="_Toc244002653"/>
+      <w:bookmarkStart w:id="114" w:name="_Toc244159357"/>
       <w:r>
         <w:t>DATAMODEL EN KOPPELINGEN.</w:t>
       </w:r>
@@ -30448,7 +30448,7 @@
         <w:keepNext/>
       </w:pPr>
       <w:bookmarkStart w:id="115" w:name="k65"/>
-      <w:bookmarkStart w:id="116" w:name="_Toc244002654"/>
+      <w:bookmarkStart w:id="116" w:name="_Toc244159358"/>
       <w:r>
         <w:t>BEDRIJVEN</w:t>
       </w:r>
@@ -30659,7 +30659,7 @@
         <w:keepNext/>
       </w:pPr>
       <w:bookmarkStart w:id="117" w:name="k66"/>
-      <w:bookmarkStart w:id="118" w:name="_Toc244002655"/>
+      <w:bookmarkStart w:id="118" w:name="_Toc244159359"/>
       <w:r>
         <w:t>CONSUMPTIEPUNTEN</w:t>
       </w:r>
@@ -30978,7 +30978,7 @@
         <w:keepNext/>
       </w:pPr>
       <w:bookmarkStart w:id="119" w:name="k67"/>
-      <w:bookmarkStart w:id="120" w:name="_Toc244002656"/>
+      <w:bookmarkStart w:id="120" w:name="_Toc244159360"/>
       <w:r>
         <w:t>MEDEWERKERS</w:t>
       </w:r>
@@ -31534,7 +31534,7 @@
         <w:keepNext/>
       </w:pPr>
       <w:bookmarkStart w:id="121" w:name="k68"/>
-      <w:bookmarkStart w:id="122" w:name="_Toc244002657"/>
+      <w:bookmarkStart w:id="122" w:name="_Toc244159361"/>
       <w:r>
         <w:t>REGISTRATIES</w:t>
       </w:r>
@@ -32195,7 +32195,7 @@
         <w:keepNext/>
       </w:pPr>
       <w:bookmarkStart w:id="123" w:name="k69"/>
-      <w:bookmarkStart w:id="124" w:name="_Toc244002658"/>
+      <w:bookmarkStart w:id="124" w:name="_Toc244159362"/>
       <w:r>
         <w:t>SLIMME KOELKAST</w:t>
       </w:r>
@@ -32615,7 +32615,7 @@
         <w:keepNext/>
       </w:pPr>
       <w:bookmarkStart w:id="125" w:name="k70"/>
-      <w:bookmarkStart w:id="126" w:name="_Toc244002659"/>
+      <w:bookmarkStart w:id="126" w:name="_Toc244159363"/>
       <w:r>
         <w:t>DEMO GEZICHTSHERKENNING</w:t>
       </w:r>
@@ -32958,7 +32958,7 @@
         </w:numPr>
       </w:pPr>
       <w:bookmarkStart w:id="127" w:name="k71"/>
-      <w:bookmarkStart w:id="128" w:name="_Toc244002660"/>
+      <w:bookmarkStart w:id="128" w:name="_Toc244159364"/>
       <w:r>
         <w:t>BELANGRIJKE DEMO-BEPERKINGEN.</w:t>
       </w:r>
@@ -33392,7 +33392,7 @@
         <w:contextualSpacing w:val="0"/>
       </w:pPr>
       <w:r>
-        <w:t>Herkennen met de pas is gemak, geen bewijs van identiteit: het nummer van een pas is niet geheim en kan worden gekopieerd. In productie komt het pasnummer uit AFAS of het toegangssysteem van TVB, gekoppeld aan het personeelsnummer.</w:t>
+        <w:t>Herkennen met de pas is gemak, geen bewijs van identiteit: het nummer van een pas is niet geheim en kan worden gekopieerd. TVB heeft geen centraal systeem met pasnummers (navraag 29 oktober 2026): de passen worden nu bij de printers gebruikt, waar medewerkers ze zelf toevoegen. In productie wordt de koppeling daarom eenmalig gevuld met de serienummers van de passen (als die te krijgen zijn) of door de medewerker zelf met een code per e-mail. Zie het TO, "Herkomst van het pasnummer".</w:t>
       </w:r>
     </w:p>
     <w:p>
@@ -33424,7 +33424,7 @@
         </w:numPr>
       </w:pPr>
       <w:bookmarkStart w:id="129" w:name="k72"/>
-      <w:bookmarkStart w:id="130" w:name="_Toc244002661"/>
+      <w:bookmarkStart w:id="130" w:name="_Toc244159365"/>
       <w:r>
         <w:t>CODE UITLEGGEN TIJDENS EEN PRESENTATIE.</w:t>
       </w:r>
@@ -33830,7 +33830,7 @@
         </w:numPr>
       </w:pPr>
       <w:bookmarkStart w:id="131" w:name="k73"/>
-      <w:bookmarkStart w:id="132" w:name="_Toc244002662"/>
+      <w:bookmarkStart w:id="132" w:name="_Toc244159366"/>
       <w:r>
         <w:t>MOGELIJKE VERVOLGSTAPPEN.</w:t>
       </w:r>
@@ -34410,7 +34410,7 @@
         <v:path o:extrusionok="f" gradientshapeok="t" o:connecttype="rect"/>
         <o:lock v:ext="edit" aspectratio="t"/>
       </v:shapetype>
-      <v:shape id="_x0000_i1025" type="#_x0000_t75" style="width:254.25pt;height:219.75pt" o:bullet="t">
+      <v:shape id="_x0000_i1025" type="#_x0000_t75" style="width:254pt;height:219.5pt" o:bullet="t">
         <v:imagedata r:id="rId1" o:title="Bulletpoint"/>
       </v:shape>
     </w:pict>

</xml_diff>

<commit_message>
TO 3.24: TVB onderzoekt een eigen systeem voor de passen (route C)
</commit_message>
<xml_diff>
--- a/docs/DOCUMENTATIE.docx
+++ b/docs/DOCUMENTATIE.docx
@@ -82,7 +82,7 @@
           <w:numId w:val="0"/>
         </w:numPr>
       </w:pPr>
-      <w:bookmarkStart w:id="0" w:name="_Toc244159307"/>
+      <w:bookmarkStart w:id="0" w:name="_Toc244166262"/>
       <w:r>
         <w:t>INHOUDSOPGAVE.</w:t>
       </w:r>
@@ -112,7 +112,7 @@
       <w:r>
         <w:fldChar w:fldCharType="separate"/>
       </w:r>
-      <w:hyperlink w:anchor="_Toc244159307" w:history="1">
+      <w:hyperlink w:anchor="_Toc244166262" w:history="1">
         <w:r>
           <w:rPr>
             <w:rStyle w:val="Hyperlink"/>
@@ -139,7 +139,7 @@
             <w:noProof/>
             <w:webHidden/>
           </w:rPr>
-          <w:instrText xml:space="preserve"> PAGEREF _Toc244159307 \h </w:instrText>
+          <w:instrText xml:space="preserve"> PAGEREF _Toc244166262 \h </w:instrText>
         </w:r>
         <w:r>
           <w:rPr>
@@ -186,7 +186,7 @@
           <w:lang w:eastAsia="nl-NL"/>
         </w:rPr>
       </w:pPr>
-      <w:hyperlink w:anchor="_Toc244159308" w:history="1">
+      <w:hyperlink w:anchor="_Toc244166263" w:history="1">
         <w:r>
           <w:rPr>
             <w:rStyle w:val="Hyperlink"/>
@@ -231,7 +231,7 @@
             <w:noProof/>
             <w:webHidden/>
           </w:rPr>
-          <w:instrText xml:space="preserve"> PAGEREF _Toc244159308 \h </w:instrText>
+          <w:instrText xml:space="preserve"> PAGEREF _Toc244166263 \h </w:instrText>
         </w:r>
         <w:r>
           <w:rPr>
@@ -278,7 +278,7 @@
           <w:lang w:eastAsia="nl-NL"/>
         </w:rPr>
       </w:pPr>
-      <w:hyperlink w:anchor="_Toc244159309" w:history="1">
+      <w:hyperlink w:anchor="_Toc244166264" w:history="1">
         <w:r>
           <w:rPr>
             <w:rStyle w:val="Hyperlink"/>
@@ -323,7 +323,7 @@
             <w:noProof/>
             <w:webHidden/>
           </w:rPr>
-          <w:instrText xml:space="preserve"> PAGEREF _Toc244159309 \h </w:instrText>
+          <w:instrText xml:space="preserve"> PAGEREF _Toc244166264 \h </w:instrText>
         </w:r>
         <w:r>
           <w:rPr>
@@ -370,7 +370,7 @@
           <w:lang w:eastAsia="nl-NL"/>
         </w:rPr>
       </w:pPr>
-      <w:hyperlink w:anchor="_Toc244159310" w:history="1">
+      <w:hyperlink w:anchor="_Toc244166265" w:history="1">
         <w:r>
           <w:rPr>
             <w:rStyle w:val="Hyperlink"/>
@@ -415,7 +415,7 @@
             <w:noProof/>
             <w:webHidden/>
           </w:rPr>
-          <w:instrText xml:space="preserve"> PAGEREF _Toc244159310 \h </w:instrText>
+          <w:instrText xml:space="preserve"> PAGEREF _Toc244166265 \h </w:instrText>
         </w:r>
         <w:r>
           <w:rPr>
@@ -462,7 +462,7 @@
           <w:lang w:eastAsia="nl-NL"/>
         </w:rPr>
       </w:pPr>
-      <w:hyperlink w:anchor="_Toc244159311" w:history="1">
+      <w:hyperlink w:anchor="_Toc244166266" w:history="1">
         <w:r>
           <w:rPr>
             <w:rStyle w:val="Hyperlink"/>
@@ -507,7 +507,7 @@
             <w:noProof/>
             <w:webHidden/>
           </w:rPr>
-          <w:instrText xml:space="preserve"> PAGEREF _Toc244159311 \h </w:instrText>
+          <w:instrText xml:space="preserve"> PAGEREF _Toc244166266 \h </w:instrText>
         </w:r>
         <w:r>
           <w:rPr>
@@ -554,7 +554,7 @@
           <w:lang w:eastAsia="nl-NL"/>
         </w:rPr>
       </w:pPr>
-      <w:hyperlink w:anchor="_Toc244159312" w:history="1">
+      <w:hyperlink w:anchor="_Toc244166267" w:history="1">
         <w:r>
           <w:rPr>
             <w:rStyle w:val="Hyperlink"/>
@@ -599,7 +599,7 @@
             <w:noProof/>
             <w:webHidden/>
           </w:rPr>
-          <w:instrText xml:space="preserve"> PAGEREF _Toc244159312 \h </w:instrText>
+          <w:instrText xml:space="preserve"> PAGEREF _Toc244166267 \h </w:instrText>
         </w:r>
         <w:r>
           <w:rPr>
@@ -646,7 +646,7 @@
           <w:lang w:eastAsia="nl-NL"/>
         </w:rPr>
       </w:pPr>
-      <w:hyperlink w:anchor="_Toc244159313" w:history="1">
+      <w:hyperlink w:anchor="_Toc244166268" w:history="1">
         <w:r>
           <w:rPr>
             <w:rStyle w:val="Hyperlink"/>
@@ -691,7 +691,7 @@
             <w:noProof/>
             <w:webHidden/>
           </w:rPr>
-          <w:instrText xml:space="preserve"> PAGEREF _Toc244159313 \h </w:instrText>
+          <w:instrText xml:space="preserve"> PAGEREF _Toc244166268 \h </w:instrText>
         </w:r>
         <w:r>
           <w:rPr>
@@ -738,7 +738,7 @@
           <w:lang w:eastAsia="nl-NL"/>
         </w:rPr>
       </w:pPr>
-      <w:hyperlink w:anchor="_Toc244159314" w:history="1">
+      <w:hyperlink w:anchor="_Toc244166269" w:history="1">
         <w:r>
           <w:rPr>
             <w:rStyle w:val="Hyperlink"/>
@@ -783,7 +783,7 @@
             <w:noProof/>
             <w:webHidden/>
           </w:rPr>
-          <w:instrText xml:space="preserve"> PAGEREF _Toc244159314 \h </w:instrText>
+          <w:instrText xml:space="preserve"> PAGEREF _Toc244166269 \h </w:instrText>
         </w:r>
         <w:r>
           <w:rPr>
@@ -830,7 +830,7 @@
           <w:lang w:eastAsia="nl-NL"/>
         </w:rPr>
       </w:pPr>
-      <w:hyperlink w:anchor="_Toc244159315" w:history="1">
+      <w:hyperlink w:anchor="_Toc244166270" w:history="1">
         <w:r>
           <w:rPr>
             <w:rStyle w:val="Hyperlink"/>
@@ -875,7 +875,7 @@
             <w:noProof/>
             <w:webHidden/>
           </w:rPr>
-          <w:instrText xml:space="preserve"> PAGEREF _Toc244159315 \h </w:instrText>
+          <w:instrText xml:space="preserve"> PAGEREF _Toc244166270 \h </w:instrText>
         </w:r>
         <w:r>
           <w:rPr>
@@ -922,7 +922,7 @@
           <w:lang w:eastAsia="nl-NL"/>
         </w:rPr>
       </w:pPr>
-      <w:hyperlink w:anchor="_Toc244159316" w:history="1">
+      <w:hyperlink w:anchor="_Toc244166271" w:history="1">
         <w:r>
           <w:rPr>
             <w:rStyle w:val="Hyperlink"/>
@@ -967,7 +967,7 @@
             <w:noProof/>
             <w:webHidden/>
           </w:rPr>
-          <w:instrText xml:space="preserve"> PAGEREF _Toc244159316 \h </w:instrText>
+          <w:instrText xml:space="preserve"> PAGEREF _Toc244166271 \h </w:instrText>
         </w:r>
         <w:r>
           <w:rPr>
@@ -1014,7 +1014,7 @@
           <w:lang w:eastAsia="nl-NL"/>
         </w:rPr>
       </w:pPr>
-      <w:hyperlink w:anchor="_Toc244159317" w:history="1">
+      <w:hyperlink w:anchor="_Toc244166272" w:history="1">
         <w:r>
           <w:rPr>
             <w:rStyle w:val="Hyperlink"/>
@@ -1059,7 +1059,7 @@
             <w:noProof/>
             <w:webHidden/>
           </w:rPr>
-          <w:instrText xml:space="preserve"> PAGEREF _Toc244159317 \h </w:instrText>
+          <w:instrText xml:space="preserve"> PAGEREF _Toc244166272 \h </w:instrText>
         </w:r>
         <w:r>
           <w:rPr>
@@ -1106,7 +1106,7 @@
           <w:lang w:eastAsia="nl-NL"/>
         </w:rPr>
       </w:pPr>
-      <w:hyperlink w:anchor="_Toc244159318" w:history="1">
+      <w:hyperlink w:anchor="_Toc244166273" w:history="1">
         <w:r>
           <w:rPr>
             <w:rStyle w:val="Hyperlink"/>
@@ -1151,7 +1151,7 @@
             <w:noProof/>
             <w:webHidden/>
           </w:rPr>
-          <w:instrText xml:space="preserve"> PAGEREF _Toc244159318 \h </w:instrText>
+          <w:instrText xml:space="preserve"> PAGEREF _Toc244166273 \h </w:instrText>
         </w:r>
         <w:r>
           <w:rPr>
@@ -1198,7 +1198,7 @@
           <w:lang w:eastAsia="nl-NL"/>
         </w:rPr>
       </w:pPr>
-      <w:hyperlink w:anchor="_Toc244159319" w:history="1">
+      <w:hyperlink w:anchor="_Toc244166274" w:history="1">
         <w:r>
           <w:rPr>
             <w:rStyle w:val="Hyperlink"/>
@@ -1243,7 +1243,7 @@
             <w:noProof/>
             <w:webHidden/>
           </w:rPr>
-          <w:instrText xml:space="preserve"> PAGEREF _Toc244159319 \h </w:instrText>
+          <w:instrText xml:space="preserve"> PAGEREF _Toc244166274 \h </w:instrText>
         </w:r>
         <w:r>
           <w:rPr>
@@ -1290,7 +1290,7 @@
           <w:lang w:eastAsia="nl-NL"/>
         </w:rPr>
       </w:pPr>
-      <w:hyperlink w:anchor="_Toc244159320" w:history="1">
+      <w:hyperlink w:anchor="_Toc244166275" w:history="1">
         <w:r>
           <w:rPr>
             <w:rStyle w:val="Hyperlink"/>
@@ -1335,7 +1335,7 @@
             <w:noProof/>
             <w:webHidden/>
           </w:rPr>
-          <w:instrText xml:space="preserve"> PAGEREF _Toc244159320 \h </w:instrText>
+          <w:instrText xml:space="preserve"> PAGEREF _Toc244166275 \h </w:instrText>
         </w:r>
         <w:r>
           <w:rPr>
@@ -1382,7 +1382,7 @@
           <w:lang w:eastAsia="nl-NL"/>
         </w:rPr>
       </w:pPr>
-      <w:hyperlink w:anchor="_Toc244159321" w:history="1">
+      <w:hyperlink w:anchor="_Toc244166276" w:history="1">
         <w:r>
           <w:rPr>
             <w:rStyle w:val="Hyperlink"/>
@@ -1427,7 +1427,7 @@
             <w:noProof/>
             <w:webHidden/>
           </w:rPr>
-          <w:instrText xml:space="preserve"> PAGEREF _Toc244159321 \h </w:instrText>
+          <w:instrText xml:space="preserve"> PAGEREF _Toc244166276 \h </w:instrText>
         </w:r>
         <w:r>
           <w:rPr>
@@ -1474,7 +1474,7 @@
           <w:lang w:eastAsia="nl-NL"/>
         </w:rPr>
       </w:pPr>
-      <w:hyperlink w:anchor="_Toc244159322" w:history="1">
+      <w:hyperlink w:anchor="_Toc244166277" w:history="1">
         <w:r>
           <w:rPr>
             <w:rStyle w:val="Hyperlink"/>
@@ -1519,7 +1519,7 @@
             <w:noProof/>
             <w:webHidden/>
           </w:rPr>
-          <w:instrText xml:space="preserve"> PAGEREF _Toc244159322 \h </w:instrText>
+          <w:instrText xml:space="preserve"> PAGEREF _Toc244166277 \h </w:instrText>
         </w:r>
         <w:r>
           <w:rPr>
@@ -1566,7 +1566,7 @@
           <w:lang w:eastAsia="nl-NL"/>
         </w:rPr>
       </w:pPr>
-      <w:hyperlink w:anchor="_Toc244159323" w:history="1">
+      <w:hyperlink w:anchor="_Toc244166278" w:history="1">
         <w:r>
           <w:rPr>
             <w:rStyle w:val="Hyperlink"/>
@@ -1611,7 +1611,7 @@
             <w:noProof/>
             <w:webHidden/>
           </w:rPr>
-          <w:instrText xml:space="preserve"> PAGEREF _Toc244159323 \h </w:instrText>
+          <w:instrText xml:space="preserve"> PAGEREF _Toc244166278 \h </w:instrText>
         </w:r>
         <w:r>
           <w:rPr>
@@ -1658,7 +1658,7 @@
           <w:lang w:eastAsia="nl-NL"/>
         </w:rPr>
       </w:pPr>
-      <w:hyperlink w:anchor="_Toc244159324" w:history="1">
+      <w:hyperlink w:anchor="_Toc244166279" w:history="1">
         <w:r>
           <w:rPr>
             <w:rStyle w:val="Hyperlink"/>
@@ -1703,7 +1703,7 @@
             <w:noProof/>
             <w:webHidden/>
           </w:rPr>
-          <w:instrText xml:space="preserve"> PAGEREF _Toc244159324 \h </w:instrText>
+          <w:instrText xml:space="preserve"> PAGEREF _Toc244166279 \h </w:instrText>
         </w:r>
         <w:r>
           <w:rPr>
@@ -1750,7 +1750,7 @@
           <w:lang w:eastAsia="nl-NL"/>
         </w:rPr>
       </w:pPr>
-      <w:hyperlink w:anchor="_Toc244159325" w:history="1">
+      <w:hyperlink w:anchor="_Toc244166280" w:history="1">
         <w:r>
           <w:rPr>
             <w:rStyle w:val="Hyperlink"/>
@@ -1795,7 +1795,7 @@
             <w:noProof/>
             <w:webHidden/>
           </w:rPr>
-          <w:instrText xml:space="preserve"> PAGEREF _Toc244159325 \h </w:instrText>
+          <w:instrText xml:space="preserve"> PAGEREF _Toc244166280 \h </w:instrText>
         </w:r>
         <w:r>
           <w:rPr>
@@ -1842,7 +1842,7 @@
           <w:lang w:eastAsia="nl-NL"/>
         </w:rPr>
       </w:pPr>
-      <w:hyperlink w:anchor="_Toc244159326" w:history="1">
+      <w:hyperlink w:anchor="_Toc244166281" w:history="1">
         <w:r>
           <w:rPr>
             <w:rStyle w:val="Hyperlink"/>
@@ -1887,7 +1887,7 @@
             <w:noProof/>
             <w:webHidden/>
           </w:rPr>
-          <w:instrText xml:space="preserve"> PAGEREF _Toc244159326 \h </w:instrText>
+          <w:instrText xml:space="preserve"> PAGEREF _Toc244166281 \h </w:instrText>
         </w:r>
         <w:r>
           <w:rPr>
@@ -1934,7 +1934,7 @@
           <w:lang w:eastAsia="nl-NL"/>
         </w:rPr>
       </w:pPr>
-      <w:hyperlink w:anchor="_Toc244159327" w:history="1">
+      <w:hyperlink w:anchor="_Toc244166282" w:history="1">
         <w:r>
           <w:rPr>
             <w:rStyle w:val="Hyperlink"/>
@@ -1979,7 +1979,7 @@
             <w:noProof/>
             <w:webHidden/>
           </w:rPr>
-          <w:instrText xml:space="preserve"> PAGEREF _Toc244159327 \h </w:instrText>
+          <w:instrText xml:space="preserve"> PAGEREF _Toc244166282 \h </w:instrText>
         </w:r>
         <w:r>
           <w:rPr>
@@ -2026,7 +2026,7 @@
           <w:lang w:eastAsia="nl-NL"/>
         </w:rPr>
       </w:pPr>
-      <w:hyperlink w:anchor="_Toc244159328" w:history="1">
+      <w:hyperlink w:anchor="_Toc244166283" w:history="1">
         <w:r>
           <w:rPr>
             <w:rStyle w:val="Hyperlink"/>
@@ -2071,7 +2071,7 @@
             <w:noProof/>
             <w:webHidden/>
           </w:rPr>
-          <w:instrText xml:space="preserve"> PAGEREF _Toc244159328 \h </w:instrText>
+          <w:instrText xml:space="preserve"> PAGEREF _Toc244166283 \h </w:instrText>
         </w:r>
         <w:r>
           <w:rPr>
@@ -2118,7 +2118,7 @@
           <w:lang w:eastAsia="nl-NL"/>
         </w:rPr>
       </w:pPr>
-      <w:hyperlink w:anchor="_Toc244159329" w:history="1">
+      <w:hyperlink w:anchor="_Toc244166284" w:history="1">
         <w:r>
           <w:rPr>
             <w:rStyle w:val="Hyperlink"/>
@@ -2163,7 +2163,7 @@
             <w:noProof/>
             <w:webHidden/>
           </w:rPr>
-          <w:instrText xml:space="preserve"> PAGEREF _Toc244159329 \h </w:instrText>
+          <w:instrText xml:space="preserve"> PAGEREF _Toc244166284 \h </w:instrText>
         </w:r>
         <w:r>
           <w:rPr>
@@ -2210,7 +2210,7 @@
           <w:lang w:eastAsia="nl-NL"/>
         </w:rPr>
       </w:pPr>
-      <w:hyperlink w:anchor="_Toc244159330" w:history="1">
+      <w:hyperlink w:anchor="_Toc244166285" w:history="1">
         <w:r>
           <w:rPr>
             <w:rStyle w:val="Hyperlink"/>
@@ -2271,7 +2271,7 @@
             <w:noProof/>
             <w:webHidden/>
           </w:rPr>
-          <w:instrText xml:space="preserve"> PAGEREF _Toc244159330 \h </w:instrText>
+          <w:instrText xml:space="preserve"> PAGEREF _Toc244166285 \h </w:instrText>
         </w:r>
         <w:r>
           <w:rPr>
@@ -2318,7 +2318,7 @@
           <w:lang w:eastAsia="nl-NL"/>
         </w:rPr>
       </w:pPr>
-      <w:hyperlink w:anchor="_Toc244159331" w:history="1">
+      <w:hyperlink w:anchor="_Toc244166286" w:history="1">
         <w:r>
           <w:rPr>
             <w:rStyle w:val="Hyperlink"/>
@@ -2363,7 +2363,7 @@
             <w:noProof/>
             <w:webHidden/>
           </w:rPr>
-          <w:instrText xml:space="preserve"> PAGEREF _Toc244159331 \h </w:instrText>
+          <w:instrText xml:space="preserve"> PAGEREF _Toc244166286 \h </w:instrText>
         </w:r>
         <w:r>
           <w:rPr>
@@ -2410,7 +2410,7 @@
           <w:lang w:eastAsia="nl-NL"/>
         </w:rPr>
       </w:pPr>
-      <w:hyperlink w:anchor="_Toc244159332" w:history="1">
+      <w:hyperlink w:anchor="_Toc244166287" w:history="1">
         <w:r>
           <w:rPr>
             <w:rStyle w:val="Hyperlink"/>
@@ -2455,7 +2455,7 @@
             <w:noProof/>
             <w:webHidden/>
           </w:rPr>
-          <w:instrText xml:space="preserve"> PAGEREF _Toc244159332 \h </w:instrText>
+          <w:instrText xml:space="preserve"> PAGEREF _Toc244166287 \h </w:instrText>
         </w:r>
         <w:r>
           <w:rPr>
@@ -2502,7 +2502,7 @@
           <w:lang w:eastAsia="nl-NL"/>
         </w:rPr>
       </w:pPr>
-      <w:hyperlink w:anchor="_Toc244159333" w:history="1">
+      <w:hyperlink w:anchor="_Toc244166288" w:history="1">
         <w:r>
           <w:rPr>
             <w:rStyle w:val="Hyperlink"/>
@@ -2547,7 +2547,7 @@
             <w:noProof/>
             <w:webHidden/>
           </w:rPr>
-          <w:instrText xml:space="preserve"> PAGEREF _Toc244159333 \h </w:instrText>
+          <w:instrText xml:space="preserve"> PAGEREF _Toc244166288 \h </w:instrText>
         </w:r>
         <w:r>
           <w:rPr>
@@ -2594,7 +2594,7 @@
           <w:lang w:eastAsia="nl-NL"/>
         </w:rPr>
       </w:pPr>
-      <w:hyperlink w:anchor="_Toc244159334" w:history="1">
+      <w:hyperlink w:anchor="_Toc244166289" w:history="1">
         <w:r>
           <w:rPr>
             <w:rStyle w:val="Hyperlink"/>
@@ -2639,7 +2639,7 @@
             <w:noProof/>
             <w:webHidden/>
           </w:rPr>
-          <w:instrText xml:space="preserve"> PAGEREF _Toc244159334 \h </w:instrText>
+          <w:instrText xml:space="preserve"> PAGEREF _Toc244166289 \h </w:instrText>
         </w:r>
         <w:r>
           <w:rPr>
@@ -2686,7 +2686,7 @@
           <w:lang w:eastAsia="nl-NL"/>
         </w:rPr>
       </w:pPr>
-      <w:hyperlink w:anchor="_Toc244159335" w:history="1">
+      <w:hyperlink w:anchor="_Toc244166290" w:history="1">
         <w:r>
           <w:rPr>
             <w:rStyle w:val="Hyperlink"/>
@@ -2731,7 +2731,7 @@
             <w:noProof/>
             <w:webHidden/>
           </w:rPr>
-          <w:instrText xml:space="preserve"> PAGEREF _Toc244159335 \h </w:instrText>
+          <w:instrText xml:space="preserve"> PAGEREF _Toc244166290 \h </w:instrText>
         </w:r>
         <w:r>
           <w:rPr>
@@ -2778,7 +2778,7 @@
           <w:lang w:eastAsia="nl-NL"/>
         </w:rPr>
       </w:pPr>
-      <w:hyperlink w:anchor="_Toc244159336" w:history="1">
+      <w:hyperlink w:anchor="_Toc244166291" w:history="1">
         <w:r>
           <w:rPr>
             <w:rStyle w:val="Hyperlink"/>
@@ -2823,7 +2823,7 @@
             <w:noProof/>
             <w:webHidden/>
           </w:rPr>
-          <w:instrText xml:space="preserve"> PAGEREF _Toc244159336 \h </w:instrText>
+          <w:instrText xml:space="preserve"> PAGEREF _Toc244166291 \h </w:instrText>
         </w:r>
         <w:r>
           <w:rPr>
@@ -2870,7 +2870,7 @@
           <w:lang w:eastAsia="nl-NL"/>
         </w:rPr>
       </w:pPr>
-      <w:hyperlink w:anchor="_Toc244159337" w:history="1">
+      <w:hyperlink w:anchor="_Toc244166292" w:history="1">
         <w:r>
           <w:rPr>
             <w:rStyle w:val="Hyperlink"/>
@@ -2915,7 +2915,7 @@
             <w:noProof/>
             <w:webHidden/>
           </w:rPr>
-          <w:instrText xml:space="preserve"> PAGEREF _Toc244159337 \h </w:instrText>
+          <w:instrText xml:space="preserve"> PAGEREF _Toc244166292 \h </w:instrText>
         </w:r>
         <w:r>
           <w:rPr>
@@ -2962,7 +2962,7 @@
           <w:lang w:eastAsia="nl-NL"/>
         </w:rPr>
       </w:pPr>
-      <w:hyperlink w:anchor="_Toc244159338" w:history="1">
+      <w:hyperlink w:anchor="_Toc244166293" w:history="1">
         <w:r>
           <w:rPr>
             <w:rStyle w:val="Hyperlink"/>
@@ -3007,7 +3007,7 @@
             <w:noProof/>
             <w:webHidden/>
           </w:rPr>
-          <w:instrText xml:space="preserve"> PAGEREF _Toc244159338 \h </w:instrText>
+          <w:instrText xml:space="preserve"> PAGEREF _Toc244166293 \h </w:instrText>
         </w:r>
         <w:r>
           <w:rPr>
@@ -3054,7 +3054,7 @@
           <w:lang w:eastAsia="nl-NL"/>
         </w:rPr>
       </w:pPr>
-      <w:hyperlink w:anchor="_Toc244159339" w:history="1">
+      <w:hyperlink w:anchor="_Toc244166294" w:history="1">
         <w:r>
           <w:rPr>
             <w:rStyle w:val="Hyperlink"/>
@@ -3115,7 +3115,7 @@
             <w:noProof/>
             <w:webHidden/>
           </w:rPr>
-          <w:instrText xml:space="preserve"> PAGEREF _Toc244159339 \h </w:instrText>
+          <w:instrText xml:space="preserve"> PAGEREF _Toc244166294 \h </w:instrText>
         </w:r>
         <w:r>
           <w:rPr>
@@ -3162,7 +3162,7 @@
           <w:lang w:eastAsia="nl-NL"/>
         </w:rPr>
       </w:pPr>
-      <w:hyperlink w:anchor="_Toc244159340" w:history="1">
+      <w:hyperlink w:anchor="_Toc244166295" w:history="1">
         <w:r>
           <w:rPr>
             <w:rStyle w:val="Hyperlink"/>
@@ -3207,7 +3207,7 @@
             <w:noProof/>
             <w:webHidden/>
           </w:rPr>
-          <w:instrText xml:space="preserve"> PAGEREF _Toc244159340 \h </w:instrText>
+          <w:instrText xml:space="preserve"> PAGEREF _Toc244166295 \h </w:instrText>
         </w:r>
         <w:r>
           <w:rPr>
@@ -3254,7 +3254,7 @@
           <w:lang w:eastAsia="nl-NL"/>
         </w:rPr>
       </w:pPr>
-      <w:hyperlink w:anchor="_Toc244159341" w:history="1">
+      <w:hyperlink w:anchor="_Toc244166296" w:history="1">
         <w:r>
           <w:rPr>
             <w:rStyle w:val="Hyperlink"/>
@@ -3299,7 +3299,7 @@
             <w:noProof/>
             <w:webHidden/>
           </w:rPr>
-          <w:instrText xml:space="preserve"> PAGEREF _Toc244159341 \h </w:instrText>
+          <w:instrText xml:space="preserve"> PAGEREF _Toc244166296 \h </w:instrText>
         </w:r>
         <w:r>
           <w:rPr>
@@ -3346,7 +3346,7 @@
           <w:lang w:eastAsia="nl-NL"/>
         </w:rPr>
       </w:pPr>
-      <w:hyperlink w:anchor="_Toc244159342" w:history="1">
+      <w:hyperlink w:anchor="_Toc244166297" w:history="1">
         <w:r>
           <w:rPr>
             <w:rStyle w:val="Hyperlink"/>
@@ -3391,7 +3391,7 @@
             <w:noProof/>
             <w:webHidden/>
           </w:rPr>
-          <w:instrText xml:space="preserve"> PAGEREF _Toc244159342 \h </w:instrText>
+          <w:instrText xml:space="preserve"> PAGEREF _Toc244166297 \h </w:instrText>
         </w:r>
         <w:r>
           <w:rPr>
@@ -3438,7 +3438,7 @@
           <w:lang w:eastAsia="nl-NL"/>
         </w:rPr>
       </w:pPr>
-      <w:hyperlink w:anchor="_Toc244159343" w:history="1">
+      <w:hyperlink w:anchor="_Toc244166298" w:history="1">
         <w:r>
           <w:rPr>
             <w:rStyle w:val="Hyperlink"/>
@@ -3483,7 +3483,7 @@
             <w:noProof/>
             <w:webHidden/>
           </w:rPr>
-          <w:instrText xml:space="preserve"> PAGEREF _Toc244159343 \h </w:instrText>
+          <w:instrText xml:space="preserve"> PAGEREF _Toc244166298 \h </w:instrText>
         </w:r>
         <w:r>
           <w:rPr>
@@ -3530,7 +3530,7 @@
           <w:lang w:eastAsia="nl-NL"/>
         </w:rPr>
       </w:pPr>
-      <w:hyperlink w:anchor="_Toc244159344" w:history="1">
+      <w:hyperlink w:anchor="_Toc244166299" w:history="1">
         <w:r>
           <w:rPr>
             <w:rStyle w:val="Hyperlink"/>
@@ -3591,7 +3591,7 @@
             <w:noProof/>
             <w:webHidden/>
           </w:rPr>
-          <w:instrText xml:space="preserve"> PAGEREF _Toc244159344 \h </w:instrText>
+          <w:instrText xml:space="preserve"> PAGEREF _Toc244166299 \h </w:instrText>
         </w:r>
         <w:r>
           <w:rPr>
@@ -3638,7 +3638,7 @@
           <w:lang w:eastAsia="nl-NL"/>
         </w:rPr>
       </w:pPr>
-      <w:hyperlink w:anchor="_Toc244159345" w:history="1">
+      <w:hyperlink w:anchor="_Toc244166300" w:history="1">
         <w:r>
           <w:rPr>
             <w:rStyle w:val="Hyperlink"/>
@@ -3683,7 +3683,7 @@
             <w:noProof/>
             <w:webHidden/>
           </w:rPr>
-          <w:instrText xml:space="preserve"> PAGEREF _Toc244159345 \h </w:instrText>
+          <w:instrText xml:space="preserve"> PAGEREF _Toc244166300 \h </w:instrText>
         </w:r>
         <w:r>
           <w:rPr>
@@ -3730,7 +3730,7 @@
           <w:lang w:eastAsia="nl-NL"/>
         </w:rPr>
       </w:pPr>
-      <w:hyperlink w:anchor="_Toc244159346" w:history="1">
+      <w:hyperlink w:anchor="_Toc244166301" w:history="1">
         <w:r>
           <w:rPr>
             <w:rStyle w:val="Hyperlink"/>
@@ -3775,7 +3775,7 @@
             <w:noProof/>
             <w:webHidden/>
           </w:rPr>
-          <w:instrText xml:space="preserve"> PAGEREF _Toc244159346 \h </w:instrText>
+          <w:instrText xml:space="preserve"> PAGEREF _Toc244166301 \h </w:instrText>
         </w:r>
         <w:r>
           <w:rPr>
@@ -3822,7 +3822,7 @@
           <w:lang w:eastAsia="nl-NL"/>
         </w:rPr>
       </w:pPr>
-      <w:hyperlink w:anchor="_Toc244159347" w:history="1">
+      <w:hyperlink w:anchor="_Toc244166302" w:history="1">
         <w:r>
           <w:rPr>
             <w:rStyle w:val="Hyperlink"/>
@@ -3869,7 +3869,7 @@
             <w:noProof/>
             <w:webHidden/>
           </w:rPr>
-          <w:instrText xml:space="preserve"> PAGEREF _Toc244159347 \h </w:instrText>
+          <w:instrText xml:space="preserve"> PAGEREF _Toc244166302 \h </w:instrText>
         </w:r>
         <w:r>
           <w:rPr>
@@ -3916,7 +3916,7 @@
           <w:lang w:eastAsia="nl-NL"/>
         </w:rPr>
       </w:pPr>
-      <w:hyperlink w:anchor="_Toc244159348" w:history="1">
+      <w:hyperlink w:anchor="_Toc244166303" w:history="1">
         <w:r>
           <w:rPr>
             <w:rStyle w:val="Hyperlink"/>
@@ -3963,7 +3963,7 @@
             <w:noProof/>
             <w:webHidden/>
           </w:rPr>
-          <w:instrText xml:space="preserve"> PAGEREF _Toc244159348 \h </w:instrText>
+          <w:instrText xml:space="preserve"> PAGEREF _Toc244166303 \h </w:instrText>
         </w:r>
         <w:r>
           <w:rPr>
@@ -4010,7 +4010,7 @@
           <w:lang w:eastAsia="nl-NL"/>
         </w:rPr>
       </w:pPr>
-      <w:hyperlink w:anchor="_Toc244159349" w:history="1">
+      <w:hyperlink w:anchor="_Toc244166304" w:history="1">
         <w:r>
           <w:rPr>
             <w:rStyle w:val="Hyperlink"/>
@@ -4057,7 +4057,7 @@
             <w:noProof/>
             <w:webHidden/>
           </w:rPr>
-          <w:instrText xml:space="preserve"> PAGEREF _Toc244159349 \h </w:instrText>
+          <w:instrText xml:space="preserve"> PAGEREF _Toc244166304 \h </w:instrText>
         </w:r>
         <w:r>
           <w:rPr>
@@ -4104,7 +4104,7 @@
           <w:lang w:eastAsia="nl-NL"/>
         </w:rPr>
       </w:pPr>
-      <w:hyperlink w:anchor="_Toc244159350" w:history="1">
+      <w:hyperlink w:anchor="_Toc244166305" w:history="1">
         <w:r>
           <w:rPr>
             <w:rStyle w:val="Hyperlink"/>
@@ -4151,7 +4151,7 @@
             <w:noProof/>
             <w:webHidden/>
           </w:rPr>
-          <w:instrText xml:space="preserve"> PAGEREF _Toc244159350 \h </w:instrText>
+          <w:instrText xml:space="preserve"> PAGEREF _Toc244166305 \h </w:instrText>
         </w:r>
         <w:r>
           <w:rPr>
@@ -4198,7 +4198,7 @@
           <w:lang w:eastAsia="nl-NL"/>
         </w:rPr>
       </w:pPr>
-      <w:hyperlink w:anchor="_Toc244159351" w:history="1">
+      <w:hyperlink w:anchor="_Toc244166306" w:history="1">
         <w:r>
           <w:rPr>
             <w:rStyle w:val="Hyperlink"/>
@@ -4245,7 +4245,7 @@
             <w:noProof/>
             <w:webHidden/>
           </w:rPr>
-          <w:instrText xml:space="preserve"> PAGEREF _Toc244159351 \h </w:instrText>
+          <w:instrText xml:space="preserve"> PAGEREF _Toc244166306 \h </w:instrText>
         </w:r>
         <w:r>
           <w:rPr>
@@ -4292,7 +4292,7 @@
           <w:lang w:eastAsia="nl-NL"/>
         </w:rPr>
       </w:pPr>
-      <w:hyperlink w:anchor="_Toc244159352" w:history="1">
+      <w:hyperlink w:anchor="_Toc244166307" w:history="1">
         <w:r>
           <w:rPr>
             <w:rStyle w:val="Hyperlink"/>
@@ -4339,7 +4339,7 @@
             <w:noProof/>
             <w:webHidden/>
           </w:rPr>
-          <w:instrText xml:space="preserve"> PAGEREF _Toc244159352 \h </w:instrText>
+          <w:instrText xml:space="preserve"> PAGEREF _Toc244166307 \h </w:instrText>
         </w:r>
         <w:r>
           <w:rPr>
@@ -4386,7 +4386,7 @@
           <w:lang w:eastAsia="nl-NL"/>
         </w:rPr>
       </w:pPr>
-      <w:hyperlink w:anchor="_Toc244159353" w:history="1">
+      <w:hyperlink w:anchor="_Toc244166308" w:history="1">
         <w:r>
           <w:rPr>
             <w:rStyle w:val="Hyperlink"/>
@@ -4431,7 +4431,7 @@
             <w:noProof/>
             <w:webHidden/>
           </w:rPr>
-          <w:instrText xml:space="preserve"> PAGEREF _Toc244159353 \h </w:instrText>
+          <w:instrText xml:space="preserve"> PAGEREF _Toc244166308 \h </w:instrText>
         </w:r>
         <w:r>
           <w:rPr>
@@ -4478,7 +4478,7 @@
           <w:lang w:eastAsia="nl-NL"/>
         </w:rPr>
       </w:pPr>
-      <w:hyperlink w:anchor="_Toc244159354" w:history="1">
+      <w:hyperlink w:anchor="_Toc244166309" w:history="1">
         <w:r>
           <w:rPr>
             <w:rStyle w:val="Hyperlink"/>
@@ -4523,7 +4523,7 @@
             <w:noProof/>
             <w:webHidden/>
           </w:rPr>
-          <w:instrText xml:space="preserve"> PAGEREF _Toc244159354 \h </w:instrText>
+          <w:instrText xml:space="preserve"> PAGEREF _Toc244166309 \h </w:instrText>
         </w:r>
         <w:r>
           <w:rPr>
@@ -4570,7 +4570,7 @@
           <w:lang w:eastAsia="nl-NL"/>
         </w:rPr>
       </w:pPr>
-      <w:hyperlink w:anchor="_Toc244159355" w:history="1">
+      <w:hyperlink w:anchor="_Toc244166310" w:history="1">
         <w:r>
           <w:rPr>
             <w:rStyle w:val="Hyperlink"/>
@@ -4647,7 +4647,7 @@
             <w:noProof/>
             <w:webHidden/>
           </w:rPr>
-          <w:instrText xml:space="preserve"> PAGEREF _Toc244159355 \h </w:instrText>
+          <w:instrText xml:space="preserve"> PAGEREF _Toc244166310 \h </w:instrText>
         </w:r>
         <w:r>
           <w:rPr>
@@ -4694,7 +4694,7 @@
           <w:lang w:eastAsia="nl-NL"/>
         </w:rPr>
       </w:pPr>
-      <w:hyperlink w:anchor="_Toc244159356" w:history="1">
+      <w:hyperlink w:anchor="_Toc244166311" w:history="1">
         <w:r>
           <w:rPr>
             <w:rStyle w:val="Hyperlink"/>
@@ -4739,7 +4739,7 @@
             <w:noProof/>
             <w:webHidden/>
           </w:rPr>
-          <w:instrText xml:space="preserve"> PAGEREF _Toc244159356 \h </w:instrText>
+          <w:instrText xml:space="preserve"> PAGEREF _Toc244166311 \h </w:instrText>
         </w:r>
         <w:r>
           <w:rPr>
@@ -4786,7 +4786,7 @@
           <w:lang w:eastAsia="nl-NL"/>
         </w:rPr>
       </w:pPr>
-      <w:hyperlink w:anchor="_Toc244159357" w:history="1">
+      <w:hyperlink w:anchor="_Toc244166312" w:history="1">
         <w:r>
           <w:rPr>
             <w:rStyle w:val="Hyperlink"/>
@@ -4831,7 +4831,7 @@
             <w:noProof/>
             <w:webHidden/>
           </w:rPr>
-          <w:instrText xml:space="preserve"> PAGEREF _Toc244159357 \h </w:instrText>
+          <w:instrText xml:space="preserve"> PAGEREF _Toc244166312 \h </w:instrText>
         </w:r>
         <w:r>
           <w:rPr>
@@ -4878,7 +4878,7 @@
           <w:lang w:eastAsia="nl-NL"/>
         </w:rPr>
       </w:pPr>
-      <w:hyperlink w:anchor="_Toc244159358" w:history="1">
+      <w:hyperlink w:anchor="_Toc244166313" w:history="1">
         <w:r>
           <w:rPr>
             <w:rStyle w:val="Hyperlink"/>
@@ -4923,7 +4923,7 @@
             <w:noProof/>
             <w:webHidden/>
           </w:rPr>
-          <w:instrText xml:space="preserve"> PAGEREF _Toc244159358 \h </w:instrText>
+          <w:instrText xml:space="preserve"> PAGEREF _Toc244166313 \h </w:instrText>
         </w:r>
         <w:r>
           <w:rPr>
@@ -4970,7 +4970,7 @@
           <w:lang w:eastAsia="nl-NL"/>
         </w:rPr>
       </w:pPr>
-      <w:hyperlink w:anchor="_Toc244159359" w:history="1">
+      <w:hyperlink w:anchor="_Toc244166314" w:history="1">
         <w:r>
           <w:rPr>
             <w:rStyle w:val="Hyperlink"/>
@@ -5015,7 +5015,7 @@
             <w:noProof/>
             <w:webHidden/>
           </w:rPr>
-          <w:instrText xml:space="preserve"> PAGEREF _Toc244159359 \h </w:instrText>
+          <w:instrText xml:space="preserve"> PAGEREF _Toc244166314 \h </w:instrText>
         </w:r>
         <w:r>
           <w:rPr>
@@ -5062,7 +5062,7 @@
           <w:lang w:eastAsia="nl-NL"/>
         </w:rPr>
       </w:pPr>
-      <w:hyperlink w:anchor="_Toc244159360" w:history="1">
+      <w:hyperlink w:anchor="_Toc244166315" w:history="1">
         <w:r>
           <w:rPr>
             <w:rStyle w:val="Hyperlink"/>
@@ -5107,7 +5107,7 @@
             <w:noProof/>
             <w:webHidden/>
           </w:rPr>
-          <w:instrText xml:space="preserve"> PAGEREF _Toc244159360 \h </w:instrText>
+          <w:instrText xml:space="preserve"> PAGEREF _Toc244166315 \h </w:instrText>
         </w:r>
         <w:r>
           <w:rPr>
@@ -5154,7 +5154,7 @@
           <w:lang w:eastAsia="nl-NL"/>
         </w:rPr>
       </w:pPr>
-      <w:hyperlink w:anchor="_Toc244159361" w:history="1">
+      <w:hyperlink w:anchor="_Toc244166316" w:history="1">
         <w:r>
           <w:rPr>
             <w:rStyle w:val="Hyperlink"/>
@@ -5199,7 +5199,7 @@
             <w:noProof/>
             <w:webHidden/>
           </w:rPr>
-          <w:instrText xml:space="preserve"> PAGEREF _Toc244159361 \h </w:instrText>
+          <w:instrText xml:space="preserve"> PAGEREF _Toc244166316 \h </w:instrText>
         </w:r>
         <w:r>
           <w:rPr>
@@ -5246,7 +5246,7 @@
           <w:lang w:eastAsia="nl-NL"/>
         </w:rPr>
       </w:pPr>
-      <w:hyperlink w:anchor="_Toc244159362" w:history="1">
+      <w:hyperlink w:anchor="_Toc244166317" w:history="1">
         <w:r>
           <w:rPr>
             <w:rStyle w:val="Hyperlink"/>
@@ -5291,7 +5291,7 @@
             <w:noProof/>
             <w:webHidden/>
           </w:rPr>
-          <w:instrText xml:space="preserve"> PAGEREF _Toc244159362 \h </w:instrText>
+          <w:instrText xml:space="preserve"> PAGEREF _Toc244166317 \h </w:instrText>
         </w:r>
         <w:r>
           <w:rPr>
@@ -5338,7 +5338,7 @@
           <w:lang w:eastAsia="nl-NL"/>
         </w:rPr>
       </w:pPr>
-      <w:hyperlink w:anchor="_Toc244159363" w:history="1">
+      <w:hyperlink w:anchor="_Toc244166318" w:history="1">
         <w:r>
           <w:rPr>
             <w:rStyle w:val="Hyperlink"/>
@@ -5383,7 +5383,7 @@
             <w:noProof/>
             <w:webHidden/>
           </w:rPr>
-          <w:instrText xml:space="preserve"> PAGEREF _Toc244159363 \h </w:instrText>
+          <w:instrText xml:space="preserve"> PAGEREF _Toc244166318 \h </w:instrText>
         </w:r>
         <w:r>
           <w:rPr>
@@ -5430,7 +5430,7 @@
           <w:lang w:eastAsia="nl-NL"/>
         </w:rPr>
       </w:pPr>
-      <w:hyperlink w:anchor="_Toc244159364" w:history="1">
+      <w:hyperlink w:anchor="_Toc244166319" w:history="1">
         <w:r>
           <w:rPr>
             <w:rStyle w:val="Hyperlink"/>
@@ -5475,7 +5475,7 @@
             <w:noProof/>
             <w:webHidden/>
           </w:rPr>
-          <w:instrText xml:space="preserve"> PAGEREF _Toc244159364 \h </w:instrText>
+          <w:instrText xml:space="preserve"> PAGEREF _Toc244166319 \h </w:instrText>
         </w:r>
         <w:r>
           <w:rPr>
@@ -5522,7 +5522,7 @@
           <w:lang w:eastAsia="nl-NL"/>
         </w:rPr>
       </w:pPr>
-      <w:hyperlink w:anchor="_Toc244159365" w:history="1">
+      <w:hyperlink w:anchor="_Toc244166320" w:history="1">
         <w:r>
           <w:rPr>
             <w:rStyle w:val="Hyperlink"/>
@@ -5567,7 +5567,7 @@
             <w:noProof/>
             <w:webHidden/>
           </w:rPr>
-          <w:instrText xml:space="preserve"> PAGEREF _Toc244159365 \h </w:instrText>
+          <w:instrText xml:space="preserve"> PAGEREF _Toc244166320 \h </w:instrText>
         </w:r>
         <w:r>
           <w:rPr>
@@ -5614,7 +5614,7 @@
           <w:lang w:eastAsia="nl-NL"/>
         </w:rPr>
       </w:pPr>
-      <w:hyperlink w:anchor="_Toc244159366" w:history="1">
+      <w:hyperlink w:anchor="_Toc244166321" w:history="1">
         <w:r>
           <w:rPr>
             <w:rStyle w:val="Hyperlink"/>
@@ -5659,7 +5659,7 @@
             <w:noProof/>
             <w:webHidden/>
           </w:rPr>
-          <w:instrText xml:space="preserve"> PAGEREF _Toc244159366 \h </w:instrText>
+          <w:instrText xml:space="preserve"> PAGEREF _Toc244166321 \h </w:instrText>
         </w:r>
         <w:r>
           <w:rPr>
@@ -5712,7 +5712,7 @@
         </w:numPr>
       </w:pPr>
       <w:bookmarkStart w:id="1" w:name="k1"/>
-      <w:bookmarkStart w:id="2" w:name="_Toc244159308"/>
+      <w:bookmarkStart w:id="2" w:name="_Toc244166263"/>
       <w:r>
         <w:t>DOEL VAN DE APPLICATIE.</w:t>
       </w:r>
@@ -5794,7 +5794,7 @@
         </w:numPr>
       </w:pPr>
       <w:bookmarkStart w:id="3" w:name="k2"/>
-      <w:bookmarkStart w:id="4" w:name="_Toc244159309"/>
+      <w:bookmarkStart w:id="4" w:name="_Toc244166264"/>
       <w:r>
         <w:t>BESTANDEN.</w:t>
       </w:r>
@@ -10269,7 +10269,7 @@
         </w:numPr>
       </w:pPr>
       <w:bookmarkStart w:id="5" w:name="k3"/>
-      <w:bookmarkStart w:id="6" w:name="_Toc244159310"/>
+      <w:bookmarkStart w:id="6" w:name="_Toc244166265"/>
       <w:r>
         <w:t>DE WEBSITE STARTEN.</w:t>
       </w:r>
@@ -10491,7 +10491,7 @@
         </w:numPr>
       </w:pPr>
       <w:bookmarkStart w:id="7" w:name="k4"/>
-      <w:bookmarkStart w:id="8" w:name="_Toc244159311"/>
+      <w:bookmarkStart w:id="8" w:name="_Toc244166266"/>
       <w:r>
         <w:t>GEBRUIKERSHANDLEIDING.</w:t>
       </w:r>
@@ -10531,7 +10531,7 @@
         <w:keepNext/>
       </w:pPr>
       <w:bookmarkStart w:id="9" w:name="k5"/>
-      <w:bookmarkStart w:id="10" w:name="_Toc244159312"/>
+      <w:bookmarkStart w:id="10" w:name="_Toc244166267"/>
       <w:r>
         <w:t>EEN MEDEWERKER ZOEKEN</w:t>
       </w:r>
@@ -10597,7 +10597,7 @@
         <w:keepNext/>
       </w:pPr>
       <w:bookmarkStart w:id="11" w:name="k6"/>
-      <w:bookmarkStart w:id="12" w:name="_Toc244159313"/>
+      <w:bookmarkStart w:id="12" w:name="_Toc244166268"/>
       <w:r>
         <w:t>EEN PRODUCT REGISTREREN</w:t>
       </w:r>
@@ -10846,7 +10846,7 @@
         <w:keepNext/>
       </w:pPr>
       <w:bookmarkStart w:id="13" w:name="k7"/>
-      <w:bookmarkStart w:id="14" w:name="_Toc244159314"/>
+      <w:bookmarkStart w:id="14" w:name="_Toc244166269"/>
       <w:r>
         <w:t>ADMIN-DASHBOARD OPENEN</w:t>
       </w:r>
@@ -10977,7 +10977,7 @@
         <w:keepNext/>
       </w:pPr>
       <w:bookmarkStart w:id="15" w:name="k8"/>
-      <w:bookmarkStart w:id="16" w:name="_Toc244159315"/>
+      <w:bookmarkStart w:id="16" w:name="_Toc244166270"/>
       <w:r>
         <w:t>REGISTRATIES BEHEREN</w:t>
       </w:r>
@@ -11263,7 +11263,7 @@
         <w:keepNext/>
       </w:pPr>
       <w:bookmarkStart w:id="17" w:name="k9"/>
-      <w:bookmarkStart w:id="18" w:name="_Toc244159316"/>
+      <w:bookmarkStart w:id="18" w:name="_Toc244166271"/>
       <w:r>
         <w:t>MEDEWERKERS BEHEREN</w:t>
       </w:r>
@@ -11644,7 +11644,7 @@
         <w:keepNext/>
       </w:pPr>
       <w:bookmarkStart w:id="19" w:name="k10"/>
-      <w:bookmarkStart w:id="20" w:name="_Toc244159317"/>
+      <w:bookmarkStart w:id="20" w:name="_Toc244166272"/>
       <w:r>
         <w:t>PRODUCTEN BEHEREN</w:t>
       </w:r>
@@ -11772,7 +11772,7 @@
         <w:keepNext/>
       </w:pPr>
       <w:bookmarkStart w:id="21" w:name="k11"/>
-      <w:bookmarkStart w:id="22" w:name="_Toc244159318"/>
+      <w:bookmarkStart w:id="22" w:name="_Toc244166273"/>
       <w:r>
         <w:t>BEDRIJVEN EN CONSUMPTIEPUNTEN BEHEREN</w:t>
       </w:r>
@@ -11935,7 +11935,7 @@
         <w:keepNext/>
       </w:pPr>
       <w:bookmarkStart w:id="23" w:name="k12"/>
-      <w:bookmarkStart w:id="24" w:name="_Toc244159319"/>
+      <w:bookmarkStart w:id="24" w:name="_Toc244166274"/>
       <w:r>
         <w:t>VOORRAAD BEHEREN</w:t>
       </w:r>
@@ -12153,7 +12153,7 @@
         <w:keepNext/>
       </w:pPr>
       <w:bookmarkStart w:id="25" w:name="k13"/>
-      <w:bookmarkStart w:id="26" w:name="_Toc244159320"/>
+      <w:bookmarkStart w:id="26" w:name="_Toc244166275"/>
       <w:r>
         <w:t>LOGBOEK BEKIJKEN</w:t>
       </w:r>
@@ -12193,7 +12193,7 @@
         <w:keepNext/>
       </w:pPr>
       <w:bookmarkStart w:id="27" w:name="k14"/>
-      <w:bookmarkStart w:id="28" w:name="_Toc244159321"/>
+      <w:bookmarkStart w:id="28" w:name="_Toc244166276"/>
       <w:r>
         <w:t>ALLE GEGEVENS WISSEN</w:t>
       </w:r>
@@ -12319,7 +12319,7 @@
         <w:keepNext/>
       </w:pPr>
       <w:bookmarkStart w:id="29" w:name="k15"/>
-      <w:bookmarkStart w:id="30" w:name="_Toc244159322"/>
+      <w:bookmarkStart w:id="30" w:name="_Toc244166277"/>
       <w:r>
         <w:t>MODAL SLUITEN EN UITLOGGEN</w:t>
       </w:r>
@@ -12393,7 +12393,7 @@
         <w:keepNext/>
       </w:pPr>
       <w:bookmarkStart w:id="31" w:name="k16"/>
-      <w:bookmarkStart w:id="32" w:name="_Toc244159323"/>
+      <w:bookmarkStart w:id="32" w:name="_Toc244166278"/>
       <w:r>
         <w:t>CSV EXPORTEREN</w:t>
       </w:r>
@@ -12777,7 +12777,7 @@
         <w:keepNext/>
       </w:pPr>
       <w:bookmarkStart w:id="33" w:name="k17"/>
-      <w:bookmarkStart w:id="34" w:name="_Toc244159324"/>
+      <w:bookmarkStart w:id="34" w:name="_Toc244166279"/>
       <w:r>
         <w:t>LICHT OF DONKER THEMA</w:t>
       </w:r>
@@ -12884,7 +12884,7 @@
         <w:keepNext/>
       </w:pPr>
       <w:bookmarkStart w:id="35" w:name="k18"/>
-      <w:bookmarkStart w:id="36" w:name="_Toc244159325"/>
+      <w:bookmarkStart w:id="36" w:name="_Toc244166280"/>
       <w:r>
         <w:t>WELKOM EN "ZELFDE ALS VORIGE KEER"</w:t>
       </w:r>
@@ -12971,7 +12971,7 @@
         <w:keepNext/>
       </w:pPr>
       <w:bookmarkStart w:id="37" w:name="k19"/>
-      <w:bookmarkStart w:id="38" w:name="_Toc244159326"/>
+      <w:bookmarkStart w:id="38" w:name="_Toc244166281"/>
       <w:r>
         <w:t>DEMO GEZICHTSHERKENNING</w:t>
       </w:r>
@@ -13561,7 +13561,7 @@
         <w:keepNext/>
       </w:pPr>
       <w:bookmarkStart w:id="39" w:name="k20"/>
-      <w:bookmarkStart w:id="40" w:name="_Toc244159327"/>
+      <w:bookmarkStart w:id="40" w:name="_Toc244166282"/>
       <w:r>
         <w:t>HERKENNEN MET DE PAS</w:t>
       </w:r>
@@ -13758,7 +13758,7 @@
         <w:keepNext/>
       </w:pPr>
       <w:bookmarkStart w:id="41" w:name="k21"/>
-      <w:bookmarkStart w:id="42" w:name="_Toc244159328"/>
+      <w:bookmarkStart w:id="42" w:name="_Toc244166283"/>
       <w:r>
         <w:t>SLIMME KOELKAST (DEMO)</w:t>
       </w:r>
@@ -14392,7 +14392,7 @@
         <w:keepNext/>
       </w:pPr>
       <w:bookmarkStart w:id="43" w:name="k22"/>
-      <w:bookmarkStart w:id="44" w:name="_Toc244159329"/>
+      <w:bookmarkStart w:id="44" w:name="_Toc244166284"/>
       <w:r>
         <w:t>HET STARTSCHERM EN AUTOMATISCH SCANNEN (DEMO)</w:t>
       </w:r>
@@ -14960,7 +14960,7 @@
         </w:numPr>
       </w:pPr>
       <w:bookmarkStart w:id="45" w:name="k23"/>
-      <w:bookmarkStart w:id="46" w:name="_Toc244159330"/>
+      <w:bookmarkStart w:id="46" w:name="_Toc244166285"/>
       <w:r>
         <w:t xml:space="preserve">UITLEG VAN </w:t>
       </w:r>
@@ -14984,7 +14984,7 @@
         <w:keepNext/>
       </w:pPr>
       <w:bookmarkStart w:id="47" w:name="k24"/>
-      <w:bookmarkStart w:id="48" w:name="_Toc244159331"/>
+      <w:bookmarkStart w:id="48" w:name="_Toc244166286"/>
       <w:r>
         <w:t>METADATA EN EXTERNE BESTANDEN</w:t>
       </w:r>
@@ -15307,7 +15307,7 @@
         <w:keepNext/>
       </w:pPr>
       <w:bookmarkStart w:id="49" w:name="k25"/>
-      <w:bookmarkStart w:id="50" w:name="_Toc244159332"/>
+      <w:bookmarkStart w:id="50" w:name="_Toc244166287"/>
       <w:r>
         <w:t>NAVIGATIEBALK</w:t>
       </w:r>
@@ -15520,7 +15520,7 @@
         <w:keepNext/>
       </w:pPr>
       <w:bookmarkStart w:id="51" w:name="k26"/>
-      <w:bookmarkStart w:id="52" w:name="_Toc244159333"/>
+      <w:bookmarkStart w:id="52" w:name="_Toc244166288"/>
       <w:r>
         <w:t>HERO-GEDEELTE</w:t>
       </w:r>
@@ -15565,7 +15565,7 @@
         <w:keepNext/>
       </w:pPr>
       <w:bookmarkStart w:id="53" w:name="k27"/>
-      <w:bookmarkStart w:id="54" w:name="_Toc244159334"/>
+      <w:bookmarkStart w:id="54" w:name="_Toc244166289"/>
       <w:r>
         <w:t>MEDEWERKERLIJST</w:t>
       </w:r>
@@ -15902,7 +15902,7 @@
         <w:keepNext/>
       </w:pPr>
       <w:bookmarkStart w:id="55" w:name="k28"/>
-      <w:bookmarkStart w:id="56" w:name="_Toc244159335"/>
+      <w:bookmarkStart w:id="56" w:name="_Toc244166290"/>
       <w:r>
         <w:t>STATISTIEKEN</w:t>
       </w:r>
@@ -15985,7 +15985,7 @@
         <w:keepNext/>
       </w:pPr>
       <w:bookmarkStart w:id="57" w:name="k29"/>
-      <w:bookmarkStart w:id="58" w:name="_Toc244159336"/>
+      <w:bookmarkStart w:id="58" w:name="_Toc244166291"/>
       <w:r>
         <w:t>VENSTERS (MODALS)</w:t>
       </w:r>
@@ -16647,7 +16647,7 @@
         <w:keepNext/>
       </w:pPr>
       <w:bookmarkStart w:id="59" w:name="k30"/>
-      <w:bookmarkStart w:id="60" w:name="_Toc244159337"/>
+      <w:bookmarkStart w:id="60" w:name="_Toc244166292"/>
       <w:r>
         <w:t>STARTSCHERM</w:t>
       </w:r>
@@ -16874,7 +16874,7 @@
         <w:keepNext/>
       </w:pPr>
       <w:bookmarkStart w:id="61" w:name="k31"/>
-      <w:bookmarkStart w:id="62" w:name="_Toc244159338"/>
+      <w:bookmarkStart w:id="62" w:name="_Toc244166293"/>
       <w:r>
         <w:t>WAARSCHUWING BIJ OPENEN ALS LOS BESTAND</w:t>
       </w:r>
@@ -16919,7 +16919,7 @@
         </w:numPr>
       </w:pPr>
       <w:bookmarkStart w:id="63" w:name="k32"/>
-      <w:bookmarkStart w:id="64" w:name="_Toc244159339"/>
+      <w:bookmarkStart w:id="64" w:name="_Toc244166294"/>
       <w:r>
         <w:t>UITLEG VAN DE CSS (</w:t>
       </w:r>
@@ -16943,7 +16943,7 @@
         <w:keepNext/>
       </w:pPr>
       <w:bookmarkStart w:id="65" w:name="k33"/>
-      <w:bookmarkStart w:id="66" w:name="_Toc244159340"/>
+      <w:bookmarkStart w:id="66" w:name="_Toc244166295"/>
       <w:r>
         <w:t>BESTANDEN EN VOLGORDE</w:t>
       </w:r>
@@ -18262,7 +18262,7 @@
         <w:keepNext/>
       </w:pPr>
       <w:bookmarkStart w:id="67" w:name="k34"/>
-      <w:bookmarkStart w:id="68" w:name="_Toc244159341"/>
+      <w:bookmarkStart w:id="68" w:name="_Toc244166296"/>
       <w:r>
         <w:t>CSS-VARIABELEN</w:t>
       </w:r>
@@ -19105,7 +19105,7 @@
         <w:keepNext/>
       </w:pPr>
       <w:bookmarkStart w:id="69" w:name="k35"/>
-      <w:bookmarkStart w:id="70" w:name="_Toc244159342"/>
+      <w:bookmarkStart w:id="70" w:name="_Toc244166297"/>
       <w:r>
         <w:t>LAYOUT</w:t>
       </w:r>
@@ -19814,7 +19814,7 @@
         <w:keepNext/>
       </w:pPr>
       <w:bookmarkStart w:id="71" w:name="k36"/>
-      <w:bookmarkStart w:id="72" w:name="_Toc244159343"/>
+      <w:bookmarkStart w:id="72" w:name="_Toc244166298"/>
       <w:r>
         <w:t>COMPONENTEN</w:t>
       </w:r>
@@ -20059,7 +20059,7 @@
         </w:numPr>
       </w:pPr>
       <w:bookmarkStart w:id="73" w:name="k37"/>
-      <w:bookmarkStart w:id="74" w:name="_Toc244159344"/>
+      <w:bookmarkStart w:id="74" w:name="_Toc244166299"/>
       <w:r>
         <w:t>UITLEG VAN DE JAVASCRIPT (</w:t>
       </w:r>
@@ -20083,7 +20083,7 @@
         <w:keepNext/>
       </w:pPr>
       <w:bookmarkStart w:id="75" w:name="k38"/>
-      <w:bookmarkStart w:id="76" w:name="_Toc244159345"/>
+      <w:bookmarkStart w:id="76" w:name="_Toc244166300"/>
       <w:r>
         <w:t>OPSLAG EN VOORBEELDDATA</w:t>
       </w:r>
@@ -20861,7 +20861,7 @@
         <w:keepNext/>
       </w:pPr>
       <w:bookmarkStart w:id="77" w:name="k39"/>
-      <w:bookmarkStart w:id="78" w:name="_Toc244159346"/>
+      <w:bookmarkStart w:id="78" w:name="_Toc244166301"/>
       <w:r>
         <w:t>OBJECTGEORIËNTEERDE STRUCTUUR</w:t>
       </w:r>
@@ -28315,7 +28315,7 @@
         <w:keepNext/>
       </w:pPr>
       <w:bookmarkStart w:id="93" w:name="k54"/>
-      <w:bookmarkStart w:id="94" w:name="_Toc244159347"/>
+      <w:bookmarkStart w:id="94" w:name="_Toc244166302"/>
       <w:r>
         <w:rPr>
           <w:rFonts w:ascii="Consolas" w:hAnsi="Consolas" w:cs="Consolas"/>
@@ -28458,7 +28458,7 @@
         <w:keepNext/>
       </w:pPr>
       <w:bookmarkStart w:id="95" w:name="k55"/>
-      <w:bookmarkStart w:id="96" w:name="_Toc244159348"/>
+      <w:bookmarkStart w:id="96" w:name="_Toc244166303"/>
       <w:r>
         <w:rPr>
           <w:rFonts w:ascii="Consolas" w:hAnsi="Consolas" w:cs="Consolas"/>
@@ -28535,7 +28535,7 @@
         <w:keepNext/>
       </w:pPr>
       <w:bookmarkStart w:id="97" w:name="k56"/>
-      <w:bookmarkStart w:id="98" w:name="_Toc244159349"/>
+      <w:bookmarkStart w:id="98" w:name="_Toc244166304"/>
       <w:r>
         <w:rPr>
           <w:rFonts w:ascii="Consolas" w:hAnsi="Consolas" w:cs="Consolas"/>
@@ -28706,7 +28706,7 @@
         <w:keepNext/>
       </w:pPr>
       <w:bookmarkStart w:id="99" w:name="k57"/>
-      <w:bookmarkStart w:id="100" w:name="_Toc244159350"/>
+      <w:bookmarkStart w:id="100" w:name="_Toc244166305"/>
       <w:r>
         <w:rPr>
           <w:rFonts w:ascii="Consolas" w:hAnsi="Consolas" w:cs="Consolas"/>
@@ -28773,7 +28773,7 @@
         <w:keepNext/>
       </w:pPr>
       <w:bookmarkStart w:id="101" w:name="k58"/>
-      <w:bookmarkStart w:id="102" w:name="_Toc244159351"/>
+      <w:bookmarkStart w:id="102" w:name="_Toc244166306"/>
       <w:r>
         <w:rPr>
           <w:rFonts w:ascii="Consolas" w:hAnsi="Consolas" w:cs="Consolas"/>
@@ -28895,7 +28895,7 @@
         <w:keepNext/>
       </w:pPr>
       <w:bookmarkStart w:id="103" w:name="k59"/>
-      <w:bookmarkStart w:id="104" w:name="_Toc244159352"/>
+      <w:bookmarkStart w:id="104" w:name="_Toc244166307"/>
       <w:r>
         <w:rPr>
           <w:rFonts w:ascii="Consolas" w:hAnsi="Consolas" w:cs="Consolas"/>
@@ -29017,7 +29017,7 @@
         <w:keepNext/>
       </w:pPr>
       <w:bookmarkStart w:id="105" w:name="k60"/>
-      <w:bookmarkStart w:id="106" w:name="_Toc244159353"/>
+      <w:bookmarkStart w:id="106" w:name="_Toc244166308"/>
       <w:r>
         <w:t>OPSLAGFOUTEN EN TERUGDRAAIEN</w:t>
       </w:r>
@@ -29079,7 +29079,7 @@
         <w:keepNext/>
       </w:pPr>
       <w:bookmarkStart w:id="107" w:name="k61"/>
-      <w:bookmarkStart w:id="108" w:name="_Toc244159354"/>
+      <w:bookmarkStart w:id="108" w:name="_Toc244166309"/>
       <w:r>
         <w:t>ADMINFUNCTIES</w:t>
       </w:r>
@@ -29325,7 +29325,7 @@
         <w:keepNext/>
       </w:pPr>
       <w:bookmarkStart w:id="109" w:name="k62"/>
-      <w:bookmarkStart w:id="110" w:name="_Toc244159355"/>
+      <w:bookmarkStart w:id="110" w:name="_Toc244166310"/>
       <w:r>
         <w:t xml:space="preserve">CSV-EXPORT (CLASS </w:t>
       </w:r>
@@ -29733,7 +29733,7 @@
         <w:keepNext/>
       </w:pPr>
       <w:bookmarkStart w:id="111" w:name="k63"/>
-      <w:bookmarkStart w:id="112" w:name="_Toc244159356"/>
+      <w:bookmarkStart w:id="112" w:name="_Toc244166311"/>
       <w:r>
         <w:t>EVENT LISTENERS</w:t>
       </w:r>
@@ -30430,7 +30430,7 @@
         </w:numPr>
       </w:pPr>
       <w:bookmarkStart w:id="113" w:name="k64"/>
-      <w:bookmarkStart w:id="114" w:name="_Toc244159357"/>
+      <w:bookmarkStart w:id="114" w:name="_Toc244166312"/>
       <w:r>
         <w:t>DATAMODEL EN KOPPELINGEN.</w:t>
       </w:r>
@@ -30448,7 +30448,7 @@
         <w:keepNext/>
       </w:pPr>
       <w:bookmarkStart w:id="115" w:name="k65"/>
-      <w:bookmarkStart w:id="116" w:name="_Toc244159358"/>
+      <w:bookmarkStart w:id="116" w:name="_Toc244166313"/>
       <w:r>
         <w:t>BEDRIJVEN</w:t>
       </w:r>
@@ -30659,7 +30659,7 @@
         <w:keepNext/>
       </w:pPr>
       <w:bookmarkStart w:id="117" w:name="k66"/>
-      <w:bookmarkStart w:id="118" w:name="_Toc244159359"/>
+      <w:bookmarkStart w:id="118" w:name="_Toc244166314"/>
       <w:r>
         <w:t>CONSUMPTIEPUNTEN</w:t>
       </w:r>
@@ -30978,7 +30978,7 @@
         <w:keepNext/>
       </w:pPr>
       <w:bookmarkStart w:id="119" w:name="k67"/>
-      <w:bookmarkStart w:id="120" w:name="_Toc244159360"/>
+      <w:bookmarkStart w:id="120" w:name="_Toc244166315"/>
       <w:r>
         <w:t>MEDEWERKERS</w:t>
       </w:r>
@@ -31534,7 +31534,7 @@
         <w:keepNext/>
       </w:pPr>
       <w:bookmarkStart w:id="121" w:name="k68"/>
-      <w:bookmarkStart w:id="122" w:name="_Toc244159361"/>
+      <w:bookmarkStart w:id="122" w:name="_Toc244166316"/>
       <w:r>
         <w:t>REGISTRATIES</w:t>
       </w:r>
@@ -32195,7 +32195,7 @@
         <w:keepNext/>
       </w:pPr>
       <w:bookmarkStart w:id="123" w:name="k69"/>
-      <w:bookmarkStart w:id="124" w:name="_Toc244159362"/>
+      <w:bookmarkStart w:id="124" w:name="_Toc244166317"/>
       <w:r>
         <w:t>SLIMME KOELKAST</w:t>
       </w:r>
@@ -32615,7 +32615,7 @@
         <w:keepNext/>
       </w:pPr>
       <w:bookmarkStart w:id="125" w:name="k70"/>
-      <w:bookmarkStart w:id="126" w:name="_Toc244159363"/>
+      <w:bookmarkStart w:id="126" w:name="_Toc244166318"/>
       <w:r>
         <w:t>DEMO GEZICHTSHERKENNING</w:t>
       </w:r>
@@ -32958,7 +32958,7 @@
         </w:numPr>
       </w:pPr>
       <w:bookmarkStart w:id="127" w:name="k71"/>
-      <w:bookmarkStart w:id="128" w:name="_Toc244159364"/>
+      <w:bookmarkStart w:id="128" w:name="_Toc244166319"/>
       <w:r>
         <w:t>BELANGRIJKE DEMO-BEPERKINGEN.</w:t>
       </w:r>
@@ -33392,7 +33392,10 @@
         <w:contextualSpacing w:val="0"/>
       </w:pPr>
       <w:r>
-        <w:t>Herkennen met de pas is gemak, geen bewijs van identiteit: het nummer van een pas is niet geheim en kan worden gekopieerd. TVB heeft geen centraal systeem met pasnummers (navraag 29 oktober 2026): de passen worden nu bij de printers gebruikt, waar medewerkers ze zelf toevoegen. In productie wordt de koppeling daarom eenmalig gevuld met de serienummers van de passen (als die te krijgen zijn) of door de medewerker zelf met een code per e-mail. Zie het TO, "Herkomst van het pasnummer".</w:t>
+        <w:t>Herkennen met de pas is gemak, geen bewijs van identiteit: het nummer van een pas is niet geheim en kan worden gekopieerd. TVB heeft geen centraal systeem met pasnummers (navraag 29 oktober 2026): de passen worden nu bij de printers gebruikt, waar medewerkers ze zelf toevoegen. TVB onderzoekt een centraal systeem voor de passen met opslag van de serienummers. Komt dat er, dan haalt de backend het pasnummer daaruit. Tot dan wordt de koppeling eenmalig gevuld met de serienummers (als die te krijgen zijn) of d</w:t>
+      </w:r>
+      <w:r>
+        <w:t>oor de medewerker zelf met een code per e-mail. Zie het TO, "Herkomst van het pasnummer".</w:t>
       </w:r>
     </w:p>
     <w:p>
@@ -33424,7 +33427,7 @@
         </w:numPr>
       </w:pPr>
       <w:bookmarkStart w:id="129" w:name="k72"/>
-      <w:bookmarkStart w:id="130" w:name="_Toc244159365"/>
+      <w:bookmarkStart w:id="130" w:name="_Toc244166320"/>
       <w:r>
         <w:t>CODE UITLEGGEN TIJDENS EEN PRESENTATIE.</w:t>
       </w:r>
@@ -33830,7 +33833,7 @@
         </w:numPr>
       </w:pPr>
       <w:bookmarkStart w:id="131" w:name="k73"/>
-      <w:bookmarkStart w:id="132" w:name="_Toc244159366"/>
+      <w:bookmarkStart w:id="132" w:name="_Toc244166321"/>
       <w:r>
         <w:t>MOGELIJKE VERVOLGSTAPPEN.</w:t>
       </w:r>

</xml_diff>

<commit_message>
TO 3.25: alle wireframes bijgewerkt (L, M en W) en browsertests werken weer met Edge 156
</commit_message>
<xml_diff>
--- a/docs/DOCUMENTATIE.docx
+++ b/docs/DOCUMENTATIE.docx
@@ -82,7 +82,7 @@
           <w:numId w:val="0"/>
         </w:numPr>
       </w:pPr>
-      <w:bookmarkStart w:id="0" w:name="_Toc244166262"/>
+      <w:bookmarkStart w:id="0" w:name="_Toc244245350"/>
       <w:r>
         <w:t>INHOUDSOPGAVE.</w:t>
       </w:r>
@@ -112,7 +112,7 @@
       <w:r>
         <w:fldChar w:fldCharType="separate"/>
       </w:r>
-      <w:hyperlink w:anchor="_Toc244166262" w:history="1">
+      <w:hyperlink w:anchor="_Toc244245350" w:history="1">
         <w:r>
           <w:rPr>
             <w:rStyle w:val="Hyperlink"/>
@@ -139,7 +139,7 @@
             <w:noProof/>
             <w:webHidden/>
           </w:rPr>
-          <w:instrText xml:space="preserve"> PAGEREF _Toc244166262 \h </w:instrText>
+          <w:instrText xml:space="preserve"> PAGEREF _Toc244245350 \h </w:instrText>
         </w:r>
         <w:r>
           <w:rPr>
@@ -186,7 +186,7 @@
           <w:lang w:eastAsia="nl-NL"/>
         </w:rPr>
       </w:pPr>
-      <w:hyperlink w:anchor="_Toc244166263" w:history="1">
+      <w:hyperlink w:anchor="_Toc244245351" w:history="1">
         <w:r>
           <w:rPr>
             <w:rStyle w:val="Hyperlink"/>
@@ -231,7 +231,7 @@
             <w:noProof/>
             <w:webHidden/>
           </w:rPr>
-          <w:instrText xml:space="preserve"> PAGEREF _Toc244166263 \h </w:instrText>
+          <w:instrText xml:space="preserve"> PAGEREF _Toc244245351 \h </w:instrText>
         </w:r>
         <w:r>
           <w:rPr>
@@ -278,7 +278,7 @@
           <w:lang w:eastAsia="nl-NL"/>
         </w:rPr>
       </w:pPr>
-      <w:hyperlink w:anchor="_Toc244166264" w:history="1">
+      <w:hyperlink w:anchor="_Toc244245352" w:history="1">
         <w:r>
           <w:rPr>
             <w:rStyle w:val="Hyperlink"/>
@@ -323,7 +323,7 @@
             <w:noProof/>
             <w:webHidden/>
           </w:rPr>
-          <w:instrText xml:space="preserve"> PAGEREF _Toc244166264 \h </w:instrText>
+          <w:instrText xml:space="preserve"> PAGEREF _Toc244245352 \h </w:instrText>
         </w:r>
         <w:r>
           <w:rPr>
@@ -370,7 +370,7 @@
           <w:lang w:eastAsia="nl-NL"/>
         </w:rPr>
       </w:pPr>
-      <w:hyperlink w:anchor="_Toc244166265" w:history="1">
+      <w:hyperlink w:anchor="_Toc244245353" w:history="1">
         <w:r>
           <w:rPr>
             <w:rStyle w:val="Hyperlink"/>
@@ -415,7 +415,7 @@
             <w:noProof/>
             <w:webHidden/>
           </w:rPr>
-          <w:instrText xml:space="preserve"> PAGEREF _Toc244166265 \h </w:instrText>
+          <w:instrText xml:space="preserve"> PAGEREF _Toc244245353 \h </w:instrText>
         </w:r>
         <w:r>
           <w:rPr>
@@ -462,7 +462,7 @@
           <w:lang w:eastAsia="nl-NL"/>
         </w:rPr>
       </w:pPr>
-      <w:hyperlink w:anchor="_Toc244166266" w:history="1">
+      <w:hyperlink w:anchor="_Toc244245354" w:history="1">
         <w:r>
           <w:rPr>
             <w:rStyle w:val="Hyperlink"/>
@@ -507,7 +507,7 @@
             <w:noProof/>
             <w:webHidden/>
           </w:rPr>
-          <w:instrText xml:space="preserve"> PAGEREF _Toc244166266 \h </w:instrText>
+          <w:instrText xml:space="preserve"> PAGEREF _Toc244245354 \h </w:instrText>
         </w:r>
         <w:r>
           <w:rPr>
@@ -554,7 +554,7 @@
           <w:lang w:eastAsia="nl-NL"/>
         </w:rPr>
       </w:pPr>
-      <w:hyperlink w:anchor="_Toc244166267" w:history="1">
+      <w:hyperlink w:anchor="_Toc244245355" w:history="1">
         <w:r>
           <w:rPr>
             <w:rStyle w:val="Hyperlink"/>
@@ -599,7 +599,7 @@
             <w:noProof/>
             <w:webHidden/>
           </w:rPr>
-          <w:instrText xml:space="preserve"> PAGEREF _Toc244166267 \h </w:instrText>
+          <w:instrText xml:space="preserve"> PAGEREF _Toc244245355 \h </w:instrText>
         </w:r>
         <w:r>
           <w:rPr>
@@ -646,7 +646,7 @@
           <w:lang w:eastAsia="nl-NL"/>
         </w:rPr>
       </w:pPr>
-      <w:hyperlink w:anchor="_Toc244166268" w:history="1">
+      <w:hyperlink w:anchor="_Toc244245356" w:history="1">
         <w:r>
           <w:rPr>
             <w:rStyle w:val="Hyperlink"/>
@@ -691,7 +691,7 @@
             <w:noProof/>
             <w:webHidden/>
           </w:rPr>
-          <w:instrText xml:space="preserve"> PAGEREF _Toc244166268 \h </w:instrText>
+          <w:instrText xml:space="preserve"> PAGEREF _Toc244245356 \h </w:instrText>
         </w:r>
         <w:r>
           <w:rPr>
@@ -738,7 +738,7 @@
           <w:lang w:eastAsia="nl-NL"/>
         </w:rPr>
       </w:pPr>
-      <w:hyperlink w:anchor="_Toc244166269" w:history="1">
+      <w:hyperlink w:anchor="_Toc244245357" w:history="1">
         <w:r>
           <w:rPr>
             <w:rStyle w:val="Hyperlink"/>
@@ -783,7 +783,7 @@
             <w:noProof/>
             <w:webHidden/>
           </w:rPr>
-          <w:instrText xml:space="preserve"> PAGEREF _Toc244166269 \h </w:instrText>
+          <w:instrText xml:space="preserve"> PAGEREF _Toc244245357 \h </w:instrText>
         </w:r>
         <w:r>
           <w:rPr>
@@ -830,7 +830,7 @@
           <w:lang w:eastAsia="nl-NL"/>
         </w:rPr>
       </w:pPr>
-      <w:hyperlink w:anchor="_Toc244166270" w:history="1">
+      <w:hyperlink w:anchor="_Toc244245358" w:history="1">
         <w:r>
           <w:rPr>
             <w:rStyle w:val="Hyperlink"/>
@@ -875,7 +875,7 @@
             <w:noProof/>
             <w:webHidden/>
           </w:rPr>
-          <w:instrText xml:space="preserve"> PAGEREF _Toc244166270 \h </w:instrText>
+          <w:instrText xml:space="preserve"> PAGEREF _Toc244245358 \h </w:instrText>
         </w:r>
         <w:r>
           <w:rPr>
@@ -922,7 +922,7 @@
           <w:lang w:eastAsia="nl-NL"/>
         </w:rPr>
       </w:pPr>
-      <w:hyperlink w:anchor="_Toc244166271" w:history="1">
+      <w:hyperlink w:anchor="_Toc244245359" w:history="1">
         <w:r>
           <w:rPr>
             <w:rStyle w:val="Hyperlink"/>
@@ -967,7 +967,7 @@
             <w:noProof/>
             <w:webHidden/>
           </w:rPr>
-          <w:instrText xml:space="preserve"> PAGEREF _Toc244166271 \h </w:instrText>
+          <w:instrText xml:space="preserve"> PAGEREF _Toc244245359 \h </w:instrText>
         </w:r>
         <w:r>
           <w:rPr>
@@ -1014,7 +1014,7 @@
           <w:lang w:eastAsia="nl-NL"/>
         </w:rPr>
       </w:pPr>
-      <w:hyperlink w:anchor="_Toc244166272" w:history="1">
+      <w:hyperlink w:anchor="_Toc244245360" w:history="1">
         <w:r>
           <w:rPr>
             <w:rStyle w:val="Hyperlink"/>
@@ -1059,7 +1059,7 @@
             <w:noProof/>
             <w:webHidden/>
           </w:rPr>
-          <w:instrText xml:space="preserve"> PAGEREF _Toc244166272 \h </w:instrText>
+          <w:instrText xml:space="preserve"> PAGEREF _Toc244245360 \h </w:instrText>
         </w:r>
         <w:r>
           <w:rPr>
@@ -1106,7 +1106,7 @@
           <w:lang w:eastAsia="nl-NL"/>
         </w:rPr>
       </w:pPr>
-      <w:hyperlink w:anchor="_Toc244166273" w:history="1">
+      <w:hyperlink w:anchor="_Toc244245361" w:history="1">
         <w:r>
           <w:rPr>
             <w:rStyle w:val="Hyperlink"/>
@@ -1151,7 +1151,7 @@
             <w:noProof/>
             <w:webHidden/>
           </w:rPr>
-          <w:instrText xml:space="preserve"> PAGEREF _Toc244166273 \h </w:instrText>
+          <w:instrText xml:space="preserve"> PAGEREF _Toc244245361 \h </w:instrText>
         </w:r>
         <w:r>
           <w:rPr>
@@ -1198,7 +1198,7 @@
           <w:lang w:eastAsia="nl-NL"/>
         </w:rPr>
       </w:pPr>
-      <w:hyperlink w:anchor="_Toc244166274" w:history="1">
+      <w:hyperlink w:anchor="_Toc244245362" w:history="1">
         <w:r>
           <w:rPr>
             <w:rStyle w:val="Hyperlink"/>
@@ -1243,7 +1243,7 @@
             <w:noProof/>
             <w:webHidden/>
           </w:rPr>
-          <w:instrText xml:space="preserve"> PAGEREF _Toc244166274 \h </w:instrText>
+          <w:instrText xml:space="preserve"> PAGEREF _Toc244245362 \h </w:instrText>
         </w:r>
         <w:r>
           <w:rPr>
@@ -1290,7 +1290,7 @@
           <w:lang w:eastAsia="nl-NL"/>
         </w:rPr>
       </w:pPr>
-      <w:hyperlink w:anchor="_Toc244166275" w:history="1">
+      <w:hyperlink w:anchor="_Toc244245363" w:history="1">
         <w:r>
           <w:rPr>
             <w:rStyle w:val="Hyperlink"/>
@@ -1335,7 +1335,7 @@
             <w:noProof/>
             <w:webHidden/>
           </w:rPr>
-          <w:instrText xml:space="preserve"> PAGEREF _Toc244166275 \h </w:instrText>
+          <w:instrText xml:space="preserve"> PAGEREF _Toc244245363 \h </w:instrText>
         </w:r>
         <w:r>
           <w:rPr>
@@ -1382,7 +1382,7 @@
           <w:lang w:eastAsia="nl-NL"/>
         </w:rPr>
       </w:pPr>
-      <w:hyperlink w:anchor="_Toc244166276" w:history="1">
+      <w:hyperlink w:anchor="_Toc244245364" w:history="1">
         <w:r>
           <w:rPr>
             <w:rStyle w:val="Hyperlink"/>
@@ -1427,7 +1427,7 @@
             <w:noProof/>
             <w:webHidden/>
           </w:rPr>
-          <w:instrText xml:space="preserve"> PAGEREF _Toc244166276 \h </w:instrText>
+          <w:instrText xml:space="preserve"> PAGEREF _Toc244245364 \h </w:instrText>
         </w:r>
         <w:r>
           <w:rPr>
@@ -1474,7 +1474,7 @@
           <w:lang w:eastAsia="nl-NL"/>
         </w:rPr>
       </w:pPr>
-      <w:hyperlink w:anchor="_Toc244166277" w:history="1">
+      <w:hyperlink w:anchor="_Toc244245365" w:history="1">
         <w:r>
           <w:rPr>
             <w:rStyle w:val="Hyperlink"/>
@@ -1519,7 +1519,7 @@
             <w:noProof/>
             <w:webHidden/>
           </w:rPr>
-          <w:instrText xml:space="preserve"> PAGEREF _Toc244166277 \h </w:instrText>
+          <w:instrText xml:space="preserve"> PAGEREF _Toc244245365 \h </w:instrText>
         </w:r>
         <w:r>
           <w:rPr>
@@ -1566,7 +1566,7 @@
           <w:lang w:eastAsia="nl-NL"/>
         </w:rPr>
       </w:pPr>
-      <w:hyperlink w:anchor="_Toc244166278" w:history="1">
+      <w:hyperlink w:anchor="_Toc244245366" w:history="1">
         <w:r>
           <w:rPr>
             <w:rStyle w:val="Hyperlink"/>
@@ -1611,7 +1611,7 @@
             <w:noProof/>
             <w:webHidden/>
           </w:rPr>
-          <w:instrText xml:space="preserve"> PAGEREF _Toc244166278 \h </w:instrText>
+          <w:instrText xml:space="preserve"> PAGEREF _Toc244245366 \h </w:instrText>
         </w:r>
         <w:r>
           <w:rPr>
@@ -1658,7 +1658,7 @@
           <w:lang w:eastAsia="nl-NL"/>
         </w:rPr>
       </w:pPr>
-      <w:hyperlink w:anchor="_Toc244166279" w:history="1">
+      <w:hyperlink w:anchor="_Toc244245367" w:history="1">
         <w:r>
           <w:rPr>
             <w:rStyle w:val="Hyperlink"/>
@@ -1703,7 +1703,7 @@
             <w:noProof/>
             <w:webHidden/>
           </w:rPr>
-          <w:instrText xml:space="preserve"> PAGEREF _Toc244166279 \h </w:instrText>
+          <w:instrText xml:space="preserve"> PAGEREF _Toc244245367 \h </w:instrText>
         </w:r>
         <w:r>
           <w:rPr>
@@ -1750,7 +1750,7 @@
           <w:lang w:eastAsia="nl-NL"/>
         </w:rPr>
       </w:pPr>
-      <w:hyperlink w:anchor="_Toc244166280" w:history="1">
+      <w:hyperlink w:anchor="_Toc244245368" w:history="1">
         <w:r>
           <w:rPr>
             <w:rStyle w:val="Hyperlink"/>
@@ -1795,7 +1795,7 @@
             <w:noProof/>
             <w:webHidden/>
           </w:rPr>
-          <w:instrText xml:space="preserve"> PAGEREF _Toc244166280 \h </w:instrText>
+          <w:instrText xml:space="preserve"> PAGEREF _Toc244245368 \h </w:instrText>
         </w:r>
         <w:r>
           <w:rPr>
@@ -1842,7 +1842,7 @@
           <w:lang w:eastAsia="nl-NL"/>
         </w:rPr>
       </w:pPr>
-      <w:hyperlink w:anchor="_Toc244166281" w:history="1">
+      <w:hyperlink w:anchor="_Toc244245369" w:history="1">
         <w:r>
           <w:rPr>
             <w:rStyle w:val="Hyperlink"/>
@@ -1887,7 +1887,7 @@
             <w:noProof/>
             <w:webHidden/>
           </w:rPr>
-          <w:instrText xml:space="preserve"> PAGEREF _Toc244166281 \h </w:instrText>
+          <w:instrText xml:space="preserve"> PAGEREF _Toc244245369 \h </w:instrText>
         </w:r>
         <w:r>
           <w:rPr>
@@ -1934,7 +1934,7 @@
           <w:lang w:eastAsia="nl-NL"/>
         </w:rPr>
       </w:pPr>
-      <w:hyperlink w:anchor="_Toc244166282" w:history="1">
+      <w:hyperlink w:anchor="_Toc244245370" w:history="1">
         <w:r>
           <w:rPr>
             <w:rStyle w:val="Hyperlink"/>
@@ -1979,7 +1979,7 @@
             <w:noProof/>
             <w:webHidden/>
           </w:rPr>
-          <w:instrText xml:space="preserve"> PAGEREF _Toc244166282 \h </w:instrText>
+          <w:instrText xml:space="preserve"> PAGEREF _Toc244245370 \h </w:instrText>
         </w:r>
         <w:r>
           <w:rPr>
@@ -2026,7 +2026,7 @@
           <w:lang w:eastAsia="nl-NL"/>
         </w:rPr>
       </w:pPr>
-      <w:hyperlink w:anchor="_Toc244166283" w:history="1">
+      <w:hyperlink w:anchor="_Toc244245371" w:history="1">
         <w:r>
           <w:rPr>
             <w:rStyle w:val="Hyperlink"/>
@@ -2071,7 +2071,7 @@
             <w:noProof/>
             <w:webHidden/>
           </w:rPr>
-          <w:instrText xml:space="preserve"> PAGEREF _Toc244166283 \h </w:instrText>
+          <w:instrText xml:space="preserve"> PAGEREF _Toc244245371 \h </w:instrText>
         </w:r>
         <w:r>
           <w:rPr>
@@ -2118,7 +2118,7 @@
           <w:lang w:eastAsia="nl-NL"/>
         </w:rPr>
       </w:pPr>
-      <w:hyperlink w:anchor="_Toc244166284" w:history="1">
+      <w:hyperlink w:anchor="_Toc244245372" w:history="1">
         <w:r>
           <w:rPr>
             <w:rStyle w:val="Hyperlink"/>
@@ -2163,7 +2163,7 @@
             <w:noProof/>
             <w:webHidden/>
           </w:rPr>
-          <w:instrText xml:space="preserve"> PAGEREF _Toc244166284 \h </w:instrText>
+          <w:instrText xml:space="preserve"> PAGEREF _Toc244245372 \h </w:instrText>
         </w:r>
         <w:r>
           <w:rPr>
@@ -2210,7 +2210,7 @@
           <w:lang w:eastAsia="nl-NL"/>
         </w:rPr>
       </w:pPr>
-      <w:hyperlink w:anchor="_Toc244166285" w:history="1">
+      <w:hyperlink w:anchor="_Toc244245373" w:history="1">
         <w:r>
           <w:rPr>
             <w:rStyle w:val="Hyperlink"/>
@@ -2271,7 +2271,7 @@
             <w:noProof/>
             <w:webHidden/>
           </w:rPr>
-          <w:instrText xml:space="preserve"> PAGEREF _Toc244166285 \h </w:instrText>
+          <w:instrText xml:space="preserve"> PAGEREF _Toc244245373 \h </w:instrText>
         </w:r>
         <w:r>
           <w:rPr>
@@ -2318,7 +2318,7 @@
           <w:lang w:eastAsia="nl-NL"/>
         </w:rPr>
       </w:pPr>
-      <w:hyperlink w:anchor="_Toc244166286" w:history="1">
+      <w:hyperlink w:anchor="_Toc244245374" w:history="1">
         <w:r>
           <w:rPr>
             <w:rStyle w:val="Hyperlink"/>
@@ -2363,7 +2363,7 @@
             <w:noProof/>
             <w:webHidden/>
           </w:rPr>
-          <w:instrText xml:space="preserve"> PAGEREF _Toc244166286 \h </w:instrText>
+          <w:instrText xml:space="preserve"> PAGEREF _Toc244245374 \h </w:instrText>
         </w:r>
         <w:r>
           <w:rPr>
@@ -2410,7 +2410,7 @@
           <w:lang w:eastAsia="nl-NL"/>
         </w:rPr>
       </w:pPr>
-      <w:hyperlink w:anchor="_Toc244166287" w:history="1">
+      <w:hyperlink w:anchor="_Toc244245375" w:history="1">
         <w:r>
           <w:rPr>
             <w:rStyle w:val="Hyperlink"/>
@@ -2455,7 +2455,7 @@
             <w:noProof/>
             <w:webHidden/>
           </w:rPr>
-          <w:instrText xml:space="preserve"> PAGEREF _Toc244166287 \h </w:instrText>
+          <w:instrText xml:space="preserve"> PAGEREF _Toc244245375 \h </w:instrText>
         </w:r>
         <w:r>
           <w:rPr>
@@ -2502,7 +2502,7 @@
           <w:lang w:eastAsia="nl-NL"/>
         </w:rPr>
       </w:pPr>
-      <w:hyperlink w:anchor="_Toc244166288" w:history="1">
+      <w:hyperlink w:anchor="_Toc244245376" w:history="1">
         <w:r>
           <w:rPr>
             <w:rStyle w:val="Hyperlink"/>
@@ -2547,7 +2547,7 @@
             <w:noProof/>
             <w:webHidden/>
           </w:rPr>
-          <w:instrText xml:space="preserve"> PAGEREF _Toc244166288 \h </w:instrText>
+          <w:instrText xml:space="preserve"> PAGEREF _Toc244245376 \h </w:instrText>
         </w:r>
         <w:r>
           <w:rPr>
@@ -2594,7 +2594,7 @@
           <w:lang w:eastAsia="nl-NL"/>
         </w:rPr>
       </w:pPr>
-      <w:hyperlink w:anchor="_Toc244166289" w:history="1">
+      <w:hyperlink w:anchor="_Toc244245377" w:history="1">
         <w:r>
           <w:rPr>
             <w:rStyle w:val="Hyperlink"/>
@@ -2639,7 +2639,7 @@
             <w:noProof/>
             <w:webHidden/>
           </w:rPr>
-          <w:instrText xml:space="preserve"> PAGEREF _Toc244166289 \h </w:instrText>
+          <w:instrText xml:space="preserve"> PAGEREF _Toc244245377 \h </w:instrText>
         </w:r>
         <w:r>
           <w:rPr>
@@ -2686,7 +2686,7 @@
           <w:lang w:eastAsia="nl-NL"/>
         </w:rPr>
       </w:pPr>
-      <w:hyperlink w:anchor="_Toc244166290" w:history="1">
+      <w:hyperlink w:anchor="_Toc244245378" w:history="1">
         <w:r>
           <w:rPr>
             <w:rStyle w:val="Hyperlink"/>
@@ -2731,7 +2731,7 @@
             <w:noProof/>
             <w:webHidden/>
           </w:rPr>
-          <w:instrText xml:space="preserve"> PAGEREF _Toc244166290 \h </w:instrText>
+          <w:instrText xml:space="preserve"> PAGEREF _Toc244245378 \h </w:instrText>
         </w:r>
         <w:r>
           <w:rPr>
@@ -2778,7 +2778,7 @@
           <w:lang w:eastAsia="nl-NL"/>
         </w:rPr>
       </w:pPr>
-      <w:hyperlink w:anchor="_Toc244166291" w:history="1">
+      <w:hyperlink w:anchor="_Toc244245379" w:history="1">
         <w:r>
           <w:rPr>
             <w:rStyle w:val="Hyperlink"/>
@@ -2823,7 +2823,7 @@
             <w:noProof/>
             <w:webHidden/>
           </w:rPr>
-          <w:instrText xml:space="preserve"> PAGEREF _Toc244166291 \h </w:instrText>
+          <w:instrText xml:space="preserve"> PAGEREF _Toc244245379 \h </w:instrText>
         </w:r>
         <w:r>
           <w:rPr>
@@ -2870,7 +2870,7 @@
           <w:lang w:eastAsia="nl-NL"/>
         </w:rPr>
       </w:pPr>
-      <w:hyperlink w:anchor="_Toc244166292" w:history="1">
+      <w:hyperlink w:anchor="_Toc244245380" w:history="1">
         <w:r>
           <w:rPr>
             <w:rStyle w:val="Hyperlink"/>
@@ -2915,7 +2915,7 @@
             <w:noProof/>
             <w:webHidden/>
           </w:rPr>
-          <w:instrText xml:space="preserve"> PAGEREF _Toc244166292 \h </w:instrText>
+          <w:instrText xml:space="preserve"> PAGEREF _Toc244245380 \h </w:instrText>
         </w:r>
         <w:r>
           <w:rPr>
@@ -2962,7 +2962,7 @@
           <w:lang w:eastAsia="nl-NL"/>
         </w:rPr>
       </w:pPr>
-      <w:hyperlink w:anchor="_Toc244166293" w:history="1">
+      <w:hyperlink w:anchor="_Toc244245381" w:history="1">
         <w:r>
           <w:rPr>
             <w:rStyle w:val="Hyperlink"/>
@@ -3007,7 +3007,7 @@
             <w:noProof/>
             <w:webHidden/>
           </w:rPr>
-          <w:instrText xml:space="preserve"> PAGEREF _Toc244166293 \h </w:instrText>
+          <w:instrText xml:space="preserve"> PAGEREF _Toc244245381 \h </w:instrText>
         </w:r>
         <w:r>
           <w:rPr>
@@ -3054,7 +3054,7 @@
           <w:lang w:eastAsia="nl-NL"/>
         </w:rPr>
       </w:pPr>
-      <w:hyperlink w:anchor="_Toc244166294" w:history="1">
+      <w:hyperlink w:anchor="_Toc244245382" w:history="1">
         <w:r>
           <w:rPr>
             <w:rStyle w:val="Hyperlink"/>
@@ -3115,7 +3115,7 @@
             <w:noProof/>
             <w:webHidden/>
           </w:rPr>
-          <w:instrText xml:space="preserve"> PAGEREF _Toc244166294 \h </w:instrText>
+          <w:instrText xml:space="preserve"> PAGEREF _Toc244245382 \h </w:instrText>
         </w:r>
         <w:r>
           <w:rPr>
@@ -3162,7 +3162,7 @@
           <w:lang w:eastAsia="nl-NL"/>
         </w:rPr>
       </w:pPr>
-      <w:hyperlink w:anchor="_Toc244166295" w:history="1">
+      <w:hyperlink w:anchor="_Toc244245383" w:history="1">
         <w:r>
           <w:rPr>
             <w:rStyle w:val="Hyperlink"/>
@@ -3207,7 +3207,7 @@
             <w:noProof/>
             <w:webHidden/>
           </w:rPr>
-          <w:instrText xml:space="preserve"> PAGEREF _Toc244166295 \h </w:instrText>
+          <w:instrText xml:space="preserve"> PAGEREF _Toc244245383 \h </w:instrText>
         </w:r>
         <w:r>
           <w:rPr>
@@ -3254,7 +3254,7 @@
           <w:lang w:eastAsia="nl-NL"/>
         </w:rPr>
       </w:pPr>
-      <w:hyperlink w:anchor="_Toc244166296" w:history="1">
+      <w:hyperlink w:anchor="_Toc244245384" w:history="1">
         <w:r>
           <w:rPr>
             <w:rStyle w:val="Hyperlink"/>
@@ -3299,7 +3299,7 @@
             <w:noProof/>
             <w:webHidden/>
           </w:rPr>
-          <w:instrText xml:space="preserve"> PAGEREF _Toc244166296 \h </w:instrText>
+          <w:instrText xml:space="preserve"> PAGEREF _Toc244245384 \h </w:instrText>
         </w:r>
         <w:r>
           <w:rPr>
@@ -3346,7 +3346,7 @@
           <w:lang w:eastAsia="nl-NL"/>
         </w:rPr>
       </w:pPr>
-      <w:hyperlink w:anchor="_Toc244166297" w:history="1">
+      <w:hyperlink w:anchor="_Toc244245385" w:history="1">
         <w:r>
           <w:rPr>
             <w:rStyle w:val="Hyperlink"/>
@@ -3391,7 +3391,7 @@
             <w:noProof/>
             <w:webHidden/>
           </w:rPr>
-          <w:instrText xml:space="preserve"> PAGEREF _Toc244166297 \h </w:instrText>
+          <w:instrText xml:space="preserve"> PAGEREF _Toc244245385 \h </w:instrText>
         </w:r>
         <w:r>
           <w:rPr>
@@ -3438,7 +3438,7 @@
           <w:lang w:eastAsia="nl-NL"/>
         </w:rPr>
       </w:pPr>
-      <w:hyperlink w:anchor="_Toc244166298" w:history="1">
+      <w:hyperlink w:anchor="_Toc244245386" w:history="1">
         <w:r>
           <w:rPr>
             <w:rStyle w:val="Hyperlink"/>
@@ -3483,7 +3483,7 @@
             <w:noProof/>
             <w:webHidden/>
           </w:rPr>
-          <w:instrText xml:space="preserve"> PAGEREF _Toc244166298 \h </w:instrText>
+          <w:instrText xml:space="preserve"> PAGEREF _Toc244245386 \h </w:instrText>
         </w:r>
         <w:r>
           <w:rPr>
@@ -3530,7 +3530,7 @@
           <w:lang w:eastAsia="nl-NL"/>
         </w:rPr>
       </w:pPr>
-      <w:hyperlink w:anchor="_Toc244166299" w:history="1">
+      <w:hyperlink w:anchor="_Toc244245387" w:history="1">
         <w:r>
           <w:rPr>
             <w:rStyle w:val="Hyperlink"/>
@@ -3591,7 +3591,7 @@
             <w:noProof/>
             <w:webHidden/>
           </w:rPr>
-          <w:instrText xml:space="preserve"> PAGEREF _Toc244166299 \h </w:instrText>
+          <w:instrText xml:space="preserve"> PAGEREF _Toc244245387 \h </w:instrText>
         </w:r>
         <w:r>
           <w:rPr>
@@ -3638,7 +3638,7 @@
           <w:lang w:eastAsia="nl-NL"/>
         </w:rPr>
       </w:pPr>
-      <w:hyperlink w:anchor="_Toc244166300" w:history="1">
+      <w:hyperlink w:anchor="_Toc244245388" w:history="1">
         <w:r>
           <w:rPr>
             <w:rStyle w:val="Hyperlink"/>
@@ -3683,7 +3683,7 @@
             <w:noProof/>
             <w:webHidden/>
           </w:rPr>
-          <w:instrText xml:space="preserve"> PAGEREF _Toc244166300 \h </w:instrText>
+          <w:instrText xml:space="preserve"> PAGEREF _Toc244245388 \h </w:instrText>
         </w:r>
         <w:r>
           <w:rPr>
@@ -3730,7 +3730,7 @@
           <w:lang w:eastAsia="nl-NL"/>
         </w:rPr>
       </w:pPr>
-      <w:hyperlink w:anchor="_Toc244166301" w:history="1">
+      <w:hyperlink w:anchor="_Toc244245389" w:history="1">
         <w:r>
           <w:rPr>
             <w:rStyle w:val="Hyperlink"/>
@@ -3775,7 +3775,7 @@
             <w:noProof/>
             <w:webHidden/>
           </w:rPr>
-          <w:instrText xml:space="preserve"> PAGEREF _Toc244166301 \h </w:instrText>
+          <w:instrText xml:space="preserve"> PAGEREF _Toc244245389 \h </w:instrText>
         </w:r>
         <w:r>
           <w:rPr>
@@ -3822,7 +3822,7 @@
           <w:lang w:eastAsia="nl-NL"/>
         </w:rPr>
       </w:pPr>
-      <w:hyperlink w:anchor="_Toc244166302" w:history="1">
+      <w:hyperlink w:anchor="_Toc244245390" w:history="1">
         <w:r>
           <w:rPr>
             <w:rStyle w:val="Hyperlink"/>
@@ -3869,7 +3869,7 @@
             <w:noProof/>
             <w:webHidden/>
           </w:rPr>
-          <w:instrText xml:space="preserve"> PAGEREF _Toc244166302 \h </w:instrText>
+          <w:instrText xml:space="preserve"> PAGEREF _Toc244245390 \h </w:instrText>
         </w:r>
         <w:r>
           <w:rPr>
@@ -3916,7 +3916,7 @@
           <w:lang w:eastAsia="nl-NL"/>
         </w:rPr>
       </w:pPr>
-      <w:hyperlink w:anchor="_Toc244166303" w:history="1">
+      <w:hyperlink w:anchor="_Toc244245391" w:history="1">
         <w:r>
           <w:rPr>
             <w:rStyle w:val="Hyperlink"/>
@@ -3963,7 +3963,7 @@
             <w:noProof/>
             <w:webHidden/>
           </w:rPr>
-          <w:instrText xml:space="preserve"> PAGEREF _Toc244166303 \h </w:instrText>
+          <w:instrText xml:space="preserve"> PAGEREF _Toc244245391 \h </w:instrText>
         </w:r>
         <w:r>
           <w:rPr>
@@ -4010,7 +4010,7 @@
           <w:lang w:eastAsia="nl-NL"/>
         </w:rPr>
       </w:pPr>
-      <w:hyperlink w:anchor="_Toc244166304" w:history="1">
+      <w:hyperlink w:anchor="_Toc244245392" w:history="1">
         <w:r>
           <w:rPr>
             <w:rStyle w:val="Hyperlink"/>
@@ -4057,7 +4057,7 @@
             <w:noProof/>
             <w:webHidden/>
           </w:rPr>
-          <w:instrText xml:space="preserve"> PAGEREF _Toc244166304 \h </w:instrText>
+          <w:instrText xml:space="preserve"> PAGEREF _Toc244245392 \h </w:instrText>
         </w:r>
         <w:r>
           <w:rPr>
@@ -4104,7 +4104,7 @@
           <w:lang w:eastAsia="nl-NL"/>
         </w:rPr>
       </w:pPr>
-      <w:hyperlink w:anchor="_Toc244166305" w:history="1">
+      <w:hyperlink w:anchor="_Toc244245393" w:history="1">
         <w:r>
           <w:rPr>
             <w:rStyle w:val="Hyperlink"/>
@@ -4151,7 +4151,7 @@
             <w:noProof/>
             <w:webHidden/>
           </w:rPr>
-          <w:instrText xml:space="preserve"> PAGEREF _Toc244166305 \h </w:instrText>
+          <w:instrText xml:space="preserve"> PAGEREF _Toc244245393 \h </w:instrText>
         </w:r>
         <w:r>
           <w:rPr>
@@ -4198,7 +4198,7 @@
           <w:lang w:eastAsia="nl-NL"/>
         </w:rPr>
       </w:pPr>
-      <w:hyperlink w:anchor="_Toc244166306" w:history="1">
+      <w:hyperlink w:anchor="_Toc244245394" w:history="1">
         <w:r>
           <w:rPr>
             <w:rStyle w:val="Hyperlink"/>
@@ -4245,7 +4245,7 @@
             <w:noProof/>
             <w:webHidden/>
           </w:rPr>
-          <w:instrText xml:space="preserve"> PAGEREF _Toc244166306 \h </w:instrText>
+          <w:instrText xml:space="preserve"> PAGEREF _Toc244245394 \h </w:instrText>
         </w:r>
         <w:r>
           <w:rPr>
@@ -4292,7 +4292,7 @@
           <w:lang w:eastAsia="nl-NL"/>
         </w:rPr>
       </w:pPr>
-      <w:hyperlink w:anchor="_Toc244166307" w:history="1">
+      <w:hyperlink w:anchor="_Toc244245395" w:history="1">
         <w:r>
           <w:rPr>
             <w:rStyle w:val="Hyperlink"/>
@@ -4339,7 +4339,7 @@
             <w:noProof/>
             <w:webHidden/>
           </w:rPr>
-          <w:instrText xml:space="preserve"> PAGEREF _Toc244166307 \h </w:instrText>
+          <w:instrText xml:space="preserve"> PAGEREF _Toc244245395 \h </w:instrText>
         </w:r>
         <w:r>
           <w:rPr>
@@ -4386,7 +4386,7 @@
           <w:lang w:eastAsia="nl-NL"/>
         </w:rPr>
       </w:pPr>
-      <w:hyperlink w:anchor="_Toc244166308" w:history="1">
+      <w:hyperlink w:anchor="_Toc244245396" w:history="1">
         <w:r>
           <w:rPr>
             <w:rStyle w:val="Hyperlink"/>
@@ -4431,7 +4431,7 @@
             <w:noProof/>
             <w:webHidden/>
           </w:rPr>
-          <w:instrText xml:space="preserve"> PAGEREF _Toc244166308 \h </w:instrText>
+          <w:instrText xml:space="preserve"> PAGEREF _Toc244245396 \h </w:instrText>
         </w:r>
         <w:r>
           <w:rPr>
@@ -4478,7 +4478,7 @@
           <w:lang w:eastAsia="nl-NL"/>
         </w:rPr>
       </w:pPr>
-      <w:hyperlink w:anchor="_Toc244166309" w:history="1">
+      <w:hyperlink w:anchor="_Toc244245397" w:history="1">
         <w:r>
           <w:rPr>
             <w:rStyle w:val="Hyperlink"/>
@@ -4523,7 +4523,7 @@
             <w:noProof/>
             <w:webHidden/>
           </w:rPr>
-          <w:instrText xml:space="preserve"> PAGEREF _Toc244166309 \h </w:instrText>
+          <w:instrText xml:space="preserve"> PAGEREF _Toc244245397 \h </w:instrText>
         </w:r>
         <w:r>
           <w:rPr>
@@ -4570,7 +4570,7 @@
           <w:lang w:eastAsia="nl-NL"/>
         </w:rPr>
       </w:pPr>
-      <w:hyperlink w:anchor="_Toc244166310" w:history="1">
+      <w:hyperlink w:anchor="_Toc244245398" w:history="1">
         <w:r>
           <w:rPr>
             <w:rStyle w:val="Hyperlink"/>
@@ -4647,7 +4647,7 @@
             <w:noProof/>
             <w:webHidden/>
           </w:rPr>
-          <w:instrText xml:space="preserve"> PAGEREF _Toc244166310 \h </w:instrText>
+          <w:instrText xml:space="preserve"> PAGEREF _Toc244245398 \h </w:instrText>
         </w:r>
         <w:r>
           <w:rPr>
@@ -4694,7 +4694,7 @@
           <w:lang w:eastAsia="nl-NL"/>
         </w:rPr>
       </w:pPr>
-      <w:hyperlink w:anchor="_Toc244166311" w:history="1">
+      <w:hyperlink w:anchor="_Toc244245399" w:history="1">
         <w:r>
           <w:rPr>
             <w:rStyle w:val="Hyperlink"/>
@@ -4739,7 +4739,7 @@
             <w:noProof/>
             <w:webHidden/>
           </w:rPr>
-          <w:instrText xml:space="preserve"> PAGEREF _Toc244166311 \h </w:instrText>
+          <w:instrText xml:space="preserve"> PAGEREF _Toc244245399 \h </w:instrText>
         </w:r>
         <w:r>
           <w:rPr>
@@ -4786,7 +4786,7 @@
           <w:lang w:eastAsia="nl-NL"/>
         </w:rPr>
       </w:pPr>
-      <w:hyperlink w:anchor="_Toc244166312" w:history="1">
+      <w:hyperlink w:anchor="_Toc244245400" w:history="1">
         <w:r>
           <w:rPr>
             <w:rStyle w:val="Hyperlink"/>
@@ -4831,7 +4831,7 @@
             <w:noProof/>
             <w:webHidden/>
           </w:rPr>
-          <w:instrText xml:space="preserve"> PAGEREF _Toc244166312 \h </w:instrText>
+          <w:instrText xml:space="preserve"> PAGEREF _Toc244245400 \h </w:instrText>
         </w:r>
         <w:r>
           <w:rPr>
@@ -4878,7 +4878,7 @@
           <w:lang w:eastAsia="nl-NL"/>
         </w:rPr>
       </w:pPr>
-      <w:hyperlink w:anchor="_Toc244166313" w:history="1">
+      <w:hyperlink w:anchor="_Toc244245401" w:history="1">
         <w:r>
           <w:rPr>
             <w:rStyle w:val="Hyperlink"/>
@@ -4923,7 +4923,7 @@
             <w:noProof/>
             <w:webHidden/>
           </w:rPr>
-          <w:instrText xml:space="preserve"> PAGEREF _Toc244166313 \h </w:instrText>
+          <w:instrText xml:space="preserve"> PAGEREF _Toc244245401 \h </w:instrText>
         </w:r>
         <w:r>
           <w:rPr>
@@ -4970,7 +4970,7 @@
           <w:lang w:eastAsia="nl-NL"/>
         </w:rPr>
       </w:pPr>
-      <w:hyperlink w:anchor="_Toc244166314" w:history="1">
+      <w:hyperlink w:anchor="_Toc244245402" w:history="1">
         <w:r>
           <w:rPr>
             <w:rStyle w:val="Hyperlink"/>
@@ -5015,7 +5015,7 @@
             <w:noProof/>
             <w:webHidden/>
           </w:rPr>
-          <w:instrText xml:space="preserve"> PAGEREF _Toc244166314 \h </w:instrText>
+          <w:instrText xml:space="preserve"> PAGEREF _Toc244245402 \h </w:instrText>
         </w:r>
         <w:r>
           <w:rPr>
@@ -5062,7 +5062,7 @@
           <w:lang w:eastAsia="nl-NL"/>
         </w:rPr>
       </w:pPr>
-      <w:hyperlink w:anchor="_Toc244166315" w:history="1">
+      <w:hyperlink w:anchor="_Toc244245403" w:history="1">
         <w:r>
           <w:rPr>
             <w:rStyle w:val="Hyperlink"/>
@@ -5107,7 +5107,7 @@
             <w:noProof/>
             <w:webHidden/>
           </w:rPr>
-          <w:instrText xml:space="preserve"> PAGEREF _Toc244166315 \h </w:instrText>
+          <w:instrText xml:space="preserve"> PAGEREF _Toc244245403 \h </w:instrText>
         </w:r>
         <w:r>
           <w:rPr>
@@ -5154,7 +5154,7 @@
           <w:lang w:eastAsia="nl-NL"/>
         </w:rPr>
       </w:pPr>
-      <w:hyperlink w:anchor="_Toc244166316" w:history="1">
+      <w:hyperlink w:anchor="_Toc244245404" w:history="1">
         <w:r>
           <w:rPr>
             <w:rStyle w:val="Hyperlink"/>
@@ -5199,7 +5199,7 @@
             <w:noProof/>
             <w:webHidden/>
           </w:rPr>
-          <w:instrText xml:space="preserve"> PAGEREF _Toc244166316 \h </w:instrText>
+          <w:instrText xml:space="preserve"> PAGEREF _Toc244245404 \h </w:instrText>
         </w:r>
         <w:r>
           <w:rPr>
@@ -5246,7 +5246,7 @@
           <w:lang w:eastAsia="nl-NL"/>
         </w:rPr>
       </w:pPr>
-      <w:hyperlink w:anchor="_Toc244166317" w:history="1">
+      <w:hyperlink w:anchor="_Toc244245405" w:history="1">
         <w:r>
           <w:rPr>
             <w:rStyle w:val="Hyperlink"/>
@@ -5291,7 +5291,7 @@
             <w:noProof/>
             <w:webHidden/>
           </w:rPr>
-          <w:instrText xml:space="preserve"> PAGEREF _Toc244166317 \h </w:instrText>
+          <w:instrText xml:space="preserve"> PAGEREF _Toc244245405 \h </w:instrText>
         </w:r>
         <w:r>
           <w:rPr>
@@ -5338,7 +5338,7 @@
           <w:lang w:eastAsia="nl-NL"/>
         </w:rPr>
       </w:pPr>
-      <w:hyperlink w:anchor="_Toc244166318" w:history="1">
+      <w:hyperlink w:anchor="_Toc244245406" w:history="1">
         <w:r>
           <w:rPr>
             <w:rStyle w:val="Hyperlink"/>
@@ -5383,7 +5383,7 @@
             <w:noProof/>
             <w:webHidden/>
           </w:rPr>
-          <w:instrText xml:space="preserve"> PAGEREF _Toc244166318 \h </w:instrText>
+          <w:instrText xml:space="preserve"> PAGEREF _Toc244245406 \h </w:instrText>
         </w:r>
         <w:r>
           <w:rPr>
@@ -5430,7 +5430,7 @@
           <w:lang w:eastAsia="nl-NL"/>
         </w:rPr>
       </w:pPr>
-      <w:hyperlink w:anchor="_Toc244166319" w:history="1">
+      <w:hyperlink w:anchor="_Toc244245407" w:history="1">
         <w:r>
           <w:rPr>
             <w:rStyle w:val="Hyperlink"/>
@@ -5475,7 +5475,7 @@
             <w:noProof/>
             <w:webHidden/>
           </w:rPr>
-          <w:instrText xml:space="preserve"> PAGEREF _Toc244166319 \h </w:instrText>
+          <w:instrText xml:space="preserve"> PAGEREF _Toc244245407 \h </w:instrText>
         </w:r>
         <w:r>
           <w:rPr>
@@ -5522,7 +5522,7 @@
           <w:lang w:eastAsia="nl-NL"/>
         </w:rPr>
       </w:pPr>
-      <w:hyperlink w:anchor="_Toc244166320" w:history="1">
+      <w:hyperlink w:anchor="_Toc244245408" w:history="1">
         <w:r>
           <w:rPr>
             <w:rStyle w:val="Hyperlink"/>
@@ -5567,7 +5567,7 @@
             <w:noProof/>
             <w:webHidden/>
           </w:rPr>
-          <w:instrText xml:space="preserve"> PAGEREF _Toc244166320 \h </w:instrText>
+          <w:instrText xml:space="preserve"> PAGEREF _Toc244245408 \h </w:instrText>
         </w:r>
         <w:r>
           <w:rPr>
@@ -5614,7 +5614,7 @@
           <w:lang w:eastAsia="nl-NL"/>
         </w:rPr>
       </w:pPr>
-      <w:hyperlink w:anchor="_Toc244166321" w:history="1">
+      <w:hyperlink w:anchor="_Toc244245409" w:history="1">
         <w:r>
           <w:rPr>
             <w:rStyle w:val="Hyperlink"/>
@@ -5659,7 +5659,7 @@
             <w:noProof/>
             <w:webHidden/>
           </w:rPr>
-          <w:instrText xml:space="preserve"> PAGEREF _Toc244166321 \h </w:instrText>
+          <w:instrText xml:space="preserve"> PAGEREF _Toc244245409 \h </w:instrText>
         </w:r>
         <w:r>
           <w:rPr>
@@ -5712,7 +5712,7 @@
         </w:numPr>
       </w:pPr>
       <w:bookmarkStart w:id="1" w:name="k1"/>
-      <w:bookmarkStart w:id="2" w:name="_Toc244166263"/>
+      <w:bookmarkStart w:id="2" w:name="_Toc244245351"/>
       <w:r>
         <w:t>DOEL VAN DE APPLICATIE.</w:t>
       </w:r>
@@ -5794,7 +5794,7 @@
         </w:numPr>
       </w:pPr>
       <w:bookmarkStart w:id="3" w:name="k2"/>
-      <w:bookmarkStart w:id="4" w:name="_Toc244166264"/>
+      <w:bookmarkStart w:id="4" w:name="_Toc244245352"/>
       <w:r>
         <w:t>BESTANDEN.</w:t>
       </w:r>
@@ -10269,7 +10269,7 @@
         </w:numPr>
       </w:pPr>
       <w:bookmarkStart w:id="5" w:name="k3"/>
-      <w:bookmarkStart w:id="6" w:name="_Toc244166265"/>
+      <w:bookmarkStart w:id="6" w:name="_Toc244245353"/>
       <w:r>
         <w:t>DE WEBSITE STARTEN.</w:t>
       </w:r>
@@ -10491,7 +10491,7 @@
         </w:numPr>
       </w:pPr>
       <w:bookmarkStart w:id="7" w:name="k4"/>
-      <w:bookmarkStart w:id="8" w:name="_Toc244166266"/>
+      <w:bookmarkStart w:id="8" w:name="_Toc244245354"/>
       <w:r>
         <w:t>GEBRUIKERSHANDLEIDING.</w:t>
       </w:r>
@@ -10531,7 +10531,7 @@
         <w:keepNext/>
       </w:pPr>
       <w:bookmarkStart w:id="9" w:name="k5"/>
-      <w:bookmarkStart w:id="10" w:name="_Toc244166267"/>
+      <w:bookmarkStart w:id="10" w:name="_Toc244245355"/>
       <w:r>
         <w:t>EEN MEDEWERKER ZOEKEN</w:t>
       </w:r>
@@ -10597,7 +10597,7 @@
         <w:keepNext/>
       </w:pPr>
       <w:bookmarkStart w:id="11" w:name="k6"/>
-      <w:bookmarkStart w:id="12" w:name="_Toc244166268"/>
+      <w:bookmarkStart w:id="12" w:name="_Toc244245356"/>
       <w:r>
         <w:t>EEN PRODUCT REGISTREREN</w:t>
       </w:r>
@@ -10846,7 +10846,7 @@
         <w:keepNext/>
       </w:pPr>
       <w:bookmarkStart w:id="13" w:name="k7"/>
-      <w:bookmarkStart w:id="14" w:name="_Toc244166269"/>
+      <w:bookmarkStart w:id="14" w:name="_Toc244245357"/>
       <w:r>
         <w:t>ADMIN-DASHBOARD OPENEN</w:t>
       </w:r>
@@ -10977,7 +10977,7 @@
         <w:keepNext/>
       </w:pPr>
       <w:bookmarkStart w:id="15" w:name="k8"/>
-      <w:bookmarkStart w:id="16" w:name="_Toc244166270"/>
+      <w:bookmarkStart w:id="16" w:name="_Toc244245358"/>
       <w:r>
         <w:t>REGISTRATIES BEHEREN</w:t>
       </w:r>
@@ -11263,7 +11263,7 @@
         <w:keepNext/>
       </w:pPr>
       <w:bookmarkStart w:id="17" w:name="k9"/>
-      <w:bookmarkStart w:id="18" w:name="_Toc244166271"/>
+      <w:bookmarkStart w:id="18" w:name="_Toc244245359"/>
       <w:r>
         <w:t>MEDEWERKERS BEHEREN</w:t>
       </w:r>
@@ -11644,7 +11644,7 @@
         <w:keepNext/>
       </w:pPr>
       <w:bookmarkStart w:id="19" w:name="k10"/>
-      <w:bookmarkStart w:id="20" w:name="_Toc244166272"/>
+      <w:bookmarkStart w:id="20" w:name="_Toc244245360"/>
       <w:r>
         <w:t>PRODUCTEN BEHEREN</w:t>
       </w:r>
@@ -11772,7 +11772,7 @@
         <w:keepNext/>
       </w:pPr>
       <w:bookmarkStart w:id="21" w:name="k11"/>
-      <w:bookmarkStart w:id="22" w:name="_Toc244166273"/>
+      <w:bookmarkStart w:id="22" w:name="_Toc244245361"/>
       <w:r>
         <w:t>BEDRIJVEN EN CONSUMPTIEPUNTEN BEHEREN</w:t>
       </w:r>
@@ -11935,7 +11935,7 @@
         <w:keepNext/>
       </w:pPr>
       <w:bookmarkStart w:id="23" w:name="k12"/>
-      <w:bookmarkStart w:id="24" w:name="_Toc244166274"/>
+      <w:bookmarkStart w:id="24" w:name="_Toc244245362"/>
       <w:r>
         <w:t>VOORRAAD BEHEREN</w:t>
       </w:r>
@@ -12153,7 +12153,7 @@
         <w:keepNext/>
       </w:pPr>
       <w:bookmarkStart w:id="25" w:name="k13"/>
-      <w:bookmarkStart w:id="26" w:name="_Toc244166275"/>
+      <w:bookmarkStart w:id="26" w:name="_Toc244245363"/>
       <w:r>
         <w:t>LOGBOEK BEKIJKEN</w:t>
       </w:r>
@@ -12193,7 +12193,7 @@
         <w:keepNext/>
       </w:pPr>
       <w:bookmarkStart w:id="27" w:name="k14"/>
-      <w:bookmarkStart w:id="28" w:name="_Toc244166276"/>
+      <w:bookmarkStart w:id="28" w:name="_Toc244245364"/>
       <w:r>
         <w:t>ALLE GEGEVENS WISSEN</w:t>
       </w:r>
@@ -12319,7 +12319,7 @@
         <w:keepNext/>
       </w:pPr>
       <w:bookmarkStart w:id="29" w:name="k15"/>
-      <w:bookmarkStart w:id="30" w:name="_Toc244166277"/>
+      <w:bookmarkStart w:id="30" w:name="_Toc244245365"/>
       <w:r>
         <w:t>MODAL SLUITEN EN UITLOGGEN</w:t>
       </w:r>
@@ -12393,7 +12393,7 @@
         <w:keepNext/>
       </w:pPr>
       <w:bookmarkStart w:id="31" w:name="k16"/>
-      <w:bookmarkStart w:id="32" w:name="_Toc244166278"/>
+      <w:bookmarkStart w:id="32" w:name="_Toc244245366"/>
       <w:r>
         <w:t>CSV EXPORTEREN</w:t>
       </w:r>
@@ -12777,7 +12777,7 @@
         <w:keepNext/>
       </w:pPr>
       <w:bookmarkStart w:id="33" w:name="k17"/>
-      <w:bookmarkStart w:id="34" w:name="_Toc244166279"/>
+      <w:bookmarkStart w:id="34" w:name="_Toc244245367"/>
       <w:r>
         <w:t>LICHT OF DONKER THEMA</w:t>
       </w:r>
@@ -12884,7 +12884,7 @@
         <w:keepNext/>
       </w:pPr>
       <w:bookmarkStart w:id="35" w:name="k18"/>
-      <w:bookmarkStart w:id="36" w:name="_Toc244166280"/>
+      <w:bookmarkStart w:id="36" w:name="_Toc244245368"/>
       <w:r>
         <w:t>WELKOM EN "ZELFDE ALS VORIGE KEER"</w:t>
       </w:r>
@@ -12971,7 +12971,7 @@
         <w:keepNext/>
       </w:pPr>
       <w:bookmarkStart w:id="37" w:name="k19"/>
-      <w:bookmarkStart w:id="38" w:name="_Toc244166281"/>
+      <w:bookmarkStart w:id="38" w:name="_Toc244245369"/>
       <w:r>
         <w:t>DEMO GEZICHTSHERKENNING</w:t>
       </w:r>
@@ -13561,7 +13561,7 @@
         <w:keepNext/>
       </w:pPr>
       <w:bookmarkStart w:id="39" w:name="k20"/>
-      <w:bookmarkStart w:id="40" w:name="_Toc244166282"/>
+      <w:bookmarkStart w:id="40" w:name="_Toc244245370"/>
       <w:r>
         <w:t>HERKENNEN MET DE PAS</w:t>
       </w:r>
@@ -13758,7 +13758,7 @@
         <w:keepNext/>
       </w:pPr>
       <w:bookmarkStart w:id="41" w:name="k21"/>
-      <w:bookmarkStart w:id="42" w:name="_Toc244166283"/>
+      <w:bookmarkStart w:id="42" w:name="_Toc244245371"/>
       <w:r>
         <w:t>SLIMME KOELKAST (DEMO)</w:t>
       </w:r>
@@ -14392,7 +14392,7 @@
         <w:keepNext/>
       </w:pPr>
       <w:bookmarkStart w:id="43" w:name="k22"/>
-      <w:bookmarkStart w:id="44" w:name="_Toc244166284"/>
+      <w:bookmarkStart w:id="44" w:name="_Toc244245372"/>
       <w:r>
         <w:t>HET STARTSCHERM EN AUTOMATISCH SCANNEN (DEMO)</w:t>
       </w:r>
@@ -14960,7 +14960,7 @@
         </w:numPr>
       </w:pPr>
       <w:bookmarkStart w:id="45" w:name="k23"/>
-      <w:bookmarkStart w:id="46" w:name="_Toc244166285"/>
+      <w:bookmarkStart w:id="46" w:name="_Toc244245373"/>
       <w:r>
         <w:t xml:space="preserve">UITLEG VAN </w:t>
       </w:r>
@@ -14984,7 +14984,7 @@
         <w:keepNext/>
       </w:pPr>
       <w:bookmarkStart w:id="47" w:name="k24"/>
-      <w:bookmarkStart w:id="48" w:name="_Toc244166286"/>
+      <w:bookmarkStart w:id="48" w:name="_Toc244245374"/>
       <w:r>
         <w:t>METADATA EN EXTERNE BESTANDEN</w:t>
       </w:r>
@@ -15307,7 +15307,7 @@
         <w:keepNext/>
       </w:pPr>
       <w:bookmarkStart w:id="49" w:name="k25"/>
-      <w:bookmarkStart w:id="50" w:name="_Toc244166287"/>
+      <w:bookmarkStart w:id="50" w:name="_Toc244245375"/>
       <w:r>
         <w:t>NAVIGATIEBALK</w:t>
       </w:r>
@@ -15520,7 +15520,7 @@
         <w:keepNext/>
       </w:pPr>
       <w:bookmarkStart w:id="51" w:name="k26"/>
-      <w:bookmarkStart w:id="52" w:name="_Toc244166288"/>
+      <w:bookmarkStart w:id="52" w:name="_Toc244245376"/>
       <w:r>
         <w:t>HERO-GEDEELTE</w:t>
       </w:r>
@@ -15565,7 +15565,7 @@
         <w:keepNext/>
       </w:pPr>
       <w:bookmarkStart w:id="53" w:name="k27"/>
-      <w:bookmarkStart w:id="54" w:name="_Toc244166289"/>
+      <w:bookmarkStart w:id="54" w:name="_Toc244245377"/>
       <w:r>
         <w:t>MEDEWERKERLIJST</w:t>
       </w:r>
@@ -15902,7 +15902,7 @@
         <w:keepNext/>
       </w:pPr>
       <w:bookmarkStart w:id="55" w:name="k28"/>
-      <w:bookmarkStart w:id="56" w:name="_Toc244166290"/>
+      <w:bookmarkStart w:id="56" w:name="_Toc244245378"/>
       <w:r>
         <w:t>STATISTIEKEN</w:t>
       </w:r>
@@ -15985,7 +15985,7 @@
         <w:keepNext/>
       </w:pPr>
       <w:bookmarkStart w:id="57" w:name="k29"/>
-      <w:bookmarkStart w:id="58" w:name="_Toc244166291"/>
+      <w:bookmarkStart w:id="58" w:name="_Toc244245379"/>
       <w:r>
         <w:t>VENSTERS (MODALS)</w:t>
       </w:r>
@@ -16647,7 +16647,7 @@
         <w:keepNext/>
       </w:pPr>
       <w:bookmarkStart w:id="59" w:name="k30"/>
-      <w:bookmarkStart w:id="60" w:name="_Toc244166292"/>
+      <w:bookmarkStart w:id="60" w:name="_Toc244245380"/>
       <w:r>
         <w:t>STARTSCHERM</w:t>
       </w:r>
@@ -16874,7 +16874,7 @@
         <w:keepNext/>
       </w:pPr>
       <w:bookmarkStart w:id="61" w:name="k31"/>
-      <w:bookmarkStart w:id="62" w:name="_Toc244166293"/>
+      <w:bookmarkStart w:id="62" w:name="_Toc244245381"/>
       <w:r>
         <w:t>WAARSCHUWING BIJ OPENEN ALS LOS BESTAND</w:t>
       </w:r>
@@ -16919,7 +16919,7 @@
         </w:numPr>
       </w:pPr>
       <w:bookmarkStart w:id="63" w:name="k32"/>
-      <w:bookmarkStart w:id="64" w:name="_Toc244166294"/>
+      <w:bookmarkStart w:id="64" w:name="_Toc244245382"/>
       <w:r>
         <w:t>UITLEG VAN DE CSS (</w:t>
       </w:r>
@@ -16943,7 +16943,7 @@
         <w:keepNext/>
       </w:pPr>
       <w:bookmarkStart w:id="65" w:name="k33"/>
-      <w:bookmarkStart w:id="66" w:name="_Toc244166295"/>
+      <w:bookmarkStart w:id="66" w:name="_Toc244245383"/>
       <w:r>
         <w:t>BESTANDEN EN VOLGORDE</w:t>
       </w:r>
@@ -18262,7 +18262,7 @@
         <w:keepNext/>
       </w:pPr>
       <w:bookmarkStart w:id="67" w:name="k34"/>
-      <w:bookmarkStart w:id="68" w:name="_Toc244166296"/>
+      <w:bookmarkStart w:id="68" w:name="_Toc244245384"/>
       <w:r>
         <w:t>CSS-VARIABELEN</w:t>
       </w:r>
@@ -19105,7 +19105,7 @@
         <w:keepNext/>
       </w:pPr>
       <w:bookmarkStart w:id="69" w:name="k35"/>
-      <w:bookmarkStart w:id="70" w:name="_Toc244166297"/>
+      <w:bookmarkStart w:id="70" w:name="_Toc244245385"/>
       <w:r>
         <w:t>LAYOUT</w:t>
       </w:r>
@@ -19814,7 +19814,7 @@
         <w:keepNext/>
       </w:pPr>
       <w:bookmarkStart w:id="71" w:name="k36"/>
-      <w:bookmarkStart w:id="72" w:name="_Toc244166298"/>
+      <w:bookmarkStart w:id="72" w:name="_Toc244245386"/>
       <w:r>
         <w:t>COMPONENTEN</w:t>
       </w:r>
@@ -20059,7 +20059,7 @@
         </w:numPr>
       </w:pPr>
       <w:bookmarkStart w:id="73" w:name="k37"/>
-      <w:bookmarkStart w:id="74" w:name="_Toc244166299"/>
+      <w:bookmarkStart w:id="74" w:name="_Toc244245387"/>
       <w:r>
         <w:t>UITLEG VAN DE JAVASCRIPT (</w:t>
       </w:r>
@@ -20083,7 +20083,7 @@
         <w:keepNext/>
       </w:pPr>
       <w:bookmarkStart w:id="75" w:name="k38"/>
-      <w:bookmarkStart w:id="76" w:name="_Toc244166300"/>
+      <w:bookmarkStart w:id="76" w:name="_Toc244245388"/>
       <w:r>
         <w:t>OPSLAG EN VOORBEELDDATA</w:t>
       </w:r>
@@ -20861,7 +20861,7 @@
         <w:keepNext/>
       </w:pPr>
       <w:bookmarkStart w:id="77" w:name="k39"/>
-      <w:bookmarkStart w:id="78" w:name="_Toc244166301"/>
+      <w:bookmarkStart w:id="78" w:name="_Toc244245389"/>
       <w:r>
         <w:t>OBJECTGEORIËNTEERDE STRUCTUUR</w:t>
       </w:r>
@@ -28315,7 +28315,7 @@
         <w:keepNext/>
       </w:pPr>
       <w:bookmarkStart w:id="93" w:name="k54"/>
-      <w:bookmarkStart w:id="94" w:name="_Toc244166302"/>
+      <w:bookmarkStart w:id="94" w:name="_Toc244245390"/>
       <w:r>
         <w:rPr>
           <w:rFonts w:ascii="Consolas" w:hAnsi="Consolas" w:cs="Consolas"/>
@@ -28458,7 +28458,7 @@
         <w:keepNext/>
       </w:pPr>
       <w:bookmarkStart w:id="95" w:name="k55"/>
-      <w:bookmarkStart w:id="96" w:name="_Toc244166303"/>
+      <w:bookmarkStart w:id="96" w:name="_Toc244245391"/>
       <w:r>
         <w:rPr>
           <w:rFonts w:ascii="Consolas" w:hAnsi="Consolas" w:cs="Consolas"/>
@@ -28535,7 +28535,7 @@
         <w:keepNext/>
       </w:pPr>
       <w:bookmarkStart w:id="97" w:name="k56"/>
-      <w:bookmarkStart w:id="98" w:name="_Toc244166304"/>
+      <w:bookmarkStart w:id="98" w:name="_Toc244245392"/>
       <w:r>
         <w:rPr>
           <w:rFonts w:ascii="Consolas" w:hAnsi="Consolas" w:cs="Consolas"/>
@@ -28706,7 +28706,7 @@
         <w:keepNext/>
       </w:pPr>
       <w:bookmarkStart w:id="99" w:name="k57"/>
-      <w:bookmarkStart w:id="100" w:name="_Toc244166305"/>
+      <w:bookmarkStart w:id="100" w:name="_Toc244245393"/>
       <w:r>
         <w:rPr>
           <w:rFonts w:ascii="Consolas" w:hAnsi="Consolas" w:cs="Consolas"/>
@@ -28773,7 +28773,7 @@
         <w:keepNext/>
       </w:pPr>
       <w:bookmarkStart w:id="101" w:name="k58"/>
-      <w:bookmarkStart w:id="102" w:name="_Toc244166306"/>
+      <w:bookmarkStart w:id="102" w:name="_Toc244245394"/>
       <w:r>
         <w:rPr>
           <w:rFonts w:ascii="Consolas" w:hAnsi="Consolas" w:cs="Consolas"/>
@@ -28895,7 +28895,7 @@
         <w:keepNext/>
       </w:pPr>
       <w:bookmarkStart w:id="103" w:name="k59"/>
-      <w:bookmarkStart w:id="104" w:name="_Toc244166307"/>
+      <w:bookmarkStart w:id="104" w:name="_Toc244245395"/>
       <w:r>
         <w:rPr>
           <w:rFonts w:ascii="Consolas" w:hAnsi="Consolas" w:cs="Consolas"/>
@@ -29017,7 +29017,7 @@
         <w:keepNext/>
       </w:pPr>
       <w:bookmarkStart w:id="105" w:name="k60"/>
-      <w:bookmarkStart w:id="106" w:name="_Toc244166308"/>
+      <w:bookmarkStart w:id="106" w:name="_Toc244245396"/>
       <w:r>
         <w:t>OPSLAGFOUTEN EN TERUGDRAAIEN</w:t>
       </w:r>
@@ -29079,7 +29079,7 @@
         <w:keepNext/>
       </w:pPr>
       <w:bookmarkStart w:id="107" w:name="k61"/>
-      <w:bookmarkStart w:id="108" w:name="_Toc244166309"/>
+      <w:bookmarkStart w:id="108" w:name="_Toc244245397"/>
       <w:r>
         <w:t>ADMINFUNCTIES</w:t>
       </w:r>
@@ -29325,7 +29325,7 @@
         <w:keepNext/>
       </w:pPr>
       <w:bookmarkStart w:id="109" w:name="k62"/>
-      <w:bookmarkStart w:id="110" w:name="_Toc244166310"/>
+      <w:bookmarkStart w:id="110" w:name="_Toc244245398"/>
       <w:r>
         <w:t xml:space="preserve">CSV-EXPORT (CLASS </w:t>
       </w:r>
@@ -29733,7 +29733,7 @@
         <w:keepNext/>
       </w:pPr>
       <w:bookmarkStart w:id="111" w:name="k63"/>
-      <w:bookmarkStart w:id="112" w:name="_Toc244166311"/>
+      <w:bookmarkStart w:id="112" w:name="_Toc244245399"/>
       <w:r>
         <w:t>EVENT LISTENERS</w:t>
       </w:r>
@@ -30430,7 +30430,7 @@
         </w:numPr>
       </w:pPr>
       <w:bookmarkStart w:id="113" w:name="k64"/>
-      <w:bookmarkStart w:id="114" w:name="_Toc244166312"/>
+      <w:bookmarkStart w:id="114" w:name="_Toc244245400"/>
       <w:r>
         <w:t>DATAMODEL EN KOPPELINGEN.</w:t>
       </w:r>
@@ -30448,7 +30448,7 @@
         <w:keepNext/>
       </w:pPr>
       <w:bookmarkStart w:id="115" w:name="k65"/>
-      <w:bookmarkStart w:id="116" w:name="_Toc244166313"/>
+      <w:bookmarkStart w:id="116" w:name="_Toc244245401"/>
       <w:r>
         <w:t>BEDRIJVEN</w:t>
       </w:r>
@@ -30659,7 +30659,7 @@
         <w:keepNext/>
       </w:pPr>
       <w:bookmarkStart w:id="117" w:name="k66"/>
-      <w:bookmarkStart w:id="118" w:name="_Toc244166314"/>
+      <w:bookmarkStart w:id="118" w:name="_Toc244245402"/>
       <w:r>
         <w:t>CONSUMPTIEPUNTEN</w:t>
       </w:r>
@@ -30978,7 +30978,7 @@
         <w:keepNext/>
       </w:pPr>
       <w:bookmarkStart w:id="119" w:name="k67"/>
-      <w:bookmarkStart w:id="120" w:name="_Toc244166315"/>
+      <w:bookmarkStart w:id="120" w:name="_Toc244245403"/>
       <w:r>
         <w:t>MEDEWERKERS</w:t>
       </w:r>
@@ -31534,7 +31534,7 @@
         <w:keepNext/>
       </w:pPr>
       <w:bookmarkStart w:id="121" w:name="k68"/>
-      <w:bookmarkStart w:id="122" w:name="_Toc244166316"/>
+      <w:bookmarkStart w:id="122" w:name="_Toc244245404"/>
       <w:r>
         <w:t>REGISTRATIES</w:t>
       </w:r>
@@ -32195,7 +32195,7 @@
         <w:keepNext/>
       </w:pPr>
       <w:bookmarkStart w:id="123" w:name="k69"/>
-      <w:bookmarkStart w:id="124" w:name="_Toc244166317"/>
+      <w:bookmarkStart w:id="124" w:name="_Toc244245405"/>
       <w:r>
         <w:t>SLIMME KOELKAST</w:t>
       </w:r>
@@ -32615,7 +32615,7 @@
         <w:keepNext/>
       </w:pPr>
       <w:bookmarkStart w:id="125" w:name="k70"/>
-      <w:bookmarkStart w:id="126" w:name="_Toc244166318"/>
+      <w:bookmarkStart w:id="126" w:name="_Toc244245406"/>
       <w:r>
         <w:t>DEMO GEZICHTSHERKENNING</w:t>
       </w:r>
@@ -32958,7 +32958,7 @@
         </w:numPr>
       </w:pPr>
       <w:bookmarkStart w:id="127" w:name="k71"/>
-      <w:bookmarkStart w:id="128" w:name="_Toc244166319"/>
+      <w:bookmarkStart w:id="128" w:name="_Toc244245407"/>
       <w:r>
         <w:t>BELANGRIJKE DEMO-BEPERKINGEN.</w:t>
       </w:r>
@@ -33427,7 +33427,7 @@
         </w:numPr>
       </w:pPr>
       <w:bookmarkStart w:id="129" w:name="k72"/>
-      <w:bookmarkStart w:id="130" w:name="_Toc244166320"/>
+      <w:bookmarkStart w:id="130" w:name="_Toc244245408"/>
       <w:r>
         <w:t>CODE UITLEGGEN TIJDENS EEN PRESENTATIE.</w:t>
       </w:r>
@@ -33833,7 +33833,7 @@
         </w:numPr>
       </w:pPr>
       <w:bookmarkStart w:id="131" w:name="k73"/>
-      <w:bookmarkStart w:id="132" w:name="_Toc244166321"/>
+      <w:bookmarkStart w:id="132" w:name="_Toc244245409"/>
       <w:r>
         <w:t>MOGELIJKE VERVOLGSTAPPEN.</w:t>
       </w:r>

</xml_diff>